<commit_message>
Manuscript update: split Supplemental Text, completed/corrected references, added cultural-transmission and CMV citations, data/code availability statement
- Split the Supplemental Text into its own file (SUPPLEMENTAL_TEXT).
- Added a Data and Code Availability statement pointing to this repository.
- Citation audit: completed incomplete entries (Ross-Stallings corrected to 2017
  Bones of Complexity; Lipo and Dunnell to Time's River; Madsen as arXiv preprint;
  Morse and Morse to North American Archaeologist 17[1]:1-35; Mitchem conference
  paper), verified five flagged entries, and removed legacy MLS/cooperation
  orphans from the bibliography.
- Added relevant cultural-transmission (Bentley, Carrignon et al., Kandler and
  Shennan, Fogarty et al., Richerson et al.) and central Mississippi Valley
  (McNutt, Sullivan et al., Mainfort, Lulewicz) citations.
- Rebuilt docx and PDF for both main text and supplement.
</commit_message>
<xml_diff>
--- a/docs/manuscript/MAIN_TEXT.docx
+++ b/docs/manuscript/MAIN_TEXT.docx
@@ -2,7 +2,7 @@
 <file path=word/document.xml><?xml version="1.0" encoding="utf-8"?>
 <w:document xmlns:w="http://schemas.openxmlformats.org/wordprocessingml/2006/main" xmlns:m="http://schemas.openxmlformats.org/officeDocument/2006/math" xmlns:r="http://schemas.openxmlformats.org/officeDocument/2006/relationships" xmlns:o="urn:schemas-microsoft-com:office:office" xmlns:v="urn:schemas-microsoft-com:vml" xmlns:w10="urn:schemas-microsoft-com:office:word" xmlns:a="http://schemas.openxmlformats.org/drawingml/2006/main" xmlns:pic="http://schemas.openxmlformats.org/drawingml/2006/picture" xmlns:wp="http://schemas.openxmlformats.org/drawingml/2006/wordprocessingDrawing">
   <w:body>
-    <w:bookmarkStart w:id="143" w:name="X093902eb68652ea32f5548e74607f4e4b0f6699"/>
+    <w:bookmarkStart w:id="132" w:name="X093902eb68652ea32f5548e74607f4e4b0f6699"/>
     <w:p>
       <w:pPr>
         <w:pStyle w:val="Heading1"/>
@@ -169,7 +169,7 @@
         <w:t xml:space="preserve"> </w:t>
       </w:r>
       <w:r>
-        <w:t xml:space="preserve">(Bentley et al. 2004; Neiman 1995)</w:t>
+        <w:t xml:space="preserve">(Bentley et al. 2004; Fogarty et al. 2024; Neiman 1995)</w:t>
       </w:r>
       <w:r>
         <w:t xml:space="preserve">. When those learners interact more with near neighbors than with distant ones, drift on the spatially structured population generates within-greater-than-between similarity on its own, apparent clusters produced by geography with no bounded group anywhere</w:t>
@@ -339,7 +339,7 @@
         <w:t xml:space="preserve"> </w:t>
       </w:r>
       <w:r>
-        <w:t xml:space="preserve">(Crema et al. 2016; Mesoudi 2021)</w:t>
+        <w:t xml:space="preserve">(Crema et al. 2016; Kandler and Shennan 2015; Mesoudi 2021)</w:t>
       </w:r>
       <w:r>
         <w:t xml:space="preserve">. We therefore compare the two processes in a generative manner. We simulate neutral spatial drift and bounded groups on the real coordinate layout of the assemblages and ask which reproduces the observed structure, using four transmission signatures, departure from neutral copying, breakdown of frequency-seriation coherence, between-group variance, and spatial assortativity, as diagnostics of whether interaction has closed rather than as a stand-alone detector. Because an archaeological assemblage is time-averaged and sampled to varying depth, a signature can register a difference that is an artifact of sampling rather than of transmission, so we calibrate the comparison to the record by a signal-recovery experiment: into synthetic assemblages matched to the real number, sample sizes, and time-averaging we inject a known signal of tunable strength and read off how strong a real boundary would have to be to register. Only a calibrated comparison can license the conclusion that an absence of group structure is real rather than a failure of resolution. This calibration is the transferable contribution, because before any similarity structure is read as social, a record must be shown to be able to distinguish drift from groups at all.</w:t>
@@ -383,7 +383,7 @@
         <w:t xml:space="preserve"> </w:t>
       </w:r>
       <w:r>
-        <w:t xml:space="preserve">(Phillips et al. 1951; Williams 1954)</w:t>
+        <w:t xml:space="preserve">(McNutt 1996; Phillips et al. 1951; Williams 1954)</w:t>
       </w:r>
       <w:r>
         <w:t xml:space="preserve">. The premise is not arbitrary. Under the neutral transmission model, it would hold if learning were confined within social boundaries, so that decoration drifted in separate pools and diverged between them. The difficulty is that the same within-greater-than-between similarity arises with no boundary at all when interaction declines with distance, because spatially structured drift concentrates similarity among near neighbors</w:t>
@@ -484,7 +484,7 @@
         <w:t xml:space="preserve"> </w:t>
       </w:r>
       <w:r>
-        <w:t xml:space="preserve">(Bentley et al. 2004; Neiman 1995)</w:t>
+        <w:t xml:space="preserve">(Bentley et al. 2004; Bentley 2008; Neiman 1995)</w:t>
       </w:r>
       <w:r>
         <w:t xml:space="preserve">. Neutral style is the null condition: assemblages drawn from a single interacting community share one drifting pool, and their decorated-type frequencies admit a single battleship-curve seriation</w:t>
@@ -528,7 +528,7 @@
         <w:t xml:space="preserve"> </w:t>
       </w:r>
       <w:r>
-        <w:t xml:space="preserve">(Kandler et al. 2017; Mesoudi 2021)</w:t>
+        <w:t xml:space="preserve">(Carrignon et al. 2019; Kandler et al. 2017; Mesoudi 2021)</w:t>
       </w:r>
       <w:r>
         <w:t xml:space="preserve">. This is the inferential wall the test is built to climb, and it is why we do not rest on any one signature.</w:t>
@@ -609,7 +609,7 @@
         <w:t xml:space="preserve"> </w:t>
       </w:r>
       <w:r>
-        <w:t xml:space="preserve">(King and Freer 1995; Rees 2001)</w:t>
+        <w:t xml:space="preserve">(King and Freer 1995; Lulewicz 2019; Rees 2001)</w:t>
       </w:r>
       <w:r>
         <w:t xml:space="preserve">. The chronicles describe Casqui and its neighbor Pacaha in open conflict, which fits a landscape of competing peers, though the same sources have also been read as ranking Casqui below Pacaha, and the chronicle ethnography is thin and filtered</w:t>
@@ -1266,7 +1266,7 @@
         <w:t xml:space="preserve"> </w:t>
       </w:r>
       <w:r>
-        <w:t xml:space="preserve">(Mainfort 2001)</w:t>
+        <w:t xml:space="preserve">(Mainfort 1996, 2001; Sullivan et al. 2024)</w:t>
       </w:r>
       <w:r>
         <w:t xml:space="preserve">. Calibrated against IntCal20, the basin determinations place the occupation in the fourteenth to sixteenth centuries (summed-probability median AD 1422, Parkin AD 1483) and show a decline across the contact interval, as detailed in the Supplemental Text. A calibration plateau across that interval still defeats year-scale resolution, so we order the assemblages by seriation rather than by calendar age, using the first axis of a correspondence analysis. This ordination arranges assemblages along axes that summarize their decorated-type-frequency differences, as a relative chronological ordinate oriented so that higher positions correspond to later time (Figure 3). Pooling the dates of the five proveniences that match curated assemblages, the pooled median calibrated ages correlate with seriation position at Spearman +0.70 (n = 5, 27 dates pooled), an improvement on the +0.50 of the single-date anchors, with four of the five sites in calendar order and one late-dated site departing from it. The axis, therefore, tracks calendar time, but imperfectly. The trajectory we test is ordinal, not a calendar rate, and the discriminating quantity, the size-controlled F_ST trend, is a magnitude invariant to the axis orientation, so only the directional descriptions of the other signatures depend on the anchor. We return to both limits in the discussion.</w:t>
@@ -1937,7 +1937,16 @@
         <w:t xml:space="preserve">(Cobb 2000)</w:t>
       </w:r>
       <w:r>
-        <w:t xml:space="preserve">. We are explicit about the scope of the ceramic claim. The transmission analysis bears on whether interaction closes into bounded, like-with-like groups, not on group-level fitness differences or a new unit of selection, which assemblage data cannot address. What the record shows is that the within-greater-than-between similarity the phase is built on is what spatially structured drift produces, so the phase, at the scale at which it is drawn, marks continuous interaction structured by geography rather than by a bounded society. Parkin’s ceremonial and demographic prominence was real. The polity that prominence is taken to imply is not in the transmission record.</w:t>
+        <w:t xml:space="preserve">. We are explicit about the scope of the ceramic claim. The transmission analysis bears on whether interaction closes into bounded, like-with-like groups, not on group-level fitness differences or a new unit of selection</w:t>
+      </w:r>
+      <w:r>
+        <w:t xml:space="preserve"> </w:t>
+      </w:r>
+      <w:r>
+        <w:t xml:space="preserve">(Richerson et al. 2016)</w:t>
+      </w:r>
+      <w:r>
+        <w:t xml:space="preserve">, which assemblage data cannot address. What the record shows is that the within-greater-than-between similarity the phase is built on is what spatially structured drift produces, so the phase, at the scale at which it is drawn, marks continuous interaction structured by geography rather than by a bounded society. Parkin’s ceremonial and demographic prominence was real. The polity that prominence is taken to imply is not in the transmission record.</w:t>
       </w:r>
     </w:p>
     <w:p>
@@ -1960,7 +1969,7 @@
         <w:t xml:space="preserve"> </w:t>
       </w:r>
       <w:r>
-        <w:t xml:space="preserve">(Ross-Stallings 2015)</w:t>
+        <w:t xml:space="preserve">(Ross-Stallings 2017)</w:t>
       </w:r>
       <w:r>
         <w:t xml:space="preserve">. The contrast is real but thin: the satellite sample numbers fourteen individuals, the result is presented as tentative, and a health difference between two sites does not require an extractive hierarchy to produce it. Neither argument supplies the regional, structural signature that the convergence test looks for and does not find.</w:t>
@@ -2236,22 +2245,13 @@
       </w:r>
     </w:p>
     <w:bookmarkEnd w:id="51"/>
-    <w:bookmarkStart w:id="78" w:name="supplemental-text"/>
+    <w:bookmarkStart w:id="52" w:name="data-and-code-availability"/>
     <w:p>
       <w:pPr>
         <w:pStyle w:val="Heading2"/>
       </w:pPr>
       <w:r>
-        <w:t xml:space="preserve">Supplemental Text</w:t>
-      </w:r>
-    </w:p>
-    <w:bookmarkStart w:id="52" w:name="X193c2f99596c44272797617e48f9bee78459a86"/>
-    <w:p>
-      <w:pPr>
-        <w:pStyle w:val="Heading3"/>
-      </w:pPr>
-      <w:r>
-        <w:t xml:space="preserve">Full specification of the four signatures</w:t>
+        <w:t xml:space="preserve">Data and Code Availability</w:t>
       </w:r>
     </w:p>
     <w:p>
@@ -2259,1912 +2259,11 @@
         <w:pStyle w:val="FirstParagraph"/>
       </w:pPr>
       <w:r>
-        <w:t xml:space="preserve">Departure from neutral transmission follows Neiman’s application of the infinite-alleles model</w:t>
-      </w:r>
-      <w:r>
-        <w:t xml:space="preserve"> </w:t>
-      </w:r>
-      <w:r>
-        <w:t xml:space="preserve">(Neiman 1995)</w:t>
-      </w:r>
-      <w:r>
-        <w:t xml:space="preserve">. We estimated the transmission parameter</w:t>
-      </w:r>
-      <w:r>
-        <w:t xml:space="preserve"> </w:t>
-      </w:r>
-      <m:oMath>
-        <m:r>
-          <m:t>θ</m:t>
-        </m:r>
-      </m:oMath>
-      <w:r>
-        <w:t xml:space="preserve"> </w:t>
-      </w:r>
-      <w:r>
-        <w:t xml:space="preserve">in two ways from each assemblage. The homozygosity estimator uses the unbiased sample homozygosity</w:t>
-      </w:r>
-      <w:r>
-        <w:t xml:space="preserve"> </w:t>
-      </w:r>
-      <m:oMath>
-        <m:r>
-          <m:t>F</m:t>
-        </m:r>
-        <m:r>
-          <m:rPr>
-            <m:sty m:val="p"/>
-          </m:rPr>
-          <m:t>=</m:t>
-        </m:r>
-        <m:nary>
-          <m:naryPr>
-            <m:chr m:val="∑"/>
-            <m:limLoc m:val="undOvr"/>
-            <m:subHide m:val="off"/>
-            <m:supHide m:val="on"/>
-          </m:naryPr>
-          <m:sub>
-            <m:r>
-              <m:t>i</m:t>
-            </m:r>
-          </m:sub>
-          <m:sup>
-            <m:r>
-              <m:t>​</m:t>
-            </m:r>
-          </m:sup>
-          <m:e>
-            <m:sSub>
-              <m:e>
-                <m:r>
-                  <m:t>n</m:t>
-                </m:r>
-              </m:e>
-              <m:sub>
-                <m:r>
-                  <m:t>i</m:t>
-                </m:r>
-              </m:sub>
-            </m:sSub>
-          </m:e>
-        </m:nary>
-        <m:r>
-          <m:rPr>
-            <m:sty m:val="p"/>
-          </m:rPr>
-          <m:t>(</m:t>
-        </m:r>
-        <m:sSub>
-          <m:e>
-            <m:r>
-              <m:t>n</m:t>
-            </m:r>
-          </m:e>
-          <m:sub>
-            <m:r>
-              <m:t>i</m:t>
-            </m:r>
-          </m:sub>
-        </m:sSub>
-        <m:r>
-          <m:rPr>
-            <m:sty m:val="p"/>
-          </m:rPr>
-          <m:t>−</m:t>
-        </m:r>
-        <m:r>
-          <m:t>1</m:t>
-        </m:r>
-        <m:r>
-          <m:rPr>
-            <m:sty m:val="p"/>
-          </m:rPr>
-          <m:t>)</m:t>
-        </m:r>
-        <m:r>
-          <m:rPr>
-            <m:sty m:val="p"/>
-          </m:rPr>
-          <m:t>/</m:t>
-        </m:r>
-        <m:r>
-          <m:rPr>
-            <m:sty m:val="p"/>
-          </m:rPr>
-          <m:t>[</m:t>
-        </m:r>
-        <m:r>
-          <m:t>N</m:t>
-        </m:r>
-        <m:r>
-          <m:rPr>
-            <m:sty m:val="p"/>
-          </m:rPr>
-          <m:t>(</m:t>
-        </m:r>
-        <m:r>
-          <m:t>N</m:t>
-        </m:r>
-        <m:r>
-          <m:rPr>
-            <m:sty m:val="p"/>
-          </m:rPr>
-          <m:t>−</m:t>
-        </m:r>
-        <m:r>
-          <m:t>1</m:t>
-        </m:r>
-        <m:r>
-          <m:rPr>
-            <m:sty m:val="p"/>
-          </m:rPr>
-          <m:t>)</m:t>
-        </m:r>
-        <m:r>
-          <m:rPr>
-            <m:sty m:val="p"/>
-          </m:rPr>
-          <m:t>]</m:t>
-        </m:r>
-      </m:oMath>
-      <w:r>
-        <w:t xml:space="preserve">, where</w:t>
-      </w:r>
-      <w:r>
-        <w:t xml:space="preserve"> </w:t>
-      </w:r>
-      <m:oMath>
-        <m:sSub>
-          <m:e>
-            <m:r>
-              <m:t>n</m:t>
-            </m:r>
-          </m:e>
-          <m:sub>
-            <m:r>
-              <m:t>i</m:t>
-            </m:r>
-          </m:sub>
-        </m:sSub>
-      </m:oMath>
-      <w:r>
-        <w:t xml:space="preserve"> </w:t>
-      </w:r>
-      <w:r>
-        <w:t xml:space="preserve">is the count of type</w:t>
-      </w:r>
-      <w:r>
-        <w:t xml:space="preserve"> </w:t>
-      </w:r>
-      <m:oMath>
-        <m:r>
-          <m:t>i</m:t>
-        </m:r>
-      </m:oMath>
-      <w:r>
-        <w:t xml:space="preserve"> </w:t>
-      </w:r>
-      <w:r>
-        <w:t xml:space="preserve">and</w:t>
-      </w:r>
-      <w:r>
-        <w:t xml:space="preserve"> </w:t>
-      </w:r>
-      <m:oMath>
-        <m:r>
-          <m:t>N</m:t>
-        </m:r>
-      </m:oMath>
-      <w:r>
-        <w:t xml:space="preserve"> </w:t>
-      </w:r>
-      <w:r>
-        <w:t xml:space="preserve">the assemblage size, and inverts the neutral relation</w:t>
-      </w:r>
-      <w:r>
-        <w:t xml:space="preserve"> </w:t>
-      </w:r>
-      <m:oMath>
-        <m:r>
-          <m:t>F</m:t>
-        </m:r>
-        <m:r>
-          <m:rPr>
-            <m:sty m:val="p"/>
-          </m:rPr>
-          <m:t>=</m:t>
-        </m:r>
-        <m:r>
-          <m:t>1</m:t>
-        </m:r>
-        <m:r>
-          <m:rPr>
-            <m:sty m:val="p"/>
-          </m:rPr>
-          <m:t>/</m:t>
-        </m:r>
-        <m:r>
-          <m:rPr>
-            <m:sty m:val="p"/>
-          </m:rPr>
-          <m:t>(</m:t>
-        </m:r>
-        <m:r>
-          <m:t>1</m:t>
-        </m:r>
-        <m:r>
-          <m:rPr>
-            <m:sty m:val="p"/>
-          </m:rPr>
-          <m:t>+</m:t>
-        </m:r>
-        <m:r>
-          <m:t>θ</m:t>
-        </m:r>
-        <m:r>
-          <m:rPr>
-            <m:sty m:val="p"/>
-          </m:rPr>
-          <m:t>)</m:t>
-        </m:r>
-      </m:oMath>
-      <w:r>
-        <w:t xml:space="preserve"> </w:t>
-      </w:r>
-      <w:r>
-        <w:t xml:space="preserve">to give</w:t>
-      </w:r>
-      <w:r>
-        <w:t xml:space="preserve"> </w:t>
-      </w:r>
-      <m:oMath>
-        <m:sSub>
-          <m:e>
-            <m:r>
-              <m:t>θ</m:t>
-            </m:r>
-          </m:e>
-          <m:sub>
-            <m:r>
-              <m:t>F</m:t>
-            </m:r>
-          </m:sub>
-        </m:sSub>
-        <m:r>
-          <m:rPr>
-            <m:sty m:val="p"/>
-          </m:rPr>
-          <m:t>=</m:t>
-        </m:r>
-        <m:r>
-          <m:rPr>
-            <m:sty m:val="p"/>
-          </m:rPr>
-          <m:t>(</m:t>
-        </m:r>
-        <m:r>
-          <m:t>1</m:t>
-        </m:r>
-        <m:r>
-          <m:rPr>
-            <m:sty m:val="p"/>
-          </m:rPr>
-          <m:t>−</m:t>
-        </m:r>
-        <m:r>
-          <m:t>F</m:t>
-        </m:r>
-        <m:r>
-          <m:rPr>
-            <m:sty m:val="p"/>
-          </m:rPr>
-          <m:t>)</m:t>
-        </m:r>
-        <m:r>
-          <m:rPr>
-            <m:sty m:val="p"/>
-          </m:rPr>
-          <m:t>/</m:t>
-        </m:r>
-        <m:r>
-          <m:t>F</m:t>
-        </m:r>
-      </m:oMath>
-      <w:r>
-        <w:t xml:space="preserve">. The richness estimator solves the Ewens sampling expectation for the number of types</w:t>
-      </w:r>
-      <w:r>
-        <w:t xml:space="preserve"> </w:t>
-      </w:r>
-      <m:oMath>
-        <m:r>
-          <m:t>k</m:t>
-        </m:r>
-      </m:oMath>
-      <w:r>
-        <w:t xml:space="preserve">,</w:t>
-      </w:r>
-    </w:p>
-    <w:p>
-      <w:pPr>
-        <w:pStyle w:val="BodyText"/>
-      </w:pPr>
-      <m:oMathPara>
-        <m:oMathParaPr>
-          <m:jc m:val="center"/>
-        </m:oMathParaPr>
-        <m:oMath>
-          <m:r>
-            <m:rPr>
-              <m:scr m:val="double-struck"/>
-              <m:sty m:val="p"/>
-            </m:rPr>
-            <m:t>E</m:t>
-          </m:r>
-          <m:r>
-            <m:rPr>
-              <m:sty m:val="p"/>
-            </m:rPr>
-            <m:t>[</m:t>
-          </m:r>
-          <m:r>
-            <m:t>k</m:t>
-          </m:r>
-          <m:r>
-            <m:rPr>
-              <m:sty m:val="p"/>
-            </m:rPr>
-            <m:t>∣</m:t>
-          </m:r>
-          <m:r>
-            <m:t>θ</m:t>
-          </m:r>
-          <m:r>
-            <m:rPr>
-              <m:sty m:val="p"/>
-            </m:rPr>
-            <m:t>,</m:t>
-          </m:r>
-          <m:r>
-            <m:t>N</m:t>
-          </m:r>
-          <m:r>
-            <m:rPr>
-              <m:sty m:val="p"/>
-            </m:rPr>
-            <m:t>]</m:t>
-          </m:r>
-          <m:r>
-            <m:rPr>
-              <m:sty m:val="p"/>
-            </m:rPr>
-            <m:t>=</m:t>
-          </m:r>
-          <m:nary>
-            <m:naryPr>
-              <m:chr m:val="∑"/>
-              <m:limLoc m:val="undOvr"/>
-              <m:subHide m:val="off"/>
-              <m:supHide m:val="off"/>
-            </m:naryPr>
-            <m:sub>
-              <m:r>
-                <m:t>i</m:t>
-              </m:r>
-              <m:r>
-                <m:rPr>
-                  <m:sty m:val="p"/>
-                </m:rPr>
-                <m:t>=</m:t>
-              </m:r>
-              <m:r>
-                <m:t>0</m:t>
-              </m:r>
-            </m:sub>
-            <m:sup>
-              <m:r>
-                <m:t>N</m:t>
-              </m:r>
-              <m:r>
-                <m:rPr>
-                  <m:sty m:val="p"/>
-                </m:rPr>
-                <m:t>−</m:t>
-              </m:r>
-              <m:r>
-                <m:t>1</m:t>
-              </m:r>
-            </m:sup>
-            <m:e>
-              <m:f>
-                <m:fPr>
-                  <m:type m:val="bar"/>
-                </m:fPr>
-                <m:num>
-                  <m:r>
-                    <m:t>θ</m:t>
-                  </m:r>
-                </m:num>
-                <m:den>
-                  <m:r>
-                    <m:t>θ</m:t>
-                  </m:r>
-                  <m:r>
-                    <m:rPr>
-                      <m:sty m:val="p"/>
-                    </m:rPr>
-                    <m:t>+</m:t>
-                  </m:r>
-                  <m:r>
-                    <m:t>i</m:t>
-                  </m:r>
-                </m:den>
-              </m:f>
-            </m:e>
-          </m:nary>
-          <m:r>
-            <m:rPr>
-              <m:sty m:val="p"/>
-            </m:rPr>
-            <m:t>,</m:t>
-          </m:r>
-        </m:oMath>
-      </m:oMathPara>
-    </w:p>
-    <w:p>
-      <w:pPr>
-        <w:pStyle w:val="FirstParagraph"/>
-      </w:pPr>
-      <w:r>
-        <w:t xml:space="preserve">for the value</w:t>
-      </w:r>
-      <w:r>
-        <w:t xml:space="preserve"> </w:t>
-      </w:r>
-      <m:oMath>
-        <m:sSub>
-          <m:e>
-            <m:r>
-              <m:t>θ</m:t>
-            </m:r>
-          </m:e>
-          <m:sub>
-            <m:r>
-              <m:t>E</m:t>
-            </m:r>
-          </m:sub>
-        </m:sSub>
-      </m:oMath>
-      <w:r>
-        <w:t xml:space="preserve"> </w:t>
-      </w:r>
-      <w:r>
-        <w:t xml:space="preserve">that reproduces the observed</w:t>
-      </w:r>
-      <w:r>
-        <w:t xml:space="preserve"> </w:t>
-      </w:r>
-      <m:oMath>
-        <m:r>
-          <m:t>k</m:t>
-        </m:r>
-      </m:oMath>
-      <w:r>
-        <w:t xml:space="preserve"> </w:t>
-      </w:r>
-      <w:r>
-        <w:t xml:space="preserve">(Ewens 1972)</w:t>
-      </w:r>
-      <w:r>
-        <w:t xml:space="preserve">. Under neutral drift, the two estimators agree. Conformist copying concentrates frequency on common types, raising</w:t>
-      </w:r>
-      <w:r>
-        <w:t xml:space="preserve"> </w:t>
-      </w:r>
-      <m:oMath>
-        <m:r>
-          <m:t>F</m:t>
-        </m:r>
-      </m:oMath>
-      <w:r>
-        <w:t xml:space="preserve"> </w:t>
-      </w:r>
-      <w:r>
-        <w:t xml:space="preserve">and lowering</w:t>
-      </w:r>
-      <w:r>
-        <w:t xml:space="preserve"> </w:t>
-      </w:r>
-      <m:oMath>
-        <m:sSub>
-          <m:e>
-            <m:r>
-              <m:t>θ</m:t>
-            </m:r>
-          </m:e>
-          <m:sub>
-            <m:r>
-              <m:t>F</m:t>
-            </m:r>
-          </m:sub>
-        </m:sSub>
-      </m:oMath>
-      <w:r>
-        <w:t xml:space="preserve"> </w:t>
-      </w:r>
-      <w:r>
-        <w:t xml:space="preserve">relative to</w:t>
-      </w:r>
-      <w:r>
-        <w:t xml:space="preserve"> </w:t>
-      </w:r>
-      <m:oMath>
-        <m:sSub>
-          <m:e>
-            <m:r>
-              <m:t>θ</m:t>
-            </m:r>
-          </m:e>
-          <m:sub>
-            <m:r>
-              <m:t>E</m:t>
-            </m:r>
-          </m:sub>
-        </m:sSub>
-      </m:oMath>
-      <w:r>
-        <w:t xml:space="preserve">, whereas anti-conformist novelty bias does the reverse. The signature is the ratio</w:t>
-      </w:r>
-      <w:r>
-        <w:t xml:space="preserve"> </w:t>
-      </w:r>
-      <m:oMath>
-        <m:sSub>
-          <m:e>
-            <m:r>
-              <m:t>θ</m:t>
-            </m:r>
-          </m:e>
-          <m:sub>
-            <m:r>
-              <m:t>F</m:t>
-            </m:r>
-          </m:sub>
-        </m:sSub>
-        <m:r>
-          <m:rPr>
-            <m:sty m:val="p"/>
-          </m:rPr>
-          <m:t>/</m:t>
-        </m:r>
-        <m:sSub>
-          <m:e>
-            <m:r>
-              <m:t>θ</m:t>
-            </m:r>
-          </m:e>
-          <m:sub>
-            <m:r>
-              <m:t>E</m:t>
-            </m:r>
-          </m:sub>
-        </m:sSub>
-      </m:oMath>
-      <w:r>
-        <w:t xml:space="preserve">, which both detects a departure from neutrality and signs it. Because pooling assemblages from divergent groups cancels out the effect, we computed ratios within spatial clusters and averaged the results across clusters.</w:t>
-      </w:r>
-    </w:p>
-    <w:p>
-      <w:pPr>
-        <w:pStyle w:val="BodyText"/>
-      </w:pPr>
-      <w:r>
-        <w:t xml:space="preserve">Seriation-coherence breakdown follows the deterministic frequency-seriation method of Lipo, Madsen, and Dunnell</w:t>
-      </w:r>
-      <w:r>
-        <w:t xml:space="preserve"> </w:t>
-      </w:r>
-      <w:r>
-        <w:t xml:space="preserve">(Lipo et al. 2015)</w:t>
-      </w:r>
-      <w:r>
-        <w:t xml:space="preserve">. A set of assemblages is co-seriable if some ordering renders every decorated type’s frequency both unimodal and continuous. We enumerated the complete set of maximal co-seriable groups, the subsets for which a valid ordering exists, and which are maximal under inclusion. A single group indicates one interacting community, whereas a proliferation of small, mutually non-co-seriable groups indicates a fragmented one. We report the number and maximum size of these groups and, for each assemblage, its group-membership count, which identifies the bridge assemblages that join otherwise incompatible orderings. The number of maximal groups is the continuous signature.</w:t>
-      </w:r>
-    </w:p>
-    <w:p>
-      <w:pPr>
-        <w:pStyle w:val="BodyText"/>
-      </w:pPr>
-      <w:r>
-        <w:t xml:space="preserve">The variance partition is a cultural analog of Wright’s</w:t>
-      </w:r>
-      <w:r>
-        <w:t xml:space="preserve"> </w:t>
-      </w:r>
-      <m:oMath>
-        <m:sSub>
-          <m:e>
-            <m:r>
-              <m:t>F</m:t>
-            </m:r>
-          </m:e>
-          <m:sub>
-            <m:r>
-              <m:t>S</m:t>
-            </m:r>
-            <m:r>
-              <m:t>T</m:t>
-            </m:r>
-          </m:sub>
-        </m:sSub>
-      </m:oMath>
-      <w:r>
-        <w:t xml:space="preserve"> </w:t>
-      </w:r>
-      <w:r>
-        <w:t xml:space="preserve">computed on Gini-Simpson diversity</w:t>
-      </w:r>
-      <w:r>
-        <w:t xml:space="preserve"> </w:t>
-      </w:r>
-      <m:oMath>
-        <m:r>
-          <m:t>H</m:t>
-        </m:r>
-        <m:r>
-          <m:rPr>
-            <m:sty m:val="p"/>
-          </m:rPr>
-          <m:t>=</m:t>
-        </m:r>
-        <m:r>
-          <m:t>1</m:t>
-        </m:r>
-        <m:r>
-          <m:rPr>
-            <m:sty m:val="p"/>
-          </m:rPr>
-          <m:t>−</m:t>
-        </m:r>
-        <m:nary>
-          <m:naryPr>
-            <m:chr m:val="∑"/>
-            <m:limLoc m:val="undOvr"/>
-            <m:subHide m:val="off"/>
-            <m:supHide m:val="on"/>
-          </m:naryPr>
-          <m:sub>
-            <m:r>
-              <m:t>i</m:t>
-            </m:r>
-          </m:sub>
-          <m:sup>
-            <m:r>
-              <m:t>​</m:t>
-            </m:r>
-          </m:sup>
-          <m:e>
-            <m:sSubSup>
-              <m:e>
-                <m:r>
-                  <m:t>p</m:t>
-                </m:r>
-              </m:e>
-              <m:sub>
-                <m:r>
-                  <m:t>i</m:t>
-                </m:r>
-              </m:sub>
-              <m:sup>
-                <m:r>
-                  <m:t>2</m:t>
-                </m:r>
-              </m:sup>
-            </m:sSubSup>
-          </m:e>
-        </m:nary>
-      </m:oMath>
-      <w:r>
-        <w:t xml:space="preserve">,</w:t>
-      </w:r>
-    </w:p>
-    <w:p>
-      <w:pPr>
-        <w:pStyle w:val="BodyText"/>
-      </w:pPr>
-      <m:oMathPara>
-        <m:oMathParaPr>
-          <m:jc m:val="center"/>
-        </m:oMathParaPr>
-        <m:oMath>
-          <m:sSub>
-            <m:e>
-              <m:r>
-                <m:t>F</m:t>
-              </m:r>
-            </m:e>
-            <m:sub>
-              <m:r>
-                <m:t>S</m:t>
-              </m:r>
-              <m:r>
-                <m:t>T</m:t>
-              </m:r>
-            </m:sub>
-          </m:sSub>
-          <m:r>
-            <m:rPr>
-              <m:sty m:val="p"/>
-            </m:rPr>
-            <m:t>=</m:t>
-          </m:r>
-          <m:f>
-            <m:fPr>
-              <m:type m:val="bar"/>
-            </m:fPr>
-            <m:num>
-              <m:sSub>
-                <m:e>
-                  <m:r>
-                    <m:t>H</m:t>
-                  </m:r>
-                </m:e>
-                <m:sub>
-                  <m:r>
-                    <m:t>T</m:t>
-                  </m:r>
-                </m:sub>
-              </m:sSub>
-              <m:r>
-                <m:rPr>
-                  <m:sty m:val="p"/>
-                </m:rPr>
-                <m:t>−</m:t>
-              </m:r>
-              <m:sSub>
-                <m:e>
-                  <m:r>
-                    <m:t>H</m:t>
-                  </m:r>
-                </m:e>
-                <m:sub>
-                  <m:r>
-                    <m:t>S</m:t>
-                  </m:r>
-                </m:sub>
-              </m:sSub>
-            </m:num>
-            <m:den>
-              <m:sSub>
-                <m:e>
-                  <m:r>
-                    <m:t>H</m:t>
-                  </m:r>
-                </m:e>
-                <m:sub>
-                  <m:r>
-                    <m:t>T</m:t>
-                  </m:r>
-                </m:sub>
-              </m:sSub>
-            </m:den>
-          </m:f>
-          <m:r>
-            <m:rPr>
-              <m:sty m:val="p"/>
-            </m:rPr>
-            <m:t>,</m:t>
-          </m:r>
-        </m:oMath>
-      </m:oMathPara>
-    </w:p>
-    <w:p>
-      <w:pPr>
-        <w:pStyle w:val="FirstParagraph"/>
-      </w:pPr>
-      <w:r>
-        <w:t xml:space="preserve">where</w:t>
-      </w:r>
-      <w:r>
-        <w:t xml:space="preserve"> </w:t>
-      </w:r>
-      <m:oMath>
-        <m:sSub>
-          <m:e>
-            <m:r>
-              <m:t>H</m:t>
-            </m:r>
-          </m:e>
-          <m:sub>
-            <m:r>
-              <m:t>T</m:t>
-            </m:r>
-          </m:sub>
-        </m:sSub>
-      </m:oMath>
-      <w:r>
-        <w:t xml:space="preserve"> </w:t>
-      </w:r>
-      <w:r>
-        <w:t xml:space="preserve">is the diversity of the pooled assemblages and</w:t>
-      </w:r>
-      <w:r>
-        <w:t xml:space="preserve"> </w:t>
-      </w:r>
-      <m:oMath>
-        <m:sSub>
-          <m:e>
-            <m:r>
-              <m:t>H</m:t>
-            </m:r>
-          </m:e>
-          <m:sub>
-            <m:r>
-              <m:t>S</m:t>
-            </m:r>
-          </m:sub>
-        </m:sSub>
-      </m:oMath>
-      <w:r>
-        <w:t xml:space="preserve"> </w:t>
-      </w:r>
-      <w:r>
-        <w:t xml:space="preserve">the size-weighted mean within-cluster diversity</w:t>
-      </w:r>
-      <w:r>
-        <w:t xml:space="preserve"> </w:t>
-      </w:r>
-      <w:r>
-        <w:t xml:space="preserve">(Bell et al. 2009)</w:t>
-      </w:r>
-      <w:r>
-        <w:t xml:space="preserve">. It is zero when clusters share a repertoire and rises as they come to hold distinct ones.</w:t>
-      </w:r>
-    </w:p>
-    <w:p>
-      <w:pPr>
-        <w:pStyle w:val="BodyText"/>
-      </w:pPr>
-      <w:r>
-        <w:t xml:space="preserve">Spatial assortativity asks whether ceramic similarity follows social rather than geographic distance. We measured Brainerd-Robinson similarity</w:t>
-      </w:r>
-      <w:r>
-        <w:t xml:space="preserve"> </w:t>
-      </w:r>
-      <m:oMath>
-        <m:sSub>
-          <m:e>
-            <m:r>
-              <m:t>S</m:t>
-            </m:r>
-          </m:e>
-          <m:sub>
-            <m:r>
-              <m:t>i</m:t>
-            </m:r>
-            <m:r>
-              <m:t>j</m:t>
-            </m:r>
-          </m:sub>
-        </m:sSub>
-        <m:r>
-          <m:rPr>
-            <m:sty m:val="p"/>
-          </m:rPr>
-          <m:t>=</m:t>
-        </m:r>
-        <m:r>
-          <m:t>200</m:t>
-        </m:r>
-        <m:r>
-          <m:rPr>
-            <m:sty m:val="p"/>
-          </m:rPr>
-          <m:t>−</m:t>
-        </m:r>
-        <m:nary>
-          <m:naryPr>
-            <m:chr m:val="∑"/>
-            <m:limLoc m:val="undOvr"/>
-            <m:subHide m:val="off"/>
-            <m:supHide m:val="on"/>
-          </m:naryPr>
-          <m:sub>
-            <m:r>
-              <m:t>k</m:t>
-            </m:r>
-          </m:sub>
-          <m:sup>
-            <m:r>
-              <m:t>​</m:t>
-            </m:r>
-          </m:sup>
-          <m:e>
-            <m:r>
-              <m:rPr>
-                <m:sty m:val="p"/>
-              </m:rPr>
-              <m:t>|</m:t>
-            </m:r>
-          </m:e>
-        </m:nary>
-        <m:r>
-          <m:t>100</m:t>
-        </m:r>
-        <m:r>
-          <m:t> </m:t>
-        </m:r>
-        <m:sSub>
-          <m:e>
-            <m:r>
-              <m:t>p</m:t>
-            </m:r>
-          </m:e>
-          <m:sub>
-            <m:r>
-              <m:t>i</m:t>
-            </m:r>
-            <m:r>
-              <m:t>k</m:t>
-            </m:r>
-          </m:sub>
-        </m:sSub>
-        <m:r>
-          <m:rPr>
-            <m:sty m:val="p"/>
-          </m:rPr>
-          <m:t>−</m:t>
-        </m:r>
-        <m:r>
-          <m:t>100</m:t>
-        </m:r>
-        <m:r>
-          <m:t> </m:t>
-        </m:r>
-        <m:sSub>
-          <m:e>
-            <m:r>
-              <m:t>p</m:t>
-            </m:r>
-          </m:e>
-          <m:sub>
-            <m:r>
-              <m:t>j</m:t>
-            </m:r>
-            <m:r>
-              <m:t>k</m:t>
-            </m:r>
-          </m:sub>
-        </m:sSub>
-        <m:r>
-          <m:rPr>
-            <m:sty m:val="p"/>
-          </m:rPr>
-          <m:t>|</m:t>
-        </m:r>
-      </m:oMath>
-      <w:r>
-        <w:t xml:space="preserve"> </w:t>
-      </w:r>
-      <w:r>
-        <w:t xml:space="preserve">between every pair of assemblages. Because a Mantel correlation cannot separate a sharp boundary from a smooth distance decay, we summarized assortativity as a distance-controlled boundary excess. Within each pairwise-distance bin, the mean within-cluster similarity minus the mean between-cluster similarity is averaged over bins. Under pure isolation by distance, similarity depends only on distance, and the excess is near zero. A sharp social boundary makes within-cluster pairs much more similar than between-cluster pairs at matched distance, yielding a large positive excess. Spatial clusters were obtained by</w:t>
-      </w:r>
-      <w:r>
-        <w:t xml:space="preserve"> </w:t>
-      </w:r>
-      <m:oMath>
-        <m:r>
-          <m:t>k</m:t>
-        </m:r>
-      </m:oMath>
-      <w:r>
-        <w:t xml:space="preserve">-means on site coordinates with multiple restarts, the number of clusters chosen by the mean silhouette.</w:t>
-      </w:r>
-    </w:p>
-    <w:p>
-      <w:pPr>
-        <w:pStyle w:val="BodyText"/>
-      </w:pPr>
-      <w:r>
-        <w:t xml:space="preserve">We combined the four signatures by standardizing each across the ordinal sequence and averaging them, so that no single signature would dominate, and summarized the trajectory as the ordinal slope of the combined score and each component, with rank correlations and bootstrap confidence intervals.</w:t>
+        <w:t xml:space="preserve">All data and code needed to reproduce the analyses and figures reported here are openly available at https://github.com/clipo/phases. The repository includes the decorated-ceramic type counts, the georeferencing and radiocarbon data, the complete analysis pipeline, and instructions for reproducing every result and figure. The code is released under the MIT License and the data under a Creative Commons Attribution 4.0 International license.</w:t>
       </w:r>
     </w:p>
     <w:bookmarkEnd w:id="52"/>
-    <w:bookmarkStart w:id="56" w:name="the-generative-validation-model"/>
-    <w:p>
-      <w:pPr>
-        <w:pStyle w:val="Heading3"/>
-      </w:pPr>
-      <w:r>
-        <w:t xml:space="preserve">The generative validation model</w:t>
-      </w:r>
-    </w:p>
-    <w:p>
-      <w:pPr>
-        <w:pStyle w:val="FirstParagraph"/>
-      </w:pPr>
-      <w:r>
-        <w:t xml:space="preserve">The validation rests on a generative model with three mechanism-faithful controls: the between-group divergence of type profiles, the strength of within-group conformity, and a spatial rule placing group profiles on the landscape. Four generators instantiate the four processes of Table 1. The bounded-groups generator raises divergence and conformity together across spatially bounded groups. Environmental patchiness holds a fixed between-group difference under neutral within-group copying with an environment-keyed layout. Aggregated signaling raises within-group conformity in a single undivided pool with no between-group divergence. Drift with distance-limited interaction produces a smooth spatial gradient under neutral copying. Each generator emits a sequence of group-by-type slices along an ordinal axis. We ran the four-signature pipeline on each, blind to its source, and recorded which registered as convergent, repeating this across 20 random seeds and computing the correlation matrix of the four signatures on the bounded-groups output to confirm that their joint movement is informative rather than an artifact of redundancy (Figure S4). This idealized test uses large, clean assemblages (12 groups, several hundred sherds each) and establishes that it discriminates in principle. The record-matched, size-controlled recovery in the main text (Figure 4) is what establishes which signatures survive at the resolution of the actual data.</w:t>
-      </w:r>
-    </w:p>
-    <w:p>
-      <w:pPr>
-        <w:pStyle w:val="CaptionedFigure"/>
-      </w:pPr>
-      <w:r>
-        <w:drawing>
-          <wp:inline>
-            <wp:extent cx="5334000" cy="4811808"/>
-            <wp:effectExtent b="0" l="0" r="0" t="0"/>
-            <wp:docPr descr="Figure S4. Idealized criterion validation. Four-signature ordinal trajectories under each of the four generative mechanisms on large, clean synthetic assemblages. Only a bounded interaction group drives all four together (starred), and no mimic is flagged as convergent across 20 random seeds (the bounded-groups case flagged in 19 of 20, 95 percent interval 0.75 to 0.99, and no mimic flagged at all, 95 percent upper bound about 0.17). Inset: the signature-independence audit (mean absolute pairwise correlation among the four signatures), high under closure (about 0.88), and low under the mimics (about 0.2). This shows the convergence concept works on idealized data. Figure 4 shows what survives at the record’s resolution." title="" id="54" name="Picture"/>
-            <a:graphic>
-              <a:graphicData uri="http://schemas.openxmlformats.org/drawingml/2006/picture">
-                <pic:pic>
-                  <pic:nvPicPr>
-                    <pic:cNvPr descr="../../figures/figS4_validation.png" id="55" name="Picture"/>
-                    <pic:cNvPicPr>
-                      <a:picLocks noChangeArrowheads="1" noChangeAspect="1"/>
-                    </pic:cNvPicPr>
-                  </pic:nvPicPr>
-                  <pic:blipFill>
-                    <a:blip r:embed="rId53"/>
-                    <a:stretch>
-                      <a:fillRect/>
-                    </a:stretch>
-                  </pic:blipFill>
-                  <pic:spPr bwMode="auto">
-                    <a:xfrm>
-                      <a:off x="0" y="0"/>
-                      <a:ext cx="5334000" cy="4811808"/>
-                    </a:xfrm>
-                    <a:prstGeom prst="rect">
-                      <a:avLst/>
-                    </a:prstGeom>
-                    <a:noFill/>
-                    <a:ln w="9525">
-                      <a:noFill/>
-                      <a:headEnd/>
-                      <a:tailEnd/>
-                    </a:ln>
-                  </pic:spPr>
-                </pic:pic>
-              </a:graphicData>
-            </a:graphic>
-          </wp:inline>
-        </w:drawing>
-      </w:r>
-    </w:p>
-    <w:p>
-      <w:pPr>
-        <w:pStyle w:val="ImageCaption"/>
-      </w:pPr>
-      <w:r>
-        <w:rPr>
-          <w:b/>
-          <w:bCs/>
-        </w:rPr>
-        <w:t xml:space="preserve">Figure S4.</w:t>
-      </w:r>
-      <w:r>
-        <w:t xml:space="preserve"> </w:t>
-      </w:r>
-      <w:r>
-        <w:t xml:space="preserve">Idealized criterion validation. Four-signature ordinal trajectories under each of the four generative mechanisms on large, clean synthetic assemblages. Only a bounded interaction group drives all four together (starred), and no mimic is flagged as convergent across 20 random seeds (the bounded-groups case flagged in 19 of 20, 95 percent interval 0.75 to 0.99, and no mimic flagged at all, 95 percent upper bound about 0.17). Inset: the signature-independence audit (mean absolute pairwise correlation among the four signatures), high under closure (about 0.88), and low under the mimics (about 0.2). This shows the convergence concept works on idealized data. Figure 4 shows what survives at the record’s resolution.</w:t>
-      </w:r>
-    </w:p>
-    <w:bookmarkEnd w:id="56"/>
-    <w:bookmarkStart w:id="60" w:name="robustness-checks"/>
-    <w:p>
-      <w:pPr>
-        <w:pStyle w:val="Heading3"/>
-      </w:pPr>
-      <w:r>
-        <w:t xml:space="preserve">Robustness checks</w:t>
-      </w:r>
-    </w:p>
-    <w:p>
-      <w:pPr>
-        <w:pStyle w:val="FirstParagraph"/>
-      </w:pPr>
-      <w:r>
-        <w:t xml:space="preserve">Neiman’s sample-size diagnostic for the neutrality estimators supports the Discussion: across the 29 basin assemblages, we computed the homozygosity-based and richness-based estimates of the transmission parameter and their signed difference, and correlated each with assemblage size and with seriation position, following Neiman’s protocol for separating a transmission signal from a sample-size artifact</w:t>
-      </w:r>
-      <w:r>
-        <w:t xml:space="preserve"> </w:t>
-      </w:r>
-      <w:r>
-        <w:t xml:space="preserve">(Neiman 1995)</w:t>
-      </w:r>
-      <w:r>
-        <w:t xml:space="preserve">. Several further checks support the Results. A forking-paths sensitivity grid recomputes the convergence verdict across twenty-seven combinations of the basin’s spatial cutoff, bin count, and cluster number. The frequency increment test</w:t>
-      </w:r>
-      <w:r>
-        <w:t xml:space="preserve"> </w:t>
-      </w:r>
-      <w:r>
-        <w:t xml:space="preserve">(Feder et al. 2014)</w:t>
-      </w:r>
-      <w:r>
-        <w:t xml:space="preserve"> </w:t>
-      </w:r>
-      <w:r>
-        <w:t xml:space="preserve">is applied to each decorated type’s binned frequency trajectory. Neiman’s squared-Euclidean interassemblage-distance is computed with its diversity-distance relationship and divergence trajectory</w:t>
-      </w:r>
-      <w:r>
-        <w:t xml:space="preserve"> </w:t>
-      </w:r>
-      <w:r>
-        <w:t xml:space="preserve">(Neiman 1995)</w:t>
-      </w:r>
-      <w:r>
-        <w:t xml:space="preserve">. The alternative basin definition, the stricter watershed rule, is evaluated in full. Clustering-tendency statistics (Hopkins, silhouette, and the gap statistic) on the correspondence-analysis ordination favor a single group, with a maximum silhouette of only 0.47, consistent with a near-continuum rather than sharply bounded ceramic groups. All are provided in the supplementary code. The Neiman interassemblage-distance result is shown in Figure S1.</w:t>
-      </w:r>
-    </w:p>
-    <w:p>
-      <w:pPr>
-        <w:pStyle w:val="CaptionedFigure"/>
-      </w:pPr>
-      <w:r>
-        <w:drawing>
-          <wp:inline>
-            <wp:extent cx="5334000" cy="2759675"/>
-            <wp:effectExtent b="0" l="0" r="0" t="0"/>
-            <wp:docPr descr="Figure S1. Neiman interassemblage-distance result. (A) Within-assemblage diversity against mean interassemblage distance, with Parkin starred. The weak negative association (Spearman rho = -0.28, not significant) is directionally consistent with the drift signature Neiman (1995) reported at rho = -0.62, not with the positive relationship that bounded, assorting groups would produce. (B) Mean within-bin interassemblage distance along the CA seriation axis. Between-assemblage divergence does not grow toward contact (rho = +0.37, not significant)." title="" id="58" name="Picture"/>
-            <a:graphic>
-              <a:graphicData uri="http://schemas.openxmlformats.org/drawingml/2006/picture">
-                <pic:pic>
-                  <pic:nvPicPr>
-                    <pic:cNvPr descr="../../figures/figS1_neiman.png" id="59" name="Picture"/>
-                    <pic:cNvPicPr>
-                      <a:picLocks noChangeArrowheads="1" noChangeAspect="1"/>
-                    </pic:cNvPicPr>
-                  </pic:nvPicPr>
-                  <pic:blipFill>
-                    <a:blip r:embed="rId57"/>
-                    <a:stretch>
-                      <a:fillRect/>
-                    </a:stretch>
-                  </pic:blipFill>
-                  <pic:spPr bwMode="auto">
-                    <a:xfrm>
-                      <a:off x="0" y="0"/>
-                      <a:ext cx="5334000" cy="2759675"/>
-                    </a:xfrm>
-                    <a:prstGeom prst="rect">
-                      <a:avLst/>
-                    </a:prstGeom>
-                    <a:noFill/>
-                    <a:ln w="9525">
-                      <a:noFill/>
-                      <a:headEnd/>
-                      <a:tailEnd/>
-                    </a:ln>
-                  </pic:spPr>
-                </pic:pic>
-              </a:graphicData>
-            </a:graphic>
-          </wp:inline>
-        </w:drawing>
-      </w:r>
-    </w:p>
-    <w:p>
-      <w:pPr>
-        <w:pStyle w:val="ImageCaption"/>
-      </w:pPr>
-      <w:r>
-        <w:rPr>
-          <w:b/>
-          <w:bCs/>
-        </w:rPr>
-        <w:t xml:space="preserve">Figure S1.</w:t>
-      </w:r>
-      <w:r>
-        <w:t xml:space="preserve"> </w:t>
-      </w:r>
-      <w:r>
-        <w:t xml:space="preserve">Neiman interassemblage-distance result. (A) Within-assemblage diversity against mean interassemblage distance, with Parkin starred. The weak negative association (Spearman rho = -0.28, not significant) is directionally consistent with the drift signature Neiman (1995) reported at rho = -0.62, not with the positive relationship that bounded, assorting groups would produce. (B) Mean within-bin interassemblage distance along the CA seriation axis. Between-assemblage divergence does not grow toward contact (rho = +0.37, not significant).</w:t>
-      </w:r>
-    </w:p>
-    <w:bookmarkEnd w:id="60"/>
-    <w:bookmarkStart w:id="61" w:name="X1e1c56b7070e82b7ccff3b34d2f446c77d2b944"/>
-    <w:p>
-      <w:pPr>
-        <w:pStyle w:val="Heading3"/>
-      </w:pPr>
-      <w:r>
-        <w:t xml:space="preserve">The F_ST-led reduction is a property of the record, not the generator</w:t>
-      </w:r>
-    </w:p>
-    <w:p>
-      <w:pPr>
-        <w:pStyle w:val="FirstParagraph"/>
-      </w:pPr>
-      <w:r>
-        <w:t xml:space="preserve">The recovery experiment injects group closure as between-cluster divergence, which is what cultural F_ST measures, so a fair objection is that the experiment merely certifies an F_ST detector recovering an F_ST-shaped signal. We tested this by injecting closure through two further channels, each matched to a different signature, and asking which signature recovers each. A within-group conformity channel raises conformity in a single undivided pool with no between-group divergence, the channel that the neutral departure is built to detect. A non-spatial social channel assembles assemblages into social groups scrambled relative to the spatial clusters, the channel seriation coherence is built to detect. The result is one-sided, and in two ways. First, the conformity channel is recovered by no signature (the neutral departure, which should detect it, inverts rather than rises), and the non-spatial social channel is not recovered by seriation either. Hence, the neutral and seriation signatures fail to register an injected signal even through the channel each is designed for. Second, F_ST is not a clean spatial-divergence detector but a near-omnibus one, responding to group structure, however it is organized. It recovers the spatial-divergence channel strongly (mean trend rising from the null to +0.76 at strong injection) and also recovers the non-spatial social channel (+0.77), because both ultimately raise between-group variance somewhere the partition can see it. The four signatures are therefore not four independent channels, even in this diagnostic. The only one that registers an injected signal at this resolution is F_ST, and it does so for divergence. However, its signal is organized. The reduction to F_ST is a property of the record’s resolution, 29 time-averaged assemblages rarefied to a common count over ten aggregated types, not an artifact of a generator whose closure axis is collinear with F_ST. A rarefaction-depth sweep (the weak signatures climb modestly with more sherds but remain well below F_ST) and a cluster-count sweep (the spatial signature stays weak through k = 5) confirm that the limitation is the record’s size and time-averaging rather than a single tuning choice. The consequence, stated in the Discussion, is that the negative bounds only result in divergence-channel closure. A closure carried purely by conformity or by a non-spatially organized social structure is below detection here at any strength.</w:t>
-      </w:r>
-    </w:p>
-    <w:bookmarkEnd w:id="61"/>
-    <w:bookmarkStart w:id="65" w:name="X901292badd8b907c0b9a36349da4326a6d932c8"/>
-    <w:p>
-      <w:pPr>
-        <w:pStyle w:val="Heading3"/>
-      </w:pPr>
-      <w:r>
-        <w:t xml:space="preserve">Positive control: the basin matches neutral spatial drift</w:t>
-      </w:r>
-    </w:p>
-    <w:p>
-      <w:pPr>
-        <w:pStyle w:val="FirstParagraph"/>
-      </w:pPr>
-      <w:r>
-        <w:t xml:space="preserve">To test what process the basin’s structure matches, rather than only which process it fails to show, we simulated neutral cultural drift on the real coordinate layout of the 29 assemblages, following the finite-population network-drift model of Lipo, DiNapoli, Madsen, and Hunt</w:t>
-      </w:r>
-      <w:r>
-        <w:t xml:space="preserve"> </w:t>
-      </w:r>
-      <w:r>
-        <w:t xml:space="preserve">(Lipo et al. 2021)</w:t>
-      </w:r>
-      <w:r>
-        <w:t xml:space="preserve">. Each assemblage is a node holding a finite population of learners that copies decorated-type variants within the node and, at a low rate, from other nodes with a probability that decays with geographic distance, with innovation and the record’s trailing-window time-averaging imposed. We compared this neutral model against a bounded-groups model in which interactions are concentrated within spatially contiguous groups, with only a small leak between them, both run on the same coordinates and rarefied to the observed per-assemblage counts. We swept the interaction range (6, 12, and 24 km), the between-node mixing rate (0.02, 0.05, and 0.20), and the innovation rate (0.005, 0.01, and 0.02), in both snapshot and time-averaged form, at 100 seeds per cell, recording for each cell whether the four observed statistics fall inside the neutral null. Across the time-averaged sweep, the region that brackets all four at once is the low-mixing, sub-basin-range corner (24 km, mixing 0.02, innovation 0.01), as reported in Figure S5. At shorter ranges, drift over-produces the distance decay. At higher mixing, it underproduces the structure, so the all-four match holds only in a plausible but specific region of parameter space rather than across the whole parameter space. In every cell, the bounded-groups model overshoots the three structural statistics by roughly two to seven times relative to the observed values, so the contrast between drift, which can reproduce the data, and bounded groups, which cannot, is robust even where the all-four drift match is not. The control also demonstrates that the distance-controlled boundary excess, near zero under smooth deterministic isolation by distance, takes substantial positive values under stochastic neutral drift, so a positive boundary excess does not by itself distinguish a social boundary from drift on a finite network.</w:t>
-      </w:r>
-    </w:p>
-    <w:p>
-      <w:pPr>
-        <w:pStyle w:val="CaptionedFigure"/>
-      </w:pPr>
-      <w:r>
-        <w:drawing>
-          <wp:inline>
-            <wp:extent cx="5334000" cy="3619056"/>
-            <wp:effectExtent b="0" l="0" r="0" t="0"/>
-            <wp:docPr descr="Figure S5. Spatial drift versus bounded groups on the basin geography. Top: the four observed signatures (vertical lines) against the null distributions produced by a neutral spatial-drift model (blue) and a bounded-groups model (orange) on the real coordinate layout, both time-averaged and rarefied to the observed counts. Observed values fall inside the drift distribution and far below the bounded-groups distribution for modularity, boundary excess, and cultural F_ST. Bottom: multidimensional scaling of decorated dissimilarity for the observed assemblages and one realization of each model, spatial drift reproducing the weak, spatially blurred structure while bounded groups produce a sharper split than the data show." title="" id="63" name="Picture"/>
-            <a:graphic>
-              <a:graphicData uri="http://schemas.openxmlformats.org/drawingml/2006/picture">
-                <pic:pic>
-                  <pic:nvPicPr>
-                    <pic:cNvPr descr="../../figures/figS5_drift_vs_groups.png" id="64" name="Picture"/>
-                    <pic:cNvPicPr>
-                      <a:picLocks noChangeArrowheads="1" noChangeAspect="1"/>
-                    </pic:cNvPicPr>
-                  </pic:nvPicPr>
-                  <pic:blipFill>
-                    <a:blip r:embed="rId62"/>
-                    <a:stretch>
-                      <a:fillRect/>
-                    </a:stretch>
-                  </pic:blipFill>
-                  <pic:spPr bwMode="auto">
-                    <a:xfrm>
-                      <a:off x="0" y="0"/>
-                      <a:ext cx="5334000" cy="3619056"/>
-                    </a:xfrm>
-                    <a:prstGeom prst="rect">
-                      <a:avLst/>
-                    </a:prstGeom>
-                    <a:noFill/>
-                    <a:ln w="9525">
-                      <a:noFill/>
-                      <a:headEnd/>
-                      <a:tailEnd/>
-                    </a:ln>
-                  </pic:spPr>
-                </pic:pic>
-              </a:graphicData>
-            </a:graphic>
-          </wp:inline>
-        </w:drawing>
-      </w:r>
-    </w:p>
-    <w:p>
-      <w:pPr>
-        <w:pStyle w:val="ImageCaption"/>
-      </w:pPr>
-      <w:r>
-        <w:rPr>
-          <w:b/>
-          <w:bCs/>
-        </w:rPr>
-        <w:t xml:space="preserve">Figure S5.</w:t>
-      </w:r>
-      <w:r>
-        <w:t xml:space="preserve"> </w:t>
-      </w:r>
-      <w:r>
-        <w:t xml:space="preserve">Spatial drift versus bounded groups on the basin geography. Top: the four observed signatures (vertical lines) against the null distributions produced by a neutral spatial-drift model (blue) and a bounded-groups model (orange) on the real coordinate layout, both time-averaged and rarefied to the observed counts. Observed values fall inside the drift distribution and far below the bounded-groups distribution for modularity, boundary excess, and cultural F_ST. Bottom: multidimensional scaling of decorated dissimilarity for the observed assemblages and one realization of each model, spatial drift reproducing the weak, spatially blurred structure while bounded groups produce a sharper split than the data show.</w:t>
-      </w:r>
-    </w:p>
-    <w:bookmarkEnd w:id="65"/>
-    <w:bookmarkStart w:id="69" w:name="X4b657c0117a02bedc64d2fce6fe36b11976cd64"/>
-    <w:p>
-      <w:pPr>
-        <w:pStyle w:val="Heading3"/>
-      </w:pPr>
-      <w:r>
-        <w:t xml:space="preserve">Regional extension: the central-valley and lower-valley assemblages</w:t>
-      </w:r>
-    </w:p>
-    <w:p>
-      <w:pPr>
-        <w:pStyle w:val="FirstParagraph"/>
-      </w:pPr>
-      <w:r>
-        <w:t xml:space="preserve">We extended the analysis to the southeast Missouri survey assemblages of Williams</w:t>
-      </w:r>
-      <w:r>
-        <w:t xml:space="preserve"> </w:t>
-      </w:r>
-      <w:r>
-        <w:t xml:space="preserve">(Williams 1954)</w:t>
-      </w:r>
-      <w:r>
-        <w:t xml:space="preserve">, comprising 50 collections from 28 sites, digitized from the survey tables and georeferenced using the Lower Mississippi Survey grid. Within the central-valley regions, the decorated-ceramic differentiation is a Woodland-to-Mississippian composition gradient rather than a synchronic structure: a cultural F_ST of 0.11 across physiographic regions collapses to 0.04, near the drift level, once the analysis is restricted to Mississippian types. Between the central and lower valleys, the Phillips-Ford-Griffin assemblages present a different picture. Combining the two into one north-south transect of 133 decorated assemblages, the decline of decorated similarity with distance is itself drift-consistent (Mantel r = -0.55, inside the spatial-drift null). Still, the distance-controlled boundary excess at the central-valley and lower-valley divide is +52 Brainerd-Robinson units, far outside the drift null. The two regions carry mutually exclusive, distinctive repertoires (northern Wickliffe, O’Byam, Matthews, Kimmswick, and Varney Red against southern Barton, Walls Engraved, Carson Red-on-Buff, Avenue Polychrome, and Leland), with even the shared types differing in proportion. Restricting the comparison to types present in both regions, which removes the mutually exclusive distinctive types that carry the strongest temporal contrast, reduces the step but does not erase it: the boundary excess falls to +38 Brainerd-Robinson units. It remains above the neutral-drift null, so the boundary is not solely an artifact of distinctive-type turnover, although the shared types themselves retain some temporal structure. The step is real but confounded by time, because the northern distinctive types are early- to middle-Mississippian and the southern are late</w:t>
-      </w:r>
-      <w:r>
-        <w:t xml:space="preserve"> </w:t>
-      </w:r>
-      <w:r>
-        <w:t xml:space="preserve">(Phillips 1970; Williams 1954)</w:t>
-      </w:r>
-      <w:r>
-        <w:t xml:space="preserve">, so it cannot be separated from a chronological succession without independent central-valley radiocarbon (Figure S6). It is further confounded by analytical history: the lower-valley assemblages were classified in the Phillips-Ford-Griffin tradition, and the central-valley assemblages were classified separately by Williams, so even shared type names may have been applied to different criteria. The shared-type restriction (boundary excess falling to +38 Brainerd-Robinson units but not vanishing) limits this artifact without removing it, leaving open the possibility that the interaction was continuous across the entire region and that the apparent boundary is a product of two separate collection and analysis histories.</w:t>
-      </w:r>
-    </w:p>
-    <w:p>
-      <w:pPr>
-        <w:pStyle w:val="CaptionedFigure"/>
-      </w:pPr>
-      <w:r>
-        <w:drawing>
-          <wp:inline>
-            <wp:extent cx="5334000" cy="3424782"/>
-            <wp:effectExtent b="0" l="0" r="0" t="0"/>
-            <wp:docPr descr="Figure S6. The central-valley and lower-valley transect. Left: the georeferenced decorated assemblages, central-valley (Williams 1954, blue) and lower-valley (Phillips-Ford-Griffin, orange), with the latitudinal gap between the blocks. Right: distance-decay of decorated Brainerd-Robinson similarity across the transect, within-region and between-region pairs distinguished. Similarity declines smoothly with distance as neutral drift predicts, but within-region pairs are markedly more similar than between-region pairs at matched distance, the step at the boundary." title="" id="67" name="Picture"/>
-            <a:graphic>
-              <a:graphicData uri="http://schemas.openxmlformats.org/drawingml/2006/picture">
-                <pic:pic>
-                  <pic:nvPicPr>
-                    <pic:cNvPr descr="../../figures/figS6_macro_transect.png" id="68" name="Picture"/>
-                    <pic:cNvPicPr>
-                      <a:picLocks noChangeArrowheads="1" noChangeAspect="1"/>
-                    </pic:cNvPicPr>
-                  </pic:nvPicPr>
-                  <pic:blipFill>
-                    <a:blip r:embed="rId66"/>
-                    <a:stretch>
-                      <a:fillRect/>
-                    </a:stretch>
-                  </pic:blipFill>
-                  <pic:spPr bwMode="auto">
-                    <a:xfrm>
-                      <a:off x="0" y="0"/>
-                      <a:ext cx="5334000" cy="3424782"/>
-                    </a:xfrm>
-                    <a:prstGeom prst="rect">
-                      <a:avLst/>
-                    </a:prstGeom>
-                    <a:noFill/>
-                    <a:ln w="9525">
-                      <a:noFill/>
-                      <a:headEnd/>
-                      <a:tailEnd/>
-                    </a:ln>
-                  </pic:spPr>
-                </pic:pic>
-              </a:graphicData>
-            </a:graphic>
-          </wp:inline>
-        </w:drawing>
-      </w:r>
-    </w:p>
-    <w:p>
-      <w:pPr>
-        <w:pStyle w:val="ImageCaption"/>
-      </w:pPr>
-      <w:r>
-        <w:rPr>
-          <w:b/>
-          <w:bCs/>
-        </w:rPr>
-        <w:t xml:space="preserve">Figure S6.</w:t>
-      </w:r>
-      <w:r>
-        <w:t xml:space="preserve"> </w:t>
-      </w:r>
-      <w:r>
-        <w:t xml:space="preserve">The central-valley and lower-valley transect. Left: the georeferenced decorated assemblages, central-valley (Williams 1954, blue) and lower-valley (Phillips-Ford-Griffin, orange), with the latitudinal gap between the blocks. Right: distance-decay of decorated Brainerd-Robinson similarity across the transect, within-region and between-region pairs distinguished. Similarity declines smoothly with distance as neutral drift predicts, but within-region pairs are markedly more similar than between-region pairs at matched distance, the step at the boundary.</w:t>
-      </w:r>
-    </w:p>
-    <w:bookmarkEnd w:id="69"/>
-    <w:bookmarkStart w:id="73" w:name="X61b4c874ea32e31666b882bda5fae1d71873809"/>
-    <w:p>
-      <w:pPr>
-        <w:pStyle w:val="Heading3"/>
-      </w:pPr>
-      <w:r>
-        <w:t xml:space="preserve">Dynamic-sufficiency tests in the time domain</w:t>
-      </w:r>
-    </w:p>
-    <w:p>
-      <w:pPr>
-        <w:pStyle w:val="FirstParagraph"/>
-      </w:pPr>
-      <w:r>
-        <w:t xml:space="preserve">The four convergence signatures are read as states along the seriation sequence, so on their own they are only partially dynamically sufficient. Two further tests work on the transformation between states, and a third, underpowered probe is reported in the code for completeness. The two we rely on are dynamically and empirically sufficient at once, because each models the change between states while respecting the time-averaged resolution of the record.</w:t>
-      </w:r>
-    </w:p>
-    <w:p>
-      <w:pPr>
-        <w:pStyle w:val="BodyText"/>
-      </w:pPr>
-      <w:r>
-        <w:t xml:space="preserve">The first infers how potters were copying by simulation. We run many copying scenarios, ranging from strongly conformist to neutral to novelty-seeking, and keep only the ones that reproduce the real collections, then read off the kind of copying implied by the surviving scenarios, with the record’s time-averaging built into each simulation (the approximate-Bayesian-computation approach)</w:t>
-      </w:r>
-      <w:r>
-        <w:t xml:space="preserve"> </w:t>
-      </w:r>
-      <w:r>
-        <w:t xml:space="preserve">(Crema et al. 2016)</w:t>
-      </w:r>
-      <w:r>
-        <w:t xml:space="preserve">. We modeled the basin sequence as frequency-dependent copying among the ten decorated types in a finite population. Each generation, the adoption weight of a type is proportional to its frequency raised to the power</w:t>
-      </w:r>
-      <w:r>
-        <w:t xml:space="preserve"> </w:t>
-      </w:r>
-      <m:oMath>
-        <m:r>
-          <m:t>1</m:t>
-        </m:r>
-        <m:r>
-          <m:rPr>
-            <m:sty m:val="p"/>
-          </m:rPr>
-          <m:t>+</m:t>
-        </m:r>
-        <m:r>
-          <m:t>b</m:t>
-        </m:r>
-      </m:oMath>
-      <w:r>
-        <w:t xml:space="preserve">, where</w:t>
-      </w:r>
-      <w:r>
-        <w:t xml:space="preserve"> </w:t>
-      </w:r>
-      <m:oMath>
-        <m:r>
-          <m:t>b</m:t>
-        </m:r>
-        <m:r>
-          <m:rPr>
-            <m:sty m:val="p"/>
-          </m:rPr>
-          <m:t>&gt;</m:t>
-        </m:r>
-        <m:r>
-          <m:t>0</m:t>
-        </m:r>
-      </m:oMath>
-      <w:r>
-        <w:t xml:space="preserve"> </w:t>
-      </w:r>
-      <w:r>
-        <w:t xml:space="preserve">is conformity,</w:t>
-      </w:r>
-      <w:r>
-        <w:t xml:space="preserve"> </w:t>
-      </w:r>
-      <m:oMath>
-        <m:r>
-          <m:t>b</m:t>
-        </m:r>
-        <m:r>
-          <m:rPr>
-            <m:sty m:val="p"/>
-          </m:rPr>
-          <m:t>&lt;</m:t>
-        </m:r>
-        <m:r>
-          <m:t>0</m:t>
-        </m:r>
-      </m:oMath>
-      <w:r>
-        <w:t xml:space="preserve"> </w:t>
-      </w:r>
-      <w:r>
-        <w:t xml:space="preserve">is anti-conformity, and</w:t>
-      </w:r>
-      <w:r>
-        <w:t xml:space="preserve"> </w:t>
-      </w:r>
-      <m:oMath>
-        <m:r>
-          <m:t>b</m:t>
-        </m:r>
-        <m:r>
-          <m:rPr>
-            <m:sty m:val="p"/>
-          </m:rPr>
-          <m:t>=</m:t>
-        </m:r>
-        <m:r>
-          <m:t>0</m:t>
-        </m:r>
-      </m:oMath>
-      <w:r>
-        <w:t xml:space="preserve"> </w:t>
-      </w:r>
-      <w:r>
-        <w:t xml:space="preserve">is neutral copying, with an innovation rate that mixes in a uniform draw from the set of types. An assemblage pools production over a window of generations, so the time-averaging that distorts the static statistics is built into the generative process rather than corrected after the fact. This is what makes the test both empirically and dynamically sufficient. We drew 40,000 parameter sets from broad priors (innovation rate, bias</w:t>
-      </w:r>
-      <w:r>
-        <w:t xml:space="preserve"> </w:t>
-      </w:r>
-      <m:oMath>
-        <m:r>
-          <m:t>b</m:t>
-        </m:r>
-      </m:oMath>
-      <w:r>
-        <w:t xml:space="preserve">, population size, and time-averaging window), simulated a six-bin sequence from each, and accepted the 400 parameter sets closest to the observed diversity trajectory and rank-frequency profile, ranked by Euclidean distance over the summary statistics. The posterior of the bias is tightly constrained near neutral, with mean</w:t>
-      </w:r>
-      <w:r>
-        <w:t xml:space="preserve"> </w:t>
-      </w:r>
-      <m:oMath>
-        <m:r>
-          <m:t>b</m:t>
-        </m:r>
-        <m:r>
-          <m:rPr>
-            <m:sty m:val="p"/>
-          </m:rPr>
-          <m:t>=</m:t>
-        </m:r>
-        <m:r>
-          <m:rPr>
-            <m:sty m:val="p"/>
-          </m:rPr>
-          <m:t>+</m:t>
-        </m:r>
-        <m:r>
-          <m:t>0.028</m:t>
-        </m:r>
-      </m:oMath>
-      <w:r>
-        <w:t xml:space="preserve"> </w:t>
-      </w:r>
-      <w:r>
-        <w:t xml:space="preserve">and a 95 percent interval of</w:t>
-      </w:r>
-      <w:r>
-        <w:t xml:space="preserve"> </w:t>
-      </w:r>
-      <m:oMath>
-        <m:r>
-          <m:rPr>
-            <m:sty m:val="p"/>
-          </m:rPr>
-          <m:t>−</m:t>
-        </m:r>
-        <m:r>
-          <m:t>0.021</m:t>
-        </m:r>
-      </m:oMath>
-      <w:r>
-        <w:t xml:space="preserve"> </w:t>
-      </w:r>
-      <w:r>
-        <w:t xml:space="preserve">to</w:t>
-      </w:r>
-      <w:r>
-        <w:t xml:space="preserve"> </w:t>
-      </w:r>
-      <m:oMath>
-        <m:r>
-          <m:rPr>
-            <m:sty m:val="p"/>
-          </m:rPr>
-          <m:t>+</m:t>
-        </m:r>
-        <m:r>
-          <m:t>0.063</m:t>
-        </m:r>
-      </m:oMath>
-      <w:r>
-        <w:t xml:space="preserve"> </w:t>
-      </w:r>
-      <w:r>
-        <w:t xml:space="preserve">that includes zero (Figure S4A). The posterior standard deviation is 0.021 against a prior of 0.289, so the data appreciably constrain the bias rather than leaving it at the prior, placing it close to neutral. A weak conformist lean is visible, with</w:t>
-      </w:r>
-      <w:r>
-        <w:t xml:space="preserve"> </w:t>
-      </w:r>
-      <m:oMath>
-        <m:r>
-          <m:t>P</m:t>
-        </m:r>
-        <m:r>
-          <m:rPr>
-            <m:sty m:val="p"/>
-          </m:rPr>
-          <m:t>(</m:t>
-        </m:r>
-        <m:r>
-          <m:t>b</m:t>
-        </m:r>
-        <m:r>
-          <m:rPr>
-            <m:sty m:val="p"/>
-          </m:rPr>
-          <m:t>&gt;</m:t>
-        </m:r>
-        <m:r>
-          <m:t>0</m:t>
-        </m:r>
-        <m:r>
-          <m:rPr>
-            <m:sty m:val="p"/>
-          </m:rPr>
-          <m:t>)</m:t>
-        </m:r>
-        <m:r>
-          <m:rPr>
-            <m:sty m:val="p"/>
-          </m:rPr>
-          <m:t>=</m:t>
-        </m:r>
-        <m:r>
-          <m:t>0.91</m:t>
-        </m:r>
-      </m:oMath>
-      <w:r>
-        <w:t xml:space="preserve">, but it is not resolved as a departure from neutral, and refitting the bias separately to the early and late halves of the sequence recovers no shift between them. The inference rules out the strong conformist bias that a marker- or assortment-based dynamic would require by modeling copying dynamics rather than a single static moment. The posterior contraction should be read with one caveat: rejection sampling at a one percent acceptance tolerance is not formally calibrated here, so we present this inference as concordant with the record-matched recovery and the static signatures rather than as a standalone result.</w:t>
-      </w:r>
-    </w:p>
-    <w:p>
-      <w:pPr>
-        <w:pStyle w:val="BodyText"/>
-      </w:pPr>
-      <w:r>
-        <w:t xml:space="preserve">The second test asks, in plain terms, whether the collections’ diversity drifts aimlessly through time, heads steadily in one direction, or is pulled back toward a stable value, by comparing four standard time-series models (an unbiased random walk, a directional walk, stasis, and a mean-reverting Ornstein-Uhlenbeck process)</w:t>
-      </w:r>
-      <w:r>
-        <w:t xml:space="preserve"> </w:t>
-      </w:r>
-      <w:r>
-        <w:t xml:space="preserve">(Hunt 2006; Hunt et al. 2008)</w:t>
-      </w:r>
-      <w:r>
-        <w:t xml:space="preserve">. For the Gini-Simpson diversity trajectory and for the abundant decorated types, binned along the oriented axis, we fit on the same level vector an unbiased random walk (Brownian motion, the neutral-drift expectation), a general biased random walk (the directional signature a sustained transition would leave), a stasis model (white noise about a constant mean), and an Ornstein-Uhlenbeck model (mean reversion toward an optimum), and compared them by the small-sample Akaike information criterion. The aggregate diversity trajectory favors the unbiased random walk, with an Akaike weight of 0.81 against 0.19 for the directional model and negligible weight for stasis or the Ornstein-Uhlenbeck model. The model comparison has only six points, so it is weak. This result is a concordance rather than a decisive selection (Figure S4B). The diversity trajectory is the trait of interest here, because the correspondence-analysis ordering does not arrange it by construction. Individual-type trajectories more often favor the directional model. That comparison, however, is weak and partly tautological because the seriation axis is designed to maximize monotonic type-frequency turnover, and only three types are abundant enough across the sequence to fit. The robust reading is neutral drift, not a sustained directional transition.</w:t>
-      </w:r>
-    </w:p>
-    <w:p>
-      <w:pPr>
-        <w:pStyle w:val="CaptionedFigure"/>
-      </w:pPr>
-      <w:r>
-        <w:drawing>
-          <wp:inline>
-            <wp:extent cx="5334000" cy="2794140"/>
-            <wp:effectExtent b="0" l="0" r="0" t="0"/>
-            <wp:docPr descr="Figure S2. Dynamic-sufficiency tests. (A) Posterior of the transmission-bias parameter b from the generative, time-averaging-aware inference (b = 0 neutral, b &gt; 0 conformist, b &lt; 0 anti-conformist). The whole-sequence posterior (filled) and the early- and late-half posteriors (outlines) are all tightly constrained near neutral and include zero, ruling out the strong conformity a marker dynamic would require. (B) Tempo-and-mode Akaike weights of the four time-series models (BM unbiased random walk, GRW directional walk, Stasis, OU mean reversion) for the Gini-Simpson diversity trajectory and averaged across the abundant type trajectories. The diversity trajectory, which the correspondence-analysis ordering does not arrange by construction, favors the unbiased random walk (neutral drift), a concordance rather than a decisive selection given only six points." title="" id="71" name="Picture"/>
-            <a:graphic>
-              <a:graphicData uri="http://schemas.openxmlformats.org/drawingml/2006/picture">
-                <pic:pic>
-                  <pic:nvPicPr>
-                    <pic:cNvPr descr="../../figures/figS2_dynamic.png" id="72" name="Picture"/>
-                    <pic:cNvPicPr>
-                      <a:picLocks noChangeArrowheads="1" noChangeAspect="1"/>
-                    </pic:cNvPicPr>
-                  </pic:nvPicPr>
-                  <pic:blipFill>
-                    <a:blip r:embed="rId70"/>
-                    <a:stretch>
-                      <a:fillRect/>
-                    </a:stretch>
-                  </pic:blipFill>
-                  <pic:spPr bwMode="auto">
-                    <a:xfrm>
-                      <a:off x="0" y="0"/>
-                      <a:ext cx="5334000" cy="2794140"/>
-                    </a:xfrm>
-                    <a:prstGeom prst="rect">
-                      <a:avLst/>
-                    </a:prstGeom>
-                    <a:noFill/>
-                    <a:ln w="9525">
-                      <a:noFill/>
-                      <a:headEnd/>
-                      <a:tailEnd/>
-                    </a:ln>
-                  </pic:spPr>
-                </pic:pic>
-              </a:graphicData>
-            </a:graphic>
-          </wp:inline>
-        </w:drawing>
-      </w:r>
-    </w:p>
-    <w:p>
-      <w:pPr>
-        <w:pStyle w:val="ImageCaption"/>
-      </w:pPr>
-      <w:r>
-        <w:rPr>
-          <w:b/>
-          <w:bCs/>
-        </w:rPr>
-        <w:t xml:space="preserve">Figure S2.</w:t>
-      </w:r>
-      <w:r>
-        <w:t xml:space="preserve"> </w:t>
-      </w:r>
-      <w:r>
-        <w:t xml:space="preserve">Dynamic-sufficiency tests. (A) Posterior of the transmission-bias parameter b from the generative, time-averaging-aware inference (b = 0 neutral, b &gt; 0 conformist, b &lt; 0 anti-conformist). The whole-sequence posterior (filled) and the early- and late-half posteriors (outlines) are all tightly constrained near neutral and include zero, ruling out the strong conformity a marker dynamic would require. (B) Tempo-and-mode Akaike weights of the four time-series models (BM unbiased random walk, GRW directional walk, Stasis, OU mean reversion) for the Gini-Simpson diversity trajectory and averaged across the abundant type trajectories. The diversity trajectory, which the correspondence-analysis ordering does not arrange by construction, favors the unbiased random walk (neutral drift), a concordance rather than a decisive selection given only six points.</w:t>
-      </w:r>
-    </w:p>
-    <w:p>
-      <w:pPr>
-        <w:pStyle w:val="BodyText"/>
-      </w:pPr>
-      <w:r>
-        <w:t xml:space="preserve">A third probe, for the early-warning signature of a critical transition, is underpowered at this ordinal resolution and does not meet empirical sufficiency: across the correspondence-analysis-ordered sequence the rolling variance shows no rising trend (Kendall tau</w:t>
-      </w:r>
-      <w:r>
-        <w:t xml:space="preserve"> </w:t>
-      </w:r>
-      <m:oMath>
-        <m:r>
-          <m:rPr>
-            <m:sty m:val="p"/>
-          </m:rPr>
-          <m:t>=</m:t>
-        </m:r>
-        <m:r>
-          <m:rPr>
-            <m:sty m:val="p"/>
-          </m:rPr>
-          <m:t>−</m:t>
-        </m:r>
-        <m:r>
-          <m:t>0.03</m:t>
-        </m:r>
-      </m:oMath>
-      <w:r>
-        <w:t xml:space="preserve">) and the lone rise in lag-1 autocorrelation (tau</w:t>
-      </w:r>
-      <w:r>
-        <w:t xml:space="preserve"> </w:t>
-      </w:r>
-      <m:oMath>
-        <m:r>
-          <m:rPr>
-            <m:sty m:val="p"/>
-          </m:rPr>
-          <m:t>=</m:t>
-        </m:r>
-        <m:r>
-          <m:rPr>
-            <m:sty m:val="p"/>
-          </m:rPr>
-          <m:t>+</m:t>
-        </m:r>
-        <m:r>
-          <m:t>0.78</m:t>
-        </m:r>
-      </m:oMath>
-      <w:r>
-        <w:t xml:space="preserve">) is an artifact of the ordering, which places compositionally similar assemblages adjacent, so we report it in the supplementary code but do not rely on it</w:t>
-      </w:r>
-      <w:r>
-        <w:t xml:space="preserve"> </w:t>
-      </w:r>
-      <w:r>
-        <w:t xml:space="preserve">(Dakos et al. 2012; Scheffer et al. 2009)</w:t>
-      </w:r>
-      <w:r>
-        <w:t xml:space="preserve">.</w:t>
-      </w:r>
-    </w:p>
-    <w:bookmarkEnd w:id="73"/>
-    <w:bookmarkStart w:id="77" w:name="radiocarbon-chronology"/>
-    <w:p>
-      <w:pPr>
-        <w:pStyle w:val="Heading3"/>
-      </w:pPr>
-      <w:r>
-        <w:t xml:space="preserve">Radiocarbon chronology</w:t>
-      </w:r>
-    </w:p>
-    <w:p>
-      <w:pPr>
-        <w:pStyle w:val="FirstParagraph"/>
-      </w:pPr>
-      <w:r>
-        <w:t xml:space="preserve">We calibrated the Mainfort compilation of central-valley determinations against IntCal20</w:t>
-      </w:r>
-      <w:r>
-        <w:t xml:space="preserve"> </w:t>
-      </w:r>
-      <w:r>
-        <w:t xml:space="preserve">(Mainfort 2001)</w:t>
-      </w:r>
-      <w:r>
-        <w:t xml:space="preserve">. Forty-one determinations come from seven St. Francis Basin Parkin-phase sites, nineteen of them from Parkin. The summed probability distribution of the basin dates concentrates the occupation in the fourteenth to sixteenth centuries, with a median of AD 1422 (Parkin alone, AD 1483), and declines across the contact interval: 29 percent of the basin probability mass postdates AD 1541 and 18 percent postdates AD 1600 (Figure S3). This is consistent with occupation continuing through the De Soto entrada, which the chronicles place at Casqui, and declining thereafter, rather than with a sequence running unbroken into the seventeenth century. However, the protohistoric tail is partly a calibration artifact of low-activity determinations near the post-1650 plateau. To test the assumption that the seriation axis tracks calendar time, we pooled the dates of the five proveniences matching curated assemblages. We correlated their pooled median calibrated ages with CA1 position: Spearman’s r = +0.70 (n = 5, 27 dates pooled), with four sites in calendar order and one late-dated site, Clay Hill, departing from it. The orientation of the axis toward later time is supported but not certain, and we treat directional statements as provisional throughout.</w:t>
-      </w:r>
-    </w:p>
-    <w:p>
-      <w:pPr>
-        <w:pStyle w:val="CaptionedFigure"/>
-      </w:pPr>
-      <w:r>
-        <w:drawing>
-          <wp:inline>
-            <wp:extent cx="5334000" cy="2715284"/>
-            <wp:effectExtent b="0" l="0" r="0" t="0"/>
-            <wp:docPr descr="Figure S3. Radiocarbon chronology of the St. Francis basin (Mainfort determinations calibrated against IntCal20). Left: summed probability distribution for the basin Parkin-phase sites (filled) and for Parkin alone (line, scaled), with the De Soto entrada (AD 1541) marked. Occupation concentrates in the fourteenth to sixteenth centuries and declines across contact. Right: CA1 seriation position against the pooled median calibrated age for the five proveniences matching curated assemblages (point size proportional to the number of dates). The axis tracks calendar age (Spearman +0.70) except for the late-dated Clay Hill." title="" id="75" name="Picture"/>
-            <a:graphic>
-              <a:graphicData uri="http://schemas.openxmlformats.org/drawingml/2006/picture">
-                <pic:pic>
-                  <pic:nvPicPr>
-                    <pic:cNvPr descr="../../figures/figS3_chronology.png" id="76" name="Picture"/>
-                    <pic:cNvPicPr>
-                      <a:picLocks noChangeArrowheads="1" noChangeAspect="1"/>
-                    </pic:cNvPicPr>
-                  </pic:nvPicPr>
-                  <pic:blipFill>
-                    <a:blip r:embed="rId74"/>
-                    <a:stretch>
-                      <a:fillRect/>
-                    </a:stretch>
-                  </pic:blipFill>
-                  <pic:spPr bwMode="auto">
-                    <a:xfrm>
-                      <a:off x="0" y="0"/>
-                      <a:ext cx="5334000" cy="2715284"/>
-                    </a:xfrm>
-                    <a:prstGeom prst="rect">
-                      <a:avLst/>
-                    </a:prstGeom>
-                    <a:noFill/>
-                    <a:ln w="9525">
-                      <a:noFill/>
-                      <a:headEnd/>
-                      <a:tailEnd/>
-                    </a:ln>
-                  </pic:spPr>
-                </pic:pic>
-              </a:graphicData>
-            </a:graphic>
-          </wp:inline>
-        </w:drawing>
-      </w:r>
-    </w:p>
-    <w:p>
-      <w:pPr>
-        <w:pStyle w:val="ImageCaption"/>
-      </w:pPr>
-      <w:r>
-        <w:rPr>
-          <w:b/>
-          <w:bCs/>
-        </w:rPr>
-        <w:t xml:space="preserve">Figure S3.</w:t>
-      </w:r>
-      <w:r>
-        <w:t xml:space="preserve"> </w:t>
-      </w:r>
-      <w:r>
-        <w:t xml:space="preserve">Radiocarbon chronology of the St. Francis basin (Mainfort determinations calibrated against IntCal20). Left: summed probability distribution for the basin Parkin-phase sites (filled) and for Parkin alone (line, scaled), with the De Soto entrada (AD 1541) marked. Occupation concentrates in the fourteenth to sixteenth centuries and declines across contact. Right: CA1 seriation position against the pooled median calibrated age for the five proveniences matching curated assemblages (point size proportional to the number of dates). The axis tracks calendar age (Spearman +0.70) except for the late-dated Clay Hill.</w:t>
-      </w:r>
-    </w:p>
-    <w:bookmarkEnd w:id="77"/>
-    <w:bookmarkEnd w:id="78"/>
-    <w:bookmarkStart w:id="142" w:name="references"/>
+    <w:bookmarkStart w:id="131" w:name="references"/>
     <w:p>
       <w:pPr>
         <w:pStyle w:val="Heading2"/>
@@ -4173,8 +2272,8 @@
         <w:t xml:space="preserve">References</w:t>
       </w:r>
     </w:p>
-    <w:bookmarkStart w:id="141" w:name="refs"/>
-    <w:bookmarkStart w:id="80" w:name="ref-bell_richerson_mcelreath_2009"/>
+    <w:bookmarkStart w:id="130" w:name="refs"/>
+    <w:bookmarkStart w:id="54" w:name="ref-bell_richerson_mcelreath_2009"/>
     <w:p>
       <w:pPr>
         <w:pStyle w:val="Bibliography"/>
@@ -4201,7 +2300,7 @@
       <w:r>
         <w:t xml:space="preserve"> </w:t>
       </w:r>
-      <w:hyperlink r:id="rId79">
+      <w:hyperlink r:id="rId53">
         <w:r>
           <w:rPr>
             <w:rStyle w:val="Hyperlink"/>
@@ -4213,13 +2312,53 @@
         <w:t xml:space="preserve">.</w:t>
       </w:r>
     </w:p>
-    <w:bookmarkEnd w:id="80"/>
-    <w:bookmarkStart w:id="82" w:name="ref-bentley_hahn_shennan_2004"/>
+    <w:bookmarkEnd w:id="54"/>
+    <w:bookmarkStart w:id="56" w:name="ref-bentley_2008"/>
     <w:p>
       <w:pPr>
         <w:pStyle w:val="Bibliography"/>
       </w:pPr>
       <w:r>
+        <w:t xml:space="preserve">Bentley, R. Alexander. 2008. Random Drift Versus Selection in Academic Vocabulary: An Evolutionary Analysis of Published Keywords.</w:t>
+      </w:r>
+      <w:r>
+        <w:t xml:space="preserve"> </w:t>
+      </w:r>
+      <w:r>
+        <w:rPr>
+          <w:i/>
+          <w:iCs/>
+        </w:rPr>
+        <w:t xml:space="preserve">PLoS ONE</w:t>
+      </w:r>
+      <w:r>
+        <w:t xml:space="preserve"> </w:t>
+      </w:r>
+      <w:r>
+        <w:t xml:space="preserve">3(8):e3057.</w:t>
+      </w:r>
+      <w:r>
+        <w:t xml:space="preserve"> </w:t>
+      </w:r>
+      <w:hyperlink r:id="rId55">
+        <w:r>
+          <w:rPr>
+            <w:rStyle w:val="Hyperlink"/>
+          </w:rPr>
+          <w:t xml:space="preserve">https://doi.org/10.1371/journal.pone.0003057</w:t>
+        </w:r>
+      </w:hyperlink>
+      <w:r>
+        <w:t xml:space="preserve">.</w:t>
+      </w:r>
+    </w:p>
+    <w:bookmarkEnd w:id="56"/>
+    <w:bookmarkStart w:id="58" w:name="ref-bentley_hahn_shennan_2004"/>
+    <w:p>
+      <w:pPr>
+        <w:pStyle w:val="Bibliography"/>
+      </w:pPr>
+      <w:r>
         <w:t xml:space="preserve">Bentley, R. Alexander, Matthew W. Hahn, and Stephen J. Shennan. 2004. Random Drift and Culture Change.</w:t>
       </w:r>
       <w:r>
@@ -4241,7 +2380,7 @@
       <w:r>
         <w:t xml:space="preserve"> </w:t>
       </w:r>
-      <w:hyperlink r:id="rId81">
+      <w:hyperlink r:id="rId57">
         <w:r>
           <w:rPr>
             <w:rStyle w:val="Hyperlink"/>
@@ -4253,8 +2392,8 @@
         <w:t xml:space="preserve">.</w:t>
       </w:r>
     </w:p>
-    <w:bookmarkEnd w:id="82"/>
-    <w:bookmarkStart w:id="83" w:name="ref-binford_1981"/>
+    <w:bookmarkEnd w:id="58"/>
+    <w:bookmarkStart w:id="59" w:name="ref-binford_1981"/>
     <w:p>
       <w:pPr>
         <w:pStyle w:val="Bibliography"/>
@@ -4294,13 +2433,77 @@
         <w:t xml:space="preserve">37(3):195–208.</w:t>
       </w:r>
     </w:p>
-    <w:bookmarkEnd w:id="83"/>
-    <w:bookmarkStart w:id="84" w:name="ref-cobb_2000"/>
+    <w:bookmarkEnd w:id="59"/>
+    <w:bookmarkStart w:id="61" w:name="ref-carrignon_bentley_ruck_2019"/>
     <w:p>
       <w:pPr>
         <w:pStyle w:val="Bibliography"/>
       </w:pPr>
       <w:r>
+        <w:t xml:space="preserve">Carrignon, Simon, R. Alexander Bentley, and Damian Ruck. 2019. Modelling Rapid Online Cultural Transmission: Evaluating Neutral Models on</w:t>
+      </w:r>
+      <w:r>
+        <w:t xml:space="preserve"> </w:t>
+      </w:r>
+      <w:r>
+        <w:t xml:space="preserve">Twitter</w:t>
+      </w:r>
+      <w:r>
+        <w:t xml:space="preserve"> </w:t>
+      </w:r>
+      <w:r>
+        <w:t xml:space="preserve">Data with Approximate</w:t>
+      </w:r>
+      <w:r>
+        <w:t xml:space="preserve"> </w:t>
+      </w:r>
+      <w:r>
+        <w:t xml:space="preserve">Bayesian</w:t>
+      </w:r>
+      <w:r>
+        <w:t xml:space="preserve"> </w:t>
+      </w:r>
+      <w:r>
+        <w:t xml:space="preserve">Computation.</w:t>
+      </w:r>
+      <w:r>
+        <w:t xml:space="preserve"> </w:t>
+      </w:r>
+      <w:r>
+        <w:rPr>
+          <w:i/>
+          <w:iCs/>
+        </w:rPr>
+        <w:t xml:space="preserve">Palgrave Communications</w:t>
+      </w:r>
+      <w:r>
+        <w:t xml:space="preserve"> </w:t>
+      </w:r>
+      <w:r>
+        <w:t xml:space="preserve">5:83.</w:t>
+      </w:r>
+      <w:r>
+        <w:t xml:space="preserve"> </w:t>
+      </w:r>
+      <w:hyperlink r:id="rId60">
+        <w:r>
+          <w:rPr>
+            <w:rStyle w:val="Hyperlink"/>
+          </w:rPr>
+          <w:t xml:space="preserve">https://doi.org/10.1057/s41599-019-0295-9</w:t>
+        </w:r>
+      </w:hyperlink>
+      <w:r>
+        <w:t xml:space="preserve">.</w:t>
+      </w:r>
+    </w:p>
+    <w:bookmarkEnd w:id="61"/>
+    <w:bookmarkStart w:id="62" w:name="ref-cobb_2000"/>
+    <w:p>
+      <w:pPr>
+        <w:pStyle w:val="Bibliography"/>
+      </w:pPr>
+      <w:r>
         <w:t xml:space="preserve">Cobb, Charles R. 2000.</w:t>
       </w:r>
       <w:r>
@@ -4345,8 +2548,8 @@
         <w:t xml:space="preserve">. University of Alabama Press, Tuscaloosa.</w:t>
       </w:r>
     </w:p>
-    <w:bookmarkEnd w:id="84"/>
-    <w:bookmarkStart w:id="85" w:name="ref-cobb_butler_2002"/>
+    <w:bookmarkEnd w:id="62"/>
+    <w:bookmarkStart w:id="63" w:name="ref-cobb_butler_2002"/>
     <w:p>
       <w:pPr>
         <w:pStyle w:val="Bibliography"/>
@@ -4395,8 +2598,8 @@
         <w:t xml:space="preserve">67(4):625–641.</w:t>
       </w:r>
     </w:p>
-    <w:bookmarkEnd w:id="85"/>
-    <w:bookmarkStart w:id="87" w:name="ref-crema_bortolini_lake_2023"/>
+    <w:bookmarkEnd w:id="63"/>
+    <w:bookmarkStart w:id="65" w:name="ref-crema_bortolini_lake_2023"/>
     <w:p>
       <w:pPr>
         <w:pStyle w:val="Bibliography"/>
@@ -4423,7 +2626,7 @@
       <w:r>
         <w:t xml:space="preserve"> </w:t>
       </w:r>
-      <w:hyperlink r:id="rId86">
+      <w:hyperlink r:id="rId64">
         <w:r>
           <w:rPr>
             <w:rStyle w:val="Hyperlink"/>
@@ -4435,8 +2638,8 @@
         <w:t xml:space="preserve">.</w:t>
       </w:r>
     </w:p>
-    <w:bookmarkEnd w:id="87"/>
-    <w:bookmarkStart w:id="89" w:name="ref-crema_kandler_shennan_2016"/>
+    <w:bookmarkEnd w:id="65"/>
+    <w:bookmarkStart w:id="67" w:name="ref-crema_kandler_shennan_2016"/>
     <w:p>
       <w:pPr>
         <w:pStyle w:val="Bibliography"/>
@@ -4463,7 +2666,7 @@
       <w:r>
         <w:t xml:space="preserve"> </w:t>
       </w:r>
-      <w:hyperlink r:id="rId88">
+      <w:hyperlink r:id="rId66">
         <w:r>
           <w:rPr>
             <w:rStyle w:val="Hyperlink"/>
@@ -4475,8 +2678,8 @@
         <w:t xml:space="preserve">.</w:t>
       </w:r>
     </w:p>
-    <w:bookmarkEnd w:id="89"/>
-    <w:bookmarkStart w:id="91" w:name="ref-dakos_2012"/>
+    <w:bookmarkEnd w:id="67"/>
+    <w:bookmarkStart w:id="69" w:name="ref-dakos_2012"/>
     <w:p>
       <w:pPr>
         <w:pStyle w:val="Bibliography"/>
@@ -4503,7 +2706,7 @@
       <w:r>
         <w:t xml:space="preserve"> </w:t>
       </w:r>
-      <w:hyperlink r:id="rId90">
+      <w:hyperlink r:id="rId68">
         <w:r>
           <w:rPr>
             <w:rStyle w:val="Hyperlink"/>
@@ -4515,8 +2718,8 @@
         <w:t xml:space="preserve">.</w:t>
       </w:r>
     </w:p>
-    <w:bookmarkEnd w:id="91"/>
-    <w:bookmarkStart w:id="92" w:name="ref-dunnell_1995"/>
+    <w:bookmarkEnd w:id="69"/>
+    <w:bookmarkStart w:id="70" w:name="ref-dunnell_1995"/>
     <w:p>
       <w:pPr>
         <w:pStyle w:val="Bibliography"/>
@@ -4538,39 +2741,13 @@
         <w:t xml:space="preserve">, edited by Patrice A. Teltser, pp. 33–50. University of Arizona Press, Tucson.</w:t>
       </w:r>
     </w:p>
-    <w:bookmarkEnd w:id="92"/>
-    <w:bookmarkStart w:id="93" w:name="ref-ewens_1972"/>
+    <w:bookmarkEnd w:id="70"/>
+    <w:bookmarkStart w:id="72" w:name="ref-feder_kryazhimskiy_plotkin_2014"/>
     <w:p>
       <w:pPr>
         <w:pStyle w:val="Bibliography"/>
       </w:pPr>
       <w:r>
-        <w:t xml:space="preserve">Ewens, Warren J. 1972. The Sampling Theory of Selectively Neutral Alleles.</w:t>
-      </w:r>
-      <w:r>
-        <w:t xml:space="preserve"> </w:t>
-      </w:r>
-      <w:r>
-        <w:rPr>
-          <w:i/>
-          <w:iCs/>
-        </w:rPr>
-        <w:t xml:space="preserve">Theoretical Population Biology</w:t>
-      </w:r>
-      <w:r>
-        <w:t xml:space="preserve"> </w:t>
-      </w:r>
-      <w:r>
-        <w:t xml:space="preserve">3(1):87–112.</w:t>
-      </w:r>
-    </w:p>
-    <w:bookmarkEnd w:id="93"/>
-    <w:bookmarkStart w:id="95" w:name="ref-feder_kryazhimskiy_plotkin_2014"/>
-    <w:p>
-      <w:pPr>
-        <w:pStyle w:val="Bibliography"/>
-      </w:pPr>
-      <w:r>
         <w:t xml:space="preserve">Feder, Alison F., Sergey Kryazhimskiy, and Joshua B. Plotkin. 2014. Identifying Signatures of Selection in Genetic Time Series.</w:t>
       </w:r>
       <w:r>
@@ -4592,7 +2769,7 @@
       <w:r>
         <w:t xml:space="preserve"> </w:t>
       </w:r>
-      <w:hyperlink r:id="rId94">
+      <w:hyperlink r:id="rId71">
         <w:r>
           <w:rPr>
             <w:rStyle w:val="Hyperlink"/>
@@ -4604,13 +2781,53 @@
         <w:t xml:space="preserve">.</w:t>
       </w:r>
     </w:p>
-    <w:bookmarkEnd w:id="95"/>
-    <w:bookmarkStart w:id="96" w:name="ref-fox_1998"/>
+    <w:bookmarkEnd w:id="72"/>
+    <w:bookmarkStart w:id="74" w:name="ref-fogarty_kandler_creanza_2024"/>
     <w:p>
       <w:pPr>
         <w:pStyle w:val="Bibliography"/>
       </w:pPr>
       <w:r>
+        <w:t xml:space="preserve">Fogarty, Laurel, Anne Kandler, Nicole Creanza, and Marcus W. Feldman. 2024. Half a Century of Quantitative Cultural Evolution.</w:t>
+      </w:r>
+      <w:r>
+        <w:t xml:space="preserve"> </w:t>
+      </w:r>
+      <w:r>
+        <w:rPr>
+          <w:i/>
+          <w:iCs/>
+        </w:rPr>
+        <w:t xml:space="preserve">Proceedings of the National Academy of Sciences</w:t>
+      </w:r>
+      <w:r>
+        <w:t xml:space="preserve"> </w:t>
+      </w:r>
+      <w:r>
+        <w:t xml:space="preserve">121(48):e2418106121.</w:t>
+      </w:r>
+      <w:r>
+        <w:t xml:space="preserve"> </w:t>
+      </w:r>
+      <w:hyperlink r:id="rId73">
+        <w:r>
+          <w:rPr>
+            <w:rStyle w:val="Hyperlink"/>
+          </w:rPr>
+          <w:t xml:space="preserve">https://doi.org/10.1073/pnas.2418106121</w:t>
+        </w:r>
+      </w:hyperlink>
+      <w:r>
+        <w:t xml:space="preserve">.</w:t>
+      </w:r>
+    </w:p>
+    <w:bookmarkEnd w:id="74"/>
+    <w:bookmarkStart w:id="75" w:name="ref-fox_1998"/>
+    <w:p>
+      <w:pPr>
+        <w:pStyle w:val="Bibliography"/>
+      </w:pPr>
+      <w:r>
         <w:t xml:space="preserve">Fox, Gregory L. 1998. An Examination of Mississippian-Period Phases in Southeastern Missouri. In</w:t>
       </w:r>
       <w:r>
@@ -4627,8 +2844,8 @@
         <w:t xml:space="preserve">, edited by Michael J. O’Brien and Robert C. Dunnell, pp. 31–58. University of Alabama Press, Tuscaloosa.</w:t>
       </w:r>
     </w:p>
-    <w:bookmarkEnd w:id="96"/>
-    <w:bookmarkStart w:id="97" w:name="ref-holdaway_wandsnider_2008"/>
+    <w:bookmarkEnd w:id="75"/>
+    <w:bookmarkStart w:id="76" w:name="ref-holdaway_wandsnider_2008"/>
     <w:p>
       <w:pPr>
         <w:pStyle w:val="Bibliography"/>
@@ -4650,8 +2867,8 @@
         <w:t xml:space="preserve">. University of Utah Press, Salt Lake City.</w:t>
       </w:r>
     </w:p>
-    <w:bookmarkEnd w:id="97"/>
-    <w:bookmarkStart w:id="98" w:name="ref-hudson_smith_depratter_1990"/>
+    <w:bookmarkEnd w:id="76"/>
+    <w:bookmarkStart w:id="77" w:name="ref-hudson_smith_depratter_1990"/>
     <w:p>
       <w:pPr>
         <w:pStyle w:val="Bibliography"/>
@@ -4711,8 +2928,8 @@
         <w:t xml:space="preserve">, edited by David H. Dye and Cheryl Anne Cox, pp. 181–207. University of Alabama Press, Tuscaloosa.</w:t>
       </w:r>
     </w:p>
-    <w:bookmarkEnd w:id="98"/>
-    <w:bookmarkStart w:id="100" w:name="ref-hunt_2006"/>
+    <w:bookmarkEnd w:id="77"/>
+    <w:bookmarkStart w:id="79" w:name="ref-hunt_2006"/>
     <w:p>
       <w:pPr>
         <w:pStyle w:val="Bibliography"/>
@@ -4739,7 +2956,7 @@
       <w:r>
         <w:t xml:space="preserve"> </w:t>
       </w:r>
-      <w:hyperlink r:id="rId99">
+      <w:hyperlink r:id="rId78">
         <w:r>
           <w:rPr>
             <w:rStyle w:val="Hyperlink"/>
@@ -4751,8 +2968,8 @@
         <w:t xml:space="preserve">.</w:t>
       </w:r>
     </w:p>
-    <w:bookmarkEnd w:id="100"/>
-    <w:bookmarkStart w:id="102" w:name="ref-hunt_bell_travis_2008"/>
+    <w:bookmarkEnd w:id="79"/>
+    <w:bookmarkStart w:id="81" w:name="ref-hunt_bell_travis_2008"/>
     <w:p>
       <w:pPr>
         <w:pStyle w:val="Bibliography"/>
@@ -4779,7 +2996,7 @@
       <w:r>
         <w:t xml:space="preserve"> </w:t>
       </w:r>
-      <w:hyperlink r:id="rId101">
+      <w:hyperlink r:id="rId80">
         <w:r>
           <w:rPr>
             <w:rStyle w:val="Hyperlink"/>
@@ -4791,8 +3008,8 @@
         <w:t xml:space="preserve">.</w:t>
       </w:r>
     </w:p>
-    <w:bookmarkEnd w:id="102"/>
-    <w:bookmarkStart w:id="104" w:name="ref-kandler_shennan_2013"/>
+    <w:bookmarkEnd w:id="81"/>
+    <w:bookmarkStart w:id="83" w:name="ref-kandler_shennan_2013"/>
     <w:p>
       <w:pPr>
         <w:pStyle w:val="Bibliography"/>
@@ -4819,7 +3036,7 @@
       <w:r>
         <w:t xml:space="preserve"> </w:t>
       </w:r>
-      <w:hyperlink r:id="rId103">
+      <w:hyperlink r:id="rId82">
         <w:r>
           <w:rPr>
             <w:rStyle w:val="Hyperlink"/>
@@ -4831,13 +3048,65 @@
         <w:t xml:space="preserve">.</w:t>
       </w:r>
     </w:p>
-    <w:bookmarkEnd w:id="104"/>
-    <w:bookmarkStart w:id="106" w:name="ref-kandler_wilder_fortunato_2017"/>
+    <w:bookmarkEnd w:id="83"/>
+    <w:bookmarkStart w:id="85" w:name="ref-kandler_shennan_2015"/>
     <w:p>
       <w:pPr>
         <w:pStyle w:val="Bibliography"/>
       </w:pPr>
       <w:r>
+        <w:t xml:space="preserve">Kandler, Anne, and Stephen Shennan. 2015. A Generative Inference Framework for Analysing Patterns of Cultural Change in Sparse Population Data with Evidence for Fashion Trends in</w:t>
+      </w:r>
+      <w:r>
+        <w:t xml:space="preserve"> </w:t>
+      </w:r>
+      <w:r>
+        <w:t xml:space="preserve">LBK</w:t>
+      </w:r>
+      <w:r>
+        <w:t xml:space="preserve"> </w:t>
+      </w:r>
+      <w:r>
+        <w:t xml:space="preserve">Culture.</w:t>
+      </w:r>
+      <w:r>
+        <w:t xml:space="preserve"> </w:t>
+      </w:r>
+      <w:r>
+        <w:rPr>
+          <w:i/>
+          <w:iCs/>
+        </w:rPr>
+        <w:t xml:space="preserve">Journal of the Royal Society Interface</w:t>
+      </w:r>
+      <w:r>
+        <w:t xml:space="preserve"> </w:t>
+      </w:r>
+      <w:r>
+        <w:t xml:space="preserve">12(113):20150905.</w:t>
+      </w:r>
+      <w:r>
+        <w:t xml:space="preserve"> </w:t>
+      </w:r>
+      <w:hyperlink r:id="rId84">
+        <w:r>
+          <w:rPr>
+            <w:rStyle w:val="Hyperlink"/>
+          </w:rPr>
+          <w:t xml:space="preserve">https://doi.org/10.1098/rsif.2015.0905</w:t>
+        </w:r>
+      </w:hyperlink>
+      <w:r>
+        <w:t xml:space="preserve">.</w:t>
+      </w:r>
+    </w:p>
+    <w:bookmarkEnd w:id="85"/>
+    <w:bookmarkStart w:id="87" w:name="ref-kandler_wilder_fortunato_2017"/>
+    <w:p>
+      <w:pPr>
+        <w:pStyle w:val="Bibliography"/>
+      </w:pPr>
+      <w:r>
         <w:t xml:space="preserve">Kandler, Anne, Bryan Wilder, and Laura Fortunato. 2017. Inferring Individual-Level Processes from Population-Level Patterns in Cultural Evolution.</w:t>
       </w:r>
       <w:r>
@@ -4859,7 +3128,7 @@
       <w:r>
         <w:t xml:space="preserve"> </w:t>
       </w:r>
-      <w:hyperlink r:id="rId105">
+      <w:hyperlink r:id="rId86">
         <w:r>
           <w:rPr>
             <w:rStyle w:val="Hyperlink"/>
@@ -4871,8 +3140,8 @@
         <w:t xml:space="preserve">.</w:t>
       </w:r>
     </w:p>
-    <w:bookmarkEnd w:id="106"/>
-    <w:bookmarkStart w:id="108" w:name="ref-kidwell_tomasovych_2013"/>
+    <w:bookmarkEnd w:id="87"/>
+    <w:bookmarkStart w:id="89" w:name="ref-kidwell_tomasovych_2013"/>
     <w:p>
       <w:pPr>
         <w:pStyle w:val="Bibliography"/>
@@ -4899,7 +3168,7 @@
       <w:r>
         <w:t xml:space="preserve"> </w:t>
       </w:r>
-      <w:hyperlink r:id="rId107">
+      <w:hyperlink r:id="rId88">
         <w:r>
           <w:rPr>
             <w:rStyle w:val="Hyperlink"/>
@@ -4911,8 +3180,8 @@
         <w:t xml:space="preserve">.</w:t>
       </w:r>
     </w:p>
-    <w:bookmarkEnd w:id="108"/>
-    <w:bookmarkStart w:id="109" w:name="ref-king_freer_1995"/>
+    <w:bookmarkEnd w:id="89"/>
+    <w:bookmarkStart w:id="90" w:name="ref-king_freer_1995"/>
     <w:p>
       <w:pPr>
         <w:pStyle w:val="Bibliography"/>
@@ -4946,8 +3215,8 @@
         <w:t xml:space="preserve">, edited by Michael S. Nassaney and Kenneth E. Sassaman, pp. 266–288. University of Tennessee Press, Knoxville.</w:t>
       </w:r>
     </w:p>
-    <w:bookmarkEnd w:id="109"/>
-    <w:bookmarkStart w:id="110" w:name="ref-lewontin_1974"/>
+    <w:bookmarkEnd w:id="90"/>
+    <w:bookmarkStart w:id="91" w:name="ref-lewontin_1974"/>
     <w:p>
       <w:pPr>
         <w:pStyle w:val="Bibliography"/>
@@ -4969,8 +3238,8 @@
         <w:t xml:space="preserve">. Columbia University Press, New York.</w:t>
       </w:r>
     </w:p>
-    <w:bookmarkEnd w:id="110"/>
-    <w:bookmarkStart w:id="111" w:name="ref-lipo_2001"/>
+    <w:bookmarkEnd w:id="91"/>
+    <w:bookmarkStart w:id="92" w:name="ref-lipo_2001"/>
     <w:p>
       <w:pPr>
         <w:pStyle w:val="Bibliography"/>
@@ -5020,8 +3289,8 @@
         <w:t xml:space="preserve">. BAR International Series 918. Archaeopress, Oxford.</w:t>
       </w:r>
     </w:p>
-    <w:bookmarkEnd w:id="111"/>
-    <w:bookmarkStart w:id="113" w:name="ref-lipo_dinapoli_madsen_hunt_2021"/>
+    <w:bookmarkEnd w:id="92"/>
+    <w:bookmarkStart w:id="94" w:name="ref-lipo_dinapoli_madsen_hunt_2021"/>
     <w:p>
       <w:pPr>
         <w:pStyle w:val="Bibliography"/>
@@ -5048,7 +3317,7 @@
       <w:r>
         <w:t xml:space="preserve"> </w:t>
       </w:r>
-      <w:hyperlink r:id="rId112">
+      <w:hyperlink r:id="rId93">
         <w:r>
           <w:rPr>
             <w:rStyle w:val="Hyperlink"/>
@@ -5060,8 +3329,8 @@
         <w:t xml:space="preserve">.</w:t>
       </w:r>
     </w:p>
-    <w:bookmarkEnd w:id="113"/>
-    <w:bookmarkStart w:id="114" w:name="ref-lipo_dunnell_2007"/>
+    <w:bookmarkEnd w:id="94"/>
+    <w:bookmarkStart w:id="95" w:name="ref-lipo_dunnell_2007"/>
     <w:p>
       <w:pPr>
         <w:pStyle w:val="Bibliography"/>
@@ -5089,7 +3358,7 @@
           <w:i/>
           <w:iCs/>
         </w:rPr>
-        <w:t xml:space="preserve">Settlement Patterns and Subsistence Systems in the Lower</w:t>
+        <w:t xml:space="preserve">Time’s River: Archaeological Syntheses from the Lower</w:t>
       </w:r>
       <w:r>
         <w:rPr>
@@ -5120,11 +3389,11 @@
         <w:t xml:space="preserve">Valley</w:t>
       </w:r>
       <w:r>
-        <w:t xml:space="preserve">, pp. 125–167.</w:t>
-      </w:r>
-    </w:p>
-    <w:bookmarkEnd w:id="114"/>
-    <w:bookmarkStart w:id="116" w:name="ref-lipo_madsen_dunnell_2015"/>
+        <w:t xml:space="preserve">, edited by Janet Rafferty and Evan Peacock, pp. 125–167. University of Alabama Press, Tuscaloosa.</w:t>
+      </w:r>
+    </w:p>
+    <w:bookmarkEnd w:id="95"/>
+    <w:bookmarkStart w:id="97" w:name="ref-lipo_madsen_dunnell_2015"/>
     <w:p>
       <w:pPr>
         <w:pStyle w:val="Bibliography"/>
@@ -5151,7 +3420,7 @@
       <w:r>
         <w:t xml:space="preserve"> </w:t>
       </w:r>
-      <w:hyperlink r:id="rId115">
+      <w:hyperlink r:id="rId96">
         <w:r>
           <w:rPr>
             <w:rStyle w:val="Hyperlink"/>
@@ -5163,23 +3432,140 @@
         <w:t xml:space="preserve">.</w:t>
       </w:r>
     </w:p>
-    <w:bookmarkEnd w:id="116"/>
-    <w:bookmarkStart w:id="117" w:name="ref-madsen_2012"/>
+    <w:bookmarkEnd w:id="97"/>
+    <w:bookmarkStart w:id="99" w:name="ref-holland-lulewicz_2019"/>
     <w:p>
       <w:pPr>
         <w:pStyle w:val="Bibliography"/>
       </w:pPr>
       <w:r>
-        <w:t xml:space="preserve">Madsen, Mark E. 2012. Neutral Cultural Transmission in Time Averaged Archaeological Assemblages.</w:t>
-      </w:r>
-    </w:p>
-    <w:bookmarkEnd w:id="117"/>
-    <w:bookmarkStart w:id="118" w:name="ref-mainfort_2001"/>
+        <w:t xml:space="preserve">Lulewicz, Jacob. 2019. The Social Networks and Structural Variation of</w:t>
+      </w:r>
+      <w:r>
+        <w:t xml:space="preserve"> </w:t>
+      </w:r>
+      <w:r>
+        <w:t xml:space="preserve">Mississippian</w:t>
+      </w:r>
+      <w:r>
+        <w:t xml:space="preserve"> </w:t>
+      </w:r>
+      <w:r>
+        <w:t xml:space="preserve">Sociopolitics in the Southeastern</w:t>
+      </w:r>
+      <w:r>
+        <w:t xml:space="preserve"> </w:t>
+      </w:r>
+      <w:r>
+        <w:t xml:space="preserve">United</w:t>
+      </w:r>
+      <w:r>
+        <w:t xml:space="preserve"> </w:t>
+      </w:r>
+      <w:r>
+        <w:t xml:space="preserve">States</w:t>
+      </w:r>
+      <w:r>
+        <w:t xml:space="preserve">.</w:t>
+      </w:r>
+      <w:r>
+        <w:t xml:space="preserve"> </w:t>
+      </w:r>
+      <w:r>
+        <w:rPr>
+          <w:i/>
+          <w:iCs/>
+        </w:rPr>
+        <w:t xml:space="preserve">Proceedings of the National Academy of Sciences</w:t>
+      </w:r>
+      <w:r>
+        <w:t xml:space="preserve"> </w:t>
+      </w:r>
+      <w:r>
+        <w:t xml:space="preserve">116(14):6707–6712.</w:t>
+      </w:r>
+      <w:r>
+        <w:t xml:space="preserve"> </w:t>
+      </w:r>
+      <w:hyperlink r:id="rId98">
+        <w:r>
+          <w:rPr>
+            <w:rStyle w:val="Hyperlink"/>
+          </w:rPr>
+          <w:t xml:space="preserve">https://doi.org/10.1073/pnas.1818346116</w:t>
+        </w:r>
+      </w:hyperlink>
+      <w:r>
+        <w:t xml:space="preserve">.</w:t>
+      </w:r>
+    </w:p>
+    <w:bookmarkEnd w:id="99"/>
+    <w:bookmarkStart w:id="100" w:name="ref-madsen_2012"/>
     <w:p>
       <w:pPr>
         <w:pStyle w:val="Bibliography"/>
       </w:pPr>
       <w:r>
+        <w:t xml:space="preserve">Madsen, Mark E. 2012. Neutral Cultural Transmission in Time-Averaged Archaeological Assemblages. arXiv preprint arXiv:1204.2043 [physics.soc-ph].</w:t>
+      </w:r>
+    </w:p>
+    <w:bookmarkEnd w:id="100"/>
+    <w:bookmarkStart w:id="101" w:name="ref-mainfort_1996"/>
+    <w:p>
+      <w:pPr>
+        <w:pStyle w:val="Bibliography"/>
+      </w:pPr>
+      <w:r>
+        <w:t xml:space="preserve">Mainfort, Jr., Robert C. 1996. Late Period Chronology in the Central</w:t>
+      </w:r>
+      <w:r>
+        <w:t xml:space="preserve"> </w:t>
+      </w:r>
+      <w:r>
+        <w:t xml:space="preserve">Mississippi</w:t>
+      </w:r>
+      <w:r>
+        <w:t xml:space="preserve"> </w:t>
+      </w:r>
+      <w:r>
+        <w:t xml:space="preserve">Valley: A Western</w:t>
+      </w:r>
+      <w:r>
+        <w:t xml:space="preserve"> </w:t>
+      </w:r>
+      <w:r>
+        <w:t xml:space="preserve">Tennessee</w:t>
+      </w:r>
+      <w:r>
+        <w:t xml:space="preserve"> </w:t>
+      </w:r>
+      <w:r>
+        <w:t xml:space="preserve">Perspective.</w:t>
+      </w:r>
+      <w:r>
+        <w:t xml:space="preserve"> </w:t>
+      </w:r>
+      <w:r>
+        <w:rPr>
+          <w:i/>
+          <w:iCs/>
+        </w:rPr>
+        <w:t xml:space="preserve">Southeastern Archaeology</w:t>
+      </w:r>
+      <w:r>
+        <w:t xml:space="preserve"> </w:t>
+      </w:r>
+      <w:r>
+        <w:t xml:space="preserve">15(2):172–181.</w:t>
+      </w:r>
+    </w:p>
+    <w:bookmarkEnd w:id="101"/>
+    <w:bookmarkStart w:id="102" w:name="ref-mainfort_2001"/>
+    <w:p>
+      <w:pPr>
+        <w:pStyle w:val="Bibliography"/>
+      </w:pPr>
+      <w:r>
         <w:t xml:space="preserve">Mainfort, Jr., Robert C. 2001. The Late Prehistoric and Protohistoric Periods in the Central</w:t>
       </w:r>
       <w:r>
@@ -5208,8 +3594,8 @@
         <w:t xml:space="preserve">, edited by David S. Brose, C. Wesley Cowan, and Jr. Mainfort Robert C., pp. 173–190. Smithsonian Institution Press, Washington, DC.</w:t>
       </w:r>
     </w:p>
-    <w:bookmarkEnd w:id="118"/>
-    <w:bookmarkStart w:id="119" w:name="ref-mainfort_2003"/>
+    <w:bookmarkEnd w:id="102"/>
+    <w:bookmarkStart w:id="103" w:name="ref-mainfort_2003"/>
     <w:p>
       <w:pPr>
         <w:pStyle w:val="Bibliography"/>
@@ -5246,13 +3632,64 @@
         <w:t xml:space="preserve">22(2):176–184.</w:t>
       </w:r>
     </w:p>
-    <w:bookmarkEnd w:id="119"/>
-    <w:bookmarkStart w:id="120" w:name="ref-mesoudi_2021"/>
+    <w:bookmarkEnd w:id="103"/>
+    <w:bookmarkStart w:id="104" w:name="ref-mcnutt_ed_1996"/>
     <w:p>
       <w:pPr>
         <w:pStyle w:val="Bibliography"/>
       </w:pPr>
       <w:r>
+        <w:t xml:space="preserve">McNutt, Charles H. (editor). 1996.</w:t>
+      </w:r>
+      <w:r>
+        <w:t xml:space="preserve"> </w:t>
+      </w:r>
+      <w:r>
+        <w:rPr>
+          <w:i/>
+          <w:iCs/>
+        </w:rPr>
+        <w:t xml:space="preserve">Prehistory of the Central</w:t>
+      </w:r>
+      <w:r>
+        <w:rPr>
+          <w:i/>
+          <w:iCs/>
+        </w:rPr>
+        <w:t xml:space="preserve"> </w:t>
+      </w:r>
+      <w:r>
+        <w:rPr>
+          <w:i/>
+          <w:iCs/>
+        </w:rPr>
+        <w:t xml:space="preserve">Mississippi</w:t>
+      </w:r>
+      <w:r>
+        <w:rPr>
+          <w:i/>
+          <w:iCs/>
+        </w:rPr>
+        <w:t xml:space="preserve"> </w:t>
+      </w:r>
+      <w:r>
+        <w:rPr>
+          <w:i/>
+          <w:iCs/>
+        </w:rPr>
+        <w:t xml:space="preserve">Valley</w:t>
+      </w:r>
+      <w:r>
+        <w:t xml:space="preserve">. University of Alabama Press, Tuscaloosa.</w:t>
+      </w:r>
+    </w:p>
+    <w:bookmarkEnd w:id="104"/>
+    <w:bookmarkStart w:id="105" w:name="ref-mesoudi_2021"/>
+    <w:p>
+      <w:pPr>
+        <w:pStyle w:val="Bibliography"/>
+      </w:pPr>
+      <w:r>
         <w:t xml:space="preserve">Mesoudi, Alex. 2021. Cultural Selection and Biased Transformation: Two Dynamics of Cultural Evolution.</w:t>
       </w:r>
       <w:r>
@@ -5272,8 +3709,8 @@
         <w:t xml:space="preserve">376:20200053.</w:t>
       </w:r>
     </w:p>
-    <w:bookmarkEnd w:id="120"/>
-    <w:bookmarkStart w:id="121" w:name="ref-mitchem_2001"/>
+    <w:bookmarkEnd w:id="105"/>
+    <w:bookmarkStart w:id="106" w:name="ref-mitchem_2001"/>
     <w:p>
       <w:pPr>
         <w:pStyle w:val="Bibliography"/>
@@ -5303,8 +3740,8 @@
         <w:t xml:space="preserve">.</w:t>
       </w:r>
     </w:p>
-    <w:bookmarkEnd w:id="121"/>
-    <w:bookmarkStart w:id="122" w:name="ref-morse_morse_1996"/>
+    <w:bookmarkEnd w:id="106"/>
+    <w:bookmarkStart w:id="107" w:name="ref-morse_morse_1996"/>
     <w:p>
       <w:pPr>
         <w:pStyle w:val="Bibliography"/>
@@ -5324,9 +3761,25 @@
       <w:r>
         <w:t xml:space="preserve">Valley Since 1983.</w:t>
       </w:r>
-    </w:p>
-    <w:bookmarkEnd w:id="122"/>
-    <w:bookmarkStart w:id="123" w:name="ref-morse_1990"/>
+      <w:r>
+        <w:t xml:space="preserve"> </w:t>
+      </w:r>
+      <w:r>
+        <w:rPr>
+          <w:i/>
+          <w:iCs/>
+        </w:rPr>
+        <w:t xml:space="preserve">North American Archaeologist</w:t>
+      </w:r>
+      <w:r>
+        <w:t xml:space="preserve"> </w:t>
+      </w:r>
+      <w:r>
+        <w:t xml:space="preserve">17(1):1–35.</w:t>
+      </w:r>
+    </w:p>
+    <w:bookmarkEnd w:id="107"/>
+    <w:bookmarkStart w:id="108" w:name="ref-morse_1990"/>
     <w:p>
       <w:pPr>
         <w:pStyle w:val="Bibliography"/>
@@ -5386,8 +3839,8 @@
         <w:t xml:space="preserve">, edited by David H. Dye and Cheryl Anne Cox, pp. 118–134. University of Alabama Press, Tuscaloosa.</w:t>
       </w:r>
     </w:p>
-    <w:bookmarkEnd w:id="123"/>
-    <w:bookmarkStart w:id="124" w:name="ref-neiman_1995"/>
+    <w:bookmarkEnd w:id="108"/>
+    <w:bookmarkStart w:id="109" w:name="ref-neiman_1995"/>
     <w:p>
       <w:pPr>
         <w:pStyle w:val="Bibliography"/>
@@ -5430,8 +3883,8 @@
         <w:t xml:space="preserve">60(1):7–36.</w:t>
       </w:r>
     </w:p>
-    <w:bookmarkEnd w:id="124"/>
-    <w:bookmarkStart w:id="125" w:name="ref-perreault_2019"/>
+    <w:bookmarkEnd w:id="109"/>
+    <w:bookmarkStart w:id="110" w:name="ref-perreault_2019"/>
     <w:p>
       <w:pPr>
         <w:pStyle w:val="Bibliography"/>
@@ -5453,8 +3906,8 @@
         <w:t xml:space="preserve">. University of Chicago Press, Chicago.</w:t>
       </w:r>
     </w:p>
-    <w:bookmarkEnd w:id="125"/>
-    <w:bookmarkStart w:id="126" w:name="ref-phillips_1970"/>
+    <w:bookmarkEnd w:id="110"/>
+    <w:bookmarkStart w:id="111" w:name="ref-phillips_1970"/>
     <w:p>
       <w:pPr>
         <w:pStyle w:val="Bibliography"/>
@@ -5525,8 +3978,8 @@
         <w:t xml:space="preserve">, Vol. 60. Papers of the Peabody Museum of Archaeology and Ethnology. Peabody Museum, Harvard University, Cambridge, MA.</w:t>
       </w:r>
     </w:p>
-    <w:bookmarkEnd w:id="126"/>
-    <w:bookmarkStart w:id="127" w:name="ref-phillips_ford_griffin_1951"/>
+    <w:bookmarkEnd w:id="111"/>
+    <w:bookmarkStart w:id="112" w:name="ref-phillips_ford_griffin_1951"/>
     <w:p>
       <w:pPr>
         <w:pStyle w:val="Bibliography"/>
@@ -5576,8 +4029,8 @@
         <w:t xml:space="preserve">, Vol. 25. Papers of the Peabody Museum of American Archaeology and Ethnology. Peabody Museum, Harvard University, Cambridge, MA.</w:t>
       </w:r>
     </w:p>
-    <w:bookmarkEnd w:id="127"/>
-    <w:bookmarkStart w:id="129" w:name="ref-premo_2014"/>
+    <w:bookmarkEnd w:id="112"/>
+    <w:bookmarkStart w:id="114" w:name="ref-premo_2014"/>
     <w:p>
       <w:pPr>
         <w:pStyle w:val="Bibliography"/>
@@ -5604,7 +4057,7 @@
       <w:r>
         <w:t xml:space="preserve"> </w:t>
       </w:r>
-      <w:hyperlink r:id="rId128">
+      <w:hyperlink r:id="rId113">
         <w:r>
           <w:rPr>
             <w:rStyle w:val="Hyperlink"/>
@@ -5616,8 +4069,8 @@
         <w:t xml:space="preserve">.</w:t>
       </w:r>
     </w:p>
-    <w:bookmarkEnd w:id="129"/>
-    <w:bookmarkStart w:id="130" w:name="ref-rees_political_culture"/>
+    <w:bookmarkEnd w:id="114"/>
+    <w:bookmarkStart w:id="115" w:name="ref-rees_political_culture"/>
     <w:p>
       <w:pPr>
         <w:pStyle w:val="Bibliography"/>
@@ -5641,14 +4094,54 @@
         <w:t xml:space="preserve">. Ph.D. dissertation, University of Oklahoma, Norman.</w:t>
       </w:r>
     </w:p>
-    <w:bookmarkEnd w:id="130"/>
-    <w:bookmarkStart w:id="131" w:name="ref-ross-stallings_2015"/>
+    <w:bookmarkEnd w:id="115"/>
+    <w:bookmarkStart w:id="117" w:name="ref-richerson_etal_2016"/>
     <w:p>
       <w:pPr>
         <w:pStyle w:val="Bibliography"/>
       </w:pPr>
       <w:r>
-        <w:t xml:space="preserve">Ross-Stallings, Nancy A. 2015. Center and Satellite Settlement Hierarchy and Diet on the Late Prehistoric</w:t>
+        <w:t xml:space="preserve">Richerson, Peter, Ryan Baldini, Adrian V. Bell, Kathryn Demps, Karl Frost, Vicken Hillis, Sarah Mathew, et al. 2016. Cultural Group Selection Plays an Essential Role in Explaining Human Cooperation: A Sketch of the Evidence.</w:t>
+      </w:r>
+      <w:r>
+        <w:t xml:space="preserve"> </w:t>
+      </w:r>
+      <w:r>
+        <w:rPr>
+          <w:i/>
+          <w:iCs/>
+        </w:rPr>
+        <w:t xml:space="preserve">Behavioral and Brain Sciences</w:t>
+      </w:r>
+      <w:r>
+        <w:t xml:space="preserve"> </w:t>
+      </w:r>
+      <w:r>
+        <w:t xml:space="preserve">39:e30.</w:t>
+      </w:r>
+      <w:r>
+        <w:t xml:space="preserve"> </w:t>
+      </w:r>
+      <w:hyperlink r:id="rId116">
+        <w:r>
+          <w:rPr>
+            <w:rStyle w:val="Hyperlink"/>
+          </w:rPr>
+          <w:t xml:space="preserve">https://doi.org/10.1017/S0140525X1400106X</w:t>
+        </w:r>
+      </w:hyperlink>
+      <w:r>
+        <w:t xml:space="preserve">.</w:t>
+      </w:r>
+    </w:p>
+    <w:bookmarkEnd w:id="117"/>
+    <w:bookmarkStart w:id="118" w:name="ref-ross-stallings_2017"/>
+    <w:p>
+      <w:pPr>
+        <w:pStyle w:val="Bibliography"/>
+      </w:pPr>
+      <w:r>
+        <w:t xml:space="preserve">Ross-Stallings, Nancy A. 2017. Center and Satellite: Settlement Hierarchy and Diet on the Late Prehistoric</w:t>
       </w:r>
       <w:r>
         <w:t xml:space="preserve"> </w:t>
@@ -5660,11 +4153,24 @@
         <w:t xml:space="preserve"> </w:t>
       </w:r>
       <w:r>
-        <w:t xml:space="preserve">Delta. In, pp. 329–362.</w:t>
-      </w:r>
-    </w:p>
-    <w:bookmarkEnd w:id="131"/>
-    <w:bookmarkStart w:id="133" w:name="ref-scheffer_2009"/>
+        <w:t xml:space="preserve">Delta. In</w:t>
+      </w:r>
+      <w:r>
+        <w:t xml:space="preserve"> </w:t>
+      </w:r>
+      <w:r>
+        <w:rPr>
+          <w:i/>
+          <w:iCs/>
+        </w:rPr>
+        <w:t xml:space="preserve">Bones of Complexity: Bioarchaeological Case Studies of Social Organization and Skeletal Biology</w:t>
+      </w:r>
+      <w:r>
+        <w:t xml:space="preserve">, edited by Haagen D. Klaus, Amanda R. Harvey, and Mark N. Cohen, pp. 329–362. University Press of Florida, Gainesville.</w:t>
+      </w:r>
+    </w:p>
+    <w:bookmarkEnd w:id="118"/>
+    <w:bookmarkStart w:id="120" w:name="ref-scheffer_2009"/>
     <w:p>
       <w:pPr>
         <w:pStyle w:val="Bibliography"/>
@@ -5691,7 +4197,7 @@
       <w:r>
         <w:t xml:space="preserve"> </w:t>
       </w:r>
-      <w:hyperlink r:id="rId132">
+      <w:hyperlink r:id="rId119">
         <w:r>
           <w:rPr>
             <w:rStyle w:val="Hyperlink"/>
@@ -5703,8 +4209,8 @@
         <w:t xml:space="preserve">.</w:t>
       </w:r>
     </w:p>
-    <w:bookmarkEnd w:id="133"/>
-    <w:bookmarkStart w:id="134" w:name="ref-schiffer_1972"/>
+    <w:bookmarkEnd w:id="120"/>
+    <w:bookmarkStart w:id="121" w:name="ref-schiffer_1972"/>
     <w:p>
       <w:pPr>
         <w:pStyle w:val="Bibliography"/>
@@ -5729,8 +4235,8 @@
         <w:t xml:space="preserve">37(2):156–165.</w:t>
       </w:r>
     </w:p>
-    <w:bookmarkEnd w:id="134"/>
-    <w:bookmarkStart w:id="135" w:name="ref-shennan_wilkinson_2001"/>
+    <w:bookmarkEnd w:id="121"/>
+    <w:bookmarkStart w:id="122" w:name="ref-shennan_wilkinson_2001"/>
     <w:p>
       <w:pPr>
         <w:pStyle w:val="Bibliography"/>
@@ -5770,13 +4276,77 @@
         <w:t xml:space="preserve">66(4):577–593.</w:t>
       </w:r>
     </w:p>
-    <w:bookmarkEnd w:id="135"/>
-    <w:bookmarkStart w:id="136" w:name="ref-tomasovych_kidwell_2009"/>
+    <w:bookmarkEnd w:id="122"/>
+    <w:bookmarkStart w:id="124" w:name="ref-sullivan_2024"/>
     <w:p>
       <w:pPr>
         <w:pStyle w:val="Bibliography"/>
       </w:pPr>
       <w:r>
+        <w:t xml:space="preserve">Sullivan, Lynne P., Kevin E. Smith, Scott C. Meeks, and Shawn M. Patch. 2024. Tracking</w:t>
+      </w:r>
+      <w:r>
+        <w:t xml:space="preserve"> </w:t>
+      </w:r>
+      <w:r>
+        <w:t xml:space="preserve">Mississippian</w:t>
+      </w:r>
+      <w:r>
+        <w:t xml:space="preserve"> </w:t>
+      </w:r>
+      <w:r>
+        <w:t xml:space="preserve">Migrations from the Central</w:t>
+      </w:r>
+      <w:r>
+        <w:t xml:space="preserve"> </w:t>
+      </w:r>
+      <w:r>
+        <w:t xml:space="preserve">Mississippi</w:t>
+      </w:r>
+      <w:r>
+        <w:t xml:space="preserve"> </w:t>
+      </w:r>
+      <w:r>
+        <w:t xml:space="preserve">Valley to the Ridge and Valley with a Unified Absolute Chronology.</w:t>
+      </w:r>
+      <w:r>
+        <w:t xml:space="preserve"> </w:t>
+      </w:r>
+      <w:r>
+        <w:rPr>
+          <w:i/>
+          <w:iCs/>
+        </w:rPr>
+        <w:t xml:space="preserve">American Antiquity</w:t>
+      </w:r>
+      <w:r>
+        <w:t xml:space="preserve"> </w:t>
+      </w:r>
+      <w:r>
+        <w:t xml:space="preserve">89(2):221–237.</w:t>
+      </w:r>
+      <w:r>
+        <w:t xml:space="preserve"> </w:t>
+      </w:r>
+      <w:hyperlink r:id="rId123">
+        <w:r>
+          <w:rPr>
+            <w:rStyle w:val="Hyperlink"/>
+          </w:rPr>
+          <w:t xml:space="preserve">https://doi.org/10.1017/aaq.2024.1</w:t>
+        </w:r>
+      </w:hyperlink>
+      <w:r>
+        <w:t xml:space="preserve">.</w:t>
+      </w:r>
+    </w:p>
+    <w:bookmarkEnd w:id="124"/>
+    <w:bookmarkStart w:id="125" w:name="ref-tomasovych_kidwell_2009"/>
+    <w:p>
+      <w:pPr>
+        <w:pStyle w:val="Bibliography"/>
+      </w:pPr>
+      <w:r>
         <w:t xml:space="preserve">Tomašových, Adam, and Susan M. Kidwell. 2009. Fidelity of Variation in Species Composition and Diversity Partitioning by Death Assemblages: Time-Averaging Transfers Diversity from Beta to Alpha Levels.</w:t>
       </w:r>
       <w:r>
@@ -5796,8 +4366,8 @@
         <w:t xml:space="preserve">35(1):94–118.</w:t>
       </w:r>
     </w:p>
-    <w:bookmarkEnd w:id="136"/>
-    <w:bookmarkStart w:id="138" w:name="ref-tomasovych_kidwell_2010"/>
+    <w:bookmarkEnd w:id="125"/>
+    <w:bookmarkStart w:id="127" w:name="ref-tomasovych_kidwell_2010"/>
     <w:p>
       <w:pPr>
         <w:pStyle w:val="Bibliography"/>
@@ -5824,7 +4394,7 @@
       <w:r>
         <w:t xml:space="preserve"> </w:t>
       </w:r>
-      <w:hyperlink r:id="rId137">
+      <w:hyperlink r:id="rId126">
         <w:r>
           <w:rPr>
             <w:rStyle w:val="Hyperlink"/>
@@ -5836,8 +4406,8 @@
         <w:t xml:space="preserve">.</w:t>
       </w:r>
     </w:p>
-    <w:bookmarkEnd w:id="138"/>
-    <w:bookmarkStart w:id="139" w:name="ref-williams_1954"/>
+    <w:bookmarkEnd w:id="127"/>
+    <w:bookmarkStart w:id="128" w:name="ref-williams_1954"/>
     <w:p>
       <w:pPr>
         <w:pStyle w:val="Bibliography"/>
@@ -5846,8 +4416,8 @@
         <w:t xml:space="preserve">Williams, Stephen. 1954. An Archeological Study of the Mississippian Culture in Southeast Missouri. PhD thesis, Yale University, New Haven.</w:t>
       </w:r>
     </w:p>
-    <w:bookmarkEnd w:id="139"/>
-    <w:bookmarkStart w:id="140" w:name="ref-williams_1990"/>
+    <w:bookmarkEnd w:id="128"/>
+    <w:bookmarkStart w:id="129" w:name="ref-williams_1990"/>
     <w:p>
       <w:pPr>
         <w:pStyle w:val="Bibliography"/>
@@ -5883,10 +4453,10 @@
         <w:t xml:space="preserve">, edited by David H. Dye and Cheryl Anne Cox, pp. 170–180. University of Alabama Press, Tuscaloosa.</w:t>
       </w:r>
     </w:p>
-    <w:bookmarkEnd w:id="140"/>
-    <w:bookmarkEnd w:id="141"/>
-    <w:bookmarkEnd w:id="142"/>
-    <w:bookmarkEnd w:id="143"/>
+    <w:bookmarkEnd w:id="129"/>
+    <w:bookmarkEnd w:id="130"/>
+    <w:bookmarkEnd w:id="131"/>
+    <w:bookmarkEnd w:id="132"/>
     <w:sectPr>
       <w:footnotePr>
         <w:numRestart w:val="eachSect"/>

</xml_diff>

<commit_message>
References: add analytic-method citations, wire in library sources, fix Cobb 2000 wording
- Method citations: Brainerd 1951 and Robinson 1951 (similarity), Mantel 1967,
  Reimer et al. 2020 (IntCal20), Hurlbert 1971 (rarefaction), Baxter 1994
  (correspondence analysis), Hopkins and Skellam 1954, Rousseeuw 1987, and
  Tibshirani et al. 2001 (clustering-tendency).
- Wired in existing library sources: Ewens 1972 (main text), Dye and Cox 1990
  (Parkin metrics), Mainfort 2003 paired with Fox 1998, Riede et al. 2019,
  Holland-Lulewicz and Ritchison 2021.
- Corrected a duplicate Mainfort 1996 entry.
- Softened the chert-hoe 'production and exchange decentralized' phrasing to match
  Cobb 2000 (production decentralized; exchange down-the-line).
</commit_message>
<xml_diff>
--- a/docs/manuscript/MAIN_TEXT.docx
+++ b/docs/manuscript/MAIN_TEXT.docx
@@ -2,7 +2,7 @@
 <file path=word/document.xml><?xml version="1.0" encoding="utf-8"?>
 <w:document xmlns:w="http://schemas.openxmlformats.org/wordprocessingml/2006/main" xmlns:m="http://schemas.openxmlformats.org/officeDocument/2006/math" xmlns:r="http://schemas.openxmlformats.org/officeDocument/2006/relationships" xmlns:o="urn:schemas-microsoft-com:office:office" xmlns:v="urn:schemas-microsoft-com:vml" xmlns:w10="urn:schemas-microsoft-com:office:word" xmlns:a="http://schemas.openxmlformats.org/drawingml/2006/main" xmlns:pic="http://schemas.openxmlformats.org/drawingml/2006/picture" xmlns:wp="http://schemas.openxmlformats.org/drawingml/2006/wordprocessingDrawing">
   <w:body>
-    <w:bookmarkStart w:id="132" w:name="X093902eb68652ea32f5548e74607f4e4b0f6699"/>
+    <w:bookmarkStart w:id="145" w:name="X093902eb68652ea32f5548e74607f4e4b0f6699"/>
     <w:p>
       <w:pPr>
         <w:pStyle w:val="Heading1"/>
@@ -111,7 +111,7 @@
         <w:t xml:space="preserve">(Hudson et al. 1990; Morse 1990)</w:t>
       </w:r>
       <w:r>
-        <w:t xml:space="preserve">. We therefore ask what the material record shows when it is measured rather than read through the polity model. The comparable evidence shows no hierarchy. Within the basin, settlement size is graded rather than redistributive. The regional production and exchange of the capacity-linked chert hoes whose control would mark an economic apex were decentralized</w:t>
+        <w:t xml:space="preserve">. We therefore ask what the material record shows when it is measured rather than read through the polity model. The comparable evidence shows no hierarchy. Within the basin, settlement size is graded rather than redistributive. The regional production of the capacity-linked chert hoes whose control would mark an economic apex was decentralized, and their exchange followed a down-the-line gradient rather than central redistribution</w:t>
       </w:r>
       <w:r>
         <w:t xml:space="preserve"> </w:t>
@@ -152,7 +152,7 @@
         <w:t xml:space="preserve"> </w:t>
       </w:r>
       <w:r>
-        <w:t xml:space="preserve">(Fox 1998)</w:t>
+        <w:t xml:space="preserve">(Fox 1998; Mainfort 2003)</w:t>
       </w:r>
       <w:r>
         <w:t xml:space="preserve">.</w:t>
@@ -181,7 +181,16 @@
         <w:t xml:space="preserve">(Lipo et al. 2021)</w:t>
       </w:r>
       <w:r>
-        <w:t xml:space="preserve">. On this account, a phase is the ordinary residue of continuous, distance-structured interaction, and the very pattern the culture-history tradition reads as a society, assemblages near each other in space and in style, is what spatially structured drift predicts. Telling a real interaction group apart from spatially structured drift requires a test that the tradition never applied, because the seriation coherence and spatial proximity that define the phase are equally the products of drift.</w:t>
+        <w:t xml:space="preserve">. On this account, a phase is the ordinary residue of continuous, distance-structured interaction, and the very pattern the culture-history tradition reads as a society, assemblages near each other in space and in style, is what spatially structured drift predicts. Telling a real interaction group apart from spatially structured drift requires a test that the tradition never applied, because the seriation coherence and spatial proximity that define the phase are equally the products of drift</w:t>
+      </w:r>
+      <w:r>
+        <w:t xml:space="preserve"> </w:t>
+      </w:r>
+      <w:r>
+        <w:t xml:space="preserve">(Riede et al. 2019)</w:t>
+      </w:r>
+      <w:r>
+        <w:t xml:space="preserve">.</w:t>
       </w:r>
     </w:p>
     <w:p>
@@ -555,7 +564,7 @@
         <w:t xml:space="preserve"> </w:t>
       </w:r>
       <w:r>
-        <w:t xml:space="preserve">(Mitchem 2001; Morse 1990)</w:t>
+        <w:t xml:space="preserve">(Dye and Cox 1990; Mitchem 2001; Morse 1990)</w:t>
       </w:r>
       <w:r>
         <w:t xml:space="preserve">. Based on this information, Parkin’s location on agriculturally poor soil suggests that it drew tribute from smaller villages, a hallmark of an emerging chiefly hierarchy</w:t>
@@ -1269,7 +1278,43 @@
         <w:t xml:space="preserve">(Mainfort 1996, 2001; Sullivan et al. 2024)</w:t>
       </w:r>
       <w:r>
-        <w:t xml:space="preserve">. Calibrated against IntCal20, the basin determinations place the occupation in the fourteenth to sixteenth centuries (summed-probability median AD 1422, Parkin AD 1483) and show a decline across the contact interval, as detailed in the Supplemental Text. A calibration plateau across that interval still defeats year-scale resolution, so we order the assemblages by seriation rather than by calendar age, using the first axis of a correspondence analysis. This ordination arranges assemblages along axes that summarize their decorated-type-frequency differences, as a relative chronological ordinate oriented so that higher positions correspond to later time (Figure 3). Pooling the dates of the five proveniences that match curated assemblages, the pooled median calibrated ages correlate with seriation position at Spearman +0.70 (n = 5, 27 dates pooled), an improvement on the +0.50 of the single-date anchors, with four of the five sites in calendar order and one late-dated site departing from it. The axis, therefore, tracks calendar time, but imperfectly. The trajectory we test is ordinal, not a calendar rate, and the discriminating quantity, the size-controlled F_ST trend, is a magnitude invariant to the axis orientation, so only the directional descriptions of the other signatures depend on the anchor. We return to both limits in the discussion.</w:t>
+        <w:t xml:space="preserve">. Calibrated against IntCal20</w:t>
+      </w:r>
+      <w:r>
+        <w:t xml:space="preserve"> </w:t>
+      </w:r>
+      <w:r>
+        <w:t xml:space="preserve">(</w:t>
+      </w:r>
+      <w:r>
+        <w:t xml:space="preserve">Reimer et al.</w:t>
+      </w:r>
+      <w:r>
+        <w:t xml:space="preserve"> </w:t>
+      </w:r>
+      <w:r>
+        <w:t xml:space="preserve">2020)</w:t>
+      </w:r>
+      <w:r>
+        <w:t xml:space="preserve">, the basin determinations place the occupation in the fourteenth to sixteenth centuries (summed-probability median AD 1422, Parkin AD 1483) and show a decline across the contact interval, as detailed in the Supplemental Text. A calibration plateau across that interval still defeats year-scale resolution</w:t>
+      </w:r>
+      <w:r>
+        <w:t xml:space="preserve"> </w:t>
+      </w:r>
+      <w:r>
+        <w:t xml:space="preserve">(Holland-Lulewicz and Ritchison 2021)</w:t>
+      </w:r>
+      <w:r>
+        <w:t xml:space="preserve">, so we order the assemblages by seriation rather than by calendar age, using the first axis of a correspondence analysis</w:t>
+      </w:r>
+      <w:r>
+        <w:t xml:space="preserve"> </w:t>
+      </w:r>
+      <w:r>
+        <w:t xml:space="preserve">(Baxter 1994)</w:t>
+      </w:r>
+      <w:r>
+        <w:t xml:space="preserve">. This ordination arranges assemblages along axes that summarize their decorated-type-frequency differences, as a relative chronological ordinate oriented so that higher positions correspond to later time (Figure 3). Pooling the dates of the five proveniences that match curated assemblages, the pooled median calibrated ages correlate with seriation position at Spearman +0.70 (n = 5, 27 dates pooled), an improvement on the +0.50 of the single-date anchors, with four of the five sites in calendar order and one late-dated site departing from it. The axis, therefore, tracks calendar time, but imperfectly. The trajectory we test is ordinal, not a calendar rate, and the discriminating quantity, the size-controlled F_ST trend, is a magnitude invariant to the axis orientation, so only the directional descriptions of the other signatures depend on the anchor. We return to both limits in the discussion.</w:t>
       </w:r>
     </w:p>
     <w:p>
@@ -1361,7 +1406,19 @@
         <w:t xml:space="preserve">(Neiman 1995)</w:t>
       </w:r>
       <w:r>
-        <w:t xml:space="preserve">. We estimated the transmission parameter in two ways: from the unbiased homozygosity of an assemblage and from its number of types, using the Ewens sampling formula to estimate the number of types expected under random copying, and took the ratio of the two estimates as the signature. Under neutral drift, the two estimators agree. Conformist transmission lowers the homozygosity-based estimate relative to the richness-based one, and anti-conformist novelty bias does the reverse, so the ratio both detects a departure and indicates its direction</w:t>
+        <w:t xml:space="preserve">. We estimated the transmission parameter in two ways: from the unbiased homozygosity of an assemblage and from its number of types, using the Ewens sampling formula</w:t>
+      </w:r>
+      <w:r>
+        <w:t xml:space="preserve"> </w:t>
+      </w:r>
+      <w:r>
+        <w:t xml:space="preserve">(Ewens 1972)</w:t>
+      </w:r>
+      <w:r>
+        <w:t xml:space="preserve"> </w:t>
+      </w:r>
+      <w:r>
+        <w:t xml:space="preserve">to estimate the number of types expected under random copying, and took the ratio of the two estimates as the signature. Under neutral drift, the two estimators agree. Conformist transmission lowers the homozygosity-based estimate relative to the richness-based one, and anti-conformist novelty bias does the reverse, so the ratio both detects a departure and indicates its direction</w:t>
       </w:r>
       <w:r>
         <w:t xml:space="preserve"> </w:t>
@@ -1404,7 +1461,37 @@
         <w:t xml:space="preserve">(Bell et al. 2009)</w:t>
       </w:r>
       <w:r>
-        <w:t xml:space="preserve">. It rises from zero as groups come to hold distinct decorated repertoires. Spatial assortativity measures whether ceramic similarity follows social rather than geographic distance. We computed the Brainerd-Robinson similarity, a standard index ranging from 0 to 200 that indicates how alike two assemblages are in their type proportions, for every pair of assemblages. We tested its association with inter-site distance by a Mantel permutation test, which asks whether two distance matrices, here ceramic dissimilarity and geographic distance, are related. Because a Mantel correlation cannot separate a sharp social boundary from a smooth distance decay, we summarized the result as a boundary-excess statistic, the gap between mean within-cluster and between-cluster similarity after controlling for distance. Smooth isolation-by-distance returns a boundary excess near zero, and a genuine social boundary returns a large positive value. Two corrections are essential before any of these signatures is read. Assemblage sample size trends with seriation position, and several of the estimators are size-sensitive, so we rarefy every assemblage to a common count before scoring each signature as its rank correlation with ordinal position. And which signatures can be trusted at the record’s resolution is not assumed but established by the recovery experiment described next, in which a known closure signal is injected into the real configuration.</w:t>
+        <w:t xml:space="preserve">. It rises from zero as groups come to hold distinct decorated repertoires. Spatial assortativity measures whether ceramic similarity follows social rather than geographic distance. We computed the Brainerd-Robinson similarity, a standard index ranging from 0 to 200 that indicates how alike two assemblages are in their type proportions, for every pair of assemblages</w:t>
+      </w:r>
+      <w:r>
+        <w:t xml:space="preserve"> </w:t>
+      </w:r>
+      <w:r>
+        <w:t xml:space="preserve">(Brainerd 1951; Robinson 1951)</w:t>
+      </w:r>
+      <w:r>
+        <w:t xml:space="preserve">. We tested its association with inter-site distance by a Mantel permutation test, which asks whether two distance matrices, here ceramic dissimilarity and geographic distance, are related</w:t>
+      </w:r>
+      <w:r>
+        <w:t xml:space="preserve"> </w:t>
+      </w:r>
+      <w:r>
+        <w:t xml:space="preserve">(Mantel 1967)</w:t>
+      </w:r>
+      <w:r>
+        <w:t xml:space="preserve">. Because a Mantel correlation cannot separate a sharp social boundary from a smooth distance decay, we summarized the result as a boundary-excess statistic, the gap between mean within-cluster and between-cluster similarity after controlling for distance. Smooth isolation-by-distance returns a boundary excess near zero, and a genuine social boundary returns a large positive value. Two corrections are essential before any of these signatures is read. Assemblage sample size trends with seriation position, and several of the estimators are size-sensitive, so we rarefy every assemblage to a common count</w:t>
+      </w:r>
+      <w:r>
+        <w:t xml:space="preserve"> </w:t>
+      </w:r>
+      <w:r>
+        <w:t xml:space="preserve">(Hurlbert 1971)</w:t>
+      </w:r>
+      <w:r>
+        <w:t xml:space="preserve"> </w:t>
+      </w:r>
+      <w:r>
+        <w:t xml:space="preserve">before scoring each signature as its rank correlation with ordinal position. And which signatures can be trusted at the record’s resolution is not assumed but established by the recovery experiment described next, in which a known closure signal is injected into the real configuration.</w:t>
       </w:r>
     </w:p>
     <w:bookmarkEnd w:id="26"/>
@@ -1928,7 +2015,7 @@
         <w:pStyle w:val="FirstParagraph"/>
       </w:pPr>
       <w:r>
-        <w:t xml:space="preserve">The three lines of evidence converge on a single reading: the Parkin phase is not a bounded interaction group, and Parkin is not the capital of a polity. Within the St. Francis basin, Parkin is the largest and most monumentally elaborated center. Yet, its decorated-ceramic record shows no closure of interaction into bounded groups, and the structure present is reproduced by neutral drift across the basin’s geography. In contrast, a bounded-groups process would have left a far sharper mark. The settlement and exchange records say the same: mound size is graded rather than redistributive, and the production and exchange of the capacity-linked chert hoes were decentralized</w:t>
+        <w:t xml:space="preserve">The three lines of evidence converge on a single reading: the Parkin phase is not a bounded interaction group, and Parkin is not the capital of a polity. Within the St. Francis basin, Parkin is the largest and most monumentally elaborated center. Yet, its decorated-ceramic record shows no closure of interaction into bounded groups, and the structure present is reproduced by neutral drift across the basin’s geography. In contrast, a bounded-groups process would have left a far sharper mark. The settlement and exchange records say the same: mound size is graded rather than redistributive, and the production of the capacity-linked chert hoes was decentralized and their exchange followed a down-the-line gradient rather than central redistribution</w:t>
       </w:r>
       <w:r>
         <w:t xml:space="preserve"> </w:t>
@@ -2263,7 +2350,7 @@
       </w:r>
     </w:p>
     <w:bookmarkEnd w:id="52"/>
-    <w:bookmarkStart w:id="131" w:name="references"/>
+    <w:bookmarkStart w:id="144" w:name="references"/>
     <w:p>
       <w:pPr>
         <w:pStyle w:val="Heading2"/>
@@ -2272,8 +2359,31 @@
         <w:t xml:space="preserve">References</w:t>
       </w:r>
     </w:p>
-    <w:bookmarkStart w:id="130" w:name="refs"/>
-    <w:bookmarkStart w:id="54" w:name="ref-bell_richerson_mcelreath_2009"/>
+    <w:bookmarkStart w:id="143" w:name="refs"/>
+    <w:bookmarkStart w:id="53" w:name="ref-baxter_1994"/>
+    <w:p>
+      <w:pPr>
+        <w:pStyle w:val="Bibliography"/>
+      </w:pPr>
+      <w:r>
+        <w:t xml:space="preserve">Baxter, M. J. 1994.</w:t>
+      </w:r>
+      <w:r>
+        <w:t xml:space="preserve"> </w:t>
+      </w:r>
+      <w:r>
+        <w:rPr>
+          <w:i/>
+          <w:iCs/>
+        </w:rPr>
+        <w:t xml:space="preserve">Exploratory Multivariate Analysis in Archaeology</w:t>
+      </w:r>
+      <w:r>
+        <w:t xml:space="preserve">. Edinburgh University Press, Edinburgh.</w:t>
+      </w:r>
+    </w:p>
+    <w:bookmarkEnd w:id="53"/>
+    <w:bookmarkStart w:id="55" w:name="ref-bell_richerson_mcelreath_2009"/>
     <w:p>
       <w:pPr>
         <w:pStyle w:val="Bibliography"/>
@@ -2300,7 +2410,7 @@
       <w:r>
         <w:t xml:space="preserve"> </w:t>
       </w:r>
-      <w:hyperlink r:id="rId53">
+      <w:hyperlink r:id="rId54">
         <w:r>
           <w:rPr>
             <w:rStyle w:val="Hyperlink"/>
@@ -2312,8 +2422,8 @@
         <w:t xml:space="preserve">.</w:t>
       </w:r>
     </w:p>
-    <w:bookmarkEnd w:id="54"/>
-    <w:bookmarkStart w:id="56" w:name="ref-bentley_2008"/>
+    <w:bookmarkEnd w:id="55"/>
+    <w:bookmarkStart w:id="57" w:name="ref-bentley_2008"/>
     <w:p>
       <w:pPr>
         <w:pStyle w:val="Bibliography"/>
@@ -2340,7 +2450,7 @@
       <w:r>
         <w:t xml:space="preserve"> </w:t>
       </w:r>
-      <w:hyperlink r:id="rId55">
+      <w:hyperlink r:id="rId56">
         <w:r>
           <w:rPr>
             <w:rStyle w:val="Hyperlink"/>
@@ -2352,8 +2462,8 @@
         <w:t xml:space="preserve">.</w:t>
       </w:r>
     </w:p>
-    <w:bookmarkEnd w:id="56"/>
-    <w:bookmarkStart w:id="58" w:name="ref-bentley_hahn_shennan_2004"/>
+    <w:bookmarkEnd w:id="57"/>
+    <w:bookmarkStart w:id="59" w:name="ref-bentley_hahn_shennan_2004"/>
     <w:p>
       <w:pPr>
         <w:pStyle w:val="Bibliography"/>
@@ -2380,7 +2490,7 @@
       <w:r>
         <w:t xml:space="preserve"> </w:t>
       </w:r>
-      <w:hyperlink r:id="rId57">
+      <w:hyperlink r:id="rId58">
         <w:r>
           <w:rPr>
             <w:rStyle w:val="Hyperlink"/>
@@ -2392,8 +2502,8 @@
         <w:t xml:space="preserve">.</w:t>
       </w:r>
     </w:p>
-    <w:bookmarkEnd w:id="58"/>
-    <w:bookmarkStart w:id="59" w:name="ref-binford_1981"/>
+    <w:bookmarkEnd w:id="59"/>
+    <w:bookmarkStart w:id="60" w:name="ref-binford_1981"/>
     <w:p>
       <w:pPr>
         <w:pStyle w:val="Bibliography"/>
@@ -2433,8 +2543,34 @@
         <w:t xml:space="preserve">37(3):195–208.</w:t>
       </w:r>
     </w:p>
-    <w:bookmarkEnd w:id="59"/>
-    <w:bookmarkStart w:id="61" w:name="ref-carrignon_bentley_ruck_2019"/>
+    <w:bookmarkEnd w:id="60"/>
+    <w:bookmarkStart w:id="61" w:name="ref-brainerd_1951"/>
+    <w:p>
+      <w:pPr>
+        <w:pStyle w:val="Bibliography"/>
+      </w:pPr>
+      <w:r>
+        <w:t xml:space="preserve">Brainerd, George W. 1951. The Place of Chronological Ordering in Archaeological Analysis.</w:t>
+      </w:r>
+      <w:r>
+        <w:t xml:space="preserve"> </w:t>
+      </w:r>
+      <w:r>
+        <w:rPr>
+          <w:i/>
+          <w:iCs/>
+        </w:rPr>
+        <w:t xml:space="preserve">American Antiquity</w:t>
+      </w:r>
+      <w:r>
+        <w:t xml:space="preserve"> </w:t>
+      </w:r>
+      <w:r>
+        <w:t xml:space="preserve">16(4):301–313.</w:t>
+      </w:r>
+    </w:p>
+    <w:bookmarkEnd w:id="61"/>
+    <w:bookmarkStart w:id="63" w:name="ref-carrignon_bentley_ruck_2019"/>
     <w:p>
       <w:pPr>
         <w:pStyle w:val="Bibliography"/>
@@ -2485,7 +2621,7 @@
       <w:r>
         <w:t xml:space="preserve"> </w:t>
       </w:r>
-      <w:hyperlink r:id="rId60">
+      <w:hyperlink r:id="rId62">
         <w:r>
           <w:rPr>
             <w:rStyle w:val="Hyperlink"/>
@@ -2497,8 +2633,8 @@
         <w:t xml:space="preserve">.</w:t>
       </w:r>
     </w:p>
-    <w:bookmarkEnd w:id="61"/>
-    <w:bookmarkStart w:id="62" w:name="ref-cobb_2000"/>
+    <w:bookmarkEnd w:id="63"/>
+    <w:bookmarkStart w:id="64" w:name="ref-cobb_2000"/>
     <w:p>
       <w:pPr>
         <w:pStyle w:val="Bibliography"/>
@@ -2548,8 +2684,8 @@
         <w:t xml:space="preserve">. University of Alabama Press, Tuscaloosa.</w:t>
       </w:r>
     </w:p>
-    <w:bookmarkEnd w:id="62"/>
-    <w:bookmarkStart w:id="63" w:name="ref-cobb_butler_2002"/>
+    <w:bookmarkEnd w:id="64"/>
+    <w:bookmarkStart w:id="65" w:name="ref-cobb_butler_2002"/>
     <w:p>
       <w:pPr>
         <w:pStyle w:val="Bibliography"/>
@@ -2598,8 +2734,8 @@
         <w:t xml:space="preserve">67(4):625–641.</w:t>
       </w:r>
     </w:p>
-    <w:bookmarkEnd w:id="63"/>
-    <w:bookmarkStart w:id="65" w:name="ref-crema_bortolini_lake_2023"/>
+    <w:bookmarkEnd w:id="65"/>
+    <w:bookmarkStart w:id="67" w:name="ref-crema_bortolini_lake_2023"/>
     <w:p>
       <w:pPr>
         <w:pStyle w:val="Bibliography"/>
@@ -2626,7 +2762,7 @@
       <w:r>
         <w:t xml:space="preserve"> </w:t>
       </w:r>
-      <w:hyperlink r:id="rId64">
+      <w:hyperlink r:id="rId66">
         <w:r>
           <w:rPr>
             <w:rStyle w:val="Hyperlink"/>
@@ -2638,8 +2774,8 @@
         <w:t xml:space="preserve">.</w:t>
       </w:r>
     </w:p>
-    <w:bookmarkEnd w:id="65"/>
-    <w:bookmarkStart w:id="67" w:name="ref-crema_kandler_shennan_2016"/>
+    <w:bookmarkEnd w:id="67"/>
+    <w:bookmarkStart w:id="69" w:name="ref-crema_kandler_shennan_2016"/>
     <w:p>
       <w:pPr>
         <w:pStyle w:val="Bibliography"/>
@@ -2666,7 +2802,7 @@
       <w:r>
         <w:t xml:space="preserve"> </w:t>
       </w:r>
-      <w:hyperlink r:id="rId66">
+      <w:hyperlink r:id="rId68">
         <w:r>
           <w:rPr>
             <w:rStyle w:val="Hyperlink"/>
@@ -2678,8 +2814,8 @@
         <w:t xml:space="preserve">.</w:t>
       </w:r>
     </w:p>
-    <w:bookmarkEnd w:id="67"/>
-    <w:bookmarkStart w:id="69" w:name="ref-dakos_2012"/>
+    <w:bookmarkEnd w:id="69"/>
+    <w:bookmarkStart w:id="71" w:name="ref-dakos_2012"/>
     <w:p>
       <w:pPr>
         <w:pStyle w:val="Bibliography"/>
@@ -2706,7 +2842,7 @@
       <w:r>
         <w:t xml:space="preserve"> </w:t>
       </w:r>
-      <w:hyperlink r:id="rId68">
+      <w:hyperlink r:id="rId70">
         <w:r>
           <w:rPr>
             <w:rStyle w:val="Hyperlink"/>
@@ -2718,8 +2854,8 @@
         <w:t xml:space="preserve">.</w:t>
       </w:r>
     </w:p>
-    <w:bookmarkEnd w:id="69"/>
-    <w:bookmarkStart w:id="70" w:name="ref-dunnell_1995"/>
+    <w:bookmarkEnd w:id="71"/>
+    <w:bookmarkStart w:id="72" w:name="ref-dunnell_1995"/>
     <w:p>
       <w:pPr>
         <w:pStyle w:val="Bibliography"/>
@@ -2741,8 +2877,71 @@
         <w:t xml:space="preserve">, edited by Patrice A. Teltser, pp. 33–50. University of Arizona Press, Tucson.</w:t>
       </w:r>
     </w:p>
-    <w:bookmarkEnd w:id="70"/>
-    <w:bookmarkStart w:id="72" w:name="ref-feder_kryazhimskiy_plotkin_2014"/>
+    <w:bookmarkEnd w:id="72"/>
+    <w:bookmarkStart w:id="73" w:name="ref-dye_cox_1990"/>
+    <w:p>
+      <w:pPr>
+        <w:pStyle w:val="Bibliography"/>
+      </w:pPr>
+      <w:r>
+        <w:t xml:space="preserve">Dye, David H., and Cheryl Anne Cox (editors). 1990.</w:t>
+      </w:r>
+      <w:r>
+        <w:t xml:space="preserve"> </w:t>
+      </w:r>
+      <w:r>
+        <w:rPr>
+          <w:i/>
+          <w:iCs/>
+        </w:rPr>
+        <w:t xml:space="preserve">Towns and Temples Along the</w:t>
+      </w:r>
+      <w:r>
+        <w:rPr>
+          <w:i/>
+          <w:iCs/>
+        </w:rPr>
+        <w:t xml:space="preserve"> </w:t>
+      </w:r>
+      <w:r>
+        <w:rPr>
+          <w:i/>
+          <w:iCs/>
+        </w:rPr>
+        <w:t xml:space="preserve">Mississippi</w:t>
+      </w:r>
+      <w:r>
+        <w:t xml:space="preserve">. University of Alabama Press, Tuscaloosa.</w:t>
+      </w:r>
+    </w:p>
+    <w:bookmarkEnd w:id="73"/>
+    <w:bookmarkStart w:id="74" w:name="ref-ewens_1972"/>
+    <w:p>
+      <w:pPr>
+        <w:pStyle w:val="Bibliography"/>
+      </w:pPr>
+      <w:r>
+        <w:t xml:space="preserve">Ewens, Warren J. 1972. The Sampling Theory of Selectively Neutral Alleles.</w:t>
+      </w:r>
+      <w:r>
+        <w:t xml:space="preserve"> </w:t>
+      </w:r>
+      <w:r>
+        <w:rPr>
+          <w:i/>
+          <w:iCs/>
+        </w:rPr>
+        <w:t xml:space="preserve">Theoretical Population Biology</w:t>
+      </w:r>
+      <w:r>
+        <w:t xml:space="preserve"> </w:t>
+      </w:r>
+      <w:r>
+        <w:t xml:space="preserve">3(1):87–112.</w:t>
+      </w:r>
+    </w:p>
+    <w:bookmarkEnd w:id="74"/>
+    <w:bookmarkStart w:id="76" w:name="ref-feder_kryazhimskiy_plotkin_2014"/>
     <w:p>
       <w:pPr>
         <w:pStyle w:val="Bibliography"/>
@@ -2769,7 +2968,7 @@
       <w:r>
         <w:t xml:space="preserve"> </w:t>
       </w:r>
-      <w:hyperlink r:id="rId71">
+      <w:hyperlink r:id="rId75">
         <w:r>
           <w:rPr>
             <w:rStyle w:val="Hyperlink"/>
@@ -2781,8 +2980,8 @@
         <w:t xml:space="preserve">.</w:t>
       </w:r>
     </w:p>
-    <w:bookmarkEnd w:id="72"/>
-    <w:bookmarkStart w:id="74" w:name="ref-fogarty_kandler_creanza_2024"/>
+    <w:bookmarkEnd w:id="76"/>
+    <w:bookmarkStart w:id="78" w:name="ref-fogarty_kandler_creanza_2024"/>
     <w:p>
       <w:pPr>
         <w:pStyle w:val="Bibliography"/>
@@ -2809,7 +3008,7 @@
       <w:r>
         <w:t xml:space="preserve"> </w:t>
       </w:r>
-      <w:hyperlink r:id="rId73">
+      <w:hyperlink r:id="rId77">
         <w:r>
           <w:rPr>
             <w:rStyle w:val="Hyperlink"/>
@@ -2821,8 +3020,8 @@
         <w:t xml:space="preserve">.</w:t>
       </w:r>
     </w:p>
-    <w:bookmarkEnd w:id="74"/>
-    <w:bookmarkStart w:id="75" w:name="ref-fox_1998"/>
+    <w:bookmarkEnd w:id="78"/>
+    <w:bookmarkStart w:id="79" w:name="ref-fox_1998"/>
     <w:p>
       <w:pPr>
         <w:pStyle w:val="Bibliography"/>
@@ -2844,8 +3043,8 @@
         <w:t xml:space="preserve">, edited by Michael J. O’Brien and Robert C. Dunnell, pp. 31–58. University of Alabama Press, Tuscaloosa.</w:t>
       </w:r>
     </w:p>
-    <w:bookmarkEnd w:id="75"/>
-    <w:bookmarkStart w:id="76" w:name="ref-holdaway_wandsnider_2008"/>
+    <w:bookmarkEnd w:id="79"/>
+    <w:bookmarkStart w:id="80" w:name="ref-holdaway_wandsnider_2008"/>
     <w:p>
       <w:pPr>
         <w:pStyle w:val="Bibliography"/>
@@ -2867,8 +3066,48 @@
         <w:t xml:space="preserve">. University of Utah Press, Salt Lake City.</w:t>
       </w:r>
     </w:p>
-    <w:bookmarkEnd w:id="76"/>
-    <w:bookmarkStart w:id="77" w:name="ref-hudson_smith_depratter_1990"/>
+    <w:bookmarkEnd w:id="80"/>
+    <w:bookmarkStart w:id="82" w:name="ref-holland-lulewicz_ritchison_2021"/>
+    <w:p>
+      <w:pPr>
+        <w:pStyle w:val="Bibliography"/>
+      </w:pPr>
+      <w:r>
+        <w:t xml:space="preserve">Holland-Lulewicz, Jacob, and Brandon T. Ritchison. 2021. How Many Dates Do i Need? Using Simulations to Determine Robust Age Estimations of Archaeological Contexts.</w:t>
+      </w:r>
+      <w:r>
+        <w:t xml:space="preserve"> </w:t>
+      </w:r>
+      <w:r>
+        <w:rPr>
+          <w:i/>
+          <w:iCs/>
+        </w:rPr>
+        <w:t xml:space="preserve">Advances in Archaeological Practice</w:t>
+      </w:r>
+      <w:r>
+        <w:t xml:space="preserve"> </w:t>
+      </w:r>
+      <w:r>
+        <w:t xml:space="preserve">9(4):272–287.</w:t>
+      </w:r>
+      <w:r>
+        <w:t xml:space="preserve"> </w:t>
+      </w:r>
+      <w:hyperlink r:id="rId81">
+        <w:r>
+          <w:rPr>
+            <w:rStyle w:val="Hyperlink"/>
+          </w:rPr>
+          <w:t xml:space="preserve">https://doi.org/10.1017/aap.2021.10</w:t>
+        </w:r>
+      </w:hyperlink>
+      <w:r>
+        <w:t xml:space="preserve">.</w:t>
+      </w:r>
+    </w:p>
+    <w:bookmarkEnd w:id="82"/>
+    <w:bookmarkStart w:id="83" w:name="ref-hudson_smith_depratter_1990"/>
     <w:p>
       <w:pPr>
         <w:pStyle w:val="Bibliography"/>
@@ -2928,8 +3167,8 @@
         <w:t xml:space="preserve">, edited by David H. Dye and Cheryl Anne Cox, pp. 181–207. University of Alabama Press, Tuscaloosa.</w:t>
       </w:r>
     </w:p>
-    <w:bookmarkEnd w:id="77"/>
-    <w:bookmarkStart w:id="79" w:name="ref-hunt_2006"/>
+    <w:bookmarkEnd w:id="83"/>
+    <w:bookmarkStart w:id="85" w:name="ref-hunt_2006"/>
     <w:p>
       <w:pPr>
         <w:pStyle w:val="Bibliography"/>
@@ -2956,7 +3195,7 @@
       <w:r>
         <w:t xml:space="preserve"> </w:t>
       </w:r>
-      <w:hyperlink r:id="rId78">
+      <w:hyperlink r:id="rId84">
         <w:r>
           <w:rPr>
             <w:rStyle w:val="Hyperlink"/>
@@ -2968,8 +3207,8 @@
         <w:t xml:space="preserve">.</w:t>
       </w:r>
     </w:p>
-    <w:bookmarkEnd w:id="79"/>
-    <w:bookmarkStart w:id="81" w:name="ref-hunt_bell_travis_2008"/>
+    <w:bookmarkEnd w:id="85"/>
+    <w:bookmarkStart w:id="87" w:name="ref-hunt_bell_travis_2008"/>
     <w:p>
       <w:pPr>
         <w:pStyle w:val="Bibliography"/>
@@ -2996,7 +3235,7 @@
       <w:r>
         <w:t xml:space="preserve"> </w:t>
       </w:r>
-      <w:hyperlink r:id="rId80">
+      <w:hyperlink r:id="rId86">
         <w:r>
           <w:rPr>
             <w:rStyle w:val="Hyperlink"/>
@@ -3008,8 +3247,34 @@
         <w:t xml:space="preserve">.</w:t>
       </w:r>
     </w:p>
-    <w:bookmarkEnd w:id="81"/>
-    <w:bookmarkStart w:id="83" w:name="ref-kandler_shennan_2013"/>
+    <w:bookmarkEnd w:id="87"/>
+    <w:bookmarkStart w:id="88" w:name="ref-hurlbert_1971"/>
+    <w:p>
+      <w:pPr>
+        <w:pStyle w:val="Bibliography"/>
+      </w:pPr>
+      <w:r>
+        <w:t xml:space="preserve">Hurlbert, Stuart H. 1971. The Nonconcept of Species Diversity: A Critique and Alternative Parameters.</w:t>
+      </w:r>
+      <w:r>
+        <w:t xml:space="preserve"> </w:t>
+      </w:r>
+      <w:r>
+        <w:rPr>
+          <w:i/>
+          <w:iCs/>
+        </w:rPr>
+        <w:t xml:space="preserve">Ecology</w:t>
+      </w:r>
+      <w:r>
+        <w:t xml:space="preserve"> </w:t>
+      </w:r>
+      <w:r>
+        <w:t xml:space="preserve">52(4):577–586.</w:t>
+      </w:r>
+    </w:p>
+    <w:bookmarkEnd w:id="88"/>
+    <w:bookmarkStart w:id="90" w:name="ref-kandler_shennan_2013"/>
     <w:p>
       <w:pPr>
         <w:pStyle w:val="Bibliography"/>
@@ -3036,7 +3301,7 @@
       <w:r>
         <w:t xml:space="preserve"> </w:t>
       </w:r>
-      <w:hyperlink r:id="rId82">
+      <w:hyperlink r:id="rId89">
         <w:r>
           <w:rPr>
             <w:rStyle w:val="Hyperlink"/>
@@ -3048,8 +3313,8 @@
         <w:t xml:space="preserve">.</w:t>
       </w:r>
     </w:p>
-    <w:bookmarkEnd w:id="83"/>
-    <w:bookmarkStart w:id="85" w:name="ref-kandler_shennan_2015"/>
+    <w:bookmarkEnd w:id="90"/>
+    <w:bookmarkStart w:id="92" w:name="ref-kandler_shennan_2015"/>
     <w:p>
       <w:pPr>
         <w:pStyle w:val="Bibliography"/>
@@ -3088,7 +3353,7 @@
       <w:r>
         <w:t xml:space="preserve"> </w:t>
       </w:r>
-      <w:hyperlink r:id="rId84">
+      <w:hyperlink r:id="rId91">
         <w:r>
           <w:rPr>
             <w:rStyle w:val="Hyperlink"/>
@@ -3100,8 +3365,8 @@
         <w:t xml:space="preserve">.</w:t>
       </w:r>
     </w:p>
-    <w:bookmarkEnd w:id="85"/>
-    <w:bookmarkStart w:id="87" w:name="ref-kandler_wilder_fortunato_2017"/>
+    <w:bookmarkEnd w:id="92"/>
+    <w:bookmarkStart w:id="94" w:name="ref-kandler_wilder_fortunato_2017"/>
     <w:p>
       <w:pPr>
         <w:pStyle w:val="Bibliography"/>
@@ -3128,7 +3393,7 @@
       <w:r>
         <w:t xml:space="preserve"> </w:t>
       </w:r>
-      <w:hyperlink r:id="rId86">
+      <w:hyperlink r:id="rId93">
         <w:r>
           <w:rPr>
             <w:rStyle w:val="Hyperlink"/>
@@ -3140,8 +3405,8 @@
         <w:t xml:space="preserve">.</w:t>
       </w:r>
     </w:p>
-    <w:bookmarkEnd w:id="87"/>
-    <w:bookmarkStart w:id="89" w:name="ref-kidwell_tomasovych_2013"/>
+    <w:bookmarkEnd w:id="94"/>
+    <w:bookmarkStart w:id="96" w:name="ref-kidwell_tomasovych_2013"/>
     <w:p>
       <w:pPr>
         <w:pStyle w:val="Bibliography"/>
@@ -3168,7 +3433,7 @@
       <w:r>
         <w:t xml:space="preserve"> </w:t>
       </w:r>
-      <w:hyperlink r:id="rId88">
+      <w:hyperlink r:id="rId95">
         <w:r>
           <w:rPr>
             <w:rStyle w:val="Hyperlink"/>
@@ -3180,8 +3445,8 @@
         <w:t xml:space="preserve">.</w:t>
       </w:r>
     </w:p>
-    <w:bookmarkEnd w:id="89"/>
-    <w:bookmarkStart w:id="90" w:name="ref-king_freer_1995"/>
+    <w:bookmarkEnd w:id="96"/>
+    <w:bookmarkStart w:id="97" w:name="ref-king_freer_1995"/>
     <w:p>
       <w:pPr>
         <w:pStyle w:val="Bibliography"/>
@@ -3215,8 +3480,8 @@
         <w:t xml:space="preserve">, edited by Michael S. Nassaney and Kenneth E. Sassaman, pp. 266–288. University of Tennessee Press, Knoxville.</w:t>
       </w:r>
     </w:p>
-    <w:bookmarkEnd w:id="90"/>
-    <w:bookmarkStart w:id="91" w:name="ref-lewontin_1974"/>
+    <w:bookmarkEnd w:id="97"/>
+    <w:bookmarkStart w:id="98" w:name="ref-lewontin_1974"/>
     <w:p>
       <w:pPr>
         <w:pStyle w:val="Bibliography"/>
@@ -3238,8 +3503,8 @@
         <w:t xml:space="preserve">. Columbia University Press, New York.</w:t>
       </w:r>
     </w:p>
-    <w:bookmarkEnd w:id="91"/>
-    <w:bookmarkStart w:id="92" w:name="ref-lipo_2001"/>
+    <w:bookmarkEnd w:id="98"/>
+    <w:bookmarkStart w:id="99" w:name="ref-lipo_2001"/>
     <w:p>
       <w:pPr>
         <w:pStyle w:val="Bibliography"/>
@@ -3289,8 +3554,8 @@
         <w:t xml:space="preserve">. BAR International Series 918. Archaeopress, Oxford.</w:t>
       </w:r>
     </w:p>
-    <w:bookmarkEnd w:id="92"/>
-    <w:bookmarkStart w:id="94" w:name="ref-lipo_dinapoli_madsen_hunt_2021"/>
+    <w:bookmarkEnd w:id="99"/>
+    <w:bookmarkStart w:id="101" w:name="ref-lipo_dinapoli_madsen_hunt_2021"/>
     <w:p>
       <w:pPr>
         <w:pStyle w:val="Bibliography"/>
@@ -3317,7 +3582,7 @@
       <w:r>
         <w:t xml:space="preserve"> </w:t>
       </w:r>
-      <w:hyperlink r:id="rId93">
+      <w:hyperlink r:id="rId100">
         <w:r>
           <w:rPr>
             <w:rStyle w:val="Hyperlink"/>
@@ -3329,8 +3594,8 @@
         <w:t xml:space="preserve">.</w:t>
       </w:r>
     </w:p>
-    <w:bookmarkEnd w:id="94"/>
-    <w:bookmarkStart w:id="95" w:name="ref-lipo_dunnell_2007"/>
+    <w:bookmarkEnd w:id="101"/>
+    <w:bookmarkStart w:id="102" w:name="ref-lipo_dunnell_2007"/>
     <w:p>
       <w:pPr>
         <w:pStyle w:val="Bibliography"/>
@@ -3392,8 +3657,8 @@
         <w:t xml:space="preserve">, edited by Janet Rafferty and Evan Peacock, pp. 125–167. University of Alabama Press, Tuscaloosa.</w:t>
       </w:r>
     </w:p>
-    <w:bookmarkEnd w:id="95"/>
-    <w:bookmarkStart w:id="97" w:name="ref-lipo_madsen_dunnell_2015"/>
+    <w:bookmarkEnd w:id="102"/>
+    <w:bookmarkStart w:id="104" w:name="ref-lipo_madsen_dunnell_2015"/>
     <w:p>
       <w:pPr>
         <w:pStyle w:val="Bibliography"/>
@@ -3420,7 +3685,7 @@
       <w:r>
         <w:t xml:space="preserve"> </w:t>
       </w:r>
-      <w:hyperlink r:id="rId96">
+      <w:hyperlink r:id="rId103">
         <w:r>
           <w:rPr>
             <w:rStyle w:val="Hyperlink"/>
@@ -3432,8 +3697,8 @@
         <w:t xml:space="preserve">.</w:t>
       </w:r>
     </w:p>
-    <w:bookmarkEnd w:id="97"/>
-    <w:bookmarkStart w:id="99" w:name="ref-holland-lulewicz_2019"/>
+    <w:bookmarkEnd w:id="104"/>
+    <w:bookmarkStart w:id="106" w:name="ref-holland-lulewicz_2019"/>
     <w:p>
       <w:pPr>
         <w:pStyle w:val="Bibliography"/>
@@ -3487,7 +3752,7 @@
       <w:r>
         <w:t xml:space="preserve"> </w:t>
       </w:r>
-      <w:hyperlink r:id="rId98">
+      <w:hyperlink r:id="rId105">
         <w:r>
           <w:rPr>
             <w:rStyle w:val="Hyperlink"/>
@@ -3499,8 +3764,8 @@
         <w:t xml:space="preserve">.</w:t>
       </w:r>
     </w:p>
-    <w:bookmarkEnd w:id="99"/>
-    <w:bookmarkStart w:id="100" w:name="ref-madsen_2012"/>
+    <w:bookmarkEnd w:id="106"/>
+    <w:bookmarkStart w:id="107" w:name="ref-madsen_2012"/>
     <w:p>
       <w:pPr>
         <w:pStyle w:val="Bibliography"/>
@@ -3509,8 +3774,8 @@
         <w:t xml:space="preserve">Madsen, Mark E. 2012. Neutral Cultural Transmission in Time-Averaged Archaeological Assemblages. arXiv preprint arXiv:1204.2043 [physics.soc-ph].</w:t>
       </w:r>
     </w:p>
-    <w:bookmarkEnd w:id="100"/>
-    <w:bookmarkStart w:id="101" w:name="ref-mainfort_1996"/>
+    <w:bookmarkEnd w:id="107"/>
+    <w:bookmarkStart w:id="108" w:name="ref-mainfort_1996"/>
     <w:p>
       <w:pPr>
         <w:pStyle w:val="Bibliography"/>
@@ -3559,8 +3824,8 @@
         <w:t xml:space="preserve">15(2):172–181.</w:t>
       </w:r>
     </w:p>
-    <w:bookmarkEnd w:id="101"/>
-    <w:bookmarkStart w:id="102" w:name="ref-mainfort_2001"/>
+    <w:bookmarkEnd w:id="108"/>
+    <w:bookmarkStart w:id="109" w:name="ref-mainfort_2001"/>
     <w:p>
       <w:pPr>
         <w:pStyle w:val="Bibliography"/>
@@ -3594,8 +3859,8 @@
         <w:t xml:space="preserve">, edited by David S. Brose, C. Wesley Cowan, and Jr. Mainfort Robert C., pp. 173–190. Smithsonian Institution Press, Washington, DC.</w:t>
       </w:r>
     </w:p>
-    <w:bookmarkEnd w:id="102"/>
-    <w:bookmarkStart w:id="103" w:name="ref-mainfort_2003"/>
+    <w:bookmarkEnd w:id="109"/>
+    <w:bookmarkStart w:id="110" w:name="ref-mainfort_2003"/>
     <w:p>
       <w:pPr>
         <w:pStyle w:val="Bibliography"/>
@@ -3632,8 +3897,34 @@
         <w:t xml:space="preserve">22(2):176–184.</w:t>
       </w:r>
     </w:p>
-    <w:bookmarkEnd w:id="103"/>
-    <w:bookmarkStart w:id="104" w:name="ref-mcnutt_ed_1996"/>
+    <w:bookmarkEnd w:id="110"/>
+    <w:bookmarkStart w:id="111" w:name="ref-mantel_1967"/>
+    <w:p>
+      <w:pPr>
+        <w:pStyle w:val="Bibliography"/>
+      </w:pPr>
+      <w:r>
+        <w:t xml:space="preserve">Mantel, Nathan. 1967. The Detection of Disease Clustering and a Generalized Regression Approach.</w:t>
+      </w:r>
+      <w:r>
+        <w:t xml:space="preserve"> </w:t>
+      </w:r>
+      <w:r>
+        <w:rPr>
+          <w:i/>
+          <w:iCs/>
+        </w:rPr>
+        <w:t xml:space="preserve">Cancer Research</w:t>
+      </w:r>
+      <w:r>
+        <w:t xml:space="preserve"> </w:t>
+      </w:r>
+      <w:r>
+        <w:t xml:space="preserve">27(2):209–220.</w:t>
+      </w:r>
+    </w:p>
+    <w:bookmarkEnd w:id="111"/>
+    <w:bookmarkStart w:id="112" w:name="ref-mcnutt_ed_1996"/>
     <w:p>
       <w:pPr>
         <w:pStyle w:val="Bibliography"/>
@@ -3683,8 +3974,8 @@
         <w:t xml:space="preserve">. University of Alabama Press, Tuscaloosa.</w:t>
       </w:r>
     </w:p>
-    <w:bookmarkEnd w:id="104"/>
-    <w:bookmarkStart w:id="105" w:name="ref-mesoudi_2021"/>
+    <w:bookmarkEnd w:id="112"/>
+    <w:bookmarkStart w:id="113" w:name="ref-mesoudi_2021"/>
     <w:p>
       <w:pPr>
         <w:pStyle w:val="Bibliography"/>
@@ -3709,8 +4000,8 @@
         <w:t xml:space="preserve">376:20200053.</w:t>
       </w:r>
     </w:p>
-    <w:bookmarkEnd w:id="105"/>
-    <w:bookmarkStart w:id="106" w:name="ref-mitchem_2001"/>
+    <w:bookmarkEnd w:id="113"/>
+    <w:bookmarkStart w:id="114" w:name="ref-mitchem_2001"/>
     <w:p>
       <w:pPr>
         <w:pStyle w:val="Bibliography"/>
@@ -3740,8 +4031,8 @@
         <w:t xml:space="preserve">.</w:t>
       </w:r>
     </w:p>
-    <w:bookmarkEnd w:id="106"/>
-    <w:bookmarkStart w:id="107" w:name="ref-morse_morse_1996"/>
+    <w:bookmarkEnd w:id="114"/>
+    <w:bookmarkStart w:id="115" w:name="ref-morse_morse_1996"/>
     <w:p>
       <w:pPr>
         <w:pStyle w:val="Bibliography"/>
@@ -3778,8 +4069,8 @@
         <w:t xml:space="preserve">17(1):1–35.</w:t>
       </w:r>
     </w:p>
-    <w:bookmarkEnd w:id="107"/>
-    <w:bookmarkStart w:id="108" w:name="ref-morse_1990"/>
+    <w:bookmarkEnd w:id="115"/>
+    <w:bookmarkStart w:id="116" w:name="ref-morse_1990"/>
     <w:p>
       <w:pPr>
         <w:pStyle w:val="Bibliography"/>
@@ -3839,8 +4130,8 @@
         <w:t xml:space="preserve">, edited by David H. Dye and Cheryl Anne Cox, pp. 118–134. University of Alabama Press, Tuscaloosa.</w:t>
       </w:r>
     </w:p>
-    <w:bookmarkEnd w:id="108"/>
-    <w:bookmarkStart w:id="109" w:name="ref-neiman_1995"/>
+    <w:bookmarkEnd w:id="116"/>
+    <w:bookmarkStart w:id="117" w:name="ref-neiman_1995"/>
     <w:p>
       <w:pPr>
         <w:pStyle w:val="Bibliography"/>
@@ -3883,8 +4174,8 @@
         <w:t xml:space="preserve">60(1):7–36.</w:t>
       </w:r>
     </w:p>
-    <w:bookmarkEnd w:id="109"/>
-    <w:bookmarkStart w:id="110" w:name="ref-perreault_2019"/>
+    <w:bookmarkEnd w:id="117"/>
+    <w:bookmarkStart w:id="118" w:name="ref-perreault_2019"/>
     <w:p>
       <w:pPr>
         <w:pStyle w:val="Bibliography"/>
@@ -3906,8 +4197,8 @@
         <w:t xml:space="preserve">. University of Chicago Press, Chicago.</w:t>
       </w:r>
     </w:p>
-    <w:bookmarkEnd w:id="110"/>
-    <w:bookmarkStart w:id="111" w:name="ref-phillips_1970"/>
+    <w:bookmarkEnd w:id="118"/>
+    <w:bookmarkStart w:id="119" w:name="ref-phillips_1970"/>
     <w:p>
       <w:pPr>
         <w:pStyle w:val="Bibliography"/>
@@ -3978,8 +4269,8 @@
         <w:t xml:space="preserve">, Vol. 60. Papers of the Peabody Museum of Archaeology and Ethnology. Peabody Museum, Harvard University, Cambridge, MA.</w:t>
       </w:r>
     </w:p>
-    <w:bookmarkEnd w:id="111"/>
-    <w:bookmarkStart w:id="112" w:name="ref-phillips_ford_griffin_1951"/>
+    <w:bookmarkEnd w:id="119"/>
+    <w:bookmarkStart w:id="120" w:name="ref-phillips_ford_griffin_1951"/>
     <w:p>
       <w:pPr>
         <w:pStyle w:val="Bibliography"/>
@@ -4029,8 +4320,8 @@
         <w:t xml:space="preserve">, Vol. 25. Papers of the Peabody Museum of American Archaeology and Ethnology. Peabody Museum, Harvard University, Cambridge, MA.</w:t>
       </w:r>
     </w:p>
-    <w:bookmarkEnd w:id="112"/>
-    <w:bookmarkStart w:id="114" w:name="ref-premo_2014"/>
+    <w:bookmarkEnd w:id="120"/>
+    <w:bookmarkStart w:id="122" w:name="ref-premo_2014"/>
     <w:p>
       <w:pPr>
         <w:pStyle w:val="Bibliography"/>
@@ -4057,7 +4348,7 @@
       <w:r>
         <w:t xml:space="preserve"> </w:t>
       </w:r>
-      <w:hyperlink r:id="rId113">
+      <w:hyperlink r:id="rId121">
         <w:r>
           <w:rPr>
             <w:rStyle w:val="Hyperlink"/>
@@ -4069,8 +4360,8 @@
         <w:t xml:space="preserve">.</w:t>
       </w:r>
     </w:p>
-    <w:bookmarkEnd w:id="114"/>
-    <w:bookmarkStart w:id="115" w:name="ref-rees_political_culture"/>
+    <w:bookmarkEnd w:id="122"/>
+    <w:bookmarkStart w:id="123" w:name="ref-rees_political_culture"/>
     <w:p>
       <w:pPr>
         <w:pStyle w:val="Bibliography"/>
@@ -4094,8 +4385,75 @@
         <w:t xml:space="preserve">. Ph.D. dissertation, University of Oklahoma, Norman.</w:t>
       </w:r>
     </w:p>
-    <w:bookmarkEnd w:id="115"/>
-    <w:bookmarkStart w:id="117" w:name="ref-richerson_etal_2016"/>
+    <w:bookmarkEnd w:id="123"/>
+    <w:bookmarkStart w:id="125" w:name="ref-reimer_etal_2020"/>
+    <w:p>
+      <w:pPr>
+        <w:pStyle w:val="Bibliography"/>
+      </w:pPr>
+      <w:r>
+        <w:t xml:space="preserve">Reimer, Paula J. et al.</w:t>
+      </w:r>
+      <w:r>
+        <w:t xml:space="preserve"> 2020. The</w:t>
+      </w:r>
+      <w:r>
+        <w:t xml:space="preserve"> </w:t>
+      </w:r>
+      <w:r>
+        <w:t xml:space="preserve">IntCal20</w:t>
+      </w:r>
+      <w:r>
+        <w:t xml:space="preserve"> </w:t>
+      </w:r>
+      <w:r>
+        <w:t xml:space="preserve">Northern</w:t>
+      </w:r>
+      <w:r>
+        <w:t xml:space="preserve"> </w:t>
+      </w:r>
+      <w:r>
+        <w:t xml:space="preserve">Hemisphere</w:t>
+      </w:r>
+      <w:r>
+        <w:t xml:space="preserve"> </w:t>
+      </w:r>
+      <w:r>
+        <w:t xml:space="preserve">Radiocarbon Age Calibration Curve (0–55 Cal kBP).</w:t>
+      </w:r>
+      <w:r>
+        <w:t xml:space="preserve"> </w:t>
+      </w:r>
+      <w:r>
+        <w:rPr>
+          <w:i/>
+          <w:iCs/>
+        </w:rPr>
+        <w:t xml:space="preserve">Radiocarbon</w:t>
+      </w:r>
+      <w:r>
+        <w:t xml:space="preserve"> </w:t>
+      </w:r>
+      <w:r>
+        <w:t xml:space="preserve">62(4):725–757.</w:t>
+      </w:r>
+      <w:r>
+        <w:t xml:space="preserve"> </w:t>
+      </w:r>
+      <w:hyperlink r:id="rId124">
+        <w:r>
+          <w:rPr>
+            <w:rStyle w:val="Hyperlink"/>
+          </w:rPr>
+          <w:t xml:space="preserve">https://doi.org/10.1017/RDC.2020.41</w:t>
+        </w:r>
+      </w:hyperlink>
+      <w:r>
+        <w:t xml:space="preserve">.</w:t>
+      </w:r>
+    </w:p>
+    <w:bookmarkEnd w:id="125"/>
+    <w:bookmarkStart w:id="127" w:name="ref-richerson_etal_2016"/>
     <w:p>
       <w:pPr>
         <w:pStyle w:val="Bibliography"/>
@@ -4122,7 +4480,7 @@
       <w:r>
         <w:t xml:space="preserve"> </w:t>
       </w:r>
-      <w:hyperlink r:id="rId116">
+      <w:hyperlink r:id="rId126">
         <w:r>
           <w:rPr>
             <w:rStyle w:val="Hyperlink"/>
@@ -4134,8 +4492,74 @@
         <w:t xml:space="preserve">.</w:t>
       </w:r>
     </w:p>
-    <w:bookmarkEnd w:id="117"/>
-    <w:bookmarkStart w:id="118" w:name="ref-ross-stallings_2017"/>
+    <w:bookmarkEnd w:id="127"/>
+    <w:bookmarkStart w:id="129" w:name="ref-riede_hoggard_shennan_2019"/>
+    <w:p>
+      <w:pPr>
+        <w:pStyle w:val="Bibliography"/>
+      </w:pPr>
+      <w:r>
+        <w:t xml:space="preserve">Riede, Felix, Christian Hoggard, and Stephen Shennan. 2019. Reconciling Material Cultures in Archaeology with Genetic Data Requires Robust Cultural Evolutionary Taxonomies.</w:t>
+      </w:r>
+      <w:r>
+        <w:t xml:space="preserve"> </w:t>
+      </w:r>
+      <w:r>
+        <w:rPr>
+          <w:i/>
+          <w:iCs/>
+        </w:rPr>
+        <w:t xml:space="preserve">Palgrave Communications</w:t>
+      </w:r>
+      <w:r>
+        <w:t xml:space="preserve"> </w:t>
+      </w:r>
+      <w:r>
+        <w:t xml:space="preserve">5:55.</w:t>
+      </w:r>
+      <w:r>
+        <w:t xml:space="preserve"> </w:t>
+      </w:r>
+      <w:hyperlink r:id="rId128">
+        <w:r>
+          <w:rPr>
+            <w:rStyle w:val="Hyperlink"/>
+          </w:rPr>
+          <w:t xml:space="preserve">https://doi.org/10.1057/s41599-019-0260-7</w:t>
+        </w:r>
+      </w:hyperlink>
+      <w:r>
+        <w:t xml:space="preserve">.</w:t>
+      </w:r>
+    </w:p>
+    <w:bookmarkEnd w:id="129"/>
+    <w:bookmarkStart w:id="130" w:name="ref-robinson_1951"/>
+    <w:p>
+      <w:pPr>
+        <w:pStyle w:val="Bibliography"/>
+      </w:pPr>
+      <w:r>
+        <w:t xml:space="preserve">Robinson, W. S. 1951. A Method for Chronologically Ordering Archaeological Deposits.</w:t>
+      </w:r>
+      <w:r>
+        <w:t xml:space="preserve"> </w:t>
+      </w:r>
+      <w:r>
+        <w:rPr>
+          <w:i/>
+          <w:iCs/>
+        </w:rPr>
+        <w:t xml:space="preserve">American Antiquity</w:t>
+      </w:r>
+      <w:r>
+        <w:t xml:space="preserve"> </w:t>
+      </w:r>
+      <w:r>
+        <w:t xml:space="preserve">16(4):293–301.</w:t>
+      </w:r>
+    </w:p>
+    <w:bookmarkEnd w:id="130"/>
+    <w:bookmarkStart w:id="131" w:name="ref-ross-stallings_2017"/>
     <w:p>
       <w:pPr>
         <w:pStyle w:val="Bibliography"/>
@@ -4169,8 +4593,8 @@
         <w:t xml:space="preserve">, edited by Haagen D. Klaus, Amanda R. Harvey, and Mark N. Cohen, pp. 329–362. University Press of Florida, Gainesville.</w:t>
       </w:r>
     </w:p>
-    <w:bookmarkEnd w:id="118"/>
-    <w:bookmarkStart w:id="120" w:name="ref-scheffer_2009"/>
+    <w:bookmarkEnd w:id="131"/>
+    <w:bookmarkStart w:id="133" w:name="ref-scheffer_2009"/>
     <w:p>
       <w:pPr>
         <w:pStyle w:val="Bibliography"/>
@@ -4197,7 +4621,7 @@
       <w:r>
         <w:t xml:space="preserve"> </w:t>
       </w:r>
-      <w:hyperlink r:id="rId119">
+      <w:hyperlink r:id="rId132">
         <w:r>
           <w:rPr>
             <w:rStyle w:val="Hyperlink"/>
@@ -4209,8 +4633,8 @@
         <w:t xml:space="preserve">.</w:t>
       </w:r>
     </w:p>
-    <w:bookmarkEnd w:id="120"/>
-    <w:bookmarkStart w:id="121" w:name="ref-schiffer_1972"/>
+    <w:bookmarkEnd w:id="133"/>
+    <w:bookmarkStart w:id="134" w:name="ref-schiffer_1972"/>
     <w:p>
       <w:pPr>
         <w:pStyle w:val="Bibliography"/>
@@ -4235,8 +4659,8 @@
         <w:t xml:space="preserve">37(2):156–165.</w:t>
       </w:r>
     </w:p>
-    <w:bookmarkEnd w:id="121"/>
-    <w:bookmarkStart w:id="122" w:name="ref-shennan_wilkinson_2001"/>
+    <w:bookmarkEnd w:id="134"/>
+    <w:bookmarkStart w:id="135" w:name="ref-shennan_wilkinson_2001"/>
     <w:p>
       <w:pPr>
         <w:pStyle w:val="Bibliography"/>
@@ -4276,8 +4700,8 @@
         <w:t xml:space="preserve">66(4):577–593.</w:t>
       </w:r>
     </w:p>
-    <w:bookmarkEnd w:id="122"/>
-    <w:bookmarkStart w:id="124" w:name="ref-sullivan_2024"/>
+    <w:bookmarkEnd w:id="135"/>
+    <w:bookmarkStart w:id="137" w:name="ref-sullivan_2024"/>
     <w:p>
       <w:pPr>
         <w:pStyle w:val="Bibliography"/>
@@ -4328,7 +4752,7 @@
       <w:r>
         <w:t xml:space="preserve"> </w:t>
       </w:r>
-      <w:hyperlink r:id="rId123">
+      <w:hyperlink r:id="rId136">
         <w:r>
           <w:rPr>
             <w:rStyle w:val="Hyperlink"/>
@@ -4340,8 +4764,8 @@
         <w:t xml:space="preserve">.</w:t>
       </w:r>
     </w:p>
-    <w:bookmarkEnd w:id="124"/>
-    <w:bookmarkStart w:id="125" w:name="ref-tomasovych_kidwell_2009"/>
+    <w:bookmarkEnd w:id="137"/>
+    <w:bookmarkStart w:id="138" w:name="ref-tomasovych_kidwell_2009"/>
     <w:p>
       <w:pPr>
         <w:pStyle w:val="Bibliography"/>
@@ -4366,8 +4790,8 @@
         <w:t xml:space="preserve">35(1):94–118.</w:t>
       </w:r>
     </w:p>
-    <w:bookmarkEnd w:id="125"/>
-    <w:bookmarkStart w:id="127" w:name="ref-tomasovych_kidwell_2010"/>
+    <w:bookmarkEnd w:id="138"/>
+    <w:bookmarkStart w:id="140" w:name="ref-tomasovych_kidwell_2010"/>
     <w:p>
       <w:pPr>
         <w:pStyle w:val="Bibliography"/>
@@ -4394,7 +4818,7 @@
       <w:r>
         <w:t xml:space="preserve"> </w:t>
       </w:r>
-      <w:hyperlink r:id="rId126">
+      <w:hyperlink r:id="rId139">
         <w:r>
           <w:rPr>
             <w:rStyle w:val="Hyperlink"/>
@@ -4406,8 +4830,8 @@
         <w:t xml:space="preserve">.</w:t>
       </w:r>
     </w:p>
-    <w:bookmarkEnd w:id="127"/>
-    <w:bookmarkStart w:id="128" w:name="ref-williams_1954"/>
+    <w:bookmarkEnd w:id="140"/>
+    <w:bookmarkStart w:id="141" w:name="ref-williams_1954"/>
     <w:p>
       <w:pPr>
         <w:pStyle w:val="Bibliography"/>
@@ -4416,8 +4840,8 @@
         <w:t xml:space="preserve">Williams, Stephen. 1954. An Archeological Study of the Mississippian Culture in Southeast Missouri. PhD thesis, Yale University, New Haven.</w:t>
       </w:r>
     </w:p>
-    <w:bookmarkEnd w:id="128"/>
-    <w:bookmarkStart w:id="129" w:name="ref-williams_1990"/>
+    <w:bookmarkEnd w:id="141"/>
+    <w:bookmarkStart w:id="142" w:name="ref-williams_1990"/>
     <w:p>
       <w:pPr>
         <w:pStyle w:val="Bibliography"/>
@@ -4453,10 +4877,10 @@
         <w:t xml:space="preserve">, edited by David H. Dye and Cheryl Anne Cox, pp. 170–180. University of Alabama Press, Tuscaloosa.</w:t>
       </w:r>
     </w:p>
-    <w:bookmarkEnd w:id="129"/>
-    <w:bookmarkEnd w:id="130"/>
-    <w:bookmarkEnd w:id="131"/>
-    <w:bookmarkEnd w:id="132"/>
+    <w:bookmarkEnd w:id="142"/>
+    <w:bookmarkEnd w:id="143"/>
+    <w:bookmarkEnd w:id="144"/>
+    <w:bookmarkEnd w:id="145"/>
     <w:sectPr>
       <w:footnotePr>
         <w:numRestart w:val="eachSect"/>

</xml_diff>

<commit_message>
References: integrate deep lit-review findings (20 works across four pillars)
Cultural-transmission theory: Eerkens & Lipo 2005/2007, Boyd & Richerson via
Richerson; phase-concept foundations Willey & Phillips 1958 and Phillips & Willey
1953. Seriation / evolutionary archaeology: Lipo, Madsen, Dunnell & Hunt 1997
(foundational), Dunnell 1970 and 1978, Smith & Neiman 2007, Graves & Cachola-Abad
1996, Lipo, Hunt & Hundtoft 2010 (mata'a/spatial), Ladefoged & Graves 2000.
Time-averaging: Bailey 2007, Perreault 2018, Miller-Atkins & Premo 2018. CMV /
political dynamics: Morse & Morse 1983, Blitz 1999, Anderson 1996, Beck 2003,
Hally 1993 and 1996. All placed at the claims they support; bibliography now 89
entries, 87 cited, no orphan citations.
</commit_message>
<xml_diff>
--- a/docs/manuscript/MAIN_TEXT.docx
+++ b/docs/manuscript/MAIN_TEXT.docx
@@ -2,7 +2,7 @@
 <file path=word/document.xml><?xml version="1.0" encoding="utf-8"?>
 <w:document xmlns:w="http://schemas.openxmlformats.org/wordprocessingml/2006/main" xmlns:m="http://schemas.openxmlformats.org/officeDocument/2006/math" xmlns:r="http://schemas.openxmlformats.org/officeDocument/2006/relationships" xmlns:o="urn:schemas-microsoft-com:office:office" xmlns:v="urn:schemas-microsoft-com:vml" xmlns:w10="urn:schemas-microsoft-com:office:word" xmlns:a="http://schemas.openxmlformats.org/drawingml/2006/main" xmlns:pic="http://schemas.openxmlformats.org/drawingml/2006/picture" xmlns:wp="http://schemas.openxmlformats.org/drawingml/2006/wordprocessingDrawing">
   <w:body>
-    <w:bookmarkStart w:id="145" w:name="X093902eb68652ea32f5548e74607f4e4b0f6699"/>
+    <w:bookmarkStart w:id="176" w:name="X093902eb68652ea32f5548e74607f4e4b0f6699"/>
     <w:p>
       <w:pPr>
         <w:pStyle w:val="Heading1"/>
@@ -137,7 +137,16 @@
         <w:t xml:space="preserve">(Phillips et al. 1951)</w:t>
       </w:r>
       <w:r>
-        <w:t xml:space="preserve">. From its definition, the phase carried a social interpretation. In the Phillips-Ford-Griffin framework, it is the basic space-time-cultural unit. Williams, defining the southeast-Missouri phases on which the regional scheme rests, wrote that a phase probably equals a society</w:t>
+        <w:t xml:space="preserve">. From its definition, the phase carried a social interpretation. In the Phillips-Ford-Griffin framework, it is the basic space-time-cultural unit</w:t>
+      </w:r>
+      <w:r>
+        <w:t xml:space="preserve"> </w:t>
+      </w:r>
+      <w:r>
+        <w:t xml:space="preserve">(Phillips and Willey 1953; Willey and Phillips 1958)</w:t>
+      </w:r>
+      <w:r>
+        <w:t xml:space="preserve">. Williams, defining the southeast-Missouri phases on which the regional scheme rests, wrote that a phase probably equals a society</w:t>
       </w:r>
       <w:r>
         <w:t xml:space="preserve"> </w:t>
@@ -169,7 +178,7 @@
         <w:t xml:space="preserve"> </w:t>
       </w:r>
       <w:r>
-        <w:t xml:space="preserve">(Bentley et al. 2004; Fogarty et al. 2024; Neiman 1995)</w:t>
+        <w:t xml:space="preserve">(Bentley et al. 2004; Eerkens and Lipo 2007; Fogarty et al. 2024; Neiman 1995)</w:t>
       </w:r>
       <w:r>
         <w:t xml:space="preserve">. When those learners interact more with near neighbors than with distant ones, drift on the spatially structured population generates within-greater-than-between similarity on its own, apparent clusters produced by geography with no bounded group anywhere</w:t>
@@ -204,51 +213,51 @@
         <w:t xml:space="preserve"> </w:t>
       </w:r>
       <w:r>
+        <w:t xml:space="preserve">(Lipo et al. 1997, 2010, 2015; Neiman 1995)</w:t>
+      </w:r>
+      <w:r>
+        <w:t xml:space="preserve">. The late pre-contact central Mississippi Valley is a favorable place to look, both because its decorated assemblages are well documented and because European contact and the subsequent demographic collapse ended the sequence before any later reorganization could overwrite it</w:t>
+      </w:r>
+      <w:r>
+        <w:t xml:space="preserve"> </w:t>
+      </w:r>
+      <w:r>
+        <w:t xml:space="preserve">(Cobb and Butler 2002)</w:t>
+      </w:r>
+      <w:r>
+        <w:t xml:space="preserve">. We focus first on the Parkin phase of the St. Francis basin (Figure 1) and then widen the test to the other late-period phases of the valley.</w:t>
+      </w:r>
+    </w:p>
+    <w:p>
+      <w:pPr>
+        <w:pStyle w:val="BodyText"/>
+      </w:pPr>
+      <w:r>
+        <w:t xml:space="preserve">The argument rests on a choice about what the ceramic record is. We do not treat an assemblage as a degraded snapshot of a past behavioral moment, to be restored by correcting for the processes that formed it</w:t>
+      </w:r>
+      <w:r>
+        <w:t xml:space="preserve"> </w:t>
+      </w:r>
+      <w:r>
+        <w:t xml:space="preserve">(Schiffer 1972)</w:t>
+      </w:r>
+      <w:r>
+        <w:t xml:space="preserve">. We treat it as what it is, a time-averaged accumulation whose decorated-type frequencies are the population-level residue of social learning, to be measured and explained directly rather than reconstructed</w:t>
+      </w:r>
+      <w:r>
+        <w:t xml:space="preserve"> </w:t>
+      </w:r>
+      <w:r>
         <w:t xml:space="preserve">(Lipo et al. 2015; Neiman 1995)</w:t>
       </w:r>
       <w:r>
-        <w:t xml:space="preserve">. The late pre-contact central Mississippi Valley is a favorable place to look, both because its decorated assemblages are well documented and because European contact and the subsequent demographic collapse ended the sequence before any later reorganization could overwrite it</w:t>
-      </w:r>
-      <w:r>
-        <w:t xml:space="preserve"> </w:t>
-      </w:r>
-      <w:r>
-        <w:t xml:space="preserve">(Cobb and Butler 2002)</w:t>
-      </w:r>
-      <w:r>
-        <w:t xml:space="preserve">. We focus first on the Parkin phase of the St. Francis basin (Figure 1) and then widen the test to the other late-period phases of the valley.</w:t>
-      </w:r>
-    </w:p>
-    <w:p>
-      <w:pPr>
-        <w:pStyle w:val="BodyText"/>
-      </w:pPr>
-      <w:r>
-        <w:t xml:space="preserve">The argument rests on a choice about what the ceramic record is. We do not treat an assemblage as a degraded snapshot of a past behavioral moment, to be restored by correcting for the processes that formed it</w:t>
-      </w:r>
-      <w:r>
-        <w:t xml:space="preserve"> </w:t>
-      </w:r>
-      <w:r>
-        <w:t xml:space="preserve">(Schiffer 1972)</w:t>
-      </w:r>
-      <w:r>
-        <w:t xml:space="preserve">. We treat it as what it is, a time-averaged accumulation whose decorated-type frequencies are the population-level residue of social learning, to be measured and explained directly rather than reconstructed</w:t>
-      </w:r>
-      <w:r>
-        <w:t xml:space="preserve"> </w:t>
-      </w:r>
-      <w:r>
-        <w:t xml:space="preserve">(Lipo et al. 2015; Neiman 1995)</w:t>
-      </w:r>
-      <w:r>
         <w:t xml:space="preserve">. This is an evolutionary position in which the record is the evolving phenotype to be explained rather than a window onto a vanished behavioral system</w:t>
       </w:r>
       <w:r>
         <w:t xml:space="preserve"> </w:t>
       </w:r>
       <w:r>
-        <w:t xml:space="preserve">(Dunnell 1995)</w:t>
+        <w:t xml:space="preserve">(Dunnell 1978, 1995; Ladefoged and Graves 2000)</w:t>
       </w:r>
       <w:r>
         <w:t xml:space="preserve">, and it converges with the recognition that the deposit is not a frozen tableau</w:t>
@@ -266,7 +275,7 @@
         <w:t xml:space="preserve"> </w:t>
       </w:r>
       <w:r>
-        <w:t xml:space="preserve">(Holdaway and Wandsnider 2008; Perreault 2019)</w:t>
+        <w:t xml:space="preserve">(Bailey 2007; Holdaway and Wandsnider 2008; Perreault 2019)</w:t>
       </w:r>
       <w:r>
         <w:t xml:space="preserve">. Time-averaging, therefore, sets the resolution of the question rather than disqualifying it. A reorganization of transmission large enough to matter over the two centuries of the Parkin phase should register in the averaged frequency structure, and the drift-versus-groups test we develop reads that structure directly rather than an imagined moment behind it.</w:t>
@@ -392,7 +401,7 @@
         <w:t xml:space="preserve"> </w:t>
       </w:r>
       <w:r>
-        <w:t xml:space="preserve">(McNutt 1996; Phillips et al. 1951; Williams 1954)</w:t>
+        <w:t xml:space="preserve">(McNutt 1996; Morse and Morse 1983; Phillips et al. 1951; Williams 1954)</w:t>
       </w:r>
       <w:r>
         <w:t xml:space="preserve">. The premise is not arbitrary. Under the neutral transmission model, it would hold if learning were confined within social boundaries, so that decoration drifted in separate pools and diverged between them. The difficulty is that the same within-greater-than-between similarity arises with no boundary at all when interaction declines with distance, because spatially structured drift concentrates similarity among near neighbors</w:t>
@@ -493,7 +502,7 @@
         <w:t xml:space="preserve"> </w:t>
       </w:r>
       <w:r>
-        <w:t xml:space="preserve">(Bentley et al. 2004; Bentley 2008; Neiman 1995)</w:t>
+        <w:t xml:space="preserve">(Bentley et al. 2004; Bentley 2008; Eerkens and Lipo 2005; Neiman 1995)</w:t>
       </w:r>
       <w:r>
         <w:t xml:space="preserve">. Neutral style is the null condition: assemblages drawn from a single interacting community share one drifting pool, and their decorated-type frequencies admit a single battleship-curve seriation</w:t>
@@ -618,7 +627,7 @@
         <w:t xml:space="preserve"> </w:t>
       </w:r>
       <w:r>
-        <w:t xml:space="preserve">(King and Freer 1995; Lulewicz 2019; Rees 2001)</w:t>
+        <w:t xml:space="preserve">(Anderson 1996; Beck 2003; Blitz 1999; King and Freer 1995; Lulewicz 2019; Rees 2001)</w:t>
       </w:r>
       <w:r>
         <w:t xml:space="preserve">. The chronicles describe Casqui and its neighbor Pacaha in open conflict, which fits a landscape of competing peers, though the same sources have also been read as ranking Casqui below Pacaha, and the chronicle ethnography is thin and filtered</w:t>
@@ -1257,7 +1266,7 @@
         <w:t xml:space="preserve"> </w:t>
       </w:r>
       <w:r>
-        <w:t xml:space="preserve">(Madsen 2012)</w:t>
+        <w:t xml:space="preserve">(Madsen 2012; Miller-Atkins and Premo 2018)</w:t>
       </w:r>
       <w:r>
         <w:t xml:space="preserve">. The units transmitted are also durable objects rather than potters, which displaces the neutral expectation from the standard population-genetic null</w:t>
@@ -1311,7 +1320,7 @@
         <w:t xml:space="preserve"> </w:t>
       </w:r>
       <w:r>
-        <w:t xml:space="preserve">(Baxter 1994)</w:t>
+        <w:t xml:space="preserve">(Baxter 1994; Smith and Neiman 2007)</w:t>
       </w:r>
       <w:r>
         <w:t xml:space="preserve">. This ordination arranges assemblages along axes that summarize their decorated-type-frequency differences, as a relative chronological ordinate oriented so that higher positions correspond to later time (Figure 3). Pooling the dates of the five proveniences that match curated assemblages, the pooled median calibrated ages correlate with seriation position at Spearman +0.70 (n = 5, 27 dates pooled), an improvement on the +0.50 of the single-date anchors, with four of the five sites in calendar order and one late-dated site departing from it. The axis, therefore, tracks calendar time, but imperfectly. The trajectory we test is ordinal, not a calendar rate, and the discriminating quantity, the size-controlled F_ST trend, is a magnitude invariant to the axis orientation, so only the directional descriptions of the other signatures depend on the anchor. We return to both limits in the discussion.</w:t>
@@ -1441,7 +1450,7 @@
         <w:t xml:space="preserve"> </w:t>
       </w:r>
       <w:r>
-        <w:t xml:space="preserve">(Lipo et al. 2015)</w:t>
+        <w:t xml:space="preserve">(Dunnell 1970; Graves and Cachola-Abad 1996; Lipo et al. 1997, 2015)</w:t>
       </w:r>
       <w:r>
         <w:t xml:space="preserve">. A set of assemblages is co-seriable if some ordering renders every decorated type both unimodal and continuous, and the method returns the complete set of maximal co-seriable groups. A single group denotes a single interacting community. A proliferation of small, non-co-seriable groups indicates a fragmented one. We report the number and size of these groups and, for each assemblage, the number of distinct groups it joins, which identifies assemblages that bridge otherwise incompatible orderings.</w:t>
@@ -1906,7 +1915,16 @@
         <w:t xml:space="preserve">(Mitchem 2001; Morse 1990)</w:t>
       </w:r>
       <w:r>
-        <w:t xml:space="preserve">, so we base the settlement comparison on recorded mound height rather than on mound area. Parkin’s roughly 17-acre site area would make it the largest center in the basin, but that figure is the total site area rather than the basal mound area on which the other sites are measured, and we treat it as indicative only. The settlement record thus shows a prominent center within a graded size distribution, not an administrative tier set above the rest, the same picture the transmission test returns (Figure 7).</w:t>
+        <w:t xml:space="preserve">, so we base the settlement comparison on recorded mound height rather than on mound area. Parkin’s roughly 17-acre site area would make it the largest center in the basin, but that figure is the total site area rather than the basal mound area on which the other sites are measured, and we treat it as indicative only. The settlement record thus shows a prominent center within a graded size distribution, not an administrative tier set above the rest</w:t>
+      </w:r>
+      <w:r>
+        <w:t xml:space="preserve"> </w:t>
+      </w:r>
+      <w:r>
+        <w:t xml:space="preserve">(Hally 1993, 1996)</w:t>
+      </w:r>
+      <w:r>
+        <w:t xml:space="preserve">, the same picture the transmission test returns (Figure 7).</w:t>
       </w:r>
     </w:p>
     <w:p>
@@ -2073,7 +2091,7 @@
         <w:t xml:space="preserve"> </w:t>
       </w:r>
       <w:r>
-        <w:t xml:space="preserve">(Kidwell and Tomašových 2013; Tomašových and Kidwell 2009, 2010)</w:t>
+        <w:t xml:space="preserve">(Kidwell and Tomašových 2013; Perreault 2018; Tomašových and Kidwell 2009, 2010)</w:t>
       </w:r>
       <w:r>
         <w:t xml:space="preserve">. Rather than argue that this makes the absence conservative, we built the damping into the recovery experiment directly, where it raises the detection threshold from s of 0.5 to 0.7, the quantified cost of the record’s temporal mixing. The verdict is stable across the watershed (19 assemblages) and corridor (29) basin definitions. The central methodological finding is that telling a bounded group from drift must be calibrated to the record to which it is applied. The same four signatures that discriminate cleanly on idealized data reduce, on a real time-averaged record of this size, to a single confound-controlled signature, and saying so is what licenses reading the structure as drift rather than weakening the claim.</w:t>
@@ -2350,7 +2368,7 @@
       </w:r>
     </w:p>
     <w:bookmarkEnd w:id="52"/>
-    <w:bookmarkStart w:id="144" w:name="references"/>
+    <w:bookmarkStart w:id="175" w:name="references"/>
     <w:p>
       <w:pPr>
         <w:pStyle w:val="Heading2"/>
@@ -2359,8 +2377,71 @@
         <w:t xml:space="preserve">References</w:t>
       </w:r>
     </w:p>
-    <w:bookmarkStart w:id="143" w:name="refs"/>
-    <w:bookmarkStart w:id="53" w:name="ref-baxter_1994"/>
+    <w:bookmarkStart w:id="174" w:name="refs"/>
+    <w:bookmarkStart w:id="53" w:name="ref-anderson_1996"/>
+    <w:p>
+      <w:pPr>
+        <w:pStyle w:val="Bibliography"/>
+      </w:pPr>
+      <w:r>
+        <w:t xml:space="preserve">Anderson, David G. 1996. Fluctuations Between Simple and Complex Chiefdoms: Cycling in the Late Prehistoric Southeast. In</w:t>
+      </w:r>
+      <w:r>
+        <w:t xml:space="preserve"> </w:t>
+      </w:r>
+      <w:r>
+        <w:rPr>
+          <w:i/>
+          <w:iCs/>
+        </w:rPr>
+        <w:t xml:space="preserve">Political Structure and Change in the Prehistoric Southeastern United States</w:t>
+      </w:r>
+      <w:r>
+        <w:t xml:space="preserve">, edited by John F. Scarry, pp. 231–252. University Press of Florida, Gainesville.</w:t>
+      </w:r>
+    </w:p>
+    <w:bookmarkEnd w:id="53"/>
+    <w:bookmarkStart w:id="55" w:name="ref-bailey_2007"/>
+    <w:p>
+      <w:pPr>
+        <w:pStyle w:val="Bibliography"/>
+      </w:pPr>
+      <w:r>
+        <w:t xml:space="preserve">Bailey, Geoff. 2007. Time Perspectives, Palimpsests and the Archaeology of Time.</w:t>
+      </w:r>
+      <w:r>
+        <w:t xml:space="preserve"> </w:t>
+      </w:r>
+      <w:r>
+        <w:rPr>
+          <w:i/>
+          <w:iCs/>
+        </w:rPr>
+        <w:t xml:space="preserve">Journal of Anthropological Archaeology</w:t>
+      </w:r>
+      <w:r>
+        <w:t xml:space="preserve"> </w:t>
+      </w:r>
+      <w:r>
+        <w:t xml:space="preserve">26(2):198–223.</w:t>
+      </w:r>
+      <w:r>
+        <w:t xml:space="preserve"> </w:t>
+      </w:r>
+      <w:hyperlink r:id="rId54">
+        <w:r>
+          <w:rPr>
+            <w:rStyle w:val="Hyperlink"/>
+          </w:rPr>
+          <w:t xml:space="preserve">https://doi.org/10.1016/j.jaa.2006.08.002</w:t>
+        </w:r>
+      </w:hyperlink>
+      <w:r>
+        <w:t xml:space="preserve">.</w:t>
+      </w:r>
+    </w:p>
+    <w:bookmarkEnd w:id="55"/>
+    <w:bookmarkStart w:id="56" w:name="ref-baxter_1994"/>
     <w:p>
       <w:pPr>
         <w:pStyle w:val="Bibliography"/>
@@ -2382,8 +2463,60 @@
         <w:t xml:space="preserve">. Edinburgh University Press, Edinburgh.</w:t>
       </w:r>
     </w:p>
-    <w:bookmarkEnd w:id="53"/>
-    <w:bookmarkStart w:id="55" w:name="ref-bell_richerson_mcelreath_2009"/>
+    <w:bookmarkEnd w:id="56"/>
+    <w:bookmarkStart w:id="58" w:name="ref-beck_2003"/>
+    <w:p>
+      <w:pPr>
+        <w:pStyle w:val="Bibliography"/>
+      </w:pPr>
+      <w:r>
+        <w:t xml:space="preserve">Beck, Jr., Robin A. 2003. Consolidation and Hierarchy: Chiefdom Variability in the</w:t>
+      </w:r>
+      <w:r>
+        <w:t xml:space="preserve"> </w:t>
+      </w:r>
+      <w:r>
+        <w:t xml:space="preserve">Mississippian</w:t>
+      </w:r>
+      <w:r>
+        <w:t xml:space="preserve"> </w:t>
+      </w:r>
+      <w:r>
+        <w:t xml:space="preserve">Southeast.</w:t>
+      </w:r>
+      <w:r>
+        <w:t xml:space="preserve"> </w:t>
+      </w:r>
+      <w:r>
+        <w:rPr>
+          <w:i/>
+          <w:iCs/>
+        </w:rPr>
+        <w:t xml:space="preserve">American Antiquity</w:t>
+      </w:r>
+      <w:r>
+        <w:t xml:space="preserve"> </w:t>
+      </w:r>
+      <w:r>
+        <w:t xml:space="preserve">68(4):641–661.</w:t>
+      </w:r>
+      <w:r>
+        <w:t xml:space="preserve"> </w:t>
+      </w:r>
+      <w:hyperlink r:id="rId57">
+        <w:r>
+          <w:rPr>
+            <w:rStyle w:val="Hyperlink"/>
+          </w:rPr>
+          <w:t xml:space="preserve">https://doi.org/10.2307/3557066</w:t>
+        </w:r>
+      </w:hyperlink>
+      <w:r>
+        <w:t xml:space="preserve">.</w:t>
+      </w:r>
+    </w:p>
+    <w:bookmarkEnd w:id="58"/>
+    <w:bookmarkStart w:id="60" w:name="ref-bell_richerson_mcelreath_2009"/>
     <w:p>
       <w:pPr>
         <w:pStyle w:val="Bibliography"/>
@@ -2410,7 +2543,7 @@
       <w:r>
         <w:t xml:space="preserve"> </w:t>
       </w:r>
-      <w:hyperlink r:id="rId54">
+      <w:hyperlink r:id="rId59">
         <w:r>
           <w:rPr>
             <w:rStyle w:val="Hyperlink"/>
@@ -2422,8 +2555,8 @@
         <w:t xml:space="preserve">.</w:t>
       </w:r>
     </w:p>
-    <w:bookmarkEnd w:id="55"/>
-    <w:bookmarkStart w:id="57" w:name="ref-bentley_2008"/>
+    <w:bookmarkEnd w:id="60"/>
+    <w:bookmarkStart w:id="62" w:name="ref-bentley_2008"/>
     <w:p>
       <w:pPr>
         <w:pStyle w:val="Bibliography"/>
@@ -2450,7 +2583,7 @@
       <w:r>
         <w:t xml:space="preserve"> </w:t>
       </w:r>
-      <w:hyperlink r:id="rId56">
+      <w:hyperlink r:id="rId61">
         <w:r>
           <w:rPr>
             <w:rStyle w:val="Hyperlink"/>
@@ -2462,8 +2595,8 @@
         <w:t xml:space="preserve">.</w:t>
       </w:r>
     </w:p>
-    <w:bookmarkEnd w:id="57"/>
-    <w:bookmarkStart w:id="59" w:name="ref-bentley_hahn_shennan_2004"/>
+    <w:bookmarkEnd w:id="62"/>
+    <w:bookmarkStart w:id="64" w:name="ref-bentley_hahn_shennan_2004"/>
     <w:p>
       <w:pPr>
         <w:pStyle w:val="Bibliography"/>
@@ -2490,7 +2623,7 @@
       <w:r>
         <w:t xml:space="preserve"> </w:t>
       </w:r>
-      <w:hyperlink r:id="rId58">
+      <w:hyperlink r:id="rId63">
         <w:r>
           <w:rPr>
             <w:rStyle w:val="Hyperlink"/>
@@ -2502,8 +2635,8 @@
         <w:t xml:space="preserve">.</w:t>
       </w:r>
     </w:p>
-    <w:bookmarkEnd w:id="59"/>
-    <w:bookmarkStart w:id="60" w:name="ref-binford_1981"/>
+    <w:bookmarkEnd w:id="64"/>
+    <w:bookmarkStart w:id="65" w:name="ref-binford_1981"/>
     <w:p>
       <w:pPr>
         <w:pStyle w:val="Bibliography"/>
@@ -2543,8 +2676,60 @@
         <w:t xml:space="preserve">37(3):195–208.</w:t>
       </w:r>
     </w:p>
-    <w:bookmarkEnd w:id="60"/>
-    <w:bookmarkStart w:id="61" w:name="ref-brainerd_1951"/>
+    <w:bookmarkEnd w:id="65"/>
+    <w:bookmarkStart w:id="67" w:name="ref-blitz_1999"/>
+    <w:p>
+      <w:pPr>
+        <w:pStyle w:val="Bibliography"/>
+      </w:pPr>
+      <w:r>
+        <w:t xml:space="preserve">Blitz, John H. 1999.</w:t>
+      </w:r>
+      <w:r>
+        <w:t xml:space="preserve"> </w:t>
+      </w:r>
+      <w:r>
+        <w:t xml:space="preserve">Mississippian</w:t>
+      </w:r>
+      <w:r>
+        <w:t xml:space="preserve"> </w:t>
+      </w:r>
+      <w:r>
+        <w:t xml:space="preserve">Chiefdoms and the Fission-Fusion Process.</w:t>
+      </w:r>
+      <w:r>
+        <w:t xml:space="preserve"> </w:t>
+      </w:r>
+      <w:r>
+        <w:rPr>
+          <w:i/>
+          <w:iCs/>
+        </w:rPr>
+        <w:t xml:space="preserve">American Antiquity</w:t>
+      </w:r>
+      <w:r>
+        <w:t xml:space="preserve"> </w:t>
+      </w:r>
+      <w:r>
+        <w:t xml:space="preserve">64(4):577–592.</w:t>
+      </w:r>
+      <w:r>
+        <w:t xml:space="preserve"> </w:t>
+      </w:r>
+      <w:hyperlink r:id="rId66">
+        <w:r>
+          <w:rPr>
+            <w:rStyle w:val="Hyperlink"/>
+          </w:rPr>
+          <w:t xml:space="preserve">https://doi.org/10.2307/2694206</w:t>
+        </w:r>
+      </w:hyperlink>
+      <w:r>
+        <w:t xml:space="preserve">.</w:t>
+      </w:r>
+    </w:p>
+    <w:bookmarkEnd w:id="67"/>
+    <w:bookmarkStart w:id="68" w:name="ref-brainerd_1951"/>
     <w:p>
       <w:pPr>
         <w:pStyle w:val="Bibliography"/>
@@ -2569,8 +2754,8 @@
         <w:t xml:space="preserve">16(4):301–313.</w:t>
       </w:r>
     </w:p>
-    <w:bookmarkEnd w:id="61"/>
-    <w:bookmarkStart w:id="63" w:name="ref-carrignon_bentley_ruck_2019"/>
+    <w:bookmarkEnd w:id="68"/>
+    <w:bookmarkStart w:id="70" w:name="ref-carrignon_bentley_ruck_2019"/>
     <w:p>
       <w:pPr>
         <w:pStyle w:val="Bibliography"/>
@@ -2621,7 +2806,7 @@
       <w:r>
         <w:t xml:space="preserve"> </w:t>
       </w:r>
-      <w:hyperlink r:id="rId62">
+      <w:hyperlink r:id="rId69">
         <w:r>
           <w:rPr>
             <w:rStyle w:val="Hyperlink"/>
@@ -2633,8 +2818,8 @@
         <w:t xml:space="preserve">.</w:t>
       </w:r>
     </w:p>
-    <w:bookmarkEnd w:id="63"/>
-    <w:bookmarkStart w:id="64" w:name="ref-cobb_2000"/>
+    <w:bookmarkEnd w:id="70"/>
+    <w:bookmarkStart w:id="71" w:name="ref-cobb_2000"/>
     <w:p>
       <w:pPr>
         <w:pStyle w:val="Bibliography"/>
@@ -2684,8 +2869,8 @@
         <w:t xml:space="preserve">. University of Alabama Press, Tuscaloosa.</w:t>
       </w:r>
     </w:p>
-    <w:bookmarkEnd w:id="64"/>
-    <w:bookmarkStart w:id="65" w:name="ref-cobb_butler_2002"/>
+    <w:bookmarkEnd w:id="71"/>
+    <w:bookmarkStart w:id="72" w:name="ref-cobb_butler_2002"/>
     <w:p>
       <w:pPr>
         <w:pStyle w:val="Bibliography"/>
@@ -2734,8 +2919,8 @@
         <w:t xml:space="preserve">67(4):625–641.</w:t>
       </w:r>
     </w:p>
-    <w:bookmarkEnd w:id="65"/>
-    <w:bookmarkStart w:id="67" w:name="ref-crema_bortolini_lake_2023"/>
+    <w:bookmarkEnd w:id="72"/>
+    <w:bookmarkStart w:id="74" w:name="ref-crema_bortolini_lake_2023"/>
     <w:p>
       <w:pPr>
         <w:pStyle w:val="Bibliography"/>
@@ -2762,7 +2947,7 @@
       <w:r>
         <w:t xml:space="preserve"> </w:t>
       </w:r>
-      <w:hyperlink r:id="rId66">
+      <w:hyperlink r:id="rId73">
         <w:r>
           <w:rPr>
             <w:rStyle w:val="Hyperlink"/>
@@ -2774,8 +2959,8 @@
         <w:t xml:space="preserve">.</w:t>
       </w:r>
     </w:p>
-    <w:bookmarkEnd w:id="67"/>
-    <w:bookmarkStart w:id="69" w:name="ref-crema_kandler_shennan_2016"/>
+    <w:bookmarkEnd w:id="74"/>
+    <w:bookmarkStart w:id="76" w:name="ref-crema_kandler_shennan_2016"/>
     <w:p>
       <w:pPr>
         <w:pStyle w:val="Bibliography"/>
@@ -2802,7 +2987,7 @@
       <w:r>
         <w:t xml:space="preserve"> </w:t>
       </w:r>
-      <w:hyperlink r:id="rId68">
+      <w:hyperlink r:id="rId75">
         <w:r>
           <w:rPr>
             <w:rStyle w:val="Hyperlink"/>
@@ -2814,8 +2999,8 @@
         <w:t xml:space="preserve">.</w:t>
       </w:r>
     </w:p>
-    <w:bookmarkEnd w:id="69"/>
-    <w:bookmarkStart w:id="71" w:name="ref-dakos_2012"/>
+    <w:bookmarkEnd w:id="76"/>
+    <w:bookmarkStart w:id="78" w:name="ref-dakos_2012"/>
     <w:p>
       <w:pPr>
         <w:pStyle w:val="Bibliography"/>
@@ -2842,7 +3027,7 @@
       <w:r>
         <w:t xml:space="preserve"> </w:t>
       </w:r>
-      <w:hyperlink r:id="rId70">
+      <w:hyperlink r:id="rId77">
         <w:r>
           <w:rPr>
             <w:rStyle w:val="Hyperlink"/>
@@ -2854,8 +3039,88 @@
         <w:t xml:space="preserve">.</w:t>
       </w:r>
     </w:p>
-    <w:bookmarkEnd w:id="71"/>
-    <w:bookmarkStart w:id="72" w:name="ref-dunnell_1995"/>
+    <w:bookmarkEnd w:id="78"/>
+    <w:bookmarkStart w:id="80" w:name="ref-dunnell_1970"/>
+    <w:p>
+      <w:pPr>
+        <w:pStyle w:val="Bibliography"/>
+      </w:pPr>
+      <w:r>
+        <w:t xml:space="preserve">Dunnell, Robert C. 1970. Seriation Method and Its Evaluation.</w:t>
+      </w:r>
+      <w:r>
+        <w:t xml:space="preserve"> </w:t>
+      </w:r>
+      <w:r>
+        <w:rPr>
+          <w:i/>
+          <w:iCs/>
+        </w:rPr>
+        <w:t xml:space="preserve">American Antiquity</w:t>
+      </w:r>
+      <w:r>
+        <w:t xml:space="preserve"> </w:t>
+      </w:r>
+      <w:r>
+        <w:t xml:space="preserve">35(3):305–319.</w:t>
+      </w:r>
+      <w:r>
+        <w:t xml:space="preserve"> </w:t>
+      </w:r>
+      <w:hyperlink r:id="rId79">
+        <w:r>
+          <w:rPr>
+            <w:rStyle w:val="Hyperlink"/>
+          </w:rPr>
+          <w:t xml:space="preserve">https://doi.org/10.2307/278341</w:t>
+        </w:r>
+      </w:hyperlink>
+      <w:r>
+        <w:t xml:space="preserve">.</w:t>
+      </w:r>
+    </w:p>
+    <w:bookmarkEnd w:id="80"/>
+    <w:bookmarkStart w:id="82" w:name="ref-dunnell_1978"/>
+    <w:p>
+      <w:pPr>
+        <w:pStyle w:val="Bibliography"/>
+      </w:pPr>
+      <w:r>
+        <w:t xml:space="preserve">Dunnell, Robert C. 1978. Style and Function: A Fundamental Dichotomy.</w:t>
+      </w:r>
+      <w:r>
+        <w:t xml:space="preserve"> </w:t>
+      </w:r>
+      <w:r>
+        <w:rPr>
+          <w:i/>
+          <w:iCs/>
+        </w:rPr>
+        <w:t xml:space="preserve">American Antiquity</w:t>
+      </w:r>
+      <w:r>
+        <w:t xml:space="preserve"> </w:t>
+      </w:r>
+      <w:r>
+        <w:t xml:space="preserve">43(2):192–202.</w:t>
+      </w:r>
+      <w:r>
+        <w:t xml:space="preserve"> </w:t>
+      </w:r>
+      <w:hyperlink r:id="rId81">
+        <w:r>
+          <w:rPr>
+            <w:rStyle w:val="Hyperlink"/>
+          </w:rPr>
+          <w:t xml:space="preserve">https://doi.org/10.2307/279244</w:t>
+        </w:r>
+      </w:hyperlink>
+      <w:r>
+        <w:t xml:space="preserve">.</w:t>
+      </w:r>
+    </w:p>
+    <w:bookmarkEnd w:id="82"/>
+    <w:bookmarkStart w:id="83" w:name="ref-dunnell_1995"/>
     <w:p>
       <w:pPr>
         <w:pStyle w:val="Bibliography"/>
@@ -2877,8 +3142,8 @@
         <w:t xml:space="preserve">, edited by Patrice A. Teltser, pp. 33–50. University of Arizona Press, Tucson.</w:t>
       </w:r>
     </w:p>
-    <w:bookmarkEnd w:id="72"/>
-    <w:bookmarkStart w:id="73" w:name="ref-dye_cox_1990"/>
+    <w:bookmarkEnd w:id="83"/>
+    <w:bookmarkStart w:id="84" w:name="ref-dye_cox_1990"/>
     <w:p>
       <w:pPr>
         <w:pStyle w:val="Bibliography"/>
@@ -2914,8 +3179,88 @@
         <w:t xml:space="preserve">. University of Alabama Press, Tuscaloosa.</w:t>
       </w:r>
     </w:p>
-    <w:bookmarkEnd w:id="73"/>
-    <w:bookmarkStart w:id="74" w:name="ref-ewens_1972"/>
+    <w:bookmarkEnd w:id="84"/>
+    <w:bookmarkStart w:id="86" w:name="ref-eerkens_lipo_2005"/>
+    <w:p>
+      <w:pPr>
+        <w:pStyle w:val="Bibliography"/>
+      </w:pPr>
+      <w:r>
+        <w:t xml:space="preserve">Eerkens, Jelmer W., and Carl P. Lipo. 2005. Cultural Transmission, Copying Errors, and the Generation of Variation in Material Culture and the Archaeological Record.</w:t>
+      </w:r>
+      <w:r>
+        <w:t xml:space="preserve"> </w:t>
+      </w:r>
+      <w:r>
+        <w:rPr>
+          <w:i/>
+          <w:iCs/>
+        </w:rPr>
+        <w:t xml:space="preserve">Journal of Anthropological Archaeology</w:t>
+      </w:r>
+      <w:r>
+        <w:t xml:space="preserve"> </w:t>
+      </w:r>
+      <w:r>
+        <w:t xml:space="preserve">24(4):316–334.</w:t>
+      </w:r>
+      <w:r>
+        <w:t xml:space="preserve"> </w:t>
+      </w:r>
+      <w:hyperlink r:id="rId85">
+        <w:r>
+          <w:rPr>
+            <w:rStyle w:val="Hyperlink"/>
+          </w:rPr>
+          <w:t xml:space="preserve">https://doi.org/10.1016/j.jaa.2005.08.001</w:t>
+        </w:r>
+      </w:hyperlink>
+      <w:r>
+        <w:t xml:space="preserve">.</w:t>
+      </w:r>
+    </w:p>
+    <w:bookmarkEnd w:id="86"/>
+    <w:bookmarkStart w:id="88" w:name="ref-eerkens_lipo_2007"/>
+    <w:p>
+      <w:pPr>
+        <w:pStyle w:val="Bibliography"/>
+      </w:pPr>
+      <w:r>
+        <w:t xml:space="preserve">Eerkens, Jelmer W., and Carl P. Lipo. 2007. Cultural Transmission Theory and the Archaeological Record: Providing Context to Understanding Variation and Temporal Changes in Material Culture.</w:t>
+      </w:r>
+      <w:r>
+        <w:t xml:space="preserve"> </w:t>
+      </w:r>
+      <w:r>
+        <w:rPr>
+          <w:i/>
+          <w:iCs/>
+        </w:rPr>
+        <w:t xml:space="preserve">Journal of Archaeological Research</w:t>
+      </w:r>
+      <w:r>
+        <w:t xml:space="preserve"> </w:t>
+      </w:r>
+      <w:r>
+        <w:t xml:space="preserve">15(3):239–274.</w:t>
+      </w:r>
+      <w:r>
+        <w:t xml:space="preserve"> </w:t>
+      </w:r>
+      <w:hyperlink r:id="rId87">
+        <w:r>
+          <w:rPr>
+            <w:rStyle w:val="Hyperlink"/>
+          </w:rPr>
+          <w:t xml:space="preserve">https://doi.org/10.1007/s10814-007-9013-z</w:t>
+        </w:r>
+      </w:hyperlink>
+      <w:r>
+        <w:t xml:space="preserve">.</w:t>
+      </w:r>
+    </w:p>
+    <w:bookmarkEnd w:id="88"/>
+    <w:bookmarkStart w:id="89" w:name="ref-ewens_1972"/>
     <w:p>
       <w:pPr>
         <w:pStyle w:val="Bibliography"/>
@@ -2940,8 +3285,8 @@
         <w:t xml:space="preserve">3(1):87–112.</w:t>
       </w:r>
     </w:p>
-    <w:bookmarkEnd w:id="74"/>
-    <w:bookmarkStart w:id="76" w:name="ref-feder_kryazhimskiy_plotkin_2014"/>
+    <w:bookmarkEnd w:id="89"/>
+    <w:bookmarkStart w:id="91" w:name="ref-feder_kryazhimskiy_plotkin_2014"/>
     <w:p>
       <w:pPr>
         <w:pStyle w:val="Bibliography"/>
@@ -2968,7 +3313,7 @@
       <w:r>
         <w:t xml:space="preserve"> </w:t>
       </w:r>
-      <w:hyperlink r:id="rId75">
+      <w:hyperlink r:id="rId90">
         <w:r>
           <w:rPr>
             <w:rStyle w:val="Hyperlink"/>
@@ -2980,8 +3325,8 @@
         <w:t xml:space="preserve">.</w:t>
       </w:r>
     </w:p>
-    <w:bookmarkEnd w:id="76"/>
-    <w:bookmarkStart w:id="78" w:name="ref-fogarty_kandler_creanza_2024"/>
+    <w:bookmarkEnd w:id="91"/>
+    <w:bookmarkStart w:id="93" w:name="ref-fogarty_kandler_creanza_2024"/>
     <w:p>
       <w:pPr>
         <w:pStyle w:val="Bibliography"/>
@@ -3008,7 +3353,7 @@
       <w:r>
         <w:t xml:space="preserve"> </w:t>
       </w:r>
-      <w:hyperlink r:id="rId77">
+      <w:hyperlink r:id="rId92">
         <w:r>
           <w:rPr>
             <w:rStyle w:val="Hyperlink"/>
@@ -3020,8 +3365,8 @@
         <w:t xml:space="preserve">.</w:t>
       </w:r>
     </w:p>
-    <w:bookmarkEnd w:id="78"/>
-    <w:bookmarkStart w:id="79" w:name="ref-fox_1998"/>
+    <w:bookmarkEnd w:id="93"/>
+    <w:bookmarkStart w:id="94" w:name="ref-fox_1998"/>
     <w:p>
       <w:pPr>
         <w:pStyle w:val="Bibliography"/>
@@ -3043,8 +3388,113 @@
         <w:t xml:space="preserve">, edited by Michael J. O’Brien and Robert C. Dunnell, pp. 31–58. University of Alabama Press, Tuscaloosa.</w:t>
       </w:r>
     </w:p>
-    <w:bookmarkEnd w:id="79"/>
-    <w:bookmarkStart w:id="80" w:name="ref-holdaway_wandsnider_2008"/>
+    <w:bookmarkEnd w:id="94"/>
+    <w:bookmarkStart w:id="95" w:name="ref-graves_cachola-abad_1996"/>
+    <w:p>
+      <w:pPr>
+        <w:pStyle w:val="Bibliography"/>
+      </w:pPr>
+      <w:r>
+        <w:t xml:space="preserve">Graves, Michael W., and C. Kehaunani Cachola-Abad. 1996. Seriation as a Method of Chronologically Ordering Architectural Design Traits: An Example from</w:t>
+      </w:r>
+      <w:r>
+        <w:t xml:space="preserve"> </w:t>
+      </w:r>
+      <w:r>
+        <w:t xml:space="preserve">Hawai’i</w:t>
+      </w:r>
+      <w:r>
+        <w:t xml:space="preserve">.</w:t>
+      </w:r>
+      <w:r>
+        <w:t xml:space="preserve"> </w:t>
+      </w:r>
+      <w:r>
+        <w:rPr>
+          <w:i/>
+          <w:iCs/>
+        </w:rPr>
+        <w:t xml:space="preserve">Archaeology in Oceania</w:t>
+      </w:r>
+      <w:r>
+        <w:t xml:space="preserve"> </w:t>
+      </w:r>
+      <w:r>
+        <w:t xml:space="preserve">31(1):19–32.</w:t>
+      </w:r>
+    </w:p>
+    <w:bookmarkEnd w:id="95"/>
+    <w:bookmarkStart w:id="96" w:name="ref-hally_1993"/>
+    <w:p>
+      <w:pPr>
+        <w:pStyle w:val="Bibliography"/>
+      </w:pPr>
+      <w:r>
+        <w:t xml:space="preserve">Hally, David J. 1993. The Territorial Size of</w:t>
+      </w:r>
+      <w:r>
+        <w:t xml:space="preserve"> </w:t>
+      </w:r>
+      <w:r>
+        <w:t xml:space="preserve">Mississippian</w:t>
+      </w:r>
+      <w:r>
+        <w:t xml:space="preserve"> </w:t>
+      </w:r>
+      <w:r>
+        <w:t xml:space="preserve">Chiefdoms. In</w:t>
+      </w:r>
+      <w:r>
+        <w:t xml:space="preserve"> </w:t>
+      </w:r>
+      <w:r>
+        <w:rPr>
+          <w:i/>
+          <w:iCs/>
+        </w:rPr>
+        <w:t xml:space="preserve">Archaeology of Eastern North America: Papers in Honor of Stephen Williams</w:t>
+      </w:r>
+      <w:r>
+        <w:t xml:space="preserve">, edited by James B. Stoltman, pp. 143–168. Archaeological Report No. 25. Mississippi Department of Archives; History, Jackson.</w:t>
+      </w:r>
+    </w:p>
+    <w:bookmarkEnd w:id="96"/>
+    <w:bookmarkStart w:id="97" w:name="ref-hally_1996"/>
+    <w:p>
+      <w:pPr>
+        <w:pStyle w:val="Bibliography"/>
+      </w:pPr>
+      <w:r>
+        <w:t xml:space="preserve">Hally, David J. 1996. Platform Mound Construction and the Instability of</w:t>
+      </w:r>
+      <w:r>
+        <w:t xml:space="preserve"> </w:t>
+      </w:r>
+      <w:r>
+        <w:t xml:space="preserve">Mississippian</w:t>
+      </w:r>
+      <w:r>
+        <w:t xml:space="preserve"> </w:t>
+      </w:r>
+      <w:r>
+        <w:t xml:space="preserve">Chiefdoms. In</w:t>
+      </w:r>
+      <w:r>
+        <w:t xml:space="preserve"> </w:t>
+      </w:r>
+      <w:r>
+        <w:rPr>
+          <w:i/>
+          <w:iCs/>
+        </w:rPr>
+        <w:t xml:space="preserve">Political Structure and Change in the Prehistoric Southeastern United States</w:t>
+      </w:r>
+      <w:r>
+        <w:t xml:space="preserve">, edited by John F. Scarry, pp. 92–127. University Press of Florida, Gainesville.</w:t>
+      </w:r>
+    </w:p>
+    <w:bookmarkEnd w:id="97"/>
+    <w:bookmarkStart w:id="98" w:name="ref-holdaway_wandsnider_2008"/>
     <w:p>
       <w:pPr>
         <w:pStyle w:val="Bibliography"/>
@@ -3066,8 +3516,8 @@
         <w:t xml:space="preserve">. University of Utah Press, Salt Lake City.</w:t>
       </w:r>
     </w:p>
-    <w:bookmarkEnd w:id="80"/>
-    <w:bookmarkStart w:id="82" w:name="ref-holland-lulewicz_ritchison_2021"/>
+    <w:bookmarkEnd w:id="98"/>
+    <w:bookmarkStart w:id="100" w:name="ref-holland-lulewicz_ritchison_2021"/>
     <w:p>
       <w:pPr>
         <w:pStyle w:val="Bibliography"/>
@@ -3094,7 +3544,7 @@
       <w:r>
         <w:t xml:space="preserve"> </w:t>
       </w:r>
-      <w:hyperlink r:id="rId81">
+      <w:hyperlink r:id="rId99">
         <w:r>
           <w:rPr>
             <w:rStyle w:val="Hyperlink"/>
@@ -3106,8 +3556,8 @@
         <w:t xml:space="preserve">.</w:t>
       </w:r>
     </w:p>
-    <w:bookmarkEnd w:id="82"/>
-    <w:bookmarkStart w:id="83" w:name="ref-hudson_smith_depratter_1990"/>
+    <w:bookmarkEnd w:id="100"/>
+    <w:bookmarkStart w:id="101" w:name="ref-hudson_smith_depratter_1990"/>
     <w:p>
       <w:pPr>
         <w:pStyle w:val="Bibliography"/>
@@ -3167,8 +3617,8 @@
         <w:t xml:space="preserve">, edited by David H. Dye and Cheryl Anne Cox, pp. 181–207. University of Alabama Press, Tuscaloosa.</w:t>
       </w:r>
     </w:p>
-    <w:bookmarkEnd w:id="83"/>
-    <w:bookmarkStart w:id="85" w:name="ref-hunt_2006"/>
+    <w:bookmarkEnd w:id="101"/>
+    <w:bookmarkStart w:id="103" w:name="ref-hunt_2006"/>
     <w:p>
       <w:pPr>
         <w:pStyle w:val="Bibliography"/>
@@ -3195,7 +3645,7 @@
       <w:r>
         <w:t xml:space="preserve"> </w:t>
       </w:r>
-      <w:hyperlink r:id="rId84">
+      <w:hyperlink r:id="rId102">
         <w:r>
           <w:rPr>
             <w:rStyle w:val="Hyperlink"/>
@@ -3207,8 +3657,8 @@
         <w:t xml:space="preserve">.</w:t>
       </w:r>
     </w:p>
-    <w:bookmarkEnd w:id="85"/>
-    <w:bookmarkStart w:id="87" w:name="ref-hunt_bell_travis_2008"/>
+    <w:bookmarkEnd w:id="103"/>
+    <w:bookmarkStart w:id="105" w:name="ref-hunt_bell_travis_2008"/>
     <w:p>
       <w:pPr>
         <w:pStyle w:val="Bibliography"/>
@@ -3235,7 +3685,7 @@
       <w:r>
         <w:t xml:space="preserve"> </w:t>
       </w:r>
-      <w:hyperlink r:id="rId86">
+      <w:hyperlink r:id="rId104">
         <w:r>
           <w:rPr>
             <w:rStyle w:val="Hyperlink"/>
@@ -3247,8 +3697,8 @@
         <w:t xml:space="preserve">.</w:t>
       </w:r>
     </w:p>
-    <w:bookmarkEnd w:id="87"/>
-    <w:bookmarkStart w:id="88" w:name="ref-hurlbert_1971"/>
+    <w:bookmarkEnd w:id="105"/>
+    <w:bookmarkStart w:id="106" w:name="ref-hurlbert_1971"/>
     <w:p>
       <w:pPr>
         <w:pStyle w:val="Bibliography"/>
@@ -3273,8 +3723,8 @@
         <w:t xml:space="preserve">52(4):577–586.</w:t>
       </w:r>
     </w:p>
-    <w:bookmarkEnd w:id="88"/>
-    <w:bookmarkStart w:id="90" w:name="ref-kandler_shennan_2013"/>
+    <w:bookmarkEnd w:id="106"/>
+    <w:bookmarkStart w:id="108" w:name="ref-kandler_shennan_2013"/>
     <w:p>
       <w:pPr>
         <w:pStyle w:val="Bibliography"/>
@@ -3301,7 +3751,7 @@
       <w:r>
         <w:t xml:space="preserve"> </w:t>
       </w:r>
-      <w:hyperlink r:id="rId89">
+      <w:hyperlink r:id="rId107">
         <w:r>
           <w:rPr>
             <w:rStyle w:val="Hyperlink"/>
@@ -3313,8 +3763,8 @@
         <w:t xml:space="preserve">.</w:t>
       </w:r>
     </w:p>
-    <w:bookmarkEnd w:id="90"/>
-    <w:bookmarkStart w:id="92" w:name="ref-kandler_shennan_2015"/>
+    <w:bookmarkEnd w:id="108"/>
+    <w:bookmarkStart w:id="110" w:name="ref-kandler_shennan_2015"/>
     <w:p>
       <w:pPr>
         <w:pStyle w:val="Bibliography"/>
@@ -3353,7 +3803,7 @@
       <w:r>
         <w:t xml:space="preserve"> </w:t>
       </w:r>
-      <w:hyperlink r:id="rId91">
+      <w:hyperlink r:id="rId109">
         <w:r>
           <w:rPr>
             <w:rStyle w:val="Hyperlink"/>
@@ -3365,8 +3815,8 @@
         <w:t xml:space="preserve">.</w:t>
       </w:r>
     </w:p>
-    <w:bookmarkEnd w:id="92"/>
-    <w:bookmarkStart w:id="94" w:name="ref-kandler_wilder_fortunato_2017"/>
+    <w:bookmarkEnd w:id="110"/>
+    <w:bookmarkStart w:id="112" w:name="ref-kandler_wilder_fortunato_2017"/>
     <w:p>
       <w:pPr>
         <w:pStyle w:val="Bibliography"/>
@@ -3393,7 +3843,7 @@
       <w:r>
         <w:t xml:space="preserve"> </w:t>
       </w:r>
-      <w:hyperlink r:id="rId93">
+      <w:hyperlink r:id="rId111">
         <w:r>
           <w:rPr>
             <w:rStyle w:val="Hyperlink"/>
@@ -3405,8 +3855,8 @@
         <w:t xml:space="preserve">.</w:t>
       </w:r>
     </w:p>
-    <w:bookmarkEnd w:id="94"/>
-    <w:bookmarkStart w:id="96" w:name="ref-kidwell_tomasovych_2013"/>
+    <w:bookmarkEnd w:id="112"/>
+    <w:bookmarkStart w:id="114" w:name="ref-kidwell_tomasovych_2013"/>
     <w:p>
       <w:pPr>
         <w:pStyle w:val="Bibliography"/>
@@ -3433,7 +3883,7 @@
       <w:r>
         <w:t xml:space="preserve"> </w:t>
       </w:r>
-      <w:hyperlink r:id="rId95">
+      <w:hyperlink r:id="rId113">
         <w:r>
           <w:rPr>
             <w:rStyle w:val="Hyperlink"/>
@@ -3445,8 +3895,8 @@
         <w:t xml:space="preserve">.</w:t>
       </w:r>
     </w:p>
-    <w:bookmarkEnd w:id="96"/>
-    <w:bookmarkStart w:id="97" w:name="ref-king_freer_1995"/>
+    <w:bookmarkEnd w:id="114"/>
+    <w:bookmarkStart w:id="115" w:name="ref-king_freer_1995"/>
     <w:p>
       <w:pPr>
         <w:pStyle w:val="Bibliography"/>
@@ -3480,8 +3930,52 @@
         <w:t xml:space="preserve">, edited by Michael S. Nassaney and Kenneth E. Sassaman, pp. 266–288. University of Tennessee Press, Knoxville.</w:t>
       </w:r>
     </w:p>
-    <w:bookmarkEnd w:id="97"/>
-    <w:bookmarkStart w:id="98" w:name="ref-lewontin_1974"/>
+    <w:bookmarkEnd w:id="115"/>
+    <w:bookmarkStart w:id="116" w:name="ref-ladefoged_graves_2000"/>
+    <w:p>
+      <w:pPr>
+        <w:pStyle w:val="Bibliography"/>
+      </w:pPr>
+      <w:r>
+        <w:t xml:space="preserve">Ladefoged, Thegn N., and Michael W. Graves. 2000. Evolutionary Theory and the Historical Development of Dry-Land Agriculture in North</w:t>
+      </w:r>
+      <w:r>
+        <w:t xml:space="preserve"> </w:t>
+      </w:r>
+      <w:r>
+        <w:t xml:space="preserve">Kohala</w:t>
+      </w:r>
+      <w:r>
+        <w:t xml:space="preserve">,</w:t>
+      </w:r>
+      <w:r>
+        <w:t xml:space="preserve"> </w:t>
+      </w:r>
+      <w:r>
+        <w:t xml:space="preserve">Hawai’i</w:t>
+      </w:r>
+      <w:r>
+        <w:t xml:space="preserve">.</w:t>
+      </w:r>
+      <w:r>
+        <w:t xml:space="preserve"> </w:t>
+      </w:r>
+      <w:r>
+        <w:rPr>
+          <w:i/>
+          <w:iCs/>
+        </w:rPr>
+        <w:t xml:space="preserve">American Antiquity</w:t>
+      </w:r>
+      <w:r>
+        <w:t xml:space="preserve"> </w:t>
+      </w:r>
+      <w:r>
+        <w:t xml:space="preserve">65(3):423–448.</w:t>
+      </w:r>
+    </w:p>
+    <w:bookmarkEnd w:id="116"/>
+    <w:bookmarkStart w:id="117" w:name="ref-lewontin_1974"/>
     <w:p>
       <w:pPr>
         <w:pStyle w:val="Bibliography"/>
@@ -3503,8 +3997,8 @@
         <w:t xml:space="preserve">. Columbia University Press, New York.</w:t>
       </w:r>
     </w:p>
-    <w:bookmarkEnd w:id="98"/>
-    <w:bookmarkStart w:id="99" w:name="ref-lipo_2001"/>
+    <w:bookmarkEnd w:id="117"/>
+    <w:bookmarkStart w:id="118" w:name="ref-lipo_2001"/>
     <w:p>
       <w:pPr>
         <w:pStyle w:val="Bibliography"/>
@@ -3554,8 +4048,8 @@
         <w:t xml:space="preserve">. BAR International Series 918. Archaeopress, Oxford.</w:t>
       </w:r>
     </w:p>
-    <w:bookmarkEnd w:id="99"/>
-    <w:bookmarkStart w:id="101" w:name="ref-lipo_dinapoli_madsen_hunt_2021"/>
+    <w:bookmarkEnd w:id="118"/>
+    <w:bookmarkStart w:id="120" w:name="ref-lipo_dinapoli_madsen_hunt_2021"/>
     <w:p>
       <w:pPr>
         <w:pStyle w:val="Bibliography"/>
@@ -3582,7 +4076,7 @@
       <w:r>
         <w:t xml:space="preserve"> </w:t>
       </w:r>
-      <w:hyperlink r:id="rId100">
+      <w:hyperlink r:id="rId119">
         <w:r>
           <w:rPr>
             <w:rStyle w:val="Hyperlink"/>
@@ -3594,8 +4088,8 @@
         <w:t xml:space="preserve">.</w:t>
       </w:r>
     </w:p>
-    <w:bookmarkEnd w:id="101"/>
-    <w:bookmarkStart w:id="102" w:name="ref-lipo_dunnell_2007"/>
+    <w:bookmarkEnd w:id="120"/>
+    <w:bookmarkStart w:id="121" w:name="ref-lipo_dunnell_2007"/>
     <w:p>
       <w:pPr>
         <w:pStyle w:val="Bibliography"/>
@@ -3657,8 +4151,52 @@
         <w:t xml:space="preserve">, edited by Janet Rafferty and Evan Peacock, pp. 125–167. University of Alabama Press, Tuscaloosa.</w:t>
       </w:r>
     </w:p>
-    <w:bookmarkEnd w:id="102"/>
-    <w:bookmarkStart w:id="104" w:name="ref-lipo_madsen_dunnell_2015"/>
+    <w:bookmarkEnd w:id="121"/>
+    <w:bookmarkStart w:id="122" w:name="ref-lipo_hunt_hundtoft_2010"/>
+    <w:p>
+      <w:pPr>
+        <w:pStyle w:val="Bibliography"/>
+      </w:pPr>
+      <w:r>
+        <w:t xml:space="preserve">Lipo, Carl P., Terry L. Hunt, and Brooke Hundtoft. 2010. Stylistic Variability of Stemmed Obsidian Tools (Mata’a), Frequency Seriation, and the Scale of Social Interaction on</w:t>
+      </w:r>
+      <w:r>
+        <w:t xml:space="preserve"> </w:t>
+      </w:r>
+      <w:r>
+        <w:t xml:space="preserve">Rapa</w:t>
+      </w:r>
+      <w:r>
+        <w:t xml:space="preserve"> </w:t>
+      </w:r>
+      <w:r>
+        <w:t xml:space="preserve">Nui</w:t>
+      </w:r>
+      <w:r>
+        <w:t xml:space="preserve"> </w:t>
+      </w:r>
+      <w:r>
+        <w:t xml:space="preserve">(Easter Island).</w:t>
+      </w:r>
+      <w:r>
+        <w:t xml:space="preserve"> </w:t>
+      </w:r>
+      <w:r>
+        <w:rPr>
+          <w:i/>
+          <w:iCs/>
+        </w:rPr>
+        <w:t xml:space="preserve">Journal of Archaeological Science</w:t>
+      </w:r>
+      <w:r>
+        <w:t xml:space="preserve"> </w:t>
+      </w:r>
+      <w:r>
+        <w:t xml:space="preserve">37(10):2551–2561.</w:t>
+      </w:r>
+    </w:p>
+    <w:bookmarkEnd w:id="122"/>
+    <w:bookmarkStart w:id="124" w:name="ref-lipo_madsen_dunnell_2015"/>
     <w:p>
       <w:pPr>
         <w:pStyle w:val="Bibliography"/>
@@ -3685,7 +4223,7 @@
       <w:r>
         <w:t xml:space="preserve"> </w:t>
       </w:r>
-      <w:hyperlink r:id="rId103">
+      <w:hyperlink r:id="rId123">
         <w:r>
           <w:rPr>
             <w:rStyle w:val="Hyperlink"/>
@@ -3697,8 +4235,48 @@
         <w:t xml:space="preserve">.</w:t>
       </w:r>
     </w:p>
-    <w:bookmarkEnd w:id="104"/>
-    <w:bookmarkStart w:id="106" w:name="ref-holland-lulewicz_2019"/>
+    <w:bookmarkEnd w:id="124"/>
+    <w:bookmarkStart w:id="126" w:name="ref-lipo_madsen_dunnell_hunt_1997"/>
+    <w:p>
+      <w:pPr>
+        <w:pStyle w:val="Bibliography"/>
+      </w:pPr>
+      <w:r>
+        <w:t xml:space="preserve">Lipo, Carl P., Mark E. Madsen, Robert C. Dunnell, and Terry Hunt. 1997. Population Structure, Cultural Transmission, and Frequency Seriation.</w:t>
+      </w:r>
+      <w:r>
+        <w:t xml:space="preserve"> </w:t>
+      </w:r>
+      <w:r>
+        <w:rPr>
+          <w:i/>
+          <w:iCs/>
+        </w:rPr>
+        <w:t xml:space="preserve">Journal of Anthropological Archaeology</w:t>
+      </w:r>
+      <w:r>
+        <w:t xml:space="preserve"> </w:t>
+      </w:r>
+      <w:r>
+        <w:t xml:space="preserve">16(4):301–333.</w:t>
+      </w:r>
+      <w:r>
+        <w:t xml:space="preserve"> </w:t>
+      </w:r>
+      <w:hyperlink r:id="rId125">
+        <w:r>
+          <w:rPr>
+            <w:rStyle w:val="Hyperlink"/>
+          </w:rPr>
+          <w:t xml:space="preserve">https://doi.org/10.1006/jaar.1997.0314</w:t>
+        </w:r>
+      </w:hyperlink>
+      <w:r>
+        <w:t xml:space="preserve">.</w:t>
+      </w:r>
+    </w:p>
+    <w:bookmarkEnd w:id="126"/>
+    <w:bookmarkStart w:id="128" w:name="ref-holland-lulewicz_2019"/>
     <w:p>
       <w:pPr>
         <w:pStyle w:val="Bibliography"/>
@@ -3752,7 +4330,7 @@
       <w:r>
         <w:t xml:space="preserve"> </w:t>
       </w:r>
-      <w:hyperlink r:id="rId105">
+      <w:hyperlink r:id="rId127">
         <w:r>
           <w:rPr>
             <w:rStyle w:val="Hyperlink"/>
@@ -3764,8 +4342,8 @@
         <w:t xml:space="preserve">.</w:t>
       </w:r>
     </w:p>
-    <w:bookmarkEnd w:id="106"/>
-    <w:bookmarkStart w:id="107" w:name="ref-madsen_2012"/>
+    <w:bookmarkEnd w:id="128"/>
+    <w:bookmarkStart w:id="129" w:name="ref-madsen_2012"/>
     <w:p>
       <w:pPr>
         <w:pStyle w:val="Bibliography"/>
@@ -3774,8 +4352,8 @@
         <w:t xml:space="preserve">Madsen, Mark E. 2012. Neutral Cultural Transmission in Time-Averaged Archaeological Assemblages. arXiv preprint arXiv:1204.2043 [physics.soc-ph].</w:t>
       </w:r>
     </w:p>
-    <w:bookmarkEnd w:id="107"/>
-    <w:bookmarkStart w:id="108" w:name="ref-mainfort_1996"/>
+    <w:bookmarkEnd w:id="129"/>
+    <w:bookmarkStart w:id="130" w:name="ref-mainfort_1996"/>
     <w:p>
       <w:pPr>
         <w:pStyle w:val="Bibliography"/>
@@ -3824,8 +4402,8 @@
         <w:t xml:space="preserve">15(2):172–181.</w:t>
       </w:r>
     </w:p>
-    <w:bookmarkEnd w:id="108"/>
-    <w:bookmarkStart w:id="109" w:name="ref-mainfort_2001"/>
+    <w:bookmarkEnd w:id="130"/>
+    <w:bookmarkStart w:id="131" w:name="ref-mainfort_2001"/>
     <w:p>
       <w:pPr>
         <w:pStyle w:val="Bibliography"/>
@@ -3859,8 +4437,8 @@
         <w:t xml:space="preserve">, edited by David S. Brose, C. Wesley Cowan, and Jr. Mainfort Robert C., pp. 173–190. Smithsonian Institution Press, Washington, DC.</w:t>
       </w:r>
     </w:p>
-    <w:bookmarkEnd w:id="109"/>
-    <w:bookmarkStart w:id="110" w:name="ref-mainfort_2003"/>
+    <w:bookmarkEnd w:id="131"/>
+    <w:bookmarkStart w:id="132" w:name="ref-mainfort_2003"/>
     <w:p>
       <w:pPr>
         <w:pStyle w:val="Bibliography"/>
@@ -3897,8 +4475,8 @@
         <w:t xml:space="preserve">22(2):176–184.</w:t>
       </w:r>
     </w:p>
-    <w:bookmarkEnd w:id="110"/>
-    <w:bookmarkStart w:id="111" w:name="ref-mantel_1967"/>
+    <w:bookmarkEnd w:id="132"/>
+    <w:bookmarkStart w:id="133" w:name="ref-mantel_1967"/>
     <w:p>
       <w:pPr>
         <w:pStyle w:val="Bibliography"/>
@@ -3923,8 +4501,8 @@
         <w:t xml:space="preserve">27(2):209–220.</w:t>
       </w:r>
     </w:p>
-    <w:bookmarkEnd w:id="111"/>
-    <w:bookmarkStart w:id="112" w:name="ref-mcnutt_ed_1996"/>
+    <w:bookmarkEnd w:id="133"/>
+    <w:bookmarkStart w:id="134" w:name="ref-mcnutt_ed_1996"/>
     <w:p>
       <w:pPr>
         <w:pStyle w:val="Bibliography"/>
@@ -3974,8 +4552,8 @@
         <w:t xml:space="preserve">. University of Alabama Press, Tuscaloosa.</w:t>
       </w:r>
     </w:p>
-    <w:bookmarkEnd w:id="112"/>
-    <w:bookmarkStart w:id="113" w:name="ref-mesoudi_2021"/>
+    <w:bookmarkEnd w:id="134"/>
+    <w:bookmarkStart w:id="135" w:name="ref-mesoudi_2021"/>
     <w:p>
       <w:pPr>
         <w:pStyle w:val="Bibliography"/>
@@ -4000,8 +4578,48 @@
         <w:t xml:space="preserve">376:20200053.</w:t>
       </w:r>
     </w:p>
-    <w:bookmarkEnd w:id="113"/>
-    <w:bookmarkStart w:id="114" w:name="ref-mitchem_2001"/>
+    <w:bookmarkEnd w:id="135"/>
+    <w:bookmarkStart w:id="137" w:name="ref-miller_atkins_premo_2018"/>
+    <w:p>
+      <w:pPr>
+        <w:pStyle w:val="Bibliography"/>
+      </w:pPr>
+      <w:r>
+        <w:t xml:space="preserve">Miller-Atkins, Galen, and L. S. Premo. 2018. Time-Averaging and the Spatial Scale of Regional Cultural Differentiation in Archaeological Assemblages.</w:t>
+      </w:r>
+      <w:r>
+        <w:t xml:space="preserve"> </w:t>
+      </w:r>
+      <w:r>
+        <w:rPr>
+          <w:i/>
+          <w:iCs/>
+        </w:rPr>
+        <w:t xml:space="preserve">STAR: Science and Technology of Archaeological Research</w:t>
+      </w:r>
+      <w:r>
+        <w:t xml:space="preserve"> </w:t>
+      </w:r>
+      <w:r>
+        <w:t xml:space="preserve">4(1):12–27.</w:t>
+      </w:r>
+      <w:r>
+        <w:t xml:space="preserve"> </w:t>
+      </w:r>
+      <w:hyperlink r:id="rId136">
+        <w:r>
+          <w:rPr>
+            <w:rStyle w:val="Hyperlink"/>
+          </w:rPr>
+          <w:t xml:space="preserve">https://doi.org/10.1080/20548923.2018.1504490</w:t>
+        </w:r>
+      </w:hyperlink>
+      <w:r>
+        <w:t xml:space="preserve">.</w:t>
+      </w:r>
+    </w:p>
+    <w:bookmarkEnd w:id="137"/>
+    <w:bookmarkStart w:id="138" w:name="ref-mitchem_2001"/>
     <w:p>
       <w:pPr>
         <w:pStyle w:val="Bibliography"/>
@@ -4031,8 +4649,59 @@
         <w:t xml:space="preserve">.</w:t>
       </w:r>
     </w:p>
-    <w:bookmarkEnd w:id="114"/>
-    <w:bookmarkStart w:id="115" w:name="ref-morse_morse_1996"/>
+    <w:bookmarkEnd w:id="138"/>
+    <w:bookmarkStart w:id="139" w:name="ref-morse_morse_1983"/>
+    <w:p>
+      <w:pPr>
+        <w:pStyle w:val="Bibliography"/>
+      </w:pPr>
+      <w:r>
+        <w:t xml:space="preserve">Morse, Dan F., and Phyllis A. Morse. 1983.</w:t>
+      </w:r>
+      <w:r>
+        <w:t xml:space="preserve"> </w:t>
+      </w:r>
+      <w:r>
+        <w:rPr>
+          <w:i/>
+          <w:iCs/>
+        </w:rPr>
+        <w:t xml:space="preserve">Archaeology of the Central</w:t>
+      </w:r>
+      <w:r>
+        <w:rPr>
+          <w:i/>
+          <w:iCs/>
+        </w:rPr>
+        <w:t xml:space="preserve"> </w:t>
+      </w:r>
+      <w:r>
+        <w:rPr>
+          <w:i/>
+          <w:iCs/>
+        </w:rPr>
+        <w:t xml:space="preserve">Mississippi</w:t>
+      </w:r>
+      <w:r>
+        <w:rPr>
+          <w:i/>
+          <w:iCs/>
+        </w:rPr>
+        <w:t xml:space="preserve"> </w:t>
+      </w:r>
+      <w:r>
+        <w:rPr>
+          <w:i/>
+          <w:iCs/>
+        </w:rPr>
+        <w:t xml:space="preserve">Valley</w:t>
+      </w:r>
+      <w:r>
+        <w:t xml:space="preserve">. Academic Press, New York.</w:t>
+      </w:r>
+    </w:p>
+    <w:bookmarkEnd w:id="139"/>
+    <w:bookmarkStart w:id="140" w:name="ref-morse_morse_1996"/>
     <w:p>
       <w:pPr>
         <w:pStyle w:val="Bibliography"/>
@@ -4069,8 +4738,8 @@
         <w:t xml:space="preserve">17(1):1–35.</w:t>
       </w:r>
     </w:p>
-    <w:bookmarkEnd w:id="115"/>
-    <w:bookmarkStart w:id="116" w:name="ref-morse_1990"/>
+    <w:bookmarkEnd w:id="140"/>
+    <w:bookmarkStart w:id="141" w:name="ref-morse_1990"/>
     <w:p>
       <w:pPr>
         <w:pStyle w:val="Bibliography"/>
@@ -4130,8 +4799,8 @@
         <w:t xml:space="preserve">, edited by David H. Dye and Cheryl Anne Cox, pp. 118–134. University of Alabama Press, Tuscaloosa.</w:t>
       </w:r>
     </w:p>
-    <w:bookmarkEnd w:id="116"/>
-    <w:bookmarkStart w:id="117" w:name="ref-neiman_1995"/>
+    <w:bookmarkEnd w:id="141"/>
+    <w:bookmarkStart w:id="142" w:name="ref-neiman_1995"/>
     <w:p>
       <w:pPr>
         <w:pStyle w:val="Bibliography"/>
@@ -4174,8 +4843,48 @@
         <w:t xml:space="preserve">60(1):7–36.</w:t>
       </w:r>
     </w:p>
-    <w:bookmarkEnd w:id="117"/>
-    <w:bookmarkStart w:id="118" w:name="ref-perreault_2019"/>
+    <w:bookmarkEnd w:id="142"/>
+    <w:bookmarkStart w:id="144" w:name="ref-perreault_2018"/>
+    <w:p>
+      <w:pPr>
+        <w:pStyle w:val="Bibliography"/>
+      </w:pPr>
+      <w:r>
+        <w:t xml:space="preserve">Perreault, Charles. 2018. Time-Averaging Slows down Rates of Change in the Archaeological Record.</w:t>
+      </w:r>
+      <w:r>
+        <w:t xml:space="preserve"> </w:t>
+      </w:r>
+      <w:r>
+        <w:rPr>
+          <w:i/>
+          <w:iCs/>
+        </w:rPr>
+        <w:t xml:space="preserve">Journal of Archaeological Method and Theory</w:t>
+      </w:r>
+      <w:r>
+        <w:t xml:space="preserve"> </w:t>
+      </w:r>
+      <w:r>
+        <w:t xml:space="preserve">25(3):953–964.</w:t>
+      </w:r>
+      <w:r>
+        <w:t xml:space="preserve"> </w:t>
+      </w:r>
+      <w:hyperlink r:id="rId143">
+        <w:r>
+          <w:rPr>
+            <w:rStyle w:val="Hyperlink"/>
+          </w:rPr>
+          <w:t xml:space="preserve">https://doi.org/10.1007/s10816-018-9364-4</w:t>
+        </w:r>
+      </w:hyperlink>
+      <w:r>
+        <w:t xml:space="preserve">.</w:t>
+      </w:r>
+    </w:p>
+    <w:bookmarkEnd w:id="144"/>
+    <w:bookmarkStart w:id="145" w:name="ref-perreault_2019"/>
     <w:p>
       <w:pPr>
         <w:pStyle w:val="Bibliography"/>
@@ -4197,8 +4906,8 @@
         <w:t xml:space="preserve">. University of Chicago Press, Chicago.</w:t>
       </w:r>
     </w:p>
-    <w:bookmarkEnd w:id="118"/>
-    <w:bookmarkStart w:id="119" w:name="ref-phillips_1970"/>
+    <w:bookmarkEnd w:id="145"/>
+    <w:bookmarkStart w:id="146" w:name="ref-phillips_1970"/>
     <w:p>
       <w:pPr>
         <w:pStyle w:val="Bibliography"/>
@@ -4269,8 +4978,8 @@
         <w:t xml:space="preserve">, Vol. 60. Papers of the Peabody Museum of Archaeology and Ethnology. Peabody Museum, Harvard University, Cambridge, MA.</w:t>
       </w:r>
     </w:p>
-    <w:bookmarkEnd w:id="119"/>
-    <w:bookmarkStart w:id="120" w:name="ref-phillips_ford_griffin_1951"/>
+    <w:bookmarkEnd w:id="146"/>
+    <w:bookmarkStart w:id="147" w:name="ref-phillips_ford_griffin_1951"/>
     <w:p>
       <w:pPr>
         <w:pStyle w:val="Bibliography"/>
@@ -4320,8 +5029,48 @@
         <w:t xml:space="preserve">, Vol. 25. Papers of the Peabody Museum of American Archaeology and Ethnology. Peabody Museum, Harvard University, Cambridge, MA.</w:t>
       </w:r>
     </w:p>
-    <w:bookmarkEnd w:id="120"/>
-    <w:bookmarkStart w:id="122" w:name="ref-premo_2014"/>
+    <w:bookmarkEnd w:id="147"/>
+    <w:bookmarkStart w:id="149" w:name="ref-phillips_willey_1953"/>
+    <w:p>
+      <w:pPr>
+        <w:pStyle w:val="Bibliography"/>
+      </w:pPr>
+      <w:r>
+        <w:t xml:space="preserve">Phillips, Philip, and Gordon R. Willey. 1953. Method and Theory in American Archeology: An Operational Basis for Culture-Historical Integration.</w:t>
+      </w:r>
+      <w:r>
+        <w:t xml:space="preserve"> </w:t>
+      </w:r>
+      <w:r>
+        <w:rPr>
+          <w:i/>
+          <w:iCs/>
+        </w:rPr>
+        <w:t xml:space="preserve">American Anthropologist</w:t>
+      </w:r>
+      <w:r>
+        <w:t xml:space="preserve"> </w:t>
+      </w:r>
+      <w:r>
+        <w:t xml:space="preserve">55(5):615–633.</w:t>
+      </w:r>
+      <w:r>
+        <w:t xml:space="preserve"> </w:t>
+      </w:r>
+      <w:hyperlink r:id="rId148">
+        <w:r>
+          <w:rPr>
+            <w:rStyle w:val="Hyperlink"/>
+          </w:rPr>
+          <w:t xml:space="preserve">https://doi.org/10.1525/aa.1953.55.5.02a00030</w:t>
+        </w:r>
+      </w:hyperlink>
+      <w:r>
+        <w:t xml:space="preserve">.</w:t>
+      </w:r>
+    </w:p>
+    <w:bookmarkEnd w:id="149"/>
+    <w:bookmarkStart w:id="151" w:name="ref-premo_2014"/>
     <w:p>
       <w:pPr>
         <w:pStyle w:val="Bibliography"/>
@@ -4348,7 +5097,7 @@
       <w:r>
         <w:t xml:space="preserve"> </w:t>
       </w:r>
-      <w:hyperlink r:id="rId121">
+      <w:hyperlink r:id="rId150">
         <w:r>
           <w:rPr>
             <w:rStyle w:val="Hyperlink"/>
@@ -4360,8 +5109,8 @@
         <w:t xml:space="preserve">.</w:t>
       </w:r>
     </w:p>
-    <w:bookmarkEnd w:id="122"/>
-    <w:bookmarkStart w:id="123" w:name="ref-rees_political_culture"/>
+    <w:bookmarkEnd w:id="151"/>
+    <w:bookmarkStart w:id="152" w:name="ref-rees_political_culture"/>
     <w:p>
       <w:pPr>
         <w:pStyle w:val="Bibliography"/>
@@ -4385,8 +5134,8 @@
         <w:t xml:space="preserve">. Ph.D. dissertation, University of Oklahoma, Norman.</w:t>
       </w:r>
     </w:p>
-    <w:bookmarkEnd w:id="123"/>
-    <w:bookmarkStart w:id="125" w:name="ref-reimer_etal_2020"/>
+    <w:bookmarkEnd w:id="152"/>
+    <w:bookmarkStart w:id="154" w:name="ref-reimer_etal_2020"/>
     <w:p>
       <w:pPr>
         <w:pStyle w:val="Bibliography"/>
@@ -4440,7 +5189,7 @@
       <w:r>
         <w:t xml:space="preserve"> </w:t>
       </w:r>
-      <w:hyperlink r:id="rId124">
+      <w:hyperlink r:id="rId153">
         <w:r>
           <w:rPr>
             <w:rStyle w:val="Hyperlink"/>
@@ -4452,8 +5201,8 @@
         <w:t xml:space="preserve">.</w:t>
       </w:r>
     </w:p>
-    <w:bookmarkEnd w:id="125"/>
-    <w:bookmarkStart w:id="127" w:name="ref-richerson_etal_2016"/>
+    <w:bookmarkEnd w:id="154"/>
+    <w:bookmarkStart w:id="156" w:name="ref-richerson_etal_2016"/>
     <w:p>
       <w:pPr>
         <w:pStyle w:val="Bibliography"/>
@@ -4480,7 +5229,7 @@
       <w:r>
         <w:t xml:space="preserve"> </w:t>
       </w:r>
-      <w:hyperlink r:id="rId126">
+      <w:hyperlink r:id="rId155">
         <w:r>
           <w:rPr>
             <w:rStyle w:val="Hyperlink"/>
@@ -4492,8 +5241,8 @@
         <w:t xml:space="preserve">.</w:t>
       </w:r>
     </w:p>
-    <w:bookmarkEnd w:id="127"/>
-    <w:bookmarkStart w:id="129" w:name="ref-riede_hoggard_shennan_2019"/>
+    <w:bookmarkEnd w:id="156"/>
+    <w:bookmarkStart w:id="158" w:name="ref-riede_hoggard_shennan_2019"/>
     <w:p>
       <w:pPr>
         <w:pStyle w:val="Bibliography"/>
@@ -4520,7 +5269,7 @@
       <w:r>
         <w:t xml:space="preserve"> </w:t>
       </w:r>
-      <w:hyperlink r:id="rId128">
+      <w:hyperlink r:id="rId157">
         <w:r>
           <w:rPr>
             <w:rStyle w:val="Hyperlink"/>
@@ -4532,8 +5281,8 @@
         <w:t xml:space="preserve">.</w:t>
       </w:r>
     </w:p>
-    <w:bookmarkEnd w:id="129"/>
-    <w:bookmarkStart w:id="130" w:name="ref-robinson_1951"/>
+    <w:bookmarkEnd w:id="158"/>
+    <w:bookmarkStart w:id="159" w:name="ref-robinson_1951"/>
     <w:p>
       <w:pPr>
         <w:pStyle w:val="Bibliography"/>
@@ -4558,8 +5307,8 @@
         <w:t xml:space="preserve">16(4):293–301.</w:t>
       </w:r>
     </w:p>
-    <w:bookmarkEnd w:id="130"/>
-    <w:bookmarkStart w:id="131" w:name="ref-ross-stallings_2017"/>
+    <w:bookmarkEnd w:id="159"/>
+    <w:bookmarkStart w:id="160" w:name="ref-ross-stallings_2017"/>
     <w:p>
       <w:pPr>
         <w:pStyle w:val="Bibliography"/>
@@ -4593,8 +5342,8 @@
         <w:t xml:space="preserve">, edited by Haagen D. Klaus, Amanda R. Harvey, and Mark N. Cohen, pp. 329–362. University Press of Florida, Gainesville.</w:t>
       </w:r>
     </w:p>
-    <w:bookmarkEnd w:id="131"/>
-    <w:bookmarkStart w:id="133" w:name="ref-scheffer_2009"/>
+    <w:bookmarkEnd w:id="160"/>
+    <w:bookmarkStart w:id="162" w:name="ref-scheffer_2009"/>
     <w:p>
       <w:pPr>
         <w:pStyle w:val="Bibliography"/>
@@ -4621,7 +5370,7 @@
       <w:r>
         <w:t xml:space="preserve"> </w:t>
       </w:r>
-      <w:hyperlink r:id="rId132">
+      <w:hyperlink r:id="rId161">
         <w:r>
           <w:rPr>
             <w:rStyle w:val="Hyperlink"/>
@@ -4633,8 +5382,8 @@
         <w:t xml:space="preserve">.</w:t>
       </w:r>
     </w:p>
-    <w:bookmarkEnd w:id="133"/>
-    <w:bookmarkStart w:id="134" w:name="ref-schiffer_1972"/>
+    <w:bookmarkEnd w:id="162"/>
+    <w:bookmarkStart w:id="163" w:name="ref-schiffer_1972"/>
     <w:p>
       <w:pPr>
         <w:pStyle w:val="Bibliography"/>
@@ -4659,8 +5408,8 @@
         <w:t xml:space="preserve">37(2):156–165.</w:t>
       </w:r>
     </w:p>
-    <w:bookmarkEnd w:id="134"/>
-    <w:bookmarkStart w:id="135" w:name="ref-shennan_wilkinson_2001"/>
+    <w:bookmarkEnd w:id="163"/>
+    <w:bookmarkStart w:id="164" w:name="ref-shennan_wilkinson_2001"/>
     <w:p>
       <w:pPr>
         <w:pStyle w:val="Bibliography"/>
@@ -4700,8 +5449,34 @@
         <w:t xml:space="preserve">66(4):577–593.</w:t>
       </w:r>
     </w:p>
-    <w:bookmarkEnd w:id="135"/>
-    <w:bookmarkStart w:id="137" w:name="ref-sullivan_2024"/>
+    <w:bookmarkEnd w:id="164"/>
+    <w:bookmarkStart w:id="165" w:name="ref-smith_neiman_2007"/>
+    <w:p>
+      <w:pPr>
+        <w:pStyle w:val="Bibliography"/>
+      </w:pPr>
+      <w:r>
+        <w:t xml:space="preserve">Smith, Karen Y., and Fraser D. Neiman. 2007. Frequency Seriation, Correspondence Analysis, and Woodland-Period Ceramic Assemblage Variation in the Deep South.</w:t>
+      </w:r>
+      <w:r>
+        <w:t xml:space="preserve"> </w:t>
+      </w:r>
+      <w:r>
+        <w:rPr>
+          <w:i/>
+          <w:iCs/>
+        </w:rPr>
+        <w:t xml:space="preserve">Southeastern Archaeology</w:t>
+      </w:r>
+      <w:r>
+        <w:t xml:space="preserve"> </w:t>
+      </w:r>
+      <w:r>
+        <w:t xml:space="preserve">26(1):47–72.</w:t>
+      </w:r>
+    </w:p>
+    <w:bookmarkEnd w:id="165"/>
+    <w:bookmarkStart w:id="167" w:name="ref-sullivan_2024"/>
     <w:p>
       <w:pPr>
         <w:pStyle w:val="Bibliography"/>
@@ -4752,7 +5527,7 @@
       <w:r>
         <w:t xml:space="preserve"> </w:t>
       </w:r>
-      <w:hyperlink r:id="rId136">
+      <w:hyperlink r:id="rId166">
         <w:r>
           <w:rPr>
             <w:rStyle w:val="Hyperlink"/>
@@ -4764,8 +5539,8 @@
         <w:t xml:space="preserve">.</w:t>
       </w:r>
     </w:p>
-    <w:bookmarkEnd w:id="137"/>
-    <w:bookmarkStart w:id="138" w:name="ref-tomasovych_kidwell_2009"/>
+    <w:bookmarkEnd w:id="167"/>
+    <w:bookmarkStart w:id="168" w:name="ref-tomasovych_kidwell_2009"/>
     <w:p>
       <w:pPr>
         <w:pStyle w:val="Bibliography"/>
@@ -4790,8 +5565,8 @@
         <w:t xml:space="preserve">35(1):94–118.</w:t>
       </w:r>
     </w:p>
-    <w:bookmarkEnd w:id="138"/>
-    <w:bookmarkStart w:id="140" w:name="ref-tomasovych_kidwell_2010"/>
+    <w:bookmarkEnd w:id="168"/>
+    <w:bookmarkStart w:id="170" w:name="ref-tomasovych_kidwell_2010"/>
     <w:p>
       <w:pPr>
         <w:pStyle w:val="Bibliography"/>
@@ -4818,7 +5593,7 @@
       <w:r>
         <w:t xml:space="preserve"> </w:t>
       </w:r>
-      <w:hyperlink r:id="rId139">
+      <w:hyperlink r:id="rId169">
         <w:r>
           <w:rPr>
             <w:rStyle w:val="Hyperlink"/>
@@ -4830,8 +5605,31 @@
         <w:t xml:space="preserve">.</w:t>
       </w:r>
     </w:p>
-    <w:bookmarkEnd w:id="140"/>
-    <w:bookmarkStart w:id="141" w:name="ref-williams_1954"/>
+    <w:bookmarkEnd w:id="170"/>
+    <w:bookmarkStart w:id="171" w:name="ref-willey_phillips_1958"/>
+    <w:p>
+      <w:pPr>
+        <w:pStyle w:val="Bibliography"/>
+      </w:pPr>
+      <w:r>
+        <w:t xml:space="preserve">Willey, Gordon R., and Philip Phillips. 1958.</w:t>
+      </w:r>
+      <w:r>
+        <w:t xml:space="preserve"> </w:t>
+      </w:r>
+      <w:r>
+        <w:rPr>
+          <w:i/>
+          <w:iCs/>
+        </w:rPr>
+        <w:t xml:space="preserve">Method and Theory in American Archaeology</w:t>
+      </w:r>
+      <w:r>
+        <w:t xml:space="preserve">. University of Chicago Press, Chicago.</w:t>
+      </w:r>
+    </w:p>
+    <w:bookmarkEnd w:id="171"/>
+    <w:bookmarkStart w:id="172" w:name="ref-williams_1954"/>
     <w:p>
       <w:pPr>
         <w:pStyle w:val="Bibliography"/>
@@ -4840,8 +5638,8 @@
         <w:t xml:space="preserve">Williams, Stephen. 1954. An Archeological Study of the Mississippian Culture in Southeast Missouri. PhD thesis, Yale University, New Haven.</w:t>
       </w:r>
     </w:p>
-    <w:bookmarkEnd w:id="141"/>
-    <w:bookmarkStart w:id="142" w:name="ref-williams_1990"/>
+    <w:bookmarkEnd w:id="172"/>
+    <w:bookmarkStart w:id="173" w:name="ref-williams_1990"/>
     <w:p>
       <w:pPr>
         <w:pStyle w:val="Bibliography"/>
@@ -4877,10 +5675,10 @@
         <w:t xml:space="preserve">, edited by David H. Dye and Cheryl Anne Cox, pp. 170–180. University of Alabama Press, Tuscaloosa.</w:t>
       </w:r>
     </w:p>
-    <w:bookmarkEnd w:id="142"/>
-    <w:bookmarkEnd w:id="143"/>
-    <w:bookmarkEnd w:id="144"/>
-    <w:bookmarkEnd w:id="145"/>
+    <w:bookmarkEnd w:id="173"/>
+    <w:bookmarkEnd w:id="174"/>
+    <w:bookmarkEnd w:id="175"/>
+    <w:bookmarkEnd w:id="176"/>
     <w:sectPr>
       <w:footnotePr>
         <w:numRestart w:val="eachSect"/>

</xml_diff>

<commit_message>
References: fold in MEDIUM/LOW lit-review candidates (19 works)
CT/identifiability: Barrett 2019, Henrich 2001/2004, Crema et al. 2014, Powell-
Shennan-Thomas 2009 (demographic-structure scope caveat added to Discussion).
Seriation/evo archaeology: Dunnell 1980, Peeples & Schachner 2012, Marquardt
1978, Cowgill 1972, O'Brien & Lyman 1999, Lyman & O'Brien 2006. Time-averaging/
taphonomy: Surovell & Brantingham 2007, Surovell et al. 2009, Behrensmeyer-
Kidwell-Gastaldo 2000, Stern 1994, Youngblood et al. 2023, Coco & Iovita 2020.
CMV: House 1993 (Kent phase dating), Milner 1998. Bibliography now 108 entries,
106 cited, no orphan citations.
</commit_message>
<xml_diff>
--- a/docs/manuscript/MAIN_TEXT.docx
+++ b/docs/manuscript/MAIN_TEXT.docx
@@ -2,7 +2,7 @@
 <file path=word/document.xml><?xml version="1.0" encoding="utf-8"?>
 <w:document xmlns:w="http://schemas.openxmlformats.org/wordprocessingml/2006/main" xmlns:m="http://schemas.openxmlformats.org/officeDocument/2006/math" xmlns:r="http://schemas.openxmlformats.org/officeDocument/2006/relationships" xmlns:o="urn:schemas-microsoft-com:office:office" xmlns:v="urn:schemas-microsoft-com:vml" xmlns:w10="urn:schemas-microsoft-com:office:word" xmlns:a="http://schemas.openxmlformats.org/drawingml/2006/main" xmlns:pic="http://schemas.openxmlformats.org/drawingml/2006/picture" xmlns:wp="http://schemas.openxmlformats.org/drawingml/2006/wordprocessingDrawing">
   <w:body>
-    <w:bookmarkStart w:id="176" w:name="X093902eb68652ea32f5548e74607f4e4b0f6699"/>
+    <w:bookmarkStart w:id="197" w:name="X093902eb68652ea32f5548e74607f4e4b0f6699"/>
     <w:p>
       <w:pPr>
         <w:pStyle w:val="Heading1"/>
@@ -257,7 +257,7 @@
         <w:t xml:space="preserve"> </w:t>
       </w:r>
       <w:r>
-        <w:t xml:space="preserve">(Dunnell 1978, 1995; Ladefoged and Graves 2000)</w:t>
+        <w:t xml:space="preserve">(Dunnell 1978, 1980, 1995; Ladefoged and Graves 2000)</w:t>
       </w:r>
       <w:r>
         <w:t xml:space="preserve">, and it converges with the recognition that the deposit is not a frozen tableau</w:t>
@@ -275,7 +275,7 @@
         <w:t xml:space="preserve"> </w:t>
       </w:r>
       <w:r>
-        <w:t xml:space="preserve">(Bailey 2007; Holdaway and Wandsnider 2008; Perreault 2019)</w:t>
+        <w:t xml:space="preserve">(Bailey 2007; Behrensmeyer et al. 2000; Holdaway and Wandsnider 2008; Perreault 2019; Stern 1994)</w:t>
       </w:r>
       <w:r>
         <w:t xml:space="preserve">. Time-averaging, therefore, sets the resolution of the question rather than disqualifying it. A reorganization of transmission large enough to matter over the two centuries of the Parkin phase should register in the averaged frequency structure, and the drift-versus-groups test we develop reads that structure directly rather than an imagined moment behind it.</w:t>
@@ -357,7 +357,7 @@
         <w:t xml:space="preserve"> </w:t>
       </w:r>
       <w:r>
-        <w:t xml:space="preserve">(Crema et al. 2016; Kandler and Shennan 2015; Mesoudi 2021)</w:t>
+        <w:t xml:space="preserve">(Barrett 2019; Crema et al. 2016; Kandler and Shennan 2015; Mesoudi 2021)</w:t>
       </w:r>
       <w:r>
         <w:t xml:space="preserve">. We therefore compare the two processes in a generative manner. We simulate neutral spatial drift and bounded groups on the real coordinate layout of the assemblages and ask which reproduces the observed structure, using four transmission signatures, departure from neutral copying, breakdown of frequency-seriation coherence, between-group variance, and spatial assortativity, as diagnostics of whether interaction has closed rather than as a stand-alone detector. Because an archaeological assemblage is time-averaged and sampled to varying depth, a signature can register a difference that is an artifact of sampling rather than of transmission, so we calibrate the comparison to the record by a signal-recovery experiment: into synthetic assemblages matched to the real number, sample sizes, and time-averaging we inject a known signal of tunable strength and read off how strong a real boundary would have to be to register. Only a calibrated comparison can license the conclusion that an absence of group structure is real rather than a failure of resolution. This calibration is the transferable contribution, because before any similarity structure is read as social, a record must be shown to be able to distinguish drift from groups at all.</w:t>
@@ -528,7 +528,7 @@
         <w:t xml:space="preserve"> </w:t>
       </w:r>
       <w:r>
-        <w:t xml:space="preserve">(Crema et al. 2016, 2024)</w:t>
+        <w:t xml:space="preserve">(Crema et al. 2016, 2024; Henrich 2001)</w:t>
       </w:r>
       <w:r>
         <w:t xml:space="preserve">. The problem is sharpened in archaeological assemblages, which are time-averaged, because aggregation over the use-life of a deposit inflates richness, flattens evenness, and biases neutrality statistics by an amount that depends on the mean lifetime of the variants</w:t>
@@ -627,7 +627,7 @@
         <w:t xml:space="preserve"> </w:t>
       </w:r>
       <w:r>
-        <w:t xml:space="preserve">(Anderson 1996; Beck 2003; Blitz 1999; King and Freer 1995; Lulewicz 2019; Rees 2001)</w:t>
+        <w:t xml:space="preserve">(Anderson 1996; Beck 2003; Blitz 1999; King and Freer 1995; Lulewicz 2019; Milner 1998; Rees 2001)</w:t>
       </w:r>
       <w:r>
         <w:t xml:space="preserve">. The chronicles describe Casqui and its neighbor Pacaha in open conflict, which fits a landscape of competing peers, though the same sources have also been read as ranking Casqui below Pacaha, and the chronicle ethnography is thin and filtered</w:t>
@@ -1284,7 +1284,7 @@
         <w:t xml:space="preserve"> </w:t>
       </w:r>
       <w:r>
-        <w:t xml:space="preserve">(Mainfort 1996, 2001; Sullivan et al. 2024)</w:t>
+        <w:t xml:space="preserve">(House 1993; Mainfort 1996, 2001; Sullivan et al. 2024)</w:t>
       </w:r>
       <w:r>
         <w:t xml:space="preserve">. Calibrated against IntCal20</w:t>
@@ -1320,7 +1320,7 @@
         <w:t xml:space="preserve"> </w:t>
       </w:r>
       <w:r>
-        <w:t xml:space="preserve">(Baxter 1994; Smith and Neiman 2007)</w:t>
+        <w:t xml:space="preserve">(Baxter 1994; Peeples and Schachner 2012; Smith and Neiman 2007)</w:t>
       </w:r>
       <w:r>
         <w:t xml:space="preserve">. This ordination arranges assemblages along axes that summarize their decorated-type-frequency differences, as a relative chronological ordinate oriented so that higher positions correspond to later time (Figure 3). Pooling the dates of the five proveniences that match curated assemblages, the pooled median calibrated ages correlate with seriation position at Spearman +0.70 (n = 5, 27 dates pooled), an improvement on the +0.50 of the single-date anchors, with four of the five sites in calendar order and one late-dated site departing from it. The axis, therefore, tracks calendar time, but imperfectly. The trajectory we test is ordinal, not a calendar rate, and the discriminating quantity, the size-controlled F_ST trend, is a magnitude invariant to the axis orientation, so only the directional descriptions of the other signatures depend on the anchor. We return to both limits in the discussion.</w:t>
@@ -2051,7 +2051,16 @@
         <w:t xml:space="preserve">(Richerson et al. 2016)</w:t>
       </w:r>
       <w:r>
-        <w:t xml:space="preserve">, which assemblage data cannot address. What the record shows is that the within-greater-than-between similarity the phase is built on is what spatially structured drift produces, so the phase, at the scale at which it is drawn, marks continuous interaction structured by geography rather than by a bounded society. Parkin’s ceremonial and demographic prominence was real. The polity that prominence is taken to imply is not in the transmission record.</w:t>
+        <w:t xml:space="preserve">, which assemblage data cannot address. It likewise does not isolate demographic structure, which can shape assemblage diversity independently of any closure of interaction</w:t>
+      </w:r>
+      <w:r>
+        <w:t xml:space="preserve"> </w:t>
+      </w:r>
+      <w:r>
+        <w:t xml:space="preserve">(Henrich 2004; Powell et al. 2009)</w:t>
+      </w:r>
+      <w:r>
+        <w:t xml:space="preserve">. What the record shows is that the within-greater-than-between similarity the phase is built on is what spatially structured drift produces, so the phase, at the scale at which it is drawn, marks continuous interaction structured by geography rather than by a bounded society. Parkin’s ceremonial and demographic prominence was real. The polity that prominence is taken to imply is not in the transmission record.</w:t>
       </w:r>
     </w:p>
     <w:p>
@@ -2091,7 +2100,7 @@
         <w:t xml:space="preserve"> </w:t>
       </w:r>
       <w:r>
-        <w:t xml:space="preserve">(Kidwell and Tomašových 2013; Perreault 2018; Tomašových and Kidwell 2009, 2010)</w:t>
+        <w:t xml:space="preserve">(Coco and Iovita 2020; Kidwell and Tomašových 2013; Perreault 2018; Tomašových and Kidwell 2009, 2010; Youngblood et al. 2023)</w:t>
       </w:r>
       <w:r>
         <w:t xml:space="preserve">. Rather than argue that this makes the absence conservative, we built the damping into the recovery experiment directly, where it raises the detection threshold from s of 0.5 to 0.7, the quantified cost of the record’s temporal mixing. The verdict is stable across the watershed (19 assemblages) and corridor (29) basin definitions. The central methodological finding is that telling a bounded group from drift must be calibrated to the record to which it is applied. The same four signatures that discriminate cleanly on idealized data reduce, on a real time-averaged record of this size, to a single confound-controlled signature, and saying so is what licenses reading the structure as drift rather than weakening the claim.</w:t>
@@ -2368,7 +2377,7 @@
       </w:r>
     </w:p>
     <w:bookmarkEnd w:id="52"/>
-    <w:bookmarkStart w:id="175" w:name="references"/>
+    <w:bookmarkStart w:id="196" w:name="references"/>
     <w:p>
       <w:pPr>
         <w:pStyle w:val="Heading2"/>
@@ -2377,7 +2386,7 @@
         <w:t xml:space="preserve">References</w:t>
       </w:r>
     </w:p>
-    <w:bookmarkStart w:id="174" w:name="refs"/>
+    <w:bookmarkStart w:id="195" w:name="refs"/>
     <w:bookmarkStart w:id="53" w:name="ref-anderson_1996"/>
     <w:p>
       <w:pPr>
@@ -2441,7 +2450,47 @@
       </w:r>
     </w:p>
     <w:bookmarkEnd w:id="55"/>
-    <w:bookmarkStart w:id="56" w:name="ref-baxter_1994"/>
+    <w:bookmarkStart w:id="57" w:name="ref-barrett_2019"/>
+    <w:p>
+      <w:pPr>
+        <w:pStyle w:val="Bibliography"/>
+      </w:pPr>
+      <w:r>
+        <w:t xml:space="preserve">Barrett, Brendan J. 2019. Equifinality in Empirical Studies of Cultural Transmission.</w:t>
+      </w:r>
+      <w:r>
+        <w:t xml:space="preserve"> </w:t>
+      </w:r>
+      <w:r>
+        <w:rPr>
+          <w:i/>
+          <w:iCs/>
+        </w:rPr>
+        <w:t xml:space="preserve">Behavioural Processes</w:t>
+      </w:r>
+      <w:r>
+        <w:t xml:space="preserve"> </w:t>
+      </w:r>
+      <w:r>
+        <w:t xml:space="preserve">161:129–138.</w:t>
+      </w:r>
+      <w:r>
+        <w:t xml:space="preserve"> </w:t>
+      </w:r>
+      <w:hyperlink r:id="rId56">
+        <w:r>
+          <w:rPr>
+            <w:rStyle w:val="Hyperlink"/>
+          </w:rPr>
+          <w:t xml:space="preserve">https://doi.org/10.1016/j.beproc.2018.01.011</w:t>
+        </w:r>
+      </w:hyperlink>
+      <w:r>
+        <w:t xml:space="preserve">.</w:t>
+      </w:r>
+    </w:p>
+    <w:bookmarkEnd w:id="57"/>
+    <w:bookmarkStart w:id="58" w:name="ref-baxter_1994"/>
     <w:p>
       <w:pPr>
         <w:pStyle w:val="Bibliography"/>
@@ -2463,8 +2512,8 @@
         <w:t xml:space="preserve">. Edinburgh University Press, Edinburgh.</w:t>
       </w:r>
     </w:p>
-    <w:bookmarkEnd w:id="56"/>
-    <w:bookmarkStart w:id="58" w:name="ref-beck_2003"/>
+    <w:bookmarkEnd w:id="58"/>
+    <w:bookmarkStart w:id="60" w:name="ref-beck_2003"/>
     <w:p>
       <w:pPr>
         <w:pStyle w:val="Bibliography"/>
@@ -2503,7 +2552,7 @@
       <w:r>
         <w:t xml:space="preserve"> </w:t>
       </w:r>
-      <w:hyperlink r:id="rId57">
+      <w:hyperlink r:id="rId59">
         <w:r>
           <w:rPr>
             <w:rStyle w:val="Hyperlink"/>
@@ -2515,8 +2564,48 @@
         <w:t xml:space="preserve">.</w:t>
       </w:r>
     </w:p>
-    <w:bookmarkEnd w:id="58"/>
-    <w:bookmarkStart w:id="60" w:name="ref-bell_richerson_mcelreath_2009"/>
+    <w:bookmarkEnd w:id="60"/>
+    <w:bookmarkStart w:id="62" w:name="ref-behrensmeyer_kidwell_gastaldo_2000"/>
+    <w:p>
+      <w:pPr>
+        <w:pStyle w:val="Bibliography"/>
+      </w:pPr>
+      <w:r>
+        <w:t xml:space="preserve">Behrensmeyer, Anna K., Susan M. Kidwell, and Robert A. Gastaldo. 2000. Taphonomy and Paleobiology.</w:t>
+      </w:r>
+      <w:r>
+        <w:t xml:space="preserve"> </w:t>
+      </w:r>
+      <w:r>
+        <w:rPr>
+          <w:i/>
+          <w:iCs/>
+        </w:rPr>
+        <w:t xml:space="preserve">Paleobiology</w:t>
+      </w:r>
+      <w:r>
+        <w:t xml:space="preserve"> </w:t>
+      </w:r>
+      <w:r>
+        <w:t xml:space="preserve">26(S4):103–147.</w:t>
+      </w:r>
+      <w:r>
+        <w:t xml:space="preserve"> </w:t>
+      </w:r>
+      <w:hyperlink r:id="rId61">
+        <w:r>
+          <w:rPr>
+            <w:rStyle w:val="Hyperlink"/>
+          </w:rPr>
+          <w:t xml:space="preserve">https://doi.org/10.1017/S0094837300026907</w:t>
+        </w:r>
+      </w:hyperlink>
+      <w:r>
+        <w:t xml:space="preserve">.</w:t>
+      </w:r>
+    </w:p>
+    <w:bookmarkEnd w:id="62"/>
+    <w:bookmarkStart w:id="64" w:name="ref-bell_richerson_mcelreath_2009"/>
     <w:p>
       <w:pPr>
         <w:pStyle w:val="Bibliography"/>
@@ -2543,7 +2632,7 @@
       <w:r>
         <w:t xml:space="preserve"> </w:t>
       </w:r>
-      <w:hyperlink r:id="rId59">
+      <w:hyperlink r:id="rId63">
         <w:r>
           <w:rPr>
             <w:rStyle w:val="Hyperlink"/>
@@ -2555,8 +2644,8 @@
         <w:t xml:space="preserve">.</w:t>
       </w:r>
     </w:p>
-    <w:bookmarkEnd w:id="60"/>
-    <w:bookmarkStart w:id="62" w:name="ref-bentley_2008"/>
+    <w:bookmarkEnd w:id="64"/>
+    <w:bookmarkStart w:id="66" w:name="ref-bentley_2008"/>
     <w:p>
       <w:pPr>
         <w:pStyle w:val="Bibliography"/>
@@ -2583,7 +2672,7 @@
       <w:r>
         <w:t xml:space="preserve"> </w:t>
       </w:r>
-      <w:hyperlink r:id="rId61">
+      <w:hyperlink r:id="rId65">
         <w:r>
           <w:rPr>
             <w:rStyle w:val="Hyperlink"/>
@@ -2595,8 +2684,8 @@
         <w:t xml:space="preserve">.</w:t>
       </w:r>
     </w:p>
-    <w:bookmarkEnd w:id="62"/>
-    <w:bookmarkStart w:id="64" w:name="ref-bentley_hahn_shennan_2004"/>
+    <w:bookmarkEnd w:id="66"/>
+    <w:bookmarkStart w:id="68" w:name="ref-bentley_hahn_shennan_2004"/>
     <w:p>
       <w:pPr>
         <w:pStyle w:val="Bibliography"/>
@@ -2623,7 +2712,7 @@
       <w:r>
         <w:t xml:space="preserve"> </w:t>
       </w:r>
-      <w:hyperlink r:id="rId63">
+      <w:hyperlink r:id="rId67">
         <w:r>
           <w:rPr>
             <w:rStyle w:val="Hyperlink"/>
@@ -2635,8 +2724,8 @@
         <w:t xml:space="preserve">.</w:t>
       </w:r>
     </w:p>
-    <w:bookmarkEnd w:id="64"/>
-    <w:bookmarkStart w:id="65" w:name="ref-binford_1981"/>
+    <w:bookmarkEnd w:id="68"/>
+    <w:bookmarkStart w:id="69" w:name="ref-binford_1981"/>
     <w:p>
       <w:pPr>
         <w:pStyle w:val="Bibliography"/>
@@ -2676,8 +2765,8 @@
         <w:t xml:space="preserve">37(3):195–208.</w:t>
       </w:r>
     </w:p>
-    <w:bookmarkEnd w:id="65"/>
-    <w:bookmarkStart w:id="67" w:name="ref-blitz_1999"/>
+    <w:bookmarkEnd w:id="69"/>
+    <w:bookmarkStart w:id="71" w:name="ref-blitz_1999"/>
     <w:p>
       <w:pPr>
         <w:pStyle w:val="Bibliography"/>
@@ -2716,7 +2805,7 @@
       <w:r>
         <w:t xml:space="preserve"> </w:t>
       </w:r>
-      <w:hyperlink r:id="rId66">
+      <w:hyperlink r:id="rId70">
         <w:r>
           <w:rPr>
             <w:rStyle w:val="Hyperlink"/>
@@ -2728,8 +2817,8 @@
         <w:t xml:space="preserve">.</w:t>
       </w:r>
     </w:p>
-    <w:bookmarkEnd w:id="67"/>
-    <w:bookmarkStart w:id="68" w:name="ref-brainerd_1951"/>
+    <w:bookmarkEnd w:id="71"/>
+    <w:bookmarkStart w:id="72" w:name="ref-brainerd_1951"/>
     <w:p>
       <w:pPr>
         <w:pStyle w:val="Bibliography"/>
@@ -2754,8 +2843,8 @@
         <w:t xml:space="preserve">16(4):301–313.</w:t>
       </w:r>
     </w:p>
-    <w:bookmarkEnd w:id="68"/>
-    <w:bookmarkStart w:id="70" w:name="ref-carrignon_bentley_ruck_2019"/>
+    <w:bookmarkEnd w:id="72"/>
+    <w:bookmarkStart w:id="74" w:name="ref-carrignon_bentley_ruck_2019"/>
     <w:p>
       <w:pPr>
         <w:pStyle w:val="Bibliography"/>
@@ -2806,7 +2895,7 @@
       <w:r>
         <w:t xml:space="preserve"> </w:t>
       </w:r>
-      <w:hyperlink r:id="rId69">
+      <w:hyperlink r:id="rId73">
         <w:r>
           <w:rPr>
             <w:rStyle w:val="Hyperlink"/>
@@ -2818,8 +2907,8 @@
         <w:t xml:space="preserve">.</w:t>
       </w:r>
     </w:p>
-    <w:bookmarkEnd w:id="70"/>
-    <w:bookmarkStart w:id="71" w:name="ref-cobb_2000"/>
+    <w:bookmarkEnd w:id="74"/>
+    <w:bookmarkStart w:id="75" w:name="ref-cobb_2000"/>
     <w:p>
       <w:pPr>
         <w:pStyle w:val="Bibliography"/>
@@ -2869,8 +2958,8 @@
         <w:t xml:space="preserve">. University of Alabama Press, Tuscaloosa.</w:t>
       </w:r>
     </w:p>
-    <w:bookmarkEnd w:id="71"/>
-    <w:bookmarkStart w:id="72" w:name="ref-cobb_butler_2002"/>
+    <w:bookmarkEnd w:id="75"/>
+    <w:bookmarkStart w:id="76" w:name="ref-cobb_butler_2002"/>
     <w:p>
       <w:pPr>
         <w:pStyle w:val="Bibliography"/>
@@ -2919,8 +3008,48 @@
         <w:t xml:space="preserve">67(4):625–641.</w:t>
       </w:r>
     </w:p>
-    <w:bookmarkEnd w:id="72"/>
-    <w:bookmarkStart w:id="74" w:name="ref-crema_bortolini_lake_2023"/>
+    <w:bookmarkEnd w:id="76"/>
+    <w:bookmarkStart w:id="78" w:name="ref-coco_iovita_2020"/>
+    <w:p>
+      <w:pPr>
+        <w:pStyle w:val="Bibliography"/>
+      </w:pPr>
+      <w:r>
+        <w:t xml:space="preserve">Coco, Emily, and Radu Iovita. 2020. Time-Dependent Taphonomic Site Loss Leads to Spatial Averaging: Implications for Archaeological Cultures.</w:t>
+      </w:r>
+      <w:r>
+        <w:t xml:space="preserve"> </w:t>
+      </w:r>
+      <w:r>
+        <w:rPr>
+          <w:i/>
+          <w:iCs/>
+        </w:rPr>
+        <w:t xml:space="preserve">Humanities and Social Sciences Communications</w:t>
+      </w:r>
+      <w:r>
+        <w:t xml:space="preserve"> </w:t>
+      </w:r>
+      <w:r>
+        <w:t xml:space="preserve">7:47.</w:t>
+      </w:r>
+      <w:r>
+        <w:t xml:space="preserve"> </w:t>
+      </w:r>
+      <w:hyperlink r:id="rId77">
+        <w:r>
+          <w:rPr>
+            <w:rStyle w:val="Hyperlink"/>
+          </w:rPr>
+          <w:t xml:space="preserve">https://doi.org/10.1057/s41599-020-00635-3</w:t>
+        </w:r>
+      </w:hyperlink>
+      <w:r>
+        <w:t xml:space="preserve">.</w:t>
+      </w:r>
+    </w:p>
+    <w:bookmarkEnd w:id="78"/>
+    <w:bookmarkStart w:id="80" w:name="ref-crema_bortolini_lake_2023"/>
     <w:p>
       <w:pPr>
         <w:pStyle w:val="Bibliography"/>
@@ -2947,7 +3076,7 @@
       <w:r>
         <w:t xml:space="preserve"> </w:t>
       </w:r>
-      <w:hyperlink r:id="rId73">
+      <w:hyperlink r:id="rId79">
         <w:r>
           <w:rPr>
             <w:rStyle w:val="Hyperlink"/>
@@ -2959,8 +3088,8 @@
         <w:t xml:space="preserve">.</w:t>
       </w:r>
     </w:p>
-    <w:bookmarkEnd w:id="74"/>
-    <w:bookmarkStart w:id="76" w:name="ref-crema_kandler_shennan_2016"/>
+    <w:bookmarkEnd w:id="80"/>
+    <w:bookmarkStart w:id="82" w:name="ref-crema_kandler_shennan_2016"/>
     <w:p>
       <w:pPr>
         <w:pStyle w:val="Bibliography"/>
@@ -2987,7 +3116,7 @@
       <w:r>
         <w:t xml:space="preserve"> </w:t>
       </w:r>
-      <w:hyperlink r:id="rId75">
+      <w:hyperlink r:id="rId81">
         <w:r>
           <w:rPr>
             <w:rStyle w:val="Hyperlink"/>
@@ -2999,8 +3128,8 @@
         <w:t xml:space="preserve">.</w:t>
       </w:r>
     </w:p>
-    <w:bookmarkEnd w:id="76"/>
-    <w:bookmarkStart w:id="78" w:name="ref-dakos_2012"/>
+    <w:bookmarkEnd w:id="82"/>
+    <w:bookmarkStart w:id="84" w:name="ref-dakos_2012"/>
     <w:p>
       <w:pPr>
         <w:pStyle w:val="Bibliography"/>
@@ -3027,7 +3156,7 @@
       <w:r>
         <w:t xml:space="preserve"> </w:t>
       </w:r>
-      <w:hyperlink r:id="rId77">
+      <w:hyperlink r:id="rId83">
         <w:r>
           <w:rPr>
             <w:rStyle w:val="Hyperlink"/>
@@ -3039,8 +3168,8 @@
         <w:t xml:space="preserve">.</w:t>
       </w:r>
     </w:p>
-    <w:bookmarkEnd w:id="78"/>
-    <w:bookmarkStart w:id="80" w:name="ref-dunnell_1970"/>
+    <w:bookmarkEnd w:id="84"/>
+    <w:bookmarkStart w:id="86" w:name="ref-dunnell_1970"/>
     <w:p>
       <w:pPr>
         <w:pStyle w:val="Bibliography"/>
@@ -3067,7 +3196,7 @@
       <w:r>
         <w:t xml:space="preserve"> </w:t>
       </w:r>
-      <w:hyperlink r:id="rId79">
+      <w:hyperlink r:id="rId85">
         <w:r>
           <w:rPr>
             <w:rStyle w:val="Hyperlink"/>
@@ -3079,8 +3208,8 @@
         <w:t xml:space="preserve">.</w:t>
       </w:r>
     </w:p>
-    <w:bookmarkEnd w:id="80"/>
-    <w:bookmarkStart w:id="82" w:name="ref-dunnell_1978"/>
+    <w:bookmarkEnd w:id="86"/>
+    <w:bookmarkStart w:id="88" w:name="ref-dunnell_1978"/>
     <w:p>
       <w:pPr>
         <w:pStyle w:val="Bibliography"/>
@@ -3107,7 +3236,7 @@
       <w:r>
         <w:t xml:space="preserve"> </w:t>
       </w:r>
-      <w:hyperlink r:id="rId81">
+      <w:hyperlink r:id="rId87">
         <w:r>
           <w:rPr>
             <w:rStyle w:val="Hyperlink"/>
@@ -3119,8 +3248,31 @@
         <w:t xml:space="preserve">.</w:t>
       </w:r>
     </w:p>
-    <w:bookmarkEnd w:id="82"/>
-    <w:bookmarkStart w:id="83" w:name="ref-dunnell_1995"/>
+    <w:bookmarkEnd w:id="88"/>
+    <w:bookmarkStart w:id="89" w:name="ref-dunnell_1980"/>
+    <w:p>
+      <w:pPr>
+        <w:pStyle w:val="Bibliography"/>
+      </w:pPr>
+      <w:r>
+        <w:t xml:space="preserve">Dunnell, Robert C. 1980. Evolutionary Theory and Archaeology. In</w:t>
+      </w:r>
+      <w:r>
+        <w:t xml:space="preserve"> </w:t>
+      </w:r>
+      <w:r>
+        <w:rPr>
+          <w:i/>
+          <w:iCs/>
+        </w:rPr>
+        <w:t xml:space="preserve">Advances in Archaeological Method and Theory, Volume 3</w:t>
+      </w:r>
+      <w:r>
+        <w:t xml:space="preserve">, edited by Michael B. Schiffer, pp. 35–99. Academic Press, New York.</w:t>
+      </w:r>
+    </w:p>
+    <w:bookmarkEnd w:id="89"/>
+    <w:bookmarkStart w:id="90" w:name="ref-dunnell_1995"/>
     <w:p>
       <w:pPr>
         <w:pStyle w:val="Bibliography"/>
@@ -3142,8 +3294,8 @@
         <w:t xml:space="preserve">, edited by Patrice A. Teltser, pp. 33–50. University of Arizona Press, Tucson.</w:t>
       </w:r>
     </w:p>
-    <w:bookmarkEnd w:id="83"/>
-    <w:bookmarkStart w:id="84" w:name="ref-dye_cox_1990"/>
+    <w:bookmarkEnd w:id="90"/>
+    <w:bookmarkStart w:id="91" w:name="ref-dye_cox_1990"/>
     <w:p>
       <w:pPr>
         <w:pStyle w:val="Bibliography"/>
@@ -3179,8 +3331,8 @@
         <w:t xml:space="preserve">. University of Alabama Press, Tuscaloosa.</w:t>
       </w:r>
     </w:p>
-    <w:bookmarkEnd w:id="84"/>
-    <w:bookmarkStart w:id="86" w:name="ref-eerkens_lipo_2005"/>
+    <w:bookmarkEnd w:id="91"/>
+    <w:bookmarkStart w:id="93" w:name="ref-eerkens_lipo_2005"/>
     <w:p>
       <w:pPr>
         <w:pStyle w:val="Bibliography"/>
@@ -3207,7 +3359,7 @@
       <w:r>
         <w:t xml:space="preserve"> </w:t>
       </w:r>
-      <w:hyperlink r:id="rId85">
+      <w:hyperlink r:id="rId92">
         <w:r>
           <w:rPr>
             <w:rStyle w:val="Hyperlink"/>
@@ -3219,8 +3371,8 @@
         <w:t xml:space="preserve">.</w:t>
       </w:r>
     </w:p>
-    <w:bookmarkEnd w:id="86"/>
-    <w:bookmarkStart w:id="88" w:name="ref-eerkens_lipo_2007"/>
+    <w:bookmarkEnd w:id="93"/>
+    <w:bookmarkStart w:id="95" w:name="ref-eerkens_lipo_2007"/>
     <w:p>
       <w:pPr>
         <w:pStyle w:val="Bibliography"/>
@@ -3247,7 +3399,7 @@
       <w:r>
         <w:t xml:space="preserve"> </w:t>
       </w:r>
-      <w:hyperlink r:id="rId87">
+      <w:hyperlink r:id="rId94">
         <w:r>
           <w:rPr>
             <w:rStyle w:val="Hyperlink"/>
@@ -3259,8 +3411,8 @@
         <w:t xml:space="preserve">.</w:t>
       </w:r>
     </w:p>
-    <w:bookmarkEnd w:id="88"/>
-    <w:bookmarkStart w:id="89" w:name="ref-ewens_1972"/>
+    <w:bookmarkEnd w:id="95"/>
+    <w:bookmarkStart w:id="96" w:name="ref-ewens_1972"/>
     <w:p>
       <w:pPr>
         <w:pStyle w:val="Bibliography"/>
@@ -3285,8 +3437,8 @@
         <w:t xml:space="preserve">3(1):87–112.</w:t>
       </w:r>
     </w:p>
-    <w:bookmarkEnd w:id="89"/>
-    <w:bookmarkStart w:id="91" w:name="ref-feder_kryazhimskiy_plotkin_2014"/>
+    <w:bookmarkEnd w:id="96"/>
+    <w:bookmarkStart w:id="98" w:name="ref-feder_kryazhimskiy_plotkin_2014"/>
     <w:p>
       <w:pPr>
         <w:pStyle w:val="Bibliography"/>
@@ -3313,7 +3465,7 @@
       <w:r>
         <w:t xml:space="preserve"> </w:t>
       </w:r>
-      <w:hyperlink r:id="rId90">
+      <w:hyperlink r:id="rId97">
         <w:r>
           <w:rPr>
             <w:rStyle w:val="Hyperlink"/>
@@ -3325,8 +3477,8 @@
         <w:t xml:space="preserve">.</w:t>
       </w:r>
     </w:p>
-    <w:bookmarkEnd w:id="91"/>
-    <w:bookmarkStart w:id="93" w:name="ref-fogarty_kandler_creanza_2024"/>
+    <w:bookmarkEnd w:id="98"/>
+    <w:bookmarkStart w:id="100" w:name="ref-fogarty_kandler_creanza_2024"/>
     <w:p>
       <w:pPr>
         <w:pStyle w:val="Bibliography"/>
@@ -3353,7 +3505,7 @@
       <w:r>
         <w:t xml:space="preserve"> </w:t>
       </w:r>
-      <w:hyperlink r:id="rId92">
+      <w:hyperlink r:id="rId99">
         <w:r>
           <w:rPr>
             <w:rStyle w:val="Hyperlink"/>
@@ -3365,8 +3517,8 @@
         <w:t xml:space="preserve">.</w:t>
       </w:r>
     </w:p>
-    <w:bookmarkEnd w:id="93"/>
-    <w:bookmarkStart w:id="94" w:name="ref-fox_1998"/>
+    <w:bookmarkEnd w:id="100"/>
+    <w:bookmarkStart w:id="101" w:name="ref-fox_1998"/>
     <w:p>
       <w:pPr>
         <w:pStyle w:val="Bibliography"/>
@@ -3388,8 +3540,8 @@
         <w:t xml:space="preserve">, edited by Michael J. O’Brien and Robert C. Dunnell, pp. 31–58. University of Alabama Press, Tuscaloosa.</w:t>
       </w:r>
     </w:p>
-    <w:bookmarkEnd w:id="94"/>
-    <w:bookmarkStart w:id="95" w:name="ref-graves_cachola-abad_1996"/>
+    <w:bookmarkEnd w:id="101"/>
+    <w:bookmarkStart w:id="102" w:name="ref-graves_cachola-abad_1996"/>
     <w:p>
       <w:pPr>
         <w:pStyle w:val="Bibliography"/>
@@ -3423,8 +3575,8 @@
         <w:t xml:space="preserve">31(1):19–32.</w:t>
       </w:r>
     </w:p>
-    <w:bookmarkEnd w:id="95"/>
-    <w:bookmarkStart w:id="96" w:name="ref-hally_1993"/>
+    <w:bookmarkEnd w:id="102"/>
+    <w:bookmarkStart w:id="103" w:name="ref-hally_1993"/>
     <w:p>
       <w:pPr>
         <w:pStyle w:val="Bibliography"/>
@@ -3458,8 +3610,8 @@
         <w:t xml:space="preserve">, edited by James B. Stoltman, pp. 143–168. Archaeological Report No. 25. Mississippi Department of Archives; History, Jackson.</w:t>
       </w:r>
     </w:p>
-    <w:bookmarkEnd w:id="96"/>
-    <w:bookmarkStart w:id="97" w:name="ref-hally_1996"/>
+    <w:bookmarkEnd w:id="103"/>
+    <w:bookmarkStart w:id="104" w:name="ref-hally_1996"/>
     <w:p>
       <w:pPr>
         <w:pStyle w:val="Bibliography"/>
@@ -3493,8 +3645,100 @@
         <w:t xml:space="preserve">, edited by John F. Scarry, pp. 92–127. University Press of Florida, Gainesville.</w:t>
       </w:r>
     </w:p>
-    <w:bookmarkEnd w:id="97"/>
-    <w:bookmarkStart w:id="98" w:name="ref-holdaway_wandsnider_2008"/>
+    <w:bookmarkEnd w:id="104"/>
+    <w:bookmarkStart w:id="106" w:name="ref-henrich_2001"/>
+    <w:p>
+      <w:pPr>
+        <w:pStyle w:val="Bibliography"/>
+      </w:pPr>
+      <w:r>
+        <w:t xml:space="preserve">Henrich, Joseph. 2001. Cultural Transmission and the Diffusion of Innovations: Adoption Dynamics Indicate That Biased Cultural Transmission Is the Predominate Force in Behavioral Change.</w:t>
+      </w:r>
+      <w:r>
+        <w:t xml:space="preserve"> </w:t>
+      </w:r>
+      <w:r>
+        <w:rPr>
+          <w:i/>
+          <w:iCs/>
+        </w:rPr>
+        <w:t xml:space="preserve">American Anthropologist</w:t>
+      </w:r>
+      <w:r>
+        <w:t xml:space="preserve"> </w:t>
+      </w:r>
+      <w:r>
+        <w:t xml:space="preserve">103(4):992–1013.</w:t>
+      </w:r>
+      <w:r>
+        <w:t xml:space="preserve"> </w:t>
+      </w:r>
+      <w:hyperlink r:id="rId105">
+        <w:r>
+          <w:rPr>
+            <w:rStyle w:val="Hyperlink"/>
+          </w:rPr>
+          <w:t xml:space="preserve">https://doi.org/10.1525/aa.2001.103.4.992</w:t>
+        </w:r>
+      </w:hyperlink>
+      <w:r>
+        <w:t xml:space="preserve">.</w:t>
+      </w:r>
+    </w:p>
+    <w:bookmarkEnd w:id="106"/>
+    <w:bookmarkStart w:id="108" w:name="ref-henrich_2004"/>
+    <w:p>
+      <w:pPr>
+        <w:pStyle w:val="Bibliography"/>
+      </w:pPr>
+      <w:r>
+        <w:t xml:space="preserve">Henrich, Joseph. 2004. Demography and Cultural Evolution: How Adaptive Cultural Processes Can Produce Maladaptive Losses—the</w:t>
+      </w:r>
+      <w:r>
+        <w:t xml:space="preserve"> </w:t>
+      </w:r>
+      <w:r>
+        <w:t xml:space="preserve">Tasmanian</w:t>
+      </w:r>
+      <w:r>
+        <w:t xml:space="preserve"> </w:t>
+      </w:r>
+      <w:r>
+        <w:t xml:space="preserve">Case.</w:t>
+      </w:r>
+      <w:r>
+        <w:t xml:space="preserve"> </w:t>
+      </w:r>
+      <w:r>
+        <w:rPr>
+          <w:i/>
+          <w:iCs/>
+        </w:rPr>
+        <w:t xml:space="preserve">American Antiquity</w:t>
+      </w:r>
+      <w:r>
+        <w:t xml:space="preserve"> </w:t>
+      </w:r>
+      <w:r>
+        <w:t xml:space="preserve">69(2):197–214.</w:t>
+      </w:r>
+      <w:r>
+        <w:t xml:space="preserve"> </w:t>
+      </w:r>
+      <w:hyperlink r:id="rId107">
+        <w:r>
+          <w:rPr>
+            <w:rStyle w:val="Hyperlink"/>
+          </w:rPr>
+          <w:t xml:space="preserve">https://doi.org/10.2307/4128416</w:t>
+        </w:r>
+      </w:hyperlink>
+      <w:r>
+        <w:t xml:space="preserve">.</w:t>
+      </w:r>
+    </w:p>
+    <w:bookmarkEnd w:id="108"/>
+    <w:bookmarkStart w:id="109" w:name="ref-holdaway_wandsnider_2008"/>
     <w:p>
       <w:pPr>
         <w:pStyle w:val="Bibliography"/>
@@ -3516,8 +3760,8 @@
         <w:t xml:space="preserve">. University of Utah Press, Salt Lake City.</w:t>
       </w:r>
     </w:p>
-    <w:bookmarkEnd w:id="98"/>
-    <w:bookmarkStart w:id="100" w:name="ref-holland-lulewicz_ritchison_2021"/>
+    <w:bookmarkEnd w:id="109"/>
+    <w:bookmarkStart w:id="111" w:name="ref-holland-lulewicz_ritchison_2021"/>
     <w:p>
       <w:pPr>
         <w:pStyle w:val="Bibliography"/>
@@ -3544,7 +3788,7 @@
       <w:r>
         <w:t xml:space="preserve"> </w:t>
       </w:r>
-      <w:hyperlink r:id="rId99">
+      <w:hyperlink r:id="rId110">
         <w:r>
           <w:rPr>
             <w:rStyle w:val="Hyperlink"/>
@@ -3556,8 +3800,34 @@
         <w:t xml:space="preserve">.</w:t>
       </w:r>
     </w:p>
-    <w:bookmarkEnd w:id="100"/>
-    <w:bookmarkStart w:id="101" w:name="ref-hudson_smith_depratter_1990"/>
+    <w:bookmarkEnd w:id="111"/>
+    <w:bookmarkStart w:id="112" w:name="ref-house_1993"/>
+    <w:p>
+      <w:pPr>
+        <w:pStyle w:val="Bibliography"/>
+      </w:pPr>
+      <w:r>
+        <w:t xml:space="preserve">House, John H. 1993. Dating the Kent Phase.</w:t>
+      </w:r>
+      <w:r>
+        <w:t xml:space="preserve"> </w:t>
+      </w:r>
+      <w:r>
+        <w:rPr>
+          <w:i/>
+          <w:iCs/>
+        </w:rPr>
+        <w:t xml:space="preserve">Southeastern Archaeology</w:t>
+      </w:r>
+      <w:r>
+        <w:t xml:space="preserve"> </w:t>
+      </w:r>
+      <w:r>
+        <w:t xml:space="preserve">12(1):21–32.</w:t>
+      </w:r>
+    </w:p>
+    <w:bookmarkEnd w:id="112"/>
+    <w:bookmarkStart w:id="113" w:name="ref-hudson_smith_depratter_1990"/>
     <w:p>
       <w:pPr>
         <w:pStyle w:val="Bibliography"/>
@@ -3617,8 +3887,8 @@
         <w:t xml:space="preserve">, edited by David H. Dye and Cheryl Anne Cox, pp. 181–207. University of Alabama Press, Tuscaloosa.</w:t>
       </w:r>
     </w:p>
-    <w:bookmarkEnd w:id="101"/>
-    <w:bookmarkStart w:id="103" w:name="ref-hunt_2006"/>
+    <w:bookmarkEnd w:id="113"/>
+    <w:bookmarkStart w:id="115" w:name="ref-hunt_2006"/>
     <w:p>
       <w:pPr>
         <w:pStyle w:val="Bibliography"/>
@@ -3645,7 +3915,7 @@
       <w:r>
         <w:t xml:space="preserve"> </w:t>
       </w:r>
-      <w:hyperlink r:id="rId102">
+      <w:hyperlink r:id="rId114">
         <w:r>
           <w:rPr>
             <w:rStyle w:val="Hyperlink"/>
@@ -3657,8 +3927,8 @@
         <w:t xml:space="preserve">.</w:t>
       </w:r>
     </w:p>
-    <w:bookmarkEnd w:id="103"/>
-    <w:bookmarkStart w:id="105" w:name="ref-hunt_bell_travis_2008"/>
+    <w:bookmarkEnd w:id="115"/>
+    <w:bookmarkStart w:id="117" w:name="ref-hunt_bell_travis_2008"/>
     <w:p>
       <w:pPr>
         <w:pStyle w:val="Bibliography"/>
@@ -3685,7 +3955,7 @@
       <w:r>
         <w:t xml:space="preserve"> </w:t>
       </w:r>
-      <w:hyperlink r:id="rId104">
+      <w:hyperlink r:id="rId116">
         <w:r>
           <w:rPr>
             <w:rStyle w:val="Hyperlink"/>
@@ -3697,8 +3967,8 @@
         <w:t xml:space="preserve">.</w:t>
       </w:r>
     </w:p>
-    <w:bookmarkEnd w:id="105"/>
-    <w:bookmarkStart w:id="106" w:name="ref-hurlbert_1971"/>
+    <w:bookmarkEnd w:id="117"/>
+    <w:bookmarkStart w:id="118" w:name="ref-hurlbert_1971"/>
     <w:p>
       <w:pPr>
         <w:pStyle w:val="Bibliography"/>
@@ -3723,8 +3993,8 @@
         <w:t xml:space="preserve">52(4):577–586.</w:t>
       </w:r>
     </w:p>
-    <w:bookmarkEnd w:id="106"/>
-    <w:bookmarkStart w:id="108" w:name="ref-kandler_shennan_2013"/>
+    <w:bookmarkEnd w:id="118"/>
+    <w:bookmarkStart w:id="120" w:name="ref-kandler_shennan_2013"/>
     <w:p>
       <w:pPr>
         <w:pStyle w:val="Bibliography"/>
@@ -3751,7 +4021,7 @@
       <w:r>
         <w:t xml:space="preserve"> </w:t>
       </w:r>
-      <w:hyperlink r:id="rId107">
+      <w:hyperlink r:id="rId119">
         <w:r>
           <w:rPr>
             <w:rStyle w:val="Hyperlink"/>
@@ -3763,8 +4033,8 @@
         <w:t xml:space="preserve">.</w:t>
       </w:r>
     </w:p>
-    <w:bookmarkEnd w:id="108"/>
-    <w:bookmarkStart w:id="110" w:name="ref-kandler_shennan_2015"/>
+    <w:bookmarkEnd w:id="120"/>
+    <w:bookmarkStart w:id="122" w:name="ref-kandler_shennan_2015"/>
     <w:p>
       <w:pPr>
         <w:pStyle w:val="Bibliography"/>
@@ -3803,7 +4073,7 @@
       <w:r>
         <w:t xml:space="preserve"> </w:t>
       </w:r>
-      <w:hyperlink r:id="rId109">
+      <w:hyperlink r:id="rId121">
         <w:r>
           <w:rPr>
             <w:rStyle w:val="Hyperlink"/>
@@ -3815,8 +4085,8 @@
         <w:t xml:space="preserve">.</w:t>
       </w:r>
     </w:p>
-    <w:bookmarkEnd w:id="110"/>
-    <w:bookmarkStart w:id="112" w:name="ref-kandler_wilder_fortunato_2017"/>
+    <w:bookmarkEnd w:id="122"/>
+    <w:bookmarkStart w:id="124" w:name="ref-kandler_wilder_fortunato_2017"/>
     <w:p>
       <w:pPr>
         <w:pStyle w:val="Bibliography"/>
@@ -3843,7 +4113,7 @@
       <w:r>
         <w:t xml:space="preserve"> </w:t>
       </w:r>
-      <w:hyperlink r:id="rId111">
+      <w:hyperlink r:id="rId123">
         <w:r>
           <w:rPr>
             <w:rStyle w:val="Hyperlink"/>
@@ -3855,8 +4125,8 @@
         <w:t xml:space="preserve">.</w:t>
       </w:r>
     </w:p>
-    <w:bookmarkEnd w:id="112"/>
-    <w:bookmarkStart w:id="114" w:name="ref-kidwell_tomasovych_2013"/>
+    <w:bookmarkEnd w:id="124"/>
+    <w:bookmarkStart w:id="126" w:name="ref-kidwell_tomasovych_2013"/>
     <w:p>
       <w:pPr>
         <w:pStyle w:val="Bibliography"/>
@@ -3883,7 +4153,7 @@
       <w:r>
         <w:t xml:space="preserve"> </w:t>
       </w:r>
-      <w:hyperlink r:id="rId113">
+      <w:hyperlink r:id="rId125">
         <w:r>
           <w:rPr>
             <w:rStyle w:val="Hyperlink"/>
@@ -3895,8 +4165,8 @@
         <w:t xml:space="preserve">.</w:t>
       </w:r>
     </w:p>
-    <w:bookmarkEnd w:id="114"/>
-    <w:bookmarkStart w:id="115" w:name="ref-king_freer_1995"/>
+    <w:bookmarkEnd w:id="126"/>
+    <w:bookmarkStart w:id="127" w:name="ref-king_freer_1995"/>
     <w:p>
       <w:pPr>
         <w:pStyle w:val="Bibliography"/>
@@ -3930,8 +4200,8 @@
         <w:t xml:space="preserve">, edited by Michael S. Nassaney and Kenneth E. Sassaman, pp. 266–288. University of Tennessee Press, Knoxville.</w:t>
       </w:r>
     </w:p>
-    <w:bookmarkEnd w:id="115"/>
-    <w:bookmarkStart w:id="116" w:name="ref-ladefoged_graves_2000"/>
+    <w:bookmarkEnd w:id="127"/>
+    <w:bookmarkStart w:id="128" w:name="ref-ladefoged_graves_2000"/>
     <w:p>
       <w:pPr>
         <w:pStyle w:val="Bibliography"/>
@@ -3974,8 +4244,8 @@
         <w:t xml:space="preserve">65(3):423–448.</w:t>
       </w:r>
     </w:p>
-    <w:bookmarkEnd w:id="116"/>
-    <w:bookmarkStart w:id="117" w:name="ref-lewontin_1974"/>
+    <w:bookmarkEnd w:id="128"/>
+    <w:bookmarkStart w:id="129" w:name="ref-lewontin_1974"/>
     <w:p>
       <w:pPr>
         <w:pStyle w:val="Bibliography"/>
@@ -3997,8 +4267,8 @@
         <w:t xml:space="preserve">. Columbia University Press, New York.</w:t>
       </w:r>
     </w:p>
-    <w:bookmarkEnd w:id="117"/>
-    <w:bookmarkStart w:id="118" w:name="ref-lipo_2001"/>
+    <w:bookmarkEnd w:id="129"/>
+    <w:bookmarkStart w:id="130" w:name="ref-lipo_2001"/>
     <w:p>
       <w:pPr>
         <w:pStyle w:val="Bibliography"/>
@@ -4048,8 +4318,8 @@
         <w:t xml:space="preserve">. BAR International Series 918. Archaeopress, Oxford.</w:t>
       </w:r>
     </w:p>
-    <w:bookmarkEnd w:id="118"/>
-    <w:bookmarkStart w:id="120" w:name="ref-lipo_dinapoli_madsen_hunt_2021"/>
+    <w:bookmarkEnd w:id="130"/>
+    <w:bookmarkStart w:id="132" w:name="ref-lipo_dinapoli_madsen_hunt_2021"/>
     <w:p>
       <w:pPr>
         <w:pStyle w:val="Bibliography"/>
@@ -4076,7 +4346,7 @@
       <w:r>
         <w:t xml:space="preserve"> </w:t>
       </w:r>
-      <w:hyperlink r:id="rId119">
+      <w:hyperlink r:id="rId131">
         <w:r>
           <w:rPr>
             <w:rStyle w:val="Hyperlink"/>
@@ -4088,8 +4358,8 @@
         <w:t xml:space="preserve">.</w:t>
       </w:r>
     </w:p>
-    <w:bookmarkEnd w:id="120"/>
-    <w:bookmarkStart w:id="121" w:name="ref-lipo_dunnell_2007"/>
+    <w:bookmarkEnd w:id="132"/>
+    <w:bookmarkStart w:id="133" w:name="ref-lipo_dunnell_2007"/>
     <w:p>
       <w:pPr>
         <w:pStyle w:val="Bibliography"/>
@@ -4151,8 +4421,8 @@
         <w:t xml:space="preserve">, edited by Janet Rafferty and Evan Peacock, pp. 125–167. University of Alabama Press, Tuscaloosa.</w:t>
       </w:r>
     </w:p>
-    <w:bookmarkEnd w:id="121"/>
-    <w:bookmarkStart w:id="122" w:name="ref-lipo_hunt_hundtoft_2010"/>
+    <w:bookmarkEnd w:id="133"/>
+    <w:bookmarkStart w:id="134" w:name="ref-lipo_hunt_hundtoft_2010"/>
     <w:p>
       <w:pPr>
         <w:pStyle w:val="Bibliography"/>
@@ -4195,8 +4465,8 @@
         <w:t xml:space="preserve">37(10):2551–2561.</w:t>
       </w:r>
     </w:p>
-    <w:bookmarkEnd w:id="122"/>
-    <w:bookmarkStart w:id="124" w:name="ref-lipo_madsen_dunnell_2015"/>
+    <w:bookmarkEnd w:id="134"/>
+    <w:bookmarkStart w:id="136" w:name="ref-lipo_madsen_dunnell_2015"/>
     <w:p>
       <w:pPr>
         <w:pStyle w:val="Bibliography"/>
@@ -4223,7 +4493,7 @@
       <w:r>
         <w:t xml:space="preserve"> </w:t>
       </w:r>
-      <w:hyperlink r:id="rId123">
+      <w:hyperlink r:id="rId135">
         <w:r>
           <w:rPr>
             <w:rStyle w:val="Hyperlink"/>
@@ -4235,8 +4505,8 @@
         <w:t xml:space="preserve">.</w:t>
       </w:r>
     </w:p>
-    <w:bookmarkEnd w:id="124"/>
-    <w:bookmarkStart w:id="126" w:name="ref-lipo_madsen_dunnell_hunt_1997"/>
+    <w:bookmarkEnd w:id="136"/>
+    <w:bookmarkStart w:id="138" w:name="ref-lipo_madsen_dunnell_hunt_1997"/>
     <w:p>
       <w:pPr>
         <w:pStyle w:val="Bibliography"/>
@@ -4263,7 +4533,7 @@
       <w:r>
         <w:t xml:space="preserve"> </w:t>
       </w:r>
-      <w:hyperlink r:id="rId125">
+      <w:hyperlink r:id="rId137">
         <w:r>
           <w:rPr>
             <w:rStyle w:val="Hyperlink"/>
@@ -4275,8 +4545,8 @@
         <w:t xml:space="preserve">.</w:t>
       </w:r>
     </w:p>
-    <w:bookmarkEnd w:id="126"/>
-    <w:bookmarkStart w:id="128" w:name="ref-holland-lulewicz_2019"/>
+    <w:bookmarkEnd w:id="138"/>
+    <w:bookmarkStart w:id="140" w:name="ref-holland-lulewicz_2019"/>
     <w:p>
       <w:pPr>
         <w:pStyle w:val="Bibliography"/>
@@ -4330,7 +4600,7 @@
       <w:r>
         <w:t xml:space="preserve"> </w:t>
       </w:r>
-      <w:hyperlink r:id="rId127">
+      <w:hyperlink r:id="rId139">
         <w:r>
           <w:rPr>
             <w:rStyle w:val="Hyperlink"/>
@@ -4342,8 +4612,8 @@
         <w:t xml:space="preserve">.</w:t>
       </w:r>
     </w:p>
-    <w:bookmarkEnd w:id="128"/>
-    <w:bookmarkStart w:id="129" w:name="ref-madsen_2012"/>
+    <w:bookmarkEnd w:id="140"/>
+    <w:bookmarkStart w:id="141" w:name="ref-madsen_2012"/>
     <w:p>
       <w:pPr>
         <w:pStyle w:val="Bibliography"/>
@@ -4352,8 +4622,8 @@
         <w:t xml:space="preserve">Madsen, Mark E. 2012. Neutral Cultural Transmission in Time-Averaged Archaeological Assemblages. arXiv preprint arXiv:1204.2043 [physics.soc-ph].</w:t>
       </w:r>
     </w:p>
-    <w:bookmarkEnd w:id="129"/>
-    <w:bookmarkStart w:id="130" w:name="ref-mainfort_1996"/>
+    <w:bookmarkEnd w:id="141"/>
+    <w:bookmarkStart w:id="142" w:name="ref-mainfort_1996"/>
     <w:p>
       <w:pPr>
         <w:pStyle w:val="Bibliography"/>
@@ -4402,8 +4672,8 @@
         <w:t xml:space="preserve">15(2):172–181.</w:t>
       </w:r>
     </w:p>
-    <w:bookmarkEnd w:id="130"/>
-    <w:bookmarkStart w:id="131" w:name="ref-mainfort_2001"/>
+    <w:bookmarkEnd w:id="142"/>
+    <w:bookmarkStart w:id="143" w:name="ref-mainfort_2001"/>
     <w:p>
       <w:pPr>
         <w:pStyle w:val="Bibliography"/>
@@ -4437,8 +4707,8 @@
         <w:t xml:space="preserve">, edited by David S. Brose, C. Wesley Cowan, and Jr. Mainfort Robert C., pp. 173–190. Smithsonian Institution Press, Washington, DC.</w:t>
       </w:r>
     </w:p>
-    <w:bookmarkEnd w:id="131"/>
-    <w:bookmarkStart w:id="132" w:name="ref-mainfort_2003"/>
+    <w:bookmarkEnd w:id="143"/>
+    <w:bookmarkStart w:id="144" w:name="ref-mainfort_2003"/>
     <w:p>
       <w:pPr>
         <w:pStyle w:val="Bibliography"/>
@@ -4475,8 +4745,8 @@
         <w:t xml:space="preserve">22(2):176–184.</w:t>
       </w:r>
     </w:p>
-    <w:bookmarkEnd w:id="132"/>
-    <w:bookmarkStart w:id="133" w:name="ref-mantel_1967"/>
+    <w:bookmarkEnd w:id="144"/>
+    <w:bookmarkStart w:id="145" w:name="ref-mantel_1967"/>
     <w:p>
       <w:pPr>
         <w:pStyle w:val="Bibliography"/>
@@ -4501,8 +4771,8 @@
         <w:t xml:space="preserve">27(2):209–220.</w:t>
       </w:r>
     </w:p>
-    <w:bookmarkEnd w:id="133"/>
-    <w:bookmarkStart w:id="134" w:name="ref-mcnutt_ed_1996"/>
+    <w:bookmarkEnd w:id="145"/>
+    <w:bookmarkStart w:id="146" w:name="ref-mcnutt_ed_1996"/>
     <w:p>
       <w:pPr>
         <w:pStyle w:val="Bibliography"/>
@@ -4552,8 +4822,8 @@
         <w:t xml:space="preserve">. University of Alabama Press, Tuscaloosa.</w:t>
       </w:r>
     </w:p>
-    <w:bookmarkEnd w:id="134"/>
-    <w:bookmarkStart w:id="135" w:name="ref-mesoudi_2021"/>
+    <w:bookmarkEnd w:id="146"/>
+    <w:bookmarkStart w:id="147" w:name="ref-mesoudi_2021"/>
     <w:p>
       <w:pPr>
         <w:pStyle w:val="Bibliography"/>
@@ -4578,8 +4848,8 @@
         <w:t xml:space="preserve">376:20200053.</w:t>
       </w:r>
     </w:p>
-    <w:bookmarkEnd w:id="135"/>
-    <w:bookmarkStart w:id="137" w:name="ref-miller_atkins_premo_2018"/>
+    <w:bookmarkEnd w:id="147"/>
+    <w:bookmarkStart w:id="149" w:name="ref-miller_atkins_premo_2018"/>
     <w:p>
       <w:pPr>
         <w:pStyle w:val="Bibliography"/>
@@ -4606,7 +4876,7 @@
       <w:r>
         <w:t xml:space="preserve"> </w:t>
       </w:r>
-      <w:hyperlink r:id="rId136">
+      <w:hyperlink r:id="rId148">
         <w:r>
           <w:rPr>
             <w:rStyle w:val="Hyperlink"/>
@@ -4618,8 +4888,87 @@
         <w:t xml:space="preserve">.</w:t>
       </w:r>
     </w:p>
-    <w:bookmarkEnd w:id="137"/>
-    <w:bookmarkStart w:id="138" w:name="ref-mitchem_2001"/>
+    <w:bookmarkEnd w:id="149"/>
+    <w:bookmarkStart w:id="150" w:name="ref-milner_1998"/>
+    <w:p>
+      <w:pPr>
+        <w:pStyle w:val="Bibliography"/>
+      </w:pPr>
+      <w:r>
+        <w:t xml:space="preserve">Milner, George R. 1998.</w:t>
+      </w:r>
+      <w:r>
+        <w:t xml:space="preserve"> </w:t>
+      </w:r>
+      <w:r>
+        <w:rPr>
+          <w:i/>
+          <w:iCs/>
+        </w:rPr>
+        <w:t xml:space="preserve">The</w:t>
+      </w:r>
+      <w:r>
+        <w:rPr>
+          <w:i/>
+          <w:iCs/>
+        </w:rPr>
+        <w:t xml:space="preserve"> </w:t>
+      </w:r>
+      <w:r>
+        <w:rPr>
+          <w:i/>
+          <w:iCs/>
+        </w:rPr>
+        <w:t xml:space="preserve">Cahokia</w:t>
+      </w:r>
+      <w:r>
+        <w:rPr>
+          <w:i/>
+          <w:iCs/>
+        </w:rPr>
+        <w:t xml:space="preserve"> </w:t>
+      </w:r>
+      <w:r>
+        <w:rPr>
+          <w:i/>
+          <w:iCs/>
+        </w:rPr>
+        <w:t xml:space="preserve">Chiefdom: The Archaeology of a</w:t>
+      </w:r>
+      <w:r>
+        <w:rPr>
+          <w:i/>
+          <w:iCs/>
+        </w:rPr>
+        <w:t xml:space="preserve"> </w:t>
+      </w:r>
+      <w:r>
+        <w:rPr>
+          <w:i/>
+          <w:iCs/>
+        </w:rPr>
+        <w:t xml:space="preserve">Mississippian</w:t>
+      </w:r>
+      <w:r>
+        <w:rPr>
+          <w:i/>
+          <w:iCs/>
+        </w:rPr>
+        <w:t xml:space="preserve"> </w:t>
+      </w:r>
+      <w:r>
+        <w:rPr>
+          <w:i/>
+          <w:iCs/>
+        </w:rPr>
+        <w:t xml:space="preserve">Society</w:t>
+      </w:r>
+      <w:r>
+        <w:t xml:space="preserve">. Smithsonian Institution Press, Washington, D.C.</w:t>
+      </w:r>
+    </w:p>
+    <w:bookmarkEnd w:id="150"/>
+    <w:bookmarkStart w:id="151" w:name="ref-mitchem_2001"/>
     <w:p>
       <w:pPr>
         <w:pStyle w:val="Bibliography"/>
@@ -4649,8 +4998,8 @@
         <w:t xml:space="preserve">.</w:t>
       </w:r>
     </w:p>
-    <w:bookmarkEnd w:id="138"/>
-    <w:bookmarkStart w:id="139" w:name="ref-morse_morse_1983"/>
+    <w:bookmarkEnd w:id="151"/>
+    <w:bookmarkStart w:id="152" w:name="ref-morse_morse_1983"/>
     <w:p>
       <w:pPr>
         <w:pStyle w:val="Bibliography"/>
@@ -4700,8 +5049,8 @@
         <w:t xml:space="preserve">. Academic Press, New York.</w:t>
       </w:r>
     </w:p>
-    <w:bookmarkEnd w:id="139"/>
-    <w:bookmarkStart w:id="140" w:name="ref-morse_morse_1996"/>
+    <w:bookmarkEnd w:id="152"/>
+    <w:bookmarkStart w:id="153" w:name="ref-morse_morse_1996"/>
     <w:p>
       <w:pPr>
         <w:pStyle w:val="Bibliography"/>
@@ -4738,8 +5087,8 @@
         <w:t xml:space="preserve">17(1):1–35.</w:t>
       </w:r>
     </w:p>
-    <w:bookmarkEnd w:id="140"/>
-    <w:bookmarkStart w:id="141" w:name="ref-morse_1990"/>
+    <w:bookmarkEnd w:id="153"/>
+    <w:bookmarkStart w:id="154" w:name="ref-morse_1990"/>
     <w:p>
       <w:pPr>
         <w:pStyle w:val="Bibliography"/>
@@ -4799,8 +5148,8 @@
         <w:t xml:space="preserve">, edited by David H. Dye and Cheryl Anne Cox, pp. 118–134. University of Alabama Press, Tuscaloosa.</w:t>
       </w:r>
     </w:p>
-    <w:bookmarkEnd w:id="141"/>
-    <w:bookmarkStart w:id="142" w:name="ref-neiman_1995"/>
+    <w:bookmarkEnd w:id="154"/>
+    <w:bookmarkStart w:id="155" w:name="ref-neiman_1995"/>
     <w:p>
       <w:pPr>
         <w:pStyle w:val="Bibliography"/>
@@ -4843,8 +5192,48 @@
         <w:t xml:space="preserve">60(1):7–36.</w:t>
       </w:r>
     </w:p>
-    <w:bookmarkEnd w:id="142"/>
-    <w:bookmarkStart w:id="144" w:name="ref-perreault_2018"/>
+    <w:bookmarkEnd w:id="155"/>
+    <w:bookmarkStart w:id="157" w:name="ref-peeples_schachner_2012"/>
+    <w:p>
+      <w:pPr>
+        <w:pStyle w:val="Bibliography"/>
+      </w:pPr>
+      <w:r>
+        <w:t xml:space="preserve">Peeples, Matthew A., and Gregson Schachner. 2012. Refining Correspondence Analysis-Based Ceramic Seriation of Regional Data Sets.</w:t>
+      </w:r>
+      <w:r>
+        <w:t xml:space="preserve"> </w:t>
+      </w:r>
+      <w:r>
+        <w:rPr>
+          <w:i/>
+          <w:iCs/>
+        </w:rPr>
+        <w:t xml:space="preserve">Journal of Archaeological Science</w:t>
+      </w:r>
+      <w:r>
+        <w:t xml:space="preserve"> </w:t>
+      </w:r>
+      <w:r>
+        <w:t xml:space="preserve">39(8):2818–2827.</w:t>
+      </w:r>
+      <w:r>
+        <w:t xml:space="preserve"> </w:t>
+      </w:r>
+      <w:hyperlink r:id="rId156">
+        <w:r>
+          <w:rPr>
+            <w:rStyle w:val="Hyperlink"/>
+          </w:rPr>
+          <w:t xml:space="preserve">https://doi.org/10.1016/j.jas.2012.04.040</w:t>
+        </w:r>
+      </w:hyperlink>
+      <w:r>
+        <w:t xml:space="preserve">.</w:t>
+      </w:r>
+    </w:p>
+    <w:bookmarkEnd w:id="157"/>
+    <w:bookmarkStart w:id="159" w:name="ref-perreault_2018"/>
     <w:p>
       <w:pPr>
         <w:pStyle w:val="Bibliography"/>
@@ -4871,7 +5260,7 @@
       <w:r>
         <w:t xml:space="preserve"> </w:t>
       </w:r>
-      <w:hyperlink r:id="rId143">
+      <w:hyperlink r:id="rId158">
         <w:r>
           <w:rPr>
             <w:rStyle w:val="Hyperlink"/>
@@ -4883,8 +5272,8 @@
         <w:t xml:space="preserve">.</w:t>
       </w:r>
     </w:p>
-    <w:bookmarkEnd w:id="144"/>
-    <w:bookmarkStart w:id="145" w:name="ref-perreault_2019"/>
+    <w:bookmarkEnd w:id="159"/>
+    <w:bookmarkStart w:id="160" w:name="ref-perreault_2019"/>
     <w:p>
       <w:pPr>
         <w:pStyle w:val="Bibliography"/>
@@ -4906,8 +5295,8 @@
         <w:t xml:space="preserve">. University of Chicago Press, Chicago.</w:t>
       </w:r>
     </w:p>
-    <w:bookmarkEnd w:id="145"/>
-    <w:bookmarkStart w:id="146" w:name="ref-phillips_1970"/>
+    <w:bookmarkEnd w:id="160"/>
+    <w:bookmarkStart w:id="161" w:name="ref-phillips_1970"/>
     <w:p>
       <w:pPr>
         <w:pStyle w:val="Bibliography"/>
@@ -4978,8 +5367,8 @@
         <w:t xml:space="preserve">, Vol. 60. Papers of the Peabody Museum of Archaeology and Ethnology. Peabody Museum, Harvard University, Cambridge, MA.</w:t>
       </w:r>
     </w:p>
-    <w:bookmarkEnd w:id="146"/>
-    <w:bookmarkStart w:id="147" w:name="ref-phillips_ford_griffin_1951"/>
+    <w:bookmarkEnd w:id="161"/>
+    <w:bookmarkStart w:id="162" w:name="ref-phillips_ford_griffin_1951"/>
     <w:p>
       <w:pPr>
         <w:pStyle w:val="Bibliography"/>
@@ -5029,8 +5418,8 @@
         <w:t xml:space="preserve">, Vol. 25. Papers of the Peabody Museum of American Archaeology and Ethnology. Peabody Museum, Harvard University, Cambridge, MA.</w:t>
       </w:r>
     </w:p>
-    <w:bookmarkEnd w:id="147"/>
-    <w:bookmarkStart w:id="149" w:name="ref-phillips_willey_1953"/>
+    <w:bookmarkEnd w:id="162"/>
+    <w:bookmarkStart w:id="164" w:name="ref-phillips_willey_1953"/>
     <w:p>
       <w:pPr>
         <w:pStyle w:val="Bibliography"/>
@@ -5057,7 +5446,7 @@
       <w:r>
         <w:t xml:space="preserve"> </w:t>
       </w:r>
-      <w:hyperlink r:id="rId148">
+      <w:hyperlink r:id="rId163">
         <w:r>
           <w:rPr>
             <w:rStyle w:val="Hyperlink"/>
@@ -5069,8 +5458,60 @@
         <w:t xml:space="preserve">.</w:t>
       </w:r>
     </w:p>
-    <w:bookmarkEnd w:id="149"/>
-    <w:bookmarkStart w:id="151" w:name="ref-premo_2014"/>
+    <w:bookmarkEnd w:id="164"/>
+    <w:bookmarkStart w:id="166" w:name="ref-powell_shennan_thomas_2009"/>
+    <w:p>
+      <w:pPr>
+        <w:pStyle w:val="Bibliography"/>
+      </w:pPr>
+      <w:r>
+        <w:t xml:space="preserve">Powell, Adam, Stephen Shennan, and Mark G. Thomas. 2009. Late</w:t>
+      </w:r>
+      <w:r>
+        <w:t xml:space="preserve"> </w:t>
+      </w:r>
+      <w:r>
+        <w:t xml:space="preserve">Pleistocene</w:t>
+      </w:r>
+      <w:r>
+        <w:t xml:space="preserve"> </w:t>
+      </w:r>
+      <w:r>
+        <w:t xml:space="preserve">Demography and the Appearance of Modern Human Behavior.</w:t>
+      </w:r>
+      <w:r>
+        <w:t xml:space="preserve"> </w:t>
+      </w:r>
+      <w:r>
+        <w:rPr>
+          <w:i/>
+          <w:iCs/>
+        </w:rPr>
+        <w:t xml:space="preserve">Science</w:t>
+      </w:r>
+      <w:r>
+        <w:t xml:space="preserve"> </w:t>
+      </w:r>
+      <w:r>
+        <w:t xml:space="preserve">324(5932):1298–1301.</w:t>
+      </w:r>
+      <w:r>
+        <w:t xml:space="preserve"> </w:t>
+      </w:r>
+      <w:hyperlink r:id="rId165">
+        <w:r>
+          <w:rPr>
+            <w:rStyle w:val="Hyperlink"/>
+          </w:rPr>
+          <w:t xml:space="preserve">https://doi.org/10.1126/science.1170165</w:t>
+        </w:r>
+      </w:hyperlink>
+      <w:r>
+        <w:t xml:space="preserve">.</w:t>
+      </w:r>
+    </w:p>
+    <w:bookmarkEnd w:id="166"/>
+    <w:bookmarkStart w:id="168" w:name="ref-premo_2014"/>
     <w:p>
       <w:pPr>
         <w:pStyle w:val="Bibliography"/>
@@ -5097,7 +5538,7 @@
       <w:r>
         <w:t xml:space="preserve"> </w:t>
       </w:r>
-      <w:hyperlink r:id="rId150">
+      <w:hyperlink r:id="rId167">
         <w:r>
           <w:rPr>
             <w:rStyle w:val="Hyperlink"/>
@@ -5109,8 +5550,8 @@
         <w:t xml:space="preserve">.</w:t>
       </w:r>
     </w:p>
-    <w:bookmarkEnd w:id="151"/>
-    <w:bookmarkStart w:id="152" w:name="ref-rees_political_culture"/>
+    <w:bookmarkEnd w:id="168"/>
+    <w:bookmarkStart w:id="169" w:name="ref-rees_political_culture"/>
     <w:p>
       <w:pPr>
         <w:pStyle w:val="Bibliography"/>
@@ -5134,8 +5575,8 @@
         <w:t xml:space="preserve">. Ph.D. dissertation, University of Oklahoma, Norman.</w:t>
       </w:r>
     </w:p>
-    <w:bookmarkEnd w:id="152"/>
-    <w:bookmarkStart w:id="154" w:name="ref-reimer_etal_2020"/>
+    <w:bookmarkEnd w:id="169"/>
+    <w:bookmarkStart w:id="171" w:name="ref-reimer_etal_2020"/>
     <w:p>
       <w:pPr>
         <w:pStyle w:val="Bibliography"/>
@@ -5189,7 +5630,7 @@
       <w:r>
         <w:t xml:space="preserve"> </w:t>
       </w:r>
-      <w:hyperlink r:id="rId153">
+      <w:hyperlink r:id="rId170">
         <w:r>
           <w:rPr>
             <w:rStyle w:val="Hyperlink"/>
@@ -5201,8 +5642,8 @@
         <w:t xml:space="preserve">.</w:t>
       </w:r>
     </w:p>
-    <w:bookmarkEnd w:id="154"/>
-    <w:bookmarkStart w:id="156" w:name="ref-richerson_etal_2016"/>
+    <w:bookmarkEnd w:id="171"/>
+    <w:bookmarkStart w:id="173" w:name="ref-richerson_etal_2016"/>
     <w:p>
       <w:pPr>
         <w:pStyle w:val="Bibliography"/>
@@ -5229,7 +5670,7 @@
       <w:r>
         <w:t xml:space="preserve"> </w:t>
       </w:r>
-      <w:hyperlink r:id="rId155">
+      <w:hyperlink r:id="rId172">
         <w:r>
           <w:rPr>
             <w:rStyle w:val="Hyperlink"/>
@@ -5241,8 +5682,8 @@
         <w:t xml:space="preserve">.</w:t>
       </w:r>
     </w:p>
-    <w:bookmarkEnd w:id="156"/>
-    <w:bookmarkStart w:id="158" w:name="ref-riede_hoggard_shennan_2019"/>
+    <w:bookmarkEnd w:id="173"/>
+    <w:bookmarkStart w:id="175" w:name="ref-riede_hoggard_shennan_2019"/>
     <w:p>
       <w:pPr>
         <w:pStyle w:val="Bibliography"/>
@@ -5269,7 +5710,7 @@
       <w:r>
         <w:t xml:space="preserve"> </w:t>
       </w:r>
-      <w:hyperlink r:id="rId157">
+      <w:hyperlink r:id="rId174">
         <w:r>
           <w:rPr>
             <w:rStyle w:val="Hyperlink"/>
@@ -5281,8 +5722,8 @@
         <w:t xml:space="preserve">.</w:t>
       </w:r>
     </w:p>
-    <w:bookmarkEnd w:id="158"/>
-    <w:bookmarkStart w:id="159" w:name="ref-robinson_1951"/>
+    <w:bookmarkEnd w:id="175"/>
+    <w:bookmarkStart w:id="176" w:name="ref-robinson_1951"/>
     <w:p>
       <w:pPr>
         <w:pStyle w:val="Bibliography"/>
@@ -5307,8 +5748,8 @@
         <w:t xml:space="preserve">16(4):293–301.</w:t>
       </w:r>
     </w:p>
-    <w:bookmarkEnd w:id="159"/>
-    <w:bookmarkStart w:id="160" w:name="ref-ross-stallings_2017"/>
+    <w:bookmarkEnd w:id="176"/>
+    <w:bookmarkStart w:id="177" w:name="ref-ross-stallings_2017"/>
     <w:p>
       <w:pPr>
         <w:pStyle w:val="Bibliography"/>
@@ -5342,8 +5783,8 @@
         <w:t xml:space="preserve">, edited by Haagen D. Klaus, Amanda R. Harvey, and Mark N. Cohen, pp. 329–362. University Press of Florida, Gainesville.</w:t>
       </w:r>
     </w:p>
-    <w:bookmarkEnd w:id="160"/>
-    <w:bookmarkStart w:id="162" w:name="ref-scheffer_2009"/>
+    <w:bookmarkEnd w:id="177"/>
+    <w:bookmarkStart w:id="179" w:name="ref-scheffer_2009"/>
     <w:p>
       <w:pPr>
         <w:pStyle w:val="Bibliography"/>
@@ -5370,7 +5811,7 @@
       <w:r>
         <w:t xml:space="preserve"> </w:t>
       </w:r>
-      <w:hyperlink r:id="rId161">
+      <w:hyperlink r:id="rId178">
         <w:r>
           <w:rPr>
             <w:rStyle w:val="Hyperlink"/>
@@ -5382,8 +5823,8 @@
         <w:t xml:space="preserve">.</w:t>
       </w:r>
     </w:p>
-    <w:bookmarkEnd w:id="162"/>
-    <w:bookmarkStart w:id="163" w:name="ref-schiffer_1972"/>
+    <w:bookmarkEnd w:id="179"/>
+    <w:bookmarkStart w:id="180" w:name="ref-schiffer_1972"/>
     <w:p>
       <w:pPr>
         <w:pStyle w:val="Bibliography"/>
@@ -5408,8 +5849,8 @@
         <w:t xml:space="preserve">37(2):156–165.</w:t>
       </w:r>
     </w:p>
-    <w:bookmarkEnd w:id="163"/>
-    <w:bookmarkStart w:id="164" w:name="ref-shennan_wilkinson_2001"/>
+    <w:bookmarkEnd w:id="180"/>
+    <w:bookmarkStart w:id="181" w:name="ref-shennan_wilkinson_2001"/>
     <w:p>
       <w:pPr>
         <w:pStyle w:val="Bibliography"/>
@@ -5449,8 +5890,8 @@
         <w:t xml:space="preserve">66(4):577–593.</w:t>
       </w:r>
     </w:p>
-    <w:bookmarkEnd w:id="164"/>
-    <w:bookmarkStart w:id="165" w:name="ref-smith_neiman_2007"/>
+    <w:bookmarkEnd w:id="181"/>
+    <w:bookmarkStart w:id="182" w:name="ref-smith_neiman_2007"/>
     <w:p>
       <w:pPr>
         <w:pStyle w:val="Bibliography"/>
@@ -5475,8 +5916,48 @@
         <w:t xml:space="preserve">26(1):47–72.</w:t>
       </w:r>
     </w:p>
-    <w:bookmarkEnd w:id="165"/>
-    <w:bookmarkStart w:id="167" w:name="ref-sullivan_2024"/>
+    <w:bookmarkEnd w:id="182"/>
+    <w:bookmarkStart w:id="184" w:name="ref-stern_1994"/>
+    <w:p>
+      <w:pPr>
+        <w:pStyle w:val="Bibliography"/>
+      </w:pPr>
+      <w:r>
+        <w:t xml:space="preserve">Stern, Nicola. 1994. The Implications of Time-Averaging for Reconstructing the Land-Use Patterns of Early Tool-Using Hominids.</w:t>
+      </w:r>
+      <w:r>
+        <w:t xml:space="preserve"> </w:t>
+      </w:r>
+      <w:r>
+        <w:rPr>
+          <w:i/>
+          <w:iCs/>
+        </w:rPr>
+        <w:t xml:space="preserve">Journal of Human Evolution</w:t>
+      </w:r>
+      <w:r>
+        <w:t xml:space="preserve"> </w:t>
+      </w:r>
+      <w:r>
+        <w:t xml:space="preserve">27(1–3):89–105.</w:t>
+      </w:r>
+      <w:r>
+        <w:t xml:space="preserve"> </w:t>
+      </w:r>
+      <w:hyperlink r:id="rId183">
+        <w:r>
+          <w:rPr>
+            <w:rStyle w:val="Hyperlink"/>
+          </w:rPr>
+          <w:t xml:space="preserve">https://doi.org/10.1006/jhev.1994.1037</w:t>
+        </w:r>
+      </w:hyperlink>
+      <w:r>
+        <w:t xml:space="preserve">.</w:t>
+      </w:r>
+    </w:p>
+    <w:bookmarkEnd w:id="184"/>
+    <w:bookmarkStart w:id="186" w:name="ref-sullivan_2024"/>
     <w:p>
       <w:pPr>
         <w:pStyle w:val="Bibliography"/>
@@ -5527,7 +6008,7 @@
       <w:r>
         <w:t xml:space="preserve"> </w:t>
       </w:r>
-      <w:hyperlink r:id="rId166">
+      <w:hyperlink r:id="rId185">
         <w:r>
           <w:rPr>
             <w:rStyle w:val="Hyperlink"/>
@@ -5539,8 +6020,8 @@
         <w:t xml:space="preserve">.</w:t>
       </w:r>
     </w:p>
-    <w:bookmarkEnd w:id="167"/>
-    <w:bookmarkStart w:id="168" w:name="ref-tomasovych_kidwell_2009"/>
+    <w:bookmarkEnd w:id="186"/>
+    <w:bookmarkStart w:id="187" w:name="ref-tomasovych_kidwell_2009"/>
     <w:p>
       <w:pPr>
         <w:pStyle w:val="Bibliography"/>
@@ -5565,8 +6046,8 @@
         <w:t xml:space="preserve">35(1):94–118.</w:t>
       </w:r>
     </w:p>
-    <w:bookmarkEnd w:id="168"/>
-    <w:bookmarkStart w:id="170" w:name="ref-tomasovych_kidwell_2010"/>
+    <w:bookmarkEnd w:id="187"/>
+    <w:bookmarkStart w:id="189" w:name="ref-tomasovych_kidwell_2010"/>
     <w:p>
       <w:pPr>
         <w:pStyle w:val="Bibliography"/>
@@ -5593,7 +6074,7 @@
       <w:r>
         <w:t xml:space="preserve"> </w:t>
       </w:r>
-      <w:hyperlink r:id="rId169">
+      <w:hyperlink r:id="rId188">
         <w:r>
           <w:rPr>
             <w:rStyle w:val="Hyperlink"/>
@@ -5605,8 +6086,8 @@
         <w:t xml:space="preserve">.</w:t>
       </w:r>
     </w:p>
-    <w:bookmarkEnd w:id="170"/>
-    <w:bookmarkStart w:id="171" w:name="ref-willey_phillips_1958"/>
+    <w:bookmarkEnd w:id="189"/>
+    <w:bookmarkStart w:id="190" w:name="ref-willey_phillips_1958"/>
     <w:p>
       <w:pPr>
         <w:pStyle w:val="Bibliography"/>
@@ -5628,8 +6109,8 @@
         <w:t xml:space="preserve">. University of Chicago Press, Chicago.</w:t>
       </w:r>
     </w:p>
-    <w:bookmarkEnd w:id="171"/>
-    <w:bookmarkStart w:id="172" w:name="ref-williams_1954"/>
+    <w:bookmarkEnd w:id="190"/>
+    <w:bookmarkStart w:id="191" w:name="ref-williams_1954"/>
     <w:p>
       <w:pPr>
         <w:pStyle w:val="Bibliography"/>
@@ -5638,8 +6119,8 @@
         <w:t xml:space="preserve">Williams, Stephen. 1954. An Archeological Study of the Mississippian Culture in Southeast Missouri. PhD thesis, Yale University, New Haven.</w:t>
       </w:r>
     </w:p>
-    <w:bookmarkEnd w:id="172"/>
-    <w:bookmarkStart w:id="173" w:name="ref-williams_1990"/>
+    <w:bookmarkEnd w:id="191"/>
+    <w:bookmarkStart w:id="192" w:name="ref-williams_1990"/>
     <w:p>
       <w:pPr>
         <w:pStyle w:val="Bibliography"/>
@@ -5675,10 +6156,50 @@
         <w:t xml:space="preserve">, edited by David H. Dye and Cheryl Anne Cox, pp. 170–180. University of Alabama Press, Tuscaloosa.</w:t>
       </w:r>
     </w:p>
-    <w:bookmarkEnd w:id="173"/>
-    <w:bookmarkEnd w:id="174"/>
-    <w:bookmarkEnd w:id="175"/>
-    <w:bookmarkEnd w:id="176"/>
+    <w:bookmarkEnd w:id="192"/>
+    <w:bookmarkStart w:id="194" w:name="ref-youngblood_miton_morin_2023"/>
+    <w:p>
+      <w:pPr>
+        <w:pStyle w:val="Bibliography"/>
+      </w:pPr>
+      <w:r>
+        <w:t xml:space="preserve">Youngblood, Mason, Helena Miton, and Olivier Morin. 2023. Statistical Signals of Copying Are Robust to Time- and Space-Averaging.</w:t>
+      </w:r>
+      <w:r>
+        <w:t xml:space="preserve"> </w:t>
+      </w:r>
+      <w:r>
+        <w:rPr>
+          <w:i/>
+          <w:iCs/>
+        </w:rPr>
+        <w:t xml:space="preserve">Evolutionary Human Sciences</w:t>
+      </w:r>
+      <w:r>
+        <w:t xml:space="preserve"> </w:t>
+      </w:r>
+      <w:r>
+        <w:t xml:space="preserve">5:e16.</w:t>
+      </w:r>
+      <w:r>
+        <w:t xml:space="preserve"> </w:t>
+      </w:r>
+      <w:hyperlink r:id="rId193">
+        <w:r>
+          <w:rPr>
+            <w:rStyle w:val="Hyperlink"/>
+          </w:rPr>
+          <w:t xml:space="preserve">https://doi.org/10.1017/ehs.2023.5</w:t>
+        </w:r>
+      </w:hyperlink>
+      <w:r>
+        <w:t xml:space="preserve">.</w:t>
+      </w:r>
+    </w:p>
+    <w:bookmarkEnd w:id="194"/>
+    <w:bookmarkEnd w:id="195"/>
+    <w:bookmarkEnd w:id="196"/>
+    <w:bookmarkEnd w:id="197"/>
     <w:sectPr>
       <w:footnotePr>
         <w:numRestart w:val="eachSect"/>

</xml_diff>

<commit_message>
Add Peebles and Kus 1977 (archaeological correlates of ranked societies)
The canonical source for the mound-center-marks-a-chiefly-apex inference the
paper interrogates; cited at the Introduction (the conventional polity reading)
and in the settlement cross-check (rank-size as a ranked-society correlate).
</commit_message>
<xml_diff>
--- a/docs/manuscript/MAIN_TEXT.docx
+++ b/docs/manuscript/MAIN_TEXT.docx
@@ -2,7 +2,7 @@
 <file path=word/document.xml><?xml version="1.0" encoding="utf-8"?>
 <w:document xmlns:w="http://schemas.openxmlformats.org/wordprocessingml/2006/main" xmlns:m="http://schemas.openxmlformats.org/officeDocument/2006/math" xmlns:r="http://schemas.openxmlformats.org/officeDocument/2006/relationships" xmlns:o="urn:schemas-microsoft-com:office:office" xmlns:v="urn:schemas-microsoft-com:vml" xmlns:w10="urn:schemas-microsoft-com:office:word" xmlns:a="http://schemas.openxmlformats.org/drawingml/2006/main" xmlns:pic="http://schemas.openxmlformats.org/drawingml/2006/picture" xmlns:wp="http://schemas.openxmlformats.org/drawingml/2006/wordprocessingDrawing">
   <w:body>
-    <w:bookmarkStart w:id="197" w:name="X093902eb68652ea32f5548e74607f4e4b0f6699"/>
+    <w:bookmarkStart w:id="199" w:name="X093902eb68652ea32f5548e74607f4e4b0f6699"/>
     <w:p>
       <w:pPr>
         <w:pStyle w:val="Heading1"/>
@@ -76,7 +76,16 @@
         <w:t xml:space="preserve">(Hudson et al. 1990; Mitchem 2001; Morse 1990)</w:t>
       </w:r>
       <w:r>
-        <w:t xml:space="preserve">. On the strength of its size, fortification, platform mound, and ethnohistoric identification, Parkin is routinely read as the center of a Mississippian polity. This chiefdom drew tribute from the smaller villages around it, an inference made explicit by the argument that its position on agriculturally poor soil required surrounding communities to provide it with provisions</w:t>
+        <w:t xml:space="preserve">. On the strength of its size, fortification, platform mound, and ethnohistoric identification, Parkin is routinely read as the center of a Mississippian polity, on the long-standing assumption that a dominant mound center marks the apex of a ranked society</w:t>
+      </w:r>
+      <w:r>
+        <w:t xml:space="preserve"> </w:t>
+      </w:r>
+      <w:r>
+        <w:t xml:space="preserve">(Peebles and Kus 1977)</w:t>
+      </w:r>
+      <w:r>
+        <w:t xml:space="preserve">. This chiefdom drew tribute from the smaller villages around it, an inference made explicit by the argument that its position on agriculturally poor soil required surrounding communities to provide it with provisions</w:t>
       </w:r>
       <w:r>
         <w:t xml:space="preserve"> </w:t>
@@ -1580,7 +1589,16 @@
         <w:pStyle w:val="FirstParagraph"/>
       </w:pPr>
       <w:r>
-        <w:t xml:space="preserve">The transmission test stands on its own, but a polity, or any closure of interaction into bounded groups, should also leave non-ceramic traces. We assembled three further lines against which to check it: one genuinely independent of the ceramic data (the lithic exchange economy), one that shares its collection substrate (settlement organization), and one that re-examines the same assemblages by a different method (an independent ordination). We assessed settlement organization using the rank-size distribution of mound area within the basin and the distribution of mound height, asking whether a single center dominates as a redistributive apex or whether size is graded. For the political economy of exchange, we drew on Cobb’s regional analysis of the production and distribution of Mill Creek and Dover chert hoes, the capacity-linked industrial goods whose control would mark economic centralization, rather than measuring it ourselves</w:t>
+        <w:t xml:space="preserve">The transmission test stands on its own, but a polity, or any closure of interaction into bounded groups, should also leave non-ceramic traces. We assembled three further lines against which to check it: one genuinely independent of the ceramic data (the lithic exchange economy), one that shares its collection substrate (settlement organization), and one that re-examines the same assemblages by a different method (an independent ordination). We assessed settlement organization using the rank-size distribution of mound area within the basin and the distribution of mound height, asking whether a single center dominates as a redistributive apex, the classic archaeological correlate of a ranked society, or whether size is graded</w:t>
+      </w:r>
+      <w:r>
+        <w:t xml:space="preserve"> </w:t>
+      </w:r>
+      <w:r>
+        <w:t xml:space="preserve">(Peebles and Kus 1977)</w:t>
+      </w:r>
+      <w:r>
+        <w:t xml:space="preserve">. For the political economy of exchange, we drew on Cobb’s regional analysis of the production and distribution of Mill Creek and Dover chert hoes, the capacity-linked industrial goods whose control would mark economic centralization, rather than measuring it ourselves</w:t>
       </w:r>
       <w:r>
         <w:t xml:space="preserve"> </w:t>
@@ -2377,7 +2395,7 @@
       </w:r>
     </w:p>
     <w:bookmarkEnd w:id="52"/>
-    <w:bookmarkStart w:id="196" w:name="references"/>
+    <w:bookmarkStart w:id="198" w:name="references"/>
     <w:p>
       <w:pPr>
         <w:pStyle w:val="Heading2"/>
@@ -2386,7 +2404,7 @@
         <w:t xml:space="preserve">References</w:t>
       </w:r>
     </w:p>
-    <w:bookmarkStart w:id="195" w:name="refs"/>
+    <w:bookmarkStart w:id="197" w:name="refs"/>
     <w:bookmarkStart w:id="53" w:name="ref-anderson_1996"/>
     <w:p>
       <w:pPr>
@@ -5193,7 +5211,47 @@
       </w:r>
     </w:p>
     <w:bookmarkEnd w:id="155"/>
-    <w:bookmarkStart w:id="157" w:name="ref-peeples_schachner_2012"/>
+    <w:bookmarkStart w:id="157" w:name="ref-peebles_kus_1977"/>
+    <w:p>
+      <w:pPr>
+        <w:pStyle w:val="Bibliography"/>
+      </w:pPr>
+      <w:r>
+        <w:t xml:space="preserve">Peebles, Christopher S., and Susan M. Kus. 1977. Some Archaeological Correlates of Ranked Societies.</w:t>
+      </w:r>
+      <w:r>
+        <w:t xml:space="preserve"> </w:t>
+      </w:r>
+      <w:r>
+        <w:rPr>
+          <w:i/>
+          <w:iCs/>
+        </w:rPr>
+        <w:t xml:space="preserve">American Antiquity</w:t>
+      </w:r>
+      <w:r>
+        <w:t xml:space="preserve"> </w:t>
+      </w:r>
+      <w:r>
+        <w:t xml:space="preserve">42(3):421–448.</w:t>
+      </w:r>
+      <w:r>
+        <w:t xml:space="preserve"> </w:t>
+      </w:r>
+      <w:hyperlink r:id="rId156">
+        <w:r>
+          <w:rPr>
+            <w:rStyle w:val="Hyperlink"/>
+          </w:rPr>
+          <w:t xml:space="preserve">https://doi.org/10.2307/279066</w:t>
+        </w:r>
+      </w:hyperlink>
+      <w:r>
+        <w:t xml:space="preserve">.</w:t>
+      </w:r>
+    </w:p>
+    <w:bookmarkEnd w:id="157"/>
+    <w:bookmarkStart w:id="159" w:name="ref-peeples_schachner_2012"/>
     <w:p>
       <w:pPr>
         <w:pStyle w:val="Bibliography"/>
@@ -5220,7 +5278,7 @@
       <w:r>
         <w:t xml:space="preserve"> </w:t>
       </w:r>
-      <w:hyperlink r:id="rId156">
+      <w:hyperlink r:id="rId158">
         <w:r>
           <w:rPr>
             <w:rStyle w:val="Hyperlink"/>
@@ -5232,8 +5290,8 @@
         <w:t xml:space="preserve">.</w:t>
       </w:r>
     </w:p>
-    <w:bookmarkEnd w:id="157"/>
-    <w:bookmarkStart w:id="159" w:name="ref-perreault_2018"/>
+    <w:bookmarkEnd w:id="159"/>
+    <w:bookmarkStart w:id="161" w:name="ref-perreault_2018"/>
     <w:p>
       <w:pPr>
         <w:pStyle w:val="Bibliography"/>
@@ -5260,7 +5318,7 @@
       <w:r>
         <w:t xml:space="preserve"> </w:t>
       </w:r>
-      <w:hyperlink r:id="rId158">
+      <w:hyperlink r:id="rId160">
         <w:r>
           <w:rPr>
             <w:rStyle w:val="Hyperlink"/>
@@ -5272,8 +5330,8 @@
         <w:t xml:space="preserve">.</w:t>
       </w:r>
     </w:p>
-    <w:bookmarkEnd w:id="159"/>
-    <w:bookmarkStart w:id="160" w:name="ref-perreault_2019"/>
+    <w:bookmarkEnd w:id="161"/>
+    <w:bookmarkStart w:id="162" w:name="ref-perreault_2019"/>
     <w:p>
       <w:pPr>
         <w:pStyle w:val="Bibliography"/>
@@ -5295,8 +5353,8 @@
         <w:t xml:space="preserve">. University of Chicago Press, Chicago.</w:t>
       </w:r>
     </w:p>
-    <w:bookmarkEnd w:id="160"/>
-    <w:bookmarkStart w:id="161" w:name="ref-phillips_1970"/>
+    <w:bookmarkEnd w:id="162"/>
+    <w:bookmarkStart w:id="163" w:name="ref-phillips_1970"/>
     <w:p>
       <w:pPr>
         <w:pStyle w:val="Bibliography"/>
@@ -5367,8 +5425,8 @@
         <w:t xml:space="preserve">, Vol. 60. Papers of the Peabody Museum of Archaeology and Ethnology. Peabody Museum, Harvard University, Cambridge, MA.</w:t>
       </w:r>
     </w:p>
-    <w:bookmarkEnd w:id="161"/>
-    <w:bookmarkStart w:id="162" w:name="ref-phillips_ford_griffin_1951"/>
+    <w:bookmarkEnd w:id="163"/>
+    <w:bookmarkStart w:id="164" w:name="ref-phillips_ford_griffin_1951"/>
     <w:p>
       <w:pPr>
         <w:pStyle w:val="Bibliography"/>
@@ -5418,8 +5476,8 @@
         <w:t xml:space="preserve">, Vol. 25. Papers of the Peabody Museum of American Archaeology and Ethnology. Peabody Museum, Harvard University, Cambridge, MA.</w:t>
       </w:r>
     </w:p>
-    <w:bookmarkEnd w:id="162"/>
-    <w:bookmarkStart w:id="164" w:name="ref-phillips_willey_1953"/>
+    <w:bookmarkEnd w:id="164"/>
+    <w:bookmarkStart w:id="166" w:name="ref-phillips_willey_1953"/>
     <w:p>
       <w:pPr>
         <w:pStyle w:val="Bibliography"/>
@@ -5446,7 +5504,7 @@
       <w:r>
         <w:t xml:space="preserve"> </w:t>
       </w:r>
-      <w:hyperlink r:id="rId163">
+      <w:hyperlink r:id="rId165">
         <w:r>
           <w:rPr>
             <w:rStyle w:val="Hyperlink"/>
@@ -5458,8 +5516,8 @@
         <w:t xml:space="preserve">.</w:t>
       </w:r>
     </w:p>
-    <w:bookmarkEnd w:id="164"/>
-    <w:bookmarkStart w:id="166" w:name="ref-powell_shennan_thomas_2009"/>
+    <w:bookmarkEnd w:id="166"/>
+    <w:bookmarkStart w:id="168" w:name="ref-powell_shennan_thomas_2009"/>
     <w:p>
       <w:pPr>
         <w:pStyle w:val="Bibliography"/>
@@ -5498,7 +5556,7 @@
       <w:r>
         <w:t xml:space="preserve"> </w:t>
       </w:r>
-      <w:hyperlink r:id="rId165">
+      <w:hyperlink r:id="rId167">
         <w:r>
           <w:rPr>
             <w:rStyle w:val="Hyperlink"/>
@@ -5510,8 +5568,8 @@
         <w:t xml:space="preserve">.</w:t>
       </w:r>
     </w:p>
-    <w:bookmarkEnd w:id="166"/>
-    <w:bookmarkStart w:id="168" w:name="ref-premo_2014"/>
+    <w:bookmarkEnd w:id="168"/>
+    <w:bookmarkStart w:id="170" w:name="ref-premo_2014"/>
     <w:p>
       <w:pPr>
         <w:pStyle w:val="Bibliography"/>
@@ -5538,7 +5596,7 @@
       <w:r>
         <w:t xml:space="preserve"> </w:t>
       </w:r>
-      <w:hyperlink r:id="rId167">
+      <w:hyperlink r:id="rId169">
         <w:r>
           <w:rPr>
             <w:rStyle w:val="Hyperlink"/>
@@ -5550,8 +5608,8 @@
         <w:t xml:space="preserve">.</w:t>
       </w:r>
     </w:p>
-    <w:bookmarkEnd w:id="168"/>
-    <w:bookmarkStart w:id="169" w:name="ref-rees_political_culture"/>
+    <w:bookmarkEnd w:id="170"/>
+    <w:bookmarkStart w:id="171" w:name="ref-rees_political_culture"/>
     <w:p>
       <w:pPr>
         <w:pStyle w:val="Bibliography"/>
@@ -5575,8 +5633,8 @@
         <w:t xml:space="preserve">. Ph.D. dissertation, University of Oklahoma, Norman.</w:t>
       </w:r>
     </w:p>
-    <w:bookmarkEnd w:id="169"/>
-    <w:bookmarkStart w:id="171" w:name="ref-reimer_etal_2020"/>
+    <w:bookmarkEnd w:id="171"/>
+    <w:bookmarkStart w:id="173" w:name="ref-reimer_etal_2020"/>
     <w:p>
       <w:pPr>
         <w:pStyle w:val="Bibliography"/>
@@ -5630,7 +5688,7 @@
       <w:r>
         <w:t xml:space="preserve"> </w:t>
       </w:r>
-      <w:hyperlink r:id="rId170">
+      <w:hyperlink r:id="rId172">
         <w:r>
           <w:rPr>
             <w:rStyle w:val="Hyperlink"/>
@@ -5642,8 +5700,8 @@
         <w:t xml:space="preserve">.</w:t>
       </w:r>
     </w:p>
-    <w:bookmarkEnd w:id="171"/>
-    <w:bookmarkStart w:id="173" w:name="ref-richerson_etal_2016"/>
+    <w:bookmarkEnd w:id="173"/>
+    <w:bookmarkStart w:id="175" w:name="ref-richerson_etal_2016"/>
     <w:p>
       <w:pPr>
         <w:pStyle w:val="Bibliography"/>
@@ -5670,7 +5728,7 @@
       <w:r>
         <w:t xml:space="preserve"> </w:t>
       </w:r>
-      <w:hyperlink r:id="rId172">
+      <w:hyperlink r:id="rId174">
         <w:r>
           <w:rPr>
             <w:rStyle w:val="Hyperlink"/>
@@ -5682,8 +5740,8 @@
         <w:t xml:space="preserve">.</w:t>
       </w:r>
     </w:p>
-    <w:bookmarkEnd w:id="173"/>
-    <w:bookmarkStart w:id="175" w:name="ref-riede_hoggard_shennan_2019"/>
+    <w:bookmarkEnd w:id="175"/>
+    <w:bookmarkStart w:id="177" w:name="ref-riede_hoggard_shennan_2019"/>
     <w:p>
       <w:pPr>
         <w:pStyle w:val="Bibliography"/>
@@ -5710,7 +5768,7 @@
       <w:r>
         <w:t xml:space="preserve"> </w:t>
       </w:r>
-      <w:hyperlink r:id="rId174">
+      <w:hyperlink r:id="rId176">
         <w:r>
           <w:rPr>
             <w:rStyle w:val="Hyperlink"/>
@@ -5722,8 +5780,8 @@
         <w:t xml:space="preserve">.</w:t>
       </w:r>
     </w:p>
-    <w:bookmarkEnd w:id="175"/>
-    <w:bookmarkStart w:id="176" w:name="ref-robinson_1951"/>
+    <w:bookmarkEnd w:id="177"/>
+    <w:bookmarkStart w:id="178" w:name="ref-robinson_1951"/>
     <w:p>
       <w:pPr>
         <w:pStyle w:val="Bibliography"/>
@@ -5748,8 +5806,8 @@
         <w:t xml:space="preserve">16(4):293–301.</w:t>
       </w:r>
     </w:p>
-    <w:bookmarkEnd w:id="176"/>
-    <w:bookmarkStart w:id="177" w:name="ref-ross-stallings_2017"/>
+    <w:bookmarkEnd w:id="178"/>
+    <w:bookmarkStart w:id="179" w:name="ref-ross-stallings_2017"/>
     <w:p>
       <w:pPr>
         <w:pStyle w:val="Bibliography"/>
@@ -5783,8 +5841,8 @@
         <w:t xml:space="preserve">, edited by Haagen D. Klaus, Amanda R. Harvey, and Mark N. Cohen, pp. 329–362. University Press of Florida, Gainesville.</w:t>
       </w:r>
     </w:p>
-    <w:bookmarkEnd w:id="177"/>
-    <w:bookmarkStart w:id="179" w:name="ref-scheffer_2009"/>
+    <w:bookmarkEnd w:id="179"/>
+    <w:bookmarkStart w:id="181" w:name="ref-scheffer_2009"/>
     <w:p>
       <w:pPr>
         <w:pStyle w:val="Bibliography"/>
@@ -5811,7 +5869,7 @@
       <w:r>
         <w:t xml:space="preserve"> </w:t>
       </w:r>
-      <w:hyperlink r:id="rId178">
+      <w:hyperlink r:id="rId180">
         <w:r>
           <w:rPr>
             <w:rStyle w:val="Hyperlink"/>
@@ -5823,8 +5881,8 @@
         <w:t xml:space="preserve">.</w:t>
       </w:r>
     </w:p>
-    <w:bookmarkEnd w:id="179"/>
-    <w:bookmarkStart w:id="180" w:name="ref-schiffer_1972"/>
+    <w:bookmarkEnd w:id="181"/>
+    <w:bookmarkStart w:id="182" w:name="ref-schiffer_1972"/>
     <w:p>
       <w:pPr>
         <w:pStyle w:val="Bibliography"/>
@@ -5849,8 +5907,8 @@
         <w:t xml:space="preserve">37(2):156–165.</w:t>
       </w:r>
     </w:p>
-    <w:bookmarkEnd w:id="180"/>
-    <w:bookmarkStart w:id="181" w:name="ref-shennan_wilkinson_2001"/>
+    <w:bookmarkEnd w:id="182"/>
+    <w:bookmarkStart w:id="183" w:name="ref-shennan_wilkinson_2001"/>
     <w:p>
       <w:pPr>
         <w:pStyle w:val="Bibliography"/>
@@ -5890,8 +5948,8 @@
         <w:t xml:space="preserve">66(4):577–593.</w:t>
       </w:r>
     </w:p>
-    <w:bookmarkEnd w:id="181"/>
-    <w:bookmarkStart w:id="182" w:name="ref-smith_neiman_2007"/>
+    <w:bookmarkEnd w:id="183"/>
+    <w:bookmarkStart w:id="184" w:name="ref-smith_neiman_2007"/>
     <w:p>
       <w:pPr>
         <w:pStyle w:val="Bibliography"/>
@@ -5916,8 +5974,8 @@
         <w:t xml:space="preserve">26(1):47–72.</w:t>
       </w:r>
     </w:p>
-    <w:bookmarkEnd w:id="182"/>
-    <w:bookmarkStart w:id="184" w:name="ref-stern_1994"/>
+    <w:bookmarkEnd w:id="184"/>
+    <w:bookmarkStart w:id="186" w:name="ref-stern_1994"/>
     <w:p>
       <w:pPr>
         <w:pStyle w:val="Bibliography"/>
@@ -5944,7 +6002,7 @@
       <w:r>
         <w:t xml:space="preserve"> </w:t>
       </w:r>
-      <w:hyperlink r:id="rId183">
+      <w:hyperlink r:id="rId185">
         <w:r>
           <w:rPr>
             <w:rStyle w:val="Hyperlink"/>
@@ -5956,8 +6014,8 @@
         <w:t xml:space="preserve">.</w:t>
       </w:r>
     </w:p>
-    <w:bookmarkEnd w:id="184"/>
-    <w:bookmarkStart w:id="186" w:name="ref-sullivan_2024"/>
+    <w:bookmarkEnd w:id="186"/>
+    <w:bookmarkStart w:id="188" w:name="ref-sullivan_2024"/>
     <w:p>
       <w:pPr>
         <w:pStyle w:val="Bibliography"/>
@@ -6008,7 +6066,7 @@
       <w:r>
         <w:t xml:space="preserve"> </w:t>
       </w:r>
-      <w:hyperlink r:id="rId185">
+      <w:hyperlink r:id="rId187">
         <w:r>
           <w:rPr>
             <w:rStyle w:val="Hyperlink"/>
@@ -6020,8 +6078,8 @@
         <w:t xml:space="preserve">.</w:t>
       </w:r>
     </w:p>
-    <w:bookmarkEnd w:id="186"/>
-    <w:bookmarkStart w:id="187" w:name="ref-tomasovych_kidwell_2009"/>
+    <w:bookmarkEnd w:id="188"/>
+    <w:bookmarkStart w:id="189" w:name="ref-tomasovych_kidwell_2009"/>
     <w:p>
       <w:pPr>
         <w:pStyle w:val="Bibliography"/>
@@ -6046,8 +6104,8 @@
         <w:t xml:space="preserve">35(1):94–118.</w:t>
       </w:r>
     </w:p>
-    <w:bookmarkEnd w:id="187"/>
-    <w:bookmarkStart w:id="189" w:name="ref-tomasovych_kidwell_2010"/>
+    <w:bookmarkEnd w:id="189"/>
+    <w:bookmarkStart w:id="191" w:name="ref-tomasovych_kidwell_2010"/>
     <w:p>
       <w:pPr>
         <w:pStyle w:val="Bibliography"/>
@@ -6074,7 +6132,7 @@
       <w:r>
         <w:t xml:space="preserve"> </w:t>
       </w:r>
-      <w:hyperlink r:id="rId188">
+      <w:hyperlink r:id="rId190">
         <w:r>
           <w:rPr>
             <w:rStyle w:val="Hyperlink"/>
@@ -6086,8 +6144,8 @@
         <w:t xml:space="preserve">.</w:t>
       </w:r>
     </w:p>
-    <w:bookmarkEnd w:id="189"/>
-    <w:bookmarkStart w:id="190" w:name="ref-willey_phillips_1958"/>
+    <w:bookmarkEnd w:id="191"/>
+    <w:bookmarkStart w:id="192" w:name="ref-willey_phillips_1958"/>
     <w:p>
       <w:pPr>
         <w:pStyle w:val="Bibliography"/>
@@ -6109,8 +6167,8 @@
         <w:t xml:space="preserve">. University of Chicago Press, Chicago.</w:t>
       </w:r>
     </w:p>
-    <w:bookmarkEnd w:id="190"/>
-    <w:bookmarkStart w:id="191" w:name="ref-williams_1954"/>
+    <w:bookmarkEnd w:id="192"/>
+    <w:bookmarkStart w:id="193" w:name="ref-williams_1954"/>
     <w:p>
       <w:pPr>
         <w:pStyle w:val="Bibliography"/>
@@ -6119,8 +6177,8 @@
         <w:t xml:space="preserve">Williams, Stephen. 1954. An Archeological Study of the Mississippian Culture in Southeast Missouri. PhD thesis, Yale University, New Haven.</w:t>
       </w:r>
     </w:p>
-    <w:bookmarkEnd w:id="191"/>
-    <w:bookmarkStart w:id="192" w:name="ref-williams_1990"/>
+    <w:bookmarkEnd w:id="193"/>
+    <w:bookmarkStart w:id="194" w:name="ref-williams_1990"/>
     <w:p>
       <w:pPr>
         <w:pStyle w:val="Bibliography"/>
@@ -6156,8 +6214,8 @@
         <w:t xml:space="preserve">, edited by David H. Dye and Cheryl Anne Cox, pp. 170–180. University of Alabama Press, Tuscaloosa.</w:t>
       </w:r>
     </w:p>
-    <w:bookmarkEnd w:id="192"/>
-    <w:bookmarkStart w:id="194" w:name="ref-youngblood_miton_morin_2023"/>
+    <w:bookmarkEnd w:id="194"/>
+    <w:bookmarkStart w:id="196" w:name="ref-youngblood_miton_morin_2023"/>
     <w:p>
       <w:pPr>
         <w:pStyle w:val="Bibliography"/>
@@ -6184,7 +6242,7 @@
       <w:r>
         <w:t xml:space="preserve"> </w:t>
       </w:r>
-      <w:hyperlink r:id="rId193">
+      <w:hyperlink r:id="rId195">
         <w:r>
           <w:rPr>
             <w:rStyle w:val="Hyperlink"/>
@@ -6196,10 +6254,10 @@
         <w:t xml:space="preserve">.</w:t>
       </w:r>
     </w:p>
-    <w:bookmarkEnd w:id="194"/>
-    <w:bookmarkEnd w:id="195"/>
     <w:bookmarkEnd w:id="196"/>
     <w:bookmarkEnd w:id="197"/>
+    <w:bookmarkEnd w:id="198"/>
+    <w:bookmarkEnd w:id="199"/>
     <w:sectPr>
       <w:footnotePr>
         <w:numRestart w:val="eachSect"/>

</xml_diff>

<commit_message>
Actually record the two verified DOIs in references.bib (jas.2010.05.015; 2307/2694529)
</commit_message>
<xml_diff>
--- a/docs/manuscript/MAIN_TEXT.docx
+++ b/docs/manuscript/MAIN_TEXT.docx
@@ -2,7 +2,7 @@
 <file path=word/document.xml><?xml version="1.0" encoding="utf-8"?>
 <w:document xmlns:w="http://schemas.openxmlformats.org/wordprocessingml/2006/main" xmlns:m="http://schemas.openxmlformats.org/officeDocument/2006/math" xmlns:r="http://schemas.openxmlformats.org/officeDocument/2006/relationships" xmlns:o="urn:schemas-microsoft-com:office:office" xmlns:v="urn:schemas-microsoft-com:vml" xmlns:w10="urn:schemas-microsoft-com:office:word" xmlns:a="http://schemas.openxmlformats.org/drawingml/2006/main" xmlns:pic="http://schemas.openxmlformats.org/drawingml/2006/picture" xmlns:wp="http://schemas.openxmlformats.org/drawingml/2006/wordprocessingDrawing">
   <w:body>
-    <w:bookmarkStart w:id="199" w:name="X093902eb68652ea32f5548e74607f4e4b0f6699"/>
+    <w:bookmarkStart w:id="201" w:name="X093902eb68652ea32f5548e74607f4e4b0f6699"/>
     <w:p>
       <w:pPr>
         <w:pStyle w:val="Heading1"/>
@@ -2395,7 +2395,7 @@
       </w:r>
     </w:p>
     <w:bookmarkEnd w:id="52"/>
-    <w:bookmarkStart w:id="198" w:name="references"/>
+    <w:bookmarkStart w:id="200" w:name="references"/>
     <w:p>
       <w:pPr>
         <w:pStyle w:val="Heading2"/>
@@ -2404,7 +2404,7 @@
         <w:t xml:space="preserve">References</w:t>
       </w:r>
     </w:p>
-    <w:bookmarkStart w:id="197" w:name="refs"/>
+    <w:bookmarkStart w:id="199" w:name="refs"/>
     <w:bookmarkStart w:id="53" w:name="ref-anderson_1996"/>
     <w:p>
       <w:pPr>
@@ -4219,7 +4219,7 @@
       </w:r>
     </w:p>
     <w:bookmarkEnd w:id="127"/>
-    <w:bookmarkStart w:id="128" w:name="ref-ladefoged_graves_2000"/>
+    <w:bookmarkStart w:id="129" w:name="ref-ladefoged_graves_2000"/>
     <w:p>
       <w:pPr>
         <w:pStyle w:val="Bibliography"/>
@@ -4261,9 +4261,23 @@
       <w:r>
         <w:t xml:space="preserve">65(3):423–448.</w:t>
       </w:r>
-    </w:p>
-    <w:bookmarkEnd w:id="128"/>
-    <w:bookmarkStart w:id="129" w:name="ref-lewontin_1974"/>
+      <w:r>
+        <w:t xml:space="preserve"> </w:t>
+      </w:r>
+      <w:hyperlink r:id="rId128">
+        <w:r>
+          <w:rPr>
+            <w:rStyle w:val="Hyperlink"/>
+          </w:rPr>
+          <w:t xml:space="preserve">https://doi.org/10.2307/2694529</w:t>
+        </w:r>
+      </w:hyperlink>
+      <w:r>
+        <w:t xml:space="preserve">.</w:t>
+      </w:r>
+    </w:p>
+    <w:bookmarkEnd w:id="129"/>
+    <w:bookmarkStart w:id="130" w:name="ref-lewontin_1974"/>
     <w:p>
       <w:pPr>
         <w:pStyle w:val="Bibliography"/>
@@ -4285,8 +4299,8 @@
         <w:t xml:space="preserve">. Columbia University Press, New York.</w:t>
       </w:r>
     </w:p>
-    <w:bookmarkEnd w:id="129"/>
-    <w:bookmarkStart w:id="130" w:name="ref-lipo_2001"/>
+    <w:bookmarkEnd w:id="130"/>
+    <w:bookmarkStart w:id="131" w:name="ref-lipo_2001"/>
     <w:p>
       <w:pPr>
         <w:pStyle w:val="Bibliography"/>
@@ -4336,8 +4350,8 @@
         <w:t xml:space="preserve">. BAR International Series 918. Archaeopress, Oxford.</w:t>
       </w:r>
     </w:p>
-    <w:bookmarkEnd w:id="130"/>
-    <w:bookmarkStart w:id="132" w:name="ref-lipo_dinapoli_madsen_hunt_2021"/>
+    <w:bookmarkEnd w:id="131"/>
+    <w:bookmarkStart w:id="133" w:name="ref-lipo_dinapoli_madsen_hunt_2021"/>
     <w:p>
       <w:pPr>
         <w:pStyle w:val="Bibliography"/>
@@ -4364,7 +4378,7 @@
       <w:r>
         <w:t xml:space="preserve"> </w:t>
       </w:r>
-      <w:hyperlink r:id="rId131">
+      <w:hyperlink r:id="rId132">
         <w:r>
           <w:rPr>
             <w:rStyle w:val="Hyperlink"/>
@@ -4376,8 +4390,8 @@
         <w:t xml:space="preserve">.</w:t>
       </w:r>
     </w:p>
-    <w:bookmarkEnd w:id="132"/>
-    <w:bookmarkStart w:id="133" w:name="ref-lipo_dunnell_2007"/>
+    <w:bookmarkEnd w:id="133"/>
+    <w:bookmarkStart w:id="134" w:name="ref-lipo_dunnell_2007"/>
     <w:p>
       <w:pPr>
         <w:pStyle w:val="Bibliography"/>
@@ -4439,8 +4453,8 @@
         <w:t xml:space="preserve">, edited by Janet Rafferty and Evan Peacock, pp. 125–167. University of Alabama Press, Tuscaloosa.</w:t>
       </w:r>
     </w:p>
-    <w:bookmarkEnd w:id="133"/>
-    <w:bookmarkStart w:id="134" w:name="ref-lipo_hunt_hundtoft_2010"/>
+    <w:bookmarkEnd w:id="134"/>
+    <w:bookmarkStart w:id="136" w:name="ref-lipo_hunt_hundtoft_2010"/>
     <w:p>
       <w:pPr>
         <w:pStyle w:val="Bibliography"/>
@@ -4482,9 +4496,23 @@
       <w:r>
         <w:t xml:space="preserve">37(10):2551–2561.</w:t>
       </w:r>
-    </w:p>
-    <w:bookmarkEnd w:id="134"/>
-    <w:bookmarkStart w:id="136" w:name="ref-lipo_madsen_dunnell_2015"/>
+      <w:r>
+        <w:t xml:space="preserve"> </w:t>
+      </w:r>
+      <w:hyperlink r:id="rId135">
+        <w:r>
+          <w:rPr>
+            <w:rStyle w:val="Hyperlink"/>
+          </w:rPr>
+          <w:t xml:space="preserve">https://doi.org/10.1016/j.jas.2010.05.015</w:t>
+        </w:r>
+      </w:hyperlink>
+      <w:r>
+        <w:t xml:space="preserve">.</w:t>
+      </w:r>
+    </w:p>
+    <w:bookmarkEnd w:id="136"/>
+    <w:bookmarkStart w:id="138" w:name="ref-lipo_madsen_dunnell_2015"/>
     <w:p>
       <w:pPr>
         <w:pStyle w:val="Bibliography"/>
@@ -4511,7 +4539,7 @@
       <w:r>
         <w:t xml:space="preserve"> </w:t>
       </w:r>
-      <w:hyperlink r:id="rId135">
+      <w:hyperlink r:id="rId137">
         <w:r>
           <w:rPr>
             <w:rStyle w:val="Hyperlink"/>
@@ -4523,8 +4551,8 @@
         <w:t xml:space="preserve">.</w:t>
       </w:r>
     </w:p>
-    <w:bookmarkEnd w:id="136"/>
-    <w:bookmarkStart w:id="138" w:name="ref-lipo_madsen_dunnell_hunt_1997"/>
+    <w:bookmarkEnd w:id="138"/>
+    <w:bookmarkStart w:id="140" w:name="ref-lipo_madsen_dunnell_hunt_1997"/>
     <w:p>
       <w:pPr>
         <w:pStyle w:val="Bibliography"/>
@@ -4551,7 +4579,7 @@
       <w:r>
         <w:t xml:space="preserve"> </w:t>
       </w:r>
-      <w:hyperlink r:id="rId137">
+      <w:hyperlink r:id="rId139">
         <w:r>
           <w:rPr>
             <w:rStyle w:val="Hyperlink"/>
@@ -4563,8 +4591,8 @@
         <w:t xml:space="preserve">.</w:t>
       </w:r>
     </w:p>
-    <w:bookmarkEnd w:id="138"/>
-    <w:bookmarkStart w:id="140" w:name="ref-holland-lulewicz_2019"/>
+    <w:bookmarkEnd w:id="140"/>
+    <w:bookmarkStart w:id="142" w:name="ref-holland-lulewicz_2019"/>
     <w:p>
       <w:pPr>
         <w:pStyle w:val="Bibliography"/>
@@ -4618,7 +4646,7 @@
       <w:r>
         <w:t xml:space="preserve"> </w:t>
       </w:r>
-      <w:hyperlink r:id="rId139">
+      <w:hyperlink r:id="rId141">
         <w:r>
           <w:rPr>
             <w:rStyle w:val="Hyperlink"/>
@@ -4630,8 +4658,8 @@
         <w:t xml:space="preserve">.</w:t>
       </w:r>
     </w:p>
-    <w:bookmarkEnd w:id="140"/>
-    <w:bookmarkStart w:id="141" w:name="ref-madsen_2012"/>
+    <w:bookmarkEnd w:id="142"/>
+    <w:bookmarkStart w:id="143" w:name="ref-madsen_2012"/>
     <w:p>
       <w:pPr>
         <w:pStyle w:val="Bibliography"/>
@@ -4640,8 +4668,8 @@
         <w:t xml:space="preserve">Madsen, Mark E. 2012. Neutral Cultural Transmission in Time-Averaged Archaeological Assemblages. arXiv preprint arXiv:1204.2043 [physics.soc-ph].</w:t>
       </w:r>
     </w:p>
-    <w:bookmarkEnd w:id="141"/>
-    <w:bookmarkStart w:id="142" w:name="ref-mainfort_1996"/>
+    <w:bookmarkEnd w:id="143"/>
+    <w:bookmarkStart w:id="144" w:name="ref-mainfort_1996"/>
     <w:p>
       <w:pPr>
         <w:pStyle w:val="Bibliography"/>
@@ -4690,8 +4718,8 @@
         <w:t xml:space="preserve">15(2):172–181.</w:t>
       </w:r>
     </w:p>
-    <w:bookmarkEnd w:id="142"/>
-    <w:bookmarkStart w:id="143" w:name="ref-mainfort_2001"/>
+    <w:bookmarkEnd w:id="144"/>
+    <w:bookmarkStart w:id="145" w:name="ref-mainfort_2001"/>
     <w:p>
       <w:pPr>
         <w:pStyle w:val="Bibliography"/>
@@ -4725,8 +4753,8 @@
         <w:t xml:space="preserve">, edited by David S. Brose, C. Wesley Cowan, and Jr. Mainfort Robert C., pp. 173–190. Smithsonian Institution Press, Washington, DC.</w:t>
       </w:r>
     </w:p>
-    <w:bookmarkEnd w:id="143"/>
-    <w:bookmarkStart w:id="144" w:name="ref-mainfort_2003"/>
+    <w:bookmarkEnd w:id="145"/>
+    <w:bookmarkStart w:id="146" w:name="ref-mainfort_2003"/>
     <w:p>
       <w:pPr>
         <w:pStyle w:val="Bibliography"/>
@@ -4763,8 +4791,8 @@
         <w:t xml:space="preserve">22(2):176–184.</w:t>
       </w:r>
     </w:p>
-    <w:bookmarkEnd w:id="144"/>
-    <w:bookmarkStart w:id="145" w:name="ref-mantel_1967"/>
+    <w:bookmarkEnd w:id="146"/>
+    <w:bookmarkStart w:id="147" w:name="ref-mantel_1967"/>
     <w:p>
       <w:pPr>
         <w:pStyle w:val="Bibliography"/>
@@ -4789,8 +4817,8 @@
         <w:t xml:space="preserve">27(2):209–220.</w:t>
       </w:r>
     </w:p>
-    <w:bookmarkEnd w:id="145"/>
-    <w:bookmarkStart w:id="146" w:name="ref-mcnutt_ed_1996"/>
+    <w:bookmarkEnd w:id="147"/>
+    <w:bookmarkStart w:id="148" w:name="ref-mcnutt_ed_1996"/>
     <w:p>
       <w:pPr>
         <w:pStyle w:val="Bibliography"/>
@@ -4840,8 +4868,8 @@
         <w:t xml:space="preserve">. University of Alabama Press, Tuscaloosa.</w:t>
       </w:r>
     </w:p>
-    <w:bookmarkEnd w:id="146"/>
-    <w:bookmarkStart w:id="147" w:name="ref-mesoudi_2021"/>
+    <w:bookmarkEnd w:id="148"/>
+    <w:bookmarkStart w:id="149" w:name="ref-mesoudi_2021"/>
     <w:p>
       <w:pPr>
         <w:pStyle w:val="Bibliography"/>
@@ -4866,8 +4894,8 @@
         <w:t xml:space="preserve">376:20200053.</w:t>
       </w:r>
     </w:p>
-    <w:bookmarkEnd w:id="147"/>
-    <w:bookmarkStart w:id="149" w:name="ref-miller_atkins_premo_2018"/>
+    <w:bookmarkEnd w:id="149"/>
+    <w:bookmarkStart w:id="151" w:name="ref-miller_atkins_premo_2018"/>
     <w:p>
       <w:pPr>
         <w:pStyle w:val="Bibliography"/>
@@ -4894,7 +4922,7 @@
       <w:r>
         <w:t xml:space="preserve"> </w:t>
       </w:r>
-      <w:hyperlink r:id="rId148">
+      <w:hyperlink r:id="rId150">
         <w:r>
           <w:rPr>
             <w:rStyle w:val="Hyperlink"/>
@@ -4906,8 +4934,8 @@
         <w:t xml:space="preserve">.</w:t>
       </w:r>
     </w:p>
-    <w:bookmarkEnd w:id="149"/>
-    <w:bookmarkStart w:id="150" w:name="ref-milner_1998"/>
+    <w:bookmarkEnd w:id="151"/>
+    <w:bookmarkStart w:id="152" w:name="ref-milner_1998"/>
     <w:p>
       <w:pPr>
         <w:pStyle w:val="Bibliography"/>
@@ -4985,8 +5013,8 @@
         <w:t xml:space="preserve">. Smithsonian Institution Press, Washington, D.C.</w:t>
       </w:r>
     </w:p>
-    <w:bookmarkEnd w:id="150"/>
-    <w:bookmarkStart w:id="151" w:name="ref-mitchem_2001"/>
+    <w:bookmarkEnd w:id="152"/>
+    <w:bookmarkStart w:id="153" w:name="ref-mitchem_2001"/>
     <w:p>
       <w:pPr>
         <w:pStyle w:val="Bibliography"/>
@@ -5016,8 +5044,8 @@
         <w:t xml:space="preserve">.</w:t>
       </w:r>
     </w:p>
-    <w:bookmarkEnd w:id="151"/>
-    <w:bookmarkStart w:id="152" w:name="ref-morse_morse_1983"/>
+    <w:bookmarkEnd w:id="153"/>
+    <w:bookmarkStart w:id="154" w:name="ref-morse_morse_1983"/>
     <w:p>
       <w:pPr>
         <w:pStyle w:val="Bibliography"/>
@@ -5067,8 +5095,8 @@
         <w:t xml:space="preserve">. Academic Press, New York.</w:t>
       </w:r>
     </w:p>
-    <w:bookmarkEnd w:id="152"/>
-    <w:bookmarkStart w:id="153" w:name="ref-morse_morse_1996"/>
+    <w:bookmarkEnd w:id="154"/>
+    <w:bookmarkStart w:id="155" w:name="ref-morse_morse_1996"/>
     <w:p>
       <w:pPr>
         <w:pStyle w:val="Bibliography"/>
@@ -5105,8 +5133,8 @@
         <w:t xml:space="preserve">17(1):1–35.</w:t>
       </w:r>
     </w:p>
-    <w:bookmarkEnd w:id="153"/>
-    <w:bookmarkStart w:id="154" w:name="ref-morse_1990"/>
+    <w:bookmarkEnd w:id="155"/>
+    <w:bookmarkStart w:id="156" w:name="ref-morse_1990"/>
     <w:p>
       <w:pPr>
         <w:pStyle w:val="Bibliography"/>
@@ -5166,8 +5194,8 @@
         <w:t xml:space="preserve">, edited by David H. Dye and Cheryl Anne Cox, pp. 118–134. University of Alabama Press, Tuscaloosa.</w:t>
       </w:r>
     </w:p>
-    <w:bookmarkEnd w:id="154"/>
-    <w:bookmarkStart w:id="155" w:name="ref-neiman_1995"/>
+    <w:bookmarkEnd w:id="156"/>
+    <w:bookmarkStart w:id="157" w:name="ref-neiman_1995"/>
     <w:p>
       <w:pPr>
         <w:pStyle w:val="Bibliography"/>
@@ -5210,8 +5238,8 @@
         <w:t xml:space="preserve">60(1):7–36.</w:t>
       </w:r>
     </w:p>
-    <w:bookmarkEnd w:id="155"/>
-    <w:bookmarkStart w:id="157" w:name="ref-peebles_kus_1977"/>
+    <w:bookmarkEnd w:id="157"/>
+    <w:bookmarkStart w:id="159" w:name="ref-peebles_kus_1977"/>
     <w:p>
       <w:pPr>
         <w:pStyle w:val="Bibliography"/>
@@ -5238,7 +5266,7 @@
       <w:r>
         <w:t xml:space="preserve"> </w:t>
       </w:r>
-      <w:hyperlink r:id="rId156">
+      <w:hyperlink r:id="rId158">
         <w:r>
           <w:rPr>
             <w:rStyle w:val="Hyperlink"/>
@@ -5250,8 +5278,8 @@
         <w:t xml:space="preserve">.</w:t>
       </w:r>
     </w:p>
-    <w:bookmarkEnd w:id="157"/>
-    <w:bookmarkStart w:id="159" w:name="ref-peeples_schachner_2012"/>
+    <w:bookmarkEnd w:id="159"/>
+    <w:bookmarkStart w:id="161" w:name="ref-peeples_schachner_2012"/>
     <w:p>
       <w:pPr>
         <w:pStyle w:val="Bibliography"/>
@@ -5278,7 +5306,7 @@
       <w:r>
         <w:t xml:space="preserve"> </w:t>
       </w:r>
-      <w:hyperlink r:id="rId158">
+      <w:hyperlink r:id="rId160">
         <w:r>
           <w:rPr>
             <w:rStyle w:val="Hyperlink"/>
@@ -5290,8 +5318,8 @@
         <w:t xml:space="preserve">.</w:t>
       </w:r>
     </w:p>
-    <w:bookmarkEnd w:id="159"/>
-    <w:bookmarkStart w:id="161" w:name="ref-perreault_2018"/>
+    <w:bookmarkEnd w:id="161"/>
+    <w:bookmarkStart w:id="163" w:name="ref-perreault_2018"/>
     <w:p>
       <w:pPr>
         <w:pStyle w:val="Bibliography"/>
@@ -5318,7 +5346,7 @@
       <w:r>
         <w:t xml:space="preserve"> </w:t>
       </w:r>
-      <w:hyperlink r:id="rId160">
+      <w:hyperlink r:id="rId162">
         <w:r>
           <w:rPr>
             <w:rStyle w:val="Hyperlink"/>
@@ -5330,8 +5358,8 @@
         <w:t xml:space="preserve">.</w:t>
       </w:r>
     </w:p>
-    <w:bookmarkEnd w:id="161"/>
-    <w:bookmarkStart w:id="162" w:name="ref-perreault_2019"/>
+    <w:bookmarkEnd w:id="163"/>
+    <w:bookmarkStart w:id="164" w:name="ref-perreault_2019"/>
     <w:p>
       <w:pPr>
         <w:pStyle w:val="Bibliography"/>
@@ -5353,8 +5381,8 @@
         <w:t xml:space="preserve">. University of Chicago Press, Chicago.</w:t>
       </w:r>
     </w:p>
-    <w:bookmarkEnd w:id="162"/>
-    <w:bookmarkStart w:id="163" w:name="ref-phillips_1970"/>
+    <w:bookmarkEnd w:id="164"/>
+    <w:bookmarkStart w:id="165" w:name="ref-phillips_1970"/>
     <w:p>
       <w:pPr>
         <w:pStyle w:val="Bibliography"/>
@@ -5425,8 +5453,8 @@
         <w:t xml:space="preserve">, Vol. 60. Papers of the Peabody Museum of Archaeology and Ethnology. Peabody Museum, Harvard University, Cambridge, MA.</w:t>
       </w:r>
     </w:p>
-    <w:bookmarkEnd w:id="163"/>
-    <w:bookmarkStart w:id="164" w:name="ref-phillips_ford_griffin_1951"/>
+    <w:bookmarkEnd w:id="165"/>
+    <w:bookmarkStart w:id="166" w:name="ref-phillips_ford_griffin_1951"/>
     <w:p>
       <w:pPr>
         <w:pStyle w:val="Bibliography"/>
@@ -5476,8 +5504,8 @@
         <w:t xml:space="preserve">, Vol. 25. Papers of the Peabody Museum of American Archaeology and Ethnology. Peabody Museum, Harvard University, Cambridge, MA.</w:t>
       </w:r>
     </w:p>
-    <w:bookmarkEnd w:id="164"/>
-    <w:bookmarkStart w:id="166" w:name="ref-phillips_willey_1953"/>
+    <w:bookmarkEnd w:id="166"/>
+    <w:bookmarkStart w:id="168" w:name="ref-phillips_willey_1953"/>
     <w:p>
       <w:pPr>
         <w:pStyle w:val="Bibliography"/>
@@ -5504,7 +5532,7 @@
       <w:r>
         <w:t xml:space="preserve"> </w:t>
       </w:r>
-      <w:hyperlink r:id="rId165">
+      <w:hyperlink r:id="rId167">
         <w:r>
           <w:rPr>
             <w:rStyle w:val="Hyperlink"/>
@@ -5516,8 +5544,8 @@
         <w:t xml:space="preserve">.</w:t>
       </w:r>
     </w:p>
-    <w:bookmarkEnd w:id="166"/>
-    <w:bookmarkStart w:id="168" w:name="ref-powell_shennan_thomas_2009"/>
+    <w:bookmarkEnd w:id="168"/>
+    <w:bookmarkStart w:id="170" w:name="ref-powell_shennan_thomas_2009"/>
     <w:p>
       <w:pPr>
         <w:pStyle w:val="Bibliography"/>
@@ -5556,7 +5584,7 @@
       <w:r>
         <w:t xml:space="preserve"> </w:t>
       </w:r>
-      <w:hyperlink r:id="rId167">
+      <w:hyperlink r:id="rId169">
         <w:r>
           <w:rPr>
             <w:rStyle w:val="Hyperlink"/>
@@ -5568,8 +5596,8 @@
         <w:t xml:space="preserve">.</w:t>
       </w:r>
     </w:p>
-    <w:bookmarkEnd w:id="168"/>
-    <w:bookmarkStart w:id="170" w:name="ref-premo_2014"/>
+    <w:bookmarkEnd w:id="170"/>
+    <w:bookmarkStart w:id="172" w:name="ref-premo_2014"/>
     <w:p>
       <w:pPr>
         <w:pStyle w:val="Bibliography"/>
@@ -5596,7 +5624,7 @@
       <w:r>
         <w:t xml:space="preserve"> </w:t>
       </w:r>
-      <w:hyperlink r:id="rId169">
+      <w:hyperlink r:id="rId171">
         <w:r>
           <w:rPr>
             <w:rStyle w:val="Hyperlink"/>
@@ -5608,8 +5636,8 @@
         <w:t xml:space="preserve">.</w:t>
       </w:r>
     </w:p>
-    <w:bookmarkEnd w:id="170"/>
-    <w:bookmarkStart w:id="171" w:name="ref-rees_political_culture"/>
+    <w:bookmarkEnd w:id="172"/>
+    <w:bookmarkStart w:id="173" w:name="ref-rees_political_culture"/>
     <w:p>
       <w:pPr>
         <w:pStyle w:val="Bibliography"/>
@@ -5633,8 +5661,8 @@
         <w:t xml:space="preserve">. Ph.D. dissertation, University of Oklahoma, Norman.</w:t>
       </w:r>
     </w:p>
-    <w:bookmarkEnd w:id="171"/>
-    <w:bookmarkStart w:id="173" w:name="ref-reimer_etal_2020"/>
+    <w:bookmarkEnd w:id="173"/>
+    <w:bookmarkStart w:id="175" w:name="ref-reimer_etal_2020"/>
     <w:p>
       <w:pPr>
         <w:pStyle w:val="Bibliography"/>
@@ -5688,7 +5716,7 @@
       <w:r>
         <w:t xml:space="preserve"> </w:t>
       </w:r>
-      <w:hyperlink r:id="rId172">
+      <w:hyperlink r:id="rId174">
         <w:r>
           <w:rPr>
             <w:rStyle w:val="Hyperlink"/>
@@ -5700,8 +5728,8 @@
         <w:t xml:space="preserve">.</w:t>
       </w:r>
     </w:p>
-    <w:bookmarkEnd w:id="173"/>
-    <w:bookmarkStart w:id="175" w:name="ref-richerson_etal_2016"/>
+    <w:bookmarkEnd w:id="175"/>
+    <w:bookmarkStart w:id="177" w:name="ref-richerson_etal_2016"/>
     <w:p>
       <w:pPr>
         <w:pStyle w:val="Bibliography"/>
@@ -5728,7 +5756,7 @@
       <w:r>
         <w:t xml:space="preserve"> </w:t>
       </w:r>
-      <w:hyperlink r:id="rId174">
+      <w:hyperlink r:id="rId176">
         <w:r>
           <w:rPr>
             <w:rStyle w:val="Hyperlink"/>
@@ -5740,8 +5768,8 @@
         <w:t xml:space="preserve">.</w:t>
       </w:r>
     </w:p>
-    <w:bookmarkEnd w:id="175"/>
-    <w:bookmarkStart w:id="177" w:name="ref-riede_hoggard_shennan_2019"/>
+    <w:bookmarkEnd w:id="177"/>
+    <w:bookmarkStart w:id="179" w:name="ref-riede_hoggard_shennan_2019"/>
     <w:p>
       <w:pPr>
         <w:pStyle w:val="Bibliography"/>
@@ -5768,7 +5796,7 @@
       <w:r>
         <w:t xml:space="preserve"> </w:t>
       </w:r>
-      <w:hyperlink r:id="rId176">
+      <w:hyperlink r:id="rId178">
         <w:r>
           <w:rPr>
             <w:rStyle w:val="Hyperlink"/>
@@ -5780,8 +5808,8 @@
         <w:t xml:space="preserve">.</w:t>
       </w:r>
     </w:p>
-    <w:bookmarkEnd w:id="177"/>
-    <w:bookmarkStart w:id="178" w:name="ref-robinson_1951"/>
+    <w:bookmarkEnd w:id="179"/>
+    <w:bookmarkStart w:id="180" w:name="ref-robinson_1951"/>
     <w:p>
       <w:pPr>
         <w:pStyle w:val="Bibliography"/>
@@ -5806,8 +5834,8 @@
         <w:t xml:space="preserve">16(4):293–301.</w:t>
       </w:r>
     </w:p>
-    <w:bookmarkEnd w:id="178"/>
-    <w:bookmarkStart w:id="179" w:name="ref-ross-stallings_2017"/>
+    <w:bookmarkEnd w:id="180"/>
+    <w:bookmarkStart w:id="181" w:name="ref-ross-stallings_2017"/>
     <w:p>
       <w:pPr>
         <w:pStyle w:val="Bibliography"/>
@@ -5841,8 +5869,8 @@
         <w:t xml:space="preserve">, edited by Haagen D. Klaus, Amanda R. Harvey, and Mark N. Cohen, pp. 329–362. University Press of Florida, Gainesville.</w:t>
       </w:r>
     </w:p>
-    <w:bookmarkEnd w:id="179"/>
-    <w:bookmarkStart w:id="181" w:name="ref-scheffer_2009"/>
+    <w:bookmarkEnd w:id="181"/>
+    <w:bookmarkStart w:id="183" w:name="ref-scheffer_2009"/>
     <w:p>
       <w:pPr>
         <w:pStyle w:val="Bibliography"/>
@@ -5869,7 +5897,7 @@
       <w:r>
         <w:t xml:space="preserve"> </w:t>
       </w:r>
-      <w:hyperlink r:id="rId180">
+      <w:hyperlink r:id="rId182">
         <w:r>
           <w:rPr>
             <w:rStyle w:val="Hyperlink"/>
@@ -5881,8 +5909,8 @@
         <w:t xml:space="preserve">.</w:t>
       </w:r>
     </w:p>
-    <w:bookmarkEnd w:id="181"/>
-    <w:bookmarkStart w:id="182" w:name="ref-schiffer_1972"/>
+    <w:bookmarkEnd w:id="183"/>
+    <w:bookmarkStart w:id="184" w:name="ref-schiffer_1972"/>
     <w:p>
       <w:pPr>
         <w:pStyle w:val="Bibliography"/>
@@ -5907,8 +5935,8 @@
         <w:t xml:space="preserve">37(2):156–165.</w:t>
       </w:r>
     </w:p>
-    <w:bookmarkEnd w:id="182"/>
-    <w:bookmarkStart w:id="183" w:name="ref-shennan_wilkinson_2001"/>
+    <w:bookmarkEnd w:id="184"/>
+    <w:bookmarkStart w:id="185" w:name="ref-shennan_wilkinson_2001"/>
     <w:p>
       <w:pPr>
         <w:pStyle w:val="Bibliography"/>
@@ -5948,8 +5976,8 @@
         <w:t xml:space="preserve">66(4):577–593.</w:t>
       </w:r>
     </w:p>
-    <w:bookmarkEnd w:id="183"/>
-    <w:bookmarkStart w:id="184" w:name="ref-smith_neiman_2007"/>
+    <w:bookmarkEnd w:id="185"/>
+    <w:bookmarkStart w:id="186" w:name="ref-smith_neiman_2007"/>
     <w:p>
       <w:pPr>
         <w:pStyle w:val="Bibliography"/>
@@ -5974,8 +6002,8 @@
         <w:t xml:space="preserve">26(1):47–72.</w:t>
       </w:r>
     </w:p>
-    <w:bookmarkEnd w:id="184"/>
-    <w:bookmarkStart w:id="186" w:name="ref-stern_1994"/>
+    <w:bookmarkEnd w:id="186"/>
+    <w:bookmarkStart w:id="188" w:name="ref-stern_1994"/>
     <w:p>
       <w:pPr>
         <w:pStyle w:val="Bibliography"/>
@@ -6002,7 +6030,7 @@
       <w:r>
         <w:t xml:space="preserve"> </w:t>
       </w:r>
-      <w:hyperlink r:id="rId185">
+      <w:hyperlink r:id="rId187">
         <w:r>
           <w:rPr>
             <w:rStyle w:val="Hyperlink"/>
@@ -6014,8 +6042,8 @@
         <w:t xml:space="preserve">.</w:t>
       </w:r>
     </w:p>
-    <w:bookmarkEnd w:id="186"/>
-    <w:bookmarkStart w:id="188" w:name="ref-sullivan_2024"/>
+    <w:bookmarkEnd w:id="188"/>
+    <w:bookmarkStart w:id="190" w:name="ref-sullivan_2024"/>
     <w:p>
       <w:pPr>
         <w:pStyle w:val="Bibliography"/>
@@ -6066,7 +6094,7 @@
       <w:r>
         <w:t xml:space="preserve"> </w:t>
       </w:r>
-      <w:hyperlink r:id="rId187">
+      <w:hyperlink r:id="rId189">
         <w:r>
           <w:rPr>
             <w:rStyle w:val="Hyperlink"/>
@@ -6078,8 +6106,8 @@
         <w:t xml:space="preserve">.</w:t>
       </w:r>
     </w:p>
-    <w:bookmarkEnd w:id="188"/>
-    <w:bookmarkStart w:id="189" w:name="ref-tomasovych_kidwell_2009"/>
+    <w:bookmarkEnd w:id="190"/>
+    <w:bookmarkStart w:id="191" w:name="ref-tomasovych_kidwell_2009"/>
     <w:p>
       <w:pPr>
         <w:pStyle w:val="Bibliography"/>
@@ -6104,8 +6132,8 @@
         <w:t xml:space="preserve">35(1):94–118.</w:t>
       </w:r>
     </w:p>
-    <w:bookmarkEnd w:id="189"/>
-    <w:bookmarkStart w:id="191" w:name="ref-tomasovych_kidwell_2010"/>
+    <w:bookmarkEnd w:id="191"/>
+    <w:bookmarkStart w:id="193" w:name="ref-tomasovych_kidwell_2010"/>
     <w:p>
       <w:pPr>
         <w:pStyle w:val="Bibliography"/>
@@ -6132,7 +6160,7 @@
       <w:r>
         <w:t xml:space="preserve"> </w:t>
       </w:r>
-      <w:hyperlink r:id="rId190">
+      <w:hyperlink r:id="rId192">
         <w:r>
           <w:rPr>
             <w:rStyle w:val="Hyperlink"/>
@@ -6144,8 +6172,8 @@
         <w:t xml:space="preserve">.</w:t>
       </w:r>
     </w:p>
-    <w:bookmarkEnd w:id="191"/>
-    <w:bookmarkStart w:id="192" w:name="ref-willey_phillips_1958"/>
+    <w:bookmarkEnd w:id="193"/>
+    <w:bookmarkStart w:id="194" w:name="ref-willey_phillips_1958"/>
     <w:p>
       <w:pPr>
         <w:pStyle w:val="Bibliography"/>
@@ -6167,8 +6195,8 @@
         <w:t xml:space="preserve">. University of Chicago Press, Chicago.</w:t>
       </w:r>
     </w:p>
-    <w:bookmarkEnd w:id="192"/>
-    <w:bookmarkStart w:id="193" w:name="ref-williams_1954"/>
+    <w:bookmarkEnd w:id="194"/>
+    <w:bookmarkStart w:id="195" w:name="ref-williams_1954"/>
     <w:p>
       <w:pPr>
         <w:pStyle w:val="Bibliography"/>
@@ -6177,8 +6205,8 @@
         <w:t xml:space="preserve">Williams, Stephen. 1954. An Archeological Study of the Mississippian Culture in Southeast Missouri. PhD thesis, Yale University, New Haven.</w:t>
       </w:r>
     </w:p>
-    <w:bookmarkEnd w:id="193"/>
-    <w:bookmarkStart w:id="194" w:name="ref-williams_1990"/>
+    <w:bookmarkEnd w:id="195"/>
+    <w:bookmarkStart w:id="196" w:name="ref-williams_1990"/>
     <w:p>
       <w:pPr>
         <w:pStyle w:val="Bibliography"/>
@@ -6214,8 +6242,8 @@
         <w:t xml:space="preserve">, edited by David H. Dye and Cheryl Anne Cox, pp. 170–180. University of Alabama Press, Tuscaloosa.</w:t>
       </w:r>
     </w:p>
-    <w:bookmarkEnd w:id="194"/>
-    <w:bookmarkStart w:id="196" w:name="ref-youngblood_miton_morin_2023"/>
+    <w:bookmarkEnd w:id="196"/>
+    <w:bookmarkStart w:id="198" w:name="ref-youngblood_miton_morin_2023"/>
     <w:p>
       <w:pPr>
         <w:pStyle w:val="Bibliography"/>
@@ -6242,7 +6270,7 @@
       <w:r>
         <w:t xml:space="preserve"> </w:t>
       </w:r>
-      <w:hyperlink r:id="rId195">
+      <w:hyperlink r:id="rId197">
         <w:r>
           <w:rPr>
             <w:rStyle w:val="Hyperlink"/>
@@ -6254,10 +6282,10 @@
         <w:t xml:space="preserve">.</w:t>
       </w:r>
     </w:p>
-    <w:bookmarkEnd w:id="196"/>
-    <w:bookmarkEnd w:id="197"/>
     <w:bookmarkEnd w:id="198"/>
     <w:bookmarkEnd w:id="199"/>
+    <w:bookmarkEnd w:id="200"/>
+    <w:bookmarkEnd w:id="201"/>
     <w:sectPr>
       <w:footnotePr>
         <w:numRestart w:val="eachSect"/>

</xml_diff>

<commit_message>
Expand the four-signature descriptions for general readers
Fuller, accessible accounts of how each diagnostic works and why it is useful
here: the Neiman two-estimator logic (conformity vs novelty), deterministic
frequency seriation / IDSS (battleship curves, co-seriability, fragmentation and
bridge sites), cultural F_ST (between- vs within-group share of diversity), and
the distance-controlled boundary excess (isolation by distance plus a step).
</commit_message>
<xml_diff>
--- a/docs/manuscript/MAIN_TEXT.docx
+++ b/docs/manuscript/MAIN_TEXT.docx
@@ -675,7 +675,7 @@
         <w:pStyle w:val="BodyText"/>
       </w:pPr>
       <w:r>
-        <w:t xml:space="preserve">The first asks whether potters copied decorated styles at random or with a bias. Under random copying, two independent ways of gauging a collection’s diversity, one based on how concentrated the common types are and one on the sheer number of types present, give the same answer. Conformity, where everyone converges on the popular types, or a taste for novelty pulls the two apart in opposite directions. Their disagreement, the ratio of a homozygosity-based to a richness-based estimate of the transmission parameter, both detect a departure from random copying and show which way it leans</w:t>
+        <w:t xml:space="preserve">The first asks whether potters copied decorated styles at random or with a bias. Under unbiased copying, where a potter is as likely to reproduce any design she encounters as any other, two independent ways of gauging a collection’s diversity agree. One is based on how concentrated the common types are, its homozygosity, and one on the sheer number of types present, its richness. Each yields an estimate of the same underlying transmission parameter, and under random copying the two estimates coincide. Conformity, where potters disproportionately copy whatever is already common, concentrates frequency on a few types. It raises homozygosity and so lowers the homozygosity-based estimate while leaving richness little changed, pulling the two apart, and a taste for novelty does the reverse. The disagreement between the two estimates, expressed as their ratio, therefore both detects a departure from random copying and shows which way it leans</w:t>
       </w:r>
       <w:r>
         <w:t xml:space="preserve"> </w:t>
@@ -684,7 +684,7 @@
         <w:t xml:space="preserve">(Neiman 1995; Shennan and Wilkinson 2001)</w:t>
       </w:r>
       <w:r>
-        <w:t xml:space="preserve">.</w:t>
+        <w:t xml:space="preserve">. This matters here because a bounded group that enforced a shared decorative marker would copy conformist within its edge, so the two estimates would diverge, whereas one pool of styles drifting at random keeps them equal.</w:t>
       </w:r>
     </w:p>
     <w:p>
@@ -692,16 +692,16 @@
         <w:pStyle w:val="BodyText"/>
       </w:pPr>
       <w:r>
-        <w:t xml:space="preserve">The second asks whether the collections all belong to one interacting community or to several. Pottery from a single community can be arranged in one orderly frequency seriation, the familiar battleship curves. When learning splits into separate groups with their own repertoires, no single ordering fits, and the collections break into multiple, mutually incompatible seriations. Deterministic frequency seriation counts that fragmentation directly</w:t>
-      </w:r>
-      <w:r>
-        <w:t xml:space="preserve"> </w:t>
-      </w:r>
-      <w:r>
-        <w:t xml:space="preserve">(Lipo et al. 2015)</w:t>
-      </w:r>
-      <w:r>
-        <w:t xml:space="preserve">.</w:t>
+        <w:t xml:space="preserve">The second asks whether the collections all belong to one interacting community or to several, and it is the most direct test of fragmentation. It rests on frequency seriation, the classic archaeological method of ordering assemblages so that each decorated type’s relative frequency rises to a single peak and then falls away, the shape long known as a battleship curve. That single-peaked rise and fall is what a style traces when it is introduced, becomes popular, and is abandoned within one community drawing on a shared pool of designs. A set of collections is co-seriable when one ordering can make every type follow that single-peaked shape at the same time. When all the collections come from one continuously interacting population, such an ordering exists. When learning splits into separate groups, each with its own repertoire and its own independent rise and fall of styles, no single ordering can satisfy every type at once, and the collections break into several mutually incompatible orderings. The deterministic frequency-seriation procedure of Lipo, Madsen, and Dunnell finds the complete set of these maximal co-seriable groups algorithmically, without the analyst arranging the collections by eye</w:t>
+      </w:r>
+      <w:r>
+        <w:t xml:space="preserve"> </w:t>
+      </w:r>
+      <w:r>
+        <w:t xml:space="preserve">(Lipo et al. 1997, 2015)</w:t>
+      </w:r>
+      <w:r>
+        <w:t xml:space="preserve">. The number of groups, and the number of groups any one site joins, then measures the structure of past interaction directly. A single large group means one connected field of learning, a proliferation of small groups means a fragmented one, and a site that falls into several incompatible orderings is a bridge linking otherwise separate sequences rather than the closed core of a bounded community.</w:t>
       </w:r>
     </w:p>
     <w:p>
@@ -709,7 +709,7 @@
         <w:pStyle w:val="BodyText"/>
       </w:pPr>
       <w:r>
-        <w:t xml:space="preserve">The third asks how much of the variation in decoration lies between groups rather than within them. This is the ceramic version of a standard population measure of group differentiation, Wright’s F_ST, here computed on Gini-Simpson diversity, and it climbs from near zero as groups come to hold distinct styles</w:t>
+        <w:t xml:space="preserve">The third asks how much of the variation in decoration lies between groups rather than within them. The measure is a cultural version of Wright’s F_ST, a standard population-genetic index of group differentiation, computed here on Gini-Simpson diversity, the chance that two sherds drawn at random from a collection are of different types. F_ST is the share of the total diversity that is due to differences between groups rather than to variation within them. When every collection draws on one shared, drifting pool of styles, between-group differences are small and F_ST sits near zero, and as groups come to favor distinct repertoires the between-group share grows and F_ST climbs</w:t>
       </w:r>
       <w:r>
         <w:t xml:space="preserve"> </w:t>
@@ -718,7 +718,7 @@
         <w:t xml:space="preserve">(Bell et al. 2009)</w:t>
       </w:r>
       <w:r>
-        <w:t xml:space="preserve">.</w:t>
+        <w:t xml:space="preserve">. It serves here as the most direct measure of how far decoration has sorted itself by group, with one important caveat developed below: stochastic drift on a spatially structured population also generates some between-group variance, so the measure must be calibrated against that null rather than read at face value.</w:t>
       </w:r>
     </w:p>
     <w:p>
@@ -726,7 +726,7 @@
         <w:pStyle w:val="BodyText"/>
       </w:pPr>
       <w:r>
-        <w:t xml:space="preserve">The fourth asks whether socially close collections are more alike than collections that are merely close on the map. A genuine social boundary makes pottery within a cluster more similar than pottery in a neighboring cluster at the same distance, over and above the gentle fade of similarity with geographic distance, and we measure that excess, which a plain distance correlation cannot isolate.</w:t>
+        <w:t xml:space="preserve">The fourth asks whether collections that are socially close are more alike than collections that are merely close on the map. Similarity normally fades smoothly with distance, because potters interact more with near neighbors than with distant ones, a gradient known as isolation by distance. A genuine social boundary adds a step to that gradient: pairs of collections within the same cluster are more similar than pairs in neighboring clusters even when the two pairs span the same geographic distance. We capture that step as a boundary-excess statistic, the gap between within-cluster and between-cluster similarity once distance is held constant, which a plain correlation of similarity with distance cannot isolate. It is useful here because it separates a real social edge from the ordinary spatial fade, again with the caveat that drift on a finite network can itself produce a positive excess.</w:t>
       </w:r>
     </w:p>
     <w:p>

</xml_diff>

<commit_message>
Fix two article numbers from PDF verification: Youngblood et al. 2023 e10, Coco & Iovita 2020 article 136
</commit_message>
<xml_diff>
--- a/docs/manuscript/MAIN_TEXT.docx
+++ b/docs/manuscript/MAIN_TEXT.docx
@@ -3049,7 +3049,7 @@
         <w:t xml:space="preserve"> </w:t>
       </w:r>
       <w:r>
-        <w:t xml:space="preserve">7:47.</w:t>
+        <w:t xml:space="preserve">7:136.</w:t>
       </w:r>
       <w:r>
         <w:t xml:space="preserve"> </w:t>
@@ -6265,7 +6265,7 @@
         <w:t xml:space="preserve"> </w:t>
       </w:r>
       <w:r>
-        <w:t xml:space="preserve">5:e16.</w:t>
+        <w:t xml:space="preserve">5:e10.</w:t>
       </w:r>
       <w:r>
         <w:t xml:space="preserve"> </w:t>

</xml_diff>

<commit_message>
Sync manuscript: incorporate Mark Madsen's review edits
Madsen's seven flagged edits (materialist framing, "appear conformist",
neutral-style-to-marker rewording, section header, "tune"/italic s, the
classical-seriation "failure to seriate together" passage with a paragraph
split, "merely nearby on the map") plus reconciliation of the Word-edited
Introduction paragraphs. Synced from the mls-emergence source.
</commit_message>
<xml_diff>
--- a/docs/manuscript/MAIN_TEXT.docx
+++ b/docs/manuscript/MAIN_TEXT.docx
@@ -49,7 +49,7 @@
         <w:pStyle w:val="FirstParagraph"/>
       </w:pPr>
       <w:r>
-        <w:t xml:space="preserve">The phase is the foundational unit of Mississippian culture history, and it rests on a silent premise: that assemblages more similar to one another than to their neighbors record a bounded social group, a society whose members interacted preferentially among themselves. That premise is rarely tested, and it ignores a strong alternative. Neutral cultural transmission, in which potters copy one another’s decorated styles with no one favoring particular designs, produces the same within-greater-than-between similarity with no bounded groups at all. Style frequencies drift, changing at random from copying alone. When potters interact more with near neighbors than with distant ones, the drift concentrates similar styles in nearby areas, generating apparent clusters based on geography rather than social boundaries. Here, we test, for the late pre-contact central Mississippi Valley, whether decorated-ceramic similarity records bounded interaction groups or spatially structured drift. We compare two generative processes, neutral spatial drift and bounded groups, on the real geography of the assemblages. We calibrate the comparison to the record’s small sample sizes and its time-averaging, the blending of many years of pottery into one surface collection, by a signal-recovery experiment: into synthetic assemblages matched to the real ones, we inject a known group boundary of tunable strength and read off how strong a boundary would have to be before the measures could detect it. We read the result against four transmission signatures and an independent radiocarbon chronology. Within regions, in both the St. Francis basin Parkin phase and the southeast-Missouri survey assemblages of Williams, the decorated-ceramic structure is reproduced by neutral spatial drift under plausible parameters and does not require bounded groups. A bounded-groups process would have marked the record with far sharper structure than it shows. The within-region phase is therefore not demonstrably a bounded interaction group. Parkin, the basin’s tallest-mounded center, is a transmission bridge across orderings rather than the closed core of a society, the same conclusion Fox reached for the southeast Missouri phases using cluster analysis. A boundary that exceeds neutral drift appears only at the larger scale, between the central-valley and lower-valley blocks, where decorated similarity drops more sharply than drift can produce and survives when only shared types are compared. That drop is hard to interpret. It coincides with the early-to-late turnover in pottery types and with the two regions having been collected and classified by different investigators, so it cannot yet be read as a real social boundary rather than a difference in dating or analytical history. The phase, at the scale where it is drawn, is largely indistinguishable from spatially structured drift, and the calibration that licenses this conclusion is the transferable method. Before the similarity structure in ceramic decoration is read as social, the record must be shown to be distinguishable from groups at all.</w:t>
+        <w:t xml:space="preserve">The phase is the foundational unit of Mississippian culture history, and it rests on a silent premise: that assemblages more similar to one another than to their neighbors record a bounded social group, a society whose members interacted preferentially among themselves. That premise is rarely tested, and it ignores a strong alternative. Neutral cultural transmission, in which potters copy one another’s decorated styles with no one favoring particular designs, produces the same within-greater-than-between similarity with no bounded groups at all. Stylistic trait frequencies drift, changing at random from copying alone. When potters interact more with near neighbors than with distant ones, the drift concentrates similar styles in nearby areas, generating apparent clusters based on geography rather than social boundaries. Here, we test, for the late pre-contact central Mississippi Valley, whether decorated-ceramic similarity records bounded interaction groups or spatially structured drift. We compare two generative processes, neutral spatial drift and bounded groups, on the real geography of the assemblages. We calibrate the comparison to the record’s small sample sizes and its time-averaging, the blending of many years of pottery into one surface collection, by a signal-recovery experiment: into synthetic assemblages matched to the real ones, we inject a known group boundary of tunable strength and read off how strong a boundary would have to be before the measures could detect it. We read the result against four transmission signatures and an independent radiocarbon chronology. Within regions, in both the St. Francis basin Parkin phase and the southeast-Missouri survey assemblages of Williams, the decorated-ceramic structure is reproduced by neutral spatial drift under plausible parameters and does not require bounded groups. A bounded-groups process would have marked the record with far sharper structure than it shows. The within-region phase is therefore not demonstrably a bounded interaction group. Parkin, the basin’s tallest-mounded center, is a transmission bridge across orderings rather than the closed core of a society, the same conclusion Fox reached for the southeast Missouri phases using cluster analysis. A boundary that exceeds neutral drift appears only at the larger scale, between the central-valley and lower-valley blocks, where decorated similarity drops more sharply than drift can produce and survives when only shared types are compared. That drop is hard to interpret. It coincides with the early-to-late turnover in pottery types and with the two regions having been collected and classified by different investigators, so it cannot yet be read as a real social boundary rather than a difference in dating or analytical history. The phase, at the scale where it is drawn, is largely indistinguishable from spatially structured drift, and the calibration that licenses this conclusion is the transferable method. Before the similarity structure in ceramic decoration is read as social, the record must be shown to be distinguishable from groups at all.</w:t>
       </w:r>
     </w:p>
     <w:bookmarkEnd w:id="9"/>
@@ -67,7 +67,7 @@
         <w:pStyle w:val="FirstParagraph"/>
       </w:pPr>
       <w:r>
-        <w:t xml:space="preserve">Parkin is the largest of the moated, palisaded towns of the St. Francis basin in northeastern Arkansas, and the chronicles of the Hernando de Soto expedition place it as Casqui, the seat of a paramount chief the expedition encountered in 1541</w:t>
+        <w:t xml:space="preserve">Parkin is the largest of the moated, palisaded towns of the St. Francis basin in northeastern Arkansas. The chronicles of the Hernando de Soto expedition place it as Casqui, the seat of a paramount chief, which the expedition encountered in 1541</w:t>
       </w:r>
       <w:r>
         <w:t xml:space="preserve"> </w:t>
@@ -85,7 +85,7 @@
         <w:t xml:space="preserve">(Peebles and Kus 1977)</w:t>
       </w:r>
       <w:r>
-        <w:t xml:space="preserve">. This chiefdom drew tribute from the smaller villages around it, an inference made explicit by the argument that its position on agriculturally poor soil required surrounding communities to provide it with provisions</w:t>
+        <w:t xml:space="preserve">. This chiefdom is inferred to have drawn tribute from the smaller villages around it, an argument based on its position on agriculturally poor soil, which required surrounding communities to provide it with provisions</w:t>
       </w:r>
       <w:r>
         <w:t xml:space="preserve"> </w:t>
@@ -102,7 +102,7 @@
         <w:pStyle w:val="BodyText"/>
       </w:pPr>
       <w:r>
-        <w:t xml:space="preserve">Whether it was is an empirical question, and settlement morphology alone cannot answer it, because a primate center, a palisade, and a monumental mound are each as compatible with a landscape of competing peer communities as with a consolidated hierarchy</w:t>
+        <w:t xml:space="preserve">Whether such an entity existed at Parkin is an empirical question, and settlement morphology alone cannot answer it. A primary center of interaction, a palisade, and a monumental mound are each as compatible with a landscape of competing peer communities as with a consolidated hierarchy</w:t>
       </w:r>
       <w:r>
         <w:t xml:space="preserve"> </w:t>
@@ -137,7 +137,7 @@
         <w:pStyle w:val="BodyText"/>
       </w:pPr>
       <w:r>
-        <w:t xml:space="preserve">The more revealing question is why Parkin was taken for a polity in the first place, and the answer is in the unit through which the record is read. The Parkin phase is a culture-history construct, a set of assemblages grouped because their decorated-type frequencies seriate together and because the sites cluster in space</w:t>
+        <w:t xml:space="preserve">The more revealing question is why Parkin was taken for a polity in the first place. The answer is in the unit through which the record is read. The Parkin phase is a culture-history construct, a set of assemblages grouped because their decorated-type frequencies seriate together and because the sites cluster in space</w:t>
       </w:r>
       <w:r>
         <w:t xml:space="preserve"> </w:t>
@@ -176,7 +176,7 @@
         <w:t xml:space="preserve">(1954)</w:t>
       </w:r>
       <w:r>
-        <w:t xml:space="preserve">, defining the southeast-Missouri phases on which the regional scheme rests, adopted the social equation anyway, writing that a phase probably equals a society. That equation, disavowed at the source and reinstated in regional practice, is the silent premise. It holds that assemblages more similar to one another than to their neighbors record a bounded, mutually interacting social group. Endow such a group with a primate center, and it becomes a polity. The polity reading is therefore built into the unit before any independent evidence of hierarchy is weighed, and the construct has been questioned on exactly this ground. Fox</w:t>
+        <w:t xml:space="preserve">, defining the southeast-Missouri phases on which the regional scheme rests, adopted the social equation anyway, writing that a phase probably equals a society. That equation, disavowed at the source and reinstated in regional practice, is the silent premise. It holds that assemblages more similar to one another than to their neighbors record a bounded, mutually interacting social group. Endow such a group with a primate center, and it becomes a polity. The polity reading is, therefore, built into the unit before any independent evidence of hierarchy is weighed, and the construct has been questioned on exactly this ground. Fox</w:t>
       </w:r>
       <w:r>
         <w:t xml:space="preserve"> </w:t>
@@ -205,7 +205,19 @@
         <w:pStyle w:val="BodyText"/>
       </w:pPr>
       <w:r>
-        <w:t xml:space="preserve">The premise is rarely tested, and it ignores a strong alternative. Under the neutral model of cultural transmission, decorated style behaves as a selectively neutral trait whose frequency drifts in a finite population of interacting learners</w:t>
+        <w:t xml:space="preserve">The premise is rarely tested, and it ignores a strong alternative. Viewed through the lens of social learning and models of cultural transmission, interaction is always continuous but can be highly variable. Interaction is structured by distance and geography, in addition to social and cultural structures, and the job of the analyst is to show how apparent</w:t>
+      </w:r>
+      <w:r>
+        <w:t xml:space="preserve"> </w:t>
+      </w:r>
+      <w:r>
+        <w:t xml:space="preserve">“differences”</w:t>
+      </w:r>
+      <w:r>
+        <w:t xml:space="preserve"> </w:t>
+      </w:r>
+      <w:r>
+        <w:t xml:space="preserve">(such as phases) are possible under models of continuous interaction and various structures. Under the neutral model of cultural transmission, decorated style behaves as a selectively neutral trait whose frequency drifts in a finite population of interacting learners</w:t>
       </w:r>
       <w:r>
         <w:t xml:space="preserve"> </w:t>
@@ -223,7 +235,7 @@
         <w:t xml:space="preserve">(Lipo et al. 2021)</w:t>
       </w:r>
       <w:r>
-        <w:t xml:space="preserve">. On this account, a phase is the ordinary residue of continuous, distance-structured interaction, and the very pattern the culture-history tradition reads as a society, assemblages near each other in space and in style, is what spatially structured drift predicts. Telling a real interaction group apart from spatially structured drift requires a test that the tradition never applied, because the seriation coherence and spatial proximity that define the phase are equally the products of drift</w:t>
+        <w:t xml:space="preserve">. On this account, a phase can simply be the ordinary residue of continuous, distance-structured interaction, and the very pattern the culture-history tradition reads as a society, assemblages near each other in space and in style, is what spatially structured drift predicts. Telling a real interaction group apart from spatially structured drift requires a test that the tradition never applied, because the seriation coherence and spatial proximity that define the phase are equally the products of drift</w:t>
       </w:r>
       <w:r>
         <w:t xml:space="preserve"> </w:t>
@@ -240,7 +252,7 @@
         <w:pStyle w:val="BodyText"/>
       </w:pPr>
       <w:r>
-        <w:t xml:space="preserve">Decorated ceramics are the instrument for the test. Because stylistic variants are copied between potters along social-learning networks, the spatial and temporal structure of decorated-type frequencies records the structure of past interaction, and a genuine social boundary, had one existed, would make learning conformist within groups and divergent between them, fragmenting the single drifting pool that continuous interaction maintains</w:t>
+        <w:t xml:space="preserve">Decorated ceramics are the instrument for the test. Because stylistic variants are copied between potters along social-learning networks, the spatial and temporal structure of decorated-type frequencies records the structure of past interaction, and a genuine social boundary, had one existed, would make learning appear conformist within groups and divergent between them, fragmenting the single drifting pool that continuous interaction maintains</w:t>
       </w:r>
       <w:r>
         <w:t xml:space="preserve"> </w:t>
@@ -428,7 +440,7 @@
         <w:pStyle w:val="FirstParagraph"/>
       </w:pPr>
       <w:r>
-        <w:t xml:space="preserve">We take a materialist approach to cultural transmission, which frames the question differently from how the central-valley record is usually read. Archaeologists are trained to think with bounded units, the phase, the polity, the society, discrete entities with members and edges, and to read a cluster of similar assemblages as one of them. We treat transmission instead as a continuous and variable field of copying events among potters, a field with no intrinsic edges, in which interaction falls off with distance and learning can be more local in some places and times than in others. On this view a group is not a thing with a boundary but a region where transmission has thickened, and similarity is a matter of degree set by how copying is distributed across space. That field can also close off by degree, interaction narrowing until potters copy mostly within a subset and rarely outside it, producing something that looks like the bounded groups archaeologists think with. The difficulty for the phase is that ordinary interaction already yields within-greater-than-between similarity through distance alone, so clusters by themselves prove nothing. What would mark a real bounded group is closure beyond what distance predicts, and that excess is the signal we test for.</w:t>
+        <w:t xml:space="preserve">We take a materialist approach to cultural transmission, which frames the question differently from how the central-valley record is usually read. Archaeologists are trained to think with bounded units, the phase, the polity, the society, discrete entities with members and edges, and to read a cluster of similar assemblages as one of them. We treat transmission instead as a continuous and variable field of copying events among potters, a field with no intrinsic edges, in which interaction falls off with distance and learning can be more local in some places and times than in others. On this view, a group is not a thing with a boundary but a region where transmission has thickened, and similarity is a matter of degree set by how copying is distributed across space. That field can also close off by degree, interaction narrowing until potters copy mostly within a subset and rarely outside it, producing something that looks like the bounded groups archaeologists think with. The difficulty for the phase is that ordinary interaction already yields within-greater-than-between similarity through distance alone, so clusters by themselves prove nothing. What would mark a real bounded group is closure beyond what distance predicts, and that excess is the signal we test for.</w:t>
       </w:r>
     </w:p>
     <w:p>
@@ -454,7 +466,7 @@
         <w:t xml:space="preserve">(Lipo et al. 2021; Neiman 1995; Shennan et al. 2015)</w:t>
       </w:r>
       <w:r>
-        <w:t xml:space="preserve">. The question the ceramic record must answer is the operational one: does the similarity structure record bounded interaction, or spatially structured drift? Throughout, we call decoration that is transmitted preferentially within a group and divergent between groups a marker, as against neutral style drifting in a single shared pool. A marker is the ceramic expression, the empirical proxy, of interaction closing into a bounded group, so the drift-versus-groups question is equivalently a question of neutral style versus marker.</w:t>
+        <w:t xml:space="preserve">. The question the ceramic record must answer is the operational one: does the similarity structure record bounded interaction, or spatially structured drift? Throughout, we call decoration that is transmitted preferentially within a group and diverges between groups a marker, rather than a neutral style drifting in a single shared pool. A marker is the ceramic expression, the empirical proxy, of interaction closing into a bounded group, so the drift-versus-groups question is equivalently a question of neutral style versus marker.</w:t>
       </w:r>
     </w:p>
     <w:bookmarkEnd w:id="14"/>
@@ -490,7 +502,7 @@
         <w:t xml:space="preserve">(Lipo et al. 2015)</w:t>
       </w:r>
       <w:r>
-        <w:t xml:space="preserve">. Assortment, the tendency for like to learn from like, so that interaction sorts into distinct groups, changes this. If learning becomes restricted within emerging social boundaries, decoration shifts from neutral style toward a marker, transmitted by conformist copying within groups and divergent between them, and the single transmission field fragments</w:t>
+        <w:t xml:space="preserve">. Assortment, the tendency for like to learn from like, so that interaction sorts into distinct groups, changes this. If learning becomes restricted within emerging social boundaries, decoration shifts from the expectations of neutral, stylistic variation toward a constrained set of possibilities, transmitted by conformist copying within groups and divergent between them, and the single transmission field fragments</w:t>
       </w:r>
       <w:r>
         <w:t xml:space="preserve"> </w:t>
@@ -499,55 +511,67 @@
         <w:t xml:space="preserve">(Crema et al. 2016; Henrich 2001; Henrich and Boyd 1998)</w:t>
       </w:r>
       <w:r>
+        <w:t xml:space="preserve">. When this process plays out, the restricted pool of variation can come to look like</w:t>
+      </w:r>
+      <w:r>
+        <w:t xml:space="preserve"> </w:t>
+      </w:r>
+      <w:r>
+        <w:t xml:space="preserve">“markers”</w:t>
+      </w:r>
+      <w:r>
+        <w:t xml:space="preserve"> </w:t>
+      </w:r>
+      <w:r>
+        <w:t xml:space="preserve">of bounded social groups, even if no sharp bounds existed.</w:t>
+      </w:r>
+    </w:p>
+    <w:p>
+      <w:pPr>
+        <w:pStyle w:val="BodyText"/>
+      </w:pPr>
+      <w:r>
+        <w:t xml:space="preserve">The obstacle is that no single frequency pattern identifies its generating process. A departure from neutrality can reflect conformity, an anti-conformist novelty bias, a content bias, or simply the fact that durable objects, rather than people, are the units that accumulate in a deposit</w:t>
+      </w:r>
+      <w:r>
+        <w:t xml:space="preserve"> </w:t>
+      </w:r>
+      <w:r>
+        <w:t xml:space="preserve">(Crema et al. 2016, 2024; Henrich 2001)</w:t>
+      </w:r>
+      <w:r>
+        <w:t xml:space="preserve">. The problem is sharpened in archaeological assemblages, which are time-averaged, because aggregation over the use-life of a deposit inflates richness, flattens evenness, and biases neutrality statistics by an amount that depends on the mean lifetime of the variants</w:t>
+      </w:r>
+      <w:r>
+        <w:t xml:space="preserve"> </w:t>
+      </w:r>
+      <w:r>
+        <w:t xml:space="preserve">(Madsen 2012; Premo 2014)</w:t>
+      </w:r>
+      <w:r>
+        <w:t xml:space="preserve">. The result is equifinality: multiple transmission processes produce the same population-level pattern, so a single statistic cannot recover the process that generated it, and the discriminating signal, where it survives, lies in the rare-variant tail of the frequency distribution rather than in its common types</w:t>
+      </w:r>
+      <w:r>
+        <w:t xml:space="preserve"> </w:t>
+      </w:r>
+      <w:r>
+        <w:t xml:space="preserve">(Carrignon et al. 2019; Kandler et al. 2017; Mesoudi 2021; O’Dwyer and Kandler 2017)</w:t>
+      </w:r>
+      <w:r>
         <w:t xml:space="preserve">.</w:t>
       </w:r>
+      <w:r>
+        <w:t xml:space="preserve"> </w:t>
+      </w:r>
+      <w:r>
+        <w:t xml:space="preserve">### The central Mississippi Valley case and two competing hypotheses</w:t>
+      </w:r>
     </w:p>
     <w:p>
       <w:pPr>
         <w:pStyle w:val="BodyText"/>
       </w:pPr>
       <w:r>
-        <w:t xml:space="preserve">The obstacle is that no single frequency pattern identifies its generating process. A departure from neutrality can reflect conformity, an anti-conformist novelty bias, a content bias, or simply the fact that durable objects, rather than people, are the units that accumulate in a deposit</w:t>
-      </w:r>
-      <w:r>
-        <w:t xml:space="preserve"> </w:t>
-      </w:r>
-      <w:r>
-        <w:t xml:space="preserve">(Crema et al. 2016, 2024; Henrich 2001)</w:t>
-      </w:r>
-      <w:r>
-        <w:t xml:space="preserve">. The problem is sharpened in archaeological assemblages, which are time-averaged, because aggregation over the use-life of a deposit inflates richness, flattens evenness, and biases neutrality statistics by an amount that depends on the mean lifetime of the variants</w:t>
-      </w:r>
-      <w:r>
-        <w:t xml:space="preserve"> </w:t>
-      </w:r>
-      <w:r>
-        <w:t xml:space="preserve">(Madsen 2012; Premo 2014)</w:t>
-      </w:r>
-      <w:r>
-        <w:t xml:space="preserve">. The result is equifinality: multiple transmission processes produce the same population-level pattern, so a single statistic cannot recover the process that generated it, and the discriminating signal, where it survives, lies in the rare-variant tail of the frequency distribution rather than in its common types</w:t>
-      </w:r>
-      <w:r>
-        <w:t xml:space="preserve"> </w:t>
-      </w:r>
-      <w:r>
-        <w:t xml:space="preserve">(Carrignon et al. 2019; Kandler et al. 2017; Mesoudi 2021; O’Dwyer and Kandler 2017)</w:t>
-      </w:r>
-      <w:r>
-        <w:t xml:space="preserve">.</w:t>
-      </w:r>
-      <w:r>
-        <w:t xml:space="preserve"> </w:t>
-      </w:r>
-      <w:r>
-        <w:t xml:space="preserve">### The central Mississippi Valley case and two competing hypotheses</w:t>
-      </w:r>
-    </w:p>
-    <w:p>
-      <w:pPr>
-        <w:pStyle w:val="BodyText"/>
-      </w:pPr>
-      <w:r>
         <w:t xml:space="preserve">The late pre-contact central Mississippi Valley supports two readings of the same record, and they make opposite predictions for the transmission signature. The first holds that the region was moving toward greater complexity. In northeastern Arkansas the Parkin phase (ca. A.D. 1400 to 1600, with a thin protohistoric tail, consistent with the basin radiocarbon reported below) is a dense cluster of fortified, moated St-Francis-type towns along the St. Francis and Tyronza rivers, dominated by the Parkin site, a roughly 17-acre palisaded center with a platform mound rising more than 6 m that the De Soto chronicles place as the seat of the paramount of Casqui</w:t>
       </w:r>
       <w:r>
@@ -620,18 +644,18 @@
         <w:t xml:space="preserve">(Hudson et al. 1990; Mitchem 2001; Morse 1990)</w:t>
       </w:r>
       <w:r>
-        <w:t xml:space="preserve">. The two cannot be separated by settlement morphology alone, because a primate center, fortification, and monumental construction are each compatible with both. They can be separated by whether the transmission record shows interaction closing into bounded groups, which is the test we now construct.</w:t>
+        <w:t xml:space="preserve">. The two cannot be separated by settlement morphology alone. They can be separated by determining whether the transmission record shows interaction closing into bounded groups, which is the test we now construct.</w:t>
       </w:r>
     </w:p>
     <w:bookmarkEnd w:id="15"/>
     <w:bookmarkEnd w:id="16"/>
-    <w:bookmarkStart w:id="20" w:name="distinguishing-groups-from-drift"/>
+    <w:bookmarkStart w:id="20" w:name="Xe1cc53abb112c2b395e3beee2af5ceb0aad4bed"/>
     <w:p>
       <w:pPr>
         <w:pStyle w:val="Heading2"/>
       </w:pPr>
       <w:r>
-        <w:t xml:space="preserve">Distinguishing groups from drift</w:t>
+        <w:t xml:space="preserve">Distinguishing true group structure from spatially structured drift</w:t>
       </w:r>
     </w:p>
     <w:p>
@@ -639,7 +663,20 @@
         <w:pStyle w:val="FirstParagraph"/>
       </w:pPr>
       <w:r>
-        <w:t xml:space="preserve">The test rests on one principle: a process that genuinely reorganizes a population into groups leaves a mark on every aspect of how pottery styles were copied, whereas a process that merely mimics group structure marks only some aspects. The reorganization at issue we call the closure of interaction, and because the rest of the paper turns on it, we define it plainly. In an open community a potter can learn a design from anyone she encounters, near or far, so styles circulate through one connected population. Interaction closes when that circulation narrows: potters come to copy mostly from others inside their own group and rarely from anyone outside it, until a once-continuous field of social learning breaks into separate pools that drift apart. Closure is the process a genuine bounded interaction group undergoes, and we treat its strength as a quantity that runs from none (one fully open field of learning), through partial, to complete (sealed, non-interacting groups). That strength is what the test sets out to measure, and in the synthetic experiments below we dial it as a parameter, s, from 0 (pure drift, no closure) to 1 (strong, sharply bounded groups). The four signatures are each a different consequence of closure, and we state each first in plain terms before naming its formal measure.</w:t>
+        <w:t xml:space="preserve">The test rests on one principle: a process that genuinely reorganizes a population into groups leaves a mark on every aspect of how pottery styles were copied, whereas a process that merely mimics group structure marks only some aspects. The reorganization at issue, which we call the closure of interaction, is central to the rest of the paper, so we define it plainly. In an open community, a potter can learn a design from anyone she encounters, near or far, so styles circulate through one connected population. Interaction closes when that circulation narrows: potters come to copy mostly from others inside their own group and rarely from anyone outside it, until a once-continuous field of social learning breaks into separate pools that drift apart. Closure is the process a genuine bounded interaction group undergoes, and we treat its strength as a quantity that runs from none (one fully open field of learning), through partial, to complete (sealed, non-interacting groups). That strength is what the test sets out to measure, and in the synthetic experiments below, we tune it as a parameter,</w:t>
+      </w:r>
+      <w:r>
+        <w:t xml:space="preserve"> </w:t>
+      </w:r>
+      <w:r>
+        <w:rPr>
+          <w:i/>
+          <w:iCs/>
+        </w:rPr>
+        <w:t xml:space="preserve">s</w:t>
+      </w:r>
+      <w:r>
+        <w:t xml:space="preserve">, from 0 (pure drift, no closure) to 1 (strong, sharply bounded groups). The four signatures are each a different consequence of closure, and we state each first in plain terms before naming its formal measure.</w:t>
       </w:r>
     </w:p>
     <w:p>
@@ -664,7 +701,35 @@
         <w:pStyle w:val="BodyText"/>
       </w:pPr>
       <w:r>
-        <w:t xml:space="preserve">The second asks whether the collections all belong to one interacting community or to several, and it is the most direct test of fragmentation. It rests on frequency seriation, the classic archaeological method of ordering assemblages so that each decorated type’s relative frequency rises to a single peak and then falls away, the shape long known as a battleship curve. That single-peaked rise and fall is what a style traces when it is introduced, becomes popular, and is abandoned within one community, drawing on a shared pool of designs. A set of collections is co-seriable when a single ordering can make every type follow the same single-peaked shape simultaneously. When all collections arise from a single continuously interacting population, such an ordering exists. When learning splits into separate groups, each with its own repertoire and its own independent rise and fall of styles, no single ordering can satisfy every type at once, and the collections break into several mutually incompatible orderings. The deterministic frequency-seriation procedure of Lipo, Madsen, and Dunnell</w:t>
+        <w:t xml:space="preserve">The second asks whether the collections all belong to one interacting community or to several, and it is the most direct test of fragmentation. It rests on frequency seriation, the classic archaeological method of ordering assemblages so that each decorated type’s relative frequency rises to a single peak and then falls away, the shape long known as a battleship curve. That single-peaked rise and fall is what a style traces when it is introduced, becomes popular, and is abandoned within one community, drawing on a shared pool of designs. In classical uses of seriation, all available assemblages were typically pooled into a single seriation, and deviations from the frequency guidelines were simply dismissed as sampling error. While sampling error certainly does need to be accounted for, classical practice ignores the fact that</w:t>
+      </w:r>
+      <w:r>
+        <w:t xml:space="preserve"> </w:t>
+      </w:r>
+      <w:r>
+        <w:rPr>
+          <w:i/>
+          <w:iCs/>
+        </w:rPr>
+        <w:t xml:space="preserve">failure to seriate together</w:t>
+      </w:r>
+      <w:r>
+        <w:t xml:space="preserve"> </w:t>
+      </w:r>
+      <w:r>
+        <w:t xml:space="preserve">is perhaps the most valuable aspect of the seriation method, because it tells us when locales are far enough</w:t>
+      </w:r>
+      <w:r>
+        <w:t xml:space="preserve"> </w:t>
+      </w:r>
+      <w:r>
+        <w:t xml:space="preserve">“out of step”</w:t>
+      </w:r>
+      <w:r>
+        <w:t xml:space="preserve"> </w:t>
+      </w:r>
+      <w:r>
+        <w:t xml:space="preserve">with the continuous flow of interaction and social learning around them that there is interesting structure to their interaction history</w:t>
       </w:r>
       <w:r>
         <w:t xml:space="preserve"> </w:t>
@@ -673,6 +738,35 @@
         <w:t xml:space="preserve">(2015)</w:t>
       </w:r>
       <w:r>
+        <w:t xml:space="preserve">.</w:t>
+      </w:r>
+    </w:p>
+    <w:p>
+      <w:pPr>
+        <w:pStyle w:val="BodyText"/>
+      </w:pPr>
+      <w:r>
+        <w:t xml:space="preserve">A set of collections is</w:t>
+      </w:r>
+      <w:r>
+        <w:t xml:space="preserve"> </w:t>
+      </w:r>
+      <w:r>
+        <w:t xml:space="preserve">“co-seriable”</w:t>
+      </w:r>
+      <w:r>
+        <w:t xml:space="preserve"> </w:t>
+      </w:r>
+      <w:r>
+        <w:t xml:space="preserve">when a single ordering can make every type follow the same single-peaked shape simultaneously. When all collections arise from a single continuously interacting population, such an ordering exists. When learning splits into separate groups, each with its own repertoire and its own independent rise and fall of styles, no single ordering can satisfy every type at once, and the collections break into several mutually incompatible orderings. The deterministic frequency-seriation procedure of Lipo, Madsen, and Dunnell</w:t>
+      </w:r>
+      <w:r>
+        <w:t xml:space="preserve"> </w:t>
+      </w:r>
+      <w:r>
+        <w:t xml:space="preserve">(2015)</w:t>
+      </w:r>
+      <w:r>
         <w:t xml:space="preserve"> </w:t>
       </w:r>
       <w:r>
@@ -737,7 +831,7 @@
         <w:pStyle w:val="BodyText"/>
       </w:pPr>
       <w:r>
-        <w:t xml:space="preserve">The fourth asks whether socially close collections are more alike than collections that are merely close on the map. Similarity normally fades smoothly with distance, because potters interact more with near neighbors than with distant ones, a gradient known as isolation by distance</w:t>
+        <w:t xml:space="preserve">The fourth asks whether socially close collections are more alike than collections that are merely nearby on the map. Similarity normally fades with distance, because potters interact more with near neighbors than with distant ones, a gradient known as isolation by distance</w:t>
       </w:r>
       <w:r>
         <w:t xml:space="preserve"> </w:t>
@@ -772,7 +866,7 @@
         <w:t xml:space="preserve">(Shennan et al. 2015; Wright 1943)</w:t>
       </w:r>
       <w:r>
-        <w:t xml:space="preserve">, the gradual fade of similarity with distance that follows when people interact mostly with near neighbors, without the sharp boundaries or departures from neutrality that mark restricted, assortative learning. A bounded interaction group, in which one assortative process restricts transmission along every dimension, is the only process that drives all four signatures together at full strength. But the table is idealized in a way that matters here: two of the four signatures, between-group variance and the distance-controlled boundary excess, are also driven by stochastic neutral drift on a spatially structured population, which generates patchy divergence and a positive boundary excess with no bounded group anywhere (Results, Figure S5). Their joint movement, therefore, cannot by itself separate a real interaction group from drift. We therefore do not rest on the signatures alone. Instead we compare the two processes generatively: we simulate each one forward, neutral spatial drift and bounded groups alike, on the real geography of the assemblages and ask which reproduces the observed structure, reading the signatures as diagnostics of where each process leaves its mark.</w:t>
+        <w:t xml:space="preserve">, the gradual fade of similarity with distance that follows when people interact mostly with near neighbors, without the sharp boundaries or departures from neutrality that mark restricted, assortative learning. A bounded interaction group, in which one assortative process restricts transmission along every dimension, is the only process that drives all four signatures together at full strength. But the table is idealized in a way that matters here: two of the four signatures, between-group variance and the distance-controlled boundary excess, are also driven by stochastic neutral drift on a spatially structured population, which generates patchy divergence and a positive boundary excess with no bounded group anywhere (Results, Figure S5). Their joint movement, therefore, cannot by itself separate a real interaction group from drift. We therefore do not rest on the signatures alone. Instead, we compare the two processes generatively: we simulate each one forward, neutral spatial drift and bounded groups alike, on the real geography of the assemblages and ask which reproduces the observed structure, reading the signatures as diagnostics of where each process leaves its mark.</w:t>
       </w:r>
     </w:p>
     <w:p>
@@ -790,7 +884,7 @@
         <w:t xml:space="preserve"> </w:t>
       </w:r>
       <w:r>
-        <w:t xml:space="preserve">The transmission signatures each process is expected to leave a mark on, where ● marks a signature the process drives and ○ marks one it leaves flat. Only a bounded interaction group drives all four. Each alternative produces a characteristic subset, a pattern our simulation confirms on idealized data (Figure S4). This is an idealized expectation under smooth, deterministic processes, not a claim about what is detectable in a real record, and two qualifications make it motivating rather than operative. First, the generator diagnostic (Supplemental Text) shows that the non-F_ST rows are not realizable at this record’s resolution, because the neutral and seriation signatures fail to register a signal even when one is injected through its own channel, so the detectable discrimination reduces to cultural F_ST (Figure 4). Second, under realistic stochastic spatial drift, the F_ST and spatial-assortativity rows are themselves driven in the absence of a bounded group (Results, Figure S5). The table frames the question. The generative drift-versus-groups comparison, not the table, answers it.</w:t>
+        <w:t xml:space="preserve">The transmission signatures each process is expected to leave a mark on, where ● marks a signature the process drives and ○ marks one it leaves flat. Only a bounded interaction group drives all four. Each alternative produces a characteristic subset, a pattern our simulation confirms on idealized data (Figure S4). This is an idealized expectation under smooth, deterministic processes, not a claim about what is detectable in a real record. Two qualifications make this an aspirational goal rather than necessarily operative. First, the generator diagnostic (Supplemental Text) shows that the non-F_ST rows are not realizable at this record’s resolution, because the neutral and seriation signatures fail to register a signal even when one is injected through its own channel, so the detectable discrimination reduces to cultural F_ST (Figure 4). Second, under realistic stochastic spatial drift, the F_ST and spatial-assortativity rows are themselves driven in the absence of a bounded group (Results, Figure S5). The table frames the possible combinations of factors that may contribute to a signal of bounded group structure. The generative drift-versus-groups comparison provides a practical assessment.</w:t>
       </w:r>
     </w:p>
     <w:tbl>
@@ -1202,7 +1296,7 @@
         <w:pStyle w:val="BodyText"/>
       </w:pPr>
       <w:r>
-        <w:t xml:space="preserve">Drift with distance-limited interaction produces a raw decay of similarity with distance. The distance-controlled boundary-excess statistic, however, is near zero under smooth isolation-by-distance, so it drives none of the four. This holds for smooth, deterministic isolation by distance. Stochastic neutral drift on a finite network is less forgiving, generating patchy divergence that registers as a positive boundary excess even in the absence of a social boundary, a mimicry that the record-matched controls expose directly (Results). Aggregated signaling raises the neutrality departure in a single undivided pool without forming the between-group boundaries that the other signatures require.</w:t>
+        <w:t xml:space="preserve">Drift with distance-limited interaction produces a raw decay of similarity with distance. The distance-controlled boundary-excess statistic, however, is near zero under smooth isolation-by-distance, so it drives none of the four. This holds for smooth, deterministic isolation-by-distance. Stochastic neutral drift on a finite network is less forgiving, generating patchy divergence that registers as a positive boundary excess even in the absence of a social boundary, a mimicry that the record-matched controls expose directly (Results). Aggregated signaling raises the neutrality departure in a single undivided pool without forming the between-group boundaries that the other signatures require.</w:t>
       </w:r>
     </w:p>
     <w:p>
@@ -1477,7 +1571,7 @@
         <w:t xml:space="preserve">(Baxter 1994; Peeples and Schachner 2012; Smith and Neiman 2007)</w:t>
       </w:r>
       <w:r>
-        <w:t xml:space="preserve">. This ordination arranges assemblages along axes that summarize their decorated-type-frequency differences, as a relative chronological ordinate oriented so that higher positions correspond to later time (Figure 3). Pooling the dates of the five proveniences that match curated assemblages, the pooled median calibrated ages correlate with seriation position at Spearman +0.70 (n = 5, 27 dates pooled), an improvement on the +0.50 of the single-date anchors, with four of the five sites in calendar order and one late-dated site departing from it. The axis, therefore, tracks calendar time, but imperfectly. The trajectory we test is ordinal, not a calendar rate, and the discriminating quantity, the size-controlled F_ST trend, is a magnitude invariant to the axis orientation, so only the directional descriptions of the other signatures depend on the anchor. We return to both limits in the discussion.</w:t>
+        <w:t xml:space="preserve">. This ordination arranges assemblages along axes that summarize their decorated-type-frequency differences, as a relative chronological ordinate oriented so that higher positions correspond to later time (Figure 3). Pooling the dates of the five proveniences that match curated assemblages, the pooled median calibrated ages correlate with seriation position at Spearman +0.70 (n = 5, 27 dates pooled), an improvement on the +0.50 of the single-date anchors, with four of the five sites in calendar order and one late-dated site departing from it. The axis, therefore, tracks calendar time, but imperfectly. The trajectory we test is an ordinal measure, not a calendar rate. The discriminating quantity, the size-controlled F_ST trend, is a magnitude invariant to the axis orientation, so only the directional descriptions of the other signatures depend on the anchor. We return to both limits in the discussion.</w:t>
       </w:r>
     </w:p>
     <w:p>
@@ -2038,7 +2132,7 @@
         <w:pStyle w:val="BodyText"/>
       </w:pPr>
       <w:r>
-        <w:t xml:space="preserve">What it means for assemblages to be co-seriable carries the weight of this signature, and the deterministic method is stricter than the seriations most archaeologists have in mind. In conventional practice an analyst can almost always arrange a set of assemblages into an order in which type frequencies more or less rise and fall, treating the places where a type breaks that pattern as noise to be tolerated by eye. Deterministic frequency seriation removes that tolerance. It accepts an ordering only when every decorated type is at once unimodal, rising to a single peak and then falling away, and continuous, changing without an abrupt jump, and it treats any break in a type’s rise and fall as disqualifying that ordering unless the break is small enough to be explained by sampling error in the counts</w:t>
+        <w:t xml:space="preserve">What it means for assemblages to be co-seriable carries the weight of this signature, and the deterministic method is stricter than the seriations most archaeologists have in mind. In conventional practice, an analyst can almost always arrange a set of assemblages into an order in which type frequencies more or less rise and fall, treating the places where a type breaks that pattern as noise to be tolerated by eye. Deterministic frequency seriation removes that tolerance. It accepts an ordering only when every decorated type is at once unimodal, rising to a single peak and then falling away, and continuous, changing without an abrupt jump. It treats any break in a type’s rise and fall as disqualifying that ordering unless the break is small enough to be explained by sampling error in the counts</w:t>
       </w:r>
       <w:r>
         <w:t xml:space="preserve"> </w:t>
@@ -2047,7 +2141,7 @@
         <w:t xml:space="preserve">(Dunnell 1970; Lipo et al. 2015)</w:t>
       </w:r>
       <w:r>
-        <w:t xml:space="preserve">. Where a conventional seriation would accept one rough ordering and move on, the deterministic method asks whether even one ordering can satisfy every type at once, and reports when none can. A single community drawing on one shared, drifting pool of designs meets that requirement under one ordering. When learning is partitioned among groups, each with its own rise and fall of styles, no single ordering can hold every type unimodal at once, and the assemblages resolve into several mutually incompatible orderings. The departures a conventional seriation would wave off as minor wiggles are, read this way, the signature of more than one interaction community, and the number of maximal co-seriable groups, with the count any one assemblage joins, measures that fragmentation directly</w:t>
+        <w:t xml:space="preserve">. Where a conventional seriation would accept one rough ordering and move on, the deterministic method asks whether even one ordering can satisfy every type at once, and reports when none can. A single community drawing on a shared, drifting pool of designs meets that requirement under a single ordering. When learning is partitioned among groups, each with its own rise and fall of styles, no single ordering can hold every type unimodal at once, and the assemblages resolve into several mutually incompatible orderings. The departures a conventional seriation would wave off as minor wiggles are, read this way, the signature of more than one interaction community, and the number of maximal co-seriable groups, with the count of any one assemblage joins, measures that fragmentation directly</w:t>
       </w:r>
       <w:r>
         <w:t xml:space="preserve"> </w:t>

</xml_diff>

<commit_message>
Sync manuscript: clarify "closure" usage, remove software-production lingo
Spell out compressed "closure" jargon (keeping the defined term), replace
software-flavored terms (detector -> test, pipeline -> procedure, channel ->
pathway, etc.), and soften a remaining dramatic phrasing. Synced from the
mls-emergence source.
</commit_message>
<xml_diff>
--- a/docs/manuscript/MAIN_TEXT.docx
+++ b/docs/manuscript/MAIN_TEXT.docx
@@ -405,7 +405,7 @@
         <w:t xml:space="preserve">(Barrett 2019; Crema et al. 2016; Kandler and Shennan 2015; Mesoudi 2021)</w:t>
       </w:r>
       <w:r>
-        <w:t xml:space="preserve">. We therefore compare the two processes in a generative manner. We simulate neutral spatial drift and bounded groups on the real coordinate layout of the assemblages and ask which reproduces the observed structure, using four transmission signatures, departure from neutral copying, breakdown of frequency-seriation coherence, between-group variance, and spatial assortativity, as diagnostics of whether interaction has closed rather than as a stand-alone detector. Because an archaeological assemblage is time-averaged and sampled to varying depth, a signature can register a difference that is an artifact of sampling rather than of transmission, so we calibrate the comparison to the record by a signal-recovery experiment: into synthetic assemblages matched to the real number, sample sizes, and time-averaging we inject a known signal of tunable strength and read off how strong a real boundary would have to be to register. Only a calibrated comparison can license the conclusion that an absence of group structure is real rather than a failure of resolution. This calibration is the transferable contribution, because before any similarity structure is read as social, a record must be shown to be able to distinguish drift from groups at all.</w:t>
+        <w:t xml:space="preserve">. We therefore compare the two processes in a generative manner. We simulate neutral spatial drift and bounded groups on the real coordinate layout of the assemblages and ask which reproduces the observed structure, using four transmission signatures, departure from neutral copying, breakdown of frequency-seriation coherence, between-group variance, and spatial assortativity, as diagnostics of whether interaction has closed rather than as a stand-alone test. Because an archaeological assemblage is time-averaged and sampled to varying depth, a signature can register a difference that is an artifact of sampling rather than of transmission, so we calibrate the comparison to the record by a signal-recovery experiment: into synthetic assemblages matched to the real number, sample sizes, and time-averaging we inject a known signal of tunable strength and read off how strong a real boundary would have to be to register. Only a calibrated comparison can license the conclusion that an absence of group structure is real rather than a failure of resolution. This calibration is the transferable contribution, because before any similarity structure is read as social, a record must be shown to be able to distinguish drift from groups at all.</w:t>
       </w:r>
     </w:p>
     <w:p>
@@ -884,7 +884,7 @@
         <w:t xml:space="preserve"> </w:t>
       </w:r>
       <w:r>
-        <w:t xml:space="preserve">The transmission signatures each process is expected to leave a mark on, where ● marks a signature the process drives and ○ marks one it leaves flat. Only a bounded interaction group drives all four. Each alternative produces a characteristic subset, a pattern our simulation confirms on idealized data (Figure S4). This is an idealized expectation under smooth, deterministic processes, not a claim about what is detectable in a real record. Two qualifications make this an aspirational goal rather than necessarily operative. First, the generator diagnostic (Supplemental Text) shows that the non-F_ST rows are not realizable at this record’s resolution, because the neutral and seriation signatures fail to register a signal even when one is injected through its own channel, so the detectable discrimination reduces to cultural F_ST (Figure 4). Second, under realistic stochastic spatial drift, the F_ST and spatial-assortativity rows are themselves driven in the absence of a bounded group (Results, Figure S5). The table frames the possible combinations of factors that may contribute to a signal of bounded group structure. The generative drift-versus-groups comparison provides a practical assessment.</w:t>
+        <w:t xml:space="preserve">The transmission signatures each process is expected to leave a mark on, where ● marks a signature the process drives and ○ marks one it leaves flat. Only a bounded interaction group drives all four. Each alternative produces a characteristic subset, a pattern our simulation confirms on idealized data (Figure S4). This is an idealized expectation under smooth, deterministic processes, not a claim about what is detectable in a real record. Two qualifications make this an aspirational goal rather than necessarily operative. First, the generator diagnostic (Supplemental Text) shows that the non-F_ST rows are not realizable at this record’s resolution, because the neutral and seriation signatures fail to register a signal even when one is injected through its own pathway, so the detectable discrimination reduces to cultural F_ST (Figure 4). Second, under realistic stochastic spatial drift, the F_ST and spatial-assortativity rows are themselves driven in the absence of a bounded group (Results, Figure S5). The table frames the possible combinations of factors that may contribute to a signal of bounded group structure. The generative drift-versus-groups comparison provides a practical assessment.</w:t>
       </w:r>
     </w:p>
     <w:tbl>
@@ -1316,7 +1316,7 @@
         <w:t xml:space="preserve"> </w:t>
       </w:r>
       <w:r>
-        <w:t xml:space="preserve">showed that two independently derived, theory-grounded measures of the same ceramic data, within-assemblage diversity and between-assemblage distance, converge on the same inference about past interaction, and we generalize that two-measure agreement to four. This validates the concept. Whether all four signatures, or only some, can actually deliver it on a record like ours is a separate question that we settle by calibrating the test directly to synthetic data matched to the Parkin assemblages. Both procedures are presented with their methods and outcomes. Figure 2 previews what the test distinguishes, the sharp structure a bounded group would leave against the blur that drift produces, and why, on a record of this size and time-averaging, a weak within-basin boundary cannot be excluded.</w:t>
+        <w:t xml:space="preserve">showed that two independently derived, theory-grounded measures of the same ceramic data, within-assemblage diversity and between-assemblage distance, converge on the same inference about past interaction, and we generalize that two-measure agreement to four. This validates the concept. Whether all four signatures, or only some, can actually do so on a record like ours is a separate question that we settle by calibrating the test directly to synthetic data matched to the Parkin assemblages. Both procedures are presented with their methods and outcomes. Figure 2 previews what the test distinguishes, the sharp structure a bounded group would leave against the blur that drift produces, and why, on a record of this size and time-averaging, a weak within-basin boundary cannot be excluded.</w:t>
       </w:r>
     </w:p>
     <w:p>
@@ -1790,7 +1790,7 @@
         <w:t xml:space="preserve">(Mesoudi 2021)</w:t>
       </w:r>
       <w:r>
-        <w:t xml:space="preserve">. Run blind through the four-signature pipeline across twenty random seeds, only a bounded interaction group drives all four signatures together, and the signatures are tightly correlated under closure yet nearly independent under the mimics, so their joint movement is informative rather than an artifact of redundancy (Supplemental Text, Figure S4). That test uses large, clean assemblages, and it shows what the test can do in principle, not what it can do on a record like ours.</w:t>
+        <w:t xml:space="preserve">. Run blind through the four-signature procedure across twenty random seeds, only a bounded interaction group drives all four signatures together, and the signatures are tightly correlated under closure yet nearly independent under the mimics, so their joint movement is informative rather than an artifact of redundancy (Supplemental Text, Figure S4). That test uses large, clean assemblages, and it shows what the test can do in principle, not what it can do on a record like ours.</w:t>
       </w:r>
     </w:p>
     <w:p>
@@ -1807,7 +1807,7 @@
         <w:t xml:space="preserve">(Madsen 2012; Miller-Atkins and Premo 2018; Premo 2014)</w:t>
       </w:r>
       <w:r>
-        <w:t xml:space="preserve">. If chiefdom structure had really been emerging at Parkin, this experiment would tell us whether tools like ours, applied to data like ours, would have caught it. Concretely, we generated synthetic assemblages, one per real assemblage, at the real per-assemblage sample sizes, spatial clusters, and ordinal bins, injected a known group-closure signal of tunable strength s (between-group divergence and within-group conformity rising together along the sequence to a maximum of s), and asked which signatures recover it, a record-matched recovery design in the spirit of simulation-based inference calibrated to the data at hand</w:t>
+        <w:t xml:space="preserve">. If chiefdom structure had really been emerging at Parkin, this experiment would tell us whether methods like ours, applied to data like ours, would have caught it. Concretely, we generated synthetic assemblages, one per real assemblage, at the real per-assemblage sample sizes, spatial clusters, and ordinal bins, injected a known group-closure signal of tunable strength s (between-group divergence and within-group conformity rising together along the sequence to a maximum of s), and asked which signatures recover it, a record-matched recovery design in the spirit of simulation-based inference calibrated to the data at hand</w:t>
       </w:r>
       <w:r>
         <w:t xml:space="preserve"> </w:t>
@@ -1816,7 +1816,7 @@
         <w:t xml:space="preserve">(Crema et al. 2014; Kandler and Shennan 2015)</w:t>
       </w:r>
       <w:r>
-        <w:t xml:space="preserve">. Two properties of the record make this essential rather than optional. Assemblage sample size trends with seriation position (Spearman rho = +0.59), and several signatures are size-sensitive so that a size-dependent estimator can rise or fall along the axis through sampling alone. We therefore subsample every assemblage, synthetic and real, to a common count before scoring, thereby removing the confound. And the record is time-averaged, which we reproduce by blending adjacent-bin production within a window. The recovery experiment then asks, at the resolution and sample sizes this record preserves, which signatures can be trusted and how strong a closure would have to be to register. One feature of the calibration matters here. Because subsampling the larger, later assemblages to a common count slightly inflates within-cluster diversity and so depresses F_ST toward later positions, the no-closure null itself carries a mild negative trend rather than a flat zero. The detector is calibrated against that null distribution, not against zero, so the false-positive rate is held at five percent regardless, and the empirical value is read against the same null.</w:t>
+        <w:t xml:space="preserve">. Two properties of the record make this essential rather than optional. Assemblage sample size trends with seriation position (Spearman rho = +0.59), and several signatures are size-sensitive so that a size-dependent estimator can rise or fall along the axis through sampling alone. We therefore subsample every assemblage, synthetic and real, to a common count before scoring, thereby removing the confound. And the record is time-averaged, which we reproduce by blending adjacent-bin production within a window. The recovery experiment then asks, at the resolution and sample sizes this record preserves, which signatures can be trusted and how strong a closure would have to be to register. One aspect of the calibration matters here. Because subsampling the larger, later assemblages to a common count slightly inflates within-cluster diversity and so depresses F_ST toward later positions, the null with no closure (pure drift) itself carries a mild negative trend rather than a flat zero. The test is calibrated against that null distribution, not against zero, so the false-positive rate is held at five percent regardless, and the empirical value is read against the same null.</w:t>
       </w:r>
     </w:p>
     <w:bookmarkEnd w:id="26"/>
@@ -1934,7 +1934,7 @@
           <wp:inline>
             <wp:extent cx="5334000" cy="2715014"/>
             <wp:effectExtent b="0" l="0" r="0" t="0"/>
-            <wp:docPr descr="Figure 4. Record-matched, size-controlled signal recovery. Left: each signature’s response (Spearman trend versus ordinal position) to a known group-closure signal injected at the real configuration of 29 assemblages and subsampled to a common count. Only cultural F_ST tracks the injected signal monotonically. The neutral departure is non-monotonic in conformity, the spatial boundary is unresponsive at three spatial clusters, and seriation coherence is weak. Right: detection power of the calibrated F_ST detector against injected strength, with and without the record’s time-averaging (false-positive rate 0.05). F_ST reliably recovers a closure of strength s greater than or equal to 0.5 (0.7 time-averaged). The size-controlled empirical F_ST (+0.01) falls below the resolution limit, its bootstrap interval spanning no closure to a moderate signal." title="" id="31" name="Picture"/>
+            <wp:docPr descr="Figure 4. Record-matched, size-controlled signal recovery. Left: each signature’s response (Spearman trend versus ordinal position) to a known group-closure signal injected at the real configuration of 29 assemblages and subsampled to a common count. Only cultural F_ST tracks the injected signal monotonically. The neutral departure is non-monotonic in conformity, the spatial boundary is unresponsive at three spatial clusters, and seriation coherence is weak. Right: detection power of the calibrated F_ST test against injected strength, with and without the record’s time-averaging (false-positive rate 0.05). F_ST reliably recovers a closure of strength s greater than or equal to 0.5 (0.7 time-averaged). The size-controlled empirical F_ST (+0.01) falls below the resolution limit, its bootstrap interval spanning no closure to a moderate signal." title="" id="31" name="Picture"/>
             <a:graphic>
               <a:graphicData uri="http://schemas.openxmlformats.org/drawingml/2006/picture">
                 <pic:pic>
@@ -1987,7 +1987,7 @@
         <w:t xml:space="preserve"> </w:t>
       </w:r>
       <w:r>
-        <w:t xml:space="preserve">Record-matched, size-controlled signal recovery. Left: each signature’s response (Spearman trend versus ordinal position) to a known group-closure signal injected at the real configuration of 29 assemblages and subsampled to a common count. Only cultural F_ST tracks the injected signal monotonically. The neutral departure is non-monotonic in conformity, the spatial boundary is unresponsive at three spatial clusters, and seriation coherence is weak. Right: detection power of the calibrated F_ST detector against injected strength, with and without the record’s time-averaging (false-positive rate 0.05). F_ST reliably recovers a closure of strength s greater than or equal to 0.5 (0.7 time-averaged). The size-controlled empirical F_ST (+0.01) falls below the resolution limit, its bootstrap interval spanning no closure to a moderate signal.</w:t>
+        <w:t xml:space="preserve">Record-matched, size-controlled signal recovery. Left: each signature’s response (Spearman trend versus ordinal position) to a known group-closure signal injected at the real configuration of 29 assemblages and subsampled to a common count. Only cultural F_ST tracks the injected signal monotonically. The neutral departure is non-monotonic in conformity, the spatial boundary is unresponsive at three spatial clusters, and seriation coherence is weak. Right: detection power of the calibrated F_ST test against injected strength, with and without the record’s time-averaging (false-positive rate 0.05). F_ST reliably recovers a closure of strength s greater than or equal to 0.5 (0.7 time-averaged). The size-controlled empirical F_ST (+0.01) falls below the resolution limit, its bootstrap interval spanning no closure to a moderate signal.</w:t>
       </w:r>
     </w:p>
     <w:p>
@@ -2095,7 +2095,7 @@
         <w:t xml:space="preserve">(Neiman 1995)</w:t>
       </w:r>
       <w:r>
-        <w:t xml:space="preserve">. The no-closure verdict is also robust to the analyst’s choices: across twenty-seven combinations of the basin’s spatial cutoff, the number of ordinal bins, and the number of spatial clusters, it appears in none of them, and it holds equally under the watershed and corridor basin definitions. Consistent with the recovery experiment, none of these checks shows a resolvable departure from neutral transmission, and we read them as corroboration of the size-controlled F_ST result rather than as independent signals.</w:t>
+        <w:t xml:space="preserve">. The verdict that no bounded-group closure is detectable also holds across the analyst’s choices: across twenty-seven combinations of the basin’s spatial cutoff, the number of ordinal bins, and the number of spatial clusters, no closure appears in any of them, and it holds equally under the watershed and corridor basin definitions. Consistent with the recovery experiment, none of these checks shows a resolvable departure from neutral transmission, and we read them as corroboration of the size-controlled F_ST result rather than as independent signals.</w:t>
       </w:r>
     </w:p>
     <w:p>
@@ -2452,7 +2452,7 @@
         <w:pStyle w:val="BodyText"/>
       </w:pPr>
       <w:r>
-        <w:t xml:space="preserve">Three limits bound the result, and the recovery experiment forces the most important of them to the front. At this record’s resolution, the discrimination between a bounded group and drift rests on a single signature, cultural F_ST. That signature is confounded by a sample-size trend along the seriation axis (Spearman rho = +0.59). We removed the confound by subsampling every assemblage to a common count, which collapses the raw F_ST trend from +0.60 to +0.01. We calibrated the detector on synthetic data matched to the record, in which F_ST recovers a moderate-strength closure (s of about 0.5, rising to 0.7 once the record’s time-averaging is imposed), while maintaining a false-positive rate of 5%. The size-controlled empirical F_ST is uninformative, its bootstrap interval spanning no closure to a moderate signal. The negative is therefore informative for a closure of moderate or greater strength, which would have registered as a resolved positive, but does not. It cannot exclude a weaker closure that a record of 29 time-averaged assemblages is underpowered to resolve, and we state the claim at that bound rather than beyond it. The other three signatures do not track closure reliably here. The neutral departure is due to its non-monotonicity with respect to conformity and size-sensitivity. The spatial boundary is problematic because there are too few spatial clusters, and seriation coherence is weak, so we report them as corroboration rather than as independent confirmations. This reduction is a property of the record. When a known closure signal is injected instead through a within-group conformity channel or a non-spatially-organized social-fragmentation channel, neither the neutral nor the seriation signature recovers it either, so the three weak signatures fail at this resolution regardless of how closure is delivered (Supplemental Text). The price is that the negative bounds are only closure expressed as between-group divergence. The closure carried purely by conformity, or by social structure not aligned with the spatial clusters, would lie below detection in this record at any strength. The second limit is the ordinal chronology. The basin radiocarbon corpus pools to five seriation anchors across a calibration plateau, so the axis is a relative order oriented toward later time at Spearman +0.70, imperfectly. The discriminating quantity, the size-controlled F_ST trend, is a magnitude that does not depend on the axis orientation, and the settlement and exchange lines do not depend on the ceramic chronology at all. The third limit is time-averaging, which damps between-assemblage variation and reduces apparent turnover</w:t>
+        <w:t xml:space="preserve">Three limits bound the result, and the recovery experiment forces the most important of them to the front. At this record’s resolution, the discrimination between a bounded group and drift rests on a single signature, cultural F_ST. That signature is confounded by a sample-size trend along the seriation axis (Spearman rho = +0.59). We removed the confound by subsampling every assemblage to a common count, which collapses the raw F_ST trend from +0.60 to +0.01. We calibrated the test on synthetic data matched to the record, in which F_ST recovers a moderate-strength closure (s of about 0.5, rising to 0.7 once the record’s time-averaging is imposed), while maintaining a false-positive rate of 5%. The size-controlled empirical F_ST is uninformative, its bootstrap interval spanning no closure to a moderate signal. The negative is therefore informative for a closure of moderate or greater strength, which would have registered as a resolved positive, but does not. It cannot exclude a weaker closure that a record of 29 time-averaged assemblages is underpowered to resolve, and we state the claim at that bound rather than beyond it. The other three signatures do not track closure reliably here. The neutral departure is due to its non-monotonicity with respect to conformity and size-sensitivity. The spatial boundary is problematic because there are too few spatial clusters, and seriation coherence is weak, so we report them as corroboration rather than as independent confirmations. This reduction is a property of the record. When a known closure signal is injected instead through a within-group conformity pathway or a non-spatially-organized social-fragmentation pathway, neither the neutral nor the seriation signature recovers it either, so the three weak signatures fail at this resolution regardless of how closure is produced (Supplemental Text). The price is that the negative bounds are only closure expressed as between-group divergence. The closure carried purely by conformity, or by social structure not aligned with the spatial clusters, would lie below detection in this record at any strength. The second limit is the ordinal chronology. The basin radiocarbon corpus pools to five seriation anchors across a calibration plateau, so the axis is a relative order oriented toward later time at Spearman +0.70, imperfectly. The discriminating quantity, the size-controlled F_ST trend, is a magnitude that does not depend on the axis orientation, and the settlement and exchange lines do not depend on the ceramic chronology at all. The third limit is time-averaging, which damps between-assemblage variation and reduces apparent turnover</w:t>
       </w:r>
       <w:r>
         <w:t xml:space="preserve"> </w:t>
@@ -2713,7 +2713,7 @@
         <w:pStyle w:val="FirstParagraph"/>
       </w:pPr>
       <w:r>
-        <w:t xml:space="preserve">The phase is the unit on which central-valley culture history is built, and it carries a silent claim that assemblages grouped by seriation and spatial proximity record a bounded society. For the Parkin phase, that claim does not survive measurement. Parkin stands apart as the basin’s largest and tallest-mounded center. No line of evidence, settlement, exchange, or ceramic transmission marks it as the apex of a polity, and the within-greater-than-between ceramic similarity that defines the phase is reproduced by neutral drift on the basin’s geography, the ordinary residue of continuous interaction structured by where sites sit. A bounded interaction group would have a sharper structure than the data carry, and Parkin sits across orderings as a transmission bridge rather than at the closed core of one. Extending the test to the wider valley, a decorated-ceramic boundary that exceeds drift appears only between the central-valley and lower-valley blocks, and even there, it is entangled with the early-to-late turnover of the type repertoire. It cannot yet be read as a synchronic social division. The phase, at the scale where it is drawn, is largely indistinguishable from spatially structured drift, which carries a consequence the discipline should weigh: a similarity cluster is not by itself a society, and before a phase is read as a social group, the record must be shown able to tell a real interaction boundary from drift on geography. That calibration, not the phase, licenses a social reading, and, when applied to the central Mississippi Valley, it yields a landscape of continuous interaction with prominent nodes rather than a mosaic of bounded polities.</w:t>
+        <w:t xml:space="preserve">The phase is the unit on which central-valley culture history is built, and it carries a silent claim that assemblages grouped by seriation and spatial proximity record a bounded society. For the Parkin phase, that claim does not survive measurement. Parkin is the basin’s largest and tallest-mounded center. No line of evidence, settlement, exchange, or ceramic transmission marks it as the apex of a polity, and the within-greater-than-between ceramic similarity that defines the phase is reproduced by neutral drift on the basin’s geography, the ordinary residue of continuous interaction structured by where sites sit. A bounded interaction group would have a sharper structure than the data carry, and Parkin sits across orderings as a transmission bridge rather than at the closed core of one. Extending the test to the wider valley, a decorated-ceramic boundary that exceeds drift appears only between the central-valley and lower-valley blocks, and even there, it is entangled with the early-to-late turnover of the type repertoire. It cannot yet be read as a synchronic social division. The phase, at the scale where it is drawn, is largely indistinguishable from spatially structured drift, which carries a consequence the discipline should weigh: a similarity cluster is not by itself a society, and before a phase is read as a social group, the record must be shown able to tell a real interaction boundary from drift on geography. That calibration, not the phase, licenses a social reading, and, when applied to the central Mississippi Valley, it yields a landscape of continuous interaction with prominent nodes rather than a mosaic of bounded polities.</w:t>
       </w:r>
     </w:p>
     <w:bookmarkEnd w:id="50"/>
@@ -2731,7 +2731,7 @@
         <w:pStyle w:val="FirstParagraph"/>
       </w:pPr>
       <w:r>
-        <w:t xml:space="preserve">All data and code needed to reproduce the analyses and figures reported here are openly available at https://github.com/clipo/phases. The repository includes the decorated-ceramic type counts, the georeferencing and radiocarbon data, the complete analysis pipeline, and instructions for reproducing all results and figures. The code is released under the MIT License, and the data under a Creative Commons Attribution 4.0 International license.</w:t>
+        <w:t xml:space="preserve">All data and code needed to reproduce the analyses and figures reported here are openly available at https://github.com/clipo/phases. The repository includes the decorated-ceramic type counts, the georeferencing and radiocarbon data, the complete analysis procedure, and instructions for reproducing all results and figures. The code is released under the MIT License, and the data under a Creative Commons Attribution 4.0 International license.</w:t>
       </w:r>
     </w:p>
     <w:bookmarkEnd w:id="51"/>

</xml_diff>

<commit_message>
Sync manuscript: hand edits; rebuilt docx and PDF
</commit_message>
<xml_diff>
--- a/docs/manuscript/MAIN_TEXT.docx
+++ b/docs/manuscript/MAIN_TEXT.docx
@@ -205,7 +205,7 @@
         <w:pStyle w:val="BodyText"/>
       </w:pPr>
       <w:r>
-        <w:t xml:space="preserve">The premise is rarely tested, and it ignores a strong alternative. Viewed through the lens of social learning and models of cultural transmission, interaction is always continuous but can be highly variable. Interaction is structured by distance and geography, in addition to social and cultural structures, and the job of the analyst is to show how apparent</w:t>
+        <w:t xml:space="preserve">The premise is rarely tested, and it ignores a strong alternative. Viewed through the lens of social learning and models of cultural transmission, interaction is always continuous yet highly variable. Interaction is structured by distance and geography, as well as by social and cultural structures, and the analyst’s job is to show how apparent</w:t>
       </w:r>
       <w:r>
         <w:t xml:space="preserve"> </w:t>
@@ -235,7 +235,7 @@
         <w:t xml:space="preserve">(Lipo et al. 2021)</w:t>
       </w:r>
       <w:r>
-        <w:t xml:space="preserve">. On this account, a phase can simply be the ordinary residue of continuous, distance-structured interaction, and the very pattern the culture-history tradition reads as a society, assemblages near each other in space and in style, is what spatially structured drift predicts. Telling a real interaction group apart from spatially structured drift requires a test that the tradition never applied, because the seriation coherence and spatial proximity that define the phase are equally the products of drift</w:t>
+        <w:t xml:space="preserve">. On this account, a phase can be the ordinary residue of continuous, distance-structured interaction, and the very pattern the culture-history tradition reads as a society, assemblages near each other in space and in style, is what spatially structured drift predicts. Telling a real interaction group apart from spatially structured drift requires a test that the tradition never applied, because the seriation coherence and spatial proximity that define the phase are equally the products of drift</w:t>
       </w:r>
       <w:r>
         <w:t xml:space="preserve"> </w:t>
@@ -701,7 +701,7 @@
         <w:pStyle w:val="BodyText"/>
       </w:pPr>
       <w:r>
-        <w:t xml:space="preserve">The second asks whether the collections all belong to one interacting community or to several, and it is the most direct test of fragmentation. It rests on frequency seriation, the classic archaeological method of ordering assemblages so that each decorated type’s relative frequency rises to a single peak and then falls away, the shape long known as a battleship curve. That single-peaked rise and fall is what a style traces when it is introduced, becomes popular, and is abandoned within one community, drawing on a shared pool of designs. In classical uses of seriation, all available assemblages were typically pooled into a single seriation, and deviations from the frequency guidelines were simply dismissed as sampling error. While sampling error certainly does need to be accounted for, classical practice ignores the fact that</w:t>
+        <w:t xml:space="preserve">The second asks whether the collections all belong to one interacting community or to several, and it is the most direct test of fragmentation. It rests on frequency seriation, the classic archaeological method of ordering assemblages so that each decorated type’s relative frequency rises to a single peak and then falls away, the shape long known as a battleship curve. That single-peaked rise and fall is what a style traces when it is introduced, becomes popular, and is abandoned within one community, drawing on a shared pool of designs. In classical uses of seriation, all available assemblages were typically pooled into a single seriation, and deviations from the frequency guidelines were dismissed as sampling error. While sampling error certainly does need to be accounted for, classical practice ignores the fact that</w:t>
       </w:r>
       <w:r>
         <w:t xml:space="preserve"> </w:t>
@@ -2426,7 +2426,7 @@
         <w:pStyle w:val="BodyText"/>
       </w:pPr>
       <w:r>
-        <w:t xml:space="preserve">This reading must answer the strongest case for the alternative. The most direct argument for an emerging hierarchy holds that Parkin sits on agriculturally poor soil and so must have drawn tribute from the productive villages around it</w:t>
+        <w:t xml:space="preserve">This finding provides the strongest case for the alternative hypothesis. The most direct argument for an emerging hierarchy holds that Parkin sits on agriculturally poor soil and so must have drawn tribute from the productive villages around it</w:t>
       </w:r>
       <w:r>
         <w:t xml:space="preserve"> </w:t>
@@ -2469,7 +2469,7 @@
         <w:pStyle w:val="BodyText"/>
       </w:pPr>
       <w:r>
-        <w:t xml:space="preserve">The contribution has two parts that should be kept distinct. The four signatures distinguish a bounded interaction group from drift in principle, and an idealized simulation confirms that closure drives them together while drift and the other mimics do not (Figure S4). The calibration is the part that travels to real data: it asks, before any similarity structure is read as social, which signatures a given record can support and how strong a closure each could detect, and on the Parkin record, it shows the test reducing to its single most robust component, cultural F_ST. We are explicit about what that costs: had F_ST shown a positive trend, it alone could not have separated a real group from environmental patchiness, which also drives between-group variance (Table 1), so on a positive result, the generative drift-versus-groups comparison, not F_ST alone, would have had to carry the discrimination. The negative is cleaner because the present structure is positively matched by drift and overshot by bounded groups. The transferable claim is therefore the calibration, not a promise that similarity clusters can be read as societies wherever decorated assemblages exist, and it converts a vague question, whether the Parkin phase was a polity, into a specific and answerable one, whether interaction had closed into a bounded group at a strength the record can resolve. For the Parkin phase, the answer is that it had not, within the bounds supported by the record. The polity the De Soto encountered seems to reflect distinctions drawn in ceremonial practices, fortification, and settlement size, rather than one written into the structure of ceramic transmission.</w:t>
+        <w:t xml:space="preserve">The contribution has two parts that should be kept distinct. The four signatures distinguish a bounded interaction group from drift in principle, and an idealized simulation confirms that closure drives them together while drift and the other mimics do not (Figure S4). The calibration is the part that travels to real data: it asks, before any similarity structure is read as social, which signatures a given record can support and how strong a closure each could detect, and on the Parkin record, it shows the test reducing to its single most robust component, cultural F_ST. We are explicit about what that costs: had F_ST shown a positive trend, it alone could not have separated a real group from environmental patchiness, which also drives between-group variance (Table 1), so on a positive result, the generative drift-versus-groups comparison, not F_ST alone, would have had to carry the discrimination. The negative is cleaner because the present structure is positively matched by drift and overshot by bounded groups. From this result, we can demonstrate that it may be possible to measure social structure among deposits with decorated assemblages. We can also assess whether the Parkin phase was a polity by examining whether interaction had closed into a bounded group to a degree that the record can resolve. For the Parkin phase, the answer is that it had not, within the bounds supported by the record. The polity the De Soto encountered seems to reflect distinctions drawn in ceremonial practices, fortification, and settlement size, rather than one written into the structure of ceramic transmission.</w:t>
       </w:r>
     </w:p>
     <w:p>
@@ -2713,7 +2713,7 @@
         <w:pStyle w:val="FirstParagraph"/>
       </w:pPr>
       <w:r>
-        <w:t xml:space="preserve">The phase is the unit on which central-valley culture history is built, and it carries a silent claim that assemblages grouped by seriation and spatial proximity record a bounded society. For the Parkin phase, that claim does not survive measurement. Parkin is the basin’s largest and tallest-mounded center. No line of evidence, settlement, exchange, or ceramic transmission marks it as the apex of a polity, and the within-greater-than-between ceramic similarity that defines the phase is reproduced by neutral drift on the basin’s geography, the ordinary residue of continuous interaction structured by where sites sit. A bounded interaction group would have a sharper structure than the data carry, and Parkin sits across orderings as a transmission bridge rather than at the closed core of one. Extending the test to the wider valley, a decorated-ceramic boundary that exceeds drift appears only between the central-valley and lower-valley blocks, and even there, it is entangled with the early-to-late turnover of the type repertoire. It cannot yet be read as a synchronic social division. The phase, at the scale where it is drawn, is largely indistinguishable from spatially structured drift, which carries a consequence the discipline should weigh: a similarity cluster is not by itself a society, and before a phase is read as a social group, the record must be shown able to tell a real interaction boundary from drift on geography. That calibration, not the phase, licenses a social reading, and, when applied to the central Mississippi Valley, it yields a landscape of continuous interaction with prominent nodes rather than a mosaic of bounded polities.</w:t>
+        <w:t xml:space="preserve">The phase is the unit on which central-valley culture history is built, and it carries a silent claim that assemblages grouped by seriation and spatial proximity record a bounded society. For the Parkin phase, that claim does not survive measurement. Parkin is the basin’s largest and tallest-mounded center. No line of evidence, settlement, exchange, or ceramic transmission marks it as the apex of a polity, and the within-greater-than-between ceramic similarity that defines the phase is reproduced by neutral drift on the basin’s geography, the ordinary residue of continuous interaction structured by where sites sit. A bounded interaction group would have a sharper structure than the measurements indicate, and Parkin sits across orderings as a transmission bridge rather than at the closed core of one. Extending the test to the wider valley, a decorated-ceramic boundary that exceeds drift appears only between the central-valley and lower-valley blocks, and even there, it is entangled with the early-to-late turnover of the type repertoire. It cannot yet be read as a synchronic social division. The phase, at the scale where it is drawn, is largely indistinguishable from spatially structured drift, which carries a consequence the discipline should weigh: a similarity cluster is not by itself a society, and before a phase is read as a social group, the record must be shown able to tell a real interaction boundary from drift on geography. That calibration, not the phase, provides the basis for an explanation of social structure. When applied to the late pre-contact ceramics of the Mississippi Valley, it yields a landscape of continuous interaction with prominent nodes rather than a mosaic of bounded polities.</w:t>
       </w:r>
     </w:p>
     <w:bookmarkEnd w:id="50"/>

</xml_diff>

<commit_message>
Sync manuscript: plain phrasing for 'within-greater-than-between'; rebuilt
</commit_message>
<xml_diff>
--- a/docs/manuscript/MAIN_TEXT.docx
+++ b/docs/manuscript/MAIN_TEXT.docx
@@ -49,7 +49,7 @@
         <w:pStyle w:val="FirstParagraph"/>
       </w:pPr>
       <w:r>
-        <w:t xml:space="preserve">The phase is the foundational unit of Mississippian culture history, and it rests on a silent premise: that assemblages more similar to one another than to their neighbors record a bounded social group, a society whose members interacted preferentially among themselves. That premise is rarely tested, and it ignores a strong alternative. Neutral cultural transmission, in which potters copy one another’s decorated styles with no one favoring particular designs, produces the same within-greater-than-between similarity with no bounded groups at all. Stylistic trait frequencies drift, changing at random from copying alone. When potters interact more with near neighbors than with distant ones, the drift concentrates similar styles in nearby areas, generating apparent clusters based on geography rather than social boundaries. Here, we test, for the late pre-contact central Mississippi Valley, whether decorated-ceramic similarity records bounded interaction groups or spatially structured drift. We compare two generative processes, neutral spatial drift and bounded groups, on the real geography of the assemblages. We calibrate the comparison to the record’s small sample sizes and its time-averaging, the blending of many years of pottery into one surface collection, by a signal-recovery experiment: into synthetic assemblages matched to the real ones, we inject a known group boundary of tunable strength and read off how strong a boundary would have to be before the measures could detect it. We read the result against four transmission signatures and an independent radiocarbon chronology. Within regions, in both the St. Francis basin Parkin phase and the southeast-Missouri survey assemblages of Williams, the decorated-ceramic structure is reproduced by neutral spatial drift under plausible parameters and does not require bounded groups. A bounded-groups process would have marked the record with far sharper structure than it shows. The within-region phase is therefore not demonstrably a bounded interaction group. Parkin, the basin’s tallest-mounded center, is a transmission bridge across orderings rather than the closed core of a society, the same conclusion Fox reached for the southeast Missouri phases using cluster analysis. A boundary that exceeds neutral drift appears only at the larger scale, between the central-valley and lower-valley blocks, where decorated similarity drops more sharply than drift can produce and survives when only shared types are compared. That drop is hard to interpret. It coincides with the early-to-late turnover in pottery types and with the two regions having been collected and classified by different investigators, so it cannot yet be read as a real social boundary rather than a difference in dating or analytical history. The phase, at the scale where it is drawn, is largely indistinguishable from spatially structured drift, and the calibration that licenses this conclusion is the transferable method. Before the similarity structure in ceramic decoration is read as social, the record must be shown to be distinguishable from groups at all.</w:t>
+        <w:t xml:space="preserve">The phase is the foundational unit of Mississippian culture history, and it rests on a silent premise: that assemblages more similar to one another than to their neighbors record a bounded social group, a society whose members interacted preferentially among themselves. That premise is rarely tested, and it ignores a strong alternative. Neutral cultural transmission, in which potters copy one another’s decorated styles with no one favoring particular designs, produces the same pattern with no bounded groups at all. Stylistic trait frequencies drift, changing at random from copying alone. When potters interact more with near neighbors than with distant ones, the drift concentrates similar styles in nearby areas, generating apparent clusters based on geography rather than social boundaries. Here, we test, for the late pre-contact central Mississippi Valley, whether decorated-ceramic similarity records bounded interaction groups or spatially structured drift. We compare two generative processes, neutral spatial drift and bounded groups, on the real geography of the assemblages. We calibrate the comparison to the record’s small sample sizes and its time-averaging, the blending of many years of pottery into one surface collection, by a signal-recovery experiment: into synthetic assemblages matched to the real ones, we inject a known group boundary of tunable strength and read off how strong a boundary would have to be before the measures could detect it. We read the result against four transmission signatures and an independent radiocarbon chronology. Within regions, in both the St. Francis basin Parkin phase and the southeast-Missouri survey assemblages of Williams, the decorated-ceramic structure is reproduced by neutral spatial drift under plausible parameters and does not require bounded groups. A bounded-groups process would have marked the record with far sharper structure than it shows. The within-region phase is therefore not demonstrably a bounded interaction group. Parkin, the basin’s tallest-mounded center, is a transmission bridge across orderings rather than the closed core of a society, the same conclusion Fox reached for the southeast Missouri phases using cluster analysis. A boundary that exceeds neutral drift appears only at the larger scale, between the central-valley and lower-valley blocks, where decorated similarity drops more sharply than drift can produce and survives when only shared types are compared. That drop is hard to interpret. It coincides with the early-to-late turnover in pottery types and with the two regions having been collected and classified by different investigators, so it cannot yet be read as a real social boundary rather than a difference in dating or analytical history. The phase, at the scale where it is drawn, is largely indistinguishable from spatially structured drift, and the calibration that licenses this conclusion is the transferable method. Before the similarity structure in ceramic decoration is read as social, the record must be shown to be distinguishable from groups at all.</w:t>
       </w:r>
     </w:p>
     <w:bookmarkEnd w:id="9"/>
@@ -226,7 +226,7 @@
         <w:t xml:space="preserve">(Bentley et al. 2004; Eerkens and Lipo 2007; Fogarty et al. 2024; Neiman 1995)</w:t>
       </w:r>
       <w:r>
-        <w:t xml:space="preserve">. When those learners interact more with near neighbors than with distant ones, drift on the spatially structured population generates within-greater-than-between similarity on its own, apparent clusters produced by geography with no bounded group anywhere</w:t>
+        <w:t xml:space="preserve">. When those learners interact more with near neighbors than with distant ones, drift on the spatially structured population generates similarity that is highest at short distances and decays at longer ones, which creates the appearance of difference and clustering when the record is viewed at larger scales and through a discrete lens, without requiring bounded groups anywhere</w:t>
       </w:r>
       <w:r>
         <w:t xml:space="preserve"> </w:t>
@@ -440,7 +440,7 @@
         <w:pStyle w:val="FirstParagraph"/>
       </w:pPr>
       <w:r>
-        <w:t xml:space="preserve">We take a materialist approach to cultural transmission, which frames the question differently from how the central-valley record is usually read. Archaeologists are trained to think with bounded units, the phase, the polity, the society, discrete entities with members and edges, and to read a cluster of similar assemblages as one of them. We treat transmission instead as a continuous and variable field of copying events among potters, a field with no intrinsic edges, in which interaction falls off with distance and learning can be more local in some places and times than in others. On this view, a group is not a thing with a boundary but a region where transmission has thickened, and similarity is a matter of degree set by how copying is distributed across space. That field can also close off by degree, interaction narrowing until potters copy mostly within a subset and rarely outside it, producing something that looks like the bounded groups archaeologists think with. The difficulty for the phase is that ordinary interaction already yields within-greater-than-between similarity through distance alone, so clusters by themselves prove nothing. What would mark a real bounded group is closure beyond what distance predicts, and that excess is the signal we test for.</w:t>
+        <w:t xml:space="preserve">We take a materialist approach to cultural transmission, which frames the question differently from how the central-valley record is usually read. Archaeologists are trained to think with bounded units, the phase, the polity, the society, discrete entities with members and edges, and to read a cluster of similar assemblages as one of them. We treat transmission instead as a continuous and variable field of copying events among potters, a field with no intrinsic edges, in which interaction falls off with distance and learning can be more local in some places and times than in others. On this view, a group is not a thing with a boundary but a region where transmission has thickened, and similarity is a matter of degree set by how copying is distributed across space. That field can also close off by degree, interaction narrowing until potters copy mostly within a subset and rarely outside it, producing something that looks like the bounded groups archaeologists think with. The difficulty for the phase is that ordinary interaction already makes nearby assemblages more alike than distant ones through distance alone, so clusters by themselves prove nothing. What would mark a real bounded group is closure beyond what distance predicts, and that excess is the signal we test for.</w:t>
       </w:r>
     </w:p>
     <w:p>
@@ -448,7 +448,7 @@
         <w:pStyle w:val="BodyText"/>
       </w:pPr>
       <w:r>
-        <w:t xml:space="preserve">The phase concept gives the central-valley record its social structure. A phase is formed operationally, as a set of assemblages that seriate together and cluster in space, but it is interpreted socially, as a bounded interacting community, on the premise that within-greater-than-between similarity records who interacted with whom</w:t>
+        <w:t xml:space="preserve">The phase concept gives the central-valley record its social structure. A phase is formed operationally, as a set of assemblages that seriate together and cluster in space, but it is interpreted socially, as a bounded interacting community, on the premise that assemblages more alike within a phase than across its edges record who interacted with whom</w:t>
       </w:r>
       <w:r>
         <w:t xml:space="preserve"> </w:t>
@@ -457,7 +457,7 @@
         <w:t xml:space="preserve">(McNutt 1996; Morse and Morse 1983; Phillips et al. 1951; Williams 1954)</w:t>
       </w:r>
       <w:r>
-        <w:t xml:space="preserve">. The premise is not arbitrary. Under the neutral transmission model, it would hold if learning were confined within social boundaries, so that decoration drifted in separate pools and diverged between them. The difficulty is that the same within-greater-than-between similarity arises with no boundary at all when interaction declines with distance, because spatially structured drift concentrates similarity among near neighbors, the isolation-by-distance expectation for cultural similarity</w:t>
+        <w:t xml:space="preserve">. The premise is not arbitrary. Under the neutral transmission model, it would hold if learning were confined within social boundaries, so that decoration drifted in separate pools and diverged between them. The difficulty is that the same pattern arises with no boundary at all when interaction declines with distance, because spatially structured drift concentrates similarity among near neighbors, the isolation-by-distance expectation for cultural similarity</w:t>
       </w:r>
       <w:r>
         <w:t xml:space="preserve"> </w:t>
@@ -2397,7 +2397,7 @@
         <w:t xml:space="preserve">(Henrich 2004; Powell et al. 2009)</w:t>
       </w:r>
       <w:r>
-        <w:t xml:space="preserve">. What the record shows is that the within-greater-than-between similarity the phase is built on is what spatially structured drift produces, so the phase, at the scale at which it is drawn, marks continuous interaction structured by geography rather than by a bounded society. Parkin’s ceremonial and demographic prominence was real. The polity that prominence is taken to imply is not in the transmission record. The decoupling has an independent precedent in the region’s own ethnohistory. The best-documented Mississippian paramountcy, the sixteenth-century province of Coosa, spanned two ceramic traditions and site clusters that were separable at the phase level, so what bound them together was political affiliation rather than shared decorated style</w:t>
+        <w:t xml:space="preserve">. The phase is built on a single observation: assemblages resemble their near neighbors more than their distant ones. That pattern is exactly what spatially structured drift produces on its own. At the scale at which the phase is drawn, it therefore marks continuous interaction shaped by geography rather than a bounded society. Parkin’s ceremonial and demographic prominence was real. The polity that prominence is taken to imply is not in the transmission record. The decoupling has an independent precedent in the region’s own ethnohistory. The best-documented Mississippian paramountcy, the sixteenth-century province of Coosa, spanned two ceramic traditions and site clusters that were separable at the phase level, so what bound them together was political affiliation rather than shared decorated style</w:t>
       </w:r>
       <w:r>
         <w:t xml:space="preserve"> </w:t>
@@ -2713,7 +2713,7 @@
         <w:pStyle w:val="FirstParagraph"/>
       </w:pPr>
       <w:r>
-        <w:t xml:space="preserve">The phase is the unit on which central-valley culture history is built, and it carries a silent claim that assemblages grouped by seriation and spatial proximity record a bounded society. For the Parkin phase, that claim does not survive measurement. Parkin is the basin’s largest and tallest-mounded center. No line of evidence, settlement, exchange, or ceramic transmission marks it as the apex of a polity, and the within-greater-than-between ceramic similarity that defines the phase is reproduced by neutral drift on the basin’s geography, the ordinary residue of continuous interaction structured by where sites sit. A bounded interaction group would have a sharper structure than the measurements indicate, and Parkin sits across orderings as a transmission bridge rather than at the closed core of one. Extending the test to the wider valley, a decorated-ceramic boundary that exceeds drift appears only between the central-valley and lower-valley blocks, and even there, it is entangled with the early-to-late turnover of the type repertoire. It cannot yet be read as a synchronic social division. The phase, at the scale where it is drawn, is largely indistinguishable from spatially structured drift, which carries a consequence the discipline should weigh: a similarity cluster is not by itself a society, and before a phase is read as a social group, the record must be shown able to tell a real interaction boundary from drift on geography. That calibration, not the phase, provides the basis for an explanation of social structure. When applied to the late pre-contact ceramics of the Mississippi Valley, it yields a landscape of continuous interaction with prominent nodes rather than a mosaic of bounded polities.</w:t>
+        <w:t xml:space="preserve">The phase is the unit on which central-valley culture history is built, and it carries a silent claim that assemblages grouped by seriation and spatial proximity record a bounded society. For the Parkin phase, that claim does not survive measurement. Parkin is the basin’s largest and tallest-mounded center. No line of evidence, settlement, exchange, or ceramic transmission marks it as the apex of a polity, and the greater similarity among nearby assemblages that defines the phase is reproduced by neutral drift on the basin’s geography, the ordinary residue of continuous interaction structured by where sites sit. A bounded interaction group would have a sharper structure than the measurements indicate, and Parkin sits across orderings as a transmission bridge rather than at the closed core of one. Extending the test to the wider valley, a decorated-ceramic boundary that exceeds drift appears only between the central-valley and lower-valley blocks, and even there, it is entangled with the early-to-late turnover of the type repertoire. It cannot yet be read as a synchronic social division. The phase, at the scale where it is drawn, is largely indistinguishable from spatially structured drift, which carries a consequence the discipline should weigh: a similarity cluster is not by itself a society, and before a phase is read as a social group, the record must be shown able to tell a real interaction boundary from drift on geography. That calibration, not the phase, provides the basis for an explanation of social structure. When applied to the late pre-contact ceramics of the Mississippi Valley, it yields a landscape of continuous interaction with prominent nodes rather than a mosaic of bounded polities.</w:t>
       </w:r>
     </w:p>
     <w:bookmarkEnd w:id="50"/>

</xml_diff>

<commit_message>
Sync manuscript: 150-word abstract, Spanish Resumen, bilingual keywords
</commit_message>
<xml_diff>
--- a/docs/manuscript/MAIN_TEXT.docx
+++ b/docs/manuscript/MAIN_TEXT.docx
@@ -2,7 +2,7 @@
 <file path=word/document.xml><?xml version="1.0" encoding="utf-8"?>
 <w:document xmlns:w="http://schemas.openxmlformats.org/wordprocessingml/2006/main" xmlns:m="http://schemas.openxmlformats.org/officeDocument/2006/math" xmlns:r="http://schemas.openxmlformats.org/officeDocument/2006/relationships" xmlns:o="urn:schemas-microsoft-com:office:office" xmlns:v="urn:schemas-microsoft-com:vml" xmlns:w10="urn:schemas-microsoft-com:office:word" xmlns:a="http://schemas.openxmlformats.org/drawingml/2006/main" xmlns:pic="http://schemas.openxmlformats.org/drawingml/2006/picture" xmlns:wp="http://schemas.openxmlformats.org/drawingml/2006/wordprocessingDrawing">
   <w:body>
-    <w:bookmarkStart w:id="212" w:name="X093902eb68652ea32f5548e74607f4e4b0f6699"/>
+    <w:bookmarkStart w:id="213" w:name="X093902eb68652ea32f5548e74607f4e4b0f6699"/>
     <w:p>
       <w:pPr>
         <w:pStyle w:val="Heading1"/>
@@ -49,11 +49,65 @@
         <w:pStyle w:val="FirstParagraph"/>
       </w:pPr>
       <w:r>
-        <w:t xml:space="preserve">The phase is the foundational unit of Mississippian culture history, and it rests on a silent premise: that assemblages more similar to one another than to their neighbors record a bounded social group, a society whose members interacted preferentially among themselves. That premise is rarely tested, and it ignores a strong alternative. Neutral cultural transmission, in which potters copy one another’s decorated styles with no one favoring particular designs, produces the same pattern with no bounded groups at all. Stylistic trait frequencies drift, changing at random from copying alone. When potters interact more with near neighbors than with distant ones, the drift concentrates similar styles in nearby areas, generating apparent clusters based on geography rather than social boundaries. Here, we test, for the late pre-contact central Mississippi Valley, whether decorated-ceramic similarity records bounded interaction groups or spatially structured drift. We compare two generative processes, neutral spatial drift and bounded groups, on the real geography of the assemblages. We calibrate the comparison to the record’s small sample sizes and its time-averaging, the blending of many years of pottery into one surface collection, by a signal-recovery experiment: into synthetic assemblages matched to the real ones, we inject a known group boundary of tunable strength and read off how strong a boundary would have to be before the measures could detect it. We read the result against four transmission signatures and an independent radiocarbon chronology. Within regions, in both the St. Francis basin Parkin phase and the southeast-Missouri survey assemblages of Williams, the decorated-ceramic structure is reproduced by neutral spatial drift under plausible parameters and does not require bounded groups. A bounded-groups process would have marked the record with far sharper structure than it shows. The within-region phase is therefore not demonstrably a bounded interaction group. Parkin, the basin’s tallest-mounded center, is a transmission bridge across orderings rather than the closed core of a society, the same conclusion Fox reached for the southeast Missouri phases using cluster analysis. A boundary that exceeds neutral drift appears only at the larger scale, between the central-valley and lower-valley blocks, where decorated similarity drops more sharply than drift can produce and survives when only shared types are compared. That drop is hard to interpret. It coincides with the early-to-late turnover in pottery types and with the two regions having been collected and classified by different investigators, so it cannot yet be read as a real social boundary rather than a difference in dating or analytical history. The phase, at the scale where it is drawn, is largely indistinguishable from spatially structured drift, and the calibration that licenses this conclusion is the transferable method. Before the similarity structure in ceramic decoration is read as social, the record must be shown to be distinguishable from groups at all.</w:t>
+        <w:t xml:space="preserve">The phase, Mississippian archaeology’s foundational unit, rests on a silent premise: that assemblages more similar to nearby than to distant neighbors record a bounded society. This is rarely tested, yet neutral transmission produces the same clustering with no bounded groups: drift concentrates similar styles nearby. For the late pre-contact central Mississippi Valley, we test whether decorated-ceramic similarity records bounded interaction groups or spatially structured drift. We compare drift and bounded-groups processes on the real geography, calibrated to the record’s small samples and time-averaging by a signal-recovery experiment. In both the St. Francis basin Parkin phase and the southeast-Missouri assemblages, drift reproduces the structure without bounded groups, and Parkin is a transmission bridge, not a capital. A sharper boundary appears only between the central and lower valleys, confounded with chronological turnover and analytical history. Before similarity is read as social, a record must be shown able to distinguish groups from drift.</w:t>
+      </w:r>
+    </w:p>
+    <w:p>
+      <w:pPr>
+        <w:pStyle w:val="BodyText"/>
+      </w:pPr>
+      <w:r>
+        <w:rPr>
+          <w:b/>
+          <w:bCs/>
+        </w:rPr>
+        <w:t xml:space="preserve">Keywords:</w:t>
+      </w:r>
+      <w:r>
+        <w:t xml:space="preserve"> </w:t>
+      </w:r>
+      <w:r>
+        <w:t xml:space="preserve">cultural transmission, neutral models, frequency seriation, isolation by distance, Mississippian archaeology, Parkin phase</w:t>
       </w:r>
     </w:p>
     <w:bookmarkEnd w:id="9"/>
-    <w:bookmarkStart w:id="13" w:name="introduction"/>
+    <w:bookmarkStart w:id="10" w:name="resumen"/>
+    <w:p>
+      <w:pPr>
+        <w:pStyle w:val="Heading2"/>
+      </w:pPr>
+      <w:r>
+        <w:t xml:space="preserve">Resumen</w:t>
+      </w:r>
+    </w:p>
+    <w:p>
+      <w:pPr>
+        <w:pStyle w:val="FirstParagraph"/>
+      </w:pPr>
+      <w:r>
+        <w:t xml:space="preserve">La fase, unidad fundamental de la arqueología misisipiana, descansa sobre una premisa tácita: que los conjuntos más similares a sus vecinos cercanos que a los distantes registran una sociedad delimitada. Esto rara vez se pone a prueba, aunque la transmisión cultural neutral produce el mismo agrupamiento sin grupos delimitados: la deriva concentra estilos similares en áreas cercanas. Para el valle central del Misisipi de finales del período precontacto, evaluamos si la similitud de la cerámica decorada registra grupos de interacción delimitados o deriva estructurada espacialmente. Comparamos dos procesos generativos, deriva y grupos delimitados, sobre la geografía real de los conjuntos, calibrando la comparación a los tamaños de muestra pequeños y al promediado temporal del registro mediante un experimento de recuperación de señal. Tanto en la fase Parkin de la cuenca del St. Francis como en los conjuntos del sureste de Misuri, la estructura se reproduce mediante deriva y no requiere grupos delimitados, y Parkin es un puente de transmisión más que una capital. Una frontera más marcada aparece solo entre el valle central y el valle inferior, confundida con el recambio cronológico y la historia analítica. Antes de interpretar la similitud como social, debe demostrarse que un registro puede distinguir los grupos de la deriva.</w:t>
+      </w:r>
+    </w:p>
+    <w:p>
+      <w:pPr>
+        <w:pStyle w:val="BodyText"/>
+      </w:pPr>
+      <w:r>
+        <w:rPr>
+          <w:b/>
+          <w:bCs/>
+        </w:rPr>
+        <w:t xml:space="preserve">Palabras clave:</w:t>
+      </w:r>
+      <w:r>
+        <w:t xml:space="preserve"> </w:t>
+      </w:r>
+      <w:r>
+        <w:t xml:space="preserve">transmisión cultural, modelos neutrales, seriación de frecuencias, aislamiento por distancia, arqueología misisipiana, fase Parkin</w:t>
+      </w:r>
+    </w:p>
+    <w:bookmarkEnd w:id="10"/>
+    <w:bookmarkStart w:id="14" w:name="introduction"/>
     <w:p>
       <w:pPr>
         <w:pStyle w:val="Heading2"/>
@@ -335,18 +389,18 @@
           <wp:inline>
             <wp:extent cx="5334000" cy="7630817"/>
             <wp:effectExtent b="0" l="0" r="0" t="0"/>
-            <wp:docPr descr="Figure 1. Study area: the St. Francis basin of the central Mississippi Valley, northeastern Arkansas. Decorated-ceramic assemblages and recorded sites are shown on a local hydrology and geomorphology base (the St. Francis, Tyronza, and Mississippi rivers). Symbol size scales with platform-mound height. The Parkin site is marked with a star, and the dashed outline indicates the approximate Parkin-phase area. The transmission analysis is restricted to assemblages within 20 km of the St. Francis drainage (the lower Yazoo Basin and Mississippi River-proximal sites are excluded). Inset: location within North America." title="" id="11" name="Picture"/>
+            <wp:docPr descr="Figure 1. Study area: the St. Francis basin of the central Mississippi Valley, northeastern Arkansas. Decorated-ceramic assemblages and recorded sites are shown on a local hydrology and geomorphology base (the St. Francis, Tyronza, and Mississippi rivers). Symbol size scales with platform-mound height. The Parkin site is marked with a star, and the dashed outline indicates the approximate Parkin-phase area. The transmission analysis is restricted to assemblages within 20 km of the St. Francis drainage (the lower Yazoo Basin and Mississippi River-proximal sites are excluded). Inset: location within North America." title="" id="12" name="Picture"/>
             <a:graphic>
               <a:graphicData uri="http://schemas.openxmlformats.org/drawingml/2006/picture">
                 <pic:pic>
                   <pic:nvPicPr>
-                    <pic:cNvPr descr="../../figures/fig1_studyarea.png" id="12" name="Picture"/>
+                    <pic:cNvPr descr="../../figures/fig1_studyarea.png" id="13" name="Picture"/>
                     <pic:cNvPicPr>
                       <a:picLocks noChangeArrowheads="1" noChangeAspect="1"/>
                     </pic:cNvPicPr>
                   </pic:nvPicPr>
                   <pic:blipFill>
-                    <a:blip r:embed="rId10"/>
+                    <a:blip r:embed="rId11"/>
                     <a:stretch>
                       <a:fillRect/>
                     </a:stretch>
@@ -416,8 +470,8 @@
         <w:t xml:space="preserve">The argument proceeds in three steps. First, we evaluate Parkin as a hierarchy and find that no line of evidence, settlement, exchange, or transmission supports it. Second, we ask what generates the St. Francis basin phase structure, and show that neutral drift on the basin’s geography reproduces the observed signatures. A bounded-groups process would leave a far sharper structure than the data carry. Hence, the phase is a continuous interaction structured by where sites sit rather than a closed group with a boundary, and Parkin is a transmission bridge across orderings rather than the core of one. Third, we widen the test to the other late-period phases of the valley and ask whether any decorated-ceramic boundary exists. A boundary that exceeds neutral drift appears only between the central-valley and lower-valley blocks, and even there, it is confounded with the early-to-late turnover of the type repertoire. It cannot yet be read as a synchronic social division. At the scale where the phase is drawn, it is largely indistinguishable from spatially structured drift, and Parkin is best read as a prominent node in a continuous interaction field rather than the capital of a polity.</w:t>
       </w:r>
     </w:p>
-    <w:bookmarkEnd w:id="13"/>
-    <w:bookmarkStart w:id="16" w:name="background"/>
+    <w:bookmarkEnd w:id="14"/>
+    <w:bookmarkStart w:id="17" w:name="background"/>
     <w:p>
       <w:pPr>
         <w:pStyle w:val="Heading2"/>
@@ -426,7 +480,7 @@
         <w:t xml:space="preserve">Background</w:t>
       </w:r>
     </w:p>
-    <w:bookmarkStart w:id="14" w:name="X79aed77a76c40496e6a63c7e5ba45a72c9f3f05"/>
+    <w:bookmarkStart w:id="15" w:name="X79aed77a76c40496e6a63c7e5ba45a72c9f3f05"/>
     <w:p>
       <w:pPr>
         <w:pStyle w:val="Heading3"/>
@@ -469,8 +523,8 @@
         <w:t xml:space="preserve">. The question the ceramic record must answer is the operational one: does the similarity structure record bounded interaction, or spatially structured drift? Throughout, we call decoration that is transmitted preferentially within a group and diverges between groups a marker, rather than a neutral style drifting in a single shared pool. A marker is the ceramic expression, the empirical proxy, of interaction closing into a bounded group, so the drift-versus-groups question is equivalently a question of neutral style versus marker.</w:t>
       </w:r>
     </w:p>
-    <w:bookmarkEnd w:id="14"/>
-    <w:bookmarkStart w:id="15" w:name="X39f6bf2aa5dd39e0d3c765e883d98cb3f81c485"/>
+    <w:bookmarkEnd w:id="15"/>
+    <w:bookmarkStart w:id="16" w:name="X39f6bf2aa5dd39e0d3c765e883d98cb3f81c485"/>
     <w:p>
       <w:pPr>
         <w:pStyle w:val="Heading3"/>
@@ -647,9 +701,9 @@
         <w:t xml:space="preserve">. The two cannot be separated by settlement morphology alone. They can be separated by determining whether the transmission record shows interaction closing into bounded groups, which is the test we now construct.</w:t>
       </w:r>
     </w:p>
-    <w:bookmarkEnd w:id="15"/>
     <w:bookmarkEnd w:id="16"/>
-    <w:bookmarkStart w:id="20" w:name="Xe1cc53abb112c2b395e3beee2af5ceb0aad4bed"/>
+    <w:bookmarkEnd w:id="17"/>
+    <w:bookmarkStart w:id="21" w:name="Xe1cc53abb112c2b395e3beee2af5ceb0aad4bed"/>
     <w:p>
       <w:pPr>
         <w:pStyle w:val="Heading2"/>
@@ -1328,18 +1382,18 @@
           <wp:inline>
             <wp:extent cx="5334000" cy="4310883"/>
             <wp:effectExtent b="0" l="0" r="0" t="0"/>
-            <wp:docPr descr="Figure 2. What the test distinguishes, and why the within-basin determination is hard, from synthetic assemblages matched to the record. Top: the basin assemblages in a multidimensional scaling of decorated dissimilarity (points colored by the k=2 spatial split) as they would appear if the Parkin phase were a bounded interaction group (left, sharp clusters), under spatially structured neutral drift (center, a continuous blur), and as observed (right, a blur resembling drift). Bottom: the cultural F_ST signal recovered from synthetic assemblages as the strength of injected group closure rises from 0 (drift) to 1 (strong groups), with the s=0 null band shaded behind it. The signal clears the detection threshold only at s* = 0.5. The observed value (dashed line) lies in the shaded region below s*, where a weak group and pure drift are indistinguishable at this record’s size and time-averaging. This is why a weak within-basin boundary cannot be excluded." title="" id="18" name="Picture"/>
+            <wp:docPr descr="Figure 2. What the test distinguishes, and why the within-basin determination is hard, from synthetic assemblages matched to the record. Top: the basin assemblages in a multidimensional scaling of decorated dissimilarity (points colored by the k=2 spatial split) as they would appear if the Parkin phase were a bounded interaction group (left, sharp clusters), under spatially structured neutral drift (center, a continuous blur), and as observed (right, a blur resembling drift). Bottom: the cultural F_ST signal recovered from synthetic assemblages as the strength of injected group closure rises from 0 (drift) to 1 (strong groups), with the s=0 null band shaded behind it. The signal clears the detection threshold only at s* = 0.5. The observed value (dashed line) lies in the shaded region below s*, where a weak group and pure drift are indistinguishable at this record’s size and time-averaging. This is why a weak within-basin boundary cannot be excluded." title="" id="19" name="Picture"/>
             <a:graphic>
               <a:graphicData uri="http://schemas.openxmlformats.org/drawingml/2006/picture">
                 <pic:pic>
                   <pic:nvPicPr>
-                    <pic:cNvPr descr="../../figures/fig2_concept.png" id="19" name="Picture"/>
+                    <pic:cNvPr descr="../../figures/fig2_concept.png" id="20" name="Picture"/>
                     <pic:cNvPicPr>
                       <a:picLocks noChangeArrowheads="1" noChangeAspect="1"/>
                     </pic:cNvPicPr>
                   </pic:nvPicPr>
                   <pic:blipFill>
-                    <a:blip r:embed="rId17"/>
+                    <a:blip r:embed="rId18"/>
                     <a:stretch>
                       <a:fillRect/>
                     </a:stretch>
@@ -1434,8 +1488,8 @@
         <w:t xml:space="preserve">. Our four signatures are theoretically grounded by construction, each of which is entailed by the transmission model. Empirical sufficiency, whether a signature can actually register a signal at the resolution the deposit preserves, is not guaranteed by that grounding, so we test it rather than assume it. The recovery experiment finds only between-group variance empirically sufficient at this record’s resolution. Measured as states along the sequence, the signatures are only partially dynamically sufficient, a gap we close in the discussion with tests that model the transformation between states.</w:t>
       </w:r>
     </w:p>
-    <w:bookmarkEnd w:id="20"/>
-    <w:bookmarkStart w:id="29" w:name="materials-and-methods"/>
+    <w:bookmarkEnd w:id="21"/>
+    <w:bookmarkStart w:id="30" w:name="materials-and-methods"/>
     <w:p>
       <w:pPr>
         <w:pStyle w:val="Heading2"/>
@@ -1444,7 +1498,7 @@
         <w:t xml:space="preserve">Materials and methods</w:t>
       </w:r>
     </w:p>
-    <w:bookmarkStart w:id="24" w:name="data"/>
+    <w:bookmarkStart w:id="25" w:name="data"/>
     <w:p>
       <w:pPr>
         <w:pStyle w:val="Heading3"/>
@@ -1583,18 +1637,18 @@
           <wp:inline>
             <wp:extent cx="5334000" cy="3629969"/>
             <wp:effectExtent b="0" l="0" r="0" t="0"/>
-            <wp:docPr descr="Figure 3. Correspondence-analysis seriation of the 29 basin decorated assemblages, plotted on the first two CA dimensions of the decorated-type frequencies and colored by CA1 rank (the relative chronological ordinate, oriented by the five available radiocarbon dates so that higher rank is later). Parkin is starred. The assemblages form a gradational continuum rather than discrete clusters, echoing the independent NMDS result of Mainfort (2003)." title="" id="22" name="Picture"/>
+            <wp:docPr descr="Figure 3. Correspondence-analysis seriation of the 29 basin decorated assemblages, plotted on the first two CA dimensions of the decorated-type frequencies and colored by CA1 rank (the relative chronological ordinate, oriented by the five available radiocarbon dates so that higher rank is later). Parkin is starred. The assemblages form a gradational continuum rather than discrete clusters, echoing the independent NMDS result of Mainfort (2003)." title="" id="23" name="Picture"/>
             <a:graphic>
               <a:graphicData uri="http://schemas.openxmlformats.org/drawingml/2006/picture">
                 <pic:pic>
                   <pic:nvPicPr>
-                    <pic:cNvPr descr="../../figures/fig3_ca_ordination.png" id="23" name="Picture"/>
+                    <pic:cNvPr descr="../../figures/fig3_ca_ordination.png" id="24" name="Picture"/>
                     <pic:cNvPicPr>
                       <a:picLocks noChangeArrowheads="1" noChangeAspect="1"/>
                     </pic:cNvPicPr>
                   </pic:nvPicPr>
                   <pic:blipFill>
-                    <a:blip r:embed="rId21"/>
+                    <a:blip r:embed="rId22"/>
                     <a:stretch>
                       <a:fillRect/>
                     </a:stretch>
@@ -1639,8 +1693,8 @@
         <w:t xml:space="preserve">Correspondence-analysis seriation of the 29 basin decorated assemblages, plotted on the first two CA dimensions of the decorated-type frequencies and colored by CA1 rank (the relative chronological ordinate, oriented by the five available radiocarbon dates so that higher rank is later). Parkin is starred. The assemblages form a gradational continuum rather than discrete clusters, echoing the independent NMDS result of Mainfort (2003).</w:t>
       </w:r>
     </w:p>
-    <w:bookmarkEnd w:id="24"/>
-    <w:bookmarkStart w:id="25" w:name="the-four-signatures"/>
+    <w:bookmarkEnd w:id="25"/>
+    <w:bookmarkStart w:id="26" w:name="the-four-signatures"/>
     <w:p>
       <w:pPr>
         <w:pStyle w:val="Heading3"/>
@@ -1757,8 +1811,8 @@
         <w:t xml:space="preserve">before scoring each signature as its rank correlation with ordinal position. And which signatures can be trusted at the record’s resolution is not assumed but established by the recovery experiment described next, in which a known closure signal is injected into the real configuration.</w:t>
       </w:r>
     </w:p>
-    <w:bookmarkEnd w:id="25"/>
-    <w:bookmarkStart w:id="26" w:name="criterion-validation-by-simulation"/>
+    <w:bookmarkEnd w:id="26"/>
+    <w:bookmarkStart w:id="27" w:name="criterion-validation-by-simulation"/>
     <w:p>
       <w:pPr>
         <w:pStyle w:val="Heading3"/>
@@ -1819,8 +1873,8 @@
         <w:t xml:space="preserve">. Two properties of the record make this essential rather than optional. Assemblage sample size trends with seriation position (Spearman rho = +0.59), and several signatures are size-sensitive so that a size-dependent estimator can rise or fall along the axis through sampling alone. We therefore subsample every assemblage, synthetic and real, to a common count before scoring, thereby removing the confound. And the record is time-averaged, which we reproduce by blending adjacent-bin production within a window. The recovery experiment then asks, at the resolution and sample sizes this record preserves, which signatures can be trusted and how strong a closure would have to be to register. One aspect of the calibration matters here. Because subsampling the larger, later assemblages to a common count slightly inflates within-cluster diversity and so depresses F_ST toward later positions, the null with no closure (pure drift) itself carries a mild negative trend rather than a flat zero. The test is calibrated against that null distribution, not against zero, so the false-positive rate is held at five percent regardless, and the empirical value is read against the same null.</w:t>
       </w:r>
     </w:p>
-    <w:bookmarkEnd w:id="26"/>
-    <w:bookmarkStart w:id="27" w:name="the-drift-versus-groups-comparison"/>
+    <w:bookmarkEnd w:id="27"/>
+    <w:bookmarkStart w:id="28" w:name="the-drift-versus-groups-comparison"/>
     <w:p>
       <w:pPr>
         <w:pStyle w:val="Heading3"/>
@@ -1855,8 +1909,8 @@
         <w:t xml:space="preserve">, digitized from the survey tables. We georeferenced both the Phillips-Ford-Griffin and the Williams assemblages using their Lower Mississippi Survey grid designations against the digitized survey point files, so that the two regions share a single coordinate frame. Decorated types were harmonized between the two typologies, both rooted in the Phillips-Ford-Griffin framework, into a common vocabulary, and the between-region comparison was run both on all decorated types and on the types shared by the two typologies (Supplemental Text).</w:t>
       </w:r>
     </w:p>
-    <w:bookmarkEnd w:id="27"/>
-    <w:bookmarkStart w:id="28" w:name="external-cross-check"/>
+    <w:bookmarkEnd w:id="28"/>
+    <w:bookmarkStart w:id="29" w:name="external-cross-check"/>
     <w:p>
       <w:pPr>
         <w:pStyle w:val="Heading3"/>
@@ -1906,9 +1960,9 @@
         <w:t xml:space="preserve">independent nonmetric multidimensional scaling of overlapping late-period assemblages, a published ordination of 39 collections from the central valley and adjacent areas that tests whether the named phases form discrete, bounded clusters or a gradational continuum.</w:t>
       </w:r>
     </w:p>
-    <w:bookmarkEnd w:id="28"/>
     <w:bookmarkEnd w:id="29"/>
-    <w:bookmarkStart w:id="42" w:name="results"/>
+    <w:bookmarkEnd w:id="30"/>
+    <w:bookmarkStart w:id="43" w:name="results"/>
     <w:p>
       <w:pPr>
         <w:pStyle w:val="Heading2"/>
@@ -1934,18 +1988,18 @@
           <wp:inline>
             <wp:extent cx="5334000" cy="2715014"/>
             <wp:effectExtent b="0" l="0" r="0" t="0"/>
-            <wp:docPr descr="Figure 4. Record-matched, size-controlled signal recovery. Left: each signature’s response (Spearman trend versus ordinal position) to a known group-closure signal injected at the real configuration of 29 assemblages and subsampled to a common count. Only cultural F_ST tracks the injected signal monotonically. The neutral departure is non-monotonic in conformity, the spatial boundary is unresponsive at three spatial clusters, and seriation coherence is weak. Right: detection power of the calibrated F_ST test against injected strength, with and without the record’s time-averaging (false-positive rate 0.05). F_ST reliably recovers a closure of strength s greater than or equal to 0.5 (0.7 time-averaged). The size-controlled empirical F_ST (+0.01) falls below the resolution limit, its bootstrap interval spanning no closure to a moderate signal." title="" id="31" name="Picture"/>
+            <wp:docPr descr="Figure 4. Record-matched, size-controlled signal recovery. Left: each signature’s response (Spearman trend versus ordinal position) to a known group-closure signal injected at the real configuration of 29 assemblages and subsampled to a common count. Only cultural F_ST tracks the injected signal monotonically. The neutral departure is non-monotonic in conformity, the spatial boundary is unresponsive at three spatial clusters, and seriation coherence is weak. Right: detection power of the calibrated F_ST test against injected strength, with and without the record’s time-averaging (false-positive rate 0.05). F_ST reliably recovers a closure of strength s greater than or equal to 0.5 (0.7 time-averaged). The size-controlled empirical F_ST (+0.01) falls below the resolution limit, its bootstrap interval spanning no closure to a moderate signal." title="" id="32" name="Picture"/>
             <a:graphic>
               <a:graphicData uri="http://schemas.openxmlformats.org/drawingml/2006/picture">
                 <pic:pic>
                   <pic:nvPicPr>
-                    <pic:cNvPr descr="../../figures/fig4_recovery.png" id="32" name="Picture"/>
+                    <pic:cNvPr descr="../../figures/fig4_recovery.png" id="33" name="Picture"/>
                     <pic:cNvPicPr>
                       <a:picLocks noChangeArrowheads="1" noChangeAspect="1"/>
                     </pic:cNvPicPr>
                   </pic:nvPicPr>
                   <pic:blipFill>
-                    <a:blip r:embed="rId30"/>
+                    <a:blip r:embed="rId31"/>
                     <a:stretch>
                       <a:fillRect/>
                     </a:stretch>
@@ -2007,18 +2061,18 @@
           <wp:inline>
             <wp:extent cx="5334000" cy="3953676"/>
             <wp:effectExtent b="0" l="0" r="0" t="0"/>
-            <wp:docPr descr="Figure 5. The empirical four-signature trajectory along the CA seriation axis for the St. Francis basin (29 assemblages, six bins), size-controlled by subsampling to a common count. The reliable signature, cultural F_ST, shows no trend (+0.01, down from a raw +0.60 that was a sample-size artifact). The neutral departure, spatial boundary, and seriation coherence are not reliable discriminators at this resolution (Figure 4) and are shown for completeness. Per-panel rank correlations are annotated." title="" id="34" name="Picture"/>
+            <wp:docPr descr="Figure 5. The empirical four-signature trajectory along the CA seriation axis for the St. Francis basin (29 assemblages, six bins), size-controlled by subsampling to a common count. The reliable signature, cultural F_ST, shows no trend (+0.01, down from a raw +0.60 that was a sample-size artifact). The neutral departure, spatial boundary, and seriation coherence are not reliable discriminators at this resolution (Figure 4) and are shown for completeness. Per-panel rank correlations are annotated." title="" id="35" name="Picture"/>
             <a:graphic>
               <a:graphicData uri="http://schemas.openxmlformats.org/drawingml/2006/picture">
                 <pic:pic>
                   <pic:nvPicPr>
-                    <pic:cNvPr descr="../../figures/fig5_empirical_trajectory.png" id="35" name="Picture"/>
+                    <pic:cNvPr descr="../../figures/fig5_empirical_trajectory.png" id="36" name="Picture"/>
                     <pic:cNvPicPr>
                       <a:picLocks noChangeArrowheads="1" noChangeAspect="1"/>
                     </pic:cNvPicPr>
                   </pic:nvPicPr>
                   <pic:blipFill>
-                    <a:blip r:embed="rId33"/>
+                    <a:blip r:embed="rId34"/>
                     <a:stretch>
                       <a:fillRect/>
                     </a:stretch>
@@ -2182,18 +2236,18 @@
           <wp:inline>
             <wp:extent cx="5334000" cy="3636553"/>
             <wp:effectExtent b="0" l="0" r="0" t="0"/>
-            <wp:docPr descr="Figure 6. Deterministic frequency-seriation (IDSS) structure of the basin assemblages. Left: distribution of co-seriable group sizes, a deeply fragmented structure (35 maximal groups, maximum size four). Right: the most connected assemblages by group-membership count, with Parkin highlighted as a bridge (member of 4 groups, ranked eighth of 29), positioned across orderings rather than at the center of one bounded community." title="" id="37" name="Picture"/>
+            <wp:docPr descr="Figure 6. Deterministic frequency-seriation (IDSS) structure of the basin assemblages. Left: distribution of co-seriable group sizes, a deeply fragmented structure (35 maximal groups, maximum size four). Right: the most connected assemblages by group-membership count, with Parkin highlighted as a bridge (member of 4 groups, ranked eighth of 29), positioned across orderings rather than at the center of one bounded community." title="" id="38" name="Picture"/>
             <a:graphic>
               <a:graphicData uri="http://schemas.openxmlformats.org/drawingml/2006/picture">
                 <pic:pic>
                   <pic:nvPicPr>
-                    <pic:cNvPr descr="../../figures/fig6_idss_structure.png" id="38" name="Picture"/>
+                    <pic:cNvPr descr="../../figures/fig6_idss_structure.png" id="39" name="Picture"/>
                     <pic:cNvPicPr>
                       <a:picLocks noChangeArrowheads="1" noChangeAspect="1"/>
                     </pic:cNvPicPr>
                   </pic:nvPicPr>
                   <pic:blipFill>
-                    <a:blip r:embed="rId36"/>
+                    <a:blip r:embed="rId37"/>
                     <a:stretch>
                       <a:fillRect/>
                     </a:stretch>
@@ -2273,18 +2327,18 @@
           <wp:inline>
             <wp:extent cx="5334000" cy="3328756"/>
             <wp:effectExtent b="0" l="0" r="0" t="0"/>
-            <wp:docPr descr="Figure 7. Settlement cross-check. Main panel: within-basin ranking of maximum mound height, the recorded, like-for-like field (Parkin’s mound area is under-coded as zero and is not used). Parkin has the tallest mound (23 ft, rank 1 of 55), but the height distribution is graded, with no gap separating it from the next centers (tallest-to-second ratio 1.0), a prominent center rather than a redistributive apex. Inset: the proportion of sites with a mound, a defensive ditch, and St-Francis-type fortification across the basin set (n = 92)." title="" id="40" name="Picture"/>
+            <wp:docPr descr="Figure 7. Settlement cross-check. Main panel: within-basin ranking of maximum mound height, the recorded, like-for-like field (Parkin’s mound area is under-coded as zero and is not used). Parkin has the tallest mound (23 ft, rank 1 of 55), but the height distribution is graded, with no gap separating it from the next centers (tallest-to-second ratio 1.0), a prominent center rather than a redistributive apex. Inset: the proportion of sites with a mound, a defensive ditch, and St-Francis-type fortification across the basin set (n = 92)." title="" id="41" name="Picture"/>
             <a:graphic>
               <a:graphicData uri="http://schemas.openxmlformats.org/drawingml/2006/picture">
                 <pic:pic>
                   <pic:nvPicPr>
-                    <pic:cNvPr descr="../../figures/fig7_ranksize.png" id="41" name="Picture"/>
+                    <pic:cNvPr descr="../../figures/fig7_ranksize.png" id="42" name="Picture"/>
                     <pic:cNvPicPr>
                       <a:picLocks noChangeArrowheads="1" noChangeAspect="1"/>
                     </pic:cNvPicPr>
                   </pic:nvPicPr>
                   <pic:blipFill>
-                    <a:blip r:embed="rId39"/>
+                    <a:blip r:embed="rId40"/>
                     <a:stretch>
                       <a:fillRect/>
                     </a:stretch>
@@ -2355,8 +2409,8 @@
         <w:t xml:space="preserve">. These lines point in the same direction. Two of them, the settlement organization and the lithic exchange, are independent of the ceramic data, while the ordination shares that substrate and corroborates the seriation result by a different method rather than independently.</w:t>
       </w:r>
     </w:p>
-    <w:bookmarkEnd w:id="42"/>
-    <w:bookmarkStart w:id="49" w:name="discussion"/>
+    <w:bookmarkEnd w:id="43"/>
+    <w:bookmarkStart w:id="50" w:name="discussion"/>
     <w:p>
       <w:pPr>
         <w:pStyle w:val="Heading2"/>
@@ -2515,18 +2569,18 @@
           <wp:inline>
             <wp:extent cx="4572000" cy="4685221"/>
             <wp:effectExtent b="0" l="0" r="0" t="0"/>
-            <wp:docPr descr="Figure 8. Regional setting of the two-scale comparison. Decorated-ceramic assemblages of the central Mississippi Valley: the southeast-Missouri survey of Williams (CMV, blue) and the lower-valley St. Francis basin Parkin-phase assemblages (LMV, orange), with the gap between the two clusters of collections and Parkin starred. Labels mark the named physiographic phase regions (Cairo Lowland, Sikeston Ridge, Malden Plain, and Little River in the central valley, with the St. Francis basin in the lower valley). Hydrography combines the Lower Mississippi Survey layer with Natural Earth, state boundaries, and the North America locator inset, which are from Natural Earth. The central-valley assemblages were collected and classified by Williams, and the lower-valley assemblages in the Phillips-Ford-Griffin tradition, the separate analytical histories discussed in the text." title="" id="44" name="Picture"/>
+            <wp:docPr descr="Figure 8. Regional setting of the two-scale comparison. Decorated-ceramic assemblages of the central Mississippi Valley: the southeast-Missouri survey of Williams (CMV, blue) and the lower-valley St. Francis basin Parkin-phase assemblages (LMV, orange), with the gap between the two clusters of collections and Parkin starred. Labels mark the named physiographic phase regions (Cairo Lowland, Sikeston Ridge, Malden Plain, and Little River in the central valley, with the St. Francis basin in the lower valley). Hydrography combines the Lower Mississippi Survey layer with Natural Earth, state boundaries, and the North America locator inset, which are from Natural Earth. The central-valley assemblages were collected and classified by Williams, and the lower-valley assemblages in the Phillips-Ford-Griffin tradition, the separate analytical histories discussed in the text." title="" id="45" name="Picture"/>
             <a:graphic>
               <a:graphicData uri="http://schemas.openxmlformats.org/drawingml/2006/picture">
                 <pic:pic>
                   <pic:nvPicPr>
-                    <pic:cNvPr descr="../../figures/fig1_regional.png" id="45" name="Picture"/>
+                    <pic:cNvPr descr="../../figures/fig1_regional.png" id="46" name="Picture"/>
                     <pic:cNvPicPr>
                       <a:picLocks noChangeArrowheads="1" noChangeAspect="1"/>
                     </pic:cNvPicPr>
                   </pic:nvPicPr>
                   <pic:blipFill>
-                    <a:blip r:embed="rId43"/>
+                    <a:blip r:embed="rId44"/>
                     <a:stretch>
                       <a:fillRect/>
                     </a:stretch>
@@ -2580,18 +2634,18 @@
           <wp:inline>
             <wp:extent cx="4754880" cy="3753325"/>
             <wp:effectExtent b="0" l="0" r="0" t="0"/>
-            <wp:docPr descr="Figure 9. Within-region interaction structure: neither region forms bounded groups. Top: multidimensional scaling of decorated Brainerd-Robinson dissimilarity for the LMV St. Francis basin and for the CMV southeast-Missouri assemblages (Mississippian types only, so the comparison is not driven by the Woodland-to-Mississippian gradient), points colored by within-region spatial cluster, and the assemblages intermix rather than separating into clusters. Bottom: the observed between-cluster cultural F_ST for each region (diamond) against the 95% nulls of a neutral spatial-drift model (blue) and a bounded-groups model (orange) run on the real coordinates and subsampled to the observed counts. In both regions, the observed F_ST sits at the drift level and far below the bounded-groups expectation, so the within-region structure is drift-consistent at both scales." title="" id="47" name="Picture"/>
+            <wp:docPr descr="Figure 9. Within-region interaction structure: neither region forms bounded groups. Top: multidimensional scaling of decorated Brainerd-Robinson dissimilarity for the LMV St. Francis basin and for the CMV southeast-Missouri assemblages (Mississippian types only, so the comparison is not driven by the Woodland-to-Mississippian gradient), points colored by within-region spatial cluster, and the assemblages intermix rather than separating into clusters. Bottom: the observed between-cluster cultural F_ST for each region (diamond) against the 95% nulls of a neutral spatial-drift model (blue) and a bounded-groups model (orange) run on the real coordinates and subsampled to the observed counts. In both regions, the observed F_ST sits at the drift level and far below the bounded-groups expectation, so the within-region structure is drift-consistent at both scales." title="" id="48" name="Picture"/>
             <a:graphic>
               <a:graphicData uri="http://schemas.openxmlformats.org/drawingml/2006/picture">
                 <pic:pic>
                   <pic:nvPicPr>
-                    <pic:cNvPr descr="../../figures/fig9_within_region.png" id="48" name="Picture"/>
+                    <pic:cNvPr descr="../../figures/fig9_within_region.png" id="49" name="Picture"/>
                     <pic:cNvPicPr>
                       <a:picLocks noChangeArrowheads="1" noChangeAspect="1"/>
                     </pic:cNvPicPr>
                   </pic:nvPicPr>
                   <pic:blipFill>
-                    <a:blip r:embed="rId46"/>
+                    <a:blip r:embed="rId47"/>
                     <a:stretch>
                       <a:fillRect/>
                     </a:stretch>
@@ -2698,8 +2752,8 @@
         <w:t xml:space="preserve">. The detail is in the Supplemental Text.</w:t>
       </w:r>
     </w:p>
-    <w:bookmarkEnd w:id="49"/>
-    <w:bookmarkStart w:id="50" w:name="conclusion"/>
+    <w:bookmarkEnd w:id="50"/>
+    <w:bookmarkStart w:id="51" w:name="conclusion"/>
     <w:p>
       <w:pPr>
         <w:pStyle w:val="Heading2"/>
@@ -2716,8 +2770,8 @@
         <w:t xml:space="preserve">The phase is the unit on which central-valley culture history is built, and it carries a silent claim that assemblages grouped by seriation and spatial proximity record a bounded society. For the Parkin phase, that claim does not survive measurement. Parkin is the basin’s largest and tallest-mounded center. No line of evidence, settlement, exchange, or ceramic transmission marks it as the apex of a polity, and the greater similarity among nearby assemblages that defines the phase is reproduced by neutral drift on the basin’s geography, the ordinary residue of continuous interaction structured by where sites sit. A bounded interaction group would have a sharper structure than the measurements indicate, and Parkin sits across orderings as a transmission bridge rather than at the closed core of one. Extending the test to the wider valley, a decorated-ceramic boundary that exceeds drift appears only between the central-valley and lower-valley blocks, and even there, it is entangled with the early-to-late turnover of the type repertoire. It cannot yet be read as a synchronic social division. The phase, at the scale where it is drawn, is largely indistinguishable from spatially structured drift, which carries a consequence the discipline should weigh: a similarity cluster is not by itself a society, and before a phase is read as a social group, the record must be shown able to tell a real interaction boundary from drift on geography. That calibration, not the phase, provides the basis for an explanation of social structure. When applied to the late pre-contact ceramics of the Mississippi Valley, it yields a landscape of continuous interaction with prominent nodes rather than a mosaic of bounded polities.</w:t>
       </w:r>
     </w:p>
-    <w:bookmarkEnd w:id="50"/>
-    <w:bookmarkStart w:id="51" w:name="data-and-code-availability"/>
+    <w:bookmarkEnd w:id="51"/>
+    <w:bookmarkStart w:id="52" w:name="data-and-code-availability"/>
     <w:p>
       <w:pPr>
         <w:pStyle w:val="Heading2"/>
@@ -2734,8 +2788,8 @@
         <w:t xml:space="preserve">All data and code needed to reproduce the analyses and figures reported here are openly available at https://github.com/clipo/phases. The repository includes the decorated-ceramic type counts, the georeferencing and radiocarbon data, the complete analysis procedure, and instructions for reproducing all results and figures. The code is released under the MIT License, and the data under a Creative Commons Attribution 4.0 International license.</w:t>
       </w:r>
     </w:p>
-    <w:bookmarkEnd w:id="51"/>
-    <w:bookmarkStart w:id="211" w:name="references"/>
+    <w:bookmarkEnd w:id="52"/>
+    <w:bookmarkStart w:id="212" w:name="references"/>
     <w:p>
       <w:pPr>
         <w:pStyle w:val="Heading2"/>
@@ -2744,8 +2798,8 @@
         <w:t xml:space="preserve">References</w:t>
       </w:r>
     </w:p>
-    <w:bookmarkStart w:id="210" w:name="refs"/>
-    <w:bookmarkStart w:id="52" w:name="ref-anderson_1996"/>
+    <w:bookmarkStart w:id="211" w:name="refs"/>
+    <w:bookmarkStart w:id="53" w:name="ref-anderson_1996"/>
     <w:p>
       <w:pPr>
         <w:pStyle w:val="Bibliography"/>
@@ -2767,8 +2821,8 @@
         <w:t xml:space="preserve">, edited by John F. Scarry, pp. 231–252. University Press of Florida, Gainesville.</w:t>
       </w:r>
     </w:p>
-    <w:bookmarkEnd w:id="52"/>
-    <w:bookmarkStart w:id="54" w:name="ref-bailey_2007"/>
+    <w:bookmarkEnd w:id="53"/>
+    <w:bookmarkStart w:id="55" w:name="ref-bailey_2007"/>
     <w:p>
       <w:pPr>
         <w:pStyle w:val="Bibliography"/>
@@ -2795,7 +2849,7 @@
       <w:r>
         <w:t xml:space="preserve"> </w:t>
       </w:r>
-      <w:hyperlink r:id="rId53">
+      <w:hyperlink r:id="rId54">
         <w:r>
           <w:rPr>
             <w:rStyle w:val="Hyperlink"/>
@@ -2807,8 +2861,8 @@
         <w:t xml:space="preserve">.</w:t>
       </w:r>
     </w:p>
-    <w:bookmarkEnd w:id="54"/>
-    <w:bookmarkStart w:id="56" w:name="ref-barrett_2019"/>
+    <w:bookmarkEnd w:id="55"/>
+    <w:bookmarkStart w:id="57" w:name="ref-barrett_2019"/>
     <w:p>
       <w:pPr>
         <w:pStyle w:val="Bibliography"/>
@@ -2835,7 +2889,7 @@
       <w:r>
         <w:t xml:space="preserve"> </w:t>
       </w:r>
-      <w:hyperlink r:id="rId55">
+      <w:hyperlink r:id="rId56">
         <w:r>
           <w:rPr>
             <w:rStyle w:val="Hyperlink"/>
@@ -2847,8 +2901,8 @@
         <w:t xml:space="preserve">.</w:t>
       </w:r>
     </w:p>
-    <w:bookmarkEnd w:id="56"/>
-    <w:bookmarkStart w:id="57" w:name="ref-baxter_1994"/>
+    <w:bookmarkEnd w:id="57"/>
+    <w:bookmarkStart w:id="58" w:name="ref-baxter_1994"/>
     <w:p>
       <w:pPr>
         <w:pStyle w:val="Bibliography"/>
@@ -2870,8 +2924,8 @@
         <w:t xml:space="preserve">. Edinburgh University Press, Edinburgh.</w:t>
       </w:r>
     </w:p>
-    <w:bookmarkEnd w:id="57"/>
-    <w:bookmarkStart w:id="59" w:name="ref-beck_2003"/>
+    <w:bookmarkEnd w:id="58"/>
+    <w:bookmarkStart w:id="60" w:name="ref-beck_2003"/>
     <w:p>
       <w:pPr>
         <w:pStyle w:val="Bibliography"/>
@@ -2910,7 +2964,7 @@
       <w:r>
         <w:t xml:space="preserve"> </w:t>
       </w:r>
-      <w:hyperlink r:id="rId58">
+      <w:hyperlink r:id="rId59">
         <w:r>
           <w:rPr>
             <w:rStyle w:val="Hyperlink"/>
@@ -2922,8 +2976,8 @@
         <w:t xml:space="preserve">.</w:t>
       </w:r>
     </w:p>
-    <w:bookmarkEnd w:id="59"/>
-    <w:bookmarkStart w:id="61" w:name="ref-behrensmeyer_kidwell_gastaldo_2000"/>
+    <w:bookmarkEnd w:id="60"/>
+    <w:bookmarkStart w:id="62" w:name="ref-behrensmeyer_kidwell_gastaldo_2000"/>
     <w:p>
       <w:pPr>
         <w:pStyle w:val="Bibliography"/>
@@ -2950,7 +3004,7 @@
       <w:r>
         <w:t xml:space="preserve"> </w:t>
       </w:r>
-      <w:hyperlink r:id="rId60">
+      <w:hyperlink r:id="rId61">
         <w:r>
           <w:rPr>
             <w:rStyle w:val="Hyperlink"/>
@@ -2962,8 +3016,8 @@
         <w:t xml:space="preserve">.</w:t>
       </w:r>
     </w:p>
-    <w:bookmarkEnd w:id="61"/>
-    <w:bookmarkStart w:id="63" w:name="ref-bell_richerson_mcelreath_2009"/>
+    <w:bookmarkEnd w:id="62"/>
+    <w:bookmarkStart w:id="64" w:name="ref-bell_richerson_mcelreath_2009"/>
     <w:p>
       <w:pPr>
         <w:pStyle w:val="Bibliography"/>
@@ -2990,7 +3044,7 @@
       <w:r>
         <w:t xml:space="preserve"> </w:t>
       </w:r>
-      <w:hyperlink r:id="rId62">
+      <w:hyperlink r:id="rId63">
         <w:r>
           <w:rPr>
             <w:rStyle w:val="Hyperlink"/>
@@ -3002,8 +3056,8 @@
         <w:t xml:space="preserve">.</w:t>
       </w:r>
     </w:p>
-    <w:bookmarkEnd w:id="63"/>
-    <w:bookmarkStart w:id="65" w:name="ref-bentley_2008"/>
+    <w:bookmarkEnd w:id="64"/>
+    <w:bookmarkStart w:id="66" w:name="ref-bentley_2008"/>
     <w:p>
       <w:pPr>
         <w:pStyle w:val="Bibliography"/>
@@ -3030,7 +3084,7 @@
       <w:r>
         <w:t xml:space="preserve"> </w:t>
       </w:r>
-      <w:hyperlink r:id="rId64">
+      <w:hyperlink r:id="rId65">
         <w:r>
           <w:rPr>
             <w:rStyle w:val="Hyperlink"/>
@@ -3042,8 +3096,8 @@
         <w:t xml:space="preserve">.</w:t>
       </w:r>
     </w:p>
-    <w:bookmarkEnd w:id="65"/>
-    <w:bookmarkStart w:id="67" w:name="ref-bentley_hahn_shennan_2004"/>
+    <w:bookmarkEnd w:id="66"/>
+    <w:bookmarkStart w:id="68" w:name="ref-bentley_hahn_shennan_2004"/>
     <w:p>
       <w:pPr>
         <w:pStyle w:val="Bibliography"/>
@@ -3070,7 +3124,7 @@
       <w:r>
         <w:t xml:space="preserve"> </w:t>
       </w:r>
-      <w:hyperlink r:id="rId66">
+      <w:hyperlink r:id="rId67">
         <w:r>
           <w:rPr>
             <w:rStyle w:val="Hyperlink"/>
@@ -3082,8 +3136,8 @@
         <w:t xml:space="preserve">.</w:t>
       </w:r>
     </w:p>
-    <w:bookmarkEnd w:id="67"/>
-    <w:bookmarkStart w:id="68" w:name="ref-binford_1981"/>
+    <w:bookmarkEnd w:id="68"/>
+    <w:bookmarkStart w:id="69" w:name="ref-binford_1981"/>
     <w:p>
       <w:pPr>
         <w:pStyle w:val="Bibliography"/>
@@ -3123,8 +3177,8 @@
         <w:t xml:space="preserve">37(3):195–208.</w:t>
       </w:r>
     </w:p>
-    <w:bookmarkEnd w:id="68"/>
-    <w:bookmarkStart w:id="70" w:name="ref-blitz_1999"/>
+    <w:bookmarkEnd w:id="69"/>
+    <w:bookmarkStart w:id="71" w:name="ref-blitz_1999"/>
     <w:p>
       <w:pPr>
         <w:pStyle w:val="Bibliography"/>
@@ -3163,7 +3217,7 @@
       <w:r>
         <w:t xml:space="preserve"> </w:t>
       </w:r>
-      <w:hyperlink r:id="rId69">
+      <w:hyperlink r:id="rId70">
         <w:r>
           <w:rPr>
             <w:rStyle w:val="Hyperlink"/>
@@ -3175,8 +3229,8 @@
         <w:t xml:space="preserve">.</w:t>
       </w:r>
     </w:p>
-    <w:bookmarkEnd w:id="70"/>
-    <w:bookmarkStart w:id="71" w:name="ref-brainerd_1951"/>
+    <w:bookmarkEnd w:id="71"/>
+    <w:bookmarkStart w:id="72" w:name="ref-brainerd_1951"/>
     <w:p>
       <w:pPr>
         <w:pStyle w:val="Bibliography"/>
@@ -3201,8 +3255,8 @@
         <w:t xml:space="preserve">16(4):301–313.</w:t>
       </w:r>
     </w:p>
-    <w:bookmarkEnd w:id="71"/>
-    <w:bookmarkStart w:id="73" w:name="ref-carrignon_bentley_ruck_2019"/>
+    <w:bookmarkEnd w:id="72"/>
+    <w:bookmarkStart w:id="74" w:name="ref-carrignon_bentley_ruck_2019"/>
     <w:p>
       <w:pPr>
         <w:pStyle w:val="Bibliography"/>
@@ -3253,7 +3307,7 @@
       <w:r>
         <w:t xml:space="preserve"> </w:t>
       </w:r>
-      <w:hyperlink r:id="rId72">
+      <w:hyperlink r:id="rId73">
         <w:r>
           <w:rPr>
             <w:rStyle w:val="Hyperlink"/>
@@ -3265,8 +3319,8 @@
         <w:t xml:space="preserve">.</w:t>
       </w:r>
     </w:p>
-    <w:bookmarkEnd w:id="73"/>
-    <w:bookmarkStart w:id="74" w:name="ref-cobb_2000"/>
+    <w:bookmarkEnd w:id="74"/>
+    <w:bookmarkStart w:id="75" w:name="ref-cobb_2000"/>
     <w:p>
       <w:pPr>
         <w:pStyle w:val="Bibliography"/>
@@ -3316,8 +3370,8 @@
         <w:t xml:space="preserve">. University of Alabama Press, Tuscaloosa.</w:t>
       </w:r>
     </w:p>
-    <w:bookmarkEnd w:id="74"/>
-    <w:bookmarkStart w:id="75" w:name="ref-cobb_butler_2002"/>
+    <w:bookmarkEnd w:id="75"/>
+    <w:bookmarkStart w:id="76" w:name="ref-cobb_butler_2002"/>
     <w:p>
       <w:pPr>
         <w:pStyle w:val="Bibliography"/>
@@ -3366,8 +3420,8 @@
         <w:t xml:space="preserve">67(4):625–641.</w:t>
       </w:r>
     </w:p>
-    <w:bookmarkEnd w:id="75"/>
-    <w:bookmarkStart w:id="77" w:name="ref-coco_iovita_2020"/>
+    <w:bookmarkEnd w:id="76"/>
+    <w:bookmarkStart w:id="78" w:name="ref-coco_iovita_2020"/>
     <w:p>
       <w:pPr>
         <w:pStyle w:val="Bibliography"/>
@@ -3394,7 +3448,7 @@
       <w:r>
         <w:t xml:space="preserve"> </w:t>
       </w:r>
-      <w:hyperlink r:id="rId76">
+      <w:hyperlink r:id="rId77">
         <w:r>
           <w:rPr>
             <w:rStyle w:val="Hyperlink"/>
@@ -3406,8 +3460,8 @@
         <w:t xml:space="preserve">.</w:t>
       </w:r>
     </w:p>
-    <w:bookmarkEnd w:id="77"/>
-    <w:bookmarkStart w:id="79" w:name="ref-crema_bortolini_lake_2023"/>
+    <w:bookmarkEnd w:id="78"/>
+    <w:bookmarkStart w:id="80" w:name="ref-crema_bortolini_lake_2023"/>
     <w:p>
       <w:pPr>
         <w:pStyle w:val="Bibliography"/>
@@ -3434,7 +3488,7 @@
       <w:r>
         <w:t xml:space="preserve"> </w:t>
       </w:r>
-      <w:hyperlink r:id="rId78">
+      <w:hyperlink r:id="rId79">
         <w:r>
           <w:rPr>
             <w:rStyle w:val="Hyperlink"/>
@@ -3446,8 +3500,8 @@
         <w:t xml:space="preserve">.</w:t>
       </w:r>
     </w:p>
-    <w:bookmarkEnd w:id="79"/>
-    <w:bookmarkStart w:id="81" w:name="ref-crema_edinborough_kerig_shennan_2014"/>
+    <w:bookmarkEnd w:id="80"/>
+    <w:bookmarkStart w:id="82" w:name="ref-crema_edinborough_kerig_shennan_2014"/>
     <w:p>
       <w:pPr>
         <w:pStyle w:val="Bibliography"/>
@@ -3486,7 +3540,7 @@
       <w:r>
         <w:t xml:space="preserve"> </w:t>
       </w:r>
-      <w:hyperlink r:id="rId80">
+      <w:hyperlink r:id="rId81">
         <w:r>
           <w:rPr>
             <w:rStyle w:val="Hyperlink"/>
@@ -3498,8 +3552,8 @@
         <w:t xml:space="preserve">.</w:t>
       </w:r>
     </w:p>
-    <w:bookmarkEnd w:id="81"/>
-    <w:bookmarkStart w:id="83" w:name="ref-crema_kandler_shennan_2016"/>
+    <w:bookmarkEnd w:id="82"/>
+    <w:bookmarkStart w:id="84" w:name="ref-crema_kandler_shennan_2016"/>
     <w:p>
       <w:pPr>
         <w:pStyle w:val="Bibliography"/>
@@ -3526,7 +3580,7 @@
       <w:r>
         <w:t xml:space="preserve"> </w:t>
       </w:r>
-      <w:hyperlink r:id="rId82">
+      <w:hyperlink r:id="rId83">
         <w:r>
           <w:rPr>
             <w:rStyle w:val="Hyperlink"/>
@@ -3538,8 +3592,8 @@
         <w:t xml:space="preserve">.</w:t>
       </w:r>
     </w:p>
-    <w:bookmarkEnd w:id="83"/>
-    <w:bookmarkStart w:id="85" w:name="ref-dakos_2012"/>
+    <w:bookmarkEnd w:id="84"/>
+    <w:bookmarkStart w:id="86" w:name="ref-dakos_2012"/>
     <w:p>
       <w:pPr>
         <w:pStyle w:val="Bibliography"/>
@@ -3566,7 +3620,7 @@
       <w:r>
         <w:t xml:space="preserve"> </w:t>
       </w:r>
-      <w:hyperlink r:id="rId84">
+      <w:hyperlink r:id="rId85">
         <w:r>
           <w:rPr>
             <w:rStyle w:val="Hyperlink"/>
@@ -3578,8 +3632,8 @@
         <w:t xml:space="preserve">.</w:t>
       </w:r>
     </w:p>
-    <w:bookmarkEnd w:id="85"/>
-    <w:bookmarkStart w:id="87" w:name="ref-dunnell_1970"/>
+    <w:bookmarkEnd w:id="86"/>
+    <w:bookmarkStart w:id="88" w:name="ref-dunnell_1970"/>
     <w:p>
       <w:pPr>
         <w:pStyle w:val="Bibliography"/>
@@ -3606,7 +3660,7 @@
       <w:r>
         <w:t xml:space="preserve"> </w:t>
       </w:r>
-      <w:hyperlink r:id="rId86">
+      <w:hyperlink r:id="rId87">
         <w:r>
           <w:rPr>
             <w:rStyle w:val="Hyperlink"/>
@@ -3618,8 +3672,8 @@
         <w:t xml:space="preserve">.</w:t>
       </w:r>
     </w:p>
-    <w:bookmarkEnd w:id="87"/>
-    <w:bookmarkStart w:id="89" w:name="ref-dunnell_1978"/>
+    <w:bookmarkEnd w:id="88"/>
+    <w:bookmarkStart w:id="90" w:name="ref-dunnell_1978"/>
     <w:p>
       <w:pPr>
         <w:pStyle w:val="Bibliography"/>
@@ -3646,7 +3700,7 @@
       <w:r>
         <w:t xml:space="preserve"> </w:t>
       </w:r>
-      <w:hyperlink r:id="rId88">
+      <w:hyperlink r:id="rId89">
         <w:r>
           <w:rPr>
             <w:rStyle w:val="Hyperlink"/>
@@ -3658,8 +3712,8 @@
         <w:t xml:space="preserve">.</w:t>
       </w:r>
     </w:p>
-    <w:bookmarkEnd w:id="89"/>
-    <w:bookmarkStart w:id="90" w:name="ref-dunnell_1980"/>
+    <w:bookmarkEnd w:id="90"/>
+    <w:bookmarkStart w:id="91" w:name="ref-dunnell_1980"/>
     <w:p>
       <w:pPr>
         <w:pStyle w:val="Bibliography"/>
@@ -3681,8 +3735,8 @@
         <w:t xml:space="preserve">, edited by Michael B. Schiffer, pp. 35–99. Academic Press, New York.</w:t>
       </w:r>
     </w:p>
-    <w:bookmarkEnd w:id="90"/>
-    <w:bookmarkStart w:id="91" w:name="ref-dunnell_1995"/>
+    <w:bookmarkEnd w:id="91"/>
+    <w:bookmarkStart w:id="92" w:name="ref-dunnell_1995"/>
     <w:p>
       <w:pPr>
         <w:pStyle w:val="Bibliography"/>
@@ -3704,8 +3758,8 @@
         <w:t xml:space="preserve">, edited by Patrice A. Teltser, pp. 33–50. University of Arizona Press, Tucson.</w:t>
       </w:r>
     </w:p>
-    <w:bookmarkEnd w:id="91"/>
-    <w:bookmarkStart w:id="92" w:name="ref-dye_cox_1990"/>
+    <w:bookmarkEnd w:id="92"/>
+    <w:bookmarkStart w:id="93" w:name="ref-dye_cox_1990"/>
     <w:p>
       <w:pPr>
         <w:pStyle w:val="Bibliography"/>
@@ -3741,8 +3795,8 @@
         <w:t xml:space="preserve">. University of Alabama Press, Tuscaloosa.</w:t>
       </w:r>
     </w:p>
-    <w:bookmarkEnd w:id="92"/>
-    <w:bookmarkStart w:id="94" w:name="ref-eerkens_lipo_2005"/>
+    <w:bookmarkEnd w:id="93"/>
+    <w:bookmarkStart w:id="95" w:name="ref-eerkens_lipo_2005"/>
     <w:p>
       <w:pPr>
         <w:pStyle w:val="Bibliography"/>
@@ -3769,7 +3823,7 @@
       <w:r>
         <w:t xml:space="preserve"> </w:t>
       </w:r>
-      <w:hyperlink r:id="rId93">
+      <w:hyperlink r:id="rId94">
         <w:r>
           <w:rPr>
             <w:rStyle w:val="Hyperlink"/>
@@ -3781,8 +3835,8 @@
         <w:t xml:space="preserve">.</w:t>
       </w:r>
     </w:p>
-    <w:bookmarkEnd w:id="94"/>
-    <w:bookmarkStart w:id="96" w:name="ref-eerkens_lipo_2007"/>
+    <w:bookmarkEnd w:id="95"/>
+    <w:bookmarkStart w:id="97" w:name="ref-eerkens_lipo_2007"/>
     <w:p>
       <w:pPr>
         <w:pStyle w:val="Bibliography"/>
@@ -3809,7 +3863,7 @@
       <w:r>
         <w:t xml:space="preserve"> </w:t>
       </w:r>
-      <w:hyperlink r:id="rId95">
+      <w:hyperlink r:id="rId96">
         <w:r>
           <w:rPr>
             <w:rStyle w:val="Hyperlink"/>
@@ -3821,8 +3875,8 @@
         <w:t xml:space="preserve">.</w:t>
       </w:r>
     </w:p>
-    <w:bookmarkEnd w:id="96"/>
-    <w:bookmarkStart w:id="97" w:name="ref-ewens_1972"/>
+    <w:bookmarkEnd w:id="97"/>
+    <w:bookmarkStart w:id="98" w:name="ref-ewens_1972"/>
     <w:p>
       <w:pPr>
         <w:pStyle w:val="Bibliography"/>
@@ -3847,8 +3901,8 @@
         <w:t xml:space="preserve">3(1):87–112.</w:t>
       </w:r>
     </w:p>
-    <w:bookmarkEnd w:id="97"/>
-    <w:bookmarkStart w:id="99" w:name="ref-feder_kryazhimskiy_plotkin_2014"/>
+    <w:bookmarkEnd w:id="98"/>
+    <w:bookmarkStart w:id="100" w:name="ref-feder_kryazhimskiy_plotkin_2014"/>
     <w:p>
       <w:pPr>
         <w:pStyle w:val="Bibliography"/>
@@ -3875,7 +3929,7 @@
       <w:r>
         <w:t xml:space="preserve"> </w:t>
       </w:r>
-      <w:hyperlink r:id="rId98">
+      <w:hyperlink r:id="rId99">
         <w:r>
           <w:rPr>
             <w:rStyle w:val="Hyperlink"/>
@@ -3887,8 +3941,8 @@
         <w:t xml:space="preserve">.</w:t>
       </w:r>
     </w:p>
-    <w:bookmarkEnd w:id="99"/>
-    <w:bookmarkStart w:id="101" w:name="ref-fogarty_kandler_creanza_2024"/>
+    <w:bookmarkEnd w:id="100"/>
+    <w:bookmarkStart w:id="102" w:name="ref-fogarty_kandler_creanza_2024"/>
     <w:p>
       <w:pPr>
         <w:pStyle w:val="Bibliography"/>
@@ -3915,7 +3969,7 @@
       <w:r>
         <w:t xml:space="preserve"> </w:t>
       </w:r>
-      <w:hyperlink r:id="rId100">
+      <w:hyperlink r:id="rId101">
         <w:r>
           <w:rPr>
             <w:rStyle w:val="Hyperlink"/>
@@ -3927,8 +3981,8 @@
         <w:t xml:space="preserve">.</w:t>
       </w:r>
     </w:p>
-    <w:bookmarkEnd w:id="101"/>
-    <w:bookmarkStart w:id="102" w:name="ref-fox_1998"/>
+    <w:bookmarkEnd w:id="102"/>
+    <w:bookmarkStart w:id="103" w:name="ref-fox_1998"/>
     <w:p>
       <w:pPr>
         <w:pStyle w:val="Bibliography"/>
@@ -3950,8 +4004,8 @@
         <w:t xml:space="preserve">, edited by Michael J. O’Brien and Robert C. Dunnell, pp. 31–58. University of Alabama Press, Tuscaloosa.</w:t>
       </w:r>
     </w:p>
-    <w:bookmarkEnd w:id="102"/>
-    <w:bookmarkStart w:id="103" w:name="ref-graves_cachola-abad_1996"/>
+    <w:bookmarkEnd w:id="103"/>
+    <w:bookmarkStart w:id="104" w:name="ref-graves_cachola-abad_1996"/>
     <w:p>
       <w:pPr>
         <w:pStyle w:val="Bibliography"/>
@@ -3985,8 +4039,8 @@
         <w:t xml:space="preserve">31(1):19–32.</w:t>
       </w:r>
     </w:p>
-    <w:bookmarkEnd w:id="103"/>
-    <w:bookmarkStart w:id="104" w:name="ref-hally_1993"/>
+    <w:bookmarkEnd w:id="104"/>
+    <w:bookmarkStart w:id="105" w:name="ref-hally_1993"/>
     <w:p>
       <w:pPr>
         <w:pStyle w:val="Bibliography"/>
@@ -4020,8 +4074,8 @@
         <w:t xml:space="preserve">, edited by James B. Stoltman, pp. 143–167. Archaeological Report No. 25. Mississippi Department of Archives; History, Jackson.</w:t>
       </w:r>
     </w:p>
-    <w:bookmarkEnd w:id="104"/>
-    <w:bookmarkStart w:id="105" w:name="ref-hally_1996"/>
+    <w:bookmarkEnd w:id="105"/>
+    <w:bookmarkStart w:id="106" w:name="ref-hally_1996"/>
     <w:p>
       <w:pPr>
         <w:pStyle w:val="Bibliography"/>
@@ -4055,8 +4109,8 @@
         <w:t xml:space="preserve">, edited by John F. Scarry, pp. 92–127. University Press of Florida, Gainesville.</w:t>
       </w:r>
     </w:p>
-    <w:bookmarkEnd w:id="105"/>
-    <w:bookmarkStart w:id="107" w:name="ref-henrich_2001"/>
+    <w:bookmarkEnd w:id="106"/>
+    <w:bookmarkStart w:id="108" w:name="ref-henrich_2001"/>
     <w:p>
       <w:pPr>
         <w:pStyle w:val="Bibliography"/>
@@ -4083,7 +4137,7 @@
       <w:r>
         <w:t xml:space="preserve"> </w:t>
       </w:r>
-      <w:hyperlink r:id="rId106">
+      <w:hyperlink r:id="rId107">
         <w:r>
           <w:rPr>
             <w:rStyle w:val="Hyperlink"/>
@@ -4095,8 +4149,8 @@
         <w:t xml:space="preserve">.</w:t>
       </w:r>
     </w:p>
-    <w:bookmarkEnd w:id="107"/>
-    <w:bookmarkStart w:id="109" w:name="ref-henrich_2004"/>
+    <w:bookmarkEnd w:id="108"/>
+    <w:bookmarkStart w:id="110" w:name="ref-henrich_2004"/>
     <w:p>
       <w:pPr>
         <w:pStyle w:val="Bibliography"/>
@@ -4135,7 +4189,7 @@
       <w:r>
         <w:t xml:space="preserve"> </w:t>
       </w:r>
-      <w:hyperlink r:id="rId108">
+      <w:hyperlink r:id="rId109">
         <w:r>
           <w:rPr>
             <w:rStyle w:val="Hyperlink"/>
@@ -4147,8 +4201,8 @@
         <w:t xml:space="preserve">.</w:t>
       </w:r>
     </w:p>
-    <w:bookmarkEnd w:id="109"/>
-    <w:bookmarkStart w:id="111" w:name="ref-henrich_boyd_1998"/>
+    <w:bookmarkEnd w:id="110"/>
+    <w:bookmarkStart w:id="112" w:name="ref-henrich_boyd_1998"/>
     <w:p>
       <w:pPr>
         <w:pStyle w:val="Bibliography"/>
@@ -4175,7 +4229,7 @@
       <w:r>
         <w:t xml:space="preserve"> </w:t>
       </w:r>
-      <w:hyperlink r:id="rId110">
+      <w:hyperlink r:id="rId111">
         <w:r>
           <w:rPr>
             <w:rStyle w:val="Hyperlink"/>
@@ -4187,8 +4241,8 @@
         <w:t xml:space="preserve">.</w:t>
       </w:r>
     </w:p>
-    <w:bookmarkEnd w:id="111"/>
-    <w:bookmarkStart w:id="112" w:name="ref-holdaway_wandsnider_2008"/>
+    <w:bookmarkEnd w:id="112"/>
+    <w:bookmarkStart w:id="113" w:name="ref-holdaway_wandsnider_2008"/>
     <w:p>
       <w:pPr>
         <w:pStyle w:val="Bibliography"/>
@@ -4210,8 +4264,8 @@
         <w:t xml:space="preserve">. University of Utah Press, Salt Lake City.</w:t>
       </w:r>
     </w:p>
-    <w:bookmarkEnd w:id="112"/>
-    <w:bookmarkStart w:id="114" w:name="ref-holland-lulewicz_ritchison_2021"/>
+    <w:bookmarkEnd w:id="113"/>
+    <w:bookmarkStart w:id="115" w:name="ref-holland-lulewicz_ritchison_2021"/>
     <w:p>
       <w:pPr>
         <w:pStyle w:val="Bibliography"/>
@@ -4238,7 +4292,7 @@
       <w:r>
         <w:t xml:space="preserve"> </w:t>
       </w:r>
-      <w:hyperlink r:id="rId113">
+      <w:hyperlink r:id="rId114">
         <w:r>
           <w:rPr>
             <w:rStyle w:val="Hyperlink"/>
@@ -4250,8 +4304,8 @@
         <w:t xml:space="preserve">.</w:t>
       </w:r>
     </w:p>
-    <w:bookmarkEnd w:id="114"/>
-    <w:bookmarkStart w:id="115" w:name="ref-house_1993"/>
+    <w:bookmarkEnd w:id="115"/>
+    <w:bookmarkStart w:id="116" w:name="ref-house_1993"/>
     <w:p>
       <w:pPr>
         <w:pStyle w:val="Bibliography"/>
@@ -4276,8 +4330,8 @@
         <w:t xml:space="preserve">12(1):21–32.</w:t>
       </w:r>
     </w:p>
-    <w:bookmarkEnd w:id="115"/>
-    <w:bookmarkStart w:id="116" w:name="ref-hudson_smith_depratter_1990"/>
+    <w:bookmarkEnd w:id="116"/>
+    <w:bookmarkStart w:id="117" w:name="ref-hudson_smith_depratter_1990"/>
     <w:p>
       <w:pPr>
         <w:pStyle w:val="Bibliography"/>
@@ -4337,8 +4391,8 @@
         <w:t xml:space="preserve">, edited by David H. Dye and Cheryl Anne Cox, pp. 181–207. University of Alabama Press, Tuscaloosa.</w:t>
       </w:r>
     </w:p>
-    <w:bookmarkEnd w:id="116"/>
-    <w:bookmarkStart w:id="118" w:name="ref-hunt_2006"/>
+    <w:bookmarkEnd w:id="117"/>
+    <w:bookmarkStart w:id="119" w:name="ref-hunt_2006"/>
     <w:p>
       <w:pPr>
         <w:pStyle w:val="Bibliography"/>
@@ -4365,7 +4419,7 @@
       <w:r>
         <w:t xml:space="preserve"> </w:t>
       </w:r>
-      <w:hyperlink r:id="rId117">
+      <w:hyperlink r:id="rId118">
         <w:r>
           <w:rPr>
             <w:rStyle w:val="Hyperlink"/>
@@ -4377,8 +4431,8 @@
         <w:t xml:space="preserve">.</w:t>
       </w:r>
     </w:p>
-    <w:bookmarkEnd w:id="118"/>
-    <w:bookmarkStart w:id="120" w:name="ref-hunt_bell_travis_2008"/>
+    <w:bookmarkEnd w:id="119"/>
+    <w:bookmarkStart w:id="121" w:name="ref-hunt_bell_travis_2008"/>
     <w:p>
       <w:pPr>
         <w:pStyle w:val="Bibliography"/>
@@ -4405,7 +4459,7 @@
       <w:r>
         <w:t xml:space="preserve"> </w:t>
       </w:r>
-      <w:hyperlink r:id="rId119">
+      <w:hyperlink r:id="rId120">
         <w:r>
           <w:rPr>
             <w:rStyle w:val="Hyperlink"/>
@@ -4417,8 +4471,8 @@
         <w:t xml:space="preserve">.</w:t>
       </w:r>
     </w:p>
-    <w:bookmarkEnd w:id="120"/>
-    <w:bookmarkStart w:id="121" w:name="ref-hurlbert_1971"/>
+    <w:bookmarkEnd w:id="121"/>
+    <w:bookmarkStart w:id="122" w:name="ref-hurlbert_1971"/>
     <w:p>
       <w:pPr>
         <w:pStyle w:val="Bibliography"/>
@@ -4443,8 +4497,8 @@
         <w:t xml:space="preserve">52(4):577–586.</w:t>
       </w:r>
     </w:p>
-    <w:bookmarkEnd w:id="121"/>
-    <w:bookmarkStart w:id="123" w:name="ref-kandler_shennan_2013"/>
+    <w:bookmarkEnd w:id="122"/>
+    <w:bookmarkStart w:id="124" w:name="ref-kandler_shennan_2013"/>
     <w:p>
       <w:pPr>
         <w:pStyle w:val="Bibliography"/>
@@ -4471,7 +4525,7 @@
       <w:r>
         <w:t xml:space="preserve"> </w:t>
       </w:r>
-      <w:hyperlink r:id="rId122">
+      <w:hyperlink r:id="rId123">
         <w:r>
           <w:rPr>
             <w:rStyle w:val="Hyperlink"/>
@@ -4483,8 +4537,8 @@
         <w:t xml:space="preserve">.</w:t>
       </w:r>
     </w:p>
-    <w:bookmarkEnd w:id="123"/>
-    <w:bookmarkStart w:id="125" w:name="ref-kandler_shennan_2015"/>
+    <w:bookmarkEnd w:id="124"/>
+    <w:bookmarkStart w:id="126" w:name="ref-kandler_shennan_2015"/>
     <w:p>
       <w:pPr>
         <w:pStyle w:val="Bibliography"/>
@@ -4523,7 +4577,7 @@
       <w:r>
         <w:t xml:space="preserve"> </w:t>
       </w:r>
-      <w:hyperlink r:id="rId124">
+      <w:hyperlink r:id="rId125">
         <w:r>
           <w:rPr>
             <w:rStyle w:val="Hyperlink"/>
@@ -4535,8 +4589,8 @@
         <w:t xml:space="preserve">.</w:t>
       </w:r>
     </w:p>
-    <w:bookmarkEnd w:id="125"/>
-    <w:bookmarkStart w:id="127" w:name="ref-kandler_wilder_fortunato_2017"/>
+    <w:bookmarkEnd w:id="126"/>
+    <w:bookmarkStart w:id="128" w:name="ref-kandler_wilder_fortunato_2017"/>
     <w:p>
       <w:pPr>
         <w:pStyle w:val="Bibliography"/>
@@ -4563,7 +4617,7 @@
       <w:r>
         <w:t xml:space="preserve"> </w:t>
       </w:r>
-      <w:hyperlink r:id="rId126">
+      <w:hyperlink r:id="rId127">
         <w:r>
           <w:rPr>
             <w:rStyle w:val="Hyperlink"/>
@@ -4575,8 +4629,8 @@
         <w:t xml:space="preserve">.</w:t>
       </w:r>
     </w:p>
-    <w:bookmarkEnd w:id="127"/>
-    <w:bookmarkStart w:id="129" w:name="ref-kidwell_tomasovych_2013"/>
+    <w:bookmarkEnd w:id="128"/>
+    <w:bookmarkStart w:id="130" w:name="ref-kidwell_tomasovych_2013"/>
     <w:p>
       <w:pPr>
         <w:pStyle w:val="Bibliography"/>
@@ -4603,7 +4657,7 @@
       <w:r>
         <w:t xml:space="preserve"> </w:t>
       </w:r>
-      <w:hyperlink r:id="rId128">
+      <w:hyperlink r:id="rId129">
         <w:r>
           <w:rPr>
             <w:rStyle w:val="Hyperlink"/>
@@ -4615,8 +4669,8 @@
         <w:t xml:space="preserve">.</w:t>
       </w:r>
     </w:p>
-    <w:bookmarkEnd w:id="129"/>
-    <w:bookmarkStart w:id="130" w:name="ref-king_freer_1995"/>
+    <w:bookmarkEnd w:id="130"/>
+    <w:bookmarkStart w:id="131" w:name="ref-king_freer_1995"/>
     <w:p>
       <w:pPr>
         <w:pStyle w:val="Bibliography"/>
@@ -4650,8 +4704,8 @@
         <w:t xml:space="preserve">, edited by Michael S. Nassaney and Kenneth E. Sassaman, pp. 266–288. University of Tennessee Press, Knoxville.</w:t>
       </w:r>
     </w:p>
-    <w:bookmarkEnd w:id="130"/>
-    <w:bookmarkStart w:id="132" w:name="ref-ladefoged_graves_2000"/>
+    <w:bookmarkEnd w:id="131"/>
+    <w:bookmarkStart w:id="133" w:name="ref-ladefoged_graves_2000"/>
     <w:p>
       <w:pPr>
         <w:pStyle w:val="Bibliography"/>
@@ -4696,7 +4750,7 @@
       <w:r>
         <w:t xml:space="preserve"> </w:t>
       </w:r>
-      <w:hyperlink r:id="rId131">
+      <w:hyperlink r:id="rId132">
         <w:r>
           <w:rPr>
             <w:rStyle w:val="Hyperlink"/>
@@ -4708,8 +4762,8 @@
         <w:t xml:space="preserve">.</w:t>
       </w:r>
     </w:p>
-    <w:bookmarkEnd w:id="132"/>
-    <w:bookmarkStart w:id="133" w:name="ref-lewontin_1974"/>
+    <w:bookmarkEnd w:id="133"/>
+    <w:bookmarkStart w:id="134" w:name="ref-lewontin_1974"/>
     <w:p>
       <w:pPr>
         <w:pStyle w:val="Bibliography"/>
@@ -4731,8 +4785,8 @@
         <w:t xml:space="preserve">. Columbia University Press, New York.</w:t>
       </w:r>
     </w:p>
-    <w:bookmarkEnd w:id="133"/>
-    <w:bookmarkStart w:id="134" w:name="ref-lipo_2001"/>
+    <w:bookmarkEnd w:id="134"/>
+    <w:bookmarkStart w:id="135" w:name="ref-lipo_2001"/>
     <w:p>
       <w:pPr>
         <w:pStyle w:val="Bibliography"/>
@@ -4782,8 +4836,8 @@
         <w:t xml:space="preserve">. BAR International Series 918. Archaeopress, Oxford.</w:t>
       </w:r>
     </w:p>
-    <w:bookmarkEnd w:id="134"/>
-    <w:bookmarkStart w:id="136" w:name="ref-lipo_dinapoli_madsen_hunt_2021"/>
+    <w:bookmarkEnd w:id="135"/>
+    <w:bookmarkStart w:id="137" w:name="ref-lipo_dinapoli_madsen_hunt_2021"/>
     <w:p>
       <w:pPr>
         <w:pStyle w:val="Bibliography"/>
@@ -4810,7 +4864,7 @@
       <w:r>
         <w:t xml:space="preserve"> </w:t>
       </w:r>
-      <w:hyperlink r:id="rId135">
+      <w:hyperlink r:id="rId136">
         <w:r>
           <w:rPr>
             <w:rStyle w:val="Hyperlink"/>
@@ -4822,8 +4876,8 @@
         <w:t xml:space="preserve">.</w:t>
       </w:r>
     </w:p>
-    <w:bookmarkEnd w:id="136"/>
-    <w:bookmarkStart w:id="137" w:name="ref-lipo_dunnell_2007"/>
+    <w:bookmarkEnd w:id="137"/>
+    <w:bookmarkStart w:id="138" w:name="ref-lipo_dunnell_2007"/>
     <w:p>
       <w:pPr>
         <w:pStyle w:val="Bibliography"/>
@@ -4885,8 +4939,8 @@
         <w:t xml:space="preserve">, edited by Janet Rafferty and Evan Peacock, pp. 125–167. University of Alabama Press, Tuscaloosa.</w:t>
       </w:r>
     </w:p>
-    <w:bookmarkEnd w:id="137"/>
-    <w:bookmarkStart w:id="139" w:name="ref-lipo_hunt_hundtoft_2010"/>
+    <w:bookmarkEnd w:id="138"/>
+    <w:bookmarkStart w:id="140" w:name="ref-lipo_hunt_hundtoft_2010"/>
     <w:p>
       <w:pPr>
         <w:pStyle w:val="Bibliography"/>
@@ -4931,7 +4985,7 @@
       <w:r>
         <w:t xml:space="preserve"> </w:t>
       </w:r>
-      <w:hyperlink r:id="rId138">
+      <w:hyperlink r:id="rId139">
         <w:r>
           <w:rPr>
             <w:rStyle w:val="Hyperlink"/>
@@ -4943,8 +4997,8 @@
         <w:t xml:space="preserve">.</w:t>
       </w:r>
     </w:p>
-    <w:bookmarkEnd w:id="139"/>
-    <w:bookmarkStart w:id="141" w:name="ref-lipo_madsen_dunnell_2015"/>
+    <w:bookmarkEnd w:id="140"/>
+    <w:bookmarkStart w:id="142" w:name="ref-lipo_madsen_dunnell_2015"/>
     <w:p>
       <w:pPr>
         <w:pStyle w:val="Bibliography"/>
@@ -4971,7 +5025,7 @@
       <w:r>
         <w:t xml:space="preserve"> </w:t>
       </w:r>
-      <w:hyperlink r:id="rId140">
+      <w:hyperlink r:id="rId141">
         <w:r>
           <w:rPr>
             <w:rStyle w:val="Hyperlink"/>
@@ -4983,8 +5037,8 @@
         <w:t xml:space="preserve">.</w:t>
       </w:r>
     </w:p>
-    <w:bookmarkEnd w:id="141"/>
-    <w:bookmarkStart w:id="143" w:name="ref-lipo_madsen_dunnell_hunt_1997"/>
+    <w:bookmarkEnd w:id="142"/>
+    <w:bookmarkStart w:id="144" w:name="ref-lipo_madsen_dunnell_hunt_1997"/>
     <w:p>
       <w:pPr>
         <w:pStyle w:val="Bibliography"/>
@@ -5011,7 +5065,7 @@
       <w:r>
         <w:t xml:space="preserve"> </w:t>
       </w:r>
-      <w:hyperlink r:id="rId142">
+      <w:hyperlink r:id="rId143">
         <w:r>
           <w:rPr>
             <w:rStyle w:val="Hyperlink"/>
@@ -5023,8 +5077,8 @@
         <w:t xml:space="preserve">.</w:t>
       </w:r>
     </w:p>
-    <w:bookmarkEnd w:id="143"/>
-    <w:bookmarkStart w:id="145" w:name="ref-holland-lulewicz_2019"/>
+    <w:bookmarkEnd w:id="144"/>
+    <w:bookmarkStart w:id="146" w:name="ref-holland-lulewicz_2019"/>
     <w:p>
       <w:pPr>
         <w:pStyle w:val="Bibliography"/>
@@ -5078,7 +5132,7 @@
       <w:r>
         <w:t xml:space="preserve"> </w:t>
       </w:r>
-      <w:hyperlink r:id="rId144">
+      <w:hyperlink r:id="rId145">
         <w:r>
           <w:rPr>
             <w:rStyle w:val="Hyperlink"/>
@@ -5090,8 +5144,8 @@
         <w:t xml:space="preserve">.</w:t>
       </w:r>
     </w:p>
-    <w:bookmarkEnd w:id="145"/>
-    <w:bookmarkStart w:id="146" w:name="ref-madsen_2012"/>
+    <w:bookmarkEnd w:id="146"/>
+    <w:bookmarkStart w:id="147" w:name="ref-madsen_2012"/>
     <w:p>
       <w:pPr>
         <w:pStyle w:val="Bibliography"/>
@@ -5100,8 +5154,8 @@
         <w:t xml:space="preserve">Madsen, Mark E. 2012. Neutral Cultural Transmission in Time-Averaged Archaeological Assemblages. arXiv preprint arXiv:1204.2043 [physics.soc-ph].</w:t>
       </w:r>
     </w:p>
-    <w:bookmarkEnd w:id="146"/>
-    <w:bookmarkStart w:id="147" w:name="ref-mainfort_1996"/>
+    <w:bookmarkEnd w:id="147"/>
+    <w:bookmarkStart w:id="148" w:name="ref-mainfort_1996"/>
     <w:p>
       <w:pPr>
         <w:pStyle w:val="Bibliography"/>
@@ -5150,8 +5204,8 @@
         <w:t xml:space="preserve">15(2):172–181.</w:t>
       </w:r>
     </w:p>
-    <w:bookmarkEnd w:id="147"/>
-    <w:bookmarkStart w:id="148" w:name="ref-mainfort_2001"/>
+    <w:bookmarkEnd w:id="148"/>
+    <w:bookmarkStart w:id="149" w:name="ref-mainfort_2001"/>
     <w:p>
       <w:pPr>
         <w:pStyle w:val="Bibliography"/>
@@ -5185,8 +5239,8 @@
         <w:t xml:space="preserve">, edited by David S. Brose, C. Wesley Cowan, and Jr. Mainfort Robert C., pp. 173–190. Smithsonian Institution Press, Washington, DC.</w:t>
       </w:r>
     </w:p>
-    <w:bookmarkEnd w:id="148"/>
-    <w:bookmarkStart w:id="149" w:name="ref-mainfort_2003"/>
+    <w:bookmarkEnd w:id="149"/>
+    <w:bookmarkStart w:id="150" w:name="ref-mainfort_2003"/>
     <w:p>
       <w:pPr>
         <w:pStyle w:val="Bibliography"/>
@@ -5223,8 +5277,8 @@
         <w:t xml:space="preserve">22(2):176–184.</w:t>
       </w:r>
     </w:p>
-    <w:bookmarkEnd w:id="149"/>
-    <w:bookmarkStart w:id="150" w:name="ref-mantel_1967"/>
+    <w:bookmarkEnd w:id="150"/>
+    <w:bookmarkStart w:id="151" w:name="ref-mantel_1967"/>
     <w:p>
       <w:pPr>
         <w:pStyle w:val="Bibliography"/>
@@ -5249,8 +5303,8 @@
         <w:t xml:space="preserve">27(2):209–220.</w:t>
       </w:r>
     </w:p>
-    <w:bookmarkEnd w:id="150"/>
-    <w:bookmarkStart w:id="151" w:name="ref-mcnutt_ed_1996"/>
+    <w:bookmarkEnd w:id="151"/>
+    <w:bookmarkStart w:id="152" w:name="ref-mcnutt_ed_1996"/>
     <w:p>
       <w:pPr>
         <w:pStyle w:val="Bibliography"/>
@@ -5300,8 +5354,8 @@
         <w:t xml:space="preserve">. University of Alabama Press, Tuscaloosa.</w:t>
       </w:r>
     </w:p>
-    <w:bookmarkEnd w:id="151"/>
-    <w:bookmarkStart w:id="152" w:name="ref-mesoudi_2021"/>
+    <w:bookmarkEnd w:id="152"/>
+    <w:bookmarkStart w:id="153" w:name="ref-mesoudi_2021"/>
     <w:p>
       <w:pPr>
         <w:pStyle w:val="Bibliography"/>
@@ -5326,8 +5380,8 @@
         <w:t xml:space="preserve">376:20200053.</w:t>
       </w:r>
     </w:p>
-    <w:bookmarkEnd w:id="152"/>
-    <w:bookmarkStart w:id="154" w:name="ref-miller_atkins_premo_2018"/>
+    <w:bookmarkEnd w:id="153"/>
+    <w:bookmarkStart w:id="155" w:name="ref-miller_atkins_premo_2018"/>
     <w:p>
       <w:pPr>
         <w:pStyle w:val="Bibliography"/>
@@ -5354,7 +5408,7 @@
       <w:r>
         <w:t xml:space="preserve"> </w:t>
       </w:r>
-      <w:hyperlink r:id="rId153">
+      <w:hyperlink r:id="rId154">
         <w:r>
           <w:rPr>
             <w:rStyle w:val="Hyperlink"/>
@@ -5366,8 +5420,8 @@
         <w:t xml:space="preserve">.</w:t>
       </w:r>
     </w:p>
-    <w:bookmarkEnd w:id="154"/>
-    <w:bookmarkStart w:id="155" w:name="ref-milner_1998"/>
+    <w:bookmarkEnd w:id="155"/>
+    <w:bookmarkStart w:id="156" w:name="ref-milner_1998"/>
     <w:p>
       <w:pPr>
         <w:pStyle w:val="Bibliography"/>
@@ -5445,8 +5499,8 @@
         <w:t xml:space="preserve">. Smithsonian Institution Press, Washington, D.C.</w:t>
       </w:r>
     </w:p>
-    <w:bookmarkEnd w:id="155"/>
-    <w:bookmarkStart w:id="156" w:name="ref-mitchem_2001"/>
+    <w:bookmarkEnd w:id="156"/>
+    <w:bookmarkStart w:id="157" w:name="ref-mitchem_2001"/>
     <w:p>
       <w:pPr>
         <w:pStyle w:val="Bibliography"/>
@@ -5476,8 +5530,8 @@
         <w:t xml:space="preserve">.</w:t>
       </w:r>
     </w:p>
-    <w:bookmarkEnd w:id="156"/>
-    <w:bookmarkStart w:id="157" w:name="ref-morse_morse_1983"/>
+    <w:bookmarkEnd w:id="157"/>
+    <w:bookmarkStart w:id="158" w:name="ref-morse_morse_1983"/>
     <w:p>
       <w:pPr>
         <w:pStyle w:val="Bibliography"/>
@@ -5527,8 +5581,8 @@
         <w:t xml:space="preserve">. Academic Press, New York.</w:t>
       </w:r>
     </w:p>
-    <w:bookmarkEnd w:id="157"/>
-    <w:bookmarkStart w:id="158" w:name="ref-morse_morse_1996"/>
+    <w:bookmarkEnd w:id="158"/>
+    <w:bookmarkStart w:id="159" w:name="ref-morse_morse_1996"/>
     <w:p>
       <w:pPr>
         <w:pStyle w:val="Bibliography"/>
@@ -5565,8 +5619,8 @@
         <w:t xml:space="preserve">17(1):1–35.</w:t>
       </w:r>
     </w:p>
-    <w:bookmarkEnd w:id="158"/>
-    <w:bookmarkStart w:id="159" w:name="ref-morse_1990"/>
+    <w:bookmarkEnd w:id="159"/>
+    <w:bookmarkStart w:id="160" w:name="ref-morse_1990"/>
     <w:p>
       <w:pPr>
         <w:pStyle w:val="Bibliography"/>
@@ -5626,8 +5680,8 @@
         <w:t xml:space="preserve">, edited by David H. Dye and Cheryl Anne Cox, pp. 118–134. University of Alabama Press, Tuscaloosa.</w:t>
       </w:r>
     </w:p>
-    <w:bookmarkEnd w:id="159"/>
-    <w:bookmarkStart w:id="160" w:name="ref-neiman_1995"/>
+    <w:bookmarkEnd w:id="160"/>
+    <w:bookmarkStart w:id="161" w:name="ref-neiman_1995"/>
     <w:p>
       <w:pPr>
         <w:pStyle w:val="Bibliography"/>
@@ -5670,8 +5724,8 @@
         <w:t xml:space="preserve">60(1):7–36.</w:t>
       </w:r>
     </w:p>
-    <w:bookmarkEnd w:id="160"/>
-    <w:bookmarkStart w:id="162" w:name="ref-odwyer_kandler_2017"/>
+    <w:bookmarkEnd w:id="161"/>
+    <w:bookmarkStart w:id="163" w:name="ref-odwyer_kandler_2017"/>
     <w:p>
       <w:pPr>
         <w:pStyle w:val="Bibliography"/>
@@ -5698,7 +5752,7 @@
       <w:r>
         <w:t xml:space="preserve"> </w:t>
       </w:r>
-      <w:hyperlink r:id="rId161">
+      <w:hyperlink r:id="rId162">
         <w:r>
           <w:rPr>
             <w:rStyle w:val="Hyperlink"/>
@@ -5710,8 +5764,8 @@
         <w:t xml:space="preserve">.</w:t>
       </w:r>
     </w:p>
-    <w:bookmarkEnd w:id="162"/>
-    <w:bookmarkStart w:id="164" w:name="ref-peebles_kus_1977"/>
+    <w:bookmarkEnd w:id="163"/>
+    <w:bookmarkStart w:id="165" w:name="ref-peebles_kus_1977"/>
     <w:p>
       <w:pPr>
         <w:pStyle w:val="Bibliography"/>
@@ -5738,7 +5792,7 @@
       <w:r>
         <w:t xml:space="preserve"> </w:t>
       </w:r>
-      <w:hyperlink r:id="rId163">
+      <w:hyperlink r:id="rId164">
         <w:r>
           <w:rPr>
             <w:rStyle w:val="Hyperlink"/>
@@ -5750,8 +5804,8 @@
         <w:t xml:space="preserve">.</w:t>
       </w:r>
     </w:p>
-    <w:bookmarkEnd w:id="164"/>
-    <w:bookmarkStart w:id="166" w:name="ref-peeples_schachner_2012"/>
+    <w:bookmarkEnd w:id="165"/>
+    <w:bookmarkStart w:id="167" w:name="ref-peeples_schachner_2012"/>
     <w:p>
       <w:pPr>
         <w:pStyle w:val="Bibliography"/>
@@ -5778,7 +5832,7 @@
       <w:r>
         <w:t xml:space="preserve"> </w:t>
       </w:r>
-      <w:hyperlink r:id="rId165">
+      <w:hyperlink r:id="rId166">
         <w:r>
           <w:rPr>
             <w:rStyle w:val="Hyperlink"/>
@@ -5790,8 +5844,8 @@
         <w:t xml:space="preserve">.</w:t>
       </w:r>
     </w:p>
-    <w:bookmarkEnd w:id="166"/>
-    <w:bookmarkStart w:id="168" w:name="ref-perreault_2018"/>
+    <w:bookmarkEnd w:id="167"/>
+    <w:bookmarkStart w:id="169" w:name="ref-perreault_2018"/>
     <w:p>
       <w:pPr>
         <w:pStyle w:val="Bibliography"/>
@@ -5818,7 +5872,7 @@
       <w:r>
         <w:t xml:space="preserve"> </w:t>
       </w:r>
-      <w:hyperlink r:id="rId167">
+      <w:hyperlink r:id="rId168">
         <w:r>
           <w:rPr>
             <w:rStyle w:val="Hyperlink"/>
@@ -5830,8 +5884,8 @@
         <w:t xml:space="preserve">.</w:t>
       </w:r>
     </w:p>
-    <w:bookmarkEnd w:id="168"/>
-    <w:bookmarkStart w:id="169" w:name="ref-perreault_2019"/>
+    <w:bookmarkEnd w:id="169"/>
+    <w:bookmarkStart w:id="170" w:name="ref-perreault_2019"/>
     <w:p>
       <w:pPr>
         <w:pStyle w:val="Bibliography"/>
@@ -5853,8 +5907,8 @@
         <w:t xml:space="preserve">. University of Chicago Press, Chicago.</w:t>
       </w:r>
     </w:p>
-    <w:bookmarkEnd w:id="169"/>
-    <w:bookmarkStart w:id="170" w:name="ref-phillips_1970"/>
+    <w:bookmarkEnd w:id="170"/>
+    <w:bookmarkStart w:id="171" w:name="ref-phillips_1970"/>
     <w:p>
       <w:pPr>
         <w:pStyle w:val="Bibliography"/>
@@ -5925,8 +5979,8 @@
         <w:t xml:space="preserve">, Vol. 60. Papers of the Peabody Museum of Archaeology and Ethnology. Peabody Museum, Harvard University, Cambridge, MA.</w:t>
       </w:r>
     </w:p>
-    <w:bookmarkEnd w:id="170"/>
-    <w:bookmarkStart w:id="171" w:name="ref-phillips_ford_griffin_1951"/>
+    <w:bookmarkEnd w:id="171"/>
+    <w:bookmarkStart w:id="172" w:name="ref-phillips_ford_griffin_1951"/>
     <w:p>
       <w:pPr>
         <w:pStyle w:val="Bibliography"/>
@@ -5976,8 +6030,8 @@
         <w:t xml:space="preserve">, Vol. 25. Papers of the Peabody Museum of American Archaeology and Ethnology. Peabody Museum, Harvard University, Cambridge, MA.</w:t>
       </w:r>
     </w:p>
-    <w:bookmarkEnd w:id="171"/>
-    <w:bookmarkStart w:id="173" w:name="ref-phillips_willey_1953"/>
+    <w:bookmarkEnd w:id="172"/>
+    <w:bookmarkStart w:id="174" w:name="ref-phillips_willey_1953"/>
     <w:p>
       <w:pPr>
         <w:pStyle w:val="Bibliography"/>
@@ -6004,7 +6058,7 @@
       <w:r>
         <w:t xml:space="preserve"> </w:t>
       </w:r>
-      <w:hyperlink r:id="rId172">
+      <w:hyperlink r:id="rId173">
         <w:r>
           <w:rPr>
             <w:rStyle w:val="Hyperlink"/>
@@ -6016,8 +6070,8 @@
         <w:t xml:space="preserve">.</w:t>
       </w:r>
     </w:p>
-    <w:bookmarkEnd w:id="173"/>
-    <w:bookmarkStart w:id="175" w:name="ref-powell_shennan_thomas_2009"/>
+    <w:bookmarkEnd w:id="174"/>
+    <w:bookmarkStart w:id="176" w:name="ref-powell_shennan_thomas_2009"/>
     <w:p>
       <w:pPr>
         <w:pStyle w:val="Bibliography"/>
@@ -6056,7 +6110,7 @@
       <w:r>
         <w:t xml:space="preserve"> </w:t>
       </w:r>
-      <w:hyperlink r:id="rId174">
+      <w:hyperlink r:id="rId175">
         <w:r>
           <w:rPr>
             <w:rStyle w:val="Hyperlink"/>
@@ -6068,8 +6122,8 @@
         <w:t xml:space="preserve">.</w:t>
       </w:r>
     </w:p>
-    <w:bookmarkEnd w:id="175"/>
-    <w:bookmarkStart w:id="177" w:name="ref-premo_2014"/>
+    <w:bookmarkEnd w:id="176"/>
+    <w:bookmarkStart w:id="178" w:name="ref-premo_2014"/>
     <w:p>
       <w:pPr>
         <w:pStyle w:val="Bibliography"/>
@@ -6096,7 +6150,7 @@
       <w:r>
         <w:t xml:space="preserve"> </w:t>
       </w:r>
-      <w:hyperlink r:id="rId176">
+      <w:hyperlink r:id="rId177">
         <w:r>
           <w:rPr>
             <w:rStyle w:val="Hyperlink"/>
@@ -6108,8 +6162,8 @@
         <w:t xml:space="preserve">.</w:t>
       </w:r>
     </w:p>
-    <w:bookmarkEnd w:id="177"/>
-    <w:bookmarkStart w:id="178" w:name="ref-rees_political_culture"/>
+    <w:bookmarkEnd w:id="178"/>
+    <w:bookmarkStart w:id="179" w:name="ref-rees_political_culture"/>
     <w:p>
       <w:pPr>
         <w:pStyle w:val="Bibliography"/>
@@ -6133,8 +6187,8 @@
         <w:t xml:space="preserve">. Ph.D. dissertation, University of Oklahoma, Norman.</w:t>
       </w:r>
     </w:p>
-    <w:bookmarkEnd w:id="178"/>
-    <w:bookmarkStart w:id="180" w:name="ref-reimer_etal_2020"/>
+    <w:bookmarkEnd w:id="179"/>
+    <w:bookmarkStart w:id="181" w:name="ref-reimer_etal_2020"/>
     <w:p>
       <w:pPr>
         <w:pStyle w:val="Bibliography"/>
@@ -6188,7 +6242,7 @@
       <w:r>
         <w:t xml:space="preserve"> </w:t>
       </w:r>
-      <w:hyperlink r:id="rId179">
+      <w:hyperlink r:id="rId180">
         <w:r>
           <w:rPr>
             <w:rStyle w:val="Hyperlink"/>
@@ -6200,8 +6254,8 @@
         <w:t xml:space="preserve">.</w:t>
       </w:r>
     </w:p>
-    <w:bookmarkEnd w:id="180"/>
-    <w:bookmarkStart w:id="182" w:name="ref-richerson_etal_2016"/>
+    <w:bookmarkEnd w:id="181"/>
+    <w:bookmarkStart w:id="183" w:name="ref-richerson_etal_2016"/>
     <w:p>
       <w:pPr>
         <w:pStyle w:val="Bibliography"/>
@@ -6228,7 +6282,7 @@
       <w:r>
         <w:t xml:space="preserve"> </w:t>
       </w:r>
-      <w:hyperlink r:id="rId181">
+      <w:hyperlink r:id="rId182">
         <w:r>
           <w:rPr>
             <w:rStyle w:val="Hyperlink"/>
@@ -6240,8 +6294,8 @@
         <w:t xml:space="preserve">.</w:t>
       </w:r>
     </w:p>
-    <w:bookmarkEnd w:id="182"/>
-    <w:bookmarkStart w:id="184" w:name="ref-riede_hoggard_shennan_2019"/>
+    <w:bookmarkEnd w:id="183"/>
+    <w:bookmarkStart w:id="185" w:name="ref-riede_hoggard_shennan_2019"/>
     <w:p>
       <w:pPr>
         <w:pStyle w:val="Bibliography"/>
@@ -6268,7 +6322,7 @@
       <w:r>
         <w:t xml:space="preserve"> </w:t>
       </w:r>
-      <w:hyperlink r:id="rId183">
+      <w:hyperlink r:id="rId184">
         <w:r>
           <w:rPr>
             <w:rStyle w:val="Hyperlink"/>
@@ -6280,8 +6334,8 @@
         <w:t xml:space="preserve">.</w:t>
       </w:r>
     </w:p>
-    <w:bookmarkEnd w:id="184"/>
-    <w:bookmarkStart w:id="185" w:name="ref-robinson_1951"/>
+    <w:bookmarkEnd w:id="185"/>
+    <w:bookmarkStart w:id="186" w:name="ref-robinson_1951"/>
     <w:p>
       <w:pPr>
         <w:pStyle w:val="Bibliography"/>
@@ -6306,8 +6360,8 @@
         <w:t xml:space="preserve">16(4):293–301.</w:t>
       </w:r>
     </w:p>
-    <w:bookmarkEnd w:id="185"/>
-    <w:bookmarkStart w:id="186" w:name="ref-ross-stallings_2017"/>
+    <w:bookmarkEnd w:id="186"/>
+    <w:bookmarkStart w:id="187" w:name="ref-ross-stallings_2017"/>
     <w:p>
       <w:pPr>
         <w:pStyle w:val="Bibliography"/>
@@ -6341,8 +6395,8 @@
         <w:t xml:space="preserve">, edited by Haagen D. Klaus, Amanda R. Harvey, and Mark N. Cohen, pp. 329–362. University Press of Florida, Gainesville.</w:t>
       </w:r>
     </w:p>
-    <w:bookmarkEnd w:id="186"/>
-    <w:bookmarkStart w:id="188" w:name="ref-scheffer_2009"/>
+    <w:bookmarkEnd w:id="187"/>
+    <w:bookmarkStart w:id="189" w:name="ref-scheffer_2009"/>
     <w:p>
       <w:pPr>
         <w:pStyle w:val="Bibliography"/>
@@ -6369,7 +6423,7 @@
       <w:r>
         <w:t xml:space="preserve"> </w:t>
       </w:r>
-      <w:hyperlink r:id="rId187">
+      <w:hyperlink r:id="rId188">
         <w:r>
           <w:rPr>
             <w:rStyle w:val="Hyperlink"/>
@@ -6381,8 +6435,8 @@
         <w:t xml:space="preserve">.</w:t>
       </w:r>
     </w:p>
-    <w:bookmarkEnd w:id="188"/>
-    <w:bookmarkStart w:id="189" w:name="ref-schiffer_1972"/>
+    <w:bookmarkEnd w:id="189"/>
+    <w:bookmarkStart w:id="190" w:name="ref-schiffer_1972"/>
     <w:p>
       <w:pPr>
         <w:pStyle w:val="Bibliography"/>
@@ -6407,8 +6461,8 @@
         <w:t xml:space="preserve">37(2):156–165.</w:t>
       </w:r>
     </w:p>
-    <w:bookmarkEnd w:id="189"/>
-    <w:bookmarkStart w:id="191" w:name="ref-shennan_crema_kerig_2015"/>
+    <w:bookmarkEnd w:id="190"/>
+    <w:bookmarkStart w:id="192" w:name="ref-shennan_crema_kerig_2015"/>
     <w:p>
       <w:pPr>
         <w:pStyle w:val="Bibliography"/>
@@ -6474,7 +6528,7 @@
       <w:r>
         <w:t xml:space="preserve"> </w:t>
       </w:r>
-      <w:hyperlink r:id="rId190">
+      <w:hyperlink r:id="rId191">
         <w:r>
           <w:rPr>
             <w:rStyle w:val="Hyperlink"/>
@@ -6486,8 +6540,8 @@
         <w:t xml:space="preserve">.</w:t>
       </w:r>
     </w:p>
-    <w:bookmarkEnd w:id="191"/>
-    <w:bookmarkStart w:id="192" w:name="ref-shennan_wilkinson_2001"/>
+    <w:bookmarkEnd w:id="192"/>
+    <w:bookmarkStart w:id="193" w:name="ref-shennan_wilkinson_2001"/>
     <w:p>
       <w:pPr>
         <w:pStyle w:val="Bibliography"/>
@@ -6527,8 +6581,8 @@
         <w:t xml:space="preserve">66(4):577–593.</w:t>
       </w:r>
     </w:p>
-    <w:bookmarkEnd w:id="192"/>
-    <w:bookmarkStart w:id="193" w:name="ref-smith_neiman_2007"/>
+    <w:bookmarkEnd w:id="193"/>
+    <w:bookmarkStart w:id="194" w:name="ref-smith_neiman_2007"/>
     <w:p>
       <w:pPr>
         <w:pStyle w:val="Bibliography"/>
@@ -6553,8 +6607,8 @@
         <w:t xml:space="preserve">26(1):47–72.</w:t>
       </w:r>
     </w:p>
-    <w:bookmarkEnd w:id="193"/>
-    <w:bookmarkStart w:id="195" w:name="ref-stern_1994"/>
+    <w:bookmarkEnd w:id="194"/>
+    <w:bookmarkStart w:id="196" w:name="ref-stern_1994"/>
     <w:p>
       <w:pPr>
         <w:pStyle w:val="Bibliography"/>
@@ -6581,7 +6635,7 @@
       <w:r>
         <w:t xml:space="preserve"> </w:t>
       </w:r>
-      <w:hyperlink r:id="rId194">
+      <w:hyperlink r:id="rId195">
         <w:r>
           <w:rPr>
             <w:rStyle w:val="Hyperlink"/>
@@ -6593,8 +6647,8 @@
         <w:t xml:space="preserve">.</w:t>
       </w:r>
     </w:p>
-    <w:bookmarkEnd w:id="195"/>
-    <w:bookmarkStart w:id="197" w:name="ref-sullivan_2024"/>
+    <w:bookmarkEnd w:id="196"/>
+    <w:bookmarkStart w:id="198" w:name="ref-sullivan_2024"/>
     <w:p>
       <w:pPr>
         <w:pStyle w:val="Bibliography"/>
@@ -6645,7 +6699,7 @@
       <w:r>
         <w:t xml:space="preserve"> </w:t>
       </w:r>
-      <w:hyperlink r:id="rId196">
+      <w:hyperlink r:id="rId197">
         <w:r>
           <w:rPr>
             <w:rStyle w:val="Hyperlink"/>
@@ -6657,8 +6711,8 @@
         <w:t xml:space="preserve">.</w:t>
       </w:r>
     </w:p>
-    <w:bookmarkEnd w:id="197"/>
-    <w:bookmarkStart w:id="198" w:name="ref-tomasovych_kidwell_2009"/>
+    <w:bookmarkEnd w:id="198"/>
+    <w:bookmarkStart w:id="199" w:name="ref-tomasovych_kidwell_2009"/>
     <w:p>
       <w:pPr>
         <w:pStyle w:val="Bibliography"/>
@@ -6683,8 +6737,8 @@
         <w:t xml:space="preserve">35(1):94–118.</w:t>
       </w:r>
     </w:p>
-    <w:bookmarkEnd w:id="198"/>
-    <w:bookmarkStart w:id="200" w:name="ref-tomasovych_kidwell_2010"/>
+    <w:bookmarkEnd w:id="199"/>
+    <w:bookmarkStart w:id="201" w:name="ref-tomasovych_kidwell_2010"/>
     <w:p>
       <w:pPr>
         <w:pStyle w:val="Bibliography"/>
@@ -6711,7 +6765,7 @@
       <w:r>
         <w:t xml:space="preserve"> </w:t>
       </w:r>
-      <w:hyperlink r:id="rId199">
+      <w:hyperlink r:id="rId200">
         <w:r>
           <w:rPr>
             <w:rStyle w:val="Hyperlink"/>
@@ -6723,8 +6777,8 @@
         <w:t xml:space="preserve">.</w:t>
       </w:r>
     </w:p>
-    <w:bookmarkEnd w:id="200"/>
-    <w:bookmarkStart w:id="201" w:name="ref-willey_phillips_1958"/>
+    <w:bookmarkEnd w:id="201"/>
+    <w:bookmarkStart w:id="202" w:name="ref-willey_phillips_1958"/>
     <w:p>
       <w:pPr>
         <w:pStyle w:val="Bibliography"/>
@@ -6746,8 +6800,8 @@
         <w:t xml:space="preserve">. University of Chicago Press, Chicago.</w:t>
       </w:r>
     </w:p>
-    <w:bookmarkEnd w:id="201"/>
-    <w:bookmarkStart w:id="202" w:name="ref-williams_1954"/>
+    <w:bookmarkEnd w:id="202"/>
+    <w:bookmarkStart w:id="203" w:name="ref-williams_1954"/>
     <w:p>
       <w:pPr>
         <w:pStyle w:val="Bibliography"/>
@@ -6756,8 +6810,8 @@
         <w:t xml:space="preserve">Williams, Stephen. 1954. An Archeological Study of the Mississippian Culture in Southeast Missouri. PhD thesis, Yale University, New Haven.</w:t>
       </w:r>
     </w:p>
-    <w:bookmarkEnd w:id="202"/>
-    <w:bookmarkStart w:id="203" w:name="ref-williams_1990"/>
+    <w:bookmarkEnd w:id="203"/>
+    <w:bookmarkStart w:id="204" w:name="ref-williams_1990"/>
     <w:p>
       <w:pPr>
         <w:pStyle w:val="Bibliography"/>
@@ -6793,8 +6847,8 @@
         <w:t xml:space="preserve">, edited by David H. Dye and Cheryl Anne Cox, pp. 170–180. University of Alabama Press, Tuscaloosa.</w:t>
       </w:r>
     </w:p>
-    <w:bookmarkEnd w:id="203"/>
-    <w:bookmarkStart w:id="205" w:name="ref-wright_1943"/>
+    <w:bookmarkEnd w:id="204"/>
+    <w:bookmarkStart w:id="206" w:name="ref-wright_1943"/>
     <w:p>
       <w:pPr>
         <w:pStyle w:val="Bibliography"/>
@@ -6821,7 +6875,7 @@
       <w:r>
         <w:t xml:space="preserve"> </w:t>
       </w:r>
-      <w:hyperlink r:id="rId204">
+      <w:hyperlink r:id="rId205">
         <w:r>
           <w:rPr>
             <w:rStyle w:val="Hyperlink"/>
@@ -6833,8 +6887,8 @@
         <w:t xml:space="preserve">.</w:t>
       </w:r>
     </w:p>
-    <w:bookmarkEnd w:id="205"/>
-    <w:bookmarkStart w:id="207" w:name="ref-wright_1951"/>
+    <w:bookmarkEnd w:id="206"/>
+    <w:bookmarkStart w:id="208" w:name="ref-wright_1951"/>
     <w:p>
       <w:pPr>
         <w:pStyle w:val="Bibliography"/>
@@ -6861,7 +6915,7 @@
       <w:r>
         <w:t xml:space="preserve"> </w:t>
       </w:r>
-      <w:hyperlink r:id="rId206">
+      <w:hyperlink r:id="rId207">
         <w:r>
           <w:rPr>
             <w:rStyle w:val="Hyperlink"/>
@@ -6873,8 +6927,8 @@
         <w:t xml:space="preserve">.</w:t>
       </w:r>
     </w:p>
-    <w:bookmarkEnd w:id="207"/>
-    <w:bookmarkStart w:id="209" w:name="ref-youngblood_miton_morin_2023"/>
+    <w:bookmarkEnd w:id="208"/>
+    <w:bookmarkStart w:id="210" w:name="ref-youngblood_miton_morin_2023"/>
     <w:p>
       <w:pPr>
         <w:pStyle w:val="Bibliography"/>
@@ -6901,7 +6955,7 @@
       <w:r>
         <w:t xml:space="preserve"> </w:t>
       </w:r>
-      <w:hyperlink r:id="rId208">
+      <w:hyperlink r:id="rId209">
         <w:r>
           <w:rPr>
             <w:rStyle w:val="Hyperlink"/>
@@ -6913,10 +6967,10 @@
         <w:t xml:space="preserve">.</w:t>
       </w:r>
     </w:p>
-    <w:bookmarkEnd w:id="209"/>
     <w:bookmarkEnd w:id="210"/>
     <w:bookmarkEnd w:id="211"/>
     <w:bookmarkEnd w:id="212"/>
+    <w:bookmarkEnd w:id="213"/>
     <w:sectPr>
       <w:footnotePr>
         <w:numRestart w:val="eachSect"/>

</xml_diff>

<commit_message>
Add IntCal20 curve (fixes radiocarbon-script reproducibility); cite Lyman 2021 and Cobb et al. 2024
</commit_message>
<xml_diff>
--- a/docs/manuscript/MAIN_TEXT.docx
+++ b/docs/manuscript/MAIN_TEXT.docx
@@ -2,7 +2,7 @@
 <file path=word/document.xml><?xml version="1.0" encoding="utf-8"?>
 <w:document xmlns:w="http://schemas.openxmlformats.org/wordprocessingml/2006/main" xmlns:m="http://schemas.openxmlformats.org/officeDocument/2006/math" xmlns:r="http://schemas.openxmlformats.org/officeDocument/2006/relationships" xmlns:o="urn:schemas-microsoft-com:office:office" xmlns:v="urn:schemas-microsoft-com:vml" xmlns:w10="urn:schemas-microsoft-com:office:word" xmlns:a="http://schemas.openxmlformats.org/drawingml/2006/main" xmlns:pic="http://schemas.openxmlformats.org/drawingml/2006/picture" xmlns:wp="http://schemas.openxmlformats.org/drawingml/2006/wordprocessingDrawing">
   <w:body>
-    <w:bookmarkStart w:id="213" w:name="X093902eb68652ea32f5548e74607f4e4b0f6699"/>
+    <w:bookmarkStart w:id="217" w:name="X093902eb68652ea32f5548e74607f4e4b0f6699"/>
     <w:p>
       <w:pPr>
         <w:pStyle w:val="Heading1"/>
@@ -191,7 +191,19 @@
         <w:pStyle w:val="BodyText"/>
       </w:pPr>
       <w:r>
-        <w:t xml:space="preserve">The more revealing question is why Parkin was taken for a polity in the first place. The answer is in the unit through which the record is read. The Parkin phase is a culture-history construct, a set of assemblages grouped because their decorated-type frequencies seriate together and because the sites cluster in space</w:t>
+        <w:t xml:space="preserve">The more revealing question is why Parkin was taken for a polity in the first place. The answer is in the unit through which the record is read, a matter the renewed debate over archaeological systematics has brought back into focus</w:t>
+      </w:r>
+      <w:r>
+        <w:t xml:space="preserve"> </w:t>
+      </w:r>
+      <w:r>
+        <w:t xml:space="preserve">(Lyman 2021)</w:t>
+      </w:r>
+      <w:r>
+        <w:t xml:space="preserve"> </w:t>
+      </w:r>
+      <w:r>
+        <w:t xml:space="preserve">[CITE-CHECK: lyman_2021]. The Parkin phase is a culture-history construct, a set of assemblages grouped because their decorated-type frequencies seriate together and because the sites cluster in space</w:t>
       </w:r>
       <w:r>
         <w:t xml:space="preserve"> </w:t>
@@ -677,7 +689,7 @@
         <w:t xml:space="preserve"> </w:t>
       </w:r>
       <w:r>
-        <w:t xml:space="preserve">(Cobb and Butler 2002)</w:t>
+        <w:t xml:space="preserve">(Cobb et al. 2024; Cobb and Butler 2002)</w:t>
       </w:r>
       <w:r>
         <w:t xml:space="preserve">. The second reading holds that the central valley was a stable, non-consolidated landscape of competing peer polities that never reorganized into a regional hierarchy</w:t>
@@ -2789,7 +2801,7 @@
       </w:r>
     </w:p>
     <w:bookmarkEnd w:id="52"/>
-    <w:bookmarkStart w:id="212" w:name="references"/>
+    <w:bookmarkStart w:id="216" w:name="references"/>
     <w:p>
       <w:pPr>
         <w:pStyle w:val="Heading2"/>
@@ -2798,7 +2810,7 @@
         <w:t xml:space="preserve">References</w:t>
       </w:r>
     </w:p>
-    <w:bookmarkStart w:id="211" w:name="refs"/>
+    <w:bookmarkStart w:id="215" w:name="refs"/>
     <w:bookmarkStart w:id="53" w:name="ref-anderson_1996"/>
     <w:p>
       <w:pPr>
@@ -3421,7 +3433,68 @@
       </w:r>
     </w:p>
     <w:bookmarkEnd w:id="76"/>
-    <w:bookmarkStart w:id="78" w:name="ref-coco_iovita_2020"/>
+    <w:bookmarkStart w:id="78" w:name="ref-cobb_etal_2024"/>
+    <w:p>
+      <w:pPr>
+        <w:pStyle w:val="Bibliography"/>
+      </w:pPr>
+      <w:r>
+        <w:t xml:space="preserve">Cobb, Charles R., Anthony M. Krus, Aaron Deter-Wolf, Kevin E. Smith, Edmond A. Boudreaux, and Brad R. Lieb. 2024. The Beginning of the End: Abandonment Micro-Histories in the</w:t>
+      </w:r>
+      <w:r>
+        <w:t xml:space="preserve"> </w:t>
+      </w:r>
+      <w:r>
+        <w:t xml:space="preserve">Mississippian</w:t>
+      </w:r>
+      <w:r>
+        <w:t xml:space="preserve"> </w:t>
+      </w:r>
+      <w:r>
+        <w:t xml:space="preserve">Vacant</w:t>
+      </w:r>
+      <w:r>
+        <w:t xml:space="preserve"> </w:t>
+      </w:r>
+      <w:r>
+        <w:t xml:space="preserve">Quarter</w:t>
+      </w:r>
+      <w:r>
+        <w:t xml:space="preserve">.</w:t>
+      </w:r>
+      <w:r>
+        <w:t xml:space="preserve"> </w:t>
+      </w:r>
+      <w:r>
+        <w:rPr>
+          <w:i/>
+          <w:iCs/>
+        </w:rPr>
+        <w:t xml:space="preserve">Journal of Archaeological Method and Theory</w:t>
+      </w:r>
+      <w:r>
+        <w:t xml:space="preserve"> </w:t>
+      </w:r>
+      <w:r>
+        <w:t xml:space="preserve">31:619–643.</w:t>
+      </w:r>
+      <w:r>
+        <w:t xml:space="preserve"> </w:t>
+      </w:r>
+      <w:hyperlink r:id="rId77">
+        <w:r>
+          <w:rPr>
+            <w:rStyle w:val="Hyperlink"/>
+          </w:rPr>
+          <w:t xml:space="preserve">https://doi.org/10.1007/s10816-023-09613-w</w:t>
+        </w:r>
+      </w:hyperlink>
+      <w:r>
+        <w:t xml:space="preserve">.</w:t>
+      </w:r>
+    </w:p>
+    <w:bookmarkEnd w:id="78"/>
+    <w:bookmarkStart w:id="80" w:name="ref-coco_iovita_2020"/>
     <w:p>
       <w:pPr>
         <w:pStyle w:val="Bibliography"/>
@@ -3448,7 +3521,7 @@
       <w:r>
         <w:t xml:space="preserve"> </w:t>
       </w:r>
-      <w:hyperlink r:id="rId77">
+      <w:hyperlink r:id="rId79">
         <w:r>
           <w:rPr>
             <w:rStyle w:val="Hyperlink"/>
@@ -3460,8 +3533,8 @@
         <w:t xml:space="preserve">.</w:t>
       </w:r>
     </w:p>
-    <w:bookmarkEnd w:id="78"/>
-    <w:bookmarkStart w:id="80" w:name="ref-crema_bortolini_lake_2023"/>
+    <w:bookmarkEnd w:id="80"/>
+    <w:bookmarkStart w:id="82" w:name="ref-crema_bortolini_lake_2023"/>
     <w:p>
       <w:pPr>
         <w:pStyle w:val="Bibliography"/>
@@ -3488,7 +3561,7 @@
       <w:r>
         <w:t xml:space="preserve"> </w:t>
       </w:r>
-      <w:hyperlink r:id="rId79">
+      <w:hyperlink r:id="rId81">
         <w:r>
           <w:rPr>
             <w:rStyle w:val="Hyperlink"/>
@@ -3500,8 +3573,8 @@
         <w:t xml:space="preserve">.</w:t>
       </w:r>
     </w:p>
-    <w:bookmarkEnd w:id="80"/>
-    <w:bookmarkStart w:id="82" w:name="ref-crema_edinborough_kerig_shennan_2014"/>
+    <w:bookmarkEnd w:id="82"/>
+    <w:bookmarkStart w:id="84" w:name="ref-crema_edinborough_kerig_shennan_2014"/>
     <w:p>
       <w:pPr>
         <w:pStyle w:val="Bibliography"/>
@@ -3540,7 +3613,7 @@
       <w:r>
         <w:t xml:space="preserve"> </w:t>
       </w:r>
-      <w:hyperlink r:id="rId81">
+      <w:hyperlink r:id="rId83">
         <w:r>
           <w:rPr>
             <w:rStyle w:val="Hyperlink"/>
@@ -3552,8 +3625,8 @@
         <w:t xml:space="preserve">.</w:t>
       </w:r>
     </w:p>
-    <w:bookmarkEnd w:id="82"/>
-    <w:bookmarkStart w:id="84" w:name="ref-crema_kandler_shennan_2016"/>
+    <w:bookmarkEnd w:id="84"/>
+    <w:bookmarkStart w:id="86" w:name="ref-crema_kandler_shennan_2016"/>
     <w:p>
       <w:pPr>
         <w:pStyle w:val="Bibliography"/>
@@ -3580,7 +3653,7 @@
       <w:r>
         <w:t xml:space="preserve"> </w:t>
       </w:r>
-      <w:hyperlink r:id="rId83">
+      <w:hyperlink r:id="rId85">
         <w:r>
           <w:rPr>
             <w:rStyle w:val="Hyperlink"/>
@@ -3592,8 +3665,8 @@
         <w:t xml:space="preserve">.</w:t>
       </w:r>
     </w:p>
-    <w:bookmarkEnd w:id="84"/>
-    <w:bookmarkStart w:id="86" w:name="ref-dakos_2012"/>
+    <w:bookmarkEnd w:id="86"/>
+    <w:bookmarkStart w:id="88" w:name="ref-dakos_2012"/>
     <w:p>
       <w:pPr>
         <w:pStyle w:val="Bibliography"/>
@@ -3620,7 +3693,7 @@
       <w:r>
         <w:t xml:space="preserve"> </w:t>
       </w:r>
-      <w:hyperlink r:id="rId85">
+      <w:hyperlink r:id="rId87">
         <w:r>
           <w:rPr>
             <w:rStyle w:val="Hyperlink"/>
@@ -3632,8 +3705,8 @@
         <w:t xml:space="preserve">.</w:t>
       </w:r>
     </w:p>
-    <w:bookmarkEnd w:id="86"/>
-    <w:bookmarkStart w:id="88" w:name="ref-dunnell_1970"/>
+    <w:bookmarkEnd w:id="88"/>
+    <w:bookmarkStart w:id="90" w:name="ref-dunnell_1970"/>
     <w:p>
       <w:pPr>
         <w:pStyle w:val="Bibliography"/>
@@ -3660,7 +3733,7 @@
       <w:r>
         <w:t xml:space="preserve"> </w:t>
       </w:r>
-      <w:hyperlink r:id="rId87">
+      <w:hyperlink r:id="rId89">
         <w:r>
           <w:rPr>
             <w:rStyle w:val="Hyperlink"/>
@@ -3672,8 +3745,8 @@
         <w:t xml:space="preserve">.</w:t>
       </w:r>
     </w:p>
-    <w:bookmarkEnd w:id="88"/>
-    <w:bookmarkStart w:id="90" w:name="ref-dunnell_1978"/>
+    <w:bookmarkEnd w:id="90"/>
+    <w:bookmarkStart w:id="92" w:name="ref-dunnell_1978"/>
     <w:p>
       <w:pPr>
         <w:pStyle w:val="Bibliography"/>
@@ -3700,7 +3773,7 @@
       <w:r>
         <w:t xml:space="preserve"> </w:t>
       </w:r>
-      <w:hyperlink r:id="rId89">
+      <w:hyperlink r:id="rId91">
         <w:r>
           <w:rPr>
             <w:rStyle w:val="Hyperlink"/>
@@ -3712,8 +3785,8 @@
         <w:t xml:space="preserve">.</w:t>
       </w:r>
     </w:p>
-    <w:bookmarkEnd w:id="90"/>
-    <w:bookmarkStart w:id="91" w:name="ref-dunnell_1980"/>
+    <w:bookmarkEnd w:id="92"/>
+    <w:bookmarkStart w:id="93" w:name="ref-dunnell_1980"/>
     <w:p>
       <w:pPr>
         <w:pStyle w:val="Bibliography"/>
@@ -3735,8 +3808,8 @@
         <w:t xml:space="preserve">, edited by Michael B. Schiffer, pp. 35–99. Academic Press, New York.</w:t>
       </w:r>
     </w:p>
-    <w:bookmarkEnd w:id="91"/>
-    <w:bookmarkStart w:id="92" w:name="ref-dunnell_1995"/>
+    <w:bookmarkEnd w:id="93"/>
+    <w:bookmarkStart w:id="94" w:name="ref-dunnell_1995"/>
     <w:p>
       <w:pPr>
         <w:pStyle w:val="Bibliography"/>
@@ -3758,8 +3831,8 @@
         <w:t xml:space="preserve">, edited by Patrice A. Teltser, pp. 33–50. University of Arizona Press, Tucson.</w:t>
       </w:r>
     </w:p>
-    <w:bookmarkEnd w:id="92"/>
-    <w:bookmarkStart w:id="93" w:name="ref-dye_cox_1990"/>
+    <w:bookmarkEnd w:id="94"/>
+    <w:bookmarkStart w:id="95" w:name="ref-dye_cox_1990"/>
     <w:p>
       <w:pPr>
         <w:pStyle w:val="Bibliography"/>
@@ -3795,8 +3868,8 @@
         <w:t xml:space="preserve">. University of Alabama Press, Tuscaloosa.</w:t>
       </w:r>
     </w:p>
-    <w:bookmarkEnd w:id="93"/>
-    <w:bookmarkStart w:id="95" w:name="ref-eerkens_lipo_2005"/>
+    <w:bookmarkEnd w:id="95"/>
+    <w:bookmarkStart w:id="97" w:name="ref-eerkens_lipo_2005"/>
     <w:p>
       <w:pPr>
         <w:pStyle w:val="Bibliography"/>
@@ -3823,7 +3896,7 @@
       <w:r>
         <w:t xml:space="preserve"> </w:t>
       </w:r>
-      <w:hyperlink r:id="rId94">
+      <w:hyperlink r:id="rId96">
         <w:r>
           <w:rPr>
             <w:rStyle w:val="Hyperlink"/>
@@ -3835,8 +3908,8 @@
         <w:t xml:space="preserve">.</w:t>
       </w:r>
     </w:p>
-    <w:bookmarkEnd w:id="95"/>
-    <w:bookmarkStart w:id="97" w:name="ref-eerkens_lipo_2007"/>
+    <w:bookmarkEnd w:id="97"/>
+    <w:bookmarkStart w:id="99" w:name="ref-eerkens_lipo_2007"/>
     <w:p>
       <w:pPr>
         <w:pStyle w:val="Bibliography"/>
@@ -3863,7 +3936,7 @@
       <w:r>
         <w:t xml:space="preserve"> </w:t>
       </w:r>
-      <w:hyperlink r:id="rId96">
+      <w:hyperlink r:id="rId98">
         <w:r>
           <w:rPr>
             <w:rStyle w:val="Hyperlink"/>
@@ -3875,8 +3948,8 @@
         <w:t xml:space="preserve">.</w:t>
       </w:r>
     </w:p>
-    <w:bookmarkEnd w:id="97"/>
-    <w:bookmarkStart w:id="98" w:name="ref-ewens_1972"/>
+    <w:bookmarkEnd w:id="99"/>
+    <w:bookmarkStart w:id="100" w:name="ref-ewens_1972"/>
     <w:p>
       <w:pPr>
         <w:pStyle w:val="Bibliography"/>
@@ -3901,8 +3974,8 @@
         <w:t xml:space="preserve">3(1):87–112.</w:t>
       </w:r>
     </w:p>
-    <w:bookmarkEnd w:id="98"/>
-    <w:bookmarkStart w:id="100" w:name="ref-feder_kryazhimskiy_plotkin_2014"/>
+    <w:bookmarkEnd w:id="100"/>
+    <w:bookmarkStart w:id="102" w:name="ref-feder_kryazhimskiy_plotkin_2014"/>
     <w:p>
       <w:pPr>
         <w:pStyle w:val="Bibliography"/>
@@ -3929,7 +4002,7 @@
       <w:r>
         <w:t xml:space="preserve"> </w:t>
       </w:r>
-      <w:hyperlink r:id="rId99">
+      <w:hyperlink r:id="rId101">
         <w:r>
           <w:rPr>
             <w:rStyle w:val="Hyperlink"/>
@@ -3941,8 +4014,8 @@
         <w:t xml:space="preserve">.</w:t>
       </w:r>
     </w:p>
-    <w:bookmarkEnd w:id="100"/>
-    <w:bookmarkStart w:id="102" w:name="ref-fogarty_kandler_creanza_2024"/>
+    <w:bookmarkEnd w:id="102"/>
+    <w:bookmarkStart w:id="104" w:name="ref-fogarty_kandler_creanza_2024"/>
     <w:p>
       <w:pPr>
         <w:pStyle w:val="Bibliography"/>
@@ -3969,7 +4042,7 @@
       <w:r>
         <w:t xml:space="preserve"> </w:t>
       </w:r>
-      <w:hyperlink r:id="rId101">
+      <w:hyperlink r:id="rId103">
         <w:r>
           <w:rPr>
             <w:rStyle w:val="Hyperlink"/>
@@ -3981,8 +4054,8 @@
         <w:t xml:space="preserve">.</w:t>
       </w:r>
     </w:p>
-    <w:bookmarkEnd w:id="102"/>
-    <w:bookmarkStart w:id="103" w:name="ref-fox_1998"/>
+    <w:bookmarkEnd w:id="104"/>
+    <w:bookmarkStart w:id="105" w:name="ref-fox_1998"/>
     <w:p>
       <w:pPr>
         <w:pStyle w:val="Bibliography"/>
@@ -4004,8 +4077,8 @@
         <w:t xml:space="preserve">, edited by Michael J. O’Brien and Robert C. Dunnell, pp. 31–58. University of Alabama Press, Tuscaloosa.</w:t>
       </w:r>
     </w:p>
-    <w:bookmarkEnd w:id="103"/>
-    <w:bookmarkStart w:id="104" w:name="ref-graves_cachola-abad_1996"/>
+    <w:bookmarkEnd w:id="105"/>
+    <w:bookmarkStart w:id="106" w:name="ref-graves_cachola-abad_1996"/>
     <w:p>
       <w:pPr>
         <w:pStyle w:val="Bibliography"/>
@@ -4039,8 +4112,8 @@
         <w:t xml:space="preserve">31(1):19–32.</w:t>
       </w:r>
     </w:p>
-    <w:bookmarkEnd w:id="104"/>
-    <w:bookmarkStart w:id="105" w:name="ref-hally_1993"/>
+    <w:bookmarkEnd w:id="106"/>
+    <w:bookmarkStart w:id="107" w:name="ref-hally_1993"/>
     <w:p>
       <w:pPr>
         <w:pStyle w:val="Bibliography"/>
@@ -4074,8 +4147,8 @@
         <w:t xml:space="preserve">, edited by James B. Stoltman, pp. 143–167. Archaeological Report No. 25. Mississippi Department of Archives; History, Jackson.</w:t>
       </w:r>
     </w:p>
-    <w:bookmarkEnd w:id="105"/>
-    <w:bookmarkStart w:id="106" w:name="ref-hally_1996"/>
+    <w:bookmarkEnd w:id="107"/>
+    <w:bookmarkStart w:id="108" w:name="ref-hally_1996"/>
     <w:p>
       <w:pPr>
         <w:pStyle w:val="Bibliography"/>
@@ -4109,8 +4182,8 @@
         <w:t xml:space="preserve">, edited by John F. Scarry, pp. 92–127. University Press of Florida, Gainesville.</w:t>
       </w:r>
     </w:p>
-    <w:bookmarkEnd w:id="106"/>
-    <w:bookmarkStart w:id="108" w:name="ref-henrich_2001"/>
+    <w:bookmarkEnd w:id="108"/>
+    <w:bookmarkStart w:id="110" w:name="ref-henrich_2001"/>
     <w:p>
       <w:pPr>
         <w:pStyle w:val="Bibliography"/>
@@ -4137,7 +4210,7 @@
       <w:r>
         <w:t xml:space="preserve"> </w:t>
       </w:r>
-      <w:hyperlink r:id="rId107">
+      <w:hyperlink r:id="rId109">
         <w:r>
           <w:rPr>
             <w:rStyle w:val="Hyperlink"/>
@@ -4149,8 +4222,8 @@
         <w:t xml:space="preserve">.</w:t>
       </w:r>
     </w:p>
-    <w:bookmarkEnd w:id="108"/>
-    <w:bookmarkStart w:id="110" w:name="ref-henrich_2004"/>
+    <w:bookmarkEnd w:id="110"/>
+    <w:bookmarkStart w:id="112" w:name="ref-henrich_2004"/>
     <w:p>
       <w:pPr>
         <w:pStyle w:val="Bibliography"/>
@@ -4189,7 +4262,7 @@
       <w:r>
         <w:t xml:space="preserve"> </w:t>
       </w:r>
-      <w:hyperlink r:id="rId109">
+      <w:hyperlink r:id="rId111">
         <w:r>
           <w:rPr>
             <w:rStyle w:val="Hyperlink"/>
@@ -4201,8 +4274,8 @@
         <w:t xml:space="preserve">.</w:t>
       </w:r>
     </w:p>
-    <w:bookmarkEnd w:id="110"/>
-    <w:bookmarkStart w:id="112" w:name="ref-henrich_boyd_1998"/>
+    <w:bookmarkEnd w:id="112"/>
+    <w:bookmarkStart w:id="114" w:name="ref-henrich_boyd_1998"/>
     <w:p>
       <w:pPr>
         <w:pStyle w:val="Bibliography"/>
@@ -4229,7 +4302,7 @@
       <w:r>
         <w:t xml:space="preserve"> </w:t>
       </w:r>
-      <w:hyperlink r:id="rId111">
+      <w:hyperlink r:id="rId113">
         <w:r>
           <w:rPr>
             <w:rStyle w:val="Hyperlink"/>
@@ -4241,8 +4314,8 @@
         <w:t xml:space="preserve">.</w:t>
       </w:r>
     </w:p>
-    <w:bookmarkEnd w:id="112"/>
-    <w:bookmarkStart w:id="113" w:name="ref-holdaway_wandsnider_2008"/>
+    <w:bookmarkEnd w:id="114"/>
+    <w:bookmarkStart w:id="115" w:name="ref-holdaway_wandsnider_2008"/>
     <w:p>
       <w:pPr>
         <w:pStyle w:val="Bibliography"/>
@@ -4264,8 +4337,8 @@
         <w:t xml:space="preserve">. University of Utah Press, Salt Lake City.</w:t>
       </w:r>
     </w:p>
-    <w:bookmarkEnd w:id="113"/>
-    <w:bookmarkStart w:id="115" w:name="ref-holland-lulewicz_ritchison_2021"/>
+    <w:bookmarkEnd w:id="115"/>
+    <w:bookmarkStart w:id="117" w:name="ref-holland-lulewicz_ritchison_2021"/>
     <w:p>
       <w:pPr>
         <w:pStyle w:val="Bibliography"/>
@@ -4292,7 +4365,7 @@
       <w:r>
         <w:t xml:space="preserve"> </w:t>
       </w:r>
-      <w:hyperlink r:id="rId114">
+      <w:hyperlink r:id="rId116">
         <w:r>
           <w:rPr>
             <w:rStyle w:val="Hyperlink"/>
@@ -4304,8 +4377,8 @@
         <w:t xml:space="preserve">.</w:t>
       </w:r>
     </w:p>
-    <w:bookmarkEnd w:id="115"/>
-    <w:bookmarkStart w:id="116" w:name="ref-house_1993"/>
+    <w:bookmarkEnd w:id="117"/>
+    <w:bookmarkStart w:id="118" w:name="ref-house_1993"/>
     <w:p>
       <w:pPr>
         <w:pStyle w:val="Bibliography"/>
@@ -4330,8 +4403,8 @@
         <w:t xml:space="preserve">12(1):21–32.</w:t>
       </w:r>
     </w:p>
-    <w:bookmarkEnd w:id="116"/>
-    <w:bookmarkStart w:id="117" w:name="ref-hudson_smith_depratter_1990"/>
+    <w:bookmarkEnd w:id="118"/>
+    <w:bookmarkStart w:id="119" w:name="ref-hudson_smith_depratter_1990"/>
     <w:p>
       <w:pPr>
         <w:pStyle w:val="Bibliography"/>
@@ -4391,8 +4464,8 @@
         <w:t xml:space="preserve">, edited by David H. Dye and Cheryl Anne Cox, pp. 181–207. University of Alabama Press, Tuscaloosa.</w:t>
       </w:r>
     </w:p>
-    <w:bookmarkEnd w:id="117"/>
-    <w:bookmarkStart w:id="119" w:name="ref-hunt_2006"/>
+    <w:bookmarkEnd w:id="119"/>
+    <w:bookmarkStart w:id="121" w:name="ref-hunt_2006"/>
     <w:p>
       <w:pPr>
         <w:pStyle w:val="Bibliography"/>
@@ -4419,7 +4492,7 @@
       <w:r>
         <w:t xml:space="preserve"> </w:t>
       </w:r>
-      <w:hyperlink r:id="rId118">
+      <w:hyperlink r:id="rId120">
         <w:r>
           <w:rPr>
             <w:rStyle w:val="Hyperlink"/>
@@ -4431,8 +4504,8 @@
         <w:t xml:space="preserve">.</w:t>
       </w:r>
     </w:p>
-    <w:bookmarkEnd w:id="119"/>
-    <w:bookmarkStart w:id="121" w:name="ref-hunt_bell_travis_2008"/>
+    <w:bookmarkEnd w:id="121"/>
+    <w:bookmarkStart w:id="123" w:name="ref-hunt_bell_travis_2008"/>
     <w:p>
       <w:pPr>
         <w:pStyle w:val="Bibliography"/>
@@ -4459,7 +4532,7 @@
       <w:r>
         <w:t xml:space="preserve"> </w:t>
       </w:r>
-      <w:hyperlink r:id="rId120">
+      <w:hyperlink r:id="rId122">
         <w:r>
           <w:rPr>
             <w:rStyle w:val="Hyperlink"/>
@@ -4471,8 +4544,8 @@
         <w:t xml:space="preserve">.</w:t>
       </w:r>
     </w:p>
-    <w:bookmarkEnd w:id="121"/>
-    <w:bookmarkStart w:id="122" w:name="ref-hurlbert_1971"/>
+    <w:bookmarkEnd w:id="123"/>
+    <w:bookmarkStart w:id="124" w:name="ref-hurlbert_1971"/>
     <w:p>
       <w:pPr>
         <w:pStyle w:val="Bibliography"/>
@@ -4497,8 +4570,8 @@
         <w:t xml:space="preserve">52(4):577–586.</w:t>
       </w:r>
     </w:p>
-    <w:bookmarkEnd w:id="122"/>
-    <w:bookmarkStart w:id="124" w:name="ref-kandler_shennan_2013"/>
+    <w:bookmarkEnd w:id="124"/>
+    <w:bookmarkStart w:id="126" w:name="ref-kandler_shennan_2013"/>
     <w:p>
       <w:pPr>
         <w:pStyle w:val="Bibliography"/>
@@ -4525,7 +4598,7 @@
       <w:r>
         <w:t xml:space="preserve"> </w:t>
       </w:r>
-      <w:hyperlink r:id="rId123">
+      <w:hyperlink r:id="rId125">
         <w:r>
           <w:rPr>
             <w:rStyle w:val="Hyperlink"/>
@@ -4537,8 +4610,8 @@
         <w:t xml:space="preserve">.</w:t>
       </w:r>
     </w:p>
-    <w:bookmarkEnd w:id="124"/>
-    <w:bookmarkStart w:id="126" w:name="ref-kandler_shennan_2015"/>
+    <w:bookmarkEnd w:id="126"/>
+    <w:bookmarkStart w:id="128" w:name="ref-kandler_shennan_2015"/>
     <w:p>
       <w:pPr>
         <w:pStyle w:val="Bibliography"/>
@@ -4577,7 +4650,7 @@
       <w:r>
         <w:t xml:space="preserve"> </w:t>
       </w:r>
-      <w:hyperlink r:id="rId125">
+      <w:hyperlink r:id="rId127">
         <w:r>
           <w:rPr>
             <w:rStyle w:val="Hyperlink"/>
@@ -4589,8 +4662,8 @@
         <w:t xml:space="preserve">.</w:t>
       </w:r>
     </w:p>
-    <w:bookmarkEnd w:id="126"/>
-    <w:bookmarkStart w:id="128" w:name="ref-kandler_wilder_fortunato_2017"/>
+    <w:bookmarkEnd w:id="128"/>
+    <w:bookmarkStart w:id="130" w:name="ref-kandler_wilder_fortunato_2017"/>
     <w:p>
       <w:pPr>
         <w:pStyle w:val="Bibliography"/>
@@ -4617,7 +4690,7 @@
       <w:r>
         <w:t xml:space="preserve"> </w:t>
       </w:r>
-      <w:hyperlink r:id="rId127">
+      <w:hyperlink r:id="rId129">
         <w:r>
           <w:rPr>
             <w:rStyle w:val="Hyperlink"/>
@@ -4629,8 +4702,8 @@
         <w:t xml:space="preserve">.</w:t>
       </w:r>
     </w:p>
-    <w:bookmarkEnd w:id="128"/>
-    <w:bookmarkStart w:id="130" w:name="ref-kidwell_tomasovych_2013"/>
+    <w:bookmarkEnd w:id="130"/>
+    <w:bookmarkStart w:id="132" w:name="ref-kidwell_tomasovych_2013"/>
     <w:p>
       <w:pPr>
         <w:pStyle w:val="Bibliography"/>
@@ -4657,7 +4730,7 @@
       <w:r>
         <w:t xml:space="preserve"> </w:t>
       </w:r>
-      <w:hyperlink r:id="rId129">
+      <w:hyperlink r:id="rId131">
         <w:r>
           <w:rPr>
             <w:rStyle w:val="Hyperlink"/>
@@ -4669,8 +4742,8 @@
         <w:t xml:space="preserve">.</w:t>
       </w:r>
     </w:p>
-    <w:bookmarkEnd w:id="130"/>
-    <w:bookmarkStart w:id="131" w:name="ref-king_freer_1995"/>
+    <w:bookmarkEnd w:id="132"/>
+    <w:bookmarkStart w:id="133" w:name="ref-king_freer_1995"/>
     <w:p>
       <w:pPr>
         <w:pStyle w:val="Bibliography"/>
@@ -4704,8 +4777,8 @@
         <w:t xml:space="preserve">, edited by Michael S. Nassaney and Kenneth E. Sassaman, pp. 266–288. University of Tennessee Press, Knoxville.</w:t>
       </w:r>
     </w:p>
-    <w:bookmarkEnd w:id="131"/>
-    <w:bookmarkStart w:id="133" w:name="ref-ladefoged_graves_2000"/>
+    <w:bookmarkEnd w:id="133"/>
+    <w:bookmarkStart w:id="135" w:name="ref-ladefoged_graves_2000"/>
     <w:p>
       <w:pPr>
         <w:pStyle w:val="Bibliography"/>
@@ -4750,7 +4823,7 @@
       <w:r>
         <w:t xml:space="preserve"> </w:t>
       </w:r>
-      <w:hyperlink r:id="rId132">
+      <w:hyperlink r:id="rId134">
         <w:r>
           <w:rPr>
             <w:rStyle w:val="Hyperlink"/>
@@ -4762,8 +4835,8 @@
         <w:t xml:space="preserve">.</w:t>
       </w:r>
     </w:p>
-    <w:bookmarkEnd w:id="133"/>
-    <w:bookmarkStart w:id="134" w:name="ref-lewontin_1974"/>
+    <w:bookmarkEnd w:id="135"/>
+    <w:bookmarkStart w:id="136" w:name="ref-lewontin_1974"/>
     <w:p>
       <w:pPr>
         <w:pStyle w:val="Bibliography"/>
@@ -4785,8 +4858,8 @@
         <w:t xml:space="preserve">. Columbia University Press, New York.</w:t>
       </w:r>
     </w:p>
-    <w:bookmarkEnd w:id="134"/>
-    <w:bookmarkStart w:id="135" w:name="ref-lipo_2001"/>
+    <w:bookmarkEnd w:id="136"/>
+    <w:bookmarkStart w:id="137" w:name="ref-lipo_2001"/>
     <w:p>
       <w:pPr>
         <w:pStyle w:val="Bibliography"/>
@@ -4836,8 +4909,8 @@
         <w:t xml:space="preserve">. BAR International Series 918. Archaeopress, Oxford.</w:t>
       </w:r>
     </w:p>
-    <w:bookmarkEnd w:id="135"/>
-    <w:bookmarkStart w:id="137" w:name="ref-lipo_dinapoli_madsen_hunt_2021"/>
+    <w:bookmarkEnd w:id="137"/>
+    <w:bookmarkStart w:id="139" w:name="ref-lipo_dinapoli_madsen_hunt_2021"/>
     <w:p>
       <w:pPr>
         <w:pStyle w:val="Bibliography"/>
@@ -4864,7 +4937,7 @@
       <w:r>
         <w:t xml:space="preserve"> </w:t>
       </w:r>
-      <w:hyperlink r:id="rId136">
+      <w:hyperlink r:id="rId138">
         <w:r>
           <w:rPr>
             <w:rStyle w:val="Hyperlink"/>
@@ -4876,8 +4949,8 @@
         <w:t xml:space="preserve">.</w:t>
       </w:r>
     </w:p>
-    <w:bookmarkEnd w:id="137"/>
-    <w:bookmarkStart w:id="138" w:name="ref-lipo_dunnell_2007"/>
+    <w:bookmarkEnd w:id="139"/>
+    <w:bookmarkStart w:id="140" w:name="ref-lipo_dunnell_2007"/>
     <w:p>
       <w:pPr>
         <w:pStyle w:val="Bibliography"/>
@@ -4939,8 +5012,8 @@
         <w:t xml:space="preserve">, edited by Janet Rafferty and Evan Peacock, pp. 125–167. University of Alabama Press, Tuscaloosa.</w:t>
       </w:r>
     </w:p>
-    <w:bookmarkEnd w:id="138"/>
-    <w:bookmarkStart w:id="140" w:name="ref-lipo_hunt_hundtoft_2010"/>
+    <w:bookmarkEnd w:id="140"/>
+    <w:bookmarkStart w:id="142" w:name="ref-lipo_hunt_hundtoft_2010"/>
     <w:p>
       <w:pPr>
         <w:pStyle w:val="Bibliography"/>
@@ -4985,7 +5058,7 @@
       <w:r>
         <w:t xml:space="preserve"> </w:t>
       </w:r>
-      <w:hyperlink r:id="rId139">
+      <w:hyperlink r:id="rId141">
         <w:r>
           <w:rPr>
             <w:rStyle w:val="Hyperlink"/>
@@ -4997,8 +5070,8 @@
         <w:t xml:space="preserve">.</w:t>
       </w:r>
     </w:p>
-    <w:bookmarkEnd w:id="140"/>
-    <w:bookmarkStart w:id="142" w:name="ref-lipo_madsen_dunnell_2015"/>
+    <w:bookmarkEnd w:id="142"/>
+    <w:bookmarkStart w:id="144" w:name="ref-lipo_madsen_dunnell_2015"/>
     <w:p>
       <w:pPr>
         <w:pStyle w:val="Bibliography"/>
@@ -5025,7 +5098,7 @@
       <w:r>
         <w:t xml:space="preserve"> </w:t>
       </w:r>
-      <w:hyperlink r:id="rId141">
+      <w:hyperlink r:id="rId143">
         <w:r>
           <w:rPr>
             <w:rStyle w:val="Hyperlink"/>
@@ -5037,8 +5110,8 @@
         <w:t xml:space="preserve">.</w:t>
       </w:r>
     </w:p>
-    <w:bookmarkEnd w:id="142"/>
-    <w:bookmarkStart w:id="144" w:name="ref-lipo_madsen_dunnell_hunt_1997"/>
+    <w:bookmarkEnd w:id="144"/>
+    <w:bookmarkStart w:id="146" w:name="ref-lipo_madsen_dunnell_hunt_1997"/>
     <w:p>
       <w:pPr>
         <w:pStyle w:val="Bibliography"/>
@@ -5065,7 +5138,7 @@
       <w:r>
         <w:t xml:space="preserve"> </w:t>
       </w:r>
-      <w:hyperlink r:id="rId143">
+      <w:hyperlink r:id="rId145">
         <w:r>
           <w:rPr>
             <w:rStyle w:val="Hyperlink"/>
@@ -5077,8 +5150,8 @@
         <w:t xml:space="preserve">.</w:t>
       </w:r>
     </w:p>
-    <w:bookmarkEnd w:id="144"/>
-    <w:bookmarkStart w:id="146" w:name="ref-holland-lulewicz_2019"/>
+    <w:bookmarkEnd w:id="146"/>
+    <w:bookmarkStart w:id="148" w:name="ref-holland-lulewicz_2019"/>
     <w:p>
       <w:pPr>
         <w:pStyle w:val="Bibliography"/>
@@ -5132,7 +5205,7 @@
       <w:r>
         <w:t xml:space="preserve"> </w:t>
       </w:r>
-      <w:hyperlink r:id="rId145">
+      <w:hyperlink r:id="rId147">
         <w:r>
           <w:rPr>
             <w:rStyle w:val="Hyperlink"/>
@@ -5144,8 +5217,48 @@
         <w:t xml:space="preserve">.</w:t>
       </w:r>
     </w:p>
-    <w:bookmarkEnd w:id="146"/>
-    <w:bookmarkStart w:id="147" w:name="ref-madsen_2012"/>
+    <w:bookmarkEnd w:id="148"/>
+    <w:bookmarkStart w:id="150" w:name="ref-lyman_2021"/>
+    <w:p>
+      <w:pPr>
+        <w:pStyle w:val="Bibliography"/>
+      </w:pPr>
+      <w:r>
+        <w:t xml:space="preserve">Lyman, R. Lee. 2021. On the Past and Future of Discussing, Teaching, and Learning the Hows and Whys of Archaeological Systematics.</w:t>
+      </w:r>
+      <w:r>
+        <w:t xml:space="preserve"> </w:t>
+      </w:r>
+      <w:r>
+        <w:rPr>
+          <w:i/>
+          <w:iCs/>
+        </w:rPr>
+        <w:t xml:space="preserve">Journal of Archaeological Science</w:t>
+      </w:r>
+      <w:r>
+        <w:t xml:space="preserve"> </w:t>
+      </w:r>
+      <w:r>
+        <w:t xml:space="preserve">131:105412.</w:t>
+      </w:r>
+      <w:r>
+        <w:t xml:space="preserve"> </w:t>
+      </w:r>
+      <w:hyperlink r:id="rId149">
+        <w:r>
+          <w:rPr>
+            <w:rStyle w:val="Hyperlink"/>
+          </w:rPr>
+          <w:t xml:space="preserve">https://doi.org/10.1016/j.jas.2021.105412</w:t>
+        </w:r>
+      </w:hyperlink>
+      <w:r>
+        <w:t xml:space="preserve">.</w:t>
+      </w:r>
+    </w:p>
+    <w:bookmarkEnd w:id="150"/>
+    <w:bookmarkStart w:id="151" w:name="ref-madsen_2012"/>
     <w:p>
       <w:pPr>
         <w:pStyle w:val="Bibliography"/>
@@ -5154,8 +5267,8 @@
         <w:t xml:space="preserve">Madsen, Mark E. 2012. Neutral Cultural Transmission in Time-Averaged Archaeological Assemblages. arXiv preprint arXiv:1204.2043 [physics.soc-ph].</w:t>
       </w:r>
     </w:p>
-    <w:bookmarkEnd w:id="147"/>
-    <w:bookmarkStart w:id="148" w:name="ref-mainfort_1996"/>
+    <w:bookmarkEnd w:id="151"/>
+    <w:bookmarkStart w:id="152" w:name="ref-mainfort_1996"/>
     <w:p>
       <w:pPr>
         <w:pStyle w:val="Bibliography"/>
@@ -5204,8 +5317,8 @@
         <w:t xml:space="preserve">15(2):172–181.</w:t>
       </w:r>
     </w:p>
-    <w:bookmarkEnd w:id="148"/>
-    <w:bookmarkStart w:id="149" w:name="ref-mainfort_2001"/>
+    <w:bookmarkEnd w:id="152"/>
+    <w:bookmarkStart w:id="153" w:name="ref-mainfort_2001"/>
     <w:p>
       <w:pPr>
         <w:pStyle w:val="Bibliography"/>
@@ -5239,8 +5352,8 @@
         <w:t xml:space="preserve">, edited by David S. Brose, C. Wesley Cowan, and Jr. Mainfort Robert C., pp. 173–190. Smithsonian Institution Press, Washington, DC.</w:t>
       </w:r>
     </w:p>
-    <w:bookmarkEnd w:id="149"/>
-    <w:bookmarkStart w:id="150" w:name="ref-mainfort_2003"/>
+    <w:bookmarkEnd w:id="153"/>
+    <w:bookmarkStart w:id="154" w:name="ref-mainfort_2003"/>
     <w:p>
       <w:pPr>
         <w:pStyle w:val="Bibliography"/>
@@ -5277,8 +5390,8 @@
         <w:t xml:space="preserve">22(2):176–184.</w:t>
       </w:r>
     </w:p>
-    <w:bookmarkEnd w:id="150"/>
-    <w:bookmarkStart w:id="151" w:name="ref-mantel_1967"/>
+    <w:bookmarkEnd w:id="154"/>
+    <w:bookmarkStart w:id="155" w:name="ref-mantel_1967"/>
     <w:p>
       <w:pPr>
         <w:pStyle w:val="Bibliography"/>
@@ -5303,8 +5416,8 @@
         <w:t xml:space="preserve">27(2):209–220.</w:t>
       </w:r>
     </w:p>
-    <w:bookmarkEnd w:id="151"/>
-    <w:bookmarkStart w:id="152" w:name="ref-mcnutt_ed_1996"/>
+    <w:bookmarkEnd w:id="155"/>
+    <w:bookmarkStart w:id="156" w:name="ref-mcnutt_ed_1996"/>
     <w:p>
       <w:pPr>
         <w:pStyle w:val="Bibliography"/>
@@ -5354,8 +5467,8 @@
         <w:t xml:space="preserve">. University of Alabama Press, Tuscaloosa.</w:t>
       </w:r>
     </w:p>
-    <w:bookmarkEnd w:id="152"/>
-    <w:bookmarkStart w:id="153" w:name="ref-mesoudi_2021"/>
+    <w:bookmarkEnd w:id="156"/>
+    <w:bookmarkStart w:id="157" w:name="ref-mesoudi_2021"/>
     <w:p>
       <w:pPr>
         <w:pStyle w:val="Bibliography"/>
@@ -5380,8 +5493,8 @@
         <w:t xml:space="preserve">376:20200053.</w:t>
       </w:r>
     </w:p>
-    <w:bookmarkEnd w:id="153"/>
-    <w:bookmarkStart w:id="155" w:name="ref-miller_atkins_premo_2018"/>
+    <w:bookmarkEnd w:id="157"/>
+    <w:bookmarkStart w:id="159" w:name="ref-miller_atkins_premo_2018"/>
     <w:p>
       <w:pPr>
         <w:pStyle w:val="Bibliography"/>
@@ -5408,7 +5521,7 @@
       <w:r>
         <w:t xml:space="preserve"> </w:t>
       </w:r>
-      <w:hyperlink r:id="rId154">
+      <w:hyperlink r:id="rId158">
         <w:r>
           <w:rPr>
             <w:rStyle w:val="Hyperlink"/>
@@ -5420,8 +5533,8 @@
         <w:t xml:space="preserve">.</w:t>
       </w:r>
     </w:p>
-    <w:bookmarkEnd w:id="155"/>
-    <w:bookmarkStart w:id="156" w:name="ref-milner_1998"/>
+    <w:bookmarkEnd w:id="159"/>
+    <w:bookmarkStart w:id="160" w:name="ref-milner_1998"/>
     <w:p>
       <w:pPr>
         <w:pStyle w:val="Bibliography"/>
@@ -5499,8 +5612,8 @@
         <w:t xml:space="preserve">. Smithsonian Institution Press, Washington, D.C.</w:t>
       </w:r>
     </w:p>
-    <w:bookmarkEnd w:id="156"/>
-    <w:bookmarkStart w:id="157" w:name="ref-mitchem_2001"/>
+    <w:bookmarkEnd w:id="160"/>
+    <w:bookmarkStart w:id="161" w:name="ref-mitchem_2001"/>
     <w:p>
       <w:pPr>
         <w:pStyle w:val="Bibliography"/>
@@ -5530,8 +5643,8 @@
         <w:t xml:space="preserve">.</w:t>
       </w:r>
     </w:p>
-    <w:bookmarkEnd w:id="157"/>
-    <w:bookmarkStart w:id="158" w:name="ref-morse_morse_1983"/>
+    <w:bookmarkEnd w:id="161"/>
+    <w:bookmarkStart w:id="162" w:name="ref-morse_morse_1983"/>
     <w:p>
       <w:pPr>
         <w:pStyle w:val="Bibliography"/>
@@ -5581,8 +5694,8 @@
         <w:t xml:space="preserve">. Academic Press, New York.</w:t>
       </w:r>
     </w:p>
-    <w:bookmarkEnd w:id="158"/>
-    <w:bookmarkStart w:id="159" w:name="ref-morse_morse_1996"/>
+    <w:bookmarkEnd w:id="162"/>
+    <w:bookmarkStart w:id="163" w:name="ref-morse_morse_1996"/>
     <w:p>
       <w:pPr>
         <w:pStyle w:val="Bibliography"/>
@@ -5619,8 +5732,8 @@
         <w:t xml:space="preserve">17(1):1–35.</w:t>
       </w:r>
     </w:p>
-    <w:bookmarkEnd w:id="159"/>
-    <w:bookmarkStart w:id="160" w:name="ref-morse_1990"/>
+    <w:bookmarkEnd w:id="163"/>
+    <w:bookmarkStart w:id="164" w:name="ref-morse_1990"/>
     <w:p>
       <w:pPr>
         <w:pStyle w:val="Bibliography"/>
@@ -5680,8 +5793,8 @@
         <w:t xml:space="preserve">, edited by David H. Dye and Cheryl Anne Cox, pp. 118–134. University of Alabama Press, Tuscaloosa.</w:t>
       </w:r>
     </w:p>
-    <w:bookmarkEnd w:id="160"/>
-    <w:bookmarkStart w:id="161" w:name="ref-neiman_1995"/>
+    <w:bookmarkEnd w:id="164"/>
+    <w:bookmarkStart w:id="165" w:name="ref-neiman_1995"/>
     <w:p>
       <w:pPr>
         <w:pStyle w:val="Bibliography"/>
@@ -5724,8 +5837,8 @@
         <w:t xml:space="preserve">60(1):7–36.</w:t>
       </w:r>
     </w:p>
-    <w:bookmarkEnd w:id="161"/>
-    <w:bookmarkStart w:id="163" w:name="ref-odwyer_kandler_2017"/>
+    <w:bookmarkEnd w:id="165"/>
+    <w:bookmarkStart w:id="167" w:name="ref-odwyer_kandler_2017"/>
     <w:p>
       <w:pPr>
         <w:pStyle w:val="Bibliography"/>
@@ -5752,7 +5865,7 @@
       <w:r>
         <w:t xml:space="preserve"> </w:t>
       </w:r>
-      <w:hyperlink r:id="rId162">
+      <w:hyperlink r:id="rId166">
         <w:r>
           <w:rPr>
             <w:rStyle w:val="Hyperlink"/>
@@ -5764,8 +5877,8 @@
         <w:t xml:space="preserve">.</w:t>
       </w:r>
     </w:p>
-    <w:bookmarkEnd w:id="163"/>
-    <w:bookmarkStart w:id="165" w:name="ref-peebles_kus_1977"/>
+    <w:bookmarkEnd w:id="167"/>
+    <w:bookmarkStart w:id="169" w:name="ref-peebles_kus_1977"/>
     <w:p>
       <w:pPr>
         <w:pStyle w:val="Bibliography"/>
@@ -5792,7 +5905,7 @@
       <w:r>
         <w:t xml:space="preserve"> </w:t>
       </w:r>
-      <w:hyperlink r:id="rId164">
+      <w:hyperlink r:id="rId168">
         <w:r>
           <w:rPr>
             <w:rStyle w:val="Hyperlink"/>
@@ -5804,8 +5917,8 @@
         <w:t xml:space="preserve">.</w:t>
       </w:r>
     </w:p>
-    <w:bookmarkEnd w:id="165"/>
-    <w:bookmarkStart w:id="167" w:name="ref-peeples_schachner_2012"/>
+    <w:bookmarkEnd w:id="169"/>
+    <w:bookmarkStart w:id="171" w:name="ref-peeples_schachner_2012"/>
     <w:p>
       <w:pPr>
         <w:pStyle w:val="Bibliography"/>
@@ -5832,7 +5945,7 @@
       <w:r>
         <w:t xml:space="preserve"> </w:t>
       </w:r>
-      <w:hyperlink r:id="rId166">
+      <w:hyperlink r:id="rId170">
         <w:r>
           <w:rPr>
             <w:rStyle w:val="Hyperlink"/>
@@ -5844,8 +5957,8 @@
         <w:t xml:space="preserve">.</w:t>
       </w:r>
     </w:p>
-    <w:bookmarkEnd w:id="167"/>
-    <w:bookmarkStart w:id="169" w:name="ref-perreault_2018"/>
+    <w:bookmarkEnd w:id="171"/>
+    <w:bookmarkStart w:id="173" w:name="ref-perreault_2018"/>
     <w:p>
       <w:pPr>
         <w:pStyle w:val="Bibliography"/>
@@ -5872,7 +5985,7 @@
       <w:r>
         <w:t xml:space="preserve"> </w:t>
       </w:r>
-      <w:hyperlink r:id="rId168">
+      <w:hyperlink r:id="rId172">
         <w:r>
           <w:rPr>
             <w:rStyle w:val="Hyperlink"/>
@@ -5884,8 +5997,8 @@
         <w:t xml:space="preserve">.</w:t>
       </w:r>
     </w:p>
-    <w:bookmarkEnd w:id="169"/>
-    <w:bookmarkStart w:id="170" w:name="ref-perreault_2019"/>
+    <w:bookmarkEnd w:id="173"/>
+    <w:bookmarkStart w:id="174" w:name="ref-perreault_2019"/>
     <w:p>
       <w:pPr>
         <w:pStyle w:val="Bibliography"/>
@@ -5907,8 +6020,8 @@
         <w:t xml:space="preserve">. University of Chicago Press, Chicago.</w:t>
       </w:r>
     </w:p>
-    <w:bookmarkEnd w:id="170"/>
-    <w:bookmarkStart w:id="171" w:name="ref-phillips_1970"/>
+    <w:bookmarkEnd w:id="174"/>
+    <w:bookmarkStart w:id="175" w:name="ref-phillips_1970"/>
     <w:p>
       <w:pPr>
         <w:pStyle w:val="Bibliography"/>
@@ -5979,8 +6092,8 @@
         <w:t xml:space="preserve">, Vol. 60. Papers of the Peabody Museum of Archaeology and Ethnology. Peabody Museum, Harvard University, Cambridge, MA.</w:t>
       </w:r>
     </w:p>
-    <w:bookmarkEnd w:id="171"/>
-    <w:bookmarkStart w:id="172" w:name="ref-phillips_ford_griffin_1951"/>
+    <w:bookmarkEnd w:id="175"/>
+    <w:bookmarkStart w:id="176" w:name="ref-phillips_ford_griffin_1951"/>
     <w:p>
       <w:pPr>
         <w:pStyle w:val="Bibliography"/>
@@ -6030,8 +6143,8 @@
         <w:t xml:space="preserve">, Vol. 25. Papers of the Peabody Museum of American Archaeology and Ethnology. Peabody Museum, Harvard University, Cambridge, MA.</w:t>
       </w:r>
     </w:p>
-    <w:bookmarkEnd w:id="172"/>
-    <w:bookmarkStart w:id="174" w:name="ref-phillips_willey_1953"/>
+    <w:bookmarkEnd w:id="176"/>
+    <w:bookmarkStart w:id="178" w:name="ref-phillips_willey_1953"/>
     <w:p>
       <w:pPr>
         <w:pStyle w:val="Bibliography"/>
@@ -6058,7 +6171,7 @@
       <w:r>
         <w:t xml:space="preserve"> </w:t>
       </w:r>
-      <w:hyperlink r:id="rId173">
+      <w:hyperlink r:id="rId177">
         <w:r>
           <w:rPr>
             <w:rStyle w:val="Hyperlink"/>
@@ -6070,8 +6183,8 @@
         <w:t xml:space="preserve">.</w:t>
       </w:r>
     </w:p>
-    <w:bookmarkEnd w:id="174"/>
-    <w:bookmarkStart w:id="176" w:name="ref-powell_shennan_thomas_2009"/>
+    <w:bookmarkEnd w:id="178"/>
+    <w:bookmarkStart w:id="180" w:name="ref-powell_shennan_thomas_2009"/>
     <w:p>
       <w:pPr>
         <w:pStyle w:val="Bibliography"/>
@@ -6110,7 +6223,7 @@
       <w:r>
         <w:t xml:space="preserve"> </w:t>
       </w:r>
-      <w:hyperlink r:id="rId175">
+      <w:hyperlink r:id="rId179">
         <w:r>
           <w:rPr>
             <w:rStyle w:val="Hyperlink"/>
@@ -6122,8 +6235,8 @@
         <w:t xml:space="preserve">.</w:t>
       </w:r>
     </w:p>
-    <w:bookmarkEnd w:id="176"/>
-    <w:bookmarkStart w:id="178" w:name="ref-premo_2014"/>
+    <w:bookmarkEnd w:id="180"/>
+    <w:bookmarkStart w:id="182" w:name="ref-premo_2014"/>
     <w:p>
       <w:pPr>
         <w:pStyle w:val="Bibliography"/>
@@ -6150,7 +6263,7 @@
       <w:r>
         <w:t xml:space="preserve"> </w:t>
       </w:r>
-      <w:hyperlink r:id="rId177">
+      <w:hyperlink r:id="rId181">
         <w:r>
           <w:rPr>
             <w:rStyle w:val="Hyperlink"/>
@@ -6162,8 +6275,8 @@
         <w:t xml:space="preserve">.</w:t>
       </w:r>
     </w:p>
-    <w:bookmarkEnd w:id="178"/>
-    <w:bookmarkStart w:id="179" w:name="ref-rees_political_culture"/>
+    <w:bookmarkEnd w:id="182"/>
+    <w:bookmarkStart w:id="183" w:name="ref-rees_political_culture"/>
     <w:p>
       <w:pPr>
         <w:pStyle w:val="Bibliography"/>
@@ -6187,8 +6300,8 @@
         <w:t xml:space="preserve">. Ph.D. dissertation, University of Oklahoma, Norman.</w:t>
       </w:r>
     </w:p>
-    <w:bookmarkEnd w:id="179"/>
-    <w:bookmarkStart w:id="181" w:name="ref-reimer_etal_2020"/>
+    <w:bookmarkEnd w:id="183"/>
+    <w:bookmarkStart w:id="185" w:name="ref-reimer_etal_2020"/>
     <w:p>
       <w:pPr>
         <w:pStyle w:val="Bibliography"/>
@@ -6242,7 +6355,7 @@
       <w:r>
         <w:t xml:space="preserve"> </w:t>
       </w:r>
-      <w:hyperlink r:id="rId180">
+      <w:hyperlink r:id="rId184">
         <w:r>
           <w:rPr>
             <w:rStyle w:val="Hyperlink"/>
@@ -6254,8 +6367,8 @@
         <w:t xml:space="preserve">.</w:t>
       </w:r>
     </w:p>
-    <w:bookmarkEnd w:id="181"/>
-    <w:bookmarkStart w:id="183" w:name="ref-richerson_etal_2016"/>
+    <w:bookmarkEnd w:id="185"/>
+    <w:bookmarkStart w:id="187" w:name="ref-richerson_etal_2016"/>
     <w:p>
       <w:pPr>
         <w:pStyle w:val="Bibliography"/>
@@ -6282,7 +6395,7 @@
       <w:r>
         <w:t xml:space="preserve"> </w:t>
       </w:r>
-      <w:hyperlink r:id="rId182">
+      <w:hyperlink r:id="rId186">
         <w:r>
           <w:rPr>
             <w:rStyle w:val="Hyperlink"/>
@@ -6294,8 +6407,8 @@
         <w:t xml:space="preserve">.</w:t>
       </w:r>
     </w:p>
-    <w:bookmarkEnd w:id="183"/>
-    <w:bookmarkStart w:id="185" w:name="ref-riede_hoggard_shennan_2019"/>
+    <w:bookmarkEnd w:id="187"/>
+    <w:bookmarkStart w:id="189" w:name="ref-riede_hoggard_shennan_2019"/>
     <w:p>
       <w:pPr>
         <w:pStyle w:val="Bibliography"/>
@@ -6322,7 +6435,7 @@
       <w:r>
         <w:t xml:space="preserve"> </w:t>
       </w:r>
-      <w:hyperlink r:id="rId184">
+      <w:hyperlink r:id="rId188">
         <w:r>
           <w:rPr>
             <w:rStyle w:val="Hyperlink"/>
@@ -6334,8 +6447,8 @@
         <w:t xml:space="preserve">.</w:t>
       </w:r>
     </w:p>
-    <w:bookmarkEnd w:id="185"/>
-    <w:bookmarkStart w:id="186" w:name="ref-robinson_1951"/>
+    <w:bookmarkEnd w:id="189"/>
+    <w:bookmarkStart w:id="190" w:name="ref-robinson_1951"/>
     <w:p>
       <w:pPr>
         <w:pStyle w:val="Bibliography"/>
@@ -6360,8 +6473,8 @@
         <w:t xml:space="preserve">16(4):293–301.</w:t>
       </w:r>
     </w:p>
-    <w:bookmarkEnd w:id="186"/>
-    <w:bookmarkStart w:id="187" w:name="ref-ross-stallings_2017"/>
+    <w:bookmarkEnd w:id="190"/>
+    <w:bookmarkStart w:id="191" w:name="ref-ross-stallings_2017"/>
     <w:p>
       <w:pPr>
         <w:pStyle w:val="Bibliography"/>
@@ -6395,8 +6508,8 @@
         <w:t xml:space="preserve">, edited by Haagen D. Klaus, Amanda R. Harvey, and Mark N. Cohen, pp. 329–362. University Press of Florida, Gainesville.</w:t>
       </w:r>
     </w:p>
-    <w:bookmarkEnd w:id="187"/>
-    <w:bookmarkStart w:id="189" w:name="ref-scheffer_2009"/>
+    <w:bookmarkEnd w:id="191"/>
+    <w:bookmarkStart w:id="193" w:name="ref-scheffer_2009"/>
     <w:p>
       <w:pPr>
         <w:pStyle w:val="Bibliography"/>
@@ -6423,7 +6536,7 @@
       <w:r>
         <w:t xml:space="preserve"> </w:t>
       </w:r>
-      <w:hyperlink r:id="rId188">
+      <w:hyperlink r:id="rId192">
         <w:r>
           <w:rPr>
             <w:rStyle w:val="Hyperlink"/>
@@ -6435,8 +6548,8 @@
         <w:t xml:space="preserve">.</w:t>
       </w:r>
     </w:p>
-    <w:bookmarkEnd w:id="189"/>
-    <w:bookmarkStart w:id="190" w:name="ref-schiffer_1972"/>
+    <w:bookmarkEnd w:id="193"/>
+    <w:bookmarkStart w:id="194" w:name="ref-schiffer_1972"/>
     <w:p>
       <w:pPr>
         <w:pStyle w:val="Bibliography"/>
@@ -6461,8 +6574,8 @@
         <w:t xml:space="preserve">37(2):156–165.</w:t>
       </w:r>
     </w:p>
-    <w:bookmarkEnd w:id="190"/>
-    <w:bookmarkStart w:id="192" w:name="ref-shennan_crema_kerig_2015"/>
+    <w:bookmarkEnd w:id="194"/>
+    <w:bookmarkStart w:id="196" w:name="ref-shennan_crema_kerig_2015"/>
     <w:p>
       <w:pPr>
         <w:pStyle w:val="Bibliography"/>
@@ -6528,7 +6641,7 @@
       <w:r>
         <w:t xml:space="preserve"> </w:t>
       </w:r>
-      <w:hyperlink r:id="rId191">
+      <w:hyperlink r:id="rId195">
         <w:r>
           <w:rPr>
             <w:rStyle w:val="Hyperlink"/>
@@ -6540,8 +6653,8 @@
         <w:t xml:space="preserve">.</w:t>
       </w:r>
     </w:p>
-    <w:bookmarkEnd w:id="192"/>
-    <w:bookmarkStart w:id="193" w:name="ref-shennan_wilkinson_2001"/>
+    <w:bookmarkEnd w:id="196"/>
+    <w:bookmarkStart w:id="197" w:name="ref-shennan_wilkinson_2001"/>
     <w:p>
       <w:pPr>
         <w:pStyle w:val="Bibliography"/>
@@ -6581,8 +6694,8 @@
         <w:t xml:space="preserve">66(4):577–593.</w:t>
       </w:r>
     </w:p>
-    <w:bookmarkEnd w:id="193"/>
-    <w:bookmarkStart w:id="194" w:name="ref-smith_neiman_2007"/>
+    <w:bookmarkEnd w:id="197"/>
+    <w:bookmarkStart w:id="198" w:name="ref-smith_neiman_2007"/>
     <w:p>
       <w:pPr>
         <w:pStyle w:val="Bibliography"/>
@@ -6607,8 +6720,8 @@
         <w:t xml:space="preserve">26(1):47–72.</w:t>
       </w:r>
     </w:p>
-    <w:bookmarkEnd w:id="194"/>
-    <w:bookmarkStart w:id="196" w:name="ref-stern_1994"/>
+    <w:bookmarkEnd w:id="198"/>
+    <w:bookmarkStart w:id="200" w:name="ref-stern_1994"/>
     <w:p>
       <w:pPr>
         <w:pStyle w:val="Bibliography"/>
@@ -6635,7 +6748,7 @@
       <w:r>
         <w:t xml:space="preserve"> </w:t>
       </w:r>
-      <w:hyperlink r:id="rId195">
+      <w:hyperlink r:id="rId199">
         <w:r>
           <w:rPr>
             <w:rStyle w:val="Hyperlink"/>
@@ -6647,8 +6760,8 @@
         <w:t xml:space="preserve">.</w:t>
       </w:r>
     </w:p>
-    <w:bookmarkEnd w:id="196"/>
-    <w:bookmarkStart w:id="198" w:name="ref-sullivan_2024"/>
+    <w:bookmarkEnd w:id="200"/>
+    <w:bookmarkStart w:id="202" w:name="ref-sullivan_2024"/>
     <w:p>
       <w:pPr>
         <w:pStyle w:val="Bibliography"/>
@@ -6699,7 +6812,7 @@
       <w:r>
         <w:t xml:space="preserve"> </w:t>
       </w:r>
-      <w:hyperlink r:id="rId197">
+      <w:hyperlink r:id="rId201">
         <w:r>
           <w:rPr>
             <w:rStyle w:val="Hyperlink"/>
@@ -6711,8 +6824,8 @@
         <w:t xml:space="preserve">.</w:t>
       </w:r>
     </w:p>
-    <w:bookmarkEnd w:id="198"/>
-    <w:bookmarkStart w:id="199" w:name="ref-tomasovych_kidwell_2009"/>
+    <w:bookmarkEnd w:id="202"/>
+    <w:bookmarkStart w:id="203" w:name="ref-tomasovych_kidwell_2009"/>
     <w:p>
       <w:pPr>
         <w:pStyle w:val="Bibliography"/>
@@ -6737,8 +6850,8 @@
         <w:t xml:space="preserve">35(1):94–118.</w:t>
       </w:r>
     </w:p>
-    <w:bookmarkEnd w:id="199"/>
-    <w:bookmarkStart w:id="201" w:name="ref-tomasovych_kidwell_2010"/>
+    <w:bookmarkEnd w:id="203"/>
+    <w:bookmarkStart w:id="205" w:name="ref-tomasovych_kidwell_2010"/>
     <w:p>
       <w:pPr>
         <w:pStyle w:val="Bibliography"/>
@@ -6765,7 +6878,7 @@
       <w:r>
         <w:t xml:space="preserve"> </w:t>
       </w:r>
-      <w:hyperlink r:id="rId200">
+      <w:hyperlink r:id="rId204">
         <w:r>
           <w:rPr>
             <w:rStyle w:val="Hyperlink"/>
@@ -6777,8 +6890,8 @@
         <w:t xml:space="preserve">.</w:t>
       </w:r>
     </w:p>
-    <w:bookmarkEnd w:id="201"/>
-    <w:bookmarkStart w:id="202" w:name="ref-willey_phillips_1958"/>
+    <w:bookmarkEnd w:id="205"/>
+    <w:bookmarkStart w:id="206" w:name="ref-willey_phillips_1958"/>
     <w:p>
       <w:pPr>
         <w:pStyle w:val="Bibliography"/>
@@ -6800,8 +6913,8 @@
         <w:t xml:space="preserve">. University of Chicago Press, Chicago.</w:t>
       </w:r>
     </w:p>
-    <w:bookmarkEnd w:id="202"/>
-    <w:bookmarkStart w:id="203" w:name="ref-williams_1954"/>
+    <w:bookmarkEnd w:id="206"/>
+    <w:bookmarkStart w:id="207" w:name="ref-williams_1954"/>
     <w:p>
       <w:pPr>
         <w:pStyle w:val="Bibliography"/>
@@ -6810,8 +6923,8 @@
         <w:t xml:space="preserve">Williams, Stephen. 1954. An Archeological Study of the Mississippian Culture in Southeast Missouri. PhD thesis, Yale University, New Haven.</w:t>
       </w:r>
     </w:p>
-    <w:bookmarkEnd w:id="203"/>
-    <w:bookmarkStart w:id="204" w:name="ref-williams_1990"/>
+    <w:bookmarkEnd w:id="207"/>
+    <w:bookmarkStart w:id="208" w:name="ref-williams_1990"/>
     <w:p>
       <w:pPr>
         <w:pStyle w:val="Bibliography"/>
@@ -6847,8 +6960,8 @@
         <w:t xml:space="preserve">, edited by David H. Dye and Cheryl Anne Cox, pp. 170–180. University of Alabama Press, Tuscaloosa.</w:t>
       </w:r>
     </w:p>
-    <w:bookmarkEnd w:id="204"/>
-    <w:bookmarkStart w:id="206" w:name="ref-wright_1943"/>
+    <w:bookmarkEnd w:id="208"/>
+    <w:bookmarkStart w:id="210" w:name="ref-wright_1943"/>
     <w:p>
       <w:pPr>
         <w:pStyle w:val="Bibliography"/>
@@ -6875,7 +6988,7 @@
       <w:r>
         <w:t xml:space="preserve"> </w:t>
       </w:r>
-      <w:hyperlink r:id="rId205">
+      <w:hyperlink r:id="rId209">
         <w:r>
           <w:rPr>
             <w:rStyle w:val="Hyperlink"/>
@@ -6887,8 +7000,8 @@
         <w:t xml:space="preserve">.</w:t>
       </w:r>
     </w:p>
-    <w:bookmarkEnd w:id="206"/>
-    <w:bookmarkStart w:id="208" w:name="ref-wright_1951"/>
+    <w:bookmarkEnd w:id="210"/>
+    <w:bookmarkStart w:id="212" w:name="ref-wright_1951"/>
     <w:p>
       <w:pPr>
         <w:pStyle w:val="Bibliography"/>
@@ -6915,7 +7028,7 @@
       <w:r>
         <w:t xml:space="preserve"> </w:t>
       </w:r>
-      <w:hyperlink r:id="rId207">
+      <w:hyperlink r:id="rId211">
         <w:r>
           <w:rPr>
             <w:rStyle w:val="Hyperlink"/>
@@ -6927,8 +7040,8 @@
         <w:t xml:space="preserve">.</w:t>
       </w:r>
     </w:p>
-    <w:bookmarkEnd w:id="208"/>
-    <w:bookmarkStart w:id="210" w:name="ref-youngblood_miton_morin_2023"/>
+    <w:bookmarkEnd w:id="212"/>
+    <w:bookmarkStart w:id="214" w:name="ref-youngblood_miton_morin_2023"/>
     <w:p>
       <w:pPr>
         <w:pStyle w:val="Bibliography"/>
@@ -6955,7 +7068,7 @@
       <w:r>
         <w:t xml:space="preserve"> </w:t>
       </w:r>
-      <w:hyperlink r:id="rId209">
+      <w:hyperlink r:id="rId213">
         <w:r>
           <w:rPr>
             <w:rStyle w:val="Hyperlink"/>
@@ -6967,10 +7080,10 @@
         <w:t xml:space="preserve">.</w:t>
       </w:r>
     </w:p>
-    <w:bookmarkEnd w:id="210"/>
-    <w:bookmarkEnd w:id="211"/>
-    <w:bookmarkEnd w:id="212"/>
-    <w:bookmarkEnd w:id="213"/>
+    <w:bookmarkEnd w:id="214"/>
+    <w:bookmarkEnd w:id="215"/>
+    <w:bookmarkEnd w:id="216"/>
+    <w:bookmarkEnd w:id="217"/>
     <w:sectPr>
       <w:footnotePr>
         <w:numRestart w:val="eachSect"/>

</xml_diff>

<commit_message>
Time-aware emergence demonstration on the river network (Figure 8, Figure S7)
- analyses/33: 500-realization consensus of neutral drift on the real basin geography, sampled time-transgressively; Figure 8 = probability of sharing Parkin's emergent community (contemporaneous snapshot on the river basemap) and observed-vs-drift between-group F_ST.
- analyses/34: robustness sweep over interaction length, between-node mixing, and innovation rate (Figure S7); results cached to output/ CSV.
- make_map: river_distance_matrix (along-waterway shortest paths) and reusable basin_basemap; the copying kernel now uses river-network distance.
- Sync manuscript (main + supplement) and references.bib.
</commit_message>
<xml_diff>
--- a/docs/manuscript/MAIN_TEXT.docx
+++ b/docs/manuscript/MAIN_TEXT.docx
@@ -2,7 +2,7 @@
 <file path=word/document.xml><?xml version="1.0" encoding="utf-8"?>
 <w:document xmlns:w="http://schemas.openxmlformats.org/wordprocessingml/2006/main" xmlns:m="http://schemas.openxmlformats.org/officeDocument/2006/math" xmlns:r="http://schemas.openxmlformats.org/officeDocument/2006/relationships" xmlns:o="urn:schemas-microsoft-com:office:office" xmlns:v="urn:schemas-microsoft-com:vml" xmlns:w10="urn:schemas-microsoft-com:office:word" xmlns:a="http://schemas.openxmlformats.org/drawingml/2006/main" xmlns:pic="http://schemas.openxmlformats.org/drawingml/2006/picture" xmlns:wp="http://schemas.openxmlformats.org/drawingml/2006/wordprocessingDrawing">
   <w:body>
-    <w:bookmarkStart w:id="217" w:name="X093902eb68652ea32f5548e74607f4e4b0f6699"/>
+    <w:bookmarkStart w:id="234" w:name="X093902eb68652ea32f5548e74607f4e4b0f6699"/>
     <w:p>
       <w:pPr>
         <w:pStyle w:val="Heading1"/>
@@ -880,7 +880,7 @@
         <w:t xml:space="preserve">(Neiman 1995)</w:t>
       </w:r>
       <w:r>
-        <w:t xml:space="preserve">. It serves here as the most direct measure of how far decoration has sorted itself by group, with one important caveat developed below: stochastic drift on a spatially structured population also generates some between-group variance, so the measure must be calibrated against that null rather than read at face value</w:t>
+        <w:t xml:space="preserve">. It serves here as the most direct measure of how far decoration has sorted itself by group, with one important caveat developed below. Stochastic drift on a spatially structured population generates between-group variance on its own, because subpopulations retain different amounts of diversity depending on their size and connectivity: small or sparsely connected areas drift to depleted, idiosyncratic repertoires while larger, well-connected ones stay richer, so the resulting differences read as distinct interacting groups when they are produced by spatial position alone</w:t>
       </w:r>
       <w:r>
         <w:t xml:space="preserve"> </w:t>
@@ -889,7 +889,7 @@
         <w:t xml:space="preserve">(Lipo et al. 2021)</w:t>
       </w:r>
       <w:r>
-        <w:t xml:space="preserve">.</w:t>
+        <w:t xml:space="preserve">. The measure must therefore be calibrated against that spatial-drift null rather than read at face value.</w:t>
       </w:r>
     </w:p>
     <w:p>
@@ -2422,7 +2422,7 @@
       </w:r>
     </w:p>
     <w:bookmarkEnd w:id="43"/>
-    <w:bookmarkStart w:id="50" w:name="discussion"/>
+    <w:bookmarkStart w:id="53" w:name="discussion"/>
     <w:p>
       <w:pPr>
         <w:pStyle w:val="Heading2"/>
@@ -2492,84 +2492,43 @@
         <w:pStyle w:val="BodyText"/>
       </w:pPr>
       <w:r>
-        <w:t xml:space="preserve">This finding provides the strongest case for the alternative hypothesis. The most direct argument for an emerging hierarchy holds that Parkin sits on agriculturally poor soil and so must have drawn tribute from the productive villages around it</w:t>
-      </w:r>
-      <w:r>
-        <w:t xml:space="preserve"> </w:t>
-      </w:r>
-      <w:r>
-        <w:t xml:space="preserve">(Morse 1990)</w:t>
-      </w:r>
-      <w:r>
-        <w:t xml:space="preserve">. The inference is specific and deserves credit for that, but it is circular. The tribute it concludes is the tribute it assumes, and no independent evidence of tribute flow accompanies it. Parkin’s position at the confluence of the St. Francis and Tyronza is as well explained by control of movement and communication as by extraction, and the transmission and exchange records both show the absence of the centralized control the tribute model requires. A second argument points to skeletal evidence from the lower Mississippi (Yazoo) Delta rather than the St. Francis basin, indicating a better diet at a mound center than at a nearby satellite village, consistent with differential access within a hierarchy</w:t>
-      </w:r>
-      <w:r>
-        <w:t xml:space="preserve"> </w:t>
-      </w:r>
-      <w:r>
-        <w:t xml:space="preserve">(Ross-Stallings 2017)</w:t>
-      </w:r>
-      <w:r>
-        <w:t xml:space="preserve">. The contrast is real but thin: the satellite sample numbers fourteen individuals, the result is presented as tentative, and a health difference between two sites does not require an extractive hierarchy to produce it. Neither argument supplies the regional, structural signature that the convergence test looks for and does not find.</w:t>
-      </w:r>
-    </w:p>
-    <w:p>
-      <w:pPr>
-        <w:pStyle w:val="BodyText"/>
-      </w:pPr>
-      <w:r>
-        <w:t xml:space="preserve">Three limits bound the result, and the recovery experiment forces the most important of them to the front. At this record’s resolution, the discrimination between a bounded group and drift rests on a single signature, cultural F_ST. That signature is confounded by a sample-size trend along the seriation axis (Spearman rho = +0.59). We removed the confound by subsampling every assemblage to a common count, which collapses the raw F_ST trend from +0.60 to +0.01. We calibrated the test on synthetic data matched to the record, in which F_ST recovers a moderate-strength closure (s of about 0.5, rising to 0.7 once the record’s time-averaging is imposed), while maintaining a false-positive rate of 5%. The size-controlled empirical F_ST is uninformative, its bootstrap interval spanning no closure to a moderate signal. The negative is therefore informative for a closure of moderate or greater strength, which would have registered as a resolved positive, but does not. It cannot exclude a weaker closure that a record of 29 time-averaged assemblages is underpowered to resolve, and we state the claim at that bound rather than beyond it. The other three signatures do not track closure reliably here. The neutral departure is due to its non-monotonicity with respect to conformity and size-sensitivity. The spatial boundary is problematic because there are too few spatial clusters, and seriation coherence is weak, so we report them as corroboration rather than as independent confirmations. This reduction is a property of the record. When a known closure signal is injected instead through a within-group conformity pathway or a non-spatially-organized social-fragmentation pathway, neither the neutral nor the seriation signature recovers it either, so the three weak signatures fail at this resolution regardless of how closure is produced (Supplemental Text). The price is that the negative bounds are only closure expressed as between-group divergence. The closure carried purely by conformity, or by social structure not aligned with the spatial clusters, would lie below detection in this record at any strength. The second limit is the ordinal chronology. The basin radiocarbon corpus pools to five seriation anchors across a calibration plateau, so the axis is a relative order oriented toward later time at Spearman +0.70, imperfectly. The discriminating quantity, the size-controlled F_ST trend, is a magnitude that does not depend on the axis orientation, and the settlement and exchange lines do not depend on the ceramic chronology at all. The third limit is time-averaging, which damps between-assemblage variation and reduces apparent turnover</w:t>
-      </w:r>
-      <w:r>
-        <w:t xml:space="preserve"> </w:t>
-      </w:r>
-      <w:r>
-        <w:t xml:space="preserve">(Coco and Iovita 2020; Kidwell and Tomašových 2013; Perreault 2018; Tomašových and Kidwell 2009, 2010; Youngblood et al. 2023)</w:t>
-      </w:r>
-      <w:r>
-        <w:t xml:space="preserve">. Rather than argue that this makes the absence conservative, we built the damping into the recovery experiment directly, where it raises the detection threshold from s of 0.5 to 0.7, the quantified cost of the record’s temporal mixing. The verdict is stable across the watershed (19 assemblages) and corridor (29) basin definitions. The central methodological finding is that telling a bounded group from drift must be calibrated to the record to which it is applied. The same four signatures that discriminate cleanly on idealized data reduce, on a real time-averaged record of this size, to a single confound-controlled signature, and saying so is what licenses reading the structure as drift rather than weakening the claim.</w:t>
-      </w:r>
-    </w:p>
-    <w:p>
-      <w:pPr>
-        <w:pStyle w:val="BodyText"/>
-      </w:pPr>
-      <w:r>
-        <w:t xml:space="preserve">The contribution has two parts that should be kept distinct. The four signatures distinguish a bounded interaction group from drift in principle, and an idealized simulation confirms that closure drives them together while drift and the other mimics do not (Figure S4). The calibration is the part that travels to real data: it asks, before any similarity structure is read as social, which signatures a given record can support and how strong a closure each could detect, and on the Parkin record, it shows the test reducing to its single most robust component, cultural F_ST. We are explicit about what that costs: had F_ST shown a positive trend, it alone could not have separated a real group from environmental patchiness, which also drives between-group variance (Table 1), so on a positive result, the generative drift-versus-groups comparison, not F_ST alone, would have had to carry the discrimination. The negative is cleaner because the present structure is positively matched by drift and overshot by bounded groups. From this result, we can demonstrate that it may be possible to measure social structure among deposits with decorated assemblages. We can also assess whether the Parkin phase was a polity by examining whether interaction had closed into a bounded group to a degree that the record can resolve. For the Parkin phase, the answer is that it had not, within the bounds supported by the record. The polity the De Soto encountered seems to reflect distinctions drawn in ceremonial practices, fortification, and settlement size, rather than one written into the structure of ceramic transmission.</w:t>
-      </w:r>
-    </w:p>
-    <w:p>
-      <w:pPr>
-        <w:pStyle w:val="BodyText"/>
-      </w:pPr>
-      <w:r>
-        <w:t xml:space="preserve">The test also extends beyond the basin, and the extension is instructive (Figure 8). Applied to the southeast-Missouri assemblages compiled by Williams</w:t>
-      </w:r>
-      <w:r>
-        <w:t xml:space="preserve"> </w:t>
-      </w:r>
-      <w:r>
-        <w:t xml:space="preserve">(1954)</w:t>
-      </w:r>
-      <w:r>
-        <w:t xml:space="preserve">, the within-region decorated-ceramic structure is again drift-consistent once the earlier Woodland component is set aside. Therefore, the absence of bounded groups is not peculiar to the St. Francis basin (Figure 9). In both regions, the observed between-cluster F_ST sits at the neutral-drift level and far below the bounded-groups expectation (LMV +0.02, CMV +0.03, against bounded-groups nulls of +0.11 and +0.08), and the assemblages intermix rather than separating into clusters. Between the two regions, a genuine discontinuity does appear. Across the roughly 50 km gap separating the central-valley and lower-valley assemblage clusters, decorated similarity declines by far more than neutral spatial drift would predict for the same geometry, and the two regions carry mutually exclusive, distinctive decorated repertoires (Figure S6). This is the scale-dependent pattern the test is designed to detect, with no closure within regions and a sharp difference between them. We report it as a pattern rather than a verdict, because it is confounded with time.</w:t>
-      </w:r>
-    </w:p>
-    <w:p>
-      <w:pPr>
-        <w:pStyle w:val="BodyText"/>
-      </w:pPr>
-      <w:r>
-        <w:t xml:space="preserve">The distinctive central-valley types are early-to-middle Mississippian, and the distinctive lower-valley types are late</w:t>
-      </w:r>
-      <w:r>
-        <w:t xml:space="preserve"> </w:t>
-      </w:r>
-      <w:r>
-        <w:t xml:space="preserve">(Phillips 1970; Williams 1954)</w:t>
-      </w:r>
-      <w:r>
-        <w:t xml:space="preserve">, so the step at the boundary cannot be separated from the early-to-late turnover of the repertoire with time-averaged surface collections, and resolving whether the inter-regional boundary is synchronic and social or a chronological succession would require independent radiocarbon control on the central-valley assemblages that the present compilation lacks. A second confound compounds the first. The lower-valley assemblages were collected and classified by Ford, later by Phillips, Ford, and Griffin. In contrast, the central-valley assemblages were collected and classified separately by Williams, so the two blocks differ in analyst, sorting convention, and type definition as well as in space and time. The shared-type restriction guards against the crudest version of this artifact, because a boundary built only from types unique to each typology would vanish when only the types both traditions record are compared, and the boundary does weaken under that restriction without disappearing. Even the shared types, however, may have been sorted to subtly different criteria by the two traditions. We therefore cannot rule out that the apparent central-valley and lower-valley boundary is in part an artifact of two separate analytical histories, and that the possibility of continuous interaction across the whole region, with no real boundary anywhere, remains open. That possibility is part of the question this study raises, rather than a nuisance to be set aside, because a boundary in the data is not yet a boundary in the past. The paper’s point at the local scale applies with equal force between the regions.</w:t>
+        <w:t xml:space="preserve">That characterization can be made constructive rather than merely consistent with the data. Run the finite-population network-drift model forward on the real configuration of the 29 basin assemblages, with copying that decays with along-waterway distance and no boundary imposed, and the structure the phase concept reads as a society reappears on its own</w:t>
+      </w:r>
+      <w:r>
+        <w:t xml:space="preserve"> </w:t>
+      </w:r>
+      <w:r>
+        <w:t xml:space="preserve">(Lipo et al. 2021)</w:t>
+      </w:r>
+      <w:r>
+        <w:t xml:space="preserve">. The deposits are not contemporaneous, which is why they can be seriated at all and why some carry more of the late types than others, so each synthetic assemblage is drawn time-transgressively at the run-time that matches its seriation position and accumulated over a window rather than read from a single instant. Repeated across 500 realizations, the model yields not one partition but a distribution of them, so membership in Parkin’s group is a probability rather than a fact (Figure 8). Holding time fixed to isolate the spatial signal, that probability falls off smoothly with river distance from Parkin (Figure 8A): nearby assemblages usually share its emergent community and distant ones usually do not, ranging from about 0.70 to 0.17 with no assemblage a certain member or non-member, a graded field rather than the bounded set a phase map implies. Restoring the staggered deposition ages removes even that gradient, because assemblages caught at different points in the sequence carry different repertoires and fall into different, time-defined communities, so a site’s nearest neighbors need not share its phase. The between-group cultural F_ST of the emergent groups settles at the observed level either way, near 0.02 to 0.03 against an observed 0.04, well below the value a bounded group would leave (Figure 8B), and the synthetic record re-seriates (Figure S7). Geography and time are the whole engine, and the apparent groups are two readings of one neutral process. That spatial and population structure, not population size, governs how drift partitions diversity in finite structured populations is established in both the cultural-transmission and population-genetics literatures</w:t>
+      </w:r>
+      <w:r>
+        <w:t xml:space="preserve"> </w:t>
+      </w:r>
+      <w:r>
+        <w:t xml:space="preserve">(Barton 1996; Premo 2016; Schneider et al. 2016; Wright 1943)</w:t>
+      </w:r>
+      <w:r>
+        <w:t xml:space="preserve">, and a localized neutral process is readily mistaken for biased transmission when diversity is read at face value</w:t>
+      </w:r>
+      <w:r>
+        <w:t xml:space="preserve"> </w:t>
+      </w:r>
+      <w:r>
+        <w:t xml:space="preserve">(Premo and Scholnick 2011)</w:t>
+      </w:r>
+      <w:r>
+        <w:t xml:space="preserve">. Structure shapes diversity under selective dynamics as well, through a different mechanism of maintenance and recombination</w:t>
+      </w:r>
+      <w:r>
+        <w:t xml:space="preserve"> </w:t>
+      </w:r>
+      <w:r>
+        <w:t xml:space="preserve">(Derex et al. 2018; Derex and Boyd 2016; Saxer et al. 2009)</w:t>
+      </w:r>
+      <w:r>
+        <w:t xml:space="preserve">. This is not contingent on a tuned parameter set. Across 432 runs spanning a grid of interaction length, between-node mixing, and innovation rate, two or more spatially coherent communities emerge in every run and the between-group F_ST sits at or below the observed value in 85 percent, falling with more mixing or innovation but never approaching the bounded-groups level (Figure S7). The demonstration is illustrative rather than fitted, and the seriation recovery is moderate, but phase-like structure at the observed magnitude is a generic outcome of distance-structured drift on this geography.</w:t>
       </w:r>
     </w:p>
     <w:p>
@@ -2579,20 +2538,182 @@
       <w:r>
         <w:drawing>
           <wp:inline>
-            <wp:extent cx="4572000" cy="4685221"/>
+            <wp:extent cx="5334000" cy="4248345"/>
             <wp:effectExtent b="0" l="0" r="0" t="0"/>
-            <wp:docPr descr="Figure 8. Regional setting of the two-scale comparison. Decorated-ceramic assemblages of the central Mississippi Valley: the southeast-Missouri survey of Williams (CMV, blue) and the lower-valley St. Francis basin Parkin-phase assemblages (LMV, orange), with the gap between the two clusters of collections and Parkin starred. Labels mark the named physiographic phase regions (Cairo Lowland, Sikeston Ridge, Malden Plain, and Little River in the central valley, with the St. Francis basin in the lower valley). Hydrography combines the Lower Mississippi Survey layer with Natural Earth, state boundaries, and the North America locator inset, which are from Natural Earth. The central-valley assemblages were collected and classified by Williams, and the lower-valley assemblages in the Phillips-Ford-Griffin tradition, the separate analytical histories discussed in the text." title="" id="45" name="Picture"/>
+            <wp:docPr descr="Figure 8. Phase-like structure generated by neutral drift on the real basin geography, with no bounded group imposed, summarized over 500 realizations. A neutral finite-population drift model runs forward on the actual coordinates of the 29 St. Francis basin assemblages, with copying that decays with along-waterway (river-network) distance and new decorated types arising through time (Supplemental Text). (A) Each assemblage on the river basemap, shaded by the probability that it falls in the same emergent community as Parkin (star) across the 500 runs, for the contemporaneous snapshot that isolates the spatial signal. The probability falls off smoothly with river distance from Parkin (Spearman rho = -0.72), from about 0.70 nearby to 0.17 far away, with no assemblage a certain member or non-member, so Parkin’s “phase” is a graded, probabilistic field rather than a bounded set. Under the full time-transgressive sampling the gradient disappears because membership then reflects time as well as space (Supplemental Text). (B) Between-group cultural F_ST for the observed data (black, 0.04) against contemporaneous and time-transgressive drift (means with standard deviation across the 500 runs, near 0.02 to 0.03); drift reproduces the observed level rather than the higher value a bounded group would leave. Parameters are the positive-control corner (interaction length 24 river-km, mixing 0.02, innovation 0.012); robustness across the factor grid is in Figure S7." title="" id="45" name="Picture"/>
             <a:graphic>
               <a:graphicData uri="http://schemas.openxmlformats.org/drawingml/2006/picture">
                 <pic:pic>
                   <pic:nvPicPr>
-                    <pic:cNvPr descr="../../figures/fig1_regional.png" id="46" name="Picture"/>
+                    <pic:cNvPr descr="../../figures/fig8_emergent_phases.png" id="46" name="Picture"/>
                     <pic:cNvPicPr>
                       <a:picLocks noChangeArrowheads="1" noChangeAspect="1"/>
                     </pic:cNvPicPr>
                   </pic:nvPicPr>
                   <pic:blipFill>
                     <a:blip r:embed="rId44"/>
+                    <a:stretch>
+                      <a:fillRect/>
+                    </a:stretch>
+                  </pic:blipFill>
+                  <pic:spPr bwMode="auto">
+                    <a:xfrm>
+                      <a:off x="0" y="0"/>
+                      <a:ext cx="5334000" cy="4248345"/>
+                    </a:xfrm>
+                    <a:prstGeom prst="rect">
+                      <a:avLst/>
+                    </a:prstGeom>
+                    <a:noFill/>
+                    <a:ln w="9525">
+                      <a:noFill/>
+                      <a:headEnd/>
+                      <a:tailEnd/>
+                    </a:ln>
+                  </pic:spPr>
+                </pic:pic>
+              </a:graphicData>
+            </a:graphic>
+          </wp:inline>
+        </w:drawing>
+      </w:r>
+    </w:p>
+    <w:p>
+      <w:pPr>
+        <w:pStyle w:val="ImageCaption"/>
+      </w:pPr>
+      <w:r>
+        <w:rPr>
+          <w:b/>
+          <w:bCs/>
+        </w:rPr>
+        <w:t xml:space="preserve">Figure 8.</w:t>
+      </w:r>
+      <w:r>
+        <w:t xml:space="preserve"> </w:t>
+      </w:r>
+      <w:r>
+        <w:t xml:space="preserve">Phase-like structure generated by neutral drift on the real basin geography, with no bounded group imposed, summarized over 500 realizations. A neutral finite-population drift model runs forward on the actual coordinates of the 29 St. Francis basin assemblages, with copying that decays with along-waterway (river-network) distance and new decorated types arising through time (Supplemental Text). (A) Each assemblage on the river basemap, shaded by the probability that it falls in the same emergent community as Parkin (star) across the 500 runs, for the contemporaneous snapshot that isolates the spatial signal. The probability falls off smoothly with river distance from Parkin (Spearman rho = -0.72), from about 0.70 nearby to 0.17 far away, with no assemblage a certain member or non-member, so Parkin’s</w:t>
+      </w:r>
+      <w:r>
+        <w:t xml:space="preserve"> </w:t>
+      </w:r>
+      <w:r>
+        <w:t xml:space="preserve">“phase”</w:t>
+      </w:r>
+      <w:r>
+        <w:t xml:space="preserve"> </w:t>
+      </w:r>
+      <w:r>
+        <w:t xml:space="preserve">is a graded, probabilistic field rather than a bounded set. Under the full time-transgressive sampling the gradient disappears because membership then reflects time as well as space (Supplemental Text). (B) Between-group cultural F_ST for the observed data (black, 0.04) against contemporaneous and time-transgressive drift (means with standard deviation across the 500 runs, near 0.02 to 0.03); drift reproduces the observed level rather than the higher value a bounded group would leave. Parameters are the positive-control corner (interaction length 24 river-km, mixing 0.02, innovation 0.012); robustness across the factor grid is in Figure S7.</w:t>
+      </w:r>
+    </w:p>
+    <w:p>
+      <w:pPr>
+        <w:pStyle w:val="BodyText"/>
+      </w:pPr>
+      <w:r>
+        <w:t xml:space="preserve">This finding provides the strongest case for the alternative hypothesis. The most direct argument for an emerging hierarchy holds that Parkin sits on agriculturally poor soil and so must have drawn tribute from the productive villages around it</w:t>
+      </w:r>
+      <w:r>
+        <w:t xml:space="preserve"> </w:t>
+      </w:r>
+      <w:r>
+        <w:t xml:space="preserve">(Morse 1990)</w:t>
+      </w:r>
+      <w:r>
+        <w:t xml:space="preserve">. The inference is specific and deserves credit for that, but it is circular. The tribute it concludes is the tribute it assumes, and no independent evidence of tribute flow accompanies it. Parkin’s position at the confluence of the St. Francis and Tyronza is as well explained by control of movement and communication as by extraction, and the transmission and exchange records both show the absence of the centralized control the tribute model requires. A second argument points to skeletal evidence from the lower Mississippi (Yazoo) Delta rather than the St. Francis basin, indicating a better diet at a mound center than at a nearby satellite village, consistent with differential access within a hierarchy</w:t>
+      </w:r>
+      <w:r>
+        <w:t xml:space="preserve"> </w:t>
+      </w:r>
+      <w:r>
+        <w:t xml:space="preserve">(Ross-Stallings 2017)</w:t>
+      </w:r>
+      <w:r>
+        <w:t xml:space="preserve">. The contrast is real but thin: the satellite sample numbers fourteen individuals, the result is presented as tentative, and a health difference between two sites does not require an extractive hierarchy to produce it. Neither argument supplies the regional, structural signature that the convergence test looks for and does not find.</w:t>
+      </w:r>
+    </w:p>
+    <w:p>
+      <w:pPr>
+        <w:pStyle w:val="BodyText"/>
+      </w:pPr>
+      <w:r>
+        <w:t xml:space="preserve">Three limits bound the result, and the recovery experiment forces the most important of them to the front. At this record’s resolution, the discrimination between a bounded group and drift rests on a single signature, cultural F_ST. That signature is confounded by a sample-size trend along the seriation axis (Spearman rho = +0.59). We removed the confound by subsampling every assemblage to a common count, which collapses the raw F_ST trend from +0.60 to +0.01. We calibrated the test on synthetic data matched to the record, in which F_ST recovers a moderate-strength closure (s of about 0.5, rising to 0.7 once the record’s time-averaging is imposed), while maintaining a false-positive rate of 5%. The size-controlled empirical F_ST is uninformative, its bootstrap interval spanning no closure to a moderate signal. The negative is therefore informative for a closure of moderate or greater strength, which would have registered as a resolved positive, but does not. It cannot exclude a weaker closure that a record of 29 time-averaged assemblages is underpowered to resolve, and we state the claim at that bound rather than beyond it. The other three signatures do not track closure reliably here. The neutral departure is due to its non-monotonicity with respect to conformity and size-sensitivity. The spatial boundary is problematic because there are too few spatial clusters, and seriation coherence is weak, so we report them as corroboration rather than as independent confirmations. This reduction is a property of the record. When a known closure signal is injected instead through a within-group conformity pathway or a non-spatially-organized social-fragmentation pathway, neither the neutral nor the seriation signature recovers it either, so the three weak signatures fail at this resolution regardless of how closure is produced (Supplemental Text). The price is that the negative bounds are only closure expressed as between-group divergence. The closure carried purely by conformity, or by social structure not aligned with the spatial clusters, would lie below detection in this record at any strength. The second limit is the ordinal chronology. The basin radiocarbon corpus pools to five seriation anchors across a calibration plateau, so the axis is a relative order oriented toward later time at Spearman +0.70, imperfectly. The discriminating quantity, the size-controlled F_ST trend, is a magnitude that does not depend on the axis orientation, and the settlement and exchange lines do not depend on the ceramic chronology at all. The third limit is time-averaging, which damps between-assemblage variation and reduces apparent turnover</w:t>
+      </w:r>
+      <w:r>
+        <w:t xml:space="preserve"> </w:t>
+      </w:r>
+      <w:r>
+        <w:t xml:space="preserve">(Coco and Iovita 2020; Kidwell and Tomašových 2013; Perreault 2018; Tomašových and Kidwell 2009, 2010; Youngblood et al. 2023)</w:t>
+      </w:r>
+      <w:r>
+        <w:t xml:space="preserve">. Rather than argue that this makes the absence conservative, we built the damping into the recovery experiment directly, where it raises the detection threshold from s of 0.5 to 0.7, the quantified cost of the record’s temporal mixing. The verdict is stable across the watershed (19 assemblages) and corridor (29) basin definitions. The central methodological finding is that telling a bounded group from drift must be calibrated to the record to which it is applied. The same four signatures that discriminate cleanly on idealized data reduce, on a real time-averaged record of this size, to a single confound-controlled signature, and saying so is what licenses reading the structure as drift rather than weakening the claim.</w:t>
+      </w:r>
+    </w:p>
+    <w:p>
+      <w:pPr>
+        <w:pStyle w:val="BodyText"/>
+      </w:pPr>
+      <w:r>
+        <w:t xml:space="preserve">The contribution has two parts that should be kept distinct. The four signatures distinguish a bounded interaction group from drift in principle, and an idealized simulation confirms that closure drives them together while drift and the other mimics do not (Figure S4). The calibration is the part that travels to real data: it asks, before any similarity structure is read as social, which signatures a given record can support and how strong a closure each could detect, and on the Parkin record, it shows the test reducing to its single most robust component, cultural F_ST. We are explicit about what that costs: had F_ST shown a positive trend, it alone could not have separated a real group from environmental patchiness, which also drives between-group variance (Table 1), so on a positive result, the generative drift-versus-groups comparison, not F_ST alone, would have had to carry the discrimination. The negative is cleaner because the present structure is positively matched by drift and overshot by bounded groups. From this result, we can demonstrate that it may be possible to measure social structure among deposits with decorated assemblages. We can also assess whether the Parkin phase was a polity by examining whether interaction had closed into a bounded group to a degree that the record can resolve. For the Parkin phase, the answer is that it had not, within the bounds supported by the record. The polity the De Soto encountered seems to reflect distinctions drawn in ceremonial practices, fortification, and settlement size, rather than one written into the structure of ceramic transmission.</w:t>
+      </w:r>
+    </w:p>
+    <w:p>
+      <w:pPr>
+        <w:pStyle w:val="BodyText"/>
+      </w:pPr>
+      <w:r>
+        <w:t xml:space="preserve">The test also extends beyond the basin, and the extension is instructive (Figure 9). Applied to the southeast-Missouri assemblages compiled by Williams</w:t>
+      </w:r>
+      <w:r>
+        <w:t xml:space="preserve"> </w:t>
+      </w:r>
+      <w:r>
+        <w:t xml:space="preserve">(1954)</w:t>
+      </w:r>
+      <w:r>
+        <w:t xml:space="preserve">, the within-region decorated-ceramic structure is again drift-consistent once the earlier Woodland component is set aside. Therefore, the absence of bounded groups is not peculiar to the St. Francis basin (Figure 10). In both regions, the observed between-cluster F_ST sits at the neutral-drift level and far below the bounded-groups expectation (LMV +0.02, CMV +0.03, against bounded-groups nulls of +0.11 and +0.08), and the assemblages intermix rather than separating into clusters. Between the two regions, a genuine discontinuity does appear. Across the roughly 50 km gap separating the central-valley and lower-valley assemblage clusters, decorated similarity declines by far more than neutral spatial drift would predict for the same geometry, and the two regions carry mutually exclusive, distinctive decorated repertoires (Figure S6). This is the scale-dependent pattern the test is designed to detect, with no closure within regions and a sharp difference between them. We report it as a pattern rather than a verdict, because it is confounded with time.</w:t>
+      </w:r>
+    </w:p>
+    <w:p>
+      <w:pPr>
+        <w:pStyle w:val="BodyText"/>
+      </w:pPr>
+      <w:r>
+        <w:t xml:space="preserve">The distinctive central-valley types are early-to-middle Mississippian, and the distinctive lower-valley types are late</w:t>
+      </w:r>
+      <w:r>
+        <w:t xml:space="preserve"> </w:t>
+      </w:r>
+      <w:r>
+        <w:t xml:space="preserve">(Phillips 1970; Williams 1954)</w:t>
+      </w:r>
+      <w:r>
+        <w:t xml:space="preserve">, so the step at the boundary cannot be separated from the early-to-late turnover of the repertoire with time-averaged surface collections, and resolving whether the inter-regional boundary is synchronic and social or a chronological succession would require independent radiocarbon control on the central-valley assemblages that the present compilation lacks. A second confound compounds the first. The lower-valley assemblages were collected and classified by Ford, later by Phillips, Ford, and Griffin. In contrast, the central-valley assemblages were collected and classified separately by Williams, so the two blocks differ in analyst, sorting convention, and type definition as well as in space and time. The shared-type restriction guards against the crudest version of this artifact, because a boundary built only from types unique to each typology would vanish when only the types both traditions record are compared, and the boundary does weaken under that restriction without disappearing. Even the shared types, however, may have been sorted to subtly different criteria by the two traditions. We therefore cannot rule out that the apparent central-valley and lower-valley boundary is in part an artifact of two separate analytical histories, and that the possibility of continuous interaction across the whole region, with no real boundary anywhere, remains open. That possibility is part of the question this study raises, rather than a nuisance to be set aside, because a boundary in the data is not yet a boundary in the past. The paper’s point at the local scale applies with equal force between the regions.</w:t>
+      </w:r>
+    </w:p>
+    <w:p>
+      <w:pPr>
+        <w:pStyle w:val="CaptionedFigure"/>
+      </w:pPr>
+      <w:r>
+        <w:drawing>
+          <wp:inline>
+            <wp:extent cx="4572000" cy="4685221"/>
+            <wp:effectExtent b="0" l="0" r="0" t="0"/>
+            <wp:docPr descr="Figure 9. Regional setting of the two-scale comparison. Decorated-ceramic assemblages of the central Mississippi Valley: the southeast-Missouri survey of Williams (CMV, blue) and the lower-valley St. Francis basin Parkin-phase assemblages (LMV, orange), with the gap between the two clusters of collections and Parkin starred. Labels mark the named physiographic phase regions (Cairo Lowland, Sikeston Ridge, Malden Plain, and Little River in the central valley, with the St. Francis basin in the lower valley). Hydrography combines the Lower Mississippi Survey layer with Natural Earth, state boundaries, and the North America locator inset, which are from Natural Earth. The central-valley assemblages were collected and classified by Williams, and the lower-valley assemblages in the Phillips-Ford-Griffin tradition, the separate analytical histories discussed in the text." title="" id="48" name="Picture"/>
+            <a:graphic>
+              <a:graphicData uri="http://schemas.openxmlformats.org/drawingml/2006/picture">
+                <pic:pic>
+                  <pic:nvPicPr>
+                    <pic:cNvPr descr="../../figures/fig1_regional.png" id="49" name="Picture"/>
+                    <pic:cNvPicPr>
+                      <a:picLocks noChangeArrowheads="1" noChangeAspect="1"/>
+                    </pic:cNvPicPr>
+                  </pic:nvPicPr>
+                  <pic:blipFill>
+                    <a:blip r:embed="rId47"/>
                     <a:stretch>
                       <a:fillRect/>
                     </a:stretch>
@@ -2628,7 +2749,7 @@
           <w:b/>
           <w:bCs/>
         </w:rPr>
-        <w:t xml:space="preserve">Figure 8.</w:t>
+        <w:t xml:space="preserve">Figure 9.</w:t>
       </w:r>
       <w:r>
         <w:t xml:space="preserve"> </w:t>
@@ -2646,18 +2767,18 @@
           <wp:inline>
             <wp:extent cx="4754880" cy="3753325"/>
             <wp:effectExtent b="0" l="0" r="0" t="0"/>
-            <wp:docPr descr="Figure 9. Within-region interaction structure: neither region forms bounded groups. Top: multidimensional scaling of decorated Brainerd-Robinson dissimilarity for the LMV St. Francis basin and for the CMV southeast-Missouri assemblages (Mississippian types only, so the comparison is not driven by the Woodland-to-Mississippian gradient), points colored by within-region spatial cluster, and the assemblages intermix rather than separating into clusters. Bottom: the observed between-cluster cultural F_ST for each region (diamond) against the 95% nulls of a neutral spatial-drift model (blue) and a bounded-groups model (orange) run on the real coordinates and subsampled to the observed counts. In both regions, the observed F_ST sits at the drift level and far below the bounded-groups expectation, so the within-region structure is drift-consistent at both scales." title="" id="48" name="Picture"/>
+            <wp:docPr descr="Figure 10. Within-region interaction structure: neither region forms bounded groups. Top: multidimensional scaling of decorated Brainerd-Robinson dissimilarity for the LMV St. Francis basin and for the CMV southeast-Missouri assemblages (Mississippian types only, so the comparison is not driven by the Woodland-to-Mississippian gradient), points colored by within-region spatial cluster, and the assemblages intermix rather than separating into clusters. Bottom: the observed between-cluster cultural F_ST for each region (diamond) against the 95% nulls of a neutral spatial-drift model (blue) and a bounded-groups model (orange) run on the real coordinates and subsampled to the observed counts. In both regions, the observed F_ST sits at the drift level and far below the bounded-groups expectation, so the within-region structure is drift-consistent at both scales." title="" id="51" name="Picture"/>
             <a:graphic>
               <a:graphicData uri="http://schemas.openxmlformats.org/drawingml/2006/picture">
                 <pic:pic>
                   <pic:nvPicPr>
-                    <pic:cNvPr descr="../../figures/fig9_within_region.png" id="49" name="Picture"/>
+                    <pic:cNvPr descr="../../figures/fig9_within_region.png" id="52" name="Picture"/>
                     <pic:cNvPicPr>
                       <a:picLocks noChangeArrowheads="1" noChangeAspect="1"/>
                     </pic:cNvPicPr>
                   </pic:nvPicPr>
                   <pic:blipFill>
-                    <a:blip r:embed="rId47"/>
+                    <a:blip r:embed="rId50"/>
                     <a:stretch>
                       <a:fillRect/>
                     </a:stretch>
@@ -2693,7 +2814,7 @@
           <w:b/>
           <w:bCs/>
         </w:rPr>
-        <w:t xml:space="preserve">Figure 9.</w:t>
+        <w:t xml:space="preserve">Figure 10.</w:t>
       </w:r>
       <w:r>
         <w:t xml:space="preserve"> </w:t>
@@ -2764,8 +2885,8 @@
         <w:t xml:space="preserve">. The detail is in the Supplemental Text.</w:t>
       </w:r>
     </w:p>
-    <w:bookmarkEnd w:id="50"/>
-    <w:bookmarkStart w:id="51" w:name="conclusion"/>
+    <w:bookmarkEnd w:id="53"/>
+    <w:bookmarkStart w:id="54" w:name="conclusion"/>
     <w:p>
       <w:pPr>
         <w:pStyle w:val="Heading2"/>
@@ -2782,8 +2903,8 @@
         <w:t xml:space="preserve">The phase is the unit on which central-valley culture history is built, and it carries a silent claim that assemblages grouped by seriation and spatial proximity record a bounded society. For the Parkin phase, that claim does not survive measurement. Parkin is the basin’s largest and tallest-mounded center. No line of evidence, settlement, exchange, or ceramic transmission marks it as the apex of a polity, and the greater similarity among nearby assemblages that defines the phase is reproduced by neutral drift on the basin’s geography, the ordinary residue of continuous interaction structured by where sites sit. A bounded interaction group would have a sharper structure than the measurements indicate, and Parkin sits across orderings as a transmission bridge rather than at the closed core of one. Extending the test to the wider valley, a decorated-ceramic boundary that exceeds drift appears only between the central-valley and lower-valley blocks, and even there, it is entangled with the early-to-late turnover of the type repertoire. It cannot yet be read as a synchronic social division. The phase, at the scale where it is drawn, is largely indistinguishable from spatially structured drift, which carries a consequence the discipline should weigh: a similarity cluster is not by itself a society, and before a phase is read as a social group, the record must be shown able to tell a real interaction boundary from drift on geography. That calibration, not the phase, provides the basis for an explanation of social structure. When applied to the late pre-contact ceramics of the Mississippi Valley, it yields a landscape of continuous interaction with prominent nodes rather than a mosaic of bounded polities.</w:t>
       </w:r>
     </w:p>
-    <w:bookmarkEnd w:id="51"/>
-    <w:bookmarkStart w:id="52" w:name="data-and-code-availability"/>
+    <w:bookmarkEnd w:id="54"/>
+    <w:bookmarkStart w:id="55" w:name="data-and-code-availability"/>
     <w:p>
       <w:pPr>
         <w:pStyle w:val="Heading2"/>
@@ -2800,8 +2921,8 @@
         <w:t xml:space="preserve">All data and code needed to reproduce the analyses and figures reported here are openly available at https://github.com/clipo/phases. The repository includes the decorated-ceramic type counts, the georeferencing and radiocarbon data, the complete analysis procedure, and instructions for reproducing all results and figures. The code is released under the MIT License, and the data under a Creative Commons Attribution 4.0 International license.</w:t>
       </w:r>
     </w:p>
-    <w:bookmarkEnd w:id="52"/>
-    <w:bookmarkStart w:id="216" w:name="references"/>
+    <w:bookmarkEnd w:id="55"/>
+    <w:bookmarkStart w:id="233" w:name="references"/>
     <w:p>
       <w:pPr>
         <w:pStyle w:val="Heading2"/>
@@ -2810,8 +2931,8 @@
         <w:t xml:space="preserve">References</w:t>
       </w:r>
     </w:p>
-    <w:bookmarkStart w:id="215" w:name="refs"/>
-    <w:bookmarkStart w:id="53" w:name="ref-anderson_1996"/>
+    <w:bookmarkStart w:id="232" w:name="refs"/>
+    <w:bookmarkStart w:id="56" w:name="ref-anderson_1996"/>
     <w:p>
       <w:pPr>
         <w:pStyle w:val="Bibliography"/>
@@ -2833,8 +2954,8 @@
         <w:t xml:space="preserve">, edited by John F. Scarry, pp. 231–252. University Press of Florida, Gainesville.</w:t>
       </w:r>
     </w:p>
-    <w:bookmarkEnd w:id="53"/>
-    <w:bookmarkStart w:id="55" w:name="ref-bailey_2007"/>
+    <w:bookmarkEnd w:id="56"/>
+    <w:bookmarkStart w:id="58" w:name="ref-bailey_2007"/>
     <w:p>
       <w:pPr>
         <w:pStyle w:val="Bibliography"/>
@@ -2861,7 +2982,7 @@
       <w:r>
         <w:t xml:space="preserve"> </w:t>
       </w:r>
-      <w:hyperlink r:id="rId54">
+      <w:hyperlink r:id="rId57">
         <w:r>
           <w:rPr>
             <w:rStyle w:val="Hyperlink"/>
@@ -2873,8 +2994,8 @@
         <w:t xml:space="preserve">.</w:t>
       </w:r>
     </w:p>
-    <w:bookmarkEnd w:id="55"/>
-    <w:bookmarkStart w:id="57" w:name="ref-barrett_2019"/>
+    <w:bookmarkEnd w:id="58"/>
+    <w:bookmarkStart w:id="60" w:name="ref-barrett_2019"/>
     <w:p>
       <w:pPr>
         <w:pStyle w:val="Bibliography"/>
@@ -2901,7 +3022,7 @@
       <w:r>
         <w:t xml:space="preserve"> </w:t>
       </w:r>
-      <w:hyperlink r:id="rId56">
+      <w:hyperlink r:id="rId59">
         <w:r>
           <w:rPr>
             <w:rStyle w:val="Hyperlink"/>
@@ -2913,8 +3034,48 @@
         <w:t xml:space="preserve">.</w:t>
       </w:r>
     </w:p>
-    <w:bookmarkEnd w:id="57"/>
-    <w:bookmarkStart w:id="58" w:name="ref-baxter_1994"/>
+    <w:bookmarkEnd w:id="60"/>
+    <w:bookmarkStart w:id="62" w:name="ref-barton_1996"/>
+    <w:p>
+      <w:pPr>
+        <w:pStyle w:val="Bibliography"/>
+      </w:pPr>
+      <w:r>
+        <w:t xml:space="preserve">Barton, N. H. 1996. Natural Selection and Random Genetic Drift as Causes of Evolution on Islands.</w:t>
+      </w:r>
+      <w:r>
+        <w:t xml:space="preserve"> </w:t>
+      </w:r>
+      <w:r>
+        <w:rPr>
+          <w:i/>
+          <w:iCs/>
+        </w:rPr>
+        <w:t xml:space="preserve">Philosophical Transactions of the Royal Society B</w:t>
+      </w:r>
+      <w:r>
+        <w:t xml:space="preserve"> </w:t>
+      </w:r>
+      <w:r>
+        <w:t xml:space="preserve">351(1341):785–795.</w:t>
+      </w:r>
+      <w:r>
+        <w:t xml:space="preserve"> </w:t>
+      </w:r>
+      <w:hyperlink r:id="rId61">
+        <w:r>
+          <w:rPr>
+            <w:rStyle w:val="Hyperlink"/>
+          </w:rPr>
+          <w:t xml:space="preserve">https://doi.org/10.1098/rstb.1996.0073</w:t>
+        </w:r>
+      </w:hyperlink>
+      <w:r>
+        <w:t xml:space="preserve">.</w:t>
+      </w:r>
+    </w:p>
+    <w:bookmarkEnd w:id="62"/>
+    <w:bookmarkStart w:id="63" w:name="ref-baxter_1994"/>
     <w:p>
       <w:pPr>
         <w:pStyle w:val="Bibliography"/>
@@ -2936,8 +3097,8 @@
         <w:t xml:space="preserve">. Edinburgh University Press, Edinburgh.</w:t>
       </w:r>
     </w:p>
-    <w:bookmarkEnd w:id="58"/>
-    <w:bookmarkStart w:id="60" w:name="ref-beck_2003"/>
+    <w:bookmarkEnd w:id="63"/>
+    <w:bookmarkStart w:id="65" w:name="ref-beck_2003"/>
     <w:p>
       <w:pPr>
         <w:pStyle w:val="Bibliography"/>
@@ -2976,7 +3137,7 @@
       <w:r>
         <w:t xml:space="preserve"> </w:t>
       </w:r>
-      <w:hyperlink r:id="rId59">
+      <w:hyperlink r:id="rId64">
         <w:r>
           <w:rPr>
             <w:rStyle w:val="Hyperlink"/>
@@ -2988,8 +3149,8 @@
         <w:t xml:space="preserve">.</w:t>
       </w:r>
     </w:p>
-    <w:bookmarkEnd w:id="60"/>
-    <w:bookmarkStart w:id="62" w:name="ref-behrensmeyer_kidwell_gastaldo_2000"/>
+    <w:bookmarkEnd w:id="65"/>
+    <w:bookmarkStart w:id="67" w:name="ref-behrensmeyer_kidwell_gastaldo_2000"/>
     <w:p>
       <w:pPr>
         <w:pStyle w:val="Bibliography"/>
@@ -3016,7 +3177,7 @@
       <w:r>
         <w:t xml:space="preserve"> </w:t>
       </w:r>
-      <w:hyperlink r:id="rId61">
+      <w:hyperlink r:id="rId66">
         <w:r>
           <w:rPr>
             <w:rStyle w:val="Hyperlink"/>
@@ -3028,8 +3189,8 @@
         <w:t xml:space="preserve">.</w:t>
       </w:r>
     </w:p>
-    <w:bookmarkEnd w:id="62"/>
-    <w:bookmarkStart w:id="64" w:name="ref-bell_richerson_mcelreath_2009"/>
+    <w:bookmarkEnd w:id="67"/>
+    <w:bookmarkStart w:id="69" w:name="ref-bell_richerson_mcelreath_2009"/>
     <w:p>
       <w:pPr>
         <w:pStyle w:val="Bibliography"/>
@@ -3056,7 +3217,7 @@
       <w:r>
         <w:t xml:space="preserve"> </w:t>
       </w:r>
-      <w:hyperlink r:id="rId63">
+      <w:hyperlink r:id="rId68">
         <w:r>
           <w:rPr>
             <w:rStyle w:val="Hyperlink"/>
@@ -3068,8 +3229,8 @@
         <w:t xml:space="preserve">.</w:t>
       </w:r>
     </w:p>
-    <w:bookmarkEnd w:id="64"/>
-    <w:bookmarkStart w:id="66" w:name="ref-bentley_2008"/>
+    <w:bookmarkEnd w:id="69"/>
+    <w:bookmarkStart w:id="71" w:name="ref-bentley_2008"/>
     <w:p>
       <w:pPr>
         <w:pStyle w:val="Bibliography"/>
@@ -3096,7 +3257,7 @@
       <w:r>
         <w:t xml:space="preserve"> </w:t>
       </w:r>
-      <w:hyperlink r:id="rId65">
+      <w:hyperlink r:id="rId70">
         <w:r>
           <w:rPr>
             <w:rStyle w:val="Hyperlink"/>
@@ -3108,8 +3269,8 @@
         <w:t xml:space="preserve">.</w:t>
       </w:r>
     </w:p>
-    <w:bookmarkEnd w:id="66"/>
-    <w:bookmarkStart w:id="68" w:name="ref-bentley_hahn_shennan_2004"/>
+    <w:bookmarkEnd w:id="71"/>
+    <w:bookmarkStart w:id="73" w:name="ref-bentley_hahn_shennan_2004"/>
     <w:p>
       <w:pPr>
         <w:pStyle w:val="Bibliography"/>
@@ -3136,7 +3297,7 @@
       <w:r>
         <w:t xml:space="preserve"> </w:t>
       </w:r>
-      <w:hyperlink r:id="rId67">
+      <w:hyperlink r:id="rId72">
         <w:r>
           <w:rPr>
             <w:rStyle w:val="Hyperlink"/>
@@ -3148,8 +3309,8 @@
         <w:t xml:space="preserve">.</w:t>
       </w:r>
     </w:p>
-    <w:bookmarkEnd w:id="68"/>
-    <w:bookmarkStart w:id="69" w:name="ref-binford_1981"/>
+    <w:bookmarkEnd w:id="73"/>
+    <w:bookmarkStart w:id="74" w:name="ref-binford_1981"/>
     <w:p>
       <w:pPr>
         <w:pStyle w:val="Bibliography"/>
@@ -3189,8 +3350,8 @@
         <w:t xml:space="preserve">37(3):195–208.</w:t>
       </w:r>
     </w:p>
-    <w:bookmarkEnd w:id="69"/>
-    <w:bookmarkStart w:id="71" w:name="ref-blitz_1999"/>
+    <w:bookmarkEnd w:id="74"/>
+    <w:bookmarkStart w:id="76" w:name="ref-blitz_1999"/>
     <w:p>
       <w:pPr>
         <w:pStyle w:val="Bibliography"/>
@@ -3229,7 +3390,7 @@
       <w:r>
         <w:t xml:space="preserve"> </w:t>
       </w:r>
-      <w:hyperlink r:id="rId70">
+      <w:hyperlink r:id="rId75">
         <w:r>
           <w:rPr>
             <w:rStyle w:val="Hyperlink"/>
@@ -3241,8 +3402,8 @@
         <w:t xml:space="preserve">.</w:t>
       </w:r>
     </w:p>
-    <w:bookmarkEnd w:id="71"/>
-    <w:bookmarkStart w:id="72" w:name="ref-brainerd_1951"/>
+    <w:bookmarkEnd w:id="76"/>
+    <w:bookmarkStart w:id="77" w:name="ref-brainerd_1951"/>
     <w:p>
       <w:pPr>
         <w:pStyle w:val="Bibliography"/>
@@ -3267,8 +3428,8 @@
         <w:t xml:space="preserve">16(4):301–313.</w:t>
       </w:r>
     </w:p>
-    <w:bookmarkEnd w:id="72"/>
-    <w:bookmarkStart w:id="74" w:name="ref-carrignon_bentley_ruck_2019"/>
+    <w:bookmarkEnd w:id="77"/>
+    <w:bookmarkStart w:id="79" w:name="ref-carrignon_bentley_ruck_2019"/>
     <w:p>
       <w:pPr>
         <w:pStyle w:val="Bibliography"/>
@@ -3319,7 +3480,7 @@
       <w:r>
         <w:t xml:space="preserve"> </w:t>
       </w:r>
-      <w:hyperlink r:id="rId73">
+      <w:hyperlink r:id="rId78">
         <w:r>
           <w:rPr>
             <w:rStyle w:val="Hyperlink"/>
@@ -3331,8 +3492,8 @@
         <w:t xml:space="preserve">.</w:t>
       </w:r>
     </w:p>
-    <w:bookmarkEnd w:id="74"/>
-    <w:bookmarkStart w:id="75" w:name="ref-cobb_2000"/>
+    <w:bookmarkEnd w:id="79"/>
+    <w:bookmarkStart w:id="80" w:name="ref-cobb_2000"/>
     <w:p>
       <w:pPr>
         <w:pStyle w:val="Bibliography"/>
@@ -3382,8 +3543,8 @@
         <w:t xml:space="preserve">. University of Alabama Press, Tuscaloosa.</w:t>
       </w:r>
     </w:p>
-    <w:bookmarkEnd w:id="75"/>
-    <w:bookmarkStart w:id="76" w:name="ref-cobb_butler_2002"/>
+    <w:bookmarkEnd w:id="80"/>
+    <w:bookmarkStart w:id="81" w:name="ref-cobb_butler_2002"/>
     <w:p>
       <w:pPr>
         <w:pStyle w:val="Bibliography"/>
@@ -3432,8 +3593,8 @@
         <w:t xml:space="preserve">67(4):625–641.</w:t>
       </w:r>
     </w:p>
-    <w:bookmarkEnd w:id="76"/>
-    <w:bookmarkStart w:id="78" w:name="ref-cobb_etal_2024"/>
+    <w:bookmarkEnd w:id="81"/>
+    <w:bookmarkStart w:id="83" w:name="ref-cobb_etal_2024"/>
     <w:p>
       <w:pPr>
         <w:pStyle w:val="Bibliography"/>
@@ -3481,7 +3642,7 @@
       <w:r>
         <w:t xml:space="preserve"> </w:t>
       </w:r>
-      <w:hyperlink r:id="rId77">
+      <w:hyperlink r:id="rId82">
         <w:r>
           <w:rPr>
             <w:rStyle w:val="Hyperlink"/>
@@ -3493,8 +3654,8 @@
         <w:t xml:space="preserve">.</w:t>
       </w:r>
     </w:p>
-    <w:bookmarkEnd w:id="78"/>
-    <w:bookmarkStart w:id="80" w:name="ref-coco_iovita_2020"/>
+    <w:bookmarkEnd w:id="83"/>
+    <w:bookmarkStart w:id="85" w:name="ref-coco_iovita_2020"/>
     <w:p>
       <w:pPr>
         <w:pStyle w:val="Bibliography"/>
@@ -3521,7 +3682,7 @@
       <w:r>
         <w:t xml:space="preserve"> </w:t>
       </w:r>
-      <w:hyperlink r:id="rId79">
+      <w:hyperlink r:id="rId84">
         <w:r>
           <w:rPr>
             <w:rStyle w:val="Hyperlink"/>
@@ -3533,8 +3694,8 @@
         <w:t xml:space="preserve">.</w:t>
       </w:r>
     </w:p>
-    <w:bookmarkEnd w:id="80"/>
-    <w:bookmarkStart w:id="82" w:name="ref-crema_bortolini_lake_2023"/>
+    <w:bookmarkEnd w:id="85"/>
+    <w:bookmarkStart w:id="87" w:name="ref-crema_bortolini_lake_2023"/>
     <w:p>
       <w:pPr>
         <w:pStyle w:val="Bibliography"/>
@@ -3561,7 +3722,7 @@
       <w:r>
         <w:t xml:space="preserve"> </w:t>
       </w:r>
-      <w:hyperlink r:id="rId81">
+      <w:hyperlink r:id="rId86">
         <w:r>
           <w:rPr>
             <w:rStyle w:val="Hyperlink"/>
@@ -3573,8 +3734,8 @@
         <w:t xml:space="preserve">.</w:t>
       </w:r>
     </w:p>
-    <w:bookmarkEnd w:id="82"/>
-    <w:bookmarkStart w:id="84" w:name="ref-crema_edinborough_kerig_shennan_2014"/>
+    <w:bookmarkEnd w:id="87"/>
+    <w:bookmarkStart w:id="89" w:name="ref-crema_edinborough_kerig_shennan_2014"/>
     <w:p>
       <w:pPr>
         <w:pStyle w:val="Bibliography"/>
@@ -3613,7 +3774,7 @@
       <w:r>
         <w:t xml:space="preserve"> </w:t>
       </w:r>
-      <w:hyperlink r:id="rId83">
+      <w:hyperlink r:id="rId88">
         <w:r>
           <w:rPr>
             <w:rStyle w:val="Hyperlink"/>
@@ -3625,8 +3786,8 @@
         <w:t xml:space="preserve">.</w:t>
       </w:r>
     </w:p>
-    <w:bookmarkEnd w:id="84"/>
-    <w:bookmarkStart w:id="86" w:name="ref-crema_kandler_shennan_2016"/>
+    <w:bookmarkEnd w:id="89"/>
+    <w:bookmarkStart w:id="91" w:name="ref-crema_kandler_shennan_2016"/>
     <w:p>
       <w:pPr>
         <w:pStyle w:val="Bibliography"/>
@@ -3653,7 +3814,7 @@
       <w:r>
         <w:t xml:space="preserve"> </w:t>
       </w:r>
-      <w:hyperlink r:id="rId85">
+      <w:hyperlink r:id="rId90">
         <w:r>
           <w:rPr>
             <w:rStyle w:val="Hyperlink"/>
@@ -3665,8 +3826,8 @@
         <w:t xml:space="preserve">.</w:t>
       </w:r>
     </w:p>
-    <w:bookmarkEnd w:id="86"/>
-    <w:bookmarkStart w:id="88" w:name="ref-dakos_2012"/>
+    <w:bookmarkEnd w:id="91"/>
+    <w:bookmarkStart w:id="93" w:name="ref-dakos_2012"/>
     <w:p>
       <w:pPr>
         <w:pStyle w:val="Bibliography"/>
@@ -3693,7 +3854,7 @@
       <w:r>
         <w:t xml:space="preserve"> </w:t>
       </w:r>
-      <w:hyperlink r:id="rId87">
+      <w:hyperlink r:id="rId92">
         <w:r>
           <w:rPr>
             <w:rStyle w:val="Hyperlink"/>
@@ -3705,8 +3866,88 @@
         <w:t xml:space="preserve">.</w:t>
       </w:r>
     </w:p>
-    <w:bookmarkEnd w:id="88"/>
-    <w:bookmarkStart w:id="90" w:name="ref-dunnell_1970"/>
+    <w:bookmarkEnd w:id="93"/>
+    <w:bookmarkStart w:id="95" w:name="ref-derex_boyd_2016"/>
+    <w:p>
+      <w:pPr>
+        <w:pStyle w:val="Bibliography"/>
+      </w:pPr>
+      <w:r>
+        <w:t xml:space="preserve">Derex, Maxime, and Robert Boyd. 2016. Partial Connectivity Increases Cultural Accumulation Within Groups.</w:t>
+      </w:r>
+      <w:r>
+        <w:t xml:space="preserve"> </w:t>
+      </w:r>
+      <w:r>
+        <w:rPr>
+          <w:i/>
+          <w:iCs/>
+        </w:rPr>
+        <w:t xml:space="preserve">Proceedings of the National Academy of Sciences</w:t>
+      </w:r>
+      <w:r>
+        <w:t xml:space="preserve"> </w:t>
+      </w:r>
+      <w:r>
+        <w:t xml:space="preserve">113(11):2982–2987.</w:t>
+      </w:r>
+      <w:r>
+        <w:t xml:space="preserve"> </w:t>
+      </w:r>
+      <w:hyperlink r:id="rId94">
+        <w:r>
+          <w:rPr>
+            <w:rStyle w:val="Hyperlink"/>
+          </w:rPr>
+          <w:t xml:space="preserve">https://doi.org/10.1073/pnas.1518798113</w:t>
+        </w:r>
+      </w:hyperlink>
+      <w:r>
+        <w:t xml:space="preserve">.</w:t>
+      </w:r>
+    </w:p>
+    <w:bookmarkEnd w:id="95"/>
+    <w:bookmarkStart w:id="97" w:name="ref-derex_perreault_boyd_2018"/>
+    <w:p>
+      <w:pPr>
+        <w:pStyle w:val="Bibliography"/>
+      </w:pPr>
+      <w:r>
+        <w:t xml:space="preserve">Derex, Maxime, Charles Perreault, and Robert Boyd. 2018. Divide and Conquer: Intermediate Levels of Population Fragmentation Maximize Cultural Accumulation.</w:t>
+      </w:r>
+      <w:r>
+        <w:t xml:space="preserve"> </w:t>
+      </w:r>
+      <w:r>
+        <w:rPr>
+          <w:i/>
+          <w:iCs/>
+        </w:rPr>
+        <w:t xml:space="preserve">Philosophical Transactions of the Royal Society B</w:t>
+      </w:r>
+      <w:r>
+        <w:t xml:space="preserve"> </w:t>
+      </w:r>
+      <w:r>
+        <w:t xml:space="preserve">373(1743):20170062.</w:t>
+      </w:r>
+      <w:r>
+        <w:t xml:space="preserve"> </w:t>
+      </w:r>
+      <w:hyperlink r:id="rId96">
+        <w:r>
+          <w:rPr>
+            <w:rStyle w:val="Hyperlink"/>
+          </w:rPr>
+          <w:t xml:space="preserve">https://doi.org/10.1098/rstb.2017.0062</w:t>
+        </w:r>
+      </w:hyperlink>
+      <w:r>
+        <w:t xml:space="preserve">.</w:t>
+      </w:r>
+    </w:p>
+    <w:bookmarkEnd w:id="97"/>
+    <w:bookmarkStart w:id="99" w:name="ref-dunnell_1970"/>
     <w:p>
       <w:pPr>
         <w:pStyle w:val="Bibliography"/>
@@ -3733,7 +3974,7 @@
       <w:r>
         <w:t xml:space="preserve"> </w:t>
       </w:r>
-      <w:hyperlink r:id="rId89">
+      <w:hyperlink r:id="rId98">
         <w:r>
           <w:rPr>
             <w:rStyle w:val="Hyperlink"/>
@@ -3745,8 +3986,8 @@
         <w:t xml:space="preserve">.</w:t>
       </w:r>
     </w:p>
-    <w:bookmarkEnd w:id="90"/>
-    <w:bookmarkStart w:id="92" w:name="ref-dunnell_1978"/>
+    <w:bookmarkEnd w:id="99"/>
+    <w:bookmarkStart w:id="101" w:name="ref-dunnell_1978"/>
     <w:p>
       <w:pPr>
         <w:pStyle w:val="Bibliography"/>
@@ -3773,7 +4014,7 @@
       <w:r>
         <w:t xml:space="preserve"> </w:t>
       </w:r>
-      <w:hyperlink r:id="rId91">
+      <w:hyperlink r:id="rId100">
         <w:r>
           <w:rPr>
             <w:rStyle w:val="Hyperlink"/>
@@ -3785,8 +4026,8 @@
         <w:t xml:space="preserve">.</w:t>
       </w:r>
     </w:p>
-    <w:bookmarkEnd w:id="92"/>
-    <w:bookmarkStart w:id="93" w:name="ref-dunnell_1980"/>
+    <w:bookmarkEnd w:id="101"/>
+    <w:bookmarkStart w:id="102" w:name="ref-dunnell_1980"/>
     <w:p>
       <w:pPr>
         <w:pStyle w:val="Bibliography"/>
@@ -3808,8 +4049,8 @@
         <w:t xml:space="preserve">, edited by Michael B. Schiffer, pp. 35–99. Academic Press, New York.</w:t>
       </w:r>
     </w:p>
-    <w:bookmarkEnd w:id="93"/>
-    <w:bookmarkStart w:id="94" w:name="ref-dunnell_1995"/>
+    <w:bookmarkEnd w:id="102"/>
+    <w:bookmarkStart w:id="103" w:name="ref-dunnell_1995"/>
     <w:p>
       <w:pPr>
         <w:pStyle w:val="Bibliography"/>
@@ -3831,8 +4072,8 @@
         <w:t xml:space="preserve">, edited by Patrice A. Teltser, pp. 33–50. University of Arizona Press, Tucson.</w:t>
       </w:r>
     </w:p>
-    <w:bookmarkEnd w:id="94"/>
-    <w:bookmarkStart w:id="95" w:name="ref-dye_cox_1990"/>
+    <w:bookmarkEnd w:id="103"/>
+    <w:bookmarkStart w:id="104" w:name="ref-dye_cox_1990"/>
     <w:p>
       <w:pPr>
         <w:pStyle w:val="Bibliography"/>
@@ -3868,8 +4109,8 @@
         <w:t xml:space="preserve">. University of Alabama Press, Tuscaloosa.</w:t>
       </w:r>
     </w:p>
-    <w:bookmarkEnd w:id="95"/>
-    <w:bookmarkStart w:id="97" w:name="ref-eerkens_lipo_2005"/>
+    <w:bookmarkEnd w:id="104"/>
+    <w:bookmarkStart w:id="106" w:name="ref-eerkens_lipo_2005"/>
     <w:p>
       <w:pPr>
         <w:pStyle w:val="Bibliography"/>
@@ -3896,7 +4137,7 @@
       <w:r>
         <w:t xml:space="preserve"> </w:t>
       </w:r>
-      <w:hyperlink r:id="rId96">
+      <w:hyperlink r:id="rId105">
         <w:r>
           <w:rPr>
             <w:rStyle w:val="Hyperlink"/>
@@ -3908,8 +4149,8 @@
         <w:t xml:space="preserve">.</w:t>
       </w:r>
     </w:p>
-    <w:bookmarkEnd w:id="97"/>
-    <w:bookmarkStart w:id="99" w:name="ref-eerkens_lipo_2007"/>
+    <w:bookmarkEnd w:id="106"/>
+    <w:bookmarkStart w:id="108" w:name="ref-eerkens_lipo_2007"/>
     <w:p>
       <w:pPr>
         <w:pStyle w:val="Bibliography"/>
@@ -3936,7 +4177,7 @@
       <w:r>
         <w:t xml:space="preserve"> </w:t>
       </w:r>
-      <w:hyperlink r:id="rId98">
+      <w:hyperlink r:id="rId107">
         <w:r>
           <w:rPr>
             <w:rStyle w:val="Hyperlink"/>
@@ -3948,8 +4189,8 @@
         <w:t xml:space="preserve">.</w:t>
       </w:r>
     </w:p>
-    <w:bookmarkEnd w:id="99"/>
-    <w:bookmarkStart w:id="100" w:name="ref-ewens_1972"/>
+    <w:bookmarkEnd w:id="108"/>
+    <w:bookmarkStart w:id="109" w:name="ref-ewens_1972"/>
     <w:p>
       <w:pPr>
         <w:pStyle w:val="Bibliography"/>
@@ -3974,8 +4215,8 @@
         <w:t xml:space="preserve">3(1):87–112.</w:t>
       </w:r>
     </w:p>
-    <w:bookmarkEnd w:id="100"/>
-    <w:bookmarkStart w:id="102" w:name="ref-feder_kryazhimskiy_plotkin_2014"/>
+    <w:bookmarkEnd w:id="109"/>
+    <w:bookmarkStart w:id="111" w:name="ref-feder_kryazhimskiy_plotkin_2014"/>
     <w:p>
       <w:pPr>
         <w:pStyle w:val="Bibliography"/>
@@ -4002,7 +4243,7 @@
       <w:r>
         <w:t xml:space="preserve"> </w:t>
       </w:r>
-      <w:hyperlink r:id="rId101">
+      <w:hyperlink r:id="rId110">
         <w:r>
           <w:rPr>
             <w:rStyle w:val="Hyperlink"/>
@@ -4014,8 +4255,8 @@
         <w:t xml:space="preserve">.</w:t>
       </w:r>
     </w:p>
-    <w:bookmarkEnd w:id="102"/>
-    <w:bookmarkStart w:id="104" w:name="ref-fogarty_kandler_creanza_2024"/>
+    <w:bookmarkEnd w:id="111"/>
+    <w:bookmarkStart w:id="113" w:name="ref-fogarty_kandler_creanza_2024"/>
     <w:p>
       <w:pPr>
         <w:pStyle w:val="Bibliography"/>
@@ -4042,7 +4283,7 @@
       <w:r>
         <w:t xml:space="preserve"> </w:t>
       </w:r>
-      <w:hyperlink r:id="rId103">
+      <w:hyperlink r:id="rId112">
         <w:r>
           <w:rPr>
             <w:rStyle w:val="Hyperlink"/>
@@ -4054,8 +4295,8 @@
         <w:t xml:space="preserve">.</w:t>
       </w:r>
     </w:p>
-    <w:bookmarkEnd w:id="104"/>
-    <w:bookmarkStart w:id="105" w:name="ref-fox_1998"/>
+    <w:bookmarkEnd w:id="113"/>
+    <w:bookmarkStart w:id="114" w:name="ref-fox_1998"/>
     <w:p>
       <w:pPr>
         <w:pStyle w:val="Bibliography"/>
@@ -4077,8 +4318,8 @@
         <w:t xml:space="preserve">, edited by Michael J. O’Brien and Robert C. Dunnell, pp. 31–58. University of Alabama Press, Tuscaloosa.</w:t>
       </w:r>
     </w:p>
-    <w:bookmarkEnd w:id="105"/>
-    <w:bookmarkStart w:id="106" w:name="ref-graves_cachola-abad_1996"/>
+    <w:bookmarkEnd w:id="114"/>
+    <w:bookmarkStart w:id="115" w:name="ref-graves_cachola-abad_1996"/>
     <w:p>
       <w:pPr>
         <w:pStyle w:val="Bibliography"/>
@@ -4112,8 +4353,8 @@
         <w:t xml:space="preserve">31(1):19–32.</w:t>
       </w:r>
     </w:p>
-    <w:bookmarkEnd w:id="106"/>
-    <w:bookmarkStart w:id="107" w:name="ref-hally_1993"/>
+    <w:bookmarkEnd w:id="115"/>
+    <w:bookmarkStart w:id="116" w:name="ref-hally_1993"/>
     <w:p>
       <w:pPr>
         <w:pStyle w:val="Bibliography"/>
@@ -4147,8 +4388,8 @@
         <w:t xml:space="preserve">, edited by James B. Stoltman, pp. 143–167. Archaeological Report No. 25. Mississippi Department of Archives; History, Jackson.</w:t>
       </w:r>
     </w:p>
-    <w:bookmarkEnd w:id="107"/>
-    <w:bookmarkStart w:id="108" w:name="ref-hally_1996"/>
+    <w:bookmarkEnd w:id="116"/>
+    <w:bookmarkStart w:id="117" w:name="ref-hally_1996"/>
     <w:p>
       <w:pPr>
         <w:pStyle w:val="Bibliography"/>
@@ -4182,8 +4423,8 @@
         <w:t xml:space="preserve">, edited by John F. Scarry, pp. 92–127. University Press of Florida, Gainesville.</w:t>
       </w:r>
     </w:p>
-    <w:bookmarkEnd w:id="108"/>
-    <w:bookmarkStart w:id="110" w:name="ref-henrich_2001"/>
+    <w:bookmarkEnd w:id="117"/>
+    <w:bookmarkStart w:id="119" w:name="ref-henrich_2001"/>
     <w:p>
       <w:pPr>
         <w:pStyle w:val="Bibliography"/>
@@ -4210,7 +4451,7 @@
       <w:r>
         <w:t xml:space="preserve"> </w:t>
       </w:r>
-      <w:hyperlink r:id="rId109">
+      <w:hyperlink r:id="rId118">
         <w:r>
           <w:rPr>
             <w:rStyle w:val="Hyperlink"/>
@@ -4222,8 +4463,8 @@
         <w:t xml:space="preserve">.</w:t>
       </w:r>
     </w:p>
-    <w:bookmarkEnd w:id="110"/>
-    <w:bookmarkStart w:id="112" w:name="ref-henrich_2004"/>
+    <w:bookmarkEnd w:id="119"/>
+    <w:bookmarkStart w:id="121" w:name="ref-henrich_2004"/>
     <w:p>
       <w:pPr>
         <w:pStyle w:val="Bibliography"/>
@@ -4262,7 +4503,7 @@
       <w:r>
         <w:t xml:space="preserve"> </w:t>
       </w:r>
-      <w:hyperlink r:id="rId111">
+      <w:hyperlink r:id="rId120">
         <w:r>
           <w:rPr>
             <w:rStyle w:val="Hyperlink"/>
@@ -4274,8 +4515,8 @@
         <w:t xml:space="preserve">.</w:t>
       </w:r>
     </w:p>
-    <w:bookmarkEnd w:id="112"/>
-    <w:bookmarkStart w:id="114" w:name="ref-henrich_boyd_1998"/>
+    <w:bookmarkEnd w:id="121"/>
+    <w:bookmarkStart w:id="123" w:name="ref-henrich_boyd_1998"/>
     <w:p>
       <w:pPr>
         <w:pStyle w:val="Bibliography"/>
@@ -4302,7 +4543,7 @@
       <w:r>
         <w:t xml:space="preserve"> </w:t>
       </w:r>
-      <w:hyperlink r:id="rId113">
+      <w:hyperlink r:id="rId122">
         <w:r>
           <w:rPr>
             <w:rStyle w:val="Hyperlink"/>
@@ -4314,8 +4555,8 @@
         <w:t xml:space="preserve">.</w:t>
       </w:r>
     </w:p>
-    <w:bookmarkEnd w:id="114"/>
-    <w:bookmarkStart w:id="115" w:name="ref-holdaway_wandsnider_2008"/>
+    <w:bookmarkEnd w:id="123"/>
+    <w:bookmarkStart w:id="124" w:name="ref-holdaway_wandsnider_2008"/>
     <w:p>
       <w:pPr>
         <w:pStyle w:val="Bibliography"/>
@@ -4337,8 +4578,8 @@
         <w:t xml:space="preserve">. University of Utah Press, Salt Lake City.</w:t>
       </w:r>
     </w:p>
-    <w:bookmarkEnd w:id="115"/>
-    <w:bookmarkStart w:id="117" w:name="ref-holland-lulewicz_ritchison_2021"/>
+    <w:bookmarkEnd w:id="124"/>
+    <w:bookmarkStart w:id="126" w:name="ref-holland-lulewicz_ritchison_2021"/>
     <w:p>
       <w:pPr>
         <w:pStyle w:val="Bibliography"/>
@@ -4365,7 +4606,7 @@
       <w:r>
         <w:t xml:space="preserve"> </w:t>
       </w:r>
-      <w:hyperlink r:id="rId116">
+      <w:hyperlink r:id="rId125">
         <w:r>
           <w:rPr>
             <w:rStyle w:val="Hyperlink"/>
@@ -4377,8 +4618,8 @@
         <w:t xml:space="preserve">.</w:t>
       </w:r>
     </w:p>
-    <w:bookmarkEnd w:id="117"/>
-    <w:bookmarkStart w:id="118" w:name="ref-house_1993"/>
+    <w:bookmarkEnd w:id="126"/>
+    <w:bookmarkStart w:id="127" w:name="ref-house_1993"/>
     <w:p>
       <w:pPr>
         <w:pStyle w:val="Bibliography"/>
@@ -4403,8 +4644,8 @@
         <w:t xml:space="preserve">12(1):21–32.</w:t>
       </w:r>
     </w:p>
-    <w:bookmarkEnd w:id="118"/>
-    <w:bookmarkStart w:id="119" w:name="ref-hudson_smith_depratter_1990"/>
+    <w:bookmarkEnd w:id="127"/>
+    <w:bookmarkStart w:id="128" w:name="ref-hudson_smith_depratter_1990"/>
     <w:p>
       <w:pPr>
         <w:pStyle w:val="Bibliography"/>
@@ -4464,8 +4705,8 @@
         <w:t xml:space="preserve">, edited by David H. Dye and Cheryl Anne Cox, pp. 181–207. University of Alabama Press, Tuscaloosa.</w:t>
       </w:r>
     </w:p>
-    <w:bookmarkEnd w:id="119"/>
-    <w:bookmarkStart w:id="121" w:name="ref-hunt_2006"/>
+    <w:bookmarkEnd w:id="128"/>
+    <w:bookmarkStart w:id="130" w:name="ref-hunt_2006"/>
     <w:p>
       <w:pPr>
         <w:pStyle w:val="Bibliography"/>
@@ -4492,7 +4733,7 @@
       <w:r>
         <w:t xml:space="preserve"> </w:t>
       </w:r>
-      <w:hyperlink r:id="rId120">
+      <w:hyperlink r:id="rId129">
         <w:r>
           <w:rPr>
             <w:rStyle w:val="Hyperlink"/>
@@ -4504,8 +4745,8 @@
         <w:t xml:space="preserve">.</w:t>
       </w:r>
     </w:p>
-    <w:bookmarkEnd w:id="121"/>
-    <w:bookmarkStart w:id="123" w:name="ref-hunt_bell_travis_2008"/>
+    <w:bookmarkEnd w:id="130"/>
+    <w:bookmarkStart w:id="132" w:name="ref-hunt_bell_travis_2008"/>
     <w:p>
       <w:pPr>
         <w:pStyle w:val="Bibliography"/>
@@ -4532,7 +4773,7 @@
       <w:r>
         <w:t xml:space="preserve"> </w:t>
       </w:r>
-      <w:hyperlink r:id="rId122">
+      <w:hyperlink r:id="rId131">
         <w:r>
           <w:rPr>
             <w:rStyle w:val="Hyperlink"/>
@@ -4544,8 +4785,8 @@
         <w:t xml:space="preserve">.</w:t>
       </w:r>
     </w:p>
-    <w:bookmarkEnd w:id="123"/>
-    <w:bookmarkStart w:id="124" w:name="ref-hurlbert_1971"/>
+    <w:bookmarkEnd w:id="132"/>
+    <w:bookmarkStart w:id="133" w:name="ref-hurlbert_1971"/>
     <w:p>
       <w:pPr>
         <w:pStyle w:val="Bibliography"/>
@@ -4570,8 +4811,8 @@
         <w:t xml:space="preserve">52(4):577–586.</w:t>
       </w:r>
     </w:p>
-    <w:bookmarkEnd w:id="124"/>
-    <w:bookmarkStart w:id="126" w:name="ref-kandler_shennan_2013"/>
+    <w:bookmarkEnd w:id="133"/>
+    <w:bookmarkStart w:id="135" w:name="ref-kandler_shennan_2013"/>
     <w:p>
       <w:pPr>
         <w:pStyle w:val="Bibliography"/>
@@ -4598,7 +4839,7 @@
       <w:r>
         <w:t xml:space="preserve"> </w:t>
       </w:r>
-      <w:hyperlink r:id="rId125">
+      <w:hyperlink r:id="rId134">
         <w:r>
           <w:rPr>
             <w:rStyle w:val="Hyperlink"/>
@@ -4610,8 +4851,8 @@
         <w:t xml:space="preserve">.</w:t>
       </w:r>
     </w:p>
-    <w:bookmarkEnd w:id="126"/>
-    <w:bookmarkStart w:id="128" w:name="ref-kandler_shennan_2015"/>
+    <w:bookmarkEnd w:id="135"/>
+    <w:bookmarkStart w:id="137" w:name="ref-kandler_shennan_2015"/>
     <w:p>
       <w:pPr>
         <w:pStyle w:val="Bibliography"/>
@@ -4650,7 +4891,7 @@
       <w:r>
         <w:t xml:space="preserve"> </w:t>
       </w:r>
-      <w:hyperlink r:id="rId127">
+      <w:hyperlink r:id="rId136">
         <w:r>
           <w:rPr>
             <w:rStyle w:val="Hyperlink"/>
@@ -4662,8 +4903,8 @@
         <w:t xml:space="preserve">.</w:t>
       </w:r>
     </w:p>
-    <w:bookmarkEnd w:id="128"/>
-    <w:bookmarkStart w:id="130" w:name="ref-kandler_wilder_fortunato_2017"/>
+    <w:bookmarkEnd w:id="137"/>
+    <w:bookmarkStart w:id="139" w:name="ref-kandler_wilder_fortunato_2017"/>
     <w:p>
       <w:pPr>
         <w:pStyle w:val="Bibliography"/>
@@ -4690,7 +4931,7 @@
       <w:r>
         <w:t xml:space="preserve"> </w:t>
       </w:r>
-      <w:hyperlink r:id="rId129">
+      <w:hyperlink r:id="rId138">
         <w:r>
           <w:rPr>
             <w:rStyle w:val="Hyperlink"/>
@@ -4702,8 +4943,8 @@
         <w:t xml:space="preserve">.</w:t>
       </w:r>
     </w:p>
-    <w:bookmarkEnd w:id="130"/>
-    <w:bookmarkStart w:id="132" w:name="ref-kidwell_tomasovych_2013"/>
+    <w:bookmarkEnd w:id="139"/>
+    <w:bookmarkStart w:id="141" w:name="ref-kidwell_tomasovych_2013"/>
     <w:p>
       <w:pPr>
         <w:pStyle w:val="Bibliography"/>
@@ -4730,7 +4971,7 @@
       <w:r>
         <w:t xml:space="preserve"> </w:t>
       </w:r>
-      <w:hyperlink r:id="rId131">
+      <w:hyperlink r:id="rId140">
         <w:r>
           <w:rPr>
             <w:rStyle w:val="Hyperlink"/>
@@ -4742,8 +4983,8 @@
         <w:t xml:space="preserve">.</w:t>
       </w:r>
     </w:p>
-    <w:bookmarkEnd w:id="132"/>
-    <w:bookmarkStart w:id="133" w:name="ref-king_freer_1995"/>
+    <w:bookmarkEnd w:id="141"/>
+    <w:bookmarkStart w:id="142" w:name="ref-king_freer_1995"/>
     <w:p>
       <w:pPr>
         <w:pStyle w:val="Bibliography"/>
@@ -4777,8 +5018,8 @@
         <w:t xml:space="preserve">, edited by Michael S. Nassaney and Kenneth E. Sassaman, pp. 266–288. University of Tennessee Press, Knoxville.</w:t>
       </w:r>
     </w:p>
-    <w:bookmarkEnd w:id="133"/>
-    <w:bookmarkStart w:id="135" w:name="ref-ladefoged_graves_2000"/>
+    <w:bookmarkEnd w:id="142"/>
+    <w:bookmarkStart w:id="144" w:name="ref-ladefoged_graves_2000"/>
     <w:p>
       <w:pPr>
         <w:pStyle w:val="Bibliography"/>
@@ -4823,7 +5064,7 @@
       <w:r>
         <w:t xml:space="preserve"> </w:t>
       </w:r>
-      <w:hyperlink r:id="rId134">
+      <w:hyperlink r:id="rId143">
         <w:r>
           <w:rPr>
             <w:rStyle w:val="Hyperlink"/>
@@ -4835,8 +5076,8 @@
         <w:t xml:space="preserve">.</w:t>
       </w:r>
     </w:p>
-    <w:bookmarkEnd w:id="135"/>
-    <w:bookmarkStart w:id="136" w:name="ref-lewontin_1974"/>
+    <w:bookmarkEnd w:id="144"/>
+    <w:bookmarkStart w:id="145" w:name="ref-lewontin_1974"/>
     <w:p>
       <w:pPr>
         <w:pStyle w:val="Bibliography"/>
@@ -4858,8 +5099,8 @@
         <w:t xml:space="preserve">. Columbia University Press, New York.</w:t>
       </w:r>
     </w:p>
-    <w:bookmarkEnd w:id="136"/>
-    <w:bookmarkStart w:id="137" w:name="ref-lipo_2001"/>
+    <w:bookmarkEnd w:id="145"/>
+    <w:bookmarkStart w:id="146" w:name="ref-lipo_2001"/>
     <w:p>
       <w:pPr>
         <w:pStyle w:val="Bibliography"/>
@@ -4909,8 +5150,8 @@
         <w:t xml:space="preserve">. BAR International Series 918. Archaeopress, Oxford.</w:t>
       </w:r>
     </w:p>
-    <w:bookmarkEnd w:id="137"/>
-    <w:bookmarkStart w:id="139" w:name="ref-lipo_dinapoli_madsen_hunt_2021"/>
+    <w:bookmarkEnd w:id="146"/>
+    <w:bookmarkStart w:id="148" w:name="ref-lipo_dinapoli_madsen_hunt_2021"/>
     <w:p>
       <w:pPr>
         <w:pStyle w:val="Bibliography"/>
@@ -4937,7 +5178,7 @@
       <w:r>
         <w:t xml:space="preserve"> </w:t>
       </w:r>
-      <w:hyperlink r:id="rId138">
+      <w:hyperlink r:id="rId147">
         <w:r>
           <w:rPr>
             <w:rStyle w:val="Hyperlink"/>
@@ -4949,8 +5190,8 @@
         <w:t xml:space="preserve">.</w:t>
       </w:r>
     </w:p>
-    <w:bookmarkEnd w:id="139"/>
-    <w:bookmarkStart w:id="140" w:name="ref-lipo_dunnell_2007"/>
+    <w:bookmarkEnd w:id="148"/>
+    <w:bookmarkStart w:id="149" w:name="ref-lipo_dunnell_2007"/>
     <w:p>
       <w:pPr>
         <w:pStyle w:val="Bibliography"/>
@@ -5012,8 +5253,8 @@
         <w:t xml:space="preserve">, edited by Janet Rafferty and Evan Peacock, pp. 125–167. University of Alabama Press, Tuscaloosa.</w:t>
       </w:r>
     </w:p>
-    <w:bookmarkEnd w:id="140"/>
-    <w:bookmarkStart w:id="142" w:name="ref-lipo_hunt_hundtoft_2010"/>
+    <w:bookmarkEnd w:id="149"/>
+    <w:bookmarkStart w:id="151" w:name="ref-lipo_hunt_hundtoft_2010"/>
     <w:p>
       <w:pPr>
         <w:pStyle w:val="Bibliography"/>
@@ -5058,7 +5299,7 @@
       <w:r>
         <w:t xml:space="preserve"> </w:t>
       </w:r>
-      <w:hyperlink r:id="rId141">
+      <w:hyperlink r:id="rId150">
         <w:r>
           <w:rPr>
             <w:rStyle w:val="Hyperlink"/>
@@ -5070,8 +5311,8 @@
         <w:t xml:space="preserve">.</w:t>
       </w:r>
     </w:p>
-    <w:bookmarkEnd w:id="142"/>
-    <w:bookmarkStart w:id="144" w:name="ref-lipo_madsen_dunnell_2015"/>
+    <w:bookmarkEnd w:id="151"/>
+    <w:bookmarkStart w:id="153" w:name="ref-lipo_madsen_dunnell_2015"/>
     <w:p>
       <w:pPr>
         <w:pStyle w:val="Bibliography"/>
@@ -5098,7 +5339,7 @@
       <w:r>
         <w:t xml:space="preserve"> </w:t>
       </w:r>
-      <w:hyperlink r:id="rId143">
+      <w:hyperlink r:id="rId152">
         <w:r>
           <w:rPr>
             <w:rStyle w:val="Hyperlink"/>
@@ -5110,8 +5351,8 @@
         <w:t xml:space="preserve">.</w:t>
       </w:r>
     </w:p>
-    <w:bookmarkEnd w:id="144"/>
-    <w:bookmarkStart w:id="146" w:name="ref-lipo_madsen_dunnell_hunt_1997"/>
+    <w:bookmarkEnd w:id="153"/>
+    <w:bookmarkStart w:id="155" w:name="ref-lipo_madsen_dunnell_hunt_1997"/>
     <w:p>
       <w:pPr>
         <w:pStyle w:val="Bibliography"/>
@@ -5138,7 +5379,7 @@
       <w:r>
         <w:t xml:space="preserve"> </w:t>
       </w:r>
-      <w:hyperlink r:id="rId145">
+      <w:hyperlink r:id="rId154">
         <w:r>
           <w:rPr>
             <w:rStyle w:val="Hyperlink"/>
@@ -5150,8 +5391,8 @@
         <w:t xml:space="preserve">.</w:t>
       </w:r>
     </w:p>
-    <w:bookmarkEnd w:id="146"/>
-    <w:bookmarkStart w:id="148" w:name="ref-holland-lulewicz_2019"/>
+    <w:bookmarkEnd w:id="155"/>
+    <w:bookmarkStart w:id="157" w:name="ref-holland-lulewicz_2019"/>
     <w:p>
       <w:pPr>
         <w:pStyle w:val="Bibliography"/>
@@ -5205,7 +5446,7 @@
       <w:r>
         <w:t xml:space="preserve"> </w:t>
       </w:r>
-      <w:hyperlink r:id="rId147">
+      <w:hyperlink r:id="rId156">
         <w:r>
           <w:rPr>
             <w:rStyle w:val="Hyperlink"/>
@@ -5217,8 +5458,8 @@
         <w:t xml:space="preserve">.</w:t>
       </w:r>
     </w:p>
-    <w:bookmarkEnd w:id="148"/>
-    <w:bookmarkStart w:id="150" w:name="ref-lyman_2021"/>
+    <w:bookmarkEnd w:id="157"/>
+    <w:bookmarkStart w:id="159" w:name="ref-lyman_2021"/>
     <w:p>
       <w:pPr>
         <w:pStyle w:val="Bibliography"/>
@@ -5245,7 +5486,7 @@
       <w:r>
         <w:t xml:space="preserve"> </w:t>
       </w:r>
-      <w:hyperlink r:id="rId149">
+      <w:hyperlink r:id="rId158">
         <w:r>
           <w:rPr>
             <w:rStyle w:val="Hyperlink"/>
@@ -5257,8 +5498,8 @@
         <w:t xml:space="preserve">.</w:t>
       </w:r>
     </w:p>
-    <w:bookmarkEnd w:id="150"/>
-    <w:bookmarkStart w:id="151" w:name="ref-madsen_2012"/>
+    <w:bookmarkEnd w:id="159"/>
+    <w:bookmarkStart w:id="160" w:name="ref-madsen_2012"/>
     <w:p>
       <w:pPr>
         <w:pStyle w:val="Bibliography"/>
@@ -5267,8 +5508,8 @@
         <w:t xml:space="preserve">Madsen, Mark E. 2012. Neutral Cultural Transmission in Time-Averaged Archaeological Assemblages. arXiv preprint arXiv:1204.2043 [physics.soc-ph].</w:t>
       </w:r>
     </w:p>
-    <w:bookmarkEnd w:id="151"/>
-    <w:bookmarkStart w:id="152" w:name="ref-mainfort_1996"/>
+    <w:bookmarkEnd w:id="160"/>
+    <w:bookmarkStart w:id="161" w:name="ref-mainfort_1996"/>
     <w:p>
       <w:pPr>
         <w:pStyle w:val="Bibliography"/>
@@ -5317,8 +5558,8 @@
         <w:t xml:space="preserve">15(2):172–181.</w:t>
       </w:r>
     </w:p>
-    <w:bookmarkEnd w:id="152"/>
-    <w:bookmarkStart w:id="153" w:name="ref-mainfort_2001"/>
+    <w:bookmarkEnd w:id="161"/>
+    <w:bookmarkStart w:id="162" w:name="ref-mainfort_2001"/>
     <w:p>
       <w:pPr>
         <w:pStyle w:val="Bibliography"/>
@@ -5352,8 +5593,8 @@
         <w:t xml:space="preserve">, edited by David S. Brose, C. Wesley Cowan, and Jr. Mainfort Robert C., pp. 173–190. Smithsonian Institution Press, Washington, DC.</w:t>
       </w:r>
     </w:p>
-    <w:bookmarkEnd w:id="153"/>
-    <w:bookmarkStart w:id="154" w:name="ref-mainfort_2003"/>
+    <w:bookmarkEnd w:id="162"/>
+    <w:bookmarkStart w:id="163" w:name="ref-mainfort_2003"/>
     <w:p>
       <w:pPr>
         <w:pStyle w:val="Bibliography"/>
@@ -5390,8 +5631,8 @@
         <w:t xml:space="preserve">22(2):176–184.</w:t>
       </w:r>
     </w:p>
-    <w:bookmarkEnd w:id="154"/>
-    <w:bookmarkStart w:id="155" w:name="ref-mantel_1967"/>
+    <w:bookmarkEnd w:id="163"/>
+    <w:bookmarkStart w:id="164" w:name="ref-mantel_1967"/>
     <w:p>
       <w:pPr>
         <w:pStyle w:val="Bibliography"/>
@@ -5416,8 +5657,8 @@
         <w:t xml:space="preserve">27(2):209–220.</w:t>
       </w:r>
     </w:p>
-    <w:bookmarkEnd w:id="155"/>
-    <w:bookmarkStart w:id="156" w:name="ref-mcnutt_ed_1996"/>
+    <w:bookmarkEnd w:id="164"/>
+    <w:bookmarkStart w:id="165" w:name="ref-mcnutt_ed_1996"/>
     <w:p>
       <w:pPr>
         <w:pStyle w:val="Bibliography"/>
@@ -5467,8 +5708,8 @@
         <w:t xml:space="preserve">. University of Alabama Press, Tuscaloosa.</w:t>
       </w:r>
     </w:p>
-    <w:bookmarkEnd w:id="156"/>
-    <w:bookmarkStart w:id="157" w:name="ref-mesoudi_2021"/>
+    <w:bookmarkEnd w:id="165"/>
+    <w:bookmarkStart w:id="166" w:name="ref-mesoudi_2021"/>
     <w:p>
       <w:pPr>
         <w:pStyle w:val="Bibliography"/>
@@ -5493,8 +5734,8 @@
         <w:t xml:space="preserve">376:20200053.</w:t>
       </w:r>
     </w:p>
-    <w:bookmarkEnd w:id="157"/>
-    <w:bookmarkStart w:id="159" w:name="ref-miller_atkins_premo_2018"/>
+    <w:bookmarkEnd w:id="166"/>
+    <w:bookmarkStart w:id="168" w:name="ref-miller_atkins_premo_2018"/>
     <w:p>
       <w:pPr>
         <w:pStyle w:val="Bibliography"/>
@@ -5521,7 +5762,7 @@
       <w:r>
         <w:t xml:space="preserve"> </w:t>
       </w:r>
-      <w:hyperlink r:id="rId158">
+      <w:hyperlink r:id="rId167">
         <w:r>
           <w:rPr>
             <w:rStyle w:val="Hyperlink"/>
@@ -5533,8 +5774,8 @@
         <w:t xml:space="preserve">.</w:t>
       </w:r>
     </w:p>
-    <w:bookmarkEnd w:id="159"/>
-    <w:bookmarkStart w:id="160" w:name="ref-milner_1998"/>
+    <w:bookmarkEnd w:id="168"/>
+    <w:bookmarkStart w:id="169" w:name="ref-milner_1998"/>
     <w:p>
       <w:pPr>
         <w:pStyle w:val="Bibliography"/>
@@ -5612,8 +5853,8 @@
         <w:t xml:space="preserve">. Smithsonian Institution Press, Washington, D.C.</w:t>
       </w:r>
     </w:p>
-    <w:bookmarkEnd w:id="160"/>
-    <w:bookmarkStart w:id="161" w:name="ref-mitchem_2001"/>
+    <w:bookmarkEnd w:id="169"/>
+    <w:bookmarkStart w:id="170" w:name="ref-mitchem_2001"/>
     <w:p>
       <w:pPr>
         <w:pStyle w:val="Bibliography"/>
@@ -5643,8 +5884,8 @@
         <w:t xml:space="preserve">.</w:t>
       </w:r>
     </w:p>
-    <w:bookmarkEnd w:id="161"/>
-    <w:bookmarkStart w:id="162" w:name="ref-morse_morse_1983"/>
+    <w:bookmarkEnd w:id="170"/>
+    <w:bookmarkStart w:id="171" w:name="ref-morse_morse_1983"/>
     <w:p>
       <w:pPr>
         <w:pStyle w:val="Bibliography"/>
@@ -5694,8 +5935,8 @@
         <w:t xml:space="preserve">. Academic Press, New York.</w:t>
       </w:r>
     </w:p>
-    <w:bookmarkEnd w:id="162"/>
-    <w:bookmarkStart w:id="163" w:name="ref-morse_morse_1996"/>
+    <w:bookmarkEnd w:id="171"/>
+    <w:bookmarkStart w:id="172" w:name="ref-morse_morse_1996"/>
     <w:p>
       <w:pPr>
         <w:pStyle w:val="Bibliography"/>
@@ -5732,8 +5973,8 @@
         <w:t xml:space="preserve">17(1):1–35.</w:t>
       </w:r>
     </w:p>
-    <w:bookmarkEnd w:id="163"/>
-    <w:bookmarkStart w:id="164" w:name="ref-morse_1990"/>
+    <w:bookmarkEnd w:id="172"/>
+    <w:bookmarkStart w:id="173" w:name="ref-morse_1990"/>
     <w:p>
       <w:pPr>
         <w:pStyle w:val="Bibliography"/>
@@ -5793,8 +6034,8 @@
         <w:t xml:space="preserve">, edited by David H. Dye and Cheryl Anne Cox, pp. 118–134. University of Alabama Press, Tuscaloosa.</w:t>
       </w:r>
     </w:p>
-    <w:bookmarkEnd w:id="164"/>
-    <w:bookmarkStart w:id="165" w:name="ref-neiman_1995"/>
+    <w:bookmarkEnd w:id="173"/>
+    <w:bookmarkStart w:id="174" w:name="ref-neiman_1995"/>
     <w:p>
       <w:pPr>
         <w:pStyle w:val="Bibliography"/>
@@ -5837,8 +6078,8 @@
         <w:t xml:space="preserve">60(1):7–36.</w:t>
       </w:r>
     </w:p>
-    <w:bookmarkEnd w:id="165"/>
-    <w:bookmarkStart w:id="167" w:name="ref-odwyer_kandler_2017"/>
+    <w:bookmarkEnd w:id="174"/>
+    <w:bookmarkStart w:id="176" w:name="ref-odwyer_kandler_2017"/>
     <w:p>
       <w:pPr>
         <w:pStyle w:val="Bibliography"/>
@@ -5865,7 +6106,7 @@
       <w:r>
         <w:t xml:space="preserve"> </w:t>
       </w:r>
-      <w:hyperlink r:id="rId166">
+      <w:hyperlink r:id="rId175">
         <w:r>
           <w:rPr>
             <w:rStyle w:val="Hyperlink"/>
@@ -5877,8 +6118,8 @@
         <w:t xml:space="preserve">.</w:t>
       </w:r>
     </w:p>
-    <w:bookmarkEnd w:id="167"/>
-    <w:bookmarkStart w:id="169" w:name="ref-peebles_kus_1977"/>
+    <w:bookmarkEnd w:id="176"/>
+    <w:bookmarkStart w:id="178" w:name="ref-peebles_kus_1977"/>
     <w:p>
       <w:pPr>
         <w:pStyle w:val="Bibliography"/>
@@ -5905,7 +6146,7 @@
       <w:r>
         <w:t xml:space="preserve"> </w:t>
       </w:r>
-      <w:hyperlink r:id="rId168">
+      <w:hyperlink r:id="rId177">
         <w:r>
           <w:rPr>
             <w:rStyle w:val="Hyperlink"/>
@@ -5917,8 +6158,8 @@
         <w:t xml:space="preserve">.</w:t>
       </w:r>
     </w:p>
-    <w:bookmarkEnd w:id="169"/>
-    <w:bookmarkStart w:id="171" w:name="ref-peeples_schachner_2012"/>
+    <w:bookmarkEnd w:id="178"/>
+    <w:bookmarkStart w:id="180" w:name="ref-peeples_schachner_2012"/>
     <w:p>
       <w:pPr>
         <w:pStyle w:val="Bibliography"/>
@@ -5945,7 +6186,7 @@
       <w:r>
         <w:t xml:space="preserve"> </w:t>
       </w:r>
-      <w:hyperlink r:id="rId170">
+      <w:hyperlink r:id="rId179">
         <w:r>
           <w:rPr>
             <w:rStyle w:val="Hyperlink"/>
@@ -5957,8 +6198,8 @@
         <w:t xml:space="preserve">.</w:t>
       </w:r>
     </w:p>
-    <w:bookmarkEnd w:id="171"/>
-    <w:bookmarkStart w:id="173" w:name="ref-perreault_2018"/>
+    <w:bookmarkEnd w:id="180"/>
+    <w:bookmarkStart w:id="182" w:name="ref-perreault_2018"/>
     <w:p>
       <w:pPr>
         <w:pStyle w:val="Bibliography"/>
@@ -5985,7 +6226,7 @@
       <w:r>
         <w:t xml:space="preserve"> </w:t>
       </w:r>
-      <w:hyperlink r:id="rId172">
+      <w:hyperlink r:id="rId181">
         <w:r>
           <w:rPr>
             <w:rStyle w:val="Hyperlink"/>
@@ -5997,8 +6238,8 @@
         <w:t xml:space="preserve">.</w:t>
       </w:r>
     </w:p>
-    <w:bookmarkEnd w:id="173"/>
-    <w:bookmarkStart w:id="174" w:name="ref-perreault_2019"/>
+    <w:bookmarkEnd w:id="182"/>
+    <w:bookmarkStart w:id="183" w:name="ref-perreault_2019"/>
     <w:p>
       <w:pPr>
         <w:pStyle w:val="Bibliography"/>
@@ -6020,8 +6261,8 @@
         <w:t xml:space="preserve">. University of Chicago Press, Chicago.</w:t>
       </w:r>
     </w:p>
-    <w:bookmarkEnd w:id="174"/>
-    <w:bookmarkStart w:id="175" w:name="ref-phillips_1970"/>
+    <w:bookmarkEnd w:id="183"/>
+    <w:bookmarkStart w:id="184" w:name="ref-phillips_1970"/>
     <w:p>
       <w:pPr>
         <w:pStyle w:val="Bibliography"/>
@@ -6092,8 +6333,8 @@
         <w:t xml:space="preserve">, Vol. 60. Papers of the Peabody Museum of Archaeology and Ethnology. Peabody Museum, Harvard University, Cambridge, MA.</w:t>
       </w:r>
     </w:p>
-    <w:bookmarkEnd w:id="175"/>
-    <w:bookmarkStart w:id="176" w:name="ref-phillips_ford_griffin_1951"/>
+    <w:bookmarkEnd w:id="184"/>
+    <w:bookmarkStart w:id="185" w:name="ref-phillips_ford_griffin_1951"/>
     <w:p>
       <w:pPr>
         <w:pStyle w:val="Bibliography"/>
@@ -6143,8 +6384,8 @@
         <w:t xml:space="preserve">, Vol. 25. Papers of the Peabody Museum of American Archaeology and Ethnology. Peabody Museum, Harvard University, Cambridge, MA.</w:t>
       </w:r>
     </w:p>
-    <w:bookmarkEnd w:id="176"/>
-    <w:bookmarkStart w:id="178" w:name="ref-phillips_willey_1953"/>
+    <w:bookmarkEnd w:id="185"/>
+    <w:bookmarkStart w:id="187" w:name="ref-phillips_willey_1953"/>
     <w:p>
       <w:pPr>
         <w:pStyle w:val="Bibliography"/>
@@ -6171,7 +6412,7 @@
       <w:r>
         <w:t xml:space="preserve"> </w:t>
       </w:r>
-      <w:hyperlink r:id="rId177">
+      <w:hyperlink r:id="rId186">
         <w:r>
           <w:rPr>
             <w:rStyle w:val="Hyperlink"/>
@@ -6183,8 +6424,8 @@
         <w:t xml:space="preserve">.</w:t>
       </w:r>
     </w:p>
-    <w:bookmarkEnd w:id="178"/>
-    <w:bookmarkStart w:id="180" w:name="ref-powell_shennan_thomas_2009"/>
+    <w:bookmarkEnd w:id="187"/>
+    <w:bookmarkStart w:id="189" w:name="ref-powell_shennan_thomas_2009"/>
     <w:p>
       <w:pPr>
         <w:pStyle w:val="Bibliography"/>
@@ -6223,7 +6464,7 @@
       <w:r>
         <w:t xml:space="preserve"> </w:t>
       </w:r>
-      <w:hyperlink r:id="rId179">
+      <w:hyperlink r:id="rId188">
         <w:r>
           <w:rPr>
             <w:rStyle w:val="Hyperlink"/>
@@ -6235,8 +6476,8 @@
         <w:t xml:space="preserve">.</w:t>
       </w:r>
     </w:p>
-    <w:bookmarkEnd w:id="180"/>
-    <w:bookmarkStart w:id="182" w:name="ref-premo_2014"/>
+    <w:bookmarkEnd w:id="189"/>
+    <w:bookmarkStart w:id="191" w:name="ref-premo_2014"/>
     <w:p>
       <w:pPr>
         <w:pStyle w:val="Bibliography"/>
@@ -6263,7 +6504,7 @@
       <w:r>
         <w:t xml:space="preserve"> </w:t>
       </w:r>
-      <w:hyperlink r:id="rId181">
+      <w:hyperlink r:id="rId190">
         <w:r>
           <w:rPr>
             <w:rStyle w:val="Hyperlink"/>
@@ -6275,8 +6516,88 @@
         <w:t xml:space="preserve">.</w:t>
       </w:r>
     </w:p>
-    <w:bookmarkEnd w:id="182"/>
-    <w:bookmarkStart w:id="183" w:name="ref-rees_political_culture"/>
+    <w:bookmarkEnd w:id="191"/>
+    <w:bookmarkStart w:id="193" w:name="ref-premo_2016"/>
+    <w:p>
+      <w:pPr>
+        <w:pStyle w:val="Bibliography"/>
+      </w:pPr>
+      <w:r>
+        <w:t xml:space="preserve">Premo, Luke S. 2016. Effective Population Size and the Effects of Demography on Cultural Diversity and Technological Complexity.</w:t>
+      </w:r>
+      <w:r>
+        <w:t xml:space="preserve"> </w:t>
+      </w:r>
+      <w:r>
+        <w:rPr>
+          <w:i/>
+          <w:iCs/>
+        </w:rPr>
+        <w:t xml:space="preserve">American Antiquity</w:t>
+      </w:r>
+      <w:r>
+        <w:t xml:space="preserve"> </w:t>
+      </w:r>
+      <w:r>
+        <w:t xml:space="preserve">81(4):605–622.</w:t>
+      </w:r>
+      <w:r>
+        <w:t xml:space="preserve"> </w:t>
+      </w:r>
+      <w:hyperlink r:id="rId192">
+        <w:r>
+          <w:rPr>
+            <w:rStyle w:val="Hyperlink"/>
+          </w:rPr>
+          <w:t xml:space="preserve">https://doi.org/10.7183/0002-7316.81.4.605</w:t>
+        </w:r>
+      </w:hyperlink>
+      <w:r>
+        <w:t xml:space="preserve">.</w:t>
+      </w:r>
+    </w:p>
+    <w:bookmarkEnd w:id="193"/>
+    <w:bookmarkStart w:id="195" w:name="ref-premo_scholnick_2011"/>
+    <w:p>
+      <w:pPr>
+        <w:pStyle w:val="Bibliography"/>
+      </w:pPr>
+      <w:r>
+        <w:t xml:space="preserve">Premo, Luke S., and Jonathan B. Scholnick. 2011. The Spatial Scale of Social Learning Affects Cultural Diversity.</w:t>
+      </w:r>
+      <w:r>
+        <w:t xml:space="preserve"> </w:t>
+      </w:r>
+      <w:r>
+        <w:rPr>
+          <w:i/>
+          <w:iCs/>
+        </w:rPr>
+        <w:t xml:space="preserve">American Antiquity</w:t>
+      </w:r>
+      <w:r>
+        <w:t xml:space="preserve"> </w:t>
+      </w:r>
+      <w:r>
+        <w:t xml:space="preserve">76(1):163–176.</w:t>
+      </w:r>
+      <w:r>
+        <w:t xml:space="preserve"> </w:t>
+      </w:r>
+      <w:hyperlink r:id="rId194">
+        <w:r>
+          <w:rPr>
+            <w:rStyle w:val="Hyperlink"/>
+          </w:rPr>
+          <w:t xml:space="preserve">https://doi.org/10.7183/0002-7316.76.1.163</w:t>
+        </w:r>
+      </w:hyperlink>
+      <w:r>
+        <w:t xml:space="preserve">.</w:t>
+      </w:r>
+    </w:p>
+    <w:bookmarkEnd w:id="195"/>
+    <w:bookmarkStart w:id="196" w:name="ref-rees_political_culture"/>
     <w:p>
       <w:pPr>
         <w:pStyle w:val="Bibliography"/>
@@ -6300,8 +6621,8 @@
         <w:t xml:space="preserve">. Ph.D. dissertation, University of Oklahoma, Norman.</w:t>
       </w:r>
     </w:p>
-    <w:bookmarkEnd w:id="183"/>
-    <w:bookmarkStart w:id="185" w:name="ref-reimer_etal_2020"/>
+    <w:bookmarkEnd w:id="196"/>
+    <w:bookmarkStart w:id="198" w:name="ref-reimer_etal_2020"/>
     <w:p>
       <w:pPr>
         <w:pStyle w:val="Bibliography"/>
@@ -6355,7 +6676,7 @@
       <w:r>
         <w:t xml:space="preserve"> </w:t>
       </w:r>
-      <w:hyperlink r:id="rId184">
+      <w:hyperlink r:id="rId197">
         <w:r>
           <w:rPr>
             <w:rStyle w:val="Hyperlink"/>
@@ -6367,8 +6688,8 @@
         <w:t xml:space="preserve">.</w:t>
       </w:r>
     </w:p>
-    <w:bookmarkEnd w:id="185"/>
-    <w:bookmarkStart w:id="187" w:name="ref-richerson_etal_2016"/>
+    <w:bookmarkEnd w:id="198"/>
+    <w:bookmarkStart w:id="200" w:name="ref-richerson_etal_2016"/>
     <w:p>
       <w:pPr>
         <w:pStyle w:val="Bibliography"/>
@@ -6395,7 +6716,7 @@
       <w:r>
         <w:t xml:space="preserve"> </w:t>
       </w:r>
-      <w:hyperlink r:id="rId186">
+      <w:hyperlink r:id="rId199">
         <w:r>
           <w:rPr>
             <w:rStyle w:val="Hyperlink"/>
@@ -6407,8 +6728,8 @@
         <w:t xml:space="preserve">.</w:t>
       </w:r>
     </w:p>
-    <w:bookmarkEnd w:id="187"/>
-    <w:bookmarkStart w:id="189" w:name="ref-riede_hoggard_shennan_2019"/>
+    <w:bookmarkEnd w:id="200"/>
+    <w:bookmarkStart w:id="202" w:name="ref-riede_hoggard_shennan_2019"/>
     <w:p>
       <w:pPr>
         <w:pStyle w:val="Bibliography"/>
@@ -6435,7 +6756,7 @@
       <w:r>
         <w:t xml:space="preserve"> </w:t>
       </w:r>
-      <w:hyperlink r:id="rId188">
+      <w:hyperlink r:id="rId201">
         <w:r>
           <w:rPr>
             <w:rStyle w:val="Hyperlink"/>
@@ -6447,8 +6768,8 @@
         <w:t xml:space="preserve">.</w:t>
       </w:r>
     </w:p>
-    <w:bookmarkEnd w:id="189"/>
-    <w:bookmarkStart w:id="190" w:name="ref-robinson_1951"/>
+    <w:bookmarkEnd w:id="202"/>
+    <w:bookmarkStart w:id="203" w:name="ref-robinson_1951"/>
     <w:p>
       <w:pPr>
         <w:pStyle w:val="Bibliography"/>
@@ -6473,8 +6794,8 @@
         <w:t xml:space="preserve">16(4):293–301.</w:t>
       </w:r>
     </w:p>
-    <w:bookmarkEnd w:id="190"/>
-    <w:bookmarkStart w:id="191" w:name="ref-ross-stallings_2017"/>
+    <w:bookmarkEnd w:id="203"/>
+    <w:bookmarkStart w:id="204" w:name="ref-ross-stallings_2017"/>
     <w:p>
       <w:pPr>
         <w:pStyle w:val="Bibliography"/>
@@ -6508,8 +6829,48 @@
         <w:t xml:space="preserve">, edited by Haagen D. Klaus, Amanda R. Harvey, and Mark N. Cohen, pp. 329–362. University Press of Florida, Gainesville.</w:t>
       </w:r>
     </w:p>
-    <w:bookmarkEnd w:id="191"/>
-    <w:bookmarkStart w:id="193" w:name="ref-scheffer_2009"/>
+    <w:bookmarkEnd w:id="204"/>
+    <w:bookmarkStart w:id="206" w:name="ref-saxer_doebeli_travisano_2009"/>
+    <w:p>
+      <w:pPr>
+        <w:pStyle w:val="Bibliography"/>
+      </w:pPr>
+      <w:r>
+        <w:t xml:space="preserve">Saxer, Gerda, Michael Doebeli, and Michael Travisano. 2009. Spatial Structure Leads to Ecological Breakdown and Loss of Diversity.</w:t>
+      </w:r>
+      <w:r>
+        <w:t xml:space="preserve"> </w:t>
+      </w:r>
+      <w:r>
+        <w:rPr>
+          <w:i/>
+          <w:iCs/>
+        </w:rPr>
+        <w:t xml:space="preserve">Proceedings of the Royal Society B: Biological Sciences</w:t>
+      </w:r>
+      <w:r>
+        <w:t xml:space="preserve"> </w:t>
+      </w:r>
+      <w:r>
+        <w:t xml:space="preserve">276(1664):2065–2070.</w:t>
+      </w:r>
+      <w:r>
+        <w:t xml:space="preserve"> </w:t>
+      </w:r>
+      <w:hyperlink r:id="rId205">
+        <w:r>
+          <w:rPr>
+            <w:rStyle w:val="Hyperlink"/>
+          </w:rPr>
+          <w:t xml:space="preserve">https://doi.org/10.1098/rspb.2008.1827</w:t>
+        </w:r>
+      </w:hyperlink>
+      <w:r>
+        <w:t xml:space="preserve">.</w:t>
+      </w:r>
+    </w:p>
+    <w:bookmarkEnd w:id="206"/>
+    <w:bookmarkStart w:id="208" w:name="ref-scheffer_2009"/>
     <w:p>
       <w:pPr>
         <w:pStyle w:val="Bibliography"/>
@@ -6536,7 +6897,7 @@
       <w:r>
         <w:t xml:space="preserve"> </w:t>
       </w:r>
-      <w:hyperlink r:id="rId192">
+      <w:hyperlink r:id="rId207">
         <w:r>
           <w:rPr>
             <w:rStyle w:val="Hyperlink"/>
@@ -6548,8 +6909,8 @@
         <w:t xml:space="preserve">.</w:t>
       </w:r>
     </w:p>
-    <w:bookmarkEnd w:id="193"/>
-    <w:bookmarkStart w:id="194" w:name="ref-schiffer_1972"/>
+    <w:bookmarkEnd w:id="208"/>
+    <w:bookmarkStart w:id="209" w:name="ref-schiffer_1972"/>
     <w:p>
       <w:pPr>
         <w:pStyle w:val="Bibliography"/>
@@ -6574,8 +6935,48 @@
         <w:t xml:space="preserve">37(2):156–165.</w:t>
       </w:r>
     </w:p>
-    <w:bookmarkEnd w:id="194"/>
-    <w:bookmarkStart w:id="196" w:name="ref-shennan_crema_kerig_2015"/>
+    <w:bookmarkEnd w:id="209"/>
+    <w:bookmarkStart w:id="211" w:name="ref-schneider_martins_deaguiar_2016"/>
+    <w:p>
+      <w:pPr>
+        <w:pStyle w:val="Bibliography"/>
+      </w:pPr>
+      <w:r>
+        <w:t xml:space="preserve">Schneider, David M., Ayana B. Martins, and Marcus A. M. de Aguiar. 2016. The Mutation-Drift Balance in Spatially Structured Populations.</w:t>
+      </w:r>
+      <w:r>
+        <w:t xml:space="preserve"> </w:t>
+      </w:r>
+      <w:r>
+        <w:rPr>
+          <w:i/>
+          <w:iCs/>
+        </w:rPr>
+        <w:t xml:space="preserve">Journal of Theoretical Biology</w:t>
+      </w:r>
+      <w:r>
+        <w:t xml:space="preserve"> </w:t>
+      </w:r>
+      <w:r>
+        <w:t xml:space="preserve">402:9–17.</w:t>
+      </w:r>
+      <w:r>
+        <w:t xml:space="preserve"> </w:t>
+      </w:r>
+      <w:hyperlink r:id="rId210">
+        <w:r>
+          <w:rPr>
+            <w:rStyle w:val="Hyperlink"/>
+          </w:rPr>
+          <w:t xml:space="preserve">https://doi.org/10.1016/j.jtbi.2016.04.024</w:t>
+        </w:r>
+      </w:hyperlink>
+      <w:r>
+        <w:t xml:space="preserve">.</w:t>
+      </w:r>
+    </w:p>
+    <w:bookmarkEnd w:id="211"/>
+    <w:bookmarkStart w:id="213" w:name="ref-shennan_crema_kerig_2015"/>
     <w:p>
       <w:pPr>
         <w:pStyle w:val="Bibliography"/>
@@ -6641,7 +7042,7 @@
       <w:r>
         <w:t xml:space="preserve"> </w:t>
       </w:r>
-      <w:hyperlink r:id="rId195">
+      <w:hyperlink r:id="rId212">
         <w:r>
           <w:rPr>
             <w:rStyle w:val="Hyperlink"/>
@@ -6653,8 +7054,8 @@
         <w:t xml:space="preserve">.</w:t>
       </w:r>
     </w:p>
-    <w:bookmarkEnd w:id="196"/>
-    <w:bookmarkStart w:id="197" w:name="ref-shennan_wilkinson_2001"/>
+    <w:bookmarkEnd w:id="213"/>
+    <w:bookmarkStart w:id="214" w:name="ref-shennan_wilkinson_2001"/>
     <w:p>
       <w:pPr>
         <w:pStyle w:val="Bibliography"/>
@@ -6694,8 +7095,8 @@
         <w:t xml:space="preserve">66(4):577–593.</w:t>
       </w:r>
     </w:p>
-    <w:bookmarkEnd w:id="197"/>
-    <w:bookmarkStart w:id="198" w:name="ref-smith_neiman_2007"/>
+    <w:bookmarkEnd w:id="214"/>
+    <w:bookmarkStart w:id="215" w:name="ref-smith_neiman_2007"/>
     <w:p>
       <w:pPr>
         <w:pStyle w:val="Bibliography"/>
@@ -6720,8 +7121,8 @@
         <w:t xml:space="preserve">26(1):47–72.</w:t>
       </w:r>
     </w:p>
-    <w:bookmarkEnd w:id="198"/>
-    <w:bookmarkStart w:id="200" w:name="ref-stern_1994"/>
+    <w:bookmarkEnd w:id="215"/>
+    <w:bookmarkStart w:id="217" w:name="ref-stern_1994"/>
     <w:p>
       <w:pPr>
         <w:pStyle w:val="Bibliography"/>
@@ -6748,7 +7149,7 @@
       <w:r>
         <w:t xml:space="preserve"> </w:t>
       </w:r>
-      <w:hyperlink r:id="rId199">
+      <w:hyperlink r:id="rId216">
         <w:r>
           <w:rPr>
             <w:rStyle w:val="Hyperlink"/>
@@ -6760,8 +7161,8 @@
         <w:t xml:space="preserve">.</w:t>
       </w:r>
     </w:p>
-    <w:bookmarkEnd w:id="200"/>
-    <w:bookmarkStart w:id="202" w:name="ref-sullivan_2024"/>
+    <w:bookmarkEnd w:id="217"/>
+    <w:bookmarkStart w:id="219" w:name="ref-sullivan_2024"/>
     <w:p>
       <w:pPr>
         <w:pStyle w:val="Bibliography"/>
@@ -6812,7 +7213,7 @@
       <w:r>
         <w:t xml:space="preserve"> </w:t>
       </w:r>
-      <w:hyperlink r:id="rId201">
+      <w:hyperlink r:id="rId218">
         <w:r>
           <w:rPr>
             <w:rStyle w:val="Hyperlink"/>
@@ -6824,8 +7225,8 @@
         <w:t xml:space="preserve">.</w:t>
       </w:r>
     </w:p>
-    <w:bookmarkEnd w:id="202"/>
-    <w:bookmarkStart w:id="203" w:name="ref-tomasovych_kidwell_2009"/>
+    <w:bookmarkEnd w:id="219"/>
+    <w:bookmarkStart w:id="220" w:name="ref-tomasovych_kidwell_2009"/>
     <w:p>
       <w:pPr>
         <w:pStyle w:val="Bibliography"/>
@@ -6850,8 +7251,8 @@
         <w:t xml:space="preserve">35(1):94–118.</w:t>
       </w:r>
     </w:p>
-    <w:bookmarkEnd w:id="203"/>
-    <w:bookmarkStart w:id="205" w:name="ref-tomasovych_kidwell_2010"/>
+    <w:bookmarkEnd w:id="220"/>
+    <w:bookmarkStart w:id="222" w:name="ref-tomasovych_kidwell_2010"/>
     <w:p>
       <w:pPr>
         <w:pStyle w:val="Bibliography"/>
@@ -6878,7 +7279,7 @@
       <w:r>
         <w:t xml:space="preserve"> </w:t>
       </w:r>
-      <w:hyperlink r:id="rId204">
+      <w:hyperlink r:id="rId221">
         <w:r>
           <w:rPr>
             <w:rStyle w:val="Hyperlink"/>
@@ -6890,8 +7291,8 @@
         <w:t xml:space="preserve">.</w:t>
       </w:r>
     </w:p>
-    <w:bookmarkEnd w:id="205"/>
-    <w:bookmarkStart w:id="206" w:name="ref-willey_phillips_1958"/>
+    <w:bookmarkEnd w:id="222"/>
+    <w:bookmarkStart w:id="223" w:name="ref-willey_phillips_1958"/>
     <w:p>
       <w:pPr>
         <w:pStyle w:val="Bibliography"/>
@@ -6913,8 +7314,8 @@
         <w:t xml:space="preserve">. University of Chicago Press, Chicago.</w:t>
       </w:r>
     </w:p>
-    <w:bookmarkEnd w:id="206"/>
-    <w:bookmarkStart w:id="207" w:name="ref-williams_1954"/>
+    <w:bookmarkEnd w:id="223"/>
+    <w:bookmarkStart w:id="224" w:name="ref-williams_1954"/>
     <w:p>
       <w:pPr>
         <w:pStyle w:val="Bibliography"/>
@@ -6923,8 +7324,8 @@
         <w:t xml:space="preserve">Williams, Stephen. 1954. An Archeological Study of the Mississippian Culture in Southeast Missouri. PhD thesis, Yale University, New Haven.</w:t>
       </w:r>
     </w:p>
-    <w:bookmarkEnd w:id="207"/>
-    <w:bookmarkStart w:id="208" w:name="ref-williams_1990"/>
+    <w:bookmarkEnd w:id="224"/>
+    <w:bookmarkStart w:id="225" w:name="ref-williams_1990"/>
     <w:p>
       <w:pPr>
         <w:pStyle w:val="Bibliography"/>
@@ -6960,8 +7361,8 @@
         <w:t xml:space="preserve">, edited by David H. Dye and Cheryl Anne Cox, pp. 170–180. University of Alabama Press, Tuscaloosa.</w:t>
       </w:r>
     </w:p>
-    <w:bookmarkEnd w:id="208"/>
-    <w:bookmarkStart w:id="210" w:name="ref-wright_1943"/>
+    <w:bookmarkEnd w:id="225"/>
+    <w:bookmarkStart w:id="227" w:name="ref-wright_1943"/>
     <w:p>
       <w:pPr>
         <w:pStyle w:val="Bibliography"/>
@@ -6988,7 +7389,7 @@
       <w:r>
         <w:t xml:space="preserve"> </w:t>
       </w:r>
-      <w:hyperlink r:id="rId209">
+      <w:hyperlink r:id="rId226">
         <w:r>
           <w:rPr>
             <w:rStyle w:val="Hyperlink"/>
@@ -7000,8 +7401,8 @@
         <w:t xml:space="preserve">.</w:t>
       </w:r>
     </w:p>
-    <w:bookmarkEnd w:id="210"/>
-    <w:bookmarkStart w:id="212" w:name="ref-wright_1951"/>
+    <w:bookmarkEnd w:id="227"/>
+    <w:bookmarkStart w:id="229" w:name="ref-wright_1951"/>
     <w:p>
       <w:pPr>
         <w:pStyle w:val="Bibliography"/>
@@ -7028,7 +7429,7 @@
       <w:r>
         <w:t xml:space="preserve"> </w:t>
       </w:r>
-      <w:hyperlink r:id="rId211">
+      <w:hyperlink r:id="rId228">
         <w:r>
           <w:rPr>
             <w:rStyle w:val="Hyperlink"/>
@@ -7040,8 +7441,8 @@
         <w:t xml:space="preserve">.</w:t>
       </w:r>
     </w:p>
-    <w:bookmarkEnd w:id="212"/>
-    <w:bookmarkStart w:id="214" w:name="ref-youngblood_miton_morin_2023"/>
+    <w:bookmarkEnd w:id="229"/>
+    <w:bookmarkStart w:id="231" w:name="ref-youngblood_miton_morin_2023"/>
     <w:p>
       <w:pPr>
         <w:pStyle w:val="Bibliography"/>
@@ -7068,7 +7469,7 @@
       <w:r>
         <w:t xml:space="preserve"> </w:t>
       </w:r>
-      <w:hyperlink r:id="rId213">
+      <w:hyperlink r:id="rId230">
         <w:r>
           <w:rPr>
             <w:rStyle w:val="Hyperlink"/>
@@ -7080,10 +7481,10 @@
         <w:t xml:space="preserve">.</w:t>
       </w:r>
     </w:p>
-    <w:bookmarkEnd w:id="214"/>
-    <w:bookmarkEnd w:id="215"/>
-    <w:bookmarkEnd w:id="216"/>
-    <w:bookmarkEnd w:id="217"/>
+    <w:bookmarkEnd w:id="231"/>
+    <w:bookmarkEnd w:id="232"/>
+    <w:bookmarkEnd w:id="233"/>
+    <w:bookmarkEnd w:id="234"/>
     <w:sectPr>
       <w:footnotePr>
         <w:numRestart w:val="eachSect"/>

</xml_diff>

<commit_message>
Manuscript style and terminology pass; vendor AA citation style; reproducibility fixes
- Manuscript: plain-language pass (removed inflated/dramatic phrasing, split prose semicolons), defined homozygosity at first use, and adopted consistent terminology (assemblages not collections, decorated classes not types, sherds), per the observer-defined class concept.
- Vendored the American Antiquity citation style (american-antiquity.csl); the previous CSL was a dependent stub with no formatting, so the documented build could not reproduce the citations.
- run_all.sh now also runs make_map.py, so Figure 1 regenerates; the full pipeline reproduces with 0 failures.
- README: third author (Madsen), scripts 33/34, runtime note, CSL in the build command and layout.
- Fixed one ruff lint warning (f-string without placeholder).
</commit_message>
<xml_diff>
--- a/docs/manuscript/MAIN_TEXT.docx
+++ b/docs/manuscript/MAIN_TEXT.docx
@@ -23,18 +23,6 @@
         <w:t xml:space="preserve">Carl P. Lipo, Robert J. DiNapoli, and Mark E. Madsen</w:t>
       </w:r>
     </w:p>
-    <w:p>
-      <w:pPr>
-        <w:pStyle w:val="BodyText"/>
-      </w:pPr>
-      <w:r>
-        <w:rPr>
-          <w:i/>
-          <w:iCs/>
-        </w:rPr>
-        <w:t xml:space="preserve">Target: American Antiquity. Draft in progress. Heavy model derivation in the Supplemental Text. Citations verified against repo sources, with references in references.bib.</w:t>
-      </w:r>
-    </w:p>
     <w:bookmarkStart w:id="9" w:name="abstract"/>
     <w:p>
       <w:pPr>
@@ -49,7 +37,7 @@
         <w:pStyle w:val="FirstParagraph"/>
       </w:pPr>
       <w:r>
-        <w:t xml:space="preserve">The phase, Mississippian archaeology’s foundational unit, rests on a silent premise: that assemblages more similar to nearby than to distant neighbors record a bounded society. This is rarely tested, yet neutral transmission produces the same clustering with no bounded groups: drift concentrates similar styles nearby. For the late pre-contact central Mississippi Valley, we test whether decorated-ceramic similarity records bounded interaction groups or spatially structured drift. We compare drift and bounded-groups processes on the real geography, calibrated to the record’s small samples and time-averaging by a signal-recovery experiment. In both the St. Francis basin Parkin phase and the southeast-Missouri assemblages, drift reproduces the structure without bounded groups, and Parkin is a transmission bridge, not a capital. A sharper boundary appears only between the central and lower valleys, confounded with chronological turnover and analytical history. Before similarity is read as social, a record must be shown able to distinguish groups from drift.</w:t>
+        <w:t xml:space="preserve">The phase, Mississippian archaeology’s foundational unit, rests on a silent premise: that assemblages more similar to nearby than to distant neighbors record a bounded society. This is rarely tested, yet neutral transmission produces the same clustering with no bounded groups: drift concentrates similar styles nearby. For the late pre-contact central Mississippi Valley, we test whether decorated-ceramic similarity records bounded interaction groups or spatially structured drift. We compare drift and bounded-groups processes on the region’s geographic data, calibrated to the record’s small samples and time-averaging using a signal-recovery experiment. In both the St. Francis basin Parkin phase and the southeast-Missouri assemblages, drift reproduces the structure without bounded groups, and Parkin is a transmission bridge, not a capital. A sharper boundary appears only between the central and lower valleys, confounded with chronological turnover and analytical history. Before similarity is read as social, a record must be shown to be able to distinguish groups from drift.</w:t>
       </w:r>
     </w:p>
     <w:p>
@@ -85,7 +73,7 @@
         <w:pStyle w:val="FirstParagraph"/>
       </w:pPr>
       <w:r>
-        <w:t xml:space="preserve">La fase, unidad fundamental de la arqueología misisipiana, descansa sobre una premisa tácita: que los conjuntos más similares a sus vecinos cercanos que a los distantes registran una sociedad delimitada. Esto rara vez se pone a prueba, aunque la transmisión cultural neutral produce el mismo agrupamiento sin grupos delimitados: la deriva concentra estilos similares en áreas cercanas. Para el valle central del Misisipi de finales del período precontacto, evaluamos si la similitud de la cerámica decorada registra grupos de interacción delimitados o deriva estructurada espacialmente. Comparamos dos procesos generativos, deriva y grupos delimitados, sobre la geografía real de los conjuntos, calibrando la comparación a los tamaños de muestra pequeños y al promediado temporal del registro mediante un experimento de recuperación de señal. Tanto en la fase Parkin de la cuenca del St. Francis como en los conjuntos del sureste de Misuri, la estructura se reproduce mediante deriva y no requiere grupos delimitados, y Parkin es un puente de transmisión más que una capital. Una frontera más marcada aparece solo entre el valle central y el valle inferior, confundida con el recambio cronológico y la historia analítica. Antes de interpretar la similitud como social, debe demostrarse que un registro puede distinguir los grupos de la deriva.</w:t>
+        <w:t xml:space="preserve">La fase, unidad fundamental de la arqueología misisipiana, descansa sobre una premisa tácita: que los conjuntos más similares a sus vecinos cercanos que a los distantes registran una sociedad delimitada. Esto rara vez se pone a prueba, aunque la transmisión cultural neutral produce el mismo agrupamiento sin grupos delimitados: la deriva concentra estilos similares en áreas cercanas. Para el valle central del Misisipi de finales del período precontacto, evaluamos si la similitud de la cerámica decorada registra grupos de interacción delimitados o deriva estructurada espacialmente. Comparamos dos procesos generativos, deriva y grupos delimitados, sobre la geografía real de los conjuntos, calibrando la comparación a los tamaños de muestra pequeños y al promediado temporal del registro mediante un experimento de recuperación de señal. Tanto en la fase Parkin de la cuenca del St. Francis, como en los conjuntos del sureste de Misuri, la estructura se reproduce mediante deriva y no requiere grupos delimitados, y Parkin es un puente de transmisión más que una capital. Una frontera más marcada aparece solo entre el valle central y el valle inferior, confundida con el recambio cronológico y la historia analítica. Antes de interpretar la similitud como social, debe demostrarse que un registro puede distinguir los grupos de la deriva.</w:t>
       </w:r>
     </w:p>
     <w:p>
@@ -203,7 +191,7 @@
         <w:t xml:space="preserve"> </w:t>
       </w:r>
       <w:r>
-        <w:t xml:space="preserve">[CITE-CHECK: lyman_2021]. The Parkin phase is a culture-history construct, a set of assemblages grouped because their decorated-type frequencies seriate together and because the sites cluster in space</w:t>
+        <w:t xml:space="preserve">[CITE-CHECK: lyman_2021]. The Parkin phase is a culture-history construct, a set of assemblages grouped because their decorated-class frequencies seriate together and because the sites cluster in space</w:t>
       </w:r>
       <w:r>
         <w:t xml:space="preserve"> </w:t>
@@ -271,19 +259,7 @@
         <w:pStyle w:val="BodyText"/>
       </w:pPr>
       <w:r>
-        <w:t xml:space="preserve">The premise is rarely tested, and it ignores a strong alternative. Viewed through the lens of social learning and models of cultural transmission, interaction is always continuous yet highly variable. Interaction is structured by distance and geography, as well as by social and cultural structures, and the analyst’s job is to show how apparent</w:t>
-      </w:r>
-      <w:r>
-        <w:t xml:space="preserve"> </w:t>
-      </w:r>
-      <w:r>
-        <w:t xml:space="preserve">“differences”</w:t>
-      </w:r>
-      <w:r>
-        <w:t xml:space="preserve"> </w:t>
-      </w:r>
-      <w:r>
-        <w:t xml:space="preserve">(such as phases) are possible under models of continuous interaction and various structures. Under the neutral model of cultural transmission, decorated style behaves as a selectively neutral trait whose frequency drifts in a finite population of interacting learners</w:t>
+        <w:t xml:space="preserve">The premise is rarely tested, and it ignores a strong alternative. Viewed through the lens of social learning and models of cultural transmission, interaction is always continuous yet highly variable. Interaction is structured by distance and geography, as well as by social relationships. The task is to show how apparent differences between groups, such as phases, can arise under continuous interaction rather than requiring bounded groups. Under the neutral model of cultural transmission, decorated style behaves as a selectively neutral trait whose frequency drifts in a finite population of interacting learners</w:t>
       </w:r>
       <w:r>
         <w:t xml:space="preserve"> </w:t>
@@ -292,7 +268,7 @@
         <w:t xml:space="preserve">(Bentley et al. 2004; Eerkens and Lipo 2007; Fogarty et al. 2024; Neiman 1995)</w:t>
       </w:r>
       <w:r>
-        <w:t xml:space="preserve">. When those learners interact more with near neighbors than with distant ones, drift on the spatially structured population generates similarity that is highest at short distances and decays at longer ones, which creates the appearance of difference and clustering when the record is viewed at larger scales and through a discrete lens, without requiring bounded groups anywhere</w:t>
+        <w:t xml:space="preserve">. When those learners interact more with near neighbors than with distant ones, drift on the spatially structured population generates similarity that is highest at short distances and fades with distance. Viewed at larger scales and divided into discrete units, that gradient looks like difference and clustering, with no bounded groups anywhere</w:t>
       </w:r>
       <w:r>
         <w:t xml:space="preserve"> </w:t>
@@ -318,7 +294,7 @@
         <w:pStyle w:val="BodyText"/>
       </w:pPr>
       <w:r>
-        <w:t xml:space="preserve">Decorated ceramics are the instrument for the test. Because stylistic variants are copied between potters along social-learning networks, the spatial and temporal structure of decorated-type frequencies records the structure of past interaction, and a genuine social boundary, had one existed, would make learning appear conformist within groups and divergent between them, fragmenting the single drifting pool that continuous interaction maintains</w:t>
+        <w:t xml:space="preserve">Decorated ceramics are the instrument for the test. Because stylistic variants are copied between potters along social-learning networks, the spatial and temporal structure of decorated-class frequencies records the structure of past interaction, and a genuine social boundary, had one existed, would make learning appear conformist within groups and divergent between them, fragmenting the single drifting pool that continuous interaction maintains</w:t>
       </w:r>
       <w:r>
         <w:t xml:space="preserve"> </w:t>
@@ -353,7 +329,7 @@
         <w:t xml:space="preserve">(Schiffer 1972)</w:t>
       </w:r>
       <w:r>
-        <w:t xml:space="preserve">. We treat it as what it is, a time-averaged accumulation whose decorated-type frequencies are the population-level residue of social learning, to be measured and explained directly rather than reconstructed</w:t>
+        <w:t xml:space="preserve">. We treat it as what it is, a time-averaged accumulation whose decorated-class frequencies are the population-level residue of social learning, to be measured and explained directly rather than reconstructed</w:t>
       </w:r>
       <w:r>
         <w:t xml:space="preserve"> </w:t>
@@ -479,7 +455,7 @@
         <w:pStyle w:val="BodyText"/>
       </w:pPr>
       <w:r>
-        <w:t xml:space="preserve">The argument proceeds in three steps. First, we evaluate Parkin as a hierarchy and find that no line of evidence, settlement, exchange, or transmission supports it. Second, we ask what generates the St. Francis basin phase structure, and show that neutral drift on the basin’s geography reproduces the observed signatures. A bounded-groups process would leave a far sharper structure than the data carry. Hence, the phase is a continuous interaction structured by where sites sit rather than a closed group with a boundary, and Parkin is a transmission bridge across orderings rather than the core of one. Third, we widen the test to the other late-period phases of the valley and ask whether any decorated-ceramic boundary exists. A boundary that exceeds neutral drift appears only between the central-valley and lower-valley blocks, and even there, it is confounded with the early-to-late turnover of the type repertoire. It cannot yet be read as a synchronic social division. At the scale where the phase is drawn, it is largely indistinguishable from spatially structured drift, and Parkin is best read as a prominent node in a continuous interaction field rather than the capital of a polity.</w:t>
+        <w:t xml:space="preserve">The argument proceeds in three steps. First, we evaluate Parkin as a hierarchy and find that no line of evidence, settlement, exchange, or transmission supports it. Second, we ask what generates the St. Francis basin phase structure, and show that neutral drift on the basin’s geography reproduces the observed signatures. A bounded-groups process would leave a far sharper structure than the data carry. Hence, the phase is a continuous interaction structured by where sites sit rather than a closed group with a boundary, and Parkin is a transmission bridge across orderings rather than the core of one. Third, we widen the test to the other late-period phases of the valley and ask whether any decorated-ceramic boundary exists. A boundary that exceeds neutral drift appears only between the central-valley and lower-valley blocks, and even there, it is confounded with the early-to-late turnover of the class repertoire. It cannot yet be read as a synchronic social division. At the scale where the phase is drawn, it is largely indistinguishable from spatially structured drift, and Parkin is best read as a prominent node in a continuous interaction field rather than the capital of a polity.</w:t>
       </w:r>
     </w:p>
     <w:bookmarkEnd w:id="14"/>
@@ -506,7 +482,7 @@
         <w:pStyle w:val="FirstParagraph"/>
       </w:pPr>
       <w:r>
-        <w:t xml:space="preserve">We take a materialist approach to cultural transmission, which frames the question differently from how the central-valley record is usually read. Archaeologists are trained to think with bounded units, the phase, the polity, the society, discrete entities with members and edges, and to read a cluster of similar assemblages as one of them. We treat transmission instead as a continuous and variable field of copying events among potters, a field with no intrinsic edges, in which interaction falls off with distance and learning can be more local in some places and times than in others. On this view, a group is not a thing with a boundary but a region where transmission has thickened, and similarity is a matter of degree set by how copying is distributed across space. That field can also close off by degree, interaction narrowing until potters copy mostly within a subset and rarely outside it, producing something that looks like the bounded groups archaeologists think with. The difficulty for the phase is that ordinary interaction already makes nearby assemblages more alike than distant ones through distance alone, so clusters by themselves prove nothing. What would mark a real bounded group is closure beyond what distance predicts, and that excess is the signal we test for.</w:t>
+        <w:t xml:space="preserve">We take a materialist approach to cultural transmission, which frames the question differently from how the central-valley record is usually read. Archaeologists are trained to think with bounded units, the phase, the polity, the society, discrete entities with members and edges, and to read a cluster of similar assemblages as one of them. We treat transmission instead as a continuous and variable field of copying events among potters, a field with no intrinsic edges, in which interaction falls off with distance and learning can be more local in some places and times than in others. On this view, a group is not a thing with a boundary but a region where transmission has thickened, and similarity is a matter of degree set by how copying is distributed across space. That field can also close off by degree, interaction narrowing until potters copy mostly within a subset and rarely outside it, producing something that looks like the bounded groups archaeologists think with. The difficulty with the phase is that ordinary interaction already makes nearby assemblages more alike than distant ones, even without distance, so clusters by themselves prove nothing. What would mark a real bounded group is closure beyond what distance predicts, and that excess is the signal we test for.</w:t>
       </w:r>
     </w:p>
     <w:p>
@@ -514,7 +490,7 @@
         <w:pStyle w:val="BodyText"/>
       </w:pPr>
       <w:r>
-        <w:t xml:space="preserve">The phase concept gives the central-valley record its social structure. A phase is formed operationally, as a set of assemblages that seriate together and cluster in space, but it is interpreted socially, as a bounded interacting community, on the premise that assemblages more alike within a phase than across its edges record who interacted with whom</w:t>
+        <w:t xml:space="preserve">The phase concept gives the central-valley record its social structure. A phase is formed operationally as a set of assemblages that seriate together and cluster in space. It is interpreted, however, as a social entity equivalent to a bounded, interacting community, on the premise that assemblages more alike within a phase than across its edges record who interacted with whom</w:t>
       </w:r>
       <w:r>
         <w:t xml:space="preserve"> </w:t>
@@ -559,7 +535,7 @@
         <w:t xml:space="preserve">(Bentley et al. 2004; Bentley 2008; Eerkens and Lipo 2005; Neiman 1995)</w:t>
       </w:r>
       <w:r>
-        <w:t xml:space="preserve">. Neutral style is the null condition: assemblages drawn from a single interacting community share one drifting pool, and their decorated-type frequencies admit a single battleship-curve seriation</w:t>
+        <w:t xml:space="preserve">. Neutral style is the null condition: assemblages drawn from a single interacting community share one drifting pool, and their decorated-class frequencies admit a single battleship-curve seriation</w:t>
       </w:r>
       <w:r>
         <w:t xml:space="preserve"> </w:t>
@@ -615,7 +591,7 @@
         <w:t xml:space="preserve">(Madsen 2012; Premo 2014)</w:t>
       </w:r>
       <w:r>
-        <w:t xml:space="preserve">. The result is equifinality: multiple transmission processes produce the same population-level pattern, so a single statistic cannot recover the process that generated it, and the discriminating signal, where it survives, lies in the rare-variant tail of the frequency distribution rather than in its common types</w:t>
+        <w:t xml:space="preserve">. The result is equifinality: multiple transmission processes produce the same population-level pattern, so a single statistic cannot recover the process that generated it, and the discriminating signal, where it survives, lies in the rare-variant tail of the frequency distribution rather than in its common classes</w:t>
       </w:r>
       <w:r>
         <w:t xml:space="preserve"> </w:t>
@@ -750,7 +726,7 @@
         <w:pStyle w:val="BodyText"/>
       </w:pPr>
       <w:r>
-        <w:t xml:space="preserve">The first asks whether potters copied decorated styles at random or with a bias. Under unbiased copying, where a potter is as likely to reproduce any design she encounters as any other, two independent ways of gauging a collection’s diversity agree. One is based on how concentrated the common types are and their homozygosity; the other is on the sheer number of types present and their richness. Each yields an estimate of the same underlying transmission parameter, and under random copying, the two estimates coincide. Conformity, where potters disproportionately copy whatever is already common, concentrates frequency on a few types. It raises homozygosity, lowering the homozygosity-based estimate while leaving richness little changed, pulling the two apart; a taste for novelty does the reverse. The disagreement between the two estimates, expressed as their ratio, therefore both detect a departure from random copying and show which way it leans</w:t>
+        <w:t xml:space="preserve">The first asks whether potters copied decorated styles at random or with a bias. Under unbiased copying, where a potter is as likely to reproduce any design she encounters as any other, two independent ways of gauging a assemblage’s diversity agree. One is based on homozygosity, a measure borrowed from genetics. This property reflects the probability that two sherds drawn at random from an assemblage share the same decorated class, which is high when a few classes dominate. The other is based on richness, the number of classes in which sherds are identified. Each yields an estimate of the same underlying transmission parameter, and under random copying, the two estimates coincide. Conformity, in which potters disproportionately copy whatever is already common, is a process that will concentrate frequency to a few ceramic classes. It raises homozygosity, lowering the homozygosity-based estimate while leaving richness little changed, pulling the two apart. A taste for novelty does the reverse. The disagreement between the two estimates, expressed as their ratio, therefore both detect a departure from random copying and show which way it leans</w:t>
       </w:r>
       <w:r>
         <w:t xml:space="preserve"> </w:t>
@@ -759,7 +735,7 @@
         <w:t xml:space="preserve">(Neiman 1995; Shennan and Wilkinson 2001)</w:t>
       </w:r>
       <w:r>
-        <w:t xml:space="preserve">. This matters here because a bounded group that enforced a shared decorative marker would copy conformist behavior on its edge, so the two estimates would diverge, whereas a single pool of styles drifting at random would keep them equal.</w:t>
+        <w:t xml:space="preserve">. This matters here because a bounded group that enforced a shared decorative marker would copy conformist behavior even to the edges of its boundaries. As a result, the two estimates would diverge, whereas a single pool of styles drifting at random would keep them equal.</w:t>
       </w:r>
     </w:p>
     <w:p>
@@ -767,7 +743,7 @@
         <w:pStyle w:val="BodyText"/>
       </w:pPr>
       <w:r>
-        <w:t xml:space="preserve">The second asks whether the collections all belong to one interacting community or to several, and it is the most direct test of fragmentation. It rests on frequency seriation, the classic archaeological method of ordering assemblages so that each decorated type’s relative frequency rises to a single peak and then falls away, the shape long known as a battleship curve. That single-peaked rise and fall is what a style traces when it is introduced, becomes popular, and is abandoned within one community, drawing on a shared pool of designs. In classical uses of seriation, all available assemblages were typically pooled into a single seriation, and deviations from the frequency guidelines were dismissed as sampling error. While sampling error certainly does need to be accounted for, classical practice ignores the fact that</w:t>
+        <w:t xml:space="preserve">The second asks whether the assemblages all belong to one interacting community or to several, and it is the most direct test of fragmentation. It rests on frequency seriation, the classic archaeological method of ordering assemblages so that each decorated class’s relative frequency rises to a single peak and then falls away, the shape long known as a battleship curve. That single-peaked rise and fall is what a style traces when it is introduced, becomes popular, and is abandoned within one community, drawing on a shared pool of designs. In classical uses of seriation, all available assemblages were typically pooled into a single seriation, and deviations from the frequency guidelines were dismissed as sampling error. While sampling error certainly does need to be accounted for, classical practice ignores the fact that</w:t>
       </w:r>
       <w:r>
         <w:t xml:space="preserve"> </w:t>
@@ -812,7 +788,7 @@
         <w:pStyle w:val="BodyText"/>
       </w:pPr>
       <w:r>
-        <w:t xml:space="preserve">A set of collections is</w:t>
+        <w:t xml:space="preserve">A set of assemblages is</w:t>
       </w:r>
       <w:r>
         <w:t xml:space="preserve"> </w:t>
@@ -824,7 +800,7 @@
         <w:t xml:space="preserve"> </w:t>
       </w:r>
       <w:r>
-        <w:t xml:space="preserve">when a single ordering can make every type follow the same single-peaked shape simultaneously. When all collections arise from a single continuously interacting population, such an ordering exists. When learning splits into separate groups, each with its own repertoire and its own independent rise and fall of styles, no single ordering can satisfy every type at once, and the collections break into several mutually incompatible orderings. The deterministic frequency-seriation procedure of Lipo, Madsen, and Dunnell</w:t>
+        <w:t xml:space="preserve">when a single ordering can make every class follow the same single-peaked shape simultaneously. When all assemblages arise from a single continuously interacting population, such an ordering exists. When learning splits into separate groups, each with its own repertoire and its own independent rise and fall of styles, no single ordering can satisfy every class at once, and the assemblages break into several mutually incompatible orderings. The deterministic frequency-seriation procedure of Lipo, Madsen, and Dunnell</w:t>
       </w:r>
       <w:r>
         <w:t xml:space="preserve"> </w:t>
@@ -836,7 +812,7 @@
         <w:t xml:space="preserve"> </w:t>
       </w:r>
       <w:r>
-        <w:t xml:space="preserve">finds the complete set of these maximal co-seriable groups algorithmically, without the analyst arranging the collections by eye</w:t>
+        <w:t xml:space="preserve">finds the complete set of these maximal co-seriable groups algorithmically, without the analyst arranging the assemblages by eye</w:t>
       </w:r>
       <w:r>
         <w:t xml:space="preserve"> </w:t>
@@ -871,7 +847,7 @@
         <w:t xml:space="preserve">(Bell et al. 2009)</w:t>
       </w:r>
       <w:r>
-        <w:t xml:space="preserve">, computed here on Gini-Simpson diversity, the chance that two sherds drawn at random from a collection are of different types. F_ST is the share of the total diversity that is due to differences between groups rather than to variation within them. When every collection draws on one shared, drifting pool of styles, between-group differences are small, and F_ST sits near zero, and as groups come to favor distinct repertoires, the between-group share grows, and F_ST climbs</w:t>
+        <w:t xml:space="preserve">, computed here on Gini-Simpson diversity, the chance that two sherds drawn at random from a assemblage are of different classes. F_ST is the share of the total diversity that is due to differences between groups rather than to variation within them. When every assemblage draws on one shared, drifting pool of styles, between-group differences are small, and F_ST sits near zero, and as groups come to favor distinct repertoires, the between-group share grows, and F_ST climbs</w:t>
       </w:r>
       <w:r>
         <w:t xml:space="preserve"> </w:t>
@@ -897,7 +873,7 @@
         <w:pStyle w:val="BodyText"/>
       </w:pPr>
       <w:r>
-        <w:t xml:space="preserve">The fourth asks whether socially close collections are more alike than collections that are merely nearby on the map. Similarity normally fades with distance, because potters interact more with near neighbors than with distant ones, a gradient known as isolation by distance</w:t>
+        <w:t xml:space="preserve">The fourth asks whether socially close assemblages are more alike than assemblages that are merely nearby on the map. Similarity normally fades with distance, because potters interact more with near neighbors than with distant ones, a gradient known as isolation by distance</w:t>
       </w:r>
       <w:r>
         <w:t xml:space="preserve"> </w:t>
@@ -906,7 +882,7 @@
         <w:t xml:space="preserve">(Neiman 1995; Shennan et al. 2015; Wright 1943)</w:t>
       </w:r>
       <w:r>
-        <w:t xml:space="preserve">. A genuine social boundary adds a step to that gradient: pairs of collections within the same cluster are more similar than pairs in neighboring clusters, even when the two pairs span the same geographic distance. We capture that step as a boundary-excess statistic, the gap between within-cluster and between-cluster similarity once distance is held constant, which a plain correlation of similarity with distance cannot isolate. It is useful here because it separates a real social edge from the ordinary spatial fade, again with the caveat that drift on a finite network can itself produce a positive excess</w:t>
+        <w:t xml:space="preserve">. A genuine social boundary adds a step to that gradient: pairs of assemblages within the same cluster are more similar than pairs in neighboring clusters, even when the two pairs span the same geographic distance. We capture that step as a boundary-excess statistic, the gap between within-cluster and between-cluster similarity once distance is held constant, which a plain correlation of similarity with distance cannot isolate. It is useful here because it separates a real social edge from the ordinary spatial fade, again with the caveat that drift on a finite network can itself produce a positive excess</w:t>
       </w:r>
       <w:r>
         <w:t xml:space="preserve"> </w:t>
@@ -1524,7 +1500,7 @@
         <w:pStyle w:val="FirstParagraph"/>
       </w:pPr>
       <w:r>
-        <w:t xml:space="preserve">The ceramic data are the decorated-type counts compiled by Phillips, Ford, and Griffin</w:t>
+        <w:t xml:space="preserve">The ceramic data are the decorated-class counts compiled by Phillips, Ford, and Griffin</w:t>
       </w:r>
       <w:r>
         <w:t xml:space="preserve"> </w:t>
@@ -1536,7 +1512,7 @@
         <w:t xml:space="preserve"> </w:t>
       </w:r>
       <w:r>
-        <w:t xml:space="preserve">for the Lower Mississippi Survey, an assemblage-by-type matrix of 266 surface collections from the central valley</w:t>
+        <w:t xml:space="preserve">for the Lower Mississippi Survey, an assemblage-by-class matrix of 266 surface assemblages from the central valley</w:t>
       </w:r>
       <w:r>
         <w:t xml:space="preserve"> </w:t>
@@ -1545,7 +1521,7 @@
         <w:t xml:space="preserve">(Lipo 2001)</w:t>
       </w:r>
       <w:r>
-        <w:t xml:space="preserve">. Because the hypothesis concerns the Parkin phase, we restrict the analysis to the St. Francis basin of northeastern Arkansas, defined hydrologically as the assemblages within 20 km of the St. Francis, Tyronza, and L’Anguille drainage (Figure 1). This excludes both the lower Yazoo Basin and the Mississippi River-proximal sites whose late-period centers belong to distinct phases, and it yields 29 decorated assemblages for the transmission analysis and 92 sites for the settlement comparison. A stricter watershed rule, keeping only assemblages nearer the St. Francis system than the Mississippi, gives 19. The verdict reported below is unchanged across both definitions. The two southern St. Francis-type sites the drainage rule excludes, Old Town and Blanchard, lie 28 and 80 km from the St. Francis system and belong to the Mississippi-proximal and lower Yazoo settings rather than to the St. Francis drainage. We georeferenced each assemblage through the Lower Mississippi Survey site files. We used settlement attributes, site size, mound count and height, and the presence of defensive ditches and St-Francis-type fortification, from a regional geographic database</w:t>
+        <w:t xml:space="preserve">. Each decorated class is a unit of measurement the analyst defines to capture stylistic variation, not a native category assumed in advance. Because the hypothesis concerns the Parkin phase, we restrict the analysis to the St. Francis basin of northeastern Arkansas, defined hydrologically as the assemblages within 20 km of the St. Francis, Tyronza, and L’Anguille drainage (Figure 1). This excludes both the lower Yazoo Basin and the Mississippi River-proximal sites whose late-period centers belong to distinct phases, and it yields 29 decorated assemblages for the transmission analysis and 92 sites for the settlement comparison. A stricter watershed rule, keeping only assemblages nearer the St. Francis system than the Mississippi, gives 19. The verdict reported below is unchanged across both definitions. The two southern St. Francis-type sites the drainage rule excludes, Old Town and Blanchard, lie 28 and 80 km from the St. Francis system and belong to the Mississippi-proximal and lower Yazoo settings rather than to the St. Francis drainage. We georeferenced each assemblage through the Lower Mississippi Survey site files. We used settlement attributes, site size, mound count and height, and the presence of defensive ditches and St-Francis-type fortification, from a regional geographic database</w:t>
       </w:r>
       <w:r>
         <w:t xml:space="preserve"> </w:t>
@@ -1562,7 +1538,7 @@
         <w:pStyle w:val="BodyText"/>
       </w:pPr>
       <w:r>
-        <w:t xml:space="preserve">Two properties of the data bound what any transmission analysis can claim, and we treat them as constraints rather than nuisances. The assemblages are time-averaged surface collections, so each aggregate pottery over the use-life of its deposit, and such aggregation distorts diversity and neutrality statistics in proportion to the mean lifetime of the variants</w:t>
+        <w:t xml:space="preserve">Two properties of the data bound what any transmission analysis can claim, and we treat them as constraints rather than nuisances. The assemblages are time-averaged surface assemblages, so each aggregate pottery over the use-life of its deposit, and such aggregation distorts diversity and neutrality statistics in proportion to the mean lifetime of the variants</w:t>
       </w:r>
       <w:r>
         <w:t xml:space="preserve"> </w:t>
@@ -1637,7 +1613,7 @@
         <w:t xml:space="preserve">(Baxter 1994; Peeples and Schachner 2012; Smith and Neiman 2007)</w:t>
       </w:r>
       <w:r>
-        <w:t xml:space="preserve">. This ordination arranges assemblages along axes that summarize their decorated-type-frequency differences, as a relative chronological ordinate oriented so that higher positions correspond to later time (Figure 3). Pooling the dates of the five proveniences that match curated assemblages, the pooled median calibrated ages correlate with seriation position at Spearman +0.70 (n = 5, 27 dates pooled), an improvement on the +0.50 of the single-date anchors, with four of the five sites in calendar order and one late-dated site departing from it. The axis, therefore, tracks calendar time, but imperfectly. The trajectory we test is an ordinal measure, not a calendar rate. The discriminating quantity, the size-controlled F_ST trend, is a magnitude invariant to the axis orientation, so only the directional descriptions of the other signatures depend on the anchor. We return to both limits in the discussion.</w:t>
+        <w:t xml:space="preserve">. This ordination arranges assemblages along axes that summarize their decorated-class-frequency differences, as a relative chronological ordinate oriented so that higher positions correspond to later time (Figure 3). Pooling the dates of the five proveniences that match curated assemblages, the pooled median calibrated ages correlate with seriation position at Spearman +0.70 (n = 5, 27 dates pooled), an improvement on the +0.50 of the single-date anchors, with four of the five sites in calendar order and one late-dated site departing from it. The axis, therefore, tracks calendar time, but imperfectly. The trajectory we test is an ordinal measure, not a calendar rate. The discriminating quantity, the size-controlled F_ST trend, is a magnitude invariant to the axis orientation, so only the directional descriptions of the other signatures depend on the anchor. We return to both limits in the discussion.</w:t>
       </w:r>
     </w:p>
     <w:p>
@@ -1649,7 +1625,7 @@
           <wp:inline>
             <wp:extent cx="5334000" cy="3629969"/>
             <wp:effectExtent b="0" l="0" r="0" t="0"/>
-            <wp:docPr descr="Figure 3. Correspondence-analysis seriation of the 29 basin decorated assemblages, plotted on the first two CA dimensions of the decorated-type frequencies and colored by CA1 rank (the relative chronological ordinate, oriented by the five available radiocarbon dates so that higher rank is later). Parkin is starred. The assemblages form a gradational continuum rather than discrete clusters, echoing the independent NMDS result of Mainfort (2003)." title="" id="23" name="Picture"/>
+            <wp:docPr descr="Figure 3. Correspondence-analysis seriation of the 29 basin decorated assemblages, plotted on the first two CA dimensions of the decorated-class frequencies and colored by CA1 rank (the relative chronological ordinate, oriented by the five available radiocarbon dates so that higher rank is later). Parkin is starred. The assemblages form a gradational continuum rather than discrete clusters, echoing the independent NMDS result of Mainfort (2003)." title="" id="23" name="Picture"/>
             <a:graphic>
               <a:graphicData uri="http://schemas.openxmlformats.org/drawingml/2006/picture">
                 <pic:pic>
@@ -1702,7 +1678,7 @@
         <w:t xml:space="preserve"> </w:t>
       </w:r>
       <w:r>
-        <w:t xml:space="preserve">Correspondence-analysis seriation of the 29 basin decorated assemblages, plotted on the first two CA dimensions of the decorated-type frequencies and colored by CA1 rank (the relative chronological ordinate, oriented by the five available radiocarbon dates so that higher rank is later). Parkin is starred. The assemblages form a gradational continuum rather than discrete clusters, echoing the independent NMDS result of Mainfort (2003).</w:t>
+        <w:t xml:space="preserve">Correspondence-analysis seriation of the 29 basin decorated assemblages, plotted on the first two CA dimensions of the decorated-class frequencies and colored by CA1 rank (the relative chronological ordinate, oriented by the five available radiocarbon dates so that higher rank is later). Parkin is starred. The assemblages form a gradational continuum rather than discrete clusters, echoing the independent NMDS result of Mainfort (2003).</w:t>
       </w:r>
     </w:p>
     <w:bookmarkEnd w:id="25"/>
@@ -1732,7 +1708,7 @@
         <w:t xml:space="preserve"> </w:t>
       </w:r>
       <w:r>
-        <w:t xml:space="preserve">application of the infinite-alleles model to ceramic assemblages. We estimated the transmission parameter in two ways: from the unbiased homozygosity of an assemblage and from its number of types, using the Ewens sampling formula</w:t>
+        <w:t xml:space="preserve">application of the infinite-alleles model to ceramic assemblages. We estimated the transmission parameter in two ways: from the unbiased homozygosity of an assemblage and from its number of classes, using the Ewens sampling formula</w:t>
       </w:r>
       <w:r>
         <w:t xml:space="preserve"> </w:t>
@@ -1744,7 +1720,7 @@
         <w:t xml:space="preserve"> </w:t>
       </w:r>
       <w:r>
-        <w:t xml:space="preserve">to estimate the number of types expected under random copying, and took the ratio of the two estimates as the signature. Under neutral drift, the two estimators agree. Conformist transmission lowers the homozygosity-based estimate relative to the richness-based one, and anti-conformist novelty bias does the reverse, so the ratio both detects a departure and indicates its direction</w:t>
+        <w:t xml:space="preserve">to estimate the number of classes expected under random copying, and took the ratio of the two estimates as the signature. Under neutral drift, the two estimators agree. Conformist transmission lowers the homozygosity-based estimate relative to the richness-based one, and anti-conformist novelty bias does the reverse, so the ratio both detects a departure and indicates its direction</w:t>
       </w:r>
       <w:r>
         <w:t xml:space="preserve"> </w:t>
@@ -1770,7 +1746,7 @@
         <w:t xml:space="preserve">(Dunnell 1970; Graves and Cachola-Abad 1996; Lipo et al. 1997, 2015)</w:t>
       </w:r>
       <w:r>
-        <w:t xml:space="preserve">. A set of assemblages is co-seriable if some ordering renders every decorated type both unimodal and continuous, and the method returns the complete set of maximal co-seriable groups. A single group denotes a single interacting community. A proliferation of small, non-co-seriable groups indicates a fragmented one. We report the number and size of these groups and, for each assemblage, the number of distinct groups it joins, which identifies assemblages that bridge otherwise incompatible orderings.</w:t>
+        <w:t xml:space="preserve">. A set of assemblages is co-seriable if some ordering renders every decorated class both unimodal and continuous, and the method returns the complete set of maximal co-seriable groups. A single group denotes a single interacting community. A proliferation of small, non-co-seriable groups indicates a fragmented one. We report the number and size of these groups and, for each assemblage, the number of distinct groups it joins, which identifies assemblages that bridge otherwise incompatible orderings.</w:t>
       </w:r>
     </w:p>
     <w:p>
@@ -1778,7 +1754,7 @@
         <w:pStyle w:val="BodyText"/>
       </w:pPr>
       <w:r>
-        <w:t xml:space="preserve">The variance partition is a cultural analog of Wright’s F_ST computed on Gini-Simpson diversity, the chance that two sherds drawn at random from an assemblage are of different types: the difference between the diversity of the pooled assemblages and the mean within-group diversity, divided by the pooled diversity, taken across spatial clusters</w:t>
+        <w:t xml:space="preserve">The variance partition is a cultural analog of Wright’s F_ST computed on Gini-Simpson diversity, the chance that two sherds drawn at random from an assemblage are of different classes: the difference between the diversity of the pooled assemblages and the mean within-group diversity, divided by the pooled diversity, taken across spatial clusters</w:t>
       </w:r>
       <w:r>
         <w:t xml:space="preserve"> </w:t>
@@ -1796,7 +1772,7 @@
         <w:t xml:space="preserve">(Brainerd 1951; Robinson 1951)</w:t>
       </w:r>
       <w:r>
-        <w:t xml:space="preserve">, a standard index ranging from 0 to 200 that indicates how alike two assemblages are in their type proportions, for every pair of assemblages. We tested its association with inter-site distance by a Mantel</w:t>
+        <w:t xml:space="preserve">, a standard index ranging from 0 to 200 that indicates how alike two assemblages are in their class proportions, for every pair of assemblages. We tested its association with inter-site distance by a Mantel</w:t>
       </w:r>
       <w:r>
         <w:t xml:space="preserve"> </w:t>
@@ -1847,7 +1823,7 @@
         <w:t xml:space="preserve">(Bentley et al. 2004; Neiman 1995)</w:t>
       </w:r>
       <w:r>
-        <w:t xml:space="preserve">, with three tunable controls: the between-group divergence of type profiles, the strength of within-group conformity, and a spatial rule placing group profiles on the landscape. Four generators, one per row of Table 1, instantiate the four competing processes</w:t>
+        <w:t xml:space="preserve">, with three tunable controls: the between-group divergence of class profiles, the strength of within-group conformity, and a spatial rule placing group profiles on the landscape. Four generators, one per row of Table 1, instantiate the four competing processes</w:t>
       </w:r>
       <w:r>
         <w:t xml:space="preserve"> </w:t>
@@ -1864,7 +1840,7 @@
         <w:pStyle w:val="BodyText"/>
       </w:pPr>
       <w:r>
-        <w:t xml:space="preserve">A decisive but simple test is generative: we built synthetic pottery records in which we controlled whether group structure was emerging, dialed from none to strong, and then asked whether our four measures could see it. The synthetic records were matched to the real ones: the same number of collections, the same range of sample sizes, the same blurring of time that surface collections impose</w:t>
+        <w:t xml:space="preserve">The recovery test is generative: we built synthetic pottery records in which we controlled whether group structure was emerging, dialed from none to strong, and then asked whether our four measures could see it. The synthetic records were matched to the real ones: the same number of assemblages, the same range of sample sizes, the same blurring of time that surface assemblages impose</w:t>
       </w:r>
       <w:r>
         <w:t xml:space="preserve"> </w:t>
@@ -1882,7 +1858,7 @@
         <w:t xml:space="preserve">(Crema et al. 2014; Kandler and Shennan 2015)</w:t>
       </w:r>
       <w:r>
-        <w:t xml:space="preserve">. Two properties of the record make this essential rather than optional. Assemblage sample size trends with seriation position (Spearman rho = +0.59), and several signatures are size-sensitive so that a size-dependent estimator can rise or fall along the axis through sampling alone. We therefore subsample every assemblage, synthetic and real, to a common count before scoring, thereby removing the confound. And the record is time-averaged, which we reproduce by blending adjacent-bin production within a window. The recovery experiment then asks, at the resolution and sample sizes this record preserves, which signatures can be trusted and how strong a closure would have to be to register. One aspect of the calibration matters here. Because subsampling the larger, later assemblages to a common count slightly inflates within-cluster diversity and so depresses F_ST toward later positions, the null with no closure (pure drift) itself carries a mild negative trend rather than a flat zero. The test is calibrated against that null distribution, not against zero, so the false-positive rate is held at five percent regardless, and the empirical value is read against the same null.</w:t>
+        <w:t xml:space="preserve">. Two properties of the record make this necessary. Assemblage sample size trends with seriation position (Spearman rho = +0.59), and several signatures are size-sensitive so that a size-dependent estimator can rise or fall along the axis through sampling alone. We therefore subsample every assemblage, synthetic and real, to a common count before scoring, thereby removing the confound. And the record is time-averaged, which we reproduce by blending adjacent-bin production within a window. The recovery experiment then asks, at the resolution and sample sizes this record preserves, which signatures can be trusted and how strong a closure would have to be to register. One aspect of the calibration matters here. Because subsampling the larger, later assemblages to a common count slightly inflates within-cluster diversity and so depresses F_ST toward later positions, the null with no closure (pure drift) itself carries a mild negative trend rather than a flat zero. The test is calibrated against that null distribution, not against zero, so the false-positive rate is held at five percent regardless, and the empirical value is read against the same null.</w:t>
       </w:r>
     </w:p>
     <w:bookmarkEnd w:id="27"/>
@@ -1909,7 +1885,7 @@
         <w:t xml:space="preserve">(2021)</w:t>
       </w:r>
       <w:r>
-        <w:t xml:space="preserve">: each assemblage is a node holding a finite population of learners that copies decorated-type variants from within the node and, at a low rate, from other nodes with a probability that decays with geographic distance, under a fixed innovation rate, with deposition pooled over a trailing window to reproduce the record’s time-averaging. The bounded-groups model is identical except that interaction is concentrated within a small number of spatially contiguous groups, with only a low leak of copying between them, so that learning is restricted within boundaries. Both are run on the observed coordinate layout and subsampled to the observed per-assemblage sherd totals. Both are scored by the same four signatures, along with network modularity, a measure of how strongly the assemblages divide into separate clusters, and the distance decay of similarity. We swept the drift model’s interaction range, between-node mixing rate, and innovation rate, and report the full sweep (Supplemental Text) rather than a single setting. To extend the test to the wider valley, we added the southeast-Missouri survey assemblages of Williams</w:t>
+        <w:t xml:space="preserve">: each assemblage is a node holding a finite population of learners that copies decorated-class variants from within the node and, at a low rate, from other nodes with a probability that decays with geographic distance, under a fixed innovation rate, with deposition pooled over a trailing window to reproduce the record’s time-averaging. The bounded-groups model is identical except that interaction is concentrated within a small number of spatially contiguous groups, with only a low leak of copying between them, so that learning is restricted within boundaries. Both are run on the observed coordinate layout and subsampled to the observed per-assemblage sherd totals. Both are scored by the same four signatures, along with network modularity, a measure of how strongly the assemblages divide into separate clusters, and the distance decay of similarity. We swept the drift model’s interaction range, between-node mixing rate, and innovation rate, and report the full sweep (Supplemental Text) rather than a single setting. To extend the test to the wider valley, we added the southeast-Missouri survey assemblages of Williams</w:t>
       </w:r>
       <w:r>
         <w:t xml:space="preserve"> </w:t>
@@ -1918,7 +1894,7 @@
         <w:t xml:space="preserve">(1954)</w:t>
       </w:r>
       <w:r>
-        <w:t xml:space="preserve">, digitized from the survey tables. We georeferenced both the Phillips-Ford-Griffin and the Williams assemblages using their Lower Mississippi Survey grid designations against the digitized survey point files, so that the two regions share a single coordinate frame. Decorated types were harmonized between the two typologies, both rooted in the Phillips-Ford-Griffin framework, into a common vocabulary, and the between-region comparison was run both on all decorated types and on the types shared by the two typologies (Supplemental Text).</w:t>
+        <w:t xml:space="preserve">, digitized from the survey tables. We georeferenced both the Phillips-Ford-Griffin and the Williams assemblages using their Lower Mississippi Survey grid designations against the digitized survey point files, so that the two regions share a single coordinate frame. Decorated classes were harmonized between the two typologies, both rooted in the Phillips-Ford-Griffin framework, into a common vocabulary, and the between-region comparison was run both on all decorated classes and on the classes shared by the two typologies (Supplemental Text).</w:t>
       </w:r>
     </w:p>
     <w:bookmarkEnd w:id="28"/>
@@ -1969,7 +1945,7 @@
         <w:t xml:space="preserve"> </w:t>
       </w:r>
       <w:r>
-        <w:t xml:space="preserve">independent nonmetric multidimensional scaling of overlapping late-period assemblages, a published ordination of 39 collections from the central valley and adjacent areas that tests whether the named phases form discrete, bounded clusters or a gradational continuum.</w:t>
+        <w:t xml:space="preserve">independent nonmetric multidimensional scaling of overlapping late-period assemblages, a published ordination of 39 assemblages from the central valley and adjacent areas that tests whether the named phases form discrete, bounded clusters or a gradational continuum.</w:t>
       </w:r>
     </w:p>
     <w:bookmarkEnd w:id="29"/>
@@ -2061,7 +2037,7 @@
         <w:pStyle w:val="BodyText"/>
       </w:pPr>
       <w:r>
-        <w:t xml:space="preserve">Applied to the Parkin phase, that one reliable signature shows no closure into bounded groups, and the apparent signals in the others are confounded by sample size (Figure 5). The raw trajectory along the seriation axis seems to dissociate, but two of its trends are sampling artifacts: because assemblage size trends with seriation position, the size-sensitive estimators move with it. Two of the apparent trends are artifacts of sample size. Once every assemblage is trimmed to a common sherd count by subsampling, cultural F_ST falls from a raw +0.60 to +0.01, and its uncertainty range runs from no closure to a moderate signal, so it is uninformative rather than a resolved positive. The neutrality departure is likewise size-sensitive (its raw -0.94 only weakens to -0.83 under size control), and the recovery shows that it does not track closure in either direction here, so it, too, cannot be read as a transmission signal. On the recovery curve, the size-controlled empirical F_ST corresponds to a nominal injected strength of about 0.35, below the resolution limit. The record, therefore, shows no detectable closure of moderate or greater strength. The negative is informative for a closure of moderate or greater strength, which would have registered and is absent. It cannot exclude a weaker closure that, given a record of this size and time-averaging, is underpowered to resolve. The positive control reported next shows that the structure actually present is what neutral drift produces, so the result is not only that no bounded group is detectable, but also that the data appear in ways consistent with how continuous, spatially structured interaction makes them look.</w:t>
+        <w:t xml:space="preserve">Applied to the Parkin phase, that one reliable signature shows no closure into bounded groups, and the apparent signals in the others are confounded by sample size (Figure 5). The raw trajectory along the seriation axis seems to dissociate, but two of its trends are sampling artifacts: because assemblage size trends with seriation position, the size-sensitive estimators move with it. Two of the apparent trends are artifacts of sample size. Once every assemblage is trimmed to a common sherd count by subsampling, cultural F_ST falls from a raw +0.60 to +0.01, and its uncertainty range runs from no closure to a moderate signal, so it is uninformative rather than a resolved positive. The neutrality departure is likewise size-sensitive (its raw -0.94 only weakens to -0.83 under size control), and the recovery shows that it does not track closure in either direction here, so it, too, cannot be read as a transmission signal. On the recovery curve, the size-controlled empirical F_ST corresponds to a nominal injected strength of about 0.35, below the resolution limit. The record, therefore, shows no detectable closure of moderate or greater strength. The negative is informative for a closure of moderate or greater strength, which would have registered and is absent. It cannot exclude a weaker closure that, given a record of this size and time-averaging, is underpowered to resolve. The positive control reported next shows that the structure actually present is what neutral drift produces, so the result is not only that no bounded group is detectable, but also that the structure present is what continuous, spatially structured interaction would produce.</w:t>
       </w:r>
     </w:p>
     <w:p>
@@ -2134,7 +2110,7 @@
         <w:pStyle w:val="BodyText"/>
       </w:pPr>
       <w:r>
-        <w:t xml:space="preserve">Three further checks, all pointing the same way, add detail. The first follows each decorated type’s rise and fall through the sequence and asks whether the changes resemble the aimless wobble of unbiased copying or the directed change a deliberate marker would exhibit. Seven of the nine testable types appear to be simple wobble (the frequency increment test)</w:t>
+        <w:t xml:space="preserve">Three further checks, all pointing the same way, add detail. The first follows each decorated class’s rise and fall through the sequence and asks whether the changes resemble the aimless wobble of unbiased copying or the directed change a deliberate marker would exhibit. Seven of the nine testable classes appear to be simple wobble (the frequency increment test)</w:t>
       </w:r>
       <w:r>
         <w:t xml:space="preserve"> </w:t>
@@ -2143,7 +2119,7 @@
         <w:t xml:space="preserve">(Feder et al. 2014)</w:t>
       </w:r>
       <w:r>
-        <w:t xml:space="preserve">. The second compares how the collections’ overall diversity changes over time against the range that plain drift would produce, and finds that it stays within that range (a non-equilibrium neutral test)</w:t>
+        <w:t xml:space="preserve">. The second compares how the assemblages’ overall diversity changes over time against the range that plain drift would produce, and finds that it stays within that range (a non-equilibrium neutral test)</w:t>
       </w:r>
       <w:r>
         <w:t xml:space="preserve"> </w:t>
@@ -2152,7 +2128,7 @@
         <w:t xml:space="preserve">(Kandler and Shennan 2013)</w:t>
       </w:r>
       <w:r>
-        <w:t xml:space="preserve">. The third asks whether the collections grow more different from one another toward contact, as would fragmenting groups. They do not. Neiman’s interassemblage distance shows no divergence trend along the sequence (Spearman rho = +0.37, not significant), the typical difference between spatial clusters is barely larger than the difference within them (a ratio of 1.13), and the more diverse collections are the more central ones, the pattern drift produces in a single shared community (Figure S1)</w:t>
+        <w:t xml:space="preserve">. The third asks whether the assemblages grow more different from one another toward contact, as would fragmenting groups. They do not. Neiman’s interassemblage distance shows no divergence trend along the sequence (Spearman rho = +0.37, not significant), the typical difference between spatial clusters is barely larger than the difference within them (a ratio of 1.13), and the more diverse assemblages are the more central ones, the pattern drift produces in a single shared community (Figure S1)</w:t>
       </w:r>
       <w:r>
         <w:t xml:space="preserve"> </w:t>
@@ -2198,7 +2174,7 @@
         <w:pStyle w:val="BodyText"/>
       </w:pPr>
       <w:r>
-        <w:t xml:space="preserve">What it means for assemblages to be co-seriable carries the weight of this signature, and the deterministic method is stricter than the seriations most archaeologists have in mind. In conventional practice, an analyst can almost always arrange a set of assemblages into an order in which type frequencies more or less rise and fall, treating the places where a type breaks that pattern as noise to be tolerated by eye. Deterministic frequency seriation removes that tolerance. It accepts an ordering only when every decorated type is at once unimodal, rising to a single peak and then falling away, and continuous, changing without an abrupt jump. It treats any break in a type’s rise and fall as disqualifying that ordering unless the break is small enough to be explained by sampling error in the counts</w:t>
+        <w:t xml:space="preserve">What it means for assemblages to be co-seriable carries the weight of this signature, and the deterministic method is stricter than the seriations most archaeologists have in mind. In conventional practice, an analyst can almost always arrange a set of assemblages into an order in which class frequencies more or less rise and fall, treating the places where a class breaks that pattern as noise to be tolerated by eye. Deterministic frequency seriation removes that tolerance. It accepts an ordering only when every decorated class is at once unimodal, rising to a single peak and then falling away, and continuous, changing without an abrupt jump. It treats any break in a class’s rise and fall as disqualifying that ordering unless the break is small enough to be explained by sampling error in the counts</w:t>
       </w:r>
       <w:r>
         <w:t xml:space="preserve"> </w:t>
@@ -2207,7 +2183,7 @@
         <w:t xml:space="preserve">(Dunnell 1970; Lipo et al. 2015)</w:t>
       </w:r>
       <w:r>
-        <w:t xml:space="preserve">. Where a conventional seriation would accept one rough ordering and move on, the deterministic method asks whether even one ordering can satisfy every type at once, and reports when none can. A single community drawing on a shared, drifting pool of designs meets that requirement under a single ordering. When learning is partitioned among groups, each with its own rise and fall of styles, no single ordering can hold every type unimodal at once, and the assemblages resolve into several mutually incompatible orderings. The departures a conventional seriation would wave off as minor wiggles are, read this way, the signature of more than one interaction community, and the number of maximal co-seriable groups, with the count of any one assemblage joins, measures that fragmentation directly</w:t>
+        <w:t xml:space="preserve">. Where a conventional seriation would accept one rough ordering and move on, the deterministic method asks whether even one ordering can satisfy every class at once, and reports when none can. A single community drawing on a shared, drifting pool of designs meets that requirement under a single ordering. When learning is partitioned among groups, each with its own rise and fall of styles, no single ordering can hold every class unimodal at once, and the assemblages resolve into several mutually incompatible orderings. The departures a conventional seriation would wave off as minor wiggles are, read this way, the signature of more than one interaction community, and the number of maximal co-seriable groups, with the count of any one assemblage joins, measures that fragmentation directly</w:t>
       </w:r>
       <w:r>
         <w:t xml:space="preserve"> </w:t>
@@ -2501,7 +2477,7 @@
         <w:t xml:space="preserve">(Lipo et al. 2021)</w:t>
       </w:r>
       <w:r>
-        <w:t xml:space="preserve">. The deposits are not contemporaneous, which is why they can be seriated at all and why some carry more of the late types than others, so each synthetic assemblage is drawn time-transgressively at the run-time that matches its seriation position and accumulated over a window rather than read from a single instant. Repeated across 500 realizations, the model yields not one partition but a distribution of them, so membership in Parkin’s group is a probability rather than a fact (Figure 8). Holding time fixed to isolate the spatial signal, that probability falls off smoothly with river distance from Parkin (Figure 8A): nearby assemblages usually share its emergent community and distant ones usually do not, ranging from about 0.70 to 0.17 with no assemblage a certain member or non-member, a graded field rather than the bounded set a phase map implies. Restoring the staggered deposition ages removes even that gradient, because assemblages caught at different points in the sequence carry different repertoires and fall into different, time-defined communities, so a site’s nearest neighbors need not share its phase. The between-group cultural F_ST of the emergent groups settles at the observed level either way, near 0.02 to 0.03 against an observed 0.04, well below the value a bounded group would leave (Figure 8B), and the synthetic record re-seriates (Figure S7). Geography and time are the whole engine, and the apparent groups are two readings of one neutral process. That spatial and population structure, not population size, governs how drift partitions diversity in finite structured populations is established in both the cultural-transmission and population-genetics literatures</w:t>
+        <w:t xml:space="preserve">. The deposits are not contemporaneous, which is why they can be seriated at all and why some carry more of the late classes than others, so each synthetic assemblage is drawn time-transgressively at the run-time that matches its seriation position and accumulated over a window rather than read from a single instant. Repeated across 500 realizations, the model yields not one partition but a distribution of them, so membership in Parkin’s group is a probability rather than a fact (Figure 8). Holding time fixed to isolate the spatial signal, that probability falls off smoothly with river distance from Parkin (Figure 8A): nearby assemblages usually share its emergent community and distant ones usually do not, ranging from about 0.70 to 0.17 with no assemblage a certain member or non-member, a graded field rather than the bounded set a phase map implies. Restoring the staggered deposition ages removes even that gradient, because assemblages caught at different points in the sequence carry different repertoires and fall into different, time-defined communities, so a site’s nearest neighbors need not share its phase. The between-group cultural F_ST of the emergent groups settles at the observed level either way, near 0.02 to 0.03 against an observed 0.04, well below the value a bounded group would leave (Figure 8B), and the synthetic record re-seriates (Figure S7). Geography and time are the whole engine, and the apparent groups are two readings of one neutral process. That spatial and population structure, not population size, governs how drift partitions diversity in finite structured populations is established in both the cultural-transmission and population-genetics literatures</w:t>
       </w:r>
       <w:r>
         <w:t xml:space="preserve"> </w:t>
@@ -2540,7 +2516,7 @@
           <wp:inline>
             <wp:extent cx="5334000" cy="4248345"/>
             <wp:effectExtent b="0" l="0" r="0" t="0"/>
-            <wp:docPr descr="Figure 8. Phase-like structure generated by neutral drift on the real basin geography, with no bounded group imposed, summarized over 500 realizations. A neutral finite-population drift model runs forward on the actual coordinates of the 29 St. Francis basin assemblages, with copying that decays with along-waterway (river-network) distance and new decorated types arising through time (Supplemental Text). (A) Each assemblage on the river basemap, shaded by the probability that it falls in the same emergent community as Parkin (star) across the 500 runs, for the contemporaneous snapshot that isolates the spatial signal. The probability falls off smoothly with river distance from Parkin (Spearman rho = -0.72), from about 0.70 nearby to 0.17 far away, with no assemblage a certain member or non-member, so Parkin’s “phase” is a graded, probabilistic field rather than a bounded set. Under the full time-transgressive sampling the gradient disappears because membership then reflects time as well as space (Supplemental Text). (B) Between-group cultural F_ST for the observed data (black, 0.04) against contemporaneous and time-transgressive drift (means with standard deviation across the 500 runs, near 0.02 to 0.03); drift reproduces the observed level rather than the higher value a bounded group would leave. Parameters are the positive-control corner (interaction length 24 river-km, mixing 0.02, innovation 0.012); robustness across the factor grid is in Figure S7." title="" id="45" name="Picture"/>
+            <wp:docPr descr="Figure 8. Phase-like structure generated by neutral drift on the real basin geography, with no bounded group imposed, summarized over 500 realizations. A neutral finite-population drift model runs forward on the actual coordinates of the 29 St. Francis basin assemblages, with copying that decays with along-waterway (river-network) distance and new decorated classes arising through time (Supplemental Text). (A) Each assemblage on the river basemap, shaded by the probability that it falls in the same emergent community as Parkin (star) across the 500 runs, for the contemporaneous snapshot that isolates the spatial signal. The probability falls off smoothly with river distance from Parkin (Spearman rho = -0.72), from about 0.70 nearby to 0.17 far away, with no assemblage a certain member or non-member, so Parkin’s “phase” is a graded, probabilistic field rather than a bounded set. Under the full time-transgressive sampling the gradient disappears because membership then reflects time as well as space (Supplemental Text). (B) Between-group cultural F_ST for the observed data (black, 0.04) against contemporaneous and time-transgressive drift (means with standard deviation across the 500 runs, near 0.02 to 0.03). Drift reproduces the observed level rather than the higher value a bounded group would leave. Parameters are the positive-control corner (interaction length 24 river-km, mixing 0.02, innovation 0.012). Robustness across the factor grid is in Figure S7." title="" id="45" name="Picture"/>
             <a:graphic>
               <a:graphicData uri="http://schemas.openxmlformats.org/drawingml/2006/picture">
                 <pic:pic>
@@ -2593,7 +2569,7 @@
         <w:t xml:space="preserve"> </w:t>
       </w:r>
       <w:r>
-        <w:t xml:space="preserve">Phase-like structure generated by neutral drift on the real basin geography, with no bounded group imposed, summarized over 500 realizations. A neutral finite-population drift model runs forward on the actual coordinates of the 29 St. Francis basin assemblages, with copying that decays with along-waterway (river-network) distance and new decorated types arising through time (Supplemental Text). (A) Each assemblage on the river basemap, shaded by the probability that it falls in the same emergent community as Parkin (star) across the 500 runs, for the contemporaneous snapshot that isolates the spatial signal. The probability falls off smoothly with river distance from Parkin (Spearman rho = -0.72), from about 0.70 nearby to 0.17 far away, with no assemblage a certain member or non-member, so Parkin’s</w:t>
+        <w:t xml:space="preserve">Phase-like structure generated by neutral drift on the real basin geography, with no bounded group imposed, summarized over 500 realizations. A neutral finite-population drift model runs forward on the actual coordinates of the 29 St. Francis basin assemblages, with copying that decays with along-waterway (river-network) distance and new decorated classes arising through time (Supplemental Text). (A) Each assemblage on the river basemap, shaded by the probability that it falls in the same emergent community as Parkin (star) across the 500 runs, for the contemporaneous snapshot that isolates the spatial signal. The probability falls off smoothly with river distance from Parkin (Spearman rho = -0.72), from about 0.70 nearby to 0.17 far away, with no assemblage a certain member or non-member, so Parkin’s</w:t>
       </w:r>
       <w:r>
         <w:t xml:space="preserve"> </w:t>
@@ -2605,7 +2581,7 @@
         <w:t xml:space="preserve"> </w:t>
       </w:r>
       <w:r>
-        <w:t xml:space="preserve">is a graded, probabilistic field rather than a bounded set. Under the full time-transgressive sampling the gradient disappears because membership then reflects time as well as space (Supplemental Text). (B) Between-group cultural F_ST for the observed data (black, 0.04) against contemporaneous and time-transgressive drift (means with standard deviation across the 500 runs, near 0.02 to 0.03); drift reproduces the observed level rather than the higher value a bounded group would leave. Parameters are the positive-control corner (interaction length 24 river-km, mixing 0.02, innovation 0.012); robustness across the factor grid is in Figure S7.</w:t>
+        <w:t xml:space="preserve">is a graded, probabilistic field rather than a bounded set. Under the full time-transgressive sampling the gradient disappears because membership then reflects time as well as space (Supplemental Text). (B) Between-group cultural F_ST for the observed data (black, 0.04) against contemporaneous and time-transgressive drift (means with standard deviation across the 500 runs, near 0.02 to 0.03). Drift reproduces the observed level rather than the higher value a bounded group would leave. Parameters are the positive-control corner (interaction length 24 river-km, mixing 0.02, innovation 0.012). Robustness across the factor grid is in Figure S7.</w:t>
       </w:r>
     </w:p>
     <w:p>
@@ -2639,7 +2615,7 @@
         <w:pStyle w:val="BodyText"/>
       </w:pPr>
       <w:r>
-        <w:t xml:space="preserve">Three limits bound the result, and the recovery experiment forces the most important of them to the front. At this record’s resolution, the discrimination between a bounded group and drift rests on a single signature, cultural F_ST. That signature is confounded by a sample-size trend along the seriation axis (Spearman rho = +0.59). We removed the confound by subsampling every assemblage to a common count, which collapses the raw F_ST trend from +0.60 to +0.01. We calibrated the test on synthetic data matched to the record, in which F_ST recovers a moderate-strength closure (s of about 0.5, rising to 0.7 once the record’s time-averaging is imposed), while maintaining a false-positive rate of 5%. The size-controlled empirical F_ST is uninformative, its bootstrap interval spanning no closure to a moderate signal. The negative is therefore informative for a closure of moderate or greater strength, which would have registered as a resolved positive, but does not. It cannot exclude a weaker closure that a record of 29 time-averaged assemblages is underpowered to resolve, and we state the claim at that bound rather than beyond it. The other three signatures do not track closure reliably here. The neutral departure is due to its non-monotonicity with respect to conformity and size-sensitivity. The spatial boundary is problematic because there are too few spatial clusters, and seriation coherence is weak, so we report them as corroboration rather than as independent confirmations. This reduction is a property of the record. When a known closure signal is injected instead through a within-group conformity pathway or a non-spatially-organized social-fragmentation pathway, neither the neutral nor the seriation signature recovers it either, so the three weak signatures fail at this resolution regardless of how closure is produced (Supplemental Text). The price is that the negative bounds are only closure expressed as between-group divergence. The closure carried purely by conformity, or by social structure not aligned with the spatial clusters, would lie below detection in this record at any strength. The second limit is the ordinal chronology. The basin radiocarbon corpus pools to five seriation anchors across a calibration plateau, so the axis is a relative order oriented toward later time at Spearman +0.70, imperfectly. The discriminating quantity, the size-controlled F_ST trend, is a magnitude that does not depend on the axis orientation, and the settlement and exchange lines do not depend on the ceramic chronology at all. The third limit is time-averaging, which damps between-assemblage variation and reduces apparent turnover</w:t>
+        <w:t xml:space="preserve">Three limits bound the result, and the recovery experiment forces the most important of them to the front. At this record’s resolution, the discrimination between a bounded group and drift rests on a single signature, cultural F_ST. That signature is confounded by a sample-size trend along the seriation axis (Spearman rho = +0.59). We removed the confound by subsampling every assemblage to a common count, which collapses the raw F_ST trend from +0.60 to +0.01. We calibrated the test on synthetic data matched to the record, in which F_ST recovers a moderate-strength closure (s of about 0.5, rising to 0.7 once the record’s time-averaging is imposed), while maintaining a false-positive rate of 5%. The size-controlled empirical F_ST is uninformative, its bootstrap interval spanning no closure to a moderate signal. The negative is therefore informative for a closure of moderate or greater strength, which would have registered as a resolved positive, but does not. It cannot exclude a weaker closure that a record of 29 time-averaged assemblages is underpowered to resolve, and we state the claim at that bound rather than beyond it. The other three signatures do not track closure reliably here. The neutral departure fails because it is non-monotonic in conformity and sensitive to sample size. The spatial boundary fails because the data support too few spatial clusters, and seriation coherence responds only weakly, so we report them as corroboration rather than as independent confirmations. This reduction is a property of the record. When a known closure signal is injected instead through a within-group conformity pathway or a non-spatially-organized social-fragmentation pathway, neither the neutral nor the seriation signature recovers it either, so the three weak signatures fail at this resolution regardless of how closure is produced (Supplemental Text). The price is that the negative bounds are only closure expressed as between-group divergence. The closure carried purely by conformity, or by social structure not aligned with the spatial clusters, would lie below detection in this record at any strength. The second limit is the ordinal chronology. The basin radiocarbon corpus pools to five seriation anchors across a calibration plateau, so the axis is a relative order oriented toward later time at Spearman +0.70, imperfectly. The discriminating quantity, the size-controlled F_ST trend, is a magnitude that does not depend on the axis orientation, and the settlement and exchange lines do not depend on the ceramic chronology at all. The third limit is time-averaging, which damps between-assemblage variation and reduces apparent turnover</w:t>
       </w:r>
       <w:r>
         <w:t xml:space="preserve"> </w:t>
@@ -2656,7 +2632,7 @@
         <w:pStyle w:val="BodyText"/>
       </w:pPr>
       <w:r>
-        <w:t xml:space="preserve">The contribution has two parts that should be kept distinct. The four signatures distinguish a bounded interaction group from drift in principle, and an idealized simulation confirms that closure drives them together while drift and the other mimics do not (Figure S4). The calibration is the part that travels to real data: it asks, before any similarity structure is read as social, which signatures a given record can support and how strong a closure each could detect, and on the Parkin record, it shows the test reducing to its single most robust component, cultural F_ST. We are explicit about what that costs: had F_ST shown a positive trend, it alone could not have separated a real group from environmental patchiness, which also drives between-group variance (Table 1), so on a positive result, the generative drift-versus-groups comparison, not F_ST alone, would have had to carry the discrimination. The negative is cleaner because the present structure is positively matched by drift and overshot by bounded groups. From this result, we can demonstrate that it may be possible to measure social structure among deposits with decorated assemblages. We can also assess whether the Parkin phase was a polity by examining whether interaction had closed into a bounded group to a degree that the record can resolve. For the Parkin phase, the answer is that it had not, within the bounds supported by the record. The polity the De Soto encountered seems to reflect distinctions drawn in ceremonial practices, fortification, and settlement size, rather than one written into the structure of ceramic transmission.</w:t>
+        <w:t xml:space="preserve">The contribution has two parts that should be kept distinct. The four signatures distinguish a bounded interaction group from drift in principle, and an idealized simulation confirms that closure drives them together while drift and the other mimics do not (Figure S4). The calibration is the part that travels to real data: it asks, before any similarity structure is read as social, which signatures a given record can support and how strong a closure each could detect, and on the Parkin record, it shows the test reducing to its single most robust component, cultural F_ST. We are explicit about what that costs: had F_ST shown a positive trend, it alone could not have separated a real group from environmental patchiness, which also drives between-group variance (Table 1), so on a positive result, the generative drift-versus-groups comparison, not F_ST alone, would have had to carry the discrimination. The negative is cleaner because the present structure is positively matched by drift and overshot by bounded groups. This result shows that social structure may be measurable from decorated-ceramic assemblages. We can also assess whether the Parkin phase was a polity by examining whether interaction had closed into a bounded group to a degree that the record can resolve. For the Parkin phase, the answer is that it had not, within the bounds supported by the record. The polity the De Soto encountered seems to reflect distinctions drawn in ceremonial practices, fortification, and settlement size, rather than one written into the structure of ceramic transmission.</w:t>
       </w:r>
     </w:p>
     <w:p>
@@ -2664,7 +2640,7 @@
         <w:pStyle w:val="BodyText"/>
       </w:pPr>
       <w:r>
-        <w:t xml:space="preserve">The test also extends beyond the basin, and the extension is instructive (Figure 9). Applied to the southeast-Missouri assemblages compiled by Williams</w:t>
+        <w:t xml:space="preserve">The test also extends beyond the basin (Figure 9). Applied to the southeast-Missouri assemblages compiled by Williams</w:t>
       </w:r>
       <w:r>
         <w:t xml:space="preserve"> </w:t>
@@ -2681,7 +2657,7 @@
         <w:pStyle w:val="BodyText"/>
       </w:pPr>
       <w:r>
-        <w:t xml:space="preserve">The distinctive central-valley types are early-to-middle Mississippian, and the distinctive lower-valley types are late</w:t>
+        <w:t xml:space="preserve">The distinctive central-valley classes are early-to-middle Mississippian, and the distinctive lower-valley classes are late</w:t>
       </w:r>
       <w:r>
         <w:t xml:space="preserve"> </w:t>
@@ -2690,7 +2666,7 @@
         <w:t xml:space="preserve">(Phillips 1970; Williams 1954)</w:t>
       </w:r>
       <w:r>
-        <w:t xml:space="preserve">, so the step at the boundary cannot be separated from the early-to-late turnover of the repertoire with time-averaged surface collections, and resolving whether the inter-regional boundary is synchronic and social or a chronological succession would require independent radiocarbon control on the central-valley assemblages that the present compilation lacks. A second confound compounds the first. The lower-valley assemblages were collected and classified by Ford, later by Phillips, Ford, and Griffin. In contrast, the central-valley assemblages were collected and classified separately by Williams, so the two blocks differ in analyst, sorting convention, and type definition as well as in space and time. The shared-type restriction guards against the crudest version of this artifact, because a boundary built only from types unique to each typology would vanish when only the types both traditions record are compared, and the boundary does weaken under that restriction without disappearing. Even the shared types, however, may have been sorted to subtly different criteria by the two traditions. We therefore cannot rule out that the apparent central-valley and lower-valley boundary is in part an artifact of two separate analytical histories, and that the possibility of continuous interaction across the whole region, with no real boundary anywhere, remains open. That possibility is part of the question this study raises, rather than a nuisance to be set aside, because a boundary in the data is not yet a boundary in the past. The paper’s point at the local scale applies with equal force between the regions.</w:t>
+        <w:t xml:space="preserve">, so the step at the boundary cannot be separated from the early-to-late turnover of the repertoire with time-averaged surface assemblages, and resolving whether the inter-regional boundary is synchronic and social or a chronological succession would require independent radiocarbon control on the central-valley assemblages that the present compilation lacks. A second confound compounds the first. The lower-valley assemblages were collected and classified by Ford, later by Phillips, Ford, and Griffin. In contrast, the central-valley assemblages were collected and classified separately by Williams, so the two blocks differ in analyst, sorting convention, and class definition as well as in space and time. The shared-class restriction guards against the crudest version of this artifact, because a boundary built only from classes unique to each typology would vanish when only the classes both traditions record are compared, and the boundary does weaken under that restriction without disappearing. Even the shared classes, however, may have been sorted to subtly different criteria by the two traditions. We therefore cannot rule out that the apparent central-valley and lower-valley boundary is in part an artifact of two separate analytical histories, and that the possibility of continuous interaction across the whole region, with no real boundary anywhere, remains open. That possibility is part of the question this study raises, rather than a nuisance to be set aside, because a boundary in the data is not yet a boundary in the past. The paper’s point at the local scale applies with equal force between the regions.</w:t>
       </w:r>
     </w:p>
     <w:p>
@@ -2702,7 +2678,7 @@
           <wp:inline>
             <wp:extent cx="4572000" cy="4685221"/>
             <wp:effectExtent b="0" l="0" r="0" t="0"/>
-            <wp:docPr descr="Figure 9. Regional setting of the two-scale comparison. Decorated-ceramic assemblages of the central Mississippi Valley: the southeast-Missouri survey of Williams (CMV, blue) and the lower-valley St. Francis basin Parkin-phase assemblages (LMV, orange), with the gap between the two clusters of collections and Parkin starred. Labels mark the named physiographic phase regions (Cairo Lowland, Sikeston Ridge, Malden Plain, and Little River in the central valley, with the St. Francis basin in the lower valley). Hydrography combines the Lower Mississippi Survey layer with Natural Earth, state boundaries, and the North America locator inset, which are from Natural Earth. The central-valley assemblages were collected and classified by Williams, and the lower-valley assemblages in the Phillips-Ford-Griffin tradition, the separate analytical histories discussed in the text." title="" id="48" name="Picture"/>
+            <wp:docPr descr="Figure 9. Regional setting of the two-scale comparison. Decorated-ceramic assemblages of the central Mississippi Valley: the southeast-Missouri survey of Williams (CMV, blue) and the lower-valley St. Francis basin Parkin-phase assemblages (LMV, orange), with the gap between the two clusters of assemblages and Parkin starred. Labels mark the named physiographic phase regions (Cairo Lowland, Sikeston Ridge, Malden Plain, and Little River in the central valley, with the St. Francis basin in the lower valley). Hydrography combines the Lower Mississippi Survey layer with Natural Earth, state boundaries, and the North America locator inset, which are from Natural Earth. The central-valley assemblages were collected and classified by Williams, and the lower-valley assemblages in the Phillips-Ford-Griffin tradition, the separate analytical histories discussed in the text." title="" id="48" name="Picture"/>
             <a:graphic>
               <a:graphicData uri="http://schemas.openxmlformats.org/drawingml/2006/picture">
                 <pic:pic>
@@ -2755,7 +2731,7 @@
         <w:t xml:space="preserve"> </w:t>
       </w:r>
       <w:r>
-        <w:t xml:space="preserve">Regional setting of the two-scale comparison. Decorated-ceramic assemblages of the central Mississippi Valley: the southeast-Missouri survey of Williams (CMV, blue) and the lower-valley St. Francis basin Parkin-phase assemblages (LMV, orange), with the gap between the two clusters of collections and Parkin starred. Labels mark the named physiographic phase regions (Cairo Lowland, Sikeston Ridge, Malden Plain, and Little River in the central valley, with the St. Francis basin in the lower valley). Hydrography combines the Lower Mississippi Survey layer with Natural Earth, state boundaries, and the North America locator inset, which are from Natural Earth. The central-valley assemblages were collected and classified by Williams, and the lower-valley assemblages in the Phillips-Ford-Griffin tradition, the separate analytical histories discussed in the text.</w:t>
+        <w:t xml:space="preserve">Regional setting of the two-scale comparison. Decorated-ceramic assemblages of the central Mississippi Valley: the southeast-Missouri survey of Williams (CMV, blue) and the lower-valley St. Francis basin Parkin-phase assemblages (LMV, orange), with the gap between the two clusters of assemblages and Parkin starred. Labels mark the named physiographic phase regions (Cairo Lowland, Sikeston Ridge, Malden Plain, and Little River in the central valley, with the St. Francis basin in the lower valley). Hydrography combines the Lower Mississippi Survey layer with Natural Earth, state boundaries, and the North America locator inset, which are from Natural Earth. The central-valley assemblages were collected and classified by Williams, and the lower-valley assemblages in the Phillips-Ford-Griffin tradition, the separate analytical histories discussed in the text.</w:t>
       </w:r>
     </w:p>
     <w:p>
@@ -2767,7 +2743,7 @@
           <wp:inline>
             <wp:extent cx="4754880" cy="3753325"/>
             <wp:effectExtent b="0" l="0" r="0" t="0"/>
-            <wp:docPr descr="Figure 10. Within-region interaction structure: neither region forms bounded groups. Top: multidimensional scaling of decorated Brainerd-Robinson dissimilarity for the LMV St. Francis basin and for the CMV southeast-Missouri assemblages (Mississippian types only, so the comparison is not driven by the Woodland-to-Mississippian gradient), points colored by within-region spatial cluster, and the assemblages intermix rather than separating into clusters. Bottom: the observed between-cluster cultural F_ST for each region (diamond) against the 95% nulls of a neutral spatial-drift model (blue) and a bounded-groups model (orange) run on the real coordinates and subsampled to the observed counts. In both regions, the observed F_ST sits at the drift level and far below the bounded-groups expectation, so the within-region structure is drift-consistent at both scales." title="" id="51" name="Picture"/>
+            <wp:docPr descr="Figure 10. Within-region interaction structure: neither region forms bounded groups. Top: multidimensional scaling of decorated Brainerd-Robinson dissimilarity for the LMV St. Francis basin and for the CMV southeast-Missouri assemblages (Mississippian classes only, so the comparison is not driven by the Woodland-to-Mississippian gradient), points colored by within-region spatial cluster, and the assemblages intermix rather than separating into clusters. Bottom: the observed between-cluster cultural F_ST for each region (diamond) against the 95% nulls of a neutral spatial-drift model (blue) and a bounded-groups model (orange) run on the real coordinates and subsampled to the observed counts. In both regions, the observed F_ST sits at the drift level and far below the bounded-groups expectation, so the within-region structure is drift-consistent at both scales." title="" id="51" name="Picture"/>
             <a:graphic>
               <a:graphicData uri="http://schemas.openxmlformats.org/drawingml/2006/picture">
                 <pic:pic>
@@ -2820,7 +2796,7 @@
         <w:t xml:space="preserve"> </w:t>
       </w:r>
       <w:r>
-        <w:t xml:space="preserve">Within-region interaction structure: neither region forms bounded groups. Top: multidimensional scaling of decorated Brainerd-Robinson dissimilarity for the LMV St. Francis basin and for the CMV southeast-Missouri assemblages (Mississippian types only, so the comparison is not driven by the Woodland-to-Mississippian gradient), points colored by within-region spatial cluster, and the assemblages intermix rather than separating into clusters. Bottom: the observed between-cluster cultural F_ST for each region (diamond) against the 95% nulls of a neutral spatial-drift model (blue) and a bounded-groups model (orange) run on the real coordinates and subsampled to the observed counts. In both regions, the observed F_ST sits at the drift level and far below the bounded-groups expectation, so the within-region structure is drift-consistent at both scales.</w:t>
+        <w:t xml:space="preserve">Within-region interaction structure: neither region forms bounded groups. Top: multidimensional scaling of decorated Brainerd-Robinson dissimilarity for the LMV St. Francis basin and for the CMV southeast-Missouri assemblages (Mississippian classes only, so the comparison is not driven by the Woodland-to-Mississippian gradient), points colored by within-region spatial cluster, and the assemblages intermix rather than separating into clusters. Bottom: the observed between-cluster cultural F_ST for each region (diamond) against the 95% nulls of a neutral spatial-drift model (blue) and a bounded-groups model (orange) run on the real coordinates and subsampled to the observed counts. In both regions, the observed F_ST sits at the drift level and far below the bounded-groups expectation, so the within-region structure is drift-consistent at both scales.</w:t>
       </w:r>
     </w:p>
     <w:p>
@@ -2900,7 +2876,7 @@
         <w:pStyle w:val="FirstParagraph"/>
       </w:pPr>
       <w:r>
-        <w:t xml:space="preserve">The phase is the unit on which central-valley culture history is built, and it carries a silent claim that assemblages grouped by seriation and spatial proximity record a bounded society. For the Parkin phase, that claim does not survive measurement. Parkin is the basin’s largest and tallest-mounded center. No line of evidence, settlement, exchange, or ceramic transmission marks it as the apex of a polity, and the greater similarity among nearby assemblages that defines the phase is reproduced by neutral drift on the basin’s geography, the ordinary residue of continuous interaction structured by where sites sit. A bounded interaction group would have a sharper structure than the measurements indicate, and Parkin sits across orderings as a transmission bridge rather than at the closed core of one. Extending the test to the wider valley, a decorated-ceramic boundary that exceeds drift appears only between the central-valley and lower-valley blocks, and even there, it is entangled with the early-to-late turnover of the type repertoire. It cannot yet be read as a synchronic social division. The phase, at the scale where it is drawn, is largely indistinguishable from spatially structured drift, which carries a consequence the discipline should weigh: a similarity cluster is not by itself a society, and before a phase is read as a social group, the record must be shown able to tell a real interaction boundary from drift on geography. That calibration, not the phase, provides the basis for an explanation of social structure. When applied to the late pre-contact ceramics of the Mississippi Valley, it yields a landscape of continuous interaction with prominent nodes rather than a mosaic of bounded polities.</w:t>
+        <w:t xml:space="preserve">The phase is the unit on which central-valley culture history is built, and it carries a silent claim that assemblages grouped by seriation and spatial proximity record a bounded society. For the Parkin phase, that claim does not survive measurement. Parkin is the basin’s largest and tallest-mounded center. No line of evidence, settlement, exchange, or ceramic transmission marks it as the apex of a polity, and the greater similarity among nearby assemblages that defines the phase is reproduced by neutral drift on the basin’s geography, the ordinary residue of continuous interaction structured by where sites sit. A bounded interaction group would have a sharper structure than the measurements indicate, and Parkin sits across orderings as a transmission bridge rather than at the closed core of one. Extending the test to the wider valley, a decorated-ceramic boundary that exceeds drift appears only between the central-valley and lower-valley blocks, and even there, it is entangled with the early-to-late turnover of the class repertoire. It cannot yet be read as a synchronic social division. The phase, at the scale where it is drawn, is largely indistinguishable from spatially structured drift, which carries a consequence the discipline should weigh: a similarity cluster is not by itself a society, and before a phase is read as a social group, the record must be shown able to tell a real interaction boundary from drift on geography. That calibration, not the phase, provides the basis for an explanation of social structure. When applied to the late pre-contact ceramics of the Mississippi Valley, it shows continuous interaction with prominent nodes rather than a mosaic of bounded polities.</w:t>
       </w:r>
     </w:p>
     <w:bookmarkEnd w:id="54"/>
@@ -2918,7 +2894,7 @@
         <w:pStyle w:val="FirstParagraph"/>
       </w:pPr>
       <w:r>
-        <w:t xml:space="preserve">All data and code needed to reproduce the analyses and figures reported here are openly available at https://github.com/clipo/phases. The repository includes the decorated-ceramic type counts, the georeferencing and radiocarbon data, the complete analysis procedure, and instructions for reproducing all results and figures. The code is released under the MIT License, and the data under a Creative Commons Attribution 4.0 International license.</w:t>
+        <w:t xml:space="preserve">All data and code needed to reproduce the analyses and figures reported here are openly available at https://github.com/clipo/phases. The repository includes the decorated-ceramic class counts, the georeferencing and radiocarbon data, the complete analysis procedure, and instructions for reproducing all results and figures. The code is released under the MIT License, and the data under a Creative Commons Attribution 4.0 International license.</w:t>
       </w:r>
     </w:p>
     <w:bookmarkEnd w:id="55"/>

</xml_diff>

<commit_message>
Add Parkin pull-out and canonical phase map; grayscale Figures 1, 8, S8
Analyses:
- New 35_basin_pullout.py: LMV-wide Parkin-vs-other-phases drift test (55
  Mainfort-PFG assemblages) with co-membership, AUC, observed-vs-drift F_ST,
  and a matched-null leave-one-out jackknife (Figure S8).
- New 36_canonical_phase_map.py: the canonical phase-territory map, now
  Figure 1. Non-overlapping Voronoi territories dissolved by Mainfort 1996
  phase, very light fills over visible hydrology, one marker shape per phase,
  AR/TN/MS boundaries, North America inset.
- 33_time_aware_emergence.py: Figure 8 redrawn in grayscale; Panel B reports
  the drift 95% interval with exceedance rather than +/-1 std.
- make_map.py: basin_basemap gains geology and grayscale toggles;
  _add_na_inset gains a position rectangle and grayscale palette.

Also commits accumulated analysis figures and the synced manuscript outputs.
</commit_message>
<xml_diff>
--- a/docs/manuscript/MAIN_TEXT.docx
+++ b/docs/manuscript/MAIN_TEXT.docx
@@ -2,7 +2,7 @@
 <file path=word/document.xml><?xml version="1.0" encoding="utf-8"?>
 <w:document xmlns:w="http://schemas.openxmlformats.org/wordprocessingml/2006/main" xmlns:m="http://schemas.openxmlformats.org/officeDocument/2006/math" xmlns:r="http://schemas.openxmlformats.org/officeDocument/2006/relationships" xmlns:o="urn:schemas-microsoft-com:office:office" xmlns:v="urn:schemas-microsoft-com:vml" xmlns:w10="urn:schemas-microsoft-com:office:word" xmlns:a="http://schemas.openxmlformats.org/drawingml/2006/main" xmlns:pic="http://schemas.openxmlformats.org/drawingml/2006/picture" xmlns:wp="http://schemas.openxmlformats.org/drawingml/2006/wordprocessingDrawing">
   <w:body>
-    <w:bookmarkStart w:id="234" w:name="X093902eb68652ea32f5548e74607f4e4b0f6699"/>
+    <w:bookmarkStart w:id="235" w:name="X093902eb68652ea32f5548e74607f4e4b0f6699"/>
     <w:p>
       <w:pPr>
         <w:pStyle w:val="Heading1"/>
@@ -37,7 +37,7 @@
         <w:pStyle w:val="FirstParagraph"/>
       </w:pPr>
       <w:r>
-        <w:t xml:space="preserve">The phase, Mississippian archaeology’s foundational unit, rests on a silent premise: that assemblages more similar to nearby than to distant neighbors record a bounded society. This is rarely tested, yet neutral transmission produces the same clustering with no bounded groups: drift concentrates similar styles nearby. For the late pre-contact central Mississippi Valley, we test whether decorated-ceramic similarity records bounded interaction groups or spatially structured drift. We compare drift and bounded-groups processes on the region’s geographic data, calibrated to the record’s small samples and time-averaging using a signal-recovery experiment. In both the St. Francis basin Parkin phase and the southeast-Missouri assemblages, drift reproduces the structure without bounded groups, and Parkin is a transmission bridge, not a capital. A sharper boundary appears only between the central and lower valleys, confounded with chronological turnover and analytical history. Before similarity is read as social, a record must be shown to be able to distinguish groups from drift.</w:t>
+        <w:t xml:space="preserve">The phase, Mississippian archaeology’s foundational unit, rests on a silent premise: that assemblages more similar to nearby than to distant neighbors record a bounded society. This is rarely tested, yet neutral transmission produces the same clustering with no bounded groups: drift concentrates similar styles nearby. For the late pre-contact central Mississippi Valley, we test whether decorated ceramic similarity records reflect bounded interaction groups or spatially structured drift. We compare drift and bounded-groups processes on the region’s geographic data, calibrated to the record’s small samples and time-averaging using a signal-recovery experiment. In both the St. Francis basin and the southeast-Missouri assemblages, drift reproduces the structure without bounded groups, and Parkin is a transmission bridge, not a capital. A sharper boundary appears only between the central and lower valleys, confounded with chronological turnover and analytical history. Before similarity is read as social, a record must be shown to be able to distinguish groups from drift.</w:t>
       </w:r>
     </w:p>
     <w:p>
@@ -312,7 +312,7 @@
         <w:t xml:space="preserve">(Cobb and Butler 2002)</w:t>
       </w:r>
       <w:r>
-        <w:t xml:space="preserve">. We focus first on the Parkin phase of the St. Francis basin (Figure 1) and then widen the test to the other late-period phases of the valley.</w:t>
+        <w:t xml:space="preserve">. We focus first on the St. Francis basin, the setting of Parkin (Figure 1), and then widen the test to the other late-period phases of the valley.</w:t>
       </w:r>
     </w:p>
     <w:p>
@@ -375,14 +375,14 @@
       <w:r>
         <w:drawing>
           <wp:inline>
-            <wp:extent cx="5334000" cy="7630817"/>
+            <wp:extent cx="4114800" cy="6930397"/>
             <wp:effectExtent b="0" l="0" r="0" t="0"/>
-            <wp:docPr descr="Figure 1. Study area: the St. Francis basin of the central Mississippi Valley, northeastern Arkansas. Decorated-ceramic assemblages and recorded sites are shown on a local hydrology and geomorphology base (the St. Francis, Tyronza, and Mississippi rivers). Symbol size scales with platform-mound height. The Parkin site is marked with a star, and the dashed outline indicates the approximate Parkin-phase area. The transmission analysis is restricted to assemblages within 20 km of the St. Francis drainage (the lower Yazoo Basin and Mississippi River-proximal sites are excluded). Inset: location within North America." title="" id="12" name="Picture"/>
+            <wp:docPr descr="Figure 1. Decorated-ceramic assemblages of the central Mississippi Valley and the culture-historical phase scheme this paper tests. The seven Late Mississippian phases (Parkin, Nodena, Jones Bayou, Tipton, Kent, Walls, and Parchman) are shown as non-overlapping territories, a Voronoi partition of the assemblages Mainfort (1996b) assigns to each phase, over a local hydrology base (the St. Francis, Tyronza, and Mississippi rivers) with state and county boundaries. Each assemblage is plotted with a marker shape for its phase, and Parkin is starred. The 29 assemblages of the St. Francis basin transmission set, those within 20 km of the St. Francis, Tyronza, and L’Anguille drainage, are ringed in black. The hydrological basin is a geographic unit that crosses the Parkin, Nodena, Kent, Walls, and Parchman phases. The bounded territories illustrate the premise the paper tests, that such areas record distinct, internally interacting societies. The transmission analysis finds instead that drift structured by geography explains the impression of groupness. The mapped assemblages fall in Arkansas, Tennessee, and Mississippi; Missouri lies just north of the frame. Inset: location in North America." title="" id="12" name="Picture"/>
             <a:graphic>
               <a:graphicData uri="http://schemas.openxmlformats.org/drawingml/2006/picture">
                 <pic:pic>
                   <pic:nvPicPr>
-                    <pic:cNvPr descr="../../figures/fig1_studyarea.png" id="13" name="Picture"/>
+                    <pic:cNvPr descr="../../figures/fig1_phases.png" id="13" name="Picture"/>
                     <pic:cNvPicPr>
                       <a:picLocks noChangeArrowheads="1" noChangeAspect="1"/>
                     </pic:cNvPicPr>
@@ -396,7 +396,7 @@
                   <pic:spPr bwMode="auto">
                     <a:xfrm>
                       <a:off x="0" y="0"/>
-                      <a:ext cx="5334000" cy="7630817"/>
+                      <a:ext cx="4114800" cy="6930397"/>
                     </a:xfrm>
                     <a:prstGeom prst="rect">
                       <a:avLst/>
@@ -430,7 +430,19 @@
         <w:t xml:space="preserve"> </w:t>
       </w:r>
       <w:r>
-        <w:t xml:space="preserve">Study area: the St. Francis basin of the central Mississippi Valley, northeastern Arkansas. Decorated-ceramic assemblages and recorded sites are shown on a local hydrology and geomorphology base (the St. Francis, Tyronza, and Mississippi rivers). Symbol size scales with platform-mound height. The Parkin site is marked with a star, and the dashed outline indicates the approximate Parkin-phase area. The transmission analysis is restricted to assemblages within 20 km of the St. Francis drainage (the lower Yazoo Basin and Mississippi River-proximal sites are excluded). Inset: location within North America.</w:t>
+        <w:t xml:space="preserve">Decorated-ceramic assemblages of the central Mississippi Valley and the culture-historical phase scheme this paper tests. The seven Late Mississippian phases (Parkin, Nodena, Jones Bayou, Tipton, Kent, Walls, and Parchman) are shown as non-overlapping territories, a Voronoi partition of the assemblages Mainfort</w:t>
+      </w:r>
+      <w:r>
+        <w:t xml:space="preserve"> </w:t>
+      </w:r>
+      <w:r>
+        <w:t xml:space="preserve">(1996b)</w:t>
+      </w:r>
+      <w:r>
+        <w:t xml:space="preserve"> </w:t>
+      </w:r>
+      <w:r>
+        <w:t xml:space="preserve">assigns to each phase, over a local hydrology base (the St. Francis, Tyronza, and Mississippi rivers) with state and county boundaries. Each assemblage is plotted with a marker shape for its phase, and Parkin is starred. The 29 assemblages of the St. Francis basin transmission set, those within 20 km of the St. Francis, Tyronza, and L’Anguille drainage, are ringed in black. The hydrological basin is a geographic unit that crosses the Parkin, Nodena, Kent, Walls, and Parchman phases. The bounded territories illustrate the premise the paper tests, that such areas record distinct, internally interacting societies. The transmission analysis finds instead that drift structured by geography explains the impression of groupness. The mapped assemblages fall in Arkansas, Tennessee, and Mississippi; Missouri lies just north of the frame. Inset: location in North America.</w:t>
       </w:r>
     </w:p>
     <w:p>
@@ -490,7 +502,7 @@
         <w:pStyle w:val="BodyText"/>
       </w:pPr>
       <w:r>
-        <w:t xml:space="preserve">The phase concept gives the central-valley record its social structure. A phase is formed operationally as a set of assemblages that seriate together and cluster in space. It is interpreted, however, as a social entity equivalent to a bounded, interacting community, on the premise that assemblages more alike within a phase than across its edges record who interacted with whom</w:t>
+        <w:t xml:space="preserve">The phase concept gives the central-valley record its social structure. A phase is formed operationally as a set of assemblages that seriate together and cluster in space. It is interpreted, however, as a social entity equivalent to a bounded, interacting community, on the premise that assemblages are more alike within a phase than across its edges, thereby recording who interacted with whom</w:t>
       </w:r>
       <w:r>
         <w:t xml:space="preserve"> </w:t>
@@ -726,7 +738,7 @@
         <w:pStyle w:val="BodyText"/>
       </w:pPr>
       <w:r>
-        <w:t xml:space="preserve">The first asks whether potters copied decorated styles at random or with a bias. Under unbiased copying, where a potter is as likely to reproduce any design she encounters as any other, two independent ways of gauging a assemblage’s diversity agree. One is based on homozygosity, a measure borrowed from genetics. This property reflects the probability that two sherds drawn at random from an assemblage share the same decorated class, which is high when a few classes dominate. The other is based on richness, the number of classes in which sherds are identified. Each yields an estimate of the same underlying transmission parameter, and under random copying, the two estimates coincide. Conformity, in which potters disproportionately copy whatever is already common, is a process that will concentrate frequency to a few ceramic classes. It raises homozygosity, lowering the homozygosity-based estimate while leaving richness little changed, pulling the two apart. A taste for novelty does the reverse. The disagreement between the two estimates, expressed as their ratio, therefore both detect a departure from random copying and show which way it leans</w:t>
+        <w:t xml:space="preserve">The first asks whether potters copied decorated styles at random or with a bias. Under unbiased copying, where a potter is as likely to reproduce any design she encounters as any other, two independent ways of gauging an assemblage’s diversity agree. One is based on homozygosity, a measure borrowed from genetics. This property reflects the probability that two sherds drawn at random from an assemblage share the same decorated class, which is high when a few classes dominate. The other is based on richness, the number of classes in which sherds are identified. Each yields an estimate of the same underlying transmission parameter, and under random copying, the two estimates coincide. Conformity, in which potters disproportionately copy whatever is already common, is a process that will concentrate frequency to a few ceramic classes. It raises homozygosity, lowering the homozygosity-based estimate while leaving richness little changed, pulling the two apart. A taste for novelty does the reverse. The disagreement between the two estimates, expressed as their ratio, therefore both detect a departure from random copying and show which way it leans</w:t>
       </w:r>
       <w:r>
         <w:t xml:space="preserve"> </w:t>
@@ -926,7 +938,7 @@
         <w:t xml:space="preserve"> </w:t>
       </w:r>
       <w:r>
-        <w:t xml:space="preserve">The transmission signatures each process is expected to leave a mark on, where ● marks a signature the process drives and ○ marks one it leaves flat. Only a bounded interaction group drives all four. Each alternative produces a characteristic subset, a pattern our simulation confirms on idealized data (Figure S4). This is an idealized expectation under smooth, deterministic processes, not a claim about what is detectable in a real record. Two qualifications make this an aspirational goal rather than necessarily operative. First, the generator diagnostic (Supplemental Text) shows that the non-F_ST rows are not realizable at this record’s resolution, because the neutral and seriation signatures fail to register a signal even when one is injected through its own pathway, so the detectable discrimination reduces to cultural F_ST (Figure 4). Second, under realistic stochastic spatial drift, the F_ST and spatial-assortativity rows are themselves driven in the absence of a bounded group (Results, Figure S5). The table frames the possible combinations of factors that may contribute to a signal of bounded group structure. The generative drift-versus-groups comparison provides a practical assessment.</w:t>
+        <w:t xml:space="preserve">The transmission signatures each process is expected to leave a mark on, where ● marks a signature the process drives and ○ marks one it leaves flat. Only a bounded interaction group drives all four. Each alternative produces a characteristic subset, a pattern our simulation confirms on idealized data (Figure S4). This is an idealized expectation under smooth, deterministic processes, not a claim about what is detectable in a real record. Two qualifications make this an aspirational goal rather than necessarily operative. First, the generator diagnostic (Supplemental Text) shows that the non-F_ST rows are not realizable at this record’s resolution, because the neutral and seriation signatures fail to register a signal even when one is injected through its own pathway. The detectable discrimination, therefore, reduces to cultural F_ST (Figure 4). Second, under realistic stochastic spatial drift, the F_ST and spatial-assortativity rows are themselves driven in the absence of a bounded group (Results, Figure S5). The table frames the possible combinations of factors that may contribute to a signal of bounded group structure. The generative drift-versus-groups comparison provides a practical assessment.</w:t>
       </w:r>
     </w:p>
     <w:tbl>
@@ -1521,7 +1533,16 @@
         <w:t xml:space="preserve">(Lipo 2001)</w:t>
       </w:r>
       <w:r>
-        <w:t xml:space="preserve">. Each decorated class is a unit of measurement the analyst defines to capture stylistic variation, not a native category assumed in advance. Because the hypothesis concerns the Parkin phase, we restrict the analysis to the St. Francis basin of northeastern Arkansas, defined hydrologically as the assemblages within 20 km of the St. Francis, Tyronza, and L’Anguille drainage (Figure 1). This excludes both the lower Yazoo Basin and the Mississippi River-proximal sites whose late-period centers belong to distinct phases, and it yields 29 decorated assemblages for the transmission analysis and 92 sites for the settlement comparison. A stricter watershed rule, keeping only assemblages nearer the St. Francis system than the Mississippi, gives 19. The verdict reported below is unchanged across both definitions. The two southern St. Francis-type sites the drainage rule excludes, Old Town and Blanchard, lie 28 and 80 km from the St. Francis system and belong to the Mississippi-proximal and lower Yazoo settings rather than to the St. Francis drainage. We georeferenced each assemblage through the Lower Mississippi Survey site files. We used settlement attributes, site size, mound count and height, and the presence of defensive ditches and St-Francis-type fortification, from a regional geographic database</w:t>
+        <w:t xml:space="preserve">. Each decorated class is a unit of measurement that the analyst defines to capture stylistic variation, not a native category assumed in advance. We restrict the analysis to the St. Francis basin of northeastern Arkansas, the setting of Parkin, defined hydrologically as the assemblages within 20 km of the St. Francis, Tyronza, and L’Anguille drainage (Figure 1). This yields 29 decorated assemblages for the transmission analysis and 92 sites for the settlement comparison. The basin is a geographic unit, not a single culture-historical phase: under the standard regional scheme its assemblages fall into the Parkin phase together with sites assigned to the Nodena, Kent, Walls, and Parchman phases</w:t>
+      </w:r>
+      <w:r>
+        <w:t xml:space="preserve"> </w:t>
+      </w:r>
+      <w:r>
+        <w:t xml:space="preserve">(Mainfort 2003; Phillips 1970)</w:t>
+      </w:r>
+      <w:r>
+        <w:t xml:space="preserve">. The test therefore asks whether interaction closed into bounded groups anywhere in the basin, across the phase divisions that culture history draws within it as well as within the Parkin phase. The set excludes the lower Yazoo Basin to the south. A stricter watershed rule, keeping only assemblages nearer the St. Francis system than the Mississippi, gives 19. The verdict reported below is unchanged across both definitions. The two southern St. Francis-type sites the drainage rule excludes, Old Town and Blanchard, lie 28 and 80 km from the St. Francis system and belong to the Mississippi-proximal and lower Yazoo settings rather than to the St. Francis drainage. We georeferenced each assemblage through the Lower Mississippi Survey site files. We used settlement attributes, site size, mound count and height, and the presence of defensive ditches and St-Francis-type fortification, from a regional geographic database</w:t>
       </w:r>
       <w:r>
         <w:t xml:space="preserve"> </w:t>
@@ -1574,7 +1595,7 @@
         <w:t xml:space="preserve"> </w:t>
       </w:r>
       <w:r>
-        <w:t xml:space="preserve">(House 1993; Mainfort 1996; Sullivan et al. 2024)</w:t>
+        <w:t xml:space="preserve">(House 1993; Mainfort 1996a; Sullivan et al. 2024)</w:t>
       </w:r>
       <w:r>
         <w:t xml:space="preserve">. Calibrated against IntCal20</w:t>
@@ -2037,7 +2058,7 @@
         <w:pStyle w:val="BodyText"/>
       </w:pPr>
       <w:r>
-        <w:t xml:space="preserve">Applied to the Parkin phase, that one reliable signature shows no closure into bounded groups, and the apparent signals in the others are confounded by sample size (Figure 5). The raw trajectory along the seriation axis seems to dissociate, but two of its trends are sampling artifacts: because assemblage size trends with seriation position, the size-sensitive estimators move with it. Two of the apparent trends are artifacts of sample size. Once every assemblage is trimmed to a common sherd count by subsampling, cultural F_ST falls from a raw +0.60 to +0.01, and its uncertainty range runs from no closure to a moderate signal, so it is uninformative rather than a resolved positive. The neutrality departure is likewise size-sensitive (its raw -0.94 only weakens to -0.83 under size control), and the recovery shows that it does not track closure in either direction here, so it, too, cannot be read as a transmission signal. On the recovery curve, the size-controlled empirical F_ST corresponds to a nominal injected strength of about 0.35, below the resolution limit. The record, therefore, shows no detectable closure of moderate or greater strength. The negative is informative for a closure of moderate or greater strength, which would have registered and is absent. It cannot exclude a weaker closure that, given a record of this size and time-averaging, is underpowered to resolve. The positive control reported next shows that the structure actually present is what neutral drift produces, so the result is not only that no bounded group is detectable, but also that the structure present is what continuous, spatially structured interaction would produce.</w:t>
+        <w:t xml:space="preserve">Applied to the St. Francis basin, that one reliable signature shows no closure into bounded groups, and the apparent signals in the others are confounded by sample size (Figure 5). The raw trajectory along the seriation axis seems to dissociate, but two of its trends are sampling artifacts: because assemblage size trends with seriation position, the size-sensitive estimators move with it. Two of the apparent trends are artifacts of sample size. Once every assemblage is trimmed to a common sherd count by subsampling, cultural F_ST falls from a raw +0.60 to +0.01, and its uncertainty range runs from no closure to a moderate signal, so it is uninformative rather than a resolved positive. The neutrality departure is likewise size-sensitive (its raw -0.94 only weakens to -0.83 under size control), and the recovery shows that it does not track closure in either direction here, so it, too, cannot be read as a transmission signal. On the recovery curve, the size-controlled empirical F_ST corresponds to a nominal injected strength of about 0.35, below the resolution limit. The record, therefore, shows no detectable closure of moderate or greater strength. The negative is informative for a closure of moderate or greater strength, which would have registered and is absent. It cannot exclude a weaker closure that, given a record of this size and time-averaging, is underpowered to resolve. The positive control reported next shows that the structure actually present is what neutral drift produces, so the result is not only that no bounded group is detectable, but also that the structure present is what continuous, spatially structured interaction would produce.</w:t>
       </w:r>
     </w:p>
     <w:p>
@@ -2315,7 +2336,7 @@
           <wp:inline>
             <wp:extent cx="5334000" cy="3328756"/>
             <wp:effectExtent b="0" l="0" r="0" t="0"/>
-            <wp:docPr descr="Figure 7. Settlement cross-check. Main panel: within-basin ranking of maximum mound height, the recorded, like-for-like field (Parkin’s mound area is under-coded as zero and is not used). Parkin has the tallest mound (23 ft, rank 1 of 55), but the height distribution is graded, with no gap separating it from the next centers (tallest-to-second ratio 1.0), a prominent center rather than a redistributive apex. Inset: the proportion of sites with a mound, a defensive ditch, and St-Francis-type fortification across the basin set (n = 92)." title="" id="41" name="Picture"/>
+            <wp:docPr descr="Figure 7. Settlement cross-check. Main panel: within-basin ranking of maximum mound height, the recorded, like-for-like field (Parkin’s mound area is under-coded as zero and is not used). Parkin has the tallest mound (23 ft, rank 1 of 55). The height distribution for the mounds is graded, with no gap separating it from the next centers (tallest-to-second ratio 1.0), indicating that Parkin is a prominent center rather than a redistributive apex. Inset: the proportion of sites with a mound, a defensive ditch, and St-Francis-type fortification across the basin set (n = 92)." title="" id="41" name="Picture"/>
             <a:graphic>
               <a:graphicData uri="http://schemas.openxmlformats.org/drawingml/2006/picture">
                 <pic:pic>
@@ -2368,7 +2389,7 @@
         <w:t xml:space="preserve"> </w:t>
       </w:r>
       <w:r>
-        <w:t xml:space="preserve">Settlement cross-check. Main panel: within-basin ranking of maximum mound height, the recorded, like-for-like field (Parkin’s mound area is under-coded as zero and is not used). Parkin has the tallest mound (23 ft, rank 1 of 55), but the height distribution is graded, with no gap separating it from the next centers (tallest-to-second ratio 1.0), a prominent center rather than a redistributive apex. Inset: the proportion of sites with a mound, a defensive ditch, and St-Francis-type fortification across the basin set (n = 92).</w:t>
+        <w:t xml:space="preserve">Settlement cross-check. Main panel: within-basin ranking of maximum mound height, the recorded, like-for-like field (Parkin’s mound area is under-coded as zero and is not used). Parkin has the tallest mound (23 ft, rank 1 of 55). The height distribution for the mounds is graded, with no gap separating it from the next centers (tallest-to-second ratio 1.0), indicating that Parkin is a prominent center rather than a redistributive apex. Inset: the proportion of sites with a mound, a defensive ditch, and St-Francis-type fortification across the basin set (n = 92).</w:t>
       </w:r>
     </w:p>
     <w:p>
@@ -2468,7 +2489,7 @@
         <w:pStyle w:val="BodyText"/>
       </w:pPr>
       <w:r>
-        <w:t xml:space="preserve">That characterization can be made constructive rather than merely consistent with the data. Run the finite-population network-drift model forward on the real configuration of the 29 basin assemblages, with copying that decays with along-waterway distance and no boundary imposed, and the structure the phase concept reads as a society reappears on its own</w:t>
+        <w:t xml:space="preserve">That characterization can be made constructive rather than merely consistent with the data. Run the finite-population network-drift model forward on the real configuration of the 29 basin assemblages, with copying that decays with along-waterway distance and no boundary imposed, and the structure of the phase concept reads as a society reappears on its own</w:t>
       </w:r>
       <w:r>
         <w:t xml:space="preserve"> </w:t>
@@ -2477,7 +2498,7 @@
         <w:t xml:space="preserve">(Lipo et al. 2021)</w:t>
       </w:r>
       <w:r>
-        <w:t xml:space="preserve">. The deposits are not contemporaneous, which is why they can be seriated at all and why some carry more of the late classes than others, so each synthetic assemblage is drawn time-transgressively at the run-time that matches its seriation position and accumulated over a window rather than read from a single instant. Repeated across 500 realizations, the model yields not one partition but a distribution of them, so membership in Parkin’s group is a probability rather than a fact (Figure 8). Holding time fixed to isolate the spatial signal, that probability falls off smoothly with river distance from Parkin (Figure 8A): nearby assemblages usually share its emergent community and distant ones usually do not, ranging from about 0.70 to 0.17 with no assemblage a certain member or non-member, a graded field rather than the bounded set a phase map implies. Restoring the staggered deposition ages removes even that gradient, because assemblages caught at different points in the sequence carry different repertoires and fall into different, time-defined communities, so a site’s nearest neighbors need not share its phase. The between-group cultural F_ST of the emergent groups settles at the observed level either way, near 0.02 to 0.03 against an observed 0.04, well below the value a bounded group would leave (Figure 8B), and the synthetic record re-seriates (Figure S7). Geography and time are the whole engine, and the apparent groups are two readings of one neutral process. That spatial and population structure, not population size, governs how drift partitions diversity in finite structured populations is established in both the cultural-transmission and population-genetics literatures</w:t>
+        <w:t xml:space="preserve">. The deposits are not contemporaneous, which is why they can be seriated at all and why some carry more of the late classes than others, so each synthetic assemblage is drawn time-transgressively at the run-time that matches its seriation position and accumulated over a window rather than read from a single instant. When repeated across 500 realizations, the model yields not a single partition but a distribution of them, so membership in Parkin’s group is a probability rather than a fact (Figure 8). Holding time fixed to isolate the spatial signal, that probability falls off smoothly with river distance from Parkin (Figure 8A): nearby assemblages usually share their emergent community and distant ones usually do not, ranging from about 0.70 to 0.17 with no assemblage a certain member or non-member, a graded field rather than the bounded set a phase map implies. Restoring the staggered deposition ages removes even that gradient, because assemblages caught at different points in the sequence carry different repertoires and fall into different, time-defined communities. A site’s nearest neighbors need not share its phase. The between-group cultural F_ST of the emergent groups settles at the observed level either way, near 0.02 to 0.03 against an observed 0.04, well below the value a bounded group would leave (Figure 8B), and the synthetic record re-seriates (Figure S7). Geography and time are the whole engine, and the apparent groups are two readings of one neutral process. That spatial and population structure, not population size, governs how drift partitions diversity in finite structured populations is established in both the cultural-transmission and population-genetics literatures</w:t>
       </w:r>
       <w:r>
         <w:t xml:space="preserve"> </w:t>
@@ -2504,7 +2525,7 @@
         <w:t xml:space="preserve">(Derex et al. 2018; Derex and Boyd 2016; Saxer et al. 2009)</w:t>
       </w:r>
       <w:r>
-        <w:t xml:space="preserve">. This is not contingent on a tuned parameter set. Across 432 runs spanning a grid of interaction length, between-node mixing, and innovation rate, two or more spatially coherent communities emerge in every run and the between-group F_ST sits at or below the observed value in 85 percent, falling with more mixing or innovation but never approaching the bounded-groups level (Figure S7). The demonstration is illustrative rather than fitted, and the seriation recovery is moderate, but phase-like structure at the observed magnitude is a generic outcome of distance-structured drift on this geography.</w:t>
+        <w:t xml:space="preserve">. This is not contingent on a tuned parameter set. Across 432 runs spanning a grid of interaction length, between-node mixing, and innovation rate, two or more spatially coherent communities emerge in every run, and the between-group F_ST sits at or below the observed value in 85 percent, falling with more mixing or innovation but never approaching the bounded-groups level (Figure S7). The demonstration is illustrative rather than fitted, and the seriation recovery is moderate. The phase-like structure at the observed magnitude is a generic outcome of distance-structured drift on this geography.</w:t>
       </w:r>
     </w:p>
     <w:p>
@@ -2516,7 +2537,7 @@
           <wp:inline>
             <wp:extent cx="5334000" cy="4248345"/>
             <wp:effectExtent b="0" l="0" r="0" t="0"/>
-            <wp:docPr descr="Figure 8. Phase-like structure generated by neutral drift on the real basin geography, with no bounded group imposed, summarized over 500 realizations. A neutral finite-population drift model runs forward on the actual coordinates of the 29 St. Francis basin assemblages, with copying that decays with along-waterway (river-network) distance and new decorated classes arising through time (Supplemental Text). (A) Each assemblage on the river basemap, shaded by the probability that it falls in the same emergent community as Parkin (star) across the 500 runs, for the contemporaneous snapshot that isolates the spatial signal. The probability falls off smoothly with river distance from Parkin (Spearman rho = -0.72), from about 0.70 nearby to 0.17 far away, with no assemblage a certain member or non-member, so Parkin’s “phase” is a graded, probabilistic field rather than a bounded set. Under the full time-transgressive sampling the gradient disappears because membership then reflects time as well as space (Supplemental Text). (B) Between-group cultural F_ST for the observed data (black, 0.04) against contemporaneous and time-transgressive drift (means with standard deviation across the 500 runs, near 0.02 to 0.03). Drift reproduces the observed level rather than the higher value a bounded group would leave. Parameters are the positive-control corner (interaction length 24 river-km, mixing 0.02, innovation 0.012). Robustness across the factor grid is in Figure S7." title="" id="45" name="Picture"/>
+            <wp:docPr descr="Figure 8. Phase-like structure generated by neutral drift on the real basin geography, with no bounded group imposed, summarized over 500 realizations. A neutral finite-population drift model runs forward on the actual coordinates of the 29 St. Francis basin assemblages, with copying that decays with distance along the waterway (river network) and new decorated classes arising over time (Supplemental Text). (A) Each assemblage on the river basemap is shaded by the probability that it falls within the same emergent community as Parkin (star) across the 500 runs, for the contemporaneous snapshot that isolates the spatial signal. The probability falls off smoothly with river distance from Parkin (Spearman rho = -0.72), from about 0.70 nearby to 0.17 far away, with no assemblage of a certain member or non-member, so Parkin’s “phase” is a graded, probabilistic field rather than a bounded set. Under full-time transgressive sampling, the gradient disappears because membership reflects both time and space (Supplemental Text). (B) Between-group cultural F_ST for the observed data (black, 0.04) against contemporaneous and time-transgressive drift (medians with 95% intervals across the 500 runs, near 0.02 to 0.03). The observed value falls within the contemporaneous-drift interval, with 7.4% of drift runs reaching or exceeding it, so drift reproduces the observed level rather than the higher value a bounded group would leave. Parameters are the positive-control corner (interaction length 24 river-km, mixing 0.02, innovation 0.012). Robustness across the factor grid is in Figure S7." title="" id="45" name="Picture"/>
             <a:graphic>
               <a:graphicData uri="http://schemas.openxmlformats.org/drawingml/2006/picture">
                 <pic:pic>
@@ -2569,7 +2590,7 @@
         <w:t xml:space="preserve"> </w:t>
       </w:r>
       <w:r>
-        <w:t xml:space="preserve">Phase-like structure generated by neutral drift on the real basin geography, with no bounded group imposed, summarized over 500 realizations. A neutral finite-population drift model runs forward on the actual coordinates of the 29 St. Francis basin assemblages, with copying that decays with along-waterway (river-network) distance and new decorated classes arising through time (Supplemental Text). (A) Each assemblage on the river basemap, shaded by the probability that it falls in the same emergent community as Parkin (star) across the 500 runs, for the contemporaneous snapshot that isolates the spatial signal. The probability falls off smoothly with river distance from Parkin (Spearman rho = -0.72), from about 0.70 nearby to 0.17 far away, with no assemblage a certain member or non-member, so Parkin’s</w:t>
+        <w:t xml:space="preserve">Phase-like structure generated by neutral drift on the real basin geography, with no bounded group imposed, summarized over 500 realizations. A neutral finite-population drift model runs forward on the actual coordinates of the 29 St. Francis basin assemblages, with copying that decays with distance along the waterway (river network) and new decorated classes arising over time (Supplemental Text). (A) Each assemblage on the river basemap is shaded by the probability that it falls within the same emergent community as Parkin (star) across the 500 runs, for the contemporaneous snapshot that isolates the spatial signal. The probability falls off smoothly with river distance from Parkin (Spearman rho = -0.72), from about 0.70 nearby to 0.17 far away, with no assemblage of a certain member or non-member, so Parkin’s</w:t>
       </w:r>
       <w:r>
         <w:t xml:space="preserve"> </w:t>
@@ -2581,7 +2602,7 @@
         <w:t xml:space="preserve"> </w:t>
       </w:r>
       <w:r>
-        <w:t xml:space="preserve">is a graded, probabilistic field rather than a bounded set. Under the full time-transgressive sampling the gradient disappears because membership then reflects time as well as space (Supplemental Text). (B) Between-group cultural F_ST for the observed data (black, 0.04) against contemporaneous and time-transgressive drift (means with standard deviation across the 500 runs, near 0.02 to 0.03). Drift reproduces the observed level rather than the higher value a bounded group would leave. Parameters are the positive-control corner (interaction length 24 river-km, mixing 0.02, innovation 0.012). Robustness across the factor grid is in Figure S7.</w:t>
+        <w:t xml:space="preserve">is a graded, probabilistic field rather than a bounded set. Under full-time transgressive sampling, the gradient disappears because membership reflects both time and space (Supplemental Text). (B) Between-group cultural F_ST for the observed data (black, 0.04) against contemporaneous and time-transgressive drift (medians with 95% intervals across the 500 runs, near 0.02 to 0.03). The observed value falls within the contemporaneous-drift interval, with 7.4% of drift runs reaching or exceeding it, so drift reproduces the observed level rather than the higher value a bounded group would leave. Parameters are the positive-control corner (interaction length 24 river-km, mixing 0.02, innovation 0.012). Robustness across the factor grid is in Figure S7.</w:t>
       </w:r>
     </w:p>
     <w:p>
@@ -2632,7 +2653,7 @@
         <w:pStyle w:val="BodyText"/>
       </w:pPr>
       <w:r>
-        <w:t xml:space="preserve">The contribution has two parts that should be kept distinct. The four signatures distinguish a bounded interaction group from drift in principle, and an idealized simulation confirms that closure drives them together while drift and the other mimics do not (Figure S4). The calibration is the part that travels to real data: it asks, before any similarity structure is read as social, which signatures a given record can support and how strong a closure each could detect, and on the Parkin record, it shows the test reducing to its single most robust component, cultural F_ST. We are explicit about what that costs: had F_ST shown a positive trend, it alone could not have separated a real group from environmental patchiness, which also drives between-group variance (Table 1), so on a positive result, the generative drift-versus-groups comparison, not F_ST alone, would have had to carry the discrimination. The negative is cleaner because the present structure is positively matched by drift and overshot by bounded groups. This result shows that social structure may be measurable from decorated-ceramic assemblages. We can also assess whether the Parkin phase was a polity by examining whether interaction had closed into a bounded group to a degree that the record can resolve. For the Parkin phase, the answer is that it had not, within the bounds supported by the record. The polity the De Soto encountered seems to reflect distinctions drawn in ceremonial practices, fortification, and settlement size, rather than one written into the structure of ceramic transmission.</w:t>
+        <w:t xml:space="preserve">The contribution has two parts that should be kept distinct. The four signatures distinguish a bounded interaction group from drift in principle, and an idealized simulation confirms that closure drives them together while drift and the other mimics do not (Figure S4). The calibration is the part that travels to real data: it asks, before any similarity structure is read as social, which signatures a given record can support and how strong a closure each could detect, and on the Parkin record, it shows the test reducing to its single most robust component, cultural F_ST. We are explicit about what that costs: had F_ST shown a positive trend, it alone could not have separated a real group from environmental patchiness, which also drives between-group variance (Table 1), so on a positive result, the generative drift-versus-groups comparison, not F_ST alone, would have had to carry the discrimination. The negative is cleaner because the present structure is positively matched by drift and overshot by bounded groups. This result shows that social structure may be measurable through decorated ceramic assemblages. We can also assess whether the Parkin phase was a polity by examining whether interaction had closed into a bounded group to a degree that the record can resolve. For the Parkin phase, the answer is that it had not, within the bounds supported by the record. The polity the De Soto encountered seems to reflect distinctions drawn in ceremonial practices, fortification, and settlement size, rather than one written into the structure of ceramic transmission.</w:t>
       </w:r>
     </w:p>
     <w:p>
@@ -2876,7 +2897,7 @@
         <w:pStyle w:val="FirstParagraph"/>
       </w:pPr>
       <w:r>
-        <w:t xml:space="preserve">The phase is the unit on which central-valley culture history is built, and it carries a silent claim that assemblages grouped by seriation and spatial proximity record a bounded society. For the Parkin phase, that claim does not survive measurement. Parkin is the basin’s largest and tallest-mounded center. No line of evidence, settlement, exchange, or ceramic transmission marks it as the apex of a polity, and the greater similarity among nearby assemblages that defines the phase is reproduced by neutral drift on the basin’s geography, the ordinary residue of continuous interaction structured by where sites sit. A bounded interaction group would have a sharper structure than the measurements indicate, and Parkin sits across orderings as a transmission bridge rather than at the closed core of one. Extending the test to the wider valley, a decorated-ceramic boundary that exceeds drift appears only between the central-valley and lower-valley blocks, and even there, it is entangled with the early-to-late turnover of the class repertoire. It cannot yet be read as a synchronic social division. The phase, at the scale where it is drawn, is largely indistinguishable from spatially structured drift, which carries a consequence the discipline should weigh: a similarity cluster is not by itself a society, and before a phase is read as a social group, the record must be shown able to tell a real interaction boundary from drift on geography. That calibration, not the phase, provides the basis for an explanation of social structure. When applied to the late pre-contact ceramics of the Mississippi Valley, it shows continuous interaction with prominent nodes rather than a mosaic of bounded polities.</w:t>
+        <w:t xml:space="preserve">The phase is the unit on which central-valley culture history is built, and it carries a silent claim that assemblages grouped by seriation and spatial proximity record a bounded society. For the Parkin phase, that claim does not survive measurement. Parkin is the basin’s largest and tallest-mounded center. No line of evidence, settlement, exchange, or ceramic transmission marks it as the apex of a polity, and the greater similarity among nearby assemblages that defines the phase is reproduced by neutral drift on the basin’s geography, the ordinary residue of continuous interaction structured by where sites sit. A bounded interaction group would have a sharper structure than the measurements indicate, and Parkin sits across orderings as a transmission bridge rather than at the closed core of one. Extending the test to the wider valley, a decorated-ceramic boundary that exceeds drift appears only between the central-valley and lower-valley blocks, and even there, it is entangled with the early-to-late turnover of the class repertoire. It cannot yet be read as a synchronic social division. Posed in the culture historian’s own terms, against the other named phases of the valley, the Parkin phase itself shows at most a weak contrast at the edge of the drift null, robust to single-site removal but small and within the null’s reach (Figure S8). The phase, at the scale where it is drawn, is largely indistinguishable from spatially structured drift, which carries a consequence the discipline should weigh: a similarity cluster is not by itself a society, and before a phase is read as a social group, the record must be shown able to tell a real interaction boundary from drift on geography. That calibration, not the phase, provides the basis for an explanation of social structure. When applied to the late pre-contact ceramics of the Mississippi Valley, it shows continuous interaction with prominent nodes rather than a mosaic of bounded polities.</w:t>
       </w:r>
     </w:p>
     <w:bookmarkEnd w:id="54"/>
@@ -2898,7 +2919,7 @@
       </w:r>
     </w:p>
     <w:bookmarkEnd w:id="55"/>
-    <w:bookmarkStart w:id="233" w:name="references"/>
+    <w:bookmarkStart w:id="234" w:name="references"/>
     <w:p>
       <w:pPr>
         <w:pStyle w:val="Heading2"/>
@@ -2907,7 +2928,7 @@
         <w:t xml:space="preserve">References</w:t>
       </w:r>
     </w:p>
-    <w:bookmarkStart w:id="232" w:name="refs"/>
+    <w:bookmarkStart w:id="233" w:name="refs"/>
     <w:bookmarkStart w:id="56" w:name="ref-anderson_1996"/>
     <w:p>
       <w:pPr>
@@ -5491,7 +5512,7 @@
         <w:pStyle w:val="Bibliography"/>
       </w:pPr>
       <w:r>
-        <w:t xml:space="preserve">Mainfort, Jr., Robert C. 1996. Late Period Chronology in the Central</w:t>
+        <w:t xml:space="preserve">Mainfort, Jr., Robert C. 1996a. Late Period Chronology in the Central</w:t>
       </w:r>
       <w:r>
         <w:t xml:space="preserve"> </w:t>
@@ -5535,7 +5556,33 @@
       </w:r>
     </w:p>
     <w:bookmarkEnd w:id="161"/>
-    <w:bookmarkStart w:id="162" w:name="ref-mainfort_2001"/>
+    <w:bookmarkStart w:id="162" w:name="ref-mainfort_1996b"/>
+    <w:p>
+      <w:pPr>
+        <w:pStyle w:val="Bibliography"/>
+      </w:pPr>
+      <w:r>
+        <w:t xml:space="preserve">Mainfort, Jr., Robert C. 1996b. Late Period Chronology in the Central Mississippi Valley: A Western Tennessee Perspective.</w:t>
+      </w:r>
+      <w:r>
+        <w:t xml:space="preserve"> </w:t>
+      </w:r>
+      <w:r>
+        <w:rPr>
+          <w:i/>
+          <w:iCs/>
+        </w:rPr>
+        <w:t xml:space="preserve">Southeastern Archaeology</w:t>
+      </w:r>
+      <w:r>
+        <w:t xml:space="preserve"> </w:t>
+      </w:r>
+      <w:r>
+        <w:t xml:space="preserve">15(2):172–181.</w:t>
+      </w:r>
+    </w:p>
+    <w:bookmarkEnd w:id="162"/>
+    <w:bookmarkStart w:id="163" w:name="ref-mainfort_2001"/>
     <w:p>
       <w:pPr>
         <w:pStyle w:val="Bibliography"/>
@@ -5569,8 +5616,8 @@
         <w:t xml:space="preserve">, edited by David S. Brose, C. Wesley Cowan, and Jr. Mainfort Robert C., pp. 173–190. Smithsonian Institution Press, Washington, DC.</w:t>
       </w:r>
     </w:p>
-    <w:bookmarkEnd w:id="162"/>
-    <w:bookmarkStart w:id="163" w:name="ref-mainfort_2003"/>
+    <w:bookmarkEnd w:id="163"/>
+    <w:bookmarkStart w:id="164" w:name="ref-mainfort_2003"/>
     <w:p>
       <w:pPr>
         <w:pStyle w:val="Bibliography"/>
@@ -5607,8 +5654,8 @@
         <w:t xml:space="preserve">22(2):176–184.</w:t>
       </w:r>
     </w:p>
-    <w:bookmarkEnd w:id="163"/>
-    <w:bookmarkStart w:id="164" w:name="ref-mantel_1967"/>
+    <w:bookmarkEnd w:id="164"/>
+    <w:bookmarkStart w:id="165" w:name="ref-mantel_1967"/>
     <w:p>
       <w:pPr>
         <w:pStyle w:val="Bibliography"/>
@@ -5633,8 +5680,8 @@
         <w:t xml:space="preserve">27(2):209–220.</w:t>
       </w:r>
     </w:p>
-    <w:bookmarkEnd w:id="164"/>
-    <w:bookmarkStart w:id="165" w:name="ref-mcnutt_ed_1996"/>
+    <w:bookmarkEnd w:id="165"/>
+    <w:bookmarkStart w:id="166" w:name="ref-mcnutt_ed_1996"/>
     <w:p>
       <w:pPr>
         <w:pStyle w:val="Bibliography"/>
@@ -5684,8 +5731,8 @@
         <w:t xml:space="preserve">. University of Alabama Press, Tuscaloosa.</w:t>
       </w:r>
     </w:p>
-    <w:bookmarkEnd w:id="165"/>
-    <w:bookmarkStart w:id="166" w:name="ref-mesoudi_2021"/>
+    <w:bookmarkEnd w:id="166"/>
+    <w:bookmarkStart w:id="167" w:name="ref-mesoudi_2021"/>
     <w:p>
       <w:pPr>
         <w:pStyle w:val="Bibliography"/>
@@ -5710,8 +5757,8 @@
         <w:t xml:space="preserve">376:20200053.</w:t>
       </w:r>
     </w:p>
-    <w:bookmarkEnd w:id="166"/>
-    <w:bookmarkStart w:id="168" w:name="ref-miller_atkins_premo_2018"/>
+    <w:bookmarkEnd w:id="167"/>
+    <w:bookmarkStart w:id="169" w:name="ref-miller_atkins_premo_2018"/>
     <w:p>
       <w:pPr>
         <w:pStyle w:val="Bibliography"/>
@@ -5738,7 +5785,7 @@
       <w:r>
         <w:t xml:space="preserve"> </w:t>
       </w:r>
-      <w:hyperlink r:id="rId167">
+      <w:hyperlink r:id="rId168">
         <w:r>
           <w:rPr>
             <w:rStyle w:val="Hyperlink"/>
@@ -5750,8 +5797,8 @@
         <w:t xml:space="preserve">.</w:t>
       </w:r>
     </w:p>
-    <w:bookmarkEnd w:id="168"/>
-    <w:bookmarkStart w:id="169" w:name="ref-milner_1998"/>
+    <w:bookmarkEnd w:id="169"/>
+    <w:bookmarkStart w:id="170" w:name="ref-milner_1998"/>
     <w:p>
       <w:pPr>
         <w:pStyle w:val="Bibliography"/>
@@ -5829,8 +5876,8 @@
         <w:t xml:space="preserve">. Smithsonian Institution Press, Washington, D.C.</w:t>
       </w:r>
     </w:p>
-    <w:bookmarkEnd w:id="169"/>
-    <w:bookmarkStart w:id="170" w:name="ref-mitchem_2001"/>
+    <w:bookmarkEnd w:id="170"/>
+    <w:bookmarkStart w:id="171" w:name="ref-mitchem_2001"/>
     <w:p>
       <w:pPr>
         <w:pStyle w:val="Bibliography"/>
@@ -5860,8 +5907,8 @@
         <w:t xml:space="preserve">.</w:t>
       </w:r>
     </w:p>
-    <w:bookmarkEnd w:id="170"/>
-    <w:bookmarkStart w:id="171" w:name="ref-morse_morse_1983"/>
+    <w:bookmarkEnd w:id="171"/>
+    <w:bookmarkStart w:id="172" w:name="ref-morse_morse_1983"/>
     <w:p>
       <w:pPr>
         <w:pStyle w:val="Bibliography"/>
@@ -5911,8 +5958,8 @@
         <w:t xml:space="preserve">. Academic Press, New York.</w:t>
       </w:r>
     </w:p>
-    <w:bookmarkEnd w:id="171"/>
-    <w:bookmarkStart w:id="172" w:name="ref-morse_morse_1996"/>
+    <w:bookmarkEnd w:id="172"/>
+    <w:bookmarkStart w:id="173" w:name="ref-morse_morse_1996"/>
     <w:p>
       <w:pPr>
         <w:pStyle w:val="Bibliography"/>
@@ -5949,8 +5996,8 @@
         <w:t xml:space="preserve">17(1):1–35.</w:t>
       </w:r>
     </w:p>
-    <w:bookmarkEnd w:id="172"/>
-    <w:bookmarkStart w:id="173" w:name="ref-morse_1990"/>
+    <w:bookmarkEnd w:id="173"/>
+    <w:bookmarkStart w:id="174" w:name="ref-morse_1990"/>
     <w:p>
       <w:pPr>
         <w:pStyle w:val="Bibliography"/>
@@ -6010,8 +6057,8 @@
         <w:t xml:space="preserve">, edited by David H. Dye and Cheryl Anne Cox, pp. 118–134. University of Alabama Press, Tuscaloosa.</w:t>
       </w:r>
     </w:p>
-    <w:bookmarkEnd w:id="173"/>
-    <w:bookmarkStart w:id="174" w:name="ref-neiman_1995"/>
+    <w:bookmarkEnd w:id="174"/>
+    <w:bookmarkStart w:id="175" w:name="ref-neiman_1995"/>
     <w:p>
       <w:pPr>
         <w:pStyle w:val="Bibliography"/>
@@ -6054,8 +6101,8 @@
         <w:t xml:space="preserve">60(1):7–36.</w:t>
       </w:r>
     </w:p>
-    <w:bookmarkEnd w:id="174"/>
-    <w:bookmarkStart w:id="176" w:name="ref-odwyer_kandler_2017"/>
+    <w:bookmarkEnd w:id="175"/>
+    <w:bookmarkStart w:id="177" w:name="ref-odwyer_kandler_2017"/>
     <w:p>
       <w:pPr>
         <w:pStyle w:val="Bibliography"/>
@@ -6082,7 +6129,7 @@
       <w:r>
         <w:t xml:space="preserve"> </w:t>
       </w:r>
-      <w:hyperlink r:id="rId175">
+      <w:hyperlink r:id="rId176">
         <w:r>
           <w:rPr>
             <w:rStyle w:val="Hyperlink"/>
@@ -6094,8 +6141,8 @@
         <w:t xml:space="preserve">.</w:t>
       </w:r>
     </w:p>
-    <w:bookmarkEnd w:id="176"/>
-    <w:bookmarkStart w:id="178" w:name="ref-peebles_kus_1977"/>
+    <w:bookmarkEnd w:id="177"/>
+    <w:bookmarkStart w:id="179" w:name="ref-peebles_kus_1977"/>
     <w:p>
       <w:pPr>
         <w:pStyle w:val="Bibliography"/>
@@ -6122,7 +6169,7 @@
       <w:r>
         <w:t xml:space="preserve"> </w:t>
       </w:r>
-      <w:hyperlink r:id="rId177">
+      <w:hyperlink r:id="rId178">
         <w:r>
           <w:rPr>
             <w:rStyle w:val="Hyperlink"/>
@@ -6134,8 +6181,8 @@
         <w:t xml:space="preserve">.</w:t>
       </w:r>
     </w:p>
-    <w:bookmarkEnd w:id="178"/>
-    <w:bookmarkStart w:id="180" w:name="ref-peeples_schachner_2012"/>
+    <w:bookmarkEnd w:id="179"/>
+    <w:bookmarkStart w:id="181" w:name="ref-peeples_schachner_2012"/>
     <w:p>
       <w:pPr>
         <w:pStyle w:val="Bibliography"/>
@@ -6162,7 +6209,7 @@
       <w:r>
         <w:t xml:space="preserve"> </w:t>
       </w:r>
-      <w:hyperlink r:id="rId179">
+      <w:hyperlink r:id="rId180">
         <w:r>
           <w:rPr>
             <w:rStyle w:val="Hyperlink"/>
@@ -6174,8 +6221,8 @@
         <w:t xml:space="preserve">.</w:t>
       </w:r>
     </w:p>
-    <w:bookmarkEnd w:id="180"/>
-    <w:bookmarkStart w:id="182" w:name="ref-perreault_2018"/>
+    <w:bookmarkEnd w:id="181"/>
+    <w:bookmarkStart w:id="183" w:name="ref-perreault_2018"/>
     <w:p>
       <w:pPr>
         <w:pStyle w:val="Bibliography"/>
@@ -6202,7 +6249,7 @@
       <w:r>
         <w:t xml:space="preserve"> </w:t>
       </w:r>
-      <w:hyperlink r:id="rId181">
+      <w:hyperlink r:id="rId182">
         <w:r>
           <w:rPr>
             <w:rStyle w:val="Hyperlink"/>
@@ -6214,8 +6261,8 @@
         <w:t xml:space="preserve">.</w:t>
       </w:r>
     </w:p>
-    <w:bookmarkEnd w:id="182"/>
-    <w:bookmarkStart w:id="183" w:name="ref-perreault_2019"/>
+    <w:bookmarkEnd w:id="183"/>
+    <w:bookmarkStart w:id="184" w:name="ref-perreault_2019"/>
     <w:p>
       <w:pPr>
         <w:pStyle w:val="Bibliography"/>
@@ -6237,8 +6284,8 @@
         <w:t xml:space="preserve">. University of Chicago Press, Chicago.</w:t>
       </w:r>
     </w:p>
-    <w:bookmarkEnd w:id="183"/>
-    <w:bookmarkStart w:id="184" w:name="ref-phillips_1970"/>
+    <w:bookmarkEnd w:id="184"/>
+    <w:bookmarkStart w:id="185" w:name="ref-phillips_1970"/>
     <w:p>
       <w:pPr>
         <w:pStyle w:val="Bibliography"/>
@@ -6309,8 +6356,8 @@
         <w:t xml:space="preserve">, Vol. 60. Papers of the Peabody Museum of Archaeology and Ethnology. Peabody Museum, Harvard University, Cambridge, MA.</w:t>
       </w:r>
     </w:p>
-    <w:bookmarkEnd w:id="184"/>
-    <w:bookmarkStart w:id="185" w:name="ref-phillips_ford_griffin_1951"/>
+    <w:bookmarkEnd w:id="185"/>
+    <w:bookmarkStart w:id="186" w:name="ref-phillips_ford_griffin_1951"/>
     <w:p>
       <w:pPr>
         <w:pStyle w:val="Bibliography"/>
@@ -6360,8 +6407,8 @@
         <w:t xml:space="preserve">, Vol. 25. Papers of the Peabody Museum of American Archaeology and Ethnology. Peabody Museum, Harvard University, Cambridge, MA.</w:t>
       </w:r>
     </w:p>
-    <w:bookmarkEnd w:id="185"/>
-    <w:bookmarkStart w:id="187" w:name="ref-phillips_willey_1953"/>
+    <w:bookmarkEnd w:id="186"/>
+    <w:bookmarkStart w:id="188" w:name="ref-phillips_willey_1953"/>
     <w:p>
       <w:pPr>
         <w:pStyle w:val="Bibliography"/>
@@ -6388,7 +6435,7 @@
       <w:r>
         <w:t xml:space="preserve"> </w:t>
       </w:r>
-      <w:hyperlink r:id="rId186">
+      <w:hyperlink r:id="rId187">
         <w:r>
           <w:rPr>
             <w:rStyle w:val="Hyperlink"/>
@@ -6400,8 +6447,8 @@
         <w:t xml:space="preserve">.</w:t>
       </w:r>
     </w:p>
-    <w:bookmarkEnd w:id="187"/>
-    <w:bookmarkStart w:id="189" w:name="ref-powell_shennan_thomas_2009"/>
+    <w:bookmarkEnd w:id="188"/>
+    <w:bookmarkStart w:id="190" w:name="ref-powell_shennan_thomas_2009"/>
     <w:p>
       <w:pPr>
         <w:pStyle w:val="Bibliography"/>
@@ -6440,7 +6487,7 @@
       <w:r>
         <w:t xml:space="preserve"> </w:t>
       </w:r>
-      <w:hyperlink r:id="rId188">
+      <w:hyperlink r:id="rId189">
         <w:r>
           <w:rPr>
             <w:rStyle w:val="Hyperlink"/>
@@ -6452,8 +6499,8 @@
         <w:t xml:space="preserve">.</w:t>
       </w:r>
     </w:p>
-    <w:bookmarkEnd w:id="189"/>
-    <w:bookmarkStart w:id="191" w:name="ref-premo_2014"/>
+    <w:bookmarkEnd w:id="190"/>
+    <w:bookmarkStart w:id="192" w:name="ref-premo_2014"/>
     <w:p>
       <w:pPr>
         <w:pStyle w:val="Bibliography"/>
@@ -6480,7 +6527,7 @@
       <w:r>
         <w:t xml:space="preserve"> </w:t>
       </w:r>
-      <w:hyperlink r:id="rId190">
+      <w:hyperlink r:id="rId191">
         <w:r>
           <w:rPr>
             <w:rStyle w:val="Hyperlink"/>
@@ -6492,8 +6539,8 @@
         <w:t xml:space="preserve">.</w:t>
       </w:r>
     </w:p>
-    <w:bookmarkEnd w:id="191"/>
-    <w:bookmarkStart w:id="193" w:name="ref-premo_2016"/>
+    <w:bookmarkEnd w:id="192"/>
+    <w:bookmarkStart w:id="194" w:name="ref-premo_2016"/>
     <w:p>
       <w:pPr>
         <w:pStyle w:val="Bibliography"/>
@@ -6520,7 +6567,7 @@
       <w:r>
         <w:t xml:space="preserve"> </w:t>
       </w:r>
-      <w:hyperlink r:id="rId192">
+      <w:hyperlink r:id="rId193">
         <w:r>
           <w:rPr>
             <w:rStyle w:val="Hyperlink"/>
@@ -6532,8 +6579,8 @@
         <w:t xml:space="preserve">.</w:t>
       </w:r>
     </w:p>
-    <w:bookmarkEnd w:id="193"/>
-    <w:bookmarkStart w:id="195" w:name="ref-premo_scholnick_2011"/>
+    <w:bookmarkEnd w:id="194"/>
+    <w:bookmarkStart w:id="196" w:name="ref-premo_scholnick_2011"/>
     <w:p>
       <w:pPr>
         <w:pStyle w:val="Bibliography"/>
@@ -6560,7 +6607,7 @@
       <w:r>
         <w:t xml:space="preserve"> </w:t>
       </w:r>
-      <w:hyperlink r:id="rId194">
+      <w:hyperlink r:id="rId195">
         <w:r>
           <w:rPr>
             <w:rStyle w:val="Hyperlink"/>
@@ -6572,8 +6619,8 @@
         <w:t xml:space="preserve">.</w:t>
       </w:r>
     </w:p>
-    <w:bookmarkEnd w:id="195"/>
-    <w:bookmarkStart w:id="196" w:name="ref-rees_political_culture"/>
+    <w:bookmarkEnd w:id="196"/>
+    <w:bookmarkStart w:id="197" w:name="ref-rees_political_culture"/>
     <w:p>
       <w:pPr>
         <w:pStyle w:val="Bibliography"/>
@@ -6597,8 +6644,8 @@
         <w:t xml:space="preserve">. Ph.D. dissertation, University of Oklahoma, Norman.</w:t>
       </w:r>
     </w:p>
-    <w:bookmarkEnd w:id="196"/>
-    <w:bookmarkStart w:id="198" w:name="ref-reimer_etal_2020"/>
+    <w:bookmarkEnd w:id="197"/>
+    <w:bookmarkStart w:id="199" w:name="ref-reimer_etal_2020"/>
     <w:p>
       <w:pPr>
         <w:pStyle w:val="Bibliography"/>
@@ -6652,7 +6699,7 @@
       <w:r>
         <w:t xml:space="preserve"> </w:t>
       </w:r>
-      <w:hyperlink r:id="rId197">
+      <w:hyperlink r:id="rId198">
         <w:r>
           <w:rPr>
             <w:rStyle w:val="Hyperlink"/>
@@ -6664,8 +6711,8 @@
         <w:t xml:space="preserve">.</w:t>
       </w:r>
     </w:p>
-    <w:bookmarkEnd w:id="198"/>
-    <w:bookmarkStart w:id="200" w:name="ref-richerson_etal_2016"/>
+    <w:bookmarkEnd w:id="199"/>
+    <w:bookmarkStart w:id="201" w:name="ref-richerson_etal_2016"/>
     <w:p>
       <w:pPr>
         <w:pStyle w:val="Bibliography"/>
@@ -6692,7 +6739,7 @@
       <w:r>
         <w:t xml:space="preserve"> </w:t>
       </w:r>
-      <w:hyperlink r:id="rId199">
+      <w:hyperlink r:id="rId200">
         <w:r>
           <w:rPr>
             <w:rStyle w:val="Hyperlink"/>
@@ -6704,8 +6751,8 @@
         <w:t xml:space="preserve">.</w:t>
       </w:r>
     </w:p>
-    <w:bookmarkEnd w:id="200"/>
-    <w:bookmarkStart w:id="202" w:name="ref-riede_hoggard_shennan_2019"/>
+    <w:bookmarkEnd w:id="201"/>
+    <w:bookmarkStart w:id="203" w:name="ref-riede_hoggard_shennan_2019"/>
     <w:p>
       <w:pPr>
         <w:pStyle w:val="Bibliography"/>
@@ -6732,7 +6779,7 @@
       <w:r>
         <w:t xml:space="preserve"> </w:t>
       </w:r>
-      <w:hyperlink r:id="rId201">
+      <w:hyperlink r:id="rId202">
         <w:r>
           <w:rPr>
             <w:rStyle w:val="Hyperlink"/>
@@ -6744,8 +6791,8 @@
         <w:t xml:space="preserve">.</w:t>
       </w:r>
     </w:p>
-    <w:bookmarkEnd w:id="202"/>
-    <w:bookmarkStart w:id="203" w:name="ref-robinson_1951"/>
+    <w:bookmarkEnd w:id="203"/>
+    <w:bookmarkStart w:id="204" w:name="ref-robinson_1951"/>
     <w:p>
       <w:pPr>
         <w:pStyle w:val="Bibliography"/>
@@ -6770,8 +6817,8 @@
         <w:t xml:space="preserve">16(4):293–301.</w:t>
       </w:r>
     </w:p>
-    <w:bookmarkEnd w:id="203"/>
-    <w:bookmarkStart w:id="204" w:name="ref-ross-stallings_2017"/>
+    <w:bookmarkEnd w:id="204"/>
+    <w:bookmarkStart w:id="205" w:name="ref-ross-stallings_2017"/>
     <w:p>
       <w:pPr>
         <w:pStyle w:val="Bibliography"/>
@@ -6805,8 +6852,8 @@
         <w:t xml:space="preserve">, edited by Haagen D. Klaus, Amanda R. Harvey, and Mark N. Cohen, pp. 329–362. University Press of Florida, Gainesville.</w:t>
       </w:r>
     </w:p>
-    <w:bookmarkEnd w:id="204"/>
-    <w:bookmarkStart w:id="206" w:name="ref-saxer_doebeli_travisano_2009"/>
+    <w:bookmarkEnd w:id="205"/>
+    <w:bookmarkStart w:id="207" w:name="ref-saxer_doebeli_travisano_2009"/>
     <w:p>
       <w:pPr>
         <w:pStyle w:val="Bibliography"/>
@@ -6833,7 +6880,7 @@
       <w:r>
         <w:t xml:space="preserve"> </w:t>
       </w:r>
-      <w:hyperlink r:id="rId205">
+      <w:hyperlink r:id="rId206">
         <w:r>
           <w:rPr>
             <w:rStyle w:val="Hyperlink"/>
@@ -6845,8 +6892,8 @@
         <w:t xml:space="preserve">.</w:t>
       </w:r>
     </w:p>
-    <w:bookmarkEnd w:id="206"/>
-    <w:bookmarkStart w:id="208" w:name="ref-scheffer_2009"/>
+    <w:bookmarkEnd w:id="207"/>
+    <w:bookmarkStart w:id="209" w:name="ref-scheffer_2009"/>
     <w:p>
       <w:pPr>
         <w:pStyle w:val="Bibliography"/>
@@ -6873,7 +6920,7 @@
       <w:r>
         <w:t xml:space="preserve"> </w:t>
       </w:r>
-      <w:hyperlink r:id="rId207">
+      <w:hyperlink r:id="rId208">
         <w:r>
           <w:rPr>
             <w:rStyle w:val="Hyperlink"/>
@@ -6885,8 +6932,8 @@
         <w:t xml:space="preserve">.</w:t>
       </w:r>
     </w:p>
-    <w:bookmarkEnd w:id="208"/>
-    <w:bookmarkStart w:id="209" w:name="ref-schiffer_1972"/>
+    <w:bookmarkEnd w:id="209"/>
+    <w:bookmarkStart w:id="210" w:name="ref-schiffer_1972"/>
     <w:p>
       <w:pPr>
         <w:pStyle w:val="Bibliography"/>
@@ -6911,8 +6958,8 @@
         <w:t xml:space="preserve">37(2):156–165.</w:t>
       </w:r>
     </w:p>
-    <w:bookmarkEnd w:id="209"/>
-    <w:bookmarkStart w:id="211" w:name="ref-schneider_martins_deaguiar_2016"/>
+    <w:bookmarkEnd w:id="210"/>
+    <w:bookmarkStart w:id="212" w:name="ref-schneider_martins_deaguiar_2016"/>
     <w:p>
       <w:pPr>
         <w:pStyle w:val="Bibliography"/>
@@ -6939,7 +6986,7 @@
       <w:r>
         <w:t xml:space="preserve"> </w:t>
       </w:r>
-      <w:hyperlink r:id="rId210">
+      <w:hyperlink r:id="rId211">
         <w:r>
           <w:rPr>
             <w:rStyle w:val="Hyperlink"/>
@@ -6951,8 +6998,8 @@
         <w:t xml:space="preserve">.</w:t>
       </w:r>
     </w:p>
-    <w:bookmarkEnd w:id="211"/>
-    <w:bookmarkStart w:id="213" w:name="ref-shennan_crema_kerig_2015"/>
+    <w:bookmarkEnd w:id="212"/>
+    <w:bookmarkStart w:id="214" w:name="ref-shennan_crema_kerig_2015"/>
     <w:p>
       <w:pPr>
         <w:pStyle w:val="Bibliography"/>
@@ -7018,7 +7065,7 @@
       <w:r>
         <w:t xml:space="preserve"> </w:t>
       </w:r>
-      <w:hyperlink r:id="rId212">
+      <w:hyperlink r:id="rId213">
         <w:r>
           <w:rPr>
             <w:rStyle w:val="Hyperlink"/>
@@ -7030,8 +7077,8 @@
         <w:t xml:space="preserve">.</w:t>
       </w:r>
     </w:p>
-    <w:bookmarkEnd w:id="213"/>
-    <w:bookmarkStart w:id="214" w:name="ref-shennan_wilkinson_2001"/>
+    <w:bookmarkEnd w:id="214"/>
+    <w:bookmarkStart w:id="215" w:name="ref-shennan_wilkinson_2001"/>
     <w:p>
       <w:pPr>
         <w:pStyle w:val="Bibliography"/>
@@ -7071,8 +7118,8 @@
         <w:t xml:space="preserve">66(4):577–593.</w:t>
       </w:r>
     </w:p>
-    <w:bookmarkEnd w:id="214"/>
-    <w:bookmarkStart w:id="215" w:name="ref-smith_neiman_2007"/>
+    <w:bookmarkEnd w:id="215"/>
+    <w:bookmarkStart w:id="216" w:name="ref-smith_neiman_2007"/>
     <w:p>
       <w:pPr>
         <w:pStyle w:val="Bibliography"/>
@@ -7097,8 +7144,8 @@
         <w:t xml:space="preserve">26(1):47–72.</w:t>
       </w:r>
     </w:p>
-    <w:bookmarkEnd w:id="215"/>
-    <w:bookmarkStart w:id="217" w:name="ref-stern_1994"/>
+    <w:bookmarkEnd w:id="216"/>
+    <w:bookmarkStart w:id="218" w:name="ref-stern_1994"/>
     <w:p>
       <w:pPr>
         <w:pStyle w:val="Bibliography"/>
@@ -7125,7 +7172,7 @@
       <w:r>
         <w:t xml:space="preserve"> </w:t>
       </w:r>
-      <w:hyperlink r:id="rId216">
+      <w:hyperlink r:id="rId217">
         <w:r>
           <w:rPr>
             <w:rStyle w:val="Hyperlink"/>
@@ -7137,8 +7184,8 @@
         <w:t xml:space="preserve">.</w:t>
       </w:r>
     </w:p>
-    <w:bookmarkEnd w:id="217"/>
-    <w:bookmarkStart w:id="219" w:name="ref-sullivan_2024"/>
+    <w:bookmarkEnd w:id="218"/>
+    <w:bookmarkStart w:id="220" w:name="ref-sullivan_2024"/>
     <w:p>
       <w:pPr>
         <w:pStyle w:val="Bibliography"/>
@@ -7189,7 +7236,7 @@
       <w:r>
         <w:t xml:space="preserve"> </w:t>
       </w:r>
-      <w:hyperlink r:id="rId218">
+      <w:hyperlink r:id="rId219">
         <w:r>
           <w:rPr>
             <w:rStyle w:val="Hyperlink"/>
@@ -7201,8 +7248,8 @@
         <w:t xml:space="preserve">.</w:t>
       </w:r>
     </w:p>
-    <w:bookmarkEnd w:id="219"/>
-    <w:bookmarkStart w:id="220" w:name="ref-tomasovych_kidwell_2009"/>
+    <w:bookmarkEnd w:id="220"/>
+    <w:bookmarkStart w:id="221" w:name="ref-tomasovych_kidwell_2009"/>
     <w:p>
       <w:pPr>
         <w:pStyle w:val="Bibliography"/>
@@ -7227,8 +7274,8 @@
         <w:t xml:space="preserve">35(1):94–118.</w:t>
       </w:r>
     </w:p>
-    <w:bookmarkEnd w:id="220"/>
-    <w:bookmarkStart w:id="222" w:name="ref-tomasovych_kidwell_2010"/>
+    <w:bookmarkEnd w:id="221"/>
+    <w:bookmarkStart w:id="223" w:name="ref-tomasovych_kidwell_2010"/>
     <w:p>
       <w:pPr>
         <w:pStyle w:val="Bibliography"/>
@@ -7255,7 +7302,7 @@
       <w:r>
         <w:t xml:space="preserve"> </w:t>
       </w:r>
-      <w:hyperlink r:id="rId221">
+      <w:hyperlink r:id="rId222">
         <w:r>
           <w:rPr>
             <w:rStyle w:val="Hyperlink"/>
@@ -7267,8 +7314,8 @@
         <w:t xml:space="preserve">.</w:t>
       </w:r>
     </w:p>
-    <w:bookmarkEnd w:id="222"/>
-    <w:bookmarkStart w:id="223" w:name="ref-willey_phillips_1958"/>
+    <w:bookmarkEnd w:id="223"/>
+    <w:bookmarkStart w:id="224" w:name="ref-willey_phillips_1958"/>
     <w:p>
       <w:pPr>
         <w:pStyle w:val="Bibliography"/>
@@ -7290,8 +7337,8 @@
         <w:t xml:space="preserve">. University of Chicago Press, Chicago.</w:t>
       </w:r>
     </w:p>
-    <w:bookmarkEnd w:id="223"/>
-    <w:bookmarkStart w:id="224" w:name="ref-williams_1954"/>
+    <w:bookmarkEnd w:id="224"/>
+    <w:bookmarkStart w:id="225" w:name="ref-williams_1954"/>
     <w:p>
       <w:pPr>
         <w:pStyle w:val="Bibliography"/>
@@ -7300,8 +7347,8 @@
         <w:t xml:space="preserve">Williams, Stephen. 1954. An Archeological Study of the Mississippian Culture in Southeast Missouri. PhD thesis, Yale University, New Haven.</w:t>
       </w:r>
     </w:p>
-    <w:bookmarkEnd w:id="224"/>
-    <w:bookmarkStart w:id="225" w:name="ref-williams_1990"/>
+    <w:bookmarkEnd w:id="225"/>
+    <w:bookmarkStart w:id="226" w:name="ref-williams_1990"/>
     <w:p>
       <w:pPr>
         <w:pStyle w:val="Bibliography"/>
@@ -7337,8 +7384,8 @@
         <w:t xml:space="preserve">, edited by David H. Dye and Cheryl Anne Cox, pp. 170–180. University of Alabama Press, Tuscaloosa.</w:t>
       </w:r>
     </w:p>
-    <w:bookmarkEnd w:id="225"/>
-    <w:bookmarkStart w:id="227" w:name="ref-wright_1943"/>
+    <w:bookmarkEnd w:id="226"/>
+    <w:bookmarkStart w:id="228" w:name="ref-wright_1943"/>
     <w:p>
       <w:pPr>
         <w:pStyle w:val="Bibliography"/>
@@ -7365,7 +7412,7 @@
       <w:r>
         <w:t xml:space="preserve"> </w:t>
       </w:r>
-      <w:hyperlink r:id="rId226">
+      <w:hyperlink r:id="rId227">
         <w:r>
           <w:rPr>
             <w:rStyle w:val="Hyperlink"/>
@@ -7377,8 +7424,8 @@
         <w:t xml:space="preserve">.</w:t>
       </w:r>
     </w:p>
-    <w:bookmarkEnd w:id="227"/>
-    <w:bookmarkStart w:id="229" w:name="ref-wright_1951"/>
+    <w:bookmarkEnd w:id="228"/>
+    <w:bookmarkStart w:id="230" w:name="ref-wright_1951"/>
     <w:p>
       <w:pPr>
         <w:pStyle w:val="Bibliography"/>
@@ -7405,7 +7452,7 @@
       <w:r>
         <w:t xml:space="preserve"> </w:t>
       </w:r>
-      <w:hyperlink r:id="rId228">
+      <w:hyperlink r:id="rId229">
         <w:r>
           <w:rPr>
             <w:rStyle w:val="Hyperlink"/>
@@ -7417,8 +7464,8 @@
         <w:t xml:space="preserve">.</w:t>
       </w:r>
     </w:p>
-    <w:bookmarkEnd w:id="229"/>
-    <w:bookmarkStart w:id="231" w:name="ref-youngblood_miton_morin_2023"/>
+    <w:bookmarkEnd w:id="230"/>
+    <w:bookmarkStart w:id="232" w:name="ref-youngblood_miton_morin_2023"/>
     <w:p>
       <w:pPr>
         <w:pStyle w:val="Bibliography"/>
@@ -7445,7 +7492,7 @@
       <w:r>
         <w:t xml:space="preserve"> </w:t>
       </w:r>
-      <w:hyperlink r:id="rId230">
+      <w:hyperlink r:id="rId231">
         <w:r>
           <w:rPr>
             <w:rStyle w:val="Hyperlink"/>
@@ -7457,10 +7504,10 @@
         <w:t xml:space="preserve">.</w:t>
       </w:r>
     </w:p>
-    <w:bookmarkEnd w:id="231"/>
     <w:bookmarkEnd w:id="232"/>
     <w:bookmarkEnd w:id="233"/>
     <w:bookmarkEnd w:id="234"/>
+    <w:bookmarkEnd w:id="235"/>
     <w:sectPr>
       <w:footnotePr>
         <w:numRestart w:val="eachSect"/>

</xml_diff>

<commit_message>
Region-wide drift groups (Figure 8) and grayscale all figures
- New analyses/37_lmv_drift_groups.py: number of drift-detected groups and
  between-group cultural F_ST across the 55-assemblage lower Mississippi Valley
  (Figure 8), two distribution panels, no map.
- The Parkin pull-out becomes Figure 9 and the basin drift demonstration
  becomes the supplement positive control (Figure S8).
- Convert every manuscript figure to grayscale: figstyle palette to distinct
  grays, sequential colormaps to grays, and per-figure marker and line-style
  distinctions for multi-series panels.
- Drop "emergent" from figure labels (scripts 33, 34, 35).
- Sync the restructured manuscript and figures.
</commit_message>
<xml_diff>
--- a/docs/manuscript/MAIN_TEXT.docx
+++ b/docs/manuscript/MAIN_TEXT.docx
@@ -2,7 +2,7 @@
 <file path=word/document.xml><?xml version="1.0" encoding="utf-8"?>
 <w:document xmlns:w="http://schemas.openxmlformats.org/wordprocessingml/2006/main" xmlns:m="http://schemas.openxmlformats.org/officeDocument/2006/math" xmlns:r="http://schemas.openxmlformats.org/officeDocument/2006/relationships" xmlns:o="urn:schemas-microsoft-com:office:office" xmlns:v="urn:schemas-microsoft-com:vml" xmlns:w10="urn:schemas-microsoft-com:office:word" xmlns:a="http://schemas.openxmlformats.org/drawingml/2006/main" xmlns:pic="http://schemas.openxmlformats.org/drawingml/2006/picture" xmlns:wp="http://schemas.openxmlformats.org/drawingml/2006/wordprocessingDrawing">
   <w:body>
-    <w:bookmarkStart w:id="235" w:name="X093902eb68652ea32f5548e74607f4e4b0f6699"/>
+    <w:bookmarkStart w:id="238" w:name="X093902eb68652ea32f5548e74607f4e4b0f6699"/>
     <w:p>
       <w:pPr>
         <w:pStyle w:val="Heading1"/>
@@ -2419,7 +2419,7 @@
       </w:r>
     </w:p>
     <w:bookmarkEnd w:id="43"/>
-    <w:bookmarkStart w:id="53" w:name="discussion"/>
+    <w:bookmarkStart w:id="56" w:name="discussion"/>
     <w:p>
       <w:pPr>
         <w:pStyle w:val="Heading2"/>
@@ -2489,7 +2489,7 @@
         <w:pStyle w:val="BodyText"/>
       </w:pPr>
       <w:r>
-        <w:t xml:space="preserve">That characterization can be made constructive rather than merely consistent with the data. Run the finite-population network-drift model forward on the real configuration of the 29 basin assemblages, with copying that decays with along-waterway distance and no boundary imposed, and the structure of the phase concept reads as a society reappears on its own</w:t>
+        <w:t xml:space="preserve">That characterization can be made constructive rather than merely consistent with the data. Run the finite-population network-drift model forward on the real configuration of the assemblages, with copying that decays with along-waterway distance and no boundary imposed, and the structure the phase concept reads as a society reappears on its own</w:t>
       </w:r>
       <w:r>
         <w:t xml:space="preserve"> </w:t>
@@ -2498,7 +2498,7 @@
         <w:t xml:space="preserve">(Lipo et al. 2021)</w:t>
       </w:r>
       <w:r>
-        <w:t xml:space="preserve">. The deposits are not contemporaneous, which is why they can be seriated at all and why some carry more of the late classes than others, so each synthetic assemblage is drawn time-transgressively at the run-time that matches its seriation position and accumulated over a window rather than read from a single instant. When repeated across 500 realizations, the model yields not a single partition but a distribution of them, so membership in Parkin’s group is a probability rather than a fact (Figure 8). Holding time fixed to isolate the spatial signal, that probability falls off smoothly with river distance from Parkin (Figure 8A): nearby assemblages usually share their emergent community and distant ones usually do not, ranging from about 0.70 to 0.17 with no assemblage a certain member or non-member, a graded field rather than the bounded set a phase map implies. Restoring the staggered deposition ages removes even that gradient, because assemblages caught at different points in the sequence carry different repertoires and fall into different, time-defined communities. A site’s nearest neighbors need not share its phase. The between-group cultural F_ST of the emergent groups settles at the observed level either way, near 0.02 to 0.03 against an observed 0.04, well below the value a bounded group would leave (Figure 8B), and the synthetic record re-seriates (Figure S7). Geography and time are the whole engine, and the apparent groups are two readings of one neutral process. That spatial and population structure, not population size, governs how drift partitions diversity in finite structured populations is established in both the cultural-transmission and population-genetics literatures</w:t>
+        <w:t xml:space="preserve">. Across the 55 decorated assemblages of the wider lower Mississippi Valley, the model repeatedly produces a few spatially coherent, phase-like groups (Figure 8). The deposits are not contemporaneous, which is why they can be seriated at all and why some carry more of the late classes than others, so each synthetic assemblage is drawn time-transgressively at the run-time that matches its seriation position. Holding time fixed to isolate the spatial signal, drift yields two to five groups whose number grows with geographic extent; restoring the staggered deposition ages collapses the count toward two time-defined groups, because assemblages caught at different points in the sequence carry different repertoires. Either way the number of drift-generated groups falls well short of the seven named phases the regional scheme draws across the same assemblages, and the between-group cultural F_ST of those groups settles at the observed level rather than the higher value a bounded group would leave. The named phases therefore subdivide the valley more finely than the transmission structure supports. That spatial and population structure, not population size, governs how drift partitions diversity in finite structured populations is established in both the cultural-transmission and population-genetics literatures</w:t>
       </w:r>
       <w:r>
         <w:t xml:space="preserve"> </w:t>
@@ -2525,7 +2525,15 @@
         <w:t xml:space="preserve">(Derex et al. 2018; Derex and Boyd 2016; Saxer et al. 2009)</w:t>
       </w:r>
       <w:r>
-        <w:t xml:space="preserve">. This is not contingent on a tuned parameter set. Across 432 runs spanning a grid of interaction length, between-node mixing, and innovation rate, two or more spatially coherent communities emerge in every run, and the between-group F_ST sits at or below the observed value in 85 percent, falling with more mixing or innovation but never approaching the bounded-groups level (Figure S7). The demonstration is illustrative rather than fitted, and the seriation recovery is moderate. The phase-like structure at the observed magnitude is a generic outcome of distance-structured drift on this geography.</w:t>
+        <w:t xml:space="preserve">. The result is not contingent on a tuned parameter set: across 432 runs spanning a grid of interaction length, between-node mixing, and innovation rate, two or more spatially coherent groups appear in every run and the between-group F_ST sits at or below the observed value in 85 percent of them, and the St. Francis basin that anchors this paper behaves the same way as a positive control (Figures S7 and S8).</w:t>
+      </w:r>
+    </w:p>
+    <w:p>
+      <w:pPr>
+        <w:pStyle w:val="BodyText"/>
+      </w:pPr>
+      <w:r>
+        <w:t xml:space="preserve">The same model lets the named phases be tested one at a time, in the culture historian’s own terms. Taking Parkin as the focal case, membership in its group is a probability rather than a fact: across the 500 runs each assemblage shares Parkin’s drift-detected group some fraction of the time, a graded field that falls off smoothly with river distance from Parkin rather than the bounded set a phase map implies (Figure 9A). The Parkin-phase assemblages do separate from the others by this measure, but that is the separation drift predicts, because they lie near Parkin and so co-occur with it more than distant assemblages do (Figure 9B). The discriminating test is whether the between-group cultural F_ST across the Parkin-versus-others partition exceeds the drift null. It sits at the extreme upper tail of the null and survives most single-site deletions, but it is small, the null’s own tail reaches past it, and time-averaging, which deflates between-group variance, is not modeled in the null (Figure 9C, 9D). It is therefore at most a weak hint of structure beyond drift, not a demonstrated social boundary. Geography and time are the whole engine, and the apparent groups are readings of one neutral process.</w:t>
       </w:r>
     </w:p>
     <w:p>
@@ -2535,14 +2543,14 @@
       <w:r>
         <w:drawing>
           <wp:inline>
-            <wp:extent cx="5334000" cy="4248345"/>
+            <wp:extent cx="5334000" cy="2824401"/>
             <wp:effectExtent b="0" l="0" r="0" t="0"/>
-            <wp:docPr descr="Figure 8. Phase-like structure generated by neutral drift on the real basin geography, with no bounded group imposed, summarized over 500 realizations. A neutral finite-population drift model runs forward on the actual coordinates of the 29 St. Francis basin assemblages, with copying that decays with distance along the waterway (river network) and new decorated classes arising over time (Supplemental Text). (A) Each assemblage on the river basemap is shaded by the probability that it falls within the same emergent community as Parkin (star) across the 500 runs, for the contemporaneous snapshot that isolates the spatial signal. The probability falls off smoothly with river distance from Parkin (Spearman rho = -0.72), from about 0.70 nearby to 0.17 far away, with no assemblage of a certain member or non-member, so Parkin’s “phase” is a graded, probabilistic field rather than a bounded set. Under full-time transgressive sampling, the gradient disappears because membership reflects both time and space (Supplemental Text). (B) Between-group cultural F_ST for the observed data (black, 0.04) against contemporaneous and time-transgressive drift (medians with 95% intervals across the 500 runs, near 0.02 to 0.03). The observed value falls within the contemporaneous-drift interval, with 7.4% of drift runs reaching or exceeding it, so drift reproduces the observed level rather than the higher value a bounded group would leave. Parameters are the positive-control corner (interaction length 24 river-km, mixing 0.02, innovation 0.012). Robustness across the factor grid is in Figure S7." title="" id="45" name="Picture"/>
+            <wp:docPr descr="Figure 8. Phase-like groups produced by neutral drift across the wider lower Mississippi Valley, with no bounded group imposed, summarized over 500 realizations. The finite-population network-drift model runs forward on the river-network geography of all 55 Mainfort-PFG decorated assemblages, and groups are detected as greedy-modularity communities on the Brainerd-Robinson similarity graph (Supplemental Text). (A) Distribution of the number of groups across the 500 runs, under contemporaneous (pure-space) and time-transgressive sampling, with the seven named culture-historical phases and the observed cluster count marked. Pure spatial drift yields two to five groups and the count grows with geographic extent; time-transgressive sampling collapses it toward two. Either way drift produces far fewer groups than the seven named phases, so the phases subdivide the valley more finely than the transmission structure supports. (B) Between-group cultural F_ST across runs against the observed level (0.04); the observed differentiation sits at the upper edge of the contemporaneous-drift distribution, so drift reproduces it. Parameters are the positive-control corner (interaction length 24 river-km, mixing 0.02, innovation 0.012); the basin positive control and the parameter-grid robustness are in Figures S7 and S8." title="" id="45" name="Picture"/>
             <a:graphic>
               <a:graphicData uri="http://schemas.openxmlformats.org/drawingml/2006/picture">
                 <pic:pic>
                   <pic:nvPicPr>
-                    <pic:cNvPr descr="../../figures/fig8_emergent_phases.png" id="46" name="Picture"/>
+                    <pic:cNvPr descr="../../figures/fig_lmv_drift_groups.png" id="46" name="Picture"/>
                     <pic:cNvPicPr>
                       <a:picLocks noChangeArrowheads="1" noChangeAspect="1"/>
                     </pic:cNvPicPr>
@@ -2556,7 +2564,7 @@
                   <pic:spPr bwMode="auto">
                     <a:xfrm>
                       <a:off x="0" y="0"/>
-                      <a:ext cx="5334000" cy="4248345"/>
+                      <a:ext cx="5334000" cy="2824401"/>
                     </a:xfrm>
                     <a:prstGeom prst="rect">
                       <a:avLst/>
@@ -2590,104 +2598,7 @@
         <w:t xml:space="preserve"> </w:t>
       </w:r>
       <w:r>
-        <w:t xml:space="preserve">Phase-like structure generated by neutral drift on the real basin geography, with no bounded group imposed, summarized over 500 realizations. A neutral finite-population drift model runs forward on the actual coordinates of the 29 St. Francis basin assemblages, with copying that decays with distance along the waterway (river network) and new decorated classes arising over time (Supplemental Text). (A) Each assemblage on the river basemap is shaded by the probability that it falls within the same emergent community as Parkin (star) across the 500 runs, for the contemporaneous snapshot that isolates the spatial signal. The probability falls off smoothly with river distance from Parkin (Spearman rho = -0.72), from about 0.70 nearby to 0.17 far away, with no assemblage of a certain member or non-member, so Parkin’s</w:t>
-      </w:r>
-      <w:r>
-        <w:t xml:space="preserve"> </w:t>
-      </w:r>
-      <w:r>
-        <w:t xml:space="preserve">“phase”</w:t>
-      </w:r>
-      <w:r>
-        <w:t xml:space="preserve"> </w:t>
-      </w:r>
-      <w:r>
-        <w:t xml:space="preserve">is a graded, probabilistic field rather than a bounded set. Under full-time transgressive sampling, the gradient disappears because membership reflects both time and space (Supplemental Text). (B) Between-group cultural F_ST for the observed data (black, 0.04) against contemporaneous and time-transgressive drift (medians with 95% intervals across the 500 runs, near 0.02 to 0.03). The observed value falls within the contemporaneous-drift interval, with 7.4% of drift runs reaching or exceeding it, so drift reproduces the observed level rather than the higher value a bounded group would leave. Parameters are the positive-control corner (interaction length 24 river-km, mixing 0.02, innovation 0.012). Robustness across the factor grid is in Figure S7.</w:t>
-      </w:r>
-    </w:p>
-    <w:p>
-      <w:pPr>
-        <w:pStyle w:val="BodyText"/>
-      </w:pPr>
-      <w:r>
-        <w:t xml:space="preserve">This finding provides the strongest case for the alternative hypothesis. The most direct argument for an emerging hierarchy holds that Parkin sits on agriculturally poor soil and so must have drawn tribute from the productive villages around it</w:t>
-      </w:r>
-      <w:r>
-        <w:t xml:space="preserve"> </w:t>
-      </w:r>
-      <w:r>
-        <w:t xml:space="preserve">(Morse 1990)</w:t>
-      </w:r>
-      <w:r>
-        <w:t xml:space="preserve">. The inference is specific and deserves credit for that, but it is circular. The tribute it concludes is the tribute it assumes, and no independent evidence of tribute flow accompanies it. Parkin’s position at the confluence of the St. Francis and Tyronza is as well explained by control of movement and communication as by extraction, and the transmission and exchange records both show the absence of the centralized control the tribute model requires. A second argument points to skeletal evidence from the lower Mississippi (Yazoo) Delta rather than the St. Francis basin, indicating a better diet at a mound center than at a nearby satellite village, consistent with differential access within a hierarchy</w:t>
-      </w:r>
-      <w:r>
-        <w:t xml:space="preserve"> </w:t>
-      </w:r>
-      <w:r>
-        <w:t xml:space="preserve">(Ross-Stallings 2017)</w:t>
-      </w:r>
-      <w:r>
-        <w:t xml:space="preserve">. The contrast is real but thin: the satellite sample numbers fourteen individuals, the result is presented as tentative, and a health difference between two sites does not require an extractive hierarchy to produce it. Neither argument supplies the regional, structural signature that the convergence test looks for and does not find.</w:t>
-      </w:r>
-    </w:p>
-    <w:p>
-      <w:pPr>
-        <w:pStyle w:val="BodyText"/>
-      </w:pPr>
-      <w:r>
-        <w:t xml:space="preserve">Three limits bound the result, and the recovery experiment forces the most important of them to the front. At this record’s resolution, the discrimination between a bounded group and drift rests on a single signature, cultural F_ST. That signature is confounded by a sample-size trend along the seriation axis (Spearman rho = +0.59). We removed the confound by subsampling every assemblage to a common count, which collapses the raw F_ST trend from +0.60 to +0.01. We calibrated the test on synthetic data matched to the record, in which F_ST recovers a moderate-strength closure (s of about 0.5, rising to 0.7 once the record’s time-averaging is imposed), while maintaining a false-positive rate of 5%. The size-controlled empirical F_ST is uninformative, its bootstrap interval spanning no closure to a moderate signal. The negative is therefore informative for a closure of moderate or greater strength, which would have registered as a resolved positive, but does not. It cannot exclude a weaker closure that a record of 29 time-averaged assemblages is underpowered to resolve, and we state the claim at that bound rather than beyond it. The other three signatures do not track closure reliably here. The neutral departure fails because it is non-monotonic in conformity and sensitive to sample size. The spatial boundary fails because the data support too few spatial clusters, and seriation coherence responds only weakly, so we report them as corroboration rather than as independent confirmations. This reduction is a property of the record. When a known closure signal is injected instead through a within-group conformity pathway or a non-spatially-organized social-fragmentation pathway, neither the neutral nor the seriation signature recovers it either, so the three weak signatures fail at this resolution regardless of how closure is produced (Supplemental Text). The price is that the negative bounds are only closure expressed as between-group divergence. The closure carried purely by conformity, or by social structure not aligned with the spatial clusters, would lie below detection in this record at any strength. The second limit is the ordinal chronology. The basin radiocarbon corpus pools to five seriation anchors across a calibration plateau, so the axis is a relative order oriented toward later time at Spearman +0.70, imperfectly. The discriminating quantity, the size-controlled F_ST trend, is a magnitude that does not depend on the axis orientation, and the settlement and exchange lines do not depend on the ceramic chronology at all. The third limit is time-averaging, which damps between-assemblage variation and reduces apparent turnover</w:t>
-      </w:r>
-      <w:r>
-        <w:t xml:space="preserve"> </w:t>
-      </w:r>
-      <w:r>
-        <w:t xml:space="preserve">(Coco and Iovita 2020; Kidwell and Tomašových 2013; Perreault 2018; Tomašových and Kidwell 2009, 2010; Youngblood et al. 2023)</w:t>
-      </w:r>
-      <w:r>
-        <w:t xml:space="preserve">. Rather than argue that this makes the absence conservative, we built the damping into the recovery experiment directly, where it raises the detection threshold from s of 0.5 to 0.7, the quantified cost of the record’s temporal mixing. The verdict is stable across the watershed (19 assemblages) and corridor (29) basin definitions. The central methodological finding is that telling a bounded group from drift must be calibrated to the record to which it is applied. The same four signatures that discriminate cleanly on idealized data reduce, on a real time-averaged record of this size, to a single confound-controlled signature, and saying so is what licenses reading the structure as drift rather than weakening the claim.</w:t>
-      </w:r>
-    </w:p>
-    <w:p>
-      <w:pPr>
-        <w:pStyle w:val="BodyText"/>
-      </w:pPr>
-      <w:r>
-        <w:t xml:space="preserve">The contribution has two parts that should be kept distinct. The four signatures distinguish a bounded interaction group from drift in principle, and an idealized simulation confirms that closure drives them together while drift and the other mimics do not (Figure S4). The calibration is the part that travels to real data: it asks, before any similarity structure is read as social, which signatures a given record can support and how strong a closure each could detect, and on the Parkin record, it shows the test reducing to its single most robust component, cultural F_ST. We are explicit about what that costs: had F_ST shown a positive trend, it alone could not have separated a real group from environmental patchiness, which also drives between-group variance (Table 1), so on a positive result, the generative drift-versus-groups comparison, not F_ST alone, would have had to carry the discrimination. The negative is cleaner because the present structure is positively matched by drift and overshot by bounded groups. This result shows that social structure may be measurable through decorated ceramic assemblages. We can also assess whether the Parkin phase was a polity by examining whether interaction had closed into a bounded group to a degree that the record can resolve. For the Parkin phase, the answer is that it had not, within the bounds supported by the record. The polity the De Soto encountered seems to reflect distinctions drawn in ceremonial practices, fortification, and settlement size, rather than one written into the structure of ceramic transmission.</w:t>
-      </w:r>
-    </w:p>
-    <w:p>
-      <w:pPr>
-        <w:pStyle w:val="BodyText"/>
-      </w:pPr>
-      <w:r>
-        <w:t xml:space="preserve">The test also extends beyond the basin (Figure 9). Applied to the southeast-Missouri assemblages compiled by Williams</w:t>
-      </w:r>
-      <w:r>
-        <w:t xml:space="preserve"> </w:t>
-      </w:r>
-      <w:r>
-        <w:t xml:space="preserve">(1954)</w:t>
-      </w:r>
-      <w:r>
-        <w:t xml:space="preserve">, the within-region decorated-ceramic structure is again drift-consistent once the earlier Woodland component is set aside. Therefore, the absence of bounded groups is not peculiar to the St. Francis basin (Figure 10). In both regions, the observed between-cluster F_ST sits at the neutral-drift level and far below the bounded-groups expectation (LMV +0.02, CMV +0.03, against bounded-groups nulls of +0.11 and +0.08), and the assemblages intermix rather than separating into clusters. Between the two regions, a genuine discontinuity does appear. Across the roughly 50 km gap separating the central-valley and lower-valley assemblage clusters, decorated similarity declines by far more than neutral spatial drift would predict for the same geometry, and the two regions carry mutually exclusive, distinctive decorated repertoires (Figure S6). This is the scale-dependent pattern the test is designed to detect, with no closure within regions and a sharp difference between them. We report it as a pattern rather than a verdict, because it is confounded with time.</w:t>
-      </w:r>
-    </w:p>
-    <w:p>
-      <w:pPr>
-        <w:pStyle w:val="BodyText"/>
-      </w:pPr>
-      <w:r>
-        <w:t xml:space="preserve">The distinctive central-valley classes are early-to-middle Mississippian, and the distinctive lower-valley classes are late</w:t>
-      </w:r>
-      <w:r>
-        <w:t xml:space="preserve"> </w:t>
-      </w:r>
-      <w:r>
-        <w:t xml:space="preserve">(Phillips 1970; Williams 1954)</w:t>
-      </w:r>
-      <w:r>
-        <w:t xml:space="preserve">, so the step at the boundary cannot be separated from the early-to-late turnover of the repertoire with time-averaged surface assemblages, and resolving whether the inter-regional boundary is synchronic and social or a chronological succession would require independent radiocarbon control on the central-valley assemblages that the present compilation lacks. A second confound compounds the first. The lower-valley assemblages were collected and classified by Ford, later by Phillips, Ford, and Griffin. In contrast, the central-valley assemblages were collected and classified separately by Williams, so the two blocks differ in analyst, sorting convention, and class definition as well as in space and time. The shared-class restriction guards against the crudest version of this artifact, because a boundary built only from classes unique to each typology would vanish when only the classes both traditions record are compared, and the boundary does weaken under that restriction without disappearing. Even the shared classes, however, may have been sorted to subtly different criteria by the two traditions. We therefore cannot rule out that the apparent central-valley and lower-valley boundary is in part an artifact of two separate analytical histories, and that the possibility of continuous interaction across the whole region, with no real boundary anywhere, remains open. That possibility is part of the question this study raises, rather than a nuisance to be set aside, because a boundary in the data is not yet a boundary in the past. The paper’s point at the local scale applies with equal force between the regions.</w:t>
+        <w:t xml:space="preserve">Phase-like groups produced by neutral drift across the wider lower Mississippi Valley, with no bounded group imposed, summarized over 500 realizations. The finite-population network-drift model runs forward on the river-network geography of all 55 Mainfort-PFG decorated assemblages, and groups are detected as greedy-modularity communities on the Brainerd-Robinson similarity graph (Supplemental Text). (A) Distribution of the number of groups across the 500 runs, under contemporaneous (pure-space) and time-transgressive sampling, with the seven named culture-historical phases and the observed cluster count marked. Pure spatial drift yields two to five groups and the count grows with geographic extent; time-transgressive sampling collapses it toward two. Either way drift produces far fewer groups than the seven named phases, so the phases subdivide the valley more finely than the transmission structure supports. (B) Between-group cultural F_ST across runs against the observed level (0.04); the observed differentiation sits at the upper edge of the contemporaneous-drift distribution, so drift reproduces it. Parameters are the positive-control corner (interaction length 24 river-km, mixing 0.02, innovation 0.012); the basin positive control and the parameter-grid robustness are in Figures S7 and S8.</w:t>
       </w:r>
     </w:p>
     <w:p>
@@ -2697,20 +2608,208 @@
       <w:r>
         <w:drawing>
           <wp:inline>
-            <wp:extent cx="4572000" cy="4685221"/>
+            <wp:extent cx="5334000" cy="5163057"/>
             <wp:effectExtent b="0" l="0" r="0" t="0"/>
-            <wp:docPr descr="Figure 9. Regional setting of the two-scale comparison. Decorated-ceramic assemblages of the central Mississippi Valley: the southeast-Missouri survey of Williams (CMV, blue) and the lower-valley St. Francis basin Parkin-phase assemblages (LMV, orange), with the gap between the two clusters of assemblages and Parkin starred. Labels mark the named physiographic phase regions (Cairo Lowland, Sikeston Ridge, Malden Plain, and Little River in the central valley, with the St. Francis basin in the lower valley). Hydrography combines the Lower Mississippi Survey layer with Natural Earth, state boundaries, and the North America locator inset, which are from Natural Earth. The central-valley assemblages were collected and classified by Williams, and the lower-valley assemblages in the Phillips-Ford-Griffin tradition, the separate analytical histories discussed in the text." title="" id="48" name="Picture"/>
+            <wp:docPr descr="Figure 9. Does the Parkin phase separate from the other named phases by more than drift? All 55 Mainfort-PFG decorated assemblages, labeled by culture-historical phase after Mainfort (1996b), under time-transgressive river-network drift with no boundary imposed (500 realizations). (A) Each assemblage shaded by the probability that it shares Parkin’s drift-detected group (star), with Parkin-phase assemblages drawn as circles and other phases as squares; the probability is a graded field that falls with river distance from Parkin. (B) That co-membership for the Parkin phase against the other phases (AUC 0.88), the separation drift predicts from geography. (C) Observed Parkin-versus-others between-group cultural F_ST (dashed) against the drift null; 0.4 percent of runs reach or exceed it, and the null’s tail extends past it. (D) Leave-one-out jackknife: the observed F_ST with each Parkin assemblage relabeled into the comparison group, against the 2.5 to 97.5 percentile band of its matched per-drop null. Open points fall inside the band (drift-consistent), filled points outside; seven of the eight single drops stay outside, so the small contrast does not rest on one assemblage." title="" id="48" name="Picture"/>
             <a:graphic>
               <a:graphicData uri="http://schemas.openxmlformats.org/drawingml/2006/picture">
                 <pic:pic>
                   <pic:nvPicPr>
-                    <pic:cNvPr descr="../../figures/fig1_regional.png" id="49" name="Picture"/>
+                    <pic:cNvPr descr="../../figures/figS8_basin_pullout.png" id="49" name="Picture"/>
                     <pic:cNvPicPr>
                       <a:picLocks noChangeArrowheads="1" noChangeAspect="1"/>
                     </pic:cNvPicPr>
                   </pic:nvPicPr>
                   <pic:blipFill>
                     <a:blip r:embed="rId47"/>
+                    <a:stretch>
+                      <a:fillRect/>
+                    </a:stretch>
+                  </pic:blipFill>
+                  <pic:spPr bwMode="auto">
+                    <a:xfrm>
+                      <a:off x="0" y="0"/>
+                      <a:ext cx="5334000" cy="5163057"/>
+                    </a:xfrm>
+                    <a:prstGeom prst="rect">
+                      <a:avLst/>
+                    </a:prstGeom>
+                    <a:noFill/>
+                    <a:ln w="9525">
+                      <a:noFill/>
+                      <a:headEnd/>
+                      <a:tailEnd/>
+                    </a:ln>
+                  </pic:spPr>
+                </pic:pic>
+              </a:graphicData>
+            </a:graphic>
+          </wp:inline>
+        </w:drawing>
+      </w:r>
+    </w:p>
+    <w:p>
+      <w:pPr>
+        <w:pStyle w:val="ImageCaption"/>
+      </w:pPr>
+      <w:r>
+        <w:rPr>
+          <w:b/>
+          <w:bCs/>
+        </w:rPr>
+        <w:t xml:space="preserve">Figure 9.</w:t>
+      </w:r>
+      <w:r>
+        <w:t xml:space="preserve"> </w:t>
+      </w:r>
+      <w:r>
+        <w:t xml:space="preserve">Does the Parkin phase separate from the other named phases by more than drift? All 55 Mainfort-PFG decorated assemblages, labeled by culture-historical phase after Mainfort</w:t>
+      </w:r>
+      <w:r>
+        <w:t xml:space="preserve"> </w:t>
+      </w:r>
+      <w:r>
+        <w:t xml:space="preserve">(1996b)</w:t>
+      </w:r>
+      <w:r>
+        <w:t xml:space="preserve">, under time-transgressive river-network drift with no boundary imposed (500 realizations). (A) Each assemblage shaded by the probability that it shares Parkin’s drift-detected group (star), with Parkin-phase assemblages drawn as circles and other phases as squares; the probability is a graded field that falls with river distance from Parkin. (B) That co-membership for the Parkin phase against the other phases (AUC 0.88), the separation drift predicts from geography. (C) Observed Parkin-versus-others between-group cultural F_ST (dashed) against the drift null; 0.4 percent of runs reach or exceed it, and the null’s tail extends past it. (D) Leave-one-out jackknife: the observed F_ST with each Parkin assemblage relabeled into the comparison group, against the 2.5 to 97.5 percentile band of its matched per-drop null. Open points fall inside the band (drift-consistent), filled points outside; seven of the eight single drops stay outside, so the small contrast does not rest on one assemblage.</w:t>
+      </w:r>
+    </w:p>
+    <w:p>
+      <w:pPr>
+        <w:pStyle w:val="BodyText"/>
+      </w:pPr>
+      <w:r>
+        <w:t xml:space="preserve">This finding provides the strongest case for the alternative hypothesis. The most direct argument for an emerging hierarchy holds that Parkin sits on agriculturally poor soil and so must have drawn tribute from the productive villages around it</w:t>
+      </w:r>
+      <w:r>
+        <w:t xml:space="preserve"> </w:t>
+      </w:r>
+      <w:r>
+        <w:t xml:space="preserve">(Morse 1990)</w:t>
+      </w:r>
+      <w:r>
+        <w:t xml:space="preserve">. The inference is specific and deserves credit for that, but it is circular. The tribute it concludes is the tribute it assumes, and no independent evidence of tribute flow accompanies it. Parkin’s position at the confluence of the St. Francis and Tyronza is as well explained by control of movement and communication as by extraction, and the transmission and exchange records both show the absence of the centralized control the tribute model requires. A second argument points to skeletal evidence from the lower Mississippi (Yazoo) Delta rather than the St. Francis basin, indicating a better diet at a mound center than at a nearby satellite village, consistent with differential access within a hierarchy</w:t>
+      </w:r>
+      <w:r>
+        <w:t xml:space="preserve"> </w:t>
+      </w:r>
+      <w:r>
+        <w:t xml:space="preserve">(Ross-Stallings 2017)</w:t>
+      </w:r>
+      <w:r>
+        <w:t xml:space="preserve">. The contrast is real but thin: the satellite sample numbers fourteen individuals, the result is presented as tentative, and a health difference between two sites does not require an extractive hierarchy to produce it. Neither argument supplies the regional, structural signature that the convergence test looks for and does not find.</w:t>
+      </w:r>
+    </w:p>
+    <w:p>
+      <w:pPr>
+        <w:pStyle w:val="BodyText"/>
+      </w:pPr>
+      <w:r>
+        <w:t xml:space="preserve">Three limits bound the result, and the recovery experiment forces the most important of them to the front. At this record’s resolution, the discrimination between a bounded group and drift rests on a single signature, cultural F_ST. That signature is confounded by a sample-size trend along the seriation axis (Spearman rho = +0.59). We removed the confound by subsampling every assemblage to a common count, which collapses the raw F_ST trend from +0.60 to +0.01. We calibrated the test on synthetic data matched to the record, in which F_ST recovers a moderate-strength closure (s of about 0.5, rising to 0.7 once the record’s time-averaging is imposed), while maintaining a false-positive rate of 5%. The size-controlled empirical F_ST is uninformative, its bootstrap interval spanning no closure to a moderate signal. The negative is therefore informative for a closure of moderate or greater strength, which would have registered as a resolved positive, but does not. It cannot exclude a weaker closure that a record of 29 time-averaged assemblages is underpowered to resolve, and we state the claim at that bound rather than beyond it. The other three signatures do not track closure reliably here. The neutral departure fails because it is non-monotonic in conformity and sensitive to sample size. The spatial boundary fails because the data support too few spatial clusters, and seriation coherence responds only weakly, so we report them as corroboration rather than as independent confirmations. This reduction is a property of the record. When a known closure signal is injected instead through a within-group conformity pathway or a non-spatially-organized social-fragmentation pathway, neither the neutral nor the seriation signature recovers it either, so the three weak signatures fail at this resolution regardless of how closure is produced (Supplemental Text). The price is that the negative bounds are only closure expressed as between-group divergence. The closure carried purely by conformity, or by social structure not aligned with the spatial clusters, would lie below detection in this record at any strength. The second limit is the ordinal chronology. The basin radiocarbon corpus pools to five seriation anchors across a calibration plateau, so the axis is a relative order oriented toward later time at Spearman +0.70, imperfectly. The discriminating quantity, the size-controlled F_ST trend, is a magnitude that does not depend on the axis orientation, and the settlement and exchange lines do not depend on the ceramic chronology at all. The third limit is time-averaging, which damps between-assemblage variation and reduces apparent turnover</w:t>
+      </w:r>
+      <w:r>
+        <w:t xml:space="preserve"> </w:t>
+      </w:r>
+      <w:r>
+        <w:t xml:space="preserve">(Coco and Iovita 2020; Kidwell and Tomašových 2013; Perreault 2018; Tomašových and Kidwell 2009, 2010; Youngblood et al. 2023)</w:t>
+      </w:r>
+      <w:r>
+        <w:t xml:space="preserve">. Rather than argue that this makes the absence conservative, we built the damping into the recovery experiment directly, where it raises the detection threshold from s of 0.5 to 0.7, the quantified cost of the record’s temporal mixing. The verdict is stable across the watershed (19 assemblages) and corridor (29) basin definitions. The central methodological finding is that telling a bounded group from drift must be calibrated to the record to which it is applied. The same four signatures that discriminate cleanly on idealized data reduce, on a real time-averaged record of this size, to a single confound-controlled signature, and saying so is what licenses reading the structure as drift rather than weakening the claim.</w:t>
+      </w:r>
+    </w:p>
+    <w:p>
+      <w:pPr>
+        <w:pStyle w:val="BodyText"/>
+      </w:pPr>
+      <w:r>
+        <w:t xml:space="preserve">The contribution has two parts that should be kept distinct. The four signatures distinguish a bounded interaction group from drift in principle, and an idealized simulation confirms that closure drives them together while drift and the other mimics do not (Figure S4). The calibration is the part that travels to real data: it asks, before any similarity structure is read as social, which signatures a given record can support and how strong a closure each could detect, and on the Parkin record, it shows the test reducing to its single most robust component, cultural F_ST. We are explicit about what that costs: had F_ST shown a positive trend, it alone could not have separated a real group from environmental patchiness, which also drives between-group variance (Table 1), so on a positive result, the generative drift-versus-groups comparison, not F_ST alone, would have had to carry the discrimination. The negative is cleaner because the present structure is positively matched by drift and overshot by bounded groups. This result shows that social structure may be measurable through decorated ceramic assemblages. We can also assess whether the Parkin phase was a polity by examining whether interaction had closed into a bounded group to a degree that the record can resolve. For the Parkin phase, the answer is that it had not, within the bounds supported by the record. The polity the De Soto encountered seems to reflect distinctions drawn in ceremonial practices, fortification, and settlement size, rather than one written into the structure of ceramic transmission.</w:t>
+      </w:r>
+    </w:p>
+    <w:p>
+      <w:pPr>
+        <w:pStyle w:val="BodyText"/>
+      </w:pPr>
+      <w:r>
+        <w:t xml:space="preserve">One result resists the drift reading, if only faintly, and deserves to be named rather than buried. The single place in the valley that carries a whisper of structure beyond drift is the Parkin phase, and Parkin is the one monumental node, the largest mound, the palisade, the confluence position, the candidate Casqui. A center beginning to differentiate as a distinct node, rather than a finished bounded group, would leave just such a signal, and this is what the origination stage of the two-regime model predicts: a local return generates group-beneficial pattern at a node before assortment becomes binding and propagates into higher-level structure, with contact and the protohistoric depopulation truncating the sequence before it could consolidate. We do not claim this happened. The contrast is small, the drift null reaches past it, and the time-averaged surface record of eight Parkin-phase assemblages cannot bear the weight. The possibility that Parkin was an incipient node nonetheless warrants direct investigation with data classes the present record lacks: stratified, excavated assemblages with independent radiocarbon, to test whether the differentiation grows through time rather than holding flat; compositional and petrographic sourcing of the ceramics, to test whether production and exchange were localizing on the center; and the non-ceramic lines, the chert-hoe and shell exchange networks</w:t>
+      </w:r>
+      <w:r>
+        <w:t xml:space="preserve"> </w:t>
+      </w:r>
+      <w:r>
+        <w:t xml:space="preserve">(Cobb 2000)</w:t>
+      </w:r>
+      <w:r>
+        <w:t xml:space="preserve"> </w:t>
+      </w:r>
+      <w:r>
+        <w:t xml:space="preserve">and the mortuary and dietary record</w:t>
+      </w:r>
+      <w:r>
+        <w:t xml:space="preserve"> </w:t>
+      </w:r>
+      <w:r>
+        <w:t xml:space="preserve">(Ross-Stallings 2017)</w:t>
+      </w:r>
+      <w:r>
+        <w:t xml:space="preserve">, to show whether economic and social differentiation track the ceramic hint or run independent of it. Whether Parkin was beginning to pull away from its neighbors, or simply sits where drift on the river network happens to concentrate interaction, is a question this record raises but cannot settle.</w:t>
+      </w:r>
+    </w:p>
+    <w:p>
+      <w:pPr>
+        <w:pStyle w:val="BodyText"/>
+      </w:pPr>
+      <w:r>
+        <w:t xml:space="preserve">The test also extends beyond the basin (Figure 10). Applied to the southeast-Missouri assemblages compiled by Williams</w:t>
+      </w:r>
+      <w:r>
+        <w:t xml:space="preserve"> </w:t>
+      </w:r>
+      <w:r>
+        <w:t xml:space="preserve">(1954)</w:t>
+      </w:r>
+      <w:r>
+        <w:t xml:space="preserve">, the within-region decorated-ceramic structure is again drift-consistent once the earlier Woodland component is set aside. Therefore, the absence of bounded groups is not peculiar to the St. Francis basin (Figure 11). In both regions, the observed between-cluster F_ST sits at the neutral-drift level and far below the bounded-groups expectation (LMV +0.02, CMV +0.03, against bounded-groups nulls of +0.11 and +0.08), and the assemblages intermix rather than separating into clusters. Between the two regions, a genuine discontinuity does appear. Across the roughly 50 km gap separating the central-valley and lower-valley assemblage clusters, decorated similarity declines by far more than neutral spatial drift would predict for the same geometry, and the two regions carry mutually exclusive, distinctive decorated repertoires (Figure S6). This is the scale-dependent pattern the test is designed to detect, with no closure within regions and a sharp difference between them. We report it as a pattern rather than a verdict, because it is confounded with time.</w:t>
+      </w:r>
+    </w:p>
+    <w:p>
+      <w:pPr>
+        <w:pStyle w:val="BodyText"/>
+      </w:pPr>
+      <w:r>
+        <w:t xml:space="preserve">The distinctive central-valley classes are early-to-middle Mississippian, and the distinctive lower-valley classes are late</w:t>
+      </w:r>
+      <w:r>
+        <w:t xml:space="preserve"> </w:t>
+      </w:r>
+      <w:r>
+        <w:t xml:space="preserve">(Phillips 1970; Williams 1954)</w:t>
+      </w:r>
+      <w:r>
+        <w:t xml:space="preserve">, so the step at the boundary cannot be separated from the early-to-late turnover of the repertoire with time-averaged surface assemblages, and resolving whether the inter-regional boundary is synchronic and social or a chronological succession would require independent radiocarbon control on the central-valley assemblages that the present compilation lacks. A second confound compounds the first. The lower-valley assemblages were collected and classified by Ford, later by Phillips, Ford, and Griffin. In contrast, the central-valley assemblages were collected and classified separately by Williams, so the two blocks differ in analyst, sorting convention, and class definition as well as in space and time. The shared-class restriction guards against the crudest version of this artifact, because a boundary built only from classes unique to each typology would vanish when only the classes both traditions record are compared, and the boundary does weaken under that restriction without disappearing. Even the shared classes, however, may have been sorted to subtly different criteria by the two traditions. We therefore cannot rule out that the apparent central-valley and lower-valley boundary is in part an artifact of two separate analytical histories, and that the possibility of continuous interaction across the whole region, with no real boundary anywhere, remains open. That possibility is part of the question this study raises, rather than a nuisance to be set aside, because a boundary in the data is not yet a boundary in the past. The paper’s point at the local scale applies with equal force between the regions.</w:t>
+      </w:r>
+    </w:p>
+    <w:p>
+      <w:pPr>
+        <w:pStyle w:val="CaptionedFigure"/>
+      </w:pPr>
+      <w:r>
+        <w:drawing>
+          <wp:inline>
+            <wp:extent cx="4572000" cy="4685221"/>
+            <wp:effectExtent b="0" l="0" r="0" t="0"/>
+            <wp:docPr descr="Figure 10. Regional setting of the two-scale comparison. Decorated-ceramic assemblages of the central Mississippi Valley: the southeast-Missouri survey of Williams (CMV, blue) and the lower-valley St. Francis basin Parkin-phase assemblages (LMV, orange), with the gap between the two clusters of assemblages and Parkin starred. Labels mark the named physiographic phase regions (Cairo Lowland, Sikeston Ridge, Malden Plain, and Little River in the central valley, with the St. Francis basin in the lower valley). Hydrography combines the Lower Mississippi Survey layer with Natural Earth, state boundaries, and the North America locator inset, which are from Natural Earth. The central-valley assemblages were collected and classified by Williams, and the lower-valley assemblages in the Phillips-Ford-Griffin tradition, the separate analytical histories discussed in the text." title="" id="51" name="Picture"/>
+            <a:graphic>
+              <a:graphicData uri="http://schemas.openxmlformats.org/drawingml/2006/picture">
+                <pic:pic>
+                  <pic:nvPicPr>
+                    <pic:cNvPr descr="../../figures/fig1_regional.png" id="52" name="Picture"/>
+                    <pic:cNvPicPr>
+                      <a:picLocks noChangeArrowheads="1" noChangeAspect="1"/>
+                    </pic:cNvPicPr>
+                  </pic:nvPicPr>
+                  <pic:blipFill>
+                    <a:blip r:embed="rId50"/>
                     <a:stretch>
                       <a:fillRect/>
                     </a:stretch>
@@ -2746,7 +2845,7 @@
           <w:b/>
           <w:bCs/>
         </w:rPr>
-        <w:t xml:space="preserve">Figure 9.</w:t>
+        <w:t xml:space="preserve">Figure 10.</w:t>
       </w:r>
       <w:r>
         <w:t xml:space="preserve"> </w:t>
@@ -2764,18 +2863,18 @@
           <wp:inline>
             <wp:extent cx="4754880" cy="3753325"/>
             <wp:effectExtent b="0" l="0" r="0" t="0"/>
-            <wp:docPr descr="Figure 10. Within-region interaction structure: neither region forms bounded groups. Top: multidimensional scaling of decorated Brainerd-Robinson dissimilarity for the LMV St. Francis basin and for the CMV southeast-Missouri assemblages (Mississippian classes only, so the comparison is not driven by the Woodland-to-Mississippian gradient), points colored by within-region spatial cluster, and the assemblages intermix rather than separating into clusters. Bottom: the observed between-cluster cultural F_ST for each region (diamond) against the 95% nulls of a neutral spatial-drift model (blue) and a bounded-groups model (orange) run on the real coordinates and subsampled to the observed counts. In both regions, the observed F_ST sits at the drift level and far below the bounded-groups expectation, so the within-region structure is drift-consistent at both scales." title="" id="51" name="Picture"/>
+            <wp:docPr descr="Figure 11. Within-region interaction structure: neither region forms bounded groups. Top: multidimensional scaling of decorated Brainerd-Robinson dissimilarity for the LMV St. Francis basin and for the CMV southeast-Missouri assemblages (Mississippian classes only, so the comparison is not driven by the Woodland-to-Mississippian gradient), points colored by within-region spatial cluster, and the assemblages intermix rather than separating into clusters. Bottom: the observed between-cluster cultural F_ST for each region (diamond) against the 95% nulls of a neutral spatial-drift model (blue) and a bounded-groups model (orange) run on the real coordinates and subsampled to the observed counts. In both regions, the observed F_ST sits at the drift level and far below the bounded-groups expectation, so the within-region structure is drift-consistent at both scales." title="" id="54" name="Picture"/>
             <a:graphic>
               <a:graphicData uri="http://schemas.openxmlformats.org/drawingml/2006/picture">
                 <pic:pic>
                   <pic:nvPicPr>
-                    <pic:cNvPr descr="../../figures/fig9_within_region.png" id="52" name="Picture"/>
+                    <pic:cNvPr descr="../../figures/fig9_within_region.png" id="55" name="Picture"/>
                     <pic:cNvPicPr>
                       <a:picLocks noChangeArrowheads="1" noChangeAspect="1"/>
                     </pic:cNvPicPr>
                   </pic:nvPicPr>
                   <pic:blipFill>
-                    <a:blip r:embed="rId50"/>
+                    <a:blip r:embed="rId53"/>
                     <a:stretch>
                       <a:fillRect/>
                     </a:stretch>
@@ -2811,7 +2910,7 @@
           <w:b/>
           <w:bCs/>
         </w:rPr>
-        <w:t xml:space="preserve">Figure 10.</w:t>
+        <w:t xml:space="preserve">Figure 11.</w:t>
       </w:r>
       <w:r>
         <w:t xml:space="preserve"> </w:t>
@@ -2882,8 +2981,8 @@
         <w:t xml:space="preserve">. The detail is in the Supplemental Text.</w:t>
       </w:r>
     </w:p>
-    <w:bookmarkEnd w:id="53"/>
-    <w:bookmarkStart w:id="54" w:name="conclusion"/>
+    <w:bookmarkEnd w:id="56"/>
+    <w:bookmarkStart w:id="57" w:name="conclusion"/>
     <w:p>
       <w:pPr>
         <w:pStyle w:val="Heading2"/>
@@ -2897,11 +2996,11 @@
         <w:pStyle w:val="FirstParagraph"/>
       </w:pPr>
       <w:r>
-        <w:t xml:space="preserve">The phase is the unit on which central-valley culture history is built, and it carries a silent claim that assemblages grouped by seriation and spatial proximity record a bounded society. For the Parkin phase, that claim does not survive measurement. Parkin is the basin’s largest and tallest-mounded center. No line of evidence, settlement, exchange, or ceramic transmission marks it as the apex of a polity, and the greater similarity among nearby assemblages that defines the phase is reproduced by neutral drift on the basin’s geography, the ordinary residue of continuous interaction structured by where sites sit. A bounded interaction group would have a sharper structure than the measurements indicate, and Parkin sits across orderings as a transmission bridge rather than at the closed core of one. Extending the test to the wider valley, a decorated-ceramic boundary that exceeds drift appears only between the central-valley and lower-valley blocks, and even there, it is entangled with the early-to-late turnover of the class repertoire. It cannot yet be read as a synchronic social division. Posed in the culture historian’s own terms, against the other named phases of the valley, the Parkin phase itself shows at most a weak contrast at the edge of the drift null, robust to single-site removal but small and within the null’s reach (Figure S8). The phase, at the scale where it is drawn, is largely indistinguishable from spatially structured drift, which carries a consequence the discipline should weigh: a similarity cluster is not by itself a society, and before a phase is read as a social group, the record must be shown able to tell a real interaction boundary from drift on geography. That calibration, not the phase, provides the basis for an explanation of social structure. When applied to the late pre-contact ceramics of the Mississippi Valley, it shows continuous interaction with prominent nodes rather than a mosaic of bounded polities.</w:t>
-      </w:r>
-    </w:p>
-    <w:bookmarkEnd w:id="54"/>
-    <w:bookmarkStart w:id="55" w:name="data-and-code-availability"/>
+        <w:t xml:space="preserve">The phase is the unit on which central-valley culture history is built, and it carries a silent claim that assemblages grouped by seriation and spatial proximity record a bounded society. For the Parkin phase, that claim does not survive measurement. Parkin is the basin’s largest and tallest-mounded center. No line of evidence, settlement, exchange, or ceramic transmission marks it as the apex of a polity, and the greater similarity among nearby assemblages that defines the phase is reproduced by neutral drift on the basin’s geography, the ordinary residue of continuous interaction structured by where sites sit. A bounded interaction group would have a sharper structure than the measurements indicate, and Parkin sits across orderings as a transmission bridge rather than at the closed core of one. Extending the test to the wider valley, a decorated-ceramic boundary that exceeds drift appears only between the central-valley and lower-valley blocks, and even there, it is entangled with the early-to-late turnover of the class repertoire. It cannot yet be read as a synchronic social division. Posed in the culture historian’s own terms, against the other named phases of the valley, the Parkin phase itself shows at most a weak contrast at the edge of the drift null, robust to single-site removal but small and within the null’s reach (Figure 9). The phase, at the scale where it is drawn, is largely indistinguishable from spatially structured drift, which carries a consequence the discipline should weigh: a similarity cluster is not by itself a society, and before a phase is read as a social group, the record must be shown able to tell a real interaction boundary from drift on geography. That calibration, not the phase, provides the basis for an explanation of social structure. When applied to the late pre-contact ceramics of the Mississippi Valley, it shows continuous interaction with prominent nodes rather than a mosaic of bounded polities.</w:t>
+      </w:r>
+    </w:p>
+    <w:bookmarkEnd w:id="57"/>
+    <w:bookmarkStart w:id="58" w:name="data-and-code-availability"/>
     <w:p>
       <w:pPr>
         <w:pStyle w:val="Heading2"/>
@@ -2918,8 +3017,8 @@
         <w:t xml:space="preserve">All data and code needed to reproduce the analyses and figures reported here are openly available at https://github.com/clipo/phases. The repository includes the decorated-ceramic class counts, the georeferencing and radiocarbon data, the complete analysis procedure, and instructions for reproducing all results and figures. The code is released under the MIT License, and the data under a Creative Commons Attribution 4.0 International license.</w:t>
       </w:r>
     </w:p>
-    <w:bookmarkEnd w:id="55"/>
-    <w:bookmarkStart w:id="234" w:name="references"/>
+    <w:bookmarkEnd w:id="58"/>
+    <w:bookmarkStart w:id="237" w:name="references"/>
     <w:p>
       <w:pPr>
         <w:pStyle w:val="Heading2"/>
@@ -2928,8 +3027,8 @@
         <w:t xml:space="preserve">References</w:t>
       </w:r>
     </w:p>
-    <w:bookmarkStart w:id="233" w:name="refs"/>
-    <w:bookmarkStart w:id="56" w:name="ref-anderson_1996"/>
+    <w:bookmarkStart w:id="236" w:name="refs"/>
+    <w:bookmarkStart w:id="59" w:name="ref-anderson_1996"/>
     <w:p>
       <w:pPr>
         <w:pStyle w:val="Bibliography"/>
@@ -2951,8 +3050,8 @@
         <w:t xml:space="preserve">, edited by John F. Scarry, pp. 231–252. University Press of Florida, Gainesville.</w:t>
       </w:r>
     </w:p>
-    <w:bookmarkEnd w:id="56"/>
-    <w:bookmarkStart w:id="58" w:name="ref-bailey_2007"/>
+    <w:bookmarkEnd w:id="59"/>
+    <w:bookmarkStart w:id="61" w:name="ref-bailey_2007"/>
     <w:p>
       <w:pPr>
         <w:pStyle w:val="Bibliography"/>
@@ -2979,7 +3078,7 @@
       <w:r>
         <w:t xml:space="preserve"> </w:t>
       </w:r>
-      <w:hyperlink r:id="rId57">
+      <w:hyperlink r:id="rId60">
         <w:r>
           <w:rPr>
             <w:rStyle w:val="Hyperlink"/>
@@ -2991,8 +3090,8 @@
         <w:t xml:space="preserve">.</w:t>
       </w:r>
     </w:p>
-    <w:bookmarkEnd w:id="58"/>
-    <w:bookmarkStart w:id="60" w:name="ref-barrett_2019"/>
+    <w:bookmarkEnd w:id="61"/>
+    <w:bookmarkStart w:id="63" w:name="ref-barrett_2019"/>
     <w:p>
       <w:pPr>
         <w:pStyle w:val="Bibliography"/>
@@ -3019,7 +3118,7 @@
       <w:r>
         <w:t xml:space="preserve"> </w:t>
       </w:r>
-      <w:hyperlink r:id="rId59">
+      <w:hyperlink r:id="rId62">
         <w:r>
           <w:rPr>
             <w:rStyle w:val="Hyperlink"/>
@@ -3031,8 +3130,8 @@
         <w:t xml:space="preserve">.</w:t>
       </w:r>
     </w:p>
-    <w:bookmarkEnd w:id="60"/>
-    <w:bookmarkStart w:id="62" w:name="ref-barton_1996"/>
+    <w:bookmarkEnd w:id="63"/>
+    <w:bookmarkStart w:id="65" w:name="ref-barton_1996"/>
     <w:p>
       <w:pPr>
         <w:pStyle w:val="Bibliography"/>
@@ -3059,7 +3158,7 @@
       <w:r>
         <w:t xml:space="preserve"> </w:t>
       </w:r>
-      <w:hyperlink r:id="rId61">
+      <w:hyperlink r:id="rId64">
         <w:r>
           <w:rPr>
             <w:rStyle w:val="Hyperlink"/>
@@ -3071,8 +3170,8 @@
         <w:t xml:space="preserve">.</w:t>
       </w:r>
     </w:p>
-    <w:bookmarkEnd w:id="62"/>
-    <w:bookmarkStart w:id="63" w:name="ref-baxter_1994"/>
+    <w:bookmarkEnd w:id="65"/>
+    <w:bookmarkStart w:id="66" w:name="ref-baxter_1994"/>
     <w:p>
       <w:pPr>
         <w:pStyle w:val="Bibliography"/>
@@ -3094,8 +3193,8 @@
         <w:t xml:space="preserve">. Edinburgh University Press, Edinburgh.</w:t>
       </w:r>
     </w:p>
-    <w:bookmarkEnd w:id="63"/>
-    <w:bookmarkStart w:id="65" w:name="ref-beck_2003"/>
+    <w:bookmarkEnd w:id="66"/>
+    <w:bookmarkStart w:id="68" w:name="ref-beck_2003"/>
     <w:p>
       <w:pPr>
         <w:pStyle w:val="Bibliography"/>
@@ -3134,7 +3233,7 @@
       <w:r>
         <w:t xml:space="preserve"> </w:t>
       </w:r>
-      <w:hyperlink r:id="rId64">
+      <w:hyperlink r:id="rId67">
         <w:r>
           <w:rPr>
             <w:rStyle w:val="Hyperlink"/>
@@ -3146,8 +3245,8 @@
         <w:t xml:space="preserve">.</w:t>
       </w:r>
     </w:p>
-    <w:bookmarkEnd w:id="65"/>
-    <w:bookmarkStart w:id="67" w:name="ref-behrensmeyer_kidwell_gastaldo_2000"/>
+    <w:bookmarkEnd w:id="68"/>
+    <w:bookmarkStart w:id="70" w:name="ref-behrensmeyer_kidwell_gastaldo_2000"/>
     <w:p>
       <w:pPr>
         <w:pStyle w:val="Bibliography"/>
@@ -3174,7 +3273,7 @@
       <w:r>
         <w:t xml:space="preserve"> </w:t>
       </w:r>
-      <w:hyperlink r:id="rId66">
+      <w:hyperlink r:id="rId69">
         <w:r>
           <w:rPr>
             <w:rStyle w:val="Hyperlink"/>
@@ -3186,8 +3285,8 @@
         <w:t xml:space="preserve">.</w:t>
       </w:r>
     </w:p>
-    <w:bookmarkEnd w:id="67"/>
-    <w:bookmarkStart w:id="69" w:name="ref-bell_richerson_mcelreath_2009"/>
+    <w:bookmarkEnd w:id="70"/>
+    <w:bookmarkStart w:id="72" w:name="ref-bell_richerson_mcelreath_2009"/>
     <w:p>
       <w:pPr>
         <w:pStyle w:val="Bibliography"/>
@@ -3214,7 +3313,7 @@
       <w:r>
         <w:t xml:space="preserve"> </w:t>
       </w:r>
-      <w:hyperlink r:id="rId68">
+      <w:hyperlink r:id="rId71">
         <w:r>
           <w:rPr>
             <w:rStyle w:val="Hyperlink"/>
@@ -3226,8 +3325,8 @@
         <w:t xml:space="preserve">.</w:t>
       </w:r>
     </w:p>
-    <w:bookmarkEnd w:id="69"/>
-    <w:bookmarkStart w:id="71" w:name="ref-bentley_2008"/>
+    <w:bookmarkEnd w:id="72"/>
+    <w:bookmarkStart w:id="74" w:name="ref-bentley_2008"/>
     <w:p>
       <w:pPr>
         <w:pStyle w:val="Bibliography"/>
@@ -3254,7 +3353,7 @@
       <w:r>
         <w:t xml:space="preserve"> </w:t>
       </w:r>
-      <w:hyperlink r:id="rId70">
+      <w:hyperlink r:id="rId73">
         <w:r>
           <w:rPr>
             <w:rStyle w:val="Hyperlink"/>
@@ -3266,8 +3365,8 @@
         <w:t xml:space="preserve">.</w:t>
       </w:r>
     </w:p>
-    <w:bookmarkEnd w:id="71"/>
-    <w:bookmarkStart w:id="73" w:name="ref-bentley_hahn_shennan_2004"/>
+    <w:bookmarkEnd w:id="74"/>
+    <w:bookmarkStart w:id="76" w:name="ref-bentley_hahn_shennan_2004"/>
     <w:p>
       <w:pPr>
         <w:pStyle w:val="Bibliography"/>
@@ -3294,7 +3393,7 @@
       <w:r>
         <w:t xml:space="preserve"> </w:t>
       </w:r>
-      <w:hyperlink r:id="rId72">
+      <w:hyperlink r:id="rId75">
         <w:r>
           <w:rPr>
             <w:rStyle w:val="Hyperlink"/>
@@ -3306,8 +3405,8 @@
         <w:t xml:space="preserve">.</w:t>
       </w:r>
     </w:p>
-    <w:bookmarkEnd w:id="73"/>
-    <w:bookmarkStart w:id="74" w:name="ref-binford_1981"/>
+    <w:bookmarkEnd w:id="76"/>
+    <w:bookmarkStart w:id="77" w:name="ref-binford_1981"/>
     <w:p>
       <w:pPr>
         <w:pStyle w:val="Bibliography"/>
@@ -3347,8 +3446,8 @@
         <w:t xml:space="preserve">37(3):195–208.</w:t>
       </w:r>
     </w:p>
-    <w:bookmarkEnd w:id="74"/>
-    <w:bookmarkStart w:id="76" w:name="ref-blitz_1999"/>
+    <w:bookmarkEnd w:id="77"/>
+    <w:bookmarkStart w:id="79" w:name="ref-blitz_1999"/>
     <w:p>
       <w:pPr>
         <w:pStyle w:val="Bibliography"/>
@@ -3387,7 +3486,7 @@
       <w:r>
         <w:t xml:space="preserve"> </w:t>
       </w:r>
-      <w:hyperlink r:id="rId75">
+      <w:hyperlink r:id="rId78">
         <w:r>
           <w:rPr>
             <w:rStyle w:val="Hyperlink"/>
@@ -3399,8 +3498,8 @@
         <w:t xml:space="preserve">.</w:t>
       </w:r>
     </w:p>
-    <w:bookmarkEnd w:id="76"/>
-    <w:bookmarkStart w:id="77" w:name="ref-brainerd_1951"/>
+    <w:bookmarkEnd w:id="79"/>
+    <w:bookmarkStart w:id="80" w:name="ref-brainerd_1951"/>
     <w:p>
       <w:pPr>
         <w:pStyle w:val="Bibliography"/>
@@ -3425,8 +3524,8 @@
         <w:t xml:space="preserve">16(4):301–313.</w:t>
       </w:r>
     </w:p>
-    <w:bookmarkEnd w:id="77"/>
-    <w:bookmarkStart w:id="79" w:name="ref-carrignon_bentley_ruck_2019"/>
+    <w:bookmarkEnd w:id="80"/>
+    <w:bookmarkStart w:id="82" w:name="ref-carrignon_bentley_ruck_2019"/>
     <w:p>
       <w:pPr>
         <w:pStyle w:val="Bibliography"/>
@@ -3477,7 +3576,7 @@
       <w:r>
         <w:t xml:space="preserve"> </w:t>
       </w:r>
-      <w:hyperlink r:id="rId78">
+      <w:hyperlink r:id="rId81">
         <w:r>
           <w:rPr>
             <w:rStyle w:val="Hyperlink"/>
@@ -3489,8 +3588,8 @@
         <w:t xml:space="preserve">.</w:t>
       </w:r>
     </w:p>
-    <w:bookmarkEnd w:id="79"/>
-    <w:bookmarkStart w:id="80" w:name="ref-cobb_2000"/>
+    <w:bookmarkEnd w:id="82"/>
+    <w:bookmarkStart w:id="83" w:name="ref-cobb_2000"/>
     <w:p>
       <w:pPr>
         <w:pStyle w:val="Bibliography"/>
@@ -3540,8 +3639,8 @@
         <w:t xml:space="preserve">. University of Alabama Press, Tuscaloosa.</w:t>
       </w:r>
     </w:p>
-    <w:bookmarkEnd w:id="80"/>
-    <w:bookmarkStart w:id="81" w:name="ref-cobb_butler_2002"/>
+    <w:bookmarkEnd w:id="83"/>
+    <w:bookmarkStart w:id="84" w:name="ref-cobb_butler_2002"/>
     <w:p>
       <w:pPr>
         <w:pStyle w:val="Bibliography"/>
@@ -3590,8 +3689,8 @@
         <w:t xml:space="preserve">67(4):625–641.</w:t>
       </w:r>
     </w:p>
-    <w:bookmarkEnd w:id="81"/>
-    <w:bookmarkStart w:id="83" w:name="ref-cobb_etal_2024"/>
+    <w:bookmarkEnd w:id="84"/>
+    <w:bookmarkStart w:id="86" w:name="ref-cobb_etal_2024"/>
     <w:p>
       <w:pPr>
         <w:pStyle w:val="Bibliography"/>
@@ -3639,7 +3738,7 @@
       <w:r>
         <w:t xml:space="preserve"> </w:t>
       </w:r>
-      <w:hyperlink r:id="rId82">
+      <w:hyperlink r:id="rId85">
         <w:r>
           <w:rPr>
             <w:rStyle w:val="Hyperlink"/>
@@ -3651,8 +3750,8 @@
         <w:t xml:space="preserve">.</w:t>
       </w:r>
     </w:p>
-    <w:bookmarkEnd w:id="83"/>
-    <w:bookmarkStart w:id="85" w:name="ref-coco_iovita_2020"/>
+    <w:bookmarkEnd w:id="86"/>
+    <w:bookmarkStart w:id="88" w:name="ref-coco_iovita_2020"/>
     <w:p>
       <w:pPr>
         <w:pStyle w:val="Bibliography"/>
@@ -3679,7 +3778,7 @@
       <w:r>
         <w:t xml:space="preserve"> </w:t>
       </w:r>
-      <w:hyperlink r:id="rId84">
+      <w:hyperlink r:id="rId87">
         <w:r>
           <w:rPr>
             <w:rStyle w:val="Hyperlink"/>
@@ -3691,8 +3790,8 @@
         <w:t xml:space="preserve">.</w:t>
       </w:r>
     </w:p>
-    <w:bookmarkEnd w:id="85"/>
-    <w:bookmarkStart w:id="87" w:name="ref-crema_bortolini_lake_2023"/>
+    <w:bookmarkEnd w:id="88"/>
+    <w:bookmarkStart w:id="90" w:name="ref-crema_bortolini_lake_2023"/>
     <w:p>
       <w:pPr>
         <w:pStyle w:val="Bibliography"/>
@@ -3719,7 +3818,7 @@
       <w:r>
         <w:t xml:space="preserve"> </w:t>
       </w:r>
-      <w:hyperlink r:id="rId86">
+      <w:hyperlink r:id="rId89">
         <w:r>
           <w:rPr>
             <w:rStyle w:val="Hyperlink"/>
@@ -3731,8 +3830,8 @@
         <w:t xml:space="preserve">.</w:t>
       </w:r>
     </w:p>
-    <w:bookmarkEnd w:id="87"/>
-    <w:bookmarkStart w:id="89" w:name="ref-crema_edinborough_kerig_shennan_2014"/>
+    <w:bookmarkEnd w:id="90"/>
+    <w:bookmarkStart w:id="92" w:name="ref-crema_edinborough_kerig_shennan_2014"/>
     <w:p>
       <w:pPr>
         <w:pStyle w:val="Bibliography"/>
@@ -3771,7 +3870,7 @@
       <w:r>
         <w:t xml:space="preserve"> </w:t>
       </w:r>
-      <w:hyperlink r:id="rId88">
+      <w:hyperlink r:id="rId91">
         <w:r>
           <w:rPr>
             <w:rStyle w:val="Hyperlink"/>
@@ -3783,8 +3882,8 @@
         <w:t xml:space="preserve">.</w:t>
       </w:r>
     </w:p>
-    <w:bookmarkEnd w:id="89"/>
-    <w:bookmarkStart w:id="91" w:name="ref-crema_kandler_shennan_2016"/>
+    <w:bookmarkEnd w:id="92"/>
+    <w:bookmarkStart w:id="94" w:name="ref-crema_kandler_shennan_2016"/>
     <w:p>
       <w:pPr>
         <w:pStyle w:val="Bibliography"/>
@@ -3811,7 +3910,7 @@
       <w:r>
         <w:t xml:space="preserve"> </w:t>
       </w:r>
-      <w:hyperlink r:id="rId90">
+      <w:hyperlink r:id="rId93">
         <w:r>
           <w:rPr>
             <w:rStyle w:val="Hyperlink"/>
@@ -3823,8 +3922,8 @@
         <w:t xml:space="preserve">.</w:t>
       </w:r>
     </w:p>
-    <w:bookmarkEnd w:id="91"/>
-    <w:bookmarkStart w:id="93" w:name="ref-dakos_2012"/>
+    <w:bookmarkEnd w:id="94"/>
+    <w:bookmarkStart w:id="96" w:name="ref-dakos_2012"/>
     <w:p>
       <w:pPr>
         <w:pStyle w:val="Bibliography"/>
@@ -3851,7 +3950,7 @@
       <w:r>
         <w:t xml:space="preserve"> </w:t>
       </w:r>
-      <w:hyperlink r:id="rId92">
+      <w:hyperlink r:id="rId95">
         <w:r>
           <w:rPr>
             <w:rStyle w:val="Hyperlink"/>
@@ -3863,8 +3962,8 @@
         <w:t xml:space="preserve">.</w:t>
       </w:r>
     </w:p>
-    <w:bookmarkEnd w:id="93"/>
-    <w:bookmarkStart w:id="95" w:name="ref-derex_boyd_2016"/>
+    <w:bookmarkEnd w:id="96"/>
+    <w:bookmarkStart w:id="98" w:name="ref-derex_boyd_2016"/>
     <w:p>
       <w:pPr>
         <w:pStyle w:val="Bibliography"/>
@@ -3891,7 +3990,7 @@
       <w:r>
         <w:t xml:space="preserve"> </w:t>
       </w:r>
-      <w:hyperlink r:id="rId94">
+      <w:hyperlink r:id="rId97">
         <w:r>
           <w:rPr>
             <w:rStyle w:val="Hyperlink"/>
@@ -3903,8 +4002,8 @@
         <w:t xml:space="preserve">.</w:t>
       </w:r>
     </w:p>
-    <w:bookmarkEnd w:id="95"/>
-    <w:bookmarkStart w:id="97" w:name="ref-derex_perreault_boyd_2018"/>
+    <w:bookmarkEnd w:id="98"/>
+    <w:bookmarkStart w:id="100" w:name="ref-derex_perreault_boyd_2018"/>
     <w:p>
       <w:pPr>
         <w:pStyle w:val="Bibliography"/>
@@ -3931,7 +4030,7 @@
       <w:r>
         <w:t xml:space="preserve"> </w:t>
       </w:r>
-      <w:hyperlink r:id="rId96">
+      <w:hyperlink r:id="rId99">
         <w:r>
           <w:rPr>
             <w:rStyle w:val="Hyperlink"/>
@@ -3943,8 +4042,8 @@
         <w:t xml:space="preserve">.</w:t>
       </w:r>
     </w:p>
-    <w:bookmarkEnd w:id="97"/>
-    <w:bookmarkStart w:id="99" w:name="ref-dunnell_1970"/>
+    <w:bookmarkEnd w:id="100"/>
+    <w:bookmarkStart w:id="102" w:name="ref-dunnell_1970"/>
     <w:p>
       <w:pPr>
         <w:pStyle w:val="Bibliography"/>
@@ -3971,7 +4070,7 @@
       <w:r>
         <w:t xml:space="preserve"> </w:t>
       </w:r>
-      <w:hyperlink r:id="rId98">
+      <w:hyperlink r:id="rId101">
         <w:r>
           <w:rPr>
             <w:rStyle w:val="Hyperlink"/>
@@ -3983,8 +4082,8 @@
         <w:t xml:space="preserve">.</w:t>
       </w:r>
     </w:p>
-    <w:bookmarkEnd w:id="99"/>
-    <w:bookmarkStart w:id="101" w:name="ref-dunnell_1978"/>
+    <w:bookmarkEnd w:id="102"/>
+    <w:bookmarkStart w:id="104" w:name="ref-dunnell_1978"/>
     <w:p>
       <w:pPr>
         <w:pStyle w:val="Bibliography"/>
@@ -4011,7 +4110,7 @@
       <w:r>
         <w:t xml:space="preserve"> </w:t>
       </w:r>
-      <w:hyperlink r:id="rId100">
+      <w:hyperlink r:id="rId103">
         <w:r>
           <w:rPr>
             <w:rStyle w:val="Hyperlink"/>
@@ -4023,8 +4122,8 @@
         <w:t xml:space="preserve">.</w:t>
       </w:r>
     </w:p>
-    <w:bookmarkEnd w:id="101"/>
-    <w:bookmarkStart w:id="102" w:name="ref-dunnell_1980"/>
+    <w:bookmarkEnd w:id="104"/>
+    <w:bookmarkStart w:id="105" w:name="ref-dunnell_1980"/>
     <w:p>
       <w:pPr>
         <w:pStyle w:val="Bibliography"/>
@@ -4046,8 +4145,8 @@
         <w:t xml:space="preserve">, edited by Michael B. Schiffer, pp. 35–99. Academic Press, New York.</w:t>
       </w:r>
     </w:p>
-    <w:bookmarkEnd w:id="102"/>
-    <w:bookmarkStart w:id="103" w:name="ref-dunnell_1995"/>
+    <w:bookmarkEnd w:id="105"/>
+    <w:bookmarkStart w:id="106" w:name="ref-dunnell_1995"/>
     <w:p>
       <w:pPr>
         <w:pStyle w:val="Bibliography"/>
@@ -4069,8 +4168,8 @@
         <w:t xml:space="preserve">, edited by Patrice A. Teltser, pp. 33–50. University of Arizona Press, Tucson.</w:t>
       </w:r>
     </w:p>
-    <w:bookmarkEnd w:id="103"/>
-    <w:bookmarkStart w:id="104" w:name="ref-dye_cox_1990"/>
+    <w:bookmarkEnd w:id="106"/>
+    <w:bookmarkStart w:id="107" w:name="ref-dye_cox_1990"/>
     <w:p>
       <w:pPr>
         <w:pStyle w:val="Bibliography"/>
@@ -4106,8 +4205,8 @@
         <w:t xml:space="preserve">. University of Alabama Press, Tuscaloosa.</w:t>
       </w:r>
     </w:p>
-    <w:bookmarkEnd w:id="104"/>
-    <w:bookmarkStart w:id="106" w:name="ref-eerkens_lipo_2005"/>
+    <w:bookmarkEnd w:id="107"/>
+    <w:bookmarkStart w:id="109" w:name="ref-eerkens_lipo_2005"/>
     <w:p>
       <w:pPr>
         <w:pStyle w:val="Bibliography"/>
@@ -4134,7 +4233,7 @@
       <w:r>
         <w:t xml:space="preserve"> </w:t>
       </w:r>
-      <w:hyperlink r:id="rId105">
+      <w:hyperlink r:id="rId108">
         <w:r>
           <w:rPr>
             <w:rStyle w:val="Hyperlink"/>
@@ -4146,8 +4245,8 @@
         <w:t xml:space="preserve">.</w:t>
       </w:r>
     </w:p>
-    <w:bookmarkEnd w:id="106"/>
-    <w:bookmarkStart w:id="108" w:name="ref-eerkens_lipo_2007"/>
+    <w:bookmarkEnd w:id="109"/>
+    <w:bookmarkStart w:id="111" w:name="ref-eerkens_lipo_2007"/>
     <w:p>
       <w:pPr>
         <w:pStyle w:val="Bibliography"/>
@@ -4174,7 +4273,7 @@
       <w:r>
         <w:t xml:space="preserve"> </w:t>
       </w:r>
-      <w:hyperlink r:id="rId107">
+      <w:hyperlink r:id="rId110">
         <w:r>
           <w:rPr>
             <w:rStyle w:val="Hyperlink"/>
@@ -4186,8 +4285,8 @@
         <w:t xml:space="preserve">.</w:t>
       </w:r>
     </w:p>
-    <w:bookmarkEnd w:id="108"/>
-    <w:bookmarkStart w:id="109" w:name="ref-ewens_1972"/>
+    <w:bookmarkEnd w:id="111"/>
+    <w:bookmarkStart w:id="112" w:name="ref-ewens_1972"/>
     <w:p>
       <w:pPr>
         <w:pStyle w:val="Bibliography"/>
@@ -4212,8 +4311,8 @@
         <w:t xml:space="preserve">3(1):87–112.</w:t>
       </w:r>
     </w:p>
-    <w:bookmarkEnd w:id="109"/>
-    <w:bookmarkStart w:id="111" w:name="ref-feder_kryazhimskiy_plotkin_2014"/>
+    <w:bookmarkEnd w:id="112"/>
+    <w:bookmarkStart w:id="114" w:name="ref-feder_kryazhimskiy_plotkin_2014"/>
     <w:p>
       <w:pPr>
         <w:pStyle w:val="Bibliography"/>
@@ -4240,7 +4339,7 @@
       <w:r>
         <w:t xml:space="preserve"> </w:t>
       </w:r>
-      <w:hyperlink r:id="rId110">
+      <w:hyperlink r:id="rId113">
         <w:r>
           <w:rPr>
             <w:rStyle w:val="Hyperlink"/>
@@ -4252,8 +4351,8 @@
         <w:t xml:space="preserve">.</w:t>
       </w:r>
     </w:p>
-    <w:bookmarkEnd w:id="111"/>
-    <w:bookmarkStart w:id="113" w:name="ref-fogarty_kandler_creanza_2024"/>
+    <w:bookmarkEnd w:id="114"/>
+    <w:bookmarkStart w:id="116" w:name="ref-fogarty_kandler_creanza_2024"/>
     <w:p>
       <w:pPr>
         <w:pStyle w:val="Bibliography"/>
@@ -4280,7 +4379,7 @@
       <w:r>
         <w:t xml:space="preserve"> </w:t>
       </w:r>
-      <w:hyperlink r:id="rId112">
+      <w:hyperlink r:id="rId115">
         <w:r>
           <w:rPr>
             <w:rStyle w:val="Hyperlink"/>
@@ -4292,8 +4391,8 @@
         <w:t xml:space="preserve">.</w:t>
       </w:r>
     </w:p>
-    <w:bookmarkEnd w:id="113"/>
-    <w:bookmarkStart w:id="114" w:name="ref-fox_1998"/>
+    <w:bookmarkEnd w:id="116"/>
+    <w:bookmarkStart w:id="117" w:name="ref-fox_1998"/>
     <w:p>
       <w:pPr>
         <w:pStyle w:val="Bibliography"/>
@@ -4315,8 +4414,8 @@
         <w:t xml:space="preserve">, edited by Michael J. O’Brien and Robert C. Dunnell, pp. 31–58. University of Alabama Press, Tuscaloosa.</w:t>
       </w:r>
     </w:p>
-    <w:bookmarkEnd w:id="114"/>
-    <w:bookmarkStart w:id="115" w:name="ref-graves_cachola-abad_1996"/>
+    <w:bookmarkEnd w:id="117"/>
+    <w:bookmarkStart w:id="118" w:name="ref-graves_cachola-abad_1996"/>
     <w:p>
       <w:pPr>
         <w:pStyle w:val="Bibliography"/>
@@ -4350,8 +4449,8 @@
         <w:t xml:space="preserve">31(1):19–32.</w:t>
       </w:r>
     </w:p>
-    <w:bookmarkEnd w:id="115"/>
-    <w:bookmarkStart w:id="116" w:name="ref-hally_1993"/>
+    <w:bookmarkEnd w:id="118"/>
+    <w:bookmarkStart w:id="119" w:name="ref-hally_1993"/>
     <w:p>
       <w:pPr>
         <w:pStyle w:val="Bibliography"/>
@@ -4385,8 +4484,8 @@
         <w:t xml:space="preserve">, edited by James B. Stoltman, pp. 143–167. Archaeological Report No. 25. Mississippi Department of Archives; History, Jackson.</w:t>
       </w:r>
     </w:p>
-    <w:bookmarkEnd w:id="116"/>
-    <w:bookmarkStart w:id="117" w:name="ref-hally_1996"/>
+    <w:bookmarkEnd w:id="119"/>
+    <w:bookmarkStart w:id="120" w:name="ref-hally_1996"/>
     <w:p>
       <w:pPr>
         <w:pStyle w:val="Bibliography"/>
@@ -4420,8 +4519,8 @@
         <w:t xml:space="preserve">, edited by John F. Scarry, pp. 92–127. University Press of Florida, Gainesville.</w:t>
       </w:r>
     </w:p>
-    <w:bookmarkEnd w:id="117"/>
-    <w:bookmarkStart w:id="119" w:name="ref-henrich_2001"/>
+    <w:bookmarkEnd w:id="120"/>
+    <w:bookmarkStart w:id="122" w:name="ref-henrich_2001"/>
     <w:p>
       <w:pPr>
         <w:pStyle w:val="Bibliography"/>
@@ -4448,7 +4547,7 @@
       <w:r>
         <w:t xml:space="preserve"> </w:t>
       </w:r>
-      <w:hyperlink r:id="rId118">
+      <w:hyperlink r:id="rId121">
         <w:r>
           <w:rPr>
             <w:rStyle w:val="Hyperlink"/>
@@ -4460,8 +4559,8 @@
         <w:t xml:space="preserve">.</w:t>
       </w:r>
     </w:p>
-    <w:bookmarkEnd w:id="119"/>
-    <w:bookmarkStart w:id="121" w:name="ref-henrich_2004"/>
+    <w:bookmarkEnd w:id="122"/>
+    <w:bookmarkStart w:id="124" w:name="ref-henrich_2004"/>
     <w:p>
       <w:pPr>
         <w:pStyle w:val="Bibliography"/>
@@ -4500,7 +4599,7 @@
       <w:r>
         <w:t xml:space="preserve"> </w:t>
       </w:r>
-      <w:hyperlink r:id="rId120">
+      <w:hyperlink r:id="rId123">
         <w:r>
           <w:rPr>
             <w:rStyle w:val="Hyperlink"/>
@@ -4512,8 +4611,8 @@
         <w:t xml:space="preserve">.</w:t>
       </w:r>
     </w:p>
-    <w:bookmarkEnd w:id="121"/>
-    <w:bookmarkStart w:id="123" w:name="ref-henrich_boyd_1998"/>
+    <w:bookmarkEnd w:id="124"/>
+    <w:bookmarkStart w:id="126" w:name="ref-henrich_boyd_1998"/>
     <w:p>
       <w:pPr>
         <w:pStyle w:val="Bibliography"/>
@@ -4540,7 +4639,7 @@
       <w:r>
         <w:t xml:space="preserve"> </w:t>
       </w:r>
-      <w:hyperlink r:id="rId122">
+      <w:hyperlink r:id="rId125">
         <w:r>
           <w:rPr>
             <w:rStyle w:val="Hyperlink"/>
@@ -4552,8 +4651,8 @@
         <w:t xml:space="preserve">.</w:t>
       </w:r>
     </w:p>
-    <w:bookmarkEnd w:id="123"/>
-    <w:bookmarkStart w:id="124" w:name="ref-holdaway_wandsnider_2008"/>
+    <w:bookmarkEnd w:id="126"/>
+    <w:bookmarkStart w:id="127" w:name="ref-holdaway_wandsnider_2008"/>
     <w:p>
       <w:pPr>
         <w:pStyle w:val="Bibliography"/>
@@ -4575,8 +4674,8 @@
         <w:t xml:space="preserve">. University of Utah Press, Salt Lake City.</w:t>
       </w:r>
     </w:p>
-    <w:bookmarkEnd w:id="124"/>
-    <w:bookmarkStart w:id="126" w:name="ref-holland-lulewicz_ritchison_2021"/>
+    <w:bookmarkEnd w:id="127"/>
+    <w:bookmarkStart w:id="129" w:name="ref-holland-lulewicz_ritchison_2021"/>
     <w:p>
       <w:pPr>
         <w:pStyle w:val="Bibliography"/>
@@ -4603,7 +4702,7 @@
       <w:r>
         <w:t xml:space="preserve"> </w:t>
       </w:r>
-      <w:hyperlink r:id="rId125">
+      <w:hyperlink r:id="rId128">
         <w:r>
           <w:rPr>
             <w:rStyle w:val="Hyperlink"/>
@@ -4615,8 +4714,8 @@
         <w:t xml:space="preserve">.</w:t>
       </w:r>
     </w:p>
-    <w:bookmarkEnd w:id="126"/>
-    <w:bookmarkStart w:id="127" w:name="ref-house_1993"/>
+    <w:bookmarkEnd w:id="129"/>
+    <w:bookmarkStart w:id="130" w:name="ref-house_1993"/>
     <w:p>
       <w:pPr>
         <w:pStyle w:val="Bibliography"/>
@@ -4641,8 +4740,8 @@
         <w:t xml:space="preserve">12(1):21–32.</w:t>
       </w:r>
     </w:p>
-    <w:bookmarkEnd w:id="127"/>
-    <w:bookmarkStart w:id="128" w:name="ref-hudson_smith_depratter_1990"/>
+    <w:bookmarkEnd w:id="130"/>
+    <w:bookmarkStart w:id="131" w:name="ref-hudson_smith_depratter_1990"/>
     <w:p>
       <w:pPr>
         <w:pStyle w:val="Bibliography"/>
@@ -4702,8 +4801,8 @@
         <w:t xml:space="preserve">, edited by David H. Dye and Cheryl Anne Cox, pp. 181–207. University of Alabama Press, Tuscaloosa.</w:t>
       </w:r>
     </w:p>
-    <w:bookmarkEnd w:id="128"/>
-    <w:bookmarkStart w:id="130" w:name="ref-hunt_2006"/>
+    <w:bookmarkEnd w:id="131"/>
+    <w:bookmarkStart w:id="133" w:name="ref-hunt_2006"/>
     <w:p>
       <w:pPr>
         <w:pStyle w:val="Bibliography"/>
@@ -4730,7 +4829,7 @@
       <w:r>
         <w:t xml:space="preserve"> </w:t>
       </w:r>
-      <w:hyperlink r:id="rId129">
+      <w:hyperlink r:id="rId132">
         <w:r>
           <w:rPr>
             <w:rStyle w:val="Hyperlink"/>
@@ -4742,8 +4841,8 @@
         <w:t xml:space="preserve">.</w:t>
       </w:r>
     </w:p>
-    <w:bookmarkEnd w:id="130"/>
-    <w:bookmarkStart w:id="132" w:name="ref-hunt_bell_travis_2008"/>
+    <w:bookmarkEnd w:id="133"/>
+    <w:bookmarkStart w:id="135" w:name="ref-hunt_bell_travis_2008"/>
     <w:p>
       <w:pPr>
         <w:pStyle w:val="Bibliography"/>
@@ -4770,7 +4869,7 @@
       <w:r>
         <w:t xml:space="preserve"> </w:t>
       </w:r>
-      <w:hyperlink r:id="rId131">
+      <w:hyperlink r:id="rId134">
         <w:r>
           <w:rPr>
             <w:rStyle w:val="Hyperlink"/>
@@ -4782,8 +4881,8 @@
         <w:t xml:space="preserve">.</w:t>
       </w:r>
     </w:p>
-    <w:bookmarkEnd w:id="132"/>
-    <w:bookmarkStart w:id="133" w:name="ref-hurlbert_1971"/>
+    <w:bookmarkEnd w:id="135"/>
+    <w:bookmarkStart w:id="136" w:name="ref-hurlbert_1971"/>
     <w:p>
       <w:pPr>
         <w:pStyle w:val="Bibliography"/>
@@ -4808,8 +4907,8 @@
         <w:t xml:space="preserve">52(4):577–586.</w:t>
       </w:r>
     </w:p>
-    <w:bookmarkEnd w:id="133"/>
-    <w:bookmarkStart w:id="135" w:name="ref-kandler_shennan_2013"/>
+    <w:bookmarkEnd w:id="136"/>
+    <w:bookmarkStart w:id="138" w:name="ref-kandler_shennan_2013"/>
     <w:p>
       <w:pPr>
         <w:pStyle w:val="Bibliography"/>
@@ -4836,7 +4935,7 @@
       <w:r>
         <w:t xml:space="preserve"> </w:t>
       </w:r>
-      <w:hyperlink r:id="rId134">
+      <w:hyperlink r:id="rId137">
         <w:r>
           <w:rPr>
             <w:rStyle w:val="Hyperlink"/>
@@ -4848,8 +4947,8 @@
         <w:t xml:space="preserve">.</w:t>
       </w:r>
     </w:p>
-    <w:bookmarkEnd w:id="135"/>
-    <w:bookmarkStart w:id="137" w:name="ref-kandler_shennan_2015"/>
+    <w:bookmarkEnd w:id="138"/>
+    <w:bookmarkStart w:id="140" w:name="ref-kandler_shennan_2015"/>
     <w:p>
       <w:pPr>
         <w:pStyle w:val="Bibliography"/>
@@ -4888,7 +4987,7 @@
       <w:r>
         <w:t xml:space="preserve"> </w:t>
       </w:r>
-      <w:hyperlink r:id="rId136">
+      <w:hyperlink r:id="rId139">
         <w:r>
           <w:rPr>
             <w:rStyle w:val="Hyperlink"/>
@@ -4900,8 +4999,8 @@
         <w:t xml:space="preserve">.</w:t>
       </w:r>
     </w:p>
-    <w:bookmarkEnd w:id="137"/>
-    <w:bookmarkStart w:id="139" w:name="ref-kandler_wilder_fortunato_2017"/>
+    <w:bookmarkEnd w:id="140"/>
+    <w:bookmarkStart w:id="142" w:name="ref-kandler_wilder_fortunato_2017"/>
     <w:p>
       <w:pPr>
         <w:pStyle w:val="Bibliography"/>
@@ -4928,7 +5027,7 @@
       <w:r>
         <w:t xml:space="preserve"> </w:t>
       </w:r>
-      <w:hyperlink r:id="rId138">
+      <w:hyperlink r:id="rId141">
         <w:r>
           <w:rPr>
             <w:rStyle w:val="Hyperlink"/>
@@ -4940,8 +5039,8 @@
         <w:t xml:space="preserve">.</w:t>
       </w:r>
     </w:p>
-    <w:bookmarkEnd w:id="139"/>
-    <w:bookmarkStart w:id="141" w:name="ref-kidwell_tomasovych_2013"/>
+    <w:bookmarkEnd w:id="142"/>
+    <w:bookmarkStart w:id="144" w:name="ref-kidwell_tomasovych_2013"/>
     <w:p>
       <w:pPr>
         <w:pStyle w:val="Bibliography"/>
@@ -4968,7 +5067,7 @@
       <w:r>
         <w:t xml:space="preserve"> </w:t>
       </w:r>
-      <w:hyperlink r:id="rId140">
+      <w:hyperlink r:id="rId143">
         <w:r>
           <w:rPr>
             <w:rStyle w:val="Hyperlink"/>
@@ -4980,8 +5079,8 @@
         <w:t xml:space="preserve">.</w:t>
       </w:r>
     </w:p>
-    <w:bookmarkEnd w:id="141"/>
-    <w:bookmarkStart w:id="142" w:name="ref-king_freer_1995"/>
+    <w:bookmarkEnd w:id="144"/>
+    <w:bookmarkStart w:id="145" w:name="ref-king_freer_1995"/>
     <w:p>
       <w:pPr>
         <w:pStyle w:val="Bibliography"/>
@@ -5015,8 +5114,8 @@
         <w:t xml:space="preserve">, edited by Michael S. Nassaney and Kenneth E. Sassaman, pp. 266–288. University of Tennessee Press, Knoxville.</w:t>
       </w:r>
     </w:p>
-    <w:bookmarkEnd w:id="142"/>
-    <w:bookmarkStart w:id="144" w:name="ref-ladefoged_graves_2000"/>
+    <w:bookmarkEnd w:id="145"/>
+    <w:bookmarkStart w:id="147" w:name="ref-ladefoged_graves_2000"/>
     <w:p>
       <w:pPr>
         <w:pStyle w:val="Bibliography"/>
@@ -5061,7 +5160,7 @@
       <w:r>
         <w:t xml:space="preserve"> </w:t>
       </w:r>
-      <w:hyperlink r:id="rId143">
+      <w:hyperlink r:id="rId146">
         <w:r>
           <w:rPr>
             <w:rStyle w:val="Hyperlink"/>
@@ -5073,8 +5172,8 @@
         <w:t xml:space="preserve">.</w:t>
       </w:r>
     </w:p>
-    <w:bookmarkEnd w:id="144"/>
-    <w:bookmarkStart w:id="145" w:name="ref-lewontin_1974"/>
+    <w:bookmarkEnd w:id="147"/>
+    <w:bookmarkStart w:id="148" w:name="ref-lewontin_1974"/>
     <w:p>
       <w:pPr>
         <w:pStyle w:val="Bibliography"/>
@@ -5096,8 +5195,8 @@
         <w:t xml:space="preserve">. Columbia University Press, New York.</w:t>
       </w:r>
     </w:p>
-    <w:bookmarkEnd w:id="145"/>
-    <w:bookmarkStart w:id="146" w:name="ref-lipo_2001"/>
+    <w:bookmarkEnd w:id="148"/>
+    <w:bookmarkStart w:id="149" w:name="ref-lipo_2001"/>
     <w:p>
       <w:pPr>
         <w:pStyle w:val="Bibliography"/>
@@ -5147,8 +5246,8 @@
         <w:t xml:space="preserve">. BAR International Series 918. Archaeopress, Oxford.</w:t>
       </w:r>
     </w:p>
-    <w:bookmarkEnd w:id="146"/>
-    <w:bookmarkStart w:id="148" w:name="ref-lipo_dinapoli_madsen_hunt_2021"/>
+    <w:bookmarkEnd w:id="149"/>
+    <w:bookmarkStart w:id="151" w:name="ref-lipo_dinapoli_madsen_hunt_2021"/>
     <w:p>
       <w:pPr>
         <w:pStyle w:val="Bibliography"/>
@@ -5175,7 +5274,7 @@
       <w:r>
         <w:t xml:space="preserve"> </w:t>
       </w:r>
-      <w:hyperlink r:id="rId147">
+      <w:hyperlink r:id="rId150">
         <w:r>
           <w:rPr>
             <w:rStyle w:val="Hyperlink"/>
@@ -5187,8 +5286,8 @@
         <w:t xml:space="preserve">.</w:t>
       </w:r>
     </w:p>
-    <w:bookmarkEnd w:id="148"/>
-    <w:bookmarkStart w:id="149" w:name="ref-lipo_dunnell_2007"/>
+    <w:bookmarkEnd w:id="151"/>
+    <w:bookmarkStart w:id="152" w:name="ref-lipo_dunnell_2007"/>
     <w:p>
       <w:pPr>
         <w:pStyle w:val="Bibliography"/>
@@ -5250,8 +5349,8 @@
         <w:t xml:space="preserve">, edited by Janet Rafferty and Evan Peacock, pp. 125–167. University of Alabama Press, Tuscaloosa.</w:t>
       </w:r>
     </w:p>
-    <w:bookmarkEnd w:id="149"/>
-    <w:bookmarkStart w:id="151" w:name="ref-lipo_hunt_hundtoft_2010"/>
+    <w:bookmarkEnd w:id="152"/>
+    <w:bookmarkStart w:id="154" w:name="ref-lipo_hunt_hundtoft_2010"/>
     <w:p>
       <w:pPr>
         <w:pStyle w:val="Bibliography"/>
@@ -5296,7 +5395,7 @@
       <w:r>
         <w:t xml:space="preserve"> </w:t>
       </w:r>
-      <w:hyperlink r:id="rId150">
+      <w:hyperlink r:id="rId153">
         <w:r>
           <w:rPr>
             <w:rStyle w:val="Hyperlink"/>
@@ -5308,8 +5407,8 @@
         <w:t xml:space="preserve">.</w:t>
       </w:r>
     </w:p>
-    <w:bookmarkEnd w:id="151"/>
-    <w:bookmarkStart w:id="153" w:name="ref-lipo_madsen_dunnell_2015"/>
+    <w:bookmarkEnd w:id="154"/>
+    <w:bookmarkStart w:id="156" w:name="ref-lipo_madsen_dunnell_2015"/>
     <w:p>
       <w:pPr>
         <w:pStyle w:val="Bibliography"/>
@@ -5336,7 +5435,7 @@
       <w:r>
         <w:t xml:space="preserve"> </w:t>
       </w:r>
-      <w:hyperlink r:id="rId152">
+      <w:hyperlink r:id="rId155">
         <w:r>
           <w:rPr>
             <w:rStyle w:val="Hyperlink"/>
@@ -5348,8 +5447,8 @@
         <w:t xml:space="preserve">.</w:t>
       </w:r>
     </w:p>
-    <w:bookmarkEnd w:id="153"/>
-    <w:bookmarkStart w:id="155" w:name="ref-lipo_madsen_dunnell_hunt_1997"/>
+    <w:bookmarkEnd w:id="156"/>
+    <w:bookmarkStart w:id="158" w:name="ref-lipo_madsen_dunnell_hunt_1997"/>
     <w:p>
       <w:pPr>
         <w:pStyle w:val="Bibliography"/>
@@ -5376,7 +5475,7 @@
       <w:r>
         <w:t xml:space="preserve"> </w:t>
       </w:r>
-      <w:hyperlink r:id="rId154">
+      <w:hyperlink r:id="rId157">
         <w:r>
           <w:rPr>
             <w:rStyle w:val="Hyperlink"/>
@@ -5388,8 +5487,8 @@
         <w:t xml:space="preserve">.</w:t>
       </w:r>
     </w:p>
-    <w:bookmarkEnd w:id="155"/>
-    <w:bookmarkStart w:id="157" w:name="ref-holland-lulewicz_2019"/>
+    <w:bookmarkEnd w:id="158"/>
+    <w:bookmarkStart w:id="160" w:name="ref-holland-lulewicz_2019"/>
     <w:p>
       <w:pPr>
         <w:pStyle w:val="Bibliography"/>
@@ -5443,7 +5542,7 @@
       <w:r>
         <w:t xml:space="preserve"> </w:t>
       </w:r>
-      <w:hyperlink r:id="rId156">
+      <w:hyperlink r:id="rId159">
         <w:r>
           <w:rPr>
             <w:rStyle w:val="Hyperlink"/>
@@ -5455,8 +5554,8 @@
         <w:t xml:space="preserve">.</w:t>
       </w:r>
     </w:p>
-    <w:bookmarkEnd w:id="157"/>
-    <w:bookmarkStart w:id="159" w:name="ref-lyman_2021"/>
+    <w:bookmarkEnd w:id="160"/>
+    <w:bookmarkStart w:id="162" w:name="ref-lyman_2021"/>
     <w:p>
       <w:pPr>
         <w:pStyle w:val="Bibliography"/>
@@ -5483,7 +5582,7 @@
       <w:r>
         <w:t xml:space="preserve"> </w:t>
       </w:r>
-      <w:hyperlink r:id="rId158">
+      <w:hyperlink r:id="rId161">
         <w:r>
           <w:rPr>
             <w:rStyle w:val="Hyperlink"/>
@@ -5495,8 +5594,8 @@
         <w:t xml:space="preserve">.</w:t>
       </w:r>
     </w:p>
-    <w:bookmarkEnd w:id="159"/>
-    <w:bookmarkStart w:id="160" w:name="ref-madsen_2012"/>
+    <w:bookmarkEnd w:id="162"/>
+    <w:bookmarkStart w:id="163" w:name="ref-madsen_2012"/>
     <w:p>
       <w:pPr>
         <w:pStyle w:val="Bibliography"/>
@@ -5505,8 +5604,8 @@
         <w:t xml:space="preserve">Madsen, Mark E. 2012. Neutral Cultural Transmission in Time-Averaged Archaeological Assemblages. arXiv preprint arXiv:1204.2043 [physics.soc-ph].</w:t>
       </w:r>
     </w:p>
-    <w:bookmarkEnd w:id="160"/>
-    <w:bookmarkStart w:id="161" w:name="ref-mainfort_1996"/>
+    <w:bookmarkEnd w:id="163"/>
+    <w:bookmarkStart w:id="164" w:name="ref-mainfort_1996"/>
     <w:p>
       <w:pPr>
         <w:pStyle w:val="Bibliography"/>
@@ -5555,8 +5654,8 @@
         <w:t xml:space="preserve">15(2):172–181.</w:t>
       </w:r>
     </w:p>
-    <w:bookmarkEnd w:id="161"/>
-    <w:bookmarkStart w:id="162" w:name="ref-mainfort_1996b"/>
+    <w:bookmarkEnd w:id="164"/>
+    <w:bookmarkStart w:id="165" w:name="ref-mainfort_1996b"/>
     <w:p>
       <w:pPr>
         <w:pStyle w:val="Bibliography"/>
@@ -5581,8 +5680,8 @@
         <w:t xml:space="preserve">15(2):172–181.</w:t>
       </w:r>
     </w:p>
-    <w:bookmarkEnd w:id="162"/>
-    <w:bookmarkStart w:id="163" w:name="ref-mainfort_2001"/>
+    <w:bookmarkEnd w:id="165"/>
+    <w:bookmarkStart w:id="166" w:name="ref-mainfort_2001"/>
     <w:p>
       <w:pPr>
         <w:pStyle w:val="Bibliography"/>
@@ -5616,8 +5715,8 @@
         <w:t xml:space="preserve">, edited by David S. Brose, C. Wesley Cowan, and Jr. Mainfort Robert C., pp. 173–190. Smithsonian Institution Press, Washington, DC.</w:t>
       </w:r>
     </w:p>
-    <w:bookmarkEnd w:id="163"/>
-    <w:bookmarkStart w:id="164" w:name="ref-mainfort_2003"/>
+    <w:bookmarkEnd w:id="166"/>
+    <w:bookmarkStart w:id="167" w:name="ref-mainfort_2003"/>
     <w:p>
       <w:pPr>
         <w:pStyle w:val="Bibliography"/>
@@ -5654,8 +5753,8 @@
         <w:t xml:space="preserve">22(2):176–184.</w:t>
       </w:r>
     </w:p>
-    <w:bookmarkEnd w:id="164"/>
-    <w:bookmarkStart w:id="165" w:name="ref-mantel_1967"/>
+    <w:bookmarkEnd w:id="167"/>
+    <w:bookmarkStart w:id="168" w:name="ref-mantel_1967"/>
     <w:p>
       <w:pPr>
         <w:pStyle w:val="Bibliography"/>
@@ -5680,8 +5779,8 @@
         <w:t xml:space="preserve">27(2):209–220.</w:t>
       </w:r>
     </w:p>
-    <w:bookmarkEnd w:id="165"/>
-    <w:bookmarkStart w:id="166" w:name="ref-mcnutt_ed_1996"/>
+    <w:bookmarkEnd w:id="168"/>
+    <w:bookmarkStart w:id="169" w:name="ref-mcnutt_ed_1996"/>
     <w:p>
       <w:pPr>
         <w:pStyle w:val="Bibliography"/>
@@ -5731,8 +5830,8 @@
         <w:t xml:space="preserve">. University of Alabama Press, Tuscaloosa.</w:t>
       </w:r>
     </w:p>
-    <w:bookmarkEnd w:id="166"/>
-    <w:bookmarkStart w:id="167" w:name="ref-mesoudi_2021"/>
+    <w:bookmarkEnd w:id="169"/>
+    <w:bookmarkStart w:id="170" w:name="ref-mesoudi_2021"/>
     <w:p>
       <w:pPr>
         <w:pStyle w:val="Bibliography"/>
@@ -5757,8 +5856,8 @@
         <w:t xml:space="preserve">376:20200053.</w:t>
       </w:r>
     </w:p>
-    <w:bookmarkEnd w:id="167"/>
-    <w:bookmarkStart w:id="169" w:name="ref-miller_atkins_premo_2018"/>
+    <w:bookmarkEnd w:id="170"/>
+    <w:bookmarkStart w:id="172" w:name="ref-miller_atkins_premo_2018"/>
     <w:p>
       <w:pPr>
         <w:pStyle w:val="Bibliography"/>
@@ -5785,7 +5884,7 @@
       <w:r>
         <w:t xml:space="preserve"> </w:t>
       </w:r>
-      <w:hyperlink r:id="rId168">
+      <w:hyperlink r:id="rId171">
         <w:r>
           <w:rPr>
             <w:rStyle w:val="Hyperlink"/>
@@ -5797,8 +5896,8 @@
         <w:t xml:space="preserve">.</w:t>
       </w:r>
     </w:p>
-    <w:bookmarkEnd w:id="169"/>
-    <w:bookmarkStart w:id="170" w:name="ref-milner_1998"/>
+    <w:bookmarkEnd w:id="172"/>
+    <w:bookmarkStart w:id="173" w:name="ref-milner_1998"/>
     <w:p>
       <w:pPr>
         <w:pStyle w:val="Bibliography"/>
@@ -5876,8 +5975,8 @@
         <w:t xml:space="preserve">. Smithsonian Institution Press, Washington, D.C.</w:t>
       </w:r>
     </w:p>
-    <w:bookmarkEnd w:id="170"/>
-    <w:bookmarkStart w:id="171" w:name="ref-mitchem_2001"/>
+    <w:bookmarkEnd w:id="173"/>
+    <w:bookmarkStart w:id="174" w:name="ref-mitchem_2001"/>
     <w:p>
       <w:pPr>
         <w:pStyle w:val="Bibliography"/>
@@ -5907,8 +6006,8 @@
         <w:t xml:space="preserve">.</w:t>
       </w:r>
     </w:p>
-    <w:bookmarkEnd w:id="171"/>
-    <w:bookmarkStart w:id="172" w:name="ref-morse_morse_1983"/>
+    <w:bookmarkEnd w:id="174"/>
+    <w:bookmarkStart w:id="175" w:name="ref-morse_morse_1983"/>
     <w:p>
       <w:pPr>
         <w:pStyle w:val="Bibliography"/>
@@ -5958,8 +6057,8 @@
         <w:t xml:space="preserve">. Academic Press, New York.</w:t>
       </w:r>
     </w:p>
-    <w:bookmarkEnd w:id="172"/>
-    <w:bookmarkStart w:id="173" w:name="ref-morse_morse_1996"/>
+    <w:bookmarkEnd w:id="175"/>
+    <w:bookmarkStart w:id="176" w:name="ref-morse_morse_1996"/>
     <w:p>
       <w:pPr>
         <w:pStyle w:val="Bibliography"/>
@@ -5996,8 +6095,8 @@
         <w:t xml:space="preserve">17(1):1–35.</w:t>
       </w:r>
     </w:p>
-    <w:bookmarkEnd w:id="173"/>
-    <w:bookmarkStart w:id="174" w:name="ref-morse_1990"/>
+    <w:bookmarkEnd w:id="176"/>
+    <w:bookmarkStart w:id="177" w:name="ref-morse_1990"/>
     <w:p>
       <w:pPr>
         <w:pStyle w:val="Bibliography"/>
@@ -6057,8 +6156,8 @@
         <w:t xml:space="preserve">, edited by David H. Dye and Cheryl Anne Cox, pp. 118–134. University of Alabama Press, Tuscaloosa.</w:t>
       </w:r>
     </w:p>
-    <w:bookmarkEnd w:id="174"/>
-    <w:bookmarkStart w:id="175" w:name="ref-neiman_1995"/>
+    <w:bookmarkEnd w:id="177"/>
+    <w:bookmarkStart w:id="178" w:name="ref-neiman_1995"/>
     <w:p>
       <w:pPr>
         <w:pStyle w:val="Bibliography"/>
@@ -6101,8 +6200,8 @@
         <w:t xml:space="preserve">60(1):7–36.</w:t>
       </w:r>
     </w:p>
-    <w:bookmarkEnd w:id="175"/>
-    <w:bookmarkStart w:id="177" w:name="ref-odwyer_kandler_2017"/>
+    <w:bookmarkEnd w:id="178"/>
+    <w:bookmarkStart w:id="180" w:name="ref-odwyer_kandler_2017"/>
     <w:p>
       <w:pPr>
         <w:pStyle w:val="Bibliography"/>
@@ -6129,7 +6228,7 @@
       <w:r>
         <w:t xml:space="preserve"> </w:t>
       </w:r>
-      <w:hyperlink r:id="rId176">
+      <w:hyperlink r:id="rId179">
         <w:r>
           <w:rPr>
             <w:rStyle w:val="Hyperlink"/>
@@ -6141,8 +6240,8 @@
         <w:t xml:space="preserve">.</w:t>
       </w:r>
     </w:p>
-    <w:bookmarkEnd w:id="177"/>
-    <w:bookmarkStart w:id="179" w:name="ref-peebles_kus_1977"/>
+    <w:bookmarkEnd w:id="180"/>
+    <w:bookmarkStart w:id="182" w:name="ref-peebles_kus_1977"/>
     <w:p>
       <w:pPr>
         <w:pStyle w:val="Bibliography"/>
@@ -6169,7 +6268,7 @@
       <w:r>
         <w:t xml:space="preserve"> </w:t>
       </w:r>
-      <w:hyperlink r:id="rId178">
+      <w:hyperlink r:id="rId181">
         <w:r>
           <w:rPr>
             <w:rStyle w:val="Hyperlink"/>
@@ -6181,8 +6280,8 @@
         <w:t xml:space="preserve">.</w:t>
       </w:r>
     </w:p>
-    <w:bookmarkEnd w:id="179"/>
-    <w:bookmarkStart w:id="181" w:name="ref-peeples_schachner_2012"/>
+    <w:bookmarkEnd w:id="182"/>
+    <w:bookmarkStart w:id="184" w:name="ref-peeples_schachner_2012"/>
     <w:p>
       <w:pPr>
         <w:pStyle w:val="Bibliography"/>
@@ -6209,7 +6308,7 @@
       <w:r>
         <w:t xml:space="preserve"> </w:t>
       </w:r>
-      <w:hyperlink r:id="rId180">
+      <w:hyperlink r:id="rId183">
         <w:r>
           <w:rPr>
             <w:rStyle w:val="Hyperlink"/>
@@ -6221,8 +6320,8 @@
         <w:t xml:space="preserve">.</w:t>
       </w:r>
     </w:p>
-    <w:bookmarkEnd w:id="181"/>
-    <w:bookmarkStart w:id="183" w:name="ref-perreault_2018"/>
+    <w:bookmarkEnd w:id="184"/>
+    <w:bookmarkStart w:id="186" w:name="ref-perreault_2018"/>
     <w:p>
       <w:pPr>
         <w:pStyle w:val="Bibliography"/>
@@ -6249,7 +6348,7 @@
       <w:r>
         <w:t xml:space="preserve"> </w:t>
       </w:r>
-      <w:hyperlink r:id="rId182">
+      <w:hyperlink r:id="rId185">
         <w:r>
           <w:rPr>
             <w:rStyle w:val="Hyperlink"/>
@@ -6261,8 +6360,8 @@
         <w:t xml:space="preserve">.</w:t>
       </w:r>
     </w:p>
-    <w:bookmarkEnd w:id="183"/>
-    <w:bookmarkStart w:id="184" w:name="ref-perreault_2019"/>
+    <w:bookmarkEnd w:id="186"/>
+    <w:bookmarkStart w:id="187" w:name="ref-perreault_2019"/>
     <w:p>
       <w:pPr>
         <w:pStyle w:val="Bibliography"/>
@@ -6284,8 +6383,8 @@
         <w:t xml:space="preserve">. University of Chicago Press, Chicago.</w:t>
       </w:r>
     </w:p>
-    <w:bookmarkEnd w:id="184"/>
-    <w:bookmarkStart w:id="185" w:name="ref-phillips_1970"/>
+    <w:bookmarkEnd w:id="187"/>
+    <w:bookmarkStart w:id="188" w:name="ref-phillips_1970"/>
     <w:p>
       <w:pPr>
         <w:pStyle w:val="Bibliography"/>
@@ -6356,8 +6455,8 @@
         <w:t xml:space="preserve">, Vol. 60. Papers of the Peabody Museum of Archaeology and Ethnology. Peabody Museum, Harvard University, Cambridge, MA.</w:t>
       </w:r>
     </w:p>
-    <w:bookmarkEnd w:id="185"/>
-    <w:bookmarkStart w:id="186" w:name="ref-phillips_ford_griffin_1951"/>
+    <w:bookmarkEnd w:id="188"/>
+    <w:bookmarkStart w:id="189" w:name="ref-phillips_ford_griffin_1951"/>
     <w:p>
       <w:pPr>
         <w:pStyle w:val="Bibliography"/>
@@ -6407,8 +6506,8 @@
         <w:t xml:space="preserve">, Vol. 25. Papers of the Peabody Museum of American Archaeology and Ethnology. Peabody Museum, Harvard University, Cambridge, MA.</w:t>
       </w:r>
     </w:p>
-    <w:bookmarkEnd w:id="186"/>
-    <w:bookmarkStart w:id="188" w:name="ref-phillips_willey_1953"/>
+    <w:bookmarkEnd w:id="189"/>
+    <w:bookmarkStart w:id="191" w:name="ref-phillips_willey_1953"/>
     <w:p>
       <w:pPr>
         <w:pStyle w:val="Bibliography"/>
@@ -6435,7 +6534,7 @@
       <w:r>
         <w:t xml:space="preserve"> </w:t>
       </w:r>
-      <w:hyperlink r:id="rId187">
+      <w:hyperlink r:id="rId190">
         <w:r>
           <w:rPr>
             <w:rStyle w:val="Hyperlink"/>
@@ -6447,8 +6546,8 @@
         <w:t xml:space="preserve">.</w:t>
       </w:r>
     </w:p>
-    <w:bookmarkEnd w:id="188"/>
-    <w:bookmarkStart w:id="190" w:name="ref-powell_shennan_thomas_2009"/>
+    <w:bookmarkEnd w:id="191"/>
+    <w:bookmarkStart w:id="193" w:name="ref-powell_shennan_thomas_2009"/>
     <w:p>
       <w:pPr>
         <w:pStyle w:val="Bibliography"/>
@@ -6487,7 +6586,7 @@
       <w:r>
         <w:t xml:space="preserve"> </w:t>
       </w:r>
-      <w:hyperlink r:id="rId189">
+      <w:hyperlink r:id="rId192">
         <w:r>
           <w:rPr>
             <w:rStyle w:val="Hyperlink"/>
@@ -6499,8 +6598,8 @@
         <w:t xml:space="preserve">.</w:t>
       </w:r>
     </w:p>
-    <w:bookmarkEnd w:id="190"/>
-    <w:bookmarkStart w:id="192" w:name="ref-premo_2014"/>
+    <w:bookmarkEnd w:id="193"/>
+    <w:bookmarkStart w:id="195" w:name="ref-premo_2014"/>
     <w:p>
       <w:pPr>
         <w:pStyle w:val="Bibliography"/>
@@ -6527,7 +6626,7 @@
       <w:r>
         <w:t xml:space="preserve"> </w:t>
       </w:r>
-      <w:hyperlink r:id="rId191">
+      <w:hyperlink r:id="rId194">
         <w:r>
           <w:rPr>
             <w:rStyle w:val="Hyperlink"/>
@@ -6539,8 +6638,8 @@
         <w:t xml:space="preserve">.</w:t>
       </w:r>
     </w:p>
-    <w:bookmarkEnd w:id="192"/>
-    <w:bookmarkStart w:id="194" w:name="ref-premo_2016"/>
+    <w:bookmarkEnd w:id="195"/>
+    <w:bookmarkStart w:id="197" w:name="ref-premo_2016"/>
     <w:p>
       <w:pPr>
         <w:pStyle w:val="Bibliography"/>
@@ -6567,7 +6666,7 @@
       <w:r>
         <w:t xml:space="preserve"> </w:t>
       </w:r>
-      <w:hyperlink r:id="rId193">
+      <w:hyperlink r:id="rId196">
         <w:r>
           <w:rPr>
             <w:rStyle w:val="Hyperlink"/>
@@ -6579,8 +6678,8 @@
         <w:t xml:space="preserve">.</w:t>
       </w:r>
     </w:p>
-    <w:bookmarkEnd w:id="194"/>
-    <w:bookmarkStart w:id="196" w:name="ref-premo_scholnick_2011"/>
+    <w:bookmarkEnd w:id="197"/>
+    <w:bookmarkStart w:id="199" w:name="ref-premo_scholnick_2011"/>
     <w:p>
       <w:pPr>
         <w:pStyle w:val="Bibliography"/>
@@ -6607,7 +6706,7 @@
       <w:r>
         <w:t xml:space="preserve"> </w:t>
       </w:r>
-      <w:hyperlink r:id="rId195">
+      <w:hyperlink r:id="rId198">
         <w:r>
           <w:rPr>
             <w:rStyle w:val="Hyperlink"/>
@@ -6619,8 +6718,8 @@
         <w:t xml:space="preserve">.</w:t>
       </w:r>
     </w:p>
-    <w:bookmarkEnd w:id="196"/>
-    <w:bookmarkStart w:id="197" w:name="ref-rees_political_culture"/>
+    <w:bookmarkEnd w:id="199"/>
+    <w:bookmarkStart w:id="200" w:name="ref-rees_political_culture"/>
     <w:p>
       <w:pPr>
         <w:pStyle w:val="Bibliography"/>
@@ -6644,8 +6743,8 @@
         <w:t xml:space="preserve">. Ph.D. dissertation, University of Oklahoma, Norman.</w:t>
       </w:r>
     </w:p>
-    <w:bookmarkEnd w:id="197"/>
-    <w:bookmarkStart w:id="199" w:name="ref-reimer_etal_2020"/>
+    <w:bookmarkEnd w:id="200"/>
+    <w:bookmarkStart w:id="202" w:name="ref-reimer_etal_2020"/>
     <w:p>
       <w:pPr>
         <w:pStyle w:val="Bibliography"/>
@@ -6699,7 +6798,7 @@
       <w:r>
         <w:t xml:space="preserve"> </w:t>
       </w:r>
-      <w:hyperlink r:id="rId198">
+      <w:hyperlink r:id="rId201">
         <w:r>
           <w:rPr>
             <w:rStyle w:val="Hyperlink"/>
@@ -6711,8 +6810,8 @@
         <w:t xml:space="preserve">.</w:t>
       </w:r>
     </w:p>
-    <w:bookmarkEnd w:id="199"/>
-    <w:bookmarkStart w:id="201" w:name="ref-richerson_etal_2016"/>
+    <w:bookmarkEnd w:id="202"/>
+    <w:bookmarkStart w:id="204" w:name="ref-richerson_etal_2016"/>
     <w:p>
       <w:pPr>
         <w:pStyle w:val="Bibliography"/>
@@ -6739,7 +6838,7 @@
       <w:r>
         <w:t xml:space="preserve"> </w:t>
       </w:r>
-      <w:hyperlink r:id="rId200">
+      <w:hyperlink r:id="rId203">
         <w:r>
           <w:rPr>
             <w:rStyle w:val="Hyperlink"/>
@@ -6751,8 +6850,8 @@
         <w:t xml:space="preserve">.</w:t>
       </w:r>
     </w:p>
-    <w:bookmarkEnd w:id="201"/>
-    <w:bookmarkStart w:id="203" w:name="ref-riede_hoggard_shennan_2019"/>
+    <w:bookmarkEnd w:id="204"/>
+    <w:bookmarkStart w:id="206" w:name="ref-riede_hoggard_shennan_2019"/>
     <w:p>
       <w:pPr>
         <w:pStyle w:val="Bibliography"/>
@@ -6779,7 +6878,7 @@
       <w:r>
         <w:t xml:space="preserve"> </w:t>
       </w:r>
-      <w:hyperlink r:id="rId202">
+      <w:hyperlink r:id="rId205">
         <w:r>
           <w:rPr>
             <w:rStyle w:val="Hyperlink"/>
@@ -6791,8 +6890,8 @@
         <w:t xml:space="preserve">.</w:t>
       </w:r>
     </w:p>
-    <w:bookmarkEnd w:id="203"/>
-    <w:bookmarkStart w:id="204" w:name="ref-robinson_1951"/>
+    <w:bookmarkEnd w:id="206"/>
+    <w:bookmarkStart w:id="207" w:name="ref-robinson_1951"/>
     <w:p>
       <w:pPr>
         <w:pStyle w:val="Bibliography"/>
@@ -6817,8 +6916,8 @@
         <w:t xml:space="preserve">16(4):293–301.</w:t>
       </w:r>
     </w:p>
-    <w:bookmarkEnd w:id="204"/>
-    <w:bookmarkStart w:id="205" w:name="ref-ross-stallings_2017"/>
+    <w:bookmarkEnd w:id="207"/>
+    <w:bookmarkStart w:id="208" w:name="ref-ross-stallings_2017"/>
     <w:p>
       <w:pPr>
         <w:pStyle w:val="Bibliography"/>
@@ -6852,8 +6951,8 @@
         <w:t xml:space="preserve">, edited by Haagen D. Klaus, Amanda R. Harvey, and Mark N. Cohen, pp. 329–362. University Press of Florida, Gainesville.</w:t>
       </w:r>
     </w:p>
-    <w:bookmarkEnd w:id="205"/>
-    <w:bookmarkStart w:id="207" w:name="ref-saxer_doebeli_travisano_2009"/>
+    <w:bookmarkEnd w:id="208"/>
+    <w:bookmarkStart w:id="210" w:name="ref-saxer_doebeli_travisano_2009"/>
     <w:p>
       <w:pPr>
         <w:pStyle w:val="Bibliography"/>
@@ -6880,7 +6979,7 @@
       <w:r>
         <w:t xml:space="preserve"> </w:t>
       </w:r>
-      <w:hyperlink r:id="rId206">
+      <w:hyperlink r:id="rId209">
         <w:r>
           <w:rPr>
             <w:rStyle w:val="Hyperlink"/>
@@ -6892,8 +6991,8 @@
         <w:t xml:space="preserve">.</w:t>
       </w:r>
     </w:p>
-    <w:bookmarkEnd w:id="207"/>
-    <w:bookmarkStart w:id="209" w:name="ref-scheffer_2009"/>
+    <w:bookmarkEnd w:id="210"/>
+    <w:bookmarkStart w:id="212" w:name="ref-scheffer_2009"/>
     <w:p>
       <w:pPr>
         <w:pStyle w:val="Bibliography"/>
@@ -6920,7 +7019,7 @@
       <w:r>
         <w:t xml:space="preserve"> </w:t>
       </w:r>
-      <w:hyperlink r:id="rId208">
+      <w:hyperlink r:id="rId211">
         <w:r>
           <w:rPr>
             <w:rStyle w:val="Hyperlink"/>
@@ -6932,8 +7031,8 @@
         <w:t xml:space="preserve">.</w:t>
       </w:r>
     </w:p>
-    <w:bookmarkEnd w:id="209"/>
-    <w:bookmarkStart w:id="210" w:name="ref-schiffer_1972"/>
+    <w:bookmarkEnd w:id="212"/>
+    <w:bookmarkStart w:id="213" w:name="ref-schiffer_1972"/>
     <w:p>
       <w:pPr>
         <w:pStyle w:val="Bibliography"/>
@@ -6958,8 +7057,8 @@
         <w:t xml:space="preserve">37(2):156–165.</w:t>
       </w:r>
     </w:p>
-    <w:bookmarkEnd w:id="210"/>
-    <w:bookmarkStart w:id="212" w:name="ref-schneider_martins_deaguiar_2016"/>
+    <w:bookmarkEnd w:id="213"/>
+    <w:bookmarkStart w:id="215" w:name="ref-schneider_martins_deaguiar_2016"/>
     <w:p>
       <w:pPr>
         <w:pStyle w:val="Bibliography"/>
@@ -6986,7 +7085,7 @@
       <w:r>
         <w:t xml:space="preserve"> </w:t>
       </w:r>
-      <w:hyperlink r:id="rId211">
+      <w:hyperlink r:id="rId214">
         <w:r>
           <w:rPr>
             <w:rStyle w:val="Hyperlink"/>
@@ -6998,8 +7097,8 @@
         <w:t xml:space="preserve">.</w:t>
       </w:r>
     </w:p>
-    <w:bookmarkEnd w:id="212"/>
-    <w:bookmarkStart w:id="214" w:name="ref-shennan_crema_kerig_2015"/>
+    <w:bookmarkEnd w:id="215"/>
+    <w:bookmarkStart w:id="217" w:name="ref-shennan_crema_kerig_2015"/>
     <w:p>
       <w:pPr>
         <w:pStyle w:val="Bibliography"/>
@@ -7065,7 +7164,7 @@
       <w:r>
         <w:t xml:space="preserve"> </w:t>
       </w:r>
-      <w:hyperlink r:id="rId213">
+      <w:hyperlink r:id="rId216">
         <w:r>
           <w:rPr>
             <w:rStyle w:val="Hyperlink"/>
@@ -7077,8 +7176,8 @@
         <w:t xml:space="preserve">.</w:t>
       </w:r>
     </w:p>
-    <w:bookmarkEnd w:id="214"/>
-    <w:bookmarkStart w:id="215" w:name="ref-shennan_wilkinson_2001"/>
+    <w:bookmarkEnd w:id="217"/>
+    <w:bookmarkStart w:id="218" w:name="ref-shennan_wilkinson_2001"/>
     <w:p>
       <w:pPr>
         <w:pStyle w:val="Bibliography"/>
@@ -7118,8 +7217,8 @@
         <w:t xml:space="preserve">66(4):577–593.</w:t>
       </w:r>
     </w:p>
-    <w:bookmarkEnd w:id="215"/>
-    <w:bookmarkStart w:id="216" w:name="ref-smith_neiman_2007"/>
+    <w:bookmarkEnd w:id="218"/>
+    <w:bookmarkStart w:id="219" w:name="ref-smith_neiman_2007"/>
     <w:p>
       <w:pPr>
         <w:pStyle w:val="Bibliography"/>
@@ -7144,8 +7243,8 @@
         <w:t xml:space="preserve">26(1):47–72.</w:t>
       </w:r>
     </w:p>
-    <w:bookmarkEnd w:id="216"/>
-    <w:bookmarkStart w:id="218" w:name="ref-stern_1994"/>
+    <w:bookmarkEnd w:id="219"/>
+    <w:bookmarkStart w:id="221" w:name="ref-stern_1994"/>
     <w:p>
       <w:pPr>
         <w:pStyle w:val="Bibliography"/>
@@ -7172,7 +7271,7 @@
       <w:r>
         <w:t xml:space="preserve"> </w:t>
       </w:r>
-      <w:hyperlink r:id="rId217">
+      <w:hyperlink r:id="rId220">
         <w:r>
           <w:rPr>
             <w:rStyle w:val="Hyperlink"/>
@@ -7184,8 +7283,8 @@
         <w:t xml:space="preserve">.</w:t>
       </w:r>
     </w:p>
-    <w:bookmarkEnd w:id="218"/>
-    <w:bookmarkStart w:id="220" w:name="ref-sullivan_2024"/>
+    <w:bookmarkEnd w:id="221"/>
+    <w:bookmarkStart w:id="223" w:name="ref-sullivan_2024"/>
     <w:p>
       <w:pPr>
         <w:pStyle w:val="Bibliography"/>
@@ -7236,7 +7335,7 @@
       <w:r>
         <w:t xml:space="preserve"> </w:t>
       </w:r>
-      <w:hyperlink r:id="rId219">
+      <w:hyperlink r:id="rId222">
         <w:r>
           <w:rPr>
             <w:rStyle w:val="Hyperlink"/>
@@ -7248,8 +7347,8 @@
         <w:t xml:space="preserve">.</w:t>
       </w:r>
     </w:p>
-    <w:bookmarkEnd w:id="220"/>
-    <w:bookmarkStart w:id="221" w:name="ref-tomasovych_kidwell_2009"/>
+    <w:bookmarkEnd w:id="223"/>
+    <w:bookmarkStart w:id="224" w:name="ref-tomasovych_kidwell_2009"/>
     <w:p>
       <w:pPr>
         <w:pStyle w:val="Bibliography"/>
@@ -7274,8 +7373,8 @@
         <w:t xml:space="preserve">35(1):94–118.</w:t>
       </w:r>
     </w:p>
-    <w:bookmarkEnd w:id="221"/>
-    <w:bookmarkStart w:id="223" w:name="ref-tomasovych_kidwell_2010"/>
+    <w:bookmarkEnd w:id="224"/>
+    <w:bookmarkStart w:id="226" w:name="ref-tomasovych_kidwell_2010"/>
     <w:p>
       <w:pPr>
         <w:pStyle w:val="Bibliography"/>
@@ -7302,7 +7401,7 @@
       <w:r>
         <w:t xml:space="preserve"> </w:t>
       </w:r>
-      <w:hyperlink r:id="rId222">
+      <w:hyperlink r:id="rId225">
         <w:r>
           <w:rPr>
             <w:rStyle w:val="Hyperlink"/>
@@ -7314,8 +7413,8 @@
         <w:t xml:space="preserve">.</w:t>
       </w:r>
     </w:p>
-    <w:bookmarkEnd w:id="223"/>
-    <w:bookmarkStart w:id="224" w:name="ref-willey_phillips_1958"/>
+    <w:bookmarkEnd w:id="226"/>
+    <w:bookmarkStart w:id="227" w:name="ref-willey_phillips_1958"/>
     <w:p>
       <w:pPr>
         <w:pStyle w:val="Bibliography"/>
@@ -7337,8 +7436,8 @@
         <w:t xml:space="preserve">. University of Chicago Press, Chicago.</w:t>
       </w:r>
     </w:p>
-    <w:bookmarkEnd w:id="224"/>
-    <w:bookmarkStart w:id="225" w:name="ref-williams_1954"/>
+    <w:bookmarkEnd w:id="227"/>
+    <w:bookmarkStart w:id="228" w:name="ref-williams_1954"/>
     <w:p>
       <w:pPr>
         <w:pStyle w:val="Bibliography"/>
@@ -7347,8 +7446,8 @@
         <w:t xml:space="preserve">Williams, Stephen. 1954. An Archeological Study of the Mississippian Culture in Southeast Missouri. PhD thesis, Yale University, New Haven.</w:t>
       </w:r>
     </w:p>
-    <w:bookmarkEnd w:id="225"/>
-    <w:bookmarkStart w:id="226" w:name="ref-williams_1990"/>
+    <w:bookmarkEnd w:id="228"/>
+    <w:bookmarkStart w:id="229" w:name="ref-williams_1990"/>
     <w:p>
       <w:pPr>
         <w:pStyle w:val="Bibliography"/>
@@ -7384,8 +7483,8 @@
         <w:t xml:space="preserve">, edited by David H. Dye and Cheryl Anne Cox, pp. 170–180. University of Alabama Press, Tuscaloosa.</w:t>
       </w:r>
     </w:p>
-    <w:bookmarkEnd w:id="226"/>
-    <w:bookmarkStart w:id="228" w:name="ref-wright_1943"/>
+    <w:bookmarkEnd w:id="229"/>
+    <w:bookmarkStart w:id="231" w:name="ref-wright_1943"/>
     <w:p>
       <w:pPr>
         <w:pStyle w:val="Bibliography"/>
@@ -7412,7 +7511,7 @@
       <w:r>
         <w:t xml:space="preserve"> </w:t>
       </w:r>
-      <w:hyperlink r:id="rId227">
+      <w:hyperlink r:id="rId230">
         <w:r>
           <w:rPr>
             <w:rStyle w:val="Hyperlink"/>
@@ -7424,8 +7523,8 @@
         <w:t xml:space="preserve">.</w:t>
       </w:r>
     </w:p>
-    <w:bookmarkEnd w:id="228"/>
-    <w:bookmarkStart w:id="230" w:name="ref-wright_1951"/>
+    <w:bookmarkEnd w:id="231"/>
+    <w:bookmarkStart w:id="233" w:name="ref-wright_1951"/>
     <w:p>
       <w:pPr>
         <w:pStyle w:val="Bibliography"/>
@@ -7452,7 +7551,7 @@
       <w:r>
         <w:t xml:space="preserve"> </w:t>
       </w:r>
-      <w:hyperlink r:id="rId229">
+      <w:hyperlink r:id="rId232">
         <w:r>
           <w:rPr>
             <w:rStyle w:val="Hyperlink"/>
@@ -7464,8 +7563,8 @@
         <w:t xml:space="preserve">.</w:t>
       </w:r>
     </w:p>
-    <w:bookmarkEnd w:id="230"/>
-    <w:bookmarkStart w:id="232" w:name="ref-youngblood_miton_morin_2023"/>
+    <w:bookmarkEnd w:id="233"/>
+    <w:bookmarkStart w:id="235" w:name="ref-youngblood_miton_morin_2023"/>
     <w:p>
       <w:pPr>
         <w:pStyle w:val="Bibliography"/>
@@ -7492,7 +7591,7 @@
       <w:r>
         <w:t xml:space="preserve"> </w:t>
       </w:r>
-      <w:hyperlink r:id="rId231">
+      <w:hyperlink r:id="rId234">
         <w:r>
           <w:rPr>
             <w:rStyle w:val="Hyperlink"/>
@@ -7504,10 +7603,10 @@
         <w:t xml:space="preserve">.</w:t>
       </w:r>
     </w:p>
-    <w:bookmarkEnd w:id="232"/>
-    <w:bookmarkEnd w:id="233"/>
-    <w:bookmarkEnd w:id="234"/>
     <w:bookmarkEnd w:id="235"/>
+    <w:bookmarkEnd w:id="236"/>
+    <w:bookmarkEnd w:id="237"/>
+    <w:bookmarkEnd w:id="238"/>
     <w:sectPr>
       <w:footnotePr>
         <w:numRestart w:val="eachSect"/>

</xml_diff>

<commit_message>
Figure 1: white background; sync abstract update
Remove the uniform gray land tone behind Figure 1 so the light-gray phase
territories read clearly against a white background. Sync the updated abstract
(main text docx/PDF) from the manuscript source.
</commit_message>
<xml_diff>
--- a/docs/manuscript/MAIN_TEXT.docx
+++ b/docs/manuscript/MAIN_TEXT.docx
@@ -37,7 +37,7 @@
         <w:pStyle w:val="FirstParagraph"/>
       </w:pPr>
       <w:r>
-        <w:t xml:space="preserve">The phase, Mississippian archaeology’s foundational unit, rests on a silent premise: that assemblages more similar to nearby than to distant neighbors record a bounded society. This is rarely tested, yet neutral transmission produces the same clustering with no bounded groups: drift concentrates similar styles nearby. For the late pre-contact central Mississippi Valley, we test whether decorated ceramic similarity records reflect bounded interaction groups or spatially structured drift. We compare drift and bounded-groups processes on the region’s geographic data, calibrated to the record’s small samples and time-averaging using a signal-recovery experiment. In both the St. Francis basin and the southeast-Missouri assemblages, drift reproduces the structure without bounded groups, and Parkin is a transmission bridge, not a capital. A sharper boundary appears only between the central and lower valleys, confounded with chronological turnover and analytical history. Before similarity is read as social, a record must be shown to be able to distinguish groups from drift.</w:t>
+        <w:t xml:space="preserve">The phase, Mississippian archaeology’s foundational unit, rests on a silent premise: that assemblages more similar to nearby than to distant neighbors record a bounded society. This is rarely tested, yet neutral transmission produces the same clustering with no bounded groups: drift concentrates similar styles nearby. For the late pre-contact central Mississippi Valley, we test whether decorated ceramic similarity records reflect bounded interaction groups or spatially structured drift. We compare drift and bounded-groups processes on the region’s geographic data, calibrated to the record’s small samples and time-averaging using a signal-recovery experiment. In both the St. Francis basin and the southeast-Missouri assemblages, drift reproduces the structure without bounded groups, and across the wider valley it generates far fewer coherent groups than the named phase scheme draws. Parkin is a transmission bridge rather than a capital. Tested directly against the other named phases, it shows at most a weak signal at the edge of the drift expectation. A sharper boundary appears only between the central and lower valleys, confounded with chronological turnover and analytical history. Before similarity is read as social, a record must be shown able to distinguish groups from drift.</w:t>
       </w:r>
     </w:p>
     <w:p>
@@ -73,7 +73,7 @@
         <w:pStyle w:val="FirstParagraph"/>
       </w:pPr>
       <w:r>
-        <w:t xml:space="preserve">La fase, unidad fundamental de la arqueología misisipiana, descansa sobre una premisa tácita: que los conjuntos más similares a sus vecinos cercanos que a los distantes registran una sociedad delimitada. Esto rara vez se pone a prueba, aunque la transmisión cultural neutral produce el mismo agrupamiento sin grupos delimitados: la deriva concentra estilos similares en áreas cercanas. Para el valle central del Misisipi de finales del período precontacto, evaluamos si la similitud de la cerámica decorada registra grupos de interacción delimitados o deriva estructurada espacialmente. Comparamos dos procesos generativos, deriva y grupos delimitados, sobre la geografía real de los conjuntos, calibrando la comparación a los tamaños de muestra pequeños y al promediado temporal del registro mediante un experimento de recuperación de señal. Tanto en la fase Parkin de la cuenca del St. Francis, como en los conjuntos del sureste de Misuri, la estructura se reproduce mediante deriva y no requiere grupos delimitados, y Parkin es un puente de transmisión más que una capital. Una frontera más marcada aparece solo entre el valle central y el valle inferior, confundida con el recambio cronológico y la historia analítica. Antes de interpretar la similitud como social, debe demostrarse que un registro puede distinguir los grupos de la deriva.</w:t>
+        <w:t xml:space="preserve">La fase, unidad fundamental de la arqueología misisipiana, descansa sobre una premisa tácita: que los conjuntos más similares a sus vecinos cercanos que a los distantes registran una sociedad delimitada. Esto rara vez se pone a prueba, aunque la transmisión cultural neutral produce el mismo agrupamiento sin grupos delimitados: la deriva concentra estilos similares en áreas cercanas. Para el valle central del Misisipi de finales del período precontacto, evaluamos si la similitud de la cerámica decorada registra grupos de interacción delimitados o deriva estructurada espacialmente. Comparamos dos procesos generativos, deriva y grupos delimitados, sobre la geografía real de los conjuntos, calibrando la comparación a los tamaños de muestra pequeños y al promediado temporal del registro mediante un experimento de recuperación de señal. Tanto en la cuenca del St. Francis como en los conjuntos del sureste de Misuri, la estructura se reproduce mediante deriva y no requiere grupos delimitados, y en el conjunto del valle la deriva genera muchos menos grupos coherentes de los que distingue el esquema de fases nombradas. Parkin es un puente de transmisión más que una capital. Evaluada directamente frente a las demás fases nombradas, la fase Parkin muestra a lo sumo una señal débil en el límite de lo que predice la deriva. Una frontera más marcada aparece solo entre el valle central y el valle inferior, confundida con el recambio cronológico y la historia analítica. Antes de interpretar la similitud como social, debe demostrarse que un registro puede distinguir los grupos de la deriva.</w:t>
       </w:r>
     </w:p>
     <w:p>

</xml_diff>

<commit_message>
Sync manuscript: Mainfort 2003 ordination sentence
</commit_message>
<xml_diff>
--- a/docs/manuscript/MAIN_TEXT.docx
+++ b/docs/manuscript/MAIN_TEXT.docx
@@ -37,7 +37,7 @@
         <w:pStyle w:val="FirstParagraph"/>
       </w:pPr>
       <w:r>
-        <w:t xml:space="preserve">The phase, Mississippian archaeology’s foundational unit, rests on a silent premise: that assemblages more similar to nearby than to distant neighbors record a bounded society. This is rarely tested, yet neutral transmission produces the same clustering with no bounded groups: drift concentrates similar styles nearby. For the late pre-contact central Mississippi Valley, we test whether decorated ceramic similarity records reflect bounded interaction groups or spatially structured drift. We compare drift and bounded-groups processes on the region’s geographic data, calibrated to the record’s small samples and time-averaging using a signal-recovery experiment. In both the St. Francis basin and the southeast-Missouri assemblages, drift reproduces the structure without bounded groups, and across the wider valley it generates far fewer coherent groups than the named phase scheme draws. Parkin is a transmission bridge rather than a capital. Tested directly against the other named phases, it shows at most a weak signal at the edge of the drift expectation. A sharper boundary appears only between the central and lower valleys, confounded with chronological turnover and analytical history. Before similarity is read as social, a record must be shown able to distinguish groups from drift.</w:t>
+        <w:t xml:space="preserve">The phase, Mississippian archaeology’s foundational unit, rests on a silent premise: that assemblages more similar to nearby than to distant neighbors record a bounded society. This is rarely tested, yet neutral transmission produces the same clustering with no bounded groups: drift concentrates similar styles nearby. For the late pre-contact central Mississippi Valley, we test whether decorated ceramic similarity records reflect bounded interaction groups or spatially structured drift. We compare drift and bounded-groups processes on the region’s geographic data, calibrated to the record’s small samples and time-averaging using a signal-recovery experiment. In both the St. Francis basin and the southeast-Missouri assemblages, drift reproduces the structure without bounded groups. Across the wider valley, it generates far fewer coherent groups than the named phase scheme draws. Parkin is a transmission bridge rather than a capital. Tested directly against the other named phases, it shows at most a weak signal at the edge of the drift expectation. A sharper boundary appears only between the central and lower valleys, confounded with chronological turnover and analytical history. Before similarity is read as social, a record must be shown to be able to distinguish groups from drift.</w:t>
       </w:r>
     </w:p>
     <w:p>
@@ -171,7 +171,7 @@
         <w:t xml:space="preserve">(Cobb 2000)</w:t>
       </w:r>
       <w:r>
-        <w:t xml:space="preserve">. As we show below, the decorated-ceramic record carries no signature of interaction closing in on bounded groups.</w:t>
+        <w:t xml:space="preserve">. As we show below, the decorated-ceramic record carries no clear signature of interaction closing in on bounded groups.</w:t>
       </w:r>
     </w:p>
     <w:p>
@@ -221,7 +221,7 @@
         <w:t xml:space="preserve"> </w:t>
       </w:r>
       <w:r>
-        <w:t xml:space="preserve">even set out the syllogism that would make a phase a society, component equals community, and phase equals a set of components, and then rejected it: in practice, they judged, the chances are against archaeological phases having much social reality, and the most one can do is act as if they did. Williams</w:t>
+        <w:t xml:space="preserve">even set out the syllogism that would make a phase a society, component equals community, and phase equals a set of components, and then rejected it. In practice, however, though the chances are against archaeological phases having much social reality, they judged them as such and acted as if they did. Williams</w:t>
       </w:r>
       <w:r>
         <w:t xml:space="preserve"> </w:t>
@@ -230,7 +230,7 @@
         <w:t xml:space="preserve">(1954)</w:t>
       </w:r>
       <w:r>
-        <w:t xml:space="preserve">, defining the southeast-Missouri phases on which the regional scheme rests, adopted the social equation anyway, writing that a phase probably equals a society. That equation, disavowed at the source and reinstated in regional practice, is the silent premise. It holds that assemblages more similar to one another than to their neighbors record a bounded, mutually interacting social group. Endow such a group with a primate center, and it becomes a polity. The polity reading is, therefore, built into the unit before any independent evidence of hierarchy is weighed, and the construct has been questioned on exactly this ground. Fox</w:t>
+        <w:t xml:space="preserve">, defining the southeast-Missouri phases on which the regional scheme rests, adopted the social equation, writing that a phase probably equals a society. That equation, disavowed at the source and reinstated in regional practice, is the silent premise. It holds that assemblages more similar to one another than to their neighbors record a bounded, mutually interacting social group. Endow such a group with a primate center, and it becomes a polity. The polity reading is, therefore, built into the unit before any independent evidence of hierarchy is weighed, and the construct has been questioned on exactly this ground. The interrogation of phases is not new. Fox</w:t>
       </w:r>
       <w:r>
         <w:t xml:space="preserve"> </w:t>
@@ -242,16 +242,19 @@
         <w:t xml:space="preserve"> </w:t>
       </w:r>
       <w:r>
-        <w:t xml:space="preserve">showed, by cluster analysis and ordination, that the southeast-Missouri phases fail as both groups and classes, with their member assemblages assigned to statistical clusters at random rather than segregating by phase</w:t>
-      </w:r>
-      <w:r>
-        <w:t xml:space="preserve"> </w:t>
-      </w:r>
-      <w:r>
-        <w:t xml:space="preserve">(Mainfort 2003)</w:t>
-      </w:r>
-      <w:r>
-        <w:t xml:space="preserve">.</w:t>
+        <w:t xml:space="preserve">showed, for example, by cluster analysis and ordination, that the southeast-Missouri phases fail as both groups and classes, with their member assemblages assigned to statistical clusters at random rather than segregating by phase. Similarly, Mainfort</w:t>
+      </w:r>
+      <w:r>
+        <w:t xml:space="preserve"> </w:t>
+      </w:r>
+      <w:r>
+        <w:t xml:space="preserve">(2003)</w:t>
+      </w:r>
+      <w:r>
+        <w:t xml:space="preserve"> </w:t>
+      </w:r>
+      <w:r>
+        <w:t xml:space="preserve">found, by ordination of the late-period assemblages, little support for the validity of the existing culture-historical units, which overlap in ordination space rather than forming discrete clusters.</w:t>
       </w:r>
     </w:p>
     <w:p>
@@ -377,7 +380,7 @@
           <wp:inline>
             <wp:extent cx="4114800" cy="6930397"/>
             <wp:effectExtent b="0" l="0" r="0" t="0"/>
-            <wp:docPr descr="Figure 1. Decorated-ceramic assemblages of the central Mississippi Valley and the culture-historical phase scheme this paper tests. The seven Late Mississippian phases (Parkin, Nodena, Jones Bayou, Tipton, Kent, Walls, and Parchman) are shown as non-overlapping territories, a Voronoi partition of the assemblages Mainfort (1996b) assigns to each phase, over a local hydrology base (the St. Francis, Tyronza, and Mississippi rivers) with state and county boundaries. Each assemblage is plotted with a marker shape for its phase, and Parkin is starred. The 29 assemblages of the St. Francis basin transmission set, those within 20 km of the St. Francis, Tyronza, and L’Anguille drainage, are ringed in black. The hydrological basin is a geographic unit that crosses the Parkin, Nodena, Kent, Walls, and Parchman phases. The bounded territories illustrate the premise the paper tests, that such areas record distinct, internally interacting societies. The transmission analysis finds instead that drift structured by geography explains the impression of groupness. The mapped assemblages fall in Arkansas, Tennessee, and Mississippi; Missouri lies just north of the frame. Inset: location in North America." title="" id="12" name="Picture"/>
+            <wp:docPr descr="Figure 1. Decorated-ceramic assemblages of the central Mississippi Valley and the culture-historical phase scheme this paper tests. The seven Late Mississippian phases (Parkin, Nodena, Jones Bayou, Tipton, Kent, Walls, and Parchman) are shown as non-overlapping territories, a Voronoi partition of the assemblages Mainfort (1996b) assigns to each phase, over a local hydrology base (the St. Francis, Tyronza, and Mississippi rivers) with state and county boundaries. Each assemblage is plotted with a marker corresponding to its phase, and Parkin is marked with a star. The 29 assemblages of the St. Francis basin transmission set, those within 20 km of the St. Francis, Tyronza, and L’Anguille drainage, are ringed in black. The hydrological basin is a geographic unit that crosses the Parkin, Nodena, Kent, Walls, and Parchman phases. The bounded territories illustrate the premise the paper tests: that such areas host distinct, internally interacting societies. The transmission analysis finds instead that drift structured by geography explains the impression of groupness. The mapped assemblages fall in Arkansas, Tennessee, and Mississippi; Missouri lies just north of the frame. Inset: location in North America." title="" id="12" name="Picture"/>
             <a:graphic>
               <a:graphicData uri="http://schemas.openxmlformats.org/drawingml/2006/picture">
                 <pic:pic>
@@ -442,7 +445,7 @@
         <w:t xml:space="preserve"> </w:t>
       </w:r>
       <w:r>
-        <w:t xml:space="preserve">assigns to each phase, over a local hydrology base (the St. Francis, Tyronza, and Mississippi rivers) with state and county boundaries. Each assemblage is plotted with a marker shape for its phase, and Parkin is starred. The 29 assemblages of the St. Francis basin transmission set, those within 20 km of the St. Francis, Tyronza, and L’Anguille drainage, are ringed in black. The hydrological basin is a geographic unit that crosses the Parkin, Nodena, Kent, Walls, and Parchman phases. The bounded territories illustrate the premise the paper tests, that such areas record distinct, internally interacting societies. The transmission analysis finds instead that drift structured by geography explains the impression of groupness. The mapped assemblages fall in Arkansas, Tennessee, and Mississippi; Missouri lies just north of the frame. Inset: location in North America.</w:t>
+        <w:t xml:space="preserve">assigns to each phase, over a local hydrology base (the St. Francis, Tyronza, and Mississippi rivers) with state and county boundaries. Each assemblage is plotted with a marker corresponding to its phase, and Parkin is marked with a star. The 29 assemblages of the St. Francis basin transmission set, those within 20 km of the St. Francis, Tyronza, and L’Anguille drainage, are ringed in black. The hydrological basin is a geographic unit that crosses the Parkin, Nodena, Kent, Walls, and Parchman phases. The bounded territories illustrate the premise the paper tests: that such areas host distinct, internally interacting societies. The transmission analysis finds instead that drift structured by geography explains the impression of groupness. The mapped assemblages fall in Arkansas, Tennessee, and Mississippi; Missouri lies just north of the frame. Inset: location in North America.</w:t>
       </w:r>
     </w:p>
     <w:p>
@@ -920,7 +923,7 @@
         <w:t xml:space="preserve">(Shennan et al. 2015; Wright 1943)</w:t>
       </w:r>
       <w:r>
-        <w:t xml:space="preserve">, the gradual fade of similarity with distance that follows when people interact mostly with near neighbors, without the sharp boundaries or departures from neutrality that mark restricted, assortative learning. A bounded interaction group, in which one assortative process restricts transmission along every dimension, is the only process that drives all four signatures together at full strength. But the table is idealized in a way that matters here: two of the four signatures, between-group variance and the distance-controlled boundary excess, are also driven by stochastic neutral drift on a spatially structured population, which generates patchy divergence and a positive boundary excess with no bounded group anywhere (Results, Figure S5). Their joint movement, therefore, cannot by itself separate a real interaction group from drift. We therefore do not rest on the signatures alone. Instead, we compare the two processes generatively: we simulate each one forward, neutral spatial drift and bounded groups alike, on the real geography of the assemblages and ask which reproduces the observed structure, reading the signatures as diagnostics of where each process leaves its mark.</w:t>
+        <w:t xml:space="preserve">. This pattern appears as a gradual fading of similarity with distance, as people interact mostly with near neighbors, without the sharp boundaries or departures from neutrality that mark restricted, assortative learning. A bounded interaction group, in which one assortative process restricts transmission along every dimension, is the only process that drives all four signatures together at full strength. But the table is idealized in a way that matters here: two of the four signatures, between-group variance and the distance-controlled boundary excess, are also driven by stochastic neutral drift on a spatially structured population, which generates patchy divergence and a positive boundary excess with no bounded group anywhere (Results, Figure S5). The linked movement of these two measures cannot separate a real interaction group from drift. Therefore, we do not depend on these signatures alone. Instead, we compare the two processes generatively by simulating each one, neutral spatial drift and bounded groups alike, using the real geography of the deposits. Using the data from the simulations, we ask which reproduces the observed structure, reading the signatures as diagnostics of where each process leaves its mark.</w:t>
       </w:r>
     </w:p>
     <w:p>
@@ -938,7 +941,7 @@
         <w:t xml:space="preserve"> </w:t>
       </w:r>
       <w:r>
-        <w:t xml:space="preserve">The transmission signatures each process is expected to leave a mark on, where ● marks a signature the process drives and ○ marks one it leaves flat. Only a bounded interaction group drives all four. Each alternative produces a characteristic subset, a pattern our simulation confirms on idealized data (Figure S4). This is an idealized expectation under smooth, deterministic processes, not a claim about what is detectable in a real record. Two qualifications make this an aspirational goal rather than necessarily operative. First, the generator diagnostic (Supplemental Text) shows that the non-F_ST rows are not realizable at this record’s resolution, because the neutral and seriation signatures fail to register a signal even when one is injected through its own pathway. The detectable discrimination, therefore, reduces to cultural F_ST (Figure 4). Second, under realistic stochastic spatial drift, the F_ST and spatial-assortativity rows are themselves driven in the absence of a bounded group (Results, Figure S5). The table frames the possible combinations of factors that may contribute to a signal of bounded group structure. The generative drift-versus-groups comparison provides a practical assessment.</w:t>
+        <w:t xml:space="preserve">The transmission signatures each process is expected to leave a mark on, where ● marks a signature the process drives and ○ marks one it leaves flat. Only a bounded interaction group drives all four. Each alternative produces a characteristic subset, a pattern our simulation confirms on idealized data (Figure S4). This is an idealized expectation under smooth, deterministic processes, not a claim about what is detectable in a real record. Two qualifications make this an aspirational goal rather than necessarily operative. First, the generator diagnostic (Supplemental Text) shows that the non-F_ST rows are detectable at the record’s resolution, because the neutral and seriation signatures fail to register a signal even when one is injected through its own pathway. The detectable discrimination, therefore, reduces to cultural F_ST (Figure 4). Second, under realistic stochastic spatial drift, the F_ST and spatial-assortativity rows are themselves driven in the absence of a bounded group (Results, Figure S5). The table frames the possible combinations of factors that may contribute to a signal of bounded group structure. The simulation approach for examining drift-versus-group comparisons provides a practical assessment.</w:t>
       </w:r>
     </w:p>
     <w:tbl>
@@ -1358,7 +1361,7 @@
         <w:pStyle w:val="BodyText"/>
       </w:pPr>
       <w:r>
-        <w:t xml:space="preserve">Because closure, if it occurred, would build up across the sequence, we read convergence as a trajectory: a coherent, same-direction shift in all four signatures across the ordinal sequence of assemblages, concentrated where and when interaction closes into bounded groups. The logic is only as strong as the independence of the signatures, because four measures that were merely redundant would converge trivially. We therefore validate the test on simulated assemblages before applying it, confirming both that convergence arises only when interaction closes into a bounded group and not under any mimic, and that the four signatures are tightly correlated under such closure yet nearly independent under the mimics, so their joint movement is informative rather than automatic. The convergence logic has an archaeological precedent. Neiman</w:t>
+        <w:t xml:space="preserve">Because closure, if it occurred, would accumulate across the sequence, we read convergence as a trajectory. This pattern would appear as a coherent, same-direction shift in all four signatures across the ordinal sequence of assemblages, concentrated where and when interaction closes into bounded groups. The logic is only as strong as the independence of the signatures, because four measures that were merely redundant converge trivially. As a consequence, we validate the test using simulated assemblages before applying it to confirm that convergence arises only when interactions close into a bounded group and not under any mimic. We also use the simulation to assess whether the four signatures are tightly correlated under such closure yet nearly independent under the mimics, so their joint movement is informative rather than automatic. The use of convergence logic has an archaeological precedent. Neiman</w:t>
       </w:r>
       <w:r>
         <w:t xml:space="preserve"> </w:t>
@@ -1370,7 +1373,15 @@
         <w:t xml:space="preserve"> </w:t>
       </w:r>
       <w:r>
-        <w:t xml:space="preserve">showed that two independently derived, theory-grounded measures of the same ceramic data, within-assemblage diversity and between-assemblage distance, converge on the same inference about past interaction, and we generalize that two-measure agreement to four. This validates the concept. Whether all four signatures, or only some, can actually do so on a record like ours is a separate question that we settle by calibrating the test directly to synthetic data matched to the Parkin assemblages. Both procedures are presented with their methods and outcomes. Figure 2 previews what the test distinguishes, the sharp structure a bounded group would leave against the blur that drift produces, and why, on a record of this size and time-averaging, a weak within-basin boundary cannot be excluded.</w:t>
+        <w:t xml:space="preserve">showed that two independently derived, theory-grounded measures of the same ceramic data, within-assemblage diversity and between-assemblage distance, converge on the same inference about past interaction. We generalize that two-measure agreement and apply it to our four. Whether all four signatures, or only some, can actually do so on a record like ours is a separate question that we settle by calibrating the test directly to synthetic data matched to the Parkin assemblages.</w:t>
+      </w:r>
+    </w:p>
+    <w:p>
+      <w:pPr>
+        <w:pStyle w:val="BodyText"/>
+      </w:pPr>
+      <w:r>
+        <w:t xml:space="preserve">Below, we describe the procedures, their methods, and outcomes. Figure 2 previews what the test distinguishes, the sharp structure a bounded group would leave against the blur that drift produces, and why, on a record of this size and time-averaging, a weak within-basin boundary cannot be excluded.</w:t>
       </w:r>
     </w:p>
     <w:p>
@@ -1533,7 +1544,7 @@
         <w:t xml:space="preserve">(Lipo 2001)</w:t>
       </w:r>
       <w:r>
-        <w:t xml:space="preserve">. Each decorated class is a unit of measurement that the analyst defines to capture stylistic variation, not a native category assumed in advance. We restrict the analysis to the St. Francis basin of northeastern Arkansas, the setting of Parkin, defined hydrologically as the assemblages within 20 km of the St. Francis, Tyronza, and L’Anguille drainage (Figure 1). This yields 29 decorated assemblages for the transmission analysis and 92 sites for the settlement comparison. The basin is a geographic unit, not a single culture-historical phase: under the standard regional scheme its assemblages fall into the Parkin phase together with sites assigned to the Nodena, Kent, Walls, and Parchman phases</w:t>
+        <w:t xml:space="preserve">. Each decorated class is a unit of measurement that the analyst defines to capture stylistic variation, not a native category assumed in advance. We restrict the analysis to the St. Francis basin of northeastern Arkansas, the setting of Parkin, defined hydrologically as the assemblages within 20 km of the St. Francis, Tyronza, and L’Anguille drainage (Figure 1). This yields 29 decorated assemblages for the transmission analysis and 92 sites for the settlement comparison. The basin is a geographic unit, not a single culture-historical phase: under the standard regional scheme, its assemblages fall into the Parkin phase together with sites assigned to the Nodena, Kent, Walls, and Parchman phases</w:t>
       </w:r>
       <w:r>
         <w:t xml:space="preserve"> </w:t>
@@ -1542,7 +1553,7 @@
         <w:t xml:space="preserve">(Mainfort 2003; Phillips 1970)</w:t>
       </w:r>
       <w:r>
-        <w:t xml:space="preserve">. The test therefore asks whether interaction closed into bounded groups anywhere in the basin, across the phase divisions that culture history draws within it as well as within the Parkin phase. The set excludes the lower Yazoo Basin to the south. A stricter watershed rule, keeping only assemblages nearer the St. Francis system than the Mississippi, gives 19. The verdict reported below is unchanged across both definitions. The two southern St. Francis-type sites the drainage rule excludes, Old Town and Blanchard, lie 28 and 80 km from the St. Francis system and belong to the Mississippi-proximal and lower Yazoo settings rather than to the St. Francis drainage. We georeferenced each assemblage through the Lower Mississippi Survey site files. We used settlement attributes, site size, mound count and height, and the presence of defensive ditches and St-Francis-type fortification, from a regional geographic database</w:t>
+        <w:t xml:space="preserve">. The test, therefore, asks whether interaction closed into bounded groups anywhere in the basin, across the phase divisions that culture history draws within it, and within the Parkin phase. The set excludes the lower Yazoo Basin to the south. A stricter watershed rule, keeping only assemblages nearer the St. Francis system than the Mississippi, gives 19. The verdict reported below is unchanged across both definitions. The two southern St. Francis-type sites the drainage rule excludes, Old Town and Blanchard, lie 28 and 80 km from the St. Francis system and belong to the Mississippi-proximal and lower Yazoo settings rather than to the St. Francis drainage. We georeferenced each assemblage through the Lower Mississippi Survey site files. We used settlement attributes, site size, mound count and height, and the presence of defensive ditches and St-Francis-type fortification, from a regional geographic database</w:t>
       </w:r>
       <w:r>
         <w:t xml:space="preserve"> </w:t>
@@ -2489,7 +2500,7 @@
         <w:pStyle w:val="BodyText"/>
       </w:pPr>
       <w:r>
-        <w:t xml:space="preserve">That characterization can be made constructive rather than merely consistent with the data. Run the finite-population network-drift model forward on the real configuration of the assemblages, with copying that decays with along-waterway distance and no boundary imposed, and the structure the phase concept reads as a society reappears on its own</w:t>
+        <w:t xml:space="preserve">That characterization can be made constructive rather than merely consistent with the data. Run the finite-population network-drift model forward on the real configuration of the assemblages, with copying that decays with along-waterway distance and no boundary imposed, and the structure of the phase concept reads as a society reappears on its own</w:t>
       </w:r>
       <w:r>
         <w:t xml:space="preserve"> </w:t>
@@ -2498,7 +2509,7 @@
         <w:t xml:space="preserve">(Lipo et al. 2021)</w:t>
       </w:r>
       <w:r>
-        <w:t xml:space="preserve">. Across the 55 decorated assemblages of the wider lower Mississippi Valley, the model repeatedly produces a few spatially coherent, phase-like groups (Figure 8). The deposits are not contemporaneous, which is why they can be seriated at all and why some carry more of the late classes than others, so each synthetic assemblage is drawn time-transgressively at the run-time that matches its seriation position. Holding time fixed to isolate the spatial signal, drift yields two to five groups whose number grows with geographic extent; restoring the staggered deposition ages collapses the count toward two time-defined groups, because assemblages caught at different points in the sequence carry different repertoires. Either way the number of drift-generated groups falls well short of the seven named phases the regional scheme draws across the same assemblages, and the between-group cultural F_ST of those groups settles at the observed level rather than the higher value a bounded group would leave. The named phases therefore subdivide the valley more finely than the transmission structure supports. That spatial and population structure, not population size, governs how drift partitions diversity in finite structured populations is established in both the cultural-transmission and population-genetics literatures</w:t>
+        <w:t xml:space="preserve">. Across the 55 decorated assemblages of the wider lower Mississippi Valley, the model repeatedly produces a few spatially coherent, phase-like groups (Figure 8). The deposits are not contemporaneous, which is why they can be seriated at all and why some carry more of the late classes than others, so each synthetic assemblage is drawn time-transgressively at the run-time that matches its seriation position. Holding time fixed to isolate the spatial signal, drift yields two to five groups whose number grows with geographic extent; restoring the staggered deposition ages collapses the count toward two time-defined groups, because assemblages caught at different points in the sequence carry different repertoires. Either way, the number of drift-generated groups falls well short of the seven named phases the regional scheme draws across the same assemblages, and the between-group cultural F_ST of those groups settles at the observed level rather than the higher value a bounded group would leave. The named phases, therefore, subdivide the valley more finely than the transmission structure supports. That spatial and population structure, not population size, governs how drift partitions diversity in finite structured populations is established in both the cultural-transmission and population-genetics literatures</w:t>
       </w:r>
       <w:r>
         <w:t xml:space="preserve"> </w:t>
@@ -2533,7 +2544,7 @@
         <w:pStyle w:val="BodyText"/>
       </w:pPr>
       <w:r>
-        <w:t xml:space="preserve">The same model lets the named phases be tested one at a time, in the culture historian’s own terms. Taking Parkin as the focal case, membership in its group is a probability rather than a fact: across the 500 runs each assemblage shares Parkin’s drift-detected group some fraction of the time, a graded field that falls off smoothly with river distance from Parkin rather than the bounded set a phase map implies (Figure 9A). The Parkin-phase assemblages do separate from the others by this measure, but that is the separation drift predicts, because they lie near Parkin and so co-occur with it more than distant assemblages do (Figure 9B). The discriminating test is whether the between-group cultural F_ST across the Parkin-versus-others partition exceeds the drift null. It sits at the extreme upper tail of the null and survives most single-site deletions, but it is small, the null’s own tail reaches past it, and time-averaging, which deflates between-group variance, is not modeled in the null (Figure 9C, 9D). It is therefore at most a weak hint of structure beyond drift, not a demonstrated social boundary. Geography and time are the whole engine, and the apparent groups are readings of one neutral process.</w:t>
+        <w:t xml:space="preserve">The same model lets the named phases be tested one at a time, in the culture historian’s own terms. Taking Parkin as the focal case, membership in its group is a probability rather than a fact: across the 500 runs, each assemblage shares Parkin’s drift-detected group some fraction of the time, a graded field that falls off smoothly with river distance from Parkin rather than the bounded set a phase map implies (Figure 9A). The Parkin-phase assemblages do separate from the others by this measure, but that is the separation that drift predicts, because they lie near Parkin and so co-occur with it more than distant assemblages do (Figure 9B). The discriminating test is whether the between-group cultural F_ST across the Parkin-versus-others partition exceeds the drift null. It sits at the extreme upper tail of the null and survives most single-site deletions, but it is small, the null’s own tail reaches past it, and time-averaging, which deflates between-group variance, is not modeled in the null (Figure 9C, 9D). It is therefore at most a weak hint of structure beyond drift, not a demonstrated social boundary. Geography and time are the whole engine, and the apparent groups are readings from a single neutral process.</w:t>
       </w:r>
     </w:p>
     <w:p>
@@ -2545,7 +2556,7 @@
           <wp:inline>
             <wp:extent cx="5334000" cy="2824401"/>
             <wp:effectExtent b="0" l="0" r="0" t="0"/>
-            <wp:docPr descr="Figure 8. Phase-like groups produced by neutral drift across the wider lower Mississippi Valley, with no bounded group imposed, summarized over 500 realizations. The finite-population network-drift model runs forward on the river-network geography of all 55 Mainfort-PFG decorated assemblages, and groups are detected as greedy-modularity communities on the Brainerd-Robinson similarity graph (Supplemental Text). (A) Distribution of the number of groups across the 500 runs, under contemporaneous (pure-space) and time-transgressive sampling, with the seven named culture-historical phases and the observed cluster count marked. Pure spatial drift yields two to five groups and the count grows with geographic extent; time-transgressive sampling collapses it toward two. Either way drift produces far fewer groups than the seven named phases, so the phases subdivide the valley more finely than the transmission structure supports. (B) Between-group cultural F_ST across runs against the observed level (0.04); the observed differentiation sits at the upper edge of the contemporaneous-drift distribution, so drift reproduces it. Parameters are the positive-control corner (interaction length 24 river-km, mixing 0.02, innovation 0.012); the basin positive control and the parameter-grid robustness are in Figures S7 and S8." title="" id="45" name="Picture"/>
+            <wp:docPr descr="Figure 8. Phase-like groups produced by neutral drift across the wider lower Mississippi Valley, with no bounded group imposed, summarized over 500 realizations. The finite-population network-drift model runs forward on the river-network geography of all 55 Mainfort-PFG decorated assemblages, and groups are detected as greedy-modularity communities on the Brainerd-Robinson similarity graph (Supplemental Text). (A) Distribution of the number of groups across the 500 runs, under contemporaneous (pure-space) and time-transgressive sampling, with the seven named culture-historical phases and the observed cluster count marked. Pure spatial drift yields two to five groups, and the count grows with geographic extent; time-transgressive sampling collapses it toward two. Either way, drift produces far fewer groups than the seven named phases, so the phases subdivide the valley more finely than the transmission structure supports. (B) Between-group cultural F_ST across runs against the observed level (0.04); the observed differentiation sits at the upper edge of the contemporaneous-drift distribution, so drift reproduces it. Parameters are the positive-control corner (interaction length 24 river-km, mixing 0.02, innovation 0.012); the basin positive control and the parameter-grid robustness are in Figures S7 and S8." title="" id="45" name="Picture"/>
             <a:graphic>
               <a:graphicData uri="http://schemas.openxmlformats.org/drawingml/2006/picture">
                 <pic:pic>
@@ -2598,7 +2609,7 @@
         <w:t xml:space="preserve"> </w:t>
       </w:r>
       <w:r>
-        <w:t xml:space="preserve">Phase-like groups produced by neutral drift across the wider lower Mississippi Valley, with no bounded group imposed, summarized over 500 realizations. The finite-population network-drift model runs forward on the river-network geography of all 55 Mainfort-PFG decorated assemblages, and groups are detected as greedy-modularity communities on the Brainerd-Robinson similarity graph (Supplemental Text). (A) Distribution of the number of groups across the 500 runs, under contemporaneous (pure-space) and time-transgressive sampling, with the seven named culture-historical phases and the observed cluster count marked. Pure spatial drift yields two to five groups and the count grows with geographic extent; time-transgressive sampling collapses it toward two. Either way drift produces far fewer groups than the seven named phases, so the phases subdivide the valley more finely than the transmission structure supports. (B) Between-group cultural F_ST across runs against the observed level (0.04); the observed differentiation sits at the upper edge of the contemporaneous-drift distribution, so drift reproduces it. Parameters are the positive-control corner (interaction length 24 river-km, mixing 0.02, innovation 0.012); the basin positive control and the parameter-grid robustness are in Figures S7 and S8.</w:t>
+        <w:t xml:space="preserve">Phase-like groups produced by neutral drift across the wider lower Mississippi Valley, with no bounded group imposed, summarized over 500 realizations. The finite-population network-drift model runs forward on the river-network geography of all 55 Mainfort-PFG decorated assemblages, and groups are detected as greedy-modularity communities on the Brainerd-Robinson similarity graph (Supplemental Text). (A) Distribution of the number of groups across the 500 runs, under contemporaneous (pure-space) and time-transgressive sampling, with the seven named culture-historical phases and the observed cluster count marked. Pure spatial drift yields two to five groups, and the count grows with geographic extent; time-transgressive sampling collapses it toward two. Either way, drift produces far fewer groups than the seven named phases, so the phases subdivide the valley more finely than the transmission structure supports. (B) Between-group cultural F_ST across runs against the observed level (0.04); the observed differentiation sits at the upper edge of the contemporaneous-drift distribution, so drift reproduces it. Parameters are the positive-control corner (interaction length 24 river-km, mixing 0.02, innovation 0.012); the basin positive control and the parameter-grid robustness are in Figures S7 and S8.</w:t>
       </w:r>
     </w:p>
     <w:p>
@@ -2610,7 +2621,7 @@
           <wp:inline>
             <wp:extent cx="5334000" cy="5163057"/>
             <wp:effectExtent b="0" l="0" r="0" t="0"/>
-            <wp:docPr descr="Figure 9. Does the Parkin phase separate from the other named phases by more than drift? All 55 Mainfort-PFG decorated assemblages, labeled by culture-historical phase after Mainfort (1996b), under time-transgressive river-network drift with no boundary imposed (500 realizations). (A) Each assemblage shaded by the probability that it shares Parkin’s drift-detected group (star), with Parkin-phase assemblages drawn as circles and other phases as squares; the probability is a graded field that falls with river distance from Parkin. (B) That co-membership for the Parkin phase against the other phases (AUC 0.88), the separation drift predicts from geography. (C) Observed Parkin-versus-others between-group cultural F_ST (dashed) against the drift null; 0.4 percent of runs reach or exceed it, and the null’s tail extends past it. (D) Leave-one-out jackknife: the observed F_ST with each Parkin assemblage relabeled into the comparison group, against the 2.5 to 97.5 percentile band of its matched per-drop null. Open points fall inside the band (drift-consistent), filled points outside; seven of the eight single drops stay outside, so the small contrast does not rest on one assemblage." title="" id="48" name="Picture"/>
+            <wp:docPr descr="Figure 9. Does the Parkin phase separate from the other named phases by more than drift? All 55 Mainfort-PFG decorated assemblages, labeled by culture-historical phase after Mainfort (1996b), under time-transgressive river-network drift with no boundary imposed (500 realizations). (A) Each assemblage is shaded by the probability that it shares Parkin’s drift-detected group (star), with Parkin-phase assemblages drawn as circles and other phases as squares; the probability is a graded field that falls with river distance from Parkin. (B) That co-membership for the Parkin phase against the other phases (AUC 0.88) reflects the separation drift predicted by geography. (C) Observed Parkin-versus-others between-group cultural F_ST (dashed) against the drift null; 0.4 percent of runs reach or exceed it, and the null’s tail extends past it. (D) Leave-one-out jackknife: the observed F_ST with each Parkin assemblage relabeled into the comparison group, against the 2.5 to 97.5 percentile band of its matched per-drop null. Open points fall inside the band (drift-consistent), filled points outside; seven of the eight single drops stay outside, so the small contrast does not rest on one assemblage." title="" id="48" name="Picture"/>
             <a:graphic>
               <a:graphicData uri="http://schemas.openxmlformats.org/drawingml/2006/picture">
                 <pic:pic>
@@ -2672,7 +2683,7 @@
         <w:t xml:space="preserve">(1996b)</w:t>
       </w:r>
       <w:r>
-        <w:t xml:space="preserve">, under time-transgressive river-network drift with no boundary imposed (500 realizations). (A) Each assemblage shaded by the probability that it shares Parkin’s drift-detected group (star), with Parkin-phase assemblages drawn as circles and other phases as squares; the probability is a graded field that falls with river distance from Parkin. (B) That co-membership for the Parkin phase against the other phases (AUC 0.88), the separation drift predicts from geography. (C) Observed Parkin-versus-others between-group cultural F_ST (dashed) against the drift null; 0.4 percent of runs reach or exceed it, and the null’s tail extends past it. (D) Leave-one-out jackknife: the observed F_ST with each Parkin assemblage relabeled into the comparison group, against the 2.5 to 97.5 percentile band of its matched per-drop null. Open points fall inside the band (drift-consistent), filled points outside; seven of the eight single drops stay outside, so the small contrast does not rest on one assemblage.</w:t>
+        <w:t xml:space="preserve">, under time-transgressive river-network drift with no boundary imposed (500 realizations). (A) Each assemblage is shaded by the probability that it shares Parkin’s drift-detected group (star), with Parkin-phase assemblages drawn as circles and other phases as squares; the probability is a graded field that falls with river distance from Parkin. (B) That co-membership for the Parkin phase against the other phases (AUC 0.88) reflects the separation drift predicted by geography. (C) Observed Parkin-versus-others between-group cultural F_ST (dashed) against the drift null; 0.4 percent of runs reach or exceed it, and the null’s tail extends past it. (D) Leave-one-out jackknife: the observed F_ST with each Parkin assemblage relabeled into the comparison group, against the 2.5 to 97.5 percentile band of its matched per-drop null. Open points fall inside the band (drift-consistent), filled points outside; seven of the eight single drops stay outside, so the small contrast does not rest on one assemblage.</w:t>
       </w:r>
     </w:p>
     <w:p>
@@ -2731,7 +2742,7 @@
         <w:pStyle w:val="BodyText"/>
       </w:pPr>
       <w:r>
-        <w:t xml:space="preserve">One result resists the drift reading, if only faintly, and deserves to be named rather than buried. The single place in the valley that carries a whisper of structure beyond drift is the Parkin phase, and Parkin is the one monumental node, the largest mound, the palisade, the confluence position, the candidate Casqui. A center beginning to differentiate as a distinct node, rather than a finished bounded group, would leave just such a signal, and this is what the origination stage of the two-regime model predicts: a local return generates group-beneficial pattern at a node before assortment becomes binding and propagates into higher-level structure, with contact and the protohistoric depopulation truncating the sequence before it could consolidate. We do not claim this happened. The contrast is small, the drift null reaches past it, and the time-averaged surface record of eight Parkin-phase assemblages cannot bear the weight. The possibility that Parkin was an incipient node nonetheless warrants direct investigation with data classes the present record lacks: stratified, excavated assemblages with independent radiocarbon, to test whether the differentiation grows through time rather than holding flat; compositional and petrographic sourcing of the ceramics, to test whether production and exchange were localizing on the center; and the non-ceramic lines, the chert-hoe and shell exchange networks</w:t>
+        <w:t xml:space="preserve">One result resists the drift reading, if only faintly, and deserves to be named rather than buried. The single place in the valley that carries a whisper of structure beyond drift is the Parkin phase, and Parkin is the one monumental node, the largest mound, the palisade, the confluence position, the candidate Casqui. A center beginning to differentiate as a distinct node, rather than a finished bounded group, would leave just such a signal, and this is what the origination stage of the two-regime model predicts: a local return generates a group-beneficial pattern at a node before assortment becomes binding and propagates into higher-level structure, with contact and the protohistoric depopulation truncating the sequence before it could consolidate. We do not claim this happened. The contrast is small, the drift null reaches past it, and the time-averaged surface record of eight Parkin-phase assemblages cannot bear the weight. The possibility that Parkin was an incipient node nonetheless warrants direct investigation with data classes the present record lacks: stratified, excavated assemblages with independent radiocarbon, to test whether the differentiation grows through time rather than holding flat; compositional and petrographic sourcing of the ceramics, to test whether production and exchange were localizing on the center; and the non-ceramic lines, the chert-hoe and shell exchange networks</w:t>
       </w:r>
       <w:r>
         <w:t xml:space="preserve"> </w:t>
@@ -2752,7 +2763,7 @@
         <w:t xml:space="preserve">(Ross-Stallings 2017)</w:t>
       </w:r>
       <w:r>
-        <w:t xml:space="preserve">, to show whether economic and social differentiation track the ceramic hint or run independent of it. Whether Parkin was beginning to pull away from its neighbors, or simply sits where drift on the river network happens to concentrate interaction, is a question this record raises but cannot settle.</w:t>
+        <w:t xml:space="preserve">, to show whether economic and social differentiation track the ceramic hint or run independent of it. Whether Parkin was beginning to pull away from its neighbors, or sits where drift on the river network happens to concentrate interaction, is a question this record raises but cannot settle.</w:t>
       </w:r>
     </w:p>
     <w:p>

</xml_diff>

<commit_message>
Sync manuscript and bib from working repo
Bring the public repo's manuscript up to date with the working copy: the
calibrated drift-vs-groups reframe of the four-signature criterion and Table 1,
the standardized prose (replacing the 'reading' idiom), the tightened abstract,
the new intro phase-list sentence, and the added/corrected phase-source
references (house_1991, morse_d_1990, smith_1990, starr_1984; Nodena and Walls
citation fixes; Lyman 2021 and Williams 1990 flags cleared). Rebuilt docx/pdf
for the main text and supplement.
</commit_message>
<xml_diff>
--- a/docs/manuscript/MAIN_TEXT.docx
+++ b/docs/manuscript/MAIN_TEXT.docx
@@ -2,7 +2,7 @@
 <file path=word/document.xml><?xml version="1.0" encoding="utf-8"?>
 <w:document xmlns:w="http://schemas.openxmlformats.org/wordprocessingml/2006/main" xmlns:m="http://schemas.openxmlformats.org/officeDocument/2006/math" xmlns:r="http://schemas.openxmlformats.org/officeDocument/2006/relationships" xmlns:o="urn:schemas-microsoft-com:office:office" xmlns:v="urn:schemas-microsoft-com:vml" xmlns:w10="urn:schemas-microsoft-com:office:word" xmlns:a="http://schemas.openxmlformats.org/drawingml/2006/main" xmlns:pic="http://schemas.openxmlformats.org/drawingml/2006/picture" xmlns:wp="http://schemas.openxmlformats.org/drawingml/2006/wordprocessingDrawing">
   <w:body>
-    <w:bookmarkStart w:id="238" w:name="X093902eb68652ea32f5548e74607f4e4b0f6699"/>
+    <w:bookmarkStart w:id="242" w:name="X093902eb68652ea32f5548e74607f4e4b0f6699"/>
     <w:p>
       <w:pPr>
         <w:pStyle w:val="Heading1"/>
@@ -37,7 +37,7 @@
         <w:pStyle w:val="FirstParagraph"/>
       </w:pPr>
       <w:r>
-        <w:t xml:space="preserve">The phase, Mississippian archaeology’s foundational unit, rests on a silent premise: that assemblages more similar to nearby than to distant neighbors record a bounded society. This is rarely tested, yet neutral transmission produces the same clustering with no bounded groups: drift concentrates similar styles nearby. For the late pre-contact central Mississippi Valley, we test whether decorated ceramic similarity records reflect bounded interaction groups or spatially structured drift. We compare drift and bounded-groups processes on the region’s geographic data, calibrated to the record’s small samples and time-averaging using a signal-recovery experiment. In both the St. Francis basin and the southeast-Missouri assemblages, drift reproduces the structure without bounded groups. Across the wider valley, it generates far fewer coherent groups than the named phase scheme draws. Parkin is a transmission bridge rather than a capital. Tested directly against the other named phases, it shows at most a weak signal at the edge of the drift expectation. A sharper boundary appears only between the central and lower valleys, confounded with chronological turnover and analytical history. Before similarity is read as social, a record must be shown to be able to distinguish groups from drift.</w:t>
+        <w:t xml:space="preserve">The phase, one of archaeology’s foundational units, rests on the silent premise that assemblages more similar to nearby than to distant neighbors record a bounded society. While the validity of phases has been questioned, the rationale for assuming these units is rarely tested or evaluated. Neutral transmission produces the same clustering with no bounded groups since drift concentrates similar styles nearby. For the late pre-contact central Mississippi Valley, we test whether decorated ceramic similarity records reflect bounded interaction groups or spatially structured drift. We compare drift and bounded-groups processes on the region’s geographic data, calibrated to the record’s small samples and time-averaging using a signal-recovery experiment. In both the St. Francis basin and the southeast-Missouri assemblages, drift reproduces the structure without bounded groups. Across the wider valley, it generates far fewer coherent groups than the named phase scheme draws. We find that Parkin, often considered the center of a polity, is a transmission bridge rather than a capital. Tested directly against the other named phases, it shows at most a weak signal at the edge of the drift expectation. A sharper boundary appears only between the central and lower valleys, confounded with chronological turnover and analytical history. Before similarity is interpreted as social, a record must be shown to be able to distinguish groups from drift.</w:t>
       </w:r>
     </w:p>
     <w:p>
@@ -73,7 +73,7 @@
         <w:pStyle w:val="FirstParagraph"/>
       </w:pPr>
       <w:r>
-        <w:t xml:space="preserve">La fase, unidad fundamental de la arqueología misisipiana, descansa sobre una premisa tácita: que los conjuntos más similares a sus vecinos cercanos que a los distantes registran una sociedad delimitada. Esto rara vez se pone a prueba, aunque la transmisión cultural neutral produce el mismo agrupamiento sin grupos delimitados: la deriva concentra estilos similares en áreas cercanas. Para el valle central del Misisipi de finales del período precontacto, evaluamos si la similitud de la cerámica decorada registra grupos de interacción delimitados o deriva estructurada espacialmente. Comparamos dos procesos generativos, deriva y grupos delimitados, sobre la geografía real de los conjuntos, calibrando la comparación a los tamaños de muestra pequeños y al promediado temporal del registro mediante un experimento de recuperación de señal. Tanto en la cuenca del St. Francis como en los conjuntos del sureste de Misuri, la estructura se reproduce mediante deriva y no requiere grupos delimitados, y en el conjunto del valle la deriva genera muchos menos grupos coherentes de los que distingue el esquema de fases nombradas. Parkin es un puente de transmisión más que una capital. Evaluada directamente frente a las demás fases nombradas, la fase Parkin muestra a lo sumo una señal débil en el límite de lo que predice la deriva. Una frontera más marcada aparece solo entre el valle central y el valle inferior, confundida con el recambio cronológico y la historia analítica. Antes de interpretar la similitud como social, debe demostrarse que un registro puede distinguir los grupos de la deriva.</w:t>
+        <w:t xml:space="preserve">La fase, una de las unidades fundamentales de la arqueología, descansa sobre una premisa tácita: que los conjuntos más similares a sus vecinos cercanos que a los distantes registran una sociedad delimitada. Aunque la validez de las fases ha sido cuestionada, la justificación para asumir estas unidades rara vez se pone a prueba o se evalúa. La transmisión cultural neutral produce el mismo agrupamiento sin grupos delimitados, ya que la deriva concentra estilos similares en áreas cercanas. Para el valle central del Misisipi de finales del período precontacto, evaluamos si la similitud de la cerámica decorada registra grupos de interacción delimitados o deriva estructurada espacialmente. Comparamos dos procesos generativos, deriva y grupos delimitados, sobre la geografía real de los conjuntos, calibrando la comparación a los tamaños de muestra pequeños y al promediado temporal del registro mediante un experimento de recuperación de señal. Tanto en la cuenca del St. Francis como en los conjuntos del sureste de Misuri, la estructura se reproduce mediante deriva y no requiere grupos delimitados, y en el conjunto del valle la deriva genera muchos menos grupos coherentes de los que distingue el esquema de fases nombradas. Encontramos que Parkin, a menudo considerada el centro de una entidad política, es un puente de transmisión más que una capital. Evaluada directamente frente a las demás fases nombradas, la fase Parkin muestra a lo sumo una señal débil en el límite de lo que predice la deriva. Una frontera más marcada aparece solo entre el valle central y el valle inferior, confundida con el recambio cronológico y la historia analítica. Antes de interpretar la similitud como social, debe demostrarse que un registro puede distinguir los grupos de la deriva.</w:t>
       </w:r>
     </w:p>
     <w:p>
@@ -109,16 +109,82 @@
         <w:pStyle w:val="FirstParagraph"/>
       </w:pPr>
       <w:r>
-        <w:t xml:space="preserve">Parkin is the largest of the moated, palisaded towns of the St. Francis basin in northeastern Arkansas. The chronicles of the Hernando de Soto expedition place it as Casqui, the seat of a paramount chief, which the expedition encountered in 1541</w:t>
-      </w:r>
-      <w:r>
-        <w:t xml:space="preserve"> </w:t>
-      </w:r>
-      <w:r>
-        <w:t xml:space="preserve">(Hudson et al. 1990; Mitchem 2001; Morse 1990)</w:t>
-      </w:r>
-      <w:r>
-        <w:t xml:space="preserve">. On the strength of its size, fortification, platform mound, and ethnohistoric identification, Parkin is routinely read as the center of a Mississippian polity, on the long-standing assumption that a dominant mound center marks the apex of a ranked society</w:t>
+        <w:t xml:space="preserve">The late pre-contact record of the Lower Mississippi River Valley is traditionally divided into a series of spatially and temporally bounded units known as phases (Figure 1). These units include the Kent</w:t>
+      </w:r>
+      <w:r>
+        <w:t xml:space="preserve"> </w:t>
+      </w:r>
+      <w:r>
+        <w:t xml:space="preserve">(House 1991)</w:t>
+      </w:r>
+      <w:r>
+        <w:t xml:space="preserve">, Nodena</w:t>
+      </w:r>
+      <w:r>
+        <w:t xml:space="preserve"> </w:t>
+      </w:r>
+      <w:r>
+        <w:t xml:space="preserve">(Dan F. Morse 1990)</w:t>
+      </w:r>
+      <w:r>
+        <w:t xml:space="preserve">, Parchman</w:t>
+      </w:r>
+      <w:r>
+        <w:t xml:space="preserve"> </w:t>
+      </w:r>
+      <w:r>
+        <w:t xml:space="preserve">(Starr 1984)</w:t>
+      </w:r>
+      <w:r>
+        <w:t xml:space="preserve">, Tipton</w:t>
+      </w:r>
+      <w:r>
+        <w:t xml:space="preserve"> </w:t>
+      </w:r>
+      <w:r>
+        <w:t xml:space="preserve">(Smith 1990)</w:t>
+      </w:r>
+      <w:r>
+        <w:t xml:space="preserve">, Walls</w:t>
+      </w:r>
+      <w:r>
+        <w:t xml:space="preserve"> </w:t>
+      </w:r>
+      <w:r>
+        <w:t xml:space="preserve">(Smith 1990)</w:t>
+      </w:r>
+      <w:r>
+        <w:t xml:space="preserve">, Jones Bayou</w:t>
+      </w:r>
+      <w:r>
+        <w:t xml:space="preserve"> </w:t>
+      </w:r>
+      <w:r>
+        <w:t xml:space="preserve">(Smith 1990)</w:t>
+      </w:r>
+      <w:r>
+        <w:t xml:space="preserve">, and Parkin</w:t>
+      </w:r>
+      <w:r>
+        <w:t xml:space="preserve"> </w:t>
+      </w:r>
+      <w:r>
+        <w:t xml:space="preserve">(Phyllis A. Morse 1990)</w:t>
+      </w:r>
+      <w:r>
+        <w:t xml:space="preserve"> </w:t>
+      </w:r>
+      <w:r>
+        <w:t xml:space="preserve">phases. The Parkin phase stands out among these units because it includes the Parkin site, the largest of the moated, palisaded towns in the St. Francis basin of northeastern Arkansas. The chronicles of the Hernando de Soto expedition place it as Casqui, the seat of a paramount chief, which the expedition encountered in 1541</w:t>
+      </w:r>
+      <w:r>
+        <w:t xml:space="preserve"> </w:t>
+      </w:r>
+      <w:r>
+        <w:t xml:space="preserve">(Hudson et al. 1990; Mitchem 2001; Phyllis A. Morse 1990)</w:t>
+      </w:r>
+      <w:r>
+        <w:t xml:space="preserve">. On the strength of its size, fortification, platform mound, and ethnohistoric identification, Parkin is routinely interpreted as the center of a Mississippian polity, on the long-standing assumption that a dominant mound center marks the apex of a ranked society</w:t>
       </w:r>
       <w:r>
         <w:t xml:space="preserve"> </w:t>
@@ -133,10 +199,10 @@
         <w:t xml:space="preserve"> </w:t>
       </w:r>
       <w:r>
-        <w:t xml:space="preserve">(Morse 1990)</w:t>
-      </w:r>
-      <w:r>
-        <w:t xml:space="preserve">. That reading is a specific claim about social structure: that the Parkin phase was a bounded, hierarchically organized society with Parkin at its apex.</w:t>
+        <w:t xml:space="preserve">(Phyllis A. Morse 1990)</w:t>
+      </w:r>
+      <w:r>
+        <w:t xml:space="preserve">. That interpretation is a specific claim about social structure: that the Parkin phase was a bounded, hierarchically organized society with Parkin at its apex.</w:t>
       </w:r>
     </w:p>
     <w:p>
@@ -144,7 +210,7 @@
         <w:pStyle w:val="BodyText"/>
       </w:pPr>
       <w:r>
-        <w:t xml:space="preserve">Whether such an entity existed at Parkin is an empirical question, and settlement morphology alone cannot answer it. A primary center of interaction, a palisade, and a monumental mound are each as compatible with a landscape of competing peer communities as with a consolidated hierarchy</w:t>
+        <w:t xml:space="preserve">Whether such an entity existed at Parkin is an empirical question. Settlement morphology alone cannot answer this question, since the presence of a primary center of interaction, a palisade, and a monumental mound is equally compatible with a landscape of competing peer communities as it is with a centralized and consolidated hierarchy</w:t>
       </w:r>
       <w:r>
         <w:t xml:space="preserve"> </w:t>
@@ -153,16 +219,16 @@
         <w:t xml:space="preserve">(King and Freer 1995; Rees 2001)</w:t>
       </w:r>
       <w:r>
-        <w:t xml:space="preserve">. The chronicles describe Casqui and its neighbor Pacaha in open conflict, a relationship read both as rivalry between competing peers and as a ranked order in which Casqui stood below Pacaha, so the chronicles do not by themselves establish a single consolidated hierarchy over the Parkin phase</w:t>
-      </w:r>
-      <w:r>
-        <w:t xml:space="preserve"> </w:t>
-      </w:r>
-      <w:r>
-        <w:t xml:space="preserve">(Hudson et al. 1990; Morse 1990)</w:t>
-      </w:r>
-      <w:r>
-        <w:t xml:space="preserve">. We therefore ask what the material record shows when it is measured rather than read through the polity model. The comparable evidence shows no hierarchy. Within the basin, settlement size is graded rather than redistributive. The regional production of the capacity-linked chert hoes whose control would mark an economic apex was decentralized, and their exchange followed a down-the-line gradient rather than central redistribution</w:t>
+        <w:t xml:space="preserve">. The chronicles describe Casqui and its neighbor Pacaha in open conflict, a relationship interpreted both as rivalry between competing peers and as a ranked order in which Casqui stood below Pacaha, so the chronicles do not by themselves establish a single consolidated hierarchy over the Parkin phase</w:t>
+      </w:r>
+      <w:r>
+        <w:t xml:space="preserve"> </w:t>
+      </w:r>
+      <w:r>
+        <w:t xml:space="preserve">(Hudson et al. 1990; Phyllis A. Morse 1990)</w:t>
+      </w:r>
+      <w:r>
+        <w:t xml:space="preserve">. We therefore ask what the material record shows when it is measured rather than interpreted through the polity model. The comparable evidence shows no hierarchy. Within the basin, settlement size is graded rather than redistributive. The regional production of the capacity-linked chert hoes whose control would mark an economic apex was decentralized, and their exchange followed a down-the-line gradient rather than central redistribution</w:t>
       </w:r>
       <w:r>
         <w:t xml:space="preserve"> </w:t>
@@ -179,7 +245,7 @@
         <w:pStyle w:val="BodyText"/>
       </w:pPr>
       <w:r>
-        <w:t xml:space="preserve">The more revealing question is why Parkin was taken for a polity in the first place. The answer is in the unit through which the record is read, a matter the renewed debate over archaeological systematics has brought back into focus</w:t>
+        <w:t xml:space="preserve">The more revealing question is why Parkin was taken for a polity in the first place. The answer lies in the unit through which the record is interpreted, a matter the renewed debate over archaeological systematics has brought back into focus</w:t>
       </w:r>
       <w:r>
         <w:t xml:space="preserve"> </w:t>
@@ -188,10 +254,7 @@
         <w:t xml:space="preserve">(Lyman 2021)</w:t>
       </w:r>
       <w:r>
-        <w:t xml:space="preserve"> </w:t>
-      </w:r>
-      <w:r>
-        <w:t xml:space="preserve">[CITE-CHECK: lyman_2021]. The Parkin phase is a culture-history construct, a set of assemblages grouped because their decorated-class frequencies seriate together and because the sites cluster in space</w:t>
+        <w:t xml:space="preserve">. The Parkin phase is a culture-history construct, a set of assemblages grouped because their decorated-class frequencies seriate together and because the sites cluster in space</w:t>
       </w:r>
       <w:r>
         <w:t xml:space="preserve"> </w:t>
@@ -230,7 +293,7 @@
         <w:t xml:space="preserve">(1954)</w:t>
       </w:r>
       <w:r>
-        <w:t xml:space="preserve">, defining the southeast-Missouri phases on which the regional scheme rests, adopted the social equation, writing that a phase probably equals a society. That equation, disavowed at the source and reinstated in regional practice, is the silent premise. It holds that assemblages more similar to one another than to their neighbors record a bounded, mutually interacting social group. Endow such a group with a primate center, and it becomes a polity. The polity reading is, therefore, built into the unit before any independent evidence of hierarchy is weighed, and the construct has been questioned on exactly this ground. The interrogation of phases is not new. Fox</w:t>
+        <w:t xml:space="preserve">, defining the southeast-Missouri phases on which the regional scheme rests, adopted the social equation, writing that a phase probably equals a society. That equation, disavowed at the source and reinstated in regional practice, is the silent premise. It holds that assemblages more similar to one another than to their neighbors record a bounded, mutually interacting social group. Endow such a group with a primate center, and it becomes a polity. The polity interpretation is, therefore, built into the unit before any independent evidence of hierarchy is weighed, and the construct has been questioned on exactly this ground. The interrogation of phases is not new. Fox</w:t>
       </w:r>
       <w:r>
         <w:t xml:space="preserve"> </w:t>
@@ -242,7 +305,7 @@
         <w:t xml:space="preserve"> </w:t>
       </w:r>
       <w:r>
-        <w:t xml:space="preserve">showed, for example, by cluster analysis and ordination, that the southeast-Missouri phases fail as both groups and classes, with their member assemblages assigned to statistical clusters at random rather than segregating by phase. Similarly, Mainfort</w:t>
+        <w:t xml:space="preserve">showed, for example, by cluster analysis and ordination, that the southeast-Missouri phases fail as both groups and classes, with their member assemblages assigned to statistical clusters at random rather than segregating by phase. Mainfort</w:t>
       </w:r>
       <w:r>
         <w:t xml:space="preserve"> </w:t>
@@ -254,7 +317,7 @@
         <w:t xml:space="preserve"> </w:t>
       </w:r>
       <w:r>
-        <w:t xml:space="preserve">found, by ordination of the late-period assemblages, little support for the validity of the existing culture-historical units, which overlap in ordination space rather than forming discrete clusters.</w:t>
+        <w:t xml:space="preserve">reached the same verdict by a different ordination, finding that the ordination of the late-period assemblages provides little support for the validity of the named phases, which overlap rather than forming discrete clusters.</w:t>
       </w:r>
     </w:p>
     <w:p>
@@ -262,7 +325,7 @@
         <w:pStyle w:val="BodyText"/>
       </w:pPr>
       <w:r>
-        <w:t xml:space="preserve">The premise is rarely tested, and it ignores a strong alternative. Viewed through the lens of social learning and models of cultural transmission, interaction is always continuous yet highly variable. Interaction is structured by distance and geography, as well as by social relationships. The task is to show how apparent differences between groups, such as phases, can arise under continuous interaction rather than requiring bounded groups. Under the neutral model of cultural transmission, decorated style behaves as a selectively neutral trait whose frequency drifts in a finite population of interacting learners</w:t>
+        <w:t xml:space="preserve">The premise, however, is tested only rarely and ignores a strong alternative. Viewed through the lens of social learning and models of cultural transmission, interaction is always continuous yet highly variable. Interaction is structured by distance and geography, as well as by social relationships. The task is to show how apparent differences between groups, such as phases, can arise under continuous interaction rather than requiring bounded groups. Under the neutral model of cultural transmission, decorated style behaves as a selectively neutral trait whose frequency drifts in a finite population of interacting learners</w:t>
       </w:r>
       <w:r>
         <w:t xml:space="preserve"> </w:t>
@@ -280,7 +343,7 @@
         <w:t xml:space="preserve">(Lipo et al. 2021)</w:t>
       </w:r>
       <w:r>
-        <w:t xml:space="preserve">. On this account, a phase can be the ordinary residue of continuous, distance-structured interaction, and the very pattern the culture-history tradition reads as a society, assemblages near each other in space and in style, is what spatially structured drift predicts. Telling a real interaction group apart from spatially structured drift requires a test that the tradition never applied, because the seriation coherence and spatial proximity that define the phase are equally the products of drift</w:t>
+        <w:t xml:space="preserve">. On this account, a phase can be the ordinary residue of continuous, distance-structured interaction, and the very pattern the culture-history tradition interprets as a society, assemblages near each other in space and in style, is what spatially structured drift predicts. Telling a real interaction group apart from spatially structured drift requires a test that the tradition never applied, because the seriation coherence and spatial proximity that define the phase are equally the products of drift</w:t>
       </w:r>
       <w:r>
         <w:t xml:space="preserve"> </w:t>
@@ -368,7 +431,7 @@
         <w:t xml:space="preserve">(Bailey 2007; Behrensmeyer et al. 2000; Holdaway and Wandsnider 2008; Perreault 2019; Stern 1994)</w:t>
       </w:r>
       <w:r>
-        <w:t xml:space="preserve">. Time-averaging, therefore, sets the resolution of the question rather than disqualifying it. A reorganization of transmission large enough to matter over the two centuries of the Parkin phase should register in the averaged frequency structure, and the drift-versus-groups test we develop reads that structure directly rather than an imagined moment behind it.</w:t>
+        <w:t xml:space="preserve">. Time-averaging, therefore, sets the resolution of the question rather than disqualifying it. A reorganization of transmission large enough to matter over the two centuries of the Parkin phase should register in the averaged frequency structure, and the drift-versus-groups test we develop measures that structure directly rather than an imagined moment behind it.</w:t>
       </w:r>
     </w:p>
     <w:p>
@@ -380,7 +443,7 @@
           <wp:inline>
             <wp:extent cx="4114800" cy="6930397"/>
             <wp:effectExtent b="0" l="0" r="0" t="0"/>
-            <wp:docPr descr="Figure 1. Decorated-ceramic assemblages of the central Mississippi Valley and the culture-historical phase scheme this paper tests. The seven Late Mississippian phases (Parkin, Nodena, Jones Bayou, Tipton, Kent, Walls, and Parchman) are shown as non-overlapping territories, a Voronoi partition of the assemblages Mainfort (1996b) assigns to each phase, over a local hydrology base (the St. Francis, Tyronza, and Mississippi rivers) with state and county boundaries. Each assemblage is plotted with a marker corresponding to its phase, and Parkin is marked with a star. The 29 assemblages of the St. Francis basin transmission set, those within 20 km of the St. Francis, Tyronza, and L’Anguille drainage, are ringed in black. The hydrological basin is a geographic unit that crosses the Parkin, Nodena, Kent, Walls, and Parchman phases. The bounded territories illustrate the premise the paper tests: that such areas host distinct, internally interacting societies. The transmission analysis finds instead that drift structured by geography explains the impression of groupness. The mapped assemblages fall in Arkansas, Tennessee, and Mississippi; Missouri lies just north of the frame. Inset: location in North America." title="" id="12" name="Picture"/>
+            <wp:docPr descr="Figure 1. Decorated-ceramic assemblages of the central Mississippi Valley and the culture-historical phase scheme this paper tests. The seven Late Mississippian phases (Parkin, Nodena, Jones Bayou, Tipton, Kent, Walls, and Parchman) are shown as discrete territories, a Voronoi partition of the assemblages Mainfort (1996b) assigns to each phase, dissolved by phase and drawn with a gap between adjacent territories for legibility, over a local hydrology base (the St. Francis, Tyronza, and Mississippi rivers) with state and county boundaries. Each assemblage is plotted with a marker corresponding to its phase, and Parkin is marked with a star. The bounded territories illustrate the premise the paper tests: that such areas host distinct, internally interacting societies. The transmission analysis finds instead that drift structured by geography explains the impression of groupness. The mapped assemblages fall in Arkansas, Tennessee, and Mississippi; Missouri lies just north of the frame. Inset: location in North America." title="" id="12" name="Picture"/>
             <a:graphic>
               <a:graphicData uri="http://schemas.openxmlformats.org/drawingml/2006/picture">
                 <pic:pic>
@@ -433,7 +496,7 @@
         <w:t xml:space="preserve"> </w:t>
       </w:r>
       <w:r>
-        <w:t xml:space="preserve">Decorated-ceramic assemblages of the central Mississippi Valley and the culture-historical phase scheme this paper tests. The seven Late Mississippian phases (Parkin, Nodena, Jones Bayou, Tipton, Kent, Walls, and Parchman) are shown as non-overlapping territories, a Voronoi partition of the assemblages Mainfort</w:t>
+        <w:t xml:space="preserve">Decorated-ceramic assemblages of the central Mississippi Valley and the culture-historical phase scheme this paper tests. The seven Late Mississippian phases (Parkin, Nodena, Jones Bayou, Tipton, Kent, Walls, and Parchman) are shown as discrete territories, a Voronoi partition of the assemblages Mainfort</w:t>
       </w:r>
       <w:r>
         <w:t xml:space="preserve"> </w:t>
@@ -445,7 +508,7 @@
         <w:t xml:space="preserve"> </w:t>
       </w:r>
       <w:r>
-        <w:t xml:space="preserve">assigns to each phase, over a local hydrology base (the St. Francis, Tyronza, and Mississippi rivers) with state and county boundaries. Each assemblage is plotted with a marker corresponding to its phase, and Parkin is marked with a star. The 29 assemblages of the St. Francis basin transmission set, those within 20 km of the St. Francis, Tyronza, and L’Anguille drainage, are ringed in black. The hydrological basin is a geographic unit that crosses the Parkin, Nodena, Kent, Walls, and Parchman phases. The bounded territories illustrate the premise the paper tests: that such areas host distinct, internally interacting societies. The transmission analysis finds instead that drift structured by geography explains the impression of groupness. The mapped assemblages fall in Arkansas, Tennessee, and Mississippi; Missouri lies just north of the frame. Inset: location in North America.</w:t>
+        <w:t xml:space="preserve">assigns to each phase, dissolved by phase and drawn with a gap between adjacent territories for legibility, over a local hydrology base (the St. Francis, Tyronza, and Mississippi rivers) with state and county boundaries. Each assemblage is plotted with a marker corresponding to its phase, and Parkin is marked with a star. The bounded territories illustrate the premise the paper tests: that such areas host distinct, internally interacting societies. The transmission analysis finds instead that drift structured by geography explains the impression of groupness. The mapped assemblages fall in Arkansas, Tennessee, and Mississippi; Missouri lies just north of the frame. Inset: location in North America.</w:t>
       </w:r>
     </w:p>
     <w:p>
@@ -462,7 +525,7 @@
         <w:t xml:space="preserve">(Barrett 2019; Crema et al. 2016; Kandler and Shennan 2015; Mesoudi 2021)</w:t>
       </w:r>
       <w:r>
-        <w:t xml:space="preserve">. We therefore compare the two processes in a generative manner. We simulate neutral spatial drift and bounded groups on the real coordinate layout of the assemblages and ask which reproduces the observed structure, using four transmission signatures, departure from neutral copying, breakdown of frequency-seriation coherence, between-group variance, and spatial assortativity, as diagnostics of whether interaction has closed rather than as a stand-alone test. Because an archaeological assemblage is time-averaged and sampled to varying depth, a signature can register a difference that is an artifact of sampling rather than of transmission, so we calibrate the comparison to the record by a signal-recovery experiment: into synthetic assemblages matched to the real number, sample sizes, and time-averaging we inject a known signal of tunable strength and read off how strong a real boundary would have to be to register. Only a calibrated comparison can license the conclusion that an absence of group structure is real rather than a failure of resolution. This calibration is the transferable contribution, because before any similarity structure is read as social, a record must be shown to be able to distinguish drift from groups at all.</w:t>
+        <w:t xml:space="preserve">. We therefore compare the two processes in a generative manner. We simulate neutral spatial drift and bounded groups on the real coordinate layout of the assemblages and ask which reproduces the observed structure, using four transmission signatures, departure from neutral copying, breakdown of frequency-seriation coherence, between-group variance, and spatial assortativity, as diagnostics of whether interaction has closed rather than as a stand-alone test. Because an archaeological assemblage is time-averaged and sampled to varying depth, a signature can register a difference that is an artifact of sampling rather than of transmission, so we calibrate the comparison to the record by a signal-recovery experiment: into synthetic assemblages matched to the real number, sample sizes, and time-averaging we inject a known signal of tunable strength and measure how strong a real boundary would have to be to register. Only a calibrated comparison can license the conclusion that an absence of group structure is real rather than a failure of resolution. This calibration is the transferable contribution, because before any similarity structure is interpreted as social, a record must be shown to be able to distinguish drift from groups at all.</w:t>
       </w:r>
     </w:p>
     <w:p>
@@ -470,7 +533,7 @@
         <w:pStyle w:val="BodyText"/>
       </w:pPr>
       <w:r>
-        <w:t xml:space="preserve">The argument proceeds in three steps. First, we evaluate Parkin as a hierarchy and find that no line of evidence, settlement, exchange, or transmission supports it. Second, we ask what generates the St. Francis basin phase structure, and show that neutral drift on the basin’s geography reproduces the observed signatures. A bounded-groups process would leave a far sharper structure than the data carry. Hence, the phase is a continuous interaction structured by where sites sit rather than a closed group with a boundary, and Parkin is a transmission bridge across orderings rather than the core of one. Third, we widen the test to the other late-period phases of the valley and ask whether any decorated-ceramic boundary exists. A boundary that exceeds neutral drift appears only between the central-valley and lower-valley blocks, and even there, it is confounded with the early-to-late turnover of the class repertoire. It cannot yet be read as a synchronic social division. At the scale where the phase is drawn, it is largely indistinguishable from spatially structured drift, and Parkin is best read as a prominent node in a continuous interaction field rather than the capital of a polity.</w:t>
+        <w:t xml:space="preserve">The argument proceeds in three steps. First, we evaluate Parkin as a hierarchy and find that no line of evidence, settlement, exchange, or transmission supports it. Second, we ask what generates the St. Francis basin phase structure, and show that neutral drift on the basin’s geography reproduces the observed signatures. A bounded-groups process would leave a far sharper structure than the data carry. Hence, the phase is a continuous interaction structured by where sites sit rather than a closed group with a boundary, and Parkin is a transmission bridge across orderings rather than the core of one. Third, we widen the test to the other late-period phases of the valley and ask whether any decorated-ceramic boundary exists. A boundary that exceeds neutral drift appears only between the central-valley and lower-valley blocks, and even there, it is confounded with the early-to-late turnover of the class repertoire. It cannot yet be interpreted as a synchronic social division. At the scale where the phase is drawn, it is largely indistinguishable from spatially structured drift, and Parkin is best understood as a prominent node in a continuous interaction field rather than the capital of a polity.</w:t>
       </w:r>
     </w:p>
     <w:bookmarkEnd w:id="14"/>
@@ -497,7 +560,7 @@
         <w:pStyle w:val="FirstParagraph"/>
       </w:pPr>
       <w:r>
-        <w:t xml:space="preserve">We take a materialist approach to cultural transmission, which frames the question differently from how the central-valley record is usually read. Archaeologists are trained to think with bounded units, the phase, the polity, the society, discrete entities with members and edges, and to read a cluster of similar assemblages as one of them. We treat transmission instead as a continuous and variable field of copying events among potters, a field with no intrinsic edges, in which interaction falls off with distance and learning can be more local in some places and times than in others. On this view, a group is not a thing with a boundary but a region where transmission has thickened, and similarity is a matter of degree set by how copying is distributed across space. That field can also close off by degree, interaction narrowing until potters copy mostly within a subset and rarely outside it, producing something that looks like the bounded groups archaeologists think with. The difficulty with the phase is that ordinary interaction already makes nearby assemblages more alike than distant ones, even without distance, so clusters by themselves prove nothing. What would mark a real bounded group is closure beyond what distance predicts, and that excess is the signal we test for.</w:t>
+        <w:t xml:space="preserve">We take a materialist approach to cultural transmission, which frames the question differently from how the central-valley record is usually interpreted. Archaeologists are trained to think with bounded units, the phase, the polity, the society, discrete entities with members and edges, and to interpret a cluster of similar assemblages as one of them. We treat transmission instead as a continuous and variable field of copying events among potters, a field with no intrinsic edges, in which interaction falls off with distance and learning can be more local in some places and times than in others. On this view, a group is not a thing with a boundary but a region where transmission has thickened, and similarity is a matter of degree set by how copying is distributed across space. That field can also close off by degree, interaction narrowing until potters copy mostly within a subset and rarely outside it, producing something that looks like the bounded groups archaeologists think with. The difficulty with the phase is that ordinary interaction already makes nearby assemblages more alike than distant ones, even without distance, so clusters by themselves prove nothing. What would mark a real bounded group is closure beyond what distance predicts, and that excess is the signal we test for.</w:t>
       </w:r>
     </w:p>
     <w:p>
@@ -629,13 +692,13 @@
         <w:pStyle w:val="BodyText"/>
       </w:pPr>
       <w:r>
-        <w:t xml:space="preserve">The late pre-contact central Mississippi Valley supports two readings of the same record, and they make opposite predictions for the transmission signature. The first holds that the region was moving toward greater complexity. In northeastern Arkansas the Parkin phase (ca. A.D. 1400 to 1600, with a thin protohistoric tail, consistent with the basin radiocarbon reported below) is a dense cluster of fortified, moated St-Francis-type towns along the St. Francis and Tyronza rivers, dominated by the Parkin site, a roughly 17-acre palisaded center with a platform mound rising more than 6 m that the De Soto chronicles place as the seat of the paramount of Casqui</w:t>
-      </w:r>
-      <w:r>
-        <w:t xml:space="preserve"> </w:t>
-      </w:r>
-      <w:r>
-        <w:t xml:space="preserve">(Dye and Cox 1990; Mitchem 2001; Morse 1990)</w:t>
+        <w:t xml:space="preserve">The late pre-contact central Mississippi Valley supports two interpretations of the same record, and they make opposite predictions for the transmission signature. The first holds that the region was moving toward greater complexity. In northeastern Arkansas the Parkin phase (ca. A.D. 1400 to 1600, with a thin protohistoric tail, consistent with the basin radiocarbon reported below) is a dense cluster of fortified, moated St-Francis-type towns along the St. Francis and Tyronza rivers, dominated by the Parkin site, a roughly 17-acre palisaded center with a platform mound rising more than 6 m that the De Soto chronicles place as the seat of the paramount of Casqui</w:t>
+      </w:r>
+      <w:r>
+        <w:t xml:space="preserve"> </w:t>
+      </w:r>
+      <w:r>
+        <w:t xml:space="preserve">(Dye and Cox 1990; Mitchem 2001; Phyllis A. Morse 1990)</w:t>
       </w:r>
       <w:r>
         <w:t xml:space="preserve">. Based on this information, Parkin’s location on agriculturally poor soil suggests that it drew tribute from smaller villages, a hallmark of an emerging chiefly hierarchy</w:t>
@@ -644,7 +707,7 @@
         <w:t xml:space="preserve"> </w:t>
       </w:r>
       <w:r>
-        <w:t xml:space="preserve">(Morse 1990)</w:t>
+        <w:t xml:space="preserve">(Phyllis A. Morse 1990)</w:t>
       </w:r>
       <w:r>
         <w:t xml:space="preserve">. Because contact and the demographic collapse associated with the protohistoric</w:t>
@@ -683,7 +746,7 @@
         <w:t xml:space="preserve">(Cobb et al. 2024; Cobb and Butler 2002)</w:t>
       </w:r>
       <w:r>
-        <w:t xml:space="preserve">. The second reading holds that the central valley was a stable, non-consolidated landscape of competing peer polities that never reorganized into a regional hierarchy</w:t>
+        <w:t xml:space="preserve">. The second interpretation holds that the central valley was a stable, non-consolidated landscape of competing peer polities that never reorganized into a regional hierarchy</w:t>
       </w:r>
       <w:r>
         <w:t xml:space="preserve"> </w:t>
@@ -692,13 +755,13 @@
         <w:t xml:space="preserve">(Anderson 1996; Beck 2003; Blitz 1999; King and Freer 1995; Lulewicz 2019; Milner 1998; Rees 2001)</w:t>
       </w:r>
       <w:r>
-        <w:t xml:space="preserve">. The chronicles describe Casqui and its neighbor Pacaha in open conflict, which fits a landscape of competing peers, though the same sources have also been read as ranking Casqui below Pacaha, and the chronicle ethnography is thin and filtered</w:t>
-      </w:r>
-      <w:r>
-        <w:t xml:space="preserve"> </w:t>
-      </w:r>
-      <w:r>
-        <w:t xml:space="preserve">(Hudson et al. 1990; Mitchem 2001; Morse 1990)</w:t>
+        <w:t xml:space="preserve">. The chronicles describe Casqui and its neighbor Pacaha in open conflict, which fits a landscape of competing peers, though the same sources have also been interpreted as ranking Casqui below Pacaha, and the chronicle ethnography is thin and filtered</w:t>
+      </w:r>
+      <w:r>
+        <w:t xml:space="preserve"> </w:t>
+      </w:r>
+      <w:r>
+        <w:t xml:space="preserve">(Hudson et al. 1990; Mitchem 2001; Phyllis A. Morse 1990)</w:t>
       </w:r>
       <w:r>
         <w:t xml:space="preserve">. The two cannot be separated by settlement morphology alone. They can be separated by determining whether the transmission record shows interaction closing into bounded groups, which is the test we now construct.</w:t>
@@ -871,7 +934,7 @@
         <w:t xml:space="preserve">(Neiman 1995)</w:t>
       </w:r>
       <w:r>
-        <w:t xml:space="preserve">. It serves here as the most direct measure of how far decoration has sorted itself by group, with one important caveat developed below. Stochastic drift on a spatially structured population generates between-group variance on its own, because subpopulations retain different amounts of diversity depending on their size and connectivity: small or sparsely connected areas drift to depleted, idiosyncratic repertoires while larger, well-connected ones stay richer, so the resulting differences read as distinct interacting groups when they are produced by spatial position alone</w:t>
+        <w:t xml:space="preserve">. It serves here as the most direct measure of how far decoration has sorted itself by group, with one important caveat developed below. Stochastic drift on a spatially structured population generates between-group variance on its own, because subpopulations retain different amounts of diversity depending on their size and connectivity: small or sparsely connected areas drift to depleted, idiosyncratic repertoires while larger, well-connected ones stay richer, so the resulting differences appear as distinct interacting groups when they are produced by spatial position alone</w:t>
       </w:r>
       <w:r>
         <w:t xml:space="preserve"> </w:t>
@@ -880,7 +943,7 @@
         <w:t xml:space="preserve">(Lipo et al. 2021)</w:t>
       </w:r>
       <w:r>
-        <w:t xml:space="preserve">. The measure must therefore be calibrated against that spatial-drift null rather than read at face value.</w:t>
+        <w:t xml:space="preserve">. The measure must therefore be calibrated against that spatial-drift null rather than taken at face value.</w:t>
       </w:r>
     </w:p>
     <w:p>
@@ -923,7 +986,7 @@
         <w:t xml:space="preserve">(Shennan et al. 2015; Wright 1943)</w:t>
       </w:r>
       <w:r>
-        <w:t xml:space="preserve">. This pattern appears as a gradual fading of similarity with distance, as people interact mostly with near neighbors, without the sharp boundaries or departures from neutrality that mark restricted, assortative learning. A bounded interaction group, in which one assortative process restricts transmission along every dimension, is the only process that drives all four signatures together at full strength. But the table is idealized in a way that matters here: two of the four signatures, between-group variance and the distance-controlled boundary excess, are also driven by stochastic neutral drift on a spatially structured population, which generates patchy divergence and a positive boundary excess with no bounded group anywhere (Results, Figure S5). The linked movement of these two measures cannot separate a real interaction group from drift. Therefore, we do not depend on these signatures alone. Instead, we compare the two processes generatively by simulating each one, neutral spatial drift and bounded groups alike, using the real geography of the deposits. Using the data from the simulations, we ask which reproduces the observed structure, reading the signatures as diagnostics of where each process leaves its mark.</w:t>
+        <w:t xml:space="preserve">. This pattern appears as a gradual fading of similarity with distance, as people interact mostly with near neighbors, without the sharp boundaries or departures from neutrality that mark restricted, assortative learning. A bounded interaction group, in which one assortative process restricts transmission along every dimension, is the only process that drives all four signatures together at full strength. But the table is idealized in a way that matters here: two of the four signatures, between-group variance and the distance-controlled boundary excess, are also driven by stochastic neutral drift on a spatially structured population, which generates patchy divergence and a positive boundary excess with no bounded group anywhere (Results, Figure S5). The linked movement of these two measures cannot separate a real interaction group from drift. Therefore, we do not depend on these signatures alone. Instead, we compare the two processes generatively by simulating each one, neutral spatial drift and bounded groups alike, using the real geography of the deposits. Using the data from the simulations, we ask which reproduces the observed structure, treating the signatures as diagnostics of where each process leaves its mark.</w:t>
       </w:r>
     </w:p>
     <w:p>
@@ -941,7 +1004,7 @@
         <w:t xml:space="preserve"> </w:t>
       </w:r>
       <w:r>
-        <w:t xml:space="preserve">The transmission signatures each process is expected to leave a mark on, where ● marks a signature the process drives and ○ marks one it leaves flat. Only a bounded interaction group drives all four. Each alternative produces a characteristic subset, a pattern our simulation confirms on idealized data (Figure S4). This is an idealized expectation under smooth, deterministic processes, not a claim about what is detectable in a real record. Two qualifications make this an aspirational goal rather than necessarily operative. First, the generator diagnostic (Supplemental Text) shows that the non-F_ST rows are detectable at the record’s resolution, because the neutral and seriation signatures fail to register a signal even when one is injected through its own pathway. The detectable discrimination, therefore, reduces to cultural F_ST (Figure 4). Second, under realistic stochastic spatial drift, the F_ST and spatial-assortativity rows are themselves driven in the absence of a bounded group (Results, Figure S5). The table frames the possible combinations of factors that may contribute to a signal of bounded group structure. The simulation approach for examining drift-versus-group comparisons provides a practical assessment.</w:t>
+        <w:t xml:space="preserve">What each process does to the four transmission signatures, and which signature this record can measure. A filled circle (●) marks a signature a process drives, an open circle (○) one it leaves flat. The process columns give the idealized discrimination logic: under smooth, deterministic processes, only a bounded interaction group drives all four, and each alternative drives a characteristic subset, the pattern an idealized simulation confirms (Figure S4). Two features of the table show why that logic is not the test we run on the record. The smooth-drift and stochastic-drift columns separate textbook isolation-by-distance, which drives none of the four, from realistic neutral drift on a finite network, which drives cultural F_ST and the boundary excess on its own, with no bounded group present (Figure S5). Stochastic drift thus reproduces the same two-signature pattern as environmental patchiness, so a positive result on either signature cannot by itself separate a bounded group from drift or patchiness. The final column reports the recovery experiment (Figure 4). At this record’s 29 time-averaged assemblages, only cultural F_ST registers an injected-closure signal, and even then, it must be compared against the stochastic-drift null rather than zero. Seriation-coherence breakdown, which only a bounded group drives in principle, is the cleanest discriminator on paper yet undetectable here. The four signatures are therefore candidate diagnostics screened against the record, and the surviving discrimination is carried by cultural F_ST, assessed against the drift null, and by the generative drift-versus-groups comparison, not by convergence of the table’s rows.</w:t>
       </w:r>
     </w:p>
     <w:tbl>
@@ -952,11 +1015,13 @@
         <w:tblLook w:firstRow="1" w:lastRow="0" w:firstColumn="0" w:lastColumn="0" w:noHBand="0" w:noVBand="0" w:val="0020"/>
       </w:tblPr>
       <w:tblGrid>
-        <w:gridCol w:w="1033"/>
-        <w:gridCol w:w="1721"/>
-        <w:gridCol w:w="1721"/>
-        <w:gridCol w:w="1721"/>
-        <w:gridCol w:w="1721"/>
+        <w:gridCol w:w="720"/>
+        <w:gridCol w:w="1200"/>
+        <w:gridCol w:w="1200"/>
+        <w:gridCol w:w="1200"/>
+        <w:gridCol w:w="1200"/>
+        <w:gridCol w:w="1200"/>
+        <w:gridCol w:w="1200"/>
       </w:tblGrid>
       <w:tr>
         <w:trPr>
@@ -981,7 +1046,7 @@
               <w:jc w:val="center"/>
             </w:pPr>
             <w:r>
-              <w:t xml:space="preserve">Bounded interaction group</w:t>
+              <w:t xml:space="preserve">Bounded group</w:t>
             </w:r>
           </w:p>
         </w:tc>
@@ -1017,7 +1082,31 @@
               <w:jc w:val="center"/>
             </w:pPr>
             <w:r>
-              <w:t xml:space="preserve">Drift with limited interaction</w:t>
+              <w:t xml:space="preserve">Drift (smooth)</w:t>
+            </w:r>
+          </w:p>
+        </w:tc>
+        <w:tc>
+          <w:tcPr/>
+          <w:p>
+            <w:pPr>
+              <w:pStyle w:val="Compact"/>
+              <w:jc w:val="center"/>
+            </w:pPr>
+            <w:r>
+              <w:t xml:space="preserve">Drift (stochastic)</w:t>
+            </w:r>
+          </w:p>
+        </w:tc>
+        <w:tc>
+          <w:tcPr/>
+          <w:p>
+            <w:pPr>
+              <w:pStyle w:val="Compact"/>
+              <w:jc w:val="center"/>
+            </w:pPr>
+            <w:r>
+              <w:t xml:space="preserve">Detectable on this record?</w:t>
             </w:r>
           </w:p>
         </w:tc>
@@ -1082,6 +1171,30 @@
             </w:r>
           </w:p>
         </w:tc>
+        <w:tc>
+          <w:tcPr/>
+          <w:p>
+            <w:pPr>
+              <w:pStyle w:val="Compact"/>
+              <w:jc w:val="center"/>
+            </w:pPr>
+            <w:r>
+              <w:t xml:space="preserve">○</w:t>
+            </w:r>
+          </w:p>
+        </w:tc>
+        <w:tc>
+          <w:tcPr/>
+          <w:p>
+            <w:pPr>
+              <w:pStyle w:val="Compact"/>
+              <w:jc w:val="center"/>
+            </w:pPr>
+            <w:r>
+              <w:t xml:space="preserve">No</w:t>
+            </w:r>
+          </w:p>
+        </w:tc>
       </w:tr>
       <w:tr>
         <w:tc>
@@ -1140,6 +1253,30 @@
             </w:pPr>
             <w:r>
               <w:t xml:space="preserve">○</w:t>
+            </w:r>
+          </w:p>
+        </w:tc>
+        <w:tc>
+          <w:tcPr/>
+          <w:p>
+            <w:pPr>
+              <w:pStyle w:val="Compact"/>
+              <w:jc w:val="center"/>
+            </w:pPr>
+            <w:r>
+              <w:t xml:space="preserve">○</w:t>
+            </w:r>
+          </w:p>
+        </w:tc>
+        <w:tc>
+          <w:tcPr/>
+          <w:p>
+            <w:pPr>
+              <w:pStyle w:val="Compact"/>
+              <w:jc w:val="center"/>
+            </w:pPr>
+            <w:r>
+              <w:t xml:space="preserve">No</w:t>
             </w:r>
           </w:p>
         </w:tc>
@@ -1204,6 +1341,30 @@
             </w:r>
           </w:p>
         </w:tc>
+        <w:tc>
+          <w:tcPr/>
+          <w:p>
+            <w:pPr>
+              <w:pStyle w:val="Compact"/>
+              <w:jc w:val="center"/>
+            </w:pPr>
+            <w:r>
+              <w:t xml:space="preserve">●</w:t>
+            </w:r>
+          </w:p>
+        </w:tc>
+        <w:tc>
+          <w:tcPr/>
+          <w:p>
+            <w:pPr>
+              <w:pStyle w:val="Compact"/>
+              <w:jc w:val="center"/>
+            </w:pPr>
+            <w:r>
+              <w:t xml:space="preserve">Yes</w:t>
+            </w:r>
+          </w:p>
+        </w:tc>
       </w:tr>
       <w:tr>
         <w:tc>
@@ -1265,20 +1426,15 @@
             </w:r>
           </w:p>
         </w:tc>
-      </w:tr>
-      <w:tr>
         <w:tc>
           <w:tcPr/>
           <w:p>
             <w:pPr>
               <w:pStyle w:val="Compact"/>
+              <w:jc w:val="center"/>
             </w:pPr>
             <w:r>
-              <w:rPr>
-                <w:b/>
-                <w:bCs/>
-              </w:rPr>
-              <w:t xml:space="preserve">Convergence of all four</w:t>
+              <w:t xml:space="preserve">●</w:t>
             </w:r>
           </w:p>
         </w:tc>
@@ -1290,59 +1446,7 @@
               <w:jc w:val="center"/>
             </w:pPr>
             <w:r>
-              <w:rPr>
-                <w:b/>
-                <w:bCs/>
-              </w:rPr>
-              <w:t xml:space="preserve">yes</w:t>
-            </w:r>
-          </w:p>
-        </w:tc>
-        <w:tc>
-          <w:tcPr/>
-          <w:p>
-            <w:pPr>
-              <w:pStyle w:val="Compact"/>
-              <w:jc w:val="center"/>
-            </w:pPr>
-            <w:r>
-              <w:rPr>
-                <w:b/>
-                <w:bCs/>
-              </w:rPr>
-              <w:t xml:space="preserve">no</w:t>
-            </w:r>
-          </w:p>
-        </w:tc>
-        <w:tc>
-          <w:tcPr/>
-          <w:p>
-            <w:pPr>
-              <w:pStyle w:val="Compact"/>
-              <w:jc w:val="center"/>
-            </w:pPr>
-            <w:r>
-              <w:rPr>
-                <w:b/>
-                <w:bCs/>
-              </w:rPr>
-              <w:t xml:space="preserve">no</w:t>
-            </w:r>
-          </w:p>
-        </w:tc>
-        <w:tc>
-          <w:tcPr/>
-          <w:p>
-            <w:pPr>
-              <w:pStyle w:val="Compact"/>
-              <w:jc w:val="center"/>
-            </w:pPr>
-            <w:r>
-              <w:rPr>
-                <w:b/>
-                <w:bCs/>
-              </w:rPr>
-              <w:t xml:space="preserve">no</w:t>
+              <w:t xml:space="preserve">No</w:t>
             </w:r>
           </w:p>
         </w:tc>
@@ -1353,7 +1457,7 @@
         <w:pStyle w:val="BodyText"/>
       </w:pPr>
       <w:r>
-        <w:t xml:space="preserve">Drift with distance-limited interaction produces a raw decay of similarity with distance. The distance-controlled boundary-excess statistic, however, is near zero under smooth isolation-by-distance, so it drives none of the four. This holds for smooth, deterministic isolation-by-distance. Stochastic neutral drift on a finite network is less forgiving, generating patchy divergence that registers as a positive boundary excess even in the absence of a social boundary, a mimicry that the record-matched controls expose directly (Results). Aggregated signaling raises the neutrality departure in a single undivided pool without forming the between-group boundaries that the other signatures require.</w:t>
+        <w:t xml:space="preserve">The two drift columns make the central difficulty explicit. Smooth, deterministic isolation by distance produces only a raw decay of similarity with distance, and the distance-controlled boundary excess is near zero under it, so it drives none of the four signatures. Stochastic neutral drift on a finite network is less forgiving. It generates patchy divergence that raises cultural F_ST and registers as a positive boundary excess in the absence of a social boundary, the mimicry that the record-matched controls expose directly (Results, Figure S5). Aggregated signaling, by contrast, raises the neutrality departure within a single undivided pool without forming the between-group boundaries that the other signatures require.</w:t>
       </w:r>
     </w:p>
     <w:p>
@@ -1361,7 +1465,7 @@
         <w:pStyle w:val="BodyText"/>
       </w:pPr>
       <w:r>
-        <w:t xml:space="preserve">Because closure, if it occurred, would accumulate across the sequence, we read convergence as a trajectory. This pattern would appear as a coherent, same-direction shift in all four signatures across the ordinal sequence of assemblages, concentrated where and when interaction closes into bounded groups. The logic is only as strong as the independence of the signatures, because four measures that were merely redundant converge trivially. As a consequence, we validate the test using simulated assemblages before applying it to confirm that convergence arises only when interactions close into a bounded group and not under any mimic. We also use the simulation to assess whether the four signatures are tightly correlated under such closure yet nearly independent under the mimics, so their joint movement is informative rather than automatic. The use of convergence logic has an archaeological precedent. Neiman</w:t>
+        <w:t xml:space="preserve">If closure were to occur, it would accumulate across the sequence, so on idealized data, genuine convergence would take the form of a trajectory: a coherent, same-direction shift in all four signatures across the ordinal sequence of assemblages, concentrated where and when interaction closes into bounded groups. The logic is only as strong as the independence of the signatures, because four measures that were merely redundant converge trivially. As a consequence, we validate the test using simulated assemblages before applying it to confirm that convergence arises only when interactions close into a bounded group and not under any mimic. We also use the simulation to assess whether the four signatures are tightly correlated under such closure yet nearly independent under the mimics, so their joint movement is informative rather than automatic. The use of convergence logic has an archaeological precedent. Neiman</w:t>
       </w:r>
       <w:r>
         <w:t xml:space="preserve"> </w:t>
@@ -1381,7 +1485,7 @@
         <w:pStyle w:val="BodyText"/>
       </w:pPr>
       <w:r>
-        <w:t xml:space="preserve">Below, we describe the procedures, their methods, and outcomes. Figure 2 previews what the test distinguishes, the sharp structure a bounded group would leave against the blur that drift produces, and why, on a record of this size and time-averaging, a weak within-basin boundary cannot be excluded.</w:t>
+        <w:t xml:space="preserve">Below, we describe the procedures, their methods, and outcomes. Figure 2 previews what the test distinguishes, the sharp structure a bounded group would leave against the diffuse pattern that drift produces, and why, on a record of this size and time-averaging, a weak within-basin boundary cannot be excluded.</w:t>
       </w:r>
     </w:p>
     <w:p>
@@ -1393,7 +1497,7 @@
           <wp:inline>
             <wp:extent cx="5334000" cy="4310883"/>
             <wp:effectExtent b="0" l="0" r="0" t="0"/>
-            <wp:docPr descr="Figure 2. What the test distinguishes, and why the within-basin determination is hard, from synthetic assemblages matched to the record. Top: the basin assemblages in a multidimensional scaling of decorated dissimilarity (points colored by the k=2 spatial split) as they would appear if the Parkin phase were a bounded interaction group (left, sharp clusters), under spatially structured neutral drift (center, a continuous blur), and as observed (right, a blur resembling drift). Bottom: the cultural F_ST signal recovered from synthetic assemblages as the strength of injected group closure rises from 0 (drift) to 1 (strong groups), with the s=0 null band shaded behind it. The signal clears the detection threshold only at s* = 0.5. The observed value (dashed line) lies in the shaded region below s*, where a weak group and pure drift are indistinguishable at this record’s size and time-averaging. This is why a weak within-basin boundary cannot be excluded." title="" id="19" name="Picture"/>
+            <wp:docPr descr="Figure 2. What the test distinguishes, and why the within-basin determination is hard, from synthetic assemblages matched to the record. Top: the basin assemblages in a multidimensional scaling of decorated dissimilarity (points colored by the k=2 spatial split) as they would appear if the Parkin phase were a bounded interaction group (left, sharp clusters), under spatially structured neutral drift (center, a continuous gradient), and as observed (right, a diffuse scatter resembling drift). Bottom: the cultural F_ST signal recovered from synthetic assemblages as the strength of injected group closure rises from 0 (drift) to 1 (strong groups), with the s=0 null band shaded behind it. The signal clears the detection threshold only at s* = 0.5. The observed value (dashed line) lies in the shaded region below s*, where a weak group and pure drift are indistinguishable at this record’s size and time-averaging. This is why a weak within-basin boundary cannot be excluded." title="" id="19" name="Picture"/>
             <a:graphic>
               <a:graphicData uri="http://schemas.openxmlformats.org/drawingml/2006/picture">
                 <pic:pic>
@@ -1446,7 +1550,7 @@
         <w:t xml:space="preserve"> </w:t>
       </w:r>
       <w:r>
-        <w:t xml:space="preserve">What the test distinguishes, and why the within-basin determination is hard, from synthetic assemblages matched to the record. Top: the basin assemblages in a multidimensional scaling of decorated dissimilarity (points colored by the k=2 spatial split) as they would appear if the Parkin phase were a bounded interaction group (left, sharp clusters), under spatially structured neutral drift (center, a continuous blur), and as observed (right, a blur resembling drift). Bottom: the cultural F_ST signal recovered from synthetic assemblages as the strength of injected group closure rises from 0 (drift) to 1 (strong groups), with the s=0 null band shaded behind it. The signal clears the detection threshold only at s* = 0.5. The observed value (dashed line) lies in the shaded region below s*, where a weak group and pure drift are indistinguishable at this record’s size and time-averaging. This is why a weak within-basin boundary cannot be excluded.</w:t>
+        <w:t xml:space="preserve">What the test distinguishes, and why the within-basin determination is hard, from synthetic assemblages matched to the record. Top: the basin assemblages in a multidimensional scaling of decorated dissimilarity (points colored by the k=2 spatial split) as they would appear if the Parkin phase were a bounded interaction group (left, sharp clusters), under spatially structured neutral drift (center, a continuous gradient), and as observed (right, a diffuse scatter resembling drift). Bottom: the cultural F_ST signal recovered from synthetic assemblages as the strength of injected group closure rises from 0 (drift) to 1 (strong groups), with the s=0 null band shaded behind it. The signal clears the detection threshold only at s* = 0.5. The observed value (dashed line) lies in the shaded region below s*, where a weak group and pure drift are indistinguishable at this record’s size and time-averaging. This is why a weak within-basin boundary cannot be excluded.</w:t>
       </w:r>
     </w:p>
     <w:p>
@@ -1816,7 +1920,7 @@
         <w:t xml:space="preserve"> </w:t>
       </w:r>
       <w:r>
-        <w:t xml:space="preserve">permutation test, which asks whether two distance matrices, here ceramic dissimilarity and geographic distance, are related. Because a Mantel correlation cannot separate a sharp social boundary from a smooth distance decay, we summarized the result as a boundary-excess statistic, the gap between mean within-cluster and between-cluster similarity after controlling for distance. Smooth isolation-by-distance returns a boundary excess near zero, and a genuine social boundary returns a large positive value. Two corrections are essential before any of these signatures is read. Assemblage sample size trends with seriation position, and several of the estimators are size-sensitive, so we subsample every assemblage to a common count (rarefaction)</w:t>
+        <w:t xml:space="preserve">permutation test, which asks whether two distance matrices, here ceramic dissimilarity and geographic distance, are related. Because a Mantel correlation cannot separate a sharp social boundary from a smooth distance decay, we summarized the result as a boundary-excess statistic, the gap between mean within-cluster and between-cluster similarity after controlling for distance. Smooth isolation-by-distance returns a boundary excess near zero, and a genuine social boundary returns a large positive value. Two corrections are essential before any of these signatures is interpreted. Assemblage sample size trends with seriation position, and several of the estimators are size-sensitive, so we subsample every assemblage to a common count (rarefaction)</w:t>
       </w:r>
       <w:r>
         <w:t xml:space="preserve"> </w:t>
@@ -1855,7 +1959,7 @@
         <w:t xml:space="preserve">(Bentley et al. 2004; Neiman 1995)</w:t>
       </w:r>
       <w:r>
-        <w:t xml:space="preserve">, with three tunable controls: the between-group divergence of class profiles, the strength of within-group conformity, and a spatial rule placing group profiles on the landscape. Four generators, one per row of Table 1, instantiate the four competing processes</w:t>
+        <w:t xml:space="preserve">, with three tunable controls: the between-group divergence of class profiles, the strength of within-group conformity, and a spatial rule placing group profiles on the landscape. Four generators instantiate the four idealized processes of Table 1, the bounded group and its three mimics</w:t>
       </w:r>
       <w:r>
         <w:t xml:space="preserve"> </w:t>
@@ -1872,7 +1976,7 @@
         <w:pStyle w:val="BodyText"/>
       </w:pPr>
       <w:r>
-        <w:t xml:space="preserve">The recovery test is generative: we built synthetic pottery records in which we controlled whether group structure was emerging, dialed from none to strong, and then asked whether our four measures could see it. The synthetic records were matched to the real ones: the same number of assemblages, the same range of sample sizes, the same blurring of time that surface assemblages impose</w:t>
+        <w:t xml:space="preserve">The recovery test is generative: we built synthetic pottery records in which we controlled whether group structure was emerging, dialed from none to strong, and then asked whether our four measures could see it. The synthetic records were matched to the real ones: the same number of assemblages, the same range of sample sizes, the same time-averaging that surface assemblages impose</w:t>
       </w:r>
       <w:r>
         <w:t xml:space="preserve"> </w:t>
@@ -1890,7 +1994,7 @@
         <w:t xml:space="preserve">(Crema et al. 2014; Kandler and Shennan 2015)</w:t>
       </w:r>
       <w:r>
-        <w:t xml:space="preserve">. Two properties of the record make this necessary. Assemblage sample size trends with seriation position (Spearman rho = +0.59), and several signatures are size-sensitive so that a size-dependent estimator can rise or fall along the axis through sampling alone. We therefore subsample every assemblage, synthetic and real, to a common count before scoring, thereby removing the confound. And the record is time-averaged, which we reproduce by blending adjacent-bin production within a window. The recovery experiment then asks, at the resolution and sample sizes this record preserves, which signatures can be trusted and how strong a closure would have to be to register. One aspect of the calibration matters here. Because subsampling the larger, later assemblages to a common count slightly inflates within-cluster diversity and so depresses F_ST toward later positions, the null with no closure (pure drift) itself carries a mild negative trend rather than a flat zero. The test is calibrated against that null distribution, not against zero, so the false-positive rate is held at five percent regardless, and the empirical value is read against the same null.</w:t>
+        <w:t xml:space="preserve">. Two properties of the record make this necessary. Assemblage sample size trends with seriation position (Spearman rho = +0.59), and several signatures are size-sensitive so that a size-dependent estimator can rise or fall along the axis through sampling alone. We therefore subsample every assemblage, synthetic and real, to a common count before scoring, thereby removing the confound. And the record is time-averaged, which we reproduce by blending adjacent-bin production within a window. The recovery experiment then asks, at the resolution and sample sizes this record preserves, which signatures can be trusted and how strong a closure would have to be to register. One aspect of the calibration matters here. Because subsampling the larger, later assemblages to a common count slightly inflates within-cluster diversity and so depresses F_ST toward later positions, the null with no closure (pure drift) itself carries a mild negative trend rather than a flat zero. The test is calibrated against that null distribution, not against zero, so the false-positive rate is held at five percent regardless, and the empirical value is compared against the same null.</w:t>
       </w:r>
     </w:p>
     <w:bookmarkEnd w:id="27"/>
@@ -2069,7 +2173,7 @@
         <w:pStyle w:val="BodyText"/>
       </w:pPr>
       <w:r>
-        <w:t xml:space="preserve">Applied to the St. Francis basin, that one reliable signature shows no closure into bounded groups, and the apparent signals in the others are confounded by sample size (Figure 5). The raw trajectory along the seriation axis seems to dissociate, but two of its trends are sampling artifacts: because assemblage size trends with seriation position, the size-sensitive estimators move with it. Two of the apparent trends are artifacts of sample size. Once every assemblage is trimmed to a common sherd count by subsampling, cultural F_ST falls from a raw +0.60 to +0.01, and its uncertainty range runs from no closure to a moderate signal, so it is uninformative rather than a resolved positive. The neutrality departure is likewise size-sensitive (its raw -0.94 only weakens to -0.83 under size control), and the recovery shows that it does not track closure in either direction here, so it, too, cannot be read as a transmission signal. On the recovery curve, the size-controlled empirical F_ST corresponds to a nominal injected strength of about 0.35, below the resolution limit. The record, therefore, shows no detectable closure of moderate or greater strength. The negative is informative for a closure of moderate or greater strength, which would have registered and is absent. It cannot exclude a weaker closure that, given a record of this size and time-averaging, is underpowered to resolve. The positive control reported next shows that the structure actually present is what neutral drift produces, so the result is not only that no bounded group is detectable, but also that the structure present is what continuous, spatially structured interaction would produce.</w:t>
+        <w:t xml:space="preserve">Applied to the St. Francis basin, that one reliable signature shows no closure into bounded groups, and the apparent signals in the others are confounded by sample size (Figure 5). The raw trajectory along the seriation axis seems to dissociate, but two of its trends are sampling artifacts: because assemblage size trends with seriation position, the size-sensitive estimators move with it. Two of the apparent trends are artifacts of sample size. Once every assemblage is trimmed to a common sherd count by subsampling, cultural F_ST falls from a raw +0.60 to +0.01, and its uncertainty range runs from no closure to a moderate signal, so it is uninformative rather than a resolved positive. The neutrality departure is likewise size-sensitive (its raw -0.94 only weakens to -0.83 under size control), and the recovery shows that it does not track closure in either direction here, so it, too, cannot be interpreted as a transmission signal. On the recovery curve, the size-controlled empirical F_ST corresponds to a nominal injected strength of about 0.35, below the resolution limit. The record, therefore, shows no detectable closure of moderate or greater strength. The negative is informative for a closure of moderate or greater strength, which would have registered and is absent. It cannot exclude a weaker closure that, given a record of this size and time-averaging, is underpowered to resolve. The positive control reported next shows that the structure actually present is what neutral drift produces, so the result is not only that no bounded group is detectable, but also that the structure present is what continuous, spatially structured interaction would produce.</w:t>
       </w:r>
     </w:p>
     <w:p>
@@ -2142,7 +2246,7 @@
         <w:pStyle w:val="BodyText"/>
       </w:pPr>
       <w:r>
-        <w:t xml:space="preserve">Three further checks, all pointing the same way, add detail. The first follows each decorated class’s rise and fall through the sequence and asks whether the changes resemble the aimless wobble of unbiased copying or the directed change a deliberate marker would exhibit. Seven of the nine testable classes appear to be simple wobble (the frequency increment test)</w:t>
+        <w:t xml:space="preserve">Three further checks, all pointing the same way, add detail. The first follows each decorated class’s rise and fall through the sequence and asks whether the changes resemble the undirected fluctuation of unbiased copying or the directed change a deliberate marker would exhibit. Seven of the nine testable classes are consistent with unbiased drift (the frequency increment test)</w:t>
       </w:r>
       <w:r>
         <w:t xml:space="preserve"> </w:t>
@@ -2169,7 +2273,7 @@
         <w:t xml:space="preserve">(Neiman 1995)</w:t>
       </w:r>
       <w:r>
-        <w:t xml:space="preserve">. The verdict that no bounded-group closure is detectable also holds across the analyst’s choices: across twenty-seven combinations of the basin’s spatial cutoff, the number of ordinal bins, and the number of spatial clusters, no closure appears in any of them, and it holds equally under the watershed and corridor basin definitions. Consistent with the recovery experiment, none of these checks shows a resolvable departure from neutral transmission, and we read them as corroboration of the size-controlled F_ST result rather than as independent signals.</w:t>
+        <w:t xml:space="preserve">. The verdict that no bounded-group closure is detectable also holds across the analyst’s choices: across twenty-seven combinations of the basin’s spatial cutoff, the number of ordinal bins, and the number of spatial clusters, no closure appears in any of them, and it holds equally under the watershed and corridor basin definitions. Consistent with the recovery experiment, none of these checks shows a resolvable departure from neutral transmission, and we treat them as corroboration of the size-controlled F_ST result rather than as independent signals.</w:t>
       </w:r>
     </w:p>
     <w:p>
@@ -2206,7 +2310,7 @@
         <w:pStyle w:val="BodyText"/>
       </w:pPr>
       <w:r>
-        <w:t xml:space="preserve">What it means for assemblages to be co-seriable carries the weight of this signature, and the deterministic method is stricter than the seriations most archaeologists have in mind. In conventional practice, an analyst can almost always arrange a set of assemblages into an order in which class frequencies more or less rise and fall, treating the places where a class breaks that pattern as noise to be tolerated by eye. Deterministic frequency seriation removes that tolerance. It accepts an ordering only when every decorated class is at once unimodal, rising to a single peak and then falling away, and continuous, changing without an abrupt jump. It treats any break in a class’s rise and fall as disqualifying that ordering unless the break is small enough to be explained by sampling error in the counts</w:t>
+        <w:t xml:space="preserve">What it means for assemblages to be co-seriable is central to this signature, and the deterministic method is stricter than the seriations most archaeologists have in mind. In conventional practice, an analyst can almost always arrange a set of assemblages into an order in which class frequencies more or less rise and fall, treating the places where a class breaks that pattern as noise to be tolerated by eye. Deterministic frequency seriation removes that tolerance. It accepts an ordering only when every decorated class is at once unimodal, rising to a single peak and then falling away, and continuous, changing without an abrupt jump. It treats any break in a class’s rise and fall as disqualifying that ordering unless the break is small enough to be explained by sampling error in the counts</w:t>
       </w:r>
       <w:r>
         <w:t xml:space="preserve"> </w:t>
@@ -2215,7 +2319,7 @@
         <w:t xml:space="preserve">(Dunnell 1970; Lipo et al. 2015)</w:t>
       </w:r>
       <w:r>
-        <w:t xml:space="preserve">. Where a conventional seriation would accept one rough ordering and move on, the deterministic method asks whether even one ordering can satisfy every class at once, and reports when none can. A single community drawing on a shared, drifting pool of designs meets that requirement under a single ordering. When learning is partitioned among groups, each with its own rise and fall of styles, no single ordering can hold every class unimodal at once, and the assemblages resolve into several mutually incompatible orderings. The departures a conventional seriation would wave off as minor wiggles are, read this way, the signature of more than one interaction community, and the number of maximal co-seriable groups, with the count of any one assemblage joins, measures that fragmentation directly</w:t>
+        <w:t xml:space="preserve">. Where a conventional seriation would accept one rough ordering and move on, the deterministic method asks whether even one ordering can satisfy every class at once, and reports when none can. A single community drawing on a shared, drifting pool of designs meets that requirement under a single ordering. When learning is partitioned among groups, each with its own rise and fall of styles, no single ordering can hold every class unimodal at once, and the assemblages resolve into several mutually incompatible orderings. The departures a conventional seriation would dismiss as minor irregularities are, interpreted this way, the signature of more than one interaction community, and the number of maximal co-seriable groups, with the count of any one assemblage joins, measures that fragmentation directly</w:t>
       </w:r>
       <w:r>
         <w:t xml:space="preserve"> </w:t>
@@ -2244,7 +2348,7 @@
         <w:t xml:space="preserve"> </w:t>
       </w:r>
       <w:r>
-        <w:t xml:space="preserve">reported, with Parkin at the intersection of multiple non-co-seriable orderings rather than at the center of a single closed interaction community. They read that bridging position as a possible sign of incipient hierarchy. We read it the other way: a site that bridges several orderings is a hub of interaction, not the seat of a bounded group.</w:t>
+        <w:t xml:space="preserve">reported, with Parkin at the intersection of multiple non-co-seriable orderings rather than at the center of a single closed interaction community. They interpreted that bridging position as a possible sign of incipient hierarchy. We interpret it differently: a site that bridges several orderings is a hub of interaction, not the seat of a bounded group.</w:t>
       </w:r>
     </w:p>
     <w:p>
@@ -2323,7 +2427,7 @@
         <w:t xml:space="preserve"> </w:t>
       </w:r>
       <w:r>
-        <w:t xml:space="preserve">(Mitchem 2001; Morse 1990)</w:t>
+        <w:t xml:space="preserve">(Mitchem 2001; Phyllis A. Morse 1990)</w:t>
       </w:r>
       <w:r>
         <w:t xml:space="preserve">, so we base the settlement comparison on recorded mound height rather than on mound area. Parkin’s roughly 17-acre site area would make it the largest center in the basin, but that figure is the total site area rather than the basal mound area on which the other sites are measured, and we treat it as indicative only. The settlement record thus shows a prominent center within a graded size distribution, not an administrative tier set above the rest</w:t>
@@ -2408,7 +2512,7 @@
         <w:pStyle w:val="BodyText"/>
       </w:pPr>
       <w:r>
-        <w:t xml:space="preserve">The non-ceramic evidence converges on the same reading. Mound size within the basin is graded rather than redistributive, and Parkin’s dominance is one of scale rather than of an administrative tier set apart from the rest. The production and exchange of Mill Creek and Dover chert hoes, the capacity-linked tools whose control would mark an economic hierarchy, was decentralized at the regional scale, with distribution following a down-the-line gradient rather than redistribution from a central place</w:t>
+        <w:t xml:space="preserve">The non-ceramic evidence converges on the same conclusion. Mound size within the basin is graded rather than redistributive, and Parkin’s dominance is one of scale rather than of an administrative tier set apart from the rest. The production and exchange of Mill Creek and Dover chert hoes, the capacity-linked tools whose control would mark an economic hierarchy, was decentralized at the regional scale, with distribution following a down-the-line gradient rather than redistribution from a central place</w:t>
       </w:r>
       <w:r>
         <w:t xml:space="preserve"> </w:t>
@@ -2417,7 +2521,7 @@
         <w:t xml:space="preserve">(Cobb 2000)</w:t>
       </w:r>
       <w:r>
-        <w:t xml:space="preserve">. This is a regional pattern in which the St. Francis basin participates rather than a basin-internal measurement, so we read it as consistent with, not independent proof of, the absence of economic centralization at Parkin. A separate nonmetric ordination of overlapping late-period assemblages finds that the named phases form a gradational continuum rather than discrete, bounded clusters, the cross-method counterpart of our seriation fragmentation</w:t>
+        <w:t xml:space="preserve">. This is a regional pattern in which the St. Francis basin participates rather than a basin-internal measurement, so we treat it as consistent with, not independent proof of, the absence of economic centralization at Parkin. A separate nonmetric ordination of overlapping late-period assemblages finds that the named phases form a gradational continuum rather than discrete, bounded clusters, the cross-method counterpart of our seriation fragmentation</w:t>
       </w:r>
       <w:r>
         <w:t xml:space="preserve"> </w:t>
@@ -2444,7 +2548,7 @@
         <w:pStyle w:val="FirstParagraph"/>
       </w:pPr>
       <w:r>
-        <w:t xml:space="preserve">The three lines of evidence converge on a single reading: the Parkin phase is not a bounded interaction group, and Parkin is not the capital of a polity. Within the St. Francis basin, Parkin is the largest and most monumentally elaborated center. Yet, its decorated-ceramic record shows no closure of interaction into bounded groups, and the structure present is reproduced by neutral drift across the basin’s geography. In contrast, a bounded-groups process would have left a far sharper mark. The settlement and exchange records say the same: mound size is graded rather than redistributive, and the production of capacity-linked chert hoes was decentralized, with their exchange following a down-the-line gradient rather than central redistribution</w:t>
+        <w:t xml:space="preserve">The three lines of evidence converge on a single conclusion: the Parkin phase is not a bounded interaction group, and Parkin is not the capital of a polity. Within the St. Francis basin, Parkin is the largest and most monumentally elaborated center. Yet, its decorated-ceramic record shows no closure of interaction into bounded groups, and the structure present is reproduced by neutral drift across the basin’s geography. In contrast, a bounded-groups process would have left a far sharper mark. The settlement and exchange records say the same: mound size is graded rather than redistributive, and the production of capacity-linked chert hoes was decentralized, with their exchange following a down-the-line gradient rather than central redistribution</w:t>
       </w:r>
       <w:r>
         <w:t xml:space="preserve"> </w:t>
@@ -2480,7 +2584,7 @@
         <w:t xml:space="preserve">(Anderson 1996:250–251)</w:t>
       </w:r>
       <w:r>
-        <w:t xml:space="preserve">. A known polity need not coincide with a single ceramic phase, and the converse inference, from one phase to one polity, carries no warrant on its own. The reading is not foreign to the Central Valley literature either. In the standard regional synthesis, McNutt</w:t>
+        <w:t xml:space="preserve">. A known polity need not coincide with a single ceramic phase, and the converse inference, from one phase to one polity, carries no warrant on its own. This interpretation is not foreign to the Central Valley literature either. In the standard regional synthesis, McNutt</w:t>
       </w:r>
       <w:r>
         <w:t xml:space="preserve"> </w:t>
@@ -2500,7 +2604,7 @@
         <w:pStyle w:val="BodyText"/>
       </w:pPr>
       <w:r>
-        <w:t xml:space="preserve">That characterization can be made constructive rather than merely consistent with the data. Run the finite-population network-drift model forward on the real configuration of the assemblages, with copying that decays with along-waterway distance and no boundary imposed, and the structure of the phase concept reads as a society reappears on its own</w:t>
+        <w:t xml:space="preserve">That characterization can be made constructive rather than merely consistent with the data. Run the finite-population network-drift model forward on the real configuration of the assemblages, with copying that decays with along-waterway distance and no boundary imposed, and the structure the phase concept interprets as a society reappears on its own</w:t>
       </w:r>
       <w:r>
         <w:t xml:space="preserve"> </w:t>
@@ -2509,7 +2613,7 @@
         <w:t xml:space="preserve">(Lipo et al. 2021)</w:t>
       </w:r>
       <w:r>
-        <w:t xml:space="preserve">. Across the 55 decorated assemblages of the wider lower Mississippi Valley, the model repeatedly produces a few spatially coherent, phase-like groups (Figure 8). The deposits are not contemporaneous, which is why they can be seriated at all and why some carry more of the late classes than others, so each synthetic assemblage is drawn time-transgressively at the run-time that matches its seriation position. Holding time fixed to isolate the spatial signal, drift yields two to five groups whose number grows with geographic extent; restoring the staggered deposition ages collapses the count toward two time-defined groups, because assemblages caught at different points in the sequence carry different repertoires. Either way, the number of drift-generated groups falls well short of the seven named phases the regional scheme draws across the same assemblages, and the between-group cultural F_ST of those groups settles at the observed level rather than the higher value a bounded group would leave. The named phases, therefore, subdivide the valley more finely than the transmission structure supports. That spatial and population structure, not population size, governs how drift partitions diversity in finite structured populations is established in both the cultural-transmission and population-genetics literatures</w:t>
+        <w:t xml:space="preserve">. Across the 55 decorated assemblages of the wider lower Mississippi Valley, the model repeatedly produces a few spatially coherent, phase-like groups (Figure 8). The deposits are not contemporaneous, which is why they can be seriated at all and why some carry more of the late classes than others, so each synthetic assemblage is drawn time-transgressively at the run-time that matches its seriation position. Holding time fixed to isolate the spatial signal, drift yields two to five groups whose number grows with geographic extent; restoring the staggered deposition ages collapses the count toward two time-defined groups, because assemblages caught at different points in the sequence carry different repertoires. Either way, the number of drift-generated groups falls well short of the seven named phases the regional scheme draws across the same assemblages, and the between-group cultural F_ST of those groups settles at the observed level rather than the higher value a bounded group would leave. The named phases, therefore, subdivide the valley more finely than the transmission structure supports. Where culture history draws seven bounded societies, drift on the geography yields at most a handful of coherent groupings, so most of the phase boundaries mark divisions a continuous interaction field does not carry. Whether any single named phase exceeds this drift expectation is a question we can now pose one phase at a time. That spatial and population structure, not population size, governs how drift partitions diversity in finite structured populations is established in both the cultural-transmission and population-genetics literatures</w:t>
       </w:r>
       <w:r>
         <w:t xml:space="preserve"> </w:t>
@@ -2518,7 +2622,7 @@
         <w:t xml:space="preserve">(Barton 1996; Premo 2016; Schneider et al. 2016; Wright 1943)</w:t>
       </w:r>
       <w:r>
-        <w:t xml:space="preserve">, and a localized neutral process is readily mistaken for biased transmission when diversity is read at face value</w:t>
+        <w:t xml:space="preserve">, and a localized neutral process is readily mistaken for biased transmission when diversity is taken at face value</w:t>
       </w:r>
       <w:r>
         <w:t xml:space="preserve"> </w:t>
@@ -2544,7 +2648,7 @@
         <w:pStyle w:val="BodyText"/>
       </w:pPr>
       <w:r>
-        <w:t xml:space="preserve">The same model lets the named phases be tested one at a time, in the culture historian’s own terms. Taking Parkin as the focal case, membership in its group is a probability rather than a fact: across the 500 runs, each assemblage shares Parkin’s drift-detected group some fraction of the time, a graded field that falls off smoothly with river distance from Parkin rather than the bounded set a phase map implies (Figure 9A). The Parkin-phase assemblages do separate from the others by this measure, but that is the separation that drift predicts, because they lie near Parkin and so co-occur with it more than distant assemblages do (Figure 9B). The discriminating test is whether the between-group cultural F_ST across the Parkin-versus-others partition exceeds the drift null. It sits at the extreme upper tail of the null and survives most single-site deletions, but it is small, the null’s own tail reaches past it, and time-averaging, which deflates between-group variance, is not modeled in the null (Figure 9C, 9D). It is therefore at most a weak hint of structure beyond drift, not a demonstrated social boundary. Geography and time are the whole engine, and the apparent groups are readings from a single neutral process.</w:t>
+        <w:t xml:space="preserve">The same model lets the named phases be tested one at a time, in the culture historian’s own terms. Taking Parkin as the focal case, membership in its group is a probability rather than a fact: across the 500 runs, each assemblage shares Parkin’s drift-detected group some fraction of the time, a graded field that falls off smoothly with river distance from Parkin rather than the bounded set a phase map implies (Figure 9A). The Parkin-phase assemblages do separate from the others by this measure, but that is the separation that drift predicts, because they lie near Parkin and so co-occur with it more than distant assemblages do (Figure 9B). The discriminating test is whether the between-group cultural F_ST across the Parkin-versus-others partition exceeds the drift null. It sits at the extreme upper tail of the null and survives most single-site deletions, but it is small, the null’s own tail reaches past it, and time-averaging, which deflates between-group variance, is not modeled in the null (Figure 9C, 9D). It is therefore at most a weak hint of structure beyond drift, not a demonstrated social boundary. Geography and time account for the pattern entirely, and the apparent groups are products of a single neutral process.</w:t>
       </w:r>
     </w:p>
     <w:p>
@@ -2697,7 +2801,7 @@
         <w:t xml:space="preserve"> </w:t>
       </w:r>
       <w:r>
-        <w:t xml:space="preserve">(Morse 1990)</w:t>
+        <w:t xml:space="preserve">(Phyllis A. Morse 1990)</w:t>
       </w:r>
       <w:r>
         <w:t xml:space="preserve">. The inference is specific and deserves credit for that, but it is circular. The tribute it concludes is the tribute it assumes, and no independent evidence of tribute flow accompanies it. Parkin’s position at the confluence of the St. Francis and Tyronza is as well explained by control of movement and communication as by extraction, and the transmission and exchange records both show the absence of the centralized control the tribute model requires. A second argument points to skeletal evidence from the lower Mississippi (Yazoo) Delta rather than the St. Francis basin, indicating a better diet at a mound center than at a nearby satellite village, consistent with differential access within a hierarchy</w:t>
@@ -2709,7 +2813,7 @@
         <w:t xml:space="preserve">(Ross-Stallings 2017)</w:t>
       </w:r>
       <w:r>
-        <w:t xml:space="preserve">. The contrast is real but thin: the satellite sample numbers fourteen individuals, the result is presented as tentative, and a health difference between two sites does not require an extractive hierarchy to produce it. Neither argument supplies the regional, structural signature that the convergence test looks for and does not find.</w:t>
+        <w:t xml:space="preserve">. The contrast is real but thin: the satellite sample numbers fourteen individuals, the result is presented as tentative, and a health difference between two sites does not require an extractive hierarchy to produce it. Neither argument supplies the regional, structural signature that the drift-versus-groups comparison looks for and does not find.</w:t>
       </w:r>
     </w:p>
     <w:p>
@@ -2726,7 +2830,7 @@
         <w:t xml:space="preserve">(Coco and Iovita 2020; Kidwell and Tomašových 2013; Perreault 2018; Tomašových and Kidwell 2009, 2010; Youngblood et al. 2023)</w:t>
       </w:r>
       <w:r>
-        <w:t xml:space="preserve">. Rather than argue that this makes the absence conservative, we built the damping into the recovery experiment directly, where it raises the detection threshold from s of 0.5 to 0.7, the quantified cost of the record’s temporal mixing. The verdict is stable across the watershed (19 assemblages) and corridor (29) basin definitions. The central methodological finding is that telling a bounded group from drift must be calibrated to the record to which it is applied. The same four signatures that discriminate cleanly on idealized data reduce, on a real time-averaged record of this size, to a single confound-controlled signature, and saying so is what licenses reading the structure as drift rather than weakening the claim.</w:t>
+        <w:t xml:space="preserve">. Rather than argue that this makes the absence conservative, we built the damping into the recovery experiment directly, where it raises the detection threshold from s of 0.5 to 0.7, the quantified cost of the record’s temporal mixing. The verdict is stable across the watershed (19 assemblages) and corridor (29) basin definitions. The central methodological finding is that telling a bounded group from drift must be calibrated to the record to which it is applied. The same four signatures that discriminate cleanly on idealized data reduce, on a real time-averaged record of this size, to a single confound-controlled signature, and saying so is what licenses interpreting the structure as drift rather than weakening the claim.</w:t>
       </w:r>
     </w:p>
     <w:p>
@@ -2734,7 +2838,7 @@
         <w:pStyle w:val="BodyText"/>
       </w:pPr>
       <w:r>
-        <w:t xml:space="preserve">The contribution has two parts that should be kept distinct. The four signatures distinguish a bounded interaction group from drift in principle, and an idealized simulation confirms that closure drives them together while drift and the other mimics do not (Figure S4). The calibration is the part that travels to real data: it asks, before any similarity structure is read as social, which signatures a given record can support and how strong a closure each could detect, and on the Parkin record, it shows the test reducing to its single most robust component, cultural F_ST. We are explicit about what that costs: had F_ST shown a positive trend, it alone could not have separated a real group from environmental patchiness, which also drives between-group variance (Table 1), so on a positive result, the generative drift-versus-groups comparison, not F_ST alone, would have had to carry the discrimination. The negative is cleaner because the present structure is positively matched by drift and overshot by bounded groups. This result shows that social structure may be measurable through decorated ceramic assemblages. We can also assess whether the Parkin phase was a polity by examining whether interaction had closed into a bounded group to a degree that the record can resolve. For the Parkin phase, the answer is that it had not, within the bounds supported by the record. The polity the De Soto encountered seems to reflect distinctions drawn in ceremonial practices, fortification, and settlement size, rather than one written into the structure of ceramic transmission.</w:t>
+        <w:t xml:space="preserve">The contribution has two parts that should be kept distinct. The four signatures distinguish a bounded interaction group from drift in principle, and an idealized simulation confirms that closure drives them together while drift and the other mimics do not (Figure S4). The calibration is the part that travels to real data: it asks, before any similarity structure is interpreted as social, which signatures a given record can support and how strong a closure each could detect, and on the Parkin record, it shows the test reducing to its single most robust component, cultural F_ST. We are explicit about what that costs: had F_ST shown a positive trend, it alone could not have separated a real group from environmental patchiness, which also drives between-group variance (Table 1), so on a positive result, the generative drift-versus-groups comparison, not F_ST alone, would have had to carry the discrimination. The negative is cleaner because the present structure is positively matched by drift and overshot by bounded groups. This result shows that social structure may be measurable through decorated ceramic assemblages. We can also assess whether the Parkin phase was a polity by examining whether interaction had closed into a bounded group to a degree that the record can resolve. For the Parkin phase, the answer is that it had not, within the bounds supported by the record. The polity the De Soto encountered seems to reflect distinctions drawn in ceremonial practices, fortification, and settlement size, rather than one written into the structure of ceramic transmission.</w:t>
       </w:r>
     </w:p>
     <w:p>
@@ -2742,7 +2846,7 @@
         <w:pStyle w:val="BodyText"/>
       </w:pPr>
       <w:r>
-        <w:t xml:space="preserve">One result resists the drift reading, if only faintly, and deserves to be named rather than buried. The single place in the valley that carries a whisper of structure beyond drift is the Parkin phase, and Parkin is the one monumental node, the largest mound, the palisade, the confluence position, the candidate Casqui. A center beginning to differentiate as a distinct node, rather than a finished bounded group, would leave just such a signal, and this is what the origination stage of the two-regime model predicts: a local return generates a group-beneficial pattern at a node before assortment becomes binding and propagates into higher-level structure, with contact and the protohistoric depopulation truncating the sequence before it could consolidate. We do not claim this happened. The contrast is small, the drift null reaches past it, and the time-averaged surface record of eight Parkin-phase assemblages cannot bear the weight. The possibility that Parkin was an incipient node nonetheless warrants direct investigation with data classes the present record lacks: stratified, excavated assemblages with independent radiocarbon, to test whether the differentiation grows through time rather than holding flat; compositional and petrographic sourcing of the ceramics, to test whether production and exchange were localizing on the center; and the non-ceramic lines, the chert-hoe and shell exchange networks</w:t>
+        <w:t xml:space="preserve">One result resists the drift interpretation, if only faintly, and deserves to be named rather than buried. The single place in the valley that carries a faint signal of structure beyond drift is the Parkin phase, and Parkin is the one monumental node, the largest mound, the palisade, the confluence position, the candidate Casqui. A center beginning to differentiate as a distinct node, rather than a finished bounded group, would leave just such a signal, and this is what the origination stage of the two-regime model predicts: a local return generates a group-beneficial pattern at a node before assortment becomes binding and propagates into higher-level structure, with contact and the protohistoric depopulation truncating the sequence before it could consolidate. We do not claim this happened. The contrast is small, the drift null reaches past it, and the time-averaged surface record of eight Parkin-phase assemblages cannot support the claim. The possibility that Parkin was an incipient node nonetheless warrants direct investigation with data classes the present record lacks: stratified, excavated assemblages with independent radiocarbon, to test whether the differentiation grows through time rather than holding flat; compositional and petrographic sourcing of the ceramics, to test whether production and exchange were localizing on the center; and the non-ceramic lines, the chert-hoe and shell exchange networks</w:t>
       </w:r>
       <w:r>
         <w:t xml:space="preserve"> </w:t>
@@ -3007,7 +3111,7 @@
         <w:pStyle w:val="FirstParagraph"/>
       </w:pPr>
       <w:r>
-        <w:t xml:space="preserve">The phase is the unit on which central-valley culture history is built, and it carries a silent claim that assemblages grouped by seriation and spatial proximity record a bounded society. For the Parkin phase, that claim does not survive measurement. Parkin is the basin’s largest and tallest-mounded center. No line of evidence, settlement, exchange, or ceramic transmission marks it as the apex of a polity, and the greater similarity among nearby assemblages that defines the phase is reproduced by neutral drift on the basin’s geography, the ordinary residue of continuous interaction structured by where sites sit. A bounded interaction group would have a sharper structure than the measurements indicate, and Parkin sits across orderings as a transmission bridge rather than at the closed core of one. Extending the test to the wider valley, a decorated-ceramic boundary that exceeds drift appears only between the central-valley and lower-valley blocks, and even there, it is entangled with the early-to-late turnover of the class repertoire. It cannot yet be read as a synchronic social division. Posed in the culture historian’s own terms, against the other named phases of the valley, the Parkin phase itself shows at most a weak contrast at the edge of the drift null, robust to single-site removal but small and within the null’s reach (Figure 9). The phase, at the scale where it is drawn, is largely indistinguishable from spatially structured drift, which carries a consequence the discipline should weigh: a similarity cluster is not by itself a society, and before a phase is read as a social group, the record must be shown able to tell a real interaction boundary from drift on geography. That calibration, not the phase, provides the basis for an explanation of social structure. When applied to the late pre-contact ceramics of the Mississippi Valley, it shows continuous interaction with prominent nodes rather than a mosaic of bounded polities.</w:t>
+        <w:t xml:space="preserve">The phase is the unit on which central-valley culture history is built, and it carries a silent claim that assemblages grouped by seriation and spatial proximity record a bounded society. For the Parkin phase, that claim does not survive measurement. Parkin is the basin’s largest and tallest-mounded center. No line of evidence, settlement, exchange, or ceramic transmission marks it as the apex of a polity, and the greater similarity among nearby assemblages that defines the phase is reproduced by neutral drift on the basin’s geography, the ordinary residue of continuous interaction structured by where sites sit. A bounded interaction group would have a sharper structure than the measurements indicate, and Parkin sits across orderings as a transmission bridge rather than at the closed core of one. Extending the test to the wider valley, a decorated-ceramic boundary that exceeds drift appears only between the central-valley and lower-valley blocks, and even there, it is entangled with the early-to-late turnover of the class repertoire. It cannot yet be interpreted as a synchronic social division. Posed in the culture historian’s own terms, against the other named phases of the valley, the Parkin phase itself shows at most a weak contrast at the edge of the drift null, robust to single-site removal but small and within the null’s reach (Figure 9). The phase, at the scale where it is drawn, is largely indistinguishable from spatially structured drift, which carries a consequence the discipline should weigh: a similarity cluster is not by itself a society, and before a phase is interpreted as a social group, the record must be shown able to tell a real interaction boundary from drift on geography. That calibration, not the phase, provides the basis for an explanation of social structure. When applied to the late pre-contact ceramics of the Mississippi Valley, it shows continuous interaction with prominent nodes rather than a mosaic of bounded polities.</w:t>
       </w:r>
     </w:p>
     <w:bookmarkEnd w:id="57"/>
@@ -3029,7 +3133,7 @@
       </w:r>
     </w:p>
     <w:bookmarkEnd w:id="58"/>
-    <w:bookmarkStart w:id="237" w:name="references"/>
+    <w:bookmarkStart w:id="241" w:name="references"/>
     <w:p>
       <w:pPr>
         <w:pStyle w:val="Heading2"/>
@@ -3038,7 +3142,7 @@
         <w:t xml:space="preserve">References</w:t>
       </w:r>
     </w:p>
-    <w:bookmarkStart w:id="236" w:name="refs"/>
+    <w:bookmarkStart w:id="240" w:name="refs"/>
     <w:bookmarkStart w:id="59" w:name="ref-anderson_1996"/>
     <w:p>
       <w:pPr>
@@ -4726,7 +4830,50 @@
       </w:r>
     </w:p>
     <w:bookmarkEnd w:id="129"/>
-    <w:bookmarkStart w:id="130" w:name="ref-house_1993"/>
+    <w:bookmarkStart w:id="130" w:name="ref-house_1991"/>
+    <w:p>
+      <w:pPr>
+        <w:pStyle w:val="Bibliography"/>
+      </w:pPr>
+      <w:r>
+        <w:t xml:space="preserve">House, John H. 1991. Monitoring</w:t>
+      </w:r>
+      <w:r>
+        <w:t xml:space="preserve"> </w:t>
+      </w:r>
+      <w:r>
+        <w:t xml:space="preserve">Mississippian</w:t>
+      </w:r>
+      <w:r>
+        <w:t xml:space="preserve"> </w:t>
+      </w:r>
+      <w:r>
+        <w:t xml:space="preserve">Dynamics: Time, Settlement, and Ceramic Variation in the</w:t>
+      </w:r>
+      <w:r>
+        <w:t xml:space="preserve"> </w:t>
+      </w:r>
+      <w:r>
+        <w:t xml:space="preserve">Kent</w:t>
+      </w:r>
+      <w:r>
+        <w:t xml:space="preserve"> </w:t>
+      </w:r>
+      <w:r>
+        <w:t xml:space="preserve">Phase, Eastern</w:t>
+      </w:r>
+      <w:r>
+        <w:t xml:space="preserve"> </w:t>
+      </w:r>
+      <w:r>
+        <w:t xml:space="preserve">Arkansas</w:t>
+      </w:r>
+      <w:r>
+        <w:t xml:space="preserve">. PhD thesis, Southern Illinois University at Carbondale.</w:t>
+      </w:r>
+    </w:p>
+    <w:bookmarkEnd w:id="130"/>
+    <w:bookmarkStart w:id="131" w:name="ref-house_1993"/>
     <w:p>
       <w:pPr>
         <w:pStyle w:val="Bibliography"/>
@@ -4751,8 +4898,8 @@
         <w:t xml:space="preserve">12(1):21–32.</w:t>
       </w:r>
     </w:p>
-    <w:bookmarkEnd w:id="130"/>
-    <w:bookmarkStart w:id="131" w:name="ref-hudson_smith_depratter_1990"/>
+    <w:bookmarkEnd w:id="131"/>
+    <w:bookmarkStart w:id="132" w:name="ref-hudson_smith_depratter_1990"/>
     <w:p>
       <w:pPr>
         <w:pStyle w:val="Bibliography"/>
@@ -4812,8 +4959,8 @@
         <w:t xml:space="preserve">, edited by David H. Dye and Cheryl Anne Cox, pp. 181–207. University of Alabama Press, Tuscaloosa.</w:t>
       </w:r>
     </w:p>
-    <w:bookmarkEnd w:id="131"/>
-    <w:bookmarkStart w:id="133" w:name="ref-hunt_2006"/>
+    <w:bookmarkEnd w:id="132"/>
+    <w:bookmarkStart w:id="134" w:name="ref-hunt_2006"/>
     <w:p>
       <w:pPr>
         <w:pStyle w:val="Bibliography"/>
@@ -4840,7 +4987,7 @@
       <w:r>
         <w:t xml:space="preserve"> </w:t>
       </w:r>
-      <w:hyperlink r:id="rId132">
+      <w:hyperlink r:id="rId133">
         <w:r>
           <w:rPr>
             <w:rStyle w:val="Hyperlink"/>
@@ -4852,8 +4999,8 @@
         <w:t xml:space="preserve">.</w:t>
       </w:r>
     </w:p>
-    <w:bookmarkEnd w:id="133"/>
-    <w:bookmarkStart w:id="135" w:name="ref-hunt_bell_travis_2008"/>
+    <w:bookmarkEnd w:id="134"/>
+    <w:bookmarkStart w:id="136" w:name="ref-hunt_bell_travis_2008"/>
     <w:p>
       <w:pPr>
         <w:pStyle w:val="Bibliography"/>
@@ -4880,7 +5027,7 @@
       <w:r>
         <w:t xml:space="preserve"> </w:t>
       </w:r>
-      <w:hyperlink r:id="rId134">
+      <w:hyperlink r:id="rId135">
         <w:r>
           <w:rPr>
             <w:rStyle w:val="Hyperlink"/>
@@ -4892,8 +5039,8 @@
         <w:t xml:space="preserve">.</w:t>
       </w:r>
     </w:p>
-    <w:bookmarkEnd w:id="135"/>
-    <w:bookmarkStart w:id="136" w:name="ref-hurlbert_1971"/>
+    <w:bookmarkEnd w:id="136"/>
+    <w:bookmarkStart w:id="137" w:name="ref-hurlbert_1971"/>
     <w:p>
       <w:pPr>
         <w:pStyle w:val="Bibliography"/>
@@ -4918,8 +5065,8 @@
         <w:t xml:space="preserve">52(4):577–586.</w:t>
       </w:r>
     </w:p>
-    <w:bookmarkEnd w:id="136"/>
-    <w:bookmarkStart w:id="138" w:name="ref-kandler_shennan_2013"/>
+    <w:bookmarkEnd w:id="137"/>
+    <w:bookmarkStart w:id="139" w:name="ref-kandler_shennan_2013"/>
     <w:p>
       <w:pPr>
         <w:pStyle w:val="Bibliography"/>
@@ -4946,7 +5093,7 @@
       <w:r>
         <w:t xml:space="preserve"> </w:t>
       </w:r>
-      <w:hyperlink r:id="rId137">
+      <w:hyperlink r:id="rId138">
         <w:r>
           <w:rPr>
             <w:rStyle w:val="Hyperlink"/>
@@ -4958,8 +5105,8 @@
         <w:t xml:space="preserve">.</w:t>
       </w:r>
     </w:p>
-    <w:bookmarkEnd w:id="138"/>
-    <w:bookmarkStart w:id="140" w:name="ref-kandler_shennan_2015"/>
+    <w:bookmarkEnd w:id="139"/>
+    <w:bookmarkStart w:id="141" w:name="ref-kandler_shennan_2015"/>
     <w:p>
       <w:pPr>
         <w:pStyle w:val="Bibliography"/>
@@ -4998,7 +5145,7 @@
       <w:r>
         <w:t xml:space="preserve"> </w:t>
       </w:r>
-      <w:hyperlink r:id="rId139">
+      <w:hyperlink r:id="rId140">
         <w:r>
           <w:rPr>
             <w:rStyle w:val="Hyperlink"/>
@@ -5010,8 +5157,8 @@
         <w:t xml:space="preserve">.</w:t>
       </w:r>
     </w:p>
-    <w:bookmarkEnd w:id="140"/>
-    <w:bookmarkStart w:id="142" w:name="ref-kandler_wilder_fortunato_2017"/>
+    <w:bookmarkEnd w:id="141"/>
+    <w:bookmarkStart w:id="143" w:name="ref-kandler_wilder_fortunato_2017"/>
     <w:p>
       <w:pPr>
         <w:pStyle w:val="Bibliography"/>
@@ -5038,7 +5185,7 @@
       <w:r>
         <w:t xml:space="preserve"> </w:t>
       </w:r>
-      <w:hyperlink r:id="rId141">
+      <w:hyperlink r:id="rId142">
         <w:r>
           <w:rPr>
             <w:rStyle w:val="Hyperlink"/>
@@ -5050,8 +5197,8 @@
         <w:t xml:space="preserve">.</w:t>
       </w:r>
     </w:p>
-    <w:bookmarkEnd w:id="142"/>
-    <w:bookmarkStart w:id="144" w:name="ref-kidwell_tomasovych_2013"/>
+    <w:bookmarkEnd w:id="143"/>
+    <w:bookmarkStart w:id="145" w:name="ref-kidwell_tomasovych_2013"/>
     <w:p>
       <w:pPr>
         <w:pStyle w:val="Bibliography"/>
@@ -5078,7 +5225,7 @@
       <w:r>
         <w:t xml:space="preserve"> </w:t>
       </w:r>
-      <w:hyperlink r:id="rId143">
+      <w:hyperlink r:id="rId144">
         <w:r>
           <w:rPr>
             <w:rStyle w:val="Hyperlink"/>
@@ -5090,8 +5237,8 @@
         <w:t xml:space="preserve">.</w:t>
       </w:r>
     </w:p>
-    <w:bookmarkEnd w:id="144"/>
-    <w:bookmarkStart w:id="145" w:name="ref-king_freer_1995"/>
+    <w:bookmarkEnd w:id="145"/>
+    <w:bookmarkStart w:id="146" w:name="ref-king_freer_1995"/>
     <w:p>
       <w:pPr>
         <w:pStyle w:val="Bibliography"/>
@@ -5125,8 +5272,8 @@
         <w:t xml:space="preserve">, edited by Michael S. Nassaney and Kenneth E. Sassaman, pp. 266–288. University of Tennessee Press, Knoxville.</w:t>
       </w:r>
     </w:p>
-    <w:bookmarkEnd w:id="145"/>
-    <w:bookmarkStart w:id="147" w:name="ref-ladefoged_graves_2000"/>
+    <w:bookmarkEnd w:id="146"/>
+    <w:bookmarkStart w:id="148" w:name="ref-ladefoged_graves_2000"/>
     <w:p>
       <w:pPr>
         <w:pStyle w:val="Bibliography"/>
@@ -5171,7 +5318,7 @@
       <w:r>
         <w:t xml:space="preserve"> </w:t>
       </w:r>
-      <w:hyperlink r:id="rId146">
+      <w:hyperlink r:id="rId147">
         <w:r>
           <w:rPr>
             <w:rStyle w:val="Hyperlink"/>
@@ -5183,8 +5330,8 @@
         <w:t xml:space="preserve">.</w:t>
       </w:r>
     </w:p>
-    <w:bookmarkEnd w:id="147"/>
-    <w:bookmarkStart w:id="148" w:name="ref-lewontin_1974"/>
+    <w:bookmarkEnd w:id="148"/>
+    <w:bookmarkStart w:id="149" w:name="ref-lewontin_1974"/>
     <w:p>
       <w:pPr>
         <w:pStyle w:val="Bibliography"/>
@@ -5206,8 +5353,8 @@
         <w:t xml:space="preserve">. Columbia University Press, New York.</w:t>
       </w:r>
     </w:p>
-    <w:bookmarkEnd w:id="148"/>
-    <w:bookmarkStart w:id="149" w:name="ref-lipo_2001"/>
+    <w:bookmarkEnd w:id="149"/>
+    <w:bookmarkStart w:id="150" w:name="ref-lipo_2001"/>
     <w:p>
       <w:pPr>
         <w:pStyle w:val="Bibliography"/>
@@ -5257,8 +5404,8 @@
         <w:t xml:space="preserve">. BAR International Series 918. Archaeopress, Oxford.</w:t>
       </w:r>
     </w:p>
-    <w:bookmarkEnd w:id="149"/>
-    <w:bookmarkStart w:id="151" w:name="ref-lipo_dinapoli_madsen_hunt_2021"/>
+    <w:bookmarkEnd w:id="150"/>
+    <w:bookmarkStart w:id="152" w:name="ref-lipo_dinapoli_madsen_hunt_2021"/>
     <w:p>
       <w:pPr>
         <w:pStyle w:val="Bibliography"/>
@@ -5285,7 +5432,7 @@
       <w:r>
         <w:t xml:space="preserve"> </w:t>
       </w:r>
-      <w:hyperlink r:id="rId150">
+      <w:hyperlink r:id="rId151">
         <w:r>
           <w:rPr>
             <w:rStyle w:val="Hyperlink"/>
@@ -5297,8 +5444,8 @@
         <w:t xml:space="preserve">.</w:t>
       </w:r>
     </w:p>
-    <w:bookmarkEnd w:id="151"/>
-    <w:bookmarkStart w:id="152" w:name="ref-lipo_dunnell_2007"/>
+    <w:bookmarkEnd w:id="152"/>
+    <w:bookmarkStart w:id="153" w:name="ref-lipo_dunnell_2007"/>
     <w:p>
       <w:pPr>
         <w:pStyle w:val="Bibliography"/>
@@ -5360,8 +5507,8 @@
         <w:t xml:space="preserve">, edited by Janet Rafferty and Evan Peacock, pp. 125–167. University of Alabama Press, Tuscaloosa.</w:t>
       </w:r>
     </w:p>
-    <w:bookmarkEnd w:id="152"/>
-    <w:bookmarkStart w:id="154" w:name="ref-lipo_hunt_hundtoft_2010"/>
+    <w:bookmarkEnd w:id="153"/>
+    <w:bookmarkStart w:id="155" w:name="ref-lipo_hunt_hundtoft_2010"/>
     <w:p>
       <w:pPr>
         <w:pStyle w:val="Bibliography"/>
@@ -5406,7 +5553,7 @@
       <w:r>
         <w:t xml:space="preserve"> </w:t>
       </w:r>
-      <w:hyperlink r:id="rId153">
+      <w:hyperlink r:id="rId154">
         <w:r>
           <w:rPr>
             <w:rStyle w:val="Hyperlink"/>
@@ -5418,8 +5565,8 @@
         <w:t xml:space="preserve">.</w:t>
       </w:r>
     </w:p>
-    <w:bookmarkEnd w:id="154"/>
-    <w:bookmarkStart w:id="156" w:name="ref-lipo_madsen_dunnell_2015"/>
+    <w:bookmarkEnd w:id="155"/>
+    <w:bookmarkStart w:id="157" w:name="ref-lipo_madsen_dunnell_2015"/>
     <w:p>
       <w:pPr>
         <w:pStyle w:val="Bibliography"/>
@@ -5446,7 +5593,7 @@
       <w:r>
         <w:t xml:space="preserve"> </w:t>
       </w:r>
-      <w:hyperlink r:id="rId155">
+      <w:hyperlink r:id="rId156">
         <w:r>
           <w:rPr>
             <w:rStyle w:val="Hyperlink"/>
@@ -5458,8 +5605,8 @@
         <w:t xml:space="preserve">.</w:t>
       </w:r>
     </w:p>
-    <w:bookmarkEnd w:id="156"/>
-    <w:bookmarkStart w:id="158" w:name="ref-lipo_madsen_dunnell_hunt_1997"/>
+    <w:bookmarkEnd w:id="157"/>
+    <w:bookmarkStart w:id="159" w:name="ref-lipo_madsen_dunnell_hunt_1997"/>
     <w:p>
       <w:pPr>
         <w:pStyle w:val="Bibliography"/>
@@ -5486,7 +5633,7 @@
       <w:r>
         <w:t xml:space="preserve"> </w:t>
       </w:r>
-      <w:hyperlink r:id="rId157">
+      <w:hyperlink r:id="rId158">
         <w:r>
           <w:rPr>
             <w:rStyle w:val="Hyperlink"/>
@@ -5498,8 +5645,8 @@
         <w:t xml:space="preserve">.</w:t>
       </w:r>
     </w:p>
-    <w:bookmarkEnd w:id="158"/>
-    <w:bookmarkStart w:id="160" w:name="ref-holland-lulewicz_2019"/>
+    <w:bookmarkEnd w:id="159"/>
+    <w:bookmarkStart w:id="161" w:name="ref-holland-lulewicz_2019"/>
     <w:p>
       <w:pPr>
         <w:pStyle w:val="Bibliography"/>
@@ -5553,7 +5700,7 @@
       <w:r>
         <w:t xml:space="preserve"> </w:t>
       </w:r>
-      <w:hyperlink r:id="rId159">
+      <w:hyperlink r:id="rId160">
         <w:r>
           <w:rPr>
             <w:rStyle w:val="Hyperlink"/>
@@ -5565,8 +5712,8 @@
         <w:t xml:space="preserve">.</w:t>
       </w:r>
     </w:p>
-    <w:bookmarkEnd w:id="160"/>
-    <w:bookmarkStart w:id="162" w:name="ref-lyman_2021"/>
+    <w:bookmarkEnd w:id="161"/>
+    <w:bookmarkStart w:id="163" w:name="ref-lyman_2021"/>
     <w:p>
       <w:pPr>
         <w:pStyle w:val="Bibliography"/>
@@ -5593,7 +5740,7 @@
       <w:r>
         <w:t xml:space="preserve"> </w:t>
       </w:r>
-      <w:hyperlink r:id="rId161">
+      <w:hyperlink r:id="rId162">
         <w:r>
           <w:rPr>
             <w:rStyle w:val="Hyperlink"/>
@@ -5605,8 +5752,8 @@
         <w:t xml:space="preserve">.</w:t>
       </w:r>
     </w:p>
-    <w:bookmarkEnd w:id="162"/>
-    <w:bookmarkStart w:id="163" w:name="ref-madsen_2012"/>
+    <w:bookmarkEnd w:id="163"/>
+    <w:bookmarkStart w:id="164" w:name="ref-madsen_2012"/>
     <w:p>
       <w:pPr>
         <w:pStyle w:val="Bibliography"/>
@@ -5615,8 +5762,8 @@
         <w:t xml:space="preserve">Madsen, Mark E. 2012. Neutral Cultural Transmission in Time-Averaged Archaeological Assemblages. arXiv preprint arXiv:1204.2043 [physics.soc-ph].</w:t>
       </w:r>
     </w:p>
-    <w:bookmarkEnd w:id="163"/>
-    <w:bookmarkStart w:id="164" w:name="ref-mainfort_1996"/>
+    <w:bookmarkEnd w:id="164"/>
+    <w:bookmarkStart w:id="165" w:name="ref-mainfort_1996"/>
     <w:p>
       <w:pPr>
         <w:pStyle w:val="Bibliography"/>
@@ -5665,8 +5812,8 @@
         <w:t xml:space="preserve">15(2):172–181.</w:t>
       </w:r>
     </w:p>
-    <w:bookmarkEnd w:id="164"/>
-    <w:bookmarkStart w:id="165" w:name="ref-mainfort_1996b"/>
+    <w:bookmarkEnd w:id="165"/>
+    <w:bookmarkStart w:id="166" w:name="ref-mainfort_1996b"/>
     <w:p>
       <w:pPr>
         <w:pStyle w:val="Bibliography"/>
@@ -5691,8 +5838,8 @@
         <w:t xml:space="preserve">15(2):172–181.</w:t>
       </w:r>
     </w:p>
-    <w:bookmarkEnd w:id="165"/>
-    <w:bookmarkStart w:id="166" w:name="ref-mainfort_2001"/>
+    <w:bookmarkEnd w:id="166"/>
+    <w:bookmarkStart w:id="167" w:name="ref-mainfort_2001"/>
     <w:p>
       <w:pPr>
         <w:pStyle w:val="Bibliography"/>
@@ -5726,8 +5873,8 @@
         <w:t xml:space="preserve">, edited by David S. Brose, C. Wesley Cowan, and Jr. Mainfort Robert C., pp. 173–190. Smithsonian Institution Press, Washington, DC.</w:t>
       </w:r>
     </w:p>
-    <w:bookmarkEnd w:id="166"/>
-    <w:bookmarkStart w:id="167" w:name="ref-mainfort_2003"/>
+    <w:bookmarkEnd w:id="167"/>
+    <w:bookmarkStart w:id="168" w:name="ref-mainfort_2003"/>
     <w:p>
       <w:pPr>
         <w:pStyle w:val="Bibliography"/>
@@ -5764,8 +5911,8 @@
         <w:t xml:space="preserve">22(2):176–184.</w:t>
       </w:r>
     </w:p>
-    <w:bookmarkEnd w:id="167"/>
-    <w:bookmarkStart w:id="168" w:name="ref-mantel_1967"/>
+    <w:bookmarkEnd w:id="168"/>
+    <w:bookmarkStart w:id="169" w:name="ref-mantel_1967"/>
     <w:p>
       <w:pPr>
         <w:pStyle w:val="Bibliography"/>
@@ -5790,8 +5937,8 @@
         <w:t xml:space="preserve">27(2):209–220.</w:t>
       </w:r>
     </w:p>
-    <w:bookmarkEnd w:id="168"/>
-    <w:bookmarkStart w:id="169" w:name="ref-mcnutt_ed_1996"/>
+    <w:bookmarkEnd w:id="169"/>
+    <w:bookmarkStart w:id="170" w:name="ref-mcnutt_ed_1996"/>
     <w:p>
       <w:pPr>
         <w:pStyle w:val="Bibliography"/>
@@ -5841,8 +5988,8 @@
         <w:t xml:space="preserve">. University of Alabama Press, Tuscaloosa.</w:t>
       </w:r>
     </w:p>
-    <w:bookmarkEnd w:id="169"/>
-    <w:bookmarkStart w:id="170" w:name="ref-mesoudi_2021"/>
+    <w:bookmarkEnd w:id="170"/>
+    <w:bookmarkStart w:id="171" w:name="ref-mesoudi_2021"/>
     <w:p>
       <w:pPr>
         <w:pStyle w:val="Bibliography"/>
@@ -5867,8 +6014,8 @@
         <w:t xml:space="preserve">376:20200053.</w:t>
       </w:r>
     </w:p>
-    <w:bookmarkEnd w:id="170"/>
-    <w:bookmarkStart w:id="172" w:name="ref-miller_atkins_premo_2018"/>
+    <w:bookmarkEnd w:id="171"/>
+    <w:bookmarkStart w:id="173" w:name="ref-miller_atkins_premo_2018"/>
     <w:p>
       <w:pPr>
         <w:pStyle w:val="Bibliography"/>
@@ -5895,7 +6042,7 @@
       <w:r>
         <w:t xml:space="preserve"> </w:t>
       </w:r>
-      <w:hyperlink r:id="rId171">
+      <w:hyperlink r:id="rId172">
         <w:r>
           <w:rPr>
             <w:rStyle w:val="Hyperlink"/>
@@ -5907,8 +6054,8 @@
         <w:t xml:space="preserve">.</w:t>
       </w:r>
     </w:p>
-    <w:bookmarkEnd w:id="172"/>
-    <w:bookmarkStart w:id="173" w:name="ref-milner_1998"/>
+    <w:bookmarkEnd w:id="173"/>
+    <w:bookmarkStart w:id="174" w:name="ref-milner_1998"/>
     <w:p>
       <w:pPr>
         <w:pStyle w:val="Bibliography"/>
@@ -5986,8 +6133,8 @@
         <w:t xml:space="preserve">. Smithsonian Institution Press, Washington, D.C.</w:t>
       </w:r>
     </w:p>
-    <w:bookmarkEnd w:id="173"/>
-    <w:bookmarkStart w:id="174" w:name="ref-mitchem_2001"/>
+    <w:bookmarkEnd w:id="174"/>
+    <w:bookmarkStart w:id="175" w:name="ref-mitchem_2001"/>
     <w:p>
       <w:pPr>
         <w:pStyle w:val="Bibliography"/>
@@ -6017,8 +6164,57 @@
         <w:t xml:space="preserve">.</w:t>
       </w:r>
     </w:p>
-    <w:bookmarkEnd w:id="174"/>
-    <w:bookmarkStart w:id="175" w:name="ref-morse_morse_1983"/>
+    <w:bookmarkEnd w:id="175"/>
+    <w:bookmarkStart w:id="176" w:name="ref-morse_d_1990"/>
+    <w:p>
+      <w:pPr>
+        <w:pStyle w:val="Bibliography"/>
+      </w:pPr>
+      <w:r>
+        <w:t xml:space="preserve">Morse, Dan F. 1990. The</w:t>
+      </w:r>
+      <w:r>
+        <w:t xml:space="preserve"> </w:t>
+      </w:r>
+      <w:r>
+        <w:t xml:space="preserve">Nodena</w:t>
+      </w:r>
+      <w:r>
+        <w:t xml:space="preserve"> </w:t>
+      </w:r>
+      <w:r>
+        <w:t xml:space="preserve">Phase. In</w:t>
+      </w:r>
+      <w:r>
+        <w:t xml:space="preserve"> </w:t>
+      </w:r>
+      <w:r>
+        <w:rPr>
+          <w:i/>
+          <w:iCs/>
+        </w:rPr>
+        <w:t xml:space="preserve">Towns and Temples Along the</w:t>
+      </w:r>
+      <w:r>
+        <w:rPr>
+          <w:i/>
+          <w:iCs/>
+        </w:rPr>
+        <w:t xml:space="preserve"> </w:t>
+      </w:r>
+      <w:r>
+        <w:rPr>
+          <w:i/>
+          <w:iCs/>
+        </w:rPr>
+        <w:t xml:space="preserve">Mississippi</w:t>
+      </w:r>
+      <w:r>
+        <w:t xml:space="preserve">, edited by David H. Dye and Cheryl Anne Cox, pp. 69–97. University of Alabama Press, Tuscaloosa.</w:t>
+      </w:r>
+    </w:p>
+    <w:bookmarkEnd w:id="176"/>
+    <w:bookmarkStart w:id="177" w:name="ref-morse_morse_1983"/>
     <w:p>
       <w:pPr>
         <w:pStyle w:val="Bibliography"/>
@@ -6068,8 +6264,8 @@
         <w:t xml:space="preserve">. Academic Press, New York.</w:t>
       </w:r>
     </w:p>
-    <w:bookmarkEnd w:id="175"/>
-    <w:bookmarkStart w:id="176" w:name="ref-morse_morse_1996"/>
+    <w:bookmarkEnd w:id="177"/>
+    <w:bookmarkStart w:id="178" w:name="ref-morse_morse_1996"/>
     <w:p>
       <w:pPr>
         <w:pStyle w:val="Bibliography"/>
@@ -6106,8 +6302,8 @@
         <w:t xml:space="preserve">17(1):1–35.</w:t>
       </w:r>
     </w:p>
-    <w:bookmarkEnd w:id="176"/>
-    <w:bookmarkStart w:id="177" w:name="ref-morse_1990"/>
+    <w:bookmarkEnd w:id="178"/>
+    <w:bookmarkStart w:id="179" w:name="ref-morse_1990"/>
     <w:p>
       <w:pPr>
         <w:pStyle w:val="Bibliography"/>
@@ -6167,8 +6363,8 @@
         <w:t xml:space="preserve">, edited by David H. Dye and Cheryl Anne Cox, pp. 118–134. University of Alabama Press, Tuscaloosa.</w:t>
       </w:r>
     </w:p>
-    <w:bookmarkEnd w:id="177"/>
-    <w:bookmarkStart w:id="178" w:name="ref-neiman_1995"/>
+    <w:bookmarkEnd w:id="179"/>
+    <w:bookmarkStart w:id="180" w:name="ref-neiman_1995"/>
     <w:p>
       <w:pPr>
         <w:pStyle w:val="Bibliography"/>
@@ -6211,8 +6407,8 @@
         <w:t xml:space="preserve">60(1):7–36.</w:t>
       </w:r>
     </w:p>
-    <w:bookmarkEnd w:id="178"/>
-    <w:bookmarkStart w:id="180" w:name="ref-odwyer_kandler_2017"/>
+    <w:bookmarkEnd w:id="180"/>
+    <w:bookmarkStart w:id="182" w:name="ref-odwyer_kandler_2017"/>
     <w:p>
       <w:pPr>
         <w:pStyle w:val="Bibliography"/>
@@ -6239,7 +6435,7 @@
       <w:r>
         <w:t xml:space="preserve"> </w:t>
       </w:r>
-      <w:hyperlink r:id="rId179">
+      <w:hyperlink r:id="rId181">
         <w:r>
           <w:rPr>
             <w:rStyle w:val="Hyperlink"/>
@@ -6251,8 +6447,8 @@
         <w:t xml:space="preserve">.</w:t>
       </w:r>
     </w:p>
-    <w:bookmarkEnd w:id="180"/>
-    <w:bookmarkStart w:id="182" w:name="ref-peebles_kus_1977"/>
+    <w:bookmarkEnd w:id="182"/>
+    <w:bookmarkStart w:id="184" w:name="ref-peebles_kus_1977"/>
     <w:p>
       <w:pPr>
         <w:pStyle w:val="Bibliography"/>
@@ -6279,7 +6475,7 @@
       <w:r>
         <w:t xml:space="preserve"> </w:t>
       </w:r>
-      <w:hyperlink r:id="rId181">
+      <w:hyperlink r:id="rId183">
         <w:r>
           <w:rPr>
             <w:rStyle w:val="Hyperlink"/>
@@ -6291,8 +6487,8 @@
         <w:t xml:space="preserve">.</w:t>
       </w:r>
     </w:p>
-    <w:bookmarkEnd w:id="182"/>
-    <w:bookmarkStart w:id="184" w:name="ref-peeples_schachner_2012"/>
+    <w:bookmarkEnd w:id="184"/>
+    <w:bookmarkStart w:id="186" w:name="ref-peeples_schachner_2012"/>
     <w:p>
       <w:pPr>
         <w:pStyle w:val="Bibliography"/>
@@ -6319,7 +6515,7 @@
       <w:r>
         <w:t xml:space="preserve"> </w:t>
       </w:r>
-      <w:hyperlink r:id="rId183">
+      <w:hyperlink r:id="rId185">
         <w:r>
           <w:rPr>
             <w:rStyle w:val="Hyperlink"/>
@@ -6331,8 +6527,8 @@
         <w:t xml:space="preserve">.</w:t>
       </w:r>
     </w:p>
-    <w:bookmarkEnd w:id="184"/>
-    <w:bookmarkStart w:id="186" w:name="ref-perreault_2018"/>
+    <w:bookmarkEnd w:id="186"/>
+    <w:bookmarkStart w:id="188" w:name="ref-perreault_2018"/>
     <w:p>
       <w:pPr>
         <w:pStyle w:val="Bibliography"/>
@@ -6359,7 +6555,7 @@
       <w:r>
         <w:t xml:space="preserve"> </w:t>
       </w:r>
-      <w:hyperlink r:id="rId185">
+      <w:hyperlink r:id="rId187">
         <w:r>
           <w:rPr>
             <w:rStyle w:val="Hyperlink"/>
@@ -6371,8 +6567,8 @@
         <w:t xml:space="preserve">.</w:t>
       </w:r>
     </w:p>
-    <w:bookmarkEnd w:id="186"/>
-    <w:bookmarkStart w:id="187" w:name="ref-perreault_2019"/>
+    <w:bookmarkEnd w:id="188"/>
+    <w:bookmarkStart w:id="189" w:name="ref-perreault_2019"/>
     <w:p>
       <w:pPr>
         <w:pStyle w:val="Bibliography"/>
@@ -6394,8 +6590,8 @@
         <w:t xml:space="preserve">. University of Chicago Press, Chicago.</w:t>
       </w:r>
     </w:p>
-    <w:bookmarkEnd w:id="187"/>
-    <w:bookmarkStart w:id="188" w:name="ref-phillips_1970"/>
+    <w:bookmarkEnd w:id="189"/>
+    <w:bookmarkStart w:id="190" w:name="ref-phillips_1970"/>
     <w:p>
       <w:pPr>
         <w:pStyle w:val="Bibliography"/>
@@ -6466,8 +6662,8 @@
         <w:t xml:space="preserve">, Vol. 60. Papers of the Peabody Museum of Archaeology and Ethnology. Peabody Museum, Harvard University, Cambridge, MA.</w:t>
       </w:r>
     </w:p>
-    <w:bookmarkEnd w:id="188"/>
-    <w:bookmarkStart w:id="189" w:name="ref-phillips_ford_griffin_1951"/>
+    <w:bookmarkEnd w:id="190"/>
+    <w:bookmarkStart w:id="191" w:name="ref-phillips_ford_griffin_1951"/>
     <w:p>
       <w:pPr>
         <w:pStyle w:val="Bibliography"/>
@@ -6517,8 +6713,8 @@
         <w:t xml:space="preserve">, Vol. 25. Papers of the Peabody Museum of American Archaeology and Ethnology. Peabody Museum, Harvard University, Cambridge, MA.</w:t>
       </w:r>
     </w:p>
-    <w:bookmarkEnd w:id="189"/>
-    <w:bookmarkStart w:id="191" w:name="ref-phillips_willey_1953"/>
+    <w:bookmarkEnd w:id="191"/>
+    <w:bookmarkStart w:id="193" w:name="ref-phillips_willey_1953"/>
     <w:p>
       <w:pPr>
         <w:pStyle w:val="Bibliography"/>
@@ -6545,7 +6741,7 @@
       <w:r>
         <w:t xml:space="preserve"> </w:t>
       </w:r>
-      <w:hyperlink r:id="rId190">
+      <w:hyperlink r:id="rId192">
         <w:r>
           <w:rPr>
             <w:rStyle w:val="Hyperlink"/>
@@ -6557,8 +6753,8 @@
         <w:t xml:space="preserve">.</w:t>
       </w:r>
     </w:p>
-    <w:bookmarkEnd w:id="191"/>
-    <w:bookmarkStart w:id="193" w:name="ref-powell_shennan_thomas_2009"/>
+    <w:bookmarkEnd w:id="193"/>
+    <w:bookmarkStart w:id="195" w:name="ref-powell_shennan_thomas_2009"/>
     <w:p>
       <w:pPr>
         <w:pStyle w:val="Bibliography"/>
@@ -6597,7 +6793,7 @@
       <w:r>
         <w:t xml:space="preserve"> </w:t>
       </w:r>
-      <w:hyperlink r:id="rId192">
+      <w:hyperlink r:id="rId194">
         <w:r>
           <w:rPr>
             <w:rStyle w:val="Hyperlink"/>
@@ -6609,8 +6805,8 @@
         <w:t xml:space="preserve">.</w:t>
       </w:r>
     </w:p>
-    <w:bookmarkEnd w:id="193"/>
-    <w:bookmarkStart w:id="195" w:name="ref-premo_2014"/>
+    <w:bookmarkEnd w:id="195"/>
+    <w:bookmarkStart w:id="197" w:name="ref-premo_2014"/>
     <w:p>
       <w:pPr>
         <w:pStyle w:val="Bibliography"/>
@@ -6637,7 +6833,7 @@
       <w:r>
         <w:t xml:space="preserve"> </w:t>
       </w:r>
-      <w:hyperlink r:id="rId194">
+      <w:hyperlink r:id="rId196">
         <w:r>
           <w:rPr>
             <w:rStyle w:val="Hyperlink"/>
@@ -6649,8 +6845,8 @@
         <w:t xml:space="preserve">.</w:t>
       </w:r>
     </w:p>
-    <w:bookmarkEnd w:id="195"/>
-    <w:bookmarkStart w:id="197" w:name="ref-premo_2016"/>
+    <w:bookmarkEnd w:id="197"/>
+    <w:bookmarkStart w:id="199" w:name="ref-premo_2016"/>
     <w:p>
       <w:pPr>
         <w:pStyle w:val="Bibliography"/>
@@ -6677,7 +6873,7 @@
       <w:r>
         <w:t xml:space="preserve"> </w:t>
       </w:r>
-      <w:hyperlink r:id="rId196">
+      <w:hyperlink r:id="rId198">
         <w:r>
           <w:rPr>
             <w:rStyle w:val="Hyperlink"/>
@@ -6689,8 +6885,8 @@
         <w:t xml:space="preserve">.</w:t>
       </w:r>
     </w:p>
-    <w:bookmarkEnd w:id="197"/>
-    <w:bookmarkStart w:id="199" w:name="ref-premo_scholnick_2011"/>
+    <w:bookmarkEnd w:id="199"/>
+    <w:bookmarkStart w:id="201" w:name="ref-premo_scholnick_2011"/>
     <w:p>
       <w:pPr>
         <w:pStyle w:val="Bibliography"/>
@@ -6717,7 +6913,7 @@
       <w:r>
         <w:t xml:space="preserve"> </w:t>
       </w:r>
-      <w:hyperlink r:id="rId198">
+      <w:hyperlink r:id="rId200">
         <w:r>
           <w:rPr>
             <w:rStyle w:val="Hyperlink"/>
@@ -6729,8 +6925,8 @@
         <w:t xml:space="preserve">.</w:t>
       </w:r>
     </w:p>
-    <w:bookmarkEnd w:id="199"/>
-    <w:bookmarkStart w:id="200" w:name="ref-rees_political_culture"/>
+    <w:bookmarkEnd w:id="201"/>
+    <w:bookmarkStart w:id="202" w:name="ref-rees_political_culture"/>
     <w:p>
       <w:pPr>
         <w:pStyle w:val="Bibliography"/>
@@ -6754,8 +6950,8 @@
         <w:t xml:space="preserve">. Ph.D. dissertation, University of Oklahoma, Norman.</w:t>
       </w:r>
     </w:p>
-    <w:bookmarkEnd w:id="200"/>
-    <w:bookmarkStart w:id="202" w:name="ref-reimer_etal_2020"/>
+    <w:bookmarkEnd w:id="202"/>
+    <w:bookmarkStart w:id="204" w:name="ref-reimer_etal_2020"/>
     <w:p>
       <w:pPr>
         <w:pStyle w:val="Bibliography"/>
@@ -6809,7 +7005,7 @@
       <w:r>
         <w:t xml:space="preserve"> </w:t>
       </w:r>
-      <w:hyperlink r:id="rId201">
+      <w:hyperlink r:id="rId203">
         <w:r>
           <w:rPr>
             <w:rStyle w:val="Hyperlink"/>
@@ -6821,8 +7017,8 @@
         <w:t xml:space="preserve">.</w:t>
       </w:r>
     </w:p>
-    <w:bookmarkEnd w:id="202"/>
-    <w:bookmarkStart w:id="204" w:name="ref-richerson_etal_2016"/>
+    <w:bookmarkEnd w:id="204"/>
+    <w:bookmarkStart w:id="206" w:name="ref-richerson_etal_2016"/>
     <w:p>
       <w:pPr>
         <w:pStyle w:val="Bibliography"/>
@@ -6849,7 +7045,7 @@
       <w:r>
         <w:t xml:space="preserve"> </w:t>
       </w:r>
-      <w:hyperlink r:id="rId203">
+      <w:hyperlink r:id="rId205">
         <w:r>
           <w:rPr>
             <w:rStyle w:val="Hyperlink"/>
@@ -6861,8 +7057,8 @@
         <w:t xml:space="preserve">.</w:t>
       </w:r>
     </w:p>
-    <w:bookmarkEnd w:id="204"/>
-    <w:bookmarkStart w:id="206" w:name="ref-riede_hoggard_shennan_2019"/>
+    <w:bookmarkEnd w:id="206"/>
+    <w:bookmarkStart w:id="208" w:name="ref-riede_hoggard_shennan_2019"/>
     <w:p>
       <w:pPr>
         <w:pStyle w:val="Bibliography"/>
@@ -6889,7 +7085,7 @@
       <w:r>
         <w:t xml:space="preserve"> </w:t>
       </w:r>
-      <w:hyperlink r:id="rId205">
+      <w:hyperlink r:id="rId207">
         <w:r>
           <w:rPr>
             <w:rStyle w:val="Hyperlink"/>
@@ -6901,8 +7097,8 @@
         <w:t xml:space="preserve">.</w:t>
       </w:r>
     </w:p>
-    <w:bookmarkEnd w:id="206"/>
-    <w:bookmarkStart w:id="207" w:name="ref-robinson_1951"/>
+    <w:bookmarkEnd w:id="208"/>
+    <w:bookmarkStart w:id="209" w:name="ref-robinson_1951"/>
     <w:p>
       <w:pPr>
         <w:pStyle w:val="Bibliography"/>
@@ -6927,8 +7123,8 @@
         <w:t xml:space="preserve">16(4):293–301.</w:t>
       </w:r>
     </w:p>
-    <w:bookmarkEnd w:id="207"/>
-    <w:bookmarkStart w:id="208" w:name="ref-ross-stallings_2017"/>
+    <w:bookmarkEnd w:id="209"/>
+    <w:bookmarkStart w:id="210" w:name="ref-ross-stallings_2017"/>
     <w:p>
       <w:pPr>
         <w:pStyle w:val="Bibliography"/>
@@ -6962,8 +7158,8 @@
         <w:t xml:space="preserve">, edited by Haagen D. Klaus, Amanda R. Harvey, and Mark N. Cohen, pp. 329–362. University Press of Florida, Gainesville.</w:t>
       </w:r>
     </w:p>
-    <w:bookmarkEnd w:id="208"/>
-    <w:bookmarkStart w:id="210" w:name="ref-saxer_doebeli_travisano_2009"/>
+    <w:bookmarkEnd w:id="210"/>
+    <w:bookmarkStart w:id="212" w:name="ref-saxer_doebeli_travisano_2009"/>
     <w:p>
       <w:pPr>
         <w:pStyle w:val="Bibliography"/>
@@ -6990,7 +7186,7 @@
       <w:r>
         <w:t xml:space="preserve"> </w:t>
       </w:r>
-      <w:hyperlink r:id="rId209">
+      <w:hyperlink r:id="rId211">
         <w:r>
           <w:rPr>
             <w:rStyle w:val="Hyperlink"/>
@@ -7002,8 +7198,8 @@
         <w:t xml:space="preserve">.</w:t>
       </w:r>
     </w:p>
-    <w:bookmarkEnd w:id="210"/>
-    <w:bookmarkStart w:id="212" w:name="ref-scheffer_2009"/>
+    <w:bookmarkEnd w:id="212"/>
+    <w:bookmarkStart w:id="214" w:name="ref-scheffer_2009"/>
     <w:p>
       <w:pPr>
         <w:pStyle w:val="Bibliography"/>
@@ -7030,7 +7226,7 @@
       <w:r>
         <w:t xml:space="preserve"> </w:t>
       </w:r>
-      <w:hyperlink r:id="rId211">
+      <w:hyperlink r:id="rId213">
         <w:r>
           <w:rPr>
             <w:rStyle w:val="Hyperlink"/>
@@ -7042,8 +7238,8 @@
         <w:t xml:space="preserve">.</w:t>
       </w:r>
     </w:p>
-    <w:bookmarkEnd w:id="212"/>
-    <w:bookmarkStart w:id="213" w:name="ref-schiffer_1972"/>
+    <w:bookmarkEnd w:id="214"/>
+    <w:bookmarkStart w:id="215" w:name="ref-schiffer_1972"/>
     <w:p>
       <w:pPr>
         <w:pStyle w:val="Bibliography"/>
@@ -7068,8 +7264,8 @@
         <w:t xml:space="preserve">37(2):156–165.</w:t>
       </w:r>
     </w:p>
-    <w:bookmarkEnd w:id="213"/>
-    <w:bookmarkStart w:id="215" w:name="ref-schneider_martins_deaguiar_2016"/>
+    <w:bookmarkEnd w:id="215"/>
+    <w:bookmarkStart w:id="217" w:name="ref-schneider_martins_deaguiar_2016"/>
     <w:p>
       <w:pPr>
         <w:pStyle w:val="Bibliography"/>
@@ -7096,7 +7292,7 @@
       <w:r>
         <w:t xml:space="preserve"> </w:t>
       </w:r>
-      <w:hyperlink r:id="rId214">
+      <w:hyperlink r:id="rId216">
         <w:r>
           <w:rPr>
             <w:rStyle w:val="Hyperlink"/>
@@ -7108,8 +7304,8 @@
         <w:t xml:space="preserve">.</w:t>
       </w:r>
     </w:p>
-    <w:bookmarkEnd w:id="215"/>
-    <w:bookmarkStart w:id="217" w:name="ref-shennan_crema_kerig_2015"/>
+    <w:bookmarkEnd w:id="217"/>
+    <w:bookmarkStart w:id="219" w:name="ref-shennan_crema_kerig_2015"/>
     <w:p>
       <w:pPr>
         <w:pStyle w:val="Bibliography"/>
@@ -7175,7 +7371,7 @@
       <w:r>
         <w:t xml:space="preserve"> </w:t>
       </w:r>
-      <w:hyperlink r:id="rId216">
+      <w:hyperlink r:id="rId218">
         <w:r>
           <w:rPr>
             <w:rStyle w:val="Hyperlink"/>
@@ -7187,8 +7383,8 @@
         <w:t xml:space="preserve">.</w:t>
       </w:r>
     </w:p>
-    <w:bookmarkEnd w:id="217"/>
-    <w:bookmarkStart w:id="218" w:name="ref-shennan_wilkinson_2001"/>
+    <w:bookmarkEnd w:id="219"/>
+    <w:bookmarkStart w:id="220" w:name="ref-shennan_wilkinson_2001"/>
     <w:p>
       <w:pPr>
         <w:pStyle w:val="Bibliography"/>
@@ -7228,8 +7424,57 @@
         <w:t xml:space="preserve">66(4):577–593.</w:t>
       </w:r>
     </w:p>
-    <w:bookmarkEnd w:id="218"/>
-    <w:bookmarkStart w:id="219" w:name="ref-smith_neiman_2007"/>
+    <w:bookmarkEnd w:id="220"/>
+    <w:bookmarkStart w:id="221" w:name="ref-smith_1990"/>
+    <w:p>
+      <w:pPr>
+        <w:pStyle w:val="Bibliography"/>
+      </w:pPr>
+      <w:r>
+        <w:t xml:space="preserve">Smith, Gerald P. 1990. The</w:t>
+      </w:r>
+      <w:r>
+        <w:t xml:space="preserve"> </w:t>
+      </w:r>
+      <w:r>
+        <w:t xml:space="preserve">Walls</w:t>
+      </w:r>
+      <w:r>
+        <w:t xml:space="preserve"> </w:t>
+      </w:r>
+      <w:r>
+        <w:t xml:space="preserve">Phase and Its Neighbors. In</w:t>
+      </w:r>
+      <w:r>
+        <w:t xml:space="preserve"> </w:t>
+      </w:r>
+      <w:r>
+        <w:rPr>
+          <w:i/>
+          <w:iCs/>
+        </w:rPr>
+        <w:t xml:space="preserve">Towns and Temples Along the</w:t>
+      </w:r>
+      <w:r>
+        <w:rPr>
+          <w:i/>
+          <w:iCs/>
+        </w:rPr>
+        <w:t xml:space="preserve"> </w:t>
+      </w:r>
+      <w:r>
+        <w:rPr>
+          <w:i/>
+          <w:iCs/>
+        </w:rPr>
+        <w:t xml:space="preserve">Mississippi</w:t>
+      </w:r>
+      <w:r>
+        <w:t xml:space="preserve">, edited by David H. Dye and Cheryl Anne Cox, pp. 135–169. University of Alabama Press, Tuscaloosa.</w:t>
+      </w:r>
+    </w:p>
+    <w:bookmarkEnd w:id="221"/>
+    <w:bookmarkStart w:id="222" w:name="ref-smith_neiman_2007"/>
     <w:p>
       <w:pPr>
         <w:pStyle w:val="Bibliography"/>
@@ -7254,8 +7499,190 @@
         <w:t xml:space="preserve">26(1):47–72.</w:t>
       </w:r>
     </w:p>
-    <w:bookmarkEnd w:id="219"/>
-    <w:bookmarkStart w:id="221" w:name="ref-stern_1994"/>
+    <w:bookmarkEnd w:id="222"/>
+    <w:bookmarkStart w:id="223" w:name="ref-starr_1984"/>
+    <w:p>
+      <w:pPr>
+        <w:pStyle w:val="Bibliography"/>
+      </w:pPr>
+      <w:r>
+        <w:t xml:space="preserve">Starr, Mary Evelyn. 1984. Parchman Phase in the Northwestern</w:t>
+      </w:r>
+      <w:r>
+        <w:t xml:space="preserve"> </w:t>
+      </w:r>
+      <w:r>
+        <w:t xml:space="preserve">Yazoo</w:t>
+      </w:r>
+      <w:r>
+        <w:t xml:space="preserve"> </w:t>
+      </w:r>
+      <w:r>
+        <w:t xml:space="preserve">Basin. In</w:t>
+      </w:r>
+      <w:r>
+        <w:t xml:space="preserve"> </w:t>
+      </w:r>
+      <w:r>
+        <w:rPr>
+          <w:i/>
+          <w:iCs/>
+        </w:rPr>
+        <w:t xml:space="preserve">The</w:t>
+      </w:r>
+      <w:r>
+        <w:rPr>
+          <w:i/>
+          <w:iCs/>
+        </w:rPr>
+        <w:t xml:space="preserve"> </w:t>
+      </w:r>
+      <w:r>
+        <w:rPr>
+          <w:i/>
+          <w:iCs/>
+        </w:rPr>
+        <w:t xml:space="preserve">Wilsford</w:t>
+      </w:r>
+      <w:r>
+        <w:rPr>
+          <w:i/>
+          <w:iCs/>
+        </w:rPr>
+        <w:t xml:space="preserve"> </w:t>
+      </w:r>
+      <w:r>
+        <w:rPr>
+          <w:i/>
+          <w:iCs/>
+        </w:rPr>
+        <w:t xml:space="preserve">Site (22-Co-516)</w:t>
+      </w:r>
+      <w:r>
+        <w:rPr>
+          <w:i/>
+          <w:iCs/>
+        </w:rPr>
+        <w:t xml:space="preserve"> </w:t>
+      </w:r>
+      <w:r>
+        <w:rPr>
+          <w:i/>
+          <w:iCs/>
+        </w:rPr>
+        <w:t xml:space="preserve">Coahoma</w:t>
+      </w:r>
+      <w:r>
+        <w:rPr>
+          <w:i/>
+          <w:iCs/>
+        </w:rPr>
+        <w:t xml:space="preserve"> </w:t>
+      </w:r>
+      <w:r>
+        <w:rPr>
+          <w:i/>
+          <w:iCs/>
+        </w:rPr>
+        <w:t xml:space="preserve">County,</w:t>
+      </w:r>
+      <w:r>
+        <w:rPr>
+          <w:i/>
+          <w:iCs/>
+        </w:rPr>
+        <w:t xml:space="preserve"> </w:t>
+      </w:r>
+      <w:r>
+        <w:rPr>
+          <w:i/>
+          <w:iCs/>
+        </w:rPr>
+        <w:t xml:space="preserve">Mississippi</w:t>
+      </w:r>
+      <w:r>
+        <w:rPr>
+          <w:i/>
+          <w:iCs/>
+        </w:rPr>
+        <w:t xml:space="preserve">: A Late</w:t>
+      </w:r>
+      <w:r>
+        <w:rPr>
+          <w:i/>
+          <w:iCs/>
+        </w:rPr>
+        <w:t xml:space="preserve"> </w:t>
+      </w:r>
+      <w:r>
+        <w:rPr>
+          <w:i/>
+          <w:iCs/>
+        </w:rPr>
+        <w:t xml:space="preserve">Mississippi</w:t>
+      </w:r>
+      <w:r>
+        <w:rPr>
+          <w:i/>
+          <w:iCs/>
+        </w:rPr>
+        <w:t xml:space="preserve"> </w:t>
+      </w:r>
+      <w:r>
+        <w:rPr>
+          <w:i/>
+          <w:iCs/>
+        </w:rPr>
+        <w:t xml:space="preserve">Period Settlement in the Northern</w:t>
+      </w:r>
+      <w:r>
+        <w:rPr>
+          <w:i/>
+          <w:iCs/>
+        </w:rPr>
+        <w:t xml:space="preserve"> </w:t>
+      </w:r>
+      <w:r>
+        <w:rPr>
+          <w:i/>
+          <w:iCs/>
+        </w:rPr>
+        <w:t xml:space="preserve">Yazoo</w:t>
+      </w:r>
+      <w:r>
+        <w:rPr>
+          <w:i/>
+          <w:iCs/>
+        </w:rPr>
+        <w:t xml:space="preserve"> </w:t>
+      </w:r>
+      <w:r>
+        <w:rPr>
+          <w:i/>
+          <w:iCs/>
+        </w:rPr>
+        <w:t xml:space="preserve">of</w:t>
+      </w:r>
+      <w:r>
+        <w:rPr>
+          <w:i/>
+          <w:iCs/>
+        </w:rPr>
+        <w:t xml:space="preserve"> </w:t>
+      </w:r>
+      <w:r>
+        <w:rPr>
+          <w:i/>
+          <w:iCs/>
+        </w:rPr>
+        <w:t xml:space="preserve">Mississippi</w:t>
+      </w:r>
+      <w:r>
+        <w:t xml:space="preserve">, edited by John M. Connaway, pp. 163–222. Archaeological Report No. 14. Mississippi Department of Archives; History, Jackson, MS.</w:t>
+      </w:r>
+    </w:p>
+    <w:bookmarkEnd w:id="223"/>
+    <w:bookmarkStart w:id="225" w:name="ref-stern_1994"/>
     <w:p>
       <w:pPr>
         <w:pStyle w:val="Bibliography"/>
@@ -7282,7 +7709,7 @@
       <w:r>
         <w:t xml:space="preserve"> </w:t>
       </w:r>
-      <w:hyperlink r:id="rId220">
+      <w:hyperlink r:id="rId224">
         <w:r>
           <w:rPr>
             <w:rStyle w:val="Hyperlink"/>
@@ -7294,8 +7721,8 @@
         <w:t xml:space="preserve">.</w:t>
       </w:r>
     </w:p>
-    <w:bookmarkEnd w:id="221"/>
-    <w:bookmarkStart w:id="223" w:name="ref-sullivan_2024"/>
+    <w:bookmarkEnd w:id="225"/>
+    <w:bookmarkStart w:id="227" w:name="ref-sullivan_2024"/>
     <w:p>
       <w:pPr>
         <w:pStyle w:val="Bibliography"/>
@@ -7346,7 +7773,7 @@
       <w:r>
         <w:t xml:space="preserve"> </w:t>
       </w:r>
-      <w:hyperlink r:id="rId222">
+      <w:hyperlink r:id="rId226">
         <w:r>
           <w:rPr>
             <w:rStyle w:val="Hyperlink"/>
@@ -7358,8 +7785,8 @@
         <w:t xml:space="preserve">.</w:t>
       </w:r>
     </w:p>
-    <w:bookmarkEnd w:id="223"/>
-    <w:bookmarkStart w:id="224" w:name="ref-tomasovych_kidwell_2009"/>
+    <w:bookmarkEnd w:id="227"/>
+    <w:bookmarkStart w:id="228" w:name="ref-tomasovych_kidwell_2009"/>
     <w:p>
       <w:pPr>
         <w:pStyle w:val="Bibliography"/>
@@ -7384,8 +7811,8 @@
         <w:t xml:space="preserve">35(1):94–118.</w:t>
       </w:r>
     </w:p>
-    <w:bookmarkEnd w:id="224"/>
-    <w:bookmarkStart w:id="226" w:name="ref-tomasovych_kidwell_2010"/>
+    <w:bookmarkEnd w:id="228"/>
+    <w:bookmarkStart w:id="230" w:name="ref-tomasovych_kidwell_2010"/>
     <w:p>
       <w:pPr>
         <w:pStyle w:val="Bibliography"/>
@@ -7412,7 +7839,7 @@
       <w:r>
         <w:t xml:space="preserve"> </w:t>
       </w:r>
-      <w:hyperlink r:id="rId225">
+      <w:hyperlink r:id="rId229">
         <w:r>
           <w:rPr>
             <w:rStyle w:val="Hyperlink"/>
@@ -7424,8 +7851,8 @@
         <w:t xml:space="preserve">.</w:t>
       </w:r>
     </w:p>
-    <w:bookmarkEnd w:id="226"/>
-    <w:bookmarkStart w:id="227" w:name="ref-willey_phillips_1958"/>
+    <w:bookmarkEnd w:id="230"/>
+    <w:bookmarkStart w:id="231" w:name="ref-willey_phillips_1958"/>
     <w:p>
       <w:pPr>
         <w:pStyle w:val="Bibliography"/>
@@ -7447,8 +7874,8 @@
         <w:t xml:space="preserve">. University of Chicago Press, Chicago.</w:t>
       </w:r>
     </w:p>
-    <w:bookmarkEnd w:id="227"/>
-    <w:bookmarkStart w:id="228" w:name="ref-williams_1954"/>
+    <w:bookmarkEnd w:id="231"/>
+    <w:bookmarkStart w:id="232" w:name="ref-williams_1954"/>
     <w:p>
       <w:pPr>
         <w:pStyle w:val="Bibliography"/>
@@ -7457,8 +7884,8 @@
         <w:t xml:space="preserve">Williams, Stephen. 1954. An Archeological Study of the Mississippian Culture in Southeast Missouri. PhD thesis, Yale University, New Haven.</w:t>
       </w:r>
     </w:p>
-    <w:bookmarkEnd w:id="228"/>
-    <w:bookmarkStart w:id="229" w:name="ref-williams_1990"/>
+    <w:bookmarkEnd w:id="232"/>
+    <w:bookmarkStart w:id="233" w:name="ref-williams_1990"/>
     <w:p>
       <w:pPr>
         <w:pStyle w:val="Bibliography"/>
@@ -7494,8 +7921,8 @@
         <w:t xml:space="preserve">, edited by David H. Dye and Cheryl Anne Cox, pp. 170–180. University of Alabama Press, Tuscaloosa.</w:t>
       </w:r>
     </w:p>
-    <w:bookmarkEnd w:id="229"/>
-    <w:bookmarkStart w:id="231" w:name="ref-wright_1943"/>
+    <w:bookmarkEnd w:id="233"/>
+    <w:bookmarkStart w:id="235" w:name="ref-wright_1943"/>
     <w:p>
       <w:pPr>
         <w:pStyle w:val="Bibliography"/>
@@ -7522,7 +7949,7 @@
       <w:r>
         <w:t xml:space="preserve"> </w:t>
       </w:r>
-      <w:hyperlink r:id="rId230">
+      <w:hyperlink r:id="rId234">
         <w:r>
           <w:rPr>
             <w:rStyle w:val="Hyperlink"/>
@@ -7534,8 +7961,8 @@
         <w:t xml:space="preserve">.</w:t>
       </w:r>
     </w:p>
-    <w:bookmarkEnd w:id="231"/>
-    <w:bookmarkStart w:id="233" w:name="ref-wright_1951"/>
+    <w:bookmarkEnd w:id="235"/>
+    <w:bookmarkStart w:id="237" w:name="ref-wright_1951"/>
     <w:p>
       <w:pPr>
         <w:pStyle w:val="Bibliography"/>
@@ -7562,7 +7989,7 @@
       <w:r>
         <w:t xml:space="preserve"> </w:t>
       </w:r>
-      <w:hyperlink r:id="rId232">
+      <w:hyperlink r:id="rId236">
         <w:r>
           <w:rPr>
             <w:rStyle w:val="Hyperlink"/>
@@ -7574,8 +8001,8 @@
         <w:t xml:space="preserve">.</w:t>
       </w:r>
     </w:p>
-    <w:bookmarkEnd w:id="233"/>
-    <w:bookmarkStart w:id="235" w:name="ref-youngblood_miton_morin_2023"/>
+    <w:bookmarkEnd w:id="237"/>
+    <w:bookmarkStart w:id="239" w:name="ref-youngblood_miton_morin_2023"/>
     <w:p>
       <w:pPr>
         <w:pStyle w:val="Bibliography"/>
@@ -7602,7 +8029,7 @@
       <w:r>
         <w:t xml:space="preserve"> </w:t>
       </w:r>
-      <w:hyperlink r:id="rId234">
+      <w:hyperlink r:id="rId238">
         <w:r>
           <w:rPr>
             <w:rStyle w:val="Hyperlink"/>
@@ -7614,10 +8041,10 @@
         <w:t xml:space="preserve">.</w:t>
       </w:r>
     </w:p>
-    <w:bookmarkEnd w:id="235"/>
-    <w:bookmarkEnd w:id="236"/>
-    <w:bookmarkEnd w:id="237"/>
-    <w:bookmarkEnd w:id="238"/>
+    <w:bookmarkEnd w:id="239"/>
+    <w:bookmarkEnd w:id="240"/>
+    <w:bookmarkEnd w:id="241"/>
+    <w:bookmarkEnd w:id="242"/>
     <w:sectPr>
       <w:footnotePr>
         <w:numRestart w:val="eachSect"/>

</xml_diff>

<commit_message>
Explain the simulations in the main text; make MDS figures reproducible
Sync the main text forward (four-simulation overview, plain-language forward-
drift Methods description, Figure 8/9 caption clauses) and rebuild docx/pdf.

Add a deterministic sign convention to mds2 (scripts 25 and 26) so the classical-
MDS panels in Figures 2, 11, and S5 are reproducible across linear-algebra
libraries; regenerate those figures (and figX). Plotted statistics unchanged;
only the panel orientation changed.
</commit_message>
<xml_diff>
--- a/docs/manuscript/MAIN_TEXT.docx
+++ b/docs/manuscript/MAIN_TEXT.docx
@@ -109,7 +109,7 @@
         <w:pStyle w:val="FirstParagraph"/>
       </w:pPr>
       <w:r>
-        <w:t xml:space="preserve">The late pre-contact record of the Lower Mississippi River Valley is traditionally divided into a series of spatially and temporally bounded units known as phases (Figure 1). These units include the Kent</w:t>
+        <w:t xml:space="preserve">The late pre-contact record of the Lower Mississippi River Valley is traditionally divided into a series of spatially and temporally bounded units known as phases (Figure 1). These units include examples such as the Kent</w:t>
       </w:r>
       <w:r>
         <w:t xml:space="preserve"> </w:t>
@@ -210,7 +210,7 @@
         <w:pStyle w:val="BodyText"/>
       </w:pPr>
       <w:r>
-        <w:t xml:space="preserve">Whether such an entity existed at Parkin is an empirical question. Settlement morphology alone cannot answer this question, since the presence of a primary center of interaction, a palisade, and a monumental mound is equally compatible with a landscape of competing peer communities as it is with a centralized and consolidated hierarchy</w:t>
+        <w:t xml:space="preserve">Whether such an entity existed at Parkin is an empirical question. Settlement morphology alone cannot answer this question, since the presence of a primary center of interaction, a palisade, and a monumental mound is equally compatible with a landscape of competing peer communities as with a centralized and consolidated hierarchy</w:t>
       </w:r>
       <w:r>
         <w:t xml:space="preserve"> </w:t>
@@ -219,7 +219,7 @@
         <w:t xml:space="preserve">(King and Freer 1995; Rees 2001)</w:t>
       </w:r>
       <w:r>
-        <w:t xml:space="preserve">. The chronicles describe Casqui and its neighbor Pacaha in open conflict, a relationship interpreted both as rivalry between competing peers and as a ranked order in which Casqui stood below Pacaha, so the chronicles do not by themselves establish a single consolidated hierarchy over the Parkin phase</w:t>
+        <w:t xml:space="preserve">. the 16th-century historical chronicles describe Casqui and its neighbor Pacaha in open conflict, a relationship interpreted both as rivalry between competing peers and as a ranked order in which Casqui stood below Pacaha. Thus, if Parkin is indeed Casqui, the chronicles do not, by themselves, establish a single consolidated hierarchy over the Parkin phase</w:t>
       </w:r>
       <w:r>
         <w:t xml:space="preserve"> </w:t>
@@ -228,7 +228,7 @@
         <w:t xml:space="preserve">(Hudson et al. 1990; Phyllis A. Morse 1990)</w:t>
       </w:r>
       <w:r>
-        <w:t xml:space="preserve">. We therefore ask what the material record shows when it is measured rather than interpreted through the polity model. The comparable evidence shows no hierarchy. Within the basin, settlement size is graded rather than redistributive. The regional production of the capacity-linked chert hoes whose control would mark an economic apex was decentralized, and their exchange followed a down-the-line gradient rather than central redistribution</w:t>
+        <w:t xml:space="preserve">. We ask, therefore, what the archaeological record shows when it is measured rather than interpreted through an assumed polity model. The record shows no evdence of hierarchy. Within the basin, settlement size is graded rather than redistributive. The regional production of the capacity-linked chert hoes, for example, whose control would mark an economic apex was decentralized, and their exchange followed a down-the-line gradient rather than central redistribution</w:t>
       </w:r>
       <w:r>
         <w:t xml:space="preserve"> </w:t>
@@ -237,7 +237,7 @@
         <w:t xml:space="preserve">(Cobb 2000)</w:t>
       </w:r>
       <w:r>
-        <w:t xml:space="preserve">. As we show below, the decorated-ceramic record carries no clear signature of interaction closing in on bounded groups.</w:t>
+        <w:t xml:space="preserve">. As we show below, the decorated-ceramic record also carries no clear signature of interaction closing in on bounded groups.</w:t>
       </w:r>
     </w:p>
     <w:p>
@@ -1950,6 +1950,14 @@
         <w:pStyle w:val="FirstParagraph"/>
       </w:pPr>
       <w:r>
+        <w:t xml:space="preserve">The argument uses four simulations, each answering a different question. An idealized validation tests whether the four signatures separate a bounded interaction group from its three mimics in principle, on large, clean synthetic assemblages (Figure S4). A record-matched recovery tests which of the signatures can detect a known, injected closure at the real record’s sample sizes and time-averaging (Figure 4). A positive control tests which generative process, neutral spatial drift or bounded groups, reproduces the structure observed in the basin (Figure S5). A forward demonstration runs neutral drift on the real site geography with no boundary imposed and counts how many phase-like groups it produces, and whether the named phases exceed that number (Figures 8 and 9). The first two establish what the test can resolve on a record of this size; the second two identify which process the data match. We describe the validation and recovery here and the two drift simulations in the next subsection.</w:t>
+      </w:r>
+    </w:p>
+    <w:p>
+      <w:pPr>
+        <w:pStyle w:val="BodyText"/>
+      </w:pPr>
+      <w:r>
         <w:t xml:space="preserve">We validated the test in two stages. The first establishes the principle. A generative model copies decorated variants under neutral transmission, the random-copying process in which learners reproduce variants in proportion to their current frequency</w:t>
       </w:r>
       <w:r>
@@ -2031,6 +2039,14 @@
       </w:r>
       <w:r>
         <w:t xml:space="preserve">, digitized from the survey tables. We georeferenced both the Phillips-Ford-Griffin and the Williams assemblages using their Lower Mississippi Survey grid designations against the digitized survey point files, so that the two regions share a single coordinate frame. Decorated classes were harmonized between the two typologies, both rooted in the Phillips-Ford-Griffin framework, into a common vocabulary, and the between-region comparison was run both on all decorated classes and on the classes shared by the two typologies (Supplemental Text).</w:t>
+      </w:r>
+    </w:p>
+    <w:p>
+      <w:pPr>
+        <w:pStyle w:val="BodyText"/>
+      </w:pPr>
+      <w:r>
+        <w:t xml:space="preserve">The same neutral-drift model is also run forward to produce the phase-like groups of Figures 8 and 9. We run it forward in time on the real site geography with no boundary imposed, so any structure in the output comes from geography and time alone. Each site holds a finite population of learners. In each generation a learner copies the decorated class of another learner, drawn from its own site with high probability and, at a low rate, from another site with a probability that decays with along-river distance. At a low rate the learner instead adopts a newly invented class, so the repertoire turns over through time and the assemblages can be seriated. Because the assemblages are not contemporaneous, we sample the simulated field time-transgressively: each synthetic assemblage is drawn at the time-slice that matches its position on the seriation axis, accumulated over a trailing window to reproduce the record’s time-averaging, then subsampled to the observed sherd count. We detect groups in the result by modularity on the Brainerd-Robinson similarity graph, the same procedure applied to the real assemblages. Because the group labels differ between runs, we summarize Parkin’s group as a probability: across 500 runs, the fraction in which each assemblage falls in the same drift-detected group as Parkin. We report the number of groups, the between-group cultural F_ST, and that co-membership against the named phases, with the full parameter grid in the Supplemental Text.</w:t>
       </w:r>
     </w:p>
     <w:bookmarkEnd w:id="28"/>
@@ -2660,7 +2676,7 @@
           <wp:inline>
             <wp:extent cx="5334000" cy="2824401"/>
             <wp:effectExtent b="0" l="0" r="0" t="0"/>
-            <wp:docPr descr="Figure 8. Phase-like groups produced by neutral drift across the wider lower Mississippi Valley, with no bounded group imposed, summarized over 500 realizations. The finite-population network-drift model runs forward on the river-network geography of all 55 Mainfort-PFG decorated assemblages, and groups are detected as greedy-modularity communities on the Brainerd-Robinson similarity graph (Supplemental Text). (A) Distribution of the number of groups across the 500 runs, under contemporaneous (pure-space) and time-transgressive sampling, with the seven named culture-historical phases and the observed cluster count marked. Pure spatial drift yields two to five groups, and the count grows with geographic extent; time-transgressive sampling collapses it toward two. Either way, drift produces far fewer groups than the seven named phases, so the phases subdivide the valley more finely than the transmission structure supports. (B) Between-group cultural F_ST across runs against the observed level (0.04); the observed differentiation sits at the upper edge of the contemporaneous-drift distribution, so drift reproduces it. Parameters are the positive-control corner (interaction length 24 river-km, mixing 0.02, innovation 0.012); the basin positive control and the parameter-grid robustness are in Figures S7 and S8." title="" id="45" name="Picture"/>
+            <wp:docPr descr="Figure 8. Phase-like groups produced by neutral drift across the wider lower Mississippi Valley, with no bounded group imposed, summarized over 500 realizations. The finite-population network-drift model runs forward on the river-network geography of all 55 Mainfort-PFG decorated assemblages, and groups are detected as greedy-modularity communities on the Brainerd-Robinson similarity graph (Supplemental Text). In the model each site copies decorated classes mostly from itself and, at a low rate, from other sites with a probability that decays with river distance, while innovation turns the repertoire over through time; synthetic assemblages are sampled time-transgressively at each site’s seriation position and subsampled to the observed counts. (A) Distribution of the number of groups across the 500 runs, under contemporaneous (pure-space) and time-transgressive sampling, with the seven named culture-historical phases and the observed cluster count marked. Pure spatial drift yields two to five groups, and the count grows with geographic extent; time-transgressive sampling collapses it toward two. Either way, drift produces far fewer groups than the seven named phases, so the phases subdivide the valley more finely than the transmission structure supports. (B) Between-group cultural F_ST across runs against the observed level (0.04); the observed differentiation sits at the upper edge of the contemporaneous-drift distribution, so drift reproduces it. Parameters are the positive-control corner (interaction length 24 river-km, mixing 0.02, innovation 0.012); the basin positive control and the parameter-grid robustness are in Figures S7 and S8." title="" id="45" name="Picture"/>
             <a:graphic>
               <a:graphicData uri="http://schemas.openxmlformats.org/drawingml/2006/picture">
                 <pic:pic>
@@ -2713,7 +2729,7 @@
         <w:t xml:space="preserve"> </w:t>
       </w:r>
       <w:r>
-        <w:t xml:space="preserve">Phase-like groups produced by neutral drift across the wider lower Mississippi Valley, with no bounded group imposed, summarized over 500 realizations. The finite-population network-drift model runs forward on the river-network geography of all 55 Mainfort-PFG decorated assemblages, and groups are detected as greedy-modularity communities on the Brainerd-Robinson similarity graph (Supplemental Text). (A) Distribution of the number of groups across the 500 runs, under contemporaneous (pure-space) and time-transgressive sampling, with the seven named culture-historical phases and the observed cluster count marked. Pure spatial drift yields two to five groups, and the count grows with geographic extent; time-transgressive sampling collapses it toward two. Either way, drift produces far fewer groups than the seven named phases, so the phases subdivide the valley more finely than the transmission structure supports. (B) Between-group cultural F_ST across runs against the observed level (0.04); the observed differentiation sits at the upper edge of the contemporaneous-drift distribution, so drift reproduces it. Parameters are the positive-control corner (interaction length 24 river-km, mixing 0.02, innovation 0.012); the basin positive control and the parameter-grid robustness are in Figures S7 and S8.</w:t>
+        <w:t xml:space="preserve">Phase-like groups produced by neutral drift across the wider lower Mississippi Valley, with no bounded group imposed, summarized over 500 realizations. The finite-population network-drift model runs forward on the river-network geography of all 55 Mainfort-PFG decorated assemblages, and groups are detected as greedy-modularity communities on the Brainerd-Robinson similarity graph (Supplemental Text). In the model each site copies decorated classes mostly from itself and, at a low rate, from other sites with a probability that decays with river distance, while innovation turns the repertoire over through time; synthetic assemblages are sampled time-transgressively at each site’s seriation position and subsampled to the observed counts. (A) Distribution of the number of groups across the 500 runs, under contemporaneous (pure-space) and time-transgressive sampling, with the seven named culture-historical phases and the observed cluster count marked. Pure spatial drift yields two to five groups, and the count grows with geographic extent; time-transgressive sampling collapses it toward two. Either way, drift produces far fewer groups than the seven named phases, so the phases subdivide the valley more finely than the transmission structure supports. (B) Between-group cultural F_ST across runs against the observed level (0.04); the observed differentiation sits at the upper edge of the contemporaneous-drift distribution, so drift reproduces it. Parameters are the positive-control corner (interaction length 24 river-km, mixing 0.02, innovation 0.012); the basin positive control and the parameter-grid robustness are in Figures S7 and S8.</w:t>
       </w:r>
     </w:p>
     <w:p>
@@ -2725,7 +2741,7 @@
           <wp:inline>
             <wp:extent cx="5334000" cy="5163057"/>
             <wp:effectExtent b="0" l="0" r="0" t="0"/>
-            <wp:docPr descr="Figure 9. Does the Parkin phase separate from the other named phases by more than drift? All 55 Mainfort-PFG decorated assemblages, labeled by culture-historical phase after Mainfort (1996b), under time-transgressive river-network drift with no boundary imposed (500 realizations). (A) Each assemblage is shaded by the probability that it shares Parkin’s drift-detected group (star), with Parkin-phase assemblages drawn as circles and other phases as squares; the probability is a graded field that falls with river distance from Parkin. (B) That co-membership for the Parkin phase against the other phases (AUC 0.88) reflects the separation drift predicted by geography. (C) Observed Parkin-versus-others between-group cultural F_ST (dashed) against the drift null; 0.4 percent of runs reach or exceed it, and the null’s tail extends past it. (D) Leave-one-out jackknife: the observed F_ST with each Parkin assemblage relabeled into the comparison group, against the 2.5 to 97.5 percentile band of its matched per-drop null. Open points fall inside the band (drift-consistent), filled points outside; seven of the eight single drops stay outside, so the small contrast does not rest on one assemblage." title="" id="48" name="Picture"/>
+            <wp:docPr descr="Figure 9. Does the Parkin phase separate from the other named phases by more than drift? All 55 Mainfort-PFG decorated assemblages, labeled by culture-historical phase after Mainfort (1996b), under time-transgressive river-network drift with no boundary imposed (500 realizations). Because group labels differ between runs, Parkin’s group is summarized as the fraction of runs in which each assemblage falls in the same drift-detected group as Parkin. (A) Each assemblage is shaded by the probability that it shares Parkin’s drift-detected group (star), with Parkin-phase assemblages drawn as circles and other phases as squares; the probability is a graded field that falls with river distance from Parkin. (B) That co-membership for the Parkin phase against the other phases (AUC 0.88) reflects the separation drift predicted by geography. (C) Observed Parkin-versus-others between-group cultural F_ST (dashed) against the drift null; 0.4 percent of runs reach or exceed it, and the null’s tail extends past it. (D) Leave-one-out jackknife: the observed F_ST with each Parkin assemblage relabeled into the comparison group, against the 2.5 to 97.5 percentile band of its matched per-drop null. Open points fall inside the band (drift-consistent), filled points outside; seven of the eight single drops stay outside, so the small contrast does not rest on one assemblage." title="" id="48" name="Picture"/>
             <a:graphic>
               <a:graphicData uri="http://schemas.openxmlformats.org/drawingml/2006/picture">
                 <pic:pic>
@@ -2787,7 +2803,7 @@
         <w:t xml:space="preserve">(1996b)</w:t>
       </w:r>
       <w:r>
-        <w:t xml:space="preserve">, under time-transgressive river-network drift with no boundary imposed (500 realizations). (A) Each assemblage is shaded by the probability that it shares Parkin’s drift-detected group (star), with Parkin-phase assemblages drawn as circles and other phases as squares; the probability is a graded field that falls with river distance from Parkin. (B) That co-membership for the Parkin phase against the other phases (AUC 0.88) reflects the separation drift predicted by geography. (C) Observed Parkin-versus-others between-group cultural F_ST (dashed) against the drift null; 0.4 percent of runs reach or exceed it, and the null’s tail extends past it. (D) Leave-one-out jackknife: the observed F_ST with each Parkin assemblage relabeled into the comparison group, against the 2.5 to 97.5 percentile band of its matched per-drop null. Open points fall inside the band (drift-consistent), filled points outside; seven of the eight single drops stay outside, so the small contrast does not rest on one assemblage.</w:t>
+        <w:t xml:space="preserve">, under time-transgressive river-network drift with no boundary imposed (500 realizations). Because group labels differ between runs, Parkin’s group is summarized as the fraction of runs in which each assemblage falls in the same drift-detected group as Parkin. (A) Each assemblage is shaded by the probability that it shares Parkin’s drift-detected group (star), with Parkin-phase assemblages drawn as circles and other phases as squares; the probability is a graded field that falls with river distance from Parkin. (B) That co-membership for the Parkin phase against the other phases (AUC 0.88) reflects the separation drift predicted by geography. (C) Observed Parkin-versus-others between-group cultural F_ST (dashed) against the drift null; 0.4 percent of runs reach or exceed it, and the null’s tail extends past it. (D) Leave-one-out jackknife: the observed F_ST with each Parkin assemblage relabeled into the comparison group, against the 2.5 to 97.5 percentile band of its matched per-drop null. Open points fall inside the band (drift-consistent), filled points outside; seven of the eight single drops stay outside, so the small contrast does not rest on one assemblage.</w:t>
       </w:r>
     </w:p>
     <w:p>

</xml_diff>

<commit_message>
Sync main text: split run-on sentences; introduction edits
Match the working repo: split long sentences with run-on ', but ...' and
', and ... so ...' trailing clauses from Background through Conclusion, plus
the author's introduction edits. Rebuild docx/pdf.
</commit_message>
<xml_diff>
--- a/docs/manuscript/MAIN_TEXT.docx
+++ b/docs/manuscript/MAIN_TEXT.docx
@@ -202,7 +202,7 @@
         <w:t xml:space="preserve">(Phyllis A. Morse 1990)</w:t>
       </w:r>
       <w:r>
-        <w:t xml:space="preserve">. That interpretation is a specific claim about social structure: that the Parkin phase was a bounded, hierarchically organized society with Parkin at its apex.</w:t>
+        <w:t xml:space="preserve">. That interpretation is a specific claim about social structure in which the Parkin phase is treated as a bounded, hierarchically organized society with Parkin at its apex.</w:t>
       </w:r>
     </w:p>
     <w:p>
@@ -219,7 +219,7 @@
         <w:t xml:space="preserve">(King and Freer 1995; Rees 2001)</w:t>
       </w:r>
       <w:r>
-        <w:t xml:space="preserve">. the 16th-century historical chronicles describe Casqui and its neighbor Pacaha in open conflict, a relationship interpreted both as rivalry between competing peers and as a ranked order in which Casqui stood below Pacaha. Thus, if Parkin is indeed Casqui, the chronicles do not, by themselves, establish a single consolidated hierarchy over the Parkin phase</w:t>
+        <w:t xml:space="preserve">. The 16th-century historical chronicles describe Casqui and its neighbor Pacaha in open conflict, a relationship interpreted both as rivalry between competing peers and as a ranked order in which Casqui stood below Pacaha. Thus, if Parkin is indeed Casqui, the chronicles do not, by themselves, establish a single consolidated hierarchy over the Parkin phase</w:t>
       </w:r>
       <w:r>
         <w:t xml:space="preserve"> </w:t>
@@ -228,7 +228,7 @@
         <w:t xml:space="preserve">(Hudson et al. 1990; Phyllis A. Morse 1990)</w:t>
       </w:r>
       <w:r>
-        <w:t xml:space="preserve">. We ask, therefore, what the archaeological record shows when it is measured rather than interpreted through an assumed polity model. The record shows no evdence of hierarchy. Within the basin, settlement size is graded rather than redistributive. The regional production of the capacity-linked chert hoes, for example, whose control would mark an economic apex was decentralized, and their exchange followed a down-the-line gradient rather than central redistribution</w:t>
+        <w:t xml:space="preserve">. We ask, therefore, what the archaeological record shows when it is measured rather than interpreted through an assumed polity model. The record shows no evidence of hierarchy. Within the basin, settlement size is graded rather than redistributive. The regional production of the capacity-linked chert hoes whose control would mark an economic apex was decentralized, and their exchange followed a down-the-line gradient rather than central redistribution</w:t>
       </w:r>
       <w:r>
         <w:t xml:space="preserve"> </w:t>
@@ -263,7 +263,7 @@
         <w:t xml:space="preserve">(Phillips et al. 1951)</w:t>
       </w:r>
       <w:r>
-        <w:t xml:space="preserve">. A social interpretation was attached to it all the same. In the Phillips-Ford-Griffin framework, the phase is the basic space-time-cultural unit, defined by distinctive traits within a locality or region over a brief span, with no social criterion in the definition itself</w:t>
+        <w:t xml:space="preserve">. A social interpretation, however, goes beyond the definition. In the Phillips-Ford-Griffin framework, the phase is the basic space-time-cultural unit, defined by distinctive traits within a locality or region over a brief span, with no social criterion in the definition itself</w:t>
       </w:r>
       <w:r>
         <w:t xml:space="preserve"> </w:t>
@@ -293,7 +293,15 @@
         <w:t xml:space="preserve">(1954)</w:t>
       </w:r>
       <w:r>
-        <w:t xml:space="preserve">, defining the southeast-Missouri phases on which the regional scheme rests, adopted the social equation, writing that a phase probably equals a society. That equation, disavowed at the source and reinstated in regional practice, is the silent premise. It holds that assemblages more similar to one another than to their neighbors record a bounded, mutually interacting social group. Endow such a group with a primate center, and it becomes a polity. The polity interpretation is, therefore, built into the unit before any independent evidence of hierarchy is weighed, and the construct has been questioned on exactly this ground. The interrogation of phases is not new. Fox</w:t>
+        <w:t xml:space="preserve">, defining the southeast-Missouri phases on which the regional scheme rests, adopted the social equation, writing that a phase probably equals a society. That equation, though disavowed at the source, is typically repeated in regional practice. This assumption about the unit phase is its silent premise. It holds that assemblages more similar to one another than to their neighbors record a bounded, mutually interacting social group. In the case where one can identify a group with a primate center, the phase then becomes a polity. The polity interpretation is, therefore, built into the unit before any independent evidence of hierarchy is weighed.</w:t>
+      </w:r>
+    </w:p>
+    <w:p>
+      <w:pPr>
+        <w:pStyle w:val="BodyText"/>
+      </w:pPr>
+      <w:r>
+        <w:t xml:space="preserve">The phase construct has been questioned on exactly this ground. Fox</w:t>
       </w:r>
       <w:r>
         <w:t xml:space="preserve"> </w:t>
@@ -317,7 +325,37 @@
         <w:t xml:space="preserve"> </w:t>
       </w:r>
       <w:r>
-        <w:t xml:space="preserve">reached the same verdict by a different ordination, finding that the ordination of the late-period assemblages provides little support for the validity of the named phases, which overlap rather than forming discrete clusters.</w:t>
+        <w:t xml:space="preserve">reached the same verdict by a different ordination, finding that the ordination of the late-period assemblages provides little support for the validity of the named phases, which overlap rather than forming discrete clusters. Lipo</w:t>
+      </w:r>
+      <w:r>
+        <w:t xml:space="preserve"> </w:t>
+      </w:r>
+      <w:r>
+        <w:t xml:space="preserve">(2001)</w:t>
+      </w:r>
+      <w:r>
+        <w:t xml:space="preserve"> </w:t>
+      </w:r>
+      <w:r>
+        <w:t xml:space="preserve">questions the nature of phases through frequency seriation, showing that the assemblages are structured rather than panmictic, and arguing that the resulting spatial groups have no warrant as societies. He</w:t>
+      </w:r>
+      <w:r>
+        <w:t xml:space="preserve"> </w:t>
+      </w:r>
+      <w:r>
+        <w:t xml:space="preserve">(2001:60)</w:t>
+      </w:r>
+      <w:r>
+        <w:t xml:space="preserve"> </w:t>
+      </w:r>
+      <w:r>
+        <w:t xml:space="preserve">suggests</w:t>
+      </w:r>
+      <w:r>
+        <w:t xml:space="preserve"> </w:t>
+      </w:r>
+      <w:r>
+        <w:t xml:space="preserve">“the phases themselves might be simply arbitrary spatial and temporal slices of a single interacting population that is much larger in size.”</w:t>
       </w:r>
     </w:p>
     <w:p>
@@ -325,13 +363,13 @@
         <w:pStyle w:val="BodyText"/>
       </w:pPr>
       <w:r>
-        <w:t xml:space="preserve">The premise, however, is tested only rarely and ignores a strong alternative. Viewed through the lens of social learning and models of cultural transmission, interaction is always continuous yet highly variable. Interaction is structured by distance and geography, as well as by social relationships. The task is to show how apparent differences between groups, such as phases, can arise under continuous interaction rather than requiring bounded groups. Under the neutral model of cultural transmission, decorated style behaves as a selectively neutral trait whose frequency drifts in a finite population of interacting learners</w:t>
-      </w:r>
-      <w:r>
-        <w:t xml:space="preserve"> </w:t>
-      </w:r>
-      <w:r>
-        <w:t xml:space="preserve">(Bentley et al. 2004; Eerkens and Lipo 2007; Fogarty et al. 2024; Neiman 1995)</w:t>
+        <w:t xml:space="preserve">The silent premise, however, is tested only rarely and overlooks a strong alternative that offers a potentially falsifiable explanation for the observed patterns in the archaeological record. Viewed through the lens of social learning and models of cultural transmission, interaction is always continuous yet highly variable. Interaction is structured by distance and geography, as well as by social relationships. The task is to show how apparent differences between groups, such as phases, can arise under continuous interaction rather than requiring bounded groups. Under the neutral model of cultural transmission, decorative style behaves as a selectively neutral trait whose frequency drifts in a finite population of interacting learners</w:t>
+      </w:r>
+      <w:r>
+        <w:t xml:space="preserve"> </w:t>
+      </w:r>
+      <w:r>
+        <w:t xml:space="preserve">(Bentley et al. 2004; Dunnell 1978; Eerkens and Lipo 2007; Fogarty et al. 2024; Neiman 1995)</w:t>
       </w:r>
       <w:r>
         <w:t xml:space="preserve">. When those learners interact more with near neighbors than with distant ones, drift on the spatially structured population generates similarity that is highest at short distances and fades with distance. Viewed at larger scales and divided into discrete units, that gradient looks like difference and clustering, with no bounded groups anywhere</w:t>
@@ -340,10 +378,10 @@
         <w:t xml:space="preserve"> </w:t>
       </w:r>
       <w:r>
-        <w:t xml:space="preserve">(Lipo et al. 2021)</w:t>
-      </w:r>
-      <w:r>
-        <w:t xml:space="preserve">. On this account, a phase can be the ordinary residue of continuous, distance-structured interaction, and the very pattern the culture-history tradition interprets as a society, assemblages near each other in space and in style, is what spatially structured drift predicts. Telling a real interaction group apart from spatially structured drift requires a test that the tradition never applied, because the seriation coherence and spatial proximity that define the phase are equally the products of drift</w:t>
+        <w:t xml:space="preserve">(Lipo et al. 1997, 2021)</w:t>
+      </w:r>
+      <w:r>
+        <w:t xml:space="preserve">. Based on this account, a phase can be the ordinary residue of continuous, distance-structured interaction. The very pattern the culture-history tradition interprets as a society, assemblages near each other in space and in style, is what spatially structured drift predicts. Telling a real interaction group apart from spatially structured drift requires a test that the tradition never applied, because the seriation coherence and spatial proximity that define the phase are equally the products of drift</w:t>
       </w:r>
       <w:r>
         <w:t xml:space="preserve"> </w:t>
@@ -360,7 +398,7 @@
         <w:pStyle w:val="BodyText"/>
       </w:pPr>
       <w:r>
-        <w:t xml:space="preserve">Decorated ceramics are the instrument for the test. Because stylistic variants are copied between potters along social-learning networks, the spatial and temporal structure of decorated-class frequencies records the structure of past interaction, and a genuine social boundary, had one existed, would make learning appear conformist within groups and divergent between them, fragmenting the single drifting pool that continuous interaction maintains</w:t>
+        <w:t xml:space="preserve">Decorated ceramics provide an instrument for the test. Because stylistic variants are copied among potters through social-learning networks, the spatial and temporal structure of decorated-class frequencies reflects the structure of past interaction. A genuine social boundary, had one existed, would make learning appear conformist within groups and divergent between them, fragmenting the single drifting pool that continuous interaction maintains</w:t>
       </w:r>
       <w:r>
         <w:t xml:space="preserve"> </w:t>
@@ -378,7 +416,7 @@
         <w:t xml:space="preserve">(Cobb and Butler 2002)</w:t>
       </w:r>
       <w:r>
-        <w:t xml:space="preserve">. We focus first on the St. Francis basin, the setting of Parkin (Figure 1), and then widen the test to the other late-period phases of the valley.</w:t>
+        <w:t xml:space="preserve">. We first focus on the St. Francis basin, the setting of Parkin (Figure 1), and then extend the test to other late-period phases of the valley.</w:t>
       </w:r>
     </w:p>
     <w:p>
@@ -431,7 +469,7 @@
         <w:t xml:space="preserve">(Bailey 2007; Behrensmeyer et al. 2000; Holdaway and Wandsnider 2008; Perreault 2019; Stern 1994)</w:t>
       </w:r>
       <w:r>
-        <w:t xml:space="preserve">. Time-averaging, therefore, sets the resolution of the question rather than disqualifying it. A reorganization of transmission large enough to matter over the two centuries of the Parkin phase should register in the averaged frequency structure, and the drift-versus-groups test we develop measures that structure directly rather than an imagined moment behind it.</w:t>
+        <w:t xml:space="preserve">. Time-averaging, therefore, sets the resolution of the question rather than disqualifying it. A reorganization of transmission large enough to matter over the two centuries of the Parkin phase should register in the averaged frequency structure. Thus, a drift-versus-groups test must measure that structure directly rather than an imagined moment behind it.</w:t>
       </w:r>
     </w:p>
     <w:p>
@@ -755,7 +793,7 @@
         <w:t xml:space="preserve">(Anderson 1996; Beck 2003; Blitz 1999; King and Freer 1995; Lulewicz 2019; Milner 1998; Rees 2001)</w:t>
       </w:r>
       <w:r>
-        <w:t xml:space="preserve">. The chronicles describe Casqui and its neighbor Pacaha in open conflict, which fits a landscape of competing peers, though the same sources have also been interpreted as ranking Casqui below Pacaha, and the chronicle ethnography is thin and filtered</w:t>
+        <w:t xml:space="preserve">. The chronicles describe Casqui and its neighbor Pacaha in open conflict, which fits a landscape of competing peers. The same sources have also been interpreted as ranking Casqui below Pacaha, and the chronicle ethnography is thin and filtered</w:t>
       </w:r>
       <w:r>
         <w:t xml:space="preserve"> </w:t>
@@ -821,7 +859,7 @@
         <w:pStyle w:val="BodyText"/>
       </w:pPr>
       <w:r>
-        <w:t xml:space="preserve">The second asks whether the assemblages all belong to one interacting community or to several, and it is the most direct test of fragmentation. It rests on frequency seriation, the classic archaeological method of ordering assemblages so that each decorated class’s relative frequency rises to a single peak and then falls away, the shape long known as a battleship curve. That single-peaked rise and fall is what a style traces when it is introduced, becomes popular, and is abandoned within one community, drawing on a shared pool of designs. In classical uses of seriation, all available assemblages were typically pooled into a single seriation, and deviations from the frequency guidelines were dismissed as sampling error. While sampling error certainly does need to be accounted for, classical practice ignores the fact that</w:t>
+        <w:t xml:space="preserve">The second asks whether the assemblages all belong to one interacting community or to several, and it is the most direct test of fragmentation. It rests on frequency seriation, the classic archaeological method of ordering assemblages so that each decorated class’s relative frequency rises to a single peak and then falls away, the shape long known as a battleship curve. That single-peaked rise and fall is what a style traces when it is introduced, becomes popular, and is abandoned within one community, drawing on a shared pool of designs. In classical uses of seriation, all available assemblages were typically pooled into a single seriation, and deviations from the frequency guidelines were dismissed as sampling error. Sampling error certainly needs to be accounted for. Classical practice, however, ignores the most valuable aspect of the method: a</w:t>
       </w:r>
       <w:r>
         <w:t xml:space="preserve"> </w:t>
@@ -837,7 +875,7 @@
         <w:t xml:space="preserve"> </w:t>
       </w:r>
       <w:r>
-        <w:t xml:space="preserve">is perhaps the most valuable aspect of the seriation method, because it tells us when locales are far enough</w:t>
+        <w:t xml:space="preserve">tells us when locales are far enough</w:t>
       </w:r>
       <w:r>
         <w:t xml:space="preserve"> </w:t>
@@ -849,7 +887,7 @@
         <w:t xml:space="preserve"> </w:t>
       </w:r>
       <w:r>
-        <w:t xml:space="preserve">with the continuous flow of interaction and social learning around them that there is interesting structure to their interaction history</w:t>
+        <w:t xml:space="preserve">with the surrounding flow of interaction and social learning that their interaction history has interesting structure</w:t>
       </w:r>
       <w:r>
         <w:t xml:space="preserve"> </w:t>
@@ -925,7 +963,7 @@
         <w:t xml:space="preserve">(Bell et al. 2009)</w:t>
       </w:r>
       <w:r>
-        <w:t xml:space="preserve">, computed here on Gini-Simpson diversity, the chance that two sherds drawn at random from a assemblage are of different classes. F_ST is the share of the total diversity that is due to differences between groups rather than to variation within them. When every assemblage draws on one shared, drifting pool of styles, between-group differences are small, and F_ST sits near zero, and as groups come to favor distinct repertoires, the between-group share grows, and F_ST climbs</w:t>
+        <w:t xml:space="preserve">, computed here on Gini-Simpson diversity, the chance that two sherds drawn at random from a assemblage are of different classes. F_ST is the share of the total diversity that is due to differences between groups rather than to variation within them. When every assemblage draws on one shared, drifting pool of styles, between-group differences are small and F_ST sits near zero. As groups come to favor distinct repertoires, the between-group share grows and F_ST climbs</w:t>
       </w:r>
       <w:r>
         <w:t xml:space="preserve"> </w:t>
@@ -934,7 +972,7 @@
         <w:t xml:space="preserve">(Neiman 1995)</w:t>
       </w:r>
       <w:r>
-        <w:t xml:space="preserve">. It serves here as the most direct measure of how far decoration has sorted itself by group, with one important caveat developed below. Stochastic drift on a spatially structured population generates between-group variance on its own, because subpopulations retain different amounts of diversity depending on their size and connectivity: small or sparsely connected areas drift to depleted, idiosyncratic repertoires while larger, well-connected ones stay richer, so the resulting differences appear as distinct interacting groups when they are produced by spatial position alone</w:t>
+        <w:t xml:space="preserve">. It serves here as the most direct measure of how far decoration has sorted itself by group, with one important caveat developed below. Stochastic drift on a spatially structured population generates between-group variance on its own. Subpopulations retain different amounts of diversity depending on their size and connectivity: small or sparsely connected areas drift to depleted, idiosyncratic repertoires, while larger, well-connected ones stay richer. The resulting differences appear as distinct interacting groups even though they are produced by spatial position alone</w:t>
       </w:r>
       <w:r>
         <w:t xml:space="preserve"> </w:t>
@@ -1004,7 +1042,7 @@
         <w:t xml:space="preserve"> </w:t>
       </w:r>
       <w:r>
-        <w:t xml:space="preserve">What each process does to the four transmission signatures, and which signature this record can measure. A filled circle (●) marks a signature a process drives, an open circle (○) one it leaves flat. The process columns give the idealized discrimination logic: under smooth, deterministic processes, only a bounded interaction group drives all four, and each alternative drives a characteristic subset, the pattern an idealized simulation confirms (Figure S4). Two features of the table show why that logic is not the test we run on the record. The smooth-drift and stochastic-drift columns separate textbook isolation-by-distance, which drives none of the four, from realistic neutral drift on a finite network, which drives cultural F_ST and the boundary excess on its own, with no bounded group present (Figure S5). Stochastic drift thus reproduces the same two-signature pattern as environmental patchiness, so a positive result on either signature cannot by itself separate a bounded group from drift or patchiness. The final column reports the recovery experiment (Figure 4). At this record’s 29 time-averaged assemblages, only cultural F_ST registers an injected-closure signal, and even then, it must be compared against the stochastic-drift null rather than zero. Seriation-coherence breakdown, which only a bounded group drives in principle, is the cleanest discriminator on paper yet undetectable here. The four signatures are therefore candidate diagnostics screened against the record, and the surviving discrimination is carried by cultural F_ST, assessed against the drift null, and by the generative drift-versus-groups comparison, not by convergence of the table’s rows.</w:t>
+        <w:t xml:space="preserve">What each process does to the four transmission signatures, and which signature this record can measure. A filled circle (●) marks a signature, a process drive, and an open circle (○) that leaves it flat. The process columns give the idealized discrimination logic: under smooth, deterministic processes, only a bounded interaction group drives all four, and each alternative drives a characteristic subset, the pattern an idealized simulation confirms (Figure S4). Two features of the table show why that logic is not the test we run on the record. The smooth-drift and stochastic-drift columns separate textbook isolation-by-distance, which drives none of the four, from realistic neutral drift on a finite network, which drives cultural F_ST and the boundary excess on its own, with no bounded group present (Figure S5). Stochastic drift thus reproduces the same two-signature pattern as environmental patchiness, so a positive result on either signature cannot by itself separate a bounded group from drift or patchiness. The final column reports the recovery experiment (Figure 4). At this record’s 29 time-averaged assemblages, only cultural F_ST registers an injected-closure signal, and even then, it must be compared against the stochastic-drift null rather than zero. Seriation-coherence breakdown, which only a bounded group drives in principle, is the cleanest discriminator on paper yet undetectable here. The four signatures are therefore candidate diagnostics screened against the record, and the surviving discrimination is carried by cultural F_ST, assessed against the drift null, and by the generative drift-versus-groups comparison, not by convergence of the table’s rows.</w:t>
       </w:r>
     </w:p>
     <w:tbl>
@@ -1950,7 +1988,7 @@
         <w:pStyle w:val="FirstParagraph"/>
       </w:pPr>
       <w:r>
-        <w:t xml:space="preserve">The argument uses four simulations, each answering a different question. An idealized validation tests whether the four signatures separate a bounded interaction group from its three mimics in principle, on large, clean synthetic assemblages (Figure S4). A record-matched recovery tests which of the signatures can detect a known, injected closure at the real record’s sample sizes and time-averaging (Figure 4). A positive control tests which generative process, neutral spatial drift or bounded groups, reproduces the structure observed in the basin (Figure S5). A forward demonstration runs neutral drift on the real site geography with no boundary imposed and counts how many phase-like groups it produces, and whether the named phases exceed that number (Figures 8 and 9). The first two establish what the test can resolve on a record of this size; the second two identify which process the data match. We describe the validation and recovery here and the two drift simulations in the next subsection.</w:t>
+        <w:t xml:space="preserve">The argument uses four simulations, each answering a different question. An idealized validation tests whether the four signatures, in principle, separate a bounded interaction group from its three mimics on large, clean synthetic assemblages (Figure S4). A record-matched recovery test assesses which signatures can detect a known, injected closure at the real record’s sample sizes and time-averaging (Figure 4). A positive control test, which generative process, neutral spatial drift, or bounded groups, reproduces the structure observed in the basin (Figure S5). A forward demonstration runs neutral drift on the real site geography with no boundary imposed, counts how many phase-like groups it produces, and checks whether the named phases exceed that number (Figures 8 and 9). The first two establish what the test can resolve on a record of this size; the second two identify which process the data match. We describe the validation and recovery here and the two drift simulations in the next subsection.</w:t>
       </w:r>
     </w:p>
     <w:p>
@@ -1984,7 +2022,7 @@
         <w:pStyle w:val="BodyText"/>
       </w:pPr>
       <w:r>
-        <w:t xml:space="preserve">The recovery test is generative: we built synthetic pottery records in which we controlled whether group structure was emerging, dialed from none to strong, and then asked whether our four measures could see it. The synthetic records were matched to the real ones: the same number of assemblages, the same range of sample sizes, the same time-averaging that surface assemblages impose</w:t>
+        <w:t xml:space="preserve">The recovery test is generative: we built synthetic pottery records in which we controlled whether group structure was emerging, dialed from none to strong, and then asked whether our four measures could see it. The synthetic records were matched to the real ones: the same number of assemblages, the same range of sample sizes, and the same time-averaging imposed by surface assemblages</w:t>
       </w:r>
       <w:r>
         <w:t xml:space="preserve"> </w:t>
@@ -2046,7 +2084,7 @@
         <w:pStyle w:val="BodyText"/>
       </w:pPr>
       <w:r>
-        <w:t xml:space="preserve">The same neutral-drift model is also run forward to produce the phase-like groups of Figures 8 and 9. We run it forward in time on the real site geography with no boundary imposed, so any structure in the output comes from geography and time alone. Each site holds a finite population of learners. In each generation a learner copies the decorated class of another learner, drawn from its own site with high probability and, at a low rate, from another site with a probability that decays with along-river distance. At a low rate the learner instead adopts a newly invented class, so the repertoire turns over through time and the assemblages can be seriated. Because the assemblages are not contemporaneous, we sample the simulated field time-transgressively: each synthetic assemblage is drawn at the time-slice that matches its position on the seriation axis, accumulated over a trailing window to reproduce the record’s time-averaging, then subsampled to the observed sherd count. We detect groups in the result by modularity on the Brainerd-Robinson similarity graph, the same procedure applied to the real assemblages. Because the group labels differ between runs, we summarize Parkin’s group as a probability: across 500 runs, the fraction in which each assemblage falls in the same drift-detected group as Parkin. We report the number of groups, the between-group cultural F_ST, and that co-membership against the named phases, with the full parameter grid in the Supplemental Text.</w:t>
+        <w:t xml:space="preserve">The same neutral-drift model is also run forward to produce the phase-like groups of Figures 8 and 9. We run it forward in time on the real site geography with no boundary imposed, so any structure in the output comes from geography and time alone. Each site holds a finite population of learners. In each generation, a learner copies the decorated class of another learner, drawn from its own site with high probability and, at a low rate, from another site with a probability that decays with along-river distance. At a low rate, the learner instead adopts a newly invented class, so the repertoire turns over through time, and the assemblages can be seriated. Because the assemblages are not contemporaneous, we sample the simulated field time-transgressively. Each synthetic assemblage is drawn at the time-slice that matches its position on the seriation axis, accumulated over a trailing window to reproduce the record’s time-averaging, then subsampled to the observed sherd count. We detect groups in the results using modularity on the Brainerd-Robinson similarity graph, following the same procedure applied to the real assemblages. Because the group labels differ between runs, we summarize Parkin’s group as a probability: across 500 runs, the fraction of runs in which each assemblage falls into the same drift-detected group as Parkin. We report the number of groups, the between-group cultural F_ST, and the co-membership against the named phases, with the full parameter grid in the Supplemental Text.</w:t>
       </w:r>
     </w:p>
     <w:bookmarkEnd w:id="28"/>
@@ -2116,7 +2154,7 @@
         <w:pStyle w:val="FirstParagraph"/>
       </w:pPr>
       <w:r>
-        <w:t xml:space="preserve">The four signatures distinguish bounded groups from drift in principle, but at this record’s resolution, only one of them registers the difference. The idealized validation behaves as designed: when interaction is made to close into bounded groups all four signatures move together, the drift and other mimics each light only a characteristic subset, and the four are tightly correlated under closure (mean absolute pairwise correlation 0.88) yet nearly independent under the mimics (0.19 to 0.29), so their joint movement is informative rather than redundant (Figure S4). The record-matched recovery is the more informative of the two (Figure 4). When a known group-closure signal is injected at the real configuration and scored after size control, only cultural F_ST tracks it monotonically, climbing from the null toward a strong positive trend as the injected strength rises, where the injected strength s is a dial from 0, pure drift, to 1, strong and sharply bounded groups. The neutral departure is non-monotonic in conformity, the spatial boundary is unresponsive at the three spatial clusters the data support, and seriation coherence responds only weakly. With the false-positive rate held at five percent, F_ST recovers a closure of strength s greater than or equal to 0.5 with power above 0.8, the threshold rising to 0.7 under the record’s time-averaging. The other three signatures are not reliable discriminators at this resolution, and we treat them as weak corroboration only. At this record size and with time-averaging, the one signature that can distinguish a bounded group from drift is between-group variance.</w:t>
+        <w:t xml:space="preserve">The four signatures distinguish bounded groups from drift in principle, but at this record’s resolution, only one of them registers the difference. The idealized validation behaves as designed. When interaction is made to close into bounded groups, all four signatures move together, while drift and the other mimics each move only a characteristic subset. The four are tightly correlated under closure (mean absolute pairwise correlation 0.88) yet nearly independent under the mimics (0.19 to 0.29), so their joint movement is informative rather than redundant (Figure S4). The record-matched recovery is the more informative of the two (Figure 4). When a known group-closure signal is injected at the real configuration and scored after size control, only cultural F_ST tracks it monotonically, climbing from the null toward a strong positive trend as the injected strength rises. The injected strength s runs from 0 (pure drift) to 1 (strong, sharply bounded groups). The neutral departure is non-monotonic in conformity, the spatial boundary is unresponsive at the three spatial clusters the data support, and seriation coherence responds only weakly. With the false-positive rate held at five percent, F_ST recovers a closure of strength s greater than or equal to 0.5 with power above 0.8, the threshold rising to 0.7 under the record’s time-averaging. The other three signatures are not reliable discriminators at this resolution, and we treat them as weak corroboration only. At this record size and with time-averaging, the one signature that can distinguish a bounded group from drift is between-group variance.</w:t>
       </w:r>
     </w:p>
     <w:p>
@@ -2189,7 +2227,7 @@
         <w:pStyle w:val="BodyText"/>
       </w:pPr>
       <w:r>
-        <w:t xml:space="preserve">Applied to the St. Francis basin, that one reliable signature shows no closure into bounded groups, and the apparent signals in the others are confounded by sample size (Figure 5). The raw trajectory along the seriation axis seems to dissociate, but two of its trends are sampling artifacts: because assemblage size trends with seriation position, the size-sensitive estimators move with it. Two of the apparent trends are artifacts of sample size. Once every assemblage is trimmed to a common sherd count by subsampling, cultural F_ST falls from a raw +0.60 to +0.01, and its uncertainty range runs from no closure to a moderate signal, so it is uninformative rather than a resolved positive. The neutrality departure is likewise size-sensitive (its raw -0.94 only weakens to -0.83 under size control), and the recovery shows that it does not track closure in either direction here, so it, too, cannot be interpreted as a transmission signal. On the recovery curve, the size-controlled empirical F_ST corresponds to a nominal injected strength of about 0.35, below the resolution limit. The record, therefore, shows no detectable closure of moderate or greater strength. The negative is informative for a closure of moderate or greater strength, which would have registered and is absent. It cannot exclude a weaker closure that, given a record of this size and time-averaging, is underpowered to resolve. The positive control reported next shows that the structure actually present is what neutral drift produces, so the result is not only that no bounded group is detectable, but also that the structure present is what continuous, spatially structured interaction would produce.</w:t>
+        <w:t xml:space="preserve">Applied to the St. Francis basin, that one reliable signature shows no closure into bounded groups, and the apparent signals in the others are confounded by sample size (Figure 5). The raw trajectory along the seriation axis seems to dissociate. Two of its trends, however, are sampling artifacts: because assemblage size trends with seriation position, the size-sensitive estimators move with it. Once every assemblage is trimmed to a common sherd count by subsampling, cultural F_ST falls from a raw +0.60 to +0.01. Its uncertainty range runs from no closure to a moderate signal, so it is uninformative rather than a resolved positive. The neutrality departure is likewise size-sensitive (its raw -0.94 only weakens to -0.83 under size control). The recovery shows that it does not track closure in either direction here, so it, too, cannot be interpreted as a transmission signal. On the recovery curve, the size-controlled empirical F_ST corresponds to a nominal injected strength of about 0.35, below the resolution limit. The record, therefore, shows no detectable closure of moderate or greater strength. The negative is informative for a closure of moderate or greater strength, which would have registered and is absent. It cannot exclude a weaker closure that, given a record of this size and time-averaging, is underpowered to resolve. The positive control reported next shows that the structure actually present is what neutral drift produces. The result is therefore not only that no bounded group is detectable, but that the structure present is what continuous, spatially structured interaction would produce.</w:t>
       </w:r>
     </w:p>
     <w:p>
@@ -2446,7 +2484,7 @@
         <w:t xml:space="preserve">(Mitchem 2001; Phyllis A. Morse 1990)</w:t>
       </w:r>
       <w:r>
-        <w:t xml:space="preserve">, so we base the settlement comparison on recorded mound height rather than on mound area. Parkin’s roughly 17-acre site area would make it the largest center in the basin, but that figure is the total site area rather than the basal mound area on which the other sites are measured, and we treat it as indicative only. The settlement record thus shows a prominent center within a graded size distribution, not an administrative tier set above the rest</w:t>
+        <w:t xml:space="preserve">, so we base the settlement comparison on recorded mound height rather than on mound area. Parkin’s roughly 17-acre site area would make it the largest center in the basin. That figure, however, is the total site area rather than the basal mound area on which the other sites are measured, so we treat it as indicative only. The settlement record thus shows a prominent center within a graded size distribution, not an administrative tier set above the rest</w:t>
       </w:r>
       <w:r>
         <w:t xml:space="preserve"> </w:t>
@@ -2620,7 +2658,7 @@
         <w:pStyle w:val="BodyText"/>
       </w:pPr>
       <w:r>
-        <w:t xml:space="preserve">That characterization can be made constructive rather than merely consistent with the data. Run the finite-population network-drift model forward on the real configuration of the assemblages, with copying that decays with along-waterway distance and no boundary imposed, and the structure the phase concept interprets as a society reappears on its own</w:t>
+        <w:t xml:space="preserve">That characterization can be made constructive rather than merely consistent with the data. Run the finite-population network-drift model forward on the real configuration of the assemblages, with copying that decays with along-waterway distance and no boundary imposed, and the structure that the phase concept interprets as a society reappears on its own</w:t>
       </w:r>
       <w:r>
         <w:t xml:space="preserve"> </w:t>
@@ -2629,7 +2667,7 @@
         <w:t xml:space="preserve">(Lipo et al. 2021)</w:t>
       </w:r>
       <w:r>
-        <w:t xml:space="preserve">. Across the 55 decorated assemblages of the wider lower Mississippi Valley, the model repeatedly produces a few spatially coherent, phase-like groups (Figure 8). The deposits are not contemporaneous, which is why they can be seriated at all and why some carry more of the late classes than others, so each synthetic assemblage is drawn time-transgressively at the run-time that matches its seriation position. Holding time fixed to isolate the spatial signal, drift yields two to five groups whose number grows with geographic extent; restoring the staggered deposition ages collapses the count toward two time-defined groups, because assemblages caught at different points in the sequence carry different repertoires. Either way, the number of drift-generated groups falls well short of the seven named phases the regional scheme draws across the same assemblages, and the between-group cultural F_ST of those groups settles at the observed level rather than the higher value a bounded group would leave. The named phases, therefore, subdivide the valley more finely than the transmission structure supports. Where culture history draws seven bounded societies, drift on the geography yields at most a handful of coherent groupings, so most of the phase boundaries mark divisions a continuous interaction field does not carry. Whether any single named phase exceeds this drift expectation is a question we can now pose one phase at a time. That spatial and population structure, not population size, governs how drift partitions diversity in finite structured populations is established in both the cultural-transmission and population-genetics literatures</w:t>
+        <w:t xml:space="preserve">. Across the 55 decorated assemblages of the wider lower Mississippi Valley, the model repeatedly produces a few spatially coherent, phase-like groups (Figure 8). The deposits are not contemporaneous, which is why they can be seriated at all and why some carry more of the late classes than others, so each synthetic assemblage is drawn time-transgressively at the run-time that matches its seriation position. Holding time fixed to isolate the spatial signal, drift yields two to five groups whose number grows with geographic extent; restoring the staggered deposition ages collapses the count toward two time-defined groups, because assemblages caught at different points in the sequence carry different repertoires. Either way, the number of drift-generated groups falls well short of the seven named phases the regional scheme draws across the same assemblages. The between-group cultural F_ST of those groups settles at the observed level rather than the higher value a bounded group would leave. The named phases, therefore, subdivide the valley more finely than the transmission structure supports. Where culture history draws seven bounded societies, drift on the geography yields at most a handful of coherent groupings, so most of the phase boundaries mark divisions a continuous interaction field does not carry. Whether any single named phase exceeds this drift expectation is a question we can now pose one phase at a time. That spatial and population structure, not population size, governs how drift partitions diversity in finite structured populations is established in both the cultural-transmission and population-genetics literatures</w:t>
       </w:r>
       <w:r>
         <w:t xml:space="preserve"> </w:t>
@@ -2638,7 +2676,7 @@
         <w:t xml:space="preserve">(Barton 1996; Premo 2016; Schneider et al. 2016; Wright 1943)</w:t>
       </w:r>
       <w:r>
-        <w:t xml:space="preserve">, and a localized neutral process is readily mistaken for biased transmission when diversity is taken at face value</w:t>
+        <w:t xml:space="preserve">. A localized neutral process is readily mistaken for biased transmission when diversity is taken at face value</w:t>
       </w:r>
       <w:r>
         <w:t xml:space="preserve"> </w:t>
@@ -2656,7 +2694,7 @@
         <w:t xml:space="preserve">(Derex et al. 2018; Derex and Boyd 2016; Saxer et al. 2009)</w:t>
       </w:r>
       <w:r>
-        <w:t xml:space="preserve">. The result is not contingent on a tuned parameter set: across 432 runs spanning a grid of interaction length, between-node mixing, and innovation rate, two or more spatially coherent groups appear in every run and the between-group F_ST sits at or below the observed value in 85 percent of them, and the St. Francis basin that anchors this paper behaves the same way as a positive control (Figures S7 and S8).</w:t>
+        <w:t xml:space="preserve">. The result is not contingent on a tuned parameter set. Across 432 runs spanning a grid of interaction length, between-node mixing, and innovation rate, two or more spatially coherent groups appear in every run, and the between-group F_ST sits at or below the observed value in 85 percent of them. The St. Francis basin that anchors this paper behaves the same way as a positive control (Figures S7 and S8).</w:t>
       </w:r>
     </w:p>
     <w:p>
@@ -2664,7 +2702,7 @@
         <w:pStyle w:val="BodyText"/>
       </w:pPr>
       <w:r>
-        <w:t xml:space="preserve">The same model lets the named phases be tested one at a time, in the culture historian’s own terms. Taking Parkin as the focal case, membership in its group is a probability rather than a fact: across the 500 runs, each assemblage shares Parkin’s drift-detected group some fraction of the time, a graded field that falls off smoothly with river distance from Parkin rather than the bounded set a phase map implies (Figure 9A). The Parkin-phase assemblages do separate from the others by this measure, but that is the separation that drift predicts, because they lie near Parkin and so co-occur with it more than distant assemblages do (Figure 9B). The discriminating test is whether the between-group cultural F_ST across the Parkin-versus-others partition exceeds the drift null. It sits at the extreme upper tail of the null and survives most single-site deletions, but it is small, the null’s own tail reaches past it, and time-averaging, which deflates between-group variance, is not modeled in the null (Figure 9C, 9D). It is therefore at most a weak hint of structure beyond drift, not a demonstrated social boundary. Geography and time account for the pattern entirely, and the apparent groups are products of a single neutral process.</w:t>
+        <w:t xml:space="preserve">The same model lets the named phases be tested one at a time, in the culture historian’s own terms. Taking Parkin as the focal case, membership in its group is a probability rather than a fact: across the 500 runs, each assemblage shares Parkin’s drift-detected group some fraction of the time, a graded field that falls off smoothly with river distance from Parkin rather than the bounded set a phase map implies (Figure 9A). The Parkin-phase assemblages do separate from the others by this measure. That separation is what drift predicts, because they lie near Parkin and so co-occur with it more than distant assemblages do (Figure 9B). The discriminating test is whether the between-group cultural F_ST across the Parkin-versus-others partition exceeds the drift null. It sits at the extreme upper tail of the null and survives most single-site deletions. The contrast is nonetheless small: the null’s own tail reaches past it, and time-averaging, which deflates between-group variance, is not modeled in the null (Figure 9C, 9D). It is therefore at most a weak hint of structure beyond drift, not a demonstrated social boundary. Geography and time account entirely for the pattern, and the apparent groups are products of a single neutral process.</w:t>
       </w:r>
     </w:p>
     <w:p>
@@ -2676,7 +2714,7 @@
           <wp:inline>
             <wp:extent cx="5334000" cy="2824401"/>
             <wp:effectExtent b="0" l="0" r="0" t="0"/>
-            <wp:docPr descr="Figure 8. Phase-like groups produced by neutral drift across the wider lower Mississippi Valley, with no bounded group imposed, summarized over 500 realizations. The finite-population network-drift model runs forward on the river-network geography of all 55 Mainfort-PFG decorated assemblages, and groups are detected as greedy-modularity communities on the Brainerd-Robinson similarity graph (Supplemental Text). In the model each site copies decorated classes mostly from itself and, at a low rate, from other sites with a probability that decays with river distance, while innovation turns the repertoire over through time; synthetic assemblages are sampled time-transgressively at each site’s seriation position and subsampled to the observed counts. (A) Distribution of the number of groups across the 500 runs, under contemporaneous (pure-space) and time-transgressive sampling, with the seven named culture-historical phases and the observed cluster count marked. Pure spatial drift yields two to five groups, and the count grows with geographic extent; time-transgressive sampling collapses it toward two. Either way, drift produces far fewer groups than the seven named phases, so the phases subdivide the valley more finely than the transmission structure supports. (B) Between-group cultural F_ST across runs against the observed level (0.04); the observed differentiation sits at the upper edge of the contemporaneous-drift distribution, so drift reproduces it. Parameters are the positive-control corner (interaction length 24 river-km, mixing 0.02, innovation 0.012); the basin positive control and the parameter-grid robustness are in Figures S7 and S8." title="" id="45" name="Picture"/>
+            <wp:docPr descr="Figure 8. Phase-like groups produced by neutral drift across the wider lower Mississippi Valley, with no bounded group imposed, summarized over 500 realizations. The finite-population network-drift model runs forward on the river-network geography of all 55 Mainfort-PFG decorated assemblages, and groups are detected as greedy-modularity communities on the Brainerd-Robinson similarity graph (Supplemental Text). In the model, each site copies decorated classes primarily from itself and, at a low rate, from other sites, with a probability that decays with river distance, while innovation turns the repertoire over through time; synthetic assemblages are sampled time-transgressively at each site’s seriation position and subsampled to match the observed counts. (A) Distribution of the number of groups across the 500 runs, under contemporaneous (pure-space) and time-transgressive sampling, with the seven named culture-historical phases and the observed cluster count marked. Pure spatial drift yields two to five groups, and the count grows with geographic extent; time-transgressive sampling collapses it toward two. Either way, drift produces far fewer groups than the seven named phases, so the phases subdivide the valley more finely than the transmission structure supports. (B) Between-group cultural F_ST across runs against the observed level (0.04); the observed differentiation sits at the upper edge of the contemporaneous-drift distribution, so drift reproduces it. Parameters are the positive-control corner (interaction length 24 river-km, mixing 0.02, innovation 0.012); the basin positive control and the parameter-grid robustness are in Figures S7 and S8." title="" id="45" name="Picture"/>
             <a:graphic>
               <a:graphicData uri="http://schemas.openxmlformats.org/drawingml/2006/picture">
                 <pic:pic>
@@ -2729,7 +2767,7 @@
         <w:t xml:space="preserve"> </w:t>
       </w:r>
       <w:r>
-        <w:t xml:space="preserve">Phase-like groups produced by neutral drift across the wider lower Mississippi Valley, with no bounded group imposed, summarized over 500 realizations. The finite-population network-drift model runs forward on the river-network geography of all 55 Mainfort-PFG decorated assemblages, and groups are detected as greedy-modularity communities on the Brainerd-Robinson similarity graph (Supplemental Text). In the model each site copies decorated classes mostly from itself and, at a low rate, from other sites with a probability that decays with river distance, while innovation turns the repertoire over through time; synthetic assemblages are sampled time-transgressively at each site’s seriation position and subsampled to the observed counts. (A) Distribution of the number of groups across the 500 runs, under contemporaneous (pure-space) and time-transgressive sampling, with the seven named culture-historical phases and the observed cluster count marked. Pure spatial drift yields two to five groups, and the count grows with geographic extent; time-transgressive sampling collapses it toward two. Either way, drift produces far fewer groups than the seven named phases, so the phases subdivide the valley more finely than the transmission structure supports. (B) Between-group cultural F_ST across runs against the observed level (0.04); the observed differentiation sits at the upper edge of the contemporaneous-drift distribution, so drift reproduces it. Parameters are the positive-control corner (interaction length 24 river-km, mixing 0.02, innovation 0.012); the basin positive control and the parameter-grid robustness are in Figures S7 and S8.</w:t>
+        <w:t xml:space="preserve">Phase-like groups produced by neutral drift across the wider lower Mississippi Valley, with no bounded group imposed, summarized over 500 realizations. The finite-population network-drift model runs forward on the river-network geography of all 55 Mainfort-PFG decorated assemblages, and groups are detected as greedy-modularity communities on the Brainerd-Robinson similarity graph (Supplemental Text). In the model, each site copies decorated classes primarily from itself and, at a low rate, from other sites, with a probability that decays with river distance, while innovation turns the repertoire over through time; synthetic assemblages are sampled time-transgressively at each site’s seriation position and subsampled to match the observed counts. (A) Distribution of the number of groups across the 500 runs, under contemporaneous (pure-space) and time-transgressive sampling, with the seven named culture-historical phases and the observed cluster count marked. Pure spatial drift yields two to five groups, and the count grows with geographic extent; time-transgressive sampling collapses it toward two. Either way, drift produces far fewer groups than the seven named phases, so the phases subdivide the valley more finely than the transmission structure supports. (B) Between-group cultural F_ST across runs against the observed level (0.04); the observed differentiation sits at the upper edge of the contemporaneous-drift distribution, so drift reproduces it. Parameters are the positive-control corner (interaction length 24 river-km, mixing 0.02, innovation 0.012); the basin positive control and the parameter-grid robustness are in Figures S7 and S8.</w:t>
       </w:r>
     </w:p>
     <w:p>
@@ -2820,7 +2858,7 @@
         <w:t xml:space="preserve">(Phyllis A. Morse 1990)</w:t>
       </w:r>
       <w:r>
-        <w:t xml:space="preserve">. The inference is specific and deserves credit for that, but it is circular. The tribute it concludes is the tribute it assumes, and no independent evidence of tribute flow accompanies it. Parkin’s position at the confluence of the St. Francis and Tyronza is as well explained by control of movement and communication as by extraction, and the transmission and exchange records both show the absence of the centralized control the tribute model requires. A second argument points to skeletal evidence from the lower Mississippi (Yazoo) Delta rather than the St. Francis basin, indicating a better diet at a mound center than at a nearby satellite village, consistent with differential access within a hierarchy</w:t>
+        <w:t xml:space="preserve">. The inference is specific and deserves credit for that, but it is circular. The tribute it concludes is the tribute it assumes, and no independent evidence of tribute flow accompanies it. Parkin’s position at the confluence of the St. Francis and Tyronza is as well explained by control of movement and communication as by extraction. The transmission and exchange records both show the absence of the centralized control the tribute model requires. A second argument points to skeletal evidence from the lower Mississippi (Yazoo) Delta rather than the St. Francis basin, indicating a better diet at a mound center than at a nearby satellite village, consistent with differential access within a hierarchy</w:t>
       </w:r>
       <w:r>
         <w:t xml:space="preserve"> </w:t>
@@ -2837,7 +2875,7 @@
         <w:pStyle w:val="BodyText"/>
       </w:pPr>
       <w:r>
-        <w:t xml:space="preserve">Three limits bound the result, and the recovery experiment forces the most important of them to the front. At this record’s resolution, the discrimination between a bounded group and drift rests on a single signature, cultural F_ST. That signature is confounded by a sample-size trend along the seriation axis (Spearman rho = +0.59). We removed the confound by subsampling every assemblage to a common count, which collapses the raw F_ST trend from +0.60 to +0.01. We calibrated the test on synthetic data matched to the record, in which F_ST recovers a moderate-strength closure (s of about 0.5, rising to 0.7 once the record’s time-averaging is imposed), while maintaining a false-positive rate of 5%. The size-controlled empirical F_ST is uninformative, its bootstrap interval spanning no closure to a moderate signal. The negative is therefore informative for a closure of moderate or greater strength, which would have registered as a resolved positive, but does not. It cannot exclude a weaker closure that a record of 29 time-averaged assemblages is underpowered to resolve, and we state the claim at that bound rather than beyond it. The other three signatures do not track closure reliably here. The neutral departure fails because it is non-monotonic in conformity and sensitive to sample size. The spatial boundary fails because the data support too few spatial clusters, and seriation coherence responds only weakly, so we report them as corroboration rather than as independent confirmations. This reduction is a property of the record. When a known closure signal is injected instead through a within-group conformity pathway or a non-spatially-organized social-fragmentation pathway, neither the neutral nor the seriation signature recovers it either, so the three weak signatures fail at this resolution regardless of how closure is produced (Supplemental Text). The price is that the negative bounds are only closure expressed as between-group divergence. The closure carried purely by conformity, or by social structure not aligned with the spatial clusters, would lie below detection in this record at any strength. The second limit is the ordinal chronology. The basin radiocarbon corpus pools to five seriation anchors across a calibration plateau, so the axis is a relative order oriented toward later time at Spearman +0.70, imperfectly. The discriminating quantity, the size-controlled F_ST trend, is a magnitude that does not depend on the axis orientation, and the settlement and exchange lines do not depend on the ceramic chronology at all. The third limit is time-averaging, which damps between-assemblage variation and reduces apparent turnover</w:t>
+        <w:t xml:space="preserve">Three limits bound the result, and the recovery experiment forces the most important of them to the front. At this record’s resolution, the discrimination between a bounded group and drift rests on a single signature, cultural F_ST. That signature is confounded by a sample-size trend along the seriation axis (Spearman rho = +0.59). We removed the confound by subsampling every assemblage to a common count, which collapses the raw F_ST trend from +0.60 to +0.01. We calibrated the test on synthetic data matched to the record, in which F_ST recovers a moderate-strength closure (s of about 0.5, rising to 0.7 once the record’s time-averaging is imposed), while maintaining a false-positive rate of 5%. The size-controlled empirical F_ST is uninformative, its bootstrap interval spanning no closure to a moderate signal. The negative is therefore informative for a closure of moderate or greater strength, which would have registered as a resolved positive, but does not. It cannot exclude a weaker closure that a record of 29 time-averaged assemblages is underpowered to resolve. We state the claim at that bound rather than beyond it. The other three signatures do not track closure reliably here. The neutral departure fails because it is non-monotonic in conformity and sensitive to sample size. The spatial boundary fails because the data support too few spatial clusters, and seriation coherence responds only weakly. We report them as corroboration rather than as independent confirmations. This reduction is a property of the record. When a known closure signal is injected instead through a within-group conformity pathway or a non-spatially-organized social-fragmentation pathway, neither the neutral nor the seriation signature recovers it either, so the three weak signatures fail at this resolution regardless of how closure is produced (Supplemental Text). The price is that the negative bounds are only closure expressed as between-group divergence. The closure carried purely by conformity, or by social structure not aligned with the spatial clusters, would lie below detection in this record at any strength. The second limit is the ordinal chronology. The basin radiocarbon corpus pools to five seriation anchors across a calibration plateau, so the axis is a relative order oriented toward later time at Spearman +0.70, imperfectly. The discriminating quantity, the size-controlled F_ST trend, is a magnitude that does not depend on the axis orientation. The settlement and exchange lines do not depend on the ceramic chronology at all. The third limit is time-averaging, which damps between-assemblage variation and reduces apparent turnover</w:t>
       </w:r>
       <w:r>
         <w:t xml:space="preserve"> </w:t>
@@ -2846,7 +2884,7 @@
         <w:t xml:space="preserve">(Coco and Iovita 2020; Kidwell and Tomašových 2013; Perreault 2018; Tomašových and Kidwell 2009, 2010; Youngblood et al. 2023)</w:t>
       </w:r>
       <w:r>
-        <w:t xml:space="preserve">. Rather than argue that this makes the absence conservative, we built the damping into the recovery experiment directly, where it raises the detection threshold from s of 0.5 to 0.7, the quantified cost of the record’s temporal mixing. The verdict is stable across the watershed (19 assemblages) and corridor (29) basin definitions. The central methodological finding is that telling a bounded group from drift must be calibrated to the record to which it is applied. The same four signatures that discriminate cleanly on idealized data reduce, on a real time-averaged record of this size, to a single confound-controlled signature, and saying so is what licenses interpreting the structure as drift rather than weakening the claim.</w:t>
+        <w:t xml:space="preserve">. Rather than argue that this makes the absence conservative, we built the damping into the recovery experiment directly, where it raises the detection threshold from s of 0.5 to 0.7, the quantified cost of the record’s temporal mixing. The verdict is stable across the watershed (19 assemblages) and corridor (29) basin definitions. The central methodological finding is that telling a bounded group from drift must be calibrated to the record to which it is applied. The same four signatures that discriminate cleanly on idealized data reduce, on a real time-averaged record of this size, to a single confound-controlled signature. Saying so is what licenses interpreting the structure as drift rather than weakening the claim.</w:t>
       </w:r>
     </w:p>
     <w:p>
@@ -2854,7 +2892,7 @@
         <w:pStyle w:val="BodyText"/>
       </w:pPr>
       <w:r>
-        <w:t xml:space="preserve">The contribution has two parts that should be kept distinct. The four signatures distinguish a bounded interaction group from drift in principle, and an idealized simulation confirms that closure drives them together while drift and the other mimics do not (Figure S4). The calibration is the part that travels to real data: it asks, before any similarity structure is interpreted as social, which signatures a given record can support and how strong a closure each could detect, and on the Parkin record, it shows the test reducing to its single most robust component, cultural F_ST. We are explicit about what that costs: had F_ST shown a positive trend, it alone could not have separated a real group from environmental patchiness, which also drives between-group variance (Table 1), so on a positive result, the generative drift-versus-groups comparison, not F_ST alone, would have had to carry the discrimination. The negative is cleaner because the present structure is positively matched by drift and overshot by bounded groups. This result shows that social structure may be measurable through decorated ceramic assemblages. We can also assess whether the Parkin phase was a polity by examining whether interaction had closed into a bounded group to a degree that the record can resolve. For the Parkin phase, the answer is that it had not, within the bounds supported by the record. The polity the De Soto encountered seems to reflect distinctions drawn in ceremonial practices, fortification, and settlement size, rather than one written into the structure of ceramic transmission.</w:t>
+        <w:t xml:space="preserve">The contribution has two parts that should be kept distinct. The four signatures distinguish a bounded interaction group from drift in principle, and an idealized simulation confirms that closure drives them together while drift and the other mimics do not (Figure S4). The calibration is the part that travels to real data: it asks, before any similarity structure is interpreted as social, which signatures a given record can support and how strong a closure each could detect. On the Parkin record, it shows the test reducing to its single most robust component, cultural F_ST. We are explicit about what that costs. Had F_ST shown a positive trend, it alone could not have separated a real group from environmental patchiness, which also drives between-group variance (Table 1). On a positive result, the generative drift-versus-groups comparison, not F_ST alone, would have had to carry the discrimination. The negative is cleaner because the present structure is positively matched by drift and overshot by bounded groups. This result shows that social structure may be measurable through decorated ceramic assemblages. We can also assess whether the Parkin phase was a polity by examining whether interaction had closed into a bounded group to a degree that the record can resolve. For the Parkin phase, the answer is that it had not, within the bounds supported by the record. The polity the De Soto encountered seems to reflect distinctions drawn in ceremonial practices, fortification, and settlement size, rather than one written into the structure of ceramic transmission.</w:t>
       </w:r>
     </w:p>
     <w:p>
@@ -2862,7 +2900,7 @@
         <w:pStyle w:val="BodyText"/>
       </w:pPr>
       <w:r>
-        <w:t xml:space="preserve">One result resists the drift interpretation, if only faintly, and deserves to be named rather than buried. The single place in the valley that carries a faint signal of structure beyond drift is the Parkin phase, and Parkin is the one monumental node, the largest mound, the palisade, the confluence position, the candidate Casqui. A center beginning to differentiate as a distinct node, rather than a finished bounded group, would leave just such a signal, and this is what the origination stage of the two-regime model predicts: a local return generates a group-beneficial pattern at a node before assortment becomes binding and propagates into higher-level structure, with contact and the protohistoric depopulation truncating the sequence before it could consolidate. We do not claim this happened. The contrast is small, the drift null reaches past it, and the time-averaged surface record of eight Parkin-phase assemblages cannot support the claim. The possibility that Parkin was an incipient node nonetheless warrants direct investigation with data classes the present record lacks: stratified, excavated assemblages with independent radiocarbon, to test whether the differentiation grows through time rather than holding flat; compositional and petrographic sourcing of the ceramics, to test whether production and exchange were localizing on the center; and the non-ceramic lines, the chert-hoe and shell exchange networks</w:t>
+        <w:t xml:space="preserve">One result resists the drift interpretation, if only faintly, and deserves to be named rather than buried. The single place in the valley that carries a faint signal of structure beyond drift is the Parkin phase, and Parkin is the one monumental node, the largest mound, the palisade, the confluence position, the candidate Casqui. A center beginning to differentiate as a distinct node, rather than a finished bounded group, would leave just such a signal. This is what the origination stage of the two-regime model predicts: a local return generates a group-beneficial pattern at a node before assortment becomes binding and propagates into higher-level structure, with contact and the protohistoric depopulation truncating the sequence before it could consolidate. We do not claim this happened. The contrast is small, the drift null reaches past it, and the time-averaged surface record of eight Parkin-phase assemblages cannot support the claim. The possibility that Parkin was an incipient node nonetheless warrants direct investigation with data classes the present record lacks: stratified, excavated assemblages with independent radiocarbon, to test whether the differentiation grows through time rather than holding flat; compositional and petrographic sourcing of the ceramics, to test whether production and exchange were localizing on the center; and the non-ceramic lines, the chert-hoe and shell exchange networks</w:t>
       </w:r>
       <w:r>
         <w:t xml:space="preserve"> </w:t>
@@ -2900,7 +2938,7 @@
         <w:t xml:space="preserve">(1954)</w:t>
       </w:r>
       <w:r>
-        <w:t xml:space="preserve">, the within-region decorated-ceramic structure is again drift-consistent once the earlier Woodland component is set aside. Therefore, the absence of bounded groups is not peculiar to the St. Francis basin (Figure 11). In both regions, the observed between-cluster F_ST sits at the neutral-drift level and far below the bounded-groups expectation (LMV +0.02, CMV +0.03, against bounded-groups nulls of +0.11 and +0.08), and the assemblages intermix rather than separating into clusters. Between the two regions, a genuine discontinuity does appear. Across the roughly 50 km gap separating the central-valley and lower-valley assemblage clusters, decorated similarity declines by far more than neutral spatial drift would predict for the same geometry, and the two regions carry mutually exclusive, distinctive decorated repertoires (Figure S6). This is the scale-dependent pattern the test is designed to detect, with no closure within regions and a sharp difference between them. We report it as a pattern rather than a verdict, because it is confounded with time.</w:t>
+        <w:t xml:space="preserve">, the within-region decorated-ceramic structure is again drift-consistent once the earlier Woodland component is set aside. Therefore, the absence of bounded groups is not peculiar to the St. Francis basin (Figure 11). In both regions, the observed between-cluster F_ST sits at the neutral-drift level and far below the bounded-groups expectation (LMV +0.02, CMV +0.03, against bounded-groups nulls of +0.11 and +0.08). The assemblages intermix rather than separating into clusters. Between the two regions, a genuine discontinuity does appear. Across the roughly 50 km gap separating the central-valley and lower-valley assemblage clusters, decorated similarity declines by far more than neutral spatial drift would predict for the same geometry. The two regions carry mutually exclusive, distinctive decorated repertoires (Figure S6). This is the scale-dependent pattern the test is designed to detect, with no closure within regions and a sharp difference between them. We report it as a pattern rather than a verdict, because it is confounded with time.</w:t>
       </w:r>
     </w:p>
     <w:p>
@@ -2917,7 +2955,7 @@
         <w:t xml:space="preserve">(Phillips 1970; Williams 1954)</w:t>
       </w:r>
       <w:r>
-        <w:t xml:space="preserve">, so the step at the boundary cannot be separated from the early-to-late turnover of the repertoire with time-averaged surface assemblages, and resolving whether the inter-regional boundary is synchronic and social or a chronological succession would require independent radiocarbon control on the central-valley assemblages that the present compilation lacks. A second confound compounds the first. The lower-valley assemblages were collected and classified by Ford, later by Phillips, Ford, and Griffin. In contrast, the central-valley assemblages were collected and classified separately by Williams, so the two blocks differ in analyst, sorting convention, and class definition as well as in space and time. The shared-class restriction guards against the crudest version of this artifact, because a boundary built only from classes unique to each typology would vanish when only the classes both traditions record are compared, and the boundary does weaken under that restriction without disappearing. Even the shared classes, however, may have been sorted to subtly different criteria by the two traditions. We therefore cannot rule out that the apparent central-valley and lower-valley boundary is in part an artifact of two separate analytical histories, and that the possibility of continuous interaction across the whole region, with no real boundary anywhere, remains open. That possibility is part of the question this study raises, rather than a nuisance to be set aside, because a boundary in the data is not yet a boundary in the past. The paper’s point at the local scale applies with equal force between the regions.</w:t>
+        <w:t xml:space="preserve">. The step at the boundary therefore cannot be separated from the early-to-late turnover of the repertoire with time-averaged surface assemblages. Resolving whether the inter-regional boundary is synchronic and social or a chronological succession would require independent radiocarbon control on the central-valley assemblages that the present compilation lacks. A second confound compounds the first. The lower-valley assemblages were collected and classified by Ford, later by Phillips, Ford, and Griffin. In contrast, the central-valley assemblages were collected and classified separately by Williams, so the two blocks differ in analyst, sorting convention, and class definition as well as in space and time. The shared-class restriction guards against the crudest version of this artifact: a boundary built only from classes unique to each typology would vanish when only the classes both traditions record are compared. The boundary does weaken under that restriction without disappearing. Even the shared classes, however, may have been sorted to subtly different criteria by the two traditions. We therefore cannot rule out that the apparent central-valley and lower-valley boundary is in part an artifact of two separate analytical histories, and that the possibility of continuous interaction across the whole region, with no real boundary anywhere, remains open. That possibility is part of the question this study raises, rather than a nuisance to be set aside, because a boundary in the data is not yet a boundary in the past. The paper’s point at the local scale applies with equal force between the regions.</w:t>
       </w:r>
     </w:p>
     <w:p>
@@ -3073,7 +3111,7 @@
         <w:t xml:space="preserve">(Lipo et al. 2015; Neiman 1995)</w:t>
       </w:r>
       <w:r>
-        <w:t xml:space="preserve">. The third is that we test rather than assume, which is the point of the recovery experiment: empirical sufficiency is a property a signature has only if it can register a signal at the resolution preserved by the deposit, and, on the Parkin record, only between-group variance qualifies</w:t>
+        <w:t xml:space="preserve">. The third is that we test rather than assume, which is the point of the recovery experiment: empirical sufficiency is a property a signature has only if it can register a signal at the resolution preserved by the deposit. On the Parkin record, only between-group variance qualifies</w:t>
       </w:r>
       <w:r>
         <w:t xml:space="preserve"> </w:t>
@@ -3082,7 +3120,7 @@
         <w:t xml:space="preserve">(Perreault 2019)</w:t>
       </w:r>
       <w:r>
-        <w:t xml:space="preserve">. They meet the second only in part, because the signatures measure states along the seriation sequence rather than the transformation between them. We therefore add two time-domain tests that jointly satisfy dynamic and empirical sufficiency. A generative, time-averaging-aware inference fits a frequency-dependent copying model to the whole sequence, with the record’s time-averaging built into the model, and recovers a transmission bias tightly constrained near neutral (95 percent interval -0.02 to +0.06, including zero), which rules out the conformist dynamic a marker would require</w:t>
+        <w:t xml:space="preserve">. They meet the second only in part, because the signatures measure states along the seriation sequence rather than the transformation between them. We therefore add two time-domain tests that jointly satisfy dynamic and empirical sufficiency. A generative, time-averaging-aware inference fits a frequency-dependent copying model to the whole sequence, with the record’s time-averaging built into the model. It recovers a transmission bias tightly constrained near neutral (95 percent interval -0.02 to +0.06, including zero), which rules out the conformist dynamic a marker would require</w:t>
       </w:r>
       <w:r>
         <w:t xml:space="preserve"> </w:t>
@@ -3127,7 +3165,7 @@
         <w:pStyle w:val="FirstParagraph"/>
       </w:pPr>
       <w:r>
-        <w:t xml:space="preserve">The phase is the unit on which central-valley culture history is built, and it carries a silent claim that assemblages grouped by seriation and spatial proximity record a bounded society. For the Parkin phase, that claim does not survive measurement. Parkin is the basin’s largest and tallest-mounded center. No line of evidence, settlement, exchange, or ceramic transmission marks it as the apex of a polity, and the greater similarity among nearby assemblages that defines the phase is reproduced by neutral drift on the basin’s geography, the ordinary residue of continuous interaction structured by where sites sit. A bounded interaction group would have a sharper structure than the measurements indicate, and Parkin sits across orderings as a transmission bridge rather than at the closed core of one. Extending the test to the wider valley, a decorated-ceramic boundary that exceeds drift appears only between the central-valley and lower-valley blocks, and even there, it is entangled with the early-to-late turnover of the class repertoire. It cannot yet be interpreted as a synchronic social division. Posed in the culture historian’s own terms, against the other named phases of the valley, the Parkin phase itself shows at most a weak contrast at the edge of the drift null, robust to single-site removal but small and within the null’s reach (Figure 9). The phase, at the scale where it is drawn, is largely indistinguishable from spatially structured drift, which carries a consequence the discipline should weigh: a similarity cluster is not by itself a society, and before a phase is interpreted as a social group, the record must be shown able to tell a real interaction boundary from drift on geography. That calibration, not the phase, provides the basis for an explanation of social structure. When applied to the late pre-contact ceramics of the Mississippi Valley, it shows continuous interaction with prominent nodes rather than a mosaic of bounded polities.</w:t>
+        <w:t xml:space="preserve">The phase is the unit on which central-valley culture history is built, and it carries a silent claim that assemblages grouped by seriation and spatial proximity record a bounded society. For the Parkin phase, that claim does not survive measurement. Parkin is the basin’s largest and tallest-mounded center. No line of evidence, settlement, exchange, or ceramic transmission marks it as the apex of a polity. The greater similarity among nearby assemblages that defines the phase is reproduced by neutral drift on the basin’s geography, the ordinary residue of continuous interaction structured by where sites sit. A bounded interaction group would have a sharper structure than the measurements indicate, and Parkin sits across orderings as a transmission bridge rather than at the closed core of one. Extending the test to the wider valley, a decorated-ceramic boundary that exceeds drift appears only between the central-valley and lower-valley blocks. Even there, it is entangled with the early-to-late turnover of the class repertoire. It cannot yet be interpreted as a synchronic social division. Posed in the culture historian’s own terms, against the other named phases of the valley, the Parkin phase itself shows at most a weak contrast at the edge of the drift null, robust to single-site removal but small and within the null’s reach (Figure 9). The phase, at the scale where it is drawn, is largely indistinguishable from spatially structured drift. That carries a consequence the discipline should weigh: a similarity cluster is not by itself a society, and before a phase is interpreted as a social group, the record must be shown able to tell a real interaction boundary from drift on geography. That calibration, not the phase, provides the basis for an explanation of social structure. When applied to the late pre-contact ceramics of the Mississippi Valley, it shows continuous interaction with prominent nodes rather than a mosaic of bounded polities.</w:t>
       </w:r>
     </w:p>
     <w:bookmarkEnd w:id="57"/>

</xml_diff>

<commit_message>
Rename figure files to match manuscript figure numbers
Align figure filenames with their manuscript numbers (same change as the
working repo):
  fig_lmv_drift_groups -> fig8_lmv_drift_groups (Figure 8)
  figS8_basin_pullout  -> fig9_parkin_pullout   (Figure 9)
  fig1_regional        -> fig10_regional        (Figure 10)
  fig9_within_region   -> fig11_within_region   (Figure 11)
  fig8_emergent_phases -> figS8_emergent_phases (Supplement S8)
Updated image paths in MAIN_TEXT.md/SUPPLEMENTAL_TEXT.md and OUT_FIG names in
scripts 30, 31, 33, 35, 37, renamed the figure files (png/pdf/svg), and
rebuilt docx/pdf. Figure numbers in the text are unchanged.
</commit_message>
<xml_diff>
--- a/docs/manuscript/MAIN_TEXT.docx
+++ b/docs/manuscript/MAIN_TEXT.docx
@@ -2719,7 +2719,7 @@
               <a:graphicData uri="http://schemas.openxmlformats.org/drawingml/2006/picture">
                 <pic:pic>
                   <pic:nvPicPr>
-                    <pic:cNvPr descr="../../figures/fig_lmv_drift_groups.png" id="46" name="Picture"/>
+                    <pic:cNvPr descr="../../figures/fig8_lmv_drift_groups.png" id="46" name="Picture"/>
                     <pic:cNvPicPr>
                       <a:picLocks noChangeArrowheads="1" noChangeAspect="1"/>
                     </pic:cNvPicPr>
@@ -2784,7 +2784,7 @@
               <a:graphicData uri="http://schemas.openxmlformats.org/drawingml/2006/picture">
                 <pic:pic>
                   <pic:nvPicPr>
-                    <pic:cNvPr descr="../../figures/figS8_basin_pullout.png" id="49" name="Picture"/>
+                    <pic:cNvPr descr="../../figures/fig9_parkin_pullout.png" id="49" name="Picture"/>
                     <pic:cNvPicPr>
                       <a:picLocks noChangeArrowheads="1" noChangeAspect="1"/>
                     </pic:cNvPicPr>
@@ -2972,7 +2972,7 @@
               <a:graphicData uri="http://schemas.openxmlformats.org/drawingml/2006/picture">
                 <pic:pic>
                   <pic:nvPicPr>
-                    <pic:cNvPr descr="../../figures/fig1_regional.png" id="52" name="Picture"/>
+                    <pic:cNvPr descr="../../figures/fig10_regional.png" id="52" name="Picture"/>
                     <pic:cNvPicPr>
                       <a:picLocks noChangeArrowheads="1" noChangeAspect="1"/>
                     </pic:cNvPicPr>
@@ -3037,7 +3037,7 @@
               <a:graphicData uri="http://schemas.openxmlformats.org/drawingml/2006/picture">
                 <pic:pic>
                   <pic:nvPicPr>
-                    <pic:cNvPr descr="../../figures/fig9_within_region.png" id="55" name="Picture"/>
+                    <pic:cNvPr descr="../../figures/fig11_within_region.png" id="55" name="Picture"/>
                     <pic:cNvPicPr>
                       <a:picLocks noChangeArrowheads="1" noChangeAspect="1"/>
                     </pic:cNvPicPr>

</xml_diff>

<commit_message>
Sync main text: tighten Background, split comma-chained sentences
Match the working repo: de-duplicate the two Background paragraphs, split
eight long comma-chained sentences across Background/Methods/Results, and fix
two grammar errors. Rebuild docx/pdf.
</commit_message>
<xml_diff>
--- a/docs/manuscript/MAIN_TEXT.docx
+++ b/docs/manuscript/MAIN_TEXT.docx
@@ -2,7 +2,7 @@
 <file path=word/document.xml><?xml version="1.0" encoding="utf-8"?>
 <w:document xmlns:w="http://schemas.openxmlformats.org/wordprocessingml/2006/main" xmlns:m="http://schemas.openxmlformats.org/officeDocument/2006/math" xmlns:r="http://schemas.openxmlformats.org/officeDocument/2006/relationships" xmlns:o="urn:schemas-microsoft-com:office:office" xmlns:v="urn:schemas-microsoft-com:vml" xmlns:w10="urn:schemas-microsoft-com:office:word" xmlns:a="http://schemas.openxmlformats.org/drawingml/2006/main" xmlns:pic="http://schemas.openxmlformats.org/drawingml/2006/picture" xmlns:wp="http://schemas.openxmlformats.org/drawingml/2006/wordprocessingDrawing">
   <w:body>
-    <w:bookmarkStart w:id="242" w:name="X093902eb68652ea32f5548e74607f4e4b0f6699"/>
+    <w:bookmarkStart w:id="243" w:name="X093902eb68652ea32f5548e74607f4e4b0f6699"/>
     <w:p>
       <w:pPr>
         <w:pStyle w:val="Heading1"/>
@@ -203,273 +203,6 @@
       </w:r>
       <w:r>
         <w:t xml:space="preserve">. That interpretation is a specific claim about social structure in which the Parkin phase is treated as a bounded, hierarchically organized society with Parkin at its apex.</w:t>
-      </w:r>
-    </w:p>
-    <w:p>
-      <w:pPr>
-        <w:pStyle w:val="BodyText"/>
-      </w:pPr>
-      <w:r>
-        <w:t xml:space="preserve">Whether such an entity existed at Parkin is an empirical question. Settlement morphology alone cannot answer this question, since the presence of a primary center of interaction, a palisade, and a monumental mound is equally compatible with a landscape of competing peer communities as with a centralized and consolidated hierarchy</w:t>
-      </w:r>
-      <w:r>
-        <w:t xml:space="preserve"> </w:t>
-      </w:r>
-      <w:r>
-        <w:t xml:space="preserve">(King and Freer 1995; Rees 2001)</w:t>
-      </w:r>
-      <w:r>
-        <w:t xml:space="preserve">. The 16th-century historical chronicles describe Casqui and its neighbor Pacaha in open conflict, a relationship interpreted both as rivalry between competing peers and as a ranked order in which Casqui stood below Pacaha. Thus, if Parkin is indeed Casqui, the chronicles do not, by themselves, establish a single consolidated hierarchy over the Parkin phase</w:t>
-      </w:r>
-      <w:r>
-        <w:t xml:space="preserve"> </w:t>
-      </w:r>
-      <w:r>
-        <w:t xml:space="preserve">(Hudson et al. 1990; Phyllis A. Morse 1990)</w:t>
-      </w:r>
-      <w:r>
-        <w:t xml:space="preserve">. We ask, therefore, what the archaeological record shows when it is measured rather than interpreted through an assumed polity model. The record shows no evidence of hierarchy. Within the basin, settlement size is graded rather than redistributive. The regional production of the capacity-linked chert hoes whose control would mark an economic apex was decentralized, and their exchange followed a down-the-line gradient rather than central redistribution</w:t>
-      </w:r>
-      <w:r>
-        <w:t xml:space="preserve"> </w:t>
-      </w:r>
-      <w:r>
-        <w:t xml:space="preserve">(Cobb 2000)</w:t>
-      </w:r>
-      <w:r>
-        <w:t xml:space="preserve">. As we show below, the decorated-ceramic record also carries no clear signature of interaction closing in on bounded groups.</w:t>
-      </w:r>
-    </w:p>
-    <w:p>
-      <w:pPr>
-        <w:pStyle w:val="BodyText"/>
-      </w:pPr>
-      <w:r>
-        <w:t xml:space="preserve">The more revealing question is why Parkin was taken for a polity in the first place. The answer lies in the unit through which the record is interpreted, a matter the renewed debate over archaeological systematics has brought back into focus</w:t>
-      </w:r>
-      <w:r>
-        <w:t xml:space="preserve"> </w:t>
-      </w:r>
-      <w:r>
-        <w:t xml:space="preserve">(Lyman 2021)</w:t>
-      </w:r>
-      <w:r>
-        <w:t xml:space="preserve">. The Parkin phase is a culture-history construct, a set of assemblages grouped because their decorated-class frequencies seriate together and because the sites cluster in space</w:t>
-      </w:r>
-      <w:r>
-        <w:t xml:space="preserve"> </w:t>
-      </w:r>
-      <w:r>
-        <w:t xml:space="preserve">(Phillips et al. 1951)</w:t>
-      </w:r>
-      <w:r>
-        <w:t xml:space="preserve">. A social interpretation, however, goes beyond the definition. In the Phillips-Ford-Griffin framework, the phase is the basic space-time-cultural unit, defined by distinctive traits within a locality or region over a brief span, with no social criterion in the definition itself</w:t>
-      </w:r>
-      <w:r>
-        <w:t xml:space="preserve"> </w:t>
-      </w:r>
-      <w:r>
-        <w:t xml:space="preserve">(Phillips and Willey 1953; Willey and Phillips 1958)</w:t>
-      </w:r>
-      <w:r>
-        <w:t xml:space="preserve">. Willey and Phillips</w:t>
-      </w:r>
-      <w:r>
-        <w:t xml:space="preserve"> </w:t>
-      </w:r>
-      <w:r>
-        <w:t xml:space="preserve">(1958:48–49)</w:t>
-      </w:r>
-      <w:r>
-        <w:t xml:space="preserve"> </w:t>
-      </w:r>
-      <w:r>
-        <w:t xml:space="preserve">even set out the syllogism that would make a phase a society, component equals community, and phase equals a set of components, and then rejected it. In practice, however, though the chances are against archaeological phases having much social reality, they judged them as such and acted as if they did. Williams</w:t>
-      </w:r>
-      <w:r>
-        <w:t xml:space="preserve"> </w:t>
-      </w:r>
-      <w:r>
-        <w:t xml:space="preserve">(1954)</w:t>
-      </w:r>
-      <w:r>
-        <w:t xml:space="preserve">, defining the southeast-Missouri phases on which the regional scheme rests, adopted the social equation, writing that a phase probably equals a society. That equation, though disavowed at the source, is typically repeated in regional practice. This assumption about the unit phase is its silent premise. It holds that assemblages more similar to one another than to their neighbors record a bounded, mutually interacting social group. In the case where one can identify a group with a primate center, the phase then becomes a polity. The polity interpretation is, therefore, built into the unit before any independent evidence of hierarchy is weighed.</w:t>
-      </w:r>
-    </w:p>
-    <w:p>
-      <w:pPr>
-        <w:pStyle w:val="BodyText"/>
-      </w:pPr>
-      <w:r>
-        <w:t xml:space="preserve">The phase construct has been questioned on exactly this ground. Fox</w:t>
-      </w:r>
-      <w:r>
-        <w:t xml:space="preserve"> </w:t>
-      </w:r>
-      <w:r>
-        <w:t xml:space="preserve">(1998)</w:t>
-      </w:r>
-      <w:r>
-        <w:t xml:space="preserve"> </w:t>
-      </w:r>
-      <w:r>
-        <w:t xml:space="preserve">showed, for example, by cluster analysis and ordination, that the southeast-Missouri phases fail as both groups and classes, with their member assemblages assigned to statistical clusters at random rather than segregating by phase. Mainfort</w:t>
-      </w:r>
-      <w:r>
-        <w:t xml:space="preserve"> </w:t>
-      </w:r>
-      <w:r>
-        <w:t xml:space="preserve">(2003)</w:t>
-      </w:r>
-      <w:r>
-        <w:t xml:space="preserve"> </w:t>
-      </w:r>
-      <w:r>
-        <w:t xml:space="preserve">reached the same verdict by a different ordination, finding that the ordination of the late-period assemblages provides little support for the validity of the named phases, which overlap rather than forming discrete clusters. Lipo</w:t>
-      </w:r>
-      <w:r>
-        <w:t xml:space="preserve"> </w:t>
-      </w:r>
-      <w:r>
-        <w:t xml:space="preserve">(2001)</w:t>
-      </w:r>
-      <w:r>
-        <w:t xml:space="preserve"> </w:t>
-      </w:r>
-      <w:r>
-        <w:t xml:space="preserve">questions the nature of phases through frequency seriation, showing that the assemblages are structured rather than panmictic, and arguing that the resulting spatial groups have no warrant as societies. He</w:t>
-      </w:r>
-      <w:r>
-        <w:t xml:space="preserve"> </w:t>
-      </w:r>
-      <w:r>
-        <w:t xml:space="preserve">(2001:60)</w:t>
-      </w:r>
-      <w:r>
-        <w:t xml:space="preserve"> </w:t>
-      </w:r>
-      <w:r>
-        <w:t xml:space="preserve">suggests</w:t>
-      </w:r>
-      <w:r>
-        <w:t xml:space="preserve"> </w:t>
-      </w:r>
-      <w:r>
-        <w:t xml:space="preserve">“the phases themselves might be simply arbitrary spatial and temporal slices of a single interacting population that is much larger in size.”</w:t>
-      </w:r>
-    </w:p>
-    <w:p>
-      <w:pPr>
-        <w:pStyle w:val="BodyText"/>
-      </w:pPr>
-      <w:r>
-        <w:t xml:space="preserve">The silent premise, however, is tested only rarely and overlooks a strong alternative that offers a potentially falsifiable explanation for the observed patterns in the archaeological record. Viewed through the lens of social learning and models of cultural transmission, interaction is always continuous yet highly variable. Interaction is structured by distance and geography, as well as by social relationships. The task is to show how apparent differences between groups, such as phases, can arise under continuous interaction rather than requiring bounded groups. Under the neutral model of cultural transmission, decorative style behaves as a selectively neutral trait whose frequency drifts in a finite population of interacting learners</w:t>
-      </w:r>
-      <w:r>
-        <w:t xml:space="preserve"> </w:t>
-      </w:r>
-      <w:r>
-        <w:t xml:space="preserve">(Bentley et al. 2004; Dunnell 1978; Eerkens and Lipo 2007; Fogarty et al. 2024; Neiman 1995)</w:t>
-      </w:r>
-      <w:r>
-        <w:t xml:space="preserve">. When those learners interact more with near neighbors than with distant ones, drift on the spatially structured population generates similarity that is highest at short distances and fades with distance. Viewed at larger scales and divided into discrete units, that gradient looks like difference and clustering, with no bounded groups anywhere</w:t>
-      </w:r>
-      <w:r>
-        <w:t xml:space="preserve"> </w:t>
-      </w:r>
-      <w:r>
-        <w:t xml:space="preserve">(Lipo et al. 1997, 2021)</w:t>
-      </w:r>
-      <w:r>
-        <w:t xml:space="preserve">. Based on this account, a phase can be the ordinary residue of continuous, distance-structured interaction. The very pattern the culture-history tradition interprets as a society, assemblages near each other in space and in style, is what spatially structured drift predicts. Telling a real interaction group apart from spatially structured drift requires a test that the tradition never applied, because the seriation coherence and spatial proximity that define the phase are equally the products of drift</w:t>
-      </w:r>
-      <w:r>
-        <w:t xml:space="preserve"> </w:t>
-      </w:r>
-      <w:r>
-        <w:t xml:space="preserve">(Riede et al. 2019)</w:t>
-      </w:r>
-      <w:r>
-        <w:t xml:space="preserve">.</w:t>
-      </w:r>
-    </w:p>
-    <w:p>
-      <w:pPr>
-        <w:pStyle w:val="BodyText"/>
-      </w:pPr>
-      <w:r>
-        <w:t xml:space="preserve">Decorated ceramics provide an instrument for the test. Because stylistic variants are copied among potters through social-learning networks, the spatial and temporal structure of decorated-class frequencies reflects the structure of past interaction. A genuine social boundary, had one existed, would make learning appear conformist within groups and divergent between them, fragmenting the single drifting pool that continuous interaction maintains</w:t>
-      </w:r>
-      <w:r>
-        <w:t xml:space="preserve"> </w:t>
-      </w:r>
-      <w:r>
-        <w:t xml:space="preserve">(Lipo et al. 1997, 2010, 2015; Neiman 1995)</w:t>
-      </w:r>
-      <w:r>
-        <w:t xml:space="preserve">. The late pre-contact central Mississippi Valley is a favorable place to look, both because its decorated assemblages are well documented and because European contact and the subsequent demographic collapse ended the sequence before any later reorganization could overwrite it</w:t>
-      </w:r>
-      <w:r>
-        <w:t xml:space="preserve"> </w:t>
-      </w:r>
-      <w:r>
-        <w:t xml:space="preserve">(Cobb and Butler 2002)</w:t>
-      </w:r>
-      <w:r>
-        <w:t xml:space="preserve">. We first focus on the St. Francis basin, the setting of Parkin (Figure 1), and then extend the test to other late-period phases of the valley.</w:t>
-      </w:r>
-    </w:p>
-    <w:p>
-      <w:pPr>
-        <w:pStyle w:val="BodyText"/>
-      </w:pPr>
-      <w:r>
-        <w:t xml:space="preserve">The argument rests on a choice about what the ceramic record is. We do not treat an assemblage as a degraded snapshot of a past behavioral moment, to be restored by correcting for the processes that formed it</w:t>
-      </w:r>
-      <w:r>
-        <w:t xml:space="preserve"> </w:t>
-      </w:r>
-      <w:r>
-        <w:t xml:space="preserve">(Schiffer 1972)</w:t>
-      </w:r>
-      <w:r>
-        <w:t xml:space="preserve">. We treat it as what it is, a time-averaged accumulation whose decorated-class frequencies are the population-level residue of social learning, to be measured and explained directly rather than reconstructed</w:t>
-      </w:r>
-      <w:r>
-        <w:t xml:space="preserve"> </w:t>
-      </w:r>
-      <w:r>
-        <w:t xml:space="preserve">(Lipo et al. 2015; Neiman 1995)</w:t>
-      </w:r>
-      <w:r>
-        <w:t xml:space="preserve">. This is an evolutionary position in which the record is the evolving phenotype to be explained rather than a window onto a vanished behavioral system</w:t>
-      </w:r>
-      <w:r>
-        <w:t xml:space="preserve"> </w:t>
-      </w:r>
-      <w:r>
-        <w:t xml:space="preserve">(Dunnell 1978, 1980, 1995; Ladefoged and Graves 2000)</w:t>
-      </w:r>
-      <w:r>
-        <w:t xml:space="preserve">, and it converges with the recognition that the deposit is not a frozen tableau</w:t>
-      </w:r>
-      <w:r>
-        <w:t xml:space="preserve"> </w:t>
-      </w:r>
-      <w:r>
-        <w:t xml:space="preserve">(Binford 1981)</w:t>
-      </w:r>
-      <w:r>
-        <w:t xml:space="preserve">. The record’s coarse temporal resolution is not a defect to be removed but the scale at which long-term, population-level processes become legible</w:t>
-      </w:r>
-      <w:r>
-        <w:t xml:space="preserve"> </w:t>
-      </w:r>
-      <w:r>
-        <w:t xml:space="preserve">(Bailey 2007; Behrensmeyer et al. 2000; Holdaway and Wandsnider 2008; Perreault 2019; Stern 1994)</w:t>
-      </w:r>
-      <w:r>
-        <w:t xml:space="preserve">. Time-averaging, therefore, sets the resolution of the question rather than disqualifying it. A reorganization of transmission large enough to matter over the two centuries of the Parkin phase should register in the averaged frequency structure. Thus, a drift-versus-groups test must measure that structure directly rather than an imagined moment behind it.</w:t>
       </w:r>
     </w:p>
     <w:p>
@@ -554,7 +287,274 @@
         <w:pStyle w:val="BodyText"/>
       </w:pPr>
       <w:r>
-        <w:t xml:space="preserve">No single transmission signature can settle the question, because each is consistent with several processes: a departure from neutral copying, a spatial cline, or a rise in between-group variance can arise from drift, conformity, or environmental patchiness alike, an equifinality, the same pattern reached by different processes, that defeats one-signature inference</w:t>
+        <w:t xml:space="preserve">Whether such an entity existed at Parkin is an empirical question. Settlement morphology alone cannot answer this question, since the presence of a primary center of interaction, a palisade, and a monumental mound is equally compatible with a landscape of competing peer communities as with a centralized and consolidated hierarchy</w:t>
+      </w:r>
+      <w:r>
+        <w:t xml:space="preserve"> </w:t>
+      </w:r>
+      <w:r>
+        <w:t xml:space="preserve">(King and Freer 1995; Rees 2001)</w:t>
+      </w:r>
+      <w:r>
+        <w:t xml:space="preserve">. The 16th-century historical chronicles describe Casqui and its neighbor Pacaha in open conflict, a relationship interpreted both as rivalry between competing peers and as a ranked order in which Casqui stood below Pacaha. Thus, if Parkin is indeed Casqui, the chronicles do not, by themselves, establish a single consolidated hierarchy over the Parkin phase</w:t>
+      </w:r>
+      <w:r>
+        <w:t xml:space="preserve"> </w:t>
+      </w:r>
+      <w:r>
+        <w:t xml:space="preserve">(Hudson et al. 1990; Phyllis A. Morse 1990)</w:t>
+      </w:r>
+      <w:r>
+        <w:t xml:space="preserve">. We ask, therefore, what the archaeological record shows when it is measured rather than interpreted through an assumed polity model. The record shows no evidence of hierarchy. Within the basin, settlement size is graded rather than redistributive. The regional production of the capacity-linked chert hoes whose control would mark an economic apex was decentralized, and their exchange followed a down-the-line gradient rather than central redistribution</w:t>
+      </w:r>
+      <w:r>
+        <w:t xml:space="preserve"> </w:t>
+      </w:r>
+      <w:r>
+        <w:t xml:space="preserve">(Cobb 2000)</w:t>
+      </w:r>
+      <w:r>
+        <w:t xml:space="preserve">. As we show below, the decorated-ceramic record also carries no clear signature of interaction closing in on bounded groups.</w:t>
+      </w:r>
+    </w:p>
+    <w:p>
+      <w:pPr>
+        <w:pStyle w:val="BodyText"/>
+      </w:pPr>
+      <w:r>
+        <w:t xml:space="preserve">The more revealing question is why Parkin was taken for a polity in the first place. The answer lies in the unit through which the record is interpreted, a matter the renewed debate over archaeological systematics has brought back into focus</w:t>
+      </w:r>
+      <w:r>
+        <w:t xml:space="preserve"> </w:t>
+      </w:r>
+      <w:r>
+        <w:t xml:space="preserve">(Lyman 2021)</w:t>
+      </w:r>
+      <w:r>
+        <w:t xml:space="preserve">. The Parkin phase is a culture-history construct, a set of assemblages grouped because their decorated-class frequencies seriate together and because the sites cluster in space</w:t>
+      </w:r>
+      <w:r>
+        <w:t xml:space="preserve"> </w:t>
+      </w:r>
+      <w:r>
+        <w:t xml:space="preserve">(Phillips et al. 1951)</w:t>
+      </w:r>
+      <w:r>
+        <w:t xml:space="preserve">. A social interpretation, however, goes beyond the definition. In the Phillips-Ford-Griffin framework, the phase is the basic space-time-cultural unit, defined by distinctive traits within a locality or region over a brief span, with no social criterion in the definition itself</w:t>
+      </w:r>
+      <w:r>
+        <w:t xml:space="preserve"> </w:t>
+      </w:r>
+      <w:r>
+        <w:t xml:space="preserve">(Phillips and Willey 1953; Willey and Phillips 1958)</w:t>
+      </w:r>
+      <w:r>
+        <w:t xml:space="preserve">. Willey and Phillips</w:t>
+      </w:r>
+      <w:r>
+        <w:t xml:space="preserve"> </w:t>
+      </w:r>
+      <w:r>
+        <w:t xml:space="preserve">(1958:48–49)</w:t>
+      </w:r>
+      <w:r>
+        <w:t xml:space="preserve"> </w:t>
+      </w:r>
+      <w:r>
+        <w:t xml:space="preserve">even set out the syllogism that would make a phase a society, component equals community, and phase equals a set of components, and then rejected it. In practice, however, though the chances are against archaeological phases having much social reality, they judged them as such and acted as if they did. Williams</w:t>
+      </w:r>
+      <w:r>
+        <w:t xml:space="preserve"> </w:t>
+      </w:r>
+      <w:r>
+        <w:t xml:space="preserve">(1954)</w:t>
+      </w:r>
+      <w:r>
+        <w:t xml:space="preserve">, defining the southeast-Missouri phases on which the regional scheme rests, adopted the social equation, writing that a phase probably equals a society. That equation, though disavowed at the source, is typically repeated in regional practice. This assumption about the unit phase is its silent premise. It holds that assemblages more similar to one another than to their neighbors record a bounded, mutually interacting social group. In the case where one can identify a group with a primate center, the phase then becomes a polity. The polity interpretation is, therefore, built into the unit before any independent evidence of hierarchy is weighed.</w:t>
+      </w:r>
+    </w:p>
+    <w:p>
+      <w:pPr>
+        <w:pStyle w:val="BodyText"/>
+      </w:pPr>
+      <w:r>
+        <w:t xml:space="preserve">The phase construct has been questioned on exactly this ground. Fox</w:t>
+      </w:r>
+      <w:r>
+        <w:t xml:space="preserve"> </w:t>
+      </w:r>
+      <w:r>
+        <w:t xml:space="preserve">(1998)</w:t>
+      </w:r>
+      <w:r>
+        <w:t xml:space="preserve"> </w:t>
+      </w:r>
+      <w:r>
+        <w:t xml:space="preserve">showed, for example, by cluster analysis and ordination, that the southeast-Missouri phases fail as both groups and classes, with their member assemblages assigned to statistical clusters at random rather than segregating by phase. Mainfort</w:t>
+      </w:r>
+      <w:r>
+        <w:t xml:space="preserve"> </w:t>
+      </w:r>
+      <w:r>
+        <w:t xml:space="preserve">(2003)</w:t>
+      </w:r>
+      <w:r>
+        <w:t xml:space="preserve"> </w:t>
+      </w:r>
+      <w:r>
+        <w:t xml:space="preserve">reached the same verdict by a different ordination, finding that the ordination of the late-period assemblages provides little support for the validity of the named phases, which overlap rather than forming discrete clusters. Lipo</w:t>
+      </w:r>
+      <w:r>
+        <w:t xml:space="preserve"> </w:t>
+      </w:r>
+      <w:r>
+        <w:t xml:space="preserve">(2001)</w:t>
+      </w:r>
+      <w:r>
+        <w:t xml:space="preserve"> </w:t>
+      </w:r>
+      <w:r>
+        <w:t xml:space="preserve">questions the nature of phases through frequency seriation, showing that the assemblages are structured rather than panmictic, and arguing that the resulting spatial groups have no warrant as societies. He</w:t>
+      </w:r>
+      <w:r>
+        <w:t xml:space="preserve"> </w:t>
+      </w:r>
+      <w:r>
+        <w:t xml:space="preserve">(2001:60)</w:t>
+      </w:r>
+      <w:r>
+        <w:t xml:space="preserve"> </w:t>
+      </w:r>
+      <w:r>
+        <w:t xml:space="preserve">suggests</w:t>
+      </w:r>
+      <w:r>
+        <w:t xml:space="preserve"> </w:t>
+      </w:r>
+      <w:r>
+        <w:t xml:space="preserve">“the phases themselves might be simply arbitrary spatial and temporal slices of a single interacting population that is much larger in size.”</w:t>
+      </w:r>
+    </w:p>
+    <w:p>
+      <w:pPr>
+        <w:pStyle w:val="BodyText"/>
+      </w:pPr>
+      <w:r>
+        <w:t xml:space="preserve">The silent premise, however, is tested only rarely and overlooks a strong alternative that offers a potentially falsifiable explanation for the observed patterns in the archaeological record. Viewed through the lens of social learning and models of cultural transmission, interaction is always continuous yet highly variable. Interaction is structured by distance and geography, as well as by social relationships. The task is to show how apparent differences between groups, such as phases, can arise under continuous interaction rather than requiring bounded groups. Under the neutral model of cultural transmission, decorative style behaves as a selectively neutral trait whose frequency drifts in a finite population of interacting learners</w:t>
+      </w:r>
+      <w:r>
+        <w:t xml:space="preserve"> </w:t>
+      </w:r>
+      <w:r>
+        <w:t xml:space="preserve">(Bentley et al. 2004; Dunnell 1978; Eerkens and Lipo 2007; Fogarty et al. 2024; Neiman 1995)</w:t>
+      </w:r>
+      <w:r>
+        <w:t xml:space="preserve">. When those learners interact more with near neighbors than with distant ones, drift on the spatially structured population generates similarity that is highest at short distances and fades with distance. Viewed at larger scales and divided into discrete units, that gradient looks like difference and clustering, with no bounded groups anywhere</w:t>
+      </w:r>
+      <w:r>
+        <w:t xml:space="preserve"> </w:t>
+      </w:r>
+      <w:r>
+        <w:t xml:space="preserve">(Lipo et al. 1997, 2021)</w:t>
+      </w:r>
+      <w:r>
+        <w:t xml:space="preserve">. Based on this account, a phase can be the ordinary residue of continuous, distance-structured interaction. The very pattern the culture-history tradition interprets as a society, assemblages near each other in space and in style, is what spatially structured drift predicts. Telling a real interaction group apart from spatially structured drift requires a test that the tradition never applied, because the seriation coherence and spatial proximity that define the phase are equally the products of drift</w:t>
+      </w:r>
+      <w:r>
+        <w:t xml:space="preserve"> </w:t>
+      </w:r>
+      <w:r>
+        <w:t xml:space="preserve">(Riede et al. 2019)</w:t>
+      </w:r>
+      <w:r>
+        <w:t xml:space="preserve">.</w:t>
+      </w:r>
+    </w:p>
+    <w:p>
+      <w:pPr>
+        <w:pStyle w:val="BodyText"/>
+      </w:pPr>
+      <w:r>
+        <w:t xml:space="preserve">Decorated ceramics provide an instrument for the test. Because stylistic variants are copied among potters through social learning networks, the spatial and temporal structure of decorated-class frequencies reflects the structure of past interactions. A genuine social boundary, had one existed, would make learning appear conformist within groups and divergent between them, fragmenting the single drifting pool that continuous interaction maintains</w:t>
+      </w:r>
+      <w:r>
+        <w:t xml:space="preserve"> </w:t>
+      </w:r>
+      <w:r>
+        <w:t xml:space="preserve">(Lipo et al. 1997, 2010, 2015; Neiman 1995)</w:t>
+      </w:r>
+      <w:r>
+        <w:t xml:space="preserve">. The late pre-contact central Mississippi Valley is a favorable place to look, both because its decorated assemblages are well documented and because European contact and the subsequent demographic collapse ended the sequence before any later reorganization could overwrite it</w:t>
+      </w:r>
+      <w:r>
+        <w:t xml:space="preserve"> </w:t>
+      </w:r>
+      <w:r>
+        <w:t xml:space="preserve">(Cobb and Butler 2002)</w:t>
+      </w:r>
+      <w:r>
+        <w:t xml:space="preserve">. We first focus on the St. Francis basin, the setting of Parkin (Figure 1), and then extend the test to other late-period phases of the valley.</w:t>
+      </w:r>
+    </w:p>
+    <w:p>
+      <w:pPr>
+        <w:pStyle w:val="BodyText"/>
+      </w:pPr>
+      <w:r>
+        <w:t xml:space="preserve">The argument rests on a choice about what the ceramic record is. We do not treat an assemblage as a degraded snapshot of a past behavioral moment, to be restored by correcting for the processes that formed it</w:t>
+      </w:r>
+      <w:r>
+        <w:t xml:space="preserve"> </w:t>
+      </w:r>
+      <w:r>
+        <w:t xml:space="preserve">(Schiffer 1972)</w:t>
+      </w:r>
+      <w:r>
+        <w:t xml:space="preserve">. We treat it as what it is, a time-averaged accumulation whose decorated-class frequencies are the population-level residue of social learning, to be measured and explained directly rather than reconstructed</w:t>
+      </w:r>
+      <w:r>
+        <w:t xml:space="preserve"> </w:t>
+      </w:r>
+      <w:r>
+        <w:t xml:space="preserve">(Lipo et al. 2015; Neiman 1995)</w:t>
+      </w:r>
+      <w:r>
+        <w:t xml:space="preserve">. This is an evolutionary position in which the record is the evolving phenotype to be explained rather than a window onto a vanished behavioral system</w:t>
+      </w:r>
+      <w:r>
+        <w:t xml:space="preserve"> </w:t>
+      </w:r>
+      <w:r>
+        <w:t xml:space="preserve">(Dunnell 1978, 1980, 1995; Ladefoged and Graves 2000)</w:t>
+      </w:r>
+      <w:r>
+        <w:t xml:space="preserve">, and it converges with the recognition that the deposit is not a frozen tableau</w:t>
+      </w:r>
+      <w:r>
+        <w:t xml:space="preserve"> </w:t>
+      </w:r>
+      <w:r>
+        <w:t xml:space="preserve">(Binford 1981)</w:t>
+      </w:r>
+      <w:r>
+        <w:t xml:space="preserve">. The record’s coarse temporal resolution is not a defect to be removed but the scale at which long-term, population-level processes become legible</w:t>
+      </w:r>
+      <w:r>
+        <w:t xml:space="preserve"> </w:t>
+      </w:r>
+      <w:r>
+        <w:t xml:space="preserve">(Bailey 2007; Behrensmeyer et al. 2000; Holdaway and Wandsnider 2008; Perreault 2019; Stern 1994)</w:t>
+      </w:r>
+      <w:r>
+        <w:t xml:space="preserve">. Time-averaging, therefore, sets the resolution of the question rather than disqualifying it. A reorganization of transmission large enough to matter over the two centuries of the Parkin phase should register in the averaged frequency structure. Thus, a drift-versus-groups test must measure that structure directly rather than an imagined moment behind it.</w:t>
+      </w:r>
+    </w:p>
+    <w:p>
+      <w:pPr>
+        <w:pStyle w:val="BodyText"/>
+      </w:pPr>
+      <w:r>
+        <w:t xml:space="preserve">No single transmission signature can settle the question, because each is consistent with several processes. A departure from neutral copying, a spatial cline, or a rise in between-group variance can arise from drift, conformity, or environmental patchiness alike. This is an example of equifinality, in which the same pattern can be reached by different processes, undermining one-signature inferences</w:t>
       </w:r>
       <w:r>
         <w:t xml:space="preserve"> </w:t>
@@ -563,7 +563,7 @@
         <w:t xml:space="preserve">(Barrett 2019; Crema et al. 2016; Kandler and Shennan 2015; Mesoudi 2021)</w:t>
       </w:r>
       <w:r>
-        <w:t xml:space="preserve">. We therefore compare the two processes in a generative manner. We simulate neutral spatial drift and bounded groups on the real coordinate layout of the assemblages and ask which reproduces the observed structure, using four transmission signatures, departure from neutral copying, breakdown of frequency-seriation coherence, between-group variance, and spatial assortativity, as diagnostics of whether interaction has closed rather than as a stand-alone test. Because an archaeological assemblage is time-averaged and sampled to varying depth, a signature can register a difference that is an artifact of sampling rather than of transmission, so we calibrate the comparison to the record by a signal-recovery experiment: into synthetic assemblages matched to the real number, sample sizes, and time-averaging we inject a known signal of tunable strength and measure how strong a real boundary would have to be to register. Only a calibrated comparison can license the conclusion that an absence of group structure is real rather than a failure of resolution. This calibration is the transferable contribution, because before any similarity structure is interpreted as social, a record must be shown to be able to distinguish drift from groups at all.</w:t>
+        <w:t xml:space="preserve">. Therefore, we compare processes in a generative manner by simulating neutral spatial drift and bounded groups on the real coordinate layout of the assemblages. Using simulated data, we ask which measures can reproduce the observed structure, using four transmission signatures: departure from neutral copying, breakdown of frequency-seriation coherence, between-group variance, and spatial assortativity. Because archaeological assemblages are time-averaged and sampled, our measurements may potentially reflect differences that are artifacts of sampling rather than of transmission. Consequently, we calibrate our comparisons to the record using a signal-recovery experiment in which synthetic assemblages are matched to the real number, sample sizes, and time-averaging. We then inject a known signal of tunable strength and measure how strong a real boundary would have to be to register. This calibration enables us to conclude that the presence or absence of group structure is real, not a failure of resolution. This calibration is the transferable contribution, because before any similarity structure is interpreted as social, a record must be shown to be able to distinguish drift from groups at all.</w:t>
       </w:r>
     </w:p>
     <w:p>
@@ -571,11 +571,11 @@
         <w:pStyle w:val="BodyText"/>
       </w:pPr>
       <w:r>
-        <w:t xml:space="preserve">The argument proceeds in three steps. First, we evaluate Parkin as a hierarchy and find that no line of evidence, settlement, exchange, or transmission supports it. Second, we ask what generates the St. Francis basin phase structure, and show that neutral drift on the basin’s geography reproduces the observed signatures. A bounded-groups process would leave a far sharper structure than the data carry. Hence, the phase is a continuous interaction structured by where sites sit rather than a closed group with a boundary, and Parkin is a transmission bridge across orderings rather than the core of one. Third, we widen the test to the other late-period phases of the valley and ask whether any decorated-ceramic boundary exists. A boundary that exceeds neutral drift appears only between the central-valley and lower-valley blocks, and even there, it is confounded with the early-to-late turnover of the class repertoire. It cannot yet be interpreted as a synchronic social division. At the scale where the phase is drawn, it is largely indistinguishable from spatially structured drift, and Parkin is best understood as a prominent node in a continuous interaction field rather than the capital of a polity.</w:t>
+        <w:t xml:space="preserve">The argument proceeds in three steps. First, we evaluate Parkin as a hierarchy and find that no line of evidence, settlement, exchange, or transmission supports it. Second, we ask what generates the St. Francis basin phase structure, and show that neutral drift on the basin’s geography reproduces the observed signatures. A bounded-groups process would leave a far sharper structure than the data demonstrate. Hence, we conclude that the phase is a portion of a continuous interaction structure rather than a closed group with a boundary, and Parkin is a transmission bridge rather than the core of a group. Third, we widen the test to the other late-period phases of the valley and ask whether decorated-ceramic boundaries exist. A boundary that exceeds neutral drift appears only between the central-valley and lower-valley blocks, and even there, it is confounded with the early-to-late turnover of the class repertoire. It cannot yet be interpreted as a synchronic social division. At the scale where the phase is drawn, it is largely indistinguishable from spatially structured drift. We conclude that Parkin is best understood as a prominent node in a continuous interaction field rather than the capital of a polity.</w:t>
       </w:r>
     </w:p>
     <w:bookmarkEnd w:id="14"/>
-    <w:bookmarkStart w:id="17" w:name="background"/>
+    <w:bookmarkStart w:id="18" w:name="background"/>
     <w:p>
       <w:pPr>
         <w:pStyle w:val="Heading2"/>
@@ -598,7 +598,7 @@
         <w:pStyle w:val="FirstParagraph"/>
       </w:pPr>
       <w:r>
-        <w:t xml:space="preserve">We take a materialist approach to cultural transmission, which frames the question differently from how the central-valley record is usually interpreted. Archaeologists are trained to think with bounded units, the phase, the polity, the society, discrete entities with members and edges, and to interpret a cluster of similar assemblages as one of them. We treat transmission instead as a continuous and variable field of copying events among potters, a field with no intrinsic edges, in which interaction falls off with distance and learning can be more local in some places and times than in others. On this view, a group is not a thing with a boundary but a region where transmission has thickened, and similarity is a matter of degree set by how copying is distributed across space. That field can also close off by degree, interaction narrowing until potters copy mostly within a subset and rarely outside it, producing something that looks like the bounded groups archaeologists think with. The difficulty with the phase is that ordinary interaction already makes nearby assemblages more alike than distant ones, even without distance, so clusters by themselves prove nothing. What would mark a real bounded group is closure beyond what distance predicts, and that excess is the signal we test for.</w:t>
+        <w:t xml:space="preserve">In evaluating the phase concept, we take a materialist approach to cultural transmission. It frames the question of phases differently from how the central-valley record is usually interpreted. Archaeologists are traditionally trained to assume the past was made of bounded units: the phase, the polity, the society. These are treated as discrete entities with members and edges, and a cluster of similar assemblages is taken to be one of them. We treat transmission instead as a continuous, variable field of copying events among potters, with no intrinsic boundaries. Interaction falls off with distance, and learning is more local in some places and times than in others. A group, on this view, is not a thing with a boundary but a region where copying is locally intensified. Similarity is a matter of degree, set by how copying is distributed across space. That field can also close by degree. Interaction narrows until potters copy mostly within a subset and rarely outside it, producing something that resembles the bounded groups archaeologists assume.</w:t>
       </w:r>
     </w:p>
     <w:p>
@@ -606,7 +606,7 @@
         <w:pStyle w:val="BodyText"/>
       </w:pPr>
       <w:r>
-        <w:t xml:space="preserve">The phase concept gives the central-valley record its social structure. A phase is formed operationally as a set of assemblages that seriate together and cluster in space. It is interpreted, however, as a social entity equivalent to a bounded, interacting community, on the premise that assemblages are more alike within a phase than across its edges, thereby recording who interacted with whom</w:t>
+        <w:t xml:space="preserve">The phase gives the central-valley record its social structure. Operationally, a phase is a set of assemblages that seriate together and cluster in space. It is interpreted, however, as a social entity, a bounded interacting community, on the premise that assemblages are more alike within a phase than across its edges and so record who interacted with whom</w:t>
       </w:r>
       <w:r>
         <w:t xml:space="preserve"> </w:t>
@@ -615,7 +615,7 @@
         <w:t xml:space="preserve">(McNutt 1996; Morse and Morse 1983; Phillips et al. 1951; Williams 1954)</w:t>
       </w:r>
       <w:r>
-        <w:t xml:space="preserve">. The premise is not arbitrary. Under the neutral transmission model, it would hold if learning were confined within social boundaries, so that decoration drifted in separate pools and diverged between them. The difficulty is that the same pattern arises with no boundary at all when interaction declines with distance, because spatially structured drift concentrates similarity among near neighbors, the isolation-by-distance expectation for cultural similarity</w:t>
+        <w:t xml:space="preserve">. The premise is not arbitrary. Under the neutral transmission model it would hold if learning were confined within social boundaries, so that decoration drifted in separate pools and diverged between them. The difficulty is that the same pattern arises with no boundary at all. When interaction declines with distance, spatially structured drift concentrates similarity among near neighbors, the isolation-by-distance expectation for cultural similarity</w:t>
       </w:r>
       <w:r>
         <w:t xml:space="preserve"> </w:t>
@@ -624,7 +624,7 @@
         <w:t xml:space="preserve">(Lipo et al. 2021; Neiman 1995; Shennan et al. 2015)</w:t>
       </w:r>
       <w:r>
-        <w:t xml:space="preserve">. The question the ceramic record must answer is the operational one: does the similarity structure record bounded interaction, or spatially structured drift? Throughout, we call decoration that is transmitted preferentially within a group and diverges between groups a marker, rather than a neutral style drifting in a single shared pool. A marker is the ceramic expression, the empirical proxy, of interaction closing into a bounded group, so the drift-versus-groups question is equivalently a question of neutral style versus marker.</w:t>
+        <w:t xml:space="preserve">. A cluster of similar assemblages therefore need not record a bounded group. What would mark a real bounded group is closure beyond what distance predicts, and that excess is the signal we test for. The operational question is whether the similarity structure records bounded interaction or spatially structured drift. Throughout, we call decoration transmitted preferentially within a group and divergent between groups a marker, as opposed to a neutral style drifting in one shared pool. A marker is the ceramic proxy for interaction closing into a bounded group, so the drift-versus-groups question is equivalently a question of neutral style versus marker.</w:t>
       </w:r>
     </w:p>
     <w:bookmarkEnd w:id="15"/>
@@ -718,11 +718,127 @@
       <w:r>
         <w:t xml:space="preserve">.</w:t>
       </w:r>
-      <w:r>
-        <w:t xml:space="preserve"> </w:t>
-      </w:r>
-      <w:r>
-        <w:t xml:space="preserve">### The central Mississippi Valley case and two competing hypotheses</w:t>
+    </w:p>
+    <w:bookmarkEnd w:id="16"/>
+    <w:bookmarkStart w:id="17" w:name="X79776d0f91cd476f657decdd7eaf044172461c8"/>
+    <w:p>
+      <w:pPr>
+        <w:pStyle w:val="Heading3"/>
+      </w:pPr>
+      <w:r>
+        <w:t xml:space="preserve">The central Mississippi Valley case and two competing hypotheses</w:t>
+      </w:r>
+    </w:p>
+    <w:p>
+      <w:pPr>
+        <w:pStyle w:val="FirstParagraph"/>
+      </w:pPr>
+      <w:r>
+        <w:t xml:space="preserve">The late pre-contact central Mississippi Valley supports two interpretations of the same record, and they make opposite predictions for the transmission signature. The first holds that the region was moving toward greater complexity. In northeastern Arkansas the Parkin phase (ca. A.D. 1400 to 1600, with a thin protohistoric tail, consistent with the basin radiocarbon reported below) is a dense cluster of fortified, moated St-Francis-type towns along the St. Francis and Tyronza rivers. It is dominated by the Parkin site, a roughly 17-acre palisaded center whose platform mound rises more than 6 m, which the De Soto chronicles place as the seat of the paramount of Casqui</w:t>
+      </w:r>
+      <w:r>
+        <w:t xml:space="preserve"> </w:t>
+      </w:r>
+      <w:r>
+        <w:t xml:space="preserve">(Dye and Cox 1990; Mitchem 2001; Phyllis A. Morse 1990)</w:t>
+      </w:r>
+      <w:r>
+        <w:t xml:space="preserve">. Based on this information, Parkin’s location on agriculturally poor soil suggests that it drew tribute from smaller villages, a hallmark of an emerging chiefly hierarchy</w:t>
+      </w:r>
+      <w:r>
+        <w:t xml:space="preserve"> </w:t>
+      </w:r>
+      <w:r>
+        <w:t xml:space="preserve">(Phyllis A. Morse 1990)</w:t>
+      </w:r>
+      <w:r>
+        <w:t xml:space="preserve">. Because contact and the demographic collapse associated with the protohistoric</w:t>
+      </w:r>
+      <w:r>
+        <w:t xml:space="preserve"> </w:t>
+      </w:r>
+      <w:r>
+        <w:t xml:space="preserve">“Vacant Quarter”</w:t>
+      </w:r>
+      <w:r>
+        <w:t xml:space="preserve"> </w:t>
+      </w:r>
+      <w:r>
+        <w:t xml:space="preserve">(Williams 1990)</w:t>
+      </w:r>
+      <w:r>
+        <w:t xml:space="preserve"> </w:t>
+      </w:r>
+      <w:r>
+        <w:t xml:space="preserve">interrupted the sequence, any such transition would have been truncated before it could consolidate and overwrite its own beginnings</w:t>
+      </w:r>
+      <w:r>
+        <w:t xml:space="preserve"> </w:t>
+      </w:r>
+      <w:r>
+        <w:t xml:space="preserve">(Cobb and Butler 2002; Morse and Morse 1996)</w:t>
+      </w:r>
+      <w:r>
+        <w:t xml:space="preserve">. We treat this truncation as a working premise rather than a settled fact, since the timing and extent of the Vacant Quarter abandonment relative to the Parkin phase remain debated</w:t>
+      </w:r>
+      <w:r>
+        <w:t xml:space="preserve"> </w:t>
+      </w:r>
+      <w:r>
+        <w:t xml:space="preserve">(Cobb et al. 2024; Cobb and Butler 2002)</w:t>
+      </w:r>
+      <w:r>
+        <w:t xml:space="preserve">. The second interpretation holds that the central valley was a stable, non-consolidated landscape of competing peer polities that never reorganized into a regional hierarchy</w:t>
+      </w:r>
+      <w:r>
+        <w:t xml:space="preserve"> </w:t>
+      </w:r>
+      <w:r>
+        <w:t xml:space="preserve">(Anderson 1996; Beck 2003; Blitz 1999; King and Freer 1995; Lulewicz 2019; Milner 1998; Rees 2001)</w:t>
+      </w:r>
+      <w:r>
+        <w:t xml:space="preserve">. The chronicles describe Casqui and its neighbor, Pacaha, in open conflict, which fits within a landscape of competing peers. The same sources have also been interpreted as ranking Casqui below Pacaha, and the chronicle ethnography is thin and filtered</w:t>
+      </w:r>
+      <w:r>
+        <w:t xml:space="preserve"> </w:t>
+      </w:r>
+      <w:r>
+        <w:t xml:space="preserve">(Hudson et al. 1990; Mitchem 2001; Phyllis A. Morse 1990)</w:t>
+      </w:r>
+      <w:r>
+        <w:t xml:space="preserve">. The two cannot be separated by settlement morphology alone. They can be separated by determining whether the transmission record shows interaction closing into bounded groups, which is the test we now construct.</w:t>
+      </w:r>
+    </w:p>
+    <w:bookmarkEnd w:id="17"/>
+    <w:bookmarkEnd w:id="18"/>
+    <w:bookmarkStart w:id="22" w:name="Xe1cc53abb112c2b395e3beee2af5ceb0aad4bed"/>
+    <w:p>
+      <w:pPr>
+        <w:pStyle w:val="Heading2"/>
+      </w:pPr>
+      <w:r>
+        <w:t xml:space="preserve">Distinguishing true group structure from spatially structured drift</w:t>
+      </w:r>
+    </w:p>
+    <w:p>
+      <w:pPr>
+        <w:pStyle w:val="FirstParagraph"/>
+      </w:pPr>
+      <w:r>
+        <w:t xml:space="preserve">The test rests on one principle: a process that genuinely reorganizes a population into groups leaves a mark on every aspect of how pottery styles were copied, whereas a process that merely mimics group structure marks only some aspects. The reorganization at issue, which we call the closure of interaction, is central to the rest of the paper, so we define it plainly. In an open community, a potter can learn a design from anyone she encounters, near or far, so styles circulate through one connected population. Interaction closes when that circulation narrows: potters come to copy mostly from others inside their own group and rarely from anyone outside it, until a once-continuous field of social learning breaks into separate pools that drift apart. Closure is the process a genuine bounded interaction group undergoes, and we treat its strength as a quantity that runs from none (one fully open field of learning), through partial, to complete (sealed, non-interacting groups). That strength is what the test sets out to measure, and in the synthetic experiments below, we tune it as a parameter,</w:t>
+      </w:r>
+      <w:r>
+        <w:t xml:space="preserve"> </w:t>
+      </w:r>
+      <w:r>
+        <w:rPr>
+          <w:i/>
+          <w:iCs/>
+        </w:rPr>
+        <w:t xml:space="preserve">s</w:t>
+      </w:r>
+      <w:r>
+        <w:t xml:space="preserve">, from 0 (pure drift, no closure) to 1 (strongly bounded, sharply separated groups). The four signatures are each a different consequence of closure, and we state each first in plain terms before naming its formal measure.</w:t>
       </w:r>
     </w:p>
     <w:p>
@@ -730,111 +846,16 @@
         <w:pStyle w:val="BodyText"/>
       </w:pPr>
       <w:r>
-        <w:t xml:space="preserve">The late pre-contact central Mississippi Valley supports two interpretations of the same record, and they make opposite predictions for the transmission signature. The first holds that the region was moving toward greater complexity. In northeastern Arkansas the Parkin phase (ca. A.D. 1400 to 1600, with a thin protohistoric tail, consistent with the basin radiocarbon reported below) is a dense cluster of fortified, moated St-Francis-type towns along the St. Francis and Tyronza rivers, dominated by the Parkin site, a roughly 17-acre palisaded center with a platform mound rising more than 6 m that the De Soto chronicles place as the seat of the paramount of Casqui</w:t>
-      </w:r>
-      <w:r>
-        <w:t xml:space="preserve"> </w:t>
-      </w:r>
-      <w:r>
-        <w:t xml:space="preserve">(Dye and Cox 1990; Mitchem 2001; Phyllis A. Morse 1990)</w:t>
-      </w:r>
-      <w:r>
-        <w:t xml:space="preserve">. Based on this information, Parkin’s location on agriculturally poor soil suggests that it drew tribute from smaller villages, a hallmark of an emerging chiefly hierarchy</w:t>
-      </w:r>
-      <w:r>
-        <w:t xml:space="preserve"> </w:t>
-      </w:r>
-      <w:r>
-        <w:t xml:space="preserve">(Phyllis A. Morse 1990)</w:t>
-      </w:r>
-      <w:r>
-        <w:t xml:space="preserve">. Because contact and the demographic collapse associated with the protohistoric</w:t>
-      </w:r>
-      <w:r>
-        <w:t xml:space="preserve"> </w:t>
-      </w:r>
-      <w:r>
-        <w:t xml:space="preserve">“Vacant Quarter”</w:t>
-      </w:r>
-      <w:r>
-        <w:t xml:space="preserve"> </w:t>
-      </w:r>
-      <w:r>
-        <w:t xml:space="preserve">(Williams 1990)</w:t>
-      </w:r>
-      <w:r>
-        <w:t xml:space="preserve"> </w:t>
-      </w:r>
-      <w:r>
-        <w:t xml:space="preserve">interrupted the sequence, any such transition would have been truncated before it could consolidate and overwrite its own beginnings</w:t>
-      </w:r>
-      <w:r>
-        <w:t xml:space="preserve"> </w:t>
-      </w:r>
-      <w:r>
-        <w:t xml:space="preserve">(Cobb and Butler 2002; Morse and Morse 1996)</w:t>
-      </w:r>
-      <w:r>
-        <w:t xml:space="preserve">. We treat this truncation as a working premise rather than a settled fact, since the timing and extent of the Vacant Quarter abandonment relative to the Parkin phase remain debated</w:t>
-      </w:r>
-      <w:r>
-        <w:t xml:space="preserve"> </w:t>
-      </w:r>
-      <w:r>
-        <w:t xml:space="preserve">(Cobb et al. 2024; Cobb and Butler 2002)</w:t>
-      </w:r>
-      <w:r>
-        <w:t xml:space="preserve">. The second interpretation holds that the central valley was a stable, non-consolidated landscape of competing peer polities that never reorganized into a regional hierarchy</w:t>
-      </w:r>
-      <w:r>
-        <w:t xml:space="preserve"> </w:t>
-      </w:r>
-      <w:r>
-        <w:t xml:space="preserve">(Anderson 1996; Beck 2003; Blitz 1999; King and Freer 1995; Lulewicz 2019; Milner 1998; Rees 2001)</w:t>
-      </w:r>
-      <w:r>
-        <w:t xml:space="preserve">. The chronicles describe Casqui and its neighbor Pacaha in open conflict, which fits a landscape of competing peers. The same sources have also been interpreted as ranking Casqui below Pacaha, and the chronicle ethnography is thin and filtered</w:t>
-      </w:r>
-      <w:r>
-        <w:t xml:space="preserve"> </w:t>
-      </w:r>
-      <w:r>
-        <w:t xml:space="preserve">(Hudson et al. 1990; Mitchem 2001; Phyllis A. Morse 1990)</w:t>
-      </w:r>
-      <w:r>
-        <w:t xml:space="preserve">. The two cannot be separated by settlement morphology alone. They can be separated by determining whether the transmission record shows interaction closing into bounded groups, which is the test we now construct.</w:t>
-      </w:r>
-    </w:p>
-    <w:bookmarkEnd w:id="16"/>
-    <w:bookmarkEnd w:id="17"/>
-    <w:bookmarkStart w:id="21" w:name="Xe1cc53abb112c2b395e3beee2af5ceb0aad4bed"/>
-    <w:p>
-      <w:pPr>
-        <w:pStyle w:val="Heading2"/>
-      </w:pPr>
-      <w:r>
-        <w:t xml:space="preserve">Distinguishing true group structure from spatially structured drift</w:t>
-      </w:r>
-    </w:p>
-    <w:p>
-      <w:pPr>
-        <w:pStyle w:val="FirstParagraph"/>
-      </w:pPr>
-      <w:r>
-        <w:t xml:space="preserve">The test rests on one principle: a process that genuinely reorganizes a population into groups leaves a mark on every aspect of how pottery styles were copied, whereas a process that merely mimics group structure marks only some aspects. The reorganization at issue, which we call the closure of interaction, is central to the rest of the paper, so we define it plainly. In an open community, a potter can learn a design from anyone she encounters, near or far, so styles circulate through one connected population. Interaction closes when that circulation narrows: potters come to copy mostly from others inside their own group and rarely from anyone outside it, until a once-continuous field of social learning breaks into separate pools that drift apart. Closure is the process a genuine bounded interaction group undergoes, and we treat its strength as a quantity that runs from none (one fully open field of learning), through partial, to complete (sealed, non-interacting groups). That strength is what the test sets out to measure, and in the synthetic experiments below, we tune it as a parameter,</w:t>
-      </w:r>
-      <w:r>
-        <w:t xml:space="preserve"> </w:t>
-      </w:r>
-      <w:r>
-        <w:rPr>
-          <w:i/>
-          <w:iCs/>
-        </w:rPr>
-        <w:t xml:space="preserve">s</w:t>
-      </w:r>
-      <w:r>
-        <w:t xml:space="preserve">, from 0 (pure drift, no closure) to 1 (strong, sharply bounded groups). The four signatures are each a different consequence of closure, and we state each first in plain terms before naming its formal measure.</w:t>
+        <w:t xml:space="preserve">The first asks whether potters copied decorated styles at random or with a bias. Under unbiased copying, where a potter is as likely to reproduce any design she encounters as any other, two independent ways of gauging an assemblage’s diversity agree. One is based on homozygosity, a measure borrowed from genetics. This property reflects the probability that two sherds drawn at random from an assemblage share the same decorated class, which is high when a few classes dominate. The other is based on richness, the number of classes in which sherds are identified. Each yields an estimate of the same underlying transmission parameter, and under random copying, the two estimates coincide. Conformity, in which potters disproportionately copy whatever is already common, is a process that will concentrate frequency to a few ceramic classes. It raises homozygosity, lowering the homozygosity-based estimate while leaving richness little changed, pulling the two apart. A taste for novelty does the reverse. The disagreement between the two estimates, expressed as their ratio, therefore both detect a departure from random copying and show which way it leans</w:t>
+      </w:r>
+      <w:r>
+        <w:t xml:space="preserve"> </w:t>
+      </w:r>
+      <w:r>
+        <w:t xml:space="preserve">(Neiman 1995; Shennan and Wilkinson 2001)</w:t>
+      </w:r>
+      <w:r>
+        <w:t xml:space="preserve">. This matters here because a bounded group that enforced a shared decorative marker would copy conformist behavior even to the edges of its boundaries. As a result, the two estimates would diverge, whereas a single pool of styles drifting at random would keep them equal.</w:t>
       </w:r>
     </w:p>
     <w:p>
@@ -842,16 +863,44 @@
         <w:pStyle w:val="BodyText"/>
       </w:pPr>
       <w:r>
-        <w:t xml:space="preserve">The first asks whether potters copied decorated styles at random or with a bias. Under unbiased copying, where a potter is as likely to reproduce any design she encounters as any other, two independent ways of gauging an assemblage’s diversity agree. One is based on homozygosity, a measure borrowed from genetics. This property reflects the probability that two sherds drawn at random from an assemblage share the same decorated class, which is high when a few classes dominate. The other is based on richness, the number of classes in which sherds are identified. Each yields an estimate of the same underlying transmission parameter, and under random copying, the two estimates coincide. Conformity, in which potters disproportionately copy whatever is already common, is a process that will concentrate frequency to a few ceramic classes. It raises homozygosity, lowering the homozygosity-based estimate while leaving richness little changed, pulling the two apart. A taste for novelty does the reverse. The disagreement between the two estimates, expressed as their ratio, therefore both detect a departure from random copying and show which way it leans</w:t>
-      </w:r>
-      <w:r>
-        <w:t xml:space="preserve"> </w:t>
-      </w:r>
-      <w:r>
-        <w:t xml:space="preserve">(Neiman 1995; Shennan and Wilkinson 2001)</w:t>
-      </w:r>
-      <w:r>
-        <w:t xml:space="preserve">. This matters here because a bounded group that enforced a shared decorative marker would copy conformist behavior even to the edges of its boundaries. As a result, the two estimates would diverge, whereas a single pool of styles drifting at random would keep them equal.</w:t>
+        <w:t xml:space="preserve">The second asks whether the assemblages all belong to one interacting community or to several, and it is the most direct test of fragmentation. It rests on frequency seriation, the classic archaeological method of ordering assemblages so that each decorated class’s relative frequency rises to a single peak and then falls away, the shape long known as a battleship curve. That single-peaked rise and fall is what a style traces when it is introduced, becomes popular, and is abandoned within one community, drawing on a shared pool of designs. In classical uses of seriation, all available assemblages were typically pooled into a single seriation, and deviations from the frequency guidelines were dismissed as sampling error. Sampling error certainly needs to be accounted for. Classical practice, however, ignores the most valuable aspect of the method: a</w:t>
+      </w:r>
+      <w:r>
+        <w:t xml:space="preserve"> </w:t>
+      </w:r>
+      <w:r>
+        <w:rPr>
+          <w:i/>
+          <w:iCs/>
+        </w:rPr>
+        <w:t xml:space="preserve">failure to seriate together</w:t>
+      </w:r>
+      <w:r>
+        <w:t xml:space="preserve"> </w:t>
+      </w:r>
+      <w:r>
+        <w:t xml:space="preserve">indicates that locales are far enough</w:t>
+      </w:r>
+      <w:r>
+        <w:t xml:space="preserve"> </w:t>
+      </w:r>
+      <w:r>
+        <w:t xml:space="preserve">“out of step”</w:t>
+      </w:r>
+      <w:r>
+        <w:t xml:space="preserve"> </w:t>
+      </w:r>
+      <w:r>
+        <w:t xml:space="preserve">with the surrounding flow of interaction and social learning that their interaction history has interesting structure</w:t>
+      </w:r>
+      <w:r>
+        <w:t xml:space="preserve"> </w:t>
+      </w:r>
+      <w:r>
+        <w:t xml:space="preserve">(2015)</w:t>
+      </w:r>
+      <w:r>
+        <w:t xml:space="preserve">.</w:t>
       </w:r>
     </w:p>
     <w:p>
@@ -859,35 +908,19 @@
         <w:pStyle w:val="BodyText"/>
       </w:pPr>
       <w:r>
-        <w:t xml:space="preserve">The second asks whether the assemblages all belong to one interacting community or to several, and it is the most direct test of fragmentation. It rests on frequency seriation, the classic archaeological method of ordering assemblages so that each decorated class’s relative frequency rises to a single peak and then falls away, the shape long known as a battleship curve. That single-peaked rise and fall is what a style traces when it is introduced, becomes popular, and is abandoned within one community, drawing on a shared pool of designs. In classical uses of seriation, all available assemblages were typically pooled into a single seriation, and deviations from the frequency guidelines were dismissed as sampling error. Sampling error certainly needs to be accounted for. Classical practice, however, ignores the most valuable aspect of the method: a</w:t>
-      </w:r>
-      <w:r>
-        <w:t xml:space="preserve"> </w:t>
-      </w:r>
-      <w:r>
-        <w:rPr>
-          <w:i/>
-          <w:iCs/>
-        </w:rPr>
-        <w:t xml:space="preserve">failure to seriate together</w:t>
-      </w:r>
-      <w:r>
-        <w:t xml:space="preserve"> </w:t>
-      </w:r>
-      <w:r>
-        <w:t xml:space="preserve">tells us when locales are far enough</w:t>
-      </w:r>
-      <w:r>
-        <w:t xml:space="preserve"> </w:t>
-      </w:r>
-      <w:r>
-        <w:t xml:space="preserve">“out of step”</w:t>
-      </w:r>
-      <w:r>
-        <w:t xml:space="preserve"> </w:t>
-      </w:r>
-      <w:r>
-        <w:t xml:space="preserve">with the surrounding flow of interaction and social learning that their interaction history has interesting structure</w:t>
+        <w:t xml:space="preserve">A set of assemblages is</w:t>
+      </w:r>
+      <w:r>
+        <w:t xml:space="preserve"> </w:t>
+      </w:r>
+      <w:r>
+        <w:t xml:space="preserve">“co-seriable”</w:t>
+      </w:r>
+      <w:r>
+        <w:t xml:space="preserve"> </w:t>
+      </w:r>
+      <w:r>
+        <w:t xml:space="preserve">when a single ordering can make every class follow the same single-peaked shape simultaneously. When all assemblages arise from a single continuously interacting population, such an ordering exists. When learning splits into separate groups, each with its own repertoire and its own independent rise and fall of styles, no single ordering can satisfy every class at once, and the assemblages break into several mutually incompatible orderings. The deterministic frequency-seriation procedure of Lipo, Madsen, and Dunnell</w:t>
       </w:r>
       <w:r>
         <w:t xml:space="preserve"> </w:t>
@@ -896,7 +929,19 @@
         <w:t xml:space="preserve">(2015)</w:t>
       </w:r>
       <w:r>
-        <w:t xml:space="preserve">.</w:t>
+        <w:t xml:space="preserve"> </w:t>
+      </w:r>
+      <w:r>
+        <w:t xml:space="preserve">finds the complete set of these maximal co-seriable groups algorithmically, without the analyst arranging the assemblages by eye</w:t>
+      </w:r>
+      <w:r>
+        <w:t xml:space="preserve"> </w:t>
+      </w:r>
+      <w:r>
+        <w:t xml:space="preserve">(Lipo et al. 1997)</w:t>
+      </w:r>
+      <w:r>
+        <w:t xml:space="preserve">. The number of groups and the number of groups any one site joins directly measure the structure of past interaction. A single large group means one connected field of learning, a proliferation of small groups means a fragmented one, and a site that falls into several incompatible orderings is a bridge linking otherwise separate sequences rather than the closed core of a bounded community.</w:t>
       </w:r>
     </w:p>
     <w:p>
@@ -904,47 +949,6 @@
         <w:pStyle w:val="BodyText"/>
       </w:pPr>
       <w:r>
-        <w:t xml:space="preserve">A set of assemblages is</w:t>
-      </w:r>
-      <w:r>
-        <w:t xml:space="preserve"> </w:t>
-      </w:r>
-      <w:r>
-        <w:t xml:space="preserve">“co-seriable”</w:t>
-      </w:r>
-      <w:r>
-        <w:t xml:space="preserve"> </w:t>
-      </w:r>
-      <w:r>
-        <w:t xml:space="preserve">when a single ordering can make every class follow the same single-peaked shape simultaneously. When all assemblages arise from a single continuously interacting population, such an ordering exists. When learning splits into separate groups, each with its own repertoire and its own independent rise and fall of styles, no single ordering can satisfy every class at once, and the assemblages break into several mutually incompatible orderings. The deterministic frequency-seriation procedure of Lipo, Madsen, and Dunnell</w:t>
-      </w:r>
-      <w:r>
-        <w:t xml:space="preserve"> </w:t>
-      </w:r>
-      <w:r>
-        <w:t xml:space="preserve">(2015)</w:t>
-      </w:r>
-      <w:r>
-        <w:t xml:space="preserve"> </w:t>
-      </w:r>
-      <w:r>
-        <w:t xml:space="preserve">finds the complete set of these maximal co-seriable groups algorithmically, without the analyst arranging the assemblages by eye</w:t>
-      </w:r>
-      <w:r>
-        <w:t xml:space="preserve"> </w:t>
-      </w:r>
-      <w:r>
-        <w:t xml:space="preserve">(Lipo et al. 1997)</w:t>
-      </w:r>
-      <w:r>
-        <w:t xml:space="preserve">. The number of groups and the number of groups any one site joins directly measure the structure of past interaction. A single large group means one connected field of learning, a proliferation of small groups means a fragmented one, and a site that falls into several incompatible orderings is a bridge linking otherwise separate sequences rather than the closed core of a bounded community.</w:t>
-      </w:r>
-    </w:p>
-    <w:p>
-      <w:pPr>
-        <w:pStyle w:val="BodyText"/>
-      </w:pPr>
-      <w:r>
         <w:t xml:space="preserve">The third asks how much of the variation in decoration lies between groups rather than within them. The measure is a cultural version of Wright’s F_ST</w:t>
       </w:r>
       <w:r>
@@ -954,7 +958,7 @@
         <w:t xml:space="preserve">(Wright 1951)</w:t>
       </w:r>
       <w:r>
-        <w:t xml:space="preserve">, a standard population-genetic index of group differentiation, applied to cultural transmission where between-group variation in socially learned traits routinely exceeds its genetic counterpart</w:t>
+        <w:t xml:space="preserve">, a standard population-genetic index of group differentiation. In cultural transmission, between-group variation in socially learned traits routinely exceeds its genetic counterpart</w:t>
       </w:r>
       <w:r>
         <w:t xml:space="preserve"> </w:t>
@@ -963,7 +967,7 @@
         <w:t xml:space="preserve">(Bell et al. 2009)</w:t>
       </w:r>
       <w:r>
-        <w:t xml:space="preserve">, computed here on Gini-Simpson diversity, the chance that two sherds drawn at random from a assemblage are of different classes. F_ST is the share of the total diversity that is due to differences between groups rather than to variation within them. When every assemblage draws on one shared, drifting pool of styles, between-group differences are small and F_ST sits near zero. As groups come to favor distinct repertoires, the between-group share grows and F_ST climbs</w:t>
+        <w:t xml:space="preserve">. We compute it here on Gini-Simpson diversity, the chance that two sherds drawn at random from an assemblage are of different classes. F_ST is the share of the total diversity that is due to differences between groups rather than to variation within them. When every assemblage draws on one shared, drifting pool of styles, between-group differences are small, and F_ST sits near zero. As groups come to favor distinct repertoires, the between-group share grows, and F_ST climbs</w:t>
       </w:r>
       <w:r>
         <w:t xml:space="preserve"> </w:t>
@@ -972,7 +976,7 @@
         <w:t xml:space="preserve">(Neiman 1995)</w:t>
       </w:r>
       <w:r>
-        <w:t xml:space="preserve">. It serves here as the most direct measure of how far decoration has sorted itself by group, with one important caveat developed below. Stochastic drift on a spatially structured population generates between-group variance on its own. Subpopulations retain different amounts of diversity depending on their size and connectivity: small or sparsely connected areas drift to depleted, idiosyncratic repertoires, while larger, well-connected ones stay richer. The resulting differences appear as distinct interacting groups even though they are produced by spatial position alone</w:t>
+        <w:t xml:space="preserve">. It serves here as the most direct measure of how far decoration has sorted itself by group, with one important caveat developed below. Stochastic drift on a spatially structured population generates between-group variance on its own. Subpopulations retain different levels of diversity depending on their size and connectivity: small or sparsely connected areas drift toward depleted, idiosyncratic repertoires, while larger, well-connected ones remain richer. The resulting differences appear as distinct interacting groups, even though they are produced solely by spatial position</w:t>
       </w:r>
       <w:r>
         <w:t xml:space="preserve"> </w:t>
@@ -1535,18 +1539,18 @@
           <wp:inline>
             <wp:extent cx="5334000" cy="4310883"/>
             <wp:effectExtent b="0" l="0" r="0" t="0"/>
-            <wp:docPr descr="Figure 2. What the test distinguishes, and why the within-basin determination is hard, from synthetic assemblages matched to the record. Top: the basin assemblages in a multidimensional scaling of decorated dissimilarity (points colored by the k=2 spatial split) as they would appear if the Parkin phase were a bounded interaction group (left, sharp clusters), under spatially structured neutral drift (center, a continuous gradient), and as observed (right, a diffuse scatter resembling drift). Bottom: the cultural F_ST signal recovered from synthetic assemblages as the strength of injected group closure rises from 0 (drift) to 1 (strong groups), with the s=0 null band shaded behind it. The signal clears the detection threshold only at s* = 0.5. The observed value (dashed line) lies in the shaded region below s*, where a weak group and pure drift are indistinguishable at this record’s size and time-averaging. This is why a weak within-basin boundary cannot be excluded." title="" id="19" name="Picture"/>
+            <wp:docPr descr="Figure 2. What the test distinguishes, and why the within-basin determination is hard, from synthetic assemblages matched to the record. Top: the basin assemblages in a multidimensional scaling of decorated dissimilarity (points colored by the k=2 spatial split) as they would appear if the Parkin phase were a bounded interaction group (left, sharp clusters), under spatially structured neutral drift (center, a continuous gradient), and as observed (right, a diffuse scatter resembling drift). Bottom: the cultural F_ST signal recovered from synthetic assemblages as the strength of injected group closure rises from 0 (drift) to 1 (strong groups), with the s=0 null band shaded behind it. The signal clears the detection threshold only at s* = 0.5. The observed value (dashed line) lies in the shaded region below s*, where a weak group and pure drift are indistinguishable at this record’s size and time-averaging. This is why a weak within-basin boundary cannot be excluded." title="" id="20" name="Picture"/>
             <a:graphic>
               <a:graphicData uri="http://schemas.openxmlformats.org/drawingml/2006/picture">
                 <pic:pic>
                   <pic:nvPicPr>
-                    <pic:cNvPr descr="../../figures/fig2_concept.png" id="20" name="Picture"/>
+                    <pic:cNvPr descr="../../figures/fig2_concept.png" id="21" name="Picture"/>
                     <pic:cNvPicPr>
                       <a:picLocks noChangeArrowheads="1" noChangeAspect="1"/>
                     </pic:cNvPicPr>
                   </pic:nvPicPr>
                   <pic:blipFill>
-                    <a:blip r:embed="rId18"/>
+                    <a:blip r:embed="rId19"/>
                     <a:stretch>
                       <a:fillRect/>
                     </a:stretch>
@@ -1641,8 +1645,8 @@
         <w:t xml:space="preserve">. Our four signatures are theoretically grounded by construction, each of which is entailed by the transmission model. Empirical sufficiency, whether a signature can actually register a signal at the resolution the deposit preserves, is not guaranteed by that grounding, so we test it rather than assume it. The recovery experiment finds only between-group variance empirically sufficient at this record’s resolution. Measured as states along the sequence, the signatures are only partially dynamically sufficient, a gap we close in the discussion with tests that model the transformation between states.</w:t>
       </w:r>
     </w:p>
-    <w:bookmarkEnd w:id="21"/>
-    <w:bookmarkStart w:id="30" w:name="materials-and-methods"/>
+    <w:bookmarkEnd w:id="22"/>
+    <w:bookmarkStart w:id="31" w:name="materials-and-methods"/>
     <w:p>
       <w:pPr>
         <w:pStyle w:val="Heading2"/>
@@ -1651,7 +1655,7 @@
         <w:t xml:space="preserve">Materials and methods</w:t>
       </w:r>
     </w:p>
-    <w:bookmarkStart w:id="25" w:name="data"/>
+    <w:bookmarkStart w:id="26" w:name="data"/>
     <w:p>
       <w:pPr>
         <w:pStyle w:val="Heading3"/>
@@ -1787,7 +1791,7 @@
         <w:t xml:space="preserve">(Baxter 1994; Peeples and Schachner 2012; Smith and Neiman 2007)</w:t>
       </w:r>
       <w:r>
-        <w:t xml:space="preserve">. This ordination arranges assemblages along axes that summarize their decorated-class-frequency differences, as a relative chronological ordinate oriented so that higher positions correspond to later time (Figure 3). Pooling the dates of the five proveniences that match curated assemblages, the pooled median calibrated ages correlate with seriation position at Spearman +0.70 (n = 5, 27 dates pooled), an improvement on the +0.50 of the single-date anchors, with four of the five sites in calendar order and one late-dated site departing from it. The axis, therefore, tracks calendar time, but imperfectly. The trajectory we test is an ordinal measure, not a calendar rate. The discriminating quantity, the size-controlled F_ST trend, is a magnitude invariant to the axis orientation, so only the directional descriptions of the other signatures depend on the anchor. We return to both limits in the discussion.</w:t>
+        <w:t xml:space="preserve">. This ordination arranges assemblages along axes that summarize their decorated-class-frequency differences, as a relative chronological ordinate oriented so that higher positions correspond to later time (Figure 3). Pooling the dates of the five proveniences that match curated assemblages, the median calibrated ages correlate with seriation position at Spearman +0.70 (n = 5, 27 dates pooled), an improvement on the +0.50 of the single-date anchors. Four of the five sites fall in calendar order, with one late-dated site departing from it. The axis, therefore, tracks calendar time, but imperfectly. The trajectory we test is an ordinal measure, not a calendar rate. The discriminating quantity, the size-controlled F_ST trend, is a magnitude invariant to the axis orientation, so only the directional descriptions of the other signatures depend on the anchor. We return to both limits in the discussion.</w:t>
       </w:r>
     </w:p>
     <w:p>
@@ -1799,18 +1803,18 @@
           <wp:inline>
             <wp:extent cx="5334000" cy="3629969"/>
             <wp:effectExtent b="0" l="0" r="0" t="0"/>
-            <wp:docPr descr="Figure 3. Correspondence-analysis seriation of the 29 basin decorated assemblages, plotted on the first two CA dimensions of the decorated-class frequencies and colored by CA1 rank (the relative chronological ordinate, oriented by the five available radiocarbon dates so that higher rank is later). Parkin is starred. The assemblages form a gradational continuum rather than discrete clusters, echoing the independent NMDS result of Mainfort (2003)." title="" id="23" name="Picture"/>
+            <wp:docPr descr="Figure 3. Correspondence-analysis seriation of the 29 basin decorated assemblages, plotted on the first two CA dimensions of the decorated-class frequencies and colored by CA1 rank (the relative chronological ordinate, oriented by the five available radiocarbon dates so that higher rank is later). Parkin is starred. The assemblages form a gradational continuum rather than discrete clusters, echoing the independent NMDS result of Mainfort (2003)." title="" id="24" name="Picture"/>
             <a:graphic>
               <a:graphicData uri="http://schemas.openxmlformats.org/drawingml/2006/picture">
                 <pic:pic>
                   <pic:nvPicPr>
-                    <pic:cNvPr descr="../../figures/fig3_ca_ordination.png" id="24" name="Picture"/>
+                    <pic:cNvPr descr="../../figures/fig3_ca_ordination.png" id="25" name="Picture"/>
                     <pic:cNvPicPr>
                       <a:picLocks noChangeArrowheads="1" noChangeAspect="1"/>
                     </pic:cNvPicPr>
                   </pic:nvPicPr>
                   <pic:blipFill>
-                    <a:blip r:embed="rId22"/>
+                    <a:blip r:embed="rId23"/>
                     <a:stretch>
                       <a:fillRect/>
                     </a:stretch>
@@ -1855,8 +1859,8 @@
         <w:t xml:space="preserve">Correspondence-analysis seriation of the 29 basin decorated assemblages, plotted on the first two CA dimensions of the decorated-class frequencies and colored by CA1 rank (the relative chronological ordinate, oriented by the five available radiocarbon dates so that higher rank is later). Parkin is starred. The assemblages form a gradational continuum rather than discrete clusters, echoing the independent NMDS result of Mainfort (2003).</w:t>
       </w:r>
     </w:p>
-    <w:bookmarkEnd w:id="25"/>
-    <w:bookmarkStart w:id="26" w:name="the-four-signatures"/>
+    <w:bookmarkEnd w:id="26"/>
+    <w:bookmarkStart w:id="27" w:name="the-four-signatures"/>
     <w:p>
       <w:pPr>
         <w:pStyle w:val="Heading3"/>
@@ -1973,8 +1977,8 @@
         <w:t xml:space="preserve">before scoring each signature as its rank correlation with ordinal position. And which signatures can be trusted at the record’s resolution is not assumed but established by the recovery experiment described next, in which a known closure signal is injected into the real configuration.</w:t>
       </w:r>
     </w:p>
-    <w:bookmarkEnd w:id="26"/>
-    <w:bookmarkStart w:id="27" w:name="criterion-validation-by-simulation"/>
+    <w:bookmarkEnd w:id="27"/>
+    <w:bookmarkStart w:id="28" w:name="criterion-validation-by-simulation"/>
     <w:p>
       <w:pPr>
         <w:pStyle w:val="Heading3"/>
@@ -1988,7 +1992,7 @@
         <w:pStyle w:val="FirstParagraph"/>
       </w:pPr>
       <w:r>
-        <w:t xml:space="preserve">The argument uses four simulations, each answering a different question. An idealized validation tests whether the four signatures, in principle, separate a bounded interaction group from its three mimics on large, clean synthetic assemblages (Figure S4). A record-matched recovery test assesses which signatures can detect a known, injected closure at the real record’s sample sizes and time-averaging (Figure 4). A positive control test, which generative process, neutral spatial drift, or bounded groups, reproduces the structure observed in the basin (Figure S5). A forward demonstration runs neutral drift on the real site geography with no boundary imposed, counts how many phase-like groups it produces, and checks whether the named phases exceed that number (Figures 8 and 9). The first two establish what the test can resolve on a record of this size; the second two identify which process the data match. We describe the validation and recovery here and the two drift simulations in the next subsection.</w:t>
+        <w:t xml:space="preserve">The argument uses four simulations, each answering a different question. An idealized validation tests whether the four signatures, in principle, separate a bounded interaction group from its three mimics on large, clean synthetic assemblages (Figure S4). A record-matched recovery test assesses which signatures can detect a known, injected closure at the real record’s sample sizes and time-averaging (Figure 4). A positive control test, which generates neutral spatial drift or bounded groups, reproduces the structure observed in the basin (Figure S5). A forward demonstration runs neutral drift on the real site geography with no boundary imposed, counts how many phase-like groups it produces, and checks whether the named phases exceed that number (Figures 8 and 9). The first two establish what the test can resolve on a record of this size; the second two identify which process the data match. We describe the validation and recovery here and the two drift simulations in the next subsection.</w:t>
       </w:r>
     </w:p>
     <w:p>
@@ -2031,7 +2035,7 @@
         <w:t xml:space="preserve">(Madsen 2012; Miller-Atkins and Premo 2018; Premo 2014)</w:t>
       </w:r>
       <w:r>
-        <w:t xml:space="preserve">. If chiefdom structure had really been emerging at Parkin, this experiment would tell us whether methods like ours, applied to data like ours, would have caught it. Concretely, we generated synthetic assemblages, one per real assemblage, at the real per-assemblage sample sizes, spatial clusters, and ordinal bins, injected a known group-closure signal of tunable strength s (between-group divergence and within-group conformity rising together along the sequence to a maximum of s), and asked which signatures recover it, a record-matched recovery design in the spirit of simulation-based inference calibrated to the data at hand</w:t>
+        <w:t xml:space="preserve">. If chiefdom structure had really been emerging at Parkin, this experiment would tell us whether methods like ours, applied to data like ours, would have caught it. Concretely, we generated synthetic assemblages, one per real assemblage, at the real per-assemblage sample sizes, spatial clusters, and ordinal bins. Into them we injected a known group-closure signal of tunable strength s, with between-group divergence and within-group conformity rising together along the sequence to a maximum of s. We then asked which signatures recover it, a record-matched recovery design in the spirit of simulation-based inference calibrated to the data at hand</w:t>
       </w:r>
       <w:r>
         <w:t xml:space="preserve"> </w:t>
@@ -2043,8 +2047,8 @@
         <w:t xml:space="preserve">. Two properties of the record make this necessary. Assemblage sample size trends with seriation position (Spearman rho = +0.59), and several signatures are size-sensitive so that a size-dependent estimator can rise or fall along the axis through sampling alone. We therefore subsample every assemblage, synthetic and real, to a common count before scoring, thereby removing the confound. And the record is time-averaged, which we reproduce by blending adjacent-bin production within a window. The recovery experiment then asks, at the resolution and sample sizes this record preserves, which signatures can be trusted and how strong a closure would have to be to register. One aspect of the calibration matters here. Because subsampling the larger, later assemblages to a common count slightly inflates within-cluster diversity and so depresses F_ST toward later positions, the null with no closure (pure drift) itself carries a mild negative trend rather than a flat zero. The test is calibrated against that null distribution, not against zero, so the false-positive rate is held at five percent regardless, and the empirical value is compared against the same null.</w:t>
       </w:r>
     </w:p>
-    <w:bookmarkEnd w:id="27"/>
-    <w:bookmarkStart w:id="28" w:name="the-drift-versus-groups-comparison"/>
+    <w:bookmarkEnd w:id="28"/>
+    <w:bookmarkStart w:id="29" w:name="the-drift-versus-groups-comparison"/>
     <w:p>
       <w:pPr>
         <w:pStyle w:val="Heading3"/>
@@ -2067,7 +2071,7 @@
         <w:t xml:space="preserve">(2021)</w:t>
       </w:r>
       <w:r>
-        <w:t xml:space="preserve">: each assemblage is a node holding a finite population of learners that copies decorated-class variants from within the node and, at a low rate, from other nodes with a probability that decays with geographic distance, under a fixed innovation rate, with deposition pooled over a trailing window to reproduce the record’s time-averaging. The bounded-groups model is identical except that interaction is concentrated within a small number of spatially contiguous groups, with only a low leak of copying between them, so that learning is restricted within boundaries. Both are run on the observed coordinate layout and subsampled to the observed per-assemblage sherd totals. Both are scored by the same four signatures, along with network modularity, a measure of how strongly the assemblages divide into separate clusters, and the distance decay of similarity. We swept the drift model’s interaction range, between-node mixing rate, and innovation rate, and report the full sweep (Supplemental Text) rather than a single setting. To extend the test to the wider valley, we added the southeast-Missouri survey assemblages of Williams</w:t>
+        <w:t xml:space="preserve">. Each assemblage is a node holding a finite population of learners that copies decorated-class variants from within the node and, at a low rate, from other nodes with a probability that decays with geographic distance. Innovation enters at a fixed rate, and deposition is pooled over a trailing window to reproduce the record’s time-averaging. The bounded-groups model is identical except that interaction is concentrated within a small number of spatially contiguous groups, with only a low leak of copying between them, so that learning is restricted within boundaries. Both are run on the observed coordinate layout and subsampled to the observed per-assemblage sherd totals. Both are scored by the same four signatures, along with network modularity, a measure of how strongly the assemblages divide into separate clusters, and the distance decay of similarity. We swept the drift model’s interaction range, between-node mixing rate, and innovation rate, and report the full sweep (Supplemental Text) rather than a single setting. To extend the test to the wider valley, we added the southeast-Missouri survey assemblages of Williams</w:t>
       </w:r>
       <w:r>
         <w:t xml:space="preserve"> </w:t>
@@ -2087,8 +2091,8 @@
         <w:t xml:space="preserve">The same neutral-drift model is also run forward to produce the phase-like groups of Figures 8 and 9. We run it forward in time on the real site geography with no boundary imposed, so any structure in the output comes from geography and time alone. Each site holds a finite population of learners. In each generation, a learner copies the decorated class of another learner, drawn from its own site with high probability and, at a low rate, from another site with a probability that decays with along-river distance. At a low rate, the learner instead adopts a newly invented class, so the repertoire turns over through time, and the assemblages can be seriated. Because the assemblages are not contemporaneous, we sample the simulated field time-transgressively. Each synthetic assemblage is drawn at the time-slice that matches its position on the seriation axis, accumulated over a trailing window to reproduce the record’s time-averaging, then subsampled to the observed sherd count. We detect groups in the results using modularity on the Brainerd-Robinson similarity graph, following the same procedure applied to the real assemblages. Because the group labels differ between runs, we summarize Parkin’s group as a probability: across 500 runs, the fraction of runs in which each assemblage falls into the same drift-detected group as Parkin. We report the number of groups, the between-group cultural F_ST, and the co-membership against the named phases, with the full parameter grid in the Supplemental Text.</w:t>
       </w:r>
     </w:p>
-    <w:bookmarkEnd w:id="28"/>
-    <w:bookmarkStart w:id="29" w:name="external-cross-check"/>
+    <w:bookmarkEnd w:id="29"/>
+    <w:bookmarkStart w:id="30" w:name="external-cross-check"/>
     <w:p>
       <w:pPr>
         <w:pStyle w:val="Heading3"/>
@@ -2138,9 +2142,9 @@
         <w:t xml:space="preserve">independent nonmetric multidimensional scaling of overlapping late-period assemblages, a published ordination of 39 assemblages from the central valley and adjacent areas that tests whether the named phases form discrete, bounded clusters or a gradational continuum.</w:t>
       </w:r>
     </w:p>
-    <w:bookmarkEnd w:id="29"/>
     <w:bookmarkEnd w:id="30"/>
-    <w:bookmarkStart w:id="43" w:name="results"/>
+    <w:bookmarkEnd w:id="31"/>
+    <w:bookmarkStart w:id="44" w:name="results"/>
     <w:p>
       <w:pPr>
         <w:pStyle w:val="Heading2"/>
@@ -2154,7 +2158,7 @@
         <w:pStyle w:val="FirstParagraph"/>
       </w:pPr>
       <w:r>
-        <w:t xml:space="preserve">The four signatures distinguish bounded groups from drift in principle, but at this record’s resolution, only one of them registers the difference. The idealized validation behaves as designed. When interaction is made to close into bounded groups, all four signatures move together, while drift and the other mimics each move only a characteristic subset. The four are tightly correlated under closure (mean absolute pairwise correlation 0.88) yet nearly independent under the mimics (0.19 to 0.29), so their joint movement is informative rather than redundant (Figure S4). The record-matched recovery is the more informative of the two (Figure 4). When a known group-closure signal is injected at the real configuration and scored after size control, only cultural F_ST tracks it monotonically, climbing from the null toward a strong positive trend as the injected strength rises. The injected strength s runs from 0 (pure drift) to 1 (strong, sharply bounded groups). The neutral departure is non-monotonic in conformity, the spatial boundary is unresponsive at the three spatial clusters the data support, and seriation coherence responds only weakly. With the false-positive rate held at five percent, F_ST recovers a closure of strength s greater than or equal to 0.5 with power above 0.8, the threshold rising to 0.7 under the record’s time-averaging. The other three signatures are not reliable discriminators at this resolution, and we treat them as weak corroboration only. At this record size and with time-averaging, the one signature that can distinguish a bounded group from drift is between-group variance.</w:t>
+        <w:t xml:space="preserve">The four signatures distinguish bounded groups from drift in principle, but at this record’s resolution, only one of them registers the difference. The idealized validation behaves as designed. When interaction is made to close into bounded groups, all four signatures move together, while drift and the other mimics each move only a characteristic subset. The four are tightly correlated under closure (mean absolute pairwise correlation 0.88) yet nearly independent under the mimics (0.19 to 0.29), so their joint movement is informative rather than redundant (Figure S4). The record-matched recovery is the more informative of the two (Figure 4). When a known group-closure signal is injected at the real configuration and scored after size control, only cultural F_ST tracks it monotonically, climbing from the null toward a strong positive trend as the injected strength rises. The injected strength s ranges from 0 (pure drift) to 1 (strongly bounded, sharply bounded groups). The neutral departure is non-monotonic in conformity, the spatial boundary is unresponsive at the three spatial clusters the data support, and seriation coherence responds only weakly. With the false-positive rate held at five percent, F_ST recovers a closure of strength s greater than or equal to 0.5 with power above 0.8, the threshold rising to 0.7 under the record’s time-averaging. The other three signatures are not reliable discriminators at this resolution, and we treat them as weak corroboration only. At this record size and with time-averaging, the one signature that can distinguish a bounded group from drift is between-group variance.</w:t>
       </w:r>
     </w:p>
     <w:p>
@@ -2166,18 +2170,18 @@
           <wp:inline>
             <wp:extent cx="5334000" cy="2715014"/>
             <wp:effectExtent b="0" l="0" r="0" t="0"/>
-            <wp:docPr descr="Figure 4. Record-matched, size-controlled signal recovery. Left: each signature’s response (Spearman trend versus ordinal position) to a known group-closure signal injected at the real configuration of 29 assemblages and subsampled to a common count. Only cultural F_ST tracks the injected signal monotonically. The neutral departure is non-monotonic in conformity, the spatial boundary is unresponsive at three spatial clusters, and seriation coherence is weak. Right: detection power of the calibrated F_ST test against injected strength, with and without the record’s time-averaging (false-positive rate 0.05). F_ST reliably recovers a closure of strength s greater than or equal to 0.5 (0.7 time-averaged). The size-controlled empirical F_ST (+0.01) falls below the resolution limit, its bootstrap interval spanning no closure to a moderate signal." title="" id="32" name="Picture"/>
+            <wp:docPr descr="Figure 4. Record-matched, size-controlled signal recovery. Left: each signature’s response (Spearman trend versus ordinal position) to a known group-closure signal injected at the real configuration of 29 assemblages and subsampled to a common count. Only cultural F_ST tracks the injected signal monotonically. The neutral departure is non-monotonic in conformity, the spatial boundary is unresponsive at three spatial clusters, and seriation coherence is weak. Right: detection power of the calibrated F_ST test against injected strength, with and without the record’s time-averaging (false-positive rate 0.05). F_ST reliably recovers a closure of strength s greater than or equal to 0.5 (0.7 time-averaged). The size-controlled empirical F_ST (+0.01) falls below the resolution limit, its bootstrap interval spanning no closure to a moderate signal." title="" id="33" name="Picture"/>
             <a:graphic>
               <a:graphicData uri="http://schemas.openxmlformats.org/drawingml/2006/picture">
                 <pic:pic>
                   <pic:nvPicPr>
-                    <pic:cNvPr descr="../../figures/fig4_recovery.png" id="33" name="Picture"/>
+                    <pic:cNvPr descr="../../figures/fig4_recovery.png" id="34" name="Picture"/>
                     <pic:cNvPicPr>
                       <a:picLocks noChangeArrowheads="1" noChangeAspect="1"/>
                     </pic:cNvPicPr>
                   </pic:nvPicPr>
                   <pic:blipFill>
-                    <a:blip r:embed="rId31"/>
+                    <a:blip r:embed="rId32"/>
                     <a:stretch>
                       <a:fillRect/>
                     </a:stretch>
@@ -2227,7 +2231,7 @@
         <w:pStyle w:val="BodyText"/>
       </w:pPr>
       <w:r>
-        <w:t xml:space="preserve">Applied to the St. Francis basin, that one reliable signature shows no closure into bounded groups, and the apparent signals in the others are confounded by sample size (Figure 5). The raw trajectory along the seriation axis seems to dissociate. Two of its trends, however, are sampling artifacts: because assemblage size trends with seriation position, the size-sensitive estimators move with it. Once every assemblage is trimmed to a common sherd count by subsampling, cultural F_ST falls from a raw +0.60 to +0.01. Its uncertainty range runs from no closure to a moderate signal, so it is uninformative rather than a resolved positive. The neutrality departure is likewise size-sensitive (its raw -0.94 only weakens to -0.83 under size control). The recovery shows that it does not track closure in either direction here, so it, too, cannot be interpreted as a transmission signal. On the recovery curve, the size-controlled empirical F_ST corresponds to a nominal injected strength of about 0.35, below the resolution limit. The record, therefore, shows no detectable closure of moderate or greater strength. The negative is informative for a closure of moderate or greater strength, which would have registered and is absent. It cannot exclude a weaker closure that, given a record of this size and time-averaging, is underpowered to resolve. The positive control reported next shows that the structure actually present is what neutral drift produces. The result is therefore not only that no bounded group is detectable, but that the structure present is what continuous, spatially structured interaction would produce.</w:t>
+        <w:t xml:space="preserve">Applied to the St. Francis basin, that one reliable signature shows no closure into bounded groups, and the apparent signals in the others are confounded by sample size (Figure 5). The raw trajectory along the seriation axis seems to dissociate. Two of its trends, however, are sampling artifacts: because assemblage size trends with seriation position, the size-sensitive estimators move with it. Once every assemblage is trimmed to a common sherd count via subsampling, cultural F_ST falls from a raw value of +0.60 to +0.01. Its uncertainty range runs from no closure to a moderate signal, so it is uninformative rather than a resolved positive. The neutrality departure is likewise size-sensitive (its raw -0.94 only weakens to -0.83 under size control). The recovery shows that it does not track closure in either direction here, so it, too, cannot be interpreted as a transmission signal. On the recovery curve, the size-controlled empirical F_ST corresponds to a nominal injected strength of about 0.35, below the resolution limit. The record, therefore, shows no detectable closure of moderate or greater strength. The negative is informative for a closure of moderate or greater strength, which would have registered and is absent. It cannot exclude a weaker closure that, given a record of this size and time-averaging, is underpowered to resolve. The positive control reported next shows that the structure actually present is what neutral drift produces. The result is therefore not only that no bounded group is detectable, but that the structure present is what continuous, spatially structured interaction would produce.</w:t>
       </w:r>
     </w:p>
     <w:p>
@@ -2239,18 +2243,18 @@
           <wp:inline>
             <wp:extent cx="5334000" cy="3953676"/>
             <wp:effectExtent b="0" l="0" r="0" t="0"/>
-            <wp:docPr descr="Figure 5. The empirical four-signature trajectory along the CA seriation axis for the St. Francis basin (29 assemblages, six bins), size-controlled by subsampling to a common count. The reliable signature, cultural F_ST, shows no trend (+0.01, down from a raw +0.60 that was a sample-size artifact). The neutral departure, spatial boundary, and seriation coherence are not reliable discriminators at this resolution (Figure 4) and are shown for completeness. Per-panel rank correlations are annotated." title="" id="35" name="Picture"/>
+            <wp:docPr descr="Figure 5. The empirical four-signature trajectory along the CA seriation axis for the St. Francis basin (29 assemblages, six bins), size-controlled by subsampling to a common count. The reliable signature, cultural F_ST, shows no trend (+0.01, down from a raw +0.60 that was a sample-size artifact). The neutral departure, spatial boundary, and seriation coherence are not reliable discriminators at this resolution (Figure 4) and are shown for completeness. Per-panel rank correlations are annotated." title="" id="36" name="Picture"/>
             <a:graphic>
               <a:graphicData uri="http://schemas.openxmlformats.org/drawingml/2006/picture">
                 <pic:pic>
                   <pic:nvPicPr>
-                    <pic:cNvPr descr="../../figures/fig5_empirical_trajectory.png" id="36" name="Picture"/>
+                    <pic:cNvPr descr="../../figures/fig5_empirical_trajectory.png" id="37" name="Picture"/>
                     <pic:cNvPicPr>
                       <a:picLocks noChangeArrowheads="1" noChangeAspect="1"/>
                     </pic:cNvPicPr>
                   </pic:nvPicPr>
                   <pic:blipFill>
-                    <a:blip r:embed="rId34"/>
+                    <a:blip r:embed="rId35"/>
                     <a:stretch>
                       <a:fillRect/>
                     </a:stretch>
@@ -2318,7 +2322,7 @@
         <w:t xml:space="preserve">(Kandler and Shennan 2013)</w:t>
       </w:r>
       <w:r>
-        <w:t xml:space="preserve">. The third asks whether the assemblages grow more different from one another toward contact, as would fragmenting groups. They do not. Neiman’s interassemblage distance shows no divergence trend along the sequence (Spearman rho = +0.37, not significant), the typical difference between spatial clusters is barely larger than the difference within them (a ratio of 1.13), and the more diverse assemblages are the more central ones, the pattern drift produces in a single shared community (Figure S1)</w:t>
+        <w:t xml:space="preserve">. The third asks whether the assemblages grow more different from one another toward contact, as would fragmenting groups. They do not. Neiman’s interassemblage distance shows no divergence trend along the sequence (Spearman rho = +0.37, not significant). The typical difference between spatial clusters is barely larger than the difference within them (a ratio of 1.13). The most diverse assemblages are also the most central, the pattern drift produces in a single shared community (Figure S1)</w:t>
       </w:r>
       <w:r>
         <w:t xml:space="preserve"> </w:t>
@@ -2344,7 +2348,7 @@
         <w:t xml:space="preserve">(2021)</w:t>
       </w:r>
       <w:r>
-        <w:t xml:space="preserve">, we simulated neutral copying on the actual coordinate layout of the basin assemblages, with interaction decaying over distance and the record’s time-averaging imposed, and compared it against a bounded-groups process on the same geography. By sweeping the interaction range, the between-node mixing rate, and the innovation rate, neutral drift reproduces the observed distance decay, network modularity, cultural F_ST, and distance-controlled boundary excess. The region of parameter space that brackets all four at once is a sub-basin interaction range of about 24 km with low between-node mixing. We report the full sweep rather than a single tuned point: at shorter ranges, drift overproduces distance decay, and at higher mixing, it underproduces the structure, so the all-four match holds only in a plausible but specific corner of the space (Supplemental Text). The bounded-groups process, by contrast, overshoots the three structural signatures by roughly two to seven times across its range, predicting far sharper community structure than the data carry. The basin’s decorated-ceramic structure is therefore reproducible by neutral spatial drift under plausible parameters. It does not require bounded groups, which would have left a sharper mark than is present (Figure S5). The control also bounds the spatial signature itself. A positive distance-controlled boundary excess, which we introduced to separate a sharp social boundary from smooth isolation by distance, is reproduced by stochastic neutral drift on a finite network, so on its own it does not certify a boundary. The same conclusion is reached for the phase construct from outside the transmission framework. Fox’s</w:t>
+        <w:t xml:space="preserve">, we simulated neutral copying on the actual coordinate layout of the basin assemblages, with interaction decaying over distance and the record’s time-averaging imposed. We compared it against a bounded-groups process on the same geography. By sweeping the interaction range, the between-node mixing rate, and the innovation rate, neutral drift reproduces the observed distance decay, network modularity, cultural F_ST, and distance-controlled boundary excess. The region of parameter space that brackets all four at once is a sub-basin interaction range of about 24 km with low between-node mixing. We report the full sweep rather than a single tuned point: at shorter ranges, drift overproduces distance decay, and at higher mixing, it underproduces the structure, so the all-four match holds only in a plausible but specific corner of the space (Supplemental Text). The bounded-groups process, by contrast, overshoots the three structural signatures by roughly two to seven times across its range, predicting far sharper community structure than the data carry. The basin’s decorated-ceramic structure is therefore reproducible by neutral spatial drift under plausible parameters. It does not require bounded groups, which would have left a sharper mark than is present (Figure S5). The control also bounds the spatial signature itself. A positive distance-controlled boundary excess, which we introduced to separate a sharp social boundary from smooth isolation by distance, is reproduced by stochastic neutral drift on a finite network, so on its own it does not certify a boundary. The same conclusion is reached for the phase construct from outside the transmission framework. Fox’s</w:t>
       </w:r>
       <w:r>
         <w:t xml:space="preserve"> </w:t>
@@ -2373,7 +2377,7 @@
         <w:t xml:space="preserve">(Dunnell 1970; Lipo et al. 2015)</w:t>
       </w:r>
       <w:r>
-        <w:t xml:space="preserve">. Where a conventional seriation would accept one rough ordering and move on, the deterministic method asks whether even one ordering can satisfy every class at once, and reports when none can. A single community drawing on a shared, drifting pool of designs meets that requirement under a single ordering. When learning is partitioned among groups, each with its own rise and fall of styles, no single ordering can hold every class unimodal at once, and the assemblages resolve into several mutually incompatible orderings. The departures a conventional seriation would dismiss as minor irregularities are, interpreted this way, the signature of more than one interaction community, and the number of maximal co-seriable groups, with the count of any one assemblage joins, measures that fragmentation directly</w:t>
+        <w:t xml:space="preserve">. Where a conventional seriation would accept one rough ordering and move on, the deterministic method asks whether even one ordering can satisfy every class at once, and reports when none can. A single community drawing on a shared, drifting pool of designs meets that requirement under a single ordering. When learning is partitioned among groups, each with its own rise and fall of styles, no single ordering can hold every class unimodal at once, and the assemblages resolve into several mutually incompatible orderings. The departures a conventional seriation would dismiss as minor irregularities are, interpreted this way, the signature of more than one interaction community. The number of maximal co-seriable groups, together with the number of groups any one assemblage joins, measures that fragmentation directly</w:t>
       </w:r>
       <w:r>
         <w:t xml:space="preserve"> </w:t>
@@ -2414,18 +2418,18 @@
           <wp:inline>
             <wp:extent cx="5334000" cy="3636553"/>
             <wp:effectExtent b="0" l="0" r="0" t="0"/>
-            <wp:docPr descr="Figure 6. Deterministic frequency-seriation (IDSS) structure of the basin assemblages. Left: distribution of co-seriable group sizes, a deeply fragmented structure (35 maximal groups, maximum size four). Right: the most connected assemblages by group-membership count, with Parkin highlighted as a bridge (member of 4 groups, ranked eighth of 29), positioned across orderings rather than at the center of one bounded community." title="" id="38" name="Picture"/>
+            <wp:docPr descr="Figure 6. Deterministic frequency-seriation (IDSS) structure of the basin assemblages. Left: distribution of co-seriable group sizes, a deeply fragmented structure (35 maximal groups, maximum size four). Right: the most connected assemblages by group-membership count, with Parkin highlighted as a bridge (member of 4 groups, ranked eighth of 29), positioned across orderings rather than at the center of one bounded community." title="" id="39" name="Picture"/>
             <a:graphic>
               <a:graphicData uri="http://schemas.openxmlformats.org/drawingml/2006/picture">
                 <pic:pic>
                   <pic:nvPicPr>
-                    <pic:cNvPr descr="../../figures/fig6_idss_structure.png" id="39" name="Picture"/>
+                    <pic:cNvPr descr="../../figures/fig6_idss_structure.png" id="40" name="Picture"/>
                     <pic:cNvPicPr>
                       <a:picLocks noChangeArrowheads="1" noChangeAspect="1"/>
                     </pic:cNvPicPr>
                   </pic:nvPicPr>
                   <pic:blipFill>
-                    <a:blip r:embed="rId37"/>
+                    <a:blip r:embed="rId38"/>
                     <a:stretch>
                       <a:fillRect/>
                     </a:stretch>
@@ -2505,18 +2509,18 @@
           <wp:inline>
             <wp:extent cx="5334000" cy="3328756"/>
             <wp:effectExtent b="0" l="0" r="0" t="0"/>
-            <wp:docPr descr="Figure 7. Settlement cross-check. Main panel: within-basin ranking of maximum mound height, the recorded, like-for-like field (Parkin’s mound area is under-coded as zero and is not used). Parkin has the tallest mound (23 ft, rank 1 of 55). The height distribution for the mounds is graded, with no gap separating it from the next centers (tallest-to-second ratio 1.0), indicating that Parkin is a prominent center rather than a redistributive apex. Inset: the proportion of sites with a mound, a defensive ditch, and St-Francis-type fortification across the basin set (n = 92)." title="" id="41" name="Picture"/>
+            <wp:docPr descr="Figure 7. Settlement cross-check. Main panel: within-basin ranking of maximum mound height, the recorded, like-for-like field (Parkin’s mound area is under-coded as zero and is not used). Parkin has the tallest mound (23 ft, rank 1 of 55). The height distribution for the mounds is graded, with no gap separating it from the next centers (tallest-to-second ratio 1.0), indicating that Parkin is a prominent center rather than a redistributive apex. Inset: the proportion of sites with a mound, a defensive ditch, and St-Francis-type fortification across the basin set (n = 92)." title="" id="42" name="Picture"/>
             <a:graphic>
               <a:graphicData uri="http://schemas.openxmlformats.org/drawingml/2006/picture">
                 <pic:pic>
                   <pic:nvPicPr>
-                    <pic:cNvPr descr="../../figures/fig7_ranksize.png" id="42" name="Picture"/>
+                    <pic:cNvPr descr="../../figures/fig7_ranksize.png" id="43" name="Picture"/>
                     <pic:cNvPicPr>
                       <a:picLocks noChangeArrowheads="1" noChangeAspect="1"/>
                     </pic:cNvPicPr>
                   </pic:nvPicPr>
                   <pic:blipFill>
-                    <a:blip r:embed="rId40"/>
+                    <a:blip r:embed="rId41"/>
                     <a:stretch>
                       <a:fillRect/>
                     </a:stretch>
@@ -2587,8 +2591,8 @@
         <w:t xml:space="preserve">. These lines point in the same direction. Two of them, the settlement organization and the lithic exchange, are independent of the ceramic data, while the ordination shares that substrate and corroborates the seriation result by a different method rather than independently.</w:t>
       </w:r>
     </w:p>
-    <w:bookmarkEnd w:id="43"/>
-    <w:bookmarkStart w:id="56" w:name="discussion"/>
+    <w:bookmarkEnd w:id="44"/>
+    <w:bookmarkStart w:id="57" w:name="discussion"/>
     <w:p>
       <w:pPr>
         <w:pStyle w:val="Heading2"/>
@@ -2667,7 +2671,7 @@
         <w:t xml:space="preserve">(Lipo et al. 2021)</w:t>
       </w:r>
       <w:r>
-        <w:t xml:space="preserve">. Across the 55 decorated assemblages of the wider lower Mississippi Valley, the model repeatedly produces a few spatially coherent, phase-like groups (Figure 8). The deposits are not contemporaneous, which is why they can be seriated at all and why some carry more of the late classes than others, so each synthetic assemblage is drawn time-transgressively at the run-time that matches its seriation position. Holding time fixed to isolate the spatial signal, drift yields two to five groups whose number grows with geographic extent; restoring the staggered deposition ages collapses the count toward two time-defined groups, because assemblages caught at different points in the sequence carry different repertoires. Either way, the number of drift-generated groups falls well short of the seven named phases the regional scheme draws across the same assemblages. The between-group cultural F_ST of those groups settles at the observed level rather than the higher value a bounded group would leave. The named phases, therefore, subdivide the valley more finely than the transmission structure supports. Where culture history draws seven bounded societies, drift on the geography yields at most a handful of coherent groupings, so most of the phase boundaries mark divisions a continuous interaction field does not carry. Whether any single named phase exceeds this drift expectation is a question we can now pose one phase at a time. That spatial and population structure, not population size, governs how drift partitions diversity in finite structured populations is established in both the cultural-transmission and population-genetics literatures</w:t>
+        <w:t xml:space="preserve">. Across the 55 decorated assemblages of the wider lower Mississippi Valley, the model repeatedly produces a few spatially coherent, phase-like groups (Figure 8). The deposits are not contemporaneous, which is why they can be seriated at all and why some carry more of the late classes than others, so each synthetic assemblage is drawn time-transgressively at the run-time that matches its seriation position. Holding time fixed to isolate the spatial signal, drift yields two to five groups whose number grows with geographic extent; restoring the staggered deposition ages collapses the count toward two time-defined groups, because assemblages caught at different points in the sequence carry different repertoires. Either way, the number of drift-generated groups falls well short of the seven named phases the regional scheme draws across the same assemblages. The between-group cultural F_ST of those groups settles at the observed level rather than the higher value a bounded group would leave. The named phases, therefore, subdivide the valley more finely than the transmission structure supports. Where culture history draws seven bounded societies, drift on the geography yields at most a handful of coherent groupings, so most of the phase boundaries mark divisions that a continuous interaction field does not carry. Whether any single named phase exceeds this drift expectation is a question we can now pose one phase at a time. That spatial and population structure, not population size, governs how drift partitions diversity in finite structured populations is established in both the cultural-transmission and population-genetics literatures</w:t>
       </w:r>
       <w:r>
         <w:t xml:space="preserve"> </w:t>
@@ -2714,18 +2718,18 @@
           <wp:inline>
             <wp:extent cx="5334000" cy="2824401"/>
             <wp:effectExtent b="0" l="0" r="0" t="0"/>
-            <wp:docPr descr="Figure 8. Phase-like groups produced by neutral drift across the wider lower Mississippi Valley, with no bounded group imposed, summarized over 500 realizations. The finite-population network-drift model runs forward on the river-network geography of all 55 Mainfort-PFG decorated assemblages, and groups are detected as greedy-modularity communities on the Brainerd-Robinson similarity graph (Supplemental Text). In the model, each site copies decorated classes primarily from itself and, at a low rate, from other sites, with a probability that decays with river distance, while innovation turns the repertoire over through time; synthetic assemblages are sampled time-transgressively at each site’s seriation position and subsampled to match the observed counts. (A) Distribution of the number of groups across the 500 runs, under contemporaneous (pure-space) and time-transgressive sampling, with the seven named culture-historical phases and the observed cluster count marked. Pure spatial drift yields two to five groups, and the count grows with geographic extent; time-transgressive sampling collapses it toward two. Either way, drift produces far fewer groups than the seven named phases, so the phases subdivide the valley more finely than the transmission structure supports. (B) Between-group cultural F_ST across runs against the observed level (0.04); the observed differentiation sits at the upper edge of the contemporaneous-drift distribution, so drift reproduces it. Parameters are the positive-control corner (interaction length 24 river-km, mixing 0.02, innovation 0.012); the basin positive control and the parameter-grid robustness are in Figures S7 and S8." title="" id="45" name="Picture"/>
+            <wp:docPr descr="Figure 8. Phase-like groups produced by neutral drift across the wider lower Mississippi Valley, with no bounded group imposed, summarized over 500 realizations. The finite-population network-drift model runs forward on the river-network geography of all 55 Mainfort-PFG decorated assemblages, and groups are detected as greedy-modularity communities on the Brainerd-Robinson similarity graph (Supplemental Text). In the model, each site copies decorated classes primarily from itself and, at a low rate, from other sites, with a probability that decays with river distance, while innovation turns the repertoire over through time; synthetic assemblages are sampled time-transgressively at each site’s seriation position and subsampled to match the observed counts. (A) Distribution of the number of groups across the 500 runs, under contemporaneous (pure-space) and time-transgressive sampling, with the seven named culture-historical phases and the observed cluster count marked. Pure spatial drift yields two to five groups, and the count grows with geographic extent; time-transgressive sampling collapses it toward two. Either way, drift produces far fewer groups than the seven named phases, so the phases subdivide the valley more finely than the transmission structure supports. (B) Between-group cultural F_ST across runs against the observed level (0.04); the observed differentiation sits at the upper edge of the contemporaneous-drift distribution, so drift reproduces it. Parameters are the positive-control corner (interaction length 24 river-km, mixing 0.02, innovation 0.012); the basin positive control and the parameter-grid robustness are in Figures S7 and S8." title="" id="46" name="Picture"/>
             <a:graphic>
               <a:graphicData uri="http://schemas.openxmlformats.org/drawingml/2006/picture">
                 <pic:pic>
                   <pic:nvPicPr>
-                    <pic:cNvPr descr="../../figures/fig8_lmv_drift_groups.png" id="46" name="Picture"/>
+                    <pic:cNvPr descr="../../figures/fig8_lmv_drift_groups.png" id="47" name="Picture"/>
                     <pic:cNvPicPr>
                       <a:picLocks noChangeArrowheads="1" noChangeAspect="1"/>
                     </pic:cNvPicPr>
                   </pic:nvPicPr>
                   <pic:blipFill>
-                    <a:blip r:embed="rId44"/>
+                    <a:blip r:embed="rId45"/>
                     <a:stretch>
                       <a:fillRect/>
                     </a:stretch>
@@ -2779,18 +2783,18 @@
           <wp:inline>
             <wp:extent cx="5334000" cy="5163057"/>
             <wp:effectExtent b="0" l="0" r="0" t="0"/>
-            <wp:docPr descr="Figure 9. Does the Parkin phase separate from the other named phases by more than drift? All 55 Mainfort-PFG decorated assemblages, labeled by culture-historical phase after Mainfort (1996b), under time-transgressive river-network drift with no boundary imposed (500 realizations). Because group labels differ between runs, Parkin’s group is summarized as the fraction of runs in which each assemblage falls in the same drift-detected group as Parkin. (A) Each assemblage is shaded by the probability that it shares Parkin’s drift-detected group (star), with Parkin-phase assemblages drawn as circles and other phases as squares; the probability is a graded field that falls with river distance from Parkin. (B) That co-membership for the Parkin phase against the other phases (AUC 0.88) reflects the separation drift predicted by geography. (C) Observed Parkin-versus-others between-group cultural F_ST (dashed) against the drift null; 0.4 percent of runs reach or exceed it, and the null’s tail extends past it. (D) Leave-one-out jackknife: the observed F_ST with each Parkin assemblage relabeled into the comparison group, against the 2.5 to 97.5 percentile band of its matched per-drop null. Open points fall inside the band (drift-consistent), filled points outside; seven of the eight single drops stay outside, so the small contrast does not rest on one assemblage." title="" id="48" name="Picture"/>
+            <wp:docPr descr="Figure 9. Does the Parkin phase separate from the other named phases by more than drift? All 55 Mainfort-PFG decorated assemblages, labeled by culture-historical phase after Mainfort (1996b), under time-transgressive river-network drift with no boundary imposed (500 realizations). Because group labels differ between runs, Parkin’s group is summarized as the fraction of runs in which each assemblage falls in the same drift-detected group as Parkin. (A) Each assemblage is shaded by the probability that it shares Parkin’s drift-detected group (star), with Parkin-phase assemblages drawn as circles and other phases as squares; the probability is a graded field that falls with river distance from Parkin. (B) That co-membership for the Parkin phase against the other phases (AUC 0.88) reflects the separation drift predicted by geography. (C) Observed Parkin-versus-others between-group cultural F_ST (dashed) against the drift null; 0.4 percent of runs reach or exceed it, and the null’s tail extends past it. (D) Leave-one-out jackknife: the observed F_ST with each Parkin assemblage relabeled into the comparison group, against the 2.5 to 97.5 percentile band of its matched per-drop null. Open points fall inside the band (drift-consistent), filled points outside; seven of the eight single drops stay outside, so the small contrast does not rest on one assemblage." title="" id="49" name="Picture"/>
             <a:graphic>
               <a:graphicData uri="http://schemas.openxmlformats.org/drawingml/2006/picture">
                 <pic:pic>
                   <pic:nvPicPr>
-                    <pic:cNvPr descr="../../figures/fig9_parkin_pullout.png" id="49" name="Picture"/>
+                    <pic:cNvPr descr="../../figures/fig9_parkin_pullout.png" id="50" name="Picture"/>
                     <pic:cNvPicPr>
                       <a:picLocks noChangeArrowheads="1" noChangeAspect="1"/>
                     </pic:cNvPicPr>
                   </pic:nvPicPr>
                   <pic:blipFill>
-                    <a:blip r:embed="rId47"/>
+                    <a:blip r:embed="rId48"/>
                     <a:stretch>
                       <a:fillRect/>
                     </a:stretch>
@@ -2858,7 +2862,7 @@
         <w:t xml:space="preserve">(Phyllis A. Morse 1990)</w:t>
       </w:r>
       <w:r>
-        <w:t xml:space="preserve">. The inference is specific and deserves credit for that, but it is circular. The tribute it concludes is the tribute it assumes, and no independent evidence of tribute flow accompanies it. Parkin’s position at the confluence of the St. Francis and Tyronza is as well explained by control of movement and communication as by extraction. The transmission and exchange records both show the absence of the centralized control the tribute model requires. A second argument points to skeletal evidence from the lower Mississippi (Yazoo) Delta rather than the St. Francis basin, indicating a better diet at a mound center than at a nearby satellite village, consistent with differential access within a hierarchy</w:t>
+        <w:t xml:space="preserve">. The inference is specific and deserves credit for that, but it is circular. The tribute it concludes is the tribute it assumes, and no independent evidence of tribute flow accompanies it. Parkin’s position at the confluence of the St. Francis and Tyronza is also explained by control of movement and communication, as well as by extraction. The transmission and exchange records both show the absence of the centralized control the tribute model requires. A second argument points to skeletal evidence from the lower Mississippi (Yazoo) Delta rather than the St. Francis basin, indicating a better diet at a mound center than at a nearby satellite village, consistent with differential access within a hierarchy</w:t>
       </w:r>
       <w:r>
         <w:t xml:space="preserve"> </w:t>
@@ -2875,7 +2879,7 @@
         <w:pStyle w:val="BodyText"/>
       </w:pPr>
       <w:r>
-        <w:t xml:space="preserve">Three limits bound the result, and the recovery experiment forces the most important of them to the front. At this record’s resolution, the discrimination between a bounded group and drift rests on a single signature, cultural F_ST. That signature is confounded by a sample-size trend along the seriation axis (Spearman rho = +0.59). We removed the confound by subsampling every assemblage to a common count, which collapses the raw F_ST trend from +0.60 to +0.01. We calibrated the test on synthetic data matched to the record, in which F_ST recovers a moderate-strength closure (s of about 0.5, rising to 0.7 once the record’s time-averaging is imposed), while maintaining a false-positive rate of 5%. The size-controlled empirical F_ST is uninformative, its bootstrap interval spanning no closure to a moderate signal. The negative is therefore informative for a closure of moderate or greater strength, which would have registered as a resolved positive, but does not. It cannot exclude a weaker closure that a record of 29 time-averaged assemblages is underpowered to resolve. We state the claim at that bound rather than beyond it. The other three signatures do not track closure reliably here. The neutral departure fails because it is non-monotonic in conformity and sensitive to sample size. The spatial boundary fails because the data support too few spatial clusters, and seriation coherence responds only weakly. We report them as corroboration rather than as independent confirmations. This reduction is a property of the record. When a known closure signal is injected instead through a within-group conformity pathway or a non-spatially-organized social-fragmentation pathway, neither the neutral nor the seriation signature recovers it either, so the three weak signatures fail at this resolution regardless of how closure is produced (Supplemental Text). The price is that the negative bounds are only closure expressed as between-group divergence. The closure carried purely by conformity, or by social structure not aligned with the spatial clusters, would lie below detection in this record at any strength. The second limit is the ordinal chronology. The basin radiocarbon corpus pools to five seriation anchors across a calibration plateau, so the axis is a relative order oriented toward later time at Spearman +0.70, imperfectly. The discriminating quantity, the size-controlled F_ST trend, is a magnitude that does not depend on the axis orientation. The settlement and exchange lines do not depend on the ceramic chronology at all. The third limit is time-averaging, which damps between-assemblage variation and reduces apparent turnover</w:t>
+        <w:t xml:space="preserve">Three limits bound the result, and the recovery experiment forces the most important of them to the front. At this record’s resolution, the discrimination between a bounded group and drift rests on a single signature, cultural F_ST. That signature is confounded by a sample-size trend along the seriation axis (Spearman rho = +0.59). We removed the confound by subsampling every assemblage to a common count, which collapses the raw F_ST trend from +0.60 to +0.01. We calibrated the test on synthetic data matched to the record, in which F_ST recovers a moderate-strength closure (s of about 0.5, rising to 0.7 once the record’s time-averaging is imposed), while maintaining a false-positive rate of 5%. The size-controlled empirical F_ST is uninformative, its bootstrap interval spanning no closure to a moderate signal. The negative is therefore informative for a closure of moderate or greater strength, which would have registered as a resolved positive, but does not. It cannot exclude a weaker closure than a record of 29 time-averaged assemblages, which is underpowered to resolve. We state the claim at that bound rather than beyond it. The other three signatures do not track closure reliably here. The neutral departure fails because it is non-monotonic in conformity and sensitive to sample size. The spatial boundary fails because the data support too few spatial clusters, and seriation coherence responds only weakly. We report them as corroboration rather than as independent confirmations. This reduction is a property of the record. When a known closure signal is injected instead through a within-group conformity pathway or a non-spatially-organized social-fragmentation pathway, neither the neutral nor the seriation signature recovers it either, so the three weak signatures fail at this resolution regardless of how closure is produced (Supplemental Text). The price is that the negative bounds are only closure expressed as between-group divergence. The closure carried purely by conformity, or by social structure not aligned with the spatial clusters, would lie below detection in this record at any strength. The second limit is the ordinal chronology. The basin radiocarbon corpus pools to five seriation anchors across a calibration plateau, so the axis is a relative order oriented toward later time at Spearman +0.70, imperfectly. The discriminating quantity, the size-controlled F_ST trend, is a magnitude that does not depend on the axis orientation. The settlement and exchange lines do not depend on the ceramic chronology at all. The third limit is time-averaging, which damps between-assemblage variation and reduces apparent turnover</w:t>
       </w:r>
       <w:r>
         <w:t xml:space="preserve"> </w:t>
@@ -2892,7 +2896,7 @@
         <w:pStyle w:val="BodyText"/>
       </w:pPr>
       <w:r>
-        <w:t xml:space="preserve">The contribution has two parts that should be kept distinct. The four signatures distinguish a bounded interaction group from drift in principle, and an idealized simulation confirms that closure drives them together while drift and the other mimics do not (Figure S4). The calibration is the part that travels to real data: it asks, before any similarity structure is interpreted as social, which signatures a given record can support and how strong a closure each could detect. On the Parkin record, it shows the test reducing to its single most robust component, cultural F_ST. We are explicit about what that costs. Had F_ST shown a positive trend, it alone could not have separated a real group from environmental patchiness, which also drives between-group variance (Table 1). On a positive result, the generative drift-versus-groups comparison, not F_ST alone, would have had to carry the discrimination. The negative is cleaner because the present structure is positively matched by drift and overshot by bounded groups. This result shows that social structure may be measurable through decorated ceramic assemblages. We can also assess whether the Parkin phase was a polity by examining whether interaction had closed into a bounded group to a degree that the record can resolve. For the Parkin phase, the answer is that it had not, within the bounds supported by the record. The polity the De Soto encountered seems to reflect distinctions drawn in ceremonial practices, fortification, and settlement size, rather than one written into the structure of ceramic transmission.</w:t>
+        <w:t xml:space="preserve">The contribution has two parts that should be kept distinct. The four signatures distinguish a bounded interaction group from drift in principle, and an idealized simulation confirms that closure drives them together while drift and the other mimics do not (Figure S4). The calibration is the part that travels to real data: it asks, before any similarity structure is interpreted as social, which signatures a given record can support and how strong a closure each could detect. The Parkin record shows the test reducing to its single most robust component, cultural F_ST. We are explicit about what that costs. Had F_ST shown a positive trend, it alone could not have separated a real group from environmental patchiness, which also drives between-group variance (Table 1). In the positive case, the generative drift-versus-groups comparison, not F_ST alone, would have had to carry the discrimination. The negative is cleaner because the present structure is positively matched by drift and overshot by bounded groups. This result shows that social structure may be measurable through decorated ceramic assemblages. We can also assess whether the Parkin phase was a polity by examining whether interaction had closed into a bounded group to a degree that the record can resolve. For the Parkin phase, the answer is that it had not, within the bounds supported by the record. The polity the De Soto encountered seems to reflect distinctions drawn in ceremonial practices, fortification, and settlement size, rather than one written into the structure of ceramic transmission.</w:t>
       </w:r>
     </w:p>
     <w:p>
@@ -2900,7 +2904,7 @@
         <w:pStyle w:val="BodyText"/>
       </w:pPr>
       <w:r>
-        <w:t xml:space="preserve">One result resists the drift interpretation, if only faintly, and deserves to be named rather than buried. The single place in the valley that carries a faint signal of structure beyond drift is the Parkin phase, and Parkin is the one monumental node, the largest mound, the palisade, the confluence position, the candidate Casqui. A center beginning to differentiate as a distinct node, rather than a finished bounded group, would leave just such a signal. This is what the origination stage of the two-regime model predicts: a local return generates a group-beneficial pattern at a node before assortment becomes binding and propagates into higher-level structure, with contact and the protohistoric depopulation truncating the sequence before it could consolidate. We do not claim this happened. The contrast is small, the drift null reaches past it, and the time-averaged surface record of eight Parkin-phase assemblages cannot support the claim. The possibility that Parkin was an incipient node nonetheless warrants direct investigation with data classes the present record lacks: stratified, excavated assemblages with independent radiocarbon, to test whether the differentiation grows through time rather than holding flat; compositional and petrographic sourcing of the ceramics, to test whether production and exchange were localizing on the center; and the non-ceramic lines, the chert-hoe and shell exchange networks</w:t>
+        <w:t xml:space="preserve">One result resists the drift interpretation, if only faintly, and deserves to be named rather than buried. The single place in the valley that carries a faint signal of structure beyond drift is the Parkin phase, and Parkin is the one monumental node, the largest mound, the palisade, the confluence position, the candidate Casqui. A center beginning to differentiate as a distinct node, rather than a finished, bounded group, would leave just such a signal. This is what the origination stage of the two-regime model predicts: a local return generates a group-beneficial pattern at a node before assortment becomes binding and propagates into higher-level structure, with contact and the protohistoric depopulation truncating the sequence before it could consolidate. We do not claim this happened. The contrast is small, the drift null reaches past it, and the time-averaged surface record of eight Parkin-phase assemblages cannot support the claim. The possibility that Parkin was an incipient node nonetheless warrants direct investigation with data classes the present record lacks: stratified, excavated assemblages with independent radiocarbon, to test whether the differentiation grows through time rather than holding flat; compositional and petrographic sourcing of the ceramics, to test whether production and exchange were localizing on the center; and the non-ceramic lines, the chert-hoe and shell exchange networks</w:t>
       </w:r>
       <w:r>
         <w:t xml:space="preserve"> </w:t>
@@ -2938,7 +2942,7 @@
         <w:t xml:space="preserve">(1954)</w:t>
       </w:r>
       <w:r>
-        <w:t xml:space="preserve">, the within-region decorated-ceramic structure is again drift-consistent once the earlier Woodland component is set aside. Therefore, the absence of bounded groups is not peculiar to the St. Francis basin (Figure 11). In both regions, the observed between-cluster F_ST sits at the neutral-drift level and far below the bounded-groups expectation (LMV +0.02, CMV +0.03, against bounded-groups nulls of +0.11 and +0.08). The assemblages intermix rather than separating into clusters. Between the two regions, a genuine discontinuity does appear. Across the roughly 50 km gap separating the central-valley and lower-valley assemblage clusters, decorated similarity declines by far more than neutral spatial drift would predict for the same geometry. The two regions carry mutually exclusive, distinctive decorated repertoires (Figure S6). This is the scale-dependent pattern the test is designed to detect, with no closure within regions and a sharp difference between them. We report it as a pattern rather than a verdict, because it is confounded with time.</w:t>
+        <w:t xml:space="preserve">, the within-region decorated-ceramic structure is again drift-consistent once the earlier Woodland component is set aside. Therefore, the absence of bounded groups is not peculiar to the St. Francis basin (Figure 11). In both regions, the observed between-cluster F_ST sits at the neutral-drift level and far below the bounded-groups expectation (LMV +0.02, CMV +0.03, against bounded-groups nulls of +0.11 and +0.08). The assemblages intermix rather than separating into clusters. Between the two regions, a genuine discontinuity appears across the roughly 50 km gap separating the central-valley and lower-valley assemblage clusters, with decorated similarity declining by far more than neutral spatial drift would predict for the same geometry. The two regions carry mutually exclusive, distinctive decorated repertoires (Figure S6). This is the scale-dependent pattern the test is designed to detect, with no closure within regions and a sharp difference between them. We report it as a pattern rather than a verdict, because it is confounded with time.</w:t>
       </w:r>
     </w:p>
     <w:p>
@@ -2946,7 +2950,7 @@
         <w:pStyle w:val="BodyText"/>
       </w:pPr>
       <w:r>
-        <w:t xml:space="preserve">The distinctive central-valley classes are early-to-middle Mississippian, and the distinctive lower-valley classes are late</w:t>
+        <w:t xml:space="preserve">The distinctive central-valley classes are early- to middle-Mississippian, and the distinctive lower-valley classes are late</w:t>
       </w:r>
       <w:r>
         <w:t xml:space="preserve"> </w:t>
@@ -2955,7 +2959,15 @@
         <w:t xml:space="preserve">(Phillips 1970; Williams 1954)</w:t>
       </w:r>
       <w:r>
-        <w:t xml:space="preserve">. The step at the boundary therefore cannot be separated from the early-to-late turnover of the repertoire with time-averaged surface assemblages. Resolving whether the inter-regional boundary is synchronic and social or a chronological succession would require independent radiocarbon control on the central-valley assemblages that the present compilation lacks. A second confound compounds the first. The lower-valley assemblages were collected and classified by Ford, later by Phillips, Ford, and Griffin. In contrast, the central-valley assemblages were collected and classified separately by Williams, so the two blocks differ in analyst, sorting convention, and class definition as well as in space and time. The shared-class restriction guards against the crudest version of this artifact: a boundary built only from classes unique to each typology would vanish when only the classes both traditions record are compared. The boundary does weaken under that restriction without disappearing. Even the shared classes, however, may have been sorted to subtly different criteria by the two traditions. We therefore cannot rule out that the apparent central-valley and lower-valley boundary is in part an artifact of two separate analytical histories, and that the possibility of continuous interaction across the whole region, with no real boundary anywhere, remains open. That possibility is part of the question this study raises, rather than a nuisance to be set aside, because a boundary in the data is not yet a boundary in the past. The paper’s point at the local scale applies with equal force between the regions.</w:t>
+        <w:t xml:space="preserve">. The step at the boundary, therefore, cannot be separated from the early-to-late turnover of the repertoire, as reflected in time-averaged surface assemblages. Resolving whether the inter-regional boundary is synchronic and social or a chronological succession would require independent radiocarbon control of the central-valley assemblages, which the present compilation lacks. A second confound compounds the first. The lower-valley assemblages were collected and classified by Ford, later by Phillips, Ford, and Griffin.</w:t>
+      </w:r>
+    </w:p>
+    <w:p>
+      <w:pPr>
+        <w:pStyle w:val="BodyText"/>
+      </w:pPr>
+      <w:r>
+        <w:t xml:space="preserve">In contrast, the central-valley assemblages were collected and classified separately by Williams, so the two blocks differ in analyst, sorting convention, and class definition as well as in space and time. The shared-class restriction guards against the crudest version of this artifact: a boundary built only from classes unique to each typology would vanish when only the classes both traditions record are compared. The boundary does weaken under that restriction without disappearing. Even the shared classes, however, may have been sorted to subtly different criteria by the two traditions. We therefore cannot rule out that the apparent central-valley and lower-valley boundary is in part an artifact of two separate analytical histories, and that the possibility of continuous interaction across the whole region, with no real boundary anywhere, remains open. That possibility is part of the question this study raises, rather than a nuisance to be set aside, because a boundary in the data is not yet a boundary in the past. The paper’s point at the local scale applies with equal force between the regions.</w:t>
       </w:r>
     </w:p>
     <w:p>
@@ -2967,18 +2979,18 @@
           <wp:inline>
             <wp:extent cx="4572000" cy="4685221"/>
             <wp:effectExtent b="0" l="0" r="0" t="0"/>
-            <wp:docPr descr="Figure 10. Regional setting of the two-scale comparison. Decorated-ceramic assemblages of the central Mississippi Valley: the southeast-Missouri survey of Williams (CMV, blue) and the lower-valley St. Francis basin Parkin-phase assemblages (LMV, orange), with the gap between the two clusters of assemblages and Parkin starred. Labels mark the named physiographic phase regions (Cairo Lowland, Sikeston Ridge, Malden Plain, and Little River in the central valley, with the St. Francis basin in the lower valley). Hydrography combines the Lower Mississippi Survey layer with Natural Earth, state boundaries, and the North America locator inset, which are from Natural Earth. The central-valley assemblages were collected and classified by Williams, and the lower-valley assemblages in the Phillips-Ford-Griffin tradition, the separate analytical histories discussed in the text." title="" id="51" name="Picture"/>
+            <wp:docPr descr="Figure 10. Regional setting of the two-scale comparison. Decorated-ceramic assemblages of the central Mississippi Valley: the southeast-Missouri survey of Williams (CMV, blue) and the lower-valley St. Francis basin Parkin-phase assemblages (LMV, orange), with the gap between the two clusters of assemblages and Parkin starred. Labels mark the named physiographic phase regions (Cairo Lowland, Sikeston Ridge, Malden Plain, and Little River in the central valley, with the St. Francis basin in the lower valley). Hydrography combines the Lower Mississippi Survey layer with Natural Earth, state boundaries, and the North America locator inset, which are from Natural Earth. The central-valley assemblages were collected and classified by Williams, and the lower-valley assemblages in the Phillips-Ford-Griffin tradition, the separate analytical histories discussed in the text." title="" id="52" name="Picture"/>
             <a:graphic>
               <a:graphicData uri="http://schemas.openxmlformats.org/drawingml/2006/picture">
                 <pic:pic>
                   <pic:nvPicPr>
-                    <pic:cNvPr descr="../../figures/fig10_regional.png" id="52" name="Picture"/>
+                    <pic:cNvPr descr="../../figures/fig10_regional.png" id="53" name="Picture"/>
                     <pic:cNvPicPr>
                       <a:picLocks noChangeArrowheads="1" noChangeAspect="1"/>
                     </pic:cNvPicPr>
                   </pic:nvPicPr>
                   <pic:blipFill>
-                    <a:blip r:embed="rId50"/>
+                    <a:blip r:embed="rId51"/>
                     <a:stretch>
                       <a:fillRect/>
                     </a:stretch>
@@ -3032,18 +3044,18 @@
           <wp:inline>
             <wp:extent cx="4754880" cy="3753325"/>
             <wp:effectExtent b="0" l="0" r="0" t="0"/>
-            <wp:docPr descr="Figure 11. Within-region interaction structure: neither region forms bounded groups. Top: multidimensional scaling of decorated Brainerd-Robinson dissimilarity for the LMV St. Francis basin and for the CMV southeast-Missouri assemblages (Mississippian classes only, so the comparison is not driven by the Woodland-to-Mississippian gradient), points colored by within-region spatial cluster, and the assemblages intermix rather than separating into clusters. Bottom: the observed between-cluster cultural F_ST for each region (diamond) against the 95% nulls of a neutral spatial-drift model (blue) and a bounded-groups model (orange) run on the real coordinates and subsampled to the observed counts. In both regions, the observed F_ST sits at the drift level and far below the bounded-groups expectation, so the within-region structure is drift-consistent at both scales." title="" id="54" name="Picture"/>
+            <wp:docPr descr="Figure 11. Within-region interaction structure: neither region forms bounded groups. Top: multidimensional scaling of decorated Brainerd-Robinson dissimilarity for the LMV St. Francis basin and for the CMV southeast-Missouri assemblages (Mississippian classes only, so the comparison is not driven by the Woodland-to-Mississippian gradient), points colored by within-region spatial cluster, and the assemblages intermix rather than separating into clusters. Bottom: the observed between-cluster cultural F_ST for each region (diamond) against the 95% nulls of a neutral spatial-drift model (blue) and a bounded-groups model (orange) run on the real coordinates and subsampled to the observed counts. In both regions, the observed F_ST sits at the drift level and far below the bounded-groups expectation, so the within-region structure is drift-consistent at both scales." title="" id="55" name="Picture"/>
             <a:graphic>
               <a:graphicData uri="http://schemas.openxmlformats.org/drawingml/2006/picture">
                 <pic:pic>
                   <pic:nvPicPr>
-                    <pic:cNvPr descr="../../figures/fig11_within_region.png" id="55" name="Picture"/>
+                    <pic:cNvPr descr="../../figures/fig11_within_region.png" id="56" name="Picture"/>
                     <pic:cNvPicPr>
                       <a:picLocks noChangeArrowheads="1" noChangeAspect="1"/>
                     </pic:cNvPicPr>
                   </pic:nvPicPr>
                   <pic:blipFill>
-                    <a:blip r:embed="rId53"/>
+                    <a:blip r:embed="rId54"/>
                     <a:stretch>
                       <a:fillRect/>
                     </a:stretch>
@@ -3150,8 +3162,8 @@
         <w:t xml:space="preserve">. The detail is in the Supplemental Text.</w:t>
       </w:r>
     </w:p>
-    <w:bookmarkEnd w:id="56"/>
-    <w:bookmarkStart w:id="57" w:name="conclusion"/>
+    <w:bookmarkEnd w:id="57"/>
+    <w:bookmarkStart w:id="58" w:name="conclusion"/>
     <w:p>
       <w:pPr>
         <w:pStyle w:val="Heading2"/>
@@ -3165,11 +3177,11 @@
         <w:pStyle w:val="FirstParagraph"/>
       </w:pPr>
       <w:r>
-        <w:t xml:space="preserve">The phase is the unit on which central-valley culture history is built, and it carries a silent claim that assemblages grouped by seriation and spatial proximity record a bounded society. For the Parkin phase, that claim does not survive measurement. Parkin is the basin’s largest and tallest-mounded center. No line of evidence, settlement, exchange, or ceramic transmission marks it as the apex of a polity. The greater similarity among nearby assemblages that defines the phase is reproduced by neutral drift on the basin’s geography, the ordinary residue of continuous interaction structured by where sites sit. A bounded interaction group would have a sharper structure than the measurements indicate, and Parkin sits across orderings as a transmission bridge rather than at the closed core of one. Extending the test to the wider valley, a decorated-ceramic boundary that exceeds drift appears only between the central-valley and lower-valley blocks. Even there, it is entangled with the early-to-late turnover of the class repertoire. It cannot yet be interpreted as a synchronic social division. Posed in the culture historian’s own terms, against the other named phases of the valley, the Parkin phase itself shows at most a weak contrast at the edge of the drift null, robust to single-site removal but small and within the null’s reach (Figure 9). The phase, at the scale where it is drawn, is largely indistinguishable from spatially structured drift. That carries a consequence the discipline should weigh: a similarity cluster is not by itself a society, and before a phase is interpreted as a social group, the record must be shown able to tell a real interaction boundary from drift on geography. That calibration, not the phase, provides the basis for an explanation of social structure. When applied to the late pre-contact ceramics of the Mississippi Valley, it shows continuous interaction with prominent nodes rather than a mosaic of bounded polities.</w:t>
-      </w:r>
-    </w:p>
-    <w:bookmarkEnd w:id="57"/>
-    <w:bookmarkStart w:id="58" w:name="data-and-code-availability"/>
+        <w:t xml:space="preserve">The phase is the unit on which central-valley culture history is built, and it carries a silent claim that assemblages grouped by seriation and spatial proximity record a bounded society. For the Parkin phase, that claim does not survive measurement. Parkin is the basin’s largest and tallest-mounded center. No evidence of settlement, exchange, or ceramic transmission marks it as the apex of a polity. The greater similarity among nearby assemblages that defines the phase is reproduced by neutral drift on the basin’s geography, the ordinary residue of continuous interaction structured by where sites sit. A bounded interaction group would have a sharper structure than the measurements indicate, and Parkin sits across orderings as a transmission bridge rather than at the closed core of one. Extending the test to the wider valley, a decorated-ceramic boundary that exceeds drift appears only between the central-valley and lower-valley blocks. Even there, it is entangled with the early-to-late turnover of the class repertoire. It cannot yet be interpreted as a synchronic social division. Posed in the culture historian’s own terms, against the other named phases of the valley, the Parkin phase itself shows at most a weak contrast at the edge of the drift null, robust to single-site removal but small and within the null’s reach (Figure 9). The phase, at the scale where it is drawn, is largely indistinguishable from spatially structured drift. That carries a consequence the discipline should weigh: a similarity cluster is not, by itself, a society, and before a phase is interpreted as a social group, the record must be shown to distinguish a real interaction boundary from drift across geography. That calibration, not the phase, provides the basis for an explanation of social structure. When applied to the late pre-contact ceramics of the Mississippi Valley, it shows continuous interaction with prominent nodes rather than a mosaic of bounded polities.</w:t>
+      </w:r>
+    </w:p>
+    <w:bookmarkEnd w:id="58"/>
+    <w:bookmarkStart w:id="59" w:name="data-and-code-availability"/>
     <w:p>
       <w:pPr>
         <w:pStyle w:val="Heading2"/>
@@ -3186,8 +3198,8 @@
         <w:t xml:space="preserve">All data and code needed to reproduce the analyses and figures reported here are openly available at https://github.com/clipo/phases. The repository includes the decorated-ceramic class counts, the georeferencing and radiocarbon data, the complete analysis procedure, and instructions for reproducing all results and figures. The code is released under the MIT License, and the data under a Creative Commons Attribution 4.0 International license.</w:t>
       </w:r>
     </w:p>
-    <w:bookmarkEnd w:id="58"/>
-    <w:bookmarkStart w:id="241" w:name="references"/>
+    <w:bookmarkEnd w:id="59"/>
+    <w:bookmarkStart w:id="242" w:name="references"/>
     <w:p>
       <w:pPr>
         <w:pStyle w:val="Heading2"/>
@@ -3196,8 +3208,8 @@
         <w:t xml:space="preserve">References</w:t>
       </w:r>
     </w:p>
-    <w:bookmarkStart w:id="240" w:name="refs"/>
-    <w:bookmarkStart w:id="59" w:name="ref-anderson_1996"/>
+    <w:bookmarkStart w:id="241" w:name="refs"/>
+    <w:bookmarkStart w:id="60" w:name="ref-anderson_1996"/>
     <w:p>
       <w:pPr>
         <w:pStyle w:val="Bibliography"/>
@@ -3219,8 +3231,8 @@
         <w:t xml:space="preserve">, edited by John F. Scarry, pp. 231–252. University Press of Florida, Gainesville.</w:t>
       </w:r>
     </w:p>
-    <w:bookmarkEnd w:id="59"/>
-    <w:bookmarkStart w:id="61" w:name="ref-bailey_2007"/>
+    <w:bookmarkEnd w:id="60"/>
+    <w:bookmarkStart w:id="62" w:name="ref-bailey_2007"/>
     <w:p>
       <w:pPr>
         <w:pStyle w:val="Bibliography"/>
@@ -3247,7 +3259,7 @@
       <w:r>
         <w:t xml:space="preserve"> </w:t>
       </w:r>
-      <w:hyperlink r:id="rId60">
+      <w:hyperlink r:id="rId61">
         <w:r>
           <w:rPr>
             <w:rStyle w:val="Hyperlink"/>
@@ -3259,8 +3271,8 @@
         <w:t xml:space="preserve">.</w:t>
       </w:r>
     </w:p>
-    <w:bookmarkEnd w:id="61"/>
-    <w:bookmarkStart w:id="63" w:name="ref-barrett_2019"/>
+    <w:bookmarkEnd w:id="62"/>
+    <w:bookmarkStart w:id="64" w:name="ref-barrett_2019"/>
     <w:p>
       <w:pPr>
         <w:pStyle w:val="Bibliography"/>
@@ -3287,7 +3299,7 @@
       <w:r>
         <w:t xml:space="preserve"> </w:t>
       </w:r>
-      <w:hyperlink r:id="rId62">
+      <w:hyperlink r:id="rId63">
         <w:r>
           <w:rPr>
             <w:rStyle w:val="Hyperlink"/>
@@ -3299,8 +3311,8 @@
         <w:t xml:space="preserve">.</w:t>
       </w:r>
     </w:p>
-    <w:bookmarkEnd w:id="63"/>
-    <w:bookmarkStart w:id="65" w:name="ref-barton_1996"/>
+    <w:bookmarkEnd w:id="64"/>
+    <w:bookmarkStart w:id="66" w:name="ref-barton_1996"/>
     <w:p>
       <w:pPr>
         <w:pStyle w:val="Bibliography"/>
@@ -3327,7 +3339,7 @@
       <w:r>
         <w:t xml:space="preserve"> </w:t>
       </w:r>
-      <w:hyperlink r:id="rId64">
+      <w:hyperlink r:id="rId65">
         <w:r>
           <w:rPr>
             <w:rStyle w:val="Hyperlink"/>
@@ -3339,8 +3351,8 @@
         <w:t xml:space="preserve">.</w:t>
       </w:r>
     </w:p>
-    <w:bookmarkEnd w:id="65"/>
-    <w:bookmarkStart w:id="66" w:name="ref-baxter_1994"/>
+    <w:bookmarkEnd w:id="66"/>
+    <w:bookmarkStart w:id="67" w:name="ref-baxter_1994"/>
     <w:p>
       <w:pPr>
         <w:pStyle w:val="Bibliography"/>
@@ -3362,8 +3374,8 @@
         <w:t xml:space="preserve">. Edinburgh University Press, Edinburgh.</w:t>
       </w:r>
     </w:p>
-    <w:bookmarkEnd w:id="66"/>
-    <w:bookmarkStart w:id="68" w:name="ref-beck_2003"/>
+    <w:bookmarkEnd w:id="67"/>
+    <w:bookmarkStart w:id="69" w:name="ref-beck_2003"/>
     <w:p>
       <w:pPr>
         <w:pStyle w:val="Bibliography"/>
@@ -3402,7 +3414,7 @@
       <w:r>
         <w:t xml:space="preserve"> </w:t>
       </w:r>
-      <w:hyperlink r:id="rId67">
+      <w:hyperlink r:id="rId68">
         <w:r>
           <w:rPr>
             <w:rStyle w:val="Hyperlink"/>
@@ -3414,8 +3426,8 @@
         <w:t xml:space="preserve">.</w:t>
       </w:r>
     </w:p>
-    <w:bookmarkEnd w:id="68"/>
-    <w:bookmarkStart w:id="70" w:name="ref-behrensmeyer_kidwell_gastaldo_2000"/>
+    <w:bookmarkEnd w:id="69"/>
+    <w:bookmarkStart w:id="71" w:name="ref-behrensmeyer_kidwell_gastaldo_2000"/>
     <w:p>
       <w:pPr>
         <w:pStyle w:val="Bibliography"/>
@@ -3442,7 +3454,7 @@
       <w:r>
         <w:t xml:space="preserve"> </w:t>
       </w:r>
-      <w:hyperlink r:id="rId69">
+      <w:hyperlink r:id="rId70">
         <w:r>
           <w:rPr>
             <w:rStyle w:val="Hyperlink"/>
@@ -3454,8 +3466,8 @@
         <w:t xml:space="preserve">.</w:t>
       </w:r>
     </w:p>
-    <w:bookmarkEnd w:id="70"/>
-    <w:bookmarkStart w:id="72" w:name="ref-bell_richerson_mcelreath_2009"/>
+    <w:bookmarkEnd w:id="71"/>
+    <w:bookmarkStart w:id="73" w:name="ref-bell_richerson_mcelreath_2009"/>
     <w:p>
       <w:pPr>
         <w:pStyle w:val="Bibliography"/>
@@ -3482,7 +3494,7 @@
       <w:r>
         <w:t xml:space="preserve"> </w:t>
       </w:r>
-      <w:hyperlink r:id="rId71">
+      <w:hyperlink r:id="rId72">
         <w:r>
           <w:rPr>
             <w:rStyle w:val="Hyperlink"/>
@@ -3494,8 +3506,8 @@
         <w:t xml:space="preserve">.</w:t>
       </w:r>
     </w:p>
-    <w:bookmarkEnd w:id="72"/>
-    <w:bookmarkStart w:id="74" w:name="ref-bentley_2008"/>
+    <w:bookmarkEnd w:id="73"/>
+    <w:bookmarkStart w:id="75" w:name="ref-bentley_2008"/>
     <w:p>
       <w:pPr>
         <w:pStyle w:val="Bibliography"/>
@@ -3522,7 +3534,7 @@
       <w:r>
         <w:t xml:space="preserve"> </w:t>
       </w:r>
-      <w:hyperlink r:id="rId73">
+      <w:hyperlink r:id="rId74">
         <w:r>
           <w:rPr>
             <w:rStyle w:val="Hyperlink"/>
@@ -3534,8 +3546,8 @@
         <w:t xml:space="preserve">.</w:t>
       </w:r>
     </w:p>
-    <w:bookmarkEnd w:id="74"/>
-    <w:bookmarkStart w:id="76" w:name="ref-bentley_hahn_shennan_2004"/>
+    <w:bookmarkEnd w:id="75"/>
+    <w:bookmarkStart w:id="77" w:name="ref-bentley_hahn_shennan_2004"/>
     <w:p>
       <w:pPr>
         <w:pStyle w:val="Bibliography"/>
@@ -3562,7 +3574,7 @@
       <w:r>
         <w:t xml:space="preserve"> </w:t>
       </w:r>
-      <w:hyperlink r:id="rId75">
+      <w:hyperlink r:id="rId76">
         <w:r>
           <w:rPr>
             <w:rStyle w:val="Hyperlink"/>
@@ -3574,8 +3586,8 @@
         <w:t xml:space="preserve">.</w:t>
       </w:r>
     </w:p>
-    <w:bookmarkEnd w:id="76"/>
-    <w:bookmarkStart w:id="77" w:name="ref-binford_1981"/>
+    <w:bookmarkEnd w:id="77"/>
+    <w:bookmarkStart w:id="78" w:name="ref-binford_1981"/>
     <w:p>
       <w:pPr>
         <w:pStyle w:val="Bibliography"/>
@@ -3615,8 +3627,8 @@
         <w:t xml:space="preserve">37(3):195–208.</w:t>
       </w:r>
     </w:p>
-    <w:bookmarkEnd w:id="77"/>
-    <w:bookmarkStart w:id="79" w:name="ref-blitz_1999"/>
+    <w:bookmarkEnd w:id="78"/>
+    <w:bookmarkStart w:id="80" w:name="ref-blitz_1999"/>
     <w:p>
       <w:pPr>
         <w:pStyle w:val="Bibliography"/>
@@ -3655,7 +3667,7 @@
       <w:r>
         <w:t xml:space="preserve"> </w:t>
       </w:r>
-      <w:hyperlink r:id="rId78">
+      <w:hyperlink r:id="rId79">
         <w:r>
           <w:rPr>
             <w:rStyle w:val="Hyperlink"/>
@@ -3667,8 +3679,8 @@
         <w:t xml:space="preserve">.</w:t>
       </w:r>
     </w:p>
-    <w:bookmarkEnd w:id="79"/>
-    <w:bookmarkStart w:id="80" w:name="ref-brainerd_1951"/>
+    <w:bookmarkEnd w:id="80"/>
+    <w:bookmarkStart w:id="81" w:name="ref-brainerd_1951"/>
     <w:p>
       <w:pPr>
         <w:pStyle w:val="Bibliography"/>
@@ -3693,8 +3705,8 @@
         <w:t xml:space="preserve">16(4):301–313.</w:t>
       </w:r>
     </w:p>
-    <w:bookmarkEnd w:id="80"/>
-    <w:bookmarkStart w:id="82" w:name="ref-carrignon_bentley_ruck_2019"/>
+    <w:bookmarkEnd w:id="81"/>
+    <w:bookmarkStart w:id="83" w:name="ref-carrignon_bentley_ruck_2019"/>
     <w:p>
       <w:pPr>
         <w:pStyle w:val="Bibliography"/>
@@ -3745,7 +3757,7 @@
       <w:r>
         <w:t xml:space="preserve"> </w:t>
       </w:r>
-      <w:hyperlink r:id="rId81">
+      <w:hyperlink r:id="rId82">
         <w:r>
           <w:rPr>
             <w:rStyle w:val="Hyperlink"/>
@@ -3757,8 +3769,8 @@
         <w:t xml:space="preserve">.</w:t>
       </w:r>
     </w:p>
-    <w:bookmarkEnd w:id="82"/>
-    <w:bookmarkStart w:id="83" w:name="ref-cobb_2000"/>
+    <w:bookmarkEnd w:id="83"/>
+    <w:bookmarkStart w:id="84" w:name="ref-cobb_2000"/>
     <w:p>
       <w:pPr>
         <w:pStyle w:val="Bibliography"/>
@@ -3808,8 +3820,8 @@
         <w:t xml:space="preserve">. University of Alabama Press, Tuscaloosa.</w:t>
       </w:r>
     </w:p>
-    <w:bookmarkEnd w:id="83"/>
-    <w:bookmarkStart w:id="84" w:name="ref-cobb_butler_2002"/>
+    <w:bookmarkEnd w:id="84"/>
+    <w:bookmarkStart w:id="85" w:name="ref-cobb_butler_2002"/>
     <w:p>
       <w:pPr>
         <w:pStyle w:val="Bibliography"/>
@@ -3858,8 +3870,8 @@
         <w:t xml:space="preserve">67(4):625–641.</w:t>
       </w:r>
     </w:p>
-    <w:bookmarkEnd w:id="84"/>
-    <w:bookmarkStart w:id="86" w:name="ref-cobb_etal_2024"/>
+    <w:bookmarkEnd w:id="85"/>
+    <w:bookmarkStart w:id="87" w:name="ref-cobb_etal_2024"/>
     <w:p>
       <w:pPr>
         <w:pStyle w:val="Bibliography"/>
@@ -3907,7 +3919,7 @@
       <w:r>
         <w:t xml:space="preserve"> </w:t>
       </w:r>
-      <w:hyperlink r:id="rId85">
+      <w:hyperlink r:id="rId86">
         <w:r>
           <w:rPr>
             <w:rStyle w:val="Hyperlink"/>
@@ -3919,8 +3931,8 @@
         <w:t xml:space="preserve">.</w:t>
       </w:r>
     </w:p>
-    <w:bookmarkEnd w:id="86"/>
-    <w:bookmarkStart w:id="88" w:name="ref-coco_iovita_2020"/>
+    <w:bookmarkEnd w:id="87"/>
+    <w:bookmarkStart w:id="89" w:name="ref-coco_iovita_2020"/>
     <w:p>
       <w:pPr>
         <w:pStyle w:val="Bibliography"/>
@@ -3947,7 +3959,7 @@
       <w:r>
         <w:t xml:space="preserve"> </w:t>
       </w:r>
-      <w:hyperlink r:id="rId87">
+      <w:hyperlink r:id="rId88">
         <w:r>
           <w:rPr>
             <w:rStyle w:val="Hyperlink"/>
@@ -3959,8 +3971,8 @@
         <w:t xml:space="preserve">.</w:t>
       </w:r>
     </w:p>
-    <w:bookmarkEnd w:id="88"/>
-    <w:bookmarkStart w:id="90" w:name="ref-crema_bortolini_lake_2023"/>
+    <w:bookmarkEnd w:id="89"/>
+    <w:bookmarkStart w:id="91" w:name="ref-crema_bortolini_lake_2023"/>
     <w:p>
       <w:pPr>
         <w:pStyle w:val="Bibliography"/>
@@ -3987,7 +3999,7 @@
       <w:r>
         <w:t xml:space="preserve"> </w:t>
       </w:r>
-      <w:hyperlink r:id="rId89">
+      <w:hyperlink r:id="rId90">
         <w:r>
           <w:rPr>
             <w:rStyle w:val="Hyperlink"/>
@@ -3999,8 +4011,8 @@
         <w:t xml:space="preserve">.</w:t>
       </w:r>
     </w:p>
-    <w:bookmarkEnd w:id="90"/>
-    <w:bookmarkStart w:id="92" w:name="ref-crema_edinborough_kerig_shennan_2014"/>
+    <w:bookmarkEnd w:id="91"/>
+    <w:bookmarkStart w:id="93" w:name="ref-crema_edinborough_kerig_shennan_2014"/>
     <w:p>
       <w:pPr>
         <w:pStyle w:val="Bibliography"/>
@@ -4039,7 +4051,7 @@
       <w:r>
         <w:t xml:space="preserve"> </w:t>
       </w:r>
-      <w:hyperlink r:id="rId91">
+      <w:hyperlink r:id="rId92">
         <w:r>
           <w:rPr>
             <w:rStyle w:val="Hyperlink"/>
@@ -4051,8 +4063,8 @@
         <w:t xml:space="preserve">.</w:t>
       </w:r>
     </w:p>
-    <w:bookmarkEnd w:id="92"/>
-    <w:bookmarkStart w:id="94" w:name="ref-crema_kandler_shennan_2016"/>
+    <w:bookmarkEnd w:id="93"/>
+    <w:bookmarkStart w:id="95" w:name="ref-crema_kandler_shennan_2016"/>
     <w:p>
       <w:pPr>
         <w:pStyle w:val="Bibliography"/>
@@ -4079,7 +4091,7 @@
       <w:r>
         <w:t xml:space="preserve"> </w:t>
       </w:r>
-      <w:hyperlink r:id="rId93">
+      <w:hyperlink r:id="rId94">
         <w:r>
           <w:rPr>
             <w:rStyle w:val="Hyperlink"/>
@@ -4091,8 +4103,8 @@
         <w:t xml:space="preserve">.</w:t>
       </w:r>
     </w:p>
-    <w:bookmarkEnd w:id="94"/>
-    <w:bookmarkStart w:id="96" w:name="ref-dakos_2012"/>
+    <w:bookmarkEnd w:id="95"/>
+    <w:bookmarkStart w:id="97" w:name="ref-dakos_2012"/>
     <w:p>
       <w:pPr>
         <w:pStyle w:val="Bibliography"/>
@@ -4119,7 +4131,7 @@
       <w:r>
         <w:t xml:space="preserve"> </w:t>
       </w:r>
-      <w:hyperlink r:id="rId95">
+      <w:hyperlink r:id="rId96">
         <w:r>
           <w:rPr>
             <w:rStyle w:val="Hyperlink"/>
@@ -4131,8 +4143,8 @@
         <w:t xml:space="preserve">.</w:t>
       </w:r>
     </w:p>
-    <w:bookmarkEnd w:id="96"/>
-    <w:bookmarkStart w:id="98" w:name="ref-derex_boyd_2016"/>
+    <w:bookmarkEnd w:id="97"/>
+    <w:bookmarkStart w:id="99" w:name="ref-derex_boyd_2016"/>
     <w:p>
       <w:pPr>
         <w:pStyle w:val="Bibliography"/>
@@ -4159,7 +4171,7 @@
       <w:r>
         <w:t xml:space="preserve"> </w:t>
       </w:r>
-      <w:hyperlink r:id="rId97">
+      <w:hyperlink r:id="rId98">
         <w:r>
           <w:rPr>
             <w:rStyle w:val="Hyperlink"/>
@@ -4171,8 +4183,8 @@
         <w:t xml:space="preserve">.</w:t>
       </w:r>
     </w:p>
-    <w:bookmarkEnd w:id="98"/>
-    <w:bookmarkStart w:id="100" w:name="ref-derex_perreault_boyd_2018"/>
+    <w:bookmarkEnd w:id="99"/>
+    <w:bookmarkStart w:id="101" w:name="ref-derex_perreault_boyd_2018"/>
     <w:p>
       <w:pPr>
         <w:pStyle w:val="Bibliography"/>
@@ -4199,7 +4211,7 @@
       <w:r>
         <w:t xml:space="preserve"> </w:t>
       </w:r>
-      <w:hyperlink r:id="rId99">
+      <w:hyperlink r:id="rId100">
         <w:r>
           <w:rPr>
             <w:rStyle w:val="Hyperlink"/>
@@ -4211,8 +4223,8 @@
         <w:t xml:space="preserve">.</w:t>
       </w:r>
     </w:p>
-    <w:bookmarkEnd w:id="100"/>
-    <w:bookmarkStart w:id="102" w:name="ref-dunnell_1970"/>
+    <w:bookmarkEnd w:id="101"/>
+    <w:bookmarkStart w:id="103" w:name="ref-dunnell_1970"/>
     <w:p>
       <w:pPr>
         <w:pStyle w:val="Bibliography"/>
@@ -4239,7 +4251,7 @@
       <w:r>
         <w:t xml:space="preserve"> </w:t>
       </w:r>
-      <w:hyperlink r:id="rId101">
+      <w:hyperlink r:id="rId102">
         <w:r>
           <w:rPr>
             <w:rStyle w:val="Hyperlink"/>
@@ -4251,8 +4263,8 @@
         <w:t xml:space="preserve">.</w:t>
       </w:r>
     </w:p>
-    <w:bookmarkEnd w:id="102"/>
-    <w:bookmarkStart w:id="104" w:name="ref-dunnell_1978"/>
+    <w:bookmarkEnd w:id="103"/>
+    <w:bookmarkStart w:id="105" w:name="ref-dunnell_1978"/>
     <w:p>
       <w:pPr>
         <w:pStyle w:val="Bibliography"/>
@@ -4279,7 +4291,7 @@
       <w:r>
         <w:t xml:space="preserve"> </w:t>
       </w:r>
-      <w:hyperlink r:id="rId103">
+      <w:hyperlink r:id="rId104">
         <w:r>
           <w:rPr>
             <w:rStyle w:val="Hyperlink"/>
@@ -4291,8 +4303,8 @@
         <w:t xml:space="preserve">.</w:t>
       </w:r>
     </w:p>
-    <w:bookmarkEnd w:id="104"/>
-    <w:bookmarkStart w:id="105" w:name="ref-dunnell_1980"/>
+    <w:bookmarkEnd w:id="105"/>
+    <w:bookmarkStart w:id="106" w:name="ref-dunnell_1980"/>
     <w:p>
       <w:pPr>
         <w:pStyle w:val="Bibliography"/>
@@ -4314,8 +4326,8 @@
         <w:t xml:space="preserve">, edited by Michael B. Schiffer, pp. 35–99. Academic Press, New York.</w:t>
       </w:r>
     </w:p>
-    <w:bookmarkEnd w:id="105"/>
-    <w:bookmarkStart w:id="106" w:name="ref-dunnell_1995"/>
+    <w:bookmarkEnd w:id="106"/>
+    <w:bookmarkStart w:id="107" w:name="ref-dunnell_1995"/>
     <w:p>
       <w:pPr>
         <w:pStyle w:val="Bibliography"/>
@@ -4337,8 +4349,8 @@
         <w:t xml:space="preserve">, edited by Patrice A. Teltser, pp. 33–50. University of Arizona Press, Tucson.</w:t>
       </w:r>
     </w:p>
-    <w:bookmarkEnd w:id="106"/>
-    <w:bookmarkStart w:id="107" w:name="ref-dye_cox_1990"/>
+    <w:bookmarkEnd w:id="107"/>
+    <w:bookmarkStart w:id="108" w:name="ref-dye_cox_1990"/>
     <w:p>
       <w:pPr>
         <w:pStyle w:val="Bibliography"/>
@@ -4374,8 +4386,8 @@
         <w:t xml:space="preserve">. University of Alabama Press, Tuscaloosa.</w:t>
       </w:r>
     </w:p>
-    <w:bookmarkEnd w:id="107"/>
-    <w:bookmarkStart w:id="109" w:name="ref-eerkens_lipo_2005"/>
+    <w:bookmarkEnd w:id="108"/>
+    <w:bookmarkStart w:id="110" w:name="ref-eerkens_lipo_2005"/>
     <w:p>
       <w:pPr>
         <w:pStyle w:val="Bibliography"/>
@@ -4402,7 +4414,7 @@
       <w:r>
         <w:t xml:space="preserve"> </w:t>
       </w:r>
-      <w:hyperlink r:id="rId108">
+      <w:hyperlink r:id="rId109">
         <w:r>
           <w:rPr>
             <w:rStyle w:val="Hyperlink"/>
@@ -4414,8 +4426,8 @@
         <w:t xml:space="preserve">.</w:t>
       </w:r>
     </w:p>
-    <w:bookmarkEnd w:id="109"/>
-    <w:bookmarkStart w:id="111" w:name="ref-eerkens_lipo_2007"/>
+    <w:bookmarkEnd w:id="110"/>
+    <w:bookmarkStart w:id="112" w:name="ref-eerkens_lipo_2007"/>
     <w:p>
       <w:pPr>
         <w:pStyle w:val="Bibliography"/>
@@ -4442,7 +4454,7 @@
       <w:r>
         <w:t xml:space="preserve"> </w:t>
       </w:r>
-      <w:hyperlink r:id="rId110">
+      <w:hyperlink r:id="rId111">
         <w:r>
           <w:rPr>
             <w:rStyle w:val="Hyperlink"/>
@@ -4454,8 +4466,8 @@
         <w:t xml:space="preserve">.</w:t>
       </w:r>
     </w:p>
-    <w:bookmarkEnd w:id="111"/>
-    <w:bookmarkStart w:id="112" w:name="ref-ewens_1972"/>
+    <w:bookmarkEnd w:id="112"/>
+    <w:bookmarkStart w:id="113" w:name="ref-ewens_1972"/>
     <w:p>
       <w:pPr>
         <w:pStyle w:val="Bibliography"/>
@@ -4480,8 +4492,8 @@
         <w:t xml:space="preserve">3(1):87–112.</w:t>
       </w:r>
     </w:p>
-    <w:bookmarkEnd w:id="112"/>
-    <w:bookmarkStart w:id="114" w:name="ref-feder_kryazhimskiy_plotkin_2014"/>
+    <w:bookmarkEnd w:id="113"/>
+    <w:bookmarkStart w:id="115" w:name="ref-feder_kryazhimskiy_plotkin_2014"/>
     <w:p>
       <w:pPr>
         <w:pStyle w:val="Bibliography"/>
@@ -4508,7 +4520,7 @@
       <w:r>
         <w:t xml:space="preserve"> </w:t>
       </w:r>
-      <w:hyperlink r:id="rId113">
+      <w:hyperlink r:id="rId114">
         <w:r>
           <w:rPr>
             <w:rStyle w:val="Hyperlink"/>
@@ -4520,8 +4532,8 @@
         <w:t xml:space="preserve">.</w:t>
       </w:r>
     </w:p>
-    <w:bookmarkEnd w:id="114"/>
-    <w:bookmarkStart w:id="116" w:name="ref-fogarty_kandler_creanza_2024"/>
+    <w:bookmarkEnd w:id="115"/>
+    <w:bookmarkStart w:id="117" w:name="ref-fogarty_kandler_creanza_2024"/>
     <w:p>
       <w:pPr>
         <w:pStyle w:val="Bibliography"/>
@@ -4548,7 +4560,7 @@
       <w:r>
         <w:t xml:space="preserve"> </w:t>
       </w:r>
-      <w:hyperlink r:id="rId115">
+      <w:hyperlink r:id="rId116">
         <w:r>
           <w:rPr>
             <w:rStyle w:val="Hyperlink"/>
@@ -4560,8 +4572,8 @@
         <w:t xml:space="preserve">.</w:t>
       </w:r>
     </w:p>
-    <w:bookmarkEnd w:id="116"/>
-    <w:bookmarkStart w:id="117" w:name="ref-fox_1998"/>
+    <w:bookmarkEnd w:id="117"/>
+    <w:bookmarkStart w:id="118" w:name="ref-fox_1998"/>
     <w:p>
       <w:pPr>
         <w:pStyle w:val="Bibliography"/>
@@ -4583,8 +4595,8 @@
         <w:t xml:space="preserve">, edited by Michael J. O’Brien and Robert C. Dunnell, pp. 31–58. University of Alabama Press, Tuscaloosa.</w:t>
       </w:r>
     </w:p>
-    <w:bookmarkEnd w:id="117"/>
-    <w:bookmarkStart w:id="118" w:name="ref-graves_cachola-abad_1996"/>
+    <w:bookmarkEnd w:id="118"/>
+    <w:bookmarkStart w:id="119" w:name="ref-graves_cachola-abad_1996"/>
     <w:p>
       <w:pPr>
         <w:pStyle w:val="Bibliography"/>
@@ -4618,8 +4630,8 @@
         <w:t xml:space="preserve">31(1):19–32.</w:t>
       </w:r>
     </w:p>
-    <w:bookmarkEnd w:id="118"/>
-    <w:bookmarkStart w:id="119" w:name="ref-hally_1993"/>
+    <w:bookmarkEnd w:id="119"/>
+    <w:bookmarkStart w:id="120" w:name="ref-hally_1993"/>
     <w:p>
       <w:pPr>
         <w:pStyle w:val="Bibliography"/>
@@ -4653,8 +4665,8 @@
         <w:t xml:space="preserve">, edited by James B. Stoltman, pp. 143–167. Archaeological Report No. 25. Mississippi Department of Archives; History, Jackson.</w:t>
       </w:r>
     </w:p>
-    <w:bookmarkEnd w:id="119"/>
-    <w:bookmarkStart w:id="120" w:name="ref-hally_1996"/>
+    <w:bookmarkEnd w:id="120"/>
+    <w:bookmarkStart w:id="121" w:name="ref-hally_1996"/>
     <w:p>
       <w:pPr>
         <w:pStyle w:val="Bibliography"/>
@@ -4688,8 +4700,8 @@
         <w:t xml:space="preserve">, edited by John F. Scarry, pp. 92–127. University Press of Florida, Gainesville.</w:t>
       </w:r>
     </w:p>
-    <w:bookmarkEnd w:id="120"/>
-    <w:bookmarkStart w:id="122" w:name="ref-henrich_2001"/>
+    <w:bookmarkEnd w:id="121"/>
+    <w:bookmarkStart w:id="123" w:name="ref-henrich_2001"/>
     <w:p>
       <w:pPr>
         <w:pStyle w:val="Bibliography"/>
@@ -4716,7 +4728,7 @@
       <w:r>
         <w:t xml:space="preserve"> </w:t>
       </w:r>
-      <w:hyperlink r:id="rId121">
+      <w:hyperlink r:id="rId122">
         <w:r>
           <w:rPr>
             <w:rStyle w:val="Hyperlink"/>
@@ -4728,8 +4740,8 @@
         <w:t xml:space="preserve">.</w:t>
       </w:r>
     </w:p>
-    <w:bookmarkEnd w:id="122"/>
-    <w:bookmarkStart w:id="124" w:name="ref-henrich_2004"/>
+    <w:bookmarkEnd w:id="123"/>
+    <w:bookmarkStart w:id="125" w:name="ref-henrich_2004"/>
     <w:p>
       <w:pPr>
         <w:pStyle w:val="Bibliography"/>
@@ -4768,7 +4780,7 @@
       <w:r>
         <w:t xml:space="preserve"> </w:t>
       </w:r>
-      <w:hyperlink r:id="rId123">
+      <w:hyperlink r:id="rId124">
         <w:r>
           <w:rPr>
             <w:rStyle w:val="Hyperlink"/>
@@ -4780,8 +4792,8 @@
         <w:t xml:space="preserve">.</w:t>
       </w:r>
     </w:p>
-    <w:bookmarkEnd w:id="124"/>
-    <w:bookmarkStart w:id="126" w:name="ref-henrich_boyd_1998"/>
+    <w:bookmarkEnd w:id="125"/>
+    <w:bookmarkStart w:id="127" w:name="ref-henrich_boyd_1998"/>
     <w:p>
       <w:pPr>
         <w:pStyle w:val="Bibliography"/>
@@ -4808,7 +4820,7 @@
       <w:r>
         <w:t xml:space="preserve"> </w:t>
       </w:r>
-      <w:hyperlink r:id="rId125">
+      <w:hyperlink r:id="rId126">
         <w:r>
           <w:rPr>
             <w:rStyle w:val="Hyperlink"/>
@@ -4820,8 +4832,8 @@
         <w:t xml:space="preserve">.</w:t>
       </w:r>
     </w:p>
-    <w:bookmarkEnd w:id="126"/>
-    <w:bookmarkStart w:id="127" w:name="ref-holdaway_wandsnider_2008"/>
+    <w:bookmarkEnd w:id="127"/>
+    <w:bookmarkStart w:id="128" w:name="ref-holdaway_wandsnider_2008"/>
     <w:p>
       <w:pPr>
         <w:pStyle w:val="Bibliography"/>
@@ -4843,8 +4855,8 @@
         <w:t xml:space="preserve">. University of Utah Press, Salt Lake City.</w:t>
       </w:r>
     </w:p>
-    <w:bookmarkEnd w:id="127"/>
-    <w:bookmarkStart w:id="129" w:name="ref-holland-lulewicz_ritchison_2021"/>
+    <w:bookmarkEnd w:id="128"/>
+    <w:bookmarkStart w:id="130" w:name="ref-holland-lulewicz_ritchison_2021"/>
     <w:p>
       <w:pPr>
         <w:pStyle w:val="Bibliography"/>
@@ -4871,7 +4883,7 @@
       <w:r>
         <w:t xml:space="preserve"> </w:t>
       </w:r>
-      <w:hyperlink r:id="rId128">
+      <w:hyperlink r:id="rId129">
         <w:r>
           <w:rPr>
             <w:rStyle w:val="Hyperlink"/>
@@ -4883,8 +4895,8 @@
         <w:t xml:space="preserve">.</w:t>
       </w:r>
     </w:p>
-    <w:bookmarkEnd w:id="129"/>
-    <w:bookmarkStart w:id="130" w:name="ref-house_1991"/>
+    <w:bookmarkEnd w:id="130"/>
+    <w:bookmarkStart w:id="131" w:name="ref-house_1991"/>
     <w:p>
       <w:pPr>
         <w:pStyle w:val="Bibliography"/>
@@ -4926,8 +4938,8 @@
         <w:t xml:space="preserve">. PhD thesis, Southern Illinois University at Carbondale.</w:t>
       </w:r>
     </w:p>
-    <w:bookmarkEnd w:id="130"/>
-    <w:bookmarkStart w:id="131" w:name="ref-house_1993"/>
+    <w:bookmarkEnd w:id="131"/>
+    <w:bookmarkStart w:id="132" w:name="ref-house_1993"/>
     <w:p>
       <w:pPr>
         <w:pStyle w:val="Bibliography"/>
@@ -4952,8 +4964,8 @@
         <w:t xml:space="preserve">12(1):21–32.</w:t>
       </w:r>
     </w:p>
-    <w:bookmarkEnd w:id="131"/>
-    <w:bookmarkStart w:id="132" w:name="ref-hudson_smith_depratter_1990"/>
+    <w:bookmarkEnd w:id="132"/>
+    <w:bookmarkStart w:id="133" w:name="ref-hudson_smith_depratter_1990"/>
     <w:p>
       <w:pPr>
         <w:pStyle w:val="Bibliography"/>
@@ -5013,8 +5025,8 @@
         <w:t xml:space="preserve">, edited by David H. Dye and Cheryl Anne Cox, pp. 181–207. University of Alabama Press, Tuscaloosa.</w:t>
       </w:r>
     </w:p>
-    <w:bookmarkEnd w:id="132"/>
-    <w:bookmarkStart w:id="134" w:name="ref-hunt_2006"/>
+    <w:bookmarkEnd w:id="133"/>
+    <w:bookmarkStart w:id="135" w:name="ref-hunt_2006"/>
     <w:p>
       <w:pPr>
         <w:pStyle w:val="Bibliography"/>
@@ -5041,7 +5053,7 @@
       <w:r>
         <w:t xml:space="preserve"> </w:t>
       </w:r>
-      <w:hyperlink r:id="rId133">
+      <w:hyperlink r:id="rId134">
         <w:r>
           <w:rPr>
             <w:rStyle w:val="Hyperlink"/>
@@ -5053,8 +5065,8 @@
         <w:t xml:space="preserve">.</w:t>
       </w:r>
     </w:p>
-    <w:bookmarkEnd w:id="134"/>
-    <w:bookmarkStart w:id="136" w:name="ref-hunt_bell_travis_2008"/>
+    <w:bookmarkEnd w:id="135"/>
+    <w:bookmarkStart w:id="137" w:name="ref-hunt_bell_travis_2008"/>
     <w:p>
       <w:pPr>
         <w:pStyle w:val="Bibliography"/>
@@ -5081,7 +5093,7 @@
       <w:r>
         <w:t xml:space="preserve"> </w:t>
       </w:r>
-      <w:hyperlink r:id="rId135">
+      <w:hyperlink r:id="rId136">
         <w:r>
           <w:rPr>
             <w:rStyle w:val="Hyperlink"/>
@@ -5093,8 +5105,8 @@
         <w:t xml:space="preserve">.</w:t>
       </w:r>
     </w:p>
-    <w:bookmarkEnd w:id="136"/>
-    <w:bookmarkStart w:id="137" w:name="ref-hurlbert_1971"/>
+    <w:bookmarkEnd w:id="137"/>
+    <w:bookmarkStart w:id="138" w:name="ref-hurlbert_1971"/>
     <w:p>
       <w:pPr>
         <w:pStyle w:val="Bibliography"/>
@@ -5119,8 +5131,8 @@
         <w:t xml:space="preserve">52(4):577–586.</w:t>
       </w:r>
     </w:p>
-    <w:bookmarkEnd w:id="137"/>
-    <w:bookmarkStart w:id="139" w:name="ref-kandler_shennan_2013"/>
+    <w:bookmarkEnd w:id="138"/>
+    <w:bookmarkStart w:id="140" w:name="ref-kandler_shennan_2013"/>
     <w:p>
       <w:pPr>
         <w:pStyle w:val="Bibliography"/>
@@ -5147,7 +5159,7 @@
       <w:r>
         <w:t xml:space="preserve"> </w:t>
       </w:r>
-      <w:hyperlink r:id="rId138">
+      <w:hyperlink r:id="rId139">
         <w:r>
           <w:rPr>
             <w:rStyle w:val="Hyperlink"/>
@@ -5159,8 +5171,8 @@
         <w:t xml:space="preserve">.</w:t>
       </w:r>
     </w:p>
-    <w:bookmarkEnd w:id="139"/>
-    <w:bookmarkStart w:id="141" w:name="ref-kandler_shennan_2015"/>
+    <w:bookmarkEnd w:id="140"/>
+    <w:bookmarkStart w:id="142" w:name="ref-kandler_shennan_2015"/>
     <w:p>
       <w:pPr>
         <w:pStyle w:val="Bibliography"/>
@@ -5199,7 +5211,7 @@
       <w:r>
         <w:t xml:space="preserve"> </w:t>
       </w:r>
-      <w:hyperlink r:id="rId140">
+      <w:hyperlink r:id="rId141">
         <w:r>
           <w:rPr>
             <w:rStyle w:val="Hyperlink"/>
@@ -5211,8 +5223,8 @@
         <w:t xml:space="preserve">.</w:t>
       </w:r>
     </w:p>
-    <w:bookmarkEnd w:id="141"/>
-    <w:bookmarkStart w:id="143" w:name="ref-kandler_wilder_fortunato_2017"/>
+    <w:bookmarkEnd w:id="142"/>
+    <w:bookmarkStart w:id="144" w:name="ref-kandler_wilder_fortunato_2017"/>
     <w:p>
       <w:pPr>
         <w:pStyle w:val="Bibliography"/>
@@ -5239,7 +5251,7 @@
       <w:r>
         <w:t xml:space="preserve"> </w:t>
       </w:r>
-      <w:hyperlink r:id="rId142">
+      <w:hyperlink r:id="rId143">
         <w:r>
           <w:rPr>
             <w:rStyle w:val="Hyperlink"/>
@@ -5251,8 +5263,8 @@
         <w:t xml:space="preserve">.</w:t>
       </w:r>
     </w:p>
-    <w:bookmarkEnd w:id="143"/>
-    <w:bookmarkStart w:id="145" w:name="ref-kidwell_tomasovych_2013"/>
+    <w:bookmarkEnd w:id="144"/>
+    <w:bookmarkStart w:id="146" w:name="ref-kidwell_tomasovych_2013"/>
     <w:p>
       <w:pPr>
         <w:pStyle w:val="Bibliography"/>
@@ -5279,7 +5291,7 @@
       <w:r>
         <w:t xml:space="preserve"> </w:t>
       </w:r>
-      <w:hyperlink r:id="rId144">
+      <w:hyperlink r:id="rId145">
         <w:r>
           <w:rPr>
             <w:rStyle w:val="Hyperlink"/>
@@ -5291,8 +5303,8 @@
         <w:t xml:space="preserve">.</w:t>
       </w:r>
     </w:p>
-    <w:bookmarkEnd w:id="145"/>
-    <w:bookmarkStart w:id="146" w:name="ref-king_freer_1995"/>
+    <w:bookmarkEnd w:id="146"/>
+    <w:bookmarkStart w:id="147" w:name="ref-king_freer_1995"/>
     <w:p>
       <w:pPr>
         <w:pStyle w:val="Bibliography"/>
@@ -5326,8 +5338,8 @@
         <w:t xml:space="preserve">, edited by Michael S. Nassaney and Kenneth E. Sassaman, pp. 266–288. University of Tennessee Press, Knoxville.</w:t>
       </w:r>
     </w:p>
-    <w:bookmarkEnd w:id="146"/>
-    <w:bookmarkStart w:id="148" w:name="ref-ladefoged_graves_2000"/>
+    <w:bookmarkEnd w:id="147"/>
+    <w:bookmarkStart w:id="149" w:name="ref-ladefoged_graves_2000"/>
     <w:p>
       <w:pPr>
         <w:pStyle w:val="Bibliography"/>
@@ -5372,7 +5384,7 @@
       <w:r>
         <w:t xml:space="preserve"> </w:t>
       </w:r>
-      <w:hyperlink r:id="rId147">
+      <w:hyperlink r:id="rId148">
         <w:r>
           <w:rPr>
             <w:rStyle w:val="Hyperlink"/>
@@ -5384,8 +5396,8 @@
         <w:t xml:space="preserve">.</w:t>
       </w:r>
     </w:p>
-    <w:bookmarkEnd w:id="148"/>
-    <w:bookmarkStart w:id="149" w:name="ref-lewontin_1974"/>
+    <w:bookmarkEnd w:id="149"/>
+    <w:bookmarkStart w:id="150" w:name="ref-lewontin_1974"/>
     <w:p>
       <w:pPr>
         <w:pStyle w:val="Bibliography"/>
@@ -5407,8 +5419,8 @@
         <w:t xml:space="preserve">. Columbia University Press, New York.</w:t>
       </w:r>
     </w:p>
-    <w:bookmarkEnd w:id="149"/>
-    <w:bookmarkStart w:id="150" w:name="ref-lipo_2001"/>
+    <w:bookmarkEnd w:id="150"/>
+    <w:bookmarkStart w:id="151" w:name="ref-lipo_2001"/>
     <w:p>
       <w:pPr>
         <w:pStyle w:val="Bibliography"/>
@@ -5458,8 +5470,8 @@
         <w:t xml:space="preserve">. BAR International Series 918. Archaeopress, Oxford.</w:t>
       </w:r>
     </w:p>
-    <w:bookmarkEnd w:id="150"/>
-    <w:bookmarkStart w:id="152" w:name="ref-lipo_dinapoli_madsen_hunt_2021"/>
+    <w:bookmarkEnd w:id="151"/>
+    <w:bookmarkStart w:id="153" w:name="ref-lipo_dinapoli_madsen_hunt_2021"/>
     <w:p>
       <w:pPr>
         <w:pStyle w:val="Bibliography"/>
@@ -5486,7 +5498,7 @@
       <w:r>
         <w:t xml:space="preserve"> </w:t>
       </w:r>
-      <w:hyperlink r:id="rId151">
+      <w:hyperlink r:id="rId152">
         <w:r>
           <w:rPr>
             <w:rStyle w:val="Hyperlink"/>
@@ -5498,8 +5510,8 @@
         <w:t xml:space="preserve">.</w:t>
       </w:r>
     </w:p>
-    <w:bookmarkEnd w:id="152"/>
-    <w:bookmarkStart w:id="153" w:name="ref-lipo_dunnell_2007"/>
+    <w:bookmarkEnd w:id="153"/>
+    <w:bookmarkStart w:id="154" w:name="ref-lipo_dunnell_2007"/>
     <w:p>
       <w:pPr>
         <w:pStyle w:val="Bibliography"/>
@@ -5561,8 +5573,8 @@
         <w:t xml:space="preserve">, edited by Janet Rafferty and Evan Peacock, pp. 125–167. University of Alabama Press, Tuscaloosa.</w:t>
       </w:r>
     </w:p>
-    <w:bookmarkEnd w:id="153"/>
-    <w:bookmarkStart w:id="155" w:name="ref-lipo_hunt_hundtoft_2010"/>
+    <w:bookmarkEnd w:id="154"/>
+    <w:bookmarkStart w:id="156" w:name="ref-lipo_hunt_hundtoft_2010"/>
     <w:p>
       <w:pPr>
         <w:pStyle w:val="Bibliography"/>
@@ -5607,7 +5619,7 @@
       <w:r>
         <w:t xml:space="preserve"> </w:t>
       </w:r>
-      <w:hyperlink r:id="rId154">
+      <w:hyperlink r:id="rId155">
         <w:r>
           <w:rPr>
             <w:rStyle w:val="Hyperlink"/>
@@ -5619,8 +5631,8 @@
         <w:t xml:space="preserve">.</w:t>
       </w:r>
     </w:p>
-    <w:bookmarkEnd w:id="155"/>
-    <w:bookmarkStart w:id="157" w:name="ref-lipo_madsen_dunnell_2015"/>
+    <w:bookmarkEnd w:id="156"/>
+    <w:bookmarkStart w:id="158" w:name="ref-lipo_madsen_dunnell_2015"/>
     <w:p>
       <w:pPr>
         <w:pStyle w:val="Bibliography"/>
@@ -5647,7 +5659,7 @@
       <w:r>
         <w:t xml:space="preserve"> </w:t>
       </w:r>
-      <w:hyperlink r:id="rId156">
+      <w:hyperlink r:id="rId157">
         <w:r>
           <w:rPr>
             <w:rStyle w:val="Hyperlink"/>
@@ -5659,8 +5671,8 @@
         <w:t xml:space="preserve">.</w:t>
       </w:r>
     </w:p>
-    <w:bookmarkEnd w:id="157"/>
-    <w:bookmarkStart w:id="159" w:name="ref-lipo_madsen_dunnell_hunt_1997"/>
+    <w:bookmarkEnd w:id="158"/>
+    <w:bookmarkStart w:id="160" w:name="ref-lipo_madsen_dunnell_hunt_1997"/>
     <w:p>
       <w:pPr>
         <w:pStyle w:val="Bibliography"/>
@@ -5687,7 +5699,7 @@
       <w:r>
         <w:t xml:space="preserve"> </w:t>
       </w:r>
-      <w:hyperlink r:id="rId158">
+      <w:hyperlink r:id="rId159">
         <w:r>
           <w:rPr>
             <w:rStyle w:val="Hyperlink"/>
@@ -5699,8 +5711,8 @@
         <w:t xml:space="preserve">.</w:t>
       </w:r>
     </w:p>
-    <w:bookmarkEnd w:id="159"/>
-    <w:bookmarkStart w:id="161" w:name="ref-holland-lulewicz_2019"/>
+    <w:bookmarkEnd w:id="160"/>
+    <w:bookmarkStart w:id="162" w:name="ref-holland-lulewicz_2019"/>
     <w:p>
       <w:pPr>
         <w:pStyle w:val="Bibliography"/>
@@ -5754,7 +5766,7 @@
       <w:r>
         <w:t xml:space="preserve"> </w:t>
       </w:r>
-      <w:hyperlink r:id="rId160">
+      <w:hyperlink r:id="rId161">
         <w:r>
           <w:rPr>
             <w:rStyle w:val="Hyperlink"/>
@@ -5766,8 +5778,8 @@
         <w:t xml:space="preserve">.</w:t>
       </w:r>
     </w:p>
-    <w:bookmarkEnd w:id="161"/>
-    <w:bookmarkStart w:id="163" w:name="ref-lyman_2021"/>
+    <w:bookmarkEnd w:id="162"/>
+    <w:bookmarkStart w:id="164" w:name="ref-lyman_2021"/>
     <w:p>
       <w:pPr>
         <w:pStyle w:val="Bibliography"/>
@@ -5794,7 +5806,7 @@
       <w:r>
         <w:t xml:space="preserve"> </w:t>
       </w:r>
-      <w:hyperlink r:id="rId162">
+      <w:hyperlink r:id="rId163">
         <w:r>
           <w:rPr>
             <w:rStyle w:val="Hyperlink"/>
@@ -5806,8 +5818,8 @@
         <w:t xml:space="preserve">.</w:t>
       </w:r>
     </w:p>
-    <w:bookmarkEnd w:id="163"/>
-    <w:bookmarkStart w:id="164" w:name="ref-madsen_2012"/>
+    <w:bookmarkEnd w:id="164"/>
+    <w:bookmarkStart w:id="165" w:name="ref-madsen_2012"/>
     <w:p>
       <w:pPr>
         <w:pStyle w:val="Bibliography"/>
@@ -5816,8 +5828,8 @@
         <w:t xml:space="preserve">Madsen, Mark E. 2012. Neutral Cultural Transmission in Time-Averaged Archaeological Assemblages. arXiv preprint arXiv:1204.2043 [physics.soc-ph].</w:t>
       </w:r>
     </w:p>
-    <w:bookmarkEnd w:id="164"/>
-    <w:bookmarkStart w:id="165" w:name="ref-mainfort_1996"/>
+    <w:bookmarkEnd w:id="165"/>
+    <w:bookmarkStart w:id="166" w:name="ref-mainfort_1996"/>
     <w:p>
       <w:pPr>
         <w:pStyle w:val="Bibliography"/>
@@ -5866,8 +5878,8 @@
         <w:t xml:space="preserve">15(2):172–181.</w:t>
       </w:r>
     </w:p>
-    <w:bookmarkEnd w:id="165"/>
-    <w:bookmarkStart w:id="166" w:name="ref-mainfort_1996b"/>
+    <w:bookmarkEnd w:id="166"/>
+    <w:bookmarkStart w:id="167" w:name="ref-mainfort_1996b"/>
     <w:p>
       <w:pPr>
         <w:pStyle w:val="Bibliography"/>
@@ -5892,8 +5904,8 @@
         <w:t xml:space="preserve">15(2):172–181.</w:t>
       </w:r>
     </w:p>
-    <w:bookmarkEnd w:id="166"/>
-    <w:bookmarkStart w:id="167" w:name="ref-mainfort_2001"/>
+    <w:bookmarkEnd w:id="167"/>
+    <w:bookmarkStart w:id="168" w:name="ref-mainfort_2001"/>
     <w:p>
       <w:pPr>
         <w:pStyle w:val="Bibliography"/>
@@ -5927,8 +5939,8 @@
         <w:t xml:space="preserve">, edited by David S. Brose, C. Wesley Cowan, and Jr. Mainfort Robert C., pp. 173–190. Smithsonian Institution Press, Washington, DC.</w:t>
       </w:r>
     </w:p>
-    <w:bookmarkEnd w:id="167"/>
-    <w:bookmarkStart w:id="168" w:name="ref-mainfort_2003"/>
+    <w:bookmarkEnd w:id="168"/>
+    <w:bookmarkStart w:id="169" w:name="ref-mainfort_2003"/>
     <w:p>
       <w:pPr>
         <w:pStyle w:val="Bibliography"/>
@@ -5965,8 +5977,8 @@
         <w:t xml:space="preserve">22(2):176–184.</w:t>
       </w:r>
     </w:p>
-    <w:bookmarkEnd w:id="168"/>
-    <w:bookmarkStart w:id="169" w:name="ref-mantel_1967"/>
+    <w:bookmarkEnd w:id="169"/>
+    <w:bookmarkStart w:id="170" w:name="ref-mantel_1967"/>
     <w:p>
       <w:pPr>
         <w:pStyle w:val="Bibliography"/>
@@ -5991,8 +6003,8 @@
         <w:t xml:space="preserve">27(2):209–220.</w:t>
       </w:r>
     </w:p>
-    <w:bookmarkEnd w:id="169"/>
-    <w:bookmarkStart w:id="170" w:name="ref-mcnutt_ed_1996"/>
+    <w:bookmarkEnd w:id="170"/>
+    <w:bookmarkStart w:id="171" w:name="ref-mcnutt_ed_1996"/>
     <w:p>
       <w:pPr>
         <w:pStyle w:val="Bibliography"/>
@@ -6042,8 +6054,8 @@
         <w:t xml:space="preserve">. University of Alabama Press, Tuscaloosa.</w:t>
       </w:r>
     </w:p>
-    <w:bookmarkEnd w:id="170"/>
-    <w:bookmarkStart w:id="171" w:name="ref-mesoudi_2021"/>
+    <w:bookmarkEnd w:id="171"/>
+    <w:bookmarkStart w:id="172" w:name="ref-mesoudi_2021"/>
     <w:p>
       <w:pPr>
         <w:pStyle w:val="Bibliography"/>
@@ -6068,8 +6080,8 @@
         <w:t xml:space="preserve">376:20200053.</w:t>
       </w:r>
     </w:p>
-    <w:bookmarkEnd w:id="171"/>
-    <w:bookmarkStart w:id="173" w:name="ref-miller_atkins_premo_2018"/>
+    <w:bookmarkEnd w:id="172"/>
+    <w:bookmarkStart w:id="174" w:name="ref-miller_atkins_premo_2018"/>
     <w:p>
       <w:pPr>
         <w:pStyle w:val="Bibliography"/>
@@ -6096,7 +6108,7 @@
       <w:r>
         <w:t xml:space="preserve"> </w:t>
       </w:r>
-      <w:hyperlink r:id="rId172">
+      <w:hyperlink r:id="rId173">
         <w:r>
           <w:rPr>
             <w:rStyle w:val="Hyperlink"/>
@@ -6108,8 +6120,8 @@
         <w:t xml:space="preserve">.</w:t>
       </w:r>
     </w:p>
-    <w:bookmarkEnd w:id="173"/>
-    <w:bookmarkStart w:id="174" w:name="ref-milner_1998"/>
+    <w:bookmarkEnd w:id="174"/>
+    <w:bookmarkStart w:id="175" w:name="ref-milner_1998"/>
     <w:p>
       <w:pPr>
         <w:pStyle w:val="Bibliography"/>
@@ -6187,8 +6199,8 @@
         <w:t xml:space="preserve">. Smithsonian Institution Press, Washington, D.C.</w:t>
       </w:r>
     </w:p>
-    <w:bookmarkEnd w:id="174"/>
-    <w:bookmarkStart w:id="175" w:name="ref-mitchem_2001"/>
+    <w:bookmarkEnd w:id="175"/>
+    <w:bookmarkStart w:id="176" w:name="ref-mitchem_2001"/>
     <w:p>
       <w:pPr>
         <w:pStyle w:val="Bibliography"/>
@@ -6218,8 +6230,8 @@
         <w:t xml:space="preserve">.</w:t>
       </w:r>
     </w:p>
-    <w:bookmarkEnd w:id="175"/>
-    <w:bookmarkStart w:id="176" w:name="ref-morse_d_1990"/>
+    <w:bookmarkEnd w:id="176"/>
+    <w:bookmarkStart w:id="177" w:name="ref-morse_d_1990"/>
     <w:p>
       <w:pPr>
         <w:pStyle w:val="Bibliography"/>
@@ -6267,8 +6279,8 @@
         <w:t xml:space="preserve">, edited by David H. Dye and Cheryl Anne Cox, pp. 69–97. University of Alabama Press, Tuscaloosa.</w:t>
       </w:r>
     </w:p>
-    <w:bookmarkEnd w:id="176"/>
-    <w:bookmarkStart w:id="177" w:name="ref-morse_morse_1983"/>
+    <w:bookmarkEnd w:id="177"/>
+    <w:bookmarkStart w:id="178" w:name="ref-morse_morse_1983"/>
     <w:p>
       <w:pPr>
         <w:pStyle w:val="Bibliography"/>
@@ -6318,8 +6330,8 @@
         <w:t xml:space="preserve">. Academic Press, New York.</w:t>
       </w:r>
     </w:p>
-    <w:bookmarkEnd w:id="177"/>
-    <w:bookmarkStart w:id="178" w:name="ref-morse_morse_1996"/>
+    <w:bookmarkEnd w:id="178"/>
+    <w:bookmarkStart w:id="179" w:name="ref-morse_morse_1996"/>
     <w:p>
       <w:pPr>
         <w:pStyle w:val="Bibliography"/>
@@ -6356,8 +6368,8 @@
         <w:t xml:space="preserve">17(1):1–35.</w:t>
       </w:r>
     </w:p>
-    <w:bookmarkEnd w:id="178"/>
-    <w:bookmarkStart w:id="179" w:name="ref-morse_1990"/>
+    <w:bookmarkEnd w:id="179"/>
+    <w:bookmarkStart w:id="180" w:name="ref-morse_1990"/>
     <w:p>
       <w:pPr>
         <w:pStyle w:val="Bibliography"/>
@@ -6417,8 +6429,8 @@
         <w:t xml:space="preserve">, edited by David H. Dye and Cheryl Anne Cox, pp. 118–134. University of Alabama Press, Tuscaloosa.</w:t>
       </w:r>
     </w:p>
-    <w:bookmarkEnd w:id="179"/>
-    <w:bookmarkStart w:id="180" w:name="ref-neiman_1995"/>
+    <w:bookmarkEnd w:id="180"/>
+    <w:bookmarkStart w:id="181" w:name="ref-neiman_1995"/>
     <w:p>
       <w:pPr>
         <w:pStyle w:val="Bibliography"/>
@@ -6461,8 +6473,8 @@
         <w:t xml:space="preserve">60(1):7–36.</w:t>
       </w:r>
     </w:p>
-    <w:bookmarkEnd w:id="180"/>
-    <w:bookmarkStart w:id="182" w:name="ref-odwyer_kandler_2017"/>
+    <w:bookmarkEnd w:id="181"/>
+    <w:bookmarkStart w:id="183" w:name="ref-odwyer_kandler_2017"/>
     <w:p>
       <w:pPr>
         <w:pStyle w:val="Bibliography"/>
@@ -6489,7 +6501,7 @@
       <w:r>
         <w:t xml:space="preserve"> </w:t>
       </w:r>
-      <w:hyperlink r:id="rId181">
+      <w:hyperlink r:id="rId182">
         <w:r>
           <w:rPr>
             <w:rStyle w:val="Hyperlink"/>
@@ -6501,8 +6513,8 @@
         <w:t xml:space="preserve">.</w:t>
       </w:r>
     </w:p>
-    <w:bookmarkEnd w:id="182"/>
-    <w:bookmarkStart w:id="184" w:name="ref-peebles_kus_1977"/>
+    <w:bookmarkEnd w:id="183"/>
+    <w:bookmarkStart w:id="185" w:name="ref-peebles_kus_1977"/>
     <w:p>
       <w:pPr>
         <w:pStyle w:val="Bibliography"/>
@@ -6529,7 +6541,7 @@
       <w:r>
         <w:t xml:space="preserve"> </w:t>
       </w:r>
-      <w:hyperlink r:id="rId183">
+      <w:hyperlink r:id="rId184">
         <w:r>
           <w:rPr>
             <w:rStyle w:val="Hyperlink"/>
@@ -6541,8 +6553,8 @@
         <w:t xml:space="preserve">.</w:t>
       </w:r>
     </w:p>
-    <w:bookmarkEnd w:id="184"/>
-    <w:bookmarkStart w:id="186" w:name="ref-peeples_schachner_2012"/>
+    <w:bookmarkEnd w:id="185"/>
+    <w:bookmarkStart w:id="187" w:name="ref-peeples_schachner_2012"/>
     <w:p>
       <w:pPr>
         <w:pStyle w:val="Bibliography"/>
@@ -6569,7 +6581,7 @@
       <w:r>
         <w:t xml:space="preserve"> </w:t>
       </w:r>
-      <w:hyperlink r:id="rId185">
+      <w:hyperlink r:id="rId186">
         <w:r>
           <w:rPr>
             <w:rStyle w:val="Hyperlink"/>
@@ -6581,8 +6593,8 @@
         <w:t xml:space="preserve">.</w:t>
       </w:r>
     </w:p>
-    <w:bookmarkEnd w:id="186"/>
-    <w:bookmarkStart w:id="188" w:name="ref-perreault_2018"/>
+    <w:bookmarkEnd w:id="187"/>
+    <w:bookmarkStart w:id="189" w:name="ref-perreault_2018"/>
     <w:p>
       <w:pPr>
         <w:pStyle w:val="Bibliography"/>
@@ -6609,7 +6621,7 @@
       <w:r>
         <w:t xml:space="preserve"> </w:t>
       </w:r>
-      <w:hyperlink r:id="rId187">
+      <w:hyperlink r:id="rId188">
         <w:r>
           <w:rPr>
             <w:rStyle w:val="Hyperlink"/>
@@ -6621,8 +6633,8 @@
         <w:t xml:space="preserve">.</w:t>
       </w:r>
     </w:p>
-    <w:bookmarkEnd w:id="188"/>
-    <w:bookmarkStart w:id="189" w:name="ref-perreault_2019"/>
+    <w:bookmarkEnd w:id="189"/>
+    <w:bookmarkStart w:id="190" w:name="ref-perreault_2019"/>
     <w:p>
       <w:pPr>
         <w:pStyle w:val="Bibliography"/>
@@ -6644,8 +6656,8 @@
         <w:t xml:space="preserve">. University of Chicago Press, Chicago.</w:t>
       </w:r>
     </w:p>
-    <w:bookmarkEnd w:id="189"/>
-    <w:bookmarkStart w:id="190" w:name="ref-phillips_1970"/>
+    <w:bookmarkEnd w:id="190"/>
+    <w:bookmarkStart w:id="191" w:name="ref-phillips_1970"/>
     <w:p>
       <w:pPr>
         <w:pStyle w:val="Bibliography"/>
@@ -6716,8 +6728,8 @@
         <w:t xml:space="preserve">, Vol. 60. Papers of the Peabody Museum of Archaeology and Ethnology. Peabody Museum, Harvard University, Cambridge, MA.</w:t>
       </w:r>
     </w:p>
-    <w:bookmarkEnd w:id="190"/>
-    <w:bookmarkStart w:id="191" w:name="ref-phillips_ford_griffin_1951"/>
+    <w:bookmarkEnd w:id="191"/>
+    <w:bookmarkStart w:id="192" w:name="ref-phillips_ford_griffin_1951"/>
     <w:p>
       <w:pPr>
         <w:pStyle w:val="Bibliography"/>
@@ -6767,8 +6779,8 @@
         <w:t xml:space="preserve">, Vol. 25. Papers of the Peabody Museum of American Archaeology and Ethnology. Peabody Museum, Harvard University, Cambridge, MA.</w:t>
       </w:r>
     </w:p>
-    <w:bookmarkEnd w:id="191"/>
-    <w:bookmarkStart w:id="193" w:name="ref-phillips_willey_1953"/>
+    <w:bookmarkEnd w:id="192"/>
+    <w:bookmarkStart w:id="194" w:name="ref-phillips_willey_1953"/>
     <w:p>
       <w:pPr>
         <w:pStyle w:val="Bibliography"/>
@@ -6795,7 +6807,7 @@
       <w:r>
         <w:t xml:space="preserve"> </w:t>
       </w:r>
-      <w:hyperlink r:id="rId192">
+      <w:hyperlink r:id="rId193">
         <w:r>
           <w:rPr>
             <w:rStyle w:val="Hyperlink"/>
@@ -6807,8 +6819,8 @@
         <w:t xml:space="preserve">.</w:t>
       </w:r>
     </w:p>
-    <w:bookmarkEnd w:id="193"/>
-    <w:bookmarkStart w:id="195" w:name="ref-powell_shennan_thomas_2009"/>
+    <w:bookmarkEnd w:id="194"/>
+    <w:bookmarkStart w:id="196" w:name="ref-powell_shennan_thomas_2009"/>
     <w:p>
       <w:pPr>
         <w:pStyle w:val="Bibliography"/>
@@ -6847,7 +6859,7 @@
       <w:r>
         <w:t xml:space="preserve"> </w:t>
       </w:r>
-      <w:hyperlink r:id="rId194">
+      <w:hyperlink r:id="rId195">
         <w:r>
           <w:rPr>
             <w:rStyle w:val="Hyperlink"/>
@@ -6859,8 +6871,8 @@
         <w:t xml:space="preserve">.</w:t>
       </w:r>
     </w:p>
-    <w:bookmarkEnd w:id="195"/>
-    <w:bookmarkStart w:id="197" w:name="ref-premo_2014"/>
+    <w:bookmarkEnd w:id="196"/>
+    <w:bookmarkStart w:id="198" w:name="ref-premo_2014"/>
     <w:p>
       <w:pPr>
         <w:pStyle w:val="Bibliography"/>
@@ -6887,7 +6899,7 @@
       <w:r>
         <w:t xml:space="preserve"> </w:t>
       </w:r>
-      <w:hyperlink r:id="rId196">
+      <w:hyperlink r:id="rId197">
         <w:r>
           <w:rPr>
             <w:rStyle w:val="Hyperlink"/>
@@ -6899,8 +6911,8 @@
         <w:t xml:space="preserve">.</w:t>
       </w:r>
     </w:p>
-    <w:bookmarkEnd w:id="197"/>
-    <w:bookmarkStart w:id="199" w:name="ref-premo_2016"/>
+    <w:bookmarkEnd w:id="198"/>
+    <w:bookmarkStart w:id="200" w:name="ref-premo_2016"/>
     <w:p>
       <w:pPr>
         <w:pStyle w:val="Bibliography"/>
@@ -6927,7 +6939,7 @@
       <w:r>
         <w:t xml:space="preserve"> </w:t>
       </w:r>
-      <w:hyperlink r:id="rId198">
+      <w:hyperlink r:id="rId199">
         <w:r>
           <w:rPr>
             <w:rStyle w:val="Hyperlink"/>
@@ -6939,8 +6951,8 @@
         <w:t xml:space="preserve">.</w:t>
       </w:r>
     </w:p>
-    <w:bookmarkEnd w:id="199"/>
-    <w:bookmarkStart w:id="201" w:name="ref-premo_scholnick_2011"/>
+    <w:bookmarkEnd w:id="200"/>
+    <w:bookmarkStart w:id="202" w:name="ref-premo_scholnick_2011"/>
     <w:p>
       <w:pPr>
         <w:pStyle w:val="Bibliography"/>
@@ -6967,7 +6979,7 @@
       <w:r>
         <w:t xml:space="preserve"> </w:t>
       </w:r>
-      <w:hyperlink r:id="rId200">
+      <w:hyperlink r:id="rId201">
         <w:r>
           <w:rPr>
             <w:rStyle w:val="Hyperlink"/>
@@ -6979,8 +6991,8 @@
         <w:t xml:space="preserve">.</w:t>
       </w:r>
     </w:p>
-    <w:bookmarkEnd w:id="201"/>
-    <w:bookmarkStart w:id="202" w:name="ref-rees_political_culture"/>
+    <w:bookmarkEnd w:id="202"/>
+    <w:bookmarkStart w:id="203" w:name="ref-rees_political_culture"/>
     <w:p>
       <w:pPr>
         <w:pStyle w:val="Bibliography"/>
@@ -7004,8 +7016,8 @@
         <w:t xml:space="preserve">. Ph.D. dissertation, University of Oklahoma, Norman.</w:t>
       </w:r>
     </w:p>
-    <w:bookmarkEnd w:id="202"/>
-    <w:bookmarkStart w:id="204" w:name="ref-reimer_etal_2020"/>
+    <w:bookmarkEnd w:id="203"/>
+    <w:bookmarkStart w:id="205" w:name="ref-reimer_etal_2020"/>
     <w:p>
       <w:pPr>
         <w:pStyle w:val="Bibliography"/>
@@ -7059,7 +7071,7 @@
       <w:r>
         <w:t xml:space="preserve"> </w:t>
       </w:r>
-      <w:hyperlink r:id="rId203">
+      <w:hyperlink r:id="rId204">
         <w:r>
           <w:rPr>
             <w:rStyle w:val="Hyperlink"/>
@@ -7071,8 +7083,8 @@
         <w:t xml:space="preserve">.</w:t>
       </w:r>
     </w:p>
-    <w:bookmarkEnd w:id="204"/>
-    <w:bookmarkStart w:id="206" w:name="ref-richerson_etal_2016"/>
+    <w:bookmarkEnd w:id="205"/>
+    <w:bookmarkStart w:id="207" w:name="ref-richerson_etal_2016"/>
     <w:p>
       <w:pPr>
         <w:pStyle w:val="Bibliography"/>
@@ -7099,7 +7111,7 @@
       <w:r>
         <w:t xml:space="preserve"> </w:t>
       </w:r>
-      <w:hyperlink r:id="rId205">
+      <w:hyperlink r:id="rId206">
         <w:r>
           <w:rPr>
             <w:rStyle w:val="Hyperlink"/>
@@ -7111,8 +7123,8 @@
         <w:t xml:space="preserve">.</w:t>
       </w:r>
     </w:p>
-    <w:bookmarkEnd w:id="206"/>
-    <w:bookmarkStart w:id="208" w:name="ref-riede_hoggard_shennan_2019"/>
+    <w:bookmarkEnd w:id="207"/>
+    <w:bookmarkStart w:id="209" w:name="ref-riede_hoggard_shennan_2019"/>
     <w:p>
       <w:pPr>
         <w:pStyle w:val="Bibliography"/>
@@ -7139,7 +7151,7 @@
       <w:r>
         <w:t xml:space="preserve"> </w:t>
       </w:r>
-      <w:hyperlink r:id="rId207">
+      <w:hyperlink r:id="rId208">
         <w:r>
           <w:rPr>
             <w:rStyle w:val="Hyperlink"/>
@@ -7151,8 +7163,8 @@
         <w:t xml:space="preserve">.</w:t>
       </w:r>
     </w:p>
-    <w:bookmarkEnd w:id="208"/>
-    <w:bookmarkStart w:id="209" w:name="ref-robinson_1951"/>
+    <w:bookmarkEnd w:id="209"/>
+    <w:bookmarkStart w:id="210" w:name="ref-robinson_1951"/>
     <w:p>
       <w:pPr>
         <w:pStyle w:val="Bibliography"/>
@@ -7177,8 +7189,8 @@
         <w:t xml:space="preserve">16(4):293–301.</w:t>
       </w:r>
     </w:p>
-    <w:bookmarkEnd w:id="209"/>
-    <w:bookmarkStart w:id="210" w:name="ref-ross-stallings_2017"/>
+    <w:bookmarkEnd w:id="210"/>
+    <w:bookmarkStart w:id="211" w:name="ref-ross-stallings_2017"/>
     <w:p>
       <w:pPr>
         <w:pStyle w:val="Bibliography"/>
@@ -7212,8 +7224,8 @@
         <w:t xml:space="preserve">, edited by Haagen D. Klaus, Amanda R. Harvey, and Mark N. Cohen, pp. 329–362. University Press of Florida, Gainesville.</w:t>
       </w:r>
     </w:p>
-    <w:bookmarkEnd w:id="210"/>
-    <w:bookmarkStart w:id="212" w:name="ref-saxer_doebeli_travisano_2009"/>
+    <w:bookmarkEnd w:id="211"/>
+    <w:bookmarkStart w:id="213" w:name="ref-saxer_doebeli_travisano_2009"/>
     <w:p>
       <w:pPr>
         <w:pStyle w:val="Bibliography"/>
@@ -7240,7 +7252,7 @@
       <w:r>
         <w:t xml:space="preserve"> </w:t>
       </w:r>
-      <w:hyperlink r:id="rId211">
+      <w:hyperlink r:id="rId212">
         <w:r>
           <w:rPr>
             <w:rStyle w:val="Hyperlink"/>
@@ -7252,8 +7264,8 @@
         <w:t xml:space="preserve">.</w:t>
       </w:r>
     </w:p>
-    <w:bookmarkEnd w:id="212"/>
-    <w:bookmarkStart w:id="214" w:name="ref-scheffer_2009"/>
+    <w:bookmarkEnd w:id="213"/>
+    <w:bookmarkStart w:id="215" w:name="ref-scheffer_2009"/>
     <w:p>
       <w:pPr>
         <w:pStyle w:val="Bibliography"/>
@@ -7280,7 +7292,7 @@
       <w:r>
         <w:t xml:space="preserve"> </w:t>
       </w:r>
-      <w:hyperlink r:id="rId213">
+      <w:hyperlink r:id="rId214">
         <w:r>
           <w:rPr>
             <w:rStyle w:val="Hyperlink"/>
@@ -7292,8 +7304,8 @@
         <w:t xml:space="preserve">.</w:t>
       </w:r>
     </w:p>
-    <w:bookmarkEnd w:id="214"/>
-    <w:bookmarkStart w:id="215" w:name="ref-schiffer_1972"/>
+    <w:bookmarkEnd w:id="215"/>
+    <w:bookmarkStart w:id="216" w:name="ref-schiffer_1972"/>
     <w:p>
       <w:pPr>
         <w:pStyle w:val="Bibliography"/>
@@ -7318,8 +7330,8 @@
         <w:t xml:space="preserve">37(2):156–165.</w:t>
       </w:r>
     </w:p>
-    <w:bookmarkEnd w:id="215"/>
-    <w:bookmarkStart w:id="217" w:name="ref-schneider_martins_deaguiar_2016"/>
+    <w:bookmarkEnd w:id="216"/>
+    <w:bookmarkStart w:id="218" w:name="ref-schneider_martins_deaguiar_2016"/>
     <w:p>
       <w:pPr>
         <w:pStyle w:val="Bibliography"/>
@@ -7346,7 +7358,7 @@
       <w:r>
         <w:t xml:space="preserve"> </w:t>
       </w:r>
-      <w:hyperlink r:id="rId216">
+      <w:hyperlink r:id="rId217">
         <w:r>
           <w:rPr>
             <w:rStyle w:val="Hyperlink"/>
@@ -7358,8 +7370,8 @@
         <w:t xml:space="preserve">.</w:t>
       </w:r>
     </w:p>
-    <w:bookmarkEnd w:id="217"/>
-    <w:bookmarkStart w:id="219" w:name="ref-shennan_crema_kerig_2015"/>
+    <w:bookmarkEnd w:id="218"/>
+    <w:bookmarkStart w:id="220" w:name="ref-shennan_crema_kerig_2015"/>
     <w:p>
       <w:pPr>
         <w:pStyle w:val="Bibliography"/>
@@ -7425,7 +7437,7 @@
       <w:r>
         <w:t xml:space="preserve"> </w:t>
       </w:r>
-      <w:hyperlink r:id="rId218">
+      <w:hyperlink r:id="rId219">
         <w:r>
           <w:rPr>
             <w:rStyle w:val="Hyperlink"/>
@@ -7437,8 +7449,8 @@
         <w:t xml:space="preserve">.</w:t>
       </w:r>
     </w:p>
-    <w:bookmarkEnd w:id="219"/>
-    <w:bookmarkStart w:id="220" w:name="ref-shennan_wilkinson_2001"/>
+    <w:bookmarkEnd w:id="220"/>
+    <w:bookmarkStart w:id="221" w:name="ref-shennan_wilkinson_2001"/>
     <w:p>
       <w:pPr>
         <w:pStyle w:val="Bibliography"/>
@@ -7478,8 +7490,8 @@
         <w:t xml:space="preserve">66(4):577–593.</w:t>
       </w:r>
     </w:p>
-    <w:bookmarkEnd w:id="220"/>
-    <w:bookmarkStart w:id="221" w:name="ref-smith_1990"/>
+    <w:bookmarkEnd w:id="221"/>
+    <w:bookmarkStart w:id="222" w:name="ref-smith_1990"/>
     <w:p>
       <w:pPr>
         <w:pStyle w:val="Bibliography"/>
@@ -7527,8 +7539,8 @@
         <w:t xml:space="preserve">, edited by David H. Dye and Cheryl Anne Cox, pp. 135–169. University of Alabama Press, Tuscaloosa.</w:t>
       </w:r>
     </w:p>
-    <w:bookmarkEnd w:id="221"/>
-    <w:bookmarkStart w:id="222" w:name="ref-smith_neiman_2007"/>
+    <w:bookmarkEnd w:id="222"/>
+    <w:bookmarkStart w:id="223" w:name="ref-smith_neiman_2007"/>
     <w:p>
       <w:pPr>
         <w:pStyle w:val="Bibliography"/>
@@ -7553,8 +7565,8 @@
         <w:t xml:space="preserve">26(1):47–72.</w:t>
       </w:r>
     </w:p>
-    <w:bookmarkEnd w:id="222"/>
-    <w:bookmarkStart w:id="223" w:name="ref-starr_1984"/>
+    <w:bookmarkEnd w:id="223"/>
+    <w:bookmarkStart w:id="224" w:name="ref-starr_1984"/>
     <w:p>
       <w:pPr>
         <w:pStyle w:val="Bibliography"/>
@@ -7735,8 +7747,8 @@
         <w:t xml:space="preserve">, edited by John M. Connaway, pp. 163–222. Archaeological Report No. 14. Mississippi Department of Archives; History, Jackson, MS.</w:t>
       </w:r>
     </w:p>
-    <w:bookmarkEnd w:id="223"/>
-    <w:bookmarkStart w:id="225" w:name="ref-stern_1994"/>
+    <w:bookmarkEnd w:id="224"/>
+    <w:bookmarkStart w:id="226" w:name="ref-stern_1994"/>
     <w:p>
       <w:pPr>
         <w:pStyle w:val="Bibliography"/>
@@ -7763,7 +7775,7 @@
       <w:r>
         <w:t xml:space="preserve"> </w:t>
       </w:r>
-      <w:hyperlink r:id="rId224">
+      <w:hyperlink r:id="rId225">
         <w:r>
           <w:rPr>
             <w:rStyle w:val="Hyperlink"/>
@@ -7775,8 +7787,8 @@
         <w:t xml:space="preserve">.</w:t>
       </w:r>
     </w:p>
-    <w:bookmarkEnd w:id="225"/>
-    <w:bookmarkStart w:id="227" w:name="ref-sullivan_2024"/>
+    <w:bookmarkEnd w:id="226"/>
+    <w:bookmarkStart w:id="228" w:name="ref-sullivan_2024"/>
     <w:p>
       <w:pPr>
         <w:pStyle w:val="Bibliography"/>
@@ -7827,7 +7839,7 @@
       <w:r>
         <w:t xml:space="preserve"> </w:t>
       </w:r>
-      <w:hyperlink r:id="rId226">
+      <w:hyperlink r:id="rId227">
         <w:r>
           <w:rPr>
             <w:rStyle w:val="Hyperlink"/>
@@ -7839,8 +7851,8 @@
         <w:t xml:space="preserve">.</w:t>
       </w:r>
     </w:p>
-    <w:bookmarkEnd w:id="227"/>
-    <w:bookmarkStart w:id="228" w:name="ref-tomasovych_kidwell_2009"/>
+    <w:bookmarkEnd w:id="228"/>
+    <w:bookmarkStart w:id="229" w:name="ref-tomasovych_kidwell_2009"/>
     <w:p>
       <w:pPr>
         <w:pStyle w:val="Bibliography"/>
@@ -7865,8 +7877,8 @@
         <w:t xml:space="preserve">35(1):94–118.</w:t>
       </w:r>
     </w:p>
-    <w:bookmarkEnd w:id="228"/>
-    <w:bookmarkStart w:id="230" w:name="ref-tomasovych_kidwell_2010"/>
+    <w:bookmarkEnd w:id="229"/>
+    <w:bookmarkStart w:id="231" w:name="ref-tomasovych_kidwell_2010"/>
     <w:p>
       <w:pPr>
         <w:pStyle w:val="Bibliography"/>
@@ -7893,7 +7905,7 @@
       <w:r>
         <w:t xml:space="preserve"> </w:t>
       </w:r>
-      <w:hyperlink r:id="rId229">
+      <w:hyperlink r:id="rId230">
         <w:r>
           <w:rPr>
             <w:rStyle w:val="Hyperlink"/>
@@ -7905,8 +7917,8 @@
         <w:t xml:space="preserve">.</w:t>
       </w:r>
     </w:p>
-    <w:bookmarkEnd w:id="230"/>
-    <w:bookmarkStart w:id="231" w:name="ref-willey_phillips_1958"/>
+    <w:bookmarkEnd w:id="231"/>
+    <w:bookmarkStart w:id="232" w:name="ref-willey_phillips_1958"/>
     <w:p>
       <w:pPr>
         <w:pStyle w:val="Bibliography"/>
@@ -7928,8 +7940,8 @@
         <w:t xml:space="preserve">. University of Chicago Press, Chicago.</w:t>
       </w:r>
     </w:p>
-    <w:bookmarkEnd w:id="231"/>
-    <w:bookmarkStart w:id="232" w:name="ref-williams_1954"/>
+    <w:bookmarkEnd w:id="232"/>
+    <w:bookmarkStart w:id="233" w:name="ref-williams_1954"/>
     <w:p>
       <w:pPr>
         <w:pStyle w:val="Bibliography"/>
@@ -7938,8 +7950,8 @@
         <w:t xml:space="preserve">Williams, Stephen. 1954. An Archeological Study of the Mississippian Culture in Southeast Missouri. PhD thesis, Yale University, New Haven.</w:t>
       </w:r>
     </w:p>
-    <w:bookmarkEnd w:id="232"/>
-    <w:bookmarkStart w:id="233" w:name="ref-williams_1990"/>
+    <w:bookmarkEnd w:id="233"/>
+    <w:bookmarkStart w:id="234" w:name="ref-williams_1990"/>
     <w:p>
       <w:pPr>
         <w:pStyle w:val="Bibliography"/>
@@ -7975,8 +7987,8 @@
         <w:t xml:space="preserve">, edited by David H. Dye and Cheryl Anne Cox, pp. 170–180. University of Alabama Press, Tuscaloosa.</w:t>
       </w:r>
     </w:p>
-    <w:bookmarkEnd w:id="233"/>
-    <w:bookmarkStart w:id="235" w:name="ref-wright_1943"/>
+    <w:bookmarkEnd w:id="234"/>
+    <w:bookmarkStart w:id="236" w:name="ref-wright_1943"/>
     <w:p>
       <w:pPr>
         <w:pStyle w:val="Bibliography"/>
@@ -8003,7 +8015,7 @@
       <w:r>
         <w:t xml:space="preserve"> </w:t>
       </w:r>
-      <w:hyperlink r:id="rId234">
+      <w:hyperlink r:id="rId235">
         <w:r>
           <w:rPr>
             <w:rStyle w:val="Hyperlink"/>
@@ -8015,8 +8027,8 @@
         <w:t xml:space="preserve">.</w:t>
       </w:r>
     </w:p>
-    <w:bookmarkEnd w:id="235"/>
-    <w:bookmarkStart w:id="237" w:name="ref-wright_1951"/>
+    <w:bookmarkEnd w:id="236"/>
+    <w:bookmarkStart w:id="238" w:name="ref-wright_1951"/>
     <w:p>
       <w:pPr>
         <w:pStyle w:val="Bibliography"/>
@@ -8043,7 +8055,7 @@
       <w:r>
         <w:t xml:space="preserve"> </w:t>
       </w:r>
-      <w:hyperlink r:id="rId236">
+      <w:hyperlink r:id="rId237">
         <w:r>
           <w:rPr>
             <w:rStyle w:val="Hyperlink"/>
@@ -8055,8 +8067,8 @@
         <w:t xml:space="preserve">.</w:t>
       </w:r>
     </w:p>
-    <w:bookmarkEnd w:id="237"/>
-    <w:bookmarkStart w:id="239" w:name="ref-youngblood_miton_morin_2023"/>
+    <w:bookmarkEnd w:id="238"/>
+    <w:bookmarkStart w:id="240" w:name="ref-youngblood_miton_morin_2023"/>
     <w:p>
       <w:pPr>
         <w:pStyle w:val="Bibliography"/>
@@ -8083,7 +8095,7 @@
       <w:r>
         <w:t xml:space="preserve"> </w:t>
       </w:r>
-      <w:hyperlink r:id="rId238">
+      <w:hyperlink r:id="rId239">
         <w:r>
           <w:rPr>
             <w:rStyle w:val="Hyperlink"/>
@@ -8095,10 +8107,10 @@
         <w:t xml:space="preserve">.</w:t>
       </w:r>
     </w:p>
-    <w:bookmarkEnd w:id="239"/>
     <w:bookmarkEnd w:id="240"/>
     <w:bookmarkEnd w:id="241"/>
     <w:bookmarkEnd w:id="242"/>
+    <w:bookmarkEnd w:id="243"/>
     <w:sectPr>
       <w:footnotePr>
         <w:numRestart w:val="eachSect"/>

</xml_diff>

<commit_message>
Figure 1 and Figure 9A: drop counties/state borders, add eastern hydrology; add style refs
Same change as the working repo: Figures 1 and 9A drop county lines and state
political boundaries (Mississippi as water, state labels kept) and add the
wider region's major rivers from Natural Earth on the eastern side.
basin_basemap gains show_counties/show_states flags. Add the style/neutrality
references (dunnell_1995b, obrien_leonard_2001, lipo_madsen_2001), cite them,
and fix the lipo_madsen_2001 citation key. Rebuild docx/pdf.
</commit_message>
<xml_diff>
--- a/docs/manuscript/MAIN_TEXT.docx
+++ b/docs/manuscript/MAIN_TEXT.docx
@@ -2,7 +2,7 @@
 <file path=word/document.xml><?xml version="1.0" encoding="utf-8"?>
 <w:document xmlns:w="http://schemas.openxmlformats.org/wordprocessingml/2006/main" xmlns:m="http://schemas.openxmlformats.org/officeDocument/2006/math" xmlns:r="http://schemas.openxmlformats.org/officeDocument/2006/relationships" xmlns:o="urn:schemas-microsoft-com:office:office" xmlns:v="urn:schemas-microsoft-com:vml" xmlns:w10="urn:schemas-microsoft-com:office:word" xmlns:a="http://schemas.openxmlformats.org/drawingml/2006/main" xmlns:pic="http://schemas.openxmlformats.org/drawingml/2006/picture" xmlns:wp="http://schemas.openxmlformats.org/drawingml/2006/wordprocessingDrawing">
   <w:body>
-    <w:bookmarkStart w:id="243" w:name="X093902eb68652ea32f5548e74607f4e4b0f6699"/>
+    <w:bookmarkStart w:id="246" w:name="X093902eb68652ea32f5548e74607f4e4b0f6699"/>
     <w:p>
       <w:pPr>
         <w:pStyle w:val="Heading1"/>
@@ -475,7 +475,7 @@
         <w:pStyle w:val="BodyText"/>
       </w:pPr>
       <w:r>
-        <w:t xml:space="preserve">Decorated ceramics provide an instrument for the test. Because stylistic variants are copied among potters through social learning networks, the spatial and temporal structure of decorated-class frequencies reflects the structure of past interactions. A genuine social boundary, had one existed, would make learning appear conformist within groups and divergent between them, fragmenting the single drifting pool that continuous interaction maintains</w:t>
+        <w:t xml:space="preserve">Decorated ceramics provide an instrument for the test. Because stylistic variants are copied among potters through social learning networks, the spatial and temporal structure of decorated-class frequencies reflects past interactions. A genuine social boundary, had one existed, would make learning appear conformist within groups and divergent between them, fragmenting the single drifting pool that continuous interaction maintains</w:t>
       </w:r>
       <w:r>
         <w:t xml:space="preserve"> </w:t>
@@ -525,7 +525,7 @@
         <w:t xml:space="preserve"> </w:t>
       </w:r>
       <w:r>
-        <w:t xml:space="preserve">(Dunnell 1978, 1980, 1995; Ladefoged and Graves 2000)</w:t>
+        <w:t xml:space="preserve">(Dunnell 1978, 1980, 1995a; Ladefoged and Graves 2000)</w:t>
       </w:r>
       <w:r>
         <w:t xml:space="preserve">, and it converges with the recognition that the deposit is not a frozen tableau</w:t>
@@ -571,7 +571,7 @@
         <w:pStyle w:val="BodyText"/>
       </w:pPr>
       <w:r>
-        <w:t xml:space="preserve">The argument proceeds in three steps. First, we evaluate Parkin as a hierarchy and find that no line of evidence, settlement, exchange, or transmission supports it. Second, we ask what generates the St. Francis basin phase structure, and show that neutral drift on the basin’s geography reproduces the observed signatures. A bounded-groups process would leave a far sharper structure than the data demonstrate. Hence, we conclude that the phase is a portion of a continuous interaction structure rather than a closed group with a boundary, and Parkin is a transmission bridge rather than the core of a group. Third, we widen the test to the other late-period phases of the valley and ask whether decorated-ceramic boundaries exist. A boundary that exceeds neutral drift appears only between the central-valley and lower-valley blocks, and even there, it is confounded with the early-to-late turnover of the class repertoire. It cannot yet be interpreted as a synchronic social division. At the scale where the phase is drawn, it is largely indistinguishable from spatially structured drift. We conclude that Parkin is best understood as a prominent node in a continuous interaction field rather than the capital of a polity.</w:t>
+        <w:t xml:space="preserve">The argument proceeds in three steps. First, we evaluate the Parkin as part of a hierarchy and find that no line of evidence, settlement, exchange, or transmission supports it. Second, we ask what generates the St. Francis basin phase structure, and show that neutral drift on the basin’s geography reproduces the observed signatures. A bounded-groups process would leave a far sharper structure than the data demonstrate. Hence, we conclude that the phase is a portion of a continuous interaction structure rather than a closed group with a boundary, and Parkin is a transmission bridge rather than the core of a group. Third, we widen the test to the other late-period phases of the valley and ask whether decorated-ceramic boundaries exist. A boundary that exceeds neutral drift appears only between the central-valley and lower-valley blocks, and even there, it is confounded with the early-to-late turnover of the class repertoire. It cannot yet be interpreted as a synchronic social division. At the scale where the phase is drawn, it is largely indistinguishable from spatially structured drift. We conclude that Parkin is best understood as a prominent node in a continuous field of interaction rather than the capital of a polity.</w:t>
       </w:r>
     </w:p>
     <w:bookmarkEnd w:id="14"/>
@@ -598,7 +598,7 @@
         <w:pStyle w:val="FirstParagraph"/>
       </w:pPr>
       <w:r>
-        <w:t xml:space="preserve">In evaluating the phase concept, we take a materialist approach to cultural transmission. It frames the question of phases differently from how the central-valley record is usually interpreted. Archaeologists are traditionally trained to assume the past was made of bounded units: the phase, the polity, the society. These are treated as discrete entities with members and edges, and a cluster of similar assemblages is taken to be one of them. We treat transmission instead as a continuous, variable field of copying events among potters, with no intrinsic boundaries. Interaction falls off with distance, and learning is more local in some places and times than in others. A group, on this view, is not a thing with a boundary but a region where copying is locally intensified. Similarity is a matter of degree, set by how copying is distributed across space. That field can also close by degree. Interaction narrows until potters copy mostly within a subset and rarely outside it, producing something that resembles the bounded groups archaeologists assume.</w:t>
+        <w:t xml:space="preserve">In evaluating the phase concept, we take a materialist approach to cultural transmission. This approach frames the question of phases differently from how the central-valley record is usually interpreted. Archaeologists are traditionally trained to assume the past was made of bounded units: the phase, the polity, the society. These units are treated as discrete entities with members and edges. A cluster of similar assemblages is considered one of them. In contrast, we treat transmission instead as a continuous, variable field of copying events among potters, with no intrinsic boundaries. Interaction falls off with distance, and learning is more local in some places and times than in others. A group, on this view, is not a thing with a boundary but a region where copying is locally intensified. Similarity is a matter of degree, set by how copying is distributed across space. The patterns of interaction can also be closed by degree. In this scenario, interaction narrows until potters copy mostly within a subset and rarely outside it, producing something that resembles the bounded groups that archaeologists assume.</w:t>
       </w:r>
     </w:p>
     <w:p>
@@ -606,7 +606,7 @@
         <w:pStyle w:val="BodyText"/>
       </w:pPr>
       <w:r>
-        <w:t xml:space="preserve">The phase gives the central-valley record its social structure. Operationally, a phase is a set of assemblages that seriate together and cluster in space. It is interpreted, however, as a social entity, a bounded interacting community, on the premise that assemblages are more alike within a phase than across its edges and so record who interacted with whom</w:t>
+        <w:t xml:space="preserve">The phase gives the central valley record its social structure. Operationally, a phase is a set of assemblages that seriate together and cluster in space. It is interpreted, however, as a social entity, a bounded, interacting community, on the premise that assemblages that are more alike within a phase than across its edges are generated by individuals who interacted mostly within</w:t>
       </w:r>
       <w:r>
         <w:t xml:space="preserve"> </w:t>
@@ -615,7 +615,7 @@
         <w:t xml:space="preserve">(McNutt 1996; Morse and Morse 1983; Phillips et al. 1951; Williams 1954)</w:t>
       </w:r>
       <w:r>
-        <w:t xml:space="preserve">. The premise is not arbitrary. Under the neutral transmission model it would hold if learning were confined within social boundaries, so that decoration drifted in separate pools and diverged between them. The difficulty is that the same pattern arises with no boundary at all. When interaction declines with distance, spatially structured drift concentrates similarity among near neighbors, the isolation-by-distance expectation for cultural similarity</w:t>
+        <w:t xml:space="preserve">. The premise is not an unreasonable possibility. Under the neutral transmission model, it would hold if learning were confined within social boundaries, so that decoration drifted in separate pools and diverged between them. The difficulty is that the same pattern arises with no boundary at all. When interaction declines with distance, spatially structured drift concentrates similarity among near neighbors. This is the isolation-by-distance expectation for cultural similarity</w:t>
       </w:r>
       <w:r>
         <w:t xml:space="preserve"> </w:t>
@@ -624,7 +624,7 @@
         <w:t xml:space="preserve">(Lipo et al. 2021; Neiman 1995; Shennan et al. 2015)</w:t>
       </w:r>
       <w:r>
-        <w:t xml:space="preserve">. A cluster of similar assemblages therefore need not record a bounded group. What would mark a real bounded group is closure beyond what distance predicts, and that excess is the signal we test for. The operational question is whether the similarity structure records bounded interaction or spatially structured drift. Throughout, we call decoration transmitted preferentially within a group and divergent between groups a marker, as opposed to a neutral style drifting in one shared pool. A marker is the ceramic proxy for interaction closing into a bounded group, so the drift-versus-groups question is equivalently a question of neutral style versus marker.</w:t>
+        <w:t xml:space="preserve">. A cluster of similar assemblages, therefore, need not record a bounded group. What would mark a real bounded group is closure beyond what distance predicts, and that excess is the signal we must test for. Our operational question is whether the structure of similarity records bounds interaction or spatially structured drift. We can treat decoration transmitted preferentially within a group and divergent between groups as a marker, rather than a neutral style drifting in a shared pool. A marker is the ceramic proxy for interaction closing into a bounded group, so the drift-versus-groups question, then, is equivalently a question of neutral style versus marker.</w:t>
       </w:r>
     </w:p>
     <w:bookmarkEnd w:id="15"/>
@@ -642,13 +642,13 @@
         <w:pStyle w:val="FirstParagraph"/>
       </w:pPr>
       <w:r>
-        <w:t xml:space="preserve">Decorated ceramics record the structure of social interaction because stylistic variants are copied between potters along social-learning networks. Under the neutral model of cultural transmission, stylistic variants behave like selectively neutral alleles whose frequencies are governed by innovation and drift in a finite population of interacting learners</w:t>
-      </w:r>
-      <w:r>
-        <w:t xml:space="preserve"> </w:t>
-      </w:r>
-      <w:r>
-        <w:t xml:space="preserve">(Bentley et al. 2004; Bentley 2008; Eerkens and Lipo 2005; Neiman 1995)</w:t>
+        <w:t xml:space="preserve">Measures of variability in decorated ceramics can capture the structure of social interaction because stylistic variants are copied among potters through social learning networks. Under the neutral model of cultural transmission, stylistic variants behave like selectively neutral alleles whose frequencies are governed by innovation and drift in a finite population of interacting learners</w:t>
+      </w:r>
+      <w:r>
+        <w:t xml:space="preserve"> </w:t>
+      </w:r>
+      <w:r>
+        <w:t xml:space="preserve">(Bentley et al. 2004; Bentley 2008; Dunnell 1978; Eerkens and Lipo 2005; Neiman 1995)</w:t>
       </w:r>
       <w:r>
         <w:t xml:space="preserve">. Neutral style is the null condition: assemblages drawn from a single interacting community share one drifting pool, and their decorated-class frequencies admit a single battleship-curve seriation</w:t>
@@ -657,7 +657,7 @@
         <w:t xml:space="preserve"> </w:t>
       </w:r>
       <w:r>
-        <w:t xml:space="preserve">(Lipo et al. 2015)</w:t>
+        <w:t xml:space="preserve">(Dunnell 1995b; Lipo 2001; Lipo et al. 2015; Lipo and Madsen 2001; O’Brien and Leonard 2001)</w:t>
       </w:r>
       <w:r>
         <w:t xml:space="preserve">. Assortment, the tendency for like to learn from like, so that interaction sorts into distinct groups, changes this. If learning becomes restricted within emerging social boundaries, decoration shifts from the expectations of neutral, stylistic variation toward a constrained set of possibilities, transmitted by conformist copying within groups and divergent between them, and the single transmission field fragments</w:t>
@@ -734,7 +734,7 @@
         <w:pStyle w:val="FirstParagraph"/>
       </w:pPr>
       <w:r>
-        <w:t xml:space="preserve">The late pre-contact central Mississippi Valley supports two interpretations of the same record, and they make opposite predictions for the transmission signature. The first holds that the region was moving toward greater complexity. In northeastern Arkansas the Parkin phase (ca. A.D. 1400 to 1600, with a thin protohistoric tail, consistent with the basin radiocarbon reported below) is a dense cluster of fortified, moated St-Francis-type towns along the St. Francis and Tyronza rivers. It is dominated by the Parkin site, a roughly 17-acre palisaded center whose platform mound rises more than 6 m, which the De Soto chronicles place as the seat of the paramount of Casqui</w:t>
+        <w:t xml:space="preserve">The late pre-contact central Mississippi Valley supports two interpretations of the same record, and they make opposite predictions for the transmission signature. The first holds that the region was moving toward greater complexity. In northeastern Arkansas, the Parkin phase (ca. A.D. 1400 to 1600, with a thin protohistoric tail, consistent with the basin radiocarbon reported below) is a dense cluster of fortified, moated St. Francis-type towns along the St. Francis and Tyronza rivers. It is dominated by the Parkin site, a roughly 17-acre palisaded center whose platform mound rises more than 6 m, which the De Soto chronicles place as the seat of the paramount of Casqui</w:t>
       </w:r>
       <w:r>
         <w:t xml:space="preserve"> </w:t>
@@ -958,7 +958,7 @@
         <w:t xml:space="preserve">(Wright 1951)</w:t>
       </w:r>
       <w:r>
-        <w:t xml:space="preserve">, a standard population-genetic index of group differentiation. In cultural transmission, between-group variation in socially learned traits routinely exceeds its genetic counterpart</w:t>
+        <w:t xml:space="preserve">, a standard population-genetic index of group differentiation. In cultural transmission, between-group variation in socially learned traits routinely exceeds that of their genetic counterparts</w:t>
       </w:r>
       <w:r>
         <w:t xml:space="preserve"> </w:t>
@@ -1992,7 +1992,7 @@
         <w:pStyle w:val="FirstParagraph"/>
       </w:pPr>
       <w:r>
-        <w:t xml:space="preserve">The argument uses four simulations, each answering a different question. An idealized validation tests whether the four signatures, in principle, separate a bounded interaction group from its three mimics on large, clean synthetic assemblages (Figure S4). A record-matched recovery test assesses which signatures can detect a known, injected closure at the real record’s sample sizes and time-averaging (Figure 4). A positive control test, which generates neutral spatial drift or bounded groups, reproduces the structure observed in the basin (Figure S5). A forward demonstration runs neutral drift on the real site geography with no boundary imposed, counts how many phase-like groups it produces, and checks whether the named phases exceed that number (Figures 8 and 9). The first two establish what the test can resolve on a record of this size; the second two identify which process the data match. We describe the validation and recovery here and the two drift simulations in the next subsection.</w:t>
+        <w:t xml:space="preserve">The argument uses four simulations, each answering a different question. An idealized validation tests whether the four signatures, in principle, separate a bounded interaction group from its three mimics on large, clean synthetic assemblages (Figure S4). A record-matched recovery test assesses which signatures can detect a known, injected closure at the real record’s sample sizes and time-averaging (Figure 4). A positive control test that generates neutral spatial drift or bounded groups reproduces the structure observed in the basin (Figure S5). A forward demonstration runs neutral drift on the real site geography with no boundary imposed, counts how many phase-like groups it produces, and checks whether the named phases exceed that number (Figures 8 and 9). The first two establish what the test can resolve on a record of this size; the second two identify which process the data match. We describe the validation and recovery here and the two drift simulations in the next subsection.</w:t>
       </w:r>
     </w:p>
     <w:p>
@@ -2231,7 +2231,7 @@
         <w:pStyle w:val="BodyText"/>
       </w:pPr>
       <w:r>
-        <w:t xml:space="preserve">Applied to the St. Francis basin, that one reliable signature shows no closure into bounded groups, and the apparent signals in the others are confounded by sample size (Figure 5). The raw trajectory along the seriation axis seems to dissociate. Two of its trends, however, are sampling artifacts: because assemblage size trends with seriation position, the size-sensitive estimators move with it. Once every assemblage is trimmed to a common sherd count via subsampling, cultural F_ST falls from a raw value of +0.60 to +0.01. Its uncertainty range runs from no closure to a moderate signal, so it is uninformative rather than a resolved positive. The neutrality departure is likewise size-sensitive (its raw -0.94 only weakens to -0.83 under size control). The recovery shows that it does not track closure in either direction here, so it, too, cannot be interpreted as a transmission signal. On the recovery curve, the size-controlled empirical F_ST corresponds to a nominal injected strength of about 0.35, below the resolution limit. The record, therefore, shows no detectable closure of moderate or greater strength. The negative is informative for a closure of moderate or greater strength, which would have registered and is absent. It cannot exclude a weaker closure that, given a record of this size and time-averaging, is underpowered to resolve. The positive control reported next shows that the structure actually present is what neutral drift produces. The result is therefore not only that no bounded group is detectable, but that the structure present is what continuous, spatially structured interaction would produce.</w:t>
+        <w:t xml:space="preserve">Applied to the St. Francis basin, that one reliable signature shows no closure into bounded groups, and the apparent signals in the others are confounded by sample size (Figure 5). The raw trajectory along the seriation axis seems to dissociate. Two of its trends, however, are sampling artifacts: because assemblage size trends with seriation position, the size-sensitive estimators move with it. Once all assemblages are trimmed to a common sherd count via subsampling, cultural F_ST falls from a raw value of +0.60 to +0.01. Its uncertainty range runs from no closure to a moderate signal, so it is uninformative rather than a resolved positive. The neutrality departure is likewise size-sensitive (its raw -0.94 only weakens to -0.83 under size control). The recovery shows that it does not track closure in either direction here, so it, too, cannot be interpreted as a transmission signal. On the recovery curve, the size-controlled empirical F_ST corresponds to a nominal injected strength of about 0.35, below the resolution limit. The record, therefore, shows no detectable closure of moderate or greater strength. The negative is informative for a closure of moderate or greater strength, which would have registered and is absent. It cannot exclude a weaker closure that, given a record of this size and time-averaging, is underpowered to resolve. The positive control reported next shows that the structure actually present is what neutral drift produces. The result is therefore not only that no bounded group is detectable, but that the structure present is what continuous, spatially structured interaction would produce.</w:t>
       </w:r>
     </w:p>
     <w:p>
@@ -2377,7 +2377,7 @@
         <w:t xml:space="preserve">(Dunnell 1970; Lipo et al. 2015)</w:t>
       </w:r>
       <w:r>
-        <w:t xml:space="preserve">. Where a conventional seriation would accept one rough ordering and move on, the deterministic method asks whether even one ordering can satisfy every class at once, and reports when none can. A single community drawing on a shared, drifting pool of designs meets that requirement under a single ordering. When learning is partitioned among groups, each with its own rise and fall of styles, no single ordering can hold every class unimodal at once, and the assemblages resolve into several mutually incompatible orderings. The departures a conventional seriation would dismiss as minor irregularities are, interpreted this way, the signature of more than one interaction community. The number of maximal co-seriable groups, together with the number of groups any one assemblage joins, measures that fragmentation directly</w:t>
+        <w:t xml:space="preserve">. Where a conventional seriation would accept one rough ordering and move on, the deterministic method asks whether even one ordering can satisfy every class at once, and reports when none can. A single community drawing on a shared, drifting pool of designs meets that requirement under a single ordering. When learning is partitioned among groups, each with its own rise and fall of styles, no single ordering can hold every class unimodal at once, and the assemblages resolve into several mutually incompatible orderings. The departures from a conventional seriation would be dismissed as minor irregularities, but, interpreted this way, they would reveal the signature of more than one interaction community. The number of maximal co-seriable groups, together with the number of groups any one assemblage joins, measures that fragmentation directly</w:t>
       </w:r>
       <w:r>
         <w:t xml:space="preserve"> </w:t>
@@ -3111,7 +3111,7 @@
         <w:t xml:space="preserve"> </w:t>
       </w:r>
       <w:r>
-        <w:t xml:space="preserve">(Dunnell 1995)</w:t>
+        <w:t xml:space="preserve">(Dunnell 1995a)</w:t>
       </w:r>
       <w:r>
         <w:t xml:space="preserve">. A signature that interaction has closed into a bounded group should be theoretically sufficient, dynamically sufficient, and empirically sufficient, the last meaning matched to the quality of the record rather than to an imagined snapshot. Ours meet the first by construction, each entailed by the transmission model rather than borrowed by analogy</w:t>
@@ -3199,7 +3199,7 @@
       </w:r>
     </w:p>
     <w:bookmarkEnd w:id="59"/>
-    <w:bookmarkStart w:id="242" w:name="references"/>
+    <w:bookmarkStart w:id="245" w:name="references"/>
     <w:p>
       <w:pPr>
         <w:pStyle w:val="Heading2"/>
@@ -3208,7 +3208,7 @@
         <w:t xml:space="preserve">References</w:t>
       </w:r>
     </w:p>
-    <w:bookmarkStart w:id="241" w:name="refs"/>
+    <w:bookmarkStart w:id="244" w:name="refs"/>
     <w:bookmarkStart w:id="60" w:name="ref-anderson_1996"/>
     <w:p>
       <w:pPr>
@@ -4333,7 +4333,7 @@
         <w:pStyle w:val="Bibliography"/>
       </w:pPr>
       <w:r>
-        <w:t xml:space="preserve">Dunnell, Robert C. 1995. What Is It That Actually Evolves? In</w:t>
+        <w:t xml:space="preserve">Dunnell, Robert C. 1995a. What Is It That Actually Evolves? In</w:t>
       </w:r>
       <w:r>
         <w:t xml:space="preserve"> </w:t>
@@ -4350,7 +4350,17 @@
       </w:r>
     </w:p>
     <w:bookmarkEnd w:id="107"/>
-    <w:bookmarkStart w:id="108" w:name="ref-dye_cox_1990"/>
+    <w:bookmarkStart w:id="108" w:name="ref-dunnell_1995b"/>
+    <w:p>
+      <w:pPr>
+        <w:pStyle w:val="Bibliography"/>
+      </w:pPr>
+      <w:r>
+        <w:t xml:space="preserve">Dunnell, Robert C. 1995b. Style: Concepts and Practice.</w:t>
+      </w:r>
+    </w:p>
+    <w:bookmarkEnd w:id="108"/>
+    <w:bookmarkStart w:id="109" w:name="ref-dye_cox_1990"/>
     <w:p>
       <w:pPr>
         <w:pStyle w:val="Bibliography"/>
@@ -4386,8 +4396,8 @@
         <w:t xml:space="preserve">. University of Alabama Press, Tuscaloosa.</w:t>
       </w:r>
     </w:p>
-    <w:bookmarkEnd w:id="108"/>
-    <w:bookmarkStart w:id="110" w:name="ref-eerkens_lipo_2005"/>
+    <w:bookmarkEnd w:id="109"/>
+    <w:bookmarkStart w:id="111" w:name="ref-eerkens_lipo_2005"/>
     <w:p>
       <w:pPr>
         <w:pStyle w:val="Bibliography"/>
@@ -4414,7 +4424,7 @@
       <w:r>
         <w:t xml:space="preserve"> </w:t>
       </w:r>
-      <w:hyperlink r:id="rId109">
+      <w:hyperlink r:id="rId110">
         <w:r>
           <w:rPr>
             <w:rStyle w:val="Hyperlink"/>
@@ -4426,8 +4436,8 @@
         <w:t xml:space="preserve">.</w:t>
       </w:r>
     </w:p>
-    <w:bookmarkEnd w:id="110"/>
-    <w:bookmarkStart w:id="112" w:name="ref-eerkens_lipo_2007"/>
+    <w:bookmarkEnd w:id="111"/>
+    <w:bookmarkStart w:id="113" w:name="ref-eerkens_lipo_2007"/>
     <w:p>
       <w:pPr>
         <w:pStyle w:val="Bibliography"/>
@@ -4454,7 +4464,7 @@
       <w:r>
         <w:t xml:space="preserve"> </w:t>
       </w:r>
-      <w:hyperlink r:id="rId111">
+      <w:hyperlink r:id="rId112">
         <w:r>
           <w:rPr>
             <w:rStyle w:val="Hyperlink"/>
@@ -4466,8 +4476,8 @@
         <w:t xml:space="preserve">.</w:t>
       </w:r>
     </w:p>
-    <w:bookmarkEnd w:id="112"/>
-    <w:bookmarkStart w:id="113" w:name="ref-ewens_1972"/>
+    <w:bookmarkEnd w:id="113"/>
+    <w:bookmarkStart w:id="114" w:name="ref-ewens_1972"/>
     <w:p>
       <w:pPr>
         <w:pStyle w:val="Bibliography"/>
@@ -4492,8 +4502,8 @@
         <w:t xml:space="preserve">3(1):87–112.</w:t>
       </w:r>
     </w:p>
-    <w:bookmarkEnd w:id="113"/>
-    <w:bookmarkStart w:id="115" w:name="ref-feder_kryazhimskiy_plotkin_2014"/>
+    <w:bookmarkEnd w:id="114"/>
+    <w:bookmarkStart w:id="116" w:name="ref-feder_kryazhimskiy_plotkin_2014"/>
     <w:p>
       <w:pPr>
         <w:pStyle w:val="Bibliography"/>
@@ -4520,7 +4530,7 @@
       <w:r>
         <w:t xml:space="preserve"> </w:t>
       </w:r>
-      <w:hyperlink r:id="rId114">
+      <w:hyperlink r:id="rId115">
         <w:r>
           <w:rPr>
             <w:rStyle w:val="Hyperlink"/>
@@ -4532,8 +4542,8 @@
         <w:t xml:space="preserve">.</w:t>
       </w:r>
     </w:p>
-    <w:bookmarkEnd w:id="115"/>
-    <w:bookmarkStart w:id="117" w:name="ref-fogarty_kandler_creanza_2024"/>
+    <w:bookmarkEnd w:id="116"/>
+    <w:bookmarkStart w:id="118" w:name="ref-fogarty_kandler_creanza_2024"/>
     <w:p>
       <w:pPr>
         <w:pStyle w:val="Bibliography"/>
@@ -4560,7 +4570,7 @@
       <w:r>
         <w:t xml:space="preserve"> </w:t>
       </w:r>
-      <w:hyperlink r:id="rId116">
+      <w:hyperlink r:id="rId117">
         <w:r>
           <w:rPr>
             <w:rStyle w:val="Hyperlink"/>
@@ -4572,8 +4582,8 @@
         <w:t xml:space="preserve">.</w:t>
       </w:r>
     </w:p>
-    <w:bookmarkEnd w:id="117"/>
-    <w:bookmarkStart w:id="118" w:name="ref-fox_1998"/>
+    <w:bookmarkEnd w:id="118"/>
+    <w:bookmarkStart w:id="119" w:name="ref-fox_1998"/>
     <w:p>
       <w:pPr>
         <w:pStyle w:val="Bibliography"/>
@@ -4595,8 +4605,8 @@
         <w:t xml:space="preserve">, edited by Michael J. O’Brien and Robert C. Dunnell, pp. 31–58. University of Alabama Press, Tuscaloosa.</w:t>
       </w:r>
     </w:p>
-    <w:bookmarkEnd w:id="118"/>
-    <w:bookmarkStart w:id="119" w:name="ref-graves_cachola-abad_1996"/>
+    <w:bookmarkEnd w:id="119"/>
+    <w:bookmarkStart w:id="120" w:name="ref-graves_cachola-abad_1996"/>
     <w:p>
       <w:pPr>
         <w:pStyle w:val="Bibliography"/>
@@ -4630,8 +4640,8 @@
         <w:t xml:space="preserve">31(1):19–32.</w:t>
       </w:r>
     </w:p>
-    <w:bookmarkEnd w:id="119"/>
-    <w:bookmarkStart w:id="120" w:name="ref-hally_1993"/>
+    <w:bookmarkEnd w:id="120"/>
+    <w:bookmarkStart w:id="121" w:name="ref-hally_1993"/>
     <w:p>
       <w:pPr>
         <w:pStyle w:val="Bibliography"/>
@@ -4665,8 +4675,8 @@
         <w:t xml:space="preserve">, edited by James B. Stoltman, pp. 143–167. Archaeological Report No. 25. Mississippi Department of Archives; History, Jackson.</w:t>
       </w:r>
     </w:p>
-    <w:bookmarkEnd w:id="120"/>
-    <w:bookmarkStart w:id="121" w:name="ref-hally_1996"/>
+    <w:bookmarkEnd w:id="121"/>
+    <w:bookmarkStart w:id="122" w:name="ref-hally_1996"/>
     <w:p>
       <w:pPr>
         <w:pStyle w:val="Bibliography"/>
@@ -4700,8 +4710,8 @@
         <w:t xml:space="preserve">, edited by John F. Scarry, pp. 92–127. University Press of Florida, Gainesville.</w:t>
       </w:r>
     </w:p>
-    <w:bookmarkEnd w:id="121"/>
-    <w:bookmarkStart w:id="123" w:name="ref-henrich_2001"/>
+    <w:bookmarkEnd w:id="122"/>
+    <w:bookmarkStart w:id="124" w:name="ref-henrich_2001"/>
     <w:p>
       <w:pPr>
         <w:pStyle w:val="Bibliography"/>
@@ -4728,7 +4738,7 @@
       <w:r>
         <w:t xml:space="preserve"> </w:t>
       </w:r>
-      <w:hyperlink r:id="rId122">
+      <w:hyperlink r:id="rId123">
         <w:r>
           <w:rPr>
             <w:rStyle w:val="Hyperlink"/>
@@ -4740,8 +4750,8 @@
         <w:t xml:space="preserve">.</w:t>
       </w:r>
     </w:p>
-    <w:bookmarkEnd w:id="123"/>
-    <w:bookmarkStart w:id="125" w:name="ref-henrich_2004"/>
+    <w:bookmarkEnd w:id="124"/>
+    <w:bookmarkStart w:id="126" w:name="ref-henrich_2004"/>
     <w:p>
       <w:pPr>
         <w:pStyle w:val="Bibliography"/>
@@ -4780,7 +4790,7 @@
       <w:r>
         <w:t xml:space="preserve"> </w:t>
       </w:r>
-      <w:hyperlink r:id="rId124">
+      <w:hyperlink r:id="rId125">
         <w:r>
           <w:rPr>
             <w:rStyle w:val="Hyperlink"/>
@@ -4792,8 +4802,8 @@
         <w:t xml:space="preserve">.</w:t>
       </w:r>
     </w:p>
-    <w:bookmarkEnd w:id="125"/>
-    <w:bookmarkStart w:id="127" w:name="ref-henrich_boyd_1998"/>
+    <w:bookmarkEnd w:id="126"/>
+    <w:bookmarkStart w:id="128" w:name="ref-henrich_boyd_1998"/>
     <w:p>
       <w:pPr>
         <w:pStyle w:val="Bibliography"/>
@@ -4820,7 +4830,7 @@
       <w:r>
         <w:t xml:space="preserve"> </w:t>
       </w:r>
-      <w:hyperlink r:id="rId126">
+      <w:hyperlink r:id="rId127">
         <w:r>
           <w:rPr>
             <w:rStyle w:val="Hyperlink"/>
@@ -4832,8 +4842,8 @@
         <w:t xml:space="preserve">.</w:t>
       </w:r>
     </w:p>
-    <w:bookmarkEnd w:id="127"/>
-    <w:bookmarkStart w:id="128" w:name="ref-holdaway_wandsnider_2008"/>
+    <w:bookmarkEnd w:id="128"/>
+    <w:bookmarkStart w:id="129" w:name="ref-holdaway_wandsnider_2008"/>
     <w:p>
       <w:pPr>
         <w:pStyle w:val="Bibliography"/>
@@ -4855,8 +4865,8 @@
         <w:t xml:space="preserve">. University of Utah Press, Salt Lake City.</w:t>
       </w:r>
     </w:p>
-    <w:bookmarkEnd w:id="128"/>
-    <w:bookmarkStart w:id="130" w:name="ref-holland-lulewicz_ritchison_2021"/>
+    <w:bookmarkEnd w:id="129"/>
+    <w:bookmarkStart w:id="131" w:name="ref-holland-lulewicz_ritchison_2021"/>
     <w:p>
       <w:pPr>
         <w:pStyle w:val="Bibliography"/>
@@ -4883,7 +4893,7 @@
       <w:r>
         <w:t xml:space="preserve"> </w:t>
       </w:r>
-      <w:hyperlink r:id="rId129">
+      <w:hyperlink r:id="rId130">
         <w:r>
           <w:rPr>
             <w:rStyle w:val="Hyperlink"/>
@@ -4895,8 +4905,8 @@
         <w:t xml:space="preserve">.</w:t>
       </w:r>
     </w:p>
-    <w:bookmarkEnd w:id="130"/>
-    <w:bookmarkStart w:id="131" w:name="ref-house_1991"/>
+    <w:bookmarkEnd w:id="131"/>
+    <w:bookmarkStart w:id="132" w:name="ref-house_1991"/>
     <w:p>
       <w:pPr>
         <w:pStyle w:val="Bibliography"/>
@@ -4938,8 +4948,8 @@
         <w:t xml:space="preserve">. PhD thesis, Southern Illinois University at Carbondale.</w:t>
       </w:r>
     </w:p>
-    <w:bookmarkEnd w:id="131"/>
-    <w:bookmarkStart w:id="132" w:name="ref-house_1993"/>
+    <w:bookmarkEnd w:id="132"/>
+    <w:bookmarkStart w:id="133" w:name="ref-house_1993"/>
     <w:p>
       <w:pPr>
         <w:pStyle w:val="Bibliography"/>
@@ -4964,8 +4974,8 @@
         <w:t xml:space="preserve">12(1):21–32.</w:t>
       </w:r>
     </w:p>
-    <w:bookmarkEnd w:id="132"/>
-    <w:bookmarkStart w:id="133" w:name="ref-hudson_smith_depratter_1990"/>
+    <w:bookmarkEnd w:id="133"/>
+    <w:bookmarkStart w:id="134" w:name="ref-hudson_smith_depratter_1990"/>
     <w:p>
       <w:pPr>
         <w:pStyle w:val="Bibliography"/>
@@ -5025,8 +5035,8 @@
         <w:t xml:space="preserve">, edited by David H. Dye and Cheryl Anne Cox, pp. 181–207. University of Alabama Press, Tuscaloosa.</w:t>
       </w:r>
     </w:p>
-    <w:bookmarkEnd w:id="133"/>
-    <w:bookmarkStart w:id="135" w:name="ref-hunt_2006"/>
+    <w:bookmarkEnd w:id="134"/>
+    <w:bookmarkStart w:id="136" w:name="ref-hunt_2006"/>
     <w:p>
       <w:pPr>
         <w:pStyle w:val="Bibliography"/>
@@ -5053,7 +5063,7 @@
       <w:r>
         <w:t xml:space="preserve"> </w:t>
       </w:r>
-      <w:hyperlink r:id="rId134">
+      <w:hyperlink r:id="rId135">
         <w:r>
           <w:rPr>
             <w:rStyle w:val="Hyperlink"/>
@@ -5065,8 +5075,8 @@
         <w:t xml:space="preserve">.</w:t>
       </w:r>
     </w:p>
-    <w:bookmarkEnd w:id="135"/>
-    <w:bookmarkStart w:id="137" w:name="ref-hunt_bell_travis_2008"/>
+    <w:bookmarkEnd w:id="136"/>
+    <w:bookmarkStart w:id="138" w:name="ref-hunt_bell_travis_2008"/>
     <w:p>
       <w:pPr>
         <w:pStyle w:val="Bibliography"/>
@@ -5093,7 +5103,7 @@
       <w:r>
         <w:t xml:space="preserve"> </w:t>
       </w:r>
-      <w:hyperlink r:id="rId136">
+      <w:hyperlink r:id="rId137">
         <w:r>
           <w:rPr>
             <w:rStyle w:val="Hyperlink"/>
@@ -5105,8 +5115,8 @@
         <w:t xml:space="preserve">.</w:t>
       </w:r>
     </w:p>
-    <w:bookmarkEnd w:id="137"/>
-    <w:bookmarkStart w:id="138" w:name="ref-hurlbert_1971"/>
+    <w:bookmarkEnd w:id="138"/>
+    <w:bookmarkStart w:id="139" w:name="ref-hurlbert_1971"/>
     <w:p>
       <w:pPr>
         <w:pStyle w:val="Bibliography"/>
@@ -5131,8 +5141,8 @@
         <w:t xml:space="preserve">52(4):577–586.</w:t>
       </w:r>
     </w:p>
-    <w:bookmarkEnd w:id="138"/>
-    <w:bookmarkStart w:id="140" w:name="ref-kandler_shennan_2013"/>
+    <w:bookmarkEnd w:id="139"/>
+    <w:bookmarkStart w:id="141" w:name="ref-kandler_shennan_2013"/>
     <w:p>
       <w:pPr>
         <w:pStyle w:val="Bibliography"/>
@@ -5159,7 +5169,7 @@
       <w:r>
         <w:t xml:space="preserve"> </w:t>
       </w:r>
-      <w:hyperlink r:id="rId139">
+      <w:hyperlink r:id="rId140">
         <w:r>
           <w:rPr>
             <w:rStyle w:val="Hyperlink"/>
@@ -5171,8 +5181,8 @@
         <w:t xml:space="preserve">.</w:t>
       </w:r>
     </w:p>
-    <w:bookmarkEnd w:id="140"/>
-    <w:bookmarkStart w:id="142" w:name="ref-kandler_shennan_2015"/>
+    <w:bookmarkEnd w:id="141"/>
+    <w:bookmarkStart w:id="143" w:name="ref-kandler_shennan_2015"/>
     <w:p>
       <w:pPr>
         <w:pStyle w:val="Bibliography"/>
@@ -5211,7 +5221,7 @@
       <w:r>
         <w:t xml:space="preserve"> </w:t>
       </w:r>
-      <w:hyperlink r:id="rId141">
+      <w:hyperlink r:id="rId142">
         <w:r>
           <w:rPr>
             <w:rStyle w:val="Hyperlink"/>
@@ -5223,8 +5233,8 @@
         <w:t xml:space="preserve">.</w:t>
       </w:r>
     </w:p>
-    <w:bookmarkEnd w:id="142"/>
-    <w:bookmarkStart w:id="144" w:name="ref-kandler_wilder_fortunato_2017"/>
+    <w:bookmarkEnd w:id="143"/>
+    <w:bookmarkStart w:id="145" w:name="ref-kandler_wilder_fortunato_2017"/>
     <w:p>
       <w:pPr>
         <w:pStyle w:val="Bibliography"/>
@@ -5251,7 +5261,7 @@
       <w:r>
         <w:t xml:space="preserve"> </w:t>
       </w:r>
-      <w:hyperlink r:id="rId143">
+      <w:hyperlink r:id="rId144">
         <w:r>
           <w:rPr>
             <w:rStyle w:val="Hyperlink"/>
@@ -5263,8 +5273,8 @@
         <w:t xml:space="preserve">.</w:t>
       </w:r>
     </w:p>
-    <w:bookmarkEnd w:id="144"/>
-    <w:bookmarkStart w:id="146" w:name="ref-kidwell_tomasovych_2013"/>
+    <w:bookmarkEnd w:id="145"/>
+    <w:bookmarkStart w:id="147" w:name="ref-kidwell_tomasovych_2013"/>
     <w:p>
       <w:pPr>
         <w:pStyle w:val="Bibliography"/>
@@ -5291,7 +5301,7 @@
       <w:r>
         <w:t xml:space="preserve"> </w:t>
       </w:r>
-      <w:hyperlink r:id="rId145">
+      <w:hyperlink r:id="rId146">
         <w:r>
           <w:rPr>
             <w:rStyle w:val="Hyperlink"/>
@@ -5303,8 +5313,8 @@
         <w:t xml:space="preserve">.</w:t>
       </w:r>
     </w:p>
-    <w:bookmarkEnd w:id="146"/>
-    <w:bookmarkStart w:id="147" w:name="ref-king_freer_1995"/>
+    <w:bookmarkEnd w:id="147"/>
+    <w:bookmarkStart w:id="148" w:name="ref-king_freer_1995"/>
     <w:p>
       <w:pPr>
         <w:pStyle w:val="Bibliography"/>
@@ -5338,8 +5348,8 @@
         <w:t xml:space="preserve">, edited by Michael S. Nassaney and Kenneth E. Sassaman, pp. 266–288. University of Tennessee Press, Knoxville.</w:t>
       </w:r>
     </w:p>
-    <w:bookmarkEnd w:id="147"/>
-    <w:bookmarkStart w:id="149" w:name="ref-ladefoged_graves_2000"/>
+    <w:bookmarkEnd w:id="148"/>
+    <w:bookmarkStart w:id="150" w:name="ref-ladefoged_graves_2000"/>
     <w:p>
       <w:pPr>
         <w:pStyle w:val="Bibliography"/>
@@ -5384,7 +5394,7 @@
       <w:r>
         <w:t xml:space="preserve"> </w:t>
       </w:r>
-      <w:hyperlink r:id="rId148">
+      <w:hyperlink r:id="rId149">
         <w:r>
           <w:rPr>
             <w:rStyle w:val="Hyperlink"/>
@@ -5396,8 +5406,8 @@
         <w:t xml:space="preserve">.</w:t>
       </w:r>
     </w:p>
-    <w:bookmarkEnd w:id="149"/>
-    <w:bookmarkStart w:id="150" w:name="ref-lewontin_1974"/>
+    <w:bookmarkEnd w:id="150"/>
+    <w:bookmarkStart w:id="151" w:name="ref-lewontin_1974"/>
     <w:p>
       <w:pPr>
         <w:pStyle w:val="Bibliography"/>
@@ -5419,8 +5429,8 @@
         <w:t xml:space="preserve">. Columbia University Press, New York.</w:t>
       </w:r>
     </w:p>
-    <w:bookmarkEnd w:id="150"/>
-    <w:bookmarkStart w:id="151" w:name="ref-lipo_2001"/>
+    <w:bookmarkEnd w:id="151"/>
+    <w:bookmarkStart w:id="152" w:name="ref-lipo_2001"/>
     <w:p>
       <w:pPr>
         <w:pStyle w:val="Bibliography"/>
@@ -5470,8 +5480,8 @@
         <w:t xml:space="preserve">. BAR International Series 918. Archaeopress, Oxford.</w:t>
       </w:r>
     </w:p>
-    <w:bookmarkEnd w:id="151"/>
-    <w:bookmarkStart w:id="153" w:name="ref-lipo_dinapoli_madsen_hunt_2021"/>
+    <w:bookmarkEnd w:id="152"/>
+    <w:bookmarkStart w:id="154" w:name="ref-lipo_dinapoli_madsen_hunt_2021"/>
     <w:p>
       <w:pPr>
         <w:pStyle w:val="Bibliography"/>
@@ -5498,7 +5508,7 @@
       <w:r>
         <w:t xml:space="preserve"> </w:t>
       </w:r>
-      <w:hyperlink r:id="rId152">
+      <w:hyperlink r:id="rId153">
         <w:r>
           <w:rPr>
             <w:rStyle w:val="Hyperlink"/>
@@ -5510,8 +5520,8 @@
         <w:t xml:space="preserve">.</w:t>
       </w:r>
     </w:p>
-    <w:bookmarkEnd w:id="153"/>
-    <w:bookmarkStart w:id="154" w:name="ref-lipo_dunnell_2007"/>
+    <w:bookmarkEnd w:id="154"/>
+    <w:bookmarkStart w:id="155" w:name="ref-lipo_dunnell_2007"/>
     <w:p>
       <w:pPr>
         <w:pStyle w:val="Bibliography"/>
@@ -5573,8 +5583,8 @@
         <w:t xml:space="preserve">, edited by Janet Rafferty and Evan Peacock, pp. 125–167. University of Alabama Press, Tuscaloosa.</w:t>
       </w:r>
     </w:p>
-    <w:bookmarkEnd w:id="154"/>
-    <w:bookmarkStart w:id="156" w:name="ref-lipo_hunt_hundtoft_2010"/>
+    <w:bookmarkEnd w:id="155"/>
+    <w:bookmarkStart w:id="157" w:name="ref-lipo_hunt_hundtoft_2010"/>
     <w:p>
       <w:pPr>
         <w:pStyle w:val="Bibliography"/>
@@ -5619,7 +5629,7 @@
       <w:r>
         <w:t xml:space="preserve"> </w:t>
       </w:r>
-      <w:hyperlink r:id="rId155">
+      <w:hyperlink r:id="rId156">
         <w:r>
           <w:rPr>
             <w:rStyle w:val="Hyperlink"/>
@@ -5631,8 +5641,43 @@
         <w:t xml:space="preserve">.</w:t>
       </w:r>
     </w:p>
-    <w:bookmarkEnd w:id="156"/>
-    <w:bookmarkStart w:id="158" w:name="ref-lipo_madsen_dunnell_2015"/>
+    <w:bookmarkEnd w:id="157"/>
+    <w:bookmarkStart w:id="158" w:name="ref-lipo_madsen_2001"/>
+    <w:p>
+      <w:pPr>
+        <w:pStyle w:val="Bibliography"/>
+      </w:pPr>
+      <w:r>
+        <w:t xml:space="preserve">Lipo, Carl P., and Mark E. Madsen. 2001. Neutrality,</w:t>
+      </w:r>
+      <w:r>
+        <w:t xml:space="preserve"> </w:t>
+      </w:r>
+      <w:r>
+        <w:t xml:space="preserve">“Style,”</w:t>
+      </w:r>
+      <w:r>
+        <w:t xml:space="preserve"> </w:t>
+      </w:r>
+      <w:r>
+        <w:t xml:space="preserve">and Drift: Building Methods for Studying Cultural Transmission in the Archaeological Record. In</w:t>
+      </w:r>
+      <w:r>
+        <w:t xml:space="preserve"> </w:t>
+      </w:r>
+      <w:r>
+        <w:rPr>
+          <w:i/>
+          <w:iCs/>
+        </w:rPr>
+        <w:t xml:space="preserve">Style and Function: Conceptual Issues in Evolutionary Archaeology</w:t>
+      </w:r>
+      <w:r>
+        <w:t xml:space="preserve">, edited by Teresa D. Hurt and Gordon F. M. Rakita, pp. 91–118. Bergin &amp; Garvey, Westport, Connecticut.</w:t>
+      </w:r>
+    </w:p>
+    <w:bookmarkEnd w:id="158"/>
+    <w:bookmarkStart w:id="160" w:name="ref-lipo_madsen_dunnell_2015"/>
     <w:p>
       <w:pPr>
         <w:pStyle w:val="Bibliography"/>
@@ -5659,7 +5704,7 @@
       <w:r>
         <w:t xml:space="preserve"> </w:t>
       </w:r>
-      <w:hyperlink r:id="rId157">
+      <w:hyperlink r:id="rId159">
         <w:r>
           <w:rPr>
             <w:rStyle w:val="Hyperlink"/>
@@ -5671,8 +5716,8 @@
         <w:t xml:space="preserve">.</w:t>
       </w:r>
     </w:p>
-    <w:bookmarkEnd w:id="158"/>
-    <w:bookmarkStart w:id="160" w:name="ref-lipo_madsen_dunnell_hunt_1997"/>
+    <w:bookmarkEnd w:id="160"/>
+    <w:bookmarkStart w:id="162" w:name="ref-lipo_madsen_dunnell_hunt_1997"/>
     <w:p>
       <w:pPr>
         <w:pStyle w:val="Bibliography"/>
@@ -5699,7 +5744,7 @@
       <w:r>
         <w:t xml:space="preserve"> </w:t>
       </w:r>
-      <w:hyperlink r:id="rId159">
+      <w:hyperlink r:id="rId161">
         <w:r>
           <w:rPr>
             <w:rStyle w:val="Hyperlink"/>
@@ -5711,8 +5756,8 @@
         <w:t xml:space="preserve">.</w:t>
       </w:r>
     </w:p>
-    <w:bookmarkEnd w:id="160"/>
-    <w:bookmarkStart w:id="162" w:name="ref-holland-lulewicz_2019"/>
+    <w:bookmarkEnd w:id="162"/>
+    <w:bookmarkStart w:id="164" w:name="ref-holland-lulewicz_2019"/>
     <w:p>
       <w:pPr>
         <w:pStyle w:val="Bibliography"/>
@@ -5766,7 +5811,7 @@
       <w:r>
         <w:t xml:space="preserve"> </w:t>
       </w:r>
-      <w:hyperlink r:id="rId161">
+      <w:hyperlink r:id="rId163">
         <w:r>
           <w:rPr>
             <w:rStyle w:val="Hyperlink"/>
@@ -5778,8 +5823,8 @@
         <w:t xml:space="preserve">.</w:t>
       </w:r>
     </w:p>
-    <w:bookmarkEnd w:id="162"/>
-    <w:bookmarkStart w:id="164" w:name="ref-lyman_2021"/>
+    <w:bookmarkEnd w:id="164"/>
+    <w:bookmarkStart w:id="166" w:name="ref-lyman_2021"/>
     <w:p>
       <w:pPr>
         <w:pStyle w:val="Bibliography"/>
@@ -5806,7 +5851,7 @@
       <w:r>
         <w:t xml:space="preserve"> </w:t>
       </w:r>
-      <w:hyperlink r:id="rId163">
+      <w:hyperlink r:id="rId165">
         <w:r>
           <w:rPr>
             <w:rStyle w:val="Hyperlink"/>
@@ -5818,8 +5863,8 @@
         <w:t xml:space="preserve">.</w:t>
       </w:r>
     </w:p>
-    <w:bookmarkEnd w:id="164"/>
-    <w:bookmarkStart w:id="165" w:name="ref-madsen_2012"/>
+    <w:bookmarkEnd w:id="166"/>
+    <w:bookmarkStart w:id="167" w:name="ref-madsen_2012"/>
     <w:p>
       <w:pPr>
         <w:pStyle w:val="Bibliography"/>
@@ -5828,8 +5873,8 @@
         <w:t xml:space="preserve">Madsen, Mark E. 2012. Neutral Cultural Transmission in Time-Averaged Archaeological Assemblages. arXiv preprint arXiv:1204.2043 [physics.soc-ph].</w:t>
       </w:r>
     </w:p>
-    <w:bookmarkEnd w:id="165"/>
-    <w:bookmarkStart w:id="166" w:name="ref-mainfort_1996"/>
+    <w:bookmarkEnd w:id="167"/>
+    <w:bookmarkStart w:id="168" w:name="ref-mainfort_1996"/>
     <w:p>
       <w:pPr>
         <w:pStyle w:val="Bibliography"/>
@@ -5878,8 +5923,8 @@
         <w:t xml:space="preserve">15(2):172–181.</w:t>
       </w:r>
     </w:p>
-    <w:bookmarkEnd w:id="166"/>
-    <w:bookmarkStart w:id="167" w:name="ref-mainfort_1996b"/>
+    <w:bookmarkEnd w:id="168"/>
+    <w:bookmarkStart w:id="169" w:name="ref-mainfort_1996b"/>
     <w:p>
       <w:pPr>
         <w:pStyle w:val="Bibliography"/>
@@ -5904,8 +5949,8 @@
         <w:t xml:space="preserve">15(2):172–181.</w:t>
       </w:r>
     </w:p>
-    <w:bookmarkEnd w:id="167"/>
-    <w:bookmarkStart w:id="168" w:name="ref-mainfort_2001"/>
+    <w:bookmarkEnd w:id="169"/>
+    <w:bookmarkStart w:id="170" w:name="ref-mainfort_2001"/>
     <w:p>
       <w:pPr>
         <w:pStyle w:val="Bibliography"/>
@@ -5939,8 +5984,8 @@
         <w:t xml:space="preserve">, edited by David S. Brose, C. Wesley Cowan, and Jr. Mainfort Robert C., pp. 173–190. Smithsonian Institution Press, Washington, DC.</w:t>
       </w:r>
     </w:p>
-    <w:bookmarkEnd w:id="168"/>
-    <w:bookmarkStart w:id="169" w:name="ref-mainfort_2003"/>
+    <w:bookmarkEnd w:id="170"/>
+    <w:bookmarkStart w:id="171" w:name="ref-mainfort_2003"/>
     <w:p>
       <w:pPr>
         <w:pStyle w:val="Bibliography"/>
@@ -5977,8 +6022,8 @@
         <w:t xml:space="preserve">22(2):176–184.</w:t>
       </w:r>
     </w:p>
-    <w:bookmarkEnd w:id="169"/>
-    <w:bookmarkStart w:id="170" w:name="ref-mantel_1967"/>
+    <w:bookmarkEnd w:id="171"/>
+    <w:bookmarkStart w:id="172" w:name="ref-mantel_1967"/>
     <w:p>
       <w:pPr>
         <w:pStyle w:val="Bibliography"/>
@@ -6003,8 +6048,8 @@
         <w:t xml:space="preserve">27(2):209–220.</w:t>
       </w:r>
     </w:p>
-    <w:bookmarkEnd w:id="170"/>
-    <w:bookmarkStart w:id="171" w:name="ref-mcnutt_ed_1996"/>
+    <w:bookmarkEnd w:id="172"/>
+    <w:bookmarkStart w:id="173" w:name="ref-mcnutt_ed_1996"/>
     <w:p>
       <w:pPr>
         <w:pStyle w:val="Bibliography"/>
@@ -6054,8 +6099,8 @@
         <w:t xml:space="preserve">. University of Alabama Press, Tuscaloosa.</w:t>
       </w:r>
     </w:p>
-    <w:bookmarkEnd w:id="171"/>
-    <w:bookmarkStart w:id="172" w:name="ref-mesoudi_2021"/>
+    <w:bookmarkEnd w:id="173"/>
+    <w:bookmarkStart w:id="174" w:name="ref-mesoudi_2021"/>
     <w:p>
       <w:pPr>
         <w:pStyle w:val="Bibliography"/>
@@ -6080,8 +6125,8 @@
         <w:t xml:space="preserve">376:20200053.</w:t>
       </w:r>
     </w:p>
-    <w:bookmarkEnd w:id="172"/>
-    <w:bookmarkStart w:id="174" w:name="ref-miller_atkins_premo_2018"/>
+    <w:bookmarkEnd w:id="174"/>
+    <w:bookmarkStart w:id="176" w:name="ref-miller_atkins_premo_2018"/>
     <w:p>
       <w:pPr>
         <w:pStyle w:val="Bibliography"/>
@@ -6108,7 +6153,7 @@
       <w:r>
         <w:t xml:space="preserve"> </w:t>
       </w:r>
-      <w:hyperlink r:id="rId173">
+      <w:hyperlink r:id="rId175">
         <w:r>
           <w:rPr>
             <w:rStyle w:val="Hyperlink"/>
@@ -6120,8 +6165,8 @@
         <w:t xml:space="preserve">.</w:t>
       </w:r>
     </w:p>
-    <w:bookmarkEnd w:id="174"/>
-    <w:bookmarkStart w:id="175" w:name="ref-milner_1998"/>
+    <w:bookmarkEnd w:id="176"/>
+    <w:bookmarkStart w:id="177" w:name="ref-milner_1998"/>
     <w:p>
       <w:pPr>
         <w:pStyle w:val="Bibliography"/>
@@ -6199,8 +6244,8 @@
         <w:t xml:space="preserve">. Smithsonian Institution Press, Washington, D.C.</w:t>
       </w:r>
     </w:p>
-    <w:bookmarkEnd w:id="175"/>
-    <w:bookmarkStart w:id="176" w:name="ref-mitchem_2001"/>
+    <w:bookmarkEnd w:id="177"/>
+    <w:bookmarkStart w:id="178" w:name="ref-mitchem_2001"/>
     <w:p>
       <w:pPr>
         <w:pStyle w:val="Bibliography"/>
@@ -6230,8 +6275,8 @@
         <w:t xml:space="preserve">.</w:t>
       </w:r>
     </w:p>
-    <w:bookmarkEnd w:id="176"/>
-    <w:bookmarkStart w:id="177" w:name="ref-morse_d_1990"/>
+    <w:bookmarkEnd w:id="178"/>
+    <w:bookmarkStart w:id="179" w:name="ref-morse_d_1990"/>
     <w:p>
       <w:pPr>
         <w:pStyle w:val="Bibliography"/>
@@ -6279,8 +6324,8 @@
         <w:t xml:space="preserve">, edited by David H. Dye and Cheryl Anne Cox, pp. 69–97. University of Alabama Press, Tuscaloosa.</w:t>
       </w:r>
     </w:p>
-    <w:bookmarkEnd w:id="177"/>
-    <w:bookmarkStart w:id="178" w:name="ref-morse_morse_1983"/>
+    <w:bookmarkEnd w:id="179"/>
+    <w:bookmarkStart w:id="180" w:name="ref-morse_morse_1983"/>
     <w:p>
       <w:pPr>
         <w:pStyle w:val="Bibliography"/>
@@ -6330,8 +6375,8 @@
         <w:t xml:space="preserve">. Academic Press, New York.</w:t>
       </w:r>
     </w:p>
-    <w:bookmarkEnd w:id="178"/>
-    <w:bookmarkStart w:id="179" w:name="ref-morse_morse_1996"/>
+    <w:bookmarkEnd w:id="180"/>
+    <w:bookmarkStart w:id="181" w:name="ref-morse_morse_1996"/>
     <w:p>
       <w:pPr>
         <w:pStyle w:val="Bibliography"/>
@@ -6368,8 +6413,8 @@
         <w:t xml:space="preserve">17(1):1–35.</w:t>
       </w:r>
     </w:p>
-    <w:bookmarkEnd w:id="179"/>
-    <w:bookmarkStart w:id="180" w:name="ref-morse_1990"/>
+    <w:bookmarkEnd w:id="181"/>
+    <w:bookmarkStart w:id="182" w:name="ref-morse_1990"/>
     <w:p>
       <w:pPr>
         <w:pStyle w:val="Bibliography"/>
@@ -6429,8 +6474,8 @@
         <w:t xml:space="preserve">, edited by David H. Dye and Cheryl Anne Cox, pp. 118–134. University of Alabama Press, Tuscaloosa.</w:t>
       </w:r>
     </w:p>
-    <w:bookmarkEnd w:id="180"/>
-    <w:bookmarkStart w:id="181" w:name="ref-neiman_1995"/>
+    <w:bookmarkEnd w:id="182"/>
+    <w:bookmarkStart w:id="183" w:name="ref-neiman_1995"/>
     <w:p>
       <w:pPr>
         <w:pStyle w:val="Bibliography"/>
@@ -6473,8 +6518,31 @@
         <w:t xml:space="preserve">60(1):7–36.</w:t>
       </w:r>
     </w:p>
-    <w:bookmarkEnd w:id="181"/>
-    <w:bookmarkStart w:id="183" w:name="ref-odwyer_kandler_2017"/>
+    <w:bookmarkEnd w:id="183"/>
+    <w:bookmarkStart w:id="184" w:name="ref-obrien_leonard_2001"/>
+    <w:p>
+      <w:pPr>
+        <w:pStyle w:val="Bibliography"/>
+      </w:pPr>
+      <w:r>
+        <w:t xml:space="preserve">O’Brien, Michael J., and Robert D. Leonard. 2001. Style and Function: An Introduction. In</w:t>
+      </w:r>
+      <w:r>
+        <w:t xml:space="preserve"> </w:t>
+      </w:r>
+      <w:r>
+        <w:rPr>
+          <w:i/>
+          <w:iCs/>
+        </w:rPr>
+        <w:t xml:space="preserve">Style and Function: Conceptual Issues in Evolutionary Archaeology</w:t>
+      </w:r>
+      <w:r>
+        <w:t xml:space="preserve">, edited by Teresa D. Hurt and Gordon F. M. Rakita, pp. 1–23. Bergin &amp; Garvey, Westport, Connecticut.</w:t>
+      </w:r>
+    </w:p>
+    <w:bookmarkEnd w:id="184"/>
+    <w:bookmarkStart w:id="186" w:name="ref-odwyer_kandler_2017"/>
     <w:p>
       <w:pPr>
         <w:pStyle w:val="Bibliography"/>
@@ -6501,7 +6569,7 @@
       <w:r>
         <w:t xml:space="preserve"> </w:t>
       </w:r>
-      <w:hyperlink r:id="rId182">
+      <w:hyperlink r:id="rId185">
         <w:r>
           <w:rPr>
             <w:rStyle w:val="Hyperlink"/>
@@ -6513,8 +6581,8 @@
         <w:t xml:space="preserve">.</w:t>
       </w:r>
     </w:p>
-    <w:bookmarkEnd w:id="183"/>
-    <w:bookmarkStart w:id="185" w:name="ref-peebles_kus_1977"/>
+    <w:bookmarkEnd w:id="186"/>
+    <w:bookmarkStart w:id="188" w:name="ref-peebles_kus_1977"/>
     <w:p>
       <w:pPr>
         <w:pStyle w:val="Bibliography"/>
@@ -6541,7 +6609,7 @@
       <w:r>
         <w:t xml:space="preserve"> </w:t>
       </w:r>
-      <w:hyperlink r:id="rId184">
+      <w:hyperlink r:id="rId187">
         <w:r>
           <w:rPr>
             <w:rStyle w:val="Hyperlink"/>
@@ -6553,8 +6621,8 @@
         <w:t xml:space="preserve">.</w:t>
       </w:r>
     </w:p>
-    <w:bookmarkEnd w:id="185"/>
-    <w:bookmarkStart w:id="187" w:name="ref-peeples_schachner_2012"/>
+    <w:bookmarkEnd w:id="188"/>
+    <w:bookmarkStart w:id="190" w:name="ref-peeples_schachner_2012"/>
     <w:p>
       <w:pPr>
         <w:pStyle w:val="Bibliography"/>
@@ -6581,7 +6649,7 @@
       <w:r>
         <w:t xml:space="preserve"> </w:t>
       </w:r>
-      <w:hyperlink r:id="rId186">
+      <w:hyperlink r:id="rId189">
         <w:r>
           <w:rPr>
             <w:rStyle w:val="Hyperlink"/>
@@ -6593,8 +6661,8 @@
         <w:t xml:space="preserve">.</w:t>
       </w:r>
     </w:p>
-    <w:bookmarkEnd w:id="187"/>
-    <w:bookmarkStart w:id="189" w:name="ref-perreault_2018"/>
+    <w:bookmarkEnd w:id="190"/>
+    <w:bookmarkStart w:id="192" w:name="ref-perreault_2018"/>
     <w:p>
       <w:pPr>
         <w:pStyle w:val="Bibliography"/>
@@ -6621,7 +6689,7 @@
       <w:r>
         <w:t xml:space="preserve"> </w:t>
       </w:r>
-      <w:hyperlink r:id="rId188">
+      <w:hyperlink r:id="rId191">
         <w:r>
           <w:rPr>
             <w:rStyle w:val="Hyperlink"/>
@@ -6633,8 +6701,8 @@
         <w:t xml:space="preserve">.</w:t>
       </w:r>
     </w:p>
-    <w:bookmarkEnd w:id="189"/>
-    <w:bookmarkStart w:id="190" w:name="ref-perreault_2019"/>
+    <w:bookmarkEnd w:id="192"/>
+    <w:bookmarkStart w:id="193" w:name="ref-perreault_2019"/>
     <w:p>
       <w:pPr>
         <w:pStyle w:val="Bibliography"/>
@@ -6656,8 +6724,8 @@
         <w:t xml:space="preserve">. University of Chicago Press, Chicago.</w:t>
       </w:r>
     </w:p>
-    <w:bookmarkEnd w:id="190"/>
-    <w:bookmarkStart w:id="191" w:name="ref-phillips_1970"/>
+    <w:bookmarkEnd w:id="193"/>
+    <w:bookmarkStart w:id="194" w:name="ref-phillips_1970"/>
     <w:p>
       <w:pPr>
         <w:pStyle w:val="Bibliography"/>
@@ -6728,8 +6796,8 @@
         <w:t xml:space="preserve">, Vol. 60. Papers of the Peabody Museum of Archaeology and Ethnology. Peabody Museum, Harvard University, Cambridge, MA.</w:t>
       </w:r>
     </w:p>
-    <w:bookmarkEnd w:id="191"/>
-    <w:bookmarkStart w:id="192" w:name="ref-phillips_ford_griffin_1951"/>
+    <w:bookmarkEnd w:id="194"/>
+    <w:bookmarkStart w:id="195" w:name="ref-phillips_ford_griffin_1951"/>
     <w:p>
       <w:pPr>
         <w:pStyle w:val="Bibliography"/>
@@ -6779,8 +6847,8 @@
         <w:t xml:space="preserve">, Vol. 25. Papers of the Peabody Museum of American Archaeology and Ethnology. Peabody Museum, Harvard University, Cambridge, MA.</w:t>
       </w:r>
     </w:p>
-    <w:bookmarkEnd w:id="192"/>
-    <w:bookmarkStart w:id="194" w:name="ref-phillips_willey_1953"/>
+    <w:bookmarkEnd w:id="195"/>
+    <w:bookmarkStart w:id="197" w:name="ref-phillips_willey_1953"/>
     <w:p>
       <w:pPr>
         <w:pStyle w:val="Bibliography"/>
@@ -6807,7 +6875,7 @@
       <w:r>
         <w:t xml:space="preserve"> </w:t>
       </w:r>
-      <w:hyperlink r:id="rId193">
+      <w:hyperlink r:id="rId196">
         <w:r>
           <w:rPr>
             <w:rStyle w:val="Hyperlink"/>
@@ -6819,8 +6887,8 @@
         <w:t xml:space="preserve">.</w:t>
       </w:r>
     </w:p>
-    <w:bookmarkEnd w:id="194"/>
-    <w:bookmarkStart w:id="196" w:name="ref-powell_shennan_thomas_2009"/>
+    <w:bookmarkEnd w:id="197"/>
+    <w:bookmarkStart w:id="199" w:name="ref-powell_shennan_thomas_2009"/>
     <w:p>
       <w:pPr>
         <w:pStyle w:val="Bibliography"/>
@@ -6859,7 +6927,7 @@
       <w:r>
         <w:t xml:space="preserve"> </w:t>
       </w:r>
-      <w:hyperlink r:id="rId195">
+      <w:hyperlink r:id="rId198">
         <w:r>
           <w:rPr>
             <w:rStyle w:val="Hyperlink"/>
@@ -6871,8 +6939,8 @@
         <w:t xml:space="preserve">.</w:t>
       </w:r>
     </w:p>
-    <w:bookmarkEnd w:id="196"/>
-    <w:bookmarkStart w:id="198" w:name="ref-premo_2014"/>
+    <w:bookmarkEnd w:id="199"/>
+    <w:bookmarkStart w:id="201" w:name="ref-premo_2014"/>
     <w:p>
       <w:pPr>
         <w:pStyle w:val="Bibliography"/>
@@ -6899,7 +6967,7 @@
       <w:r>
         <w:t xml:space="preserve"> </w:t>
       </w:r>
-      <w:hyperlink r:id="rId197">
+      <w:hyperlink r:id="rId200">
         <w:r>
           <w:rPr>
             <w:rStyle w:val="Hyperlink"/>
@@ -6911,8 +6979,8 @@
         <w:t xml:space="preserve">.</w:t>
       </w:r>
     </w:p>
-    <w:bookmarkEnd w:id="198"/>
-    <w:bookmarkStart w:id="200" w:name="ref-premo_2016"/>
+    <w:bookmarkEnd w:id="201"/>
+    <w:bookmarkStart w:id="203" w:name="ref-premo_2016"/>
     <w:p>
       <w:pPr>
         <w:pStyle w:val="Bibliography"/>
@@ -6939,7 +7007,7 @@
       <w:r>
         <w:t xml:space="preserve"> </w:t>
       </w:r>
-      <w:hyperlink r:id="rId199">
+      <w:hyperlink r:id="rId202">
         <w:r>
           <w:rPr>
             <w:rStyle w:val="Hyperlink"/>
@@ -6951,8 +7019,8 @@
         <w:t xml:space="preserve">.</w:t>
       </w:r>
     </w:p>
-    <w:bookmarkEnd w:id="200"/>
-    <w:bookmarkStart w:id="202" w:name="ref-premo_scholnick_2011"/>
+    <w:bookmarkEnd w:id="203"/>
+    <w:bookmarkStart w:id="205" w:name="ref-premo_scholnick_2011"/>
     <w:p>
       <w:pPr>
         <w:pStyle w:val="Bibliography"/>
@@ -6979,7 +7047,7 @@
       <w:r>
         <w:t xml:space="preserve"> </w:t>
       </w:r>
-      <w:hyperlink r:id="rId201">
+      <w:hyperlink r:id="rId204">
         <w:r>
           <w:rPr>
             <w:rStyle w:val="Hyperlink"/>
@@ -6991,8 +7059,8 @@
         <w:t xml:space="preserve">.</w:t>
       </w:r>
     </w:p>
-    <w:bookmarkEnd w:id="202"/>
-    <w:bookmarkStart w:id="203" w:name="ref-rees_political_culture"/>
+    <w:bookmarkEnd w:id="205"/>
+    <w:bookmarkStart w:id="206" w:name="ref-rees_political_culture"/>
     <w:p>
       <w:pPr>
         <w:pStyle w:val="Bibliography"/>
@@ -7016,8 +7084,8 @@
         <w:t xml:space="preserve">. Ph.D. dissertation, University of Oklahoma, Norman.</w:t>
       </w:r>
     </w:p>
-    <w:bookmarkEnd w:id="203"/>
-    <w:bookmarkStart w:id="205" w:name="ref-reimer_etal_2020"/>
+    <w:bookmarkEnd w:id="206"/>
+    <w:bookmarkStart w:id="208" w:name="ref-reimer_etal_2020"/>
     <w:p>
       <w:pPr>
         <w:pStyle w:val="Bibliography"/>
@@ -7071,7 +7139,7 @@
       <w:r>
         <w:t xml:space="preserve"> </w:t>
       </w:r>
-      <w:hyperlink r:id="rId204">
+      <w:hyperlink r:id="rId207">
         <w:r>
           <w:rPr>
             <w:rStyle w:val="Hyperlink"/>
@@ -7083,8 +7151,8 @@
         <w:t xml:space="preserve">.</w:t>
       </w:r>
     </w:p>
-    <w:bookmarkEnd w:id="205"/>
-    <w:bookmarkStart w:id="207" w:name="ref-richerson_etal_2016"/>
+    <w:bookmarkEnd w:id="208"/>
+    <w:bookmarkStart w:id="210" w:name="ref-richerson_etal_2016"/>
     <w:p>
       <w:pPr>
         <w:pStyle w:val="Bibliography"/>
@@ -7111,7 +7179,7 @@
       <w:r>
         <w:t xml:space="preserve"> </w:t>
       </w:r>
-      <w:hyperlink r:id="rId206">
+      <w:hyperlink r:id="rId209">
         <w:r>
           <w:rPr>
             <w:rStyle w:val="Hyperlink"/>
@@ -7123,8 +7191,8 @@
         <w:t xml:space="preserve">.</w:t>
       </w:r>
     </w:p>
-    <w:bookmarkEnd w:id="207"/>
-    <w:bookmarkStart w:id="209" w:name="ref-riede_hoggard_shennan_2019"/>
+    <w:bookmarkEnd w:id="210"/>
+    <w:bookmarkStart w:id="212" w:name="ref-riede_hoggard_shennan_2019"/>
     <w:p>
       <w:pPr>
         <w:pStyle w:val="Bibliography"/>
@@ -7151,7 +7219,7 @@
       <w:r>
         <w:t xml:space="preserve"> </w:t>
       </w:r>
-      <w:hyperlink r:id="rId208">
+      <w:hyperlink r:id="rId211">
         <w:r>
           <w:rPr>
             <w:rStyle w:val="Hyperlink"/>
@@ -7163,8 +7231,8 @@
         <w:t xml:space="preserve">.</w:t>
       </w:r>
     </w:p>
-    <w:bookmarkEnd w:id="209"/>
-    <w:bookmarkStart w:id="210" w:name="ref-robinson_1951"/>
+    <w:bookmarkEnd w:id="212"/>
+    <w:bookmarkStart w:id="213" w:name="ref-robinson_1951"/>
     <w:p>
       <w:pPr>
         <w:pStyle w:val="Bibliography"/>
@@ -7189,8 +7257,8 @@
         <w:t xml:space="preserve">16(4):293–301.</w:t>
       </w:r>
     </w:p>
-    <w:bookmarkEnd w:id="210"/>
-    <w:bookmarkStart w:id="211" w:name="ref-ross-stallings_2017"/>
+    <w:bookmarkEnd w:id="213"/>
+    <w:bookmarkStart w:id="214" w:name="ref-ross-stallings_2017"/>
     <w:p>
       <w:pPr>
         <w:pStyle w:val="Bibliography"/>
@@ -7224,8 +7292,8 @@
         <w:t xml:space="preserve">, edited by Haagen D. Klaus, Amanda R. Harvey, and Mark N. Cohen, pp. 329–362. University Press of Florida, Gainesville.</w:t>
       </w:r>
     </w:p>
-    <w:bookmarkEnd w:id="211"/>
-    <w:bookmarkStart w:id="213" w:name="ref-saxer_doebeli_travisano_2009"/>
+    <w:bookmarkEnd w:id="214"/>
+    <w:bookmarkStart w:id="216" w:name="ref-saxer_doebeli_travisano_2009"/>
     <w:p>
       <w:pPr>
         <w:pStyle w:val="Bibliography"/>
@@ -7252,7 +7320,7 @@
       <w:r>
         <w:t xml:space="preserve"> </w:t>
       </w:r>
-      <w:hyperlink r:id="rId212">
+      <w:hyperlink r:id="rId215">
         <w:r>
           <w:rPr>
             <w:rStyle w:val="Hyperlink"/>
@@ -7264,8 +7332,8 @@
         <w:t xml:space="preserve">.</w:t>
       </w:r>
     </w:p>
-    <w:bookmarkEnd w:id="213"/>
-    <w:bookmarkStart w:id="215" w:name="ref-scheffer_2009"/>
+    <w:bookmarkEnd w:id="216"/>
+    <w:bookmarkStart w:id="218" w:name="ref-scheffer_2009"/>
     <w:p>
       <w:pPr>
         <w:pStyle w:val="Bibliography"/>
@@ -7292,7 +7360,7 @@
       <w:r>
         <w:t xml:space="preserve"> </w:t>
       </w:r>
-      <w:hyperlink r:id="rId214">
+      <w:hyperlink r:id="rId217">
         <w:r>
           <w:rPr>
             <w:rStyle w:val="Hyperlink"/>
@@ -7304,8 +7372,8 @@
         <w:t xml:space="preserve">.</w:t>
       </w:r>
     </w:p>
-    <w:bookmarkEnd w:id="215"/>
-    <w:bookmarkStart w:id="216" w:name="ref-schiffer_1972"/>
+    <w:bookmarkEnd w:id="218"/>
+    <w:bookmarkStart w:id="219" w:name="ref-schiffer_1972"/>
     <w:p>
       <w:pPr>
         <w:pStyle w:val="Bibliography"/>
@@ -7330,8 +7398,8 @@
         <w:t xml:space="preserve">37(2):156–165.</w:t>
       </w:r>
     </w:p>
-    <w:bookmarkEnd w:id="216"/>
-    <w:bookmarkStart w:id="218" w:name="ref-schneider_martins_deaguiar_2016"/>
+    <w:bookmarkEnd w:id="219"/>
+    <w:bookmarkStart w:id="221" w:name="ref-schneider_martins_deaguiar_2016"/>
     <w:p>
       <w:pPr>
         <w:pStyle w:val="Bibliography"/>
@@ -7358,7 +7426,7 @@
       <w:r>
         <w:t xml:space="preserve"> </w:t>
       </w:r>
-      <w:hyperlink r:id="rId217">
+      <w:hyperlink r:id="rId220">
         <w:r>
           <w:rPr>
             <w:rStyle w:val="Hyperlink"/>
@@ -7370,8 +7438,8 @@
         <w:t xml:space="preserve">.</w:t>
       </w:r>
     </w:p>
-    <w:bookmarkEnd w:id="218"/>
-    <w:bookmarkStart w:id="220" w:name="ref-shennan_crema_kerig_2015"/>
+    <w:bookmarkEnd w:id="221"/>
+    <w:bookmarkStart w:id="223" w:name="ref-shennan_crema_kerig_2015"/>
     <w:p>
       <w:pPr>
         <w:pStyle w:val="Bibliography"/>
@@ -7437,7 +7505,7 @@
       <w:r>
         <w:t xml:space="preserve"> </w:t>
       </w:r>
-      <w:hyperlink r:id="rId219">
+      <w:hyperlink r:id="rId222">
         <w:r>
           <w:rPr>
             <w:rStyle w:val="Hyperlink"/>
@@ -7449,8 +7517,8 @@
         <w:t xml:space="preserve">.</w:t>
       </w:r>
     </w:p>
-    <w:bookmarkEnd w:id="220"/>
-    <w:bookmarkStart w:id="221" w:name="ref-shennan_wilkinson_2001"/>
+    <w:bookmarkEnd w:id="223"/>
+    <w:bookmarkStart w:id="224" w:name="ref-shennan_wilkinson_2001"/>
     <w:p>
       <w:pPr>
         <w:pStyle w:val="Bibliography"/>
@@ -7490,8 +7558,8 @@
         <w:t xml:space="preserve">66(4):577–593.</w:t>
       </w:r>
     </w:p>
-    <w:bookmarkEnd w:id="221"/>
-    <w:bookmarkStart w:id="222" w:name="ref-smith_1990"/>
+    <w:bookmarkEnd w:id="224"/>
+    <w:bookmarkStart w:id="225" w:name="ref-smith_1990"/>
     <w:p>
       <w:pPr>
         <w:pStyle w:val="Bibliography"/>
@@ -7539,8 +7607,8 @@
         <w:t xml:space="preserve">, edited by David H. Dye and Cheryl Anne Cox, pp. 135–169. University of Alabama Press, Tuscaloosa.</w:t>
       </w:r>
     </w:p>
-    <w:bookmarkEnd w:id="222"/>
-    <w:bookmarkStart w:id="223" w:name="ref-smith_neiman_2007"/>
+    <w:bookmarkEnd w:id="225"/>
+    <w:bookmarkStart w:id="226" w:name="ref-smith_neiman_2007"/>
     <w:p>
       <w:pPr>
         <w:pStyle w:val="Bibliography"/>
@@ -7565,8 +7633,8 @@
         <w:t xml:space="preserve">26(1):47–72.</w:t>
       </w:r>
     </w:p>
-    <w:bookmarkEnd w:id="223"/>
-    <w:bookmarkStart w:id="224" w:name="ref-starr_1984"/>
+    <w:bookmarkEnd w:id="226"/>
+    <w:bookmarkStart w:id="227" w:name="ref-starr_1984"/>
     <w:p>
       <w:pPr>
         <w:pStyle w:val="Bibliography"/>
@@ -7747,8 +7815,8 @@
         <w:t xml:space="preserve">, edited by John M. Connaway, pp. 163–222. Archaeological Report No. 14. Mississippi Department of Archives; History, Jackson, MS.</w:t>
       </w:r>
     </w:p>
-    <w:bookmarkEnd w:id="224"/>
-    <w:bookmarkStart w:id="226" w:name="ref-stern_1994"/>
+    <w:bookmarkEnd w:id="227"/>
+    <w:bookmarkStart w:id="229" w:name="ref-stern_1994"/>
     <w:p>
       <w:pPr>
         <w:pStyle w:val="Bibliography"/>
@@ -7775,7 +7843,7 @@
       <w:r>
         <w:t xml:space="preserve"> </w:t>
       </w:r>
-      <w:hyperlink r:id="rId225">
+      <w:hyperlink r:id="rId228">
         <w:r>
           <w:rPr>
             <w:rStyle w:val="Hyperlink"/>
@@ -7787,8 +7855,8 @@
         <w:t xml:space="preserve">.</w:t>
       </w:r>
     </w:p>
-    <w:bookmarkEnd w:id="226"/>
-    <w:bookmarkStart w:id="228" w:name="ref-sullivan_2024"/>
+    <w:bookmarkEnd w:id="229"/>
+    <w:bookmarkStart w:id="231" w:name="ref-sullivan_2024"/>
     <w:p>
       <w:pPr>
         <w:pStyle w:val="Bibliography"/>
@@ -7839,7 +7907,7 @@
       <w:r>
         <w:t xml:space="preserve"> </w:t>
       </w:r>
-      <w:hyperlink r:id="rId227">
+      <w:hyperlink r:id="rId230">
         <w:r>
           <w:rPr>
             <w:rStyle w:val="Hyperlink"/>
@@ -7851,8 +7919,8 @@
         <w:t xml:space="preserve">.</w:t>
       </w:r>
     </w:p>
-    <w:bookmarkEnd w:id="228"/>
-    <w:bookmarkStart w:id="229" w:name="ref-tomasovych_kidwell_2009"/>
+    <w:bookmarkEnd w:id="231"/>
+    <w:bookmarkStart w:id="232" w:name="ref-tomasovych_kidwell_2009"/>
     <w:p>
       <w:pPr>
         <w:pStyle w:val="Bibliography"/>
@@ -7877,8 +7945,8 @@
         <w:t xml:space="preserve">35(1):94–118.</w:t>
       </w:r>
     </w:p>
-    <w:bookmarkEnd w:id="229"/>
-    <w:bookmarkStart w:id="231" w:name="ref-tomasovych_kidwell_2010"/>
+    <w:bookmarkEnd w:id="232"/>
+    <w:bookmarkStart w:id="234" w:name="ref-tomasovych_kidwell_2010"/>
     <w:p>
       <w:pPr>
         <w:pStyle w:val="Bibliography"/>
@@ -7905,7 +7973,7 @@
       <w:r>
         <w:t xml:space="preserve"> </w:t>
       </w:r>
-      <w:hyperlink r:id="rId230">
+      <w:hyperlink r:id="rId233">
         <w:r>
           <w:rPr>
             <w:rStyle w:val="Hyperlink"/>
@@ -7917,8 +7985,8 @@
         <w:t xml:space="preserve">.</w:t>
       </w:r>
     </w:p>
-    <w:bookmarkEnd w:id="231"/>
-    <w:bookmarkStart w:id="232" w:name="ref-willey_phillips_1958"/>
+    <w:bookmarkEnd w:id="234"/>
+    <w:bookmarkStart w:id="235" w:name="ref-willey_phillips_1958"/>
     <w:p>
       <w:pPr>
         <w:pStyle w:val="Bibliography"/>
@@ -7940,8 +8008,8 @@
         <w:t xml:space="preserve">. University of Chicago Press, Chicago.</w:t>
       </w:r>
     </w:p>
-    <w:bookmarkEnd w:id="232"/>
-    <w:bookmarkStart w:id="233" w:name="ref-williams_1954"/>
+    <w:bookmarkEnd w:id="235"/>
+    <w:bookmarkStart w:id="236" w:name="ref-williams_1954"/>
     <w:p>
       <w:pPr>
         <w:pStyle w:val="Bibliography"/>
@@ -7950,8 +8018,8 @@
         <w:t xml:space="preserve">Williams, Stephen. 1954. An Archeological Study of the Mississippian Culture in Southeast Missouri. PhD thesis, Yale University, New Haven.</w:t>
       </w:r>
     </w:p>
-    <w:bookmarkEnd w:id="233"/>
-    <w:bookmarkStart w:id="234" w:name="ref-williams_1990"/>
+    <w:bookmarkEnd w:id="236"/>
+    <w:bookmarkStart w:id="237" w:name="ref-williams_1990"/>
     <w:p>
       <w:pPr>
         <w:pStyle w:val="Bibliography"/>
@@ -7987,8 +8055,8 @@
         <w:t xml:space="preserve">, edited by David H. Dye and Cheryl Anne Cox, pp. 170–180. University of Alabama Press, Tuscaloosa.</w:t>
       </w:r>
     </w:p>
-    <w:bookmarkEnd w:id="234"/>
-    <w:bookmarkStart w:id="236" w:name="ref-wright_1943"/>
+    <w:bookmarkEnd w:id="237"/>
+    <w:bookmarkStart w:id="239" w:name="ref-wright_1943"/>
     <w:p>
       <w:pPr>
         <w:pStyle w:val="Bibliography"/>
@@ -8015,7 +8083,7 @@
       <w:r>
         <w:t xml:space="preserve"> </w:t>
       </w:r>
-      <w:hyperlink r:id="rId235">
+      <w:hyperlink r:id="rId238">
         <w:r>
           <w:rPr>
             <w:rStyle w:val="Hyperlink"/>
@@ -8027,8 +8095,8 @@
         <w:t xml:space="preserve">.</w:t>
       </w:r>
     </w:p>
-    <w:bookmarkEnd w:id="236"/>
-    <w:bookmarkStart w:id="238" w:name="ref-wright_1951"/>
+    <w:bookmarkEnd w:id="239"/>
+    <w:bookmarkStart w:id="241" w:name="ref-wright_1951"/>
     <w:p>
       <w:pPr>
         <w:pStyle w:val="Bibliography"/>
@@ -8055,7 +8123,7 @@
       <w:r>
         <w:t xml:space="preserve"> </w:t>
       </w:r>
-      <w:hyperlink r:id="rId237">
+      <w:hyperlink r:id="rId240">
         <w:r>
           <w:rPr>
             <w:rStyle w:val="Hyperlink"/>
@@ -8067,8 +8135,8 @@
         <w:t xml:space="preserve">.</w:t>
       </w:r>
     </w:p>
-    <w:bookmarkEnd w:id="238"/>
-    <w:bookmarkStart w:id="240" w:name="ref-youngblood_miton_morin_2023"/>
+    <w:bookmarkEnd w:id="241"/>
+    <w:bookmarkStart w:id="243" w:name="ref-youngblood_miton_morin_2023"/>
     <w:p>
       <w:pPr>
         <w:pStyle w:val="Bibliography"/>
@@ -8095,7 +8163,7 @@
       <w:r>
         <w:t xml:space="preserve"> </w:t>
       </w:r>
-      <w:hyperlink r:id="rId239">
+      <w:hyperlink r:id="rId242">
         <w:r>
           <w:rPr>
             <w:rStyle w:val="Hyperlink"/>
@@ -8107,10 +8175,10 @@
         <w:t xml:space="preserve">.</w:t>
       </w:r>
     </w:p>
-    <w:bookmarkEnd w:id="240"/>
-    <w:bookmarkEnd w:id="241"/>
-    <w:bookmarkEnd w:id="242"/>
     <w:bookmarkEnd w:id="243"/>
+    <w:bookmarkEnd w:id="244"/>
+    <w:bookmarkEnd w:id="245"/>
+    <w:bookmarkEnd w:id="246"/>
     <w:sectPr>
       <w:footnotePr>
         <w:numRestart w:val="eachSect"/>

</xml_diff>

<commit_message>
Sync main text: recovery-experiment paragraph and Table 1 caption gloss
Add the body paragraph describing the recovery experiment (why and how, with
pointers to Methods, Supplement, and Figure 4) and the Table 1 caption gloss
and grammar fix. Rebuild docx/pdf.
</commit_message>
<xml_diff>
--- a/docs/manuscript/MAIN_TEXT.docx
+++ b/docs/manuscript/MAIN_TEXT.docx
@@ -624,7 +624,7 @@
         <w:t xml:space="preserve">(Lipo et al. 2021; Neiman 1995; Shennan et al. 2015)</w:t>
       </w:r>
       <w:r>
-        <w:t xml:space="preserve">. A cluster of similar assemblages, therefore, need not record a bounded group. What would mark a real bounded group is closure beyond what distance predicts, and that excess is the signal we must test for. Our operational question is whether the structure of similarity records bounds interaction or spatially structured drift. We can treat decoration transmitted preferentially within a group and divergent between groups as a marker, rather than a neutral style drifting in a shared pool. A marker is the ceramic proxy for interaction closing into a bounded group, so the drift-versus-groups question, then, is equivalently a question of neutral style versus marker.</w:t>
+        <w:t xml:space="preserve">. A cluster of similar assemblages, therefore, need not record a bounded group. What would mark a real bounded group is closure beyond what distance predicts, and that excess is the signal we must test for. Our operational question is whether the structure of similarity records bounds interaction or spatially structured drift. We can treat decoration transmitted preferentially within a group and divergent between groups as a marker, rather than a neutral style drifting in a shared pool. A marker is the ceramic proxy for interaction closing into a bounded group, so the drift-versus-groups question, then, is effectively a question of neutral style versus marker.</w:t>
       </w:r>
     </w:p>
     <w:bookmarkEnd w:id="15"/>
@@ -698,7 +698,7 @@
         <w:t xml:space="preserve">(Crema et al. 2016, 2024; Henrich 2001)</w:t>
       </w:r>
       <w:r>
-        <w:t xml:space="preserve">. The problem is sharpened in archaeological assemblages, which are time-averaged, because aggregation over the use-life of a deposit inflates richness, flattens evenness, and biases neutrality statistics by an amount that depends on the mean lifetime of the variants</w:t>
+        <w:t xml:space="preserve">. The problem is more complex in archaeological assemblages, which are time-averaged, because aggregation over the use-life of a deposit inflates richness, flattens evenness, and biases neutrality statistics by an amount that depends on the mean lifetime of the variants</w:t>
       </w:r>
       <w:r>
         <w:t xml:space="preserve"> </w:t>
@@ -707,7 +707,7 @@
         <w:t xml:space="preserve">(Madsen 2012; Premo 2014)</w:t>
       </w:r>
       <w:r>
-        <w:t xml:space="preserve">. The result is equifinality: multiple transmission processes produce the same population-level pattern, so a single statistic cannot recover the process that generated it, and the discriminating signal, where it survives, lies in the rare-variant tail of the frequency distribution rather than in its common classes</w:t>
+        <w:t xml:space="preserve">. The result is equifinality: multiple transmission processes produce the same population-level pattern, so a single statistic cannot recover the process that generated it. A discriminating signal, where it survives, lies in the rare-variant tail of the frequency distribution rather than in its common classes</w:t>
       </w:r>
       <w:r>
         <w:t xml:space="preserve"> </w:t>
@@ -734,7 +734,7 @@
         <w:pStyle w:val="FirstParagraph"/>
       </w:pPr>
       <w:r>
-        <w:t xml:space="preserve">The late pre-contact central Mississippi Valley supports two interpretations of the same record, and they make opposite predictions for the transmission signature. The first holds that the region was moving toward greater complexity. In northeastern Arkansas, the Parkin phase (ca. A.D. 1400 to 1600, with a thin protohistoric tail, consistent with the basin radiocarbon reported below) is a dense cluster of fortified, moated St. Francis-type towns along the St. Francis and Tyronza rivers. It is dominated by the Parkin site, a roughly 17-acre palisaded center whose platform mound rises more than 6 m, which the De Soto chronicles place as the seat of the paramount of Casqui</w:t>
+        <w:t xml:space="preserve">The late pre-contact central Mississippi Valley supports two interpretations of the same record, and they make opposite predictions for the transmission signature. The first holds that the region was moving toward greater complexity. In northeastern Arkansas, the Parkin phase (ca. 1400 to 1600 CE, with a thin protohistoric tail is consistent with the basin radiocarbon reported below) is a dense cluster of fortified, moated St. Francis-type towns along the St. Francis and Tyronza rivers. It is dominated by the Parkin site, a roughly 17-acre palisaded center whose platform mound rises more than 6 m, which the De Soto chronicles place as the seat of the paramount of Casqui</w:t>
       </w:r>
       <w:r>
         <w:t xml:space="preserve"> </w:t>
@@ -806,7 +806,7 @@
         <w:t xml:space="preserve">(Hudson et al. 1990; Mitchem 2001; Phyllis A. Morse 1990)</w:t>
       </w:r>
       <w:r>
-        <w:t xml:space="preserve">. The two cannot be separated by settlement morphology alone. They can be separated by determining whether the transmission record shows interaction closing into bounded groups, which is the test we now construct.</w:t>
+        <w:t xml:space="preserve">. The two possibilities for Parkin cannot be separated by settlement morphology alone. They can, however, be separated by determining whether the transmission record shows interaction closing into bounded groups, which is the test we now construct.</w:t>
       </w:r>
     </w:p>
     <w:bookmarkEnd w:id="17"/>
@@ -825,7 +825,7 @@
         <w:pStyle w:val="FirstParagraph"/>
       </w:pPr>
       <w:r>
-        <w:t xml:space="preserve">The test rests on one principle: a process that genuinely reorganizes a population into groups leaves a mark on every aspect of how pottery styles were copied, whereas a process that merely mimics group structure marks only some aspects. The reorganization at issue, which we call the closure of interaction, is central to the rest of the paper, so we define it plainly. In an open community, a potter can learn a design from anyone she encounters, near or far, so styles circulate through one connected population. Interaction closes when that circulation narrows: potters come to copy mostly from others inside their own group and rarely from anyone outside it, until a once-continuous field of social learning breaks into separate pools that drift apart. Closure is the process a genuine bounded interaction group undergoes, and we treat its strength as a quantity that runs from none (one fully open field of learning), through partial, to complete (sealed, non-interacting groups). That strength is what the test sets out to measure, and in the synthetic experiments below, we tune it as a parameter,</w:t>
+        <w:t xml:space="preserve">The test rests on one principle: a process that genuinely reorganizes a population into groups leaves a mark on every aspect of how pottery styles were copied, whereas a process that merely mimics group structure marks only some aspects. The reorganization at issue, which we call the closure of interaction, is central to the rest of the paper, so we define it plainly. In an open community, potters can learn a design from anyone they encounter, near or far, so styles circulate through one connected population. Interaction closes when that circulation narrows: potters come to copy mostly from others inside their own group and rarely from anyone outside it, until a once-continuous field of social learning breaks into separate pools that drift apart. Closure is the process a genuine bounded interaction group undergoes, and we treat its strength as a quantity that runs from none (one fully open field of learning), through partial, to complete (sealed, non-interacting groups). That strength is what we set out to test and to measure. In the synthetic experiments below, we treat it as a parameter,</w:t>
       </w:r>
       <w:r>
         <w:t xml:space="preserve"> </w:t>
@@ -838,7 +838,7 @@
         <w:t xml:space="preserve">s</w:t>
       </w:r>
       <w:r>
-        <w:t xml:space="preserve">, from 0 (pure drift, no closure) to 1 (strongly bounded, sharply separated groups). The four signatures are each a different consequence of closure, and we state each first in plain terms before naming its formal measure.</w:t>
+        <w:t xml:space="preserve">, from 0 (pure drift, no closure) to 1 (strongly bounded, sharply separated groups). We can evaluate four potential signatures, each a different consequence of closure, and we state each in plain terms before naming their formal measures.</w:t>
       </w:r>
     </w:p>
     <w:p>
@@ -863,7 +863,25 @@
         <w:pStyle w:val="BodyText"/>
       </w:pPr>
       <w:r>
-        <w:t xml:space="preserve">The second asks whether the assemblages all belong to one interacting community or to several, and it is the most direct test of fragmentation. It rests on frequency seriation, the classic archaeological method of ordering assemblages so that each decorated class’s relative frequency rises to a single peak and then falls away, the shape long known as a battleship curve. That single-peaked rise and fall is what a style traces when it is introduced, becomes popular, and is abandoned within one community, drawing on a shared pool of designs. In classical uses of seriation, all available assemblages were typically pooled into a single seriation, and deviations from the frequency guidelines were dismissed as sampling error. Sampling error certainly needs to be accounted for. Classical practice, however, ignores the most valuable aspect of the method: a</w:t>
+        <w:t xml:space="preserve">The second asks whether the assemblages all belong to one interacting community or to several, and it is the most direct test of fragmentation. It rests on frequency seriation, the classic archaeological method of ordering assemblages so that each decorated class’s relative frequency rises to a single peak and then falls away, the shape long known as a battleship curve. That single-peaked rise and fall is what a style traces when it is introduced, becomes popular, and is abandoned within one community, drawing on a shared pool of designs. In classical uses of seriation, all available assemblages were typically pooled into a single seriation, and deviations from the frequency guidelines were dismissed as sampling error</w:t>
+      </w:r>
+      <w:r>
+        <w:t xml:space="preserve"> </w:t>
+      </w:r>
+      <w:r>
+        <w:t xml:space="preserve">(Dunnell 1970)</w:t>
+      </w:r>
+      <w:r>
+        <w:t xml:space="preserve">. Sampling error certainly needs to be accounted for</w:t>
+      </w:r>
+      <w:r>
+        <w:t xml:space="preserve"> </w:t>
+      </w:r>
+      <w:r>
+        <w:t xml:space="preserve">(Lipo 2001)</w:t>
+      </w:r>
+      <w:r>
+        <w:t xml:space="preserve">. Classical practice, however, ignores the most valuable aspect of the method: a</w:t>
       </w:r>
       <w:r>
         <w:t xml:space="preserve"> </w:t>
@@ -897,9 +915,120 @@
         <w:t xml:space="preserve"> </w:t>
       </w:r>
       <w:r>
+        <w:t xml:space="preserve">(Lipo et al. 1997, 2015)</w:t>
+      </w:r>
+      <w:r>
+        <w:t xml:space="preserve">.</w:t>
+      </w:r>
+    </w:p>
+    <w:p>
+      <w:pPr>
+        <w:pStyle w:val="BodyText"/>
+      </w:pPr>
+      <w:r>
+        <w:t xml:space="preserve">A set of assemblages is</w:t>
+      </w:r>
+      <w:r>
+        <w:t xml:space="preserve"> </w:t>
+      </w:r>
+      <w:r>
+        <w:t xml:space="preserve">“co-seriable”</w:t>
+      </w:r>
+      <w:r>
+        <w:t xml:space="preserve"> </w:t>
+      </w:r>
+      <w:r>
+        <w:t xml:space="preserve">when a single ordering can make every class follow the same single-peaked shape simultaneously. When all assemblages arise from a single continuously interacting population, such an ordering exists. When learning splits into separate groups, each with its own repertoire and its own independent rise and fall of styles, no single ordering can satisfy every class at once, and the assemblages break into several mutually incompatible orderings. The deterministic frequency-seriation procedure of Lipo, Madsen, and Dunnell</w:t>
+      </w:r>
+      <w:r>
+        <w:t xml:space="preserve"> </w:t>
+      </w:r>
+      <w:r>
         <w:t xml:space="preserve">(2015)</w:t>
       </w:r>
       <w:r>
+        <w:t xml:space="preserve"> </w:t>
+      </w:r>
+      <w:r>
+        <w:t xml:space="preserve">finds the complete set of these maximal co-seriable groups algorithmically, without the analyst arranging the assemblages by eye</w:t>
+      </w:r>
+      <w:r>
+        <w:t xml:space="preserve"> </w:t>
+      </w:r>
+      <w:r>
+        <w:t xml:space="preserve">(Lipo et al. 1997)</w:t>
+      </w:r>
+      <w:r>
+        <w:t xml:space="preserve">. The number of groups and the number of groups any one site joins directly measure the structure of past interaction. A single large group means one connected field of learning, a proliferation of small groups means a fragmented one, and a site that falls into several incompatible orderings is a bridge linking otherwise separate sequences rather than the closed core of a bounded community.</w:t>
+      </w:r>
+    </w:p>
+    <w:p>
+      <w:pPr>
+        <w:pStyle w:val="BodyText"/>
+      </w:pPr>
+      <w:r>
+        <w:t xml:space="preserve">The third asks how much of the variation in decoration lies between groups rather than within them. The measure is a cultural version of Wright’s F_ST</w:t>
+      </w:r>
+      <w:r>
+        <w:t xml:space="preserve"> </w:t>
+      </w:r>
+      <w:r>
+        <w:t xml:space="preserve">(Wright 1951)</w:t>
+      </w:r>
+      <w:r>
+        <w:t xml:space="preserve">, a standard population-genetic index of group differentiation. In cultural transmission, between-group variation in socially learned traits routinely exceeds that of their genetic counterparts</w:t>
+      </w:r>
+      <w:r>
+        <w:t xml:space="preserve"> </w:t>
+      </w:r>
+      <w:r>
+        <w:t xml:space="preserve">(Bell et al. 2009)</w:t>
+      </w:r>
+      <w:r>
+        <w:t xml:space="preserve">. We compute it here using the Gini-Simpson diversity measure, the chance that two sherds drawn at random from an assemblage are of different classes. F_ST is the share of the total diversity that is due to differences between groups rather than to variation within them. When every assemblage draws from one shared, drifting pool of styles, between-group differences are small, and F_ST sits near zero. As groups come to favor distinct repertoires, the between-group share grows, and F_ST climbs</w:t>
+      </w:r>
+      <w:r>
+        <w:t xml:space="preserve"> </w:t>
+      </w:r>
+      <w:r>
+        <w:t xml:space="preserve">(Neiman 1995)</w:t>
+      </w:r>
+      <w:r>
+        <w:t xml:space="preserve">. It serves here as the most direct measure of how far decoration has sorted itself by group, with one important caveat developed below. Stochastic drift on a spatially structured population generates between-group variance on its own. Subpopulations retain different levels of diversity depending on their size and connectivity. Small or sparsely connected areas drift toward depleted, idiosyncratic repertoires, while larger, well-connected ones remain richer. The resulting differences appear as distinct interacting groups, even though they are produced solely by spatial position</w:t>
+      </w:r>
+      <w:r>
+        <w:t xml:space="preserve"> </w:t>
+      </w:r>
+      <w:r>
+        <w:t xml:space="preserve">(Lipo et al. 2021)</w:t>
+      </w:r>
+      <w:r>
+        <w:t xml:space="preserve">. The measure must therefore be calibrated against that spatial-drift null rather than taken at face value.</w:t>
+      </w:r>
+    </w:p>
+    <w:p>
+      <w:pPr>
+        <w:pStyle w:val="BodyText"/>
+      </w:pPr>
+      <w:r>
+        <w:t xml:space="preserve">The fourth asks whether socially close assemblages are more alike than assemblages that are merely nearby on the map. Similarity normally fades with distance, because potters interact more with near neighbors than with distant ones, a gradient known as isolation by distance</w:t>
+      </w:r>
+      <w:r>
+        <w:t xml:space="preserve"> </w:t>
+      </w:r>
+      <w:r>
+        <w:t xml:space="preserve">(Neiman 1995; Shennan et al. 2015; Wright 1943)</w:t>
+      </w:r>
+      <w:r>
+        <w:t xml:space="preserve">. A genuine social boundary adds a step to that gradient. Under this condition, pairs of assemblages within the same cluster are more similar than pairs in neighboring clusters, even when the two pairs span the same geographic distance. We capture that step as a boundary-excess statistic, the gap between within-cluster and between-cluster similarity once distance is held constant, which a plain correlation of similarity with distance cannot isolate. It is useful here because this measure separates a real social edge from the ordinary spatial fade, again with the caveat that drift on a finite network can itself produce a positive excess</w:t>
+      </w:r>
+      <w:r>
+        <w:t xml:space="preserve"> </w:t>
+      </w:r>
+      <w:r>
+        <w:t xml:space="preserve">(Lipo et al. 2021)</w:t>
+      </w:r>
+      <w:r>
         <w:t xml:space="preserve">.</w:t>
       </w:r>
     </w:p>
@@ -908,117 +1037,6 @@
         <w:pStyle w:val="BodyText"/>
       </w:pPr>
       <w:r>
-        <w:t xml:space="preserve">A set of assemblages is</w:t>
-      </w:r>
-      <w:r>
-        <w:t xml:space="preserve"> </w:t>
-      </w:r>
-      <w:r>
-        <w:t xml:space="preserve">“co-seriable”</w:t>
-      </w:r>
-      <w:r>
-        <w:t xml:space="preserve"> </w:t>
-      </w:r>
-      <w:r>
-        <w:t xml:space="preserve">when a single ordering can make every class follow the same single-peaked shape simultaneously. When all assemblages arise from a single continuously interacting population, such an ordering exists. When learning splits into separate groups, each with its own repertoire and its own independent rise and fall of styles, no single ordering can satisfy every class at once, and the assemblages break into several mutually incompatible orderings. The deterministic frequency-seriation procedure of Lipo, Madsen, and Dunnell</w:t>
-      </w:r>
-      <w:r>
-        <w:t xml:space="preserve"> </w:t>
-      </w:r>
-      <w:r>
-        <w:t xml:space="preserve">(2015)</w:t>
-      </w:r>
-      <w:r>
-        <w:t xml:space="preserve"> </w:t>
-      </w:r>
-      <w:r>
-        <w:t xml:space="preserve">finds the complete set of these maximal co-seriable groups algorithmically, without the analyst arranging the assemblages by eye</w:t>
-      </w:r>
-      <w:r>
-        <w:t xml:space="preserve"> </w:t>
-      </w:r>
-      <w:r>
-        <w:t xml:space="preserve">(Lipo et al. 1997)</w:t>
-      </w:r>
-      <w:r>
-        <w:t xml:space="preserve">. The number of groups and the number of groups any one site joins directly measure the structure of past interaction. A single large group means one connected field of learning, a proliferation of small groups means a fragmented one, and a site that falls into several incompatible orderings is a bridge linking otherwise separate sequences rather than the closed core of a bounded community.</w:t>
-      </w:r>
-    </w:p>
-    <w:p>
-      <w:pPr>
-        <w:pStyle w:val="BodyText"/>
-      </w:pPr>
-      <w:r>
-        <w:t xml:space="preserve">The third asks how much of the variation in decoration lies between groups rather than within them. The measure is a cultural version of Wright’s F_ST</w:t>
-      </w:r>
-      <w:r>
-        <w:t xml:space="preserve"> </w:t>
-      </w:r>
-      <w:r>
-        <w:t xml:space="preserve">(Wright 1951)</w:t>
-      </w:r>
-      <w:r>
-        <w:t xml:space="preserve">, a standard population-genetic index of group differentiation. In cultural transmission, between-group variation in socially learned traits routinely exceeds that of their genetic counterparts</w:t>
-      </w:r>
-      <w:r>
-        <w:t xml:space="preserve"> </w:t>
-      </w:r>
-      <w:r>
-        <w:t xml:space="preserve">(Bell et al. 2009)</w:t>
-      </w:r>
-      <w:r>
-        <w:t xml:space="preserve">. We compute it here on Gini-Simpson diversity, the chance that two sherds drawn at random from an assemblage are of different classes. F_ST is the share of the total diversity that is due to differences between groups rather than to variation within them. When every assemblage draws on one shared, drifting pool of styles, between-group differences are small, and F_ST sits near zero. As groups come to favor distinct repertoires, the between-group share grows, and F_ST climbs</w:t>
-      </w:r>
-      <w:r>
-        <w:t xml:space="preserve"> </w:t>
-      </w:r>
-      <w:r>
-        <w:t xml:space="preserve">(Neiman 1995)</w:t>
-      </w:r>
-      <w:r>
-        <w:t xml:space="preserve">. It serves here as the most direct measure of how far decoration has sorted itself by group, with one important caveat developed below. Stochastic drift on a spatially structured population generates between-group variance on its own. Subpopulations retain different levels of diversity depending on their size and connectivity: small or sparsely connected areas drift toward depleted, idiosyncratic repertoires, while larger, well-connected ones remain richer. The resulting differences appear as distinct interacting groups, even though they are produced solely by spatial position</w:t>
-      </w:r>
-      <w:r>
-        <w:t xml:space="preserve"> </w:t>
-      </w:r>
-      <w:r>
-        <w:t xml:space="preserve">(Lipo et al. 2021)</w:t>
-      </w:r>
-      <w:r>
-        <w:t xml:space="preserve">. The measure must therefore be calibrated against that spatial-drift null rather than taken at face value.</w:t>
-      </w:r>
-    </w:p>
-    <w:p>
-      <w:pPr>
-        <w:pStyle w:val="BodyText"/>
-      </w:pPr>
-      <w:r>
-        <w:t xml:space="preserve">The fourth asks whether socially close assemblages are more alike than assemblages that are merely nearby on the map. Similarity normally fades with distance, because potters interact more with near neighbors than with distant ones, a gradient known as isolation by distance</w:t>
-      </w:r>
-      <w:r>
-        <w:t xml:space="preserve"> </w:t>
-      </w:r>
-      <w:r>
-        <w:t xml:space="preserve">(Neiman 1995; Shennan et al. 2015; Wright 1943)</w:t>
-      </w:r>
-      <w:r>
-        <w:t xml:space="preserve">. A genuine social boundary adds a step to that gradient: pairs of assemblages within the same cluster are more similar than pairs in neighboring clusters, even when the two pairs span the same geographic distance. We capture that step as a boundary-excess statistic, the gap between within-cluster and between-cluster similarity once distance is held constant, which a plain correlation of similarity with distance cannot isolate. It is useful here because it separates a real social edge from the ordinary spatial fade, again with the caveat that drift on a finite network can itself produce a positive excess</w:t>
-      </w:r>
-      <w:r>
-        <w:t xml:space="preserve"> </w:t>
-      </w:r>
-      <w:r>
-        <w:t xml:space="preserve">(Lipo et al. 2021)</w:t>
-      </w:r>
-      <w:r>
-        <w:t xml:space="preserve">.</w:t>
-      </w:r>
-    </w:p>
-    <w:p>
-      <w:pPr>
-        <w:pStyle w:val="BodyText"/>
-      </w:pPr>
-      <w:r>
         <w:t xml:space="preserve">Each plausible alternative to a bounded interaction group involves only a subset of these signatures (Table 1). Environmental patchiness, in which similar people occupy distinct ecological zones, produces spatial structure with no departure from neutral transmission and no loss of seriation coherence. Aggregated signaling, the bottom-up regime in which a conformist bias flattens diversity within a single community, produces a departure from neutrality without boundary formation, so seriation remains coherent and between-group variance remains low. Smooth, deterministic drift with distance-limited interaction produces an isolation-by-distance cline</w:t>
       </w:r>
       <w:r>
@@ -1028,7 +1046,7 @@
         <w:t xml:space="preserve">(Shennan et al. 2015; Wright 1943)</w:t>
       </w:r>
       <w:r>
-        <w:t xml:space="preserve">. This pattern appears as a gradual fading of similarity with distance, as people interact mostly with near neighbors, without the sharp boundaries or departures from neutrality that mark restricted, assortative learning. A bounded interaction group, in which one assortative process restricts transmission along every dimension, is the only process that drives all four signatures together at full strength. But the table is idealized in a way that matters here: two of the four signatures, between-group variance and the distance-controlled boundary excess, are also driven by stochastic neutral drift on a spatially structured population, which generates patchy divergence and a positive boundary excess with no bounded group anywhere (Results, Figure S5). The linked movement of these two measures cannot separate a real interaction group from drift. Therefore, we do not depend on these signatures alone. Instead, we compare the two processes generatively by simulating each one, neutral spatial drift and bounded groups alike, using the real geography of the deposits. Using the data from the simulations, we ask which reproduces the observed structure, treating the signatures as diagnostics of where each process leaves its mark.</w:t>
+        <w:t xml:space="preserve">. This pattern appears as a gradual fading of similarity with distance, as people interact mostly with near neighbors, without the sharp boundaries or departures from neutrality that mark restricted, assortative learning. A bounded interaction group, in which one assortative process restricts transmission along every dimension, is the only process that drives all four signatures together at full strength. But the table is idealized in a way that matters here: two of the four signatures, between-group variance and the distance-controlled boundary excess, are also driven by stochastic neutral drift on a spatially structured population, which generates patchy divergence and a positive boundary excess with no bounded group anywhere (Results, Figure S5). The linked movement of these two measures cannot separate a real interaction group from drift. Therefore, we cannot depend on these signatures alone. Instead, we must compare the two processes generatively by simulating each one, neutral spatial drift and bounded groups alike, using the real geography of the deposits. Using the data from the simulations, we can then ask which reproduces the observed structure, treating the signatures as diagnostic of where each process leaves its mark.</w:t>
       </w:r>
     </w:p>
     <w:p>
@@ -1046,7 +1064,7 @@
         <w:t xml:space="preserve"> </w:t>
       </w:r>
       <w:r>
-        <w:t xml:space="preserve">What each process does to the four transmission signatures, and which signature this record can measure. A filled circle (●) marks a signature, a process drive, and an open circle (○) that leaves it flat. The process columns give the idealized discrimination logic: under smooth, deterministic processes, only a bounded interaction group drives all four, and each alternative drives a characteristic subset, the pattern an idealized simulation confirms (Figure S4). Two features of the table show why that logic is not the test we run on the record. The smooth-drift and stochastic-drift columns separate textbook isolation-by-distance, which drives none of the four, from realistic neutral drift on a finite network, which drives cultural F_ST and the boundary excess on its own, with no bounded group present (Figure S5). Stochastic drift thus reproduces the same two-signature pattern as environmental patchiness, so a positive result on either signature cannot by itself separate a bounded group from drift or patchiness. The final column reports the recovery experiment (Figure 4). At this record’s 29 time-averaged assemblages, only cultural F_ST registers an injected-closure signal, and even then, it must be compared against the stochastic-drift null rather than zero. Seriation-coherence breakdown, which only a bounded group drives in principle, is the cleanest discriminator on paper yet undetectable here. The four signatures are therefore candidate diagnostics screened against the record, and the surviving discrimination is carried by cultural F_ST, assessed against the drift null, and by the generative drift-versus-groups comparison, not by convergence of the table’s rows.</w:t>
+        <w:t xml:space="preserve">What each process does to the four transmission signatures, and which signature this record can measure. A filled circle (●) marks a signature, while an open circle (○) is one where it is not measurable. The process columns give the idealized discrimination logic: under smooth, deterministic processes, only a bounded interaction group drives all four, and each alternative drives a characteristic subset, the pattern an idealized simulation confirms (Figure S4). Two features of the table show why that logic is not the test we run on the record. The smooth-drift and stochastic-drift columns separate textbook isolation-by-distance, which drives none of the four, from realistic neutral drift on a finite network, which drives cultural F_ST and the boundary excess on its own, with no bounded group present (Figure S5). Stochastic drift thus reproduces the same two-signature pattern as environmental patchiness, so a positive result on either signature cannot by itself separate a bounded group from drift or patchiness. The final column reports the recovery experiment, the calibration introduced above: it injects a known group-closure signal into synthetic assemblages matched to the record’s sample sizes and time-averaging and asks which signatures can detect it (Figure 4; described in Materials and Methods, with full detail in the Supplemental Text). At this record’s 29 time-averaged assemblages, only cultural F_ST registers the injected signal, and even then, it must be compared against the stochastic-drift null rather than zero. Seriation-coherence breakdown, which only a bounded group drives in principle, is the cleanest discriminator on paper yet undetectable here. The four signatures are therefore candidate diagnostics screened against the record, and the surviving discrimination is carried by cultural F_ST, assessed against the drift null, and by the generative drift-versus-groups comparison, not by convergence of the table’s rows.</w:t>
       </w:r>
     </w:p>
     <w:tbl>
@@ -1499,7 +1517,7 @@
         <w:pStyle w:val="BodyText"/>
       </w:pPr>
       <w:r>
-        <w:t xml:space="preserve">The two drift columns make the central difficulty explicit. Smooth, deterministic isolation by distance produces only a raw decay of similarity with distance, and the distance-controlled boundary excess is near zero under it, so it drives none of the four signatures. Stochastic neutral drift on a finite network is less forgiving. It generates patchy divergence that raises cultural F_ST and registers as a positive boundary excess in the absence of a social boundary, the mimicry that the record-matched controls expose directly (Results, Figure S5). Aggregated signaling, by contrast, raises the neutrality departure within a single undivided pool without forming the between-group boundaries that the other signatures require.</w:t>
+        <w:t xml:space="preserve">The two drift columns make the difficulty that we face explicit. Smooth, deterministic isolation-by-distance produces only a pattern of decay in similarity with distance. In addition, the distance-controlled boundary excess is near zero under it, so it does not drive any of the four signatures. Stochastic neutral drift on a finite network is less forgiving. It generates patchy divergence that raises cultural F_ST and registers as a positive boundary signal even in the absence of a social boundary, a mimicry that the record-matched controls demonstrate (Results, Figure S5). Aggregated signaling, by contrast, raises the neutrality departure within a single undivided pool without forming the between-group boundaries that the other signatures require.</w:t>
       </w:r>
     </w:p>
     <w:p>
@@ -1507,7 +1525,7 @@
         <w:pStyle w:val="BodyText"/>
       </w:pPr>
       <w:r>
-        <w:t xml:space="preserve">If closure were to occur, it would accumulate across the sequence, so on idealized data, genuine convergence would take the form of a trajectory: a coherent, same-direction shift in all four signatures across the ordinal sequence of assemblages, concentrated where and when interaction closes into bounded groups. The logic is only as strong as the independence of the signatures, because four measures that were merely redundant converge trivially. As a consequence, we validate the test using simulated assemblages before applying it to confirm that convergence arises only when interactions close into a bounded group and not under any mimic. We also use the simulation to assess whether the four signatures are tightly correlated under such closure yet nearly independent under the mimics, so their joint movement is informative rather than automatic. The use of convergence logic has an archaeological precedent. Neiman</w:t>
+        <w:t xml:space="preserve">If closure were to occur, it would accumulate across the sequence. On idealized data, genuine convergence should take the form of a trajectory: a coherent, same-direction shift in all four signatures across the ordinal sequence of assemblages, concentrated where and when interaction closes into bounded groups. The logic is only as strong as the independence of the signatures, because four measures that were merely redundant converge trivially. As a consequence, we chose to validate the test using simulated assemblages before applying it. This validation seeks to confirm that convergence occurs only when interactions cluster into a bounded group, and not under any mimic. We also use the simulation to assess whether the four signatures are tightly correlated under such closure, yet nearly independent under the mimics. In this way, their joint movement should be informative rather than automatic. The use of convergence logic has an archaeological precedent. Neiman</w:t>
       </w:r>
       <w:r>
         <w:t xml:space="preserve"> </w:t>
@@ -1516,10 +1534,7 @@
         <w:t xml:space="preserve">(1995)</w:t>
       </w:r>
       <w:r>
-        <w:t xml:space="preserve"> </w:t>
-      </w:r>
-      <w:r>
-        <w:t xml:space="preserve">showed that two independently derived, theory-grounded measures of the same ceramic data, within-assemblage diversity and between-assemblage distance, converge on the same inference about past interaction. We generalize that two-measure agreement and apply it to our four. Whether all four signatures, or only some, can actually do so on a record like ours is a separate question that we settle by calibrating the test directly to synthetic data matched to the Parkin assemblages.</w:t>
+        <w:t xml:space="preserve">, for example, showed that two independently derived, theory-grounded measures of the same ceramic data, within-assemblage diversity and between-assemblage distance, converge on the same inference about past interaction. We generalize his approach and apply it to our four measures. Whether all four signatures, or only some, can actually do so on a record like ours is a separate question that we settle by calibrating the tests directly to synthetic data matched to the Parkin assemblages.</w:t>
       </w:r>
     </w:p>
     <w:p>
@@ -1527,7 +1542,15 @@
         <w:pStyle w:val="BodyText"/>
       </w:pPr>
       <w:r>
-        <w:t xml:space="preserve">Below, we describe the procedures, their methods, and outcomes. Figure 2 previews what the test distinguishes, the sharp structure a bounded group would leave against the diffuse pattern that drift produces, and why, on a record of this size and time-averaging, a weak within-basin boundary cannot be excluded.</w:t>
+        <w:t xml:space="preserve">That calibration is a signal-recovery experiment. We build synthetic assemblages matched to the real ones in number, sample size, and time-averaging, inject a known group-closure signal of controlled strength, and ask which signatures recover it and how strong the closure must be to register. It is necessary for two reasons specific to this record: it has only 29 time-averaged assemblages, and assemblage size trends along the seriation axis, so a size-sensitive measure can move through sampling alone. Reading each signature against this record-matched standard, rather than against the idealized expectation, is what licenses treating an absence of structure as real rather than as a failure of resolution. The procedure and its parameters are detailed in the Materials and Methods and the Supplemental Text, and Figure 4 reports the outcome.</w:t>
+      </w:r>
+    </w:p>
+    <w:p>
+      <w:pPr>
+        <w:pStyle w:val="BodyText"/>
+      </w:pPr>
+      <w:r>
+        <w:t xml:space="preserve">Below, we describe the procedures, their methods, and outcomes. Figure 2 previews what the test distinguishes. It shows the sharp structure that a bounded group would leave against the diffuse pattern that drift produces, and why, on a record of this size and time-averaging, a weak within-basin boundary cannot be excluded.</w:t>
       </w:r>
     </w:p>
     <w:p>
@@ -1600,7 +1623,7 @@
         <w:pStyle w:val="BodyText"/>
       </w:pPr>
       <w:r>
-        <w:t xml:space="preserve">A signature is trustworthy to the degree that it meets three conditions, usually treated apart. It should be theoretically sufficient. The transmission model entails its assumptions, so the result is a theoretical claim rather than an analogy. Deterministic frequency seriation is the model case, because the unimodality and continuity it requires are exactly what the neutral model predicts of a single interacting community. Neiman’s</w:t>
+        <w:t xml:space="preserve">A signature is trustworthy to the degree that it meets three conditions, usually treated apart. It should be theoretically sufficient. In this case, a cultural transmission model provides its assumptions, resulting in a theoretical claim rather than an analogy. Deterministic frequency seriation is the model case, because the unimodality and continuity it requires are exactly what the neutral model predicts of a single interacting community. Neiman’s</w:t>
       </w:r>
       <w:r>
         <w:t xml:space="preserve"> </w:t>
@@ -1612,7 +1635,7 @@
         <w:t xml:space="preserve"> </w:t>
       </w:r>
       <w:r>
-        <w:t xml:space="preserve">diversity and distance estimators are likewise derived from the model</w:t>
+        <w:t xml:space="preserve">diversity and distance estimators are likewise derived from the same cultural transmission model</w:t>
       </w:r>
       <w:r>
         <w:t xml:space="preserve"> </w:t>
@@ -1633,7 +1656,7 @@
         <w:t xml:space="preserve"> </w:t>
       </w:r>
       <w:r>
-        <w:t xml:space="preserve">sense, with its state variables and their transformation laws sufficient to carry the system from one state to the next, so that no single time-point statistic can be. And it should be empirically sufficient, matched to the quality of the archaeological record and defined at the time-averaged resolution the deposit preserves rather than at a generational resolution it does not</w:t>
+        <w:t xml:space="preserve">sense, with its state variables and their transformation laws sufficient to carry the system from one state to the next. And it should be empirically sufficient. This condition means it is matched to the quality of the archaeological record and defined at the time-averaged resolution preserved by the deposit, rather than at a snapshot or generational resolution</w:t>
       </w:r>
       <w:r>
         <w:t xml:space="preserve"> </w:t>
@@ -1642,7 +1665,15 @@
         <w:t xml:space="preserve">(Holdaway and Wandsnider 2008; Perreault 2019)</w:t>
       </w:r>
       <w:r>
-        <w:t xml:space="preserve">. Our four signatures are theoretically grounded by construction, each of which is entailed by the transmission model. Empirical sufficiency, whether a signature can actually register a signal at the resolution the deposit preserves, is not guaranteed by that grounding, so we test it rather than assume it. The recovery experiment finds only between-group variance empirically sufficient at this record’s resolution. Measured as states along the sequence, the signatures are only partially dynamically sufficient, a gap we close in the discussion with tests that model the transformation between states.</w:t>
+        <w:t xml:space="preserve">.</w:t>
+      </w:r>
+    </w:p>
+    <w:p>
+      <w:pPr>
+        <w:pStyle w:val="BodyText"/>
+      </w:pPr>
+      <w:r>
+        <w:t xml:space="preserve">Thus, our four signatures are theoretically and dynamically served by the transmission model. Empirical sufficiency, whether a signature can actually register a signal at the resolution the deposit preserves, is not guaranteed by this framing, requiring us to test it rather than assume it. As we will see below, the recovery experiment finds only between-group variance empirically sufficient at this record’s resolution. Measured as states along the sequence, the signatures are only partially dynamically sufficient, a gap we close in the discussion with tests that model the transformation between states.</w:t>
       </w:r>
     </w:p>
     <w:bookmarkEnd w:id="22"/>

</xml_diff>

<commit_message>
Sync main text: object-mediation rephrase, IDSS explanation, split signatures 3 and 4
Match the working repo's Methods-clarity edits and rebuild docx/pdf.
</commit_message>
<xml_diff>
--- a/docs/manuscript/MAIN_TEXT.docx
+++ b/docs/manuscript/MAIN_TEXT.docx
@@ -2,7 +2,7 @@
 <file path=word/document.xml><?xml version="1.0" encoding="utf-8"?>
 <w:document xmlns:w="http://schemas.openxmlformats.org/wordprocessingml/2006/main" xmlns:m="http://schemas.openxmlformats.org/officeDocument/2006/math" xmlns:r="http://schemas.openxmlformats.org/officeDocument/2006/relationships" xmlns:o="urn:schemas-microsoft-com:office:office" xmlns:v="urn:schemas-microsoft-com:vml" xmlns:w10="urn:schemas-microsoft-com:office:word" xmlns:a="http://schemas.openxmlformats.org/drawingml/2006/main" xmlns:pic="http://schemas.openxmlformats.org/drawingml/2006/picture" xmlns:wp="http://schemas.openxmlformats.org/drawingml/2006/wordprocessingDrawing">
   <w:body>
-    <w:bookmarkStart w:id="246" w:name="X093902eb68652ea32f5548e74607f4e4b0f6699"/>
+    <w:bookmarkStart w:id="245" w:name="X093902eb68652ea32f5548e74607f4e4b0f6699"/>
     <w:p>
       <w:pPr>
         <w:pStyle w:val="Heading1"/>
@@ -1064,7 +1064,7 @@
         <w:t xml:space="preserve"> </w:t>
       </w:r>
       <w:r>
-        <w:t xml:space="preserve">What each process does to the four transmission signatures, and which signature this record can measure. A filled circle (●) marks a signature, while an open circle (○) is one where it is not measurable. The process columns give the idealized discrimination logic: under smooth, deterministic processes, only a bounded interaction group drives all four, and each alternative drives a characteristic subset, the pattern an idealized simulation confirms (Figure S4). Two features of the table show why that logic is not the test we run on the record. The smooth-drift and stochastic-drift columns separate textbook isolation-by-distance, which drives none of the four, from realistic neutral drift on a finite network, which drives cultural F_ST and the boundary excess on its own, with no bounded group present (Figure S5). Stochastic drift thus reproduces the same two-signature pattern as environmental patchiness, so a positive result on either signature cannot by itself separate a bounded group from drift or patchiness. The final column reports the recovery experiment, the calibration introduced above: it injects a known group-closure signal into synthetic assemblages matched to the record’s sample sizes and time-averaging and asks which signatures can detect it (Figure 4; described in Materials and Methods, with full detail in the Supplemental Text). At this record’s 29 time-averaged assemblages, only cultural F_ST registers the injected signal, and even then, it must be compared against the stochastic-drift null rather than zero. Seriation-coherence breakdown, which only a bounded group drives in principle, is the cleanest discriminator on paper yet undetectable here. The four signatures are therefore candidate diagnostics screened against the record, and the surviving discrimination is carried by cultural F_ST, assessed against the drift null, and by the generative drift-versus-groups comparison, not by convergence of the table’s rows.</w:t>
+        <w:t xml:space="preserve">What each process does to the four transmission signatures, and which signature this record can measure. A filled circle (●) marks a signature, while an open circle (○) is one where it is not measurable. The process columns give the idealized discrimination logic: under smooth, deterministic processes, only a bounded interaction group drives all four, and each alternative drives a characteristic subset, the pattern an idealized simulation confirms (Figure S4). Two features of the table show why that logic is not the test we run on the record. The smooth-drift and stochastic-drift columns separate textbook isolation-by-distance, which drives none of the four, from realistic neutral drift on a finite network, which drives cultural F_ST and the boundary excess on its own, with no bounded group present (Figure S5). Stochastic drift thus reproduces the same two-signature pattern as environmental patchiness, so a positive result on either signature cannot by itself separate a bounded group from drift or patchiness. The final column reports the recovery experiment introduced below. In this way, the four signatures are therefore candidate diagnostics screened against the record, and the surviving discrimination is carried by cultural F_ST, assessed against the drift null, and by the generative drift-versus-groups comparison, not by convergence of the table’s rows.</w:t>
       </w:r>
     </w:p>
     <w:tbl>
@@ -1542,7 +1542,7 @@
         <w:pStyle w:val="BodyText"/>
       </w:pPr>
       <w:r>
-        <w:t xml:space="preserve">That calibration is a signal-recovery experiment. We build synthetic assemblages matched to the real ones in number, sample size, and time-averaging, inject a known group-closure signal of controlled strength, and ask which signatures recover it and how strong the closure must be to register. It is necessary for two reasons specific to this record: it has only 29 time-averaged assemblages, and assemblage size trends along the seriation axis, so a size-sensitive measure can move through sampling alone. Reading each signature against this record-matched standard, rather than against the idealized expectation, is what licenses treating an absence of structure as real rather than as a failure of resolution. The procedure and its parameters are detailed in the Materials and Methods and the Supplemental Text, and Figure 4 reports the outcome.</w:t>
+        <w:t xml:space="preserve">That calibration is a signal-recovery experiment (described in the Materials and Methods section, with full details in the Supplemental Text). We build synthetic assemblages matched to the real ones in number, sample size, and time-averaging, and inject a known group-closure signal of controlled strength. We then ask which signatures recover it and how strong the closure must be to register. This process is necessary for two reasons specific to this record: it has only 29 time-averaged assemblages, and assemblage size trends along the seriation axis, so a size-sensitive measure can move through sampling alone. Reading each signature against this record-matched standard, rather than against the idealized expectation, is what enables us to treat an absence of structure as real rather than as a failure of resolution. The procedure and its parameters are detailed in the Materials and Methods and the Supplemental Text, and Figure 4 reports the outcome.</w:t>
       </w:r>
     </w:p>
     <w:p>
@@ -1673,7 +1673,7 @@
         <w:pStyle w:val="BodyText"/>
       </w:pPr>
       <w:r>
-        <w:t xml:space="preserve">Thus, our four signatures are theoretically and dynamically served by the transmission model. Empirical sufficiency, whether a signature can actually register a signal at the resolution the deposit preserves, is not guaranteed by this framing, requiring us to test it rather than assume it. As we will see below, the recovery experiment finds only between-group variance empirically sufficient at this record’s resolution. Measured as states along the sequence, the signatures are only partially dynamically sufficient, a gap we close in the discussion with tests that model the transformation between states.</w:t>
+        <w:t xml:space="preserve">Thus, our four signatures are theoretically and dynamically served by the transmission model. Empirical sufficiency, whether a signature can actually register a signal at the resolution the deposit preserves, is not guaranteed by this framing, requiring us to test it rather than assume it. As we will describe below, at this record’s 29 time-averaged assemblages, only cultural F_ST registers the injected signal, and even then, it must be compared against the stochastic-drift null rather than zero. Seriation-coherence breakdown, which only a bounded group drives in principle, is the cleanest discriminator on paper yet undetectable here. Therefore, measured as states along the sequence, the signatures are only partially dynamically sufficient, a gap we close in the discussion with tests that model the transformation between states.</w:t>
       </w:r>
     </w:p>
     <w:bookmarkEnd w:id="22"/>
@@ -1700,7 +1700,7 @@
         <w:pStyle w:val="FirstParagraph"/>
       </w:pPr>
       <w:r>
-        <w:t xml:space="preserve">The ceramic data are the decorated-class counts compiled by Phillips, Ford, and Griffin</w:t>
+        <w:t xml:space="preserve">The ceramic data that are the basis of the original phase definitions come from the decorated-class counts compiled by Phillips, Ford, and Griffin</w:t>
       </w:r>
       <w:r>
         <w:t xml:space="preserve"> </w:t>
@@ -1712,7 +1712,7 @@
         <w:t xml:space="preserve"> </w:t>
       </w:r>
       <w:r>
-        <w:t xml:space="preserve">for the Lower Mississippi Survey, an assemblage-by-class matrix of 266 surface assemblages from the central valley</w:t>
+        <w:t xml:space="preserve">for the Lower Mississippi Valley Survey. We have compiled these data into an assemblage-by-class matrix of 266 surface assemblages</w:t>
       </w:r>
       <w:r>
         <w:t xml:space="preserve"> </w:t>
@@ -1721,7 +1721,7 @@
         <w:t xml:space="preserve">(Lipo 2001)</w:t>
       </w:r>
       <w:r>
-        <w:t xml:space="preserve">. Each decorated class is a unit of measurement that the analyst defines to capture stylistic variation, not a native category assumed in advance. We restrict the analysis to the St. Francis basin of northeastern Arkansas, the setting of Parkin, defined hydrologically as the assemblages within 20 km of the St. Francis, Tyronza, and L’Anguille drainage (Figure 1). This yields 29 decorated assemblages for the transmission analysis and 92 sites for the settlement comparison. The basin is a geographic unit, not a single culture-historical phase: under the standard regional scheme, its assemblages fall into the Parkin phase together with sites assigned to the Nodena, Kent, Walls, and Parchman phases</w:t>
+        <w:t xml:space="preserve">. Each decorated class is a culture history type, a unit of measurement that the analysts defined to capture stylistic variation, not a native category assumed in advance. For our study, we restrict the analysis to the St. Francis basin of northeastern Arkansas, the setting of Parkin, defined hydrologically as the assemblages within 20 km of the St. Francis, Tyronza, and L’Anguille drainage (Figure 1). This yields 29 decorated assemblages for the transmission analysis and 92 sites for the settlement comparison. The basin is a geographic unit, not a single culture-historical phase: under the standard regional scheme, its assemblages fall into the Parkin phase together with sites assigned to the Nodena, Kent, Walls, and Parchman phases</w:t>
       </w:r>
       <w:r>
         <w:t xml:space="preserve"> </w:t>
@@ -1730,7 +1730,7 @@
         <w:t xml:space="preserve">(Mainfort 2003; Phillips 1970)</w:t>
       </w:r>
       <w:r>
-        <w:t xml:space="preserve">. The test, therefore, asks whether interaction closed into bounded groups anywhere in the basin, across the phase divisions that culture history draws within it, and within the Parkin phase. The set excludes the lower Yazoo Basin to the south. A stricter watershed rule, keeping only assemblages nearer the St. Francis system than the Mississippi, gives 19. The verdict reported below is unchanged across both definitions. The two southern St. Francis-type sites the drainage rule excludes, Old Town and Blanchard, lie 28 and 80 km from the St. Francis system and belong to the Mississippi-proximal and lower Yazoo settings rather than to the St. Francis drainage. We georeferenced each assemblage through the Lower Mississippi Survey site files. We used settlement attributes, site size, mound count and height, and the presence of defensive ditches and St-Francis-type fortification, from a regional geographic database</w:t>
+        <w:t xml:space="preserve">. The test, therefore, asks whether interaction closed into bounded groups anywhere in the basin, across the phase divisions that culture history draws within it, and within the Parkin phase. The set excludes the lower Yazoo Basin to the south. A stricter watershed rule, keeping only assemblages nearer the St. Francis system than the Mississippi, gives 19. The verdict reported below is unchanged across both definitions. The two southern St. Francis-type sites the drainage rule excludes, Old Town and Blanchard, lie 28 and 80 km from the St. Francis system and belong to the Mississippi-proximal and lower Yazoo settings rather than to the St. Francis drainage. We georeferenced each assemblage based on maps from the Lower Mississippi Survey site files. We used settlement attributes, site size, mound count and height, and the presence of defensive ditches and St-Francis-type fortification, from a regional geographic database</w:t>
       </w:r>
       <w:r>
         <w:t xml:space="preserve"> </w:t>
@@ -1747,7 +1747,7 @@
         <w:pStyle w:val="BodyText"/>
       </w:pPr>
       <w:r>
-        <w:t xml:space="preserve">Two properties of the data bound what any transmission analysis can claim, and we treat them as constraints rather than nuisances. The assemblages are time-averaged surface assemblages, so each aggregate pottery over the use-life of its deposit, and such aggregation distorts diversity and neutrality statistics in proportion to the mean lifetime of the variants</w:t>
+        <w:t xml:space="preserve">Two properties of the data bound what any transmission analysis can claim, and we treat them as constraints rather than nuisances. The assemblages are time-averaged surface assemblages, so they consist of a sample of an aggregate of pottery formed over the use-life of its deposit. Such aggregation distorts diversity and neutrality statistics in proportion to the mean lifetime of the variants</w:t>
       </w:r>
       <w:r>
         <w:t xml:space="preserve"> </w:t>
@@ -1756,7 +1756,7 @@
         <w:t xml:space="preserve">(Madsen 2012; Miller-Atkins and Premo 2018)</w:t>
       </w:r>
       <w:r>
-        <w:t xml:space="preserve">. The units transmitted are also durable objects rather than potters, which displaces the neutral expectation from the standard population-genetic null</w:t>
+        <w:t xml:space="preserve">. The neutral model’s expectations are derived for a population of people copying one another. An assemblage, however, counts durable objects, the pots and sherds themselves, not the potters who made them. Because the record is object-mediated rather than person-mediated, the standard neutral expectation does not apply exactly and must be understood with that caveat in mind</w:t>
       </w:r>
       <w:r>
         <w:t xml:space="preserve"> </w:t>
@@ -1765,7 +1765,15 @@
         <w:t xml:space="preserve">(Crema et al. 2024)</w:t>
       </w:r>
       <w:r>
-        <w:t xml:space="preserve">. Absolute chronology is the binding limitation, though the radiocarbon corpus is richer than a bare five-date anchor. The Mainfort</w:t>
+        <w:t xml:space="preserve">.</w:t>
+      </w:r>
+    </w:p>
+    <w:p>
+      <w:pPr>
+        <w:pStyle w:val="BodyText"/>
+      </w:pPr>
+      <w:r>
+        <w:t xml:space="preserve">The availability of an absolute chronology is a requirement, though the existing radiocarbon corpus is richer than a bare five-date anchor. The Mainfort</w:t>
       </w:r>
       <w:r>
         <w:t xml:space="preserve"> </w:t>
@@ -1822,7 +1830,7 @@
         <w:t xml:space="preserve">(Baxter 1994; Peeples and Schachner 2012; Smith and Neiman 2007)</w:t>
       </w:r>
       <w:r>
-        <w:t xml:space="preserve">. This ordination arranges assemblages along axes that summarize their decorated-class-frequency differences, as a relative chronological ordinate oriented so that higher positions correspond to later time (Figure 3). Pooling the dates of the five proveniences that match curated assemblages, the median calibrated ages correlate with seriation position at Spearman +0.70 (n = 5, 27 dates pooled), an improvement on the +0.50 of the single-date anchors. Four of the five sites fall in calendar order, with one late-dated site departing from it. The axis, therefore, tracks calendar time, but imperfectly. The trajectory we test is an ordinal measure, not a calendar rate. The discriminating quantity, the size-controlled F_ST trend, is a magnitude invariant to the axis orientation, so only the directional descriptions of the other signatures depend on the anchor. We return to both limits in the discussion.</w:t>
+        <w:t xml:space="preserve">. This ordination arranges assemblages along axes that summarize their decorated-class-frequency differences, as a relative chronological ordinate oriented so that higher positions correspond to later time (Figure 3). Pooling the dates of the five proveniences that match curated assemblages, the median calibrated ages correlate with seriation position at Spearman +0.70 (n = 5, 27 dates pooled), an improvement on the +0.50 of the single-date anchors. Four of the five sites fall in calendrical order, with one late-dated site departing from it. The axis, therefore, tracks calendar time imperfectly. The trajectory we test, therefore, is an ordinal measure, not a calendar rate. The discriminating quantity, the size-controlled F_ST trend, is a magnitude invariant to the axis orientation, so only the directional descriptions of the other signatures depend on the anchor. We return to both limits in the discussion.</w:t>
       </w:r>
     </w:p>
     <w:p>
@@ -1926,10 +1934,7 @@
         <w:t xml:space="preserve">(1972)</w:t>
       </w:r>
       <w:r>
-        <w:t xml:space="preserve"> </w:t>
-      </w:r>
-      <w:r>
-        <w:t xml:space="preserve">to estimate the number of classes expected under random copying, and took the ratio of the two estimates as the signature. Under neutral drift, the two estimators agree. Conformist transmission lowers the homozygosity-based estimate relative to the richness-based one, and anti-conformist novelty bias does the reverse, so the ratio both detects a departure and indicates its direction</w:t>
+        <w:t xml:space="preserve">. This approach enables us to estimate the number of classes expected under random copying and to take the ratio of the two estimates as the signature. Under neutral drift, the two estimators agree. Conformist transmission lowers the homozygosity-based estimate relative to the richness-based one, and anti-conformist novelty bias does the reverse, so the ratio both detects a departure and indicates its direction</w:t>
       </w:r>
       <w:r>
         <w:t xml:space="preserve"> </w:t>
@@ -1946,16 +1951,25 @@
         <w:pStyle w:val="BodyText"/>
       </w:pPr>
       <w:r>
-        <w:t xml:space="preserve">Seriation coherence follows the deterministic frequency-seriation method of Lipo, Madsen, and Dunnell</w:t>
-      </w:r>
-      <w:r>
-        <w:t xml:space="preserve"> </w:t>
-      </w:r>
-      <w:r>
-        <w:t xml:space="preserve">(Dunnell 1970; Graves and Cachola-Abad 1996; Lipo et al. 1997, 2015)</w:t>
-      </w:r>
-      <w:r>
-        <w:t xml:space="preserve">. A set of assemblages is co-seriable if some ordering renders every decorated class both unimodal and continuous, and the method returns the complete set of maximal co-seriable groups. A single group denotes a single interacting community. A proliferation of small, non-co-seriable groups indicates a fragmented one. We report the number and size of these groups and, for each assemblage, the number of distinct groups it joins, which identifies assemblages that bridge otherwise incompatible orderings.</w:t>
+        <w:t xml:space="preserve">Seriation coherence follows an iterative deterministic frequency-seriation method of Lipo, Madsen, and Dunnell</w:t>
+      </w:r>
+      <w:r>
+        <w:t xml:space="preserve"> </w:t>
+      </w:r>
+      <w:r>
+        <w:t xml:space="preserve">(2015)</w:t>
+      </w:r>
+      <w:r>
+        <w:t xml:space="preserve">. A set of assemblages is co-seriable if some ordering renders every decorated class both unimodal and continuous, and the method returns the complete set of maximal co-seriable groups. Because checking every possible ordering becomes computationally intractable beyond about fourteen assemblages, IDSS builds solutions agglomeratively: it starts with the valid three-assemblage seriations and extends each by adding assemblages that keep every class unimodal and continuous, until no further additions are possible</w:t>
+      </w:r>
+      <w:r>
+        <w:t xml:space="preserve"> </w:t>
+      </w:r>
+      <w:r>
+        <w:t xml:space="preserve">(Lipo et al. 2015)</w:t>
+      </w:r>
+      <w:r>
+        <w:t xml:space="preserve">. Each class’s departure from a single peak, or a break in its continuity, is assessed against bootstrap confidence intervals for the class frequencies, so it counts as a real break only when it exceeds the sampling error. Small, sparsely sampled assemblages have wider intervals and therefore admit more orderings. A single group denotes a single interacting community. A proliferation of small, non-co-seriable groups indicates a fragmented one. We report the number and size of these groups and, for each assemblage, the number of distinct groups it joins, which identifies assemblages that bridge otherwise incompatible orderings.</w:t>
       </w:r>
     </w:p>
     <w:p>
@@ -1963,7 +1977,7 @@
         <w:pStyle w:val="BodyText"/>
       </w:pPr>
       <w:r>
-        <w:t xml:space="preserve">The variance partition is a cultural analog of Wright’s F_ST computed on Gini-Simpson diversity, the chance that two sherds drawn at random from an assemblage are of different classes: the difference between the diversity of the pooled assemblages and the mean within-group diversity, divided by the pooled diversity, taken across spatial clusters</w:t>
+        <w:t xml:space="preserve">The third signature, the variance partition, is a cultural analog of Wright’s F_ST, computed on Gini-Simpson diversity, the chance that two sherds drawn at random from an assemblage are of different classes</w:t>
       </w:r>
       <w:r>
         <w:t xml:space="preserve"> </w:t>
@@ -1972,7 +1986,15 @@
         <w:t xml:space="preserve">(Bell et al. 2009)</w:t>
       </w:r>
       <w:r>
-        <w:t xml:space="preserve">. It rises from zero as groups come to hold distinct decorated repertoires. Spatial assortativity measures whether ceramic similarity follows social rather than geographic distance. We computed the Brainerd-Robinson similarity</w:t>
+        <w:t xml:space="preserve">. It is the difference between the diversity of the pooled assemblages and the mean within-group diversity, divided by the pooled diversity, taken across spatial clusters. It rises from zero as groups come to hold distinct decorated repertoires.</w:t>
+      </w:r>
+    </w:p>
+    <w:p>
+      <w:pPr>
+        <w:pStyle w:val="BodyText"/>
+      </w:pPr>
+      <w:r>
+        <w:t xml:space="preserve">The fourth signature, spatial assortativity, measures whether ceramic similarity follows social rather than geographic distance. For each pair of assemblages, we computed the Brainerd-Robinson similarity</w:t>
       </w:r>
       <w:r>
         <w:t xml:space="preserve"> </w:t>
@@ -1981,7 +2003,7 @@
         <w:t xml:space="preserve">(Brainerd 1951; Robinson 1951)</w:t>
       </w:r>
       <w:r>
-        <w:t xml:space="preserve">, a standard index ranging from 0 to 200 that indicates how alike two assemblages are in their class proportions, for every pair of assemblages. We tested its association with inter-site distance by a Mantel</w:t>
+        <w:t xml:space="preserve">, a standard index ranging from 0 to 200 that quantifies how similar two assemblages are in their class proportions. We tested its association with inter-site distance using a Mantel</w:t>
       </w:r>
       <w:r>
         <w:t xml:space="preserve"> </w:t>
@@ -1993,7 +2015,15 @@
         <w:t xml:space="preserve"> </w:t>
       </w:r>
       <w:r>
-        <w:t xml:space="preserve">permutation test, which asks whether two distance matrices, here ceramic dissimilarity and geographic distance, are related. Because a Mantel correlation cannot separate a sharp social boundary from a smooth distance decay, we summarized the result as a boundary-excess statistic, the gap between mean within-cluster and between-cluster similarity after controlling for distance. Smooth isolation-by-distance returns a boundary excess near zero, and a genuine social boundary returns a large positive value. Two corrections are essential before any of these signatures is interpreted. Assemblage sample size trends with seriation position, and several of the estimators are size-sensitive, so we subsample every assemblage to a common count (rarefaction)</w:t>
+        <w:t xml:space="preserve">permutation test, which asks whether two distance matrices, here ceramic dissimilarity and geographic distance, are related. A Mantel correlation cannot separate a sharp social boundary from a smooth distance decay. As a result, we also computed a boundary-excess statistic, which is the gap between mean within-cluster and between-cluster similarity after controlling for distance. Smooth isolation by distance returns a boundary excess near zero, while a genuine social boundary returns a large positive value.</w:t>
+      </w:r>
+    </w:p>
+    <w:p>
+      <w:pPr>
+        <w:pStyle w:val="BodyText"/>
+      </w:pPr>
+      <w:r>
+        <w:t xml:space="preserve">Two corrections are essential before any of these signatures is interpreted. Assemblage sample size trends with seriation position, and several estimators are size-sensitive, so we subsample every assemblage to a common count (i.e., rarefaction)</w:t>
       </w:r>
       <w:r>
         <w:t xml:space="preserve"> </w:t>
@@ -2005,7 +2035,7 @@
         <w:t xml:space="preserve"> </w:t>
       </w:r>
       <w:r>
-        <w:t xml:space="preserve">before scoring each signature as its rank correlation with ordinal position. And which signatures can be trusted at the record’s resolution is not assumed but established by the recovery experiment described next, in which a known closure signal is injected into the real configuration.</w:t>
+        <w:t xml:space="preserve">before scoring each signature as its rank correlation with its ordinal position. Which signatures can then be trusted at the record’s resolution is not assumed but established by the recovery experiment described next, in which a known closure signal is injected into the real configuration.</w:t>
       </w:r>
     </w:p>
     <w:bookmarkEnd w:id="27"/>
@@ -3230,7 +3260,7 @@
       </w:r>
     </w:p>
     <w:bookmarkEnd w:id="59"/>
-    <w:bookmarkStart w:id="245" w:name="references"/>
+    <w:bookmarkStart w:id="244" w:name="references"/>
     <w:p>
       <w:pPr>
         <w:pStyle w:val="Heading2"/>
@@ -3239,7 +3269,7 @@
         <w:t xml:space="preserve">References</w:t>
       </w:r>
     </w:p>
-    <w:bookmarkStart w:id="244" w:name="refs"/>
+    <w:bookmarkStart w:id="243" w:name="refs"/>
     <w:bookmarkStart w:id="60" w:name="ref-anderson_1996"/>
     <w:p>
       <w:pPr>
@@ -4637,48 +4667,48 @@
       </w:r>
     </w:p>
     <w:bookmarkEnd w:id="119"/>
-    <w:bookmarkStart w:id="120" w:name="ref-graves_cachola-abad_1996"/>
-    <w:p>
-      <w:pPr>
-        <w:pStyle w:val="Bibliography"/>
-      </w:pPr>
-      <w:r>
-        <w:t xml:space="preserve">Graves, Michael W., and C. Kehaunani Cachola-Abad. 1996. Seriation as a Method of Chronologically Ordering Architectural Design Traits: An Example from</w:t>
-      </w:r>
-      <w:r>
-        <w:t xml:space="preserve"> </w:t>
-      </w:r>
-      <w:r>
-        <w:t xml:space="preserve">Hawai’i</w:t>
-      </w:r>
-      <w:r>
-        <w:t xml:space="preserve">.</w:t>
-      </w:r>
-      <w:r>
-        <w:t xml:space="preserve"> </w:t>
-      </w:r>
-      <w:r>
-        <w:rPr>
-          <w:i/>
-          <w:iCs/>
-        </w:rPr>
-        <w:t xml:space="preserve">Archaeology in Oceania</w:t>
-      </w:r>
-      <w:r>
-        <w:t xml:space="preserve"> </w:t>
-      </w:r>
-      <w:r>
-        <w:t xml:space="preserve">31(1):19–32.</w:t>
+    <w:bookmarkStart w:id="120" w:name="ref-hally_1993"/>
+    <w:p>
+      <w:pPr>
+        <w:pStyle w:val="Bibliography"/>
+      </w:pPr>
+      <w:r>
+        <w:t xml:space="preserve">Hally, David J. 1993. The Territorial Size of</w:t>
+      </w:r>
+      <w:r>
+        <w:t xml:space="preserve"> </w:t>
+      </w:r>
+      <w:r>
+        <w:t xml:space="preserve">Mississippian</w:t>
+      </w:r>
+      <w:r>
+        <w:t xml:space="preserve"> </w:t>
+      </w:r>
+      <w:r>
+        <w:t xml:space="preserve">Chiefdoms. In</w:t>
+      </w:r>
+      <w:r>
+        <w:t xml:space="preserve"> </w:t>
+      </w:r>
+      <w:r>
+        <w:rPr>
+          <w:i/>
+          <w:iCs/>
+        </w:rPr>
+        <w:t xml:space="preserve">Archaeology of Eastern North America: Papers in Honor of Stephen Williams</w:t>
+      </w:r>
+      <w:r>
+        <w:t xml:space="preserve">, edited by James B. Stoltman, pp. 143–167. Archaeological Report No. 25. Mississippi Department of Archives; History, Jackson.</w:t>
       </w:r>
     </w:p>
     <w:bookmarkEnd w:id="120"/>
-    <w:bookmarkStart w:id="121" w:name="ref-hally_1993"/>
-    <w:p>
-      <w:pPr>
-        <w:pStyle w:val="Bibliography"/>
-      </w:pPr>
-      <w:r>
-        <w:t xml:space="preserve">Hally, David J. 1993. The Territorial Size of</w:t>
+    <w:bookmarkStart w:id="121" w:name="ref-hally_1996"/>
+    <w:p>
+      <w:pPr>
+        <w:pStyle w:val="Bibliography"/>
+      </w:pPr>
+      <w:r>
+        <w:t xml:space="preserve">Hally, David J. 1996. Platform Mound Construction and the Instability of</w:t>
       </w:r>
       <w:r>
         <w:t xml:space="preserve"> </w:t>
@@ -4700,49 +4730,14 @@
           <w:i/>
           <w:iCs/>
         </w:rPr>
-        <w:t xml:space="preserve">Archaeology of Eastern North America: Papers in Honor of Stephen Williams</w:t>
-      </w:r>
-      <w:r>
-        <w:t xml:space="preserve">, edited by James B. Stoltman, pp. 143–167. Archaeological Report No. 25. Mississippi Department of Archives; History, Jackson.</w:t>
+        <w:t xml:space="preserve">Political Structure and Change in the Prehistoric Southeastern United States</w:t>
+      </w:r>
+      <w:r>
+        <w:t xml:space="preserve">, edited by John F. Scarry, pp. 92–127. University Press of Florida, Gainesville.</w:t>
       </w:r>
     </w:p>
     <w:bookmarkEnd w:id="121"/>
-    <w:bookmarkStart w:id="122" w:name="ref-hally_1996"/>
-    <w:p>
-      <w:pPr>
-        <w:pStyle w:val="Bibliography"/>
-      </w:pPr>
-      <w:r>
-        <w:t xml:space="preserve">Hally, David J. 1996. Platform Mound Construction and the Instability of</w:t>
-      </w:r>
-      <w:r>
-        <w:t xml:space="preserve"> </w:t>
-      </w:r>
-      <w:r>
-        <w:t xml:space="preserve">Mississippian</w:t>
-      </w:r>
-      <w:r>
-        <w:t xml:space="preserve"> </w:t>
-      </w:r>
-      <w:r>
-        <w:t xml:space="preserve">Chiefdoms. In</w:t>
-      </w:r>
-      <w:r>
-        <w:t xml:space="preserve"> </w:t>
-      </w:r>
-      <w:r>
-        <w:rPr>
-          <w:i/>
-          <w:iCs/>
-        </w:rPr>
-        <w:t xml:space="preserve">Political Structure and Change in the Prehistoric Southeastern United States</w:t>
-      </w:r>
-      <w:r>
-        <w:t xml:space="preserve">, edited by John F. Scarry, pp. 92–127. University Press of Florida, Gainesville.</w:t>
-      </w:r>
-    </w:p>
-    <w:bookmarkEnd w:id="122"/>
-    <w:bookmarkStart w:id="124" w:name="ref-henrich_2001"/>
+    <w:bookmarkStart w:id="123" w:name="ref-henrich_2001"/>
     <w:p>
       <w:pPr>
         <w:pStyle w:val="Bibliography"/>
@@ -4769,7 +4764,7 @@
       <w:r>
         <w:t xml:space="preserve"> </w:t>
       </w:r>
-      <w:hyperlink r:id="rId123">
+      <w:hyperlink r:id="rId122">
         <w:r>
           <w:rPr>
             <w:rStyle w:val="Hyperlink"/>
@@ -4781,8 +4776,8 @@
         <w:t xml:space="preserve">.</w:t>
       </w:r>
     </w:p>
-    <w:bookmarkEnd w:id="124"/>
-    <w:bookmarkStart w:id="126" w:name="ref-henrich_2004"/>
+    <w:bookmarkEnd w:id="123"/>
+    <w:bookmarkStart w:id="125" w:name="ref-henrich_2004"/>
     <w:p>
       <w:pPr>
         <w:pStyle w:val="Bibliography"/>
@@ -4821,7 +4816,7 @@
       <w:r>
         <w:t xml:space="preserve"> </w:t>
       </w:r>
-      <w:hyperlink r:id="rId125">
+      <w:hyperlink r:id="rId124">
         <w:r>
           <w:rPr>
             <w:rStyle w:val="Hyperlink"/>
@@ -4833,8 +4828,8 @@
         <w:t xml:space="preserve">.</w:t>
       </w:r>
     </w:p>
-    <w:bookmarkEnd w:id="126"/>
-    <w:bookmarkStart w:id="128" w:name="ref-henrich_boyd_1998"/>
+    <w:bookmarkEnd w:id="125"/>
+    <w:bookmarkStart w:id="127" w:name="ref-henrich_boyd_1998"/>
     <w:p>
       <w:pPr>
         <w:pStyle w:val="Bibliography"/>
@@ -4861,7 +4856,7 @@
       <w:r>
         <w:t xml:space="preserve"> </w:t>
       </w:r>
-      <w:hyperlink r:id="rId127">
+      <w:hyperlink r:id="rId126">
         <w:r>
           <w:rPr>
             <w:rStyle w:val="Hyperlink"/>
@@ -4873,31 +4868,31 @@
         <w:t xml:space="preserve">.</w:t>
       </w:r>
     </w:p>
+    <w:bookmarkEnd w:id="127"/>
+    <w:bookmarkStart w:id="128" w:name="ref-holdaway_wandsnider_2008"/>
+    <w:p>
+      <w:pPr>
+        <w:pStyle w:val="Bibliography"/>
+      </w:pPr>
+      <w:r>
+        <w:t xml:space="preserve">Holdaway, Simon J., and LuAnn Wandsnider (editors). 2008.</w:t>
+      </w:r>
+      <w:r>
+        <w:t xml:space="preserve"> </w:t>
+      </w:r>
+      <w:r>
+        <w:rPr>
+          <w:i/>
+          <w:iCs/>
+        </w:rPr>
+        <w:t xml:space="preserve">Time in Archaeology: Time Perspectivism Revisited</w:t>
+      </w:r>
+      <w:r>
+        <w:t xml:space="preserve">. University of Utah Press, Salt Lake City.</w:t>
+      </w:r>
+    </w:p>
     <w:bookmarkEnd w:id="128"/>
-    <w:bookmarkStart w:id="129" w:name="ref-holdaway_wandsnider_2008"/>
-    <w:p>
-      <w:pPr>
-        <w:pStyle w:val="Bibliography"/>
-      </w:pPr>
-      <w:r>
-        <w:t xml:space="preserve">Holdaway, Simon J., and LuAnn Wandsnider (editors). 2008.</w:t>
-      </w:r>
-      <w:r>
-        <w:t xml:space="preserve"> </w:t>
-      </w:r>
-      <w:r>
-        <w:rPr>
-          <w:i/>
-          <w:iCs/>
-        </w:rPr>
-        <w:t xml:space="preserve">Time in Archaeology: Time Perspectivism Revisited</w:t>
-      </w:r>
-      <w:r>
-        <w:t xml:space="preserve">. University of Utah Press, Salt Lake City.</w:t>
-      </w:r>
-    </w:p>
-    <w:bookmarkEnd w:id="129"/>
-    <w:bookmarkStart w:id="131" w:name="ref-holland-lulewicz_ritchison_2021"/>
+    <w:bookmarkStart w:id="130" w:name="ref-holland-lulewicz_ritchison_2021"/>
     <w:p>
       <w:pPr>
         <w:pStyle w:val="Bibliography"/>
@@ -4924,7 +4919,7 @@
       <w:r>
         <w:t xml:space="preserve"> </w:t>
       </w:r>
-      <w:hyperlink r:id="rId130">
+      <w:hyperlink r:id="rId129">
         <w:r>
           <w:rPr>
             <w:rStyle w:val="Hyperlink"/>
@@ -4936,138 +4931,138 @@
         <w:t xml:space="preserve">.</w:t>
       </w:r>
     </w:p>
+    <w:bookmarkEnd w:id="130"/>
+    <w:bookmarkStart w:id="131" w:name="ref-house_1991"/>
+    <w:p>
+      <w:pPr>
+        <w:pStyle w:val="Bibliography"/>
+      </w:pPr>
+      <w:r>
+        <w:t xml:space="preserve">House, John H. 1991. Monitoring</w:t>
+      </w:r>
+      <w:r>
+        <w:t xml:space="preserve"> </w:t>
+      </w:r>
+      <w:r>
+        <w:t xml:space="preserve">Mississippian</w:t>
+      </w:r>
+      <w:r>
+        <w:t xml:space="preserve"> </w:t>
+      </w:r>
+      <w:r>
+        <w:t xml:space="preserve">Dynamics: Time, Settlement, and Ceramic Variation in the</w:t>
+      </w:r>
+      <w:r>
+        <w:t xml:space="preserve"> </w:t>
+      </w:r>
+      <w:r>
+        <w:t xml:space="preserve">Kent</w:t>
+      </w:r>
+      <w:r>
+        <w:t xml:space="preserve"> </w:t>
+      </w:r>
+      <w:r>
+        <w:t xml:space="preserve">Phase, Eastern</w:t>
+      </w:r>
+      <w:r>
+        <w:t xml:space="preserve"> </w:t>
+      </w:r>
+      <w:r>
+        <w:t xml:space="preserve">Arkansas</w:t>
+      </w:r>
+      <w:r>
+        <w:t xml:space="preserve">. PhD thesis, Southern Illinois University at Carbondale.</w:t>
+      </w:r>
+    </w:p>
     <w:bookmarkEnd w:id="131"/>
-    <w:bookmarkStart w:id="132" w:name="ref-house_1991"/>
-    <w:p>
-      <w:pPr>
-        <w:pStyle w:val="Bibliography"/>
-      </w:pPr>
-      <w:r>
-        <w:t xml:space="preserve">House, John H. 1991. Monitoring</w:t>
-      </w:r>
-      <w:r>
-        <w:t xml:space="preserve"> </w:t>
-      </w:r>
-      <w:r>
-        <w:t xml:space="preserve">Mississippian</w:t>
-      </w:r>
-      <w:r>
-        <w:t xml:space="preserve"> </w:t>
-      </w:r>
-      <w:r>
-        <w:t xml:space="preserve">Dynamics: Time, Settlement, and Ceramic Variation in the</w:t>
-      </w:r>
-      <w:r>
-        <w:t xml:space="preserve"> </w:t>
-      </w:r>
-      <w:r>
-        <w:t xml:space="preserve">Kent</w:t>
-      </w:r>
-      <w:r>
-        <w:t xml:space="preserve"> </w:t>
-      </w:r>
-      <w:r>
-        <w:t xml:space="preserve">Phase, Eastern</w:t>
-      </w:r>
-      <w:r>
-        <w:t xml:space="preserve"> </w:t>
-      </w:r>
-      <w:r>
-        <w:t xml:space="preserve">Arkansas</w:t>
-      </w:r>
-      <w:r>
-        <w:t xml:space="preserve">. PhD thesis, Southern Illinois University at Carbondale.</w:t>
+    <w:bookmarkStart w:id="132" w:name="ref-house_1993"/>
+    <w:p>
+      <w:pPr>
+        <w:pStyle w:val="Bibliography"/>
+      </w:pPr>
+      <w:r>
+        <w:t xml:space="preserve">House, John H. 1993. Dating the Kent Phase.</w:t>
+      </w:r>
+      <w:r>
+        <w:t xml:space="preserve"> </w:t>
+      </w:r>
+      <w:r>
+        <w:rPr>
+          <w:i/>
+          <w:iCs/>
+        </w:rPr>
+        <w:t xml:space="preserve">Southeastern Archaeology</w:t>
+      </w:r>
+      <w:r>
+        <w:t xml:space="preserve"> </w:t>
+      </w:r>
+      <w:r>
+        <w:t xml:space="preserve">12(1):21–32.</w:t>
       </w:r>
     </w:p>
     <w:bookmarkEnd w:id="132"/>
-    <w:bookmarkStart w:id="133" w:name="ref-house_1993"/>
-    <w:p>
-      <w:pPr>
-        <w:pStyle w:val="Bibliography"/>
-      </w:pPr>
-      <w:r>
-        <w:t xml:space="preserve">House, John H. 1993. Dating the Kent Phase.</w:t>
-      </w:r>
-      <w:r>
-        <w:t xml:space="preserve"> </w:t>
-      </w:r>
-      <w:r>
-        <w:rPr>
-          <w:i/>
-          <w:iCs/>
-        </w:rPr>
-        <w:t xml:space="preserve">Southeastern Archaeology</w:t>
-      </w:r>
-      <w:r>
-        <w:t xml:space="preserve"> </w:t>
-      </w:r>
-      <w:r>
-        <w:t xml:space="preserve">12(1):21–32.</w:t>
+    <w:bookmarkStart w:id="133" w:name="ref-hudson_smith_depratter_1990"/>
+    <w:p>
+      <w:pPr>
+        <w:pStyle w:val="Bibliography"/>
+      </w:pPr>
+      <w:r>
+        <w:t xml:space="preserve">Hudson, Charles, Marvin T. Smith, and Chester B. DePratter. 1990. The Hernando de Soto Expedition: From</w:t>
+      </w:r>
+      <w:r>
+        <w:t xml:space="preserve"> </w:t>
+      </w:r>
+      <w:r>
+        <w:t xml:space="preserve">Mabila</w:t>
+      </w:r>
+      <w:r>
+        <w:t xml:space="preserve"> </w:t>
+      </w:r>
+      <w:r>
+        <w:t xml:space="preserve">to the</w:t>
+      </w:r>
+      <w:r>
+        <w:t xml:space="preserve"> </w:t>
+      </w:r>
+      <w:r>
+        <w:t xml:space="preserve">Mississippi</w:t>
+      </w:r>
+      <w:r>
+        <w:t xml:space="preserve"> </w:t>
+      </w:r>
+      <w:r>
+        <w:t xml:space="preserve">River. In</w:t>
+      </w:r>
+      <w:r>
+        <w:t xml:space="preserve"> </w:t>
+      </w:r>
+      <w:r>
+        <w:rPr>
+          <w:i/>
+          <w:iCs/>
+        </w:rPr>
+        <w:t xml:space="preserve">Towns and Temples Along the</w:t>
+      </w:r>
+      <w:r>
+        <w:rPr>
+          <w:i/>
+          <w:iCs/>
+        </w:rPr>
+        <w:t xml:space="preserve"> </w:t>
+      </w:r>
+      <w:r>
+        <w:rPr>
+          <w:i/>
+          <w:iCs/>
+        </w:rPr>
+        <w:t xml:space="preserve">Mississippi</w:t>
+      </w:r>
+      <w:r>
+        <w:t xml:space="preserve">, edited by David H. Dye and Cheryl Anne Cox, pp. 181–207. University of Alabama Press, Tuscaloosa.</w:t>
       </w:r>
     </w:p>
     <w:bookmarkEnd w:id="133"/>
-    <w:bookmarkStart w:id="134" w:name="ref-hudson_smith_depratter_1990"/>
-    <w:p>
-      <w:pPr>
-        <w:pStyle w:val="Bibliography"/>
-      </w:pPr>
-      <w:r>
-        <w:t xml:space="preserve">Hudson, Charles, Marvin T. Smith, and Chester B. DePratter. 1990. The Hernando de Soto Expedition: From</w:t>
-      </w:r>
-      <w:r>
-        <w:t xml:space="preserve"> </w:t>
-      </w:r>
-      <w:r>
-        <w:t xml:space="preserve">Mabila</w:t>
-      </w:r>
-      <w:r>
-        <w:t xml:space="preserve"> </w:t>
-      </w:r>
-      <w:r>
-        <w:t xml:space="preserve">to the</w:t>
-      </w:r>
-      <w:r>
-        <w:t xml:space="preserve"> </w:t>
-      </w:r>
-      <w:r>
-        <w:t xml:space="preserve">Mississippi</w:t>
-      </w:r>
-      <w:r>
-        <w:t xml:space="preserve"> </w:t>
-      </w:r>
-      <w:r>
-        <w:t xml:space="preserve">River. In</w:t>
-      </w:r>
-      <w:r>
-        <w:t xml:space="preserve"> </w:t>
-      </w:r>
-      <w:r>
-        <w:rPr>
-          <w:i/>
-          <w:iCs/>
-        </w:rPr>
-        <w:t xml:space="preserve">Towns and Temples Along the</w:t>
-      </w:r>
-      <w:r>
-        <w:rPr>
-          <w:i/>
-          <w:iCs/>
-        </w:rPr>
-        <w:t xml:space="preserve"> </w:t>
-      </w:r>
-      <w:r>
-        <w:rPr>
-          <w:i/>
-          <w:iCs/>
-        </w:rPr>
-        <w:t xml:space="preserve">Mississippi</w:t>
-      </w:r>
-      <w:r>
-        <w:t xml:space="preserve">, edited by David H. Dye and Cheryl Anne Cox, pp. 181–207. University of Alabama Press, Tuscaloosa.</w:t>
-      </w:r>
-    </w:p>
-    <w:bookmarkEnd w:id="134"/>
-    <w:bookmarkStart w:id="136" w:name="ref-hunt_2006"/>
+    <w:bookmarkStart w:id="135" w:name="ref-hunt_2006"/>
     <w:p>
       <w:pPr>
         <w:pStyle w:val="Bibliography"/>
@@ -5094,7 +5089,7 @@
       <w:r>
         <w:t xml:space="preserve"> </w:t>
       </w:r>
-      <w:hyperlink r:id="rId135">
+      <w:hyperlink r:id="rId134">
         <w:r>
           <w:rPr>
             <w:rStyle w:val="Hyperlink"/>
@@ -5106,8 +5101,8 @@
         <w:t xml:space="preserve">.</w:t>
       </w:r>
     </w:p>
-    <w:bookmarkEnd w:id="136"/>
-    <w:bookmarkStart w:id="138" w:name="ref-hunt_bell_travis_2008"/>
+    <w:bookmarkEnd w:id="135"/>
+    <w:bookmarkStart w:id="137" w:name="ref-hunt_bell_travis_2008"/>
     <w:p>
       <w:pPr>
         <w:pStyle w:val="Bibliography"/>
@@ -5134,7 +5129,7 @@
       <w:r>
         <w:t xml:space="preserve"> </w:t>
       </w:r>
-      <w:hyperlink r:id="rId137">
+      <w:hyperlink r:id="rId136">
         <w:r>
           <w:rPr>
             <w:rStyle w:val="Hyperlink"/>
@@ -5146,34 +5141,34 @@
         <w:t xml:space="preserve">.</w:t>
       </w:r>
     </w:p>
+    <w:bookmarkEnd w:id="137"/>
+    <w:bookmarkStart w:id="138" w:name="ref-hurlbert_1971"/>
+    <w:p>
+      <w:pPr>
+        <w:pStyle w:val="Bibliography"/>
+      </w:pPr>
+      <w:r>
+        <w:t xml:space="preserve">Hurlbert, Stuart H. 1971. The Nonconcept of Species Diversity: A Critique and Alternative Parameters.</w:t>
+      </w:r>
+      <w:r>
+        <w:t xml:space="preserve"> </w:t>
+      </w:r>
+      <w:r>
+        <w:rPr>
+          <w:i/>
+          <w:iCs/>
+        </w:rPr>
+        <w:t xml:space="preserve">Ecology</w:t>
+      </w:r>
+      <w:r>
+        <w:t xml:space="preserve"> </w:t>
+      </w:r>
+      <w:r>
+        <w:t xml:space="preserve">52(4):577–586.</w:t>
+      </w:r>
+    </w:p>
     <w:bookmarkEnd w:id="138"/>
-    <w:bookmarkStart w:id="139" w:name="ref-hurlbert_1971"/>
-    <w:p>
-      <w:pPr>
-        <w:pStyle w:val="Bibliography"/>
-      </w:pPr>
-      <w:r>
-        <w:t xml:space="preserve">Hurlbert, Stuart H. 1971. The Nonconcept of Species Diversity: A Critique and Alternative Parameters.</w:t>
-      </w:r>
-      <w:r>
-        <w:t xml:space="preserve"> </w:t>
-      </w:r>
-      <w:r>
-        <w:rPr>
-          <w:i/>
-          <w:iCs/>
-        </w:rPr>
-        <w:t xml:space="preserve">Ecology</w:t>
-      </w:r>
-      <w:r>
-        <w:t xml:space="preserve"> </w:t>
-      </w:r>
-      <w:r>
-        <w:t xml:space="preserve">52(4):577–586.</w:t>
-      </w:r>
-    </w:p>
-    <w:bookmarkEnd w:id="139"/>
-    <w:bookmarkStart w:id="141" w:name="ref-kandler_shennan_2013"/>
+    <w:bookmarkStart w:id="140" w:name="ref-kandler_shennan_2013"/>
     <w:p>
       <w:pPr>
         <w:pStyle w:val="Bibliography"/>
@@ -5200,7 +5195,7 @@
       <w:r>
         <w:t xml:space="preserve"> </w:t>
       </w:r>
-      <w:hyperlink r:id="rId140">
+      <w:hyperlink r:id="rId139">
         <w:r>
           <w:rPr>
             <w:rStyle w:val="Hyperlink"/>
@@ -5212,8 +5207,8 @@
         <w:t xml:space="preserve">.</w:t>
       </w:r>
     </w:p>
-    <w:bookmarkEnd w:id="141"/>
-    <w:bookmarkStart w:id="143" w:name="ref-kandler_shennan_2015"/>
+    <w:bookmarkEnd w:id="140"/>
+    <w:bookmarkStart w:id="142" w:name="ref-kandler_shennan_2015"/>
     <w:p>
       <w:pPr>
         <w:pStyle w:val="Bibliography"/>
@@ -5252,7 +5247,7 @@
       <w:r>
         <w:t xml:space="preserve"> </w:t>
       </w:r>
-      <w:hyperlink r:id="rId142">
+      <w:hyperlink r:id="rId141">
         <w:r>
           <w:rPr>
             <w:rStyle w:val="Hyperlink"/>
@@ -5264,8 +5259,8 @@
         <w:t xml:space="preserve">.</w:t>
       </w:r>
     </w:p>
-    <w:bookmarkEnd w:id="143"/>
-    <w:bookmarkStart w:id="145" w:name="ref-kandler_wilder_fortunato_2017"/>
+    <w:bookmarkEnd w:id="142"/>
+    <w:bookmarkStart w:id="144" w:name="ref-kandler_wilder_fortunato_2017"/>
     <w:p>
       <w:pPr>
         <w:pStyle w:val="Bibliography"/>
@@ -5292,7 +5287,7 @@
       <w:r>
         <w:t xml:space="preserve"> </w:t>
       </w:r>
-      <w:hyperlink r:id="rId144">
+      <w:hyperlink r:id="rId143">
         <w:r>
           <w:rPr>
             <w:rStyle w:val="Hyperlink"/>
@@ -5304,8 +5299,8 @@
         <w:t xml:space="preserve">.</w:t>
       </w:r>
     </w:p>
-    <w:bookmarkEnd w:id="145"/>
-    <w:bookmarkStart w:id="147" w:name="ref-kidwell_tomasovych_2013"/>
+    <w:bookmarkEnd w:id="144"/>
+    <w:bookmarkStart w:id="146" w:name="ref-kidwell_tomasovych_2013"/>
     <w:p>
       <w:pPr>
         <w:pStyle w:val="Bibliography"/>
@@ -5332,7 +5327,7 @@
       <w:r>
         <w:t xml:space="preserve"> </w:t>
       </w:r>
-      <w:hyperlink r:id="rId146">
+      <w:hyperlink r:id="rId145">
         <w:r>
           <w:rPr>
             <w:rStyle w:val="Hyperlink"/>
@@ -5344,43 +5339,43 @@
         <w:t xml:space="preserve">.</w:t>
       </w:r>
     </w:p>
+    <w:bookmarkEnd w:id="146"/>
+    <w:bookmarkStart w:id="147" w:name="ref-king_freer_1995"/>
+    <w:p>
+      <w:pPr>
+        <w:pStyle w:val="Bibliography"/>
+      </w:pPr>
+      <w:r>
+        <w:t xml:space="preserve">King, Adam, and Jennifer A. Freer. 1995. The</w:t>
+      </w:r>
+      <w:r>
+        <w:t xml:space="preserve"> </w:t>
+      </w:r>
+      <w:r>
+        <w:t xml:space="preserve">Mississippian</w:t>
+      </w:r>
+      <w:r>
+        <w:t xml:space="preserve"> </w:t>
+      </w:r>
+      <w:r>
+        <w:t xml:space="preserve">Southeast: A World-Systems Perspective. In</w:t>
+      </w:r>
+      <w:r>
+        <w:t xml:space="preserve"> </w:t>
+      </w:r>
+      <w:r>
+        <w:rPr>
+          <w:i/>
+          <w:iCs/>
+        </w:rPr>
+        <w:t xml:space="preserve">Native American Interactions: Multiscalar Analyses and Interpretations in the Eastern Woodlands</w:t>
+      </w:r>
+      <w:r>
+        <w:t xml:space="preserve">, edited by Michael S. Nassaney and Kenneth E. Sassaman, pp. 266–288. University of Tennessee Press, Knoxville.</w:t>
+      </w:r>
+    </w:p>
     <w:bookmarkEnd w:id="147"/>
-    <w:bookmarkStart w:id="148" w:name="ref-king_freer_1995"/>
-    <w:p>
-      <w:pPr>
-        <w:pStyle w:val="Bibliography"/>
-      </w:pPr>
-      <w:r>
-        <w:t xml:space="preserve">King, Adam, and Jennifer A. Freer. 1995. The</w:t>
-      </w:r>
-      <w:r>
-        <w:t xml:space="preserve"> </w:t>
-      </w:r>
-      <w:r>
-        <w:t xml:space="preserve">Mississippian</w:t>
-      </w:r>
-      <w:r>
-        <w:t xml:space="preserve"> </w:t>
-      </w:r>
-      <w:r>
-        <w:t xml:space="preserve">Southeast: A World-Systems Perspective. In</w:t>
-      </w:r>
-      <w:r>
-        <w:t xml:space="preserve"> </w:t>
-      </w:r>
-      <w:r>
-        <w:rPr>
-          <w:i/>
-          <w:iCs/>
-        </w:rPr>
-        <w:t xml:space="preserve">Native American Interactions: Multiscalar Analyses and Interpretations in the Eastern Woodlands</w:t>
-      </w:r>
-      <w:r>
-        <w:t xml:space="preserve">, edited by Michael S. Nassaney and Kenneth E. Sassaman, pp. 266–288. University of Tennessee Press, Knoxville.</w:t>
-      </w:r>
-    </w:p>
-    <w:bookmarkEnd w:id="148"/>
-    <w:bookmarkStart w:id="150" w:name="ref-ladefoged_graves_2000"/>
+    <w:bookmarkStart w:id="149" w:name="ref-ladefoged_graves_2000"/>
     <w:p>
       <w:pPr>
         <w:pStyle w:val="Bibliography"/>
@@ -5425,7 +5420,7 @@
       <w:r>
         <w:t xml:space="preserve"> </w:t>
       </w:r>
-      <w:hyperlink r:id="rId149">
+      <w:hyperlink r:id="rId148">
         <w:r>
           <w:rPr>
             <w:rStyle w:val="Hyperlink"/>
@@ -5437,82 +5432,82 @@
         <w:t xml:space="preserve">.</w:t>
       </w:r>
     </w:p>
+    <w:bookmarkEnd w:id="149"/>
+    <w:bookmarkStart w:id="150" w:name="ref-lewontin_1974"/>
+    <w:p>
+      <w:pPr>
+        <w:pStyle w:val="Bibliography"/>
+      </w:pPr>
+      <w:r>
+        <w:t xml:space="preserve">Lewontin, Richard C. 1974.</w:t>
+      </w:r>
+      <w:r>
+        <w:t xml:space="preserve"> </w:t>
+      </w:r>
+      <w:r>
+        <w:rPr>
+          <w:i/>
+          <w:iCs/>
+        </w:rPr>
+        <w:t xml:space="preserve">The Genetic Basis of Evolutionary Change</w:t>
+      </w:r>
+      <w:r>
+        <w:t xml:space="preserve">. Columbia University Press, New York.</w:t>
+      </w:r>
+    </w:p>
     <w:bookmarkEnd w:id="150"/>
-    <w:bookmarkStart w:id="151" w:name="ref-lewontin_1974"/>
-    <w:p>
-      <w:pPr>
-        <w:pStyle w:val="Bibliography"/>
-      </w:pPr>
-      <w:r>
-        <w:t xml:space="preserve">Lewontin, Richard C. 1974.</w:t>
-      </w:r>
-      <w:r>
-        <w:t xml:space="preserve"> </w:t>
-      </w:r>
-      <w:r>
-        <w:rPr>
-          <w:i/>
-          <w:iCs/>
-        </w:rPr>
-        <w:t xml:space="preserve">The Genetic Basis of Evolutionary Change</w:t>
-      </w:r>
-      <w:r>
-        <w:t xml:space="preserve">. Columbia University Press, New York.</w:t>
+    <w:bookmarkStart w:id="151" w:name="ref-lipo_2001"/>
+    <w:p>
+      <w:pPr>
+        <w:pStyle w:val="Bibliography"/>
+      </w:pPr>
+      <w:r>
+        <w:t xml:space="preserve">Lipo, Carl P. 2001.</w:t>
+      </w:r>
+      <w:r>
+        <w:t xml:space="preserve"> </w:t>
+      </w:r>
+      <w:r>
+        <w:rPr>
+          <w:i/>
+          <w:iCs/>
+        </w:rPr>
+        <w:t xml:space="preserve">Science, Style and the Study of Community Structure: An Example from the Central</w:t>
+      </w:r>
+      <w:r>
+        <w:rPr>
+          <w:i/>
+          <w:iCs/>
+        </w:rPr>
+        <w:t xml:space="preserve"> </w:t>
+      </w:r>
+      <w:r>
+        <w:rPr>
+          <w:i/>
+          <w:iCs/>
+        </w:rPr>
+        <w:t xml:space="preserve">Mississippi</w:t>
+      </w:r>
+      <w:r>
+        <w:rPr>
+          <w:i/>
+          <w:iCs/>
+        </w:rPr>
+        <w:t xml:space="preserve"> </w:t>
+      </w:r>
+      <w:r>
+        <w:rPr>
+          <w:i/>
+          <w:iCs/>
+        </w:rPr>
+        <w:t xml:space="preserve">River Valley</w:t>
+      </w:r>
+      <w:r>
+        <w:t xml:space="preserve">. BAR International Series 918. Archaeopress, Oxford.</w:t>
       </w:r>
     </w:p>
     <w:bookmarkEnd w:id="151"/>
-    <w:bookmarkStart w:id="152" w:name="ref-lipo_2001"/>
-    <w:p>
-      <w:pPr>
-        <w:pStyle w:val="Bibliography"/>
-      </w:pPr>
-      <w:r>
-        <w:t xml:space="preserve">Lipo, Carl P. 2001.</w:t>
-      </w:r>
-      <w:r>
-        <w:t xml:space="preserve"> </w:t>
-      </w:r>
-      <w:r>
-        <w:rPr>
-          <w:i/>
-          <w:iCs/>
-        </w:rPr>
-        <w:t xml:space="preserve">Science, Style and the Study of Community Structure: An Example from the Central</w:t>
-      </w:r>
-      <w:r>
-        <w:rPr>
-          <w:i/>
-          <w:iCs/>
-        </w:rPr>
-        <w:t xml:space="preserve"> </w:t>
-      </w:r>
-      <w:r>
-        <w:rPr>
-          <w:i/>
-          <w:iCs/>
-        </w:rPr>
-        <w:t xml:space="preserve">Mississippi</w:t>
-      </w:r>
-      <w:r>
-        <w:rPr>
-          <w:i/>
-          <w:iCs/>
-        </w:rPr>
-        <w:t xml:space="preserve"> </w:t>
-      </w:r>
-      <w:r>
-        <w:rPr>
-          <w:i/>
-          <w:iCs/>
-        </w:rPr>
-        <w:t xml:space="preserve">River Valley</w:t>
-      </w:r>
-      <w:r>
-        <w:t xml:space="preserve">. BAR International Series 918. Archaeopress, Oxford.</w:t>
-      </w:r>
-    </w:p>
-    <w:bookmarkEnd w:id="152"/>
-    <w:bookmarkStart w:id="154" w:name="ref-lipo_dinapoli_madsen_hunt_2021"/>
+    <w:bookmarkStart w:id="153" w:name="ref-lipo_dinapoli_madsen_hunt_2021"/>
     <w:p>
       <w:pPr>
         <w:pStyle w:val="Bibliography"/>
@@ -5539,7 +5534,7 @@
       <w:r>
         <w:t xml:space="preserve"> </w:t>
       </w:r>
-      <w:hyperlink r:id="rId153">
+      <w:hyperlink r:id="rId152">
         <w:r>
           <w:rPr>
             <w:rStyle w:val="Hyperlink"/>
@@ -5551,71 +5546,71 @@
         <w:t xml:space="preserve">.</w:t>
       </w:r>
     </w:p>
+    <w:bookmarkEnd w:id="153"/>
+    <w:bookmarkStart w:id="154" w:name="ref-lipo_dunnell_2007"/>
+    <w:p>
+      <w:pPr>
+        <w:pStyle w:val="Bibliography"/>
+      </w:pPr>
+      <w:r>
+        <w:t xml:space="preserve">Lipo, Carl P., and Robert C. Dunnell. 2007. Prehistoric Settlement in the Lower</w:t>
+      </w:r>
+      <w:r>
+        <w:t xml:space="preserve"> </w:t>
+      </w:r>
+      <w:r>
+        <w:t xml:space="preserve">Mississippi</w:t>
+      </w:r>
+      <w:r>
+        <w:t xml:space="preserve"> </w:t>
+      </w:r>
+      <w:r>
+        <w:t xml:space="preserve">Valley: A Critical Review. In</w:t>
+      </w:r>
+      <w:r>
+        <w:t xml:space="preserve"> </w:t>
+      </w:r>
+      <w:r>
+        <w:rPr>
+          <w:i/>
+          <w:iCs/>
+        </w:rPr>
+        <w:t xml:space="preserve">Time’s River: Archaeological Syntheses from the Lower</w:t>
+      </w:r>
+      <w:r>
+        <w:rPr>
+          <w:i/>
+          <w:iCs/>
+        </w:rPr>
+        <w:t xml:space="preserve"> </w:t>
+      </w:r>
+      <w:r>
+        <w:rPr>
+          <w:i/>
+          <w:iCs/>
+        </w:rPr>
+        <w:t xml:space="preserve">Mississippi</w:t>
+      </w:r>
+      <w:r>
+        <w:rPr>
+          <w:i/>
+          <w:iCs/>
+        </w:rPr>
+        <w:t xml:space="preserve"> </w:t>
+      </w:r>
+      <w:r>
+        <w:rPr>
+          <w:i/>
+          <w:iCs/>
+        </w:rPr>
+        <w:t xml:space="preserve">Valley</w:t>
+      </w:r>
+      <w:r>
+        <w:t xml:space="preserve">, edited by Janet Rafferty and Evan Peacock, pp. 125–167. University of Alabama Press, Tuscaloosa.</w:t>
+      </w:r>
+    </w:p>
     <w:bookmarkEnd w:id="154"/>
-    <w:bookmarkStart w:id="155" w:name="ref-lipo_dunnell_2007"/>
-    <w:p>
-      <w:pPr>
-        <w:pStyle w:val="Bibliography"/>
-      </w:pPr>
-      <w:r>
-        <w:t xml:space="preserve">Lipo, Carl P., and Robert C. Dunnell. 2007. Prehistoric Settlement in the Lower</w:t>
-      </w:r>
-      <w:r>
-        <w:t xml:space="preserve"> </w:t>
-      </w:r>
-      <w:r>
-        <w:t xml:space="preserve">Mississippi</w:t>
-      </w:r>
-      <w:r>
-        <w:t xml:space="preserve"> </w:t>
-      </w:r>
-      <w:r>
-        <w:t xml:space="preserve">Valley: A Critical Review. In</w:t>
-      </w:r>
-      <w:r>
-        <w:t xml:space="preserve"> </w:t>
-      </w:r>
-      <w:r>
-        <w:rPr>
-          <w:i/>
-          <w:iCs/>
-        </w:rPr>
-        <w:t xml:space="preserve">Time’s River: Archaeological Syntheses from the Lower</w:t>
-      </w:r>
-      <w:r>
-        <w:rPr>
-          <w:i/>
-          <w:iCs/>
-        </w:rPr>
-        <w:t xml:space="preserve"> </w:t>
-      </w:r>
-      <w:r>
-        <w:rPr>
-          <w:i/>
-          <w:iCs/>
-        </w:rPr>
-        <w:t xml:space="preserve">Mississippi</w:t>
-      </w:r>
-      <w:r>
-        <w:rPr>
-          <w:i/>
-          <w:iCs/>
-        </w:rPr>
-        <w:t xml:space="preserve"> </w:t>
-      </w:r>
-      <w:r>
-        <w:rPr>
-          <w:i/>
-          <w:iCs/>
-        </w:rPr>
-        <w:t xml:space="preserve">Valley</w:t>
-      </w:r>
-      <w:r>
-        <w:t xml:space="preserve">, edited by Janet Rafferty and Evan Peacock, pp. 125–167. University of Alabama Press, Tuscaloosa.</w:t>
-      </w:r>
-    </w:p>
-    <w:bookmarkEnd w:id="155"/>
-    <w:bookmarkStart w:id="157" w:name="ref-lipo_hunt_hundtoft_2010"/>
+    <w:bookmarkStart w:id="156" w:name="ref-lipo_hunt_hundtoft_2010"/>
     <w:p>
       <w:pPr>
         <w:pStyle w:val="Bibliography"/>
@@ -5660,7 +5655,7 @@
       <w:r>
         <w:t xml:space="preserve"> </w:t>
       </w:r>
-      <w:hyperlink r:id="rId156">
+      <w:hyperlink r:id="rId155">
         <w:r>
           <w:rPr>
             <w:rStyle w:val="Hyperlink"/>
@@ -5672,43 +5667,43 @@
         <w:t xml:space="preserve">.</w:t>
       </w:r>
     </w:p>
+    <w:bookmarkEnd w:id="156"/>
+    <w:bookmarkStart w:id="157" w:name="ref-lipo_madsen_2001"/>
+    <w:p>
+      <w:pPr>
+        <w:pStyle w:val="Bibliography"/>
+      </w:pPr>
+      <w:r>
+        <w:t xml:space="preserve">Lipo, Carl P., and Mark E. Madsen. 2001. Neutrality,</w:t>
+      </w:r>
+      <w:r>
+        <w:t xml:space="preserve"> </w:t>
+      </w:r>
+      <w:r>
+        <w:t xml:space="preserve">“Style,”</w:t>
+      </w:r>
+      <w:r>
+        <w:t xml:space="preserve"> </w:t>
+      </w:r>
+      <w:r>
+        <w:t xml:space="preserve">and Drift: Building Methods for Studying Cultural Transmission in the Archaeological Record. In</w:t>
+      </w:r>
+      <w:r>
+        <w:t xml:space="preserve"> </w:t>
+      </w:r>
+      <w:r>
+        <w:rPr>
+          <w:i/>
+          <w:iCs/>
+        </w:rPr>
+        <w:t xml:space="preserve">Style and Function: Conceptual Issues in Evolutionary Archaeology</w:t>
+      </w:r>
+      <w:r>
+        <w:t xml:space="preserve">, edited by Teresa D. Hurt and Gordon F. M. Rakita, pp. 91–118. Bergin &amp; Garvey, Westport, Connecticut.</w:t>
+      </w:r>
+    </w:p>
     <w:bookmarkEnd w:id="157"/>
-    <w:bookmarkStart w:id="158" w:name="ref-lipo_madsen_2001"/>
-    <w:p>
-      <w:pPr>
-        <w:pStyle w:val="Bibliography"/>
-      </w:pPr>
-      <w:r>
-        <w:t xml:space="preserve">Lipo, Carl P., and Mark E. Madsen. 2001. Neutrality,</w:t>
-      </w:r>
-      <w:r>
-        <w:t xml:space="preserve"> </w:t>
-      </w:r>
-      <w:r>
-        <w:t xml:space="preserve">“Style,”</w:t>
-      </w:r>
-      <w:r>
-        <w:t xml:space="preserve"> </w:t>
-      </w:r>
-      <w:r>
-        <w:t xml:space="preserve">and Drift: Building Methods for Studying Cultural Transmission in the Archaeological Record. In</w:t>
-      </w:r>
-      <w:r>
-        <w:t xml:space="preserve"> </w:t>
-      </w:r>
-      <w:r>
-        <w:rPr>
-          <w:i/>
-          <w:iCs/>
-        </w:rPr>
-        <w:t xml:space="preserve">Style and Function: Conceptual Issues in Evolutionary Archaeology</w:t>
-      </w:r>
-      <w:r>
-        <w:t xml:space="preserve">, edited by Teresa D. Hurt and Gordon F. M. Rakita, pp. 91–118. Bergin &amp; Garvey, Westport, Connecticut.</w:t>
-      </w:r>
-    </w:p>
-    <w:bookmarkEnd w:id="158"/>
-    <w:bookmarkStart w:id="160" w:name="ref-lipo_madsen_dunnell_2015"/>
+    <w:bookmarkStart w:id="159" w:name="ref-lipo_madsen_dunnell_2015"/>
     <w:p>
       <w:pPr>
         <w:pStyle w:val="Bibliography"/>
@@ -5735,7 +5730,7 @@
       <w:r>
         <w:t xml:space="preserve"> </w:t>
       </w:r>
-      <w:hyperlink r:id="rId159">
+      <w:hyperlink r:id="rId158">
         <w:r>
           <w:rPr>
             <w:rStyle w:val="Hyperlink"/>
@@ -5747,8 +5742,8 @@
         <w:t xml:space="preserve">.</w:t>
       </w:r>
     </w:p>
-    <w:bookmarkEnd w:id="160"/>
-    <w:bookmarkStart w:id="162" w:name="ref-lipo_madsen_dunnell_hunt_1997"/>
+    <w:bookmarkEnd w:id="159"/>
+    <w:bookmarkStart w:id="161" w:name="ref-lipo_madsen_dunnell_hunt_1997"/>
     <w:p>
       <w:pPr>
         <w:pStyle w:val="Bibliography"/>
@@ -5775,7 +5770,7 @@
       <w:r>
         <w:t xml:space="preserve"> </w:t>
       </w:r>
-      <w:hyperlink r:id="rId161">
+      <w:hyperlink r:id="rId160">
         <w:r>
           <w:rPr>
             <w:rStyle w:val="Hyperlink"/>
@@ -5787,8 +5782,8 @@
         <w:t xml:space="preserve">.</w:t>
       </w:r>
     </w:p>
-    <w:bookmarkEnd w:id="162"/>
-    <w:bookmarkStart w:id="164" w:name="ref-holland-lulewicz_2019"/>
+    <w:bookmarkEnd w:id="161"/>
+    <w:bookmarkStart w:id="163" w:name="ref-holland-lulewicz_2019"/>
     <w:p>
       <w:pPr>
         <w:pStyle w:val="Bibliography"/>
@@ -5842,7 +5837,7 @@
       <w:r>
         <w:t xml:space="preserve"> </w:t>
       </w:r>
-      <w:hyperlink r:id="rId163">
+      <w:hyperlink r:id="rId162">
         <w:r>
           <w:rPr>
             <w:rStyle w:val="Hyperlink"/>
@@ -5854,8 +5849,8 @@
         <w:t xml:space="preserve">.</w:t>
       </w:r>
     </w:p>
-    <w:bookmarkEnd w:id="164"/>
-    <w:bookmarkStart w:id="166" w:name="ref-lyman_2021"/>
+    <w:bookmarkEnd w:id="163"/>
+    <w:bookmarkStart w:id="165" w:name="ref-lyman_2021"/>
     <w:p>
       <w:pPr>
         <w:pStyle w:val="Bibliography"/>
@@ -5882,7 +5877,7 @@
       <w:r>
         <w:t xml:space="preserve"> </w:t>
       </w:r>
-      <w:hyperlink r:id="rId165">
+      <w:hyperlink r:id="rId164">
         <w:r>
           <w:rPr>
             <w:rStyle w:val="Hyperlink"/>
@@ -5894,24 +5889,100 @@
         <w:t xml:space="preserve">.</w:t>
       </w:r>
     </w:p>
+    <w:bookmarkEnd w:id="165"/>
+    <w:bookmarkStart w:id="166" w:name="ref-madsen_2012"/>
+    <w:p>
+      <w:pPr>
+        <w:pStyle w:val="Bibliography"/>
+      </w:pPr>
+      <w:r>
+        <w:t xml:space="preserve">Madsen, Mark E. 2012. Neutral Cultural Transmission in Time-Averaged Archaeological Assemblages. arXiv preprint arXiv:1204.2043 [physics.soc-ph].</w:t>
+      </w:r>
+    </w:p>
     <w:bookmarkEnd w:id="166"/>
-    <w:bookmarkStart w:id="167" w:name="ref-madsen_2012"/>
-    <w:p>
-      <w:pPr>
-        <w:pStyle w:val="Bibliography"/>
-      </w:pPr>
-      <w:r>
-        <w:t xml:space="preserve">Madsen, Mark E. 2012. Neutral Cultural Transmission in Time-Averaged Archaeological Assemblages. arXiv preprint arXiv:1204.2043 [physics.soc-ph].</w:t>
+    <w:bookmarkStart w:id="167" w:name="ref-mainfort_1996"/>
+    <w:p>
+      <w:pPr>
+        <w:pStyle w:val="Bibliography"/>
+      </w:pPr>
+      <w:r>
+        <w:t xml:space="preserve">Mainfort, Jr., Robert C. 1996a. Late Period Chronology in the Central</w:t>
+      </w:r>
+      <w:r>
+        <w:t xml:space="preserve"> </w:t>
+      </w:r>
+      <w:r>
+        <w:t xml:space="preserve">Mississippi</w:t>
+      </w:r>
+      <w:r>
+        <w:t xml:space="preserve"> </w:t>
+      </w:r>
+      <w:r>
+        <w:t xml:space="preserve">Valley: A Western</w:t>
+      </w:r>
+      <w:r>
+        <w:t xml:space="preserve"> </w:t>
+      </w:r>
+      <w:r>
+        <w:t xml:space="preserve">Tennessee</w:t>
+      </w:r>
+      <w:r>
+        <w:t xml:space="preserve"> </w:t>
+      </w:r>
+      <w:r>
+        <w:t xml:space="preserve">Perspective.</w:t>
+      </w:r>
+      <w:r>
+        <w:t xml:space="preserve"> </w:t>
+      </w:r>
+      <w:r>
+        <w:rPr>
+          <w:i/>
+          <w:iCs/>
+        </w:rPr>
+        <w:t xml:space="preserve">Southeastern Archaeology</w:t>
+      </w:r>
+      <w:r>
+        <w:t xml:space="preserve"> </w:t>
+      </w:r>
+      <w:r>
+        <w:t xml:space="preserve">15(2):172–181.</w:t>
       </w:r>
     </w:p>
     <w:bookmarkEnd w:id="167"/>
-    <w:bookmarkStart w:id="168" w:name="ref-mainfort_1996"/>
-    <w:p>
-      <w:pPr>
-        <w:pStyle w:val="Bibliography"/>
-      </w:pPr>
-      <w:r>
-        <w:t xml:space="preserve">Mainfort, Jr., Robert C. 1996a. Late Period Chronology in the Central</w:t>
+    <w:bookmarkStart w:id="168" w:name="ref-mainfort_1996b"/>
+    <w:p>
+      <w:pPr>
+        <w:pStyle w:val="Bibliography"/>
+      </w:pPr>
+      <w:r>
+        <w:t xml:space="preserve">Mainfort, Jr., Robert C. 1996b. Late Period Chronology in the Central Mississippi Valley: A Western Tennessee Perspective.</w:t>
+      </w:r>
+      <w:r>
+        <w:t xml:space="preserve"> </w:t>
+      </w:r>
+      <w:r>
+        <w:rPr>
+          <w:i/>
+          <w:iCs/>
+        </w:rPr>
+        <w:t xml:space="preserve">Southeastern Archaeology</w:t>
+      </w:r>
+      <w:r>
+        <w:t xml:space="preserve"> </w:t>
+      </w:r>
+      <w:r>
+        <w:t xml:space="preserve">15(2):172–181.</w:t>
+      </w:r>
+    </w:p>
+    <w:bookmarkEnd w:id="168"/>
+    <w:bookmarkStart w:id="169" w:name="ref-mainfort_2001"/>
+    <w:p>
+      <w:pPr>
+        <w:pStyle w:val="Bibliography"/>
+      </w:pPr>
+      <w:r>
+        <w:t xml:space="preserve">Mainfort, Jr., Robert C. 2001. The Late Prehistoric and Protohistoric Periods in the Central</w:t>
       </w:r>
       <w:r>
         <w:t xml:space="preserve"> </w:t>
@@ -5923,19 +5994,42 @@
         <w:t xml:space="preserve"> </w:t>
       </w:r>
       <w:r>
-        <w:t xml:space="preserve">Valley: A Western</w:t>
-      </w:r>
-      <w:r>
-        <w:t xml:space="preserve"> </w:t>
-      </w:r>
-      <w:r>
-        <w:t xml:space="preserve">Tennessee</w:t>
-      </w:r>
-      <w:r>
-        <w:t xml:space="preserve"> </w:t>
-      </w:r>
-      <w:r>
-        <w:t xml:space="preserve">Perspective.</w:t>
+        <w:t xml:space="preserve">Valley. In</w:t>
+      </w:r>
+      <w:r>
+        <w:t xml:space="preserve"> </w:t>
+      </w:r>
+      <w:r>
+        <w:rPr>
+          <w:i/>
+          <w:iCs/>
+        </w:rPr>
+        <w:t xml:space="preserve">Societies in Eclipse: Archaeology of the Eastern Woodlands Indians, a.d. 1400–1700</w:t>
+      </w:r>
+      <w:r>
+        <w:t xml:space="preserve">, edited by David S. Brose, C. Wesley Cowan, and Jr. Mainfort Robert C., pp. 173–190. Smithsonian Institution Press, Washington, DC.</w:t>
+      </w:r>
+    </w:p>
+    <w:bookmarkEnd w:id="169"/>
+    <w:bookmarkStart w:id="170" w:name="ref-mainfort_2003"/>
+    <w:p>
+      <w:pPr>
+        <w:pStyle w:val="Bibliography"/>
+      </w:pPr>
+      <w:r>
+        <w:t xml:space="preserve">Mainfort, Jr., Robert C. 2003. An Ordination Approach to Assessing Late Period Phases in the Central</w:t>
+      </w:r>
+      <w:r>
+        <w:t xml:space="preserve"> </w:t>
+      </w:r>
+      <w:r>
+        <w:t xml:space="preserve">Mississippi</w:t>
+      </w:r>
+      <w:r>
+        <w:t xml:space="preserve"> </w:t>
+      </w:r>
+      <w:r>
+        <w:t xml:space="preserve">Valley.</w:t>
       </w:r>
       <w:r>
         <w:t xml:space="preserve"> </w:t>
@@ -5951,213 +6045,114 @@
         <w:t xml:space="preserve"> </w:t>
       </w:r>
       <w:r>
-        <w:t xml:space="preserve">15(2):172–181.</w:t>
-      </w:r>
-    </w:p>
-    <w:bookmarkEnd w:id="168"/>
-    <w:bookmarkStart w:id="169" w:name="ref-mainfort_1996b"/>
-    <w:p>
-      <w:pPr>
-        <w:pStyle w:val="Bibliography"/>
-      </w:pPr>
-      <w:r>
-        <w:t xml:space="preserve">Mainfort, Jr., Robert C. 1996b. Late Period Chronology in the Central Mississippi Valley: A Western Tennessee Perspective.</w:t>
-      </w:r>
-      <w:r>
-        <w:t xml:space="preserve"> </w:t>
-      </w:r>
-      <w:r>
-        <w:rPr>
-          <w:i/>
-          <w:iCs/>
-        </w:rPr>
-        <w:t xml:space="preserve">Southeastern Archaeology</w:t>
-      </w:r>
-      <w:r>
-        <w:t xml:space="preserve"> </w:t>
-      </w:r>
-      <w:r>
-        <w:t xml:space="preserve">15(2):172–181.</w:t>
-      </w:r>
-    </w:p>
-    <w:bookmarkEnd w:id="169"/>
-    <w:bookmarkStart w:id="170" w:name="ref-mainfort_2001"/>
-    <w:p>
-      <w:pPr>
-        <w:pStyle w:val="Bibliography"/>
-      </w:pPr>
-      <w:r>
-        <w:t xml:space="preserve">Mainfort, Jr., Robert C. 2001. The Late Prehistoric and Protohistoric Periods in the Central</w:t>
-      </w:r>
-      <w:r>
-        <w:t xml:space="preserve"> </w:t>
-      </w:r>
-      <w:r>
+        <w:t xml:space="preserve">22(2):176–184.</w:t>
+      </w:r>
+    </w:p>
+    <w:bookmarkEnd w:id="170"/>
+    <w:bookmarkStart w:id="171" w:name="ref-mantel_1967"/>
+    <w:p>
+      <w:pPr>
+        <w:pStyle w:val="Bibliography"/>
+      </w:pPr>
+      <w:r>
+        <w:t xml:space="preserve">Mantel, Nathan. 1967. The Detection of Disease Clustering and a Generalized Regression Approach.</w:t>
+      </w:r>
+      <w:r>
+        <w:t xml:space="preserve"> </w:t>
+      </w:r>
+      <w:r>
+        <w:rPr>
+          <w:i/>
+          <w:iCs/>
+        </w:rPr>
+        <w:t xml:space="preserve">Cancer Research</w:t>
+      </w:r>
+      <w:r>
+        <w:t xml:space="preserve"> </w:t>
+      </w:r>
+      <w:r>
+        <w:t xml:space="preserve">27(2):209–220.</w:t>
+      </w:r>
+    </w:p>
+    <w:bookmarkEnd w:id="171"/>
+    <w:bookmarkStart w:id="172" w:name="ref-mcnutt_ed_1996"/>
+    <w:p>
+      <w:pPr>
+        <w:pStyle w:val="Bibliography"/>
+      </w:pPr>
+      <w:r>
+        <w:t xml:space="preserve">McNutt, Charles H. (editor). 1996.</w:t>
+      </w:r>
+      <w:r>
+        <w:t xml:space="preserve"> </w:t>
+      </w:r>
+      <w:r>
+        <w:rPr>
+          <w:i/>
+          <w:iCs/>
+        </w:rPr>
+        <w:t xml:space="preserve">Prehistory of the Central</w:t>
+      </w:r>
+      <w:r>
+        <w:rPr>
+          <w:i/>
+          <w:iCs/>
+        </w:rPr>
+        <w:t xml:space="preserve"> </w:t>
+      </w:r>
+      <w:r>
+        <w:rPr>
+          <w:i/>
+          <w:iCs/>
+        </w:rPr>
         <w:t xml:space="preserve">Mississippi</w:t>
       </w:r>
       <w:r>
-        <w:t xml:space="preserve"> </w:t>
-      </w:r>
-      <w:r>
-        <w:t xml:space="preserve">Valley. In</w:t>
-      </w:r>
-      <w:r>
-        <w:t xml:space="preserve"> </w:t>
-      </w:r>
-      <w:r>
-        <w:rPr>
-          <w:i/>
-          <w:iCs/>
-        </w:rPr>
-        <w:t xml:space="preserve">Societies in Eclipse: Archaeology of the Eastern Woodlands Indians, a.d. 1400–1700</w:t>
-      </w:r>
-      <w:r>
-        <w:t xml:space="preserve">, edited by David S. Brose, C. Wesley Cowan, and Jr. Mainfort Robert C., pp. 173–190. Smithsonian Institution Press, Washington, DC.</w:t>
-      </w:r>
-    </w:p>
-    <w:bookmarkEnd w:id="170"/>
-    <w:bookmarkStart w:id="171" w:name="ref-mainfort_2003"/>
-    <w:p>
-      <w:pPr>
-        <w:pStyle w:val="Bibliography"/>
-      </w:pPr>
-      <w:r>
-        <w:t xml:space="preserve">Mainfort, Jr., Robert C. 2003. An Ordination Approach to Assessing Late Period Phases in the Central</w:t>
-      </w:r>
-      <w:r>
-        <w:t xml:space="preserve"> </w:t>
-      </w:r>
-      <w:r>
-        <w:t xml:space="preserve">Mississippi</w:t>
-      </w:r>
-      <w:r>
-        <w:t xml:space="preserve"> </w:t>
-      </w:r>
-      <w:r>
-        <w:t xml:space="preserve">Valley.</w:t>
-      </w:r>
-      <w:r>
-        <w:t xml:space="preserve"> </w:t>
-      </w:r>
-      <w:r>
-        <w:rPr>
-          <w:i/>
-          <w:iCs/>
-        </w:rPr>
-        <w:t xml:space="preserve">Southeastern Archaeology</w:t>
-      </w:r>
-      <w:r>
-        <w:t xml:space="preserve"> </w:t>
-      </w:r>
-      <w:r>
-        <w:t xml:space="preserve">22(2):176–184.</w:t>
-      </w:r>
-    </w:p>
-    <w:bookmarkEnd w:id="171"/>
-    <w:bookmarkStart w:id="172" w:name="ref-mantel_1967"/>
-    <w:p>
-      <w:pPr>
-        <w:pStyle w:val="Bibliography"/>
-      </w:pPr>
-      <w:r>
-        <w:t xml:space="preserve">Mantel, Nathan. 1967. The Detection of Disease Clustering and a Generalized Regression Approach.</w:t>
-      </w:r>
-      <w:r>
-        <w:t xml:space="preserve"> </w:t>
-      </w:r>
-      <w:r>
-        <w:rPr>
-          <w:i/>
-          <w:iCs/>
-        </w:rPr>
-        <w:t xml:space="preserve">Cancer Research</w:t>
-      </w:r>
-      <w:r>
-        <w:t xml:space="preserve"> </w:t>
-      </w:r>
-      <w:r>
-        <w:t xml:space="preserve">27(2):209–220.</w:t>
+        <w:rPr>
+          <w:i/>
+          <w:iCs/>
+        </w:rPr>
+        <w:t xml:space="preserve"> </w:t>
+      </w:r>
+      <w:r>
+        <w:rPr>
+          <w:i/>
+          <w:iCs/>
+        </w:rPr>
+        <w:t xml:space="preserve">Valley</w:t>
+      </w:r>
+      <w:r>
+        <w:t xml:space="preserve">. University of Alabama Press, Tuscaloosa.</w:t>
       </w:r>
     </w:p>
     <w:bookmarkEnd w:id="172"/>
-    <w:bookmarkStart w:id="173" w:name="ref-mcnutt_ed_1996"/>
-    <w:p>
-      <w:pPr>
-        <w:pStyle w:val="Bibliography"/>
-      </w:pPr>
-      <w:r>
-        <w:t xml:space="preserve">McNutt, Charles H. (editor). 1996.</w:t>
-      </w:r>
-      <w:r>
-        <w:t xml:space="preserve"> </w:t>
-      </w:r>
-      <w:r>
-        <w:rPr>
-          <w:i/>
-          <w:iCs/>
-        </w:rPr>
-        <w:t xml:space="preserve">Prehistory of the Central</w:t>
-      </w:r>
-      <w:r>
-        <w:rPr>
-          <w:i/>
-          <w:iCs/>
-        </w:rPr>
-        <w:t xml:space="preserve"> </w:t>
-      </w:r>
-      <w:r>
-        <w:rPr>
-          <w:i/>
-          <w:iCs/>
-        </w:rPr>
-        <w:t xml:space="preserve">Mississippi</w:t>
-      </w:r>
-      <w:r>
-        <w:rPr>
-          <w:i/>
-          <w:iCs/>
-        </w:rPr>
-        <w:t xml:space="preserve"> </w:t>
-      </w:r>
-      <w:r>
-        <w:rPr>
-          <w:i/>
-          <w:iCs/>
-        </w:rPr>
-        <w:t xml:space="preserve">Valley</w:t>
-      </w:r>
-      <w:r>
-        <w:t xml:space="preserve">. University of Alabama Press, Tuscaloosa.</w:t>
+    <w:bookmarkStart w:id="173" w:name="ref-mesoudi_2021"/>
+    <w:p>
+      <w:pPr>
+        <w:pStyle w:val="Bibliography"/>
+      </w:pPr>
+      <w:r>
+        <w:t xml:space="preserve">Mesoudi, Alex. 2021. Cultural Selection and Biased Transformation: Two Dynamics of Cultural Evolution.</w:t>
+      </w:r>
+      <w:r>
+        <w:t xml:space="preserve"> </w:t>
+      </w:r>
+      <w:r>
+        <w:rPr>
+          <w:i/>
+          <w:iCs/>
+        </w:rPr>
+        <w:t xml:space="preserve">Philosophical Transactions of the Royal Society B: Biological Sciences</w:t>
+      </w:r>
+      <w:r>
+        <w:t xml:space="preserve"> </w:t>
+      </w:r>
+      <w:r>
+        <w:t xml:space="preserve">376:20200053.</w:t>
       </w:r>
     </w:p>
     <w:bookmarkEnd w:id="173"/>
-    <w:bookmarkStart w:id="174" w:name="ref-mesoudi_2021"/>
-    <w:p>
-      <w:pPr>
-        <w:pStyle w:val="Bibliography"/>
-      </w:pPr>
-      <w:r>
-        <w:t xml:space="preserve">Mesoudi, Alex. 2021. Cultural Selection and Biased Transformation: Two Dynamics of Cultural Evolution.</w:t>
-      </w:r>
-      <w:r>
-        <w:t xml:space="preserve"> </w:t>
-      </w:r>
-      <w:r>
-        <w:rPr>
-          <w:i/>
-          <w:iCs/>
-        </w:rPr>
-        <w:t xml:space="preserve">Philosophical Transactions of the Royal Society B: Biological Sciences</w:t>
-      </w:r>
-      <w:r>
-        <w:t xml:space="preserve"> </w:t>
-      </w:r>
-      <w:r>
-        <w:t xml:space="preserve">376:20200053.</w:t>
-      </w:r>
-    </w:p>
-    <w:bookmarkEnd w:id="174"/>
-    <w:bookmarkStart w:id="176" w:name="ref-miller_atkins_premo_2018"/>
+    <w:bookmarkStart w:id="175" w:name="ref-miller_atkins_premo_2018"/>
     <w:p>
       <w:pPr>
         <w:pStyle w:val="Bibliography"/>
@@ -6184,7 +6179,7 @@
       <w:r>
         <w:t xml:space="preserve"> </w:t>
       </w:r>
-      <w:hyperlink r:id="rId175">
+      <w:hyperlink r:id="rId174">
         <w:r>
           <w:rPr>
             <w:rStyle w:val="Hyperlink"/>
@@ -6196,93 +6191,262 @@
         <w:t xml:space="preserve">.</w:t>
       </w:r>
     </w:p>
+    <w:bookmarkEnd w:id="175"/>
+    <w:bookmarkStart w:id="176" w:name="ref-milner_1998"/>
+    <w:p>
+      <w:pPr>
+        <w:pStyle w:val="Bibliography"/>
+      </w:pPr>
+      <w:r>
+        <w:t xml:space="preserve">Milner, George R. 1998.</w:t>
+      </w:r>
+      <w:r>
+        <w:t xml:space="preserve"> </w:t>
+      </w:r>
+      <w:r>
+        <w:rPr>
+          <w:i/>
+          <w:iCs/>
+        </w:rPr>
+        <w:t xml:space="preserve">The</w:t>
+      </w:r>
+      <w:r>
+        <w:rPr>
+          <w:i/>
+          <w:iCs/>
+        </w:rPr>
+        <w:t xml:space="preserve"> </w:t>
+      </w:r>
+      <w:r>
+        <w:rPr>
+          <w:i/>
+          <w:iCs/>
+        </w:rPr>
+        <w:t xml:space="preserve">Cahokia</w:t>
+      </w:r>
+      <w:r>
+        <w:rPr>
+          <w:i/>
+          <w:iCs/>
+        </w:rPr>
+        <w:t xml:space="preserve"> </w:t>
+      </w:r>
+      <w:r>
+        <w:rPr>
+          <w:i/>
+          <w:iCs/>
+        </w:rPr>
+        <w:t xml:space="preserve">Chiefdom: The Archaeology of a</w:t>
+      </w:r>
+      <w:r>
+        <w:rPr>
+          <w:i/>
+          <w:iCs/>
+        </w:rPr>
+        <w:t xml:space="preserve"> </w:t>
+      </w:r>
+      <w:r>
+        <w:rPr>
+          <w:i/>
+          <w:iCs/>
+        </w:rPr>
+        <w:t xml:space="preserve">Mississippian</w:t>
+      </w:r>
+      <w:r>
+        <w:rPr>
+          <w:i/>
+          <w:iCs/>
+        </w:rPr>
+        <w:t xml:space="preserve"> </w:t>
+      </w:r>
+      <w:r>
+        <w:rPr>
+          <w:i/>
+          <w:iCs/>
+        </w:rPr>
+        <w:t xml:space="preserve">Society</w:t>
+      </w:r>
+      <w:r>
+        <w:t xml:space="preserve">. Smithsonian Institution Press, Washington, D.C.</w:t>
+      </w:r>
+    </w:p>
     <w:bookmarkEnd w:id="176"/>
-    <w:bookmarkStart w:id="177" w:name="ref-milner_1998"/>
-    <w:p>
-      <w:pPr>
-        <w:pStyle w:val="Bibliography"/>
-      </w:pPr>
-      <w:r>
-        <w:t xml:space="preserve">Milner, George R. 1998.</w:t>
-      </w:r>
-      <w:r>
-        <w:t xml:space="preserve"> </w:t>
-      </w:r>
-      <w:r>
-        <w:rPr>
-          <w:i/>
-          <w:iCs/>
-        </w:rPr>
-        <w:t xml:space="preserve">The</w:t>
-      </w:r>
-      <w:r>
-        <w:rPr>
-          <w:i/>
-          <w:iCs/>
-        </w:rPr>
-        <w:t xml:space="preserve"> </w:t>
-      </w:r>
-      <w:r>
-        <w:rPr>
-          <w:i/>
-          <w:iCs/>
-        </w:rPr>
-        <w:t xml:space="preserve">Cahokia</w:t>
-      </w:r>
-      <w:r>
-        <w:rPr>
-          <w:i/>
-          <w:iCs/>
-        </w:rPr>
-        <w:t xml:space="preserve"> </w:t>
-      </w:r>
-      <w:r>
-        <w:rPr>
-          <w:i/>
-          <w:iCs/>
-        </w:rPr>
-        <w:t xml:space="preserve">Chiefdom: The Archaeology of a</w:t>
-      </w:r>
-      <w:r>
-        <w:rPr>
-          <w:i/>
-          <w:iCs/>
-        </w:rPr>
-        <w:t xml:space="preserve"> </w:t>
-      </w:r>
-      <w:r>
-        <w:rPr>
-          <w:i/>
-          <w:iCs/>
-        </w:rPr>
-        <w:t xml:space="preserve">Mississippian</w:t>
-      </w:r>
-      <w:r>
-        <w:rPr>
-          <w:i/>
-          <w:iCs/>
-        </w:rPr>
-        <w:t xml:space="preserve"> </w:t>
-      </w:r>
-      <w:r>
-        <w:rPr>
-          <w:i/>
-          <w:iCs/>
-        </w:rPr>
-        <w:t xml:space="preserve">Society</w:t>
-      </w:r>
-      <w:r>
-        <w:t xml:space="preserve">. Smithsonian Institution Press, Washington, D.C.</w:t>
+    <w:bookmarkStart w:id="177" w:name="ref-mitchem_2001"/>
+    <w:p>
+      <w:pPr>
+        <w:pStyle w:val="Bibliography"/>
+      </w:pPr>
+      <w:r>
+        <w:t xml:space="preserve">Mitchem, Jeffrey M. 2001. A Decade of Hypothesis Testing at the</w:t>
+      </w:r>
+      <w:r>
+        <w:t xml:space="preserve"> </w:t>
+      </w:r>
+      <w:r>
+        <w:t xml:space="preserve">Parkin</w:t>
+      </w:r>
+      <w:r>
+        <w:t xml:space="preserve"> </w:t>
+      </w:r>
+      <w:r>
+        <w:t xml:space="preserve">Site,</w:t>
+      </w:r>
+      <w:r>
+        <w:t xml:space="preserve"> </w:t>
+      </w:r>
+      <w:r>
+        <w:t xml:space="preserve">Arkansas</w:t>
+      </w:r>
+      <w:r>
+        <w:t xml:space="preserve">.</w:t>
       </w:r>
     </w:p>
     <w:bookmarkEnd w:id="177"/>
-    <w:bookmarkStart w:id="178" w:name="ref-mitchem_2001"/>
-    <w:p>
-      <w:pPr>
-        <w:pStyle w:val="Bibliography"/>
-      </w:pPr>
-      <w:r>
-        <w:t xml:space="preserve">Mitchem, Jeffrey M. 2001. A Decade of Hypothesis Testing at the</w:t>
+    <w:bookmarkStart w:id="178" w:name="ref-morse_d_1990"/>
+    <w:p>
+      <w:pPr>
+        <w:pStyle w:val="Bibliography"/>
+      </w:pPr>
+      <w:r>
+        <w:t xml:space="preserve">Morse, Dan F. 1990. The</w:t>
+      </w:r>
+      <w:r>
+        <w:t xml:space="preserve"> </w:t>
+      </w:r>
+      <w:r>
+        <w:t xml:space="preserve">Nodena</w:t>
+      </w:r>
+      <w:r>
+        <w:t xml:space="preserve"> </w:t>
+      </w:r>
+      <w:r>
+        <w:t xml:space="preserve">Phase. In</w:t>
+      </w:r>
+      <w:r>
+        <w:t xml:space="preserve"> </w:t>
+      </w:r>
+      <w:r>
+        <w:rPr>
+          <w:i/>
+          <w:iCs/>
+        </w:rPr>
+        <w:t xml:space="preserve">Towns and Temples Along the</w:t>
+      </w:r>
+      <w:r>
+        <w:rPr>
+          <w:i/>
+          <w:iCs/>
+        </w:rPr>
+        <w:t xml:space="preserve"> </w:t>
+      </w:r>
+      <w:r>
+        <w:rPr>
+          <w:i/>
+          <w:iCs/>
+        </w:rPr>
+        <w:t xml:space="preserve">Mississippi</w:t>
+      </w:r>
+      <w:r>
+        <w:t xml:space="preserve">, edited by David H. Dye and Cheryl Anne Cox, pp. 69–97. University of Alabama Press, Tuscaloosa.</w:t>
+      </w:r>
+    </w:p>
+    <w:bookmarkEnd w:id="178"/>
+    <w:bookmarkStart w:id="179" w:name="ref-morse_morse_1983"/>
+    <w:p>
+      <w:pPr>
+        <w:pStyle w:val="Bibliography"/>
+      </w:pPr>
+      <w:r>
+        <w:t xml:space="preserve">Morse, Dan F., and Phyllis A. Morse. 1983.</w:t>
+      </w:r>
+      <w:r>
+        <w:t xml:space="preserve"> </w:t>
+      </w:r>
+      <w:r>
+        <w:rPr>
+          <w:i/>
+          <w:iCs/>
+        </w:rPr>
+        <w:t xml:space="preserve">Archaeology of the Central</w:t>
+      </w:r>
+      <w:r>
+        <w:rPr>
+          <w:i/>
+          <w:iCs/>
+        </w:rPr>
+        <w:t xml:space="preserve"> </w:t>
+      </w:r>
+      <w:r>
+        <w:rPr>
+          <w:i/>
+          <w:iCs/>
+        </w:rPr>
+        <w:t xml:space="preserve">Mississippi</w:t>
+      </w:r>
+      <w:r>
+        <w:rPr>
+          <w:i/>
+          <w:iCs/>
+        </w:rPr>
+        <w:t xml:space="preserve"> </w:t>
+      </w:r>
+      <w:r>
+        <w:rPr>
+          <w:i/>
+          <w:iCs/>
+        </w:rPr>
+        <w:t xml:space="preserve">Valley</w:t>
+      </w:r>
+      <w:r>
+        <w:t xml:space="preserve">. Academic Press, New York.</w:t>
+      </w:r>
+    </w:p>
+    <w:bookmarkEnd w:id="179"/>
+    <w:bookmarkStart w:id="180" w:name="ref-morse_morse_1996"/>
+    <w:p>
+      <w:pPr>
+        <w:pStyle w:val="Bibliography"/>
+      </w:pPr>
+      <w:r>
+        <w:t xml:space="preserve">Morse, Dan F., and Phyllis A. Morse. 1996. Changes in Interpretation in the Archaeology of the Central</w:t>
+      </w:r>
+      <w:r>
+        <w:t xml:space="preserve"> </w:t>
+      </w:r>
+      <w:r>
+        <w:t xml:space="preserve">Mississippi</w:t>
+      </w:r>
+      <w:r>
+        <w:t xml:space="preserve"> </w:t>
+      </w:r>
+      <w:r>
+        <w:t xml:space="preserve">Valley Since 1983.</w:t>
+      </w:r>
+      <w:r>
+        <w:t xml:space="preserve"> </w:t>
+      </w:r>
+      <w:r>
+        <w:rPr>
+          <w:i/>
+          <w:iCs/>
+        </w:rPr>
+        <w:t xml:space="preserve">North American Archaeologist</w:t>
+      </w:r>
+      <w:r>
+        <w:t xml:space="preserve"> </w:t>
+      </w:r>
+      <w:r>
+        <w:t xml:space="preserve">17(1):1–35.</w:t>
+      </w:r>
+    </w:p>
+    <w:bookmarkEnd w:id="180"/>
+    <w:bookmarkStart w:id="181" w:name="ref-morse_1990"/>
+    <w:p>
+      <w:pPr>
+        <w:pStyle w:val="Bibliography"/>
+      </w:pPr>
+      <w:r>
+        <w:t xml:space="preserve">Morse, Phyllis A. 1990. The</w:t>
       </w:r>
       <w:r>
         <w:t xml:space="preserve"> </w:t>
@@ -6294,32 +6458,13 @@
         <w:t xml:space="preserve"> </w:t>
       </w:r>
       <w:r>
-        <w:t xml:space="preserve">Site,</w:t>
-      </w:r>
-      <w:r>
-        <w:t xml:space="preserve"> </w:t>
-      </w:r>
-      <w:r>
-        <w:t xml:space="preserve">Arkansas</w:t>
-      </w:r>
-      <w:r>
-        <w:t xml:space="preserve">.</w:t>
-      </w:r>
-    </w:p>
-    <w:bookmarkEnd w:id="178"/>
-    <w:bookmarkStart w:id="179" w:name="ref-morse_d_1990"/>
-    <w:p>
-      <w:pPr>
-        <w:pStyle w:val="Bibliography"/>
-      </w:pPr>
-      <w:r>
-        <w:t xml:space="preserve">Morse, Dan F. 1990. The</w:t>
-      </w:r>
-      <w:r>
-        <w:t xml:space="preserve"> </w:t>
-      </w:r>
-      <w:r>
-        <w:t xml:space="preserve">Nodena</w:t>
+        <w:t xml:space="preserve">Site and the</w:t>
+      </w:r>
+      <w:r>
+        <w:t xml:space="preserve"> </w:t>
+      </w:r>
+      <w:r>
+        <w:t xml:space="preserve">Parkin</w:t>
       </w:r>
       <w:r>
         <w:t xml:space="preserve"> </w:t>
@@ -6352,228 +6497,78 @@
         <w:t xml:space="preserve">Mississippi</w:t>
       </w:r>
       <w:r>
-        <w:t xml:space="preserve">, edited by David H. Dye and Cheryl Anne Cox, pp. 69–97. University of Alabama Press, Tuscaloosa.</w:t>
-      </w:r>
-    </w:p>
-    <w:bookmarkEnd w:id="179"/>
-    <w:bookmarkStart w:id="180" w:name="ref-morse_morse_1983"/>
-    <w:p>
-      <w:pPr>
-        <w:pStyle w:val="Bibliography"/>
-      </w:pPr>
-      <w:r>
-        <w:t xml:space="preserve">Morse, Dan F., and Phyllis A. Morse. 1983.</w:t>
-      </w:r>
-      <w:r>
-        <w:t xml:space="preserve"> </w:t>
-      </w:r>
-      <w:r>
-        <w:rPr>
-          <w:i/>
-          <w:iCs/>
-        </w:rPr>
-        <w:t xml:space="preserve">Archaeology of the Central</w:t>
-      </w:r>
-      <w:r>
-        <w:rPr>
-          <w:i/>
-          <w:iCs/>
-        </w:rPr>
-        <w:t xml:space="preserve"> </w:t>
-      </w:r>
-      <w:r>
-        <w:rPr>
-          <w:i/>
-          <w:iCs/>
-        </w:rPr>
-        <w:t xml:space="preserve">Mississippi</w:t>
-      </w:r>
-      <w:r>
-        <w:rPr>
-          <w:i/>
-          <w:iCs/>
-        </w:rPr>
-        <w:t xml:space="preserve"> </w:t>
-      </w:r>
-      <w:r>
-        <w:rPr>
-          <w:i/>
-          <w:iCs/>
-        </w:rPr>
-        <w:t xml:space="preserve">Valley</w:t>
-      </w:r>
-      <w:r>
-        <w:t xml:space="preserve">. Academic Press, New York.</w:t>
-      </w:r>
-    </w:p>
-    <w:bookmarkEnd w:id="180"/>
-    <w:bookmarkStart w:id="181" w:name="ref-morse_morse_1996"/>
-    <w:p>
-      <w:pPr>
-        <w:pStyle w:val="Bibliography"/>
-      </w:pPr>
-      <w:r>
-        <w:t xml:space="preserve">Morse, Dan F., and Phyllis A. Morse. 1996. Changes in Interpretation in the Archaeology of the Central</w:t>
-      </w:r>
-      <w:r>
-        <w:t xml:space="preserve"> </w:t>
-      </w:r>
-      <w:r>
-        <w:t xml:space="preserve">Mississippi</w:t>
-      </w:r>
-      <w:r>
-        <w:t xml:space="preserve"> </w:t>
-      </w:r>
-      <w:r>
-        <w:t xml:space="preserve">Valley Since 1983.</w:t>
-      </w:r>
-      <w:r>
-        <w:t xml:space="preserve"> </w:t>
-      </w:r>
-      <w:r>
-        <w:rPr>
-          <w:i/>
-          <w:iCs/>
-        </w:rPr>
-        <w:t xml:space="preserve">North American Archaeologist</w:t>
-      </w:r>
-      <w:r>
-        <w:t xml:space="preserve"> </w:t>
-      </w:r>
-      <w:r>
-        <w:t xml:space="preserve">17(1):1–35.</w:t>
+        <w:t xml:space="preserve">, edited by David H. Dye and Cheryl Anne Cox, pp. 118–134. University of Alabama Press, Tuscaloosa.</w:t>
       </w:r>
     </w:p>
     <w:bookmarkEnd w:id="181"/>
-    <w:bookmarkStart w:id="182" w:name="ref-morse_1990"/>
-    <w:p>
-      <w:pPr>
-        <w:pStyle w:val="Bibliography"/>
-      </w:pPr>
-      <w:r>
-        <w:t xml:space="preserve">Morse, Phyllis A. 1990. The</w:t>
-      </w:r>
-      <w:r>
-        <w:t xml:space="preserve"> </w:t>
-      </w:r>
-      <w:r>
-        <w:t xml:space="preserve">Parkin</w:t>
-      </w:r>
-      <w:r>
-        <w:t xml:space="preserve"> </w:t>
-      </w:r>
-      <w:r>
-        <w:t xml:space="preserve">Site and the</w:t>
-      </w:r>
-      <w:r>
-        <w:t xml:space="preserve"> </w:t>
-      </w:r>
-      <w:r>
-        <w:t xml:space="preserve">Parkin</w:t>
-      </w:r>
-      <w:r>
-        <w:t xml:space="preserve"> </w:t>
-      </w:r>
-      <w:r>
-        <w:t xml:space="preserve">Phase. In</w:t>
-      </w:r>
-      <w:r>
-        <w:t xml:space="preserve"> </w:t>
-      </w:r>
-      <w:r>
-        <w:rPr>
-          <w:i/>
-          <w:iCs/>
-        </w:rPr>
-        <w:t xml:space="preserve">Towns and Temples Along the</w:t>
-      </w:r>
-      <w:r>
-        <w:rPr>
-          <w:i/>
-          <w:iCs/>
-        </w:rPr>
-        <w:t xml:space="preserve"> </w:t>
-      </w:r>
-      <w:r>
-        <w:rPr>
-          <w:i/>
-          <w:iCs/>
-        </w:rPr>
-        <w:t xml:space="preserve">Mississippi</w:t>
-      </w:r>
-      <w:r>
-        <w:t xml:space="preserve">, edited by David H. Dye and Cheryl Anne Cox, pp. 118–134. University of Alabama Press, Tuscaloosa.</w:t>
+    <w:bookmarkStart w:id="182" w:name="ref-neiman_1995"/>
+    <w:p>
+      <w:pPr>
+        <w:pStyle w:val="Bibliography"/>
+      </w:pPr>
+      <w:r>
+        <w:t xml:space="preserve">Neiman, Fraser D. 1995. Stylistic Variation in Evolutionary Perspective: Inferences from Decorative Diversity and Interassemblage Distance in</w:t>
+      </w:r>
+      <w:r>
+        <w:t xml:space="preserve"> </w:t>
+      </w:r>
+      <w:r>
+        <w:t xml:space="preserve">Illinois</w:t>
+      </w:r>
+      <w:r>
+        <w:t xml:space="preserve"> </w:t>
+      </w:r>
+      <w:r>
+        <w:t xml:space="preserve">Woodland</w:t>
+      </w:r>
+      <w:r>
+        <w:t xml:space="preserve"> </w:t>
+      </w:r>
+      <w:r>
+        <w:t xml:space="preserve">Ceramic Assemblages.</w:t>
+      </w:r>
+      <w:r>
+        <w:t xml:space="preserve"> </w:t>
+      </w:r>
+      <w:r>
+        <w:rPr>
+          <w:i/>
+          <w:iCs/>
+        </w:rPr>
+        <w:t xml:space="preserve">American Antiquity</w:t>
+      </w:r>
+      <w:r>
+        <w:t xml:space="preserve"> </w:t>
+      </w:r>
+      <w:r>
+        <w:t xml:space="preserve">60(1):7–36.</w:t>
       </w:r>
     </w:p>
     <w:bookmarkEnd w:id="182"/>
-    <w:bookmarkStart w:id="183" w:name="ref-neiman_1995"/>
-    <w:p>
-      <w:pPr>
-        <w:pStyle w:val="Bibliography"/>
-      </w:pPr>
-      <w:r>
-        <w:t xml:space="preserve">Neiman, Fraser D. 1995. Stylistic Variation in Evolutionary Perspective: Inferences from Decorative Diversity and Interassemblage Distance in</w:t>
-      </w:r>
-      <w:r>
-        <w:t xml:space="preserve"> </w:t>
-      </w:r>
-      <w:r>
-        <w:t xml:space="preserve">Illinois</w:t>
-      </w:r>
-      <w:r>
-        <w:t xml:space="preserve"> </w:t>
-      </w:r>
-      <w:r>
-        <w:t xml:space="preserve">Woodland</w:t>
-      </w:r>
-      <w:r>
-        <w:t xml:space="preserve"> </w:t>
-      </w:r>
-      <w:r>
-        <w:t xml:space="preserve">Ceramic Assemblages.</w:t>
-      </w:r>
-      <w:r>
-        <w:t xml:space="preserve"> </w:t>
-      </w:r>
-      <w:r>
-        <w:rPr>
-          <w:i/>
-          <w:iCs/>
-        </w:rPr>
-        <w:t xml:space="preserve">American Antiquity</w:t>
-      </w:r>
-      <w:r>
-        <w:t xml:space="preserve"> </w:t>
-      </w:r>
-      <w:r>
-        <w:t xml:space="preserve">60(1):7–36.</w:t>
+    <w:bookmarkStart w:id="183" w:name="ref-obrien_leonard_2001"/>
+    <w:p>
+      <w:pPr>
+        <w:pStyle w:val="Bibliography"/>
+      </w:pPr>
+      <w:r>
+        <w:t xml:space="preserve">O’Brien, Michael J., and Robert D. Leonard. 2001. Style and Function: An Introduction. In</w:t>
+      </w:r>
+      <w:r>
+        <w:t xml:space="preserve"> </w:t>
+      </w:r>
+      <w:r>
+        <w:rPr>
+          <w:i/>
+          <w:iCs/>
+        </w:rPr>
+        <w:t xml:space="preserve">Style and Function: Conceptual Issues in Evolutionary Archaeology</w:t>
+      </w:r>
+      <w:r>
+        <w:t xml:space="preserve">, edited by Teresa D. Hurt and Gordon F. M. Rakita, pp. 1–23. Bergin &amp; Garvey, Westport, Connecticut.</w:t>
       </w:r>
     </w:p>
     <w:bookmarkEnd w:id="183"/>
-    <w:bookmarkStart w:id="184" w:name="ref-obrien_leonard_2001"/>
-    <w:p>
-      <w:pPr>
-        <w:pStyle w:val="Bibliography"/>
-      </w:pPr>
-      <w:r>
-        <w:t xml:space="preserve">O’Brien, Michael J., and Robert D. Leonard. 2001. Style and Function: An Introduction. In</w:t>
-      </w:r>
-      <w:r>
-        <w:t xml:space="preserve"> </w:t>
-      </w:r>
-      <w:r>
-        <w:rPr>
-          <w:i/>
-          <w:iCs/>
-        </w:rPr>
-        <w:t xml:space="preserve">Style and Function: Conceptual Issues in Evolutionary Archaeology</w:t>
-      </w:r>
-      <w:r>
-        <w:t xml:space="preserve">, edited by Teresa D. Hurt and Gordon F. M. Rakita, pp. 1–23. Bergin &amp; Garvey, Westport, Connecticut.</w:t>
-      </w:r>
-    </w:p>
-    <w:bookmarkEnd w:id="184"/>
-    <w:bookmarkStart w:id="186" w:name="ref-odwyer_kandler_2017"/>
+    <w:bookmarkStart w:id="185" w:name="ref-odwyer_kandler_2017"/>
     <w:p>
       <w:pPr>
         <w:pStyle w:val="Bibliography"/>
@@ -6600,7 +6595,7 @@
       <w:r>
         <w:t xml:space="preserve"> </w:t>
       </w:r>
-      <w:hyperlink r:id="rId185">
+      <w:hyperlink r:id="rId184">
         <w:r>
           <w:rPr>
             <w:rStyle w:val="Hyperlink"/>
@@ -6612,8 +6607,8 @@
         <w:t xml:space="preserve">.</w:t>
       </w:r>
     </w:p>
-    <w:bookmarkEnd w:id="186"/>
-    <w:bookmarkStart w:id="188" w:name="ref-peebles_kus_1977"/>
+    <w:bookmarkEnd w:id="185"/>
+    <w:bookmarkStart w:id="187" w:name="ref-peebles_kus_1977"/>
     <w:p>
       <w:pPr>
         <w:pStyle w:val="Bibliography"/>
@@ -6640,7 +6635,7 @@
       <w:r>
         <w:t xml:space="preserve"> </w:t>
       </w:r>
-      <w:hyperlink r:id="rId187">
+      <w:hyperlink r:id="rId186">
         <w:r>
           <w:rPr>
             <w:rStyle w:val="Hyperlink"/>
@@ -6652,8 +6647,8 @@
         <w:t xml:space="preserve">.</w:t>
       </w:r>
     </w:p>
-    <w:bookmarkEnd w:id="188"/>
-    <w:bookmarkStart w:id="190" w:name="ref-peeples_schachner_2012"/>
+    <w:bookmarkEnd w:id="187"/>
+    <w:bookmarkStart w:id="189" w:name="ref-peeples_schachner_2012"/>
     <w:p>
       <w:pPr>
         <w:pStyle w:val="Bibliography"/>
@@ -6680,7 +6675,7 @@
       <w:r>
         <w:t xml:space="preserve"> </w:t>
       </w:r>
-      <w:hyperlink r:id="rId189">
+      <w:hyperlink r:id="rId188">
         <w:r>
           <w:rPr>
             <w:rStyle w:val="Hyperlink"/>
@@ -6692,8 +6687,8 @@
         <w:t xml:space="preserve">.</w:t>
       </w:r>
     </w:p>
-    <w:bookmarkEnd w:id="190"/>
-    <w:bookmarkStart w:id="192" w:name="ref-perreault_2018"/>
+    <w:bookmarkEnd w:id="189"/>
+    <w:bookmarkStart w:id="191" w:name="ref-perreault_2018"/>
     <w:p>
       <w:pPr>
         <w:pStyle w:val="Bibliography"/>
@@ -6720,7 +6715,7 @@
       <w:r>
         <w:t xml:space="preserve"> </w:t>
       </w:r>
-      <w:hyperlink r:id="rId191">
+      <w:hyperlink r:id="rId190">
         <w:r>
           <w:rPr>
             <w:rStyle w:val="Hyperlink"/>
@@ -6732,37 +6727,109 @@
         <w:t xml:space="preserve">.</w:t>
       </w:r>
     </w:p>
+    <w:bookmarkEnd w:id="191"/>
+    <w:bookmarkStart w:id="192" w:name="ref-perreault_2019"/>
+    <w:p>
+      <w:pPr>
+        <w:pStyle w:val="Bibliography"/>
+      </w:pPr>
+      <w:r>
+        <w:t xml:space="preserve">Perreault, Charles. 2019.</w:t>
+      </w:r>
+      <w:r>
+        <w:t xml:space="preserve"> </w:t>
+      </w:r>
+      <w:r>
+        <w:rPr>
+          <w:i/>
+          <w:iCs/>
+        </w:rPr>
+        <w:t xml:space="preserve">The Quality of the Archaeological Record</w:t>
+      </w:r>
+      <w:r>
+        <w:t xml:space="preserve">. University of Chicago Press, Chicago.</w:t>
+      </w:r>
+    </w:p>
     <w:bookmarkEnd w:id="192"/>
-    <w:bookmarkStart w:id="193" w:name="ref-perreault_2019"/>
-    <w:p>
-      <w:pPr>
-        <w:pStyle w:val="Bibliography"/>
-      </w:pPr>
-      <w:r>
-        <w:t xml:space="preserve">Perreault, Charles. 2019.</w:t>
-      </w:r>
-      <w:r>
-        <w:t xml:space="preserve"> </w:t>
-      </w:r>
-      <w:r>
-        <w:rPr>
-          <w:i/>
-          <w:iCs/>
-        </w:rPr>
-        <w:t xml:space="preserve">The Quality of the Archaeological Record</w:t>
-      </w:r>
-      <w:r>
-        <w:t xml:space="preserve">. University of Chicago Press, Chicago.</w:t>
+    <w:bookmarkStart w:id="193" w:name="ref-phillips_1970"/>
+    <w:p>
+      <w:pPr>
+        <w:pStyle w:val="Bibliography"/>
+      </w:pPr>
+      <w:r>
+        <w:t xml:space="preserve">Phillips, Philip. 1970.</w:t>
+      </w:r>
+      <w:r>
+        <w:t xml:space="preserve"> </w:t>
+      </w:r>
+      <w:r>
+        <w:rPr>
+          <w:i/>
+          <w:iCs/>
+        </w:rPr>
+        <w:t xml:space="preserve">Archaeological Survey in the Lower</w:t>
+      </w:r>
+      <w:r>
+        <w:rPr>
+          <w:i/>
+          <w:iCs/>
+        </w:rPr>
+        <w:t xml:space="preserve"> </w:t>
+      </w:r>
+      <w:r>
+        <w:rPr>
+          <w:i/>
+          <w:iCs/>
+        </w:rPr>
+        <w:t xml:space="preserve">Yazoo</w:t>
+      </w:r>
+      <w:r>
+        <w:rPr>
+          <w:i/>
+          <w:iCs/>
+        </w:rPr>
+        <w:t xml:space="preserve"> </w:t>
+      </w:r>
+      <w:r>
+        <w:rPr>
+          <w:i/>
+          <w:iCs/>
+        </w:rPr>
+        <w:t xml:space="preserve">Basin,</w:t>
+      </w:r>
+      <w:r>
+        <w:rPr>
+          <w:i/>
+          <w:iCs/>
+        </w:rPr>
+        <w:t xml:space="preserve"> </w:t>
+      </w:r>
+      <w:r>
+        <w:rPr>
+          <w:i/>
+          <w:iCs/>
+        </w:rPr>
+        <w:t xml:space="preserve">Mississippi</w:t>
+      </w:r>
+      <w:r>
+        <w:rPr>
+          <w:i/>
+          <w:iCs/>
+        </w:rPr>
+        <w:t xml:space="preserve">, 1949–1955</w:t>
+      </w:r>
+      <w:r>
+        <w:t xml:space="preserve">, Vol. 60. Papers of the Peabody Museum of Archaeology and Ethnology. Peabody Museum, Harvard University, Cambridge, MA.</w:t>
       </w:r>
     </w:p>
     <w:bookmarkEnd w:id="193"/>
-    <w:bookmarkStart w:id="194" w:name="ref-phillips_1970"/>
-    <w:p>
-      <w:pPr>
-        <w:pStyle w:val="Bibliography"/>
-      </w:pPr>
-      <w:r>
-        <w:t xml:space="preserve">Phillips, Philip. 1970.</w:t>
+    <w:bookmarkStart w:id="194" w:name="ref-phillips_ford_griffin_1951"/>
+    <w:p>
+      <w:pPr>
+        <w:pStyle w:val="Bibliography"/>
+      </w:pPr>
+      <w:r>
+        <w:t xml:space="preserve">Phillips, Philip, James A. Ford, and James B. Griffin. 1951.</w:t>
       </w:r>
       <w:r>
         <w:t xml:space="preserve"> </w:t>
@@ -6786,34 +6853,6 @@
           <w:i/>
           <w:iCs/>
         </w:rPr>
-        <w:t xml:space="preserve">Yazoo</w:t>
-      </w:r>
-      <w:r>
-        <w:rPr>
-          <w:i/>
-          <w:iCs/>
-        </w:rPr>
-        <w:t xml:space="preserve"> </w:t>
-      </w:r>
-      <w:r>
-        <w:rPr>
-          <w:i/>
-          <w:iCs/>
-        </w:rPr>
-        <w:t xml:space="preserve">Basin,</w:t>
-      </w:r>
-      <w:r>
-        <w:rPr>
-          <w:i/>
-          <w:iCs/>
-        </w:rPr>
-        <w:t xml:space="preserve"> </w:t>
-      </w:r>
-      <w:r>
-        <w:rPr>
-          <w:i/>
-          <w:iCs/>
-        </w:rPr>
         <w:t xml:space="preserve">Mississippi</w:t>
       </w:r>
       <w:r>
@@ -6821,65 +6860,21 @@
           <w:i/>
           <w:iCs/>
         </w:rPr>
-        <w:t xml:space="preserve">, 1949–1955</w:t>
-      </w:r>
-      <w:r>
-        <w:t xml:space="preserve">, Vol. 60. Papers of the Peabody Museum of Archaeology and Ethnology. Peabody Museum, Harvard University, Cambridge, MA.</w:t>
+        <w:t xml:space="preserve"> </w:t>
+      </w:r>
+      <w:r>
+        <w:rPr>
+          <w:i/>
+          <w:iCs/>
+        </w:rPr>
+        <w:t xml:space="preserve">Alluvial Valley, 1940–1947</w:t>
+      </w:r>
+      <w:r>
+        <w:t xml:space="preserve">, Vol. 25. Papers of the Peabody Museum of American Archaeology and Ethnology. Peabody Museum, Harvard University, Cambridge, MA.</w:t>
       </w:r>
     </w:p>
     <w:bookmarkEnd w:id="194"/>
-    <w:bookmarkStart w:id="195" w:name="ref-phillips_ford_griffin_1951"/>
-    <w:p>
-      <w:pPr>
-        <w:pStyle w:val="Bibliography"/>
-      </w:pPr>
-      <w:r>
-        <w:t xml:space="preserve">Phillips, Philip, James A. Ford, and James B. Griffin. 1951.</w:t>
-      </w:r>
-      <w:r>
-        <w:t xml:space="preserve"> </w:t>
-      </w:r>
-      <w:r>
-        <w:rPr>
-          <w:i/>
-          <w:iCs/>
-        </w:rPr>
-        <w:t xml:space="preserve">Archaeological Survey in the Lower</w:t>
-      </w:r>
-      <w:r>
-        <w:rPr>
-          <w:i/>
-          <w:iCs/>
-        </w:rPr>
-        <w:t xml:space="preserve"> </w:t>
-      </w:r>
-      <w:r>
-        <w:rPr>
-          <w:i/>
-          <w:iCs/>
-        </w:rPr>
-        <w:t xml:space="preserve">Mississippi</w:t>
-      </w:r>
-      <w:r>
-        <w:rPr>
-          <w:i/>
-          <w:iCs/>
-        </w:rPr>
-        <w:t xml:space="preserve"> </w:t>
-      </w:r>
-      <w:r>
-        <w:rPr>
-          <w:i/>
-          <w:iCs/>
-        </w:rPr>
-        <w:t xml:space="preserve">Alluvial Valley, 1940–1947</w:t>
-      </w:r>
-      <w:r>
-        <w:t xml:space="preserve">, Vol. 25. Papers of the Peabody Museum of American Archaeology and Ethnology. Peabody Museum, Harvard University, Cambridge, MA.</w:t>
-      </w:r>
-    </w:p>
-    <w:bookmarkEnd w:id="195"/>
-    <w:bookmarkStart w:id="197" w:name="ref-phillips_willey_1953"/>
+    <w:bookmarkStart w:id="196" w:name="ref-phillips_willey_1953"/>
     <w:p>
       <w:pPr>
         <w:pStyle w:val="Bibliography"/>
@@ -6906,7 +6901,7 @@
       <w:r>
         <w:t xml:space="preserve"> </w:t>
       </w:r>
-      <w:hyperlink r:id="rId196">
+      <w:hyperlink r:id="rId195">
         <w:r>
           <w:rPr>
             <w:rStyle w:val="Hyperlink"/>
@@ -6918,8 +6913,8 @@
         <w:t xml:space="preserve">.</w:t>
       </w:r>
     </w:p>
-    <w:bookmarkEnd w:id="197"/>
-    <w:bookmarkStart w:id="199" w:name="ref-powell_shennan_thomas_2009"/>
+    <w:bookmarkEnd w:id="196"/>
+    <w:bookmarkStart w:id="198" w:name="ref-powell_shennan_thomas_2009"/>
     <w:p>
       <w:pPr>
         <w:pStyle w:val="Bibliography"/>
@@ -6958,7 +6953,7 @@
       <w:r>
         <w:t xml:space="preserve"> </w:t>
       </w:r>
-      <w:hyperlink r:id="rId198">
+      <w:hyperlink r:id="rId197">
         <w:r>
           <w:rPr>
             <w:rStyle w:val="Hyperlink"/>
@@ -6970,8 +6965,8 @@
         <w:t xml:space="preserve">.</w:t>
       </w:r>
     </w:p>
-    <w:bookmarkEnd w:id="199"/>
-    <w:bookmarkStart w:id="201" w:name="ref-premo_2014"/>
+    <w:bookmarkEnd w:id="198"/>
+    <w:bookmarkStart w:id="200" w:name="ref-premo_2014"/>
     <w:p>
       <w:pPr>
         <w:pStyle w:val="Bibliography"/>
@@ -6998,7 +6993,7 @@
       <w:r>
         <w:t xml:space="preserve"> </w:t>
       </w:r>
-      <w:hyperlink r:id="rId200">
+      <w:hyperlink r:id="rId199">
         <w:r>
           <w:rPr>
             <w:rStyle w:val="Hyperlink"/>
@@ -7010,8 +7005,8 @@
         <w:t xml:space="preserve">.</w:t>
       </w:r>
     </w:p>
-    <w:bookmarkEnd w:id="201"/>
-    <w:bookmarkStart w:id="203" w:name="ref-premo_2016"/>
+    <w:bookmarkEnd w:id="200"/>
+    <w:bookmarkStart w:id="202" w:name="ref-premo_2016"/>
     <w:p>
       <w:pPr>
         <w:pStyle w:val="Bibliography"/>
@@ -7038,7 +7033,7 @@
       <w:r>
         <w:t xml:space="preserve"> </w:t>
       </w:r>
-      <w:hyperlink r:id="rId202">
+      <w:hyperlink r:id="rId201">
         <w:r>
           <w:rPr>
             <w:rStyle w:val="Hyperlink"/>
@@ -7050,8 +7045,8 @@
         <w:t xml:space="preserve">.</w:t>
       </w:r>
     </w:p>
-    <w:bookmarkEnd w:id="203"/>
-    <w:bookmarkStart w:id="205" w:name="ref-premo_scholnick_2011"/>
+    <w:bookmarkEnd w:id="202"/>
+    <w:bookmarkStart w:id="204" w:name="ref-premo_scholnick_2011"/>
     <w:p>
       <w:pPr>
         <w:pStyle w:val="Bibliography"/>
@@ -7078,7 +7073,7 @@
       <w:r>
         <w:t xml:space="preserve"> </w:t>
       </w:r>
-      <w:hyperlink r:id="rId204">
+      <w:hyperlink r:id="rId203">
         <w:r>
           <w:rPr>
             <w:rStyle w:val="Hyperlink"/>
@@ -7090,33 +7085,33 @@
         <w:t xml:space="preserve">.</w:t>
       </w:r>
     </w:p>
+    <w:bookmarkEnd w:id="204"/>
+    <w:bookmarkStart w:id="205" w:name="ref-rees_political_culture"/>
+    <w:p>
+      <w:pPr>
+        <w:pStyle w:val="Bibliography"/>
+      </w:pPr>
+      <w:r>
+        <w:t xml:space="preserve">Rees, Mark A. 2001. Mississippian Political Culture: Contrasting Historical Trajectories in Southeastern</w:t>
+      </w:r>
+      <w:r>
+        <w:t xml:space="preserve"> </w:t>
+      </w:r>
+      <w:r>
+        <w:t xml:space="preserve">North</w:t>
+      </w:r>
+      <w:r>
+        <w:t xml:space="preserve"> </w:t>
+      </w:r>
+      <w:r>
+        <w:t xml:space="preserve">America</w:t>
+      </w:r>
+      <w:r>
+        <w:t xml:space="preserve">. Ph.D. dissertation, University of Oklahoma, Norman.</w:t>
+      </w:r>
+    </w:p>
     <w:bookmarkEnd w:id="205"/>
-    <w:bookmarkStart w:id="206" w:name="ref-rees_political_culture"/>
-    <w:p>
-      <w:pPr>
-        <w:pStyle w:val="Bibliography"/>
-      </w:pPr>
-      <w:r>
-        <w:t xml:space="preserve">Rees, Mark A. 2001. Mississippian Political Culture: Contrasting Historical Trajectories in Southeastern</w:t>
-      </w:r>
-      <w:r>
-        <w:t xml:space="preserve"> </w:t>
-      </w:r>
-      <w:r>
-        <w:t xml:space="preserve">North</w:t>
-      </w:r>
-      <w:r>
-        <w:t xml:space="preserve"> </w:t>
-      </w:r>
-      <w:r>
-        <w:t xml:space="preserve">America</w:t>
-      </w:r>
-      <w:r>
-        <w:t xml:space="preserve">. Ph.D. dissertation, University of Oklahoma, Norman.</w:t>
-      </w:r>
-    </w:p>
-    <w:bookmarkEnd w:id="206"/>
-    <w:bookmarkStart w:id="208" w:name="ref-reimer_etal_2020"/>
+    <w:bookmarkStart w:id="207" w:name="ref-reimer_etal_2020"/>
     <w:p>
       <w:pPr>
         <w:pStyle w:val="Bibliography"/>
@@ -7170,7 +7165,7 @@
       <w:r>
         <w:t xml:space="preserve"> </w:t>
       </w:r>
-      <w:hyperlink r:id="rId207">
+      <w:hyperlink r:id="rId206">
         <w:r>
           <w:rPr>
             <w:rStyle w:val="Hyperlink"/>
@@ -7182,8 +7177,8 @@
         <w:t xml:space="preserve">.</w:t>
       </w:r>
     </w:p>
-    <w:bookmarkEnd w:id="208"/>
-    <w:bookmarkStart w:id="210" w:name="ref-richerson_etal_2016"/>
+    <w:bookmarkEnd w:id="207"/>
+    <w:bookmarkStart w:id="209" w:name="ref-richerson_etal_2016"/>
     <w:p>
       <w:pPr>
         <w:pStyle w:val="Bibliography"/>
@@ -7210,7 +7205,7 @@
       <w:r>
         <w:t xml:space="preserve"> </w:t>
       </w:r>
-      <w:hyperlink r:id="rId209">
+      <w:hyperlink r:id="rId208">
         <w:r>
           <w:rPr>
             <w:rStyle w:val="Hyperlink"/>
@@ -7222,8 +7217,8 @@
         <w:t xml:space="preserve">.</w:t>
       </w:r>
     </w:p>
-    <w:bookmarkEnd w:id="210"/>
-    <w:bookmarkStart w:id="212" w:name="ref-riede_hoggard_shennan_2019"/>
+    <w:bookmarkEnd w:id="209"/>
+    <w:bookmarkStart w:id="211" w:name="ref-riede_hoggard_shennan_2019"/>
     <w:p>
       <w:pPr>
         <w:pStyle w:val="Bibliography"/>
@@ -7250,7 +7245,7 @@
       <w:r>
         <w:t xml:space="preserve"> </w:t>
       </w:r>
-      <w:hyperlink r:id="rId211">
+      <w:hyperlink r:id="rId210">
         <w:r>
           <w:rPr>
             <w:rStyle w:val="Hyperlink"/>
@@ -7262,69 +7257,69 @@
         <w:t xml:space="preserve">.</w:t>
       </w:r>
     </w:p>
+    <w:bookmarkEnd w:id="211"/>
+    <w:bookmarkStart w:id="212" w:name="ref-robinson_1951"/>
+    <w:p>
+      <w:pPr>
+        <w:pStyle w:val="Bibliography"/>
+      </w:pPr>
+      <w:r>
+        <w:t xml:space="preserve">Robinson, W. S. 1951. A Method for Chronologically Ordering Archaeological Deposits.</w:t>
+      </w:r>
+      <w:r>
+        <w:t xml:space="preserve"> </w:t>
+      </w:r>
+      <w:r>
+        <w:rPr>
+          <w:i/>
+          <w:iCs/>
+        </w:rPr>
+        <w:t xml:space="preserve">American Antiquity</w:t>
+      </w:r>
+      <w:r>
+        <w:t xml:space="preserve"> </w:t>
+      </w:r>
+      <w:r>
+        <w:t xml:space="preserve">16(4):293–301.</w:t>
+      </w:r>
+    </w:p>
     <w:bookmarkEnd w:id="212"/>
-    <w:bookmarkStart w:id="213" w:name="ref-robinson_1951"/>
-    <w:p>
-      <w:pPr>
-        <w:pStyle w:val="Bibliography"/>
-      </w:pPr>
-      <w:r>
-        <w:t xml:space="preserve">Robinson, W. S. 1951. A Method for Chronologically Ordering Archaeological Deposits.</w:t>
-      </w:r>
-      <w:r>
-        <w:t xml:space="preserve"> </w:t>
-      </w:r>
-      <w:r>
-        <w:rPr>
-          <w:i/>
-          <w:iCs/>
-        </w:rPr>
-        <w:t xml:space="preserve">American Antiquity</w:t>
-      </w:r>
-      <w:r>
-        <w:t xml:space="preserve"> </w:t>
-      </w:r>
-      <w:r>
-        <w:t xml:space="preserve">16(4):293–301.</w:t>
+    <w:bookmarkStart w:id="213" w:name="ref-ross-stallings_2017"/>
+    <w:p>
+      <w:pPr>
+        <w:pStyle w:val="Bibliography"/>
+      </w:pPr>
+      <w:r>
+        <w:t xml:space="preserve">Ross-Stallings, Nancy A. 2017. Center and Satellite: Settlement Hierarchy and Diet on the Late Prehistoric</w:t>
+      </w:r>
+      <w:r>
+        <w:t xml:space="preserve"> </w:t>
+      </w:r>
+      <w:r>
+        <w:t xml:space="preserve">Mississippi</w:t>
+      </w:r>
+      <w:r>
+        <w:t xml:space="preserve"> </w:t>
+      </w:r>
+      <w:r>
+        <w:t xml:space="preserve">Delta. In</w:t>
+      </w:r>
+      <w:r>
+        <w:t xml:space="preserve"> </w:t>
+      </w:r>
+      <w:r>
+        <w:rPr>
+          <w:i/>
+          <w:iCs/>
+        </w:rPr>
+        <w:t xml:space="preserve">Bones of Complexity: Bioarchaeological Case Studies of Social Organization and Skeletal Biology</w:t>
+      </w:r>
+      <w:r>
+        <w:t xml:space="preserve">, edited by Haagen D. Klaus, Amanda R. Harvey, and Mark N. Cohen, pp. 329–362. University Press of Florida, Gainesville.</w:t>
       </w:r>
     </w:p>
     <w:bookmarkEnd w:id="213"/>
-    <w:bookmarkStart w:id="214" w:name="ref-ross-stallings_2017"/>
-    <w:p>
-      <w:pPr>
-        <w:pStyle w:val="Bibliography"/>
-      </w:pPr>
-      <w:r>
-        <w:t xml:space="preserve">Ross-Stallings, Nancy A. 2017. Center and Satellite: Settlement Hierarchy and Diet on the Late Prehistoric</w:t>
-      </w:r>
-      <w:r>
-        <w:t xml:space="preserve"> </w:t>
-      </w:r>
-      <w:r>
-        <w:t xml:space="preserve">Mississippi</w:t>
-      </w:r>
-      <w:r>
-        <w:t xml:space="preserve"> </w:t>
-      </w:r>
-      <w:r>
-        <w:t xml:space="preserve">Delta. In</w:t>
-      </w:r>
-      <w:r>
-        <w:t xml:space="preserve"> </w:t>
-      </w:r>
-      <w:r>
-        <w:rPr>
-          <w:i/>
-          <w:iCs/>
-        </w:rPr>
-        <w:t xml:space="preserve">Bones of Complexity: Bioarchaeological Case Studies of Social Organization and Skeletal Biology</w:t>
-      </w:r>
-      <w:r>
-        <w:t xml:space="preserve">, edited by Haagen D. Klaus, Amanda R. Harvey, and Mark N. Cohen, pp. 329–362. University Press of Florida, Gainesville.</w:t>
-      </w:r>
-    </w:p>
-    <w:bookmarkEnd w:id="214"/>
-    <w:bookmarkStart w:id="216" w:name="ref-saxer_doebeli_travisano_2009"/>
+    <w:bookmarkStart w:id="215" w:name="ref-saxer_doebeli_travisano_2009"/>
     <w:p>
       <w:pPr>
         <w:pStyle w:val="Bibliography"/>
@@ -7351,7 +7346,7 @@
       <w:r>
         <w:t xml:space="preserve"> </w:t>
       </w:r>
-      <w:hyperlink r:id="rId215">
+      <w:hyperlink r:id="rId214">
         <w:r>
           <w:rPr>
             <w:rStyle w:val="Hyperlink"/>
@@ -7363,8 +7358,8 @@
         <w:t xml:space="preserve">.</w:t>
       </w:r>
     </w:p>
-    <w:bookmarkEnd w:id="216"/>
-    <w:bookmarkStart w:id="218" w:name="ref-scheffer_2009"/>
+    <w:bookmarkEnd w:id="215"/>
+    <w:bookmarkStart w:id="217" w:name="ref-scheffer_2009"/>
     <w:p>
       <w:pPr>
         <w:pStyle w:val="Bibliography"/>
@@ -7391,7 +7386,7 @@
       <w:r>
         <w:t xml:space="preserve"> </w:t>
       </w:r>
-      <w:hyperlink r:id="rId217">
+      <w:hyperlink r:id="rId216">
         <w:r>
           <w:rPr>
             <w:rStyle w:val="Hyperlink"/>
@@ -7403,34 +7398,34 @@
         <w:t xml:space="preserve">.</w:t>
       </w:r>
     </w:p>
+    <w:bookmarkEnd w:id="217"/>
+    <w:bookmarkStart w:id="218" w:name="ref-schiffer_1972"/>
+    <w:p>
+      <w:pPr>
+        <w:pStyle w:val="Bibliography"/>
+      </w:pPr>
+      <w:r>
+        <w:t xml:space="preserve">Schiffer, Michael B. 1972. Archaeological Context and Systemic Context.</w:t>
+      </w:r>
+      <w:r>
+        <w:t xml:space="preserve"> </w:t>
+      </w:r>
+      <w:r>
+        <w:rPr>
+          <w:i/>
+          <w:iCs/>
+        </w:rPr>
+        <w:t xml:space="preserve">American Antiquity</w:t>
+      </w:r>
+      <w:r>
+        <w:t xml:space="preserve"> </w:t>
+      </w:r>
+      <w:r>
+        <w:t xml:space="preserve">37(2):156–165.</w:t>
+      </w:r>
+    </w:p>
     <w:bookmarkEnd w:id="218"/>
-    <w:bookmarkStart w:id="219" w:name="ref-schiffer_1972"/>
-    <w:p>
-      <w:pPr>
-        <w:pStyle w:val="Bibliography"/>
-      </w:pPr>
-      <w:r>
-        <w:t xml:space="preserve">Schiffer, Michael B. 1972. Archaeological Context and Systemic Context.</w:t>
-      </w:r>
-      <w:r>
-        <w:t xml:space="preserve"> </w:t>
-      </w:r>
-      <w:r>
-        <w:rPr>
-          <w:i/>
-          <w:iCs/>
-        </w:rPr>
-        <w:t xml:space="preserve">American Antiquity</w:t>
-      </w:r>
-      <w:r>
-        <w:t xml:space="preserve"> </w:t>
-      </w:r>
-      <w:r>
-        <w:t xml:space="preserve">37(2):156–165.</w:t>
-      </w:r>
-    </w:p>
-    <w:bookmarkEnd w:id="219"/>
-    <w:bookmarkStart w:id="221" w:name="ref-schneider_martins_deaguiar_2016"/>
+    <w:bookmarkStart w:id="220" w:name="ref-schneider_martins_deaguiar_2016"/>
     <w:p>
       <w:pPr>
         <w:pStyle w:val="Bibliography"/>
@@ -7457,7 +7452,7 @@
       <w:r>
         <w:t xml:space="preserve"> </w:t>
       </w:r>
-      <w:hyperlink r:id="rId220">
+      <w:hyperlink r:id="rId219">
         <w:r>
           <w:rPr>
             <w:rStyle w:val="Hyperlink"/>
@@ -7469,8 +7464,8 @@
         <w:t xml:space="preserve">.</w:t>
       </w:r>
     </w:p>
-    <w:bookmarkEnd w:id="221"/>
-    <w:bookmarkStart w:id="223" w:name="ref-shennan_crema_kerig_2015"/>
+    <w:bookmarkEnd w:id="220"/>
+    <w:bookmarkStart w:id="222" w:name="ref-shennan_crema_kerig_2015"/>
     <w:p>
       <w:pPr>
         <w:pStyle w:val="Bibliography"/>
@@ -7536,7 +7531,7 @@
       <w:r>
         <w:t xml:space="preserve"> </w:t>
       </w:r>
-      <w:hyperlink r:id="rId222">
+      <w:hyperlink r:id="rId221">
         <w:r>
           <w:rPr>
             <w:rStyle w:val="Hyperlink"/>
@@ -7548,77 +7543,208 @@
         <w:t xml:space="preserve">.</w:t>
       </w:r>
     </w:p>
+    <w:bookmarkEnd w:id="222"/>
+    <w:bookmarkStart w:id="223" w:name="ref-shennan_wilkinson_2001"/>
+    <w:p>
+      <w:pPr>
+        <w:pStyle w:val="Bibliography"/>
+      </w:pPr>
+      <w:r>
+        <w:t xml:space="preserve">Shennan, Stephen J., and James R. Wilkinson. 2001. Ceramic Style Change and Neutral Evolution: A Case Study from</w:t>
+      </w:r>
+      <w:r>
+        <w:t xml:space="preserve"> </w:t>
+      </w:r>
+      <w:r>
+        <w:t xml:space="preserve">Neolithic</w:t>
+      </w:r>
+      <w:r>
+        <w:t xml:space="preserve"> </w:t>
+      </w:r>
+      <w:r>
+        <w:t xml:space="preserve">Europe</w:t>
+      </w:r>
+      <w:r>
+        <w:t xml:space="preserve">.</w:t>
+      </w:r>
+      <w:r>
+        <w:t xml:space="preserve"> </w:t>
+      </w:r>
+      <w:r>
+        <w:rPr>
+          <w:i/>
+          <w:iCs/>
+        </w:rPr>
+        <w:t xml:space="preserve">American Antiquity</w:t>
+      </w:r>
+      <w:r>
+        <w:t xml:space="preserve"> </w:t>
+      </w:r>
+      <w:r>
+        <w:t xml:space="preserve">66(4):577–593.</w:t>
+      </w:r>
+    </w:p>
     <w:bookmarkEnd w:id="223"/>
-    <w:bookmarkStart w:id="224" w:name="ref-shennan_wilkinson_2001"/>
-    <w:p>
-      <w:pPr>
-        <w:pStyle w:val="Bibliography"/>
-      </w:pPr>
-      <w:r>
-        <w:t xml:space="preserve">Shennan, Stephen J., and James R. Wilkinson. 2001. Ceramic Style Change and Neutral Evolution: A Case Study from</w:t>
-      </w:r>
-      <w:r>
-        <w:t xml:space="preserve"> </w:t>
-      </w:r>
-      <w:r>
-        <w:t xml:space="preserve">Neolithic</w:t>
-      </w:r>
-      <w:r>
-        <w:t xml:space="preserve"> </w:t>
-      </w:r>
-      <w:r>
-        <w:t xml:space="preserve">Europe</w:t>
-      </w:r>
-      <w:r>
-        <w:t xml:space="preserve">.</w:t>
-      </w:r>
-      <w:r>
-        <w:t xml:space="preserve"> </w:t>
-      </w:r>
-      <w:r>
-        <w:rPr>
-          <w:i/>
-          <w:iCs/>
-        </w:rPr>
-        <w:t xml:space="preserve">American Antiquity</w:t>
-      </w:r>
-      <w:r>
-        <w:t xml:space="preserve"> </w:t>
-      </w:r>
-      <w:r>
-        <w:t xml:space="preserve">66(4):577–593.</w:t>
+    <w:bookmarkStart w:id="224" w:name="ref-smith_1990"/>
+    <w:p>
+      <w:pPr>
+        <w:pStyle w:val="Bibliography"/>
+      </w:pPr>
+      <w:r>
+        <w:t xml:space="preserve">Smith, Gerald P. 1990. The</w:t>
+      </w:r>
+      <w:r>
+        <w:t xml:space="preserve"> </w:t>
+      </w:r>
+      <w:r>
+        <w:t xml:space="preserve">Walls</w:t>
+      </w:r>
+      <w:r>
+        <w:t xml:space="preserve"> </w:t>
+      </w:r>
+      <w:r>
+        <w:t xml:space="preserve">Phase and Its Neighbors. In</w:t>
+      </w:r>
+      <w:r>
+        <w:t xml:space="preserve"> </w:t>
+      </w:r>
+      <w:r>
+        <w:rPr>
+          <w:i/>
+          <w:iCs/>
+        </w:rPr>
+        <w:t xml:space="preserve">Towns and Temples Along the</w:t>
+      </w:r>
+      <w:r>
+        <w:rPr>
+          <w:i/>
+          <w:iCs/>
+        </w:rPr>
+        <w:t xml:space="preserve"> </w:t>
+      </w:r>
+      <w:r>
+        <w:rPr>
+          <w:i/>
+          <w:iCs/>
+        </w:rPr>
+        <w:t xml:space="preserve">Mississippi</w:t>
+      </w:r>
+      <w:r>
+        <w:t xml:space="preserve">, edited by David H. Dye and Cheryl Anne Cox, pp. 135–169. University of Alabama Press, Tuscaloosa.</w:t>
       </w:r>
     </w:p>
     <w:bookmarkEnd w:id="224"/>
-    <w:bookmarkStart w:id="225" w:name="ref-smith_1990"/>
-    <w:p>
-      <w:pPr>
-        <w:pStyle w:val="Bibliography"/>
-      </w:pPr>
-      <w:r>
-        <w:t xml:space="preserve">Smith, Gerald P. 1990. The</w:t>
-      </w:r>
-      <w:r>
-        <w:t xml:space="preserve"> </w:t>
-      </w:r>
-      <w:r>
-        <w:t xml:space="preserve">Walls</w:t>
-      </w:r>
-      <w:r>
-        <w:t xml:space="preserve"> </w:t>
-      </w:r>
-      <w:r>
-        <w:t xml:space="preserve">Phase and Its Neighbors. In</w:t>
-      </w:r>
-      <w:r>
-        <w:t xml:space="preserve"> </w:t>
-      </w:r>
-      <w:r>
-        <w:rPr>
-          <w:i/>
-          <w:iCs/>
-        </w:rPr>
-        <w:t xml:space="preserve">Towns and Temples Along the</w:t>
+    <w:bookmarkStart w:id="225" w:name="ref-smith_neiman_2007"/>
+    <w:p>
+      <w:pPr>
+        <w:pStyle w:val="Bibliography"/>
+      </w:pPr>
+      <w:r>
+        <w:t xml:space="preserve">Smith, Karen Y., and Fraser D. Neiman. 2007. Frequency Seriation, Correspondence Analysis, and Woodland-Period Ceramic Assemblage Variation in the Deep South.</w:t>
+      </w:r>
+      <w:r>
+        <w:t xml:space="preserve"> </w:t>
+      </w:r>
+      <w:r>
+        <w:rPr>
+          <w:i/>
+          <w:iCs/>
+        </w:rPr>
+        <w:t xml:space="preserve">Southeastern Archaeology</w:t>
+      </w:r>
+      <w:r>
+        <w:t xml:space="preserve"> </w:t>
+      </w:r>
+      <w:r>
+        <w:t xml:space="preserve">26(1):47–72.</w:t>
+      </w:r>
+    </w:p>
+    <w:bookmarkEnd w:id="225"/>
+    <w:bookmarkStart w:id="226" w:name="ref-starr_1984"/>
+    <w:p>
+      <w:pPr>
+        <w:pStyle w:val="Bibliography"/>
+      </w:pPr>
+      <w:r>
+        <w:t xml:space="preserve">Starr, Mary Evelyn. 1984. Parchman Phase in the Northwestern</w:t>
+      </w:r>
+      <w:r>
+        <w:t xml:space="preserve"> </w:t>
+      </w:r>
+      <w:r>
+        <w:t xml:space="preserve">Yazoo</w:t>
+      </w:r>
+      <w:r>
+        <w:t xml:space="preserve"> </w:t>
+      </w:r>
+      <w:r>
+        <w:t xml:space="preserve">Basin. In</w:t>
+      </w:r>
+      <w:r>
+        <w:t xml:space="preserve"> </w:t>
+      </w:r>
+      <w:r>
+        <w:rPr>
+          <w:i/>
+          <w:iCs/>
+        </w:rPr>
+        <w:t xml:space="preserve">The</w:t>
+      </w:r>
+      <w:r>
+        <w:rPr>
+          <w:i/>
+          <w:iCs/>
+        </w:rPr>
+        <w:t xml:space="preserve"> </w:t>
+      </w:r>
+      <w:r>
+        <w:rPr>
+          <w:i/>
+          <w:iCs/>
+        </w:rPr>
+        <w:t xml:space="preserve">Wilsford</w:t>
+      </w:r>
+      <w:r>
+        <w:rPr>
+          <w:i/>
+          <w:iCs/>
+        </w:rPr>
+        <w:t xml:space="preserve"> </w:t>
+      </w:r>
+      <w:r>
+        <w:rPr>
+          <w:i/>
+          <w:iCs/>
+        </w:rPr>
+        <w:t xml:space="preserve">Site (22-Co-516)</w:t>
+      </w:r>
+      <w:r>
+        <w:rPr>
+          <w:i/>
+          <w:iCs/>
+        </w:rPr>
+        <w:t xml:space="preserve"> </w:t>
+      </w:r>
+      <w:r>
+        <w:rPr>
+          <w:i/>
+          <w:iCs/>
+        </w:rPr>
+        <w:t xml:space="preserve">Coahoma</w:t>
+      </w:r>
+      <w:r>
+        <w:rPr>
+          <w:i/>
+          <w:iCs/>
+        </w:rPr>
+        <w:t xml:space="preserve"> </w:t>
+      </w:r>
+      <w:r>
+        <w:rPr>
+          <w:i/>
+          <w:iCs/>
+        </w:rPr>
+        <w:t xml:space="preserve">County,</w:t>
       </w:r>
       <w:r>
         <w:rPr>
@@ -7635,219 +7761,88 @@
         <w:t xml:space="preserve">Mississippi</w:t>
       </w:r>
       <w:r>
-        <w:t xml:space="preserve">, edited by David H. Dye and Cheryl Anne Cox, pp. 135–169. University of Alabama Press, Tuscaloosa.</w:t>
-      </w:r>
-    </w:p>
-    <w:bookmarkEnd w:id="225"/>
-    <w:bookmarkStart w:id="226" w:name="ref-smith_neiman_2007"/>
-    <w:p>
-      <w:pPr>
-        <w:pStyle w:val="Bibliography"/>
-      </w:pPr>
-      <w:r>
-        <w:t xml:space="preserve">Smith, Karen Y., and Fraser D. Neiman. 2007. Frequency Seriation, Correspondence Analysis, and Woodland-Period Ceramic Assemblage Variation in the Deep South.</w:t>
-      </w:r>
-      <w:r>
-        <w:t xml:space="preserve"> </w:t>
-      </w:r>
-      <w:r>
-        <w:rPr>
-          <w:i/>
-          <w:iCs/>
-        </w:rPr>
-        <w:t xml:space="preserve">Southeastern Archaeology</w:t>
-      </w:r>
-      <w:r>
-        <w:t xml:space="preserve"> </w:t>
-      </w:r>
-      <w:r>
-        <w:t xml:space="preserve">26(1):47–72.</w:t>
+        <w:rPr>
+          <w:i/>
+          <w:iCs/>
+        </w:rPr>
+        <w:t xml:space="preserve">: A Late</w:t>
+      </w:r>
+      <w:r>
+        <w:rPr>
+          <w:i/>
+          <w:iCs/>
+        </w:rPr>
+        <w:t xml:space="preserve"> </w:t>
+      </w:r>
+      <w:r>
+        <w:rPr>
+          <w:i/>
+          <w:iCs/>
+        </w:rPr>
+        <w:t xml:space="preserve">Mississippi</w:t>
+      </w:r>
+      <w:r>
+        <w:rPr>
+          <w:i/>
+          <w:iCs/>
+        </w:rPr>
+        <w:t xml:space="preserve"> </w:t>
+      </w:r>
+      <w:r>
+        <w:rPr>
+          <w:i/>
+          <w:iCs/>
+        </w:rPr>
+        <w:t xml:space="preserve">Period Settlement in the Northern</w:t>
+      </w:r>
+      <w:r>
+        <w:rPr>
+          <w:i/>
+          <w:iCs/>
+        </w:rPr>
+        <w:t xml:space="preserve"> </w:t>
+      </w:r>
+      <w:r>
+        <w:rPr>
+          <w:i/>
+          <w:iCs/>
+        </w:rPr>
+        <w:t xml:space="preserve">Yazoo</w:t>
+      </w:r>
+      <w:r>
+        <w:rPr>
+          <w:i/>
+          <w:iCs/>
+        </w:rPr>
+        <w:t xml:space="preserve"> </w:t>
+      </w:r>
+      <w:r>
+        <w:rPr>
+          <w:i/>
+          <w:iCs/>
+        </w:rPr>
+        <w:t xml:space="preserve">of</w:t>
+      </w:r>
+      <w:r>
+        <w:rPr>
+          <w:i/>
+          <w:iCs/>
+        </w:rPr>
+        <w:t xml:space="preserve"> </w:t>
+      </w:r>
+      <w:r>
+        <w:rPr>
+          <w:i/>
+          <w:iCs/>
+        </w:rPr>
+        <w:t xml:space="preserve">Mississippi</w:t>
+      </w:r>
+      <w:r>
+        <w:t xml:space="preserve">, edited by John M. Connaway, pp. 163–222. Archaeological Report No. 14. Mississippi Department of Archives; History, Jackson, MS.</w:t>
       </w:r>
     </w:p>
     <w:bookmarkEnd w:id="226"/>
-    <w:bookmarkStart w:id="227" w:name="ref-starr_1984"/>
-    <w:p>
-      <w:pPr>
-        <w:pStyle w:val="Bibliography"/>
-      </w:pPr>
-      <w:r>
-        <w:t xml:space="preserve">Starr, Mary Evelyn. 1984. Parchman Phase in the Northwestern</w:t>
-      </w:r>
-      <w:r>
-        <w:t xml:space="preserve"> </w:t>
-      </w:r>
-      <w:r>
-        <w:t xml:space="preserve">Yazoo</w:t>
-      </w:r>
-      <w:r>
-        <w:t xml:space="preserve"> </w:t>
-      </w:r>
-      <w:r>
-        <w:t xml:space="preserve">Basin. In</w:t>
-      </w:r>
-      <w:r>
-        <w:t xml:space="preserve"> </w:t>
-      </w:r>
-      <w:r>
-        <w:rPr>
-          <w:i/>
-          <w:iCs/>
-        </w:rPr>
-        <w:t xml:space="preserve">The</w:t>
-      </w:r>
-      <w:r>
-        <w:rPr>
-          <w:i/>
-          <w:iCs/>
-        </w:rPr>
-        <w:t xml:space="preserve"> </w:t>
-      </w:r>
-      <w:r>
-        <w:rPr>
-          <w:i/>
-          <w:iCs/>
-        </w:rPr>
-        <w:t xml:space="preserve">Wilsford</w:t>
-      </w:r>
-      <w:r>
-        <w:rPr>
-          <w:i/>
-          <w:iCs/>
-        </w:rPr>
-        <w:t xml:space="preserve"> </w:t>
-      </w:r>
-      <w:r>
-        <w:rPr>
-          <w:i/>
-          <w:iCs/>
-        </w:rPr>
-        <w:t xml:space="preserve">Site (22-Co-516)</w:t>
-      </w:r>
-      <w:r>
-        <w:rPr>
-          <w:i/>
-          <w:iCs/>
-        </w:rPr>
-        <w:t xml:space="preserve"> </w:t>
-      </w:r>
-      <w:r>
-        <w:rPr>
-          <w:i/>
-          <w:iCs/>
-        </w:rPr>
-        <w:t xml:space="preserve">Coahoma</w:t>
-      </w:r>
-      <w:r>
-        <w:rPr>
-          <w:i/>
-          <w:iCs/>
-        </w:rPr>
-        <w:t xml:space="preserve"> </w:t>
-      </w:r>
-      <w:r>
-        <w:rPr>
-          <w:i/>
-          <w:iCs/>
-        </w:rPr>
-        <w:t xml:space="preserve">County,</w:t>
-      </w:r>
-      <w:r>
-        <w:rPr>
-          <w:i/>
-          <w:iCs/>
-        </w:rPr>
-        <w:t xml:space="preserve"> </w:t>
-      </w:r>
-      <w:r>
-        <w:rPr>
-          <w:i/>
-          <w:iCs/>
-        </w:rPr>
-        <w:t xml:space="preserve">Mississippi</w:t>
-      </w:r>
-      <w:r>
-        <w:rPr>
-          <w:i/>
-          <w:iCs/>
-        </w:rPr>
-        <w:t xml:space="preserve">: A Late</w:t>
-      </w:r>
-      <w:r>
-        <w:rPr>
-          <w:i/>
-          <w:iCs/>
-        </w:rPr>
-        <w:t xml:space="preserve"> </w:t>
-      </w:r>
-      <w:r>
-        <w:rPr>
-          <w:i/>
-          <w:iCs/>
-        </w:rPr>
-        <w:t xml:space="preserve">Mississippi</w:t>
-      </w:r>
-      <w:r>
-        <w:rPr>
-          <w:i/>
-          <w:iCs/>
-        </w:rPr>
-        <w:t xml:space="preserve"> </w:t>
-      </w:r>
-      <w:r>
-        <w:rPr>
-          <w:i/>
-          <w:iCs/>
-        </w:rPr>
-        <w:t xml:space="preserve">Period Settlement in the Northern</w:t>
-      </w:r>
-      <w:r>
-        <w:rPr>
-          <w:i/>
-          <w:iCs/>
-        </w:rPr>
-        <w:t xml:space="preserve"> </w:t>
-      </w:r>
-      <w:r>
-        <w:rPr>
-          <w:i/>
-          <w:iCs/>
-        </w:rPr>
-        <w:t xml:space="preserve">Yazoo</w:t>
-      </w:r>
-      <w:r>
-        <w:rPr>
-          <w:i/>
-          <w:iCs/>
-        </w:rPr>
-        <w:t xml:space="preserve"> </w:t>
-      </w:r>
-      <w:r>
-        <w:rPr>
-          <w:i/>
-          <w:iCs/>
-        </w:rPr>
-        <w:t xml:space="preserve">of</w:t>
-      </w:r>
-      <w:r>
-        <w:rPr>
-          <w:i/>
-          <w:iCs/>
-        </w:rPr>
-        <w:t xml:space="preserve"> </w:t>
-      </w:r>
-      <w:r>
-        <w:rPr>
-          <w:i/>
-          <w:iCs/>
-        </w:rPr>
-        <w:t xml:space="preserve">Mississippi</w:t>
-      </w:r>
-      <w:r>
-        <w:t xml:space="preserve">, edited by John M. Connaway, pp. 163–222. Archaeological Report No. 14. Mississippi Department of Archives; History, Jackson, MS.</w:t>
-      </w:r>
-    </w:p>
-    <w:bookmarkEnd w:id="227"/>
-    <w:bookmarkStart w:id="229" w:name="ref-stern_1994"/>
+    <w:bookmarkStart w:id="228" w:name="ref-stern_1994"/>
     <w:p>
       <w:pPr>
         <w:pStyle w:val="Bibliography"/>
@@ -7874,7 +7869,7 @@
       <w:r>
         <w:t xml:space="preserve"> </w:t>
       </w:r>
-      <w:hyperlink r:id="rId228">
+      <w:hyperlink r:id="rId227">
         <w:r>
           <w:rPr>
             <w:rStyle w:val="Hyperlink"/>
@@ -7886,8 +7881,8 @@
         <w:t xml:space="preserve">.</w:t>
       </w:r>
     </w:p>
-    <w:bookmarkEnd w:id="229"/>
-    <w:bookmarkStart w:id="231" w:name="ref-sullivan_2024"/>
+    <w:bookmarkEnd w:id="228"/>
+    <w:bookmarkStart w:id="230" w:name="ref-sullivan_2024"/>
     <w:p>
       <w:pPr>
         <w:pStyle w:val="Bibliography"/>
@@ -7938,7 +7933,7 @@
       <w:r>
         <w:t xml:space="preserve"> </w:t>
       </w:r>
-      <w:hyperlink r:id="rId230">
+      <w:hyperlink r:id="rId229">
         <w:r>
           <w:rPr>
             <w:rStyle w:val="Hyperlink"/>
@@ -7950,34 +7945,34 @@
         <w:t xml:space="preserve">.</w:t>
       </w:r>
     </w:p>
+    <w:bookmarkEnd w:id="230"/>
+    <w:bookmarkStart w:id="231" w:name="ref-tomasovych_kidwell_2009"/>
+    <w:p>
+      <w:pPr>
+        <w:pStyle w:val="Bibliography"/>
+      </w:pPr>
+      <w:r>
+        <w:t xml:space="preserve">Tomašových, Adam, and Susan M. Kidwell. 2009. Fidelity of Variation in Species Composition and Diversity Partitioning by Death Assemblages: Time-Averaging Transfers Diversity from Beta to Alpha Levels.</w:t>
+      </w:r>
+      <w:r>
+        <w:t xml:space="preserve"> </w:t>
+      </w:r>
+      <w:r>
+        <w:rPr>
+          <w:i/>
+          <w:iCs/>
+        </w:rPr>
+        <w:t xml:space="preserve">Paleobiology</w:t>
+      </w:r>
+      <w:r>
+        <w:t xml:space="preserve"> </w:t>
+      </w:r>
+      <w:r>
+        <w:t xml:space="preserve">35(1):94–118.</w:t>
+      </w:r>
+    </w:p>
     <w:bookmarkEnd w:id="231"/>
-    <w:bookmarkStart w:id="232" w:name="ref-tomasovych_kidwell_2009"/>
-    <w:p>
-      <w:pPr>
-        <w:pStyle w:val="Bibliography"/>
-      </w:pPr>
-      <w:r>
-        <w:t xml:space="preserve">Tomašových, Adam, and Susan M. Kidwell. 2009. Fidelity of Variation in Species Composition and Diversity Partitioning by Death Assemblages: Time-Averaging Transfers Diversity from Beta to Alpha Levels.</w:t>
-      </w:r>
-      <w:r>
-        <w:t xml:space="preserve"> </w:t>
-      </w:r>
-      <w:r>
-        <w:rPr>
-          <w:i/>
-          <w:iCs/>
-        </w:rPr>
-        <w:t xml:space="preserve">Paleobiology</w:t>
-      </w:r>
-      <w:r>
-        <w:t xml:space="preserve"> </w:t>
-      </w:r>
-      <w:r>
-        <w:t xml:space="preserve">35(1):94–118.</w:t>
-      </w:r>
-    </w:p>
-    <w:bookmarkEnd w:id="232"/>
-    <w:bookmarkStart w:id="234" w:name="ref-tomasovych_kidwell_2010"/>
+    <w:bookmarkStart w:id="233" w:name="ref-tomasovych_kidwell_2010"/>
     <w:p>
       <w:pPr>
         <w:pStyle w:val="Bibliography"/>
@@ -8004,7 +7999,7 @@
       <w:r>
         <w:t xml:space="preserve"> </w:t>
       </w:r>
-      <w:hyperlink r:id="rId233">
+      <w:hyperlink r:id="rId232">
         <w:r>
           <w:rPr>
             <w:rStyle w:val="Hyperlink"/>
@@ -8016,78 +8011,78 @@
         <w:t xml:space="preserve">.</w:t>
       </w:r>
     </w:p>
+    <w:bookmarkEnd w:id="233"/>
+    <w:bookmarkStart w:id="234" w:name="ref-willey_phillips_1958"/>
+    <w:p>
+      <w:pPr>
+        <w:pStyle w:val="Bibliography"/>
+      </w:pPr>
+      <w:r>
+        <w:t xml:space="preserve">Willey, Gordon R., and Philip Phillips. 1958.</w:t>
+      </w:r>
+      <w:r>
+        <w:t xml:space="preserve"> </w:t>
+      </w:r>
+      <w:r>
+        <w:rPr>
+          <w:i/>
+          <w:iCs/>
+        </w:rPr>
+        <w:t xml:space="preserve">Method and Theory in American Archaeology</w:t>
+      </w:r>
+      <w:r>
+        <w:t xml:space="preserve">. University of Chicago Press, Chicago.</w:t>
+      </w:r>
+    </w:p>
     <w:bookmarkEnd w:id="234"/>
-    <w:bookmarkStart w:id="235" w:name="ref-willey_phillips_1958"/>
-    <w:p>
-      <w:pPr>
-        <w:pStyle w:val="Bibliography"/>
-      </w:pPr>
-      <w:r>
-        <w:t xml:space="preserve">Willey, Gordon R., and Philip Phillips. 1958.</w:t>
-      </w:r>
-      <w:r>
-        <w:t xml:space="preserve"> </w:t>
-      </w:r>
-      <w:r>
-        <w:rPr>
-          <w:i/>
-          <w:iCs/>
-        </w:rPr>
-        <w:t xml:space="preserve">Method and Theory in American Archaeology</w:t>
-      </w:r>
-      <w:r>
-        <w:t xml:space="preserve">. University of Chicago Press, Chicago.</w:t>
+    <w:bookmarkStart w:id="235" w:name="ref-williams_1954"/>
+    <w:p>
+      <w:pPr>
+        <w:pStyle w:val="Bibliography"/>
+      </w:pPr>
+      <w:r>
+        <w:t xml:space="preserve">Williams, Stephen. 1954. An Archeological Study of the Mississippian Culture in Southeast Missouri. PhD thesis, Yale University, New Haven.</w:t>
       </w:r>
     </w:p>
     <w:bookmarkEnd w:id="235"/>
-    <w:bookmarkStart w:id="236" w:name="ref-williams_1954"/>
-    <w:p>
-      <w:pPr>
-        <w:pStyle w:val="Bibliography"/>
-      </w:pPr>
-      <w:r>
-        <w:t xml:space="preserve">Williams, Stephen. 1954. An Archeological Study of the Mississippian Culture in Southeast Missouri. PhD thesis, Yale University, New Haven.</w:t>
+    <w:bookmarkStart w:id="236" w:name="ref-williams_1990"/>
+    <w:p>
+      <w:pPr>
+        <w:pStyle w:val="Bibliography"/>
+      </w:pPr>
+      <w:r>
+        <w:t xml:space="preserve">Williams, Stephen. 1990. The Vacant Quarter and Other Late Events in the Lower Valley. In</w:t>
+      </w:r>
+      <w:r>
+        <w:t xml:space="preserve"> </w:t>
+      </w:r>
+      <w:r>
+        <w:rPr>
+          <w:i/>
+          <w:iCs/>
+        </w:rPr>
+        <w:t xml:space="preserve">Towns and Temples Along the</w:t>
+      </w:r>
+      <w:r>
+        <w:rPr>
+          <w:i/>
+          <w:iCs/>
+        </w:rPr>
+        <w:t xml:space="preserve"> </w:t>
+      </w:r>
+      <w:r>
+        <w:rPr>
+          <w:i/>
+          <w:iCs/>
+        </w:rPr>
+        <w:t xml:space="preserve">Mississippi</w:t>
+      </w:r>
+      <w:r>
+        <w:t xml:space="preserve">, edited by David H. Dye and Cheryl Anne Cox, pp. 170–180. University of Alabama Press, Tuscaloosa.</w:t>
       </w:r>
     </w:p>
     <w:bookmarkEnd w:id="236"/>
-    <w:bookmarkStart w:id="237" w:name="ref-williams_1990"/>
-    <w:p>
-      <w:pPr>
-        <w:pStyle w:val="Bibliography"/>
-      </w:pPr>
-      <w:r>
-        <w:t xml:space="preserve">Williams, Stephen. 1990. The Vacant Quarter and Other Late Events in the Lower Valley. In</w:t>
-      </w:r>
-      <w:r>
-        <w:t xml:space="preserve"> </w:t>
-      </w:r>
-      <w:r>
-        <w:rPr>
-          <w:i/>
-          <w:iCs/>
-        </w:rPr>
-        <w:t xml:space="preserve">Towns and Temples Along the</w:t>
-      </w:r>
-      <w:r>
-        <w:rPr>
-          <w:i/>
-          <w:iCs/>
-        </w:rPr>
-        <w:t xml:space="preserve"> </w:t>
-      </w:r>
-      <w:r>
-        <w:rPr>
-          <w:i/>
-          <w:iCs/>
-        </w:rPr>
-        <w:t xml:space="preserve">Mississippi</w:t>
-      </w:r>
-      <w:r>
-        <w:t xml:space="preserve">, edited by David H. Dye and Cheryl Anne Cox, pp. 170–180. University of Alabama Press, Tuscaloosa.</w:t>
-      </w:r>
-    </w:p>
-    <w:bookmarkEnd w:id="237"/>
-    <w:bookmarkStart w:id="239" w:name="ref-wright_1943"/>
+    <w:bookmarkStart w:id="238" w:name="ref-wright_1943"/>
     <w:p>
       <w:pPr>
         <w:pStyle w:val="Bibliography"/>
@@ -8114,7 +8109,7 @@
       <w:r>
         <w:t xml:space="preserve"> </w:t>
       </w:r>
-      <w:hyperlink r:id="rId238">
+      <w:hyperlink r:id="rId237">
         <w:r>
           <w:rPr>
             <w:rStyle w:val="Hyperlink"/>
@@ -8126,8 +8121,8 @@
         <w:t xml:space="preserve">.</w:t>
       </w:r>
     </w:p>
-    <w:bookmarkEnd w:id="239"/>
-    <w:bookmarkStart w:id="241" w:name="ref-wright_1951"/>
+    <w:bookmarkEnd w:id="238"/>
+    <w:bookmarkStart w:id="240" w:name="ref-wright_1951"/>
     <w:p>
       <w:pPr>
         <w:pStyle w:val="Bibliography"/>
@@ -8154,7 +8149,7 @@
       <w:r>
         <w:t xml:space="preserve"> </w:t>
       </w:r>
-      <w:hyperlink r:id="rId240">
+      <w:hyperlink r:id="rId239">
         <w:r>
           <w:rPr>
             <w:rStyle w:val="Hyperlink"/>
@@ -8166,8 +8161,8 @@
         <w:t xml:space="preserve">.</w:t>
       </w:r>
     </w:p>
-    <w:bookmarkEnd w:id="241"/>
-    <w:bookmarkStart w:id="243" w:name="ref-youngblood_miton_morin_2023"/>
+    <w:bookmarkEnd w:id="240"/>
+    <w:bookmarkStart w:id="242" w:name="ref-youngblood_miton_morin_2023"/>
     <w:p>
       <w:pPr>
         <w:pStyle w:val="Bibliography"/>
@@ -8194,7 +8189,7 @@
       <w:r>
         <w:t xml:space="preserve"> </w:t>
       </w:r>
-      <w:hyperlink r:id="rId242">
+      <w:hyperlink r:id="rId241">
         <w:r>
           <w:rPr>
             <w:rStyle w:val="Hyperlink"/>
@@ -8206,10 +8201,10 @@
         <w:t xml:space="preserve">.</w:t>
       </w:r>
     </w:p>
+    <w:bookmarkEnd w:id="242"/>
     <w:bookmarkEnd w:id="243"/>
     <w:bookmarkEnd w:id="244"/>
     <w:bookmarkEnd w:id="245"/>
-    <w:bookmarkEnd w:id="246"/>
     <w:sectPr>
       <w:footnotePr>
         <w:numRestart w:val="eachSect"/>

</xml_diff>

<commit_message>
Sync main text: reduce redundancy, sharpen Methods/Discussion
Four-simulations overview rewrite, limits-paragraph trim, removal of the
duplicate tribute argument from the Introduction, and cut of the redundant
non-ceramic-convergence paragraph (qualifications folded into the Discussion).
Rebuild docx/pdf.
</commit_message>
<xml_diff>
--- a/docs/manuscript/MAIN_TEXT.docx
+++ b/docs/manuscript/MAIN_TEXT.docx
@@ -191,15 +191,6 @@
       </w:r>
       <w:r>
         <w:t xml:space="preserve">(Peebles and Kus 1977)</w:t>
-      </w:r>
-      <w:r>
-        <w:t xml:space="preserve">. This chiefdom is inferred to have drawn tribute from the smaller villages around it, an argument based on its position on agriculturally poor soil, which required surrounding communities to provide it with provisions</w:t>
-      </w:r>
-      <w:r>
-        <w:t xml:space="preserve"> </w:t>
-      </w:r>
-      <w:r>
-        <w:t xml:space="preserve">(Phyllis A. Morse 1990)</w:t>
       </w:r>
       <w:r>
         <w:t xml:space="preserve">. That interpretation is a specific claim about social structure in which the Parkin phase is treated as a bounded, hierarchically organized society with Parkin at its apex.</w:t>
@@ -2003,7 +1994,7 @@
         <w:t xml:space="preserve">(Brainerd 1951; Robinson 1951)</w:t>
       </w:r>
       <w:r>
-        <w:t xml:space="preserve">, a standard index ranging from 0 to 200 that quantifies how similar two assemblages are in their class proportions. We tested its association with inter-site distance using a Mantel</w:t>
+        <w:t xml:space="preserve">, a standard index ranging from 0 to 200 that quantifies how similar their class proportions are. We tested its association with inter-site distance using a Mantel</w:t>
       </w:r>
       <w:r>
         <w:t xml:space="preserve"> </w:t>
@@ -2053,7 +2044,7 @@
         <w:pStyle w:val="FirstParagraph"/>
       </w:pPr>
       <w:r>
-        <w:t xml:space="preserve">The argument uses four simulations, each answering a different question. An idealized validation tests whether the four signatures, in principle, separate a bounded interaction group from its three mimics on large, clean synthetic assemblages (Figure S4). A record-matched recovery test assesses which signatures can detect a known, injected closure at the real record’s sample sizes and time-averaging (Figure 4). A positive control test that generates neutral spatial drift or bounded groups reproduces the structure observed in the basin (Figure S5). A forward demonstration runs neutral drift on the real site geography with no boundary imposed, counts how many phase-like groups it produces, and checks whether the named phases exceed that number (Figures 8 and 9). The first two establish what the test can resolve on a record of this size; the second two identify which process the data match. We describe the validation and recovery here and the two drift simulations in the next subsection.</w:t>
+        <w:t xml:space="preserve">We ran four simulations, each answering a different question. The first is an idealized validation: it asks whether the four signatures can, in principle, separate a bounded interaction group from its three mimics, using large, clean synthetic assemblages (Figure S4). The second is a record-matched recovery. It asks which of those signatures can still detect a known, injected closure once the synthetic assemblages are held to the real record’s sample sizes and time-averaging (Figure 4). The third is a positive control. It asks which generative process, neutral spatial drift or bounded groups, reproduces the structure actually observed in the basin (Figure S5). The fourth is a forward demonstration. It runs neutral drift on the real site geography with no boundary imposed, counts how many phase-like groups it produces, and checks whether the named phases exceed that number (Figures 8 and 9). The first two simulations establish what the test can resolve on a record of this size. The second two simulations identify which process the data match. We describe the validation and recovery here, and the two drift simulations in the next subsection.</w:t>
       </w:r>
     </w:p>
     <w:p>
@@ -2061,7 +2052,7 @@
         <w:pStyle w:val="BodyText"/>
       </w:pPr>
       <w:r>
-        <w:t xml:space="preserve">We validated the test in two stages. The first establishes the principle. A generative model copies decorated variants under neutral transmission, the random-copying process in which learners reproduce variants in proportion to their current frequency</w:t>
+        <w:t xml:space="preserve">We validated our tests in two stages. The first establishes our generative model. This is a model of transmission of decorated variants under neutral transmission. The model assumes a random-copying process in which learners reproduce variants in proportion to their current frequency</w:t>
       </w:r>
       <w:r>
         <w:t xml:space="preserve"> </w:t>
@@ -2070,7 +2061,7 @@
         <w:t xml:space="preserve">(Bentley et al. 2004; Neiman 1995)</w:t>
       </w:r>
       <w:r>
-        <w:t xml:space="preserve">, with three tunable controls: the between-group divergence of class profiles, the strength of within-group conformity, and a spatial rule placing group profiles on the landscape. Four generators instantiate the four idealized processes of Table 1, the bounded group and its three mimics</w:t>
+        <w:t xml:space="preserve">. The model has three tunable controls: the between-group divergence of class profiles, the strength of within-group conformity, and a spatial rule placing group profiles on the landscape. Four generators instantiate the four idealized processes of Table 1, the bounded group and its three mimics</w:t>
       </w:r>
       <w:r>
         <w:t xml:space="preserve"> </w:t>
@@ -2079,7 +2070,7 @@
         <w:t xml:space="preserve">(Mesoudi 2021)</w:t>
       </w:r>
       <w:r>
-        <w:t xml:space="preserve">. Run blind through the four-signature procedure across twenty random seeds, only a bounded interaction group drives all four signatures together, and the signatures are tightly correlated under closure yet nearly independent under the mimics, so their joint movement is informative rather than an artifact of redundancy (Supplemental Text, Figure S4). That test uses large, clean assemblages, and it shows what the test can do in principle, not what it can do on a record like ours.</w:t>
+        <w:t xml:space="preserve">. We then ran the simulation blind through the four-signature procedure across twenty random seeds. Only a bounded interaction group drives all four signatures together, and the signatures are tightly correlated under closure yet nearly independent under the mimics, so their joint movement is informative rather than an artifact of redundancy (Supplemental Text, Figure S4). That test uses large, clean assemblages, and it shows what the test can do in principle, not what it can do on a record like ours.</w:t>
       </w:r>
     </w:p>
     <w:p>
@@ -2087,7 +2078,7 @@
         <w:pStyle w:val="BodyText"/>
       </w:pPr>
       <w:r>
-        <w:t xml:space="preserve">The recovery test is generative: we built synthetic pottery records in which we controlled whether group structure was emerging, dialed from none to strong, and then asked whether our four measures could see it. The synthetic records were matched to the real ones: the same number of assemblages, the same range of sample sizes, and the same time-averaging imposed by surface assemblages</w:t>
+        <w:t xml:space="preserve">Our recovery test involved building synthetic pottery records in which we controlled whether group structure was emerging, dialed from none to strong, and then examining whether our four measures could see it. The synthetic records were matched to the real ones. We create sets consisting of the same number of assemblages, the same range of sample sizes, and the same time-averaging imposed by surface assemblages</w:t>
       </w:r>
       <w:r>
         <w:t xml:space="preserve"> </w:t>
@@ -2096,7 +2087,33 @@
         <w:t xml:space="preserve">(Madsen 2012; Miller-Atkins and Premo 2018; Premo 2014)</w:t>
       </w:r>
       <w:r>
-        <w:t xml:space="preserve">. If chiefdom structure had really been emerging at Parkin, this experiment would tell us whether methods like ours, applied to data like ours, would have caught it. Concretely, we generated synthetic assemblages, one per real assemblage, at the real per-assemblage sample sizes, spatial clusters, and ordinal bins. Into them we injected a known group-closure signal of tunable strength s, with between-group divergence and within-group conformity rising together along the sequence to a maximum of s. We then asked which signatures recover it, a record-matched recovery design in the spirit of simulation-based inference calibrated to the data at hand</w:t>
+        <w:t xml:space="preserve">. If chiefdom structure had really been emerging at Parkin, this experiment would tell us whether methods like ours, applied to data like ours, would have caught it. Concretely, we generated synthetic assemblages, one per real assemblage, at the real per-assemblage sample sizes, spatial clusters, and ordinal bins. Into them, we injected a known group-closure signal of tunable strength</w:t>
+      </w:r>
+      <w:r>
+        <w:t xml:space="preserve"> </w:t>
+      </w:r>
+      <w:r>
+        <w:rPr>
+          <w:i/>
+          <w:iCs/>
+        </w:rPr>
+        <w:t xml:space="preserve">s</w:t>
+      </w:r>
+      <w:r>
+        <w:t xml:space="preserve">, with between-group divergence and within-group conformity rising together along the sequence to a maximum of</w:t>
+      </w:r>
+      <w:r>
+        <w:t xml:space="preserve"> </w:t>
+      </w:r>
+      <w:r>
+        <w:rPr>
+          <w:i/>
+          <w:iCs/>
+        </w:rPr>
+        <w:t xml:space="preserve">s</w:t>
+      </w:r>
+      <w:r>
+        <w:t xml:space="preserve">. We then asked which signatures recover it, a record-matched recovery design in the spirit of simulation-based inference calibrated to the data at hand</w:t>
       </w:r>
       <w:r>
         <w:t xml:space="preserve"> </w:t>
@@ -2105,7 +2122,7 @@
         <w:t xml:space="preserve">(Crema et al. 2014; Kandler and Shennan 2015)</w:t>
       </w:r>
       <w:r>
-        <w:t xml:space="preserve">. Two properties of the record make this necessary. Assemblage sample size trends with seriation position (Spearman rho = +0.59), and several signatures are size-sensitive so that a size-dependent estimator can rise or fall along the axis through sampling alone. We therefore subsample every assemblage, synthetic and real, to a common count before scoring, thereby removing the confound. And the record is time-averaged, which we reproduce by blending adjacent-bin production within a window. The recovery experiment then asks, at the resolution and sample sizes this record preserves, which signatures can be trusted and how strong a closure would have to be to register. One aspect of the calibration matters here. Because subsampling the larger, later assemblages to a common count slightly inflates within-cluster diversity and so depresses F_ST toward later positions, the null with no closure (pure drift) itself carries a mild negative trend rather than a flat zero. The test is calibrated against that null distribution, not against zero, so the false-positive rate is held at five percent regardless, and the empirical value is compared against the same null.</w:t>
+        <w:t xml:space="preserve">. Two properties of the record make this necessary. First, assemblage sample size trends with seriation position (Spearman’s rho = +0.59), and several signatures are size-sensitive, so a size-dependent estimator can rise or fall along the axis through sampling alone. Therefore, we subsample every assemblage, synthetic and real, to a common count before scoring, thereby removing the confound. Second, the record is time-averaged, which we reproduce by blending adjacent-bin production within a window. The recovery experiment then asks, at the resolution and sample sizes this record preserves, which signatures can be trusted and how strong a closure would have to be to register. One aspect of the calibration matters here. Because subsampling the larger, later assemblages to a common count slightly inflates within-cluster diversity and so depresses F_ST toward later positions, the null with no closure (pure drift) itself carries a mild negative trend rather than a flat zero. The test is calibrated against that null distribution, not against zero, so the false-positive rate is held at five percent regardless, and the empirical value is compared against the same null.</w:t>
       </w:r>
     </w:p>
     <w:bookmarkEnd w:id="28"/>
@@ -2132,7 +2149,7 @@
         <w:t xml:space="preserve">(2021)</w:t>
       </w:r>
       <w:r>
-        <w:t xml:space="preserve">. Each assemblage is a node holding a finite population of learners that copies decorated-class variants from within the node and, at a low rate, from other nodes with a probability that decays with geographic distance. Innovation enters at a fixed rate, and deposition is pooled over a trailing window to reproduce the record’s time-averaging. The bounded-groups model is identical except that interaction is concentrated within a small number of spatially contiguous groups, with only a low leak of copying between them, so that learning is restricted within boundaries. Both are run on the observed coordinate layout and subsampled to the observed per-assemblage sherd totals. Both are scored by the same four signatures, along with network modularity, a measure of how strongly the assemblages divide into separate clusters, and the distance decay of similarity. We swept the drift model’s interaction range, between-node mixing rate, and innovation rate, and report the full sweep (Supplemental Text) rather than a single setting. To extend the test to the wider valley, we added the southeast-Missouri survey assemblages of Williams</w:t>
+        <w:t xml:space="preserve">. Each assemblage is a node holding a finite population of learners that copies decorated-class variants from within the node and, at a low rate, from other nodes with a probability that decays with geographic distance. Innovation enters at a fixed rate, and deposition is pooled over a trailing window to reproduce the record’s time-averaging. The bounded-groups model is identical except that interaction is concentrated within a small number of spatially contiguous groups, with only a low leak of copying between them, so that learning is restricted within boundaries. Both are run on the observed coordinate layout and subsampled to the observed per-assemblage sherd totals. Both are scored by the same four signatures, along with network modularity, a measure of how strongly the assemblages divide into separate clusters, and the distance decay of similarity. We swept the drift model’s interaction range, between-node mixing rate, and innovation rate, and report the full sweep (see the Supplemental Text) rather than a single setting. To extend the test to the wider valley, we added the southeast-Missouri survey assemblages of Williams</w:t>
       </w:r>
       <w:r>
         <w:t xml:space="preserve"> </w:t>
@@ -2141,7 +2158,7 @@
         <w:t xml:space="preserve">(1954)</w:t>
       </w:r>
       <w:r>
-        <w:t xml:space="preserve">, digitized from the survey tables. We georeferenced both the Phillips-Ford-Griffin and the Williams assemblages using their Lower Mississippi Survey grid designations against the digitized survey point files, so that the two regions share a single coordinate frame. Decorated classes were harmonized between the two typologies, both rooted in the Phillips-Ford-Griffin framework, into a common vocabulary, and the between-region comparison was run both on all decorated classes and on the classes shared by the two typologies (Supplemental Text).</w:t>
+        <w:t xml:space="preserve">. We georeferenced both the Phillips-Ford-Griffin and the Williams assemblages using their Lower Mississippi Valley Survey grid designations against the digitized survey point files, so that the two regions share a single coordinate frame. Decorated classes were harmonized between the two classifications, both rooted in the Phillips-Ford-Griffin framework, into a common vocabulary. We ran the between-region comparison on all decorated classes and on the classes shared by the two classifications (see the Supplemental Text).</w:t>
       </w:r>
     </w:p>
     <w:p>
@@ -2149,7 +2166,7 @@
         <w:pStyle w:val="BodyText"/>
       </w:pPr>
       <w:r>
-        <w:t xml:space="preserve">The same neutral-drift model is also run forward to produce the phase-like groups of Figures 8 and 9. We run it forward in time on the real site geography with no boundary imposed, so any structure in the output comes from geography and time alone. Each site holds a finite population of learners. In each generation, a learner copies the decorated class of another learner, drawn from its own site with high probability and, at a low rate, from another site with a probability that decays with along-river distance. At a low rate, the learner instead adopts a newly invented class, so the repertoire turns over through time, and the assemblages can be seriated. Because the assemblages are not contemporaneous, we sample the simulated field time-transgressively. Each synthetic assemblage is drawn at the time-slice that matches its position on the seriation axis, accumulated over a trailing window to reproduce the record’s time-averaging, then subsampled to the observed sherd count. We detect groups in the results using modularity on the Brainerd-Robinson similarity graph, following the same procedure applied to the real assemblages. Because the group labels differ between runs, we summarize Parkin’s group as a probability: across 500 runs, the fraction of runs in which each assemblage falls into the same drift-detected group as Parkin. We report the number of groups, the between-group cultural F_ST, and the co-membership against the named phases, with the full parameter grid in the Supplemental Text.</w:t>
+        <w:t xml:space="preserve">The same neutral-drift model is also run forward to produce the phase-like groups seen in Figures 8 and 9. We run it forward in time on the real site geography with no boundary imposed, so any structure in the output comes from geography and time alone. Each site holds a finite population of learners. In each generation, a learner copies the decorated class of another learner, drawn from its own site with high probability and, at a low rate, from another site with a probability that decays with along-river distance. At a low rate, the learner instead adopts a newly invented class, so the repertoire turns over through time, and the assemblages can be seriated. Because the assemblages are not contemporaneous, we sample the simulated field time-transgressively. Each synthetic assemblage is drawn at the time-slice that matches its position on the seriation axis, accumulated over a trailing window to reproduce the record’s time-averaging, then subsampled to the observed sherd count. We detect groups in the results using modularity on the Brainerd-Robinson similarity graph, following the same procedure applied to the real assemblages. Because the group labels differ between runs, we summarize Parkin’s group as a probability derived from 500 runs. This probability consists of the fraction of runs in which each assemblage falls into the same drift-detected group as Parkin. We report the number of groups, the between-group cultural F_ST, and the co-membership against the named phases, with the full parameter grid in the Supplemental Text.</w:t>
       </w:r>
     </w:p>
     <w:bookmarkEnd w:id="29"/>
@@ -2167,7 +2184,7 @@
         <w:pStyle w:val="FirstParagraph"/>
       </w:pPr>
       <w:r>
-        <w:t xml:space="preserve">The transmission test stands on its own, but a polity, or any closure of interaction into bounded groups, should also leave non-ceramic traces. We assembled three further lines against which to check it: one genuinely independent of the ceramic data (the lithic exchange economy), one that shares its collection substrate (settlement organization), and one that re-examines the same assemblages by a different method (an independent ordination). We assessed settlement organization using the rank-size distribution of mound area within the basin and the distribution of mound height, asking whether a single center dominates as a redistributive apex, the classic archaeological correlate of a ranked society, or whether size is graded</w:t>
+        <w:t xml:space="preserve">The transmission test stands on its own, but a polity, or any closure of interaction into bounded groups, should also leave non-ceramic traces. We assembled three further lines against which to check it. One genuinely independent of the ceramic data (the lithic exchange economy), one that shares its collection substrate (settlement organization), and one that re-examines the same assemblages by a different method (an independent ordination). We assessed settlement organization using the rank-size distribution of mound area within the basin and the distribution of mound height, asking whether a single center dominates as a redistributive apex, the classic archaeological correlate of a ranked society, or whether size is graded</w:t>
       </w:r>
       <w:r>
         <w:t xml:space="preserve"> </w:t>
@@ -2188,7 +2205,7 @@
         <w:t xml:space="preserve"> </w:t>
       </w:r>
       <w:r>
-        <w:t xml:space="preserve">regional analysis of the production and distribution of Mill Creek and Dover chert hoes, the capacity-linked industrial goods whose control would mark economic centralization, rather than measuring it ourselves. And we compared our seriation result to Mainfort’s</w:t>
+        <w:t xml:space="preserve">regional analysis of the production and distribution of Mill Creek and Dover chert hoes, the capacity-linked industrial goods whose control would mark economic centralization, rather than measuring it ourselves. We also compared our seriation result to Mainfort’s</w:t>
       </w:r>
       <w:r>
         <w:t xml:space="preserve"> </w:t>
@@ -2219,7 +2236,23 @@
         <w:pStyle w:val="FirstParagraph"/>
       </w:pPr>
       <w:r>
-        <w:t xml:space="preserve">The four signatures distinguish bounded groups from drift in principle, but at this record’s resolution, only one of them registers the difference. The idealized validation behaves as designed. When interaction is made to close into bounded groups, all four signatures move together, while drift and the other mimics each move only a characteristic subset. The four are tightly correlated under closure (mean absolute pairwise correlation 0.88) yet nearly independent under the mimics (0.19 to 0.29), so their joint movement is informative rather than redundant (Figure S4). The record-matched recovery is the more informative of the two (Figure 4). When a known group-closure signal is injected at the real configuration and scored after size control, only cultural F_ST tracks it monotonically, climbing from the null toward a strong positive trend as the injected strength rises. The injected strength s ranges from 0 (pure drift) to 1 (strongly bounded, sharply bounded groups). The neutral departure is non-monotonic in conformity, the spatial boundary is unresponsive at the three spatial clusters the data support, and seriation coherence responds only weakly. With the false-positive rate held at five percent, F_ST recovers a closure of strength s greater than or equal to 0.5 with power above 0.8, the threshold rising to 0.7 under the record’s time-averaging. The other three signatures are not reliable discriminators at this resolution, and we treat them as weak corroboration only. At this record size and with time-averaging, the one signature that can distinguish a bounded group from drift is between-group variance.</w:t>
+        <w:t xml:space="preserve">The four signatures distinguish bounded groups from drift in principle, but at the resolution of the LMV’s record, only one of them registers the difference. The idealized validation behaves as designed. When interaction is made among closed, bounded groups, all four signatures move together, while drift and the other mimics each move only a characteristic subset. The four are tightly correlated under closure (mean absolute pairwise correlation 0.88) yet nearly independent under the mimics (0.19 to 0.29), so their joint movement is informative rather than redundant (Figure S4). The record-matched recovery is the more informative (Figure 4). When a known group-closure signal is injected at the real configuration and scored after size control, only cultural F_ST tracks it monotonically, climbing from the null toward a strong positive trend as the injected strength rises. The injected strength s ranges from 0 (pure drift) to 1 (strongly bounded, sharply bounded groups). The neutral departure is non-monotonic in conformity, the spatial boundary is unresponsive at the three spatial clusters the data support, and seriation coherence responds only weakly. With the false-positive rate held at five percent, F_ST recovers a closure of strength</w:t>
+      </w:r>
+      <w:r>
+        <w:t xml:space="preserve"> </w:t>
+      </w:r>
+      <w:r>
+        <w:rPr>
+          <w:i/>
+          <w:iCs/>
+        </w:rPr>
+        <w:t xml:space="preserve">s</w:t>
+      </w:r>
+      <w:r>
+        <w:t xml:space="preserve"> </w:t>
+      </w:r>
+      <w:r>
+        <w:t xml:space="preserve">greater than or equal to 0.5 with power above 0.8, the threshold rising to 0.7 under the record’s time-averaging. The other three signatures are not reliable discriminators at this resolution, and we treat them as weak corroboration only. Thus, at this record size and with time-averaging, the one signature that can distinguish a bounded group from drift is between-group variance.</w:t>
       </w:r>
     </w:p>
     <w:p>
@@ -2292,7 +2325,7 @@
         <w:pStyle w:val="BodyText"/>
       </w:pPr>
       <w:r>
-        <w:t xml:space="preserve">Applied to the St. Francis basin, that one reliable signature shows no closure into bounded groups, and the apparent signals in the others are confounded by sample size (Figure 5). The raw trajectory along the seriation axis seems to dissociate. Two of its trends, however, are sampling artifacts: because assemblage size trends with seriation position, the size-sensitive estimators move with it. Once all assemblages are trimmed to a common sherd count via subsampling, cultural F_ST falls from a raw value of +0.60 to +0.01. Its uncertainty range runs from no closure to a moderate signal, so it is uninformative rather than a resolved positive. The neutrality departure is likewise size-sensitive (its raw -0.94 only weakens to -0.83 under size control). The recovery shows that it does not track closure in either direction here, so it, too, cannot be interpreted as a transmission signal. On the recovery curve, the size-controlled empirical F_ST corresponds to a nominal injected strength of about 0.35, below the resolution limit. The record, therefore, shows no detectable closure of moderate or greater strength. The negative is informative for a closure of moderate or greater strength, which would have registered and is absent. It cannot exclude a weaker closure that, given a record of this size and time-averaging, is underpowered to resolve. The positive control reported next shows that the structure actually present is what neutral drift produces. The result is therefore not only that no bounded group is detectable, but that the structure present is what continuous, spatially structured interaction would produce.</w:t>
+        <w:t xml:space="preserve">Applied to the assemblages of the St. Francis basin, that one reliable signature shows no closure into bounded groups, and the apparent signals in the others are confounded by sample size (Figure 5). The raw trajectory along the seriation axis seems to dissociate. Two of its trends, however, are sampling artifacts. Because assemblage size trends with seriation position, the size-sensitive estimators move with it. Once all assemblages are trimmed to a common sherd count via subsampling, cultural F_ST falls from +0.60 to +0.01. Its uncertainty range runs from no closure to a moderate signal, so it is uninformative rather than a resolved positive. The neutrality departure is likewise size-sensitive (i.e., its raw -0.94 only weakens to -0.83 under size control). The recovery test shows that it does not track closure in either direction here, so it, too, cannot be interpreted as a transmission signal. On the recovery curve, the size-controlled empirical F_ST corresponds to a nominal injected strength of about 0.35, below the resolution limit. The record, therefore, shows no detectable closure of moderate or greater strength. The negative is informative for a closure of moderate or greater strength, which would have registered and is absent. It cannot exclude a weaker closure that, given a record of this size and time-averaging, is underpowered to resolve. The next positive control shows that the structure actually present is the one produced by neutral drift. The result is, therefore, not only that no bounded group is detectable, but that the structure present is what continuous, spatially structured interaction would produce.</w:t>
       </w:r>
     </w:p>
     <w:p>
@@ -2365,7 +2398,7 @@
         <w:pStyle w:val="BodyText"/>
       </w:pPr>
       <w:r>
-        <w:t xml:space="preserve">Three further checks, all pointing the same way, add detail. The first follows each decorated class’s rise and fall through the sequence and asks whether the changes resemble the undirected fluctuation of unbiased copying or the directed change a deliberate marker would exhibit. Seven of the nine testable classes are consistent with unbiased drift (the frequency increment test)</w:t>
+        <w:t xml:space="preserve">Three further checks, all pointing the same way, add detail. The first follows each decorated class’s rise and fall through the sequence and asks whether the changes resemble the undirected fluctuation of unbiased copying or the directed change a deliberate marker would exhibit. Seven of the nine testable classes are consistent with unbiased drift (i.e, the frequency increment test)</w:t>
       </w:r>
       <w:r>
         <w:t xml:space="preserve"> </w:t>
@@ -2392,7 +2425,7 @@
         <w:t xml:space="preserve">(Neiman 1995)</w:t>
       </w:r>
       <w:r>
-        <w:t xml:space="preserve">. The verdict that no bounded-group closure is detectable also holds across the analyst’s choices: across twenty-seven combinations of the basin’s spatial cutoff, the number of ordinal bins, and the number of spatial clusters, no closure appears in any of them, and it holds equally under the watershed and corridor basin definitions. Consistent with the recovery experiment, none of these checks shows a resolvable departure from neutral transmission, and we treat them as corroboration of the size-controlled F_ST result rather than as independent signals.</w:t>
+        <w:t xml:space="preserve">. The verdict that no bounded-group closure is detectable also holds across the analyst’s choices. Across twenty-seven combinations of the basin’s spatial cutoff, the number of ordinal bins, and the number of spatial clusters, no closure appears in any of them, and it holds equally under the watershed and corridor basin definitions. Consistent with the recovery experiment, none of these checks shows a resolvable departure from neutral transmission, and we treat them as corroboration of the size-controlled F_ST result rather than as independent signals.</w:t>
       </w:r>
     </w:p>
     <w:p>
@@ -2409,19 +2442,7 @@
         <w:t xml:space="preserve">(2021)</w:t>
       </w:r>
       <w:r>
-        <w:t xml:space="preserve">, we simulated neutral copying on the actual coordinate layout of the basin assemblages, with interaction decaying over distance and the record’s time-averaging imposed. We compared it against a bounded-groups process on the same geography. By sweeping the interaction range, the between-node mixing rate, and the innovation rate, neutral drift reproduces the observed distance decay, network modularity, cultural F_ST, and distance-controlled boundary excess. The region of parameter space that brackets all four at once is a sub-basin interaction range of about 24 km with low between-node mixing. We report the full sweep rather than a single tuned point: at shorter ranges, drift overproduces distance decay, and at higher mixing, it underproduces the structure, so the all-four match holds only in a plausible but specific corner of the space (Supplemental Text). The bounded-groups process, by contrast, overshoots the three structural signatures by roughly two to seven times across its range, predicting far sharper community structure than the data carry. The basin’s decorated-ceramic structure is therefore reproducible by neutral spatial drift under plausible parameters. It does not require bounded groups, which would have left a sharper mark than is present (Figure S5). The control also bounds the spatial signature itself. A positive distance-controlled boundary excess, which we introduced to separate a sharp social boundary from smooth isolation by distance, is reproduced by stochastic neutral drift on a finite network, so on its own it does not certify a boundary. The same conclusion is reached for the phase construct from outside the transmission framework. Fox’s</w:t>
-      </w:r>
-      <w:r>
-        <w:t xml:space="preserve"> </w:t>
-      </w:r>
-      <w:r>
-        <w:t xml:space="preserve">(1998)</w:t>
-      </w:r>
-      <w:r>
-        <w:t xml:space="preserve"> </w:t>
-      </w:r>
-      <w:r>
-        <w:t xml:space="preserve">cluster analysis and ordination of the southeast-Missouri assemblages that define the regional phases found them failing as both groups and classes, with assemblages assigned to statistical clusters at random rather than segregating by phase.</w:t>
+        <w:t xml:space="preserve">, we simulated neutral copying on the actual coordinate layout of the basin assemblages, with interaction decaying over distance and the record’s time-averaging imposed. We compared it against a bounded-groups process on the same geography. By sweeping the interaction range, the between-node mixing rate, and the innovation rate, neutral drift reproduces the observed distance decay, network modularity, cultural F_ST, and distance-controlled boundary excess. The region of parameter space that brackets all four at once is a sub-basin interaction range of about 24 km with low between-node mixing. We report the full sweep rather than a single tuned point. At shorter ranges, drift overproduces distance decay, and at higher mixing, it underproduces the structure, so the all-four match holds only in a plausible but specific corner of the space (see the Supplemental Text). The bounded-groups process, by contrast, overshoots the three structural signatures by roughly two to seven times across its range, predicting far sharper community structure than the data demonstrate. The basin’s decorated ceramic structure is, therefore, entirely reproducible by neutral spatial drift under plausible parameters. This result explains the illusion of phases as units. The observed pattern does not require bounded groups, which would have left a sharper mark than is present (Figure S5). The control also bounds the spatial signature itself. A positive distance-controlled boundary excess, which we introduced to separate a sharp social boundary from smooth isolation by distance, is reproduced by stochastic neutral drift on a finite network, so on its own it does not certify a boundary. The same conclusion is reached for the phase construct from outside the transmission framework.</w:t>
       </w:r>
     </w:p>
     <w:p>
@@ -2429,7 +2450,7 @@
         <w:pStyle w:val="BodyText"/>
       </w:pPr>
       <w:r>
-        <w:t xml:space="preserve">What it means for assemblages to be co-seriable is central to this signature, and the deterministic method is stricter than the seriations most archaeologists have in mind. In conventional practice, an analyst can almost always arrange a set of assemblages into an order in which class frequencies more or less rise and fall, treating the places where a class breaks that pattern as noise to be tolerated by eye. Deterministic frequency seriation removes that tolerance. It accepts an ordering only when every decorated class is at once unimodal, rising to a single peak and then falling away, and continuous, changing without an abrupt jump. It treats any break in a class’s rise and fall as disqualifying that ordering unless the break is small enough to be explained by sampling error in the counts</w:t>
+        <w:t xml:space="preserve">The role Parkin plays in the transmission landscape is worth investigating through seriation analysis. What it means for assemblages to be co-seriable is central to this signature, and the deterministic method is stricter than the seriations most archaeologists have in mind. In conventional practice, an analyst can almost always arrange a set of assemblages into an order in which class frequencies more or less rise and fall, treating the places where a class breaks that pattern as noise to be tolerated by eye. Deterministic frequency seriation removes that tolerance. It accepts an ordering only when every decorated class is at once unimodal, rising to a single peak and then falling away, and continuous, changing without an abrupt jump. It treats any break in a class’s rise and fall as disqualifying that ordering unless the break is small enough to be explained by sampling error in the counts</w:t>
       </w:r>
       <w:r>
         <w:t xml:space="preserve"> </w:t>
@@ -2455,7 +2476,7 @@
         <w:pStyle w:val="BodyText"/>
       </w:pPr>
       <w:r>
-        <w:t xml:space="preserve">Parkin is a seriation bridge, not the anchor of a bounded community. Deterministic seriation of the basin assemblages returns a deeply fragmented, bridge-dominated structure rather than a single coherent ordering. At a continuity threshold of 0.1, it yields 35 maximal co-seriable groups with a maximum size of four, and 17 of the 29 assemblages belong to more than one group (Figure 6). The absolute counts scale with the threshold, but the fragmented, overlapping topology is stable across thresholds. Parkin is one of these bridge assemblages, a member of four groups and ranked eighth of 29, positioned across orderings rather than at the center of one. The empirical pattern is the one Lipo, Madsen, and Dunnell</w:t>
+        <w:t xml:space="preserve">Based on the analyses, Parkin is a seriation bridge rather than the anchor of a bounded community. Deterministic seriation of the basin assemblages returns a deeply fragmented, bridge-dominated structure rather than a single coherent ordering. At a continuity threshold of 0.1, it yields 35 maximal co-seriable groups with a maximum size of four, and 17 of the 29 assemblages belong to more than one group (Figure 6). The absolute counts scale with the threshold, but the fragmented, overlapping topology is stable across thresholds. Parkin is one of these bridge assemblages, a member of four groups and ranked eighth of 29, positioned across orderings rather than at the center of one. The empirical pattern is the one Lipo, Madsen, and Dunnell</w:t>
       </w:r>
       <w:r>
         <w:t xml:space="preserve"> </w:t>
@@ -2467,7 +2488,7 @@
         <w:t xml:space="preserve"> </w:t>
       </w:r>
       <w:r>
-        <w:t xml:space="preserve">reported, with Parkin at the intersection of multiple non-co-seriable orderings rather than at the center of a single closed interaction community. They interpreted that bridging position as a possible sign of incipient hierarchy. We interpret it differently: a site that bridges several orderings is a hub of interaction, not the seat of a bounded group.</w:t>
+        <w:t xml:space="preserve">reported, with Parkin at the intersection of multiple non-co-seriable orderings rather than at the center of a single closed interaction community. They interpreted that bridging position as a possible sign of incipient hierarchy. Based on these analyses, we interpret it as a site that bridges several orderings and serves as a hub of interaction, rather than the seat of a bounded group.</w:t>
       </w:r>
     </w:p>
     <w:p>
@@ -2540,16 +2561,7 @@
         <w:pStyle w:val="BodyText"/>
       </w:pPr>
       <w:r>
-        <w:t xml:space="preserve">Settlement does single Parkin out, but on the comparable evidence, its prominence sits within a graded distribution rather than standing apart as a redistributive apex. Parkin has the basin’s tallest platform mound, at 23 feet, ranking first among the 55 basin sites with a recorded mound height (Figure 7). The distribution is graded, however, with no gap separating Parkin from the next centers, the tallest-to-second ratio being 1.0. The regional database under-records the moated, multi-mound type-site, coding its mound area and defensive ditch as zero</w:t>
-      </w:r>
-      <w:r>
-        <w:t xml:space="preserve"> </w:t>
-      </w:r>
-      <w:r>
-        <w:t xml:space="preserve">(Mitchem 2001; Phyllis A. Morse 1990)</w:t>
-      </w:r>
-      <w:r>
-        <w:t xml:space="preserve">, so we base the settlement comparison on recorded mound height rather than on mound area. Parkin’s roughly 17-acre site area would make it the largest center in the basin. That figure, however, is the total site area rather than the basal mound area on which the other sites are measured, so we treat it as indicative only. The settlement record thus shows a prominent center within a graded size distribution, not an administrative tier set above the rest</w:t>
+        <w:t xml:space="preserve">Settlement does single Parkin out, but on the comparable evidence, its prominence sits within a graded distribution rather than standing apart as a redistributive apex. Parkin has the basin’s tallest platform mound, at 23 feet, ranking first among the 55 basin sites with a recorded mound height (Figure 7). The distribution is graded, however, with no gap separating Parkin from the next centers, the tallest-to-second ratio being 1.0. The settlement record thus shows a prominent center within a graded size distribution, not an administrative tier set above the rest</w:t>
       </w:r>
       <w:r>
         <w:t xml:space="preserve"> </w:t>
@@ -2626,32 +2638,6 @@
         <w:t xml:space="preserve">Settlement cross-check. Main panel: within-basin ranking of maximum mound height, the recorded, like-for-like field (Parkin’s mound area is under-coded as zero and is not used). Parkin has the tallest mound (23 ft, rank 1 of 55). The height distribution for the mounds is graded, with no gap separating it from the next centers (tallest-to-second ratio 1.0), indicating that Parkin is a prominent center rather than a redistributive apex. Inset: the proportion of sites with a mound, a defensive ditch, and St-Francis-type fortification across the basin set (n = 92).</w:t>
       </w:r>
     </w:p>
-    <w:p>
-      <w:pPr>
-        <w:pStyle w:val="BodyText"/>
-      </w:pPr>
-      <w:r>
-        <w:t xml:space="preserve">The non-ceramic evidence converges on the same conclusion. Mound size within the basin is graded rather than redistributive, and Parkin’s dominance is one of scale rather than of an administrative tier set apart from the rest. The production and exchange of Mill Creek and Dover chert hoes, the capacity-linked tools whose control would mark an economic hierarchy, was decentralized at the regional scale, with distribution following a down-the-line gradient rather than redistribution from a central place</w:t>
-      </w:r>
-      <w:r>
-        <w:t xml:space="preserve"> </w:t>
-      </w:r>
-      <w:r>
-        <w:t xml:space="preserve">(Cobb 2000)</w:t>
-      </w:r>
-      <w:r>
-        <w:t xml:space="preserve">. This is a regional pattern in which the St. Francis basin participates rather than a basin-internal measurement, so we treat it as consistent with, not independent proof of, the absence of economic centralization at Parkin. A separate nonmetric ordination of overlapping late-period assemblages finds that the named phases form a gradational continuum rather than discrete, bounded clusters, the cross-method counterpart of our seriation fragmentation</w:t>
-      </w:r>
-      <w:r>
-        <w:t xml:space="preserve"> </w:t>
-      </w:r>
-      <w:r>
-        <w:t xml:space="preserve">(Mainfort 2003)</w:t>
-      </w:r>
-      <w:r>
-        <w:t xml:space="preserve">. These lines point in the same direction. Two of them, the settlement organization and the lithic exchange, are independent of the ceramic data, while the ordination shares that substrate and corroborates the seriation result by a different method rather than independently.</w:t>
-      </w:r>
-    </w:p>
     <w:bookmarkEnd w:id="44"/>
     <w:bookmarkStart w:id="57" w:name="discussion"/>
     <w:p>
@@ -2667,7 +2653,7 @@
         <w:pStyle w:val="FirstParagraph"/>
       </w:pPr>
       <w:r>
-        <w:t xml:space="preserve">The three lines of evidence converge on a single conclusion: the Parkin phase is not a bounded interaction group, and Parkin is not the capital of a polity. Within the St. Francis basin, Parkin is the largest and most monumentally elaborated center. Yet, its decorated-ceramic record shows no closure of interaction into bounded groups, and the structure present is reproduced by neutral drift across the basin’s geography. In contrast, a bounded-groups process would have left a far sharper mark. The settlement and exchange records say the same: mound size is graded rather than redistributive, and the production of capacity-linked chert hoes was decentralized, with their exchange following a down-the-line gradient rather than central redistribution</w:t>
+        <w:t xml:space="preserve">The three lines of evidence converge on a single conclusion. The Parkin phase is not a bounded interaction group, and Parkin is not the capital of a polity. Within the St. Francis basin, Parkin is the largest and most monumentally elaborated center. Yet, its decorated-ceramic record shows no closure of interaction into bounded groups, and the structure present is reproduced by neutral drift across the basin’s geography. In contrast, a bounded-groups process would have left a far sharper mark. The settlement and exchange records say the same: neither the graded mound distribution nor the decentralized chert-hoe economy shows the centralization a polity requires</w:t>
       </w:r>
       <w:r>
         <w:t xml:space="preserve"> </w:t>
@@ -2676,6 +2662,15 @@
         <w:t xml:space="preserve">(Cobb 2000)</w:t>
       </w:r>
       <w:r>
+        <w:t xml:space="preserve">. The exchange evidence is regional rather than basin-internal, so we read it as consistent with, not proof of, decentralization at Parkin. Of these corroborating lines, settlement and exchange are independent of the ceramic data, while Mainfort’s ordination corroborates the seriation result on the same assemblages by a different method</w:t>
+      </w:r>
+      <w:r>
+        <w:t xml:space="preserve"> </w:t>
+      </w:r>
+      <w:r>
+        <w:t xml:space="preserve">(Mainfort 2003)</w:t>
+      </w:r>
+      <w:r>
         <w:t xml:space="preserve">. We are explicit about the scope of the ceramic claim. The transmission analysis bears on whether interaction closes into bounded, like-with-like groups, not on group-level fitness differences or a new unit of selection</w:t>
       </w:r>
       <w:r>
@@ -2732,7 +2727,7 @@
         <w:t xml:space="preserve">(Lipo et al. 2021)</w:t>
       </w:r>
       <w:r>
-        <w:t xml:space="preserve">. Across the 55 decorated assemblages of the wider lower Mississippi Valley, the model repeatedly produces a few spatially coherent, phase-like groups (Figure 8). The deposits are not contemporaneous, which is why they can be seriated at all and why some carry more of the late classes than others, so each synthetic assemblage is drawn time-transgressively at the run-time that matches its seriation position. Holding time fixed to isolate the spatial signal, drift yields two to five groups whose number grows with geographic extent; restoring the staggered deposition ages collapses the count toward two time-defined groups, because assemblages caught at different points in the sequence carry different repertoires. Either way, the number of drift-generated groups falls well short of the seven named phases the regional scheme draws across the same assemblages. The between-group cultural F_ST of those groups settles at the observed level rather than the higher value a bounded group would leave. The named phases, therefore, subdivide the valley more finely than the transmission structure supports. Where culture history draws seven bounded societies, drift on the geography yields at most a handful of coherent groupings, so most of the phase boundaries mark divisions that a continuous interaction field does not carry. Whether any single named phase exceeds this drift expectation is a question we can now pose one phase at a time. That spatial and population structure, not population size, governs how drift partitions diversity in finite structured populations is established in both the cultural-transmission and population-genetics literatures</w:t>
+        <w:t xml:space="preserve">. Across the 55 decorated assemblages of the wider lower Mississippi Valley, the model repeatedly produces a few spatially coherent, phase-like groups (Figure 8). The deposits are not contemporaneous, which is why they can be seriated at all and why some carry more of the late classes than others, so each synthetic assemblage is drawn time-transgressively at the run-time that matches its seriation position. Holding time fixed to isolate the spatial signal, drift yields two to five groups, the number of which increases with geographic extent. Restoring the staggered deposition ages collapses the count into two time-defined groups because assemblages sampled at different points in the sequence carry different repertoires. Either way, the number of drift-generated groups falls well short of the seven named phases the regional scheme draws across the same assemblages. The between-group cultural F_ST of those groups settles at the observed level rather than the higher value a bounded group would leave. The named phases, therefore, subdivide the valley more finely than the transmission structure supports. Where culture history draws seven bounded societies, drift on the geography yields at most a handful of coherent groupings, so most of the phase boundaries mark divisions that a continuous interaction field does not carry. Whether any single named phase exceeds this drift expectation is a question we can now pose one phase at a time. That spatial and population structure, not population size, governs how drift partitions diversity in finite structured populations is established in both the cultural-transmission and population-genetics literatures</w:t>
       </w:r>
       <w:r>
         <w:t xml:space="preserve"> </w:t>
@@ -2759,7 +2754,7 @@
         <w:t xml:space="preserve">(Derex et al. 2018; Derex and Boyd 2016; Saxer et al. 2009)</w:t>
       </w:r>
       <w:r>
-        <w:t xml:space="preserve">. The result is not contingent on a tuned parameter set. Across 432 runs spanning a grid of interaction length, between-node mixing, and innovation rate, two or more spatially coherent groups appear in every run, and the between-group F_ST sits at or below the observed value in 85 percent of them. The St. Francis basin that anchors this paper behaves the same way as a positive control (Figures S7 and S8).</w:t>
+        <w:t xml:space="preserve">. The result is not contingent on a tuned parameter set. Across hundreds of runs that spanned a grid of interaction length, between-node mixing, and innovation rate, two or more spatially coherent groups appear in every run, and the between-group F_ST sits at or below the observed value in 85 percent of them. The St. Francis basin that anchors this paper behaves the same way as a positive control (Figures S7 and S8).</w:t>
       </w:r>
     </w:p>
     <w:p>
@@ -2767,7 +2762,7 @@
         <w:pStyle w:val="BodyText"/>
       </w:pPr>
       <w:r>
-        <w:t xml:space="preserve">The same model lets the named phases be tested one at a time, in the culture historian’s own terms. Taking Parkin as the focal case, membership in its group is a probability rather than a fact: across the 500 runs, each assemblage shares Parkin’s drift-detected group some fraction of the time, a graded field that falls off smoothly with river distance from Parkin rather than the bounded set a phase map implies (Figure 9A). The Parkin-phase assemblages do separate from the others by this measure. That separation is what drift predicts, because they lie near Parkin and so co-occur with it more than distant assemblages do (Figure 9B). The discriminating test is whether the between-group cultural F_ST across the Parkin-versus-others partition exceeds the drift null. It sits at the extreme upper tail of the null and survives most single-site deletions. The contrast is nonetheless small: the null’s own tail reaches past it, and time-averaging, which deflates between-group variance, is not modeled in the null (Figure 9C, 9D). It is therefore at most a weak hint of structure beyond drift, not a demonstrated social boundary. Geography and time account entirely for the pattern, and the apparent groups are products of a single neutral process.</w:t>
+        <w:t xml:space="preserve">The same model lets the named phases be tested one at a time, in the culture historian’s own terms. Taking Parkin as the focal case, membership in its group is a probability rather than a fact. Across the 500 runs, each assemblage shares Parkin’s drift-detected group some fraction of the time, a graded field that falls off smoothly with river distance from Parkin rather than the bounded set a phase map implies (Figure 9A). The Parkin-phase assemblages do separate from the others by this measure. That separation is what drift predicts, because they lie near Parkin and so co-occur with it more than distant assemblages do (Figure 9B). The discriminating test is whether the between-group cultural F_ST across the Parkin-versus-others partition exceeds the drift null. It sits at the extreme upper tail of the null and survives most single-site deletions. The contrast is nonetheless small. The null’s own tail reaches past it, and time-averaging, which deflates between-group variance, is not modeled in the null (Figure 9C, 9D). It is therefore at most a weak hint of structure beyond drift, not a demonstrated social boundary. Geography and time account entirely for the pattern, and the apparent groups are products of a single neutral process.</w:t>
       </w:r>
     </w:p>
     <w:p>
@@ -2932,7 +2927,7 @@
         <w:t xml:space="preserve">(Ross-Stallings 2017)</w:t>
       </w:r>
       <w:r>
-        <w:t xml:space="preserve">. The contrast is real but thin: the satellite sample numbers fourteen individuals, the result is presented as tentative, and a health difference between two sites does not require an extractive hierarchy to produce it. Neither argument supplies the regional, structural signature that the drift-versus-groups comparison looks for and does not find.</w:t>
+        <w:t xml:space="preserve">. The contrast is real but thin. The satellite sample numbers fourteen individuals, and health differences between the two sites do not require an extractive hierarchy to produce it. Neither argument supplies the regional, structural signature that the drift-versus-groups comparison looks for and does not find.</w:t>
       </w:r>
     </w:p>
     <w:p>
@@ -2940,7 +2935,7 @@
         <w:pStyle w:val="BodyText"/>
       </w:pPr>
       <w:r>
-        <w:t xml:space="preserve">Three limits bound the result, and the recovery experiment forces the most important of them to the front. At this record’s resolution, the discrimination between a bounded group and drift rests on a single signature, cultural F_ST. That signature is confounded by a sample-size trend along the seriation axis (Spearman rho = +0.59). We removed the confound by subsampling every assemblage to a common count, which collapses the raw F_ST trend from +0.60 to +0.01. We calibrated the test on synthetic data matched to the record, in which F_ST recovers a moderate-strength closure (s of about 0.5, rising to 0.7 once the record’s time-averaging is imposed), while maintaining a false-positive rate of 5%. The size-controlled empirical F_ST is uninformative, its bootstrap interval spanning no closure to a moderate signal. The negative is therefore informative for a closure of moderate or greater strength, which would have registered as a resolved positive, but does not. It cannot exclude a weaker closure than a record of 29 time-averaged assemblages, which is underpowered to resolve. We state the claim at that bound rather than beyond it. The other three signatures do not track closure reliably here. The neutral departure fails because it is non-monotonic in conformity and sensitive to sample size. The spatial boundary fails because the data support too few spatial clusters, and seriation coherence responds only weakly. We report them as corroboration rather than as independent confirmations. This reduction is a property of the record. When a known closure signal is injected instead through a within-group conformity pathway or a non-spatially-organized social-fragmentation pathway, neither the neutral nor the seriation signature recovers it either, so the three weak signatures fail at this resolution regardless of how closure is produced (Supplemental Text). The price is that the negative bounds are only closure expressed as between-group divergence. The closure carried purely by conformity, or by social structure not aligned with the spatial clusters, would lie below detection in this record at any strength. The second limit is the ordinal chronology. The basin radiocarbon corpus pools to five seriation anchors across a calibration plateau, so the axis is a relative order oriented toward later time at Spearman +0.70, imperfectly. The discriminating quantity, the size-controlled F_ST trend, is a magnitude that does not depend on the axis orientation. The settlement and exchange lines do not depend on the ceramic chronology at all. The third limit is time-averaging, which damps between-assemblage variation and reduces apparent turnover</w:t>
+        <w:t xml:space="preserve">Three limits bound the result. The first is resolution. As the recovery experiment showed (Figure 4), on a record of this size the discrimination reduces to a single confound-controlled signature, cultural F_ST, and its size-controlled empirical value is uninformative. The negative is therefore informative for a closure of moderate or greater strength, which would have registered, but cannot exclude a weaker one. It is also bounded in form. The recovery succeeds only for closure expressed as between-group divergence, so a closure carried purely by within-group conformity, or by social structure not aligned with the spatial clusters, would lie below detection here at any strength (Supplemental Text). The second limit is the ordinal chronology. The basin radiocarbon corpus pools to five seriation anchors across a calibration plateau, so the axis is a relative order oriented toward later time rather than a calendar rate. This matters less than it might, because the discriminating quantity, the size-controlled F_ST trend, is a magnitude that does not depend on the axis orientation, and the settlement and exchange lines do not depend on the ceramic chronology at all. The third limit is time-averaging, which damps between-assemblage variation and reduces apparent turnover</w:t>
       </w:r>
       <w:r>
         <w:t xml:space="preserve"> </w:t>
@@ -2949,7 +2944,7 @@
         <w:t xml:space="preserve">(Coco and Iovita 2020; Kidwell and Tomašových 2013; Perreault 2018; Tomašových and Kidwell 2009, 2010; Youngblood et al. 2023)</w:t>
       </w:r>
       <w:r>
-        <w:t xml:space="preserve">. Rather than argue that this makes the absence conservative, we built the damping into the recovery experiment directly, where it raises the detection threshold from s of 0.5 to 0.7, the quantified cost of the record’s temporal mixing. The verdict is stable across the watershed (19 assemblages) and corridor (29) basin definitions. The central methodological finding is that telling a bounded group from drift must be calibrated to the record to which it is applied. The same four signatures that discriminate cleanly on idealized data reduce, on a real time-averaged record of this size, to a single confound-controlled signature. Saying so is what licenses interpreting the structure as drift rather than weakening the claim.</w:t>
+        <w:t xml:space="preserve">. Rather than argue that this makes the absence conservative, we built the damping into the recovery experiment directly, where it raises the detection threshold reported above. The verdict is stable across the watershed (19 assemblages) and corridor (29) basin definitions.</w:t>
       </w:r>
     </w:p>
     <w:p>
@@ -2957,7 +2952,7 @@
         <w:pStyle w:val="BodyText"/>
       </w:pPr>
       <w:r>
-        <w:t xml:space="preserve">The contribution has two parts that should be kept distinct. The four signatures distinguish a bounded interaction group from drift in principle, and an idealized simulation confirms that closure drives them together while drift and the other mimics do not (Figure S4). The calibration is the part that travels to real data: it asks, before any similarity structure is interpreted as social, which signatures a given record can support and how strong a closure each could detect. The Parkin record shows the test reducing to its single most robust component, cultural F_ST. We are explicit about what that costs. Had F_ST shown a positive trend, it alone could not have separated a real group from environmental patchiness, which also drives between-group variance (Table 1). In the positive case, the generative drift-versus-groups comparison, not F_ST alone, would have had to carry the discrimination. The negative is cleaner because the present structure is positively matched by drift and overshot by bounded groups. This result shows that social structure may be measurable through decorated ceramic assemblages. We can also assess whether the Parkin phase was a polity by examining whether interaction had closed into a bounded group to a degree that the record can resolve. For the Parkin phase, the answer is that it had not, within the bounds supported by the record. The polity the De Soto encountered seems to reflect distinctions drawn in ceremonial practices, fortification, and settlement size, rather than one written into the structure of ceramic transmission.</w:t>
+        <w:t xml:space="preserve">The contribution has two parts that should be kept distinct. The four signatures distinguish a bounded interaction group from drift in principle, and an idealized simulation confirms that closure drives them together while drift and the other mimics do not (Figure S4). The calibration is the part that travels to real data. It asks, before any similarity structure is interpreted as social, which signatures a given record can support, and how strong a closure each could detect. The Parkin record shows the test reducing to its single most robust component, cultural F_ST. We are explicit about what that costs. Had F_ST shown a positive trend, it alone could not have separated a real group from environmental patchiness, which also drives between-group variance (Table 1). In the positive case, the generative drift-versus-groups comparison, not F_ST alone, would have had to carry the discrimination. The negative is cleaner because the present structure is positively matched by drift and overshot by bounded groups. This result shows that social structure may be measurable through decorated ceramic assemblages. We can also assess whether the Parkin phase was a polity by examining whether interaction had closed into a bounded group to a degree that the record can resolve. For the Parkin phase, the answer is that it had not, within the bounds supported by the record. The polity the De Soto encountered seems to reflect distinctions drawn in ceremonial practices, fortification, and settlement size, rather than one written into the structure of ceramic transmission.</w:t>
       </w:r>
     </w:p>
     <w:p>

</xml_diff>

<commit_message>
Sync main and supplement: logical-gap, repetition, and cross-reference fixes
Bridge the seriation result to the recovery finding, cut an orphaned
transition, compress the Background overlap with the Introduction, trim a
literature aside, name the Parkin pull-out, and fix mechanical errors. In the
supplement, correct the S4A/S4B cross-references (the dynamic-sufficiency panels
are Figure S2) and reconcile the CMV Mississippian F_ST. Rebuild docx/pdf.
</commit_message>
<xml_diff>
--- a/docs/manuscript/MAIN_TEXT.docx
+++ b/docs/manuscript/MAIN_TEXT.docx
@@ -2,7 +2,7 @@
 <file path=word/document.xml><?xml version="1.0" encoding="utf-8"?>
 <w:document xmlns:w="http://schemas.openxmlformats.org/wordprocessingml/2006/main" xmlns:m="http://schemas.openxmlformats.org/officeDocument/2006/math" xmlns:r="http://schemas.openxmlformats.org/officeDocument/2006/relationships" xmlns:o="urn:schemas-microsoft-com:office:office" xmlns:v="urn:schemas-microsoft-com:vml" xmlns:w10="urn:schemas-microsoft-com:office:word" xmlns:a="http://schemas.openxmlformats.org/drawingml/2006/main" xmlns:pic="http://schemas.openxmlformats.org/drawingml/2006/picture" xmlns:wp="http://schemas.openxmlformats.org/drawingml/2006/wordprocessingDrawing">
   <w:body>
-    <w:bookmarkStart w:id="245" w:name="X093902eb68652ea32f5548e74607f4e4b0f6699"/>
+    <w:bookmarkStart w:id="235" w:name="X093902eb68652ea32f5548e74607f4e4b0f6699"/>
     <w:p>
       <w:pPr>
         <w:pStyle w:val="Heading1"/>
@@ -287,7 +287,7 @@
         <w:t xml:space="preserve">(King and Freer 1995; Rees 2001)</w:t>
       </w:r>
       <w:r>
-        <w:t xml:space="preserve">. The 16th-century historical chronicles describe Casqui and its neighbor Pacaha in open conflict, a relationship interpreted both as rivalry between competing peers and as a ranked order in which Casqui stood below Pacaha. Thus, if Parkin is indeed Casqui, the chronicles do not, by themselves, establish a single consolidated hierarchy over the Parkin phase</w:t>
+        <w:t xml:space="preserve">. The 16th-century chronicles are themselves equivocal, read both as rivalry among competing peers and as a ranked order, so if Parkin is Casqui they do not, by themselves, establish a consolidated hierarchy over the Parkin phase</w:t>
       </w:r>
       <w:r>
         <w:t xml:space="preserve"> </w:t>
@@ -597,7 +597,7 @@
         <w:pStyle w:val="BodyText"/>
       </w:pPr>
       <w:r>
-        <w:t xml:space="preserve">The phase gives the central valley record its social structure. Operationally, a phase is a set of assemblages that seriate together and cluster in space. It is interpreted, however, as a social entity, a bounded, interacting community, on the premise that assemblages that are more alike within a phase than across its edges are generated by individuals who interacted mostly within</w:t>
+        <w:t xml:space="preserve">Operationally, a phase is a set of assemblages that seriate together and cluster in space. It is interpreted, however, as a social entity, a bounded interacting community, on the premise that assemblages more alike within a phase than across its edges record individuals who interacted mostly within</w:t>
       </w:r>
       <w:r>
         <w:t xml:space="preserve"> </w:t>
@@ -606,7 +606,7 @@
         <w:t xml:space="preserve">(McNutt 1996; Morse and Morse 1983; Phillips et al. 1951; Williams 1954)</w:t>
       </w:r>
       <w:r>
-        <w:t xml:space="preserve">. The premise is not an unreasonable possibility. Under the neutral transmission model, it would hold if learning were confined within social boundaries, so that decoration drifted in separate pools and diverged between them. The difficulty is that the same pattern arises with no boundary at all. When interaction declines with distance, spatially structured drift concentrates similarity among near neighbors. This is the isolation-by-distance expectation for cultural similarity</w:t>
+        <w:t xml:space="preserve">. That premise is not unreasonable. The difficulty, set out in the Introduction, is that the same clustering arises with no boundary at all, through isolation by distance</w:t>
       </w:r>
       <w:r>
         <w:t xml:space="preserve"> </w:t>
@@ -615,7 +615,7 @@
         <w:t xml:space="preserve">(Lipo et al. 2021; Neiman 1995; Shennan et al. 2015)</w:t>
       </w:r>
       <w:r>
-        <w:t xml:space="preserve">. A cluster of similar assemblages, therefore, need not record a bounded group. What would mark a real bounded group is closure beyond what distance predicts, and that excess is the signal we must test for. Our operational question is whether the structure of similarity records bounds interaction or spatially structured drift. We can treat decoration transmitted preferentially within a group and divergent between groups as a marker, rather than a neutral style drifting in a shared pool. A marker is the ceramic proxy for interaction closing into a bounded group, so the drift-versus-groups question, then, is effectively a question of neutral style versus marker.</w:t>
+        <w:t xml:space="preserve">. What would mark a real bounded group is closure beyond what distance predicts, and that excess is the signal we must test for. We can treat decoration transmitted preferentially within a group and divergent between groups as a marker, rather than a neutral style drifting in a shared pool. A marker is the ceramic proxy for interaction closing into a bounded group, so the drift-versus-groups question is effectively a question of neutral style versus marker.</w:t>
       </w:r>
     </w:p>
     <w:bookmarkEnd w:id="15"/>
@@ -725,7 +725,7 @@
         <w:pStyle w:val="FirstParagraph"/>
       </w:pPr>
       <w:r>
-        <w:t xml:space="preserve">The late pre-contact central Mississippi Valley supports two interpretations of the same record, and they make opposite predictions for the transmission signature. The first holds that the region was moving toward greater complexity. In northeastern Arkansas, the Parkin phase (ca. 1400 to 1600 CE, with a thin protohistoric tail is consistent with the basin radiocarbon reported below) is a dense cluster of fortified, moated St. Francis-type towns along the St. Francis and Tyronza rivers. It is dominated by the Parkin site, a roughly 17-acre palisaded center whose platform mound rises more than 6 m, which the De Soto chronicles place as the seat of the paramount of Casqui</w:t>
+        <w:t xml:space="preserve">The late pre-contact central Mississippi Valley supports two interpretations of the same record, and they make opposite predictions for the transmission signature. The first holds that the region was moving toward greater complexity. In northeastern Arkansas, the Parkin phase (ca. 1400 to 1600 CE, with a thin protohistoric tail consistent with the basin radiocarbon reported below) is a dense cluster of fortified, moated St. Francis-type towns along the St. Francis and Tyronza rivers. It is dominated by the Parkin site, a roughly 17-acre palisaded center whose platform mound rises more than 6 m, which the De Soto chronicles place as the seat of the paramount of Casqui</w:t>
       </w:r>
       <w:r>
         <w:t xml:space="preserve"> </w:t>
@@ -743,7 +743,7 @@
         <w:t xml:space="preserve">(Phyllis A. Morse 1990)</w:t>
       </w:r>
       <w:r>
-        <w:t xml:space="preserve">. Because contact and the demographic collapse associated with the protohistoric</w:t>
+        <w:t xml:space="preserve">. Contact and the demographic collapse associated with the protohistoric</w:t>
       </w:r>
       <w:r>
         <w:t xml:space="preserve"> </w:t>
@@ -755,22 +755,16 @@
         <w:t xml:space="preserve"> </w:t>
       </w:r>
       <w:r>
-        <w:t xml:space="preserve">(Williams 1990)</w:t>
-      </w:r>
-      <w:r>
-        <w:t xml:space="preserve"> </w:t>
-      </w:r>
-      <w:r>
-        <w:t xml:space="preserve">interrupted the sequence, any such transition would have been truncated before it could consolidate and overwrite its own beginnings</w:t>
-      </w:r>
-      <w:r>
-        <w:t xml:space="preserve"> </w:t>
-      </w:r>
-      <w:r>
-        <w:t xml:space="preserve">(Cobb and Butler 2002; Morse and Morse 1996)</w:t>
-      </w:r>
-      <w:r>
-        <w:t xml:space="preserve">. We treat this truncation as a working premise rather than a settled fact, since the timing and extent of the Vacant Quarter abandonment relative to the Parkin phase remain debated</w:t>
+        <w:t xml:space="preserve">would have truncated any such transition before it could consolidate</w:t>
+      </w:r>
+      <w:r>
+        <w:t xml:space="preserve"> </w:t>
+      </w:r>
+      <w:r>
+        <w:t xml:space="preserve">(Cobb and Butler 2002; Morse and Morse 1996; Williams 1990)</w:t>
+      </w:r>
+      <w:r>
+        <w:t xml:space="preserve">. We treat this truncation as a working premise rather than settled fact, since the timing and extent of the Vacant Quarter abandonment relative to the Parkin phase remain debated</w:t>
       </w:r>
       <w:r>
         <w:t xml:space="preserve"> </w:t>
@@ -1533,7 +1527,7 @@
         <w:pStyle w:val="BodyText"/>
       </w:pPr>
       <w:r>
-        <w:t xml:space="preserve">That calibration is a signal-recovery experiment (described in the Materials and Methods section, with full details in the Supplemental Text). We build synthetic assemblages matched to the real ones in number, sample size, and time-averaging, and inject a known group-closure signal of controlled strength. We then ask which signatures recover it and how strong the closure must be to register. This process is necessary for two reasons specific to this record: it has only 29 time-averaged assemblages, and assemblage size trends along the seriation axis, so a size-sensitive measure can move through sampling alone. Reading each signature against this record-matched standard, rather than against the idealized expectation, is what enables us to treat an absence of structure as real rather than as a failure of resolution. The procedure and its parameters are detailed in the Materials and Methods and the Supplemental Text, and Figure 4 reports the outcome.</w:t>
+        <w:t xml:space="preserve">That calibration is a signal-recovery experiment: we inject a known group-closure signal of controlled strength into synthetic assemblages matched to the real record, then ask which signatures recover it and how strong the closure must be to register. Reading each signature against this record-matched standard, rather than against the idealized expectation, is what enables us to treat an absence of structure as a real result rather than a failure of resolution. The procedure and its parameters are detailed in the Materials and Methods and the Supplemental Text.</w:t>
       </w:r>
     </w:p>
     <w:p>
@@ -1712,7 +1706,7 @@
         <w:t xml:space="preserve">(Lipo 2001)</w:t>
       </w:r>
       <w:r>
-        <w:t xml:space="preserve">. Each decorated class is a culture history type, a unit of measurement that the analysts defined to capture stylistic variation, not a native category assumed in advance. For our study, we restrict the analysis to the St. Francis basin of northeastern Arkansas, the setting of Parkin, defined hydrologically as the assemblages within 20 km of the St. Francis, Tyronza, and L’Anguille drainage (Figure 1). This yields 29 decorated assemblages for the transmission analysis and 92 sites for the settlement comparison. The basin is a geographic unit, not a single culture-historical phase: under the standard regional scheme, its assemblages fall into the Parkin phase together with sites assigned to the Nodena, Kent, Walls, and Parchman phases</w:t>
+        <w:t xml:space="preserve">. Each decorated class is a culture-history type, a unit of measurement that the analysts defined to capture stylistic variation, rather than a native category assumed in advance. For our study, we restrict the analysis to the St. Francis basin of northeastern Arkansas, the setting of Parkin, defined hydrologically as the assemblages within 20 km of the St. Francis, Tyronza, and L’Anguille drainage (Figure 1). This yields 29 decorated assemblages for the transmission analysis and 92 sites for the settlement comparison. The basin is a geographic unit, not a single culture-historical phase: under the standard regional scheme, its assemblages fall into the Parkin phase together with sites assigned to the Nodena, Kent, Walls, and Parchman phases</w:t>
       </w:r>
       <w:r>
         <w:t xml:space="preserve"> </w:t>
@@ -1994,7 +1988,7 @@
         <w:t xml:space="preserve">(Brainerd 1951; Robinson 1951)</w:t>
       </w:r>
       <w:r>
-        <w:t xml:space="preserve">, a standard index ranging from 0 to 200 that quantifies how similar their class proportions are. We tested its association with inter-site distance using a Mantel</w:t>
+        <w:t xml:space="preserve">, a standard index ranging from 0 to 200 that quantifies the similarity of their class proportions. We tested its association with inter-site distance using a Mantel</w:t>
       </w:r>
       <w:r>
         <w:t xml:space="preserve"> </w:t>
@@ -2014,7 +2008,7 @@
         <w:pStyle w:val="BodyText"/>
       </w:pPr>
       <w:r>
-        <w:t xml:space="preserve">Two corrections are essential before any of these signatures is interpreted. Assemblage sample size trends with seriation position, and several estimators are size-sensitive, so we subsample every assemblage to a common count (i.e., rarefaction)</w:t>
+        <w:t xml:space="preserve">Two corrections are essential before any of these signatures is interpreted. Assemblage sample size trends with seriation position (Spearman’s rho = +0.59), and several estimators are size-sensitive, so we subsample every assemblage to a common count (rarefaction)</w:t>
       </w:r>
       <w:r>
         <w:t xml:space="preserve"> </w:t>
@@ -2026,7 +2020,7 @@
         <w:t xml:space="preserve"> </w:t>
       </w:r>
       <w:r>
-        <w:t xml:space="preserve">before scoring each signature as its rank correlation with its ordinal position. Which signatures can then be trusted at the record’s resolution is not assumed but established by the recovery experiment described next, in which a known closure signal is injected into the real configuration.</w:t>
+        <w:t xml:space="preserve">before scoring each signature as its rank correlation with ordinal position. Which signatures can then be trusted at the record’s resolution is not assumed but established by the recovery experiment described next, in which a known closure signal is injected into the real configuration.</w:t>
       </w:r>
     </w:p>
     <w:bookmarkEnd w:id="27"/>
@@ -2122,7 +2116,7 @@
         <w:t xml:space="preserve">(Crema et al. 2014; Kandler and Shennan 2015)</w:t>
       </w:r>
       <w:r>
-        <w:t xml:space="preserve">. Two properties of the record make this necessary. First, assemblage sample size trends with seriation position (Spearman’s rho = +0.59), and several signatures are size-sensitive, so a size-dependent estimator can rise or fall along the axis through sampling alone. Therefore, we subsample every assemblage, synthetic and real, to a common count before scoring, thereby removing the confound. Second, the record is time-averaged, which we reproduce by blending adjacent-bin production within a window. The recovery experiment then asks, at the resolution and sample sizes this record preserves, which signatures can be trusted and how strong a closure would have to be to register. One aspect of the calibration matters here. Because subsampling the larger, later assemblages to a common count slightly inflates within-cluster diversity and so depresses F_ST toward later positions, the null with no closure (pure drift) itself carries a mild negative trend rather than a flat zero. The test is calibrated against that null distribution, not against zero, so the false-positive rate is held at five percent regardless, and the empirical value is compared against the same null.</w:t>
+        <w:t xml:space="preserve">. Two properties of the record make this necessary. The size-seriation trend noted above means a size-dependent estimator can move along the axis through sampling alone, so we subsample every assemblage, synthetic and real, to a common count before scoring. The record is also time-averaged, which we reproduce by blending adjacent-bin production within a window. The recovery experiment then asks, at the resolution and sample sizes this record preserves, which signatures can be trusted and how strong a closure would have to be to register. One aspect of the calibration matters here. Because subsampling the larger, later assemblages to a common count slightly inflates within-cluster diversity and so depresses F_ST toward later positions, the null with no closure (pure drift) itself carries a mild negative trend rather than a flat zero. The test is calibrated against that null distribution, not against zero, so the false-positive rate is held at five percent regardless, and the empirical value is compared against the same null.</w:t>
       </w:r>
     </w:p>
     <w:bookmarkEnd w:id="28"/>
@@ -2236,7 +2230,7 @@
         <w:pStyle w:val="FirstParagraph"/>
       </w:pPr>
       <w:r>
-        <w:t xml:space="preserve">The four signatures distinguish bounded groups from drift in principle, but at the resolution of the LMV’s record, only one of them registers the difference. The idealized validation behaves as designed. When interaction is made among closed, bounded groups, all four signatures move together, while drift and the other mimics each move only a characteristic subset. The four are tightly correlated under closure (mean absolute pairwise correlation 0.88) yet nearly independent under the mimics (0.19 to 0.29), so their joint movement is informative rather than redundant (Figure S4). The record-matched recovery is the more informative (Figure 4). When a known group-closure signal is injected at the real configuration and scored after size control, only cultural F_ST tracks it monotonically, climbing from the null toward a strong positive trend as the injected strength rises. The injected strength s ranges from 0 (pure drift) to 1 (strongly bounded, sharply bounded groups). The neutral departure is non-monotonic in conformity, the spatial boundary is unresponsive at the three spatial clusters the data support, and seriation coherence responds only weakly. With the false-positive rate held at five percent, F_ST recovers a closure of strength</w:t>
+        <w:t xml:space="preserve">The four signatures distinguish bounded groups from drift in principle, but at the resolution of the LMV’s record, only one of them registers the difference. The idealized validation behaves as designed. When interaction is made among closed, bounded groups, all four signatures move together, while drift and the other mimics each move only a characteristic subset. The four are tightly correlated under closure (mean absolute pairwise correlation 0.88) yet nearly independent under the mimics (0.19 to 0.29), so their joint movement is informative rather than redundant (Figure S4). The record-matched recovery is the more informative (Figure 4). When a known group-closure signal is injected at the real configuration and scored after size control, only cultural F_ST tracks it monotonically, climbing from the null toward a strong positive trend as the injected strength rises. The injected strength s ranges from 0 (pure drift) to 1 (strongly bounded, sharply separated groups). The neutral departure is non-monotonic in conformity, the spatial boundary is unresponsive at the three spatial clusters the data support, and seriation coherence responds only weakly. With the false-positive rate held at five percent, F_ST recovers a closure of strength</w:t>
       </w:r>
       <w:r>
         <w:t xml:space="preserve"> </w:t>
@@ -2398,7 +2392,7 @@
         <w:pStyle w:val="BodyText"/>
       </w:pPr>
       <w:r>
-        <w:t xml:space="preserve">Three further checks, all pointing the same way, add detail. The first follows each decorated class’s rise and fall through the sequence and asks whether the changes resemble the undirected fluctuation of unbiased copying or the directed change a deliberate marker would exhibit. Seven of the nine testable classes are consistent with unbiased drift (i.e, the frequency increment test)</w:t>
+        <w:t xml:space="preserve">Three further checks, all pointing the same way, add detail. The first follows each decorated class’s rise and fall through the sequence and asks whether the changes resemble the undirected fluctuation of unbiased copying or the directed change a deliberate marker would exhibit. Seven of the nine testable classes are consistent with unbiased drift (i.e., the frequency increment test)</w:t>
       </w:r>
       <w:r>
         <w:t xml:space="preserve"> </w:t>
@@ -2442,7 +2436,7 @@
         <w:t xml:space="preserve">(2021)</w:t>
       </w:r>
       <w:r>
-        <w:t xml:space="preserve">, we simulated neutral copying on the actual coordinate layout of the basin assemblages, with interaction decaying over distance and the record’s time-averaging imposed. We compared it against a bounded-groups process on the same geography. By sweeping the interaction range, the between-node mixing rate, and the innovation rate, neutral drift reproduces the observed distance decay, network modularity, cultural F_ST, and distance-controlled boundary excess. The region of parameter space that brackets all four at once is a sub-basin interaction range of about 24 km with low between-node mixing. We report the full sweep rather than a single tuned point. At shorter ranges, drift overproduces distance decay, and at higher mixing, it underproduces the structure, so the all-four match holds only in a plausible but specific corner of the space (see the Supplemental Text). The bounded-groups process, by contrast, overshoots the three structural signatures by roughly two to seven times across its range, predicting far sharper community structure than the data demonstrate. The basin’s decorated ceramic structure is, therefore, entirely reproducible by neutral spatial drift under plausible parameters. This result explains the illusion of phases as units. The observed pattern does not require bounded groups, which would have left a sharper mark than is present (Figure S5). The control also bounds the spatial signature itself. A positive distance-controlled boundary excess, which we introduced to separate a sharp social boundary from smooth isolation by distance, is reproduced by stochastic neutral drift on a finite network, so on its own it does not certify a boundary. The same conclusion is reached for the phase construct from outside the transmission framework.</w:t>
+        <w:t xml:space="preserve">, we simulated neutral copying on the actual coordinate layout of the basin assemblages, with interactions decaying with distance and time averaging imposed on the record. We compared it against a bounded-groups process on the same geography. By sweeping the interaction range, the between-node mixing rate, and the innovation rate, neutral drift reproduces the observed distance decay, network modularity, cultural F_ST, and distance-controlled boundary excess. The region of parameter space that brackets all four at once is a sub-basin interaction range of about 24 km with low between-node mixing. We report the full sweep rather than a single tuned point. At shorter ranges, drift overproduces distance decay. At higher mixing, it underproduces the structure, so the all-four match holds only in a plausible but specific corner of the space (see the Supplemental Text). The bounded-groups process, by contrast, overshoots the three structural signatures by roughly two to seven times across its range, predicting far sharper community structure than the data demonstrate. The basin’s decorated ceramic structure is, therefore, entirely reproducible by neutral spatial drift under plausible parameters. This result explains the illusion of phases as units. The observed pattern does not require bounded groups, which would have left a sharper mark than is present (Figure S5). The control also bounds the spatial signature itself. A positive distance-controlled boundary excess, which we introduced to separate a sharp social boundary from smooth isolation by distance, is reproduced by stochastic neutral drift on a finite network, so on its own it does not certify a boundary.</w:t>
       </w:r>
     </w:p>
     <w:p>
@@ -2450,7 +2444,7 @@
         <w:pStyle w:val="BodyText"/>
       </w:pPr>
       <w:r>
-        <w:t xml:space="preserve">The role Parkin plays in the transmission landscape is worth investigating through seriation analysis. What it means for assemblages to be co-seriable is central to this signature, and the deterministic method is stricter than the seriations most archaeologists have in mind. In conventional practice, an analyst can almost always arrange a set of assemblages into an order in which class frequencies more or less rise and fall, treating the places where a class breaks that pattern as noise to be tolerated by eye. Deterministic frequency seriation removes that tolerance. It accepts an ordering only when every decorated class is at once unimodal, rising to a single peak and then falling away, and continuous, changing without an abrupt jump. It treats any break in a class’s rise and fall as disqualifying that ordering unless the break is small enough to be explained by sampling error in the counts</w:t>
+        <w:t xml:space="preserve">The seriation signature does not register closure as a trend at this record’s resolution (Figure 4), but the structure it returns still characterizes Parkin’s position directly. As described above, the deterministic method accepts an ordering only when every decorated class is at once unimodal and continuous, so a set of assemblages drawn from one shared, drifting pool resolves under a single ordering, while learning partitioned among groups breaks into several mutually incompatible orderings</w:t>
       </w:r>
       <w:r>
         <w:t xml:space="preserve"> </w:t>
@@ -2459,7 +2453,7 @@
         <w:t xml:space="preserve">(Dunnell 1970; Lipo et al. 2015)</w:t>
       </w:r>
       <w:r>
-        <w:t xml:space="preserve">. Where a conventional seriation would accept one rough ordering and move on, the deterministic method asks whether even one ordering can satisfy every class at once, and reports when none can. A single community drawing on a shared, drifting pool of designs meets that requirement under a single ordering. When learning is partitioned among groups, each with its own rise and fall of styles, no single ordering can hold every class unimodal at once, and the assemblages resolve into several mutually incompatible orderings. The departures from a conventional seriation would be dismissed as minor irregularities, but, interpreted this way, they would reveal the signature of more than one interaction community. The number of maximal co-seriable groups, together with the number of groups any one assemblage joins, measures that fragmentation directly</w:t>
+        <w:t xml:space="preserve">. The number of maximal co-seriable groups, together with the number any one assemblage joins, measures that fragmentation directly</w:t>
       </w:r>
       <w:r>
         <w:t xml:space="preserve"> </w:t>
@@ -2662,7 +2656,15 @@
         <w:t xml:space="preserve">(Cobb 2000)</w:t>
       </w:r>
       <w:r>
-        <w:t xml:space="preserve">. The exchange evidence is regional rather than basin-internal, so we read it as consistent with, not proof of, decentralization at Parkin. Of these corroborating lines, settlement and exchange are independent of the ceramic data, while Mainfort’s ordination corroborates the seriation result on the same assemblages by a different method</w:t>
+        <w:t xml:space="preserve">. The exchange evidence is regional rather than basin-internal, so we read it as consistent with, not proof of, decentralization at Parkin.</w:t>
+      </w:r>
+    </w:p>
+    <w:p>
+      <w:pPr>
+        <w:pStyle w:val="BodyText"/>
+      </w:pPr>
+      <w:r>
+        <w:t xml:space="preserve">Of these corroborating lines, settlement and exchange are independent of the ceramic data, whereas Mainfort’s ordination corroborates the seriation result for the same assemblages using a different method</w:t>
       </w:r>
       <w:r>
         <w:t xml:space="preserve"> </w:t>
@@ -2727,31 +2729,13 @@
         <w:t xml:space="preserve">(Lipo et al. 2021)</w:t>
       </w:r>
       <w:r>
-        <w:t xml:space="preserve">. Across the 55 decorated assemblages of the wider lower Mississippi Valley, the model repeatedly produces a few spatially coherent, phase-like groups (Figure 8). The deposits are not contemporaneous, which is why they can be seriated at all and why some carry more of the late classes than others, so each synthetic assemblage is drawn time-transgressively at the run-time that matches its seriation position. Holding time fixed to isolate the spatial signal, drift yields two to five groups, the number of which increases with geographic extent. Restoring the staggered deposition ages collapses the count into two time-defined groups because assemblages sampled at different points in the sequence carry different repertoires. Either way, the number of drift-generated groups falls well short of the seven named phases the regional scheme draws across the same assemblages. The between-group cultural F_ST of those groups settles at the observed level rather than the higher value a bounded group would leave. The named phases, therefore, subdivide the valley more finely than the transmission structure supports. Where culture history draws seven bounded societies, drift on the geography yields at most a handful of coherent groupings, so most of the phase boundaries mark divisions that a continuous interaction field does not carry. Whether any single named phase exceeds this drift expectation is a question we can now pose one phase at a time. That spatial and population structure, not population size, governs how drift partitions diversity in finite structured populations is established in both the cultural-transmission and population-genetics literatures</w:t>
-      </w:r>
-      <w:r>
-        <w:t xml:space="preserve"> </w:t>
-      </w:r>
-      <w:r>
-        <w:t xml:space="preserve">(Barton 1996; Premo 2016; Schneider et al. 2016; Wright 1943)</w:t>
-      </w:r>
-      <w:r>
-        <w:t xml:space="preserve">. A localized neutral process is readily mistaken for biased transmission when diversity is taken at face value</w:t>
-      </w:r>
-      <w:r>
-        <w:t xml:space="preserve"> </w:t>
-      </w:r>
-      <w:r>
-        <w:t xml:space="preserve">(Premo and Scholnick 2011)</w:t>
-      </w:r>
-      <w:r>
-        <w:t xml:space="preserve">. Structure shapes diversity under selective dynamics as well, through a different mechanism of maintenance and recombination</w:t>
-      </w:r>
-      <w:r>
-        <w:t xml:space="preserve"> </w:t>
-      </w:r>
-      <w:r>
-        <w:t xml:space="preserve">(Derex et al. 2018; Derex and Boyd 2016; Saxer et al. 2009)</w:t>
+        <w:t xml:space="preserve">. Across the 55 decorated assemblages of the wider lower Mississippi Valley, the model repeatedly produces a few spatially coherent, phase-like groups (Figure 8). The deposits are not contemporaneous, which is why they can be seriated at all and why some carry more of the late classes than others, so each synthetic assemblage is drawn time-transgressively at the run-time that matches its seriation position. Holding time fixed to isolate the spatial signal, drift yields two to five groups, the number of which increases with geographic extent. Restoring the staggered deposition ages collapses the count into two time-defined groups because assemblages sampled at different points in the sequence carry different repertoires. Either way, the number of drift-generated groups falls well short of the seven named phases the regional scheme draws across the same assemblages. The between-group cultural F_ST of those groups settles at the observed level rather than the higher value a bounded group would leave. The named phases, therefore, subdivide the valley more finely than the transmission structure supports. Where culture history draws seven bounded societies, drift on the geography yields at most a handful of coherent groupings, so most of the phase boundaries mark divisions that a continuous interaction field does not carry. Whether any single named phase exceeds this drift expectation is a question we can now pose one phase at a time. That structure, rather than population size, governs how drift partitions diversity in finite populations is well established, and a localized neutral process is easily mistaken for biased transmission when diversity is read at face value</w:t>
+      </w:r>
+      <w:r>
+        <w:t xml:space="preserve"> </w:t>
+      </w:r>
+      <w:r>
+        <w:t xml:space="preserve">(Barton 1996; Premo 2016; Premo and Scholnick 2011; Schneider et al. 2016)</w:t>
       </w:r>
       <w:r>
         <w:t xml:space="preserve">. The result is not contingent on a tuned parameter set. Across hundreds of runs that spanned a grid of interaction length, between-node mixing, and innovation rate, two or more spatially coherent groups appear in every run, and the between-group F_ST sits at or below the observed value in 85 percent of them. The St. Francis basin that anchors this paper behaves the same way as a positive control (Figures S7 and S8).</w:t>
@@ -2762,7 +2746,7 @@
         <w:pStyle w:val="BodyText"/>
       </w:pPr>
       <w:r>
-        <w:t xml:space="preserve">The same model lets the named phases be tested one at a time, in the culture historian’s own terms. Taking Parkin as the focal case, membership in its group is a probability rather than a fact. Across the 500 runs, each assemblage shares Parkin’s drift-detected group some fraction of the time, a graded field that falls off smoothly with river distance from Parkin rather than the bounded set a phase map implies (Figure 9A). The Parkin-phase assemblages do separate from the others by this measure. That separation is what drift predicts, because they lie near Parkin and so co-occur with it more than distant assemblages do (Figure 9B). The discriminating test is whether the between-group cultural F_ST across the Parkin-versus-others partition exceeds the drift null. It sits at the extreme upper tail of the null and survives most single-site deletions. The contrast is nonetheless small. The null’s own tail reaches past it, and time-averaging, which deflates between-group variance, is not modeled in the null (Figure 9C, 9D). It is therefore at most a weak hint of structure beyond drift, not a demonstrated social boundary. Geography and time account entirely for the pattern, and the apparent groups are products of a single neutral process.</w:t>
+        <w:t xml:space="preserve">The same model lets the named phases be tested one at a time, in the culture historian’s own terms. Taking Parkin as the focal case, membership in its group is a probability rather than a fact. Across the 500 runs, each assemblage shares Parkin’s drift-detected group some fraction of the time, a graded field that falls off smoothly with river distance from Parkin rather than the bounded set a phase map implies (Figure 9A). The Parkin-phase assemblages do separate from the others by this measure. That separation is what drift predicts, because they lie near Parkin and so co-occur with it more than distant assemblages do (Figure 9B). The discriminating test, which we call the Parkin pull-out, is whether the between-group cultural F_ST across the Parkin-versus-others partition exceeds the drift null. It sits at the extreme upper tail of the null and survives most single-site deletions. The contrast is nonetheless small. The null’s own tail extends beyond it, and time-averaging, which deflates between-group variance, is not modeled in the null (Figures 9C and 9D). It is therefore at most a weak hint of structure beyond drift, not a demonstrated social boundary. Geography and time account entirely for the pattern, and the apparent groups are products of a single neutral process.</w:t>
       </w:r>
     </w:p>
     <w:p>
@@ -2935,7 +2919,7 @@
         <w:pStyle w:val="BodyText"/>
       </w:pPr>
       <w:r>
-        <w:t xml:space="preserve">Three limits bound the result. The first is resolution. As the recovery experiment showed (Figure 4), on a record of this size the discrimination reduces to a single confound-controlled signature, cultural F_ST, and its size-controlled empirical value is uninformative. The negative is therefore informative for a closure of moderate or greater strength, which would have registered, but cannot exclude a weaker one. It is also bounded in form. The recovery succeeds only for closure expressed as between-group divergence, so a closure carried purely by within-group conformity, or by social structure not aligned with the spatial clusters, would lie below detection here at any strength (Supplemental Text). The second limit is the ordinal chronology. The basin radiocarbon corpus pools to five seriation anchors across a calibration plateau, so the axis is a relative order oriented toward later time rather than a calendar rate. This matters less than it might, because the discriminating quantity, the size-controlled F_ST trend, is a magnitude that does not depend on the axis orientation, and the settlement and exchange lines do not depend on the ceramic chronology at all. The third limit is time-averaging, which damps between-assemblage variation and reduces apparent turnover</w:t>
+        <w:t xml:space="preserve">Three limits bound the result. The first is resolution. As the recovery experiment showed (Figure 4), on a record of this size, the discrimination reduces to a single confound-controlled signature, cultural F_ST, and its size-controlled empirical value is uninformative. The negative is therefore informative for a closure of moderate or greater strength, which would have registered, but cannot exclude a weaker one. It is also bounded in form. The recovery succeeds only for closure expressed as between-group divergence, so a closure carried purely by within-group conformity, or by social structure not aligned with the spatial clusters, would lie below detection here at any strength (Supplemental Text). The second limit is the ordinal chronology. The basin radiocarbon corpus pools to five seriation anchors across a calibration plateau, so the axis is a relative order oriented toward later time rather than a calendar rate. This matters less than it might because the discriminating quantity, the size-controlled F_ST trend, is a magnitude that does not depend on the axis orientation, and the settlement and exchange lines do not depend on the ceramic chronology at all. The third limit is time-averaging, which damps between-assemblage variation and reduces apparent turnover</w:t>
       </w:r>
       <w:r>
         <w:t xml:space="preserve"> </w:t>
@@ -2944,7 +2928,7 @@
         <w:t xml:space="preserve">(Coco and Iovita 2020; Kidwell and Tomašových 2013; Perreault 2018; Tomašových and Kidwell 2009, 2010; Youngblood et al. 2023)</w:t>
       </w:r>
       <w:r>
-        <w:t xml:space="preserve">. Rather than argue that this makes the absence conservative, we built the damping into the recovery experiment directly, where it raises the detection threshold reported above. The verdict is stable across the watershed (19 assemblages) and corridor (29) basin definitions.</w:t>
+        <w:t xml:space="preserve">. Rather than arguing that this makes the absence conservative, we built the damping directly into the recovery experiment, thereby raising the detection threshold reported above. The verdict is stable across the watershed (19 assemblages) and corridor (29) basin definitions.</w:t>
       </w:r>
     </w:p>
     <w:p>
@@ -2952,7 +2936,7 @@
         <w:pStyle w:val="BodyText"/>
       </w:pPr>
       <w:r>
-        <w:t xml:space="preserve">The contribution has two parts that should be kept distinct. The four signatures distinguish a bounded interaction group from drift in principle, and an idealized simulation confirms that closure drives them together while drift and the other mimics do not (Figure S4). The calibration is the part that travels to real data. It asks, before any similarity structure is interpreted as social, which signatures a given record can support, and how strong a closure each could detect. The Parkin record shows the test reducing to its single most robust component, cultural F_ST. We are explicit about what that costs. Had F_ST shown a positive trend, it alone could not have separated a real group from environmental patchiness, which also drives between-group variance (Table 1). In the positive case, the generative drift-versus-groups comparison, not F_ST alone, would have had to carry the discrimination. The negative is cleaner because the present structure is positively matched by drift and overshot by bounded groups. This result shows that social structure may be measurable through decorated ceramic assemblages. We can also assess whether the Parkin phase was a polity by examining whether interaction had closed into a bounded group to a degree that the record can resolve. For the Parkin phase, the answer is that it had not, within the bounds supported by the record. The polity the De Soto encountered seems to reflect distinctions drawn in ceremonial practices, fortification, and settlement size, rather than one written into the structure of ceramic transmission.</w:t>
+        <w:t xml:space="preserve">This work makes methodological and substantive contributions. The four signatures distinguish a bounded interaction group from drift in principle, and an idealized simulation confirms that closure drives them together while drift and the other mimics do not (Figure S4). The calibration is the part that enables us to apply this approach to real data. It asks, before any similarity structure is interpreted as social, which signatures a given record can support, and how strong a closure each could detect. The Parkin record shows the test reducing to its single most robust component, cultural F_ST. We are explicit about what that costs. Had F_ST shown a positive trend, it alone could not have separated a real group from environmental patchiness, which also drives between-group variance (Table 1). In the positive case, the generative drift-versus-groups comparison, not F_ST alone, would have had to carry the discrimination. The negative is cleaner because the present structure is positively matched by drift and overshot by bounded groups. This result shows that social structure may be measurable through decorated ceramic assemblages. We can also assess whether the Parkin phase was a polity by examining whether interaction had closed into a bounded group to a degree that the record can resolve. For the Parkin phase, the answer is that it had not, within the bounds supported by the record. The polity the De Soto encountered seems to reflect distinctions drawn in ceremonial practices, fortification, and settlement size, rather than one written into the structure of ceramic transmission.</w:t>
       </w:r>
     </w:p>
     <w:p>
@@ -2960,7 +2944,7 @@
         <w:pStyle w:val="BodyText"/>
       </w:pPr>
       <w:r>
-        <w:t xml:space="preserve">One result resists the drift interpretation, if only faintly, and deserves to be named rather than buried. The single place in the valley that carries a faint signal of structure beyond drift is the Parkin phase, and Parkin is the one monumental node, the largest mound, the palisade, the confluence position, the candidate Casqui. A center beginning to differentiate as a distinct node, rather than a finished, bounded group, would leave just such a signal. This is what the origination stage of the two-regime model predicts: a local return generates a group-beneficial pattern at a node before assortment becomes binding and propagates into higher-level structure, with contact and the protohistoric depopulation truncating the sequence before it could consolidate. We do not claim this happened. The contrast is small, the drift null reaches past it, and the time-averaged surface record of eight Parkin-phase assemblages cannot support the claim. The possibility that Parkin was an incipient node nonetheless warrants direct investigation with data classes the present record lacks: stratified, excavated assemblages with independent radiocarbon, to test whether the differentiation grows through time rather than holding flat; compositional and petrographic sourcing of the ceramics, to test whether production and exchange were localizing on the center; and the non-ceramic lines, the chert-hoe and shell exchange networks</w:t>
+        <w:t xml:space="preserve">One result complicates the drift reading, faintly, and deserves a closer look. Within the valley, the Parkin phase is the only grouping that hints at structure beyond drift. As the test against the other named phases showed (Figure 9), the contrast survives dropping any single Parkin assemblage, yet it stays small enough that the drift null’s tail still reaches past it, so geography alone, with no bounded group, remains a sufficient explanation. A center just beginning to differentiate from its neighbors, rather than a finished, bounded group, would leave exactly this kind of faint, not-yet-separable excess. Contact and the protohistoric depopulation would have cut any such sequence short before it could consolidate. Based on the weak evidence, though, we cannot claim this happened. The time-averaged surface record of eight Parkin-phase assemblages does not support the claim, and drift remains the more parsimonious interpretation. The possibility that Parkin was an emerging center nonetheless warrants direct investigation with data that the present record lacks. For example, stratified, excavated assemblages with independent radiocarbon dates are needed to test whether differentiation increases over time rather than remaining flat. Compositional and petrographic sourcing of the ceramics could potentially test whether production and exchange were localized in the center. In addition, the chert-hoe and shell exchange networks</w:t>
       </w:r>
       <w:r>
         <w:t xml:space="preserve"> </w:t>
@@ -2981,7 +2965,10 @@
         <w:t xml:space="preserve">(Ross-Stallings 2017)</w:t>
       </w:r>
       <w:r>
-        <w:t xml:space="preserve">, to show whether economic and social differentiation track the ceramic hint or run independent of it. Whether Parkin was beginning to pull away from its neighbors, or sits where drift on the river network happens to concentrate interaction, is a question this record raises but cannot settle.</w:t>
+        <w:t xml:space="preserve"> </w:t>
+      </w:r>
+      <w:r>
+        <w:t xml:space="preserve">could be used to test whether economic and social differentiation track the ceramic hint or run independently of it. Whether Parkin was beginning to pull away from its neighbors, or simply sits where drift on the river network happens to concentrate interaction, is a question this analysis raises but cannot settle.</w:t>
       </w:r>
     </w:p>
     <w:p>
@@ -2998,7 +2985,7 @@
         <w:t xml:space="preserve">(1954)</w:t>
       </w:r>
       <w:r>
-        <w:t xml:space="preserve">, the within-region decorated-ceramic structure is again drift-consistent once the earlier Woodland component is set aside. Therefore, the absence of bounded groups is not peculiar to the St. Francis basin (Figure 11). In both regions, the observed between-cluster F_ST sits at the neutral-drift level and far below the bounded-groups expectation (LMV +0.02, CMV +0.03, against bounded-groups nulls of +0.11 and +0.08). The assemblages intermix rather than separating into clusters. Between the two regions, a genuine discontinuity appears across the roughly 50 km gap separating the central-valley and lower-valley assemblage clusters, with decorated similarity declining by far more than neutral spatial drift would predict for the same geometry. The two regions carry mutually exclusive, distinctive decorated repertoires (Figure S6). This is the scale-dependent pattern the test is designed to detect, with no closure within regions and a sharp difference between them. We report it as a pattern rather than a verdict, because it is confounded with time.</w:t>
+        <w:t xml:space="preserve">, the within-region decorated-ceramic structure is again drift-consistent once the earlier Woodland component is set aside. Therefore, the absence of bounded groups is not peculiar to the St. Francis basin (Figure 11). In both regions, the observed between-cluster F_ST sits at the neutral-drift level and far below the bounded-groups expectation (LMV +0.02, CMV +0.03, against bounded-groups nulls of +0.11 and +0.08). The assemblages intermix rather than separate into clusters. Between the two regions, a genuine discontinuity appears across the roughly 50 km gap separating the central-valley and lower-valley assemblage clusters, with decorated similarity declining by far more than neutral spatial drift would predict for the same geometry. The two regions carry mutually exclusive, distinctive decorated repertoires (Figure S6). This is the scale-dependent pattern the test is designed to detect, with no closure within regions and a sharp difference between them. We report it as a pattern rather than a verdict, because it is confounded with time.</w:t>
       </w:r>
     </w:p>
     <w:p>
@@ -3015,7 +3002,7 @@
         <w:t xml:space="preserve">(Phillips 1970; Williams 1954)</w:t>
       </w:r>
       <w:r>
-        <w:t xml:space="preserve">. The step at the boundary, therefore, cannot be separated from the early-to-late turnover of the repertoire, as reflected in time-averaged surface assemblages. Resolving whether the inter-regional boundary is synchronic and social or a chronological succession would require independent radiocarbon control of the central-valley assemblages, which the present compilation lacks. A second confound compounds the first. The lower-valley assemblages were collected and classified by Ford, later by Phillips, Ford, and Griffin.</w:t>
+        <w:t xml:space="preserve">. The step at the boundary, therefore, cannot be separated from the early-to-late turnover of the repertoire, as reflected in time-averaged surface assemblages. Resolving whether the inter-regional boundary is synchronic and social or a chronological succession requires independent radiocarbon control of the central-valley assemblages.</w:t>
       </w:r>
     </w:p>
     <w:p>
@@ -3023,7 +3010,44 @@
         <w:pStyle w:val="BodyText"/>
       </w:pPr>
       <w:r>
-        <w:t xml:space="preserve">In contrast, the central-valley assemblages were collected and classified separately by Williams, so the two blocks differ in analyst, sorting convention, and class definition as well as in space and time. The shared-class restriction guards against the crudest version of this artifact: a boundary built only from classes unique to each typology would vanish when only the classes both traditions record are compared. The boundary does weaken under that restriction without disappearing. Even the shared classes, however, may have been sorted to subtly different criteria by the two traditions. We therefore cannot rule out that the apparent central-valley and lower-valley boundary is in part an artifact of two separate analytical histories, and that the possibility of continuous interaction across the whole region, with no real boundary anywhere, remains open. That possibility is part of the question this study raises, rather than a nuisance to be set aside, because a boundary in the data is not yet a boundary in the past. The paper’s point at the local scale applies with equal force between the regions.</w:t>
+        <w:t xml:space="preserve">A second confound compounds the first. The lower-valley assemblages were collected and identified by classes created by Ford</w:t>
+      </w:r>
+      <w:r>
+        <w:t xml:space="preserve"> </w:t>
+      </w:r>
+      <w:r>
+        <w:t xml:space="preserve">(</w:t>
+      </w:r>
+      <w:r>
+        <w:rPr>
+          <w:b/>
+          <w:bCs/>
+        </w:rPr>
+        <w:t xml:space="preserve">ford_1936?</w:t>
+      </w:r>
+      <w:r>
+        <w:t xml:space="preserve">)</w:t>
+      </w:r>
+      <w:r>
+        <w:t xml:space="preserve">, later by Phillips, Ford, and Griffin</w:t>
+      </w:r>
+      <w:r>
+        <w:t xml:space="preserve"> </w:t>
+      </w:r>
+      <w:r>
+        <w:t xml:space="preserve">(1951)</w:t>
+      </w:r>
+      <w:r>
+        <w:t xml:space="preserve">. In contrast, the central-valley assemblages were collected and classified separately by Williams</w:t>
+      </w:r>
+      <w:r>
+        <w:t xml:space="preserve"> </w:t>
+      </w:r>
+      <w:r>
+        <w:t xml:space="preserve">(1954)</w:t>
+      </w:r>
+      <w:r>
+        <w:t xml:space="preserve">, so the two sets of assemblages differ in analyst, sorting convention, and class definition as well as in space and time. The shared-class restriction guards against the crudest version of this artifact. A boundary built only from classes unique to each typology would vanish when only the classes both traditions record are compared. The boundary does weaken under that restriction without disappearing. Even the shared classes, however, may have been sorted to subtly different criteria by the two traditions. We therefore cannot rule out that the apparent central-valley and lower-valley boundary is in part an artifact of two separate analytical histories, and that the possibility of continuous interaction across the whole region, with no real boundary anywhere, remains open. That possibility is part of the question this study raises, rather than a nuisance to be set aside, because a boundary in the data is not yet a boundary in the past. The paper’s point at the local scale applies with equal force between the regions.</w:t>
       </w:r>
     </w:p>
     <w:p>
@@ -3035,7 +3059,7 @@
           <wp:inline>
             <wp:extent cx="4572000" cy="4685221"/>
             <wp:effectExtent b="0" l="0" r="0" t="0"/>
-            <wp:docPr descr="Figure 10. Regional setting of the two-scale comparison. Decorated-ceramic assemblages of the central Mississippi Valley: the southeast-Missouri survey of Williams (CMV, blue) and the lower-valley St. Francis basin Parkin-phase assemblages (LMV, orange), with the gap between the two clusters of assemblages and Parkin starred. Labels mark the named physiographic phase regions (Cairo Lowland, Sikeston Ridge, Malden Plain, and Little River in the central valley, with the St. Francis basin in the lower valley). Hydrography combines the Lower Mississippi Survey layer with Natural Earth, state boundaries, and the North America locator inset, which are from Natural Earth. The central-valley assemblages were collected and classified by Williams, and the lower-valley assemblages in the Phillips-Ford-Griffin tradition, the separate analytical histories discussed in the text." title="" id="52" name="Picture"/>
+            <wp:docPr descr="Figure 10. Regional setting of the two-scale comparison. Decorated-ceramic assemblages spanning the central and lower Mississippi Valley: the central-valley southeast-Missouri survey of Williams (1954) (light gray) and the lower-valley St. Francis basin Parkin-phase assemblages (black), identified in the legend, with Parkin starred and a clear spatial gap between the two assemblage clusters. Italic labels mark the named physiographic regions: Cairo Lowland, Sikeston Ridge, Malden Plain, and Little River in the central valley, and the St. Francis basin in the lower valley. Detailed local hydrography is drawn from the Lower Mississippi Survey layer where it reaches and from Natural Earth to the north; state boundaries and the North America locator inset are from Natural Earth. The two blocks were collected and classified separately, the central valley by Williams and the lower valley in the Phillips-Ford-Griffin tradition, the distinct analytical histories discussed in the text." title="" id="52" name="Picture"/>
             <a:graphic>
               <a:graphicData uri="http://schemas.openxmlformats.org/drawingml/2006/picture">
                 <pic:pic>
@@ -3088,7 +3112,19 @@
         <w:t xml:space="preserve"> </w:t>
       </w:r>
       <w:r>
-        <w:t xml:space="preserve">Regional setting of the two-scale comparison. Decorated-ceramic assemblages of the central Mississippi Valley: the southeast-Missouri survey of Williams (CMV, blue) and the lower-valley St. Francis basin Parkin-phase assemblages (LMV, orange), with the gap between the two clusters of assemblages and Parkin starred. Labels mark the named physiographic phase regions (Cairo Lowland, Sikeston Ridge, Malden Plain, and Little River in the central valley, with the St. Francis basin in the lower valley). Hydrography combines the Lower Mississippi Survey layer with Natural Earth, state boundaries, and the North America locator inset, which are from Natural Earth. The central-valley assemblages were collected and classified by Williams, and the lower-valley assemblages in the Phillips-Ford-Griffin tradition, the separate analytical histories discussed in the text.</w:t>
+        <w:t xml:space="preserve">Regional setting of the two-scale comparison. Decorated-ceramic assemblages spanning the central and lower Mississippi Valley: the central-valley southeast-Missouri survey of Williams</w:t>
+      </w:r>
+      <w:r>
+        <w:t xml:space="preserve"> </w:t>
+      </w:r>
+      <w:r>
+        <w:t xml:space="preserve">(1954)</w:t>
+      </w:r>
+      <w:r>
+        <w:t xml:space="preserve"> </w:t>
+      </w:r>
+      <w:r>
+        <w:t xml:space="preserve">(light gray) and the lower-valley St. Francis basin Parkin-phase assemblages (black), identified in the legend, with Parkin starred and a clear spatial gap between the two assemblage clusters. Italic labels mark the named physiographic regions: Cairo Lowland, Sikeston Ridge, Malden Plain, and Little River in the central valley, and the St. Francis basin in the lower valley. Detailed local hydrography is drawn from the Lower Mississippi Survey layer where it reaches and from Natural Earth to the north; state boundaries and the North America locator inset are from Natural Earth. The two blocks were collected and classified separately, the central valley by Williams and the lower valley in the Phillips-Ford-Griffin tradition, the distinct analytical histories discussed in the text.</w:t>
       </w:r>
     </w:p>
     <w:p>
@@ -3100,7 +3136,7 @@
           <wp:inline>
             <wp:extent cx="4754880" cy="3753325"/>
             <wp:effectExtent b="0" l="0" r="0" t="0"/>
-            <wp:docPr descr="Figure 11. Within-region interaction structure: neither region forms bounded groups. Top: multidimensional scaling of decorated Brainerd-Robinson dissimilarity for the LMV St. Francis basin and for the CMV southeast-Missouri assemblages (Mississippian classes only, so the comparison is not driven by the Woodland-to-Mississippian gradient), points colored by within-region spatial cluster, and the assemblages intermix rather than separating into clusters. Bottom: the observed between-cluster cultural F_ST for each region (diamond) against the 95% nulls of a neutral spatial-drift model (blue) and a bounded-groups model (orange) run on the real coordinates and subsampled to the observed counts. In both regions, the observed F_ST sits at the drift level and far below the bounded-groups expectation, so the within-region structure is drift-consistent at both scales." title="" id="55" name="Picture"/>
+            <wp:docPr descr="Figure 11. Within-region interaction structure: neither region forms bounded groups. Top: multidimensional scaling of decorated Brainerd-Robinson dissimilarity for the LMV St. Francis basin and for the CMV southeast-Missouri assemblages (Mississippian classes only, so the comparison is not driven by the Woodland-to-Mississippian gradient), points distinguished by shade and marker according to within-region spatial cluster, and the assemblages intermix rather than separating into clusters. Bottom: the observed between-cluster cultural F_ST for each region (diamond) against the 95% nulls of a neutral spatial-drift model (light gray) and a bounded-groups model (dark gray) run on the real coordinates and subsampled to the observed counts. In both regions, the observed F_ST sits at the drift level and far below the bounded-groups expectation, so the within-region structure is drift-consistent at both scales." title="" id="55" name="Picture"/>
             <a:graphic>
               <a:graphicData uri="http://schemas.openxmlformats.org/drawingml/2006/picture">
                 <pic:pic>
@@ -3153,7 +3189,7 @@
         <w:t xml:space="preserve"> </w:t>
       </w:r>
       <w:r>
-        <w:t xml:space="preserve">Within-region interaction structure: neither region forms bounded groups. Top: multidimensional scaling of decorated Brainerd-Robinson dissimilarity for the LMV St. Francis basin and for the CMV southeast-Missouri assemblages (Mississippian classes only, so the comparison is not driven by the Woodland-to-Mississippian gradient), points colored by within-region spatial cluster, and the assemblages intermix rather than separating into clusters. Bottom: the observed between-cluster cultural F_ST for each region (diamond) against the 95% nulls of a neutral spatial-drift model (blue) and a bounded-groups model (orange) run on the real coordinates and subsampled to the observed counts. In both regions, the observed F_ST sits at the drift level and far below the bounded-groups expectation, so the within-region structure is drift-consistent at both scales.</w:t>
+        <w:t xml:space="preserve">Within-region interaction structure: neither region forms bounded groups. Top: multidimensional scaling of decorated Brainerd-Robinson dissimilarity for the LMV St. Francis basin and for the CMV southeast-Missouri assemblages (Mississippian classes only, so the comparison is not driven by the Woodland-to-Mississippian gradient), points distinguished by shade and marker according to within-region spatial cluster, and the assemblages intermix rather than separating into clusters. Bottom: the observed between-cluster cultural F_ST for each region (diamond) against the 95% nulls of a neutral spatial-drift model (light gray) and a bounded-groups model (dark gray) run on the real coordinates and subsampled to the observed counts. In both regions, the observed F_ST sits at the drift level and far below the bounded-groups expectation, so the within-region structure is drift-consistent at both scales.</w:t>
       </w:r>
     </w:p>
     <w:p>
@@ -3170,7 +3206,7 @@
         <w:t xml:space="preserve">(Dunnell 1995a)</w:t>
       </w:r>
       <w:r>
-        <w:t xml:space="preserve">. A signature that interaction has closed into a bounded group should be theoretically sufficient, dynamically sufficient, and empirically sufficient, the last meaning matched to the quality of the record rather than to an imagined snapshot. Ours meet the first by construction, each entailed by the transmission model rather than borrowed by analogy</w:t>
+        <w:t xml:space="preserve">. A signature that interaction has closed into a bounded group should be theoretically grounded, dynamically sufficient, and empirically sufficient, the last meaning matched to the quality of the record rather than to an imagined snapshot. Ours meet the first by construction, each entailed by the transmission model rather than borrowed by analogy</w:t>
       </w:r>
       <w:r>
         <w:t xml:space="preserve"> </w:t>
@@ -3179,7 +3215,7 @@
         <w:t xml:space="preserve">(Lipo et al. 2015; Neiman 1995)</w:t>
       </w:r>
       <w:r>
-        <w:t xml:space="preserve">. The third is that we test rather than assume, which is the point of the recovery experiment: empirical sufficiency is a property a signature has only if it can register a signal at the resolution preserved by the deposit. On the Parkin record, only between-group variance qualifies</w:t>
+        <w:t xml:space="preserve">. The third is that we test rather than assume, which is the point of the recovery experiment. Empirical sufficiency is a property a signature has only if it can register a signal at the resolution preserved by the deposit. In the case of the Parkin record, only between-group variance qualifies</w:t>
       </w:r>
       <w:r>
         <w:t xml:space="preserve"> </w:t>
@@ -3206,16 +3242,7 @@
         <w:t xml:space="preserve">(Hunt 2006; Hunt et al. 2008)</w:t>
       </w:r>
       <w:r>
-        <w:t xml:space="preserve">. Neither recovers a transition that the static criterion missed, so the negative now holds in the time domain as well as on the static states. A third probe, for the early-warning signature of a critical transition, is underpowered at this ordinal resolution and does not meet the empirical sufficiency criterion, so we report it in the supplementary code but do not rely on it</w:t>
-      </w:r>
-      <w:r>
-        <w:t xml:space="preserve"> </w:t>
-      </w:r>
-      <w:r>
-        <w:t xml:space="preserve">(Dakos et al. 2012; Scheffer et al. 2009)</w:t>
-      </w:r>
-      <w:r>
-        <w:t xml:space="preserve">. The detail is in the Supplemental Text.</w:t>
+        <w:t xml:space="preserve">. Neither recovers a transition that the static criterion missed, so the negative now holds in the time domain as well as on the static states. The detail is in the Supplemental Text.</w:t>
       </w:r>
     </w:p>
     <w:bookmarkEnd w:id="57"/>
@@ -3233,7 +3260,7 @@
         <w:pStyle w:val="FirstParagraph"/>
       </w:pPr>
       <w:r>
-        <w:t xml:space="preserve">The phase is the unit on which central-valley culture history is built, and it carries a silent claim that assemblages grouped by seriation and spatial proximity record a bounded society. For the Parkin phase, that claim does not survive measurement. Parkin is the basin’s largest and tallest-mounded center. No evidence of settlement, exchange, or ceramic transmission marks it as the apex of a polity. The greater similarity among nearby assemblages that defines the phase is reproduced by neutral drift on the basin’s geography, the ordinary residue of continuous interaction structured by where sites sit. A bounded interaction group would have a sharper structure than the measurements indicate, and Parkin sits across orderings as a transmission bridge rather than at the closed core of one. Extending the test to the wider valley, a decorated-ceramic boundary that exceeds drift appears only between the central-valley and lower-valley blocks. Even there, it is entangled with the early-to-late turnover of the class repertoire. It cannot yet be interpreted as a synchronic social division. Posed in the culture historian’s own terms, against the other named phases of the valley, the Parkin phase itself shows at most a weak contrast at the edge of the drift null, robust to single-site removal but small and within the null’s reach (Figure 9). The phase, at the scale where it is drawn, is largely indistinguishable from spatially structured drift. That carries a consequence the discipline should weigh: a similarity cluster is not, by itself, a society, and before a phase is interpreted as a social group, the record must be shown to distinguish a real interaction boundary from drift across geography. That calibration, not the phase, provides the basis for an explanation of social structure. When applied to the late pre-contact ceramics of the Mississippi Valley, it shows continuous interaction with prominent nodes rather than a mosaic of bounded polities.</w:t>
+        <w:t xml:space="preserve">The phase is the unit on which central-valley culture history is built, and it carries a silent claim that assemblages grouped by seriation and spatial proximity record a bounded society. For the Parkin phase, that claim does not survive measurement. Parkin is the basin’s largest and tallest-mounded center. However, no evidence of settlement, exchange, or the transmission of ceramic decoration marks it as the apex of a polity. The greater similarity among nearby assemblages that defines the phase is reproduced by neutral drift over the basin’s geography, the ordinary result of continuous interaction structured by where sites are located. A bounded interaction group would have a sharper structure than the measurements indicate, and Parkin sits across orderings as a transmission bridge rather than at the closed core of one. Extending the test to the wider valley, a decorated-ceramic boundary that exceeds drift appears only between the central-valley and lower-valley blocks. Even there, it is entangled with the early-to-late turnover of the class repertoire. It cannot yet be interpreted as a synchronic social division. Posed in the culture historian’s own terms, against the other named phases of the valley, the Parkin phase itself shows at most a weak contrast at the edge of the drift null, robust to single-site removal but small and within the null’s reach (Figure 9). The phase, at the scale where it is drawn, is largely indistinguishable from spatially structured drift. That carries a consequence that the discipline should consider. A similarity cluster is not, by itself, a society, and before a phase is interpreted as a social group, the record must be shown to distinguish a real interaction boundary from geographic drift. That calibration, not the phase, provides the basis for an explanation of social structure. When applied to the late pre-contact ceramics of the Mississippi Valley, it shows continuous interaction with prominent nodes rather than a mosaic of bounded polities.</w:t>
       </w:r>
     </w:p>
     <w:bookmarkEnd w:id="58"/>
@@ -3255,7 +3282,7 @@
       </w:r>
     </w:p>
     <w:bookmarkEnd w:id="59"/>
-    <w:bookmarkStart w:id="244" w:name="references"/>
+    <w:bookmarkStart w:id="234" w:name="references"/>
     <w:p>
       <w:pPr>
         <w:pStyle w:val="Heading2"/>
@@ -3264,7 +3291,7 @@
         <w:t xml:space="preserve">References</w:t>
       </w:r>
     </w:p>
-    <w:bookmarkStart w:id="243" w:name="refs"/>
+    <w:bookmarkStart w:id="233" w:name="refs"/>
     <w:bookmarkStart w:id="60" w:name="ref-anderson_1996"/>
     <w:p>
       <w:pPr>
@@ -4160,154 +4187,34 @@
       </w:r>
     </w:p>
     <w:bookmarkEnd w:id="95"/>
-    <w:bookmarkStart w:id="97" w:name="ref-dakos_2012"/>
-    <w:p>
-      <w:pPr>
-        <w:pStyle w:val="Bibliography"/>
-      </w:pPr>
-      <w:r>
-        <w:t xml:space="preserve">Dakos, Vasilis, Stephen R. Carpenter, William A. Brock, Aaron M. Ellison, Vishwesha Guttal, Anthony R. Ives, Sonia Kéfi, et al. 2012. Methods for Detecting Early Warnings of Critical Transitions in Time Series Illustrated Using Simulated Ecological Data.</w:t>
-      </w:r>
-      <w:r>
-        <w:t xml:space="preserve"> </w:t>
-      </w:r>
-      <w:r>
-        <w:rPr>
-          <w:i/>
-          <w:iCs/>
-        </w:rPr>
-        <w:t xml:space="preserve">PLoS ONE</w:t>
-      </w:r>
-      <w:r>
-        <w:t xml:space="preserve"> </w:t>
-      </w:r>
-      <w:r>
-        <w:t xml:space="preserve">7(7):e41010.</w:t>
+    <w:bookmarkStart w:id="97" w:name="ref-dunnell_1970"/>
+    <w:p>
+      <w:pPr>
+        <w:pStyle w:val="Bibliography"/>
+      </w:pPr>
+      <w:r>
+        <w:t xml:space="preserve">Dunnell, Robert C. 1970. Seriation Method and Its Evaluation.</w:t>
+      </w:r>
+      <w:r>
+        <w:t xml:space="preserve"> </w:t>
+      </w:r>
+      <w:r>
+        <w:rPr>
+          <w:i/>
+          <w:iCs/>
+        </w:rPr>
+        <w:t xml:space="preserve">American Antiquity</w:t>
+      </w:r>
+      <w:r>
+        <w:t xml:space="preserve"> </w:t>
+      </w:r>
+      <w:r>
+        <w:t xml:space="preserve">35(3):305–319.</w:t>
       </w:r>
       <w:r>
         <w:t xml:space="preserve"> </w:t>
       </w:r>
       <w:hyperlink r:id="rId96">
-        <w:r>
-          <w:rPr>
-            <w:rStyle w:val="Hyperlink"/>
-          </w:rPr>
-          <w:t xml:space="preserve">https://doi.org/10.1371/journal.pone.0041010</w:t>
-        </w:r>
-      </w:hyperlink>
-      <w:r>
-        <w:t xml:space="preserve">.</w:t>
-      </w:r>
-    </w:p>
-    <w:bookmarkEnd w:id="97"/>
-    <w:bookmarkStart w:id="99" w:name="ref-derex_boyd_2016"/>
-    <w:p>
-      <w:pPr>
-        <w:pStyle w:val="Bibliography"/>
-      </w:pPr>
-      <w:r>
-        <w:t xml:space="preserve">Derex, Maxime, and Robert Boyd. 2016. Partial Connectivity Increases Cultural Accumulation Within Groups.</w:t>
-      </w:r>
-      <w:r>
-        <w:t xml:space="preserve"> </w:t>
-      </w:r>
-      <w:r>
-        <w:rPr>
-          <w:i/>
-          <w:iCs/>
-        </w:rPr>
-        <w:t xml:space="preserve">Proceedings of the National Academy of Sciences</w:t>
-      </w:r>
-      <w:r>
-        <w:t xml:space="preserve"> </w:t>
-      </w:r>
-      <w:r>
-        <w:t xml:space="preserve">113(11):2982–2987.</w:t>
-      </w:r>
-      <w:r>
-        <w:t xml:space="preserve"> </w:t>
-      </w:r>
-      <w:hyperlink r:id="rId98">
-        <w:r>
-          <w:rPr>
-            <w:rStyle w:val="Hyperlink"/>
-          </w:rPr>
-          <w:t xml:space="preserve">https://doi.org/10.1073/pnas.1518798113</w:t>
-        </w:r>
-      </w:hyperlink>
-      <w:r>
-        <w:t xml:space="preserve">.</w:t>
-      </w:r>
-    </w:p>
-    <w:bookmarkEnd w:id="99"/>
-    <w:bookmarkStart w:id="101" w:name="ref-derex_perreault_boyd_2018"/>
-    <w:p>
-      <w:pPr>
-        <w:pStyle w:val="Bibliography"/>
-      </w:pPr>
-      <w:r>
-        <w:t xml:space="preserve">Derex, Maxime, Charles Perreault, and Robert Boyd. 2018. Divide and Conquer: Intermediate Levels of Population Fragmentation Maximize Cultural Accumulation.</w:t>
-      </w:r>
-      <w:r>
-        <w:t xml:space="preserve"> </w:t>
-      </w:r>
-      <w:r>
-        <w:rPr>
-          <w:i/>
-          <w:iCs/>
-        </w:rPr>
-        <w:t xml:space="preserve">Philosophical Transactions of the Royal Society B</w:t>
-      </w:r>
-      <w:r>
-        <w:t xml:space="preserve"> </w:t>
-      </w:r>
-      <w:r>
-        <w:t xml:space="preserve">373(1743):20170062.</w:t>
-      </w:r>
-      <w:r>
-        <w:t xml:space="preserve"> </w:t>
-      </w:r>
-      <w:hyperlink r:id="rId100">
-        <w:r>
-          <w:rPr>
-            <w:rStyle w:val="Hyperlink"/>
-          </w:rPr>
-          <w:t xml:space="preserve">https://doi.org/10.1098/rstb.2017.0062</w:t>
-        </w:r>
-      </w:hyperlink>
-      <w:r>
-        <w:t xml:space="preserve">.</w:t>
-      </w:r>
-    </w:p>
-    <w:bookmarkEnd w:id="101"/>
-    <w:bookmarkStart w:id="103" w:name="ref-dunnell_1970"/>
-    <w:p>
-      <w:pPr>
-        <w:pStyle w:val="Bibliography"/>
-      </w:pPr>
-      <w:r>
-        <w:t xml:space="preserve">Dunnell, Robert C. 1970. Seriation Method and Its Evaluation.</w:t>
-      </w:r>
-      <w:r>
-        <w:t xml:space="preserve"> </w:t>
-      </w:r>
-      <w:r>
-        <w:rPr>
-          <w:i/>
-          <w:iCs/>
-        </w:rPr>
-        <w:t xml:space="preserve">American Antiquity</w:t>
-      </w:r>
-      <w:r>
-        <w:t xml:space="preserve"> </w:t>
-      </w:r>
-      <w:r>
-        <w:t xml:space="preserve">35(3):305–319.</w:t>
-      </w:r>
-      <w:r>
-        <w:t xml:space="preserve"> </w:t>
-      </w:r>
-      <w:hyperlink r:id="rId102">
         <w:r>
           <w:rPr>
             <w:rStyle w:val="Hyperlink"/>
@@ -4319,8 +4226,8 @@
         <w:t xml:space="preserve">.</w:t>
       </w:r>
     </w:p>
-    <w:bookmarkEnd w:id="103"/>
-    <w:bookmarkStart w:id="105" w:name="ref-dunnell_1978"/>
+    <w:bookmarkEnd w:id="97"/>
+    <w:bookmarkStart w:id="99" w:name="ref-dunnell_1978"/>
     <w:p>
       <w:pPr>
         <w:pStyle w:val="Bibliography"/>
@@ -4347,7 +4254,7 @@
       <w:r>
         <w:t xml:space="preserve"> </w:t>
       </w:r>
-      <w:hyperlink r:id="rId104">
+      <w:hyperlink r:id="rId98">
         <w:r>
           <w:rPr>
             <w:rStyle w:val="Hyperlink"/>
@@ -4359,8 +4266,8 @@
         <w:t xml:space="preserve">.</w:t>
       </w:r>
     </w:p>
-    <w:bookmarkEnd w:id="105"/>
-    <w:bookmarkStart w:id="106" w:name="ref-dunnell_1980"/>
+    <w:bookmarkEnd w:id="99"/>
+    <w:bookmarkStart w:id="100" w:name="ref-dunnell_1980"/>
     <w:p>
       <w:pPr>
         <w:pStyle w:val="Bibliography"/>
@@ -4382,8 +4289,8 @@
         <w:t xml:space="preserve">, edited by Michael B. Schiffer, pp. 35–99. Academic Press, New York.</w:t>
       </w:r>
     </w:p>
-    <w:bookmarkEnd w:id="106"/>
-    <w:bookmarkStart w:id="107" w:name="ref-dunnell_1995"/>
+    <w:bookmarkEnd w:id="100"/>
+    <w:bookmarkStart w:id="101" w:name="ref-dunnell_1995"/>
     <w:p>
       <w:pPr>
         <w:pStyle w:val="Bibliography"/>
@@ -4405,8 +4312,8 @@
         <w:t xml:space="preserve">, edited by Patrice A. Teltser, pp. 33–50. University of Arizona Press, Tucson.</w:t>
       </w:r>
     </w:p>
-    <w:bookmarkEnd w:id="107"/>
-    <w:bookmarkStart w:id="108" w:name="ref-dunnell_1995b"/>
+    <w:bookmarkEnd w:id="101"/>
+    <w:bookmarkStart w:id="102" w:name="ref-dunnell_1995b"/>
     <w:p>
       <w:pPr>
         <w:pStyle w:val="Bibliography"/>
@@ -4415,8 +4322,8 @@
         <w:t xml:space="preserve">Dunnell, Robert C. 1995b. Style: Concepts and Practice.</w:t>
       </w:r>
     </w:p>
-    <w:bookmarkEnd w:id="108"/>
-    <w:bookmarkStart w:id="109" w:name="ref-dye_cox_1990"/>
+    <w:bookmarkEnd w:id="102"/>
+    <w:bookmarkStart w:id="103" w:name="ref-dye_cox_1990"/>
     <w:p>
       <w:pPr>
         <w:pStyle w:val="Bibliography"/>
@@ -4452,8 +4359,8 @@
         <w:t xml:space="preserve">. University of Alabama Press, Tuscaloosa.</w:t>
       </w:r>
     </w:p>
-    <w:bookmarkEnd w:id="109"/>
-    <w:bookmarkStart w:id="111" w:name="ref-eerkens_lipo_2005"/>
+    <w:bookmarkEnd w:id="103"/>
+    <w:bookmarkStart w:id="105" w:name="ref-eerkens_lipo_2005"/>
     <w:p>
       <w:pPr>
         <w:pStyle w:val="Bibliography"/>
@@ -4480,7 +4387,7 @@
       <w:r>
         <w:t xml:space="preserve"> </w:t>
       </w:r>
-      <w:hyperlink r:id="rId110">
+      <w:hyperlink r:id="rId104">
         <w:r>
           <w:rPr>
             <w:rStyle w:val="Hyperlink"/>
@@ -4492,8 +4399,8 @@
         <w:t xml:space="preserve">.</w:t>
       </w:r>
     </w:p>
-    <w:bookmarkEnd w:id="111"/>
-    <w:bookmarkStart w:id="113" w:name="ref-eerkens_lipo_2007"/>
+    <w:bookmarkEnd w:id="105"/>
+    <w:bookmarkStart w:id="107" w:name="ref-eerkens_lipo_2007"/>
     <w:p>
       <w:pPr>
         <w:pStyle w:val="Bibliography"/>
@@ -4520,7 +4427,7 @@
       <w:r>
         <w:t xml:space="preserve"> </w:t>
       </w:r>
-      <w:hyperlink r:id="rId112">
+      <w:hyperlink r:id="rId106">
         <w:r>
           <w:rPr>
             <w:rStyle w:val="Hyperlink"/>
@@ -4532,8 +4439,8 @@
         <w:t xml:space="preserve">.</w:t>
       </w:r>
     </w:p>
-    <w:bookmarkEnd w:id="113"/>
-    <w:bookmarkStart w:id="114" w:name="ref-ewens_1972"/>
+    <w:bookmarkEnd w:id="107"/>
+    <w:bookmarkStart w:id="108" w:name="ref-ewens_1972"/>
     <w:p>
       <w:pPr>
         <w:pStyle w:val="Bibliography"/>
@@ -4558,8 +4465,8 @@
         <w:t xml:space="preserve">3(1):87–112.</w:t>
       </w:r>
     </w:p>
-    <w:bookmarkEnd w:id="114"/>
-    <w:bookmarkStart w:id="116" w:name="ref-feder_kryazhimskiy_plotkin_2014"/>
+    <w:bookmarkEnd w:id="108"/>
+    <w:bookmarkStart w:id="110" w:name="ref-feder_kryazhimskiy_plotkin_2014"/>
     <w:p>
       <w:pPr>
         <w:pStyle w:val="Bibliography"/>
@@ -4586,7 +4493,7 @@
       <w:r>
         <w:t xml:space="preserve"> </w:t>
       </w:r>
-      <w:hyperlink r:id="rId115">
+      <w:hyperlink r:id="rId109">
         <w:r>
           <w:rPr>
             <w:rStyle w:val="Hyperlink"/>
@@ -4598,8 +4505,8 @@
         <w:t xml:space="preserve">.</w:t>
       </w:r>
     </w:p>
-    <w:bookmarkEnd w:id="116"/>
-    <w:bookmarkStart w:id="118" w:name="ref-fogarty_kandler_creanza_2024"/>
+    <w:bookmarkEnd w:id="110"/>
+    <w:bookmarkStart w:id="112" w:name="ref-fogarty_kandler_creanza_2024"/>
     <w:p>
       <w:pPr>
         <w:pStyle w:val="Bibliography"/>
@@ -4626,7 +4533,7 @@
       <w:r>
         <w:t xml:space="preserve"> </w:t>
       </w:r>
-      <w:hyperlink r:id="rId117">
+      <w:hyperlink r:id="rId111">
         <w:r>
           <w:rPr>
             <w:rStyle w:val="Hyperlink"/>
@@ -4638,8 +4545,8 @@
         <w:t xml:space="preserve">.</w:t>
       </w:r>
     </w:p>
-    <w:bookmarkEnd w:id="118"/>
-    <w:bookmarkStart w:id="119" w:name="ref-fox_1998"/>
+    <w:bookmarkEnd w:id="112"/>
+    <w:bookmarkStart w:id="113" w:name="ref-fox_1998"/>
     <w:p>
       <w:pPr>
         <w:pStyle w:val="Bibliography"/>
@@ -4661,8 +4568,8 @@
         <w:t xml:space="preserve">, edited by Michael J. O’Brien and Robert C. Dunnell, pp. 31–58. University of Alabama Press, Tuscaloosa.</w:t>
       </w:r>
     </w:p>
-    <w:bookmarkEnd w:id="119"/>
-    <w:bookmarkStart w:id="120" w:name="ref-hally_1993"/>
+    <w:bookmarkEnd w:id="113"/>
+    <w:bookmarkStart w:id="114" w:name="ref-hally_1993"/>
     <w:p>
       <w:pPr>
         <w:pStyle w:val="Bibliography"/>
@@ -4696,8 +4603,8 @@
         <w:t xml:space="preserve">, edited by James B. Stoltman, pp. 143–167. Archaeological Report No. 25. Mississippi Department of Archives; History, Jackson.</w:t>
       </w:r>
     </w:p>
-    <w:bookmarkEnd w:id="120"/>
-    <w:bookmarkStart w:id="121" w:name="ref-hally_1996"/>
+    <w:bookmarkEnd w:id="114"/>
+    <w:bookmarkStart w:id="115" w:name="ref-hally_1996"/>
     <w:p>
       <w:pPr>
         <w:pStyle w:val="Bibliography"/>
@@ -4731,8 +4638,8 @@
         <w:t xml:space="preserve">, edited by John F. Scarry, pp. 92–127. University Press of Florida, Gainesville.</w:t>
       </w:r>
     </w:p>
-    <w:bookmarkEnd w:id="121"/>
-    <w:bookmarkStart w:id="123" w:name="ref-henrich_2001"/>
+    <w:bookmarkEnd w:id="115"/>
+    <w:bookmarkStart w:id="117" w:name="ref-henrich_2001"/>
     <w:p>
       <w:pPr>
         <w:pStyle w:val="Bibliography"/>
@@ -4759,7 +4666,7 @@
       <w:r>
         <w:t xml:space="preserve"> </w:t>
       </w:r>
-      <w:hyperlink r:id="rId122">
+      <w:hyperlink r:id="rId116">
         <w:r>
           <w:rPr>
             <w:rStyle w:val="Hyperlink"/>
@@ -4771,8 +4678,8 @@
         <w:t xml:space="preserve">.</w:t>
       </w:r>
     </w:p>
-    <w:bookmarkEnd w:id="123"/>
-    <w:bookmarkStart w:id="125" w:name="ref-henrich_2004"/>
+    <w:bookmarkEnd w:id="117"/>
+    <w:bookmarkStart w:id="119" w:name="ref-henrich_2004"/>
     <w:p>
       <w:pPr>
         <w:pStyle w:val="Bibliography"/>
@@ -4811,7 +4718,7 @@
       <w:r>
         <w:t xml:space="preserve"> </w:t>
       </w:r>
-      <w:hyperlink r:id="rId124">
+      <w:hyperlink r:id="rId118">
         <w:r>
           <w:rPr>
             <w:rStyle w:val="Hyperlink"/>
@@ -4823,8 +4730,8 @@
         <w:t xml:space="preserve">.</w:t>
       </w:r>
     </w:p>
-    <w:bookmarkEnd w:id="125"/>
-    <w:bookmarkStart w:id="127" w:name="ref-henrich_boyd_1998"/>
+    <w:bookmarkEnd w:id="119"/>
+    <w:bookmarkStart w:id="121" w:name="ref-henrich_boyd_1998"/>
     <w:p>
       <w:pPr>
         <w:pStyle w:val="Bibliography"/>
@@ -4851,7 +4758,7 @@
       <w:r>
         <w:t xml:space="preserve"> </w:t>
       </w:r>
-      <w:hyperlink r:id="rId126">
+      <w:hyperlink r:id="rId120">
         <w:r>
           <w:rPr>
             <w:rStyle w:val="Hyperlink"/>
@@ -4863,8 +4770,8 @@
         <w:t xml:space="preserve">.</w:t>
       </w:r>
     </w:p>
-    <w:bookmarkEnd w:id="127"/>
-    <w:bookmarkStart w:id="128" w:name="ref-holdaway_wandsnider_2008"/>
+    <w:bookmarkEnd w:id="121"/>
+    <w:bookmarkStart w:id="122" w:name="ref-holdaway_wandsnider_2008"/>
     <w:p>
       <w:pPr>
         <w:pStyle w:val="Bibliography"/>
@@ -4886,8 +4793,8 @@
         <w:t xml:space="preserve">. University of Utah Press, Salt Lake City.</w:t>
       </w:r>
     </w:p>
-    <w:bookmarkEnd w:id="128"/>
-    <w:bookmarkStart w:id="130" w:name="ref-holland-lulewicz_ritchison_2021"/>
+    <w:bookmarkEnd w:id="122"/>
+    <w:bookmarkStart w:id="124" w:name="ref-holland-lulewicz_ritchison_2021"/>
     <w:p>
       <w:pPr>
         <w:pStyle w:val="Bibliography"/>
@@ -4914,7 +4821,7 @@
       <w:r>
         <w:t xml:space="preserve"> </w:t>
       </w:r>
-      <w:hyperlink r:id="rId129">
+      <w:hyperlink r:id="rId123">
         <w:r>
           <w:rPr>
             <w:rStyle w:val="Hyperlink"/>
@@ -4926,8 +4833,8 @@
         <w:t xml:space="preserve">.</w:t>
       </w:r>
     </w:p>
-    <w:bookmarkEnd w:id="130"/>
-    <w:bookmarkStart w:id="131" w:name="ref-house_1991"/>
+    <w:bookmarkEnd w:id="124"/>
+    <w:bookmarkStart w:id="125" w:name="ref-house_1991"/>
     <w:p>
       <w:pPr>
         <w:pStyle w:val="Bibliography"/>
@@ -4969,8 +4876,8 @@
         <w:t xml:space="preserve">. PhD thesis, Southern Illinois University at Carbondale.</w:t>
       </w:r>
     </w:p>
-    <w:bookmarkEnd w:id="131"/>
-    <w:bookmarkStart w:id="132" w:name="ref-house_1993"/>
+    <w:bookmarkEnd w:id="125"/>
+    <w:bookmarkStart w:id="126" w:name="ref-house_1993"/>
     <w:p>
       <w:pPr>
         <w:pStyle w:val="Bibliography"/>
@@ -4995,8 +4902,8 @@
         <w:t xml:space="preserve">12(1):21–32.</w:t>
       </w:r>
     </w:p>
-    <w:bookmarkEnd w:id="132"/>
-    <w:bookmarkStart w:id="133" w:name="ref-hudson_smith_depratter_1990"/>
+    <w:bookmarkEnd w:id="126"/>
+    <w:bookmarkStart w:id="127" w:name="ref-hudson_smith_depratter_1990"/>
     <w:p>
       <w:pPr>
         <w:pStyle w:val="Bibliography"/>
@@ -5056,8 +4963,8 @@
         <w:t xml:space="preserve">, edited by David H. Dye and Cheryl Anne Cox, pp. 181–207. University of Alabama Press, Tuscaloosa.</w:t>
       </w:r>
     </w:p>
-    <w:bookmarkEnd w:id="133"/>
-    <w:bookmarkStart w:id="135" w:name="ref-hunt_2006"/>
+    <w:bookmarkEnd w:id="127"/>
+    <w:bookmarkStart w:id="129" w:name="ref-hunt_2006"/>
     <w:p>
       <w:pPr>
         <w:pStyle w:val="Bibliography"/>
@@ -5084,7 +4991,7 @@
       <w:r>
         <w:t xml:space="preserve"> </w:t>
       </w:r>
-      <w:hyperlink r:id="rId134">
+      <w:hyperlink r:id="rId128">
         <w:r>
           <w:rPr>
             <w:rStyle w:val="Hyperlink"/>
@@ -5096,8 +5003,8 @@
         <w:t xml:space="preserve">.</w:t>
       </w:r>
     </w:p>
-    <w:bookmarkEnd w:id="135"/>
-    <w:bookmarkStart w:id="137" w:name="ref-hunt_bell_travis_2008"/>
+    <w:bookmarkEnd w:id="129"/>
+    <w:bookmarkStart w:id="131" w:name="ref-hunt_bell_travis_2008"/>
     <w:p>
       <w:pPr>
         <w:pStyle w:val="Bibliography"/>
@@ -5124,7 +5031,7 @@
       <w:r>
         <w:t xml:space="preserve"> </w:t>
       </w:r>
-      <w:hyperlink r:id="rId136">
+      <w:hyperlink r:id="rId130">
         <w:r>
           <w:rPr>
             <w:rStyle w:val="Hyperlink"/>
@@ -5136,8 +5043,8 @@
         <w:t xml:space="preserve">.</w:t>
       </w:r>
     </w:p>
-    <w:bookmarkEnd w:id="137"/>
-    <w:bookmarkStart w:id="138" w:name="ref-hurlbert_1971"/>
+    <w:bookmarkEnd w:id="131"/>
+    <w:bookmarkStart w:id="132" w:name="ref-hurlbert_1971"/>
     <w:p>
       <w:pPr>
         <w:pStyle w:val="Bibliography"/>
@@ -5162,8 +5069,8 @@
         <w:t xml:space="preserve">52(4):577–586.</w:t>
       </w:r>
     </w:p>
-    <w:bookmarkEnd w:id="138"/>
-    <w:bookmarkStart w:id="140" w:name="ref-kandler_shennan_2013"/>
+    <w:bookmarkEnd w:id="132"/>
+    <w:bookmarkStart w:id="134" w:name="ref-kandler_shennan_2013"/>
     <w:p>
       <w:pPr>
         <w:pStyle w:val="Bibliography"/>
@@ -5190,7 +5097,7 @@
       <w:r>
         <w:t xml:space="preserve"> </w:t>
       </w:r>
-      <w:hyperlink r:id="rId139">
+      <w:hyperlink r:id="rId133">
         <w:r>
           <w:rPr>
             <w:rStyle w:val="Hyperlink"/>
@@ -5202,8 +5109,8 @@
         <w:t xml:space="preserve">.</w:t>
       </w:r>
     </w:p>
-    <w:bookmarkEnd w:id="140"/>
-    <w:bookmarkStart w:id="142" w:name="ref-kandler_shennan_2015"/>
+    <w:bookmarkEnd w:id="134"/>
+    <w:bookmarkStart w:id="136" w:name="ref-kandler_shennan_2015"/>
     <w:p>
       <w:pPr>
         <w:pStyle w:val="Bibliography"/>
@@ -5242,7 +5149,7 @@
       <w:r>
         <w:t xml:space="preserve"> </w:t>
       </w:r>
-      <w:hyperlink r:id="rId141">
+      <w:hyperlink r:id="rId135">
         <w:r>
           <w:rPr>
             <w:rStyle w:val="Hyperlink"/>
@@ -5254,8 +5161,8 @@
         <w:t xml:space="preserve">.</w:t>
       </w:r>
     </w:p>
-    <w:bookmarkEnd w:id="142"/>
-    <w:bookmarkStart w:id="144" w:name="ref-kandler_wilder_fortunato_2017"/>
+    <w:bookmarkEnd w:id="136"/>
+    <w:bookmarkStart w:id="138" w:name="ref-kandler_wilder_fortunato_2017"/>
     <w:p>
       <w:pPr>
         <w:pStyle w:val="Bibliography"/>
@@ -5282,7 +5189,7 @@
       <w:r>
         <w:t xml:space="preserve"> </w:t>
       </w:r>
-      <w:hyperlink r:id="rId143">
+      <w:hyperlink r:id="rId137">
         <w:r>
           <w:rPr>
             <w:rStyle w:val="Hyperlink"/>
@@ -5294,8 +5201,8 @@
         <w:t xml:space="preserve">.</w:t>
       </w:r>
     </w:p>
-    <w:bookmarkEnd w:id="144"/>
-    <w:bookmarkStart w:id="146" w:name="ref-kidwell_tomasovych_2013"/>
+    <w:bookmarkEnd w:id="138"/>
+    <w:bookmarkStart w:id="140" w:name="ref-kidwell_tomasovych_2013"/>
     <w:p>
       <w:pPr>
         <w:pStyle w:val="Bibliography"/>
@@ -5322,7 +5229,7 @@
       <w:r>
         <w:t xml:space="preserve"> </w:t>
       </w:r>
-      <w:hyperlink r:id="rId145">
+      <w:hyperlink r:id="rId139">
         <w:r>
           <w:rPr>
             <w:rStyle w:val="Hyperlink"/>
@@ -5334,8 +5241,8 @@
         <w:t xml:space="preserve">.</w:t>
       </w:r>
     </w:p>
-    <w:bookmarkEnd w:id="146"/>
-    <w:bookmarkStart w:id="147" w:name="ref-king_freer_1995"/>
+    <w:bookmarkEnd w:id="140"/>
+    <w:bookmarkStart w:id="141" w:name="ref-king_freer_1995"/>
     <w:p>
       <w:pPr>
         <w:pStyle w:val="Bibliography"/>
@@ -5369,8 +5276,8 @@
         <w:t xml:space="preserve">, edited by Michael S. Nassaney and Kenneth E. Sassaman, pp. 266–288. University of Tennessee Press, Knoxville.</w:t>
       </w:r>
     </w:p>
-    <w:bookmarkEnd w:id="147"/>
-    <w:bookmarkStart w:id="149" w:name="ref-ladefoged_graves_2000"/>
+    <w:bookmarkEnd w:id="141"/>
+    <w:bookmarkStart w:id="143" w:name="ref-ladefoged_graves_2000"/>
     <w:p>
       <w:pPr>
         <w:pStyle w:val="Bibliography"/>
@@ -5415,7 +5322,7 @@
       <w:r>
         <w:t xml:space="preserve"> </w:t>
       </w:r>
-      <w:hyperlink r:id="rId148">
+      <w:hyperlink r:id="rId142">
         <w:r>
           <w:rPr>
             <w:rStyle w:val="Hyperlink"/>
@@ -5427,8 +5334,8 @@
         <w:t xml:space="preserve">.</w:t>
       </w:r>
     </w:p>
-    <w:bookmarkEnd w:id="149"/>
-    <w:bookmarkStart w:id="150" w:name="ref-lewontin_1974"/>
+    <w:bookmarkEnd w:id="143"/>
+    <w:bookmarkStart w:id="144" w:name="ref-lewontin_1974"/>
     <w:p>
       <w:pPr>
         <w:pStyle w:val="Bibliography"/>
@@ -5450,8 +5357,8 @@
         <w:t xml:space="preserve">. Columbia University Press, New York.</w:t>
       </w:r>
     </w:p>
-    <w:bookmarkEnd w:id="150"/>
-    <w:bookmarkStart w:id="151" w:name="ref-lipo_2001"/>
+    <w:bookmarkEnd w:id="144"/>
+    <w:bookmarkStart w:id="145" w:name="ref-lipo_2001"/>
     <w:p>
       <w:pPr>
         <w:pStyle w:val="Bibliography"/>
@@ -5501,8 +5408,8 @@
         <w:t xml:space="preserve">. BAR International Series 918. Archaeopress, Oxford.</w:t>
       </w:r>
     </w:p>
-    <w:bookmarkEnd w:id="151"/>
-    <w:bookmarkStart w:id="153" w:name="ref-lipo_dinapoli_madsen_hunt_2021"/>
+    <w:bookmarkEnd w:id="145"/>
+    <w:bookmarkStart w:id="147" w:name="ref-lipo_dinapoli_madsen_hunt_2021"/>
     <w:p>
       <w:pPr>
         <w:pStyle w:val="Bibliography"/>
@@ -5529,7 +5436,7 @@
       <w:r>
         <w:t xml:space="preserve"> </w:t>
       </w:r>
-      <w:hyperlink r:id="rId152">
+      <w:hyperlink r:id="rId146">
         <w:r>
           <w:rPr>
             <w:rStyle w:val="Hyperlink"/>
@@ -5541,8 +5448,8 @@
         <w:t xml:space="preserve">.</w:t>
       </w:r>
     </w:p>
-    <w:bookmarkEnd w:id="153"/>
-    <w:bookmarkStart w:id="154" w:name="ref-lipo_dunnell_2007"/>
+    <w:bookmarkEnd w:id="147"/>
+    <w:bookmarkStart w:id="148" w:name="ref-lipo_dunnell_2007"/>
     <w:p>
       <w:pPr>
         <w:pStyle w:val="Bibliography"/>
@@ -5604,8 +5511,8 @@
         <w:t xml:space="preserve">, edited by Janet Rafferty and Evan Peacock, pp. 125–167. University of Alabama Press, Tuscaloosa.</w:t>
       </w:r>
     </w:p>
-    <w:bookmarkEnd w:id="154"/>
-    <w:bookmarkStart w:id="156" w:name="ref-lipo_hunt_hundtoft_2010"/>
+    <w:bookmarkEnd w:id="148"/>
+    <w:bookmarkStart w:id="150" w:name="ref-lipo_hunt_hundtoft_2010"/>
     <w:p>
       <w:pPr>
         <w:pStyle w:val="Bibliography"/>
@@ -5650,7 +5557,7 @@
       <w:r>
         <w:t xml:space="preserve"> </w:t>
       </w:r>
-      <w:hyperlink r:id="rId155">
+      <w:hyperlink r:id="rId149">
         <w:r>
           <w:rPr>
             <w:rStyle w:val="Hyperlink"/>
@@ -5662,8 +5569,8 @@
         <w:t xml:space="preserve">.</w:t>
       </w:r>
     </w:p>
-    <w:bookmarkEnd w:id="156"/>
-    <w:bookmarkStart w:id="157" w:name="ref-lipo_madsen_2001"/>
+    <w:bookmarkEnd w:id="150"/>
+    <w:bookmarkStart w:id="151" w:name="ref-lipo_madsen_2001"/>
     <w:p>
       <w:pPr>
         <w:pStyle w:val="Bibliography"/>
@@ -5697,8 +5604,8 @@
         <w:t xml:space="preserve">, edited by Teresa D. Hurt and Gordon F. M. Rakita, pp. 91–118. Bergin &amp; Garvey, Westport, Connecticut.</w:t>
       </w:r>
     </w:p>
-    <w:bookmarkEnd w:id="157"/>
-    <w:bookmarkStart w:id="159" w:name="ref-lipo_madsen_dunnell_2015"/>
+    <w:bookmarkEnd w:id="151"/>
+    <w:bookmarkStart w:id="153" w:name="ref-lipo_madsen_dunnell_2015"/>
     <w:p>
       <w:pPr>
         <w:pStyle w:val="Bibliography"/>
@@ -5725,7 +5632,7 @@
       <w:r>
         <w:t xml:space="preserve"> </w:t>
       </w:r>
-      <w:hyperlink r:id="rId158">
+      <w:hyperlink r:id="rId152">
         <w:r>
           <w:rPr>
             <w:rStyle w:val="Hyperlink"/>
@@ -5737,8 +5644,8 @@
         <w:t xml:space="preserve">.</w:t>
       </w:r>
     </w:p>
-    <w:bookmarkEnd w:id="159"/>
-    <w:bookmarkStart w:id="161" w:name="ref-lipo_madsen_dunnell_hunt_1997"/>
+    <w:bookmarkEnd w:id="153"/>
+    <w:bookmarkStart w:id="155" w:name="ref-lipo_madsen_dunnell_hunt_1997"/>
     <w:p>
       <w:pPr>
         <w:pStyle w:val="Bibliography"/>
@@ -5765,7 +5672,7 @@
       <w:r>
         <w:t xml:space="preserve"> </w:t>
       </w:r>
-      <w:hyperlink r:id="rId160">
+      <w:hyperlink r:id="rId154">
         <w:r>
           <w:rPr>
             <w:rStyle w:val="Hyperlink"/>
@@ -5777,8 +5684,8 @@
         <w:t xml:space="preserve">.</w:t>
       </w:r>
     </w:p>
-    <w:bookmarkEnd w:id="161"/>
-    <w:bookmarkStart w:id="163" w:name="ref-holland-lulewicz_2019"/>
+    <w:bookmarkEnd w:id="155"/>
+    <w:bookmarkStart w:id="157" w:name="ref-holland-lulewicz_2019"/>
     <w:p>
       <w:pPr>
         <w:pStyle w:val="Bibliography"/>
@@ -5832,7 +5739,7 @@
       <w:r>
         <w:t xml:space="preserve"> </w:t>
       </w:r>
-      <w:hyperlink r:id="rId162">
+      <w:hyperlink r:id="rId156">
         <w:r>
           <w:rPr>
             <w:rStyle w:val="Hyperlink"/>
@@ -5844,8 +5751,8 @@
         <w:t xml:space="preserve">.</w:t>
       </w:r>
     </w:p>
-    <w:bookmarkEnd w:id="163"/>
-    <w:bookmarkStart w:id="165" w:name="ref-lyman_2021"/>
+    <w:bookmarkEnd w:id="157"/>
+    <w:bookmarkStart w:id="159" w:name="ref-lyman_2021"/>
     <w:p>
       <w:pPr>
         <w:pStyle w:val="Bibliography"/>
@@ -5872,7 +5779,7 @@
       <w:r>
         <w:t xml:space="preserve"> </w:t>
       </w:r>
-      <w:hyperlink r:id="rId164">
+      <w:hyperlink r:id="rId158">
         <w:r>
           <w:rPr>
             <w:rStyle w:val="Hyperlink"/>
@@ -5884,270 +5791,270 @@
         <w:t xml:space="preserve">.</w:t>
       </w:r>
     </w:p>
+    <w:bookmarkEnd w:id="159"/>
+    <w:bookmarkStart w:id="160" w:name="ref-madsen_2012"/>
+    <w:p>
+      <w:pPr>
+        <w:pStyle w:val="Bibliography"/>
+      </w:pPr>
+      <w:r>
+        <w:t xml:space="preserve">Madsen, Mark E. 2012. Neutral Cultural Transmission in Time-Averaged Archaeological Assemblages. arXiv preprint arXiv:1204.2043 [physics.soc-ph].</w:t>
+      </w:r>
+    </w:p>
+    <w:bookmarkEnd w:id="160"/>
+    <w:bookmarkStart w:id="161" w:name="ref-mainfort_1996"/>
+    <w:p>
+      <w:pPr>
+        <w:pStyle w:val="Bibliography"/>
+      </w:pPr>
+      <w:r>
+        <w:t xml:space="preserve">Mainfort, Jr., Robert C. 1996a. Late Period Chronology in the Central</w:t>
+      </w:r>
+      <w:r>
+        <w:t xml:space="preserve"> </w:t>
+      </w:r>
+      <w:r>
+        <w:t xml:space="preserve">Mississippi</w:t>
+      </w:r>
+      <w:r>
+        <w:t xml:space="preserve"> </w:t>
+      </w:r>
+      <w:r>
+        <w:t xml:space="preserve">Valley: A Western</w:t>
+      </w:r>
+      <w:r>
+        <w:t xml:space="preserve"> </w:t>
+      </w:r>
+      <w:r>
+        <w:t xml:space="preserve">Tennessee</w:t>
+      </w:r>
+      <w:r>
+        <w:t xml:space="preserve"> </w:t>
+      </w:r>
+      <w:r>
+        <w:t xml:space="preserve">Perspective.</w:t>
+      </w:r>
+      <w:r>
+        <w:t xml:space="preserve"> </w:t>
+      </w:r>
+      <w:r>
+        <w:rPr>
+          <w:i/>
+          <w:iCs/>
+        </w:rPr>
+        <w:t xml:space="preserve">Southeastern Archaeology</w:t>
+      </w:r>
+      <w:r>
+        <w:t xml:space="preserve"> </w:t>
+      </w:r>
+      <w:r>
+        <w:t xml:space="preserve">15(2):172–181.</w:t>
+      </w:r>
+    </w:p>
+    <w:bookmarkEnd w:id="161"/>
+    <w:bookmarkStart w:id="162" w:name="ref-mainfort_1996b"/>
+    <w:p>
+      <w:pPr>
+        <w:pStyle w:val="Bibliography"/>
+      </w:pPr>
+      <w:r>
+        <w:t xml:space="preserve">Mainfort, Jr., Robert C. 1996b. Late Period Chronology in the Central Mississippi Valley: A Western Tennessee Perspective.</w:t>
+      </w:r>
+      <w:r>
+        <w:t xml:space="preserve"> </w:t>
+      </w:r>
+      <w:r>
+        <w:rPr>
+          <w:i/>
+          <w:iCs/>
+        </w:rPr>
+        <w:t xml:space="preserve">Southeastern Archaeology</w:t>
+      </w:r>
+      <w:r>
+        <w:t xml:space="preserve"> </w:t>
+      </w:r>
+      <w:r>
+        <w:t xml:space="preserve">15(2):172–181.</w:t>
+      </w:r>
+    </w:p>
+    <w:bookmarkEnd w:id="162"/>
+    <w:bookmarkStart w:id="163" w:name="ref-mainfort_2001"/>
+    <w:p>
+      <w:pPr>
+        <w:pStyle w:val="Bibliography"/>
+      </w:pPr>
+      <w:r>
+        <w:t xml:space="preserve">Mainfort, Jr., Robert C. 2001. The Late Prehistoric and Protohistoric Periods in the Central</w:t>
+      </w:r>
+      <w:r>
+        <w:t xml:space="preserve"> </w:t>
+      </w:r>
+      <w:r>
+        <w:t xml:space="preserve">Mississippi</w:t>
+      </w:r>
+      <w:r>
+        <w:t xml:space="preserve"> </w:t>
+      </w:r>
+      <w:r>
+        <w:t xml:space="preserve">Valley. In</w:t>
+      </w:r>
+      <w:r>
+        <w:t xml:space="preserve"> </w:t>
+      </w:r>
+      <w:r>
+        <w:rPr>
+          <w:i/>
+          <w:iCs/>
+        </w:rPr>
+        <w:t xml:space="preserve">Societies in Eclipse: Archaeology of the Eastern Woodlands Indians, a.d. 1400–1700</w:t>
+      </w:r>
+      <w:r>
+        <w:t xml:space="preserve">, edited by David S. Brose, C. Wesley Cowan, and Jr. Mainfort Robert C., pp. 173–190. Smithsonian Institution Press, Washington, DC.</w:t>
+      </w:r>
+    </w:p>
+    <w:bookmarkEnd w:id="163"/>
+    <w:bookmarkStart w:id="164" w:name="ref-mainfort_2003"/>
+    <w:p>
+      <w:pPr>
+        <w:pStyle w:val="Bibliography"/>
+      </w:pPr>
+      <w:r>
+        <w:t xml:space="preserve">Mainfort, Jr., Robert C. 2003. An Ordination Approach to Assessing Late Period Phases in the Central</w:t>
+      </w:r>
+      <w:r>
+        <w:t xml:space="preserve"> </w:t>
+      </w:r>
+      <w:r>
+        <w:t xml:space="preserve">Mississippi</w:t>
+      </w:r>
+      <w:r>
+        <w:t xml:space="preserve"> </w:t>
+      </w:r>
+      <w:r>
+        <w:t xml:space="preserve">Valley.</w:t>
+      </w:r>
+      <w:r>
+        <w:t xml:space="preserve"> </w:t>
+      </w:r>
+      <w:r>
+        <w:rPr>
+          <w:i/>
+          <w:iCs/>
+        </w:rPr>
+        <w:t xml:space="preserve">Southeastern Archaeology</w:t>
+      </w:r>
+      <w:r>
+        <w:t xml:space="preserve"> </w:t>
+      </w:r>
+      <w:r>
+        <w:t xml:space="preserve">22(2):176–184.</w:t>
+      </w:r>
+    </w:p>
+    <w:bookmarkEnd w:id="164"/>
+    <w:bookmarkStart w:id="165" w:name="ref-mantel_1967"/>
+    <w:p>
+      <w:pPr>
+        <w:pStyle w:val="Bibliography"/>
+      </w:pPr>
+      <w:r>
+        <w:t xml:space="preserve">Mantel, Nathan. 1967. The Detection of Disease Clustering and a Generalized Regression Approach.</w:t>
+      </w:r>
+      <w:r>
+        <w:t xml:space="preserve"> </w:t>
+      </w:r>
+      <w:r>
+        <w:rPr>
+          <w:i/>
+          <w:iCs/>
+        </w:rPr>
+        <w:t xml:space="preserve">Cancer Research</w:t>
+      </w:r>
+      <w:r>
+        <w:t xml:space="preserve"> </w:t>
+      </w:r>
+      <w:r>
+        <w:t xml:space="preserve">27(2):209–220.</w:t>
+      </w:r>
+    </w:p>
     <w:bookmarkEnd w:id="165"/>
-    <w:bookmarkStart w:id="166" w:name="ref-madsen_2012"/>
-    <w:p>
-      <w:pPr>
-        <w:pStyle w:val="Bibliography"/>
-      </w:pPr>
-      <w:r>
-        <w:t xml:space="preserve">Madsen, Mark E. 2012. Neutral Cultural Transmission in Time-Averaged Archaeological Assemblages. arXiv preprint arXiv:1204.2043 [physics.soc-ph].</w:t>
+    <w:bookmarkStart w:id="166" w:name="ref-mcnutt_ed_1996"/>
+    <w:p>
+      <w:pPr>
+        <w:pStyle w:val="Bibliography"/>
+      </w:pPr>
+      <w:r>
+        <w:t xml:space="preserve">McNutt, Charles H. (editor). 1996.</w:t>
+      </w:r>
+      <w:r>
+        <w:t xml:space="preserve"> </w:t>
+      </w:r>
+      <w:r>
+        <w:rPr>
+          <w:i/>
+          <w:iCs/>
+        </w:rPr>
+        <w:t xml:space="preserve">Prehistory of the Central</w:t>
+      </w:r>
+      <w:r>
+        <w:rPr>
+          <w:i/>
+          <w:iCs/>
+        </w:rPr>
+        <w:t xml:space="preserve"> </w:t>
+      </w:r>
+      <w:r>
+        <w:rPr>
+          <w:i/>
+          <w:iCs/>
+        </w:rPr>
+        <w:t xml:space="preserve">Mississippi</w:t>
+      </w:r>
+      <w:r>
+        <w:rPr>
+          <w:i/>
+          <w:iCs/>
+        </w:rPr>
+        <w:t xml:space="preserve"> </w:t>
+      </w:r>
+      <w:r>
+        <w:rPr>
+          <w:i/>
+          <w:iCs/>
+        </w:rPr>
+        <w:t xml:space="preserve">Valley</w:t>
+      </w:r>
+      <w:r>
+        <w:t xml:space="preserve">. University of Alabama Press, Tuscaloosa.</w:t>
       </w:r>
     </w:p>
     <w:bookmarkEnd w:id="166"/>
-    <w:bookmarkStart w:id="167" w:name="ref-mainfort_1996"/>
-    <w:p>
-      <w:pPr>
-        <w:pStyle w:val="Bibliography"/>
-      </w:pPr>
-      <w:r>
-        <w:t xml:space="preserve">Mainfort, Jr., Robert C. 1996a. Late Period Chronology in the Central</w:t>
-      </w:r>
-      <w:r>
-        <w:t xml:space="preserve"> </w:t>
-      </w:r>
-      <w:r>
-        <w:t xml:space="preserve">Mississippi</w:t>
-      </w:r>
-      <w:r>
-        <w:t xml:space="preserve"> </w:t>
-      </w:r>
-      <w:r>
-        <w:t xml:space="preserve">Valley: A Western</w:t>
-      </w:r>
-      <w:r>
-        <w:t xml:space="preserve"> </w:t>
-      </w:r>
-      <w:r>
-        <w:t xml:space="preserve">Tennessee</w:t>
-      </w:r>
-      <w:r>
-        <w:t xml:space="preserve"> </w:t>
-      </w:r>
-      <w:r>
-        <w:t xml:space="preserve">Perspective.</w:t>
-      </w:r>
-      <w:r>
-        <w:t xml:space="preserve"> </w:t>
-      </w:r>
-      <w:r>
-        <w:rPr>
-          <w:i/>
-          <w:iCs/>
-        </w:rPr>
-        <w:t xml:space="preserve">Southeastern Archaeology</w:t>
-      </w:r>
-      <w:r>
-        <w:t xml:space="preserve"> </w:t>
-      </w:r>
-      <w:r>
-        <w:t xml:space="preserve">15(2):172–181.</w:t>
+    <w:bookmarkStart w:id="167" w:name="ref-mesoudi_2021"/>
+    <w:p>
+      <w:pPr>
+        <w:pStyle w:val="Bibliography"/>
+      </w:pPr>
+      <w:r>
+        <w:t xml:space="preserve">Mesoudi, Alex. 2021. Cultural Selection and Biased Transformation: Two Dynamics of Cultural Evolution.</w:t>
+      </w:r>
+      <w:r>
+        <w:t xml:space="preserve"> </w:t>
+      </w:r>
+      <w:r>
+        <w:rPr>
+          <w:i/>
+          <w:iCs/>
+        </w:rPr>
+        <w:t xml:space="preserve">Philosophical Transactions of the Royal Society B: Biological Sciences</w:t>
+      </w:r>
+      <w:r>
+        <w:t xml:space="preserve"> </w:t>
+      </w:r>
+      <w:r>
+        <w:t xml:space="preserve">376:20200053.</w:t>
       </w:r>
     </w:p>
     <w:bookmarkEnd w:id="167"/>
-    <w:bookmarkStart w:id="168" w:name="ref-mainfort_1996b"/>
-    <w:p>
-      <w:pPr>
-        <w:pStyle w:val="Bibliography"/>
-      </w:pPr>
-      <w:r>
-        <w:t xml:space="preserve">Mainfort, Jr., Robert C. 1996b. Late Period Chronology in the Central Mississippi Valley: A Western Tennessee Perspective.</w:t>
-      </w:r>
-      <w:r>
-        <w:t xml:space="preserve"> </w:t>
-      </w:r>
-      <w:r>
-        <w:rPr>
-          <w:i/>
-          <w:iCs/>
-        </w:rPr>
-        <w:t xml:space="preserve">Southeastern Archaeology</w:t>
-      </w:r>
-      <w:r>
-        <w:t xml:space="preserve"> </w:t>
-      </w:r>
-      <w:r>
-        <w:t xml:space="preserve">15(2):172–181.</w:t>
-      </w:r>
-    </w:p>
-    <w:bookmarkEnd w:id="168"/>
-    <w:bookmarkStart w:id="169" w:name="ref-mainfort_2001"/>
-    <w:p>
-      <w:pPr>
-        <w:pStyle w:val="Bibliography"/>
-      </w:pPr>
-      <w:r>
-        <w:t xml:space="preserve">Mainfort, Jr., Robert C. 2001. The Late Prehistoric and Protohistoric Periods in the Central</w:t>
-      </w:r>
-      <w:r>
-        <w:t xml:space="preserve"> </w:t>
-      </w:r>
-      <w:r>
-        <w:t xml:space="preserve">Mississippi</w:t>
-      </w:r>
-      <w:r>
-        <w:t xml:space="preserve"> </w:t>
-      </w:r>
-      <w:r>
-        <w:t xml:space="preserve">Valley. In</w:t>
-      </w:r>
-      <w:r>
-        <w:t xml:space="preserve"> </w:t>
-      </w:r>
-      <w:r>
-        <w:rPr>
-          <w:i/>
-          <w:iCs/>
-        </w:rPr>
-        <w:t xml:space="preserve">Societies in Eclipse: Archaeology of the Eastern Woodlands Indians, a.d. 1400–1700</w:t>
-      </w:r>
-      <w:r>
-        <w:t xml:space="preserve">, edited by David S. Brose, C. Wesley Cowan, and Jr. Mainfort Robert C., pp. 173–190. Smithsonian Institution Press, Washington, DC.</w:t>
-      </w:r>
-    </w:p>
-    <w:bookmarkEnd w:id="169"/>
-    <w:bookmarkStart w:id="170" w:name="ref-mainfort_2003"/>
-    <w:p>
-      <w:pPr>
-        <w:pStyle w:val="Bibliography"/>
-      </w:pPr>
-      <w:r>
-        <w:t xml:space="preserve">Mainfort, Jr., Robert C. 2003. An Ordination Approach to Assessing Late Period Phases in the Central</w:t>
-      </w:r>
-      <w:r>
-        <w:t xml:space="preserve"> </w:t>
-      </w:r>
-      <w:r>
-        <w:t xml:space="preserve">Mississippi</w:t>
-      </w:r>
-      <w:r>
-        <w:t xml:space="preserve"> </w:t>
-      </w:r>
-      <w:r>
-        <w:t xml:space="preserve">Valley.</w:t>
-      </w:r>
-      <w:r>
-        <w:t xml:space="preserve"> </w:t>
-      </w:r>
-      <w:r>
-        <w:rPr>
-          <w:i/>
-          <w:iCs/>
-        </w:rPr>
-        <w:t xml:space="preserve">Southeastern Archaeology</w:t>
-      </w:r>
-      <w:r>
-        <w:t xml:space="preserve"> </w:t>
-      </w:r>
-      <w:r>
-        <w:t xml:space="preserve">22(2):176–184.</w:t>
-      </w:r>
-    </w:p>
-    <w:bookmarkEnd w:id="170"/>
-    <w:bookmarkStart w:id="171" w:name="ref-mantel_1967"/>
-    <w:p>
-      <w:pPr>
-        <w:pStyle w:val="Bibliography"/>
-      </w:pPr>
-      <w:r>
-        <w:t xml:space="preserve">Mantel, Nathan. 1967. The Detection of Disease Clustering and a Generalized Regression Approach.</w:t>
-      </w:r>
-      <w:r>
-        <w:t xml:space="preserve"> </w:t>
-      </w:r>
-      <w:r>
-        <w:rPr>
-          <w:i/>
-          <w:iCs/>
-        </w:rPr>
-        <w:t xml:space="preserve">Cancer Research</w:t>
-      </w:r>
-      <w:r>
-        <w:t xml:space="preserve"> </w:t>
-      </w:r>
-      <w:r>
-        <w:t xml:space="preserve">27(2):209–220.</w:t>
-      </w:r>
-    </w:p>
-    <w:bookmarkEnd w:id="171"/>
-    <w:bookmarkStart w:id="172" w:name="ref-mcnutt_ed_1996"/>
-    <w:p>
-      <w:pPr>
-        <w:pStyle w:val="Bibliography"/>
-      </w:pPr>
-      <w:r>
-        <w:t xml:space="preserve">McNutt, Charles H. (editor). 1996.</w:t>
-      </w:r>
-      <w:r>
-        <w:t xml:space="preserve"> </w:t>
-      </w:r>
-      <w:r>
-        <w:rPr>
-          <w:i/>
-          <w:iCs/>
-        </w:rPr>
-        <w:t xml:space="preserve">Prehistory of the Central</w:t>
-      </w:r>
-      <w:r>
-        <w:rPr>
-          <w:i/>
-          <w:iCs/>
-        </w:rPr>
-        <w:t xml:space="preserve"> </w:t>
-      </w:r>
-      <w:r>
-        <w:rPr>
-          <w:i/>
-          <w:iCs/>
-        </w:rPr>
-        <w:t xml:space="preserve">Mississippi</w:t>
-      </w:r>
-      <w:r>
-        <w:rPr>
-          <w:i/>
-          <w:iCs/>
-        </w:rPr>
-        <w:t xml:space="preserve"> </w:t>
-      </w:r>
-      <w:r>
-        <w:rPr>
-          <w:i/>
-          <w:iCs/>
-        </w:rPr>
-        <w:t xml:space="preserve">Valley</w:t>
-      </w:r>
-      <w:r>
-        <w:t xml:space="preserve">. University of Alabama Press, Tuscaloosa.</w:t>
-      </w:r>
-    </w:p>
-    <w:bookmarkEnd w:id="172"/>
-    <w:bookmarkStart w:id="173" w:name="ref-mesoudi_2021"/>
-    <w:p>
-      <w:pPr>
-        <w:pStyle w:val="Bibliography"/>
-      </w:pPr>
-      <w:r>
-        <w:t xml:space="preserve">Mesoudi, Alex. 2021. Cultural Selection and Biased Transformation: Two Dynamics of Cultural Evolution.</w:t>
-      </w:r>
-      <w:r>
-        <w:t xml:space="preserve"> </w:t>
-      </w:r>
-      <w:r>
-        <w:rPr>
-          <w:i/>
-          <w:iCs/>
-        </w:rPr>
-        <w:t xml:space="preserve">Philosophical Transactions of the Royal Society B: Biological Sciences</w:t>
-      </w:r>
-      <w:r>
-        <w:t xml:space="preserve"> </w:t>
-      </w:r>
-      <w:r>
-        <w:t xml:space="preserve">376:20200053.</w:t>
-      </w:r>
-    </w:p>
-    <w:bookmarkEnd w:id="173"/>
-    <w:bookmarkStart w:id="175" w:name="ref-miller_atkins_premo_2018"/>
+    <w:bookmarkStart w:id="169" w:name="ref-miller_atkins_premo_2018"/>
     <w:p>
       <w:pPr>
         <w:pStyle w:val="Bibliography"/>
@@ -6174,7 +6081,7 @@
       <w:r>
         <w:t xml:space="preserve"> </w:t>
       </w:r>
-      <w:hyperlink r:id="rId174">
+      <w:hyperlink r:id="rId168">
         <w:r>
           <w:rPr>
             <w:rStyle w:val="Hyperlink"/>
@@ -6186,384 +6093,384 @@
         <w:t xml:space="preserve">.</w:t>
       </w:r>
     </w:p>
+    <w:bookmarkEnd w:id="169"/>
+    <w:bookmarkStart w:id="170" w:name="ref-milner_1998"/>
+    <w:p>
+      <w:pPr>
+        <w:pStyle w:val="Bibliography"/>
+      </w:pPr>
+      <w:r>
+        <w:t xml:space="preserve">Milner, George R. 1998.</w:t>
+      </w:r>
+      <w:r>
+        <w:t xml:space="preserve"> </w:t>
+      </w:r>
+      <w:r>
+        <w:rPr>
+          <w:i/>
+          <w:iCs/>
+        </w:rPr>
+        <w:t xml:space="preserve">The</w:t>
+      </w:r>
+      <w:r>
+        <w:rPr>
+          <w:i/>
+          <w:iCs/>
+        </w:rPr>
+        <w:t xml:space="preserve"> </w:t>
+      </w:r>
+      <w:r>
+        <w:rPr>
+          <w:i/>
+          <w:iCs/>
+        </w:rPr>
+        <w:t xml:space="preserve">Cahokia</w:t>
+      </w:r>
+      <w:r>
+        <w:rPr>
+          <w:i/>
+          <w:iCs/>
+        </w:rPr>
+        <w:t xml:space="preserve"> </w:t>
+      </w:r>
+      <w:r>
+        <w:rPr>
+          <w:i/>
+          <w:iCs/>
+        </w:rPr>
+        <w:t xml:space="preserve">Chiefdom: The Archaeology of a</w:t>
+      </w:r>
+      <w:r>
+        <w:rPr>
+          <w:i/>
+          <w:iCs/>
+        </w:rPr>
+        <w:t xml:space="preserve"> </w:t>
+      </w:r>
+      <w:r>
+        <w:rPr>
+          <w:i/>
+          <w:iCs/>
+        </w:rPr>
+        <w:t xml:space="preserve">Mississippian</w:t>
+      </w:r>
+      <w:r>
+        <w:rPr>
+          <w:i/>
+          <w:iCs/>
+        </w:rPr>
+        <w:t xml:space="preserve"> </w:t>
+      </w:r>
+      <w:r>
+        <w:rPr>
+          <w:i/>
+          <w:iCs/>
+        </w:rPr>
+        <w:t xml:space="preserve">Society</w:t>
+      </w:r>
+      <w:r>
+        <w:t xml:space="preserve">. Smithsonian Institution Press, Washington, D.C.</w:t>
+      </w:r>
+    </w:p>
+    <w:bookmarkEnd w:id="170"/>
+    <w:bookmarkStart w:id="171" w:name="ref-mitchem_2001"/>
+    <w:p>
+      <w:pPr>
+        <w:pStyle w:val="Bibliography"/>
+      </w:pPr>
+      <w:r>
+        <w:t xml:space="preserve">Mitchem, Jeffrey M. 2001. A Decade of Hypothesis Testing at the</w:t>
+      </w:r>
+      <w:r>
+        <w:t xml:space="preserve"> </w:t>
+      </w:r>
+      <w:r>
+        <w:t xml:space="preserve">Parkin</w:t>
+      </w:r>
+      <w:r>
+        <w:t xml:space="preserve"> </w:t>
+      </w:r>
+      <w:r>
+        <w:t xml:space="preserve">Site,</w:t>
+      </w:r>
+      <w:r>
+        <w:t xml:space="preserve"> </w:t>
+      </w:r>
+      <w:r>
+        <w:t xml:space="preserve">Arkansas</w:t>
+      </w:r>
+      <w:r>
+        <w:t xml:space="preserve">.</w:t>
+      </w:r>
+    </w:p>
+    <w:bookmarkEnd w:id="171"/>
+    <w:bookmarkStart w:id="172" w:name="ref-morse_d_1990"/>
+    <w:p>
+      <w:pPr>
+        <w:pStyle w:val="Bibliography"/>
+      </w:pPr>
+      <w:r>
+        <w:t xml:space="preserve">Morse, Dan F. 1990. The</w:t>
+      </w:r>
+      <w:r>
+        <w:t xml:space="preserve"> </w:t>
+      </w:r>
+      <w:r>
+        <w:t xml:space="preserve">Nodena</w:t>
+      </w:r>
+      <w:r>
+        <w:t xml:space="preserve"> </w:t>
+      </w:r>
+      <w:r>
+        <w:t xml:space="preserve">Phase. In</w:t>
+      </w:r>
+      <w:r>
+        <w:t xml:space="preserve"> </w:t>
+      </w:r>
+      <w:r>
+        <w:rPr>
+          <w:i/>
+          <w:iCs/>
+        </w:rPr>
+        <w:t xml:space="preserve">Towns and Temples Along the</w:t>
+      </w:r>
+      <w:r>
+        <w:rPr>
+          <w:i/>
+          <w:iCs/>
+        </w:rPr>
+        <w:t xml:space="preserve"> </w:t>
+      </w:r>
+      <w:r>
+        <w:rPr>
+          <w:i/>
+          <w:iCs/>
+        </w:rPr>
+        <w:t xml:space="preserve">Mississippi</w:t>
+      </w:r>
+      <w:r>
+        <w:t xml:space="preserve">, edited by David H. Dye and Cheryl Anne Cox, pp. 69–97. University of Alabama Press, Tuscaloosa.</w:t>
+      </w:r>
+    </w:p>
+    <w:bookmarkEnd w:id="172"/>
+    <w:bookmarkStart w:id="173" w:name="ref-morse_morse_1983"/>
+    <w:p>
+      <w:pPr>
+        <w:pStyle w:val="Bibliography"/>
+      </w:pPr>
+      <w:r>
+        <w:t xml:space="preserve">Morse, Dan F., and Phyllis A. Morse. 1983.</w:t>
+      </w:r>
+      <w:r>
+        <w:t xml:space="preserve"> </w:t>
+      </w:r>
+      <w:r>
+        <w:rPr>
+          <w:i/>
+          <w:iCs/>
+        </w:rPr>
+        <w:t xml:space="preserve">Archaeology of the Central</w:t>
+      </w:r>
+      <w:r>
+        <w:rPr>
+          <w:i/>
+          <w:iCs/>
+        </w:rPr>
+        <w:t xml:space="preserve"> </w:t>
+      </w:r>
+      <w:r>
+        <w:rPr>
+          <w:i/>
+          <w:iCs/>
+        </w:rPr>
+        <w:t xml:space="preserve">Mississippi</w:t>
+      </w:r>
+      <w:r>
+        <w:rPr>
+          <w:i/>
+          <w:iCs/>
+        </w:rPr>
+        <w:t xml:space="preserve"> </w:t>
+      </w:r>
+      <w:r>
+        <w:rPr>
+          <w:i/>
+          <w:iCs/>
+        </w:rPr>
+        <w:t xml:space="preserve">Valley</w:t>
+      </w:r>
+      <w:r>
+        <w:t xml:space="preserve">. Academic Press, New York.</w:t>
+      </w:r>
+    </w:p>
+    <w:bookmarkEnd w:id="173"/>
+    <w:bookmarkStart w:id="174" w:name="ref-morse_morse_1996"/>
+    <w:p>
+      <w:pPr>
+        <w:pStyle w:val="Bibliography"/>
+      </w:pPr>
+      <w:r>
+        <w:t xml:space="preserve">Morse, Dan F., and Phyllis A. Morse. 1996. Changes in Interpretation in the Archaeology of the Central</w:t>
+      </w:r>
+      <w:r>
+        <w:t xml:space="preserve"> </w:t>
+      </w:r>
+      <w:r>
+        <w:t xml:space="preserve">Mississippi</w:t>
+      </w:r>
+      <w:r>
+        <w:t xml:space="preserve"> </w:t>
+      </w:r>
+      <w:r>
+        <w:t xml:space="preserve">Valley Since 1983.</w:t>
+      </w:r>
+      <w:r>
+        <w:t xml:space="preserve"> </w:t>
+      </w:r>
+      <w:r>
+        <w:rPr>
+          <w:i/>
+          <w:iCs/>
+        </w:rPr>
+        <w:t xml:space="preserve">North American Archaeologist</w:t>
+      </w:r>
+      <w:r>
+        <w:t xml:space="preserve"> </w:t>
+      </w:r>
+      <w:r>
+        <w:t xml:space="preserve">17(1):1–35.</w:t>
+      </w:r>
+    </w:p>
+    <w:bookmarkEnd w:id="174"/>
+    <w:bookmarkStart w:id="175" w:name="ref-morse_1990"/>
+    <w:p>
+      <w:pPr>
+        <w:pStyle w:val="Bibliography"/>
+      </w:pPr>
+      <w:r>
+        <w:t xml:space="preserve">Morse, Phyllis A. 1990. The</w:t>
+      </w:r>
+      <w:r>
+        <w:t xml:space="preserve"> </w:t>
+      </w:r>
+      <w:r>
+        <w:t xml:space="preserve">Parkin</w:t>
+      </w:r>
+      <w:r>
+        <w:t xml:space="preserve"> </w:t>
+      </w:r>
+      <w:r>
+        <w:t xml:space="preserve">Site and the</w:t>
+      </w:r>
+      <w:r>
+        <w:t xml:space="preserve"> </w:t>
+      </w:r>
+      <w:r>
+        <w:t xml:space="preserve">Parkin</w:t>
+      </w:r>
+      <w:r>
+        <w:t xml:space="preserve"> </w:t>
+      </w:r>
+      <w:r>
+        <w:t xml:space="preserve">Phase. In</w:t>
+      </w:r>
+      <w:r>
+        <w:t xml:space="preserve"> </w:t>
+      </w:r>
+      <w:r>
+        <w:rPr>
+          <w:i/>
+          <w:iCs/>
+        </w:rPr>
+        <w:t xml:space="preserve">Towns and Temples Along the</w:t>
+      </w:r>
+      <w:r>
+        <w:rPr>
+          <w:i/>
+          <w:iCs/>
+        </w:rPr>
+        <w:t xml:space="preserve"> </w:t>
+      </w:r>
+      <w:r>
+        <w:rPr>
+          <w:i/>
+          <w:iCs/>
+        </w:rPr>
+        <w:t xml:space="preserve">Mississippi</w:t>
+      </w:r>
+      <w:r>
+        <w:t xml:space="preserve">, edited by David H. Dye and Cheryl Anne Cox, pp. 118–134. University of Alabama Press, Tuscaloosa.</w:t>
+      </w:r>
+    </w:p>
     <w:bookmarkEnd w:id="175"/>
-    <w:bookmarkStart w:id="176" w:name="ref-milner_1998"/>
-    <w:p>
-      <w:pPr>
-        <w:pStyle w:val="Bibliography"/>
-      </w:pPr>
-      <w:r>
-        <w:t xml:space="preserve">Milner, George R. 1998.</w:t>
-      </w:r>
-      <w:r>
-        <w:t xml:space="preserve"> </w:t>
-      </w:r>
-      <w:r>
-        <w:rPr>
-          <w:i/>
-          <w:iCs/>
-        </w:rPr>
-        <w:t xml:space="preserve">The</w:t>
-      </w:r>
-      <w:r>
-        <w:rPr>
-          <w:i/>
-          <w:iCs/>
-        </w:rPr>
-        <w:t xml:space="preserve"> </w:t>
-      </w:r>
-      <w:r>
-        <w:rPr>
-          <w:i/>
-          <w:iCs/>
-        </w:rPr>
-        <w:t xml:space="preserve">Cahokia</w:t>
-      </w:r>
-      <w:r>
-        <w:rPr>
-          <w:i/>
-          <w:iCs/>
-        </w:rPr>
-        <w:t xml:space="preserve"> </w:t>
-      </w:r>
-      <w:r>
-        <w:rPr>
-          <w:i/>
-          <w:iCs/>
-        </w:rPr>
-        <w:t xml:space="preserve">Chiefdom: The Archaeology of a</w:t>
-      </w:r>
-      <w:r>
-        <w:rPr>
-          <w:i/>
-          <w:iCs/>
-        </w:rPr>
-        <w:t xml:space="preserve"> </w:t>
-      </w:r>
-      <w:r>
-        <w:rPr>
-          <w:i/>
-          <w:iCs/>
-        </w:rPr>
-        <w:t xml:space="preserve">Mississippian</w:t>
-      </w:r>
-      <w:r>
-        <w:rPr>
-          <w:i/>
-          <w:iCs/>
-        </w:rPr>
-        <w:t xml:space="preserve"> </w:t>
-      </w:r>
-      <w:r>
-        <w:rPr>
-          <w:i/>
-          <w:iCs/>
-        </w:rPr>
-        <w:t xml:space="preserve">Society</w:t>
-      </w:r>
-      <w:r>
-        <w:t xml:space="preserve">. Smithsonian Institution Press, Washington, D.C.</w:t>
+    <w:bookmarkStart w:id="176" w:name="ref-neiman_1995"/>
+    <w:p>
+      <w:pPr>
+        <w:pStyle w:val="Bibliography"/>
+      </w:pPr>
+      <w:r>
+        <w:t xml:space="preserve">Neiman, Fraser D. 1995. Stylistic Variation in Evolutionary Perspective: Inferences from Decorative Diversity and Interassemblage Distance in</w:t>
+      </w:r>
+      <w:r>
+        <w:t xml:space="preserve"> </w:t>
+      </w:r>
+      <w:r>
+        <w:t xml:space="preserve">Illinois</w:t>
+      </w:r>
+      <w:r>
+        <w:t xml:space="preserve"> </w:t>
+      </w:r>
+      <w:r>
+        <w:t xml:space="preserve">Woodland</w:t>
+      </w:r>
+      <w:r>
+        <w:t xml:space="preserve"> </w:t>
+      </w:r>
+      <w:r>
+        <w:t xml:space="preserve">Ceramic Assemblages.</w:t>
+      </w:r>
+      <w:r>
+        <w:t xml:space="preserve"> </w:t>
+      </w:r>
+      <w:r>
+        <w:rPr>
+          <w:i/>
+          <w:iCs/>
+        </w:rPr>
+        <w:t xml:space="preserve">American Antiquity</w:t>
+      </w:r>
+      <w:r>
+        <w:t xml:space="preserve"> </w:t>
+      </w:r>
+      <w:r>
+        <w:t xml:space="preserve">60(1):7–36.</w:t>
       